<commit_message>
docs: reescribe numeral 6.13 (sensibilizacion, capacitacion y gestion del cambio)
</commit_message>
<xml_diff>
--- a/normativo/DIRECTIVA-GOBIERNO-IA.docx
+++ b/normativo/DIRECTIVA-GOBIERNO-IA.docx
@@ -11056,7 +11056,6 @@
         <w:spacing w:line="276" w:lineRule="auto"/>
         <w:ind w:left="851"/>
       </w:pPr>
-      <w:commentRangeStart w:id="16"/>
       <w:r>
         <w:t>6.13</w:t>
       </w:r>
@@ -11067,30 +11066,98 @@
     </w:p>
     <w:p>
       <w:pPr>
-        <w:spacing w:after="60" w:line="276" w:lineRule="auto"/>
-        <w:ind w:left="1276" w:hanging="720"/>
+        <w:spacing w:line="276" w:lineRule="auto"/>
+        <w:ind w:left="851"/>
         <w:jc w:val="both"/>
         <w:rPr>
           <w:rFonts w:ascii="Arial" w:eastAsia="Arial" w:hAnsi="Arial" w:cs="Arial"/>
           <w:color w:val="000000"/>
-        </w:rPr>
-      </w:pPr>
-      <w:r>
-        <w:rPr>
-          <w:rFonts w:ascii="Arial" w:eastAsia="Arial" w:hAnsi="Arial" w:cs="Arial"/>
-          <w:color w:val="000000"/>
           <w:highlight w:val="yellow"/>
         </w:rPr>
-        <w:t>6.13.1</w:t>
-      </w:r>
+      </w:pPr>
       <w:r>
         <w:rPr>
           <w:rFonts w:ascii="Arial" w:eastAsia="Arial" w:hAnsi="Arial" w:cs="Arial"/>
           <w:color w:val="000000"/>
           <w:highlight w:val="yellow"/>
         </w:rPr>
-        <w:tab/>
-        <w:t>La INRH ejecuta acciones de sensibilización, concientización y capacitación, diferenciadas por grupos:</w:t>
+        <w:t>La Intendencia Nacional de Recursos Humanos conduce las acciones de sensibilización, capacitación y gestión del cambio vinculadas al uso de sistemas basados en inteligencia artificial, de conformidad con las funciones establecidas en el Reglamento de Organización y Funciones de la SUNAT y con el apoyo técnico de la Comisión de Gobierno de IA.</w:t>
+      </w:r>
+    </w:p>
+    <w:p>
+      <w:pPr>
+        <w:spacing w:line="276" w:lineRule="auto"/>
+        <w:ind w:left="851" w:hanging="284"/>
+        <w:jc w:val="both"/>
+        <w:rPr>
+          <w:rFonts w:ascii="Arial" w:eastAsia="Arial" w:hAnsi="Arial" w:cs="Arial"/>
+          <w:color w:val="000000"/>
+          <w:highlight w:val="yellow"/>
+        </w:rPr>
+      </w:pPr>
+      <w:r>
+        <w:rPr>
+          <w:rFonts w:ascii="Arial" w:eastAsia="Arial" w:hAnsi="Arial" w:cs="Arial"/>
+          <w:color w:val="000000"/>
+          <w:highlight w:val="yellow"/>
+        </w:rPr>
+        <w:t>6.</w:t>
+      </w:r>
+      <w:r>
+        <w:rPr>
+          <w:rFonts w:ascii="Arial" w:eastAsia="Arial" w:hAnsi="Arial" w:cs="Arial"/>
+          <w:color w:val="000000"/>
+          <w:highlight w:val="yellow"/>
+        </w:rPr>
+        <w:t>13</w:t>
+      </w:r>
+      <w:r>
+        <w:rPr>
+          <w:rFonts w:ascii="Arial" w:eastAsia="Arial" w:hAnsi="Arial" w:cs="Arial"/>
+          <w:color w:val="000000"/>
+          <w:highlight w:val="yellow"/>
+        </w:rPr>
+        <w:t>.1 Sensibilización</w:t>
+      </w:r>
+    </w:p>
+    <w:p>
+      <w:pPr>
+        <w:spacing w:line="276" w:lineRule="auto"/>
+        <w:ind w:left="851"/>
+        <w:jc w:val="both"/>
+        <w:rPr>
+          <w:rFonts w:ascii="Arial" w:eastAsia="Arial" w:hAnsi="Arial" w:cs="Arial"/>
+          <w:color w:val="000000"/>
+          <w:highlight w:val="yellow"/>
+        </w:rPr>
+      </w:pPr>
+      <w:r>
+        <w:rPr>
+          <w:rFonts w:ascii="Arial" w:eastAsia="Arial" w:hAnsi="Arial" w:cs="Arial"/>
+          <w:color w:val="000000"/>
+          <w:highlight w:val="yellow"/>
+        </w:rPr>
+        <w:t>Todo el personal de la SUNAT vinculado al diseño, desarrollo, implementación, evaluación o uso de sistemas basados en IA es sensibilizado respecto del uso seguro, responsable y ético de dichos sistemas, así como de los riesgos asociados y de las disposiciones establecidas en la Política de uso seguro, responsable y ético de los sistemas basados en IA de la SUNAT.</w:t>
+      </w:r>
+    </w:p>
+    <w:p>
+      <w:pPr>
+        <w:spacing w:line="276" w:lineRule="auto"/>
+        <w:ind w:left="851"/>
+        <w:jc w:val="both"/>
+        <w:rPr>
+          <w:rFonts w:ascii="Arial" w:eastAsia="Arial" w:hAnsi="Arial" w:cs="Arial"/>
+          <w:color w:val="000000"/>
+          <w:highlight w:val="yellow"/>
+        </w:rPr>
+      </w:pPr>
+      <w:r>
+        <w:rPr>
+          <w:rFonts w:ascii="Arial" w:eastAsia="Arial" w:hAnsi="Arial" w:cs="Arial"/>
+          <w:color w:val="000000"/>
+          <w:highlight w:val="yellow"/>
+        </w:rPr>
+        <w:t>Las acciones de sensibilización consideran, como mínimo:</w:t>
       </w:r>
     </w:p>
     <w:p>
@@ -11098,22 +11165,25 @@
         <w:pStyle w:val="Prrafodelista"/>
         <w:numPr>
           <w:ilvl w:val="0"/>
-          <w:numId w:val="6"/>
+          <w:numId w:val="26"/>
         </w:numPr>
-        <w:spacing w:before="0" w:after="0" w:line="276" w:lineRule="auto"/>
-        <w:ind w:left="1701"/>
-        <w:rPr>
-          <w:b w:val="0"/>
-          <w:bCs w:val="0"/>
-        </w:rPr>
-      </w:pPr>
-      <w:r>
-        <w:rPr>
-          <w:b w:val="0"/>
-          <w:bCs w:val="0"/>
-          <w:color w:val="000000"/>
-        </w:rPr>
-        <w:t>Alta Dirección: Gobernanza de IA, riesgos estratégicos, normativa.</w:t>
+        <w:spacing w:before="0" w:line="276" w:lineRule="auto"/>
+        <w:ind w:left="1276"/>
+        <w:rPr>
+          <w:b w:val="0"/>
+          <w:bCs w:val="0"/>
+          <w:color w:val="000000"/>
+          <w:highlight w:val="yellow"/>
+        </w:rPr>
+      </w:pPr>
+      <w:r>
+        <w:rPr>
+          <w:b w:val="0"/>
+          <w:bCs w:val="0"/>
+          <w:color w:val="000000"/>
+          <w:highlight w:val="yellow"/>
+        </w:rPr>
+        <w:t>La finalidad y los principios institucionales aplicables a los sistemas basados en IA.</w:t>
       </w:r>
     </w:p>
     <w:p>
@@ -11121,22 +11191,25 @@
         <w:pStyle w:val="Prrafodelista"/>
         <w:numPr>
           <w:ilvl w:val="0"/>
-          <w:numId w:val="6"/>
+          <w:numId w:val="26"/>
         </w:numPr>
-        <w:spacing w:after="40" w:line="276" w:lineRule="auto"/>
-        <w:ind w:left="1701"/>
-        <w:rPr>
-          <w:b w:val="0"/>
-          <w:bCs w:val="0"/>
-        </w:rPr>
-      </w:pPr>
-      <w:r>
-        <w:rPr>
-          <w:b w:val="0"/>
-          <w:bCs w:val="0"/>
-          <w:color w:val="000000"/>
-        </w:rPr>
-        <w:t>Personal técnico (INSI): Desarrollo responsable, MLOps, seguridad, NTP-ISO/IEC 42001.</w:t>
+        <w:spacing w:before="0" w:line="276" w:lineRule="auto"/>
+        <w:ind w:left="1276"/>
+        <w:rPr>
+          <w:b w:val="0"/>
+          <w:bCs w:val="0"/>
+          <w:color w:val="000000"/>
+          <w:highlight w:val="yellow"/>
+        </w:rPr>
+      </w:pPr>
+      <w:r>
+        <w:rPr>
+          <w:b w:val="0"/>
+          <w:bCs w:val="0"/>
+          <w:color w:val="000000"/>
+          <w:highlight w:val="yellow"/>
+        </w:rPr>
+        <w:t>Los riesgos derivados de su diseño, desarrollo, implementación y uso.</w:t>
       </w:r>
     </w:p>
     <w:p>
@@ -11144,22 +11217,25 @@
         <w:pStyle w:val="Prrafodelista"/>
         <w:numPr>
           <w:ilvl w:val="0"/>
-          <w:numId w:val="6"/>
+          <w:numId w:val="26"/>
         </w:numPr>
-        <w:spacing w:after="40" w:line="276" w:lineRule="auto"/>
-        <w:ind w:left="1701"/>
-        <w:rPr>
-          <w:b w:val="0"/>
-          <w:bCs w:val="0"/>
-        </w:rPr>
-      </w:pPr>
-      <w:r>
-        <w:rPr>
-          <w:b w:val="0"/>
-          <w:bCs w:val="0"/>
-          <w:color w:val="000000"/>
-        </w:rPr>
-        <w:t>Colaboradores operativos: Uso responsable de herramientas de IA, identificación de sesgos, limitaciones.</w:t>
+        <w:spacing w:before="0" w:line="276" w:lineRule="auto"/>
+        <w:ind w:left="1276"/>
+        <w:rPr>
+          <w:b w:val="0"/>
+          <w:bCs w:val="0"/>
+          <w:color w:val="000000"/>
+          <w:highlight w:val="yellow"/>
+        </w:rPr>
+      </w:pPr>
+      <w:r>
+        <w:rPr>
+          <w:b w:val="0"/>
+          <w:bCs w:val="0"/>
+          <w:color w:val="000000"/>
+          <w:highlight w:val="yellow"/>
+        </w:rPr>
+        <w:t>La protección de los derechos fundamentales de los administrados y la prevención de sesgos o resultados discriminatorios.</w:t>
       </w:r>
     </w:p>
     <w:p>
@@ -11167,62 +11243,428 @@
         <w:pStyle w:val="Prrafodelista"/>
         <w:numPr>
           <w:ilvl w:val="0"/>
-          <w:numId w:val="6"/>
+          <w:numId w:val="26"/>
         </w:numPr>
-        <w:spacing w:after="40" w:line="276" w:lineRule="auto"/>
-        <w:ind w:left="1701"/>
-        <w:rPr>
-          <w:b w:val="0"/>
-          <w:bCs w:val="0"/>
-        </w:rPr>
-      </w:pPr>
-      <w:r>
-        <w:rPr>
-          <w:b w:val="0"/>
-          <w:bCs w:val="0"/>
-          <w:color w:val="000000"/>
-        </w:rPr>
-        <w:t>Todos los colaboradores: Principios éticos, reglas básicas de uso, protección de la información.</w:t>
-      </w:r>
-    </w:p>
-    <w:p>
-      <w:pPr>
-        <w:spacing w:after="60" w:line="276" w:lineRule="auto"/>
-        <w:ind w:left="1276" w:hanging="720"/>
+        <w:spacing w:before="0" w:line="276" w:lineRule="auto"/>
+        <w:ind w:left="1276"/>
+        <w:rPr>
+          <w:b w:val="0"/>
+          <w:bCs w:val="0"/>
+          <w:color w:val="000000"/>
+          <w:highlight w:val="yellow"/>
+        </w:rPr>
+      </w:pPr>
+      <w:r>
+        <w:rPr>
+          <w:b w:val="0"/>
+          <w:bCs w:val="0"/>
+          <w:color w:val="000000"/>
+          <w:highlight w:val="yellow"/>
+        </w:rPr>
+        <w:lastRenderedPageBreak/>
+        <w:t>La protección de la reserva tributaria, secreto comercial y demás obligaciones de confidencialidad aplicables.</w:t>
+      </w:r>
+    </w:p>
+    <w:p>
+      <w:pPr>
+        <w:pStyle w:val="Prrafodelista"/>
+        <w:numPr>
+          <w:ilvl w:val="0"/>
+          <w:numId w:val="26"/>
+        </w:numPr>
+        <w:spacing w:before="0" w:line="276" w:lineRule="auto"/>
+        <w:ind w:left="1276"/>
+        <w:rPr>
+          <w:b w:val="0"/>
+          <w:bCs w:val="0"/>
+          <w:color w:val="000000"/>
+          <w:highlight w:val="yellow"/>
+        </w:rPr>
+      </w:pPr>
+      <w:r>
+        <w:rPr>
+          <w:b w:val="0"/>
+          <w:bCs w:val="0"/>
+          <w:color w:val="000000"/>
+          <w:highlight w:val="yellow"/>
+        </w:rPr>
+        <w:t>El impacto social y ambiental de los sistemas basados en IA.</w:t>
+      </w:r>
+    </w:p>
+    <w:p>
+      <w:pPr>
+        <w:spacing w:line="276" w:lineRule="auto"/>
+        <w:ind w:left="851"/>
         <w:jc w:val="both"/>
         <w:rPr>
           <w:rFonts w:ascii="Arial" w:eastAsia="Arial" w:hAnsi="Arial" w:cs="Arial"/>
           <w:color w:val="000000"/>
-        </w:rPr>
-      </w:pPr>
-      <w:r>
-        <w:rPr>
-          <w:rFonts w:ascii="Arial" w:eastAsia="Arial" w:hAnsi="Arial" w:cs="Arial"/>
-          <w:color w:val="000000"/>
           <w:highlight w:val="yellow"/>
         </w:rPr>
-        <w:t>6.13.2</w:t>
-      </w:r>
+      </w:pPr>
       <w:r>
         <w:rPr>
           <w:rFonts w:ascii="Arial" w:eastAsia="Arial" w:hAnsi="Arial" w:cs="Arial"/>
           <w:color w:val="000000"/>
           <w:highlight w:val="yellow"/>
         </w:rPr>
-        <w:tab/>
-        <w:t>La INRH ejecuta las acciones de forma continua, las actualiza anualmente e informa al CGTD las acciones ejecutadas durante el año.</w:t>
-      </w:r>
-      <w:commentRangeEnd w:id="16"/>
-      <w:r>
-        <w:rPr>
-          <w:rStyle w:val="Refdecomentario"/>
-          <w:rFonts w:ascii="Arial" w:eastAsia="Arial" w:hAnsi="Arial" w:cs="Arial"/>
-          <w:color w:val="000000"/>
-          <w:sz w:val="22"/>
-          <w:szCs w:val="22"/>
-        </w:rPr>
-        <w:commentReference w:id="16"/>
-      </w:r>
+        <w:t>Esta disposición incorpora los requerimientos establecidos en el numeral 28.9 del artículo 28 del Reglamento y adopta medidas adicionales de sensibilización orientadas a promover el uso seguro, responsable y ético de los sistemas basados en IA, en concordancia con el numeral 7.3 de la NTP-ISO/IEC 42001:2025.</w:t>
+      </w:r>
+    </w:p>
+    <w:p>
+      <w:pPr>
+        <w:spacing w:line="276" w:lineRule="auto"/>
+        <w:ind w:left="851" w:hanging="284"/>
+        <w:jc w:val="both"/>
+        <w:rPr>
+          <w:rFonts w:ascii="Arial" w:eastAsia="Arial" w:hAnsi="Arial" w:cs="Arial"/>
+          <w:color w:val="000000"/>
+          <w:highlight w:val="yellow"/>
+        </w:rPr>
+      </w:pPr>
+      <w:r>
+        <w:rPr>
+          <w:rFonts w:ascii="Arial" w:eastAsia="Arial" w:hAnsi="Arial" w:cs="Arial"/>
+          <w:color w:val="000000"/>
+          <w:highlight w:val="yellow"/>
+        </w:rPr>
+        <w:t>6.</w:t>
+      </w:r>
+      <w:r>
+        <w:rPr>
+          <w:rFonts w:ascii="Arial" w:eastAsia="Arial" w:hAnsi="Arial" w:cs="Arial"/>
+          <w:color w:val="000000"/>
+          <w:highlight w:val="yellow"/>
+        </w:rPr>
+        <w:t>13</w:t>
+      </w:r>
+      <w:r>
+        <w:rPr>
+          <w:rFonts w:ascii="Arial" w:eastAsia="Arial" w:hAnsi="Arial" w:cs="Arial"/>
+          <w:color w:val="000000"/>
+          <w:highlight w:val="yellow"/>
+        </w:rPr>
+        <w:t>.2 Capacitación y fortalecimiento de capacidades</w:t>
+      </w:r>
+    </w:p>
+    <w:p>
+      <w:pPr>
+        <w:spacing w:line="276" w:lineRule="auto"/>
+        <w:ind w:left="851"/>
+        <w:jc w:val="both"/>
+        <w:rPr>
+          <w:rFonts w:ascii="Arial" w:eastAsia="Arial" w:hAnsi="Arial" w:cs="Arial"/>
+          <w:color w:val="000000"/>
+          <w:highlight w:val="yellow"/>
+        </w:rPr>
+      </w:pPr>
+      <w:r>
+        <w:rPr>
+          <w:rFonts w:ascii="Arial" w:eastAsia="Arial" w:hAnsi="Arial" w:cs="Arial"/>
+          <w:color w:val="000000"/>
+          <w:highlight w:val="yellow"/>
+        </w:rPr>
+        <w:t xml:space="preserve">La Intendencia Nacional de Recursos Humanos fortalece de manera progresiva y sistemática las capacidades y competencias de su personal en materia de sistemas basados en IA mediante acciones formativas. </w:t>
+      </w:r>
+    </w:p>
+    <w:p>
+      <w:pPr>
+        <w:spacing w:line="276" w:lineRule="auto"/>
+        <w:ind w:left="851"/>
+        <w:jc w:val="both"/>
+        <w:rPr>
+          <w:rFonts w:ascii="Arial" w:eastAsia="Arial" w:hAnsi="Arial" w:cs="Arial"/>
+          <w:color w:val="000000"/>
+          <w:highlight w:val="yellow"/>
+        </w:rPr>
+      </w:pPr>
+      <w:r>
+        <w:rPr>
+          <w:rFonts w:ascii="Arial" w:eastAsia="Arial" w:hAnsi="Arial" w:cs="Arial"/>
+          <w:color w:val="000000"/>
+          <w:highlight w:val="yellow"/>
+        </w:rPr>
+        <w:t>Las necesidades de capacitación asociadas a los distintos roles, los contenidos formativos, las modalidades de capacitación y los mecanismos de evaluación de resultados se determinan en el marco normativo del Plan de Desarrollo de las Personas.</w:t>
+      </w:r>
+    </w:p>
+    <w:p>
+      <w:pPr>
+        <w:spacing w:line="276" w:lineRule="auto"/>
+        <w:ind w:left="851"/>
+        <w:jc w:val="both"/>
+        <w:rPr>
+          <w:rFonts w:ascii="Arial" w:eastAsia="Arial" w:hAnsi="Arial" w:cs="Arial"/>
+          <w:color w:val="000000"/>
+          <w:highlight w:val="yellow"/>
+        </w:rPr>
+      </w:pPr>
+      <w:r>
+        <w:rPr>
+          <w:rFonts w:ascii="Arial" w:eastAsia="Arial" w:hAnsi="Arial" w:cs="Arial"/>
+          <w:color w:val="000000"/>
+          <w:highlight w:val="yellow"/>
+        </w:rPr>
+        <w:t>Estas acciones consideran, como mínimo:</w:t>
+      </w:r>
+    </w:p>
+    <w:p>
+      <w:pPr>
+        <w:pStyle w:val="Prrafodelista"/>
+        <w:numPr>
+          <w:ilvl w:val="0"/>
+          <w:numId w:val="25"/>
+        </w:numPr>
+        <w:spacing w:before="0" w:line="276" w:lineRule="auto"/>
+        <w:ind w:left="1276"/>
+        <w:rPr>
+          <w:b w:val="0"/>
+          <w:bCs w:val="0"/>
+          <w:color w:val="000000"/>
+          <w:highlight w:val="yellow"/>
+        </w:rPr>
+      </w:pPr>
+      <w:r>
+        <w:rPr>
+          <w:b w:val="0"/>
+          <w:bCs w:val="0"/>
+          <w:color w:val="000000"/>
+          <w:highlight w:val="yellow"/>
+        </w:rPr>
+        <w:t>Los fundamentos y el ciclo de vida de los sistemas basados en IA.</w:t>
+      </w:r>
+    </w:p>
+    <w:p>
+      <w:pPr>
+        <w:pStyle w:val="Prrafodelista"/>
+        <w:numPr>
+          <w:ilvl w:val="0"/>
+          <w:numId w:val="25"/>
+        </w:numPr>
+        <w:spacing w:before="0" w:line="276" w:lineRule="auto"/>
+        <w:ind w:left="1276"/>
+        <w:rPr>
+          <w:b w:val="0"/>
+          <w:bCs w:val="0"/>
+          <w:color w:val="000000"/>
+          <w:highlight w:val="yellow"/>
+        </w:rPr>
+      </w:pPr>
+      <w:r>
+        <w:rPr>
+          <w:b w:val="0"/>
+          <w:bCs w:val="0"/>
+          <w:color w:val="000000"/>
+          <w:highlight w:val="yellow"/>
+        </w:rPr>
+        <w:t>La gestión de riesgos y la seguridad de la información aplicables.</w:t>
+      </w:r>
+    </w:p>
+    <w:p>
+      <w:pPr>
+        <w:pStyle w:val="Prrafodelista"/>
+        <w:numPr>
+          <w:ilvl w:val="0"/>
+          <w:numId w:val="25"/>
+        </w:numPr>
+        <w:spacing w:before="0" w:line="276" w:lineRule="auto"/>
+        <w:ind w:left="1276"/>
+        <w:rPr>
+          <w:b w:val="0"/>
+          <w:bCs w:val="0"/>
+          <w:color w:val="000000"/>
+          <w:highlight w:val="yellow"/>
+        </w:rPr>
+      </w:pPr>
+      <w:r>
+        <w:rPr>
+          <w:b w:val="0"/>
+          <w:bCs w:val="0"/>
+          <w:color w:val="000000"/>
+          <w:highlight w:val="yellow"/>
+        </w:rPr>
+        <w:t>La ética, integridad y responsabilidad en el uso de la IA.</w:t>
+      </w:r>
+    </w:p>
+    <w:p>
+      <w:pPr>
+        <w:pStyle w:val="Prrafodelista"/>
+        <w:numPr>
+          <w:ilvl w:val="0"/>
+          <w:numId w:val="25"/>
+        </w:numPr>
+        <w:spacing w:before="0" w:line="276" w:lineRule="auto"/>
+        <w:ind w:left="1276"/>
+        <w:rPr>
+          <w:b w:val="0"/>
+          <w:bCs w:val="0"/>
+          <w:color w:val="000000"/>
+          <w:highlight w:val="yellow"/>
+        </w:rPr>
+      </w:pPr>
+      <w:r>
+        <w:rPr>
+          <w:b w:val="0"/>
+          <w:bCs w:val="0"/>
+          <w:color w:val="000000"/>
+          <w:highlight w:val="yellow"/>
+        </w:rPr>
+        <w:t>La protección de datos personales.</w:t>
+      </w:r>
+    </w:p>
+    <w:p>
+      <w:pPr>
+        <w:pStyle w:val="Prrafodelista"/>
+        <w:numPr>
+          <w:ilvl w:val="0"/>
+          <w:numId w:val="25"/>
+        </w:numPr>
+        <w:spacing w:before="0" w:line="276" w:lineRule="auto"/>
+        <w:ind w:left="1276"/>
+        <w:rPr>
+          <w:b w:val="0"/>
+          <w:bCs w:val="0"/>
+          <w:color w:val="000000"/>
+          <w:highlight w:val="yellow"/>
+        </w:rPr>
+      </w:pPr>
+      <w:r>
+        <w:rPr>
+          <w:b w:val="0"/>
+          <w:bCs w:val="0"/>
+          <w:color w:val="000000"/>
+          <w:highlight w:val="yellow"/>
+        </w:rPr>
+        <w:t>La protección de la reserva tributaria cuando los sistemas procesen información de los administrados.</w:t>
+      </w:r>
+    </w:p>
+    <w:p>
+      <w:pPr>
+        <w:spacing w:line="276" w:lineRule="auto"/>
+        <w:ind w:left="851"/>
+        <w:jc w:val="both"/>
+        <w:rPr>
+          <w:rFonts w:ascii="Arial" w:eastAsia="Arial" w:hAnsi="Arial" w:cs="Arial"/>
+          <w:color w:val="000000"/>
+          <w:highlight w:val="yellow"/>
+        </w:rPr>
+      </w:pPr>
+      <w:r>
+        <w:rPr>
+          <w:rFonts w:ascii="Arial" w:eastAsia="Arial" w:hAnsi="Arial" w:cs="Arial"/>
+          <w:color w:val="000000"/>
+          <w:highlight w:val="yellow"/>
+        </w:rPr>
+        <w:t>Esta disposición se implementa conforme al numeral 28.5 del artículo 28 del Reglamento y en concordancia con el numeral 7.2 y el Anexo A.4 de la NTP</w:t>
+      </w:r>
+      <w:r>
+        <w:rPr>
+          <w:rFonts w:ascii="Arial" w:eastAsia="Arial" w:hAnsi="Arial" w:cs="Arial"/>
+          <w:color w:val="000000"/>
+          <w:highlight w:val="yellow"/>
+        </w:rPr>
+        <w:noBreakHyphen/>
+        <w:t>ISO/IEC 42001:2025.</w:t>
+      </w:r>
+    </w:p>
+    <w:p>
+      <w:pPr>
+        <w:spacing w:line="276" w:lineRule="auto"/>
+        <w:ind w:left="851" w:hanging="284"/>
+        <w:jc w:val="both"/>
+        <w:rPr>
+          <w:rFonts w:ascii="Arial" w:eastAsia="Arial" w:hAnsi="Arial" w:cs="Arial"/>
+          <w:color w:val="000000"/>
+          <w:highlight w:val="yellow"/>
+        </w:rPr>
+      </w:pPr>
+      <w:r>
+        <w:rPr>
+          <w:rFonts w:ascii="Arial" w:eastAsia="Arial" w:hAnsi="Arial" w:cs="Arial"/>
+          <w:color w:val="000000"/>
+          <w:highlight w:val="yellow"/>
+        </w:rPr>
+        <w:t>6.</w:t>
+      </w:r>
+      <w:r>
+        <w:rPr>
+          <w:rFonts w:ascii="Arial" w:eastAsia="Arial" w:hAnsi="Arial" w:cs="Arial"/>
+          <w:color w:val="000000"/>
+          <w:highlight w:val="yellow"/>
+        </w:rPr>
+        <w:t>13</w:t>
+      </w:r>
+      <w:r>
+        <w:rPr>
+          <w:rFonts w:ascii="Arial" w:eastAsia="Arial" w:hAnsi="Arial" w:cs="Arial"/>
+          <w:color w:val="000000"/>
+          <w:highlight w:val="yellow"/>
+        </w:rPr>
+        <w:t>.3 Gestión del cambio</w:t>
+      </w:r>
+    </w:p>
+    <w:p>
+      <w:pPr>
+        <w:spacing w:line="276" w:lineRule="auto"/>
+        <w:ind w:left="851"/>
+        <w:jc w:val="both"/>
+        <w:rPr>
+          <w:rFonts w:ascii="Arial" w:eastAsia="Arial" w:hAnsi="Arial" w:cs="Arial"/>
+          <w:color w:val="000000"/>
+          <w:highlight w:val="yellow"/>
+        </w:rPr>
+      </w:pPr>
+      <w:r>
+        <w:rPr>
+          <w:rFonts w:ascii="Arial" w:eastAsia="Arial" w:hAnsi="Arial" w:cs="Arial"/>
+          <w:color w:val="000000"/>
+          <w:highlight w:val="yellow"/>
+        </w:rPr>
+        <w:t>La Intendencia Nacional de Recursos Humanos promueve las acciones de gestión del cambio necesarias para la adopción efectiva de la Política y del sistema de gestión de IA, fomentando una cultura institucional orientada a la innovación responsable, la mejora continua y el aprovechamiento seguro y sostenible de las tecnologías basadas en IA.</w:t>
+      </w:r>
+    </w:p>
+    <w:p>
+      <w:pPr>
+        <w:spacing w:line="276" w:lineRule="auto"/>
+        <w:ind w:left="851"/>
+        <w:jc w:val="both"/>
+        <w:rPr>
+          <w:rFonts w:ascii="Arial" w:eastAsia="Arial" w:hAnsi="Arial" w:cs="Arial"/>
+          <w:color w:val="000000"/>
+          <w:highlight w:val="yellow"/>
+        </w:rPr>
+      </w:pPr>
+      <w:r>
+        <w:rPr>
+          <w:rFonts w:ascii="Arial" w:eastAsia="Arial" w:hAnsi="Arial" w:cs="Arial"/>
+          <w:color w:val="000000"/>
+          <w:highlight w:val="yellow"/>
+        </w:rPr>
+        <w:t>Las acciones de gestión del cambio facilitan la consolidación de la Política institucional de uso seguro, responsable y ético de los sistemas basados en IA y del sistema de gestión de IA, promoviendo su integración en la gestión institucional y favoreciendo las condiciones organizacionales necesarias para su sostenibilidad y mejora continua, en concordancia con los numerales 28.1 y 28.2 del artículo 28 del Reglamento.</w:t>
+      </w:r>
+    </w:p>
+    <w:p>
+      <w:pPr>
+        <w:jc w:val="both"/>
+        <w:rPr>
+          <w:color w:val="000000" w:themeColor="text1"/>
+        </w:rPr>
+      </w:pPr>
+    </w:p>
+    <w:p>
+      <w:pPr>
+        <w:jc w:val="both"/>
+        <w:rPr>
+          <w:color w:val="000000" w:themeColor="text1"/>
+        </w:rPr>
+      </w:pPr>
+    </w:p>
+    <w:p>
+      <w:pPr>
+        <w:jc w:val="both"/>
+        <w:rPr>
+          <w:color w:val="000000" w:themeColor="text1"/>
+        </w:rPr>
+      </w:pPr>
     </w:p>
     <w:p>
       <w:pPr>
@@ -11273,16 +11715,7 @@
           <w:highlight w:val="yellow"/>
         </w:rPr>
         <w:tab/>
-        <w:t xml:space="preserve">En el desarrollo, la implementación y el uso de los SBIA, la SUNAT promueve la participación de equipos diversos y multidisciplinarios, garantiza el pleno respeto de los derechos humanos y evita que se generen resultados injustos o discriminatorios, considera el impacto social y ambiental, e implementa las </w:t>
-      </w:r>
-      <w:r>
-        <w:rPr>
-          <w:rFonts w:ascii="Arial" w:eastAsia="Arial" w:hAnsi="Arial" w:cs="Arial"/>
-          <w:color w:val="000000"/>
-          <w:highlight w:val="yellow"/>
-        </w:rPr>
-        <w:lastRenderedPageBreak/>
-        <w:t>mejores prácticas, estándares y normas técnicas para identificar y minimizar los sesgos de los algoritmos y de las bases de datos utilizados</w:t>
+        <w:t>En el desarrollo, la implementación y el uso de los SBIA, la SUNAT promueve la participación de equipos diversos y multidisciplinarios, garantiza el pleno respeto de los derechos humanos y evita que se generen resultados injustos o discriminatorios, considera el impacto social y ambiental, e implementa las mejores prácticas, estándares y normas técnicas para identificar y minimizar los sesgos de los algoritmos y de las bases de datos utilizados</w:t>
       </w:r>
       <w:r>
         <w:rPr>
@@ -11480,7 +11913,14 @@
         <w:rPr>
           <w:highlight w:val="lightGray"/>
         </w:rPr>
-        <w:t>6.15.4 Cuando un proyecto de inversión pública sujeto al Sistema Nacional de Programación Multianual y Gestión de Inversiones incorpore un componente basado en IA, la Unidad Formuladora considera la opinión de la Comisión como insumo del análisis técnico que sustenta la declaración de viabilidad, sin perjuicio de las disposiciones del referido Sistema. En la ejecución, el SBIA observa el ciclo de vida del numeral 6.1.</w:t>
+        <w:t xml:space="preserve">6.15.4 Cuando un proyecto de inversión pública sujeto al Sistema Nacional de Programación Multianual y Gestión de Inversiones incorpore un componente basado en IA, la Unidad Formuladora considera la opinión de la Comisión como insumo del análisis técnico que </w:t>
+      </w:r>
+      <w:r>
+        <w:rPr>
+          <w:highlight w:val="lightGray"/>
+        </w:rPr>
+        <w:lastRenderedPageBreak/>
+        <w:t>sustenta la declaración de viabilidad, sin perjuicio de las disposiciones del referido Sistema. En la ejecución, el SBIA observa el ciclo de vida del numeral 6.1.</w:t>
       </w:r>
     </w:p>
     <w:p>
@@ -11516,7 +11956,7 @@
           <w:szCs w:val="22"/>
         </w:rPr>
       </w:pPr>
-      <w:bookmarkStart w:id="17" w:name="_Toc235003967"/>
+      <w:bookmarkStart w:id="16" w:name="_Toc235003967"/>
       <w:r>
         <w:rPr>
           <w:rFonts w:cs="Arial"/>
@@ -11527,7 +11967,7 @@
         <w:lastRenderedPageBreak/>
         <w:t>DISPOSICIONES FINALES</w:t>
       </w:r>
-      <w:bookmarkEnd w:id="17"/>
+      <w:bookmarkEnd w:id="16"/>
     </w:p>
     <w:p>
       <w:pPr>
@@ -11876,7 +12316,7 @@
           <w:szCs w:val="22"/>
         </w:rPr>
       </w:pPr>
-      <w:bookmarkStart w:id="18" w:name="_Toc235003968"/>
+      <w:bookmarkStart w:id="17" w:name="_Toc235003968"/>
       <w:r>
         <w:rPr>
           <w:rFonts w:cs="Arial"/>
@@ -11886,7 +12326,7 @@
         </w:rPr>
         <w:t>ANEXOS</w:t>
       </w:r>
-      <w:bookmarkEnd w:id="18"/>
+      <w:bookmarkEnd w:id="17"/>
     </w:p>
     <w:p>
       <w:pPr>
@@ -16166,22 +16606,6 @@
       </w:r>
     </w:p>
   </w:comment>
-  <w:comment w:id="16" w:author="Kut Castro Mario Fernando" w:date="2026-07-21T12:08:00Z" w:initials="MK">
-    <w:p>
-      <w:pPr>
-        <w:pStyle w:val="Textocomentario"/>
-      </w:pPr>
-      <w:r>
-        <w:rPr>
-          <w:rStyle w:val="Refdecomentario"/>
-        </w:rPr>
-        <w:annotationRef/>
-      </w:r>
-      <w:r>
-        <w:t>Revisión de la version del frente de sensibilización, educación y capacitación.</w:t>
-      </w:r>
-    </w:p>
-  </w:comment>
 </w:comments>
 </file>
 
@@ -16196,7 +16620,6 @@
   <w15:commentEx w15:paraId="32D4CC42" w15:done="0"/>
   <w15:commentEx w15:paraId="152D4D06" w15:done="0"/>
   <w15:commentEx w15:paraId="1A2E6AA6" w15:done="0"/>
-  <w15:commentEx w15:paraId="13CE1B71" w15:done="0"/>
 </w15:commentsEx>
 </file>
 
@@ -16211,7 +16634,6 @@
   <w16cex:commentExtensible w16cex:durableId="472286C5" w16cex:dateUtc="2026-07-21T16:47:00Z"/>
   <w16cex:commentExtensible w16cex:durableId="0734D94E" w16cex:dateUtc="2026-07-21T17:00:00Z"/>
   <w16cex:commentExtensible w16cex:durableId="2E351660" w16cex:dateUtc="2026-07-21T17:05:00Z"/>
-  <w16cex:commentExtensible w16cex:durableId="650FBCA3" w16cex:dateUtc="2026-07-21T17:08:00Z"/>
 </w16cex:commentsExtensible>
 </file>
 
@@ -16226,7 +16648,6 @@
   <w16cid:commentId w16cid:paraId="32D4CC42" w16cid:durableId="472286C5"/>
   <w16cid:commentId w16cid:paraId="152D4D06" w16cid:durableId="0734D94E"/>
   <w16cid:commentId w16cid:paraId="1A2E6AA6" w16cid:durableId="2E351660"/>
-  <w16cid:commentId w16cid:paraId="13CE1B71" w16cid:durableId="650FBCA3"/>
 </w16cid:commentsIds>
 </file>
 
@@ -16883,6 +17304,95 @@
     </w:lvl>
   </w:abstractNum>
   <w:abstractNum w:abstractNumId="1" w15:restartNumberingAfterBreak="0">
+    <w:nsid w:val="0C891F1A"/>
+    <w:multiLevelType w:val="hybridMultilevel"/>
+    <w:tmpl w:val="F53E0678"/>
+    <w:lvl w:ilvl="0" w:tplc="280A0017">
+      <w:start w:val="1"/>
+      <w:numFmt w:val="lowerLetter"/>
+      <w:lvlText w:val="%1)"/>
+      <w:lvlJc w:val="left"/>
+      <w:pPr>
+        <w:ind w:left="720" w:hanging="360"/>
+      </w:pPr>
+      <w:rPr>
+        <w:rFonts w:hint="default"/>
+      </w:rPr>
+    </w:lvl>
+    <w:lvl w:ilvl="1" w:tplc="280A0019" w:tentative="1">
+      <w:start w:val="1"/>
+      <w:numFmt w:val="lowerLetter"/>
+      <w:lvlText w:val="%2."/>
+      <w:lvlJc w:val="left"/>
+      <w:pPr>
+        <w:ind w:left="1440" w:hanging="360"/>
+      </w:pPr>
+    </w:lvl>
+    <w:lvl w:ilvl="2" w:tplc="280A001B" w:tentative="1">
+      <w:start w:val="1"/>
+      <w:numFmt w:val="lowerRoman"/>
+      <w:lvlText w:val="%3."/>
+      <w:lvlJc w:val="right"/>
+      <w:pPr>
+        <w:ind w:left="2160" w:hanging="180"/>
+      </w:pPr>
+    </w:lvl>
+    <w:lvl w:ilvl="3" w:tplc="280A000F" w:tentative="1">
+      <w:start w:val="1"/>
+      <w:numFmt w:val="decimal"/>
+      <w:lvlText w:val="%4."/>
+      <w:lvlJc w:val="left"/>
+      <w:pPr>
+        <w:ind w:left="2880" w:hanging="360"/>
+      </w:pPr>
+    </w:lvl>
+    <w:lvl w:ilvl="4" w:tplc="280A0019" w:tentative="1">
+      <w:start w:val="1"/>
+      <w:numFmt w:val="lowerLetter"/>
+      <w:lvlText w:val="%5."/>
+      <w:lvlJc w:val="left"/>
+      <w:pPr>
+        <w:ind w:left="3600" w:hanging="360"/>
+      </w:pPr>
+    </w:lvl>
+    <w:lvl w:ilvl="5" w:tplc="280A001B" w:tentative="1">
+      <w:start w:val="1"/>
+      <w:numFmt w:val="lowerRoman"/>
+      <w:lvlText w:val="%6."/>
+      <w:lvlJc w:val="right"/>
+      <w:pPr>
+        <w:ind w:left="4320" w:hanging="180"/>
+      </w:pPr>
+    </w:lvl>
+    <w:lvl w:ilvl="6" w:tplc="280A000F" w:tentative="1">
+      <w:start w:val="1"/>
+      <w:numFmt w:val="decimal"/>
+      <w:lvlText w:val="%7."/>
+      <w:lvlJc w:val="left"/>
+      <w:pPr>
+        <w:ind w:left="5040" w:hanging="360"/>
+      </w:pPr>
+    </w:lvl>
+    <w:lvl w:ilvl="7" w:tplc="280A0019" w:tentative="1">
+      <w:start w:val="1"/>
+      <w:numFmt w:val="lowerLetter"/>
+      <w:lvlText w:val="%8."/>
+      <w:lvlJc w:val="left"/>
+      <w:pPr>
+        <w:ind w:left="5760" w:hanging="360"/>
+      </w:pPr>
+    </w:lvl>
+    <w:lvl w:ilvl="8" w:tplc="280A001B" w:tentative="1">
+      <w:start w:val="1"/>
+      <w:numFmt w:val="lowerRoman"/>
+      <w:lvlText w:val="%9."/>
+      <w:lvlJc w:val="right"/>
+      <w:pPr>
+        <w:ind w:left="6480" w:hanging="180"/>
+      </w:pPr>
+    </w:lvl>
+  </w:abstractNum>
+  <w:abstractNum w:abstractNumId="2" w15:restartNumberingAfterBreak="0">
     <w:nsid w:val="0D2922A1"/>
     <w:multiLevelType w:val="multilevel"/>
     <w:tmpl w:val="349830C2"/>
@@ -17004,7 +17514,7 @@
       </w:rPr>
     </w:lvl>
   </w:abstractNum>
-  <w:abstractNum w:abstractNumId="2" w15:restartNumberingAfterBreak="0">
+  <w:abstractNum w:abstractNumId="3" w15:restartNumberingAfterBreak="0">
     <w:nsid w:val="25B376A4"/>
     <w:multiLevelType w:val="hybridMultilevel"/>
     <w:tmpl w:val="721AAEA0"/>
@@ -17090,7 +17600,96 @@
       </w:pPr>
     </w:lvl>
   </w:abstractNum>
-  <w:abstractNum w:abstractNumId="3" w15:restartNumberingAfterBreak="0">
+  <w:abstractNum w:abstractNumId="4" w15:restartNumberingAfterBreak="0">
+    <w:nsid w:val="26AB2826"/>
+    <w:multiLevelType w:val="hybridMultilevel"/>
+    <w:tmpl w:val="46300FCC"/>
+    <w:lvl w:ilvl="0" w:tplc="280A0019">
+      <w:start w:val="1"/>
+      <w:numFmt w:val="lowerLetter"/>
+      <w:lvlText w:val="%1."/>
+      <w:lvlJc w:val="left"/>
+      <w:pPr>
+        <w:ind w:left="720" w:hanging="360"/>
+      </w:pPr>
+      <w:rPr>
+        <w:rFonts w:hint="default"/>
+      </w:rPr>
+    </w:lvl>
+    <w:lvl w:ilvl="1" w:tplc="FFFFFFFF" w:tentative="1">
+      <w:start w:val="1"/>
+      <w:numFmt w:val="lowerLetter"/>
+      <w:lvlText w:val="%2."/>
+      <w:lvlJc w:val="left"/>
+      <w:pPr>
+        <w:ind w:left="1440" w:hanging="360"/>
+      </w:pPr>
+    </w:lvl>
+    <w:lvl w:ilvl="2" w:tplc="FFFFFFFF" w:tentative="1">
+      <w:start w:val="1"/>
+      <w:numFmt w:val="lowerRoman"/>
+      <w:lvlText w:val="%3."/>
+      <w:lvlJc w:val="right"/>
+      <w:pPr>
+        <w:ind w:left="2160" w:hanging="180"/>
+      </w:pPr>
+    </w:lvl>
+    <w:lvl w:ilvl="3" w:tplc="FFFFFFFF" w:tentative="1">
+      <w:start w:val="1"/>
+      <w:numFmt w:val="decimal"/>
+      <w:lvlText w:val="%4."/>
+      <w:lvlJc w:val="left"/>
+      <w:pPr>
+        <w:ind w:left="2880" w:hanging="360"/>
+      </w:pPr>
+    </w:lvl>
+    <w:lvl w:ilvl="4" w:tplc="FFFFFFFF" w:tentative="1">
+      <w:start w:val="1"/>
+      <w:numFmt w:val="lowerLetter"/>
+      <w:lvlText w:val="%5."/>
+      <w:lvlJc w:val="left"/>
+      <w:pPr>
+        <w:ind w:left="3600" w:hanging="360"/>
+      </w:pPr>
+    </w:lvl>
+    <w:lvl w:ilvl="5" w:tplc="FFFFFFFF" w:tentative="1">
+      <w:start w:val="1"/>
+      <w:numFmt w:val="lowerRoman"/>
+      <w:lvlText w:val="%6."/>
+      <w:lvlJc w:val="right"/>
+      <w:pPr>
+        <w:ind w:left="4320" w:hanging="180"/>
+      </w:pPr>
+    </w:lvl>
+    <w:lvl w:ilvl="6" w:tplc="FFFFFFFF" w:tentative="1">
+      <w:start w:val="1"/>
+      <w:numFmt w:val="decimal"/>
+      <w:lvlText w:val="%7."/>
+      <w:lvlJc w:val="left"/>
+      <w:pPr>
+        <w:ind w:left="5040" w:hanging="360"/>
+      </w:pPr>
+    </w:lvl>
+    <w:lvl w:ilvl="7" w:tplc="FFFFFFFF" w:tentative="1">
+      <w:start w:val="1"/>
+      <w:numFmt w:val="lowerLetter"/>
+      <w:lvlText w:val="%8."/>
+      <w:lvlJc w:val="left"/>
+      <w:pPr>
+        <w:ind w:left="5760" w:hanging="360"/>
+      </w:pPr>
+    </w:lvl>
+    <w:lvl w:ilvl="8" w:tplc="FFFFFFFF" w:tentative="1">
+      <w:start w:val="1"/>
+      <w:numFmt w:val="lowerRoman"/>
+      <w:lvlText w:val="%9."/>
+      <w:lvlJc w:val="right"/>
+      <w:pPr>
+        <w:ind w:left="6480" w:hanging="180"/>
+      </w:pPr>
+    </w:lvl>
+  </w:abstractNum>
+  <w:abstractNum w:abstractNumId="5" w15:restartNumberingAfterBreak="0">
     <w:nsid w:val="318F7021"/>
     <w:multiLevelType w:val="hybridMultilevel"/>
     <w:tmpl w:val="C0D421CE"/>
@@ -17176,7 +17775,7 @@
       </w:pPr>
     </w:lvl>
   </w:abstractNum>
-  <w:abstractNum w:abstractNumId="4" w15:restartNumberingAfterBreak="0">
+  <w:abstractNum w:abstractNumId="6" w15:restartNumberingAfterBreak="0">
     <w:nsid w:val="3EA73AEA"/>
     <w:multiLevelType w:val="multilevel"/>
     <w:tmpl w:val="C6F2D288"/>
@@ -17289,7 +17888,96 @@
       </w:rPr>
     </w:lvl>
   </w:abstractNum>
-  <w:abstractNum w:abstractNumId="5" w15:restartNumberingAfterBreak="0">
+  <w:abstractNum w:abstractNumId="7" w15:restartNumberingAfterBreak="0">
+    <w:nsid w:val="3FD80BD6"/>
+    <w:multiLevelType w:val="hybridMultilevel"/>
+    <w:tmpl w:val="564CF5A6"/>
+    <w:lvl w:ilvl="0" w:tplc="280A0017">
+      <w:start w:val="1"/>
+      <w:numFmt w:val="lowerLetter"/>
+      <w:lvlText w:val="%1)"/>
+      <w:lvlJc w:val="left"/>
+      <w:pPr>
+        <w:ind w:left="720" w:hanging="360"/>
+      </w:pPr>
+      <w:rPr>
+        <w:rFonts w:hint="default"/>
+      </w:rPr>
+    </w:lvl>
+    <w:lvl w:ilvl="1" w:tplc="280A0019">
+      <w:start w:val="1"/>
+      <w:numFmt w:val="lowerLetter"/>
+      <w:lvlText w:val="%2."/>
+      <w:lvlJc w:val="left"/>
+      <w:pPr>
+        <w:ind w:left="1440" w:hanging="360"/>
+      </w:pPr>
+    </w:lvl>
+    <w:lvl w:ilvl="2" w:tplc="280A001B" w:tentative="1">
+      <w:start w:val="1"/>
+      <w:numFmt w:val="lowerRoman"/>
+      <w:lvlText w:val="%3."/>
+      <w:lvlJc w:val="right"/>
+      <w:pPr>
+        <w:ind w:left="2160" w:hanging="180"/>
+      </w:pPr>
+    </w:lvl>
+    <w:lvl w:ilvl="3" w:tplc="280A000F" w:tentative="1">
+      <w:start w:val="1"/>
+      <w:numFmt w:val="decimal"/>
+      <w:lvlText w:val="%4."/>
+      <w:lvlJc w:val="left"/>
+      <w:pPr>
+        <w:ind w:left="2880" w:hanging="360"/>
+      </w:pPr>
+    </w:lvl>
+    <w:lvl w:ilvl="4" w:tplc="280A0019" w:tentative="1">
+      <w:start w:val="1"/>
+      <w:numFmt w:val="lowerLetter"/>
+      <w:lvlText w:val="%5."/>
+      <w:lvlJc w:val="left"/>
+      <w:pPr>
+        <w:ind w:left="3600" w:hanging="360"/>
+      </w:pPr>
+    </w:lvl>
+    <w:lvl w:ilvl="5" w:tplc="280A001B" w:tentative="1">
+      <w:start w:val="1"/>
+      <w:numFmt w:val="lowerRoman"/>
+      <w:lvlText w:val="%6."/>
+      <w:lvlJc w:val="right"/>
+      <w:pPr>
+        <w:ind w:left="4320" w:hanging="180"/>
+      </w:pPr>
+    </w:lvl>
+    <w:lvl w:ilvl="6" w:tplc="280A000F" w:tentative="1">
+      <w:start w:val="1"/>
+      <w:numFmt w:val="decimal"/>
+      <w:lvlText w:val="%7."/>
+      <w:lvlJc w:val="left"/>
+      <w:pPr>
+        <w:ind w:left="5040" w:hanging="360"/>
+      </w:pPr>
+    </w:lvl>
+    <w:lvl w:ilvl="7" w:tplc="280A0019" w:tentative="1">
+      <w:start w:val="1"/>
+      <w:numFmt w:val="lowerLetter"/>
+      <w:lvlText w:val="%8."/>
+      <w:lvlJc w:val="left"/>
+      <w:pPr>
+        <w:ind w:left="5760" w:hanging="360"/>
+      </w:pPr>
+    </w:lvl>
+    <w:lvl w:ilvl="8" w:tplc="280A001B" w:tentative="1">
+      <w:start w:val="1"/>
+      <w:numFmt w:val="lowerRoman"/>
+      <w:lvlText w:val="%9."/>
+      <w:lvlJc w:val="right"/>
+      <w:pPr>
+        <w:ind w:left="6480" w:hanging="180"/>
+      </w:pPr>
+    </w:lvl>
+  </w:abstractNum>
+  <w:abstractNum w:abstractNumId="8" w15:restartNumberingAfterBreak="0">
     <w:nsid w:val="3FDD5197"/>
     <w:multiLevelType w:val="hybridMultilevel"/>
     <w:tmpl w:val="C616E364"/>
@@ -17402,7 +18090,7 @@
       </w:rPr>
     </w:lvl>
   </w:abstractNum>
-  <w:abstractNum w:abstractNumId="6" w15:restartNumberingAfterBreak="0">
+  <w:abstractNum w:abstractNumId="9" w15:restartNumberingAfterBreak="0">
     <w:nsid w:val="408E55E4"/>
     <w:multiLevelType w:val="hybridMultilevel"/>
     <w:tmpl w:val="92A8D8CA"/>
@@ -17488,7 +18176,7 @@
       </w:pPr>
     </w:lvl>
   </w:abstractNum>
-  <w:abstractNum w:abstractNumId="7" w15:restartNumberingAfterBreak="0">
+  <w:abstractNum w:abstractNumId="10" w15:restartNumberingAfterBreak="0">
     <w:nsid w:val="43BD5B3E"/>
     <w:multiLevelType w:val="hybridMultilevel"/>
     <w:tmpl w:val="39143236"/>
@@ -17574,7 +18262,7 @@
       </w:pPr>
     </w:lvl>
   </w:abstractNum>
-  <w:abstractNum w:abstractNumId="8" w15:restartNumberingAfterBreak="0">
+  <w:abstractNum w:abstractNumId="11" w15:restartNumberingAfterBreak="0">
     <w:nsid w:val="4B2F08FB"/>
     <w:multiLevelType w:val="hybridMultilevel"/>
     <w:tmpl w:val="39143236"/>
@@ -17660,7 +18348,7 @@
       </w:pPr>
     </w:lvl>
   </w:abstractNum>
-  <w:abstractNum w:abstractNumId="9" w15:restartNumberingAfterBreak="0">
+  <w:abstractNum w:abstractNumId="12" w15:restartNumberingAfterBreak="0">
     <w:nsid w:val="59D0517D"/>
     <w:multiLevelType w:val="hybridMultilevel"/>
     <w:tmpl w:val="BE487E52"/>
@@ -17746,7 +18434,7 @@
       </w:pPr>
     </w:lvl>
   </w:abstractNum>
-  <w:abstractNum w:abstractNumId="10" w15:restartNumberingAfterBreak="0">
+  <w:abstractNum w:abstractNumId="13" w15:restartNumberingAfterBreak="0">
     <w:nsid w:val="5DB76E19"/>
     <w:multiLevelType w:val="hybridMultilevel"/>
     <w:tmpl w:val="EF52A196"/>
@@ -17859,7 +18547,7 @@
       </w:rPr>
     </w:lvl>
   </w:abstractNum>
-  <w:abstractNum w:abstractNumId="11" w15:restartNumberingAfterBreak="0">
+  <w:abstractNum w:abstractNumId="14" w15:restartNumberingAfterBreak="0">
     <w:nsid w:val="647B13F7"/>
     <w:multiLevelType w:val="multilevel"/>
     <w:tmpl w:val="E2D825EC"/>
@@ -17973,7 +18661,7 @@
       </w:rPr>
     </w:lvl>
   </w:abstractNum>
-  <w:abstractNum w:abstractNumId="12" w15:restartNumberingAfterBreak="0">
+  <w:abstractNum w:abstractNumId="15" w15:restartNumberingAfterBreak="0">
     <w:nsid w:val="65D30CFE"/>
     <w:multiLevelType w:val="hybridMultilevel"/>
     <w:tmpl w:val="35882B12"/>
@@ -18059,7 +18747,7 @@
       </w:pPr>
     </w:lvl>
   </w:abstractNum>
-  <w:abstractNum w:abstractNumId="13" w15:restartNumberingAfterBreak="0">
+  <w:abstractNum w:abstractNumId="16" w15:restartNumberingAfterBreak="0">
     <w:nsid w:val="669E07F8"/>
     <w:multiLevelType w:val="hybridMultilevel"/>
     <w:tmpl w:val="EAFEA70A"/>
@@ -18145,7 +18833,7 @@
       </w:pPr>
     </w:lvl>
   </w:abstractNum>
-  <w:abstractNum w:abstractNumId="14" w15:restartNumberingAfterBreak="0">
+  <w:abstractNum w:abstractNumId="17" w15:restartNumberingAfterBreak="0">
     <w:nsid w:val="6750294A"/>
     <w:multiLevelType w:val="hybridMultilevel"/>
     <w:tmpl w:val="76064DB4"/>
@@ -18258,7 +18946,7 @@
       </w:rPr>
     </w:lvl>
   </w:abstractNum>
-  <w:abstractNum w:abstractNumId="15" w15:restartNumberingAfterBreak="0">
+  <w:abstractNum w:abstractNumId="18" w15:restartNumberingAfterBreak="0">
     <w:nsid w:val="676E37BD"/>
     <w:multiLevelType w:val="hybridMultilevel"/>
     <w:tmpl w:val="EB940EB0"/>
@@ -18351,7 +19039,7 @@
       </w:pPr>
     </w:lvl>
   </w:abstractNum>
-  <w:abstractNum w:abstractNumId="16" w15:restartNumberingAfterBreak="0">
+  <w:abstractNum w:abstractNumId="19" w15:restartNumberingAfterBreak="0">
     <w:nsid w:val="6CE155A7"/>
     <w:multiLevelType w:val="hybridMultilevel"/>
     <w:tmpl w:val="3C9A6024"/>
@@ -18464,7 +19152,7 @@
       </w:rPr>
     </w:lvl>
   </w:abstractNum>
-  <w:abstractNum w:abstractNumId="17" w15:restartNumberingAfterBreak="0">
+  <w:abstractNum w:abstractNumId="20" w15:restartNumberingAfterBreak="0">
     <w:nsid w:val="70D01E5A"/>
     <w:multiLevelType w:val="hybridMultilevel"/>
     <w:tmpl w:val="592ED5D4"/>
@@ -18577,7 +19265,7 @@
       </w:rPr>
     </w:lvl>
   </w:abstractNum>
-  <w:abstractNum w:abstractNumId="18" w15:restartNumberingAfterBreak="0">
+  <w:abstractNum w:abstractNumId="21" w15:restartNumberingAfterBreak="0">
     <w:nsid w:val="7106318E"/>
     <w:multiLevelType w:val="hybridMultilevel"/>
     <w:tmpl w:val="DC206462"/>
@@ -18690,7 +19378,96 @@
       </w:rPr>
     </w:lvl>
   </w:abstractNum>
-  <w:abstractNum w:abstractNumId="19" w15:restartNumberingAfterBreak="0">
+  <w:abstractNum w:abstractNumId="22" w15:restartNumberingAfterBreak="0">
+    <w:nsid w:val="726322FD"/>
+    <w:multiLevelType w:val="hybridMultilevel"/>
+    <w:tmpl w:val="876CAB38"/>
+    <w:lvl w:ilvl="0" w:tplc="280A0019">
+      <w:start w:val="1"/>
+      <w:numFmt w:val="lowerLetter"/>
+      <w:lvlText w:val="%1."/>
+      <w:lvlJc w:val="left"/>
+      <w:pPr>
+        <w:ind w:left="720" w:hanging="360"/>
+      </w:pPr>
+      <w:rPr>
+        <w:rFonts w:hint="default"/>
+      </w:rPr>
+    </w:lvl>
+    <w:lvl w:ilvl="1" w:tplc="FFFFFFFF">
+      <w:start w:val="1"/>
+      <w:numFmt w:val="lowerLetter"/>
+      <w:lvlText w:val="%2."/>
+      <w:lvlJc w:val="left"/>
+      <w:pPr>
+        <w:ind w:left="1440" w:hanging="360"/>
+      </w:pPr>
+    </w:lvl>
+    <w:lvl w:ilvl="2" w:tplc="FFFFFFFF" w:tentative="1">
+      <w:start w:val="1"/>
+      <w:numFmt w:val="lowerRoman"/>
+      <w:lvlText w:val="%3."/>
+      <w:lvlJc w:val="right"/>
+      <w:pPr>
+        <w:ind w:left="2160" w:hanging="180"/>
+      </w:pPr>
+    </w:lvl>
+    <w:lvl w:ilvl="3" w:tplc="FFFFFFFF" w:tentative="1">
+      <w:start w:val="1"/>
+      <w:numFmt w:val="decimal"/>
+      <w:lvlText w:val="%4."/>
+      <w:lvlJc w:val="left"/>
+      <w:pPr>
+        <w:ind w:left="2880" w:hanging="360"/>
+      </w:pPr>
+    </w:lvl>
+    <w:lvl w:ilvl="4" w:tplc="FFFFFFFF" w:tentative="1">
+      <w:start w:val="1"/>
+      <w:numFmt w:val="lowerLetter"/>
+      <w:lvlText w:val="%5."/>
+      <w:lvlJc w:val="left"/>
+      <w:pPr>
+        <w:ind w:left="3600" w:hanging="360"/>
+      </w:pPr>
+    </w:lvl>
+    <w:lvl w:ilvl="5" w:tplc="FFFFFFFF" w:tentative="1">
+      <w:start w:val="1"/>
+      <w:numFmt w:val="lowerRoman"/>
+      <w:lvlText w:val="%6."/>
+      <w:lvlJc w:val="right"/>
+      <w:pPr>
+        <w:ind w:left="4320" w:hanging="180"/>
+      </w:pPr>
+    </w:lvl>
+    <w:lvl w:ilvl="6" w:tplc="FFFFFFFF" w:tentative="1">
+      <w:start w:val="1"/>
+      <w:numFmt w:val="decimal"/>
+      <w:lvlText w:val="%7."/>
+      <w:lvlJc w:val="left"/>
+      <w:pPr>
+        <w:ind w:left="5040" w:hanging="360"/>
+      </w:pPr>
+    </w:lvl>
+    <w:lvl w:ilvl="7" w:tplc="FFFFFFFF" w:tentative="1">
+      <w:start w:val="1"/>
+      <w:numFmt w:val="lowerLetter"/>
+      <w:lvlText w:val="%8."/>
+      <w:lvlJc w:val="left"/>
+      <w:pPr>
+        <w:ind w:left="5760" w:hanging="360"/>
+      </w:pPr>
+    </w:lvl>
+    <w:lvl w:ilvl="8" w:tplc="FFFFFFFF" w:tentative="1">
+      <w:start w:val="1"/>
+      <w:numFmt w:val="lowerRoman"/>
+      <w:lvlText w:val="%9."/>
+      <w:lvlJc w:val="right"/>
+      <w:pPr>
+        <w:ind w:left="6480" w:hanging="180"/>
+      </w:pPr>
+    </w:lvl>
+  </w:abstractNum>
+  <w:abstractNum w:abstractNumId="23" w15:restartNumberingAfterBreak="0">
     <w:nsid w:val="79FD4021"/>
     <w:multiLevelType w:val="hybridMultilevel"/>
     <w:tmpl w:val="96A842E0"/>
@@ -18803,7 +19580,7 @@
       </w:rPr>
     </w:lvl>
   </w:abstractNum>
-  <w:abstractNum w:abstractNumId="20" w15:restartNumberingAfterBreak="0">
+  <w:abstractNum w:abstractNumId="24" w15:restartNumberingAfterBreak="0">
     <w:nsid w:val="7BE25DC7"/>
     <w:multiLevelType w:val="hybridMultilevel"/>
     <w:tmpl w:val="AC48BD02"/>
@@ -18916,7 +19693,7 @@
       </w:rPr>
     </w:lvl>
   </w:abstractNum>
-  <w:abstractNum w:abstractNumId="21" w15:restartNumberingAfterBreak="0">
+  <w:abstractNum w:abstractNumId="25" w15:restartNumberingAfterBreak="0">
     <w:nsid w:val="7EE14D73"/>
     <w:multiLevelType w:val="multilevel"/>
     <w:tmpl w:val="FDC04314"/>
@@ -19039,70 +19816,82 @@
     </w:lvl>
   </w:abstractNum>
   <w:num w:numId="1" w16cid:durableId="1338196560">
+    <w:abstractNumId w:val="14"/>
+  </w:num>
+  <w:num w:numId="2" w16cid:durableId="997340142">
+    <w:abstractNumId w:val="2"/>
+  </w:num>
+  <w:num w:numId="3" w16cid:durableId="818888625">
+    <w:abstractNumId w:val="10"/>
+  </w:num>
+  <w:num w:numId="4" w16cid:durableId="789980796">
     <w:abstractNumId w:val="11"/>
   </w:num>
-  <w:num w:numId="2" w16cid:durableId="997340142">
-    <w:abstractNumId w:val="1"/>
-  </w:num>
-  <w:num w:numId="3" w16cid:durableId="818888625">
-    <w:abstractNumId w:val="7"/>
-  </w:num>
-  <w:num w:numId="4" w16cid:durableId="789980796">
-    <w:abstractNumId w:val="8"/>
-  </w:num>
   <w:num w:numId="5" w16cid:durableId="2135756204">
-    <w:abstractNumId w:val="2"/>
+    <w:abstractNumId w:val="3"/>
   </w:num>
   <w:num w:numId="6" w16cid:durableId="1603613276">
-    <w:abstractNumId w:val="3"/>
+    <w:abstractNumId w:val="5"/>
   </w:num>
   <w:num w:numId="7" w16cid:durableId="1698236715">
-    <w:abstractNumId w:val="19"/>
+    <w:abstractNumId w:val="23"/>
   </w:num>
   <w:num w:numId="8" w16cid:durableId="1567180075">
-    <w:abstractNumId w:val="21"/>
+    <w:abstractNumId w:val="25"/>
   </w:num>
   <w:num w:numId="9" w16cid:durableId="260988981">
-    <w:abstractNumId w:val="15"/>
+    <w:abstractNumId w:val="18"/>
   </w:num>
   <w:num w:numId="10" w16cid:durableId="360321617">
-    <w:abstractNumId w:val="9"/>
+    <w:abstractNumId w:val="12"/>
   </w:num>
   <w:num w:numId="11" w16cid:durableId="11301047">
-    <w:abstractNumId w:val="14"/>
+    <w:abstractNumId w:val="17"/>
   </w:num>
   <w:num w:numId="12" w16cid:durableId="104814016">
-    <w:abstractNumId w:val="17"/>
+    <w:abstractNumId w:val="20"/>
   </w:num>
   <w:num w:numId="13" w16cid:durableId="1885175596">
     <w:abstractNumId w:val="0"/>
   </w:num>
   <w:num w:numId="14" w16cid:durableId="167066823">
-    <w:abstractNumId w:val="18"/>
+    <w:abstractNumId w:val="21"/>
   </w:num>
   <w:num w:numId="15" w16cid:durableId="954553902">
+    <w:abstractNumId w:val="19"/>
+  </w:num>
+  <w:num w:numId="16" w16cid:durableId="1324506319">
+    <w:abstractNumId w:val="8"/>
+  </w:num>
+  <w:num w:numId="17" w16cid:durableId="1839225738">
+    <w:abstractNumId w:val="24"/>
+  </w:num>
+  <w:num w:numId="18" w16cid:durableId="267396013">
+    <w:abstractNumId w:val="13"/>
+  </w:num>
+  <w:num w:numId="19" w16cid:durableId="1228301004">
+    <w:abstractNumId w:val="15"/>
+  </w:num>
+  <w:num w:numId="20" w16cid:durableId="554125780">
+    <w:abstractNumId w:val="6"/>
+  </w:num>
+  <w:num w:numId="21" w16cid:durableId="1964574287">
+    <w:abstractNumId w:val="9"/>
+  </w:num>
+  <w:num w:numId="22" w16cid:durableId="1868059492">
     <w:abstractNumId w:val="16"/>
   </w:num>
-  <w:num w:numId="16" w16cid:durableId="1324506319">
-    <w:abstractNumId w:val="5"/>
+  <w:num w:numId="23" w16cid:durableId="529534098">
+    <w:abstractNumId w:val="1"/>
   </w:num>
-  <w:num w:numId="17" w16cid:durableId="1839225738">
-    <w:abstractNumId w:val="20"/>
+  <w:num w:numId="24" w16cid:durableId="1828084485">
+    <w:abstractNumId w:val="7"/>
   </w:num>
-  <w:num w:numId="18" w16cid:durableId="267396013">
-    <w:abstractNumId w:val="10"/>
-  </w:num>
-  <w:num w:numId="19" w16cid:durableId="1228301004">
-    <w:abstractNumId w:val="12"/>
-  </w:num>
-  <w:num w:numId="20" w16cid:durableId="554125780">
+  <w:num w:numId="25" w16cid:durableId="1934242185">
     <w:abstractNumId w:val="4"/>
   </w:num>
-  <w:num w:numId="21" w16cid:durableId="1964574287">
-    <w:abstractNumId w:val="6"/>
-  </w:num>
-  <w:num w:numId="22" w16cid:durableId="1868059492">
-    <w:abstractNumId w:val="13"/>
+  <w:num w:numId="26" w16cid:durableId="1799032513">
+    <w:abstractNumId w:val="22"/>
   </w:num>
   <w:numIdMacAtCleanup w:val="20"/>
 </w:numbering>
@@ -19313,7 +20102,7 @@
     <w:lsdException w:name="Medium Shading 2 Accent 1" w:uiPriority="64"/>
     <w:lsdException w:name="Medium List 1 Accent 1" w:uiPriority="65"/>
     <w:lsdException w:name="Revision" w:semiHidden="1"/>
-    <w:lsdException w:name="List Paragraph" w:uiPriority="0" w:qFormat="1"/>
+    <w:lsdException w:name="List Paragraph" w:uiPriority="34" w:qFormat="1"/>
     <w:lsdException w:name="Quote" w:uiPriority="29"/>
     <w:lsdException w:name="Intense Quote" w:uiPriority="30"/>
     <w:lsdException w:name="Medium List 2 Accent 1" w:uiPriority="66"/>
@@ -19784,6 +20573,7 @@
     <w:name w:val="List Paragraph"/>
     <w:aliases w:val="Colsubsidio - Lista,3,Iz - Párrafo de lista,Sivsa Parrafo,Titulo de Fígura,TITULO A,Titulo parrafo,Punto,Num Bullet 1,Bullet Number,List Paragraph1,lp1,lp11,List Paragraph11,Use Case List Paragraph,Bullet List,FooterText,numbered,列出段落"/>
     <w:link w:val="PrrafodelistaCar"/>
+    <w:uiPriority w:val="34"/>
     <w:qFormat/>
     <w:rsid w:val="00325777"/>
     <w:pPr>
@@ -20952,16 +21742,6 @@
 </file>
 
 <file path=customXml/item2.xml><?xml version="1.0" encoding="utf-8"?>
-<p:properties xmlns:p="http://schemas.microsoft.com/office/2006/metadata/properties" xmlns:xsi="http://www.w3.org/2001/XMLSchema-instance" xmlns:pc="http://schemas.microsoft.com/office/infopath/2007/PartnerControls">
-  <documentManagement/>
-</p:properties>
-</file>
-
-<file path=customXml/item3.xml><?xml version="1.0" encoding="utf-8"?>
-<b:Sources xmlns:b="http://schemas.openxmlformats.org/officeDocument/2006/bibliography" xmlns="http://schemas.openxmlformats.org/officeDocument/2006/bibliography" SelectedStyle="\APASixthEditionOfficeOnline.xsl" StyleName="APA" Version="6"/>
-</file>
-
-<file path=customXml/item4.xml><?xml version="1.0" encoding="utf-8"?>
 <ct:contentTypeSchema xmlns:ct="http://schemas.microsoft.com/office/2006/metadata/contentType" xmlns:ma="http://schemas.microsoft.com/office/2006/metadata/properties/metaAttributes" ct:_="" ma:_="" ma:contentTypeName="Document" ma:contentTypeID="0x0101005C14AC06E2BCC9479AB1E7BFB85765A3" ma:contentTypeVersion="3" ma:contentTypeDescription="Create a new document." ma:contentTypeScope="" ma:versionID="7c0f1869e227914bb9e091b5d5366560">
   <xsd:schema xmlns:xsd="http://www.w3.org/2001/XMLSchema" xmlns:xs="http://www.w3.org/2001/XMLSchema" xmlns:p="http://schemas.microsoft.com/office/2006/metadata/properties" xmlns:ns2="fdb19afe-0f16-4040-a6da-335f4767bfc9" targetNamespace="http://schemas.microsoft.com/office/2006/metadata/properties" ma:root="true" ma:fieldsID="a498babe3b735ed6250eb2675f7bac41" ns2:_="">
     <xsd:import namespace="fdb19afe-0f16-4040-a6da-335f4767bfc9"/>
@@ -21099,6 +21879,16 @@
 </ct:contentTypeSchema>
 </file>
 
+<file path=customXml/item3.xml><?xml version="1.0" encoding="utf-8"?>
+<b:Sources xmlns:b="http://schemas.openxmlformats.org/officeDocument/2006/bibliography" xmlns="http://schemas.openxmlformats.org/officeDocument/2006/bibliography" SelectedStyle="\APASixthEditionOfficeOnline.xsl" StyleName="APA" Version="6"/>
+</file>
+
+<file path=customXml/item4.xml><?xml version="1.0" encoding="utf-8"?>
+<p:properties xmlns:p="http://schemas.microsoft.com/office/2006/metadata/properties" xmlns:xsi="http://www.w3.org/2001/XMLSchema-instance" xmlns:pc="http://schemas.microsoft.com/office/infopath/2007/PartnerControls">
+  <documentManagement/>
+</p:properties>
+</file>
+
 <file path=customXml/itemProps1.xml><?xml version="1.0" encoding="utf-8"?>
 <ds:datastoreItem xmlns:ds="http://schemas.openxmlformats.org/officeDocument/2006/customXml" ds:itemID="{007781DB-EED9-4359-8AD9-68137B52B701}">
   <ds:schemaRefs>
@@ -21108,23 +21898,6 @@
 </file>
 
 <file path=customXml/itemProps2.xml><?xml version="1.0" encoding="utf-8"?>
-<ds:datastoreItem xmlns:ds="http://schemas.openxmlformats.org/officeDocument/2006/customXml" ds:itemID="{E06D9414-6C68-4A1C-B889-BD6BE2EA8645}">
-  <ds:schemaRefs>
-    <ds:schemaRef ds:uri="http://schemas.microsoft.com/office/2006/metadata/properties"/>
-    <ds:schemaRef ds:uri="http://schemas.microsoft.com/office/infopath/2007/PartnerControls"/>
-  </ds:schemaRefs>
-</ds:datastoreItem>
-</file>
-
-<file path=customXml/itemProps3.xml><?xml version="1.0" encoding="utf-8"?>
-<ds:datastoreItem xmlns:ds="http://schemas.openxmlformats.org/officeDocument/2006/customXml" ds:itemID="{599D4DEC-5966-453E-8EBA-1FE602AD820F}">
-  <ds:schemaRefs>
-    <ds:schemaRef ds:uri="http://schemas.openxmlformats.org/officeDocument/2006/bibliography"/>
-  </ds:schemaRefs>
-</ds:datastoreItem>
-</file>
-
-<file path=customXml/itemProps4.xml><?xml version="1.0" encoding="utf-8"?>
 <ds:datastoreItem xmlns:ds="http://schemas.openxmlformats.org/officeDocument/2006/customXml" ds:itemID="{5C1C6231-2072-4263-80CD-99FB4E777A75}">
   <ds:schemaRefs>
     <ds:schemaRef ds:uri="http://schemas.microsoft.com/office/2006/metadata/contentType"/>
@@ -21140,4 +21913,21 @@
     <ds:schemaRef ds:uri="http://schemas.microsoft.com/internal/obd"/>
   </ds:schemaRefs>
 </ds:datastoreItem>
+</file>
+
+<file path=customXml/itemProps3.xml><?xml version="1.0" encoding="utf-8"?>
+<ds:datastoreItem xmlns:ds="http://schemas.openxmlformats.org/officeDocument/2006/customXml" ds:itemID="{599D4DEC-5966-453E-8EBA-1FE602AD820F}">
+  <ds:schemaRefs>
+    <ds:schemaRef ds:uri="http://schemas.openxmlformats.org/officeDocument/2006/bibliography"/>
+  </ds:schemaRefs>
+</ds:datastoreItem>
+</file>
+
+<file path=customXml/itemProps4.xml><?xml version="1.0" encoding="utf-8"?>
+<ds:datastoreItem xmlns:ds="http://schemas.openxmlformats.org/officeDocument/2006/customXml" ds:itemID="{E06D9414-6C68-4A1C-B889-BD6BE2EA8645}">
+  <ds:schemaRefs>
+    <ds:schemaRef ds:uri="http://schemas.microsoft.com/office/2006/metadata/properties"/>
+    <ds:schemaRef ds:uri="http://schemas.microsoft.com/office/infopath/2007/PartnerControls"/>
+  </ds:schemaRefs>
+</ds:datastoreItem>
 </file>
</xml_diff>

<commit_message>
se ha actualizado lo referente a arquitectura y software IA
</commit_message>
<xml_diff>
--- a/normativo/DIRECTIVA-GOBIERNO-IA.docx
+++ b/normativo/DIRECTIVA-GOBIERNO-IA.docx
@@ -9215,6 +9215,210 @@
     </w:p>
     <w:p>
       <w:pPr>
+        <w:spacing w:after="60" w:line="276" w:lineRule="auto"/>
+        <w:ind w:left="1276" w:hanging="720"/>
+        <w:jc w:val="both"/>
+        <w:rPr>
+          <w:rFonts w:ascii="Arial" w:eastAsia="Arial" w:hAnsi="Arial" w:cs="Arial"/>
+          <w:color w:val="000000"/>
+          <w:highlight w:val="lightGray"/>
+        </w:rPr>
+      </w:pPr>
+      <w:r>
+        <w:rPr>
+          <w:rFonts w:ascii="Arial" w:eastAsia="Arial" w:hAnsi="Arial" w:cs="Arial"/>
+          <w:color w:val="000000"/>
+          <w:highlight w:val="lightGray"/>
+        </w:rPr>
+        <w:t xml:space="preserve">6.5.3 </w:t>
+      </w:r>
+      <w:r>
+        <w:rPr>
+          <w:rFonts w:ascii="Arial" w:eastAsia="Arial" w:hAnsi="Arial" w:cs="Arial"/>
+          <w:color w:val="000000"/>
+          <w:highlight w:val="lightGray"/>
+        </w:rPr>
+        <w:t xml:space="preserve">   </w:t>
+      </w:r>
+      <w:r>
+        <w:rPr>
+          <w:rFonts w:ascii="Arial" w:eastAsia="Arial" w:hAnsi="Arial" w:cs="Arial"/>
+          <w:color w:val="000000"/>
+          <w:highlight w:val="lightGray"/>
+        </w:rPr>
+        <w:t xml:space="preserve">El diseño de la arquitectura de los SBIA observa los Principios de Arquitectura (AAT.PRAQ.01) y los Lineamientos de Arquitectura (LAT.LIAQ.01) de la SUNAT, en sus versiones vigentes, en lo que corresponda a su naturaleza. La GA adecua dichos instrumentos y los estándares de arquitectura de su competencia para incorporar los requisitos propios de los SBIA —modelos, conjuntos de datos, componentes generativos y </w:t>
+      </w:r>
+      <w:r>
+        <w:rPr>
+          <w:rFonts w:ascii="Arial" w:eastAsia="Arial" w:hAnsi="Arial" w:cs="Arial"/>
+          <w:color w:val="000000"/>
+          <w:highlight w:val="lightGray"/>
+        </w:rPr>
+        <w:t>agenticos</w:t>
+      </w:r>
+      <w:r>
+        <w:rPr>
+          <w:rFonts w:ascii="Arial" w:eastAsia="Arial" w:hAnsi="Arial" w:cs="Arial"/>
+          <w:color w:val="000000"/>
+          <w:highlight w:val="lightGray"/>
+        </w:rPr>
+        <w:t>, e infraestructura especializada—, conforme al literal c) del artículo 130 del ROF, y los aprueba mediante el documento normativo institucional que corresponda según la METDONI.</w:t>
+      </w:r>
+    </w:p>
+    <w:p>
+      <w:pPr>
+        <w:spacing w:after="60" w:line="276" w:lineRule="auto"/>
+        <w:ind w:left="1276" w:hanging="720"/>
+        <w:jc w:val="both"/>
+        <w:rPr>
+          <w:rFonts w:ascii="Arial" w:eastAsia="Arial" w:hAnsi="Arial" w:cs="Arial"/>
+          <w:color w:val="000000"/>
+          <w:highlight w:val="lightGray"/>
+        </w:rPr>
+      </w:pPr>
+      <w:r>
+        <w:rPr>
+          <w:rFonts w:ascii="Arial" w:eastAsia="Arial" w:hAnsi="Arial" w:cs="Arial"/>
+          <w:color w:val="000000"/>
+          <w:highlight w:val="lightGray"/>
+        </w:rPr>
+        <w:t xml:space="preserve">6.5.4 </w:t>
+      </w:r>
+      <w:r>
+        <w:rPr>
+          <w:rFonts w:ascii="Arial" w:eastAsia="Arial" w:hAnsi="Arial" w:cs="Arial"/>
+          <w:color w:val="000000"/>
+          <w:highlight w:val="lightGray"/>
+        </w:rPr>
+        <w:t xml:space="preserve">  </w:t>
+      </w:r>
+      <w:r>
+        <w:rPr>
+          <w:rFonts w:ascii="Arial" w:eastAsia="Arial" w:hAnsi="Arial" w:cs="Arial"/>
+          <w:color w:val="000000"/>
+          <w:highlight w:val="lightGray"/>
+        </w:rPr>
+        <w:t>Todo SBIA cuenta con la aprobación de su arquitectura de solución por la GA, previa al inicio del desarrollo, la adquisición o el entrenamiento, conforme a la etapa 3 del numeral 6.1.1. Los requisitos derivados del nivel de riesgo aprobado, incluidos los mecanismos de supervisión humana, explicabilidad y trazabilidad, se incorporan como requisitos no funcionales de la solución.</w:t>
+      </w:r>
+    </w:p>
+    <w:p>
+      <w:pPr>
+        <w:spacing w:after="60" w:line="276" w:lineRule="auto"/>
+        <w:ind w:left="1276" w:hanging="720"/>
+        <w:jc w:val="both"/>
+        <w:rPr>
+          <w:rFonts w:ascii="Arial" w:eastAsia="Arial" w:hAnsi="Arial" w:cs="Arial"/>
+          <w:color w:val="000000"/>
+          <w:highlight w:val="lightGray"/>
+        </w:rPr>
+      </w:pPr>
+      <w:r>
+        <w:rPr>
+          <w:rFonts w:ascii="Arial" w:eastAsia="Arial" w:hAnsi="Arial" w:cs="Arial"/>
+          <w:color w:val="000000"/>
+          <w:highlight w:val="lightGray"/>
+        </w:rPr>
+        <w:t>6.5.5</w:t>
+      </w:r>
+      <w:r>
+        <w:rPr>
+          <w:rFonts w:ascii="Arial" w:eastAsia="Arial" w:hAnsi="Arial" w:cs="Arial"/>
+          <w:color w:val="000000"/>
+          <w:highlight w:val="lightGray"/>
+        </w:rPr>
+        <w:t xml:space="preserve">   Los </w:t>
+      </w:r>
+      <w:r>
+        <w:rPr>
+          <w:rFonts w:ascii="Arial" w:eastAsia="Arial" w:hAnsi="Arial" w:cs="Arial"/>
+          <w:color w:val="000000"/>
+          <w:highlight w:val="lightGray"/>
+        </w:rPr>
+        <w:t>SBIA que ejecuten acciones sobre sistemas, datos o procesos con algún grado de autonomía</w:t>
+      </w:r>
+      <w:r>
+        <w:rPr>
+          <w:rFonts w:ascii="Arial" w:eastAsia="Arial" w:hAnsi="Arial" w:cs="Arial"/>
+          <w:color w:val="000000"/>
+          <w:highlight w:val="lightGray"/>
+        </w:rPr>
+        <w:t xml:space="preserve"> </w:t>
+      </w:r>
+      <w:r>
+        <w:rPr>
+          <w:rFonts w:ascii="Arial" w:eastAsia="Arial" w:hAnsi="Arial" w:cs="Arial"/>
+          <w:color w:val="000000"/>
+          <w:highlight w:val="lightGray"/>
+        </w:rPr>
+        <w:t>incorporan mecanismos de autorización, restricción y registro de dichas acciones, proporcionales al nivel de riesgo aprobado y al grado de autonomía asignado. El propietario del caso de uso define el alcance de las acciones autorizadas; la GA verifica su implementación antes del despliegue.</w:t>
+      </w:r>
+    </w:p>
+    <w:p>
+      <w:pPr>
+        <w:spacing w:after="60" w:line="276" w:lineRule="auto"/>
+        <w:ind w:left="1276" w:hanging="720"/>
+        <w:jc w:val="both"/>
+        <w:rPr>
+          <w:rFonts w:ascii="Arial" w:eastAsia="Arial" w:hAnsi="Arial" w:cs="Arial"/>
+          <w:color w:val="000000"/>
+          <w:highlight w:val="lightGray"/>
+        </w:rPr>
+      </w:pPr>
+      <w:r>
+        <w:rPr>
+          <w:rFonts w:ascii="Arial" w:eastAsia="Arial" w:hAnsi="Arial" w:cs="Arial"/>
+          <w:color w:val="000000"/>
+          <w:highlight w:val="lightGray"/>
+        </w:rPr>
+        <w:t>6.5.6 Los SBIA generativos que utilicen información institucional incorporan mecanismos que vinculen los resultados generados con sus fuentes de información autorizadas y vigentes. Esta trazabilidad sustenta la explicabilidad exigida en el numeral 6.9.3.</w:t>
+      </w:r>
+    </w:p>
+    <w:p>
+      <w:pPr>
+        <w:spacing w:after="60" w:line="276" w:lineRule="auto"/>
+        <w:ind w:left="1276" w:hanging="720"/>
+        <w:jc w:val="both"/>
+        <w:rPr>
+          <w:rFonts w:ascii="Arial" w:eastAsia="Arial" w:hAnsi="Arial" w:cs="Arial"/>
+          <w:color w:val="000000"/>
+        </w:rPr>
+      </w:pPr>
+      <w:r>
+        <w:rPr>
+          <w:rFonts w:ascii="Arial" w:eastAsia="Arial" w:hAnsi="Arial" w:cs="Arial"/>
+          <w:color w:val="000000"/>
+          <w:highlight w:val="lightGray"/>
+        </w:rPr>
+        <w:t xml:space="preserve">6.5.7 </w:t>
+      </w:r>
+      <w:r>
+        <w:rPr>
+          <w:rFonts w:ascii="Arial" w:eastAsia="Arial" w:hAnsi="Arial" w:cs="Arial"/>
+          <w:color w:val="000000"/>
+          <w:highlight w:val="lightGray"/>
+        </w:rPr>
+        <w:t xml:space="preserve">  </w:t>
+      </w:r>
+      <w:r>
+        <w:rPr>
+          <w:rFonts w:ascii="Arial" w:eastAsia="Arial" w:hAnsi="Arial" w:cs="Arial"/>
+          <w:color w:val="000000"/>
+          <w:highlight w:val="lightGray"/>
+        </w:rPr>
+        <w:t xml:space="preserve">La publicación del código fuente de los SBIA financiados con fondos públicos, con licencia libre o abierta en la Plataforma Nacional de Software Público Peruano (PNSSP), se sujeta a la determinación previa de su publicabilidad. Dicha determinación verifica que el código no revele información sujeta a reserva tributaria conforme al artículo 85 del TUO del Código Tributario, información protegida por confidencialidad aduanera, ni reglas de detección de riesgo cuya divulgación comprometa la función de control. La GA, con opinión </w:t>
+      </w:r>
+      <w:r>
+        <w:rPr>
+          <w:rFonts w:ascii="Arial" w:eastAsia="Arial" w:hAnsi="Arial" w:cs="Arial"/>
+          <w:color w:val="000000"/>
+          <w:highlight w:val="lightGray"/>
+        </w:rPr>
+        <w:lastRenderedPageBreak/>
+        <w:t xml:space="preserve">de la INALI y de la Oficina de Seguridad Informática, determina la publicabilidad antes de cada liberación mayor; la GDS ejecuta la publicación cuando corresponda. </w:t>
+      </w:r>
+    </w:p>
+    <w:p>
+      <w:pPr>
         <w:pStyle w:val="SubtituloDONI"/>
         <w:spacing w:line="276" w:lineRule="auto"/>
         <w:ind w:left="851"/>
@@ -9427,7 +9631,6 @@
           <w:color w:val="000000"/>
           <w:highlight w:val="yellow"/>
         </w:rPr>
-        <w:lastRenderedPageBreak/>
         <w:t>Ha recibido capacitación específica sobre el funcionamiento, las limitaciones y los riesgos del SBIA que supervisa, incluyendo la identificación y prevención de sesgos algorítmicos, a fin de no sesgarse por los resultados del sistema</w:t>
       </w:r>
       <w:r>
@@ -9524,6 +9727,7 @@
           <w:rFonts w:ascii="Arial" w:eastAsia="Arial" w:hAnsi="Arial" w:cs="Arial"/>
           <w:color w:val="000000"/>
         </w:rPr>
+        <w:lastRenderedPageBreak/>
         <w:t>6.6.4</w:t>
       </w:r>
       <w:r>
@@ -9677,16 +9881,7 @@
           <w:highlight w:val="yellow"/>
         </w:rPr>
         <w:tab/>
-        <w:t xml:space="preserve">Todo SBIA, con independencia de su nivel de riesgo, integra la privacidad desde el diseño, minimizando la cantidad de datos personales recopilados y utilizando técnicas de anonimización, conforme al literal b) del artículo 29 del RLIA y a la Ley N.° 29733. En el desarrollo, la implementación y el uso de los SBIA se cumple la normativa vigente sobre privacidad y protección de datos personales, de acuerdo con lo que establezca la Autoridad Nacional de Protección de Datos Personales del Ministerio de Justicia y Derechos Humanos, conforme al artículo 26 del RLIA. Cuando la anonimización no resulte compatible con la finalidad del SBIA, la SUNAT admite la seudonimización; su justificación se documenta en la EIA o en la Ficha de </w:t>
-      </w:r>
-      <w:r>
-        <w:rPr>
-          <w:rFonts w:ascii="Arial" w:eastAsia="Arial" w:hAnsi="Arial" w:cs="Arial"/>
-          <w:color w:val="000000"/>
-          <w:highlight w:val="yellow"/>
-        </w:rPr>
-        <w:lastRenderedPageBreak/>
-        <w:t>Registro de SBIA, según corresponda. Los controles reforzados del numeral 6.7.2 aplican adicionalmente a los SBIA de riesgo alto y aceptable-limitado.</w:t>
+        <w:t>Todo SBIA, con independencia de su nivel de riesgo, integra la privacidad desde el diseño, minimizando la cantidad de datos personales recopilados y utilizando técnicas de anonimización, conforme al literal b) del artículo 29 del RLIA y a la Ley N.° 29733. En el desarrollo, la implementación y el uso de los SBIA se cumple la normativa vigente sobre privacidad y protección de datos personales, de acuerdo con lo que establezca la Autoridad Nacional de Protección de Datos Personales del Ministerio de Justicia y Derechos Humanos, conforme al artículo 26 del RLIA. Cuando la anonimización no resulte compatible con la finalidad del SBIA, la SUNAT admite la seudonimización; su justificación se documenta en la EIA o en la Ficha de Registro de SBIA, según corresponda. Los controles reforzados del numeral 6.7.2 aplican adicionalmente a los SBIA de riesgo alto y aceptable-limitado.</w:t>
       </w:r>
     </w:p>
     <w:p>
@@ -9728,7 +9923,16 @@
           <w:color w:val="000000"/>
           <w:highlight w:val="cyan"/>
         </w:rPr>
-        <w:t xml:space="preserve"> por el Procedimiento para el registro y atención de incidentes y vulnerabilidades de seguridad de la información (A-03.5.1-PR-003). Los incidentes que se presenten durante la operación de un SBIA en producción y que no constituyan incidentes de seguridad de la información se atienden conforme al Procedimiento de Gestión de Incidentes (A-03.1.1-PR-002). El propietario del caso de uso y las gerencias competentes de la INSI comunican los incidentes del uso y funcionamiento del SBIA por los canales que dichos procedimientos establecen; la Comisión de Gobierno de IA los consolida y los reporta en el informe trimestral del numeral 6.9.5.</w:t>
+        <w:t xml:space="preserve"> por el Procedimiento para el registro y atención de incidentes y vulnerabilidades de seguridad de la información (A-03.5.1-PR-003). Los incidentes que se presenten durante la operación de un SBIA en producción y que no constituyan incidentes de seguridad de la información se atienden conforme al Procedimiento de Gestión </w:t>
+      </w:r>
+      <w:r>
+        <w:rPr>
+          <w:rFonts w:ascii="Arial" w:eastAsia="Arial" w:hAnsi="Arial" w:cs="Arial"/>
+          <w:color w:val="000000"/>
+          <w:highlight w:val="cyan"/>
+        </w:rPr>
+        <w:lastRenderedPageBreak/>
+        <w:t>de Incidentes (A-03.1.1-PR-002). El propietario del caso de uso y las gerencias competentes de la INSI comunican los incidentes del uso y funcionamiento del SBIA por los canales que dichos procedimientos establecen; la Comisión de Gobierno de IA los consolida y los reporta en el informe trimestral del numeral 6.9.5.</w:t>
       </w:r>
     </w:p>
     <w:p>
@@ -9807,7 +10011,6 @@
         <w:spacing w:line="276" w:lineRule="auto"/>
         <w:ind w:left="851"/>
       </w:pPr>
-      <w:commentRangeStart w:id="15"/>
       <w:r>
         <w:rPr>
           <w:highlight w:val="yellow"/>
@@ -9980,7 +10183,6 @@
           <w:color w:val="000000"/>
           <w:highlight w:val="yellow"/>
         </w:rPr>
-        <w:lastRenderedPageBreak/>
         <w:t>6.8.4</w:t>
       </w:r>
       <w:r>
@@ -10006,17 +10208,53 @@
         </w:rPr>
         <w:t>.</w:t>
       </w:r>
-      <w:commentRangeEnd w:id="15"/>
-      <w:r>
-        <w:rPr>
-          <w:rStyle w:val="Refdecomentario"/>
-          <w:rFonts w:ascii="Arial" w:eastAsia="Arial" w:hAnsi="Arial" w:cs="Arial"/>
-          <w:color w:val="000000"/>
-          <w:sz w:val="22"/>
-          <w:szCs w:val="22"/>
-          <w:highlight w:val="yellow"/>
-        </w:rPr>
-        <w:commentReference w:id="15"/>
+    </w:p>
+    <w:p>
+      <w:pPr>
+        <w:tabs>
+          <w:tab w:val="left" w:pos="1418"/>
+        </w:tabs>
+        <w:spacing w:after="60" w:line="276" w:lineRule="auto"/>
+        <w:ind w:left="1276" w:hanging="709"/>
+        <w:jc w:val="both"/>
+        <w:rPr>
+          <w:rFonts w:ascii="Arial" w:eastAsia="Arial" w:hAnsi="Arial" w:cs="Arial"/>
+          <w:color w:val="000000"/>
+          <w:highlight w:val="lightGray"/>
+        </w:rPr>
+      </w:pPr>
+      <w:r>
+        <w:rPr>
+          <w:rFonts w:ascii="Arial" w:eastAsia="Arial" w:hAnsi="Arial" w:cs="Arial"/>
+          <w:color w:val="000000"/>
+          <w:highlight w:val="lightGray"/>
+        </w:rPr>
+        <w:t xml:space="preserve">6.8.5 </w:t>
+      </w:r>
+      <w:r>
+        <w:rPr>
+          <w:rFonts w:ascii="Arial" w:eastAsia="Arial" w:hAnsi="Arial" w:cs="Arial"/>
+          <w:color w:val="000000"/>
+          <w:highlight w:val="lightGray"/>
+        </w:rPr>
+        <w:t xml:space="preserve">  </w:t>
+      </w:r>
+      <w:r>
+        <w:rPr>
+          <w:rFonts w:ascii="Arial" w:eastAsia="Arial" w:hAnsi="Arial" w:cs="Arial"/>
+          <w:color w:val="000000"/>
+          <w:highlight w:val="lightGray"/>
+        </w:rPr>
+        <w:t xml:space="preserve">Los conjuntos de datos que la SUNAT genere o administre y que califiquen como datos de alto valor se ponen a disposición a través del Centro Nacional de Datos (CND), previa determinación de su publicabilidad conforme al artículo 85 del TUO del Código Tributario y a la normativa de protección de datos </w:t>
+      </w:r>
+      <w:r>
+        <w:rPr>
+          <w:rFonts w:ascii="Arial" w:eastAsia="Arial" w:hAnsi="Arial" w:cs="Arial"/>
+          <w:color w:val="000000"/>
+          <w:highlight w:val="lightGray"/>
+        </w:rPr>
+        <w:lastRenderedPageBreak/>
+        <w:t>personales. El OGD identifica los conjuntos candidatos y propone al CGTD su publicación.</w:t>
       </w:r>
     </w:p>
     <w:p>
@@ -10291,16 +10529,7 @@
           <w:color w:val="000000"/>
           <w:highlight w:val="yellow"/>
         </w:rPr>
-        <w:t xml:space="preserve"> son de aplicación en la SUNAT desde su entrada en vigencia. La Comisión de </w:t>
-      </w:r>
-      <w:r>
-        <w:rPr>
-          <w:rFonts w:ascii="Arial" w:eastAsia="Arial" w:hAnsi="Arial" w:cs="Arial"/>
-          <w:color w:val="000000"/>
-          <w:highlight w:val="yellow"/>
-        </w:rPr>
-        <w:lastRenderedPageBreak/>
-        <w:t>Gobierno de IA evalúa su impacto en la presente directiva y propone al CGTD los ajustes que correspondan.</w:t>
+        <w:t xml:space="preserve"> son de aplicación en la SUNAT desde su entrada en vigencia. La Comisión de Gobierno de IA evalúa su impacto en la presente directiva y propone al CGTD los ajustes que correspondan.</w:t>
       </w:r>
     </w:p>
     <w:p>
@@ -10310,6 +10539,7 @@
         <w:ind w:left="851"/>
       </w:pPr>
       <w:r>
+        <w:lastRenderedPageBreak/>
         <w:t>6.10</w:t>
       </w:r>
       <w:r>
@@ -10656,17 +10886,7 @@
           <w:color w:val="000000"/>
           <w:highlight w:val="cyan"/>
         </w:rPr>
-        <w:t xml:space="preserve">No ingresar información sujeta a reserva tributaria ni datos personales de contribuyentes u operadores aduaneros en herramientas de IA que no estén autorizadas para ese tratamiento en el catálogo institucional. El catálogo indica, para cada herramienta, los tipos de información que puede </w:t>
-      </w:r>
-      <w:r>
-        <w:rPr>
-          <w:b w:val="0"/>
-          <w:bCs w:val="0"/>
-          <w:color w:val="000000"/>
-          <w:highlight w:val="cyan"/>
-        </w:rPr>
-        <w:lastRenderedPageBreak/>
-        <w:t>procesar. El tratamiento de información sujeta a reserva tributaria se rige por el numeral 6.7.3.</w:t>
+        <w:t>No ingresar información sujeta a reserva tributaria ni datos personales de contribuyentes u operadores aduaneros en herramientas de IA que no estén autorizadas para ese tratamiento en el catálogo institucional. El catálogo indica, para cada herramienta, los tipos de información que puede procesar. El tratamiento de información sujeta a reserva tributaria se rige por el numeral 6.7.3.</w:t>
       </w:r>
     </w:p>
     <w:p>
@@ -10690,6 +10910,7 @@
           <w:color w:val="000000"/>
           <w:highlight w:val="cyan"/>
         </w:rPr>
+        <w:lastRenderedPageBreak/>
         <w:t>No utilizar herramientas de IA externas que no figuren en el catálogo institucional.</w:t>
       </w:r>
     </w:p>
@@ -10906,7 +11127,6 @@
         <w:ind w:left="851"/>
       </w:pPr>
       <w:r>
-        <w:lastRenderedPageBreak/>
         <w:t>6.12</w:t>
       </w:r>
       <w:r>
@@ -10929,6 +11149,7 @@
           <w:rFonts w:ascii="Arial" w:eastAsia="Arial" w:hAnsi="Arial" w:cs="Arial"/>
           <w:color w:val="000000"/>
         </w:rPr>
+        <w:lastRenderedPageBreak/>
         <w:t>6.12.1</w:t>
       </w:r>
       <w:r>
@@ -11055,11 +11276,20 @@
         <w:pStyle w:val="SubtituloDONI"/>
         <w:spacing w:line="276" w:lineRule="auto"/>
         <w:ind w:left="851"/>
-      </w:pPr>
-      <w:r>
+        <w:rPr>
+          <w:highlight w:val="lightGray"/>
+        </w:rPr>
+      </w:pPr>
+      <w:r>
+        <w:rPr>
+          <w:highlight w:val="lightGray"/>
+        </w:rPr>
         <w:t>6.13</w:t>
       </w:r>
       <w:r>
+        <w:rPr>
+          <w:highlight w:val="lightGray"/>
+        </w:rPr>
         <w:tab/>
         <w:t>De la sensibilización, educación y capacitación</w:t>
       </w:r>
@@ -11072,14 +11302,14 @@
         <w:rPr>
           <w:rFonts w:ascii="Arial" w:eastAsia="Arial" w:hAnsi="Arial" w:cs="Arial"/>
           <w:color w:val="000000"/>
-          <w:highlight w:val="yellow"/>
-        </w:rPr>
-      </w:pPr>
-      <w:r>
-        <w:rPr>
-          <w:rFonts w:ascii="Arial" w:eastAsia="Arial" w:hAnsi="Arial" w:cs="Arial"/>
-          <w:color w:val="000000"/>
-          <w:highlight w:val="yellow"/>
+          <w:highlight w:val="lightGray"/>
+        </w:rPr>
+      </w:pPr>
+      <w:r>
+        <w:rPr>
+          <w:rFonts w:ascii="Arial" w:eastAsia="Arial" w:hAnsi="Arial" w:cs="Arial"/>
+          <w:color w:val="000000"/>
+          <w:highlight w:val="lightGray"/>
         </w:rPr>
         <w:t>La Intendencia Nacional de Recursos Humanos conduce las acciones de sensibilización, capacitación y gestión del cambio vinculadas al uso de sistemas basados en inteligencia artificial, de conformidad con las funciones establecidas en el Reglamento de Organización y Funciones de la SUNAT y con el apoyo técnico de la Comisión de Gobierno de IA.</w:t>
       </w:r>
@@ -11092,14 +11322,14 @@
         <w:rPr>
           <w:rFonts w:ascii="Arial" w:eastAsia="Arial" w:hAnsi="Arial" w:cs="Arial"/>
           <w:color w:val="000000"/>
-          <w:highlight w:val="yellow"/>
-        </w:rPr>
-      </w:pPr>
-      <w:r>
-        <w:rPr>
-          <w:rFonts w:ascii="Arial" w:eastAsia="Arial" w:hAnsi="Arial" w:cs="Arial"/>
-          <w:color w:val="000000"/>
-          <w:highlight w:val="yellow"/>
+          <w:highlight w:val="lightGray"/>
+        </w:rPr>
+      </w:pPr>
+      <w:r>
+        <w:rPr>
+          <w:rFonts w:ascii="Arial" w:eastAsia="Arial" w:hAnsi="Arial" w:cs="Arial"/>
+          <w:color w:val="000000"/>
+          <w:highlight w:val="lightGray"/>
         </w:rPr>
         <w:t>6.</w:t>
       </w:r>
@@ -11107,7 +11337,7 @@
         <w:rPr>
           <w:rFonts w:ascii="Arial" w:eastAsia="Arial" w:hAnsi="Arial" w:cs="Arial"/>
           <w:color w:val="000000"/>
-          <w:highlight w:val="yellow"/>
+          <w:highlight w:val="lightGray"/>
         </w:rPr>
         <w:t>13</w:t>
       </w:r>
@@ -11115,7 +11345,7 @@
         <w:rPr>
           <w:rFonts w:ascii="Arial" w:eastAsia="Arial" w:hAnsi="Arial" w:cs="Arial"/>
           <w:color w:val="000000"/>
-          <w:highlight w:val="yellow"/>
+          <w:highlight w:val="lightGray"/>
         </w:rPr>
         <w:t>.1 Sensibilización</w:t>
       </w:r>
@@ -11128,14 +11358,14 @@
         <w:rPr>
           <w:rFonts w:ascii="Arial" w:eastAsia="Arial" w:hAnsi="Arial" w:cs="Arial"/>
           <w:color w:val="000000"/>
-          <w:highlight w:val="yellow"/>
-        </w:rPr>
-      </w:pPr>
-      <w:r>
-        <w:rPr>
-          <w:rFonts w:ascii="Arial" w:eastAsia="Arial" w:hAnsi="Arial" w:cs="Arial"/>
-          <w:color w:val="000000"/>
-          <w:highlight w:val="yellow"/>
+          <w:highlight w:val="lightGray"/>
+        </w:rPr>
+      </w:pPr>
+      <w:r>
+        <w:rPr>
+          <w:rFonts w:ascii="Arial" w:eastAsia="Arial" w:hAnsi="Arial" w:cs="Arial"/>
+          <w:color w:val="000000"/>
+          <w:highlight w:val="lightGray"/>
         </w:rPr>
         <w:t>Todo el personal de la SUNAT vinculado al diseño, desarrollo, implementación, evaluación o uso de sistemas basados en IA es sensibilizado respecto del uso seguro, responsable y ético de dichos sistemas, así como de los riesgos asociados y de las disposiciones establecidas en la Política de uso seguro, responsable y ético de los sistemas basados en IA de la SUNAT.</w:t>
       </w:r>
@@ -11148,14 +11378,14 @@
         <w:rPr>
           <w:rFonts w:ascii="Arial" w:eastAsia="Arial" w:hAnsi="Arial" w:cs="Arial"/>
           <w:color w:val="000000"/>
-          <w:highlight w:val="yellow"/>
-        </w:rPr>
-      </w:pPr>
-      <w:r>
-        <w:rPr>
-          <w:rFonts w:ascii="Arial" w:eastAsia="Arial" w:hAnsi="Arial" w:cs="Arial"/>
-          <w:color w:val="000000"/>
-          <w:highlight w:val="yellow"/>
+          <w:highlight w:val="lightGray"/>
+        </w:rPr>
+      </w:pPr>
+      <w:r>
+        <w:rPr>
+          <w:rFonts w:ascii="Arial" w:eastAsia="Arial" w:hAnsi="Arial" w:cs="Arial"/>
+          <w:color w:val="000000"/>
+          <w:highlight w:val="lightGray"/>
         </w:rPr>
         <w:t>Las acciones de sensibilización consideran, como mínimo:</w:t>
       </w:r>
@@ -11173,15 +11403,15 @@
           <w:b w:val="0"/>
           <w:bCs w:val="0"/>
           <w:color w:val="000000"/>
-          <w:highlight w:val="yellow"/>
-        </w:rPr>
-      </w:pPr>
-      <w:r>
-        <w:rPr>
-          <w:b w:val="0"/>
-          <w:bCs w:val="0"/>
-          <w:color w:val="000000"/>
-          <w:highlight w:val="yellow"/>
+          <w:highlight w:val="lightGray"/>
+        </w:rPr>
+      </w:pPr>
+      <w:r>
+        <w:rPr>
+          <w:b w:val="0"/>
+          <w:bCs w:val="0"/>
+          <w:color w:val="000000"/>
+          <w:highlight w:val="lightGray"/>
         </w:rPr>
         <w:t>La finalidad y los principios institucionales aplicables a los sistemas basados en IA.</w:t>
       </w:r>
@@ -11199,15 +11429,15 @@
           <w:b w:val="0"/>
           <w:bCs w:val="0"/>
           <w:color w:val="000000"/>
-          <w:highlight w:val="yellow"/>
-        </w:rPr>
-      </w:pPr>
-      <w:r>
-        <w:rPr>
-          <w:b w:val="0"/>
-          <w:bCs w:val="0"/>
-          <w:color w:val="000000"/>
-          <w:highlight w:val="yellow"/>
+          <w:highlight w:val="lightGray"/>
+        </w:rPr>
+      </w:pPr>
+      <w:r>
+        <w:rPr>
+          <w:b w:val="0"/>
+          <w:bCs w:val="0"/>
+          <w:color w:val="000000"/>
+          <w:highlight w:val="lightGray"/>
         </w:rPr>
         <w:t>Los riesgos derivados de su diseño, desarrollo, implementación y uso.</w:t>
       </w:r>
@@ -11225,15 +11455,15 @@
           <w:b w:val="0"/>
           <w:bCs w:val="0"/>
           <w:color w:val="000000"/>
-          <w:highlight w:val="yellow"/>
-        </w:rPr>
-      </w:pPr>
-      <w:r>
-        <w:rPr>
-          <w:b w:val="0"/>
-          <w:bCs w:val="0"/>
-          <w:color w:val="000000"/>
-          <w:highlight w:val="yellow"/>
+          <w:highlight w:val="lightGray"/>
+        </w:rPr>
+      </w:pPr>
+      <w:r>
+        <w:rPr>
+          <w:b w:val="0"/>
+          <w:bCs w:val="0"/>
+          <w:color w:val="000000"/>
+          <w:highlight w:val="lightGray"/>
         </w:rPr>
         <w:t>La protección de los derechos fundamentales de los administrados y la prevención de sesgos o resultados discriminatorios.</w:t>
       </w:r>
@@ -11251,15 +11481,15 @@
           <w:b w:val="0"/>
           <w:bCs w:val="0"/>
           <w:color w:val="000000"/>
-          <w:highlight w:val="yellow"/>
-        </w:rPr>
-      </w:pPr>
-      <w:r>
-        <w:rPr>
-          <w:b w:val="0"/>
-          <w:bCs w:val="0"/>
-          <w:color w:val="000000"/>
-          <w:highlight w:val="yellow"/>
+          <w:highlight w:val="lightGray"/>
+        </w:rPr>
+      </w:pPr>
+      <w:r>
+        <w:rPr>
+          <w:b w:val="0"/>
+          <w:bCs w:val="0"/>
+          <w:color w:val="000000"/>
+          <w:highlight w:val="lightGray"/>
         </w:rPr>
         <w:lastRenderedPageBreak/>
         <w:t>La protección de la reserva tributaria, secreto comercial y demás obligaciones de confidencialidad aplicables.</w:t>
@@ -11278,15 +11508,15 @@
           <w:b w:val="0"/>
           <w:bCs w:val="0"/>
           <w:color w:val="000000"/>
-          <w:highlight w:val="yellow"/>
-        </w:rPr>
-      </w:pPr>
-      <w:r>
-        <w:rPr>
-          <w:b w:val="0"/>
-          <w:bCs w:val="0"/>
-          <w:color w:val="000000"/>
-          <w:highlight w:val="yellow"/>
+          <w:highlight w:val="lightGray"/>
+        </w:rPr>
+      </w:pPr>
+      <w:r>
+        <w:rPr>
+          <w:b w:val="0"/>
+          <w:bCs w:val="0"/>
+          <w:color w:val="000000"/>
+          <w:highlight w:val="lightGray"/>
         </w:rPr>
         <w:t>El impacto social y ambiental de los sistemas basados en IA.</w:t>
       </w:r>
@@ -11299,14 +11529,14 @@
         <w:rPr>
           <w:rFonts w:ascii="Arial" w:eastAsia="Arial" w:hAnsi="Arial" w:cs="Arial"/>
           <w:color w:val="000000"/>
-          <w:highlight w:val="yellow"/>
-        </w:rPr>
-      </w:pPr>
-      <w:r>
-        <w:rPr>
-          <w:rFonts w:ascii="Arial" w:eastAsia="Arial" w:hAnsi="Arial" w:cs="Arial"/>
-          <w:color w:val="000000"/>
-          <w:highlight w:val="yellow"/>
+          <w:highlight w:val="lightGray"/>
+        </w:rPr>
+      </w:pPr>
+      <w:r>
+        <w:rPr>
+          <w:rFonts w:ascii="Arial" w:eastAsia="Arial" w:hAnsi="Arial" w:cs="Arial"/>
+          <w:color w:val="000000"/>
+          <w:highlight w:val="lightGray"/>
         </w:rPr>
         <w:t>Esta disposición incorpora los requerimientos establecidos en el numeral 28.9 del artículo 28 del Reglamento y adopta medidas adicionales de sensibilización orientadas a promover el uso seguro, responsable y ético de los sistemas basados en IA, en concordancia con el numeral 7.3 de la NTP-ISO/IEC 42001:2025.</w:t>
       </w:r>
@@ -11319,14 +11549,14 @@
         <w:rPr>
           <w:rFonts w:ascii="Arial" w:eastAsia="Arial" w:hAnsi="Arial" w:cs="Arial"/>
           <w:color w:val="000000"/>
-          <w:highlight w:val="yellow"/>
-        </w:rPr>
-      </w:pPr>
-      <w:r>
-        <w:rPr>
-          <w:rFonts w:ascii="Arial" w:eastAsia="Arial" w:hAnsi="Arial" w:cs="Arial"/>
-          <w:color w:val="000000"/>
-          <w:highlight w:val="yellow"/>
+          <w:highlight w:val="lightGray"/>
+        </w:rPr>
+      </w:pPr>
+      <w:r>
+        <w:rPr>
+          <w:rFonts w:ascii="Arial" w:eastAsia="Arial" w:hAnsi="Arial" w:cs="Arial"/>
+          <w:color w:val="000000"/>
+          <w:highlight w:val="lightGray"/>
         </w:rPr>
         <w:t>6.</w:t>
       </w:r>
@@ -11334,7 +11564,7 @@
         <w:rPr>
           <w:rFonts w:ascii="Arial" w:eastAsia="Arial" w:hAnsi="Arial" w:cs="Arial"/>
           <w:color w:val="000000"/>
-          <w:highlight w:val="yellow"/>
+          <w:highlight w:val="lightGray"/>
         </w:rPr>
         <w:t>13</w:t>
       </w:r>
@@ -11342,7 +11572,7 @@
         <w:rPr>
           <w:rFonts w:ascii="Arial" w:eastAsia="Arial" w:hAnsi="Arial" w:cs="Arial"/>
           <w:color w:val="000000"/>
-          <w:highlight w:val="yellow"/>
+          <w:highlight w:val="lightGray"/>
         </w:rPr>
         <w:t>.2 Capacitación y fortalecimiento de capacidades</w:t>
       </w:r>
@@ -11355,14 +11585,14 @@
         <w:rPr>
           <w:rFonts w:ascii="Arial" w:eastAsia="Arial" w:hAnsi="Arial" w:cs="Arial"/>
           <w:color w:val="000000"/>
-          <w:highlight w:val="yellow"/>
-        </w:rPr>
-      </w:pPr>
-      <w:r>
-        <w:rPr>
-          <w:rFonts w:ascii="Arial" w:eastAsia="Arial" w:hAnsi="Arial" w:cs="Arial"/>
-          <w:color w:val="000000"/>
-          <w:highlight w:val="yellow"/>
+          <w:highlight w:val="lightGray"/>
+        </w:rPr>
+      </w:pPr>
+      <w:r>
+        <w:rPr>
+          <w:rFonts w:ascii="Arial" w:eastAsia="Arial" w:hAnsi="Arial" w:cs="Arial"/>
+          <w:color w:val="000000"/>
+          <w:highlight w:val="lightGray"/>
         </w:rPr>
         <w:t xml:space="preserve">La Intendencia Nacional de Recursos Humanos fortalece de manera progresiva y sistemática las capacidades y competencias de su personal en materia de sistemas basados en IA mediante acciones formativas. </w:t>
       </w:r>
@@ -11375,14 +11605,14 @@
         <w:rPr>
           <w:rFonts w:ascii="Arial" w:eastAsia="Arial" w:hAnsi="Arial" w:cs="Arial"/>
           <w:color w:val="000000"/>
-          <w:highlight w:val="yellow"/>
-        </w:rPr>
-      </w:pPr>
-      <w:r>
-        <w:rPr>
-          <w:rFonts w:ascii="Arial" w:eastAsia="Arial" w:hAnsi="Arial" w:cs="Arial"/>
-          <w:color w:val="000000"/>
-          <w:highlight w:val="yellow"/>
+          <w:highlight w:val="lightGray"/>
+        </w:rPr>
+      </w:pPr>
+      <w:r>
+        <w:rPr>
+          <w:rFonts w:ascii="Arial" w:eastAsia="Arial" w:hAnsi="Arial" w:cs="Arial"/>
+          <w:color w:val="000000"/>
+          <w:highlight w:val="lightGray"/>
         </w:rPr>
         <w:t>Las necesidades de capacitación asociadas a los distintos roles, los contenidos formativos, las modalidades de capacitación y los mecanismos de evaluación de resultados se determinan en el marco normativo del Plan de Desarrollo de las Personas.</w:t>
       </w:r>
@@ -11395,14 +11625,14 @@
         <w:rPr>
           <w:rFonts w:ascii="Arial" w:eastAsia="Arial" w:hAnsi="Arial" w:cs="Arial"/>
           <w:color w:val="000000"/>
-          <w:highlight w:val="yellow"/>
-        </w:rPr>
-      </w:pPr>
-      <w:r>
-        <w:rPr>
-          <w:rFonts w:ascii="Arial" w:eastAsia="Arial" w:hAnsi="Arial" w:cs="Arial"/>
-          <w:color w:val="000000"/>
-          <w:highlight w:val="yellow"/>
+          <w:highlight w:val="lightGray"/>
+        </w:rPr>
+      </w:pPr>
+      <w:r>
+        <w:rPr>
+          <w:rFonts w:ascii="Arial" w:eastAsia="Arial" w:hAnsi="Arial" w:cs="Arial"/>
+          <w:color w:val="000000"/>
+          <w:highlight w:val="lightGray"/>
         </w:rPr>
         <w:t>Estas acciones consideran, como mínimo:</w:t>
       </w:r>
@@ -11420,15 +11650,15 @@
           <w:b w:val="0"/>
           <w:bCs w:val="0"/>
           <w:color w:val="000000"/>
-          <w:highlight w:val="yellow"/>
-        </w:rPr>
-      </w:pPr>
-      <w:r>
-        <w:rPr>
-          <w:b w:val="0"/>
-          <w:bCs w:val="0"/>
-          <w:color w:val="000000"/>
-          <w:highlight w:val="yellow"/>
+          <w:highlight w:val="lightGray"/>
+        </w:rPr>
+      </w:pPr>
+      <w:r>
+        <w:rPr>
+          <w:b w:val="0"/>
+          <w:bCs w:val="0"/>
+          <w:color w:val="000000"/>
+          <w:highlight w:val="lightGray"/>
         </w:rPr>
         <w:t>Los fundamentos y el ciclo de vida de los sistemas basados en IA.</w:t>
       </w:r>
@@ -11446,15 +11676,15 @@
           <w:b w:val="0"/>
           <w:bCs w:val="0"/>
           <w:color w:val="000000"/>
-          <w:highlight w:val="yellow"/>
-        </w:rPr>
-      </w:pPr>
-      <w:r>
-        <w:rPr>
-          <w:b w:val="0"/>
-          <w:bCs w:val="0"/>
-          <w:color w:val="000000"/>
-          <w:highlight w:val="yellow"/>
+          <w:highlight w:val="lightGray"/>
+        </w:rPr>
+      </w:pPr>
+      <w:r>
+        <w:rPr>
+          <w:b w:val="0"/>
+          <w:bCs w:val="0"/>
+          <w:color w:val="000000"/>
+          <w:highlight w:val="lightGray"/>
         </w:rPr>
         <w:t>La gestión de riesgos y la seguridad de la información aplicables.</w:t>
       </w:r>
@@ -11472,15 +11702,15 @@
           <w:b w:val="0"/>
           <w:bCs w:val="0"/>
           <w:color w:val="000000"/>
-          <w:highlight w:val="yellow"/>
-        </w:rPr>
-      </w:pPr>
-      <w:r>
-        <w:rPr>
-          <w:b w:val="0"/>
-          <w:bCs w:val="0"/>
-          <w:color w:val="000000"/>
-          <w:highlight w:val="yellow"/>
+          <w:highlight w:val="lightGray"/>
+        </w:rPr>
+      </w:pPr>
+      <w:r>
+        <w:rPr>
+          <w:b w:val="0"/>
+          <w:bCs w:val="0"/>
+          <w:color w:val="000000"/>
+          <w:highlight w:val="lightGray"/>
         </w:rPr>
         <w:t>La ética, integridad y responsabilidad en el uso de la IA.</w:t>
       </w:r>
@@ -11498,15 +11728,15 @@
           <w:b w:val="0"/>
           <w:bCs w:val="0"/>
           <w:color w:val="000000"/>
-          <w:highlight w:val="yellow"/>
-        </w:rPr>
-      </w:pPr>
-      <w:r>
-        <w:rPr>
-          <w:b w:val="0"/>
-          <w:bCs w:val="0"/>
-          <w:color w:val="000000"/>
-          <w:highlight w:val="yellow"/>
+          <w:highlight w:val="lightGray"/>
+        </w:rPr>
+      </w:pPr>
+      <w:r>
+        <w:rPr>
+          <w:b w:val="0"/>
+          <w:bCs w:val="0"/>
+          <w:color w:val="000000"/>
+          <w:highlight w:val="lightGray"/>
         </w:rPr>
         <w:t>La protección de datos personales.</w:t>
       </w:r>
@@ -11524,15 +11754,15 @@
           <w:b w:val="0"/>
           <w:bCs w:val="0"/>
           <w:color w:val="000000"/>
-          <w:highlight w:val="yellow"/>
-        </w:rPr>
-      </w:pPr>
-      <w:r>
-        <w:rPr>
-          <w:b w:val="0"/>
-          <w:bCs w:val="0"/>
-          <w:color w:val="000000"/>
-          <w:highlight w:val="yellow"/>
+          <w:highlight w:val="lightGray"/>
+        </w:rPr>
+      </w:pPr>
+      <w:r>
+        <w:rPr>
+          <w:b w:val="0"/>
+          <w:bCs w:val="0"/>
+          <w:color w:val="000000"/>
+          <w:highlight w:val="lightGray"/>
         </w:rPr>
         <w:t>La protección de la reserva tributaria cuando los sistemas procesen información de los administrados.</w:t>
       </w:r>
@@ -11545,14 +11775,14 @@
         <w:rPr>
           <w:rFonts w:ascii="Arial" w:eastAsia="Arial" w:hAnsi="Arial" w:cs="Arial"/>
           <w:color w:val="000000"/>
-          <w:highlight w:val="yellow"/>
-        </w:rPr>
-      </w:pPr>
-      <w:r>
-        <w:rPr>
-          <w:rFonts w:ascii="Arial" w:eastAsia="Arial" w:hAnsi="Arial" w:cs="Arial"/>
-          <w:color w:val="000000"/>
-          <w:highlight w:val="yellow"/>
+          <w:highlight w:val="lightGray"/>
+        </w:rPr>
+      </w:pPr>
+      <w:r>
+        <w:rPr>
+          <w:rFonts w:ascii="Arial" w:eastAsia="Arial" w:hAnsi="Arial" w:cs="Arial"/>
+          <w:color w:val="000000"/>
+          <w:highlight w:val="lightGray"/>
         </w:rPr>
         <w:t>Esta disposición se implementa conforme al numeral 28.5 del artículo 28 del Reglamento y en concordancia con el numeral 7.2 y el Anexo A.4 de la NTP</w:t>
       </w:r>
@@ -11560,7 +11790,7 @@
         <w:rPr>
           <w:rFonts w:ascii="Arial" w:eastAsia="Arial" w:hAnsi="Arial" w:cs="Arial"/>
           <w:color w:val="000000"/>
-          <w:highlight w:val="yellow"/>
+          <w:highlight w:val="lightGray"/>
         </w:rPr>
         <w:noBreakHyphen/>
         <w:t>ISO/IEC 42001:2025.</w:t>
@@ -11574,14 +11804,14 @@
         <w:rPr>
           <w:rFonts w:ascii="Arial" w:eastAsia="Arial" w:hAnsi="Arial" w:cs="Arial"/>
           <w:color w:val="000000"/>
-          <w:highlight w:val="yellow"/>
-        </w:rPr>
-      </w:pPr>
-      <w:r>
-        <w:rPr>
-          <w:rFonts w:ascii="Arial" w:eastAsia="Arial" w:hAnsi="Arial" w:cs="Arial"/>
-          <w:color w:val="000000"/>
-          <w:highlight w:val="yellow"/>
+          <w:highlight w:val="lightGray"/>
+        </w:rPr>
+      </w:pPr>
+      <w:r>
+        <w:rPr>
+          <w:rFonts w:ascii="Arial" w:eastAsia="Arial" w:hAnsi="Arial" w:cs="Arial"/>
+          <w:color w:val="000000"/>
+          <w:highlight w:val="lightGray"/>
         </w:rPr>
         <w:t>6.</w:t>
       </w:r>
@@ -11589,7 +11819,7 @@
         <w:rPr>
           <w:rFonts w:ascii="Arial" w:eastAsia="Arial" w:hAnsi="Arial" w:cs="Arial"/>
           <w:color w:val="000000"/>
-          <w:highlight w:val="yellow"/>
+          <w:highlight w:val="lightGray"/>
         </w:rPr>
         <w:t>13</w:t>
       </w:r>
@@ -11597,7 +11827,7 @@
         <w:rPr>
           <w:rFonts w:ascii="Arial" w:eastAsia="Arial" w:hAnsi="Arial" w:cs="Arial"/>
           <w:color w:val="000000"/>
-          <w:highlight w:val="yellow"/>
+          <w:highlight w:val="lightGray"/>
         </w:rPr>
         <w:t>.3 Gestión del cambio</w:t>
       </w:r>
@@ -11610,14 +11840,14 @@
         <w:rPr>
           <w:rFonts w:ascii="Arial" w:eastAsia="Arial" w:hAnsi="Arial" w:cs="Arial"/>
           <w:color w:val="000000"/>
-          <w:highlight w:val="yellow"/>
-        </w:rPr>
-      </w:pPr>
-      <w:r>
-        <w:rPr>
-          <w:rFonts w:ascii="Arial" w:eastAsia="Arial" w:hAnsi="Arial" w:cs="Arial"/>
-          <w:color w:val="000000"/>
-          <w:highlight w:val="yellow"/>
+          <w:highlight w:val="lightGray"/>
+        </w:rPr>
+      </w:pPr>
+      <w:r>
+        <w:rPr>
+          <w:rFonts w:ascii="Arial" w:eastAsia="Arial" w:hAnsi="Arial" w:cs="Arial"/>
+          <w:color w:val="000000"/>
+          <w:highlight w:val="lightGray"/>
         </w:rPr>
         <w:t>La Intendencia Nacional de Recursos Humanos promueve las acciones de gestión del cambio necesarias para la adopción efectiva de la Política y del sistema de gestión de IA, fomentando una cultura institucional orientada a la innovación responsable, la mejora continua y el aprovechamiento seguro y sostenible de las tecnologías basadas en IA.</w:t>
       </w:r>
@@ -11630,25 +11860,17 @@
         <w:rPr>
           <w:rFonts w:ascii="Arial" w:eastAsia="Arial" w:hAnsi="Arial" w:cs="Arial"/>
           <w:color w:val="000000"/>
-          <w:highlight w:val="yellow"/>
-        </w:rPr>
-      </w:pPr>
-      <w:r>
-        <w:rPr>
-          <w:rFonts w:ascii="Arial" w:eastAsia="Arial" w:hAnsi="Arial" w:cs="Arial"/>
-          <w:color w:val="000000"/>
-          <w:highlight w:val="yellow"/>
+          <w:highlight w:val="lightGray"/>
+        </w:rPr>
+      </w:pPr>
+      <w:r>
+        <w:rPr>
+          <w:rFonts w:ascii="Arial" w:eastAsia="Arial" w:hAnsi="Arial" w:cs="Arial"/>
+          <w:color w:val="000000"/>
+          <w:highlight w:val="lightGray"/>
         </w:rPr>
         <w:t>Las acciones de gestión del cambio facilitan la consolidación de la Política institucional de uso seguro, responsable y ético de los sistemas basados en IA y del sistema de gestión de IA, promoviendo su integración en la gestión institucional y favoreciendo las condiciones organizacionales necesarias para su sostenibilidad y mejora continua, en concordancia con los numerales 28.1 y 28.2 del artículo 28 del Reglamento.</w:t>
       </w:r>
-    </w:p>
-    <w:p>
-      <w:pPr>
-        <w:jc w:val="both"/>
-        <w:rPr>
-          <w:color w:val="000000" w:themeColor="text1"/>
-        </w:rPr>
-      </w:pPr>
     </w:p>
     <w:p>
       <w:pPr>
@@ -11676,6 +11898,7 @@
         <w:rPr>
           <w:highlight w:val="yellow"/>
         </w:rPr>
+        <w:lastRenderedPageBreak/>
         <w:t>6.14</w:t>
       </w:r>
       <w:r>
@@ -11913,14 +12136,7 @@
         <w:rPr>
           <w:highlight w:val="lightGray"/>
         </w:rPr>
-        <w:t xml:space="preserve">6.15.4 Cuando un proyecto de inversión pública sujeto al Sistema Nacional de Programación Multianual y Gestión de Inversiones incorpore un componente basado en IA, la Unidad Formuladora considera la opinión de la Comisión como insumo del análisis técnico que </w:t>
-      </w:r>
-      <w:r>
-        <w:rPr>
-          <w:highlight w:val="lightGray"/>
-        </w:rPr>
-        <w:lastRenderedPageBreak/>
-        <w:t>sustenta la declaración de viabilidad, sin perjuicio de las disposiciones del referido Sistema. En la ejecución, el SBIA observa el ciclo de vida del numeral 6.1.</w:t>
+        <w:t>6.15.4 Cuando un proyecto de inversión pública sujeto al Sistema Nacional de Programación Multianual y Gestión de Inversiones incorpore un componente basado en IA, la Unidad Formuladora considera la opinión de la Comisión como insumo del análisis técnico que sustenta la declaración de viabilidad, sin perjuicio de las disposiciones del referido Sistema. En la ejecución, el SBIA observa el ciclo de vida del numeral 6.1.</w:t>
       </w:r>
     </w:p>
     <w:p>
@@ -11941,6 +12157,7 @@
         <w:rPr>
           <w:highlight w:val="lightGray"/>
         </w:rPr>
+        <w:lastRenderedPageBreak/>
         <w:t>6.15.5 Las unidades competentes de cada instrumento incorporan en sus metodologías o procedimientos la verificación del componente de IA y la opinión de la Comisión, según sus competencias y sin afectar los sistemas administrativos del Estado, conforme al numeral 7.6</w:t>
       </w:r>
       <w:r>
@@ -11956,7 +12173,7 @@
           <w:szCs w:val="22"/>
         </w:rPr>
       </w:pPr>
-      <w:bookmarkStart w:id="16" w:name="_Toc235003967"/>
+      <w:bookmarkStart w:id="15" w:name="_Toc235003967"/>
       <w:r>
         <w:rPr>
           <w:rFonts w:cs="Arial"/>
@@ -11967,7 +12184,7 @@
         <w:lastRenderedPageBreak/>
         <w:t>DISPOSICIONES FINALES</w:t>
       </w:r>
-      <w:bookmarkEnd w:id="16"/>
+      <w:bookmarkEnd w:id="15"/>
     </w:p>
     <w:p>
       <w:pPr>
@@ -12316,7 +12533,7 @@
           <w:szCs w:val="22"/>
         </w:rPr>
       </w:pPr>
-      <w:bookmarkStart w:id="17" w:name="_Toc235003968"/>
+      <w:bookmarkStart w:id="16" w:name="_Toc235003968"/>
       <w:r>
         <w:rPr>
           <w:rFonts w:cs="Arial"/>
@@ -12326,7 +12543,7 @@
         </w:rPr>
         <w:t>ANEXOS</w:t>
       </w:r>
-      <w:bookmarkEnd w:id="17"/>
+      <w:bookmarkEnd w:id="16"/>
     </w:p>
     <w:p>
       <w:pPr>
@@ -16590,22 +16807,6 @@
       </w:r>
     </w:p>
   </w:comment>
-  <w:comment w:id="15" w:author="Kut Castro Mario Fernando" w:date="2026-07-21T12:05:00Z" w:initials="MK">
-    <w:p>
-      <w:pPr>
-        <w:pStyle w:val="Textocomentario"/>
-      </w:pPr>
-      <w:r>
-        <w:rPr>
-          <w:rStyle w:val="Refdecomentario"/>
-        </w:rPr>
-        <w:annotationRef/>
-      </w:r>
-      <w:r>
-        <w:t>Pendiente en agenda.</w:t>
-      </w:r>
-    </w:p>
-  </w:comment>
 </w:comments>
 </file>
 
@@ -16619,7 +16820,6 @@
   <w15:commentEx w15:paraId="7A362A96" w15:done="0"/>
   <w15:commentEx w15:paraId="32D4CC42" w15:done="0"/>
   <w15:commentEx w15:paraId="152D4D06" w15:done="0"/>
-  <w15:commentEx w15:paraId="1A2E6AA6" w15:done="0"/>
 </w15:commentsEx>
 </file>
 
@@ -16633,7 +16833,6 @@
   <w16cex:commentExtensible w16cex:durableId="29EDEAD0" w16cex:dateUtc="2026-07-21T16:40:00Z"/>
   <w16cex:commentExtensible w16cex:durableId="472286C5" w16cex:dateUtc="2026-07-21T16:47:00Z"/>
   <w16cex:commentExtensible w16cex:durableId="0734D94E" w16cex:dateUtc="2026-07-21T17:00:00Z"/>
-  <w16cex:commentExtensible w16cex:durableId="2E351660" w16cex:dateUtc="2026-07-21T17:05:00Z"/>
 </w16cex:commentsExtensible>
 </file>
 
@@ -16647,7 +16846,6 @@
   <w16cid:commentId w16cid:paraId="7A362A96" w16cid:durableId="29EDEAD0"/>
   <w16cid:commentId w16cid:paraId="32D4CC42" w16cid:durableId="472286C5"/>
   <w16cid:commentId w16cid:paraId="152D4D06" w16cid:durableId="0734D94E"/>
-  <w16cid:commentId w16cid:paraId="1A2E6AA6" w16cid:durableId="2E351660"/>
 </w16cid:commentsIds>
 </file>
 
@@ -20518,7 +20716,6 @@
   <w:style w:type="character" w:default="1" w:styleId="Fuentedeprrafopredeter">
     <w:name w:val="Default Paragraph Font"/>
     <w:uiPriority w:val="1"/>
-    <w:semiHidden/>
     <w:unhideWhenUsed/>
   </w:style>
   <w:style w:type="table" w:default="1" w:styleId="Tablanormal">

</xml_diff>

<commit_message>
docs: ajusta alcance (OCI -> Sistema Nacional de Control), reformula principio 5.1.2 de derechos fundamentales y elimina numerales 6.1.6/6.1.7 de articulacion con MGPP/demanda
</commit_message>
<xml_diff>
--- a/normativo/DIRECTIVA-GOBIERNO-IA.docx
+++ b/normativo/DIRECTIVA-GOBIERNO-IA.docx
@@ -2276,25 +2276,21 @@
         </w:rPr>
         <w:t xml:space="preserve">Las disposiciones de la presente directiva son de cumplimiento obligatorio para todas las unidades de organización de la SUNAT que desarrollen, adquieran, implementen, operen, supervisen o utilicen SBIA. </w:t>
       </w:r>
-      <w:commentRangeStart w:id="3"/>
       <w:r>
         <w:rPr>
           <w:rFonts w:ascii="Arial" w:hAnsi="Arial" w:cs="Arial"/>
           <w:color w:val="000000"/>
-          <w:highlight w:val="cyan"/>
-        </w:rPr>
-        <w:t>Se exceptúa de su alcance al Órgano de Control Institucional, que ejerce sus funciones con autonomía funcional e independencia técnica y depende funcional y administrativamente de la Contraloría General de la República, conforme a la Ley N.° 27785.</w:t>
-      </w:r>
-      <w:commentRangeEnd w:id="3"/>
-      <w:r>
-        <w:rPr>
-          <w:rStyle w:val="Refdecomentario"/>
-          <w:rFonts w:ascii="Arial" w:eastAsia="Arial" w:hAnsi="Arial" w:cs="Arial"/>
-          <w:color w:val="EE0000"/>
-          <w:sz w:val="22"/>
-          <w:szCs w:val="22"/>
-        </w:rPr>
-        <w:commentReference w:id="3"/>
+          <w:highlight w:val="lightGray"/>
+        </w:rPr>
+        <w:t>Se exceptúa de su alcance al Órgano de Control Institucional, que se rige por las disposiciones del Sistema Nacional de Control</w:t>
+      </w:r>
+      <w:r>
+        <w:rPr>
+          <w:rFonts w:ascii="Arial" w:hAnsi="Arial" w:cs="Arial"/>
+          <w:color w:val="000000"/>
+          <w:highlight w:val="lightGray"/>
+        </w:rPr>
+        <w:t>.</w:t>
       </w:r>
     </w:p>
     <w:p>
@@ -2391,7 +2387,7 @@
           <w:szCs w:val="22"/>
         </w:rPr>
       </w:pPr>
-      <w:bookmarkStart w:id="4" w:name="_Toc235003963"/>
+      <w:bookmarkStart w:id="3" w:name="_Toc235003963"/>
       <w:r>
         <w:rPr>
           <w:rFonts w:cs="Arial"/>
@@ -2401,7 +2397,7 @@
         </w:rPr>
         <w:t>BASE NORMATIVA</w:t>
       </w:r>
-      <w:bookmarkEnd w:id="4"/>
+      <w:bookmarkEnd w:id="3"/>
     </w:p>
     <w:p>
       <w:pPr>
@@ -2593,7 +2589,6 @@
           <w:bCs w:val="0"/>
           <w:color w:val="000000"/>
         </w:rPr>
-        <w:lastRenderedPageBreak/>
         <w:t>Decreto Supremo N.° 133-2013-EF (22/06/2013), que aprueba el Texto Único Ordenado del Código Tributario; en particular el artículo 85 sobre reserva tributaria.</w:t>
       </w:r>
     </w:p>
@@ -2618,6 +2613,7 @@
           <w:bCs w:val="0"/>
           <w:color w:val="000000"/>
         </w:rPr>
+        <w:lastRenderedPageBreak/>
         <w:t>Decreto Legislativo N.° 1053 (27/06/2008), que aprueba la Ley General de Aduanas, y su Reglamento; en lo relativo a la confidencialidad de la información aduanera.</w:t>
       </w:r>
     </w:p>
@@ -3042,7 +3038,7 @@
           <w:szCs w:val="22"/>
         </w:rPr>
       </w:pPr>
-      <w:bookmarkStart w:id="5" w:name="_Toc235003964"/>
+      <w:bookmarkStart w:id="4" w:name="_Toc235003964"/>
       <w:r>
         <w:rPr>
           <w:rFonts w:cs="Arial"/>
@@ -3053,7 +3049,7 @@
         <w:lastRenderedPageBreak/>
         <w:t>GLOSARIO DE TÉRMINOS</w:t>
       </w:r>
-      <w:bookmarkEnd w:id="5"/>
+      <w:bookmarkEnd w:id="4"/>
     </w:p>
     <w:p>
       <w:pPr>
@@ -3599,7 +3595,7 @@
           <w:color w:val="000000"/>
         </w:rPr>
       </w:pPr>
-      <w:commentRangeStart w:id="6"/>
+      <w:commentRangeStart w:id="5"/>
       <w:r>
         <w:rPr>
           <w:color w:val="000000"/>
@@ -3616,7 +3612,7 @@
         </w:rPr>
         <w:t>Responsable de la unidad de organización que identifica la necesidad de negocio (el caso de uso) susceptible de ser atendida mediante un SBIA, y que asume la responsabilidad funcional sobre sus resultados a lo largo de todo el ciclo de vida. Es el mismo responsable funcional del SBIA que materializa el caso de uso, y se distingue del custodio técnico a cargo de su arquitectura y operación. [NTP-ISO/IEC 42001:2025, cláusula 5.3]</w:t>
       </w:r>
-      <w:commentRangeEnd w:id="6"/>
+      <w:commentRangeEnd w:id="5"/>
       <w:r>
         <w:rPr>
           <w:rStyle w:val="Refdecomentario"/>
@@ -3626,7 +3622,7 @@
           <w:sz w:val="22"/>
           <w:szCs w:val="22"/>
         </w:rPr>
-        <w:commentReference w:id="6"/>
+        <w:commentReference w:id="5"/>
       </w:r>
     </w:p>
     <w:p>
@@ -3828,7 +3824,7 @@
           <w:szCs w:val="22"/>
         </w:rPr>
       </w:pPr>
-      <w:bookmarkStart w:id="7" w:name="_Toc235003965"/>
+      <w:bookmarkStart w:id="6" w:name="_Toc235003965"/>
       <w:r>
         <w:rPr>
           <w:rFonts w:cs="Arial"/>
@@ -3839,7 +3835,7 @@
         <w:lastRenderedPageBreak/>
         <w:t>DISPOSICIONES GENERALES</w:t>
       </w:r>
-      <w:bookmarkEnd w:id="7"/>
+      <w:bookmarkEnd w:id="6"/>
     </w:p>
     <w:p>
       <w:pPr>
@@ -3923,15 +3919,16 @@
         <w:ind w:left="1276" w:hanging="720"/>
         <w:jc w:val="both"/>
         <w:rPr>
-          <w:rFonts w:ascii="Arial" w:eastAsia="Arial" w:hAnsi="Arial" w:cs="Arial"/>
-          <w:color w:val="000000"/>
-        </w:rPr>
-      </w:pPr>
-      <w:r>
-        <w:rPr>
           <w:rFonts w:ascii="Arial" w:hAnsi="Arial" w:cs="Arial"/>
           <w:color w:val="000000"/>
-          <w:highlight w:val="cyan"/>
+          <w:highlight w:val="lightGray"/>
+        </w:rPr>
+      </w:pPr>
+      <w:r>
+        <w:rPr>
+          <w:rFonts w:ascii="Arial" w:hAnsi="Arial" w:cs="Arial"/>
+          <w:color w:val="000000"/>
+          <w:highlight w:val="lightGray"/>
         </w:rPr>
         <w:t>5.1.2</w:t>
       </w:r>
@@ -3939,39 +3936,25 @@
         <w:rPr>
           <w:rFonts w:ascii="Arial" w:hAnsi="Arial" w:cs="Arial"/>
           <w:color w:val="000000"/>
-          <w:highlight w:val="cyan"/>
+          <w:highlight w:val="lightGray"/>
         </w:rPr>
         <w:tab/>
-        <w:t xml:space="preserve">Los derechos fundamentales de las personas son inviolables. Ante cualquier conflicto </w:t>
-      </w:r>
-      <w:commentRangeStart w:id="8"/>
+      </w:r>
       <w:r>
         <w:rPr>
           <w:rFonts w:ascii="Arial" w:hAnsi="Arial" w:cs="Arial"/>
           <w:color w:val="000000"/>
-          <w:highlight w:val="cyan"/>
-        </w:rPr>
-        <w:t xml:space="preserve">entre un objetivo institucional </w:t>
-      </w:r>
-      <w:commentRangeEnd w:id="8"/>
-      <w:r>
-        <w:rPr>
-          <w:rStyle w:val="Refdecomentario"/>
+          <w:highlight w:val="lightGray"/>
+        </w:rPr>
+        <w:t>Los derechos fundamentales son intangibles y constituyen el límite de toda actuación administrativa. Por ello, cuando exista la posibilidad de que la operación de un SBIA pueda afectar los derechos fundamentales de las personas, se priorizará siempre la protección de éstos últimos.</w:t>
+      </w:r>
+      <w:r>
+        <w:rPr>
           <w:rFonts w:ascii="Arial" w:hAnsi="Arial" w:cs="Arial"/>
           <w:color w:val="000000"/>
-          <w:sz w:val="22"/>
-          <w:szCs w:val="22"/>
-          <w:highlight w:val="cyan"/>
-        </w:rPr>
-        <w:commentReference w:id="8"/>
-      </w:r>
-      <w:r>
-        <w:rPr>
-          <w:rFonts w:ascii="Arial" w:hAnsi="Arial" w:cs="Arial"/>
-          <w:color w:val="000000"/>
-          <w:highlight w:val="cyan"/>
-        </w:rPr>
-        <w:t>y la protección de los derechos de los administrados, prevalece siempre la última.</w:t>
+          <w:highlight w:val="lightGray"/>
+        </w:rPr>
+        <w:t xml:space="preserve"> </w:t>
       </w:r>
     </w:p>
     <w:p>
@@ -4211,7 +4194,16 @@
           <w:bCs w:val="0"/>
           <w:color w:val="000000"/>
         </w:rPr>
-        <w:t>Evaluar los casos de uso de SBIA propuestos por los órganos de línea (generación de valor, viabilidad técnica, legal, ética y operativa, y estimación de inversión y costos recurrentes) y elevar al CGTD la recomendación fundamentada de aprobación o no procedencia.</w:t>
+        <w:t xml:space="preserve">Evaluar los casos de uso de SBIA propuestos por los órganos de línea (generación de valor, viabilidad técnica, legal, ética y operativa, y </w:t>
+      </w:r>
+      <w:r>
+        <w:rPr>
+          <w:b w:val="0"/>
+          <w:bCs w:val="0"/>
+          <w:color w:val="000000"/>
+        </w:rPr>
+        <w:lastRenderedPageBreak/>
+        <w:t>estimación de inversión y costos recurrentes) y elevar al CGTD la recomendación fundamentada de aprobación o no procedencia.</w:t>
       </w:r>
     </w:p>
     <w:p>
@@ -4235,7 +4227,6 @@
           <w:bCs w:val="0"/>
           <w:highlight w:val="cyan"/>
         </w:rPr>
-        <w:lastRenderedPageBreak/>
         <w:t>Proponer al CGTD la clasificación de riesgo de cada SBIA, previo al inicio del desarrollo o adquisición.</w:t>
       </w:r>
     </w:p>
@@ -4959,16 +4950,8 @@
                 <w:bCs w:val="0"/>
                 <w:highlight w:val="yellow"/>
               </w:rPr>
-              <w:t xml:space="preserve">Aprueba la clasificación de riesgo de los SBIA de riesgo alto y de los estratégicos para la entidad, así </w:t>
-            </w:r>
-            <w:r>
-              <w:rPr>
-                <w:b w:val="0"/>
-                <w:bCs w:val="0"/>
-                <w:highlight w:val="yellow"/>
-              </w:rPr>
               <w:lastRenderedPageBreak/>
-              <w:t xml:space="preserve">como los casos de uso y la estrategia de IA. La clasificación de los SBIA de riesgo aceptable la aprueba la Comisión de Gobierno de IA, conforme al numeral 6.2.2. </w:t>
+              <w:t xml:space="preserve">Aprueba la clasificación de riesgo de los SBIA de riesgo alto y de los estratégicos para la entidad, así como los casos de uso y la estrategia de IA. La clasificación de los SBIA de riesgo aceptable la aprueba la Comisión de Gobierno de IA, conforme al numeral 6.2.2. </w:t>
             </w:r>
           </w:p>
           <w:p>
@@ -5596,7 +5579,17 @@
                 <w:color w:val="000000"/>
                 <w:highlight w:val="yellow"/>
               </w:rPr>
-              <w:t>En materia de tratamiento de datos personales: asegura el tratamiento adecuado de los datos personales en el desarrollo, implementación y uso de los SBIA conforme al numeral 6.7.6.</w:t>
+              <w:t xml:space="preserve">En materia de tratamiento de datos personales: asegura el tratamiento adecuado de los datos personales en el desarrollo, implementación y </w:t>
+            </w:r>
+            <w:r>
+              <w:rPr>
+                <w:b w:val="0"/>
+                <w:bCs w:val="0"/>
+                <w:color w:val="000000"/>
+                <w:highlight w:val="yellow"/>
+              </w:rPr>
+              <w:lastRenderedPageBreak/>
+              <w:t>uso de los SBIA conforme al numeral 6.7.6.</w:t>
             </w:r>
           </w:p>
           <w:p>
@@ -5621,17 +5614,7 @@
                 <w:color w:val="000000"/>
                 <w:highlight w:val="yellow"/>
               </w:rPr>
-              <w:t xml:space="preserve">Actúa como enlace con la Autoridad Nacional de Protección de Datos </w:t>
-            </w:r>
-            <w:r>
-              <w:rPr>
-                <w:b w:val="0"/>
-                <w:bCs w:val="0"/>
-                <w:color w:val="000000"/>
-                <w:highlight w:val="yellow"/>
-              </w:rPr>
-              <w:lastRenderedPageBreak/>
-              <w:t>Personales. Emite opinión sobre el tratamiento de datos personales en los casos de uso de IA.</w:t>
+              <w:t>Actúa como enlace con la Autoridad Nacional de Protección de Datos Personales. Emite opinión sobre el tratamiento de datos personales en los casos de uso de IA.</w:t>
             </w:r>
           </w:p>
         </w:tc>
@@ -6059,6 +6042,7 @@
                 <w:bCs w:val="0"/>
                 <w:highlight w:val="yellow"/>
               </w:rPr>
+              <w:lastRenderedPageBreak/>
               <w:t xml:space="preserve">Emite opinión previa sobre contratos con proveedores internacionales de IA. </w:t>
             </w:r>
           </w:p>
@@ -6188,7 +6172,7 @@
                 <w:bCs w:val="0"/>
               </w:rPr>
             </w:pPr>
-            <w:commentRangeStart w:id="9"/>
+            <w:commentRangeStart w:id="7"/>
             <w:r>
               <w:rPr>
                 <w:b w:val="0"/>
@@ -6197,7 +6181,7 @@
               </w:rPr>
               <w:t>Audita los procesos del Sistema de Gestión de Seguridad de la Información que soportan a los SBIA (GSI).</w:t>
             </w:r>
-            <w:commentRangeEnd w:id="9"/>
+            <w:commentRangeEnd w:id="7"/>
             <w:r>
               <w:rPr>
                 <w:rStyle w:val="Refdecomentario"/>
@@ -6206,7 +6190,7 @@
                 <w:sz w:val="22"/>
                 <w:szCs w:val="22"/>
               </w:rPr>
-              <w:commentReference w:id="9"/>
+              <w:commentReference w:id="7"/>
             </w:r>
           </w:p>
           <w:p>
@@ -6663,7 +6647,7 @@
                 <w:rFonts w:ascii="Arial" w:hAnsi="Arial" w:cs="Arial"/>
               </w:rPr>
             </w:pPr>
-            <w:commentRangeStart w:id="10"/>
+            <w:commentRangeStart w:id="8"/>
             <w:r>
               <w:rPr>
                 <w:rFonts w:ascii="Arial" w:eastAsia="Arial" w:hAnsi="Arial" w:cs="Arial"/>
@@ -6672,7 +6656,7 @@
               </w:rPr>
               <w:t>Representante de Negocio</w:t>
             </w:r>
-            <w:commentRangeEnd w:id="10"/>
+            <w:commentRangeEnd w:id="8"/>
             <w:r>
               <w:rPr>
                 <w:rStyle w:val="Refdecomentario"/>
@@ -6680,7 +6664,7 @@
                 <w:sz w:val="22"/>
                 <w:szCs w:val="22"/>
               </w:rPr>
-              <w:commentReference w:id="10"/>
+              <w:commentReference w:id="8"/>
             </w:r>
           </w:p>
         </w:tc>
@@ -6800,6 +6784,7 @@
                 <w:b w:val="0"/>
                 <w:bCs w:val="0"/>
               </w:rPr>
+              <w:lastRenderedPageBreak/>
               <w:t>Participa en la evaluación de los casos de uso desde la perspectiva de negocio.</w:t>
             </w:r>
           </w:p>
@@ -7024,7 +7009,7 @@
           <w:szCs w:val="22"/>
         </w:rPr>
       </w:pPr>
-      <w:bookmarkStart w:id="11" w:name="_Toc235003966"/>
+      <w:bookmarkStart w:id="9" w:name="_Toc235003966"/>
       <w:r>
         <w:rPr>
           <w:rFonts w:cs="Arial"/>
@@ -7034,7 +7019,7 @@
         </w:rPr>
         <w:t>DISPOSICIONES ESPECÍFICAS</w:t>
       </w:r>
-      <w:bookmarkEnd w:id="11"/>
+      <w:bookmarkEnd w:id="9"/>
     </w:p>
     <w:p>
       <w:pPr>
@@ -7434,6 +7419,7 @@
               <w:rPr>
                 <w:rFonts w:ascii="Arial" w:eastAsia="Arial" w:hAnsi="Arial" w:cs="Arial"/>
               </w:rPr>
+              <w:lastRenderedPageBreak/>
               <w:t>2</w:t>
             </w:r>
           </w:p>
@@ -7501,15 +7487,7 @@
                 <w:rFonts w:ascii="Arial" w:eastAsia="Arial" w:hAnsi="Arial" w:cs="Arial"/>
                 <w:highlight w:val="yellow"/>
               </w:rPr>
-              <w:t xml:space="preserve">La Comisión de Gobierno de IA coordina la evaluación técnica, legal, ética y operativa de la iniciativa y propone la clasificación </w:t>
-            </w:r>
-            <w:r>
-              <w:rPr>
-                <w:rFonts w:ascii="Arial" w:eastAsia="Arial" w:hAnsi="Arial" w:cs="Arial"/>
-                <w:highlight w:val="yellow"/>
-              </w:rPr>
-              <w:lastRenderedPageBreak/>
-              <w:t>de riesgo del SBIA, conforme al numeral 6.2.</w:t>
+              <w:t>La Comisión de Gobierno de IA coordina la evaluación técnica, legal, ética y operativa de la iniciativa y propone la clasificación de riesgo del SBIA, conforme al numeral 6.2.</w:t>
             </w:r>
           </w:p>
         </w:tc>
@@ -7542,16 +7520,7 @@
                 <w:rFonts w:ascii="Arial" w:eastAsia="Arial" w:hAnsi="Arial" w:cs="Arial"/>
                 <w:highlight w:val="yellow"/>
               </w:rPr>
-              <w:lastRenderedPageBreak/>
-              <w:t xml:space="preserve">Aprobación de la clasificación de riesgo y de la viabilidad de la </w:t>
-            </w:r>
-            <w:r>
-              <w:rPr>
-                <w:rFonts w:ascii="Arial" w:eastAsia="Arial" w:hAnsi="Arial" w:cs="Arial"/>
-                <w:highlight w:val="yellow"/>
-              </w:rPr>
-              <w:lastRenderedPageBreak/>
-              <w:t>iniciativa, conforme al numeral 6.1.2.</w:t>
+              <w:t>Aprobación de la clasificación de riesgo y de la viabilidad de la iniciativa, conforme al numeral 6.1.2.</w:t>
             </w:r>
           </w:p>
         </w:tc>
@@ -7585,7 +7554,6 @@
               <w:rPr>
                 <w:rFonts w:ascii="Arial" w:eastAsia="Arial" w:hAnsi="Arial" w:cs="Arial"/>
               </w:rPr>
-              <w:lastRenderedPageBreak/>
               <w:t>3</w:t>
             </w:r>
           </w:p>
@@ -7987,6 +7955,7 @@
               <w:rPr>
                 <w:rFonts w:ascii="Arial" w:eastAsia="Arial" w:hAnsi="Arial" w:cs="Arial"/>
               </w:rPr>
+              <w:lastRenderedPageBreak/>
               <w:t>6</w:t>
             </w:r>
           </w:p>
@@ -8121,7 +8090,6 @@
               <w:rPr>
                 <w:rFonts w:ascii="Arial" w:eastAsia="Arial" w:hAnsi="Arial" w:cs="Arial"/>
               </w:rPr>
-              <w:lastRenderedPageBreak/>
               <w:t>7</w:t>
             </w:r>
           </w:p>
@@ -8538,7 +8506,16 @@
           <w:color w:val="000000"/>
           <w:highlight w:val="yellow"/>
         </w:rPr>
-        <w:t>En la evaluación de la generación de valor, el beneficio puede sustentarse a nivel de un conjunto o programa de SBIA cuando la iniciativa forme parte de un portafolio, e incluir beneficios cualitativos y de control de procesos además de los cuantitativos.</w:t>
+        <w:t xml:space="preserve">En la evaluación de la generación de valor, el beneficio puede sustentarse a nivel de un conjunto o programa de SBIA cuando la iniciativa forme parte de un </w:t>
+      </w:r>
+      <w:r>
+        <w:rPr>
+          <w:rFonts w:ascii="Arial" w:eastAsia="Arial" w:hAnsi="Arial" w:cs="Arial"/>
+          <w:color w:val="000000"/>
+          <w:highlight w:val="yellow"/>
+        </w:rPr>
+        <w:lastRenderedPageBreak/>
+        <w:t>portafolio, e incluir beneficios cualitativos y de control de procesos además de los cuantitativos.</w:t>
       </w:r>
     </w:p>
     <w:p>
@@ -8551,7 +8528,7 @@
           <w:color w:val="000000"/>
         </w:rPr>
       </w:pPr>
-      <w:commentRangeStart w:id="12"/>
+      <w:commentRangeStart w:id="10"/>
       <w:r>
         <w:rPr>
           <w:rFonts w:ascii="Arial" w:hAnsi="Arial" w:cs="Arial"/>
@@ -8567,18 +8544,9 @@
           <w:highlight w:val="cyan"/>
         </w:rPr>
         <w:tab/>
-        <w:t xml:space="preserve">La INSI aprueba, con opinión favorable del CGTD, la metodología del ciclo de vida del SBIA previsto en el numeral 6.1.1, conforme a sus competencias y a la METDONI. La metodología comprende, como mínimo: el desarrollo y la </w:t>
-      </w:r>
-      <w:r>
-        <w:rPr>
-          <w:rFonts w:ascii="Arial" w:hAnsi="Arial" w:cs="Arial"/>
-          <w:color w:val="000000"/>
-          <w:highlight w:val="cyan"/>
-        </w:rPr>
-        <w:lastRenderedPageBreak/>
-        <w:t>aplicación de la clasificación de riesgo (Anexo N.° 2) y de la evaluación de impacto algorítmico (Anexo N.° 3), los criterios técnicos de diseño de la arquitectura de los SBIA, el contenido de los entregables de cada etapa, los tipos y las técnicas de prueba aplicables según el nivel de riesgo, los controles de contención, las prácticas de monitoreo y las condiciones de retiro. En tanto no se apruebe, los SBIA siguen el ciclo de vida del numeral 6.1.1 y la normativa de desarrollo de sistemas vigente en la SUNAT.</w:t>
-      </w:r>
-      <w:commentRangeEnd w:id="12"/>
+        <w:t>La INSI aprueba, con opinión favorable del CGTD, la metodología del ciclo de vida del SBIA previsto en el numeral 6.1.1, conforme a sus competencias y a la METDONI. La metodología comprende, como mínimo: el desarrollo y la aplicación de la clasificación de riesgo (Anexo N.° 2) y de la evaluación de impacto algorítmico (Anexo N.° 3), los criterios técnicos de diseño de la arquitectura de los SBIA, el contenido de los entregables de cada etapa, los tipos y las técnicas de prueba aplicables según el nivel de riesgo, los controles de contención, las prácticas de monitoreo y las condiciones de retiro. En tanto no se apruebe, los SBIA siguen el ciclo de vida del numeral 6.1.1 y la normativa de desarrollo de sistemas vigente en la SUNAT.</w:t>
+      </w:r>
+      <w:commentRangeEnd w:id="10"/>
       <w:r>
         <w:rPr>
           <w:rStyle w:val="Refdecomentario"/>
@@ -8587,7 +8555,21 @@
           <w:sz w:val="22"/>
           <w:szCs w:val="22"/>
         </w:rPr>
-        <w:commentReference w:id="12"/>
+        <w:commentReference w:id="10"/>
+      </w:r>
+    </w:p>
+    <w:p>
+      <w:pPr>
+        <w:pStyle w:val="SubtituloDONI"/>
+        <w:spacing w:line="276" w:lineRule="auto"/>
+        <w:ind w:left="851"/>
+      </w:pPr>
+      <w:r>
+        <w:t>6.2</w:t>
+      </w:r>
+      <w:r>
+        <w:tab/>
+        <w:t>De la clasificación de los SBIA por nivel de riesgo</w:t>
       </w:r>
     </w:p>
     <w:p>
@@ -8596,45 +8578,26 @@
         <w:ind w:left="1276" w:hanging="720"/>
         <w:jc w:val="both"/>
         <w:rPr>
+          <w:rFonts w:ascii="Arial" w:eastAsia="Arial" w:hAnsi="Arial" w:cs="Arial"/>
+          <w:color w:val="000000"/>
+        </w:rPr>
+      </w:pPr>
+      <w:r>
+        <w:rPr>
           <w:rFonts w:ascii="Arial" w:hAnsi="Arial" w:cs="Arial"/>
           <w:color w:val="000000"/>
-        </w:rPr>
-      </w:pPr>
-      <w:r>
-        <w:rPr>
-          <w:rFonts w:ascii="Arial" w:eastAsia="Arial" w:hAnsi="Arial" w:cs="Arial"/>
-          <w:color w:val="000000"/>
           <w:highlight w:val="cyan"/>
         </w:rPr>
-        <w:t>6.1.6</w:t>
-      </w:r>
-      <w:r>
-        <w:rPr>
-          <w:rFonts w:ascii="Arial" w:eastAsia="Arial" w:hAnsi="Arial" w:cs="Arial"/>
+        <w:t>6.2.1</w:t>
+      </w:r>
+      <w:r>
+        <w:rPr>
+          <w:rFonts w:ascii="Arial" w:hAnsi="Arial" w:cs="Arial"/>
           <w:color w:val="000000"/>
           <w:highlight w:val="cyan"/>
         </w:rPr>
         <w:tab/>
-      </w:r>
-      <w:commentRangeStart w:id="13"/>
-      <w:r>
-        <w:rPr>
-          <w:rFonts w:ascii="Arial" w:eastAsia="Arial" w:hAnsi="Arial" w:cs="Arial"/>
-          <w:color w:val="000000"/>
-          <w:highlight w:val="cyan"/>
-        </w:rPr>
-        <w:t>Cuando en la formulación del Caso de Negocio de un programa o proyecto institucional, conforme al Modelo de Gobernabilidad de Programas y Proyectos (MGPP), se identifiquen componentes basados en IA, el propietario del caso de uso presenta la Ficha de Evaluación de Caso de Uso (Anexo N.° 4) a la Comisión de Gobierno de IA antes de continuar, para la evaluación del o de los componentes de IA.</w:t>
-      </w:r>
-      <w:commentRangeEnd w:id="13"/>
-      <w:r>
-        <w:rPr>
-          <w:rStyle w:val="Refdecomentario"/>
-          <w:rFonts w:ascii="Arial" w:hAnsi="Arial" w:cs="Arial"/>
-          <w:color w:val="000000"/>
-          <w:sz w:val="22"/>
-          <w:szCs w:val="22"/>
-        </w:rPr>
-        <w:commentReference w:id="13"/>
+        <w:t>La clasificación de riesgo determina, para cada iniciativa o SBIA de la SUNAT, la categoría de riesgo que genera su uso conforme al RLIA: uso indebido (artículo 23), riesgo alto (artículo 24) o riesgo aceptable (numeral 22.2 del artículo 22). El uso indebido deviene en prohibido; por ello, la SUNAT no desarrolla, adquiere, implementa ni opera SBIA cuyo uso sea indebido, y la clasificación los identifica y excluye en la etapa de evaluación de viabilidad, con anterioridad a su desarrollo o adquisición. Para fines operativos de supervisión y monitoreo, el riesgo aceptable se subdivide en dos subniveles internos (aceptable-limitado y aceptable-mínimo), sin constituir una categoría adicional del RLIA. La clasificación y la gestión de los riesgos de los SBIA se alinean a la NTP-ISO 31000 vigente, de uso obligatorio conforme a la Sexta Disposición Complementaria Final del RLIA.</w:t>
       </w:r>
     </w:p>
     <w:p>
@@ -8643,69 +8606,55 @@
         <w:ind w:left="1276" w:hanging="720"/>
         <w:jc w:val="both"/>
         <w:rPr>
-          <w:rFonts w:ascii="Arial" w:hAnsi="Arial" w:cs="Arial"/>
-          <w:color w:val="000000"/>
-        </w:rPr>
-      </w:pPr>
-      <w:r>
-        <w:rPr>
-          <w:rFonts w:ascii="Arial" w:eastAsia="Arial" w:hAnsi="Arial" w:cs="Arial"/>
-          <w:color w:val="000000"/>
+          <w:rFonts w:ascii="Arial" w:eastAsia="Arial" w:hAnsi="Arial" w:cs="Arial"/>
+          <w:color w:val="000000"/>
+        </w:rPr>
+      </w:pPr>
+      <w:r>
+        <w:rPr>
+          <w:rFonts w:ascii="Arial" w:eastAsia="Arial" w:hAnsi="Arial" w:cs="Arial"/>
+          <w:color w:val="000000"/>
+          <w:highlight w:val="yellow"/>
+        </w:rPr>
+        <w:t>6.2.2</w:t>
+      </w:r>
+      <w:r>
+        <w:rPr>
+          <w:rFonts w:ascii="Arial" w:eastAsia="Arial" w:hAnsi="Arial" w:cs="Arial"/>
+          <w:color w:val="000000"/>
+          <w:highlight w:val="yellow"/>
+        </w:rPr>
+        <w:tab/>
+      </w:r>
+      <w:r>
+        <w:rPr>
+          <w:rFonts w:ascii="Arial" w:eastAsia="Arial" w:hAnsi="Arial" w:cs="Arial"/>
           <w:highlight w:val="cyan"/>
         </w:rPr>
-        <w:t>6.1.7</w:t>
-      </w:r>
-      <w:r>
-        <w:rPr>
-          <w:rFonts w:ascii="Arial" w:eastAsia="Arial" w:hAnsi="Arial" w:cs="Arial"/>
-          <w:color w:val="000000"/>
+        <w:t xml:space="preserve">Para la aplicación de la clasificación establecida, la Comisión de Gobierno de IA propone la clasificación de riesgo de las iniciativas que se presentan. </w:t>
+      </w:r>
+      <w:r>
+        <w:rPr>
+          <w:rFonts w:ascii="Arial" w:eastAsia="Arial" w:hAnsi="Arial" w:cs="Arial"/>
+          <w:color w:val="000000"/>
+          <w:highlight w:val="yellow"/>
+        </w:rPr>
+        <w:t xml:space="preserve">La opinión de la OII, en materia de ética, integridad y prevención de sesgos, y la de la INALI, en materia de cumplimiento normativo, constan de manera expresa en la propuesta. El CGTD aprueba la clasificación de las iniciativas de SBIA de riesgo alto y de aquellos estratégicos para la entidad; la Comisión de Gobierno de IA aprueba la clasificación de los SBIA de riesgo aceptable e informa de ello al CGTD. </w:t>
+      </w:r>
+      <w:r>
+        <w:rPr>
+          <w:rFonts w:ascii="Arial" w:eastAsia="Arial" w:hAnsi="Arial" w:cs="Arial"/>
           <w:highlight w:val="cyan"/>
         </w:rPr>
-        <w:tab/>
-        <w:t xml:space="preserve">Cuando una necesidad canalizada a través de la gestión de la demanda informática, conforme al Lineamiento Temporal para la Gestión de la Demanda Informática vigente, comprenda componentes basados en IA, el propietario del caso de uso presenta la </w:t>
-      </w:r>
-      <w:commentRangeStart w:id="14"/>
+        <w:t>La clasificación es parte de la evaluación de viabilidad de acuerdo al ciclo de vida descrito en el 6.1.1.</w:t>
+      </w:r>
       <w:r>
         <w:rPr>
           <w:rFonts w:ascii="Arial" w:eastAsia="Arial" w:hAnsi="Arial" w:cs="Arial"/>
           <w:color w:val="000000"/>
           <w:highlight w:val="cyan"/>
         </w:rPr>
-        <w:t xml:space="preserve">Ficha de Evaluación de Caso de Uso (Anexo N.° 4) </w:t>
-      </w:r>
-      <w:commentRangeEnd w:id="14"/>
-      <w:r>
-        <w:rPr>
-          <w:rStyle w:val="Refdecomentario"/>
-          <w:rFonts w:ascii="Arial" w:eastAsia="Arial" w:hAnsi="Arial" w:cs="Arial"/>
-          <w:color w:val="000000"/>
-          <w:sz w:val="22"/>
-          <w:szCs w:val="22"/>
-          <w:highlight w:val="cyan"/>
-        </w:rPr>
-        <w:commentReference w:id="14"/>
-      </w:r>
-      <w:r>
-        <w:rPr>
-          <w:rFonts w:ascii="Arial" w:eastAsia="Arial" w:hAnsi="Arial" w:cs="Arial"/>
-          <w:color w:val="000000"/>
-          <w:highlight w:val="cyan"/>
-        </w:rPr>
-        <w:t>a la Comisión de Gobierno de IA antes de continuar con su atención, para la evaluación del o de los componentes de IA.</w:t>
-      </w:r>
-    </w:p>
-    <w:p>
-      <w:pPr>
-        <w:pStyle w:val="SubtituloDONI"/>
-        <w:spacing w:line="276" w:lineRule="auto"/>
-        <w:ind w:left="851"/>
-      </w:pPr>
-      <w:r>
-        <w:t>6.2</w:t>
-      </w:r>
-      <w:r>
-        <w:tab/>
-        <w:t>De la clasificación de los SBIA por nivel de riesgo</w:t>
+        <w:t xml:space="preserve"> La clasificación aplica los criterios de la Matriz de Clasificación de Riesgos (Anexo N.° 2); el detalle de su aplicación se desarrolla en la metodología prevista en el numeral 6.1.5.</w:t>
       </w:r>
     </w:p>
     <w:p>
@@ -8720,96 +8669,10 @@
       </w:pPr>
       <w:r>
         <w:rPr>
-          <w:rFonts w:ascii="Arial" w:hAnsi="Arial" w:cs="Arial"/>
-          <w:color w:val="000000"/>
-          <w:highlight w:val="cyan"/>
-        </w:rPr>
-        <w:t>6.2.1</w:t>
-      </w:r>
-      <w:r>
-        <w:rPr>
-          <w:rFonts w:ascii="Arial" w:hAnsi="Arial" w:cs="Arial"/>
-          <w:color w:val="000000"/>
-          <w:highlight w:val="cyan"/>
-        </w:rPr>
-        <w:tab/>
-        <w:t>La clasificación de riesgo determina, para cada iniciativa o SBIA de la SUNAT, la categoría de riesgo que genera su uso conforme al RLIA: uso indebido (artículo 23), riesgo alto (artículo 24) o riesgo aceptable (numeral 22.2 del artículo 22). El uso indebido deviene en prohibido; por ello, la SUNAT no desarrolla, adquiere, implementa ni opera SBIA cuyo uso sea indebido, y la clasificación los identifica y excluye en la etapa de evaluación de viabilidad, con anterioridad a su desarrollo o adquisición. Para fines operativos de supervisión y monitoreo, el riesgo aceptable se subdivide en dos subniveles internos (aceptable-limitado y aceptable-mínimo), sin constituir una categoría adicional del RLIA. La clasificación y la gestión de los riesgos de los SBIA se alinean a la NTP-ISO 31000 vigente, de uso obligatorio conforme a la Sexta Disposición Complementaria Final del RLIA.</w:t>
-      </w:r>
-    </w:p>
-    <w:p>
-      <w:pPr>
-        <w:spacing w:after="60" w:line="276" w:lineRule="auto"/>
-        <w:ind w:left="1276" w:hanging="720"/>
-        <w:jc w:val="both"/>
-        <w:rPr>
-          <w:rFonts w:ascii="Arial" w:eastAsia="Arial" w:hAnsi="Arial" w:cs="Arial"/>
-          <w:color w:val="000000"/>
-        </w:rPr>
-      </w:pPr>
-      <w:r>
-        <w:rPr>
           <w:rFonts w:ascii="Arial" w:eastAsia="Arial" w:hAnsi="Arial" w:cs="Arial"/>
           <w:color w:val="000000"/>
           <w:highlight w:val="yellow"/>
         </w:rPr>
-        <w:t>6.2.2</w:t>
-      </w:r>
-      <w:r>
-        <w:rPr>
-          <w:rFonts w:ascii="Arial" w:eastAsia="Arial" w:hAnsi="Arial" w:cs="Arial"/>
-          <w:color w:val="000000"/>
-          <w:highlight w:val="yellow"/>
-        </w:rPr>
-        <w:tab/>
-      </w:r>
-      <w:r>
-        <w:rPr>
-          <w:rFonts w:ascii="Arial" w:eastAsia="Arial" w:hAnsi="Arial" w:cs="Arial"/>
-          <w:highlight w:val="cyan"/>
-        </w:rPr>
-        <w:t xml:space="preserve">Para la aplicación de la clasificación establecida, la Comisión de Gobierno de IA propone la clasificación de riesgo de las iniciativas que se presentan. </w:t>
-      </w:r>
-      <w:r>
-        <w:rPr>
-          <w:rFonts w:ascii="Arial" w:eastAsia="Arial" w:hAnsi="Arial" w:cs="Arial"/>
-          <w:color w:val="000000"/>
-          <w:highlight w:val="yellow"/>
-        </w:rPr>
-        <w:t xml:space="preserve">La opinión de la OII, en materia de ética, integridad y prevención de sesgos, y la de la INALI, en materia de cumplimiento normativo, constan de manera expresa en la propuesta. El CGTD aprueba la clasificación de las iniciativas de SBIA de riesgo alto y de aquellos estratégicos para la entidad; la Comisión de Gobierno de IA aprueba la clasificación de los SBIA de riesgo aceptable e informa de ello al CGTD. </w:t>
-      </w:r>
-      <w:r>
-        <w:rPr>
-          <w:rFonts w:ascii="Arial" w:eastAsia="Arial" w:hAnsi="Arial" w:cs="Arial"/>
-          <w:highlight w:val="cyan"/>
-        </w:rPr>
-        <w:t>La clasificación es parte de la evaluación de viabilidad de acuerdo al ciclo de vida descrito en el 6.1.1.</w:t>
-      </w:r>
-      <w:r>
-        <w:rPr>
-          <w:rFonts w:ascii="Arial" w:eastAsia="Arial" w:hAnsi="Arial" w:cs="Arial"/>
-          <w:color w:val="000000"/>
-          <w:highlight w:val="cyan"/>
-        </w:rPr>
-        <w:t xml:space="preserve"> La clasificación aplica los criterios de la Matriz de Clasificación de Riesgos (Anexo N.° 2); el detalle de su aplicación se desarrolla en la metodología prevista en el numeral 6.1.5.</w:t>
-      </w:r>
-    </w:p>
-    <w:p>
-      <w:pPr>
-        <w:spacing w:after="60" w:line="276" w:lineRule="auto"/>
-        <w:ind w:left="1276" w:hanging="720"/>
-        <w:jc w:val="both"/>
-        <w:rPr>
-          <w:rFonts w:ascii="Arial" w:eastAsia="Arial" w:hAnsi="Arial" w:cs="Arial"/>
-          <w:color w:val="000000"/>
-        </w:rPr>
-      </w:pPr>
-      <w:r>
-        <w:rPr>
-          <w:rFonts w:ascii="Arial" w:eastAsia="Arial" w:hAnsi="Arial" w:cs="Arial"/>
-          <w:color w:val="000000"/>
-          <w:highlight w:val="yellow"/>
-        </w:rPr>
-        <w:lastRenderedPageBreak/>
         <w:t>6.2.3</w:t>
       </w:r>
       <w:r>
@@ -8835,7 +8698,16 @@
           <w:color w:val="000000"/>
           <w:highlight w:val="yellow"/>
         </w:rPr>
-        <w:t>, conforme al artículo 23 del RLIA. Sin perjuicio de lo señalado en el literal e) del numeral 23.1 del citado artículo, no se consideran de uso indebido los SBIA utilizados para apoyar la evaluación humana sobre la implicación de una persona física en una actividad delictiva, siempre que se basen en hechos objetivos y verificables directamente relacionados con una actividad delictiva ya existente y cuenten con mecanismos de supervisión humana, transparencia y auditabilidad para garantizar la no discriminación y la protección de los derechos fundamentales, conforme al numeral 23.4 del citado artículo.</w:t>
+        <w:t xml:space="preserve">, conforme al artículo 23 del RLIA. Sin perjuicio de lo señalado en el literal e) del numeral 23.1 del citado artículo, no se consideran de uso indebido los SBIA utilizados para apoyar la evaluación humana sobre la implicación de una persona física en una actividad delictiva, siempre que se basen en hechos objetivos y verificables directamente relacionados con una actividad delictiva ya existente y cuenten con mecanismos de supervisión humana, transparencia y auditabilidad para </w:t>
+      </w:r>
+      <w:r>
+        <w:rPr>
+          <w:rFonts w:ascii="Arial" w:eastAsia="Arial" w:hAnsi="Arial" w:cs="Arial"/>
+          <w:color w:val="000000"/>
+          <w:highlight w:val="yellow"/>
+        </w:rPr>
+        <w:lastRenderedPageBreak/>
+        <w:t>garantizar la no discriminación y la protección de los derechos fundamentales, conforme al numeral 23.4 del citado artículo.</w:t>
       </w:r>
     </w:p>
     <w:p>
@@ -9119,7 +8991,6 @@
           <w:szCs w:val="24"/>
           <w:highlight w:val="cyan"/>
         </w:rPr>
-        <w:lastRenderedPageBreak/>
         <w:t>Del diseño, la operación y la seguridad de los SBIA</w:t>
       </w:r>
     </w:p>
@@ -9187,6 +9058,7 @@
           <w:color w:val="000000"/>
           <w:highlight w:val="yellow"/>
         </w:rPr>
+        <w:lastRenderedPageBreak/>
         <w:t>6.5.2</w:t>
       </w:r>
       <w:r>
@@ -9405,16 +9277,7 @@
           <w:color w:val="000000"/>
           <w:highlight w:val="lightGray"/>
         </w:rPr>
-        <w:t xml:space="preserve">La publicación del código fuente de los SBIA financiados con fondos públicos, con licencia libre o abierta en la Plataforma Nacional de Software Público Peruano (PNSSP), se sujeta a la determinación previa de su publicabilidad. Dicha determinación verifica que el código no revele información sujeta a reserva tributaria conforme al artículo 85 del TUO del Código Tributario, información protegida por confidencialidad aduanera, ni reglas de detección de riesgo cuya divulgación comprometa la función de control. La GA, con opinión </w:t>
-      </w:r>
-      <w:r>
-        <w:rPr>
-          <w:rFonts w:ascii="Arial" w:eastAsia="Arial" w:hAnsi="Arial" w:cs="Arial"/>
-          <w:color w:val="000000"/>
-          <w:highlight w:val="lightGray"/>
-        </w:rPr>
-        <w:lastRenderedPageBreak/>
-        <w:t xml:space="preserve">de la INALI y de la Oficina de Seguridad Informática, determina la publicabilidad antes de cada liberación mayor; la GDS ejecuta la publicación cuando corresponda. </w:t>
+        <w:t xml:space="preserve">La publicación del código fuente de los SBIA financiados con fondos públicos, con licencia libre o abierta en la Plataforma Nacional de Software Público Peruano (PNSSP), se sujeta a la determinación previa de su publicabilidad. Dicha determinación verifica que el código no revele información sujeta a reserva tributaria conforme al artículo 85 del TUO del Código Tributario, información protegida por confidencialidad aduanera, ni reglas de detección de riesgo cuya divulgación comprometa la función de control. La GA, con opinión de la INALI y de la Oficina de Seguridad Informática, determina la publicabilidad antes de cada liberación mayor; la GDS ejecuta la publicación cuando corresponda. </w:t>
       </w:r>
     </w:p>
     <w:p>
@@ -9456,7 +9319,16 @@
           <w:highlight w:val="yellow"/>
         </w:rPr>
         <w:tab/>
-        <w:t>Todo SBIA cuenta con un mecanismo de supervisión humana proporcional a su nivel de riesgo. En los SBIA de riesgo alto que intervengan en decisiones con impacto significativo, la supervisión humana es obligatoria; su extensión a los demás SBIA de riesgo alto y a los de riesgo aceptable es una decisión institucional. La correspondencia es la siguiente:</w:t>
+        <w:t xml:space="preserve">Todo SBIA cuenta con un mecanismo de supervisión humana proporcional a su nivel de riesgo. En los SBIA de riesgo alto que intervengan en decisiones </w:t>
+      </w:r>
+      <w:r>
+        <w:rPr>
+          <w:rFonts w:ascii="Arial" w:eastAsia="Arial" w:hAnsi="Arial" w:cs="Arial"/>
+          <w:color w:val="000000"/>
+          <w:highlight w:val="yellow"/>
+        </w:rPr>
+        <w:lastRenderedPageBreak/>
+        <w:t>con impacto significativo, la supervisión humana es obligatoria; su extensión a los demás SBIA de riesgo alto y a los de riesgo aceptable es una decisión institucional. La correspondencia es la siguiente:</w:t>
       </w:r>
     </w:p>
     <w:p>
@@ -9727,7 +9599,6 @@
           <w:rFonts w:ascii="Arial" w:eastAsia="Arial" w:hAnsi="Arial" w:cs="Arial"/>
           <w:color w:val="000000"/>
         </w:rPr>
-        <w:lastRenderedPageBreak/>
         <w:t>6.6.4</w:t>
       </w:r>
       <w:r>
@@ -9783,6 +9654,7 @@
           <w:color w:val="000000"/>
           <w:highlight w:val="cyan"/>
         </w:rPr>
+        <w:lastRenderedPageBreak/>
         <w:t>6.7.1</w:t>
       </w:r>
       <w:r>
@@ -9923,16 +9795,7 @@
           <w:color w:val="000000"/>
           <w:highlight w:val="cyan"/>
         </w:rPr>
-        <w:t xml:space="preserve"> por el Procedimiento para el registro y atención de incidentes y vulnerabilidades de seguridad de la información (A-03.5.1-PR-003). Los incidentes que se presenten durante la operación de un SBIA en producción y que no constituyan incidentes de seguridad de la información se atienden conforme al Procedimiento de Gestión </w:t>
-      </w:r>
-      <w:r>
-        <w:rPr>
-          <w:rFonts w:ascii="Arial" w:eastAsia="Arial" w:hAnsi="Arial" w:cs="Arial"/>
-          <w:color w:val="000000"/>
-          <w:highlight w:val="cyan"/>
-        </w:rPr>
-        <w:lastRenderedPageBreak/>
-        <w:t>de Incidentes (A-03.1.1-PR-002). El propietario del caso de uso y las gerencias competentes de la INSI comunican los incidentes del uso y funcionamiento del SBIA por los canales que dichos procedimientos establecen; la Comisión de Gobierno de IA los consolida y los reporta en el informe trimestral del numeral 6.9.5.</w:t>
+        <w:t xml:space="preserve"> por el Procedimiento para el registro y atención de incidentes y vulnerabilidades de seguridad de la información (A-03.5.1-PR-003). Los incidentes que se presenten durante la operación de un SBIA en producción y que no constituyan incidentes de seguridad de la información se atienden conforme al Procedimiento de Gestión de Incidentes (A-03.1.1-PR-002). El propietario del caso de uso y las gerencias competentes de la INSI comunican los incidentes del uso y funcionamiento del SBIA por los canales que dichos procedimientos establecen; la Comisión de Gobierno de IA los consolida y los reporta en el informe trimestral del numeral 6.9.5.</w:t>
       </w:r>
     </w:p>
     <w:p>
@@ -9960,7 +9823,16 @@
           <w:highlight w:val="yellow"/>
         </w:rPr>
         <w:tab/>
-        <w:t>El Oficial de Datos Personales (ODP) asegura que en el desarrollo, la implementación y el uso de los SBIA se realice un tratamiento adecuado de los datos personales</w:t>
+        <w:t xml:space="preserve">El Oficial de Datos Personales (ODP) asegura que en el desarrollo, la implementación y el uso de los SBIA se realice un tratamiento adecuado de los </w:t>
+      </w:r>
+      <w:r>
+        <w:rPr>
+          <w:rFonts w:ascii="Arial" w:eastAsia="Arial" w:hAnsi="Arial" w:cs="Arial"/>
+          <w:color w:val="000000"/>
+          <w:highlight w:val="yellow"/>
+        </w:rPr>
+        <w:lastRenderedPageBreak/>
+        <w:t>datos personales</w:t>
       </w:r>
       <w:r>
         <w:rPr>
@@ -10245,16 +10117,7 @@
           <w:color w:val="000000"/>
           <w:highlight w:val="lightGray"/>
         </w:rPr>
-        <w:t xml:space="preserve">Los conjuntos de datos que la SUNAT genere o administre y que califiquen como datos de alto valor se ponen a disposición a través del Centro Nacional de Datos (CND), previa determinación de su publicabilidad conforme al artículo 85 del TUO del Código Tributario y a la normativa de protección de datos </w:t>
-      </w:r>
-      <w:r>
-        <w:rPr>
-          <w:rFonts w:ascii="Arial" w:eastAsia="Arial" w:hAnsi="Arial" w:cs="Arial"/>
-          <w:color w:val="000000"/>
-          <w:highlight w:val="lightGray"/>
-        </w:rPr>
-        <w:lastRenderedPageBreak/>
-        <w:t>personales. El OGD identifica los conjuntos candidatos y propone al CGTD su publicación.</w:t>
+        <w:t>Los conjuntos de datos que la SUNAT genere o administre y que califiquen como datos de alto valor se ponen a disposición a través del Centro Nacional de Datos (CND), previa determinación de su publicabilidad conforme al artículo 85 del TUO del Código Tributario y a la normativa de protección de datos personales. El OGD identifica los conjuntos candidatos y propone al CGTD su publicación.</w:t>
       </w:r>
     </w:p>
     <w:p>
@@ -10321,7 +10184,16 @@
           <w:highlight w:val="yellow"/>
         </w:rPr>
         <w:tab/>
-        <w:t>Los SBIA de riesgo alto cuentan con mecanismos de transparencia algorítmica que informan al usuario, de forma previa, clara y sencilla, la finalidad o uso del SBIA, sus funcionalidades principales y el tipo de decisiones que puede tomar, de modo que comprenda cómo interactúa con el SBIA o con el servicio que lo emplea</w:t>
+        <w:t xml:space="preserve">Los SBIA de riesgo alto cuentan con mecanismos de transparencia algorítmica que informan al usuario, de forma previa, clara y sencilla, la finalidad o uso del </w:t>
+      </w:r>
+      <w:r>
+        <w:rPr>
+          <w:rFonts w:ascii="Arial" w:eastAsia="Arial" w:hAnsi="Arial" w:cs="Arial"/>
+          <w:color w:val="000000"/>
+          <w:highlight w:val="yellow"/>
+        </w:rPr>
+        <w:lastRenderedPageBreak/>
+        <w:t>SBIA, sus funcionalidades principales y el tipo de decisiones que puede tomar, de modo que comprenda cómo interactúa con el SBIA o con el servicio que lo emplea</w:t>
       </w:r>
       <w:r>
         <w:rPr>
@@ -10539,7 +10411,6 @@
         <w:ind w:left="851"/>
       </w:pPr>
       <w:r>
-        <w:lastRenderedPageBreak/>
         <w:t>6.10</w:t>
       </w:r>
       <w:r>
@@ -10622,6 +10493,7 @@
           <w:color w:val="000000"/>
           <w:highlight w:val="yellow"/>
         </w:rPr>
+        <w:lastRenderedPageBreak/>
         <w:t>Riesgo aceptable-limitado: revisión mensual de indicadores y revisión integral semestral.</w:t>
       </w:r>
     </w:p>
@@ -10910,7 +10782,6 @@
           <w:color w:val="000000"/>
           <w:highlight w:val="cyan"/>
         </w:rPr>
-        <w:lastRenderedPageBreak/>
         <w:t>No utilizar herramientas de IA externas que no figuren en el catálogo institucional.</w:t>
       </w:r>
     </w:p>
@@ -10980,6 +10851,7 @@
           <w:bCs w:val="0"/>
           <w:color w:val="000000"/>
         </w:rPr>
+        <w:lastRenderedPageBreak/>
         <w:t>No utilizar herramientas de IA para eludir controles internos o procedimientos establecidos.</w:t>
       </w:r>
     </w:p>
@@ -11149,7 +11021,6 @@
           <w:rFonts w:ascii="Arial" w:eastAsia="Arial" w:hAnsi="Arial" w:cs="Arial"/>
           <w:color w:val="000000"/>
         </w:rPr>
-        <w:lastRenderedPageBreak/>
         <w:t>6.12.1</w:t>
       </w:r>
       <w:r>
@@ -11186,7 +11057,16 @@
           <w:highlight w:val="yellow"/>
         </w:rPr>
         <w:tab/>
-        <w:t>Los contratos incluyen cláusulas sobre: (a) protección de datos y reserva tributaria; (b) transparencia del modelo; (c) comunicación de vulnerabilidades e incidentes; (d) derecho de auditoría, incluida la realización de auditorías éticas y de sesgo sobre el modelo; (e) transferencia de conocimiento; (f) cumplimiento de estándares técnicos. El plazo de notificación de vulnerabilidades se define en los TDR o EETT de cada contratación, según la criticidad del SBIA.</w:t>
+        <w:t xml:space="preserve">Los contratos incluyen cláusulas sobre: (a) protección de datos y reserva tributaria; (b) transparencia del modelo; (c) comunicación de vulnerabilidades e incidentes; (d) derecho de auditoría, incluida la realización de auditorías éticas </w:t>
+      </w:r>
+      <w:r>
+        <w:rPr>
+          <w:rFonts w:ascii="Arial" w:eastAsia="Arial" w:hAnsi="Arial" w:cs="Arial"/>
+          <w:color w:val="000000"/>
+          <w:highlight w:val="yellow"/>
+        </w:rPr>
+        <w:lastRenderedPageBreak/>
+        <w:t>y de sesgo sobre el modelo; (e) transferencia de conocimiento; (f) cumplimiento de estándares técnicos. El plazo de notificación de vulnerabilidades se define en los TDR o EETT de cada contratación, según la criticidad del SBIA.</w:t>
       </w:r>
     </w:p>
     <w:p>
@@ -11491,7 +11371,6 @@
           <w:color w:val="000000"/>
           <w:highlight w:val="lightGray"/>
         </w:rPr>
-        <w:lastRenderedPageBreak/>
         <w:t>La protección de la reserva tributaria, secreto comercial y demás obligaciones de confidencialidad aplicables.</w:t>
       </w:r>
     </w:p>
@@ -11538,7 +11417,16 @@
           <w:color w:val="000000"/>
           <w:highlight w:val="lightGray"/>
         </w:rPr>
-        <w:t>Esta disposición incorpora los requerimientos establecidos en el numeral 28.9 del artículo 28 del Reglamento y adopta medidas adicionales de sensibilización orientadas a promover el uso seguro, responsable y ético de los sistemas basados en IA, en concordancia con el numeral 7.3 de la NTP-ISO/IEC 42001:2025.</w:t>
+        <w:t xml:space="preserve">Esta disposición incorpora los requerimientos establecidos en el numeral 28.9 del artículo 28 del Reglamento y adopta medidas adicionales de sensibilización </w:t>
+      </w:r>
+      <w:r>
+        <w:rPr>
+          <w:rFonts w:ascii="Arial" w:eastAsia="Arial" w:hAnsi="Arial" w:cs="Arial"/>
+          <w:color w:val="000000"/>
+          <w:highlight w:val="lightGray"/>
+        </w:rPr>
+        <w:lastRenderedPageBreak/>
+        <w:t>orientadas a promover el uso seguro, responsable y ético de los sistemas basados en IA, en concordancia con el numeral 7.3 de la NTP-ISO/IEC 42001:2025.</w:t>
       </w:r>
     </w:p>
     <w:p>
@@ -11898,7 +11786,6 @@
         <w:rPr>
           <w:highlight w:val="yellow"/>
         </w:rPr>
-        <w:lastRenderedPageBreak/>
         <w:t>6.14</w:t>
       </w:r>
       <w:r>
@@ -11938,7 +11825,16 @@
           <w:highlight w:val="yellow"/>
         </w:rPr>
         <w:tab/>
-        <w:t>En el desarrollo, la implementación y el uso de los SBIA, la SUNAT promueve la participación de equipos diversos y multidisciplinarios, garantiza el pleno respeto de los derechos humanos y evita que se generen resultados injustos o discriminatorios, considera el impacto social y ambiental, e implementa las mejores prácticas, estándares y normas técnicas para identificar y minimizar los sesgos de los algoritmos y de las bases de datos utilizados</w:t>
+        <w:t xml:space="preserve">En el desarrollo, la implementación y el uso de los SBIA, la SUNAT promueve la participación de equipos diversos y multidisciplinarios, garantiza el pleno respeto de los derechos humanos y evita que se generen resultados injustos o </w:t>
+      </w:r>
+      <w:r>
+        <w:rPr>
+          <w:rFonts w:ascii="Arial" w:eastAsia="Arial" w:hAnsi="Arial" w:cs="Arial"/>
+          <w:color w:val="000000"/>
+          <w:highlight w:val="yellow"/>
+        </w:rPr>
+        <w:lastRenderedPageBreak/>
+        <w:t>discriminatorios, considera el impacto social y ambiental, e implementa las mejores prácticas, estándares y normas técnicas para identificar y minimizar los sesgos de los algoritmos y de las bases de datos utilizados</w:t>
       </w:r>
       <w:r>
         <w:rPr>
@@ -12157,7 +12053,6 @@
         <w:rPr>
           <w:highlight w:val="lightGray"/>
         </w:rPr>
-        <w:lastRenderedPageBreak/>
         <w:t>6.15.5 Las unidades competentes de cada instrumento incorporan en sus metodologías o procedimientos la verificación del componente de IA y la opinión de la Comisión, según sus competencias y sin afectar los sistemas administrativos del Estado, conforme al numeral 7.6</w:t>
       </w:r>
       <w:r>
@@ -12173,7 +12068,7 @@
           <w:szCs w:val="22"/>
         </w:rPr>
       </w:pPr>
-      <w:bookmarkStart w:id="15" w:name="_Toc235003967"/>
+      <w:bookmarkStart w:id="11" w:name="_Toc235003967"/>
       <w:r>
         <w:rPr>
           <w:rFonts w:cs="Arial"/>
@@ -12184,7 +12079,7 @@
         <w:lastRenderedPageBreak/>
         <w:t>DISPOSICIONES FINALES</w:t>
       </w:r>
-      <w:bookmarkEnd w:id="15"/>
+      <w:bookmarkEnd w:id="11"/>
     </w:p>
     <w:p>
       <w:pPr>
@@ -12533,7 +12428,7 @@
           <w:szCs w:val="22"/>
         </w:rPr>
       </w:pPr>
-      <w:bookmarkStart w:id="16" w:name="_Toc235003968"/>
+      <w:bookmarkStart w:id="12" w:name="_Toc235003968"/>
       <w:r>
         <w:rPr>
           <w:rFonts w:cs="Arial"/>
@@ -12543,7 +12438,7 @@
         </w:rPr>
         <w:t>ANEXOS</w:t>
       </w:r>
-      <w:bookmarkEnd w:id="16"/>
+      <w:bookmarkEnd w:id="12"/>
     </w:p>
     <w:p>
       <w:pPr>
@@ -16679,7 +16574,7 @@
 
 <file path=word/comments.xml><?xml version="1.0" encoding="utf-8"?>
 <w:comments xmlns:wpc="http://schemas.microsoft.com/office/word/2010/wordprocessingCanvas" xmlns:cx="http://schemas.microsoft.com/office/drawing/2014/chartex" xmlns:cx1="http://schemas.microsoft.com/office/drawing/2015/9/8/chartex" xmlns:cx2="http://schemas.microsoft.com/office/drawing/2015/10/21/chartex" xmlns:cx3="http://schemas.microsoft.com/office/drawing/2016/5/9/chartex" xmlns:cx4="http://schemas.microsoft.com/office/drawing/2016/5/10/chartex" xmlns:cx5="http://schemas.microsoft.com/office/drawing/2016/5/11/chartex" xmlns:cx6="http://schemas.microsoft.com/office/drawing/2016/5/12/chartex" xmlns:cx7="http://schemas.microsoft.com/office/drawing/2016/5/13/chartex" xmlns:cx8="http://schemas.microsoft.com/office/drawing/2016/5/14/chartex" xmlns:mc="http://schemas.openxmlformats.org/markup-compatibility/2006" xmlns:aink="http://schemas.microsoft.com/office/drawing/2016/ink" xmlns:am3d="http://schemas.microsoft.com/office/drawing/2017/model3d" xmlns:o="urn:schemas-microsoft-com:office:office" xmlns:oel="http://schemas.microsoft.com/office/2019/extlst" xmlns:r="http://schemas.openxmlformats.org/officeDocument/2006/relationships" xmlns:m="http://schemas.openxmlformats.org/officeDocument/2006/math" xmlns:v="urn:schemas-microsoft-com:vml" xmlns:wp14="http://schemas.microsoft.com/office/word/2010/wordprocessingDrawing" xmlns:wp="http://schemas.openxmlformats.org/drawingml/2006/wordprocessingDrawing" xmlns:w10="urn:schemas-microsoft-com:office:word" xmlns:w="http://schemas.openxmlformats.org/wordprocessingml/2006/main" xmlns:w14="http://schemas.microsoft.com/office/word/2010/wordml" xmlns:w15="http://schemas.microsoft.com/office/word/2012/wordml" xmlns:w16cex="http://schemas.microsoft.com/office/word/2018/wordml/cex" xmlns:w16cid="http://schemas.microsoft.com/office/word/2016/wordml/cid" xmlns:w16="http://schemas.microsoft.com/office/word/2018/wordml" xmlns:w16du="http://schemas.microsoft.com/office/word/2023/wordml/word16du" xmlns:w16sdtdh="http://schemas.microsoft.com/office/word/2020/wordml/sdtdatahash" xmlns:w16sdtfl="http://schemas.microsoft.com/office/word/2024/wordml/sdtformatlock" xmlns:w16se="http://schemas.microsoft.com/office/word/2015/wordml/symex" xmlns:wpg="http://schemas.microsoft.com/office/word/2010/wordprocessingGroup" xmlns:wpi="http://schemas.microsoft.com/office/word/2010/wordprocessingInk" xmlns:wne="http://schemas.microsoft.com/office/word/2006/wordml" xmlns:wps="http://schemas.microsoft.com/office/word/2010/wordprocessingShape" mc:Ignorable="w14 w15 w16se w16cid w16 w16cex w16sdtdh w16sdtfl w16du wp14">
-  <w:comment w:id="3" w:author="Kut Castro Mario Fernando" w:date="2026-07-21T11:12:00Z" w:initials="MK">
+  <w:comment w:id="5" w:author="Kut Castro Mario Fernando" w:date="2026-07-21T11:14:00Z" w:initials="MK">
     <w:p>
       <w:pPr>
         <w:pStyle w:val="Textocomentario"/>
@@ -16691,11 +16586,11 @@
         <w:annotationRef/>
       </w:r>
       <w:r>
-        <w:t>Confirmar con INALI.</w:t>
+        <w:t>Alinearlo de acuerdo al ROF referente a la competencia de formular iniciativas de SBIA, (unidades normativas de negocio y las unidades administrativas, TI), revisar competencias.</w:t>
       </w:r>
     </w:p>
   </w:comment>
-  <w:comment w:id="6" w:author="Kut Castro Mario Fernando" w:date="2026-07-21T11:14:00Z" w:initials="MK">
+  <w:comment w:id="7" w:author="Kut Castro Mario Fernando" w:date="2026-07-21T11:30:00Z" w:initials="MK">
     <w:p>
       <w:pPr>
         <w:pStyle w:val="Textocomentario"/>
@@ -16707,11 +16602,11 @@
         <w:annotationRef/>
       </w:r>
       <w:r>
-        <w:t>Alinearlo de acuerdo al ROF referente a la competencia de formular iniciativas de SBIA, (unidades normativas de negocio y las unidades administrativas, TI), revisar competencias.</w:t>
+        <w:t xml:space="preserve">Revisar </w:t>
       </w:r>
     </w:p>
   </w:comment>
-  <w:comment w:id="8" w:author="Kut Castro Mario Fernando" w:date="2026-07-21T11:18:00Z" w:initials="MK">
+  <w:comment w:id="8" w:author="Kut Castro Mario Fernando" w:date="2026-07-21T11:27:00Z" w:initials="MK">
     <w:p>
       <w:pPr>
         <w:pStyle w:val="Textocomentario"/>
@@ -16723,11 +16618,11 @@
         <w:annotationRef/>
       </w:r>
       <w:r>
-        <w:t>Formularlo de otra forma.</w:t>
+        <w:t>Representantes INGP, INER, INDIA, (Para revisión del ROF), a evaluar.</w:t>
       </w:r>
     </w:p>
   </w:comment>
-  <w:comment w:id="9" w:author="Kut Castro Mario Fernando" w:date="2026-07-21T11:30:00Z" w:initials="MK">
+  <w:comment w:id="10" w:author="Kut Castro Mario Fernando" w:date="2026-07-21T11:40:00Z" w:initials="MK">
     <w:p>
       <w:pPr>
         <w:pStyle w:val="Textocomentario"/>
@@ -16739,71 +16634,7 @@
         <w:annotationRef/>
       </w:r>
       <w:r>
-        <w:t xml:space="preserve">Revisar </w:t>
-      </w:r>
-    </w:p>
-  </w:comment>
-  <w:comment w:id="10" w:author="Kut Castro Mario Fernando" w:date="2026-07-21T11:27:00Z" w:initials="MK">
-    <w:p>
-      <w:pPr>
-        <w:pStyle w:val="Textocomentario"/>
-      </w:pPr>
-      <w:r>
-        <w:rPr>
-          <w:rStyle w:val="Refdecomentario"/>
-        </w:rPr>
-        <w:annotationRef/>
-      </w:r>
-      <w:r>
-        <w:t>Representantes INGP, INER, INDIA, (Para revisión del ROF), a evaluar.</w:t>
-      </w:r>
-    </w:p>
-  </w:comment>
-  <w:comment w:id="12" w:author="Kut Castro Mario Fernando" w:date="2026-07-21T11:40:00Z" w:initials="MK">
-    <w:p>
-      <w:pPr>
-        <w:pStyle w:val="Textocomentario"/>
-      </w:pPr>
-      <w:r>
-        <w:rPr>
-          <w:rStyle w:val="Refdecomentario"/>
-        </w:rPr>
-        <w:annotationRef/>
-      </w:r>
-      <w:r>
         <w:t>Analizar bajo METDONI.</w:t>
-      </w:r>
-    </w:p>
-  </w:comment>
-  <w:comment w:id="13" w:author="Kut Castro Mario Fernando" w:date="2026-07-21T11:47:00Z" w:initials="MK">
-    <w:p>
-      <w:pPr>
-        <w:pStyle w:val="Textocomentario"/>
-      </w:pPr>
-      <w:r>
-        <w:rPr>
-          <w:rStyle w:val="Refdecomentario"/>
-        </w:rPr>
-        <w:annotationRef/>
-      </w:r>
-      <w:r>
-        <w:t>Revisión del equipo.</w:t>
-      </w:r>
-    </w:p>
-  </w:comment>
-  <w:comment w:id="14" w:author="Kut Castro Mario Fernando" w:date="2026-07-21T12:00:00Z" w:initials="MK">
-    <w:p>
-      <w:pPr>
-        <w:pStyle w:val="Textocomentario"/>
-      </w:pPr>
-      <w:r>
-        <w:rPr>
-          <w:rStyle w:val="Refdecomentario"/>
-        </w:rPr>
-        <w:annotationRef/>
-      </w:r>
-      <w:r>
-        <w:t>Evaluar matiz para este tipo de requerimiento.</w:t>
       </w:r>
     </w:p>
   </w:comment>
@@ -16812,40 +16643,28 @@
 
 <file path=word/commentsExtended.xml><?xml version="1.0" encoding="utf-8"?>
 <w15:commentsEx xmlns:wpc="http://schemas.microsoft.com/office/word/2010/wordprocessingCanvas" xmlns:cx="http://schemas.microsoft.com/office/drawing/2014/chartex" xmlns:cx1="http://schemas.microsoft.com/office/drawing/2015/9/8/chartex" xmlns:cx2="http://schemas.microsoft.com/office/drawing/2015/10/21/chartex" xmlns:cx3="http://schemas.microsoft.com/office/drawing/2016/5/9/chartex" xmlns:cx4="http://schemas.microsoft.com/office/drawing/2016/5/10/chartex" xmlns:cx5="http://schemas.microsoft.com/office/drawing/2016/5/11/chartex" xmlns:cx6="http://schemas.microsoft.com/office/drawing/2016/5/12/chartex" xmlns:cx7="http://schemas.microsoft.com/office/drawing/2016/5/13/chartex" xmlns:cx8="http://schemas.microsoft.com/office/drawing/2016/5/14/chartex" xmlns:mc="http://schemas.openxmlformats.org/markup-compatibility/2006" xmlns:aink="http://schemas.microsoft.com/office/drawing/2016/ink" xmlns:am3d="http://schemas.microsoft.com/office/drawing/2017/model3d" xmlns:o="urn:schemas-microsoft-com:office:office" xmlns:oel="http://schemas.microsoft.com/office/2019/extlst" xmlns:r="http://schemas.openxmlformats.org/officeDocument/2006/relationships" xmlns:m="http://schemas.openxmlformats.org/officeDocument/2006/math" xmlns:v="urn:schemas-microsoft-com:vml" xmlns:wp14="http://schemas.microsoft.com/office/word/2010/wordprocessingDrawing" xmlns:wp="http://schemas.openxmlformats.org/drawingml/2006/wordprocessingDrawing" xmlns:w10="urn:schemas-microsoft-com:office:word" xmlns:w="http://schemas.openxmlformats.org/wordprocessingml/2006/main" xmlns:w14="http://schemas.microsoft.com/office/word/2010/wordml" xmlns:w15="http://schemas.microsoft.com/office/word/2012/wordml" xmlns:w16cex="http://schemas.microsoft.com/office/word/2018/wordml/cex" xmlns:w16cid="http://schemas.microsoft.com/office/word/2016/wordml/cid" xmlns:w16="http://schemas.microsoft.com/office/word/2018/wordml" xmlns:w16du="http://schemas.microsoft.com/office/word/2023/wordml/word16du" xmlns:w16sdtdh="http://schemas.microsoft.com/office/word/2020/wordml/sdtdatahash" xmlns:w16sdtfl="http://schemas.microsoft.com/office/word/2024/wordml/sdtformatlock" xmlns:w16se="http://schemas.microsoft.com/office/word/2015/wordml/symex" xmlns:wpg="http://schemas.microsoft.com/office/word/2010/wordprocessingGroup" xmlns:wpi="http://schemas.microsoft.com/office/word/2010/wordprocessingInk" xmlns:wne="http://schemas.microsoft.com/office/word/2006/wordml" xmlns:wps="http://schemas.microsoft.com/office/word/2010/wordprocessingShape" mc:Ignorable="w14 w15 w16se w16cid w16 w16cex w16sdtdh w16sdtfl w16du wp14">
-  <w15:commentEx w15:paraId="2B7A375D" w15:done="0"/>
   <w15:commentEx w15:paraId="1304144C" w15:done="0"/>
-  <w15:commentEx w15:paraId="33AB0D5A" w15:done="0"/>
   <w15:commentEx w15:paraId="3C0FED1C" w15:done="0"/>
   <w15:commentEx w15:paraId="2EB03F52" w15:done="0"/>
   <w15:commentEx w15:paraId="7A362A96" w15:done="0"/>
-  <w15:commentEx w15:paraId="32D4CC42" w15:done="0"/>
-  <w15:commentEx w15:paraId="152D4D06" w15:done="0"/>
 </w15:commentsEx>
 </file>
 
 <file path=word/commentsExtensible.xml><?xml version="1.0" encoding="utf-8"?>
 <w16cex:commentsExtensible xmlns:wpc="http://schemas.microsoft.com/office/word/2010/wordprocessingCanvas" xmlns:cx="http://schemas.microsoft.com/office/drawing/2014/chartex" xmlns:cx1="http://schemas.microsoft.com/office/drawing/2015/9/8/chartex" xmlns:cx2="http://schemas.microsoft.com/office/drawing/2015/10/21/chartex" xmlns:cx3="http://schemas.microsoft.com/office/drawing/2016/5/9/chartex" xmlns:cx4="http://schemas.microsoft.com/office/drawing/2016/5/10/chartex" xmlns:cx5="http://schemas.microsoft.com/office/drawing/2016/5/11/chartex" xmlns:cx6="http://schemas.microsoft.com/office/drawing/2016/5/12/chartex" xmlns:cx7="http://schemas.microsoft.com/office/drawing/2016/5/13/chartex" xmlns:cx8="http://schemas.microsoft.com/office/drawing/2016/5/14/chartex" xmlns:cr="http://schemas.microsoft.com/office/comments/2020/reactions" xmlns:mc="http://schemas.openxmlformats.org/markup-compatibility/2006" xmlns:aink="http://schemas.microsoft.com/office/drawing/2016/ink" xmlns:am3d="http://schemas.microsoft.com/office/drawing/2017/model3d" xmlns:o="urn:schemas-microsoft-com:office:office" xmlns:oel="http://schemas.microsoft.com/office/2019/extlst" xmlns:r="http://schemas.openxmlformats.org/officeDocument/2006/relationships" xmlns:m="http://schemas.openxmlformats.org/officeDocument/2006/math" xmlns:v="urn:schemas-microsoft-com:vml" xmlns:wp14="http://schemas.microsoft.com/office/word/2010/wordprocessingDrawing" xmlns:wp="http://schemas.openxmlformats.org/drawingml/2006/wordprocessingDrawing" xmlns:w10="urn:schemas-microsoft-com:office:word" xmlns:w="http://schemas.openxmlformats.org/wordprocessingml/2006/main" xmlns:w14="http://schemas.microsoft.com/office/word/2010/wordml" xmlns:w15="http://schemas.microsoft.com/office/word/2012/wordml" xmlns:w16cex="http://schemas.microsoft.com/office/word/2018/wordml/cex" xmlns:w16cid="http://schemas.microsoft.com/office/word/2016/wordml/cid" xmlns:w16="http://schemas.microsoft.com/office/word/2018/wordml" xmlns:w16du="http://schemas.microsoft.com/office/word/2023/wordml/word16du" xmlns:w16sdtdh="http://schemas.microsoft.com/office/word/2020/wordml/sdtdatahash" xmlns:w16sdtfl="http://schemas.microsoft.com/office/word/2024/wordml/sdtformatlock" xmlns:w16se="http://schemas.microsoft.com/office/word/2015/wordml/symex" xmlns:wpg="http://schemas.microsoft.com/office/word/2010/wordprocessingGroup" xmlns:wpi="http://schemas.microsoft.com/office/word/2010/wordprocessingInk" xmlns:wne="http://schemas.microsoft.com/office/word/2006/wordml" xmlns:wps="http://schemas.microsoft.com/office/word/2010/wordprocessingShape" mc:Ignorable="w14 w15 w16se w16cid w16 w16cex w16sdtdh w16sdtfl cr w16du wp14">
-  <w16cex:commentExtensible w16cex:durableId="27A6C15E" w16cex:dateUtc="2026-07-21T16:12:00Z"/>
   <w16cex:commentExtensible w16cex:durableId="74BA2796" w16cex:dateUtc="2026-07-21T16:14:00Z"/>
-  <w16cex:commentExtensible w16cex:durableId="67902DDB" w16cex:dateUtc="2026-07-21T16:18:00Z"/>
   <w16cex:commentExtensible w16cex:durableId="6387E4DA" w16cex:dateUtc="2026-07-21T16:30:00Z"/>
   <w16cex:commentExtensible w16cex:durableId="2C51B84E" w16cex:dateUtc="2026-07-21T16:27:00Z"/>
   <w16cex:commentExtensible w16cex:durableId="29EDEAD0" w16cex:dateUtc="2026-07-21T16:40:00Z"/>
-  <w16cex:commentExtensible w16cex:durableId="472286C5" w16cex:dateUtc="2026-07-21T16:47:00Z"/>
-  <w16cex:commentExtensible w16cex:durableId="0734D94E" w16cex:dateUtc="2026-07-21T17:00:00Z"/>
 </w16cex:commentsExtensible>
 </file>
 
 <file path=word/commentsIds.xml><?xml version="1.0" encoding="utf-8"?>
 <w16cid:commentsIds xmlns:wpc="http://schemas.microsoft.com/office/word/2010/wordprocessingCanvas" xmlns:cx="http://schemas.microsoft.com/office/drawing/2014/chartex" xmlns:cx1="http://schemas.microsoft.com/office/drawing/2015/9/8/chartex" xmlns:cx2="http://schemas.microsoft.com/office/drawing/2015/10/21/chartex" xmlns:cx3="http://schemas.microsoft.com/office/drawing/2016/5/9/chartex" xmlns:cx4="http://schemas.microsoft.com/office/drawing/2016/5/10/chartex" xmlns:cx5="http://schemas.microsoft.com/office/drawing/2016/5/11/chartex" xmlns:cx6="http://schemas.microsoft.com/office/drawing/2016/5/12/chartex" xmlns:cx7="http://schemas.microsoft.com/office/drawing/2016/5/13/chartex" xmlns:cx8="http://schemas.microsoft.com/office/drawing/2016/5/14/chartex" xmlns:mc="http://schemas.openxmlformats.org/markup-compatibility/2006" xmlns:aink="http://schemas.microsoft.com/office/drawing/2016/ink" xmlns:am3d="http://schemas.microsoft.com/office/drawing/2017/model3d" xmlns:o="urn:schemas-microsoft-com:office:office" xmlns:oel="http://schemas.microsoft.com/office/2019/extlst" xmlns:r="http://schemas.openxmlformats.org/officeDocument/2006/relationships" xmlns:m="http://schemas.openxmlformats.org/officeDocument/2006/math" xmlns:v="urn:schemas-microsoft-com:vml" xmlns:wp14="http://schemas.microsoft.com/office/word/2010/wordprocessingDrawing" xmlns:wp="http://schemas.openxmlformats.org/drawingml/2006/wordprocessingDrawing" xmlns:w10="urn:schemas-microsoft-com:office:word" xmlns:w="http://schemas.openxmlformats.org/wordprocessingml/2006/main" xmlns:w14="http://schemas.microsoft.com/office/word/2010/wordml" xmlns:w15="http://schemas.microsoft.com/office/word/2012/wordml" xmlns:w16cex="http://schemas.microsoft.com/office/word/2018/wordml/cex" xmlns:w16cid="http://schemas.microsoft.com/office/word/2016/wordml/cid" xmlns:w16="http://schemas.microsoft.com/office/word/2018/wordml" xmlns:w16du="http://schemas.microsoft.com/office/word/2023/wordml/word16du" xmlns:w16sdtdh="http://schemas.microsoft.com/office/word/2020/wordml/sdtdatahash" xmlns:w16sdtfl="http://schemas.microsoft.com/office/word/2024/wordml/sdtformatlock" xmlns:w16se="http://schemas.microsoft.com/office/word/2015/wordml/symex" xmlns:wpg="http://schemas.microsoft.com/office/word/2010/wordprocessingGroup" xmlns:wpi="http://schemas.microsoft.com/office/word/2010/wordprocessingInk" xmlns:wne="http://schemas.microsoft.com/office/word/2006/wordml" xmlns:wps="http://schemas.microsoft.com/office/word/2010/wordprocessingShape" mc:Ignorable="w14 w15 w16se w16cid w16 w16cex w16sdtdh w16sdtfl w16du wp14">
-  <w16cid:commentId w16cid:paraId="2B7A375D" w16cid:durableId="27A6C15E"/>
   <w16cid:commentId w16cid:paraId="1304144C" w16cid:durableId="74BA2796"/>
-  <w16cid:commentId w16cid:paraId="33AB0D5A" w16cid:durableId="67902DDB"/>
   <w16cid:commentId w16cid:paraId="3C0FED1C" w16cid:durableId="6387E4DA"/>
   <w16cid:commentId w16cid:paraId="2EB03F52" w16cid:durableId="2C51B84E"/>
   <w16cid:commentId w16cid:paraId="7A362A96" w16cid:durableId="29EDEAD0"/>
-  <w16cid:commentId w16cid:paraId="32D4CC42" w16cid:durableId="472286C5"/>
-  <w16cid:commentId w16cid:paraId="152D4D06" w16cid:durableId="0734D94E"/>
 </w16cid:commentsIds>
 </file>
 

</xml_diff>

<commit_message>
docs: redefine "propietario del caso de uso" como unidad duena del proceso (ROF) e incorpora METGEP (definicion y referencia)
</commit_message>
<xml_diff>
--- a/normativo/DIRECTIVA-GOBIERNO-IA.docx
+++ b/normativo/DIRECTIVA-GOBIERNO-IA.docx
@@ -1617,6 +1617,30 @@
           <w:b w:val="0"/>
           <w:bCs w:val="0"/>
           <w:color w:val="000000"/>
+          <w:highlight w:val="lightGray"/>
+        </w:rPr>
+        <w:t>METGEP: Metodología para la Gestión por Procesos</w:t>
+      </w:r>
+    </w:p>
+    <w:p>
+      <w:pPr>
+        <w:pStyle w:val="Prrafodelista"/>
+        <w:numPr>
+          <w:ilvl w:val="0"/>
+          <w:numId w:val="18"/>
+        </w:numPr>
+        <w:spacing w:line="276" w:lineRule="auto"/>
+        <w:rPr>
+          <w:b w:val="0"/>
+          <w:bCs w:val="0"/>
+          <w:color w:val="000000"/>
+        </w:rPr>
+      </w:pPr>
+      <w:r>
+        <w:rPr>
+          <w:b w:val="0"/>
+          <w:bCs w:val="0"/>
+          <w:color w:val="000000"/>
         </w:rPr>
         <w:t>MLOps: Operaciones de aprendizaje automático (Machine Learning Operations)</w:t>
       </w:r>
@@ -3017,6 +3041,32 @@
     </w:p>
     <w:p>
       <w:pPr>
+        <w:pStyle w:val="Prrafodelista"/>
+        <w:numPr>
+          <w:ilvl w:val="1"/>
+          <w:numId w:val="20"/>
+        </w:numPr>
+        <w:spacing w:line="276" w:lineRule="auto"/>
+        <w:ind w:left="709" w:hanging="567"/>
+        <w:rPr>
+          <w:b w:val="0"/>
+          <w:bCs w:val="0"/>
+          <w:color w:val="000000"/>
+          <w:highlight w:val="lightGray"/>
+        </w:rPr>
+      </w:pPr>
+      <w:r>
+        <w:rPr>
+          <w:b w:val="0"/>
+          <w:bCs w:val="0"/>
+          <w:color w:val="000000"/>
+          <w:highlight w:val="lightGray"/>
+        </w:rPr>
+        <w:t>Resolución de Oficina N.° 000002-2023-SUNAT/1V0000, que aprueba la Metodología para la Gestión por Procesos (METGEP) Versión 5.</w:t>
+      </w:r>
+    </w:p>
+    <w:p>
+      <w:pPr>
         <w:spacing w:line="276" w:lineRule="auto"/>
         <w:rPr>
           <w:rFonts w:ascii="Arial" w:hAnsi="Arial" w:cs="Arial"/>
@@ -3593,36 +3643,38 @@
           <w:b w:val="0"/>
           <w:bCs w:val="0"/>
           <w:color w:val="000000"/>
-        </w:rPr>
-      </w:pPr>
-      <w:commentRangeStart w:id="5"/>
-      <w:r>
-        <w:rPr>
-          <w:color w:val="000000"/>
-          <w:highlight w:val="cyan"/>
-        </w:rPr>
-        <w:t xml:space="preserve">Propietario de caso de uso: </w:t>
-      </w:r>
-      <w:r>
-        <w:rPr>
-          <w:b w:val="0"/>
-          <w:bCs w:val="0"/>
-          <w:color w:val="000000"/>
-          <w:highlight w:val="cyan"/>
-        </w:rPr>
-        <w:t>Responsable de la unidad de organización que identifica la necesidad de negocio (el caso de uso) susceptible de ser atendida mediante un SBIA, y que asume la responsabilidad funcional sobre sus resultados a lo largo de todo el ciclo de vida. Es el mismo responsable funcional del SBIA que materializa el caso de uso, y se distingue del custodio técnico a cargo de su arquitectura y operación. [NTP-ISO/IEC 42001:2025, cláusula 5.3]</w:t>
-      </w:r>
-      <w:commentRangeEnd w:id="5"/>
-      <w:r>
-        <w:rPr>
-          <w:rStyle w:val="Refdecomentario"/>
-          <w:b w:val="0"/>
-          <w:bCs w:val="0"/>
-          <w:color w:val="000000"/>
-          <w:sz w:val="22"/>
-          <w:szCs w:val="22"/>
-        </w:rPr>
-        <w:commentReference w:id="5"/>
+          <w:highlight w:val="lightGray"/>
+        </w:rPr>
+      </w:pPr>
+      <w:r>
+        <w:rPr>
+          <w:color w:val="000000"/>
+          <w:highlight w:val="lightGray"/>
+        </w:rPr>
+        <w:t>Propietario de</w:t>
+      </w:r>
+      <w:r>
+        <w:rPr>
+          <w:color w:val="000000"/>
+          <w:highlight w:val="lightGray"/>
+        </w:rPr>
+        <w:t>l</w:t>
+      </w:r>
+      <w:r>
+        <w:rPr>
+          <w:color w:val="000000"/>
+          <w:highlight w:val="lightGray"/>
+        </w:rPr>
+        <w:t xml:space="preserve"> caso de uso: </w:t>
+      </w:r>
+      <w:r>
+        <w:rPr>
+          <w:b w:val="0"/>
+          <w:bCs w:val="0"/>
+          <w:color w:val="000000"/>
+          <w:highlight w:val="lightGray"/>
+        </w:rPr>
+        <w:t>Unidad de organización que, de acuerdo con sus competencias y funciones en el ROF, es el dueño del proceso en el que se identifica la necesidad a atender mediante un SBIA y que asume la responsabilidad funcional sobre sus resultados durante todo su ciclo de vida. Se distingue del custodio técnico, a cargo de la arquitectura y la operación del SBIA. [METGEP, numeral 4.9; METDONI, numeral 4.6; NTP-ISO/IEC 42001:2025, cláusula 5.3]</w:t>
       </w:r>
     </w:p>
     <w:p>
@@ -3824,7 +3876,7 @@
           <w:szCs w:val="22"/>
         </w:rPr>
       </w:pPr>
-      <w:bookmarkStart w:id="6" w:name="_Toc235003965"/>
+      <w:bookmarkStart w:id="5" w:name="_Toc235003965"/>
       <w:r>
         <w:rPr>
           <w:rFonts w:cs="Arial"/>
@@ -3835,7 +3887,7 @@
         <w:lastRenderedPageBreak/>
         <w:t>DISPOSICIONES GENERALES</w:t>
       </w:r>
-      <w:bookmarkEnd w:id="6"/>
+      <w:bookmarkEnd w:id="5"/>
     </w:p>
     <w:p>
       <w:pPr>
@@ -6172,7 +6224,7 @@
                 <w:bCs w:val="0"/>
               </w:rPr>
             </w:pPr>
-            <w:commentRangeStart w:id="7"/>
+            <w:commentRangeStart w:id="6"/>
             <w:r>
               <w:rPr>
                 <w:b w:val="0"/>
@@ -6181,7 +6233,7 @@
               </w:rPr>
               <w:t>Audita los procesos del Sistema de Gestión de Seguridad de la Información que soportan a los SBIA (GSI).</w:t>
             </w:r>
-            <w:commentRangeEnd w:id="7"/>
+            <w:commentRangeEnd w:id="6"/>
             <w:r>
               <w:rPr>
                 <w:rStyle w:val="Refdecomentario"/>
@@ -6190,7 +6242,7 @@
                 <w:sz w:val="22"/>
                 <w:szCs w:val="22"/>
               </w:rPr>
-              <w:commentReference w:id="7"/>
+              <w:commentReference w:id="6"/>
             </w:r>
           </w:p>
           <w:p>
@@ -6647,7 +6699,7 @@
                 <w:rFonts w:ascii="Arial" w:hAnsi="Arial" w:cs="Arial"/>
               </w:rPr>
             </w:pPr>
-            <w:commentRangeStart w:id="8"/>
+            <w:commentRangeStart w:id="7"/>
             <w:r>
               <w:rPr>
                 <w:rFonts w:ascii="Arial" w:eastAsia="Arial" w:hAnsi="Arial" w:cs="Arial"/>
@@ -6656,7 +6708,7 @@
               </w:rPr>
               <w:t>Representante de Negocio</w:t>
             </w:r>
-            <w:commentRangeEnd w:id="8"/>
+            <w:commentRangeEnd w:id="7"/>
             <w:r>
               <w:rPr>
                 <w:rStyle w:val="Refdecomentario"/>
@@ -6664,7 +6716,7 @@
                 <w:sz w:val="22"/>
                 <w:szCs w:val="22"/>
               </w:rPr>
-              <w:commentReference w:id="8"/>
+              <w:commentReference w:id="7"/>
             </w:r>
           </w:p>
         </w:tc>
@@ -7009,7 +7061,7 @@
           <w:szCs w:val="22"/>
         </w:rPr>
       </w:pPr>
-      <w:bookmarkStart w:id="9" w:name="_Toc235003966"/>
+      <w:bookmarkStart w:id="8" w:name="_Toc235003966"/>
       <w:r>
         <w:rPr>
           <w:rFonts w:cs="Arial"/>
@@ -7019,7 +7071,7 @@
         </w:rPr>
         <w:t>DISPOSICIONES ESPECÍFICAS</w:t>
       </w:r>
-      <w:bookmarkEnd w:id="9"/>
+      <w:bookmarkEnd w:id="8"/>
     </w:p>
     <w:p>
       <w:pPr>
@@ -8528,7 +8580,7 @@
           <w:color w:val="000000"/>
         </w:rPr>
       </w:pPr>
-      <w:commentRangeStart w:id="10"/>
+      <w:commentRangeStart w:id="9"/>
       <w:r>
         <w:rPr>
           <w:rFonts w:ascii="Arial" w:hAnsi="Arial" w:cs="Arial"/>
@@ -8546,7 +8598,7 @@
         <w:tab/>
         <w:t>La INSI aprueba, con opinión favorable del CGTD, la metodología del ciclo de vida del SBIA previsto en el numeral 6.1.1, conforme a sus competencias y a la METDONI. La metodología comprende, como mínimo: el desarrollo y la aplicación de la clasificación de riesgo (Anexo N.° 2) y de la evaluación de impacto algorítmico (Anexo N.° 3), los criterios técnicos de diseño de la arquitectura de los SBIA, el contenido de los entregables de cada etapa, los tipos y las técnicas de prueba aplicables según el nivel de riesgo, los controles de contención, las prácticas de monitoreo y las condiciones de retiro. En tanto no se apruebe, los SBIA siguen el ciclo de vida del numeral 6.1.1 y la normativa de desarrollo de sistemas vigente en la SUNAT.</w:t>
       </w:r>
-      <w:commentRangeEnd w:id="10"/>
+      <w:commentRangeEnd w:id="9"/>
       <w:r>
         <w:rPr>
           <w:rStyle w:val="Refdecomentario"/>
@@ -8555,7 +8607,7 @@
           <w:sz w:val="22"/>
           <w:szCs w:val="22"/>
         </w:rPr>
-        <w:commentReference w:id="10"/>
+        <w:commentReference w:id="9"/>
       </w:r>
     </w:p>
     <w:p>
@@ -12068,7 +12120,7 @@
           <w:szCs w:val="22"/>
         </w:rPr>
       </w:pPr>
-      <w:bookmarkStart w:id="11" w:name="_Toc235003967"/>
+      <w:bookmarkStart w:id="10" w:name="_Toc235003967"/>
       <w:r>
         <w:rPr>
           <w:rFonts w:cs="Arial"/>
@@ -12079,7 +12131,7 @@
         <w:lastRenderedPageBreak/>
         <w:t>DISPOSICIONES FINALES</w:t>
       </w:r>
-      <w:bookmarkEnd w:id="11"/>
+      <w:bookmarkEnd w:id="10"/>
     </w:p>
     <w:p>
       <w:pPr>
@@ -12428,7 +12480,7 @@
           <w:szCs w:val="22"/>
         </w:rPr>
       </w:pPr>
-      <w:bookmarkStart w:id="12" w:name="_Toc235003968"/>
+      <w:bookmarkStart w:id="11" w:name="_Toc235003968"/>
       <w:r>
         <w:rPr>
           <w:rFonts w:cs="Arial"/>
@@ -12438,7 +12490,7 @@
         </w:rPr>
         <w:t>ANEXOS</w:t>
       </w:r>
-      <w:bookmarkEnd w:id="12"/>
+      <w:bookmarkEnd w:id="11"/>
     </w:p>
     <w:p>
       <w:pPr>
@@ -16574,7 +16626,7 @@
 
 <file path=word/comments.xml><?xml version="1.0" encoding="utf-8"?>
 <w:comments xmlns:wpc="http://schemas.microsoft.com/office/word/2010/wordprocessingCanvas" xmlns:cx="http://schemas.microsoft.com/office/drawing/2014/chartex" xmlns:cx1="http://schemas.microsoft.com/office/drawing/2015/9/8/chartex" xmlns:cx2="http://schemas.microsoft.com/office/drawing/2015/10/21/chartex" xmlns:cx3="http://schemas.microsoft.com/office/drawing/2016/5/9/chartex" xmlns:cx4="http://schemas.microsoft.com/office/drawing/2016/5/10/chartex" xmlns:cx5="http://schemas.microsoft.com/office/drawing/2016/5/11/chartex" xmlns:cx6="http://schemas.microsoft.com/office/drawing/2016/5/12/chartex" xmlns:cx7="http://schemas.microsoft.com/office/drawing/2016/5/13/chartex" xmlns:cx8="http://schemas.microsoft.com/office/drawing/2016/5/14/chartex" xmlns:mc="http://schemas.openxmlformats.org/markup-compatibility/2006" xmlns:aink="http://schemas.microsoft.com/office/drawing/2016/ink" xmlns:am3d="http://schemas.microsoft.com/office/drawing/2017/model3d" xmlns:o="urn:schemas-microsoft-com:office:office" xmlns:oel="http://schemas.microsoft.com/office/2019/extlst" xmlns:r="http://schemas.openxmlformats.org/officeDocument/2006/relationships" xmlns:m="http://schemas.openxmlformats.org/officeDocument/2006/math" xmlns:v="urn:schemas-microsoft-com:vml" xmlns:wp14="http://schemas.microsoft.com/office/word/2010/wordprocessingDrawing" xmlns:wp="http://schemas.openxmlformats.org/drawingml/2006/wordprocessingDrawing" xmlns:w10="urn:schemas-microsoft-com:office:word" xmlns:w="http://schemas.openxmlformats.org/wordprocessingml/2006/main" xmlns:w14="http://schemas.microsoft.com/office/word/2010/wordml" xmlns:w15="http://schemas.microsoft.com/office/word/2012/wordml" xmlns:w16cex="http://schemas.microsoft.com/office/word/2018/wordml/cex" xmlns:w16cid="http://schemas.microsoft.com/office/word/2016/wordml/cid" xmlns:w16="http://schemas.microsoft.com/office/word/2018/wordml" xmlns:w16du="http://schemas.microsoft.com/office/word/2023/wordml/word16du" xmlns:w16sdtdh="http://schemas.microsoft.com/office/word/2020/wordml/sdtdatahash" xmlns:w16sdtfl="http://schemas.microsoft.com/office/word/2024/wordml/sdtformatlock" xmlns:w16se="http://schemas.microsoft.com/office/word/2015/wordml/symex" xmlns:wpg="http://schemas.microsoft.com/office/word/2010/wordprocessingGroup" xmlns:wpi="http://schemas.microsoft.com/office/word/2010/wordprocessingInk" xmlns:wne="http://schemas.microsoft.com/office/word/2006/wordml" xmlns:wps="http://schemas.microsoft.com/office/word/2010/wordprocessingShape" mc:Ignorable="w14 w15 w16se w16cid w16 w16cex w16sdtdh w16sdtfl w16du wp14">
-  <w:comment w:id="5" w:author="Kut Castro Mario Fernando" w:date="2026-07-21T11:14:00Z" w:initials="MK">
+  <w:comment w:id="6" w:author="Kut Castro Mario Fernando" w:date="2026-07-21T11:30:00Z" w:initials="MK">
     <w:p>
       <w:pPr>
         <w:pStyle w:val="Textocomentario"/>
@@ -16586,11 +16638,11 @@
         <w:annotationRef/>
       </w:r>
       <w:r>
-        <w:t>Alinearlo de acuerdo al ROF referente a la competencia de formular iniciativas de SBIA, (unidades normativas de negocio y las unidades administrativas, TI), revisar competencias.</w:t>
+        <w:t xml:space="preserve">Revisar </w:t>
       </w:r>
     </w:p>
   </w:comment>
-  <w:comment w:id="7" w:author="Kut Castro Mario Fernando" w:date="2026-07-21T11:30:00Z" w:initials="MK">
+  <w:comment w:id="7" w:author="Kut Castro Mario Fernando" w:date="2026-07-21T11:27:00Z" w:initials="MK">
     <w:p>
       <w:pPr>
         <w:pStyle w:val="Textocomentario"/>
@@ -16602,27 +16654,11 @@
         <w:annotationRef/>
       </w:r>
       <w:r>
-        <w:t xml:space="preserve">Revisar </w:t>
+        <w:t>Representantes INGP, INER, INDIA, (Para revisión del ROF), a evaluar.</w:t>
       </w:r>
     </w:p>
   </w:comment>
-  <w:comment w:id="8" w:author="Kut Castro Mario Fernando" w:date="2026-07-21T11:27:00Z" w:initials="MK">
-    <w:p>
-      <w:pPr>
-        <w:pStyle w:val="Textocomentario"/>
-      </w:pPr>
-      <w:r>
-        <w:rPr>
-          <w:rStyle w:val="Refdecomentario"/>
-        </w:rPr>
-        <w:annotationRef/>
-      </w:r>
-      <w:r>
-        <w:t>Representantes INGP, INER, INDIA, (Para revisión del ROF), a evaluar.</w:t>
-      </w:r>
-    </w:p>
-  </w:comment>
-  <w:comment w:id="10" w:author="Kut Castro Mario Fernando" w:date="2026-07-21T11:40:00Z" w:initials="MK">
+  <w:comment w:id="9" w:author="Kut Castro Mario Fernando" w:date="2026-07-21T11:40:00Z" w:initials="MK">
     <w:p>
       <w:pPr>
         <w:pStyle w:val="Textocomentario"/>
@@ -16643,7 +16679,6 @@
 
 <file path=word/commentsExtended.xml><?xml version="1.0" encoding="utf-8"?>
 <w15:commentsEx xmlns:wpc="http://schemas.microsoft.com/office/word/2010/wordprocessingCanvas" xmlns:cx="http://schemas.microsoft.com/office/drawing/2014/chartex" xmlns:cx1="http://schemas.microsoft.com/office/drawing/2015/9/8/chartex" xmlns:cx2="http://schemas.microsoft.com/office/drawing/2015/10/21/chartex" xmlns:cx3="http://schemas.microsoft.com/office/drawing/2016/5/9/chartex" xmlns:cx4="http://schemas.microsoft.com/office/drawing/2016/5/10/chartex" xmlns:cx5="http://schemas.microsoft.com/office/drawing/2016/5/11/chartex" xmlns:cx6="http://schemas.microsoft.com/office/drawing/2016/5/12/chartex" xmlns:cx7="http://schemas.microsoft.com/office/drawing/2016/5/13/chartex" xmlns:cx8="http://schemas.microsoft.com/office/drawing/2016/5/14/chartex" xmlns:mc="http://schemas.openxmlformats.org/markup-compatibility/2006" xmlns:aink="http://schemas.microsoft.com/office/drawing/2016/ink" xmlns:am3d="http://schemas.microsoft.com/office/drawing/2017/model3d" xmlns:o="urn:schemas-microsoft-com:office:office" xmlns:oel="http://schemas.microsoft.com/office/2019/extlst" xmlns:r="http://schemas.openxmlformats.org/officeDocument/2006/relationships" xmlns:m="http://schemas.openxmlformats.org/officeDocument/2006/math" xmlns:v="urn:schemas-microsoft-com:vml" xmlns:wp14="http://schemas.microsoft.com/office/word/2010/wordprocessingDrawing" xmlns:wp="http://schemas.openxmlformats.org/drawingml/2006/wordprocessingDrawing" xmlns:w10="urn:schemas-microsoft-com:office:word" xmlns:w="http://schemas.openxmlformats.org/wordprocessingml/2006/main" xmlns:w14="http://schemas.microsoft.com/office/word/2010/wordml" xmlns:w15="http://schemas.microsoft.com/office/word/2012/wordml" xmlns:w16cex="http://schemas.microsoft.com/office/word/2018/wordml/cex" xmlns:w16cid="http://schemas.microsoft.com/office/word/2016/wordml/cid" xmlns:w16="http://schemas.microsoft.com/office/word/2018/wordml" xmlns:w16du="http://schemas.microsoft.com/office/word/2023/wordml/word16du" xmlns:w16sdtdh="http://schemas.microsoft.com/office/word/2020/wordml/sdtdatahash" xmlns:w16sdtfl="http://schemas.microsoft.com/office/word/2024/wordml/sdtformatlock" xmlns:w16se="http://schemas.microsoft.com/office/word/2015/wordml/symex" xmlns:wpg="http://schemas.microsoft.com/office/word/2010/wordprocessingGroup" xmlns:wpi="http://schemas.microsoft.com/office/word/2010/wordprocessingInk" xmlns:wne="http://schemas.microsoft.com/office/word/2006/wordml" xmlns:wps="http://schemas.microsoft.com/office/word/2010/wordprocessingShape" mc:Ignorable="w14 w15 w16se w16cid w16 w16cex w16sdtdh w16sdtfl w16du wp14">
-  <w15:commentEx w15:paraId="1304144C" w15:done="0"/>
   <w15:commentEx w15:paraId="3C0FED1C" w15:done="0"/>
   <w15:commentEx w15:paraId="2EB03F52" w15:done="0"/>
   <w15:commentEx w15:paraId="7A362A96" w15:done="0"/>
@@ -16652,7 +16687,6 @@
 
 <file path=word/commentsExtensible.xml><?xml version="1.0" encoding="utf-8"?>
 <w16cex:commentsExtensible xmlns:wpc="http://schemas.microsoft.com/office/word/2010/wordprocessingCanvas" xmlns:cx="http://schemas.microsoft.com/office/drawing/2014/chartex" xmlns:cx1="http://schemas.microsoft.com/office/drawing/2015/9/8/chartex" xmlns:cx2="http://schemas.microsoft.com/office/drawing/2015/10/21/chartex" xmlns:cx3="http://schemas.microsoft.com/office/drawing/2016/5/9/chartex" xmlns:cx4="http://schemas.microsoft.com/office/drawing/2016/5/10/chartex" xmlns:cx5="http://schemas.microsoft.com/office/drawing/2016/5/11/chartex" xmlns:cx6="http://schemas.microsoft.com/office/drawing/2016/5/12/chartex" xmlns:cx7="http://schemas.microsoft.com/office/drawing/2016/5/13/chartex" xmlns:cx8="http://schemas.microsoft.com/office/drawing/2016/5/14/chartex" xmlns:cr="http://schemas.microsoft.com/office/comments/2020/reactions" xmlns:mc="http://schemas.openxmlformats.org/markup-compatibility/2006" xmlns:aink="http://schemas.microsoft.com/office/drawing/2016/ink" xmlns:am3d="http://schemas.microsoft.com/office/drawing/2017/model3d" xmlns:o="urn:schemas-microsoft-com:office:office" xmlns:oel="http://schemas.microsoft.com/office/2019/extlst" xmlns:r="http://schemas.openxmlformats.org/officeDocument/2006/relationships" xmlns:m="http://schemas.openxmlformats.org/officeDocument/2006/math" xmlns:v="urn:schemas-microsoft-com:vml" xmlns:wp14="http://schemas.microsoft.com/office/word/2010/wordprocessingDrawing" xmlns:wp="http://schemas.openxmlformats.org/drawingml/2006/wordprocessingDrawing" xmlns:w10="urn:schemas-microsoft-com:office:word" xmlns:w="http://schemas.openxmlformats.org/wordprocessingml/2006/main" xmlns:w14="http://schemas.microsoft.com/office/word/2010/wordml" xmlns:w15="http://schemas.microsoft.com/office/word/2012/wordml" xmlns:w16cex="http://schemas.microsoft.com/office/word/2018/wordml/cex" xmlns:w16cid="http://schemas.microsoft.com/office/word/2016/wordml/cid" xmlns:w16="http://schemas.microsoft.com/office/word/2018/wordml" xmlns:w16du="http://schemas.microsoft.com/office/word/2023/wordml/word16du" xmlns:w16sdtdh="http://schemas.microsoft.com/office/word/2020/wordml/sdtdatahash" xmlns:w16sdtfl="http://schemas.microsoft.com/office/word/2024/wordml/sdtformatlock" xmlns:w16se="http://schemas.microsoft.com/office/word/2015/wordml/symex" xmlns:wpg="http://schemas.microsoft.com/office/word/2010/wordprocessingGroup" xmlns:wpi="http://schemas.microsoft.com/office/word/2010/wordprocessingInk" xmlns:wne="http://schemas.microsoft.com/office/word/2006/wordml" xmlns:wps="http://schemas.microsoft.com/office/word/2010/wordprocessingShape" mc:Ignorable="w14 w15 w16se w16cid w16 w16cex w16sdtdh w16sdtfl cr w16du wp14">
-  <w16cex:commentExtensible w16cex:durableId="74BA2796" w16cex:dateUtc="2026-07-21T16:14:00Z"/>
   <w16cex:commentExtensible w16cex:durableId="6387E4DA" w16cex:dateUtc="2026-07-21T16:30:00Z"/>
   <w16cex:commentExtensible w16cex:durableId="2C51B84E" w16cex:dateUtc="2026-07-21T16:27:00Z"/>
   <w16cex:commentExtensible w16cex:durableId="29EDEAD0" w16cex:dateUtc="2026-07-21T16:40:00Z"/>
@@ -16661,7 +16695,6 @@
 
 <file path=word/commentsIds.xml><?xml version="1.0" encoding="utf-8"?>
 <w16cid:commentsIds xmlns:wpc="http://schemas.microsoft.com/office/word/2010/wordprocessingCanvas" xmlns:cx="http://schemas.microsoft.com/office/drawing/2014/chartex" xmlns:cx1="http://schemas.microsoft.com/office/drawing/2015/9/8/chartex" xmlns:cx2="http://schemas.microsoft.com/office/drawing/2015/10/21/chartex" xmlns:cx3="http://schemas.microsoft.com/office/drawing/2016/5/9/chartex" xmlns:cx4="http://schemas.microsoft.com/office/drawing/2016/5/10/chartex" xmlns:cx5="http://schemas.microsoft.com/office/drawing/2016/5/11/chartex" xmlns:cx6="http://schemas.microsoft.com/office/drawing/2016/5/12/chartex" xmlns:cx7="http://schemas.microsoft.com/office/drawing/2016/5/13/chartex" xmlns:cx8="http://schemas.microsoft.com/office/drawing/2016/5/14/chartex" xmlns:mc="http://schemas.openxmlformats.org/markup-compatibility/2006" xmlns:aink="http://schemas.microsoft.com/office/drawing/2016/ink" xmlns:am3d="http://schemas.microsoft.com/office/drawing/2017/model3d" xmlns:o="urn:schemas-microsoft-com:office:office" xmlns:oel="http://schemas.microsoft.com/office/2019/extlst" xmlns:r="http://schemas.openxmlformats.org/officeDocument/2006/relationships" xmlns:m="http://schemas.openxmlformats.org/officeDocument/2006/math" xmlns:v="urn:schemas-microsoft-com:vml" xmlns:wp14="http://schemas.microsoft.com/office/word/2010/wordprocessingDrawing" xmlns:wp="http://schemas.openxmlformats.org/drawingml/2006/wordprocessingDrawing" xmlns:w10="urn:schemas-microsoft-com:office:word" xmlns:w="http://schemas.openxmlformats.org/wordprocessingml/2006/main" xmlns:w14="http://schemas.microsoft.com/office/word/2010/wordml" xmlns:w15="http://schemas.microsoft.com/office/word/2012/wordml" xmlns:w16cex="http://schemas.microsoft.com/office/word/2018/wordml/cex" xmlns:w16cid="http://schemas.microsoft.com/office/word/2016/wordml/cid" xmlns:w16="http://schemas.microsoft.com/office/word/2018/wordml" xmlns:w16du="http://schemas.microsoft.com/office/word/2023/wordml/word16du" xmlns:w16sdtdh="http://schemas.microsoft.com/office/word/2020/wordml/sdtdatahash" xmlns:w16sdtfl="http://schemas.microsoft.com/office/word/2024/wordml/sdtformatlock" xmlns:w16se="http://schemas.microsoft.com/office/word/2015/wordml/symex" xmlns:wpg="http://schemas.microsoft.com/office/word/2010/wordprocessingGroup" xmlns:wpi="http://schemas.microsoft.com/office/word/2010/wordprocessingInk" xmlns:wne="http://schemas.microsoft.com/office/word/2006/wordml" xmlns:wps="http://schemas.microsoft.com/office/word/2010/wordprocessingShape" mc:Ignorable="w14 w15 w16se w16cid w16 w16cex w16sdtdh w16sdtfl w16du wp14">
-  <w16cid:commentId w16cid:paraId="1304144C" w16cid:durableId="74BA2796"/>
   <w16cid:commentId w16cid:paraId="3C0FED1C" w16cid:durableId="6387E4DA"/>
   <w16cid:commentId w16cid:paraId="2EB03F52" w16cid:durableId="2C51B84E"/>
   <w16cid:commentId w16cid:paraId="7A362A96" w16cid:durableId="29EDEAD0"/>

</xml_diff>

<commit_message>
docs: reformula el rol "Representante de Negocio" -> "Vision de negocio" (organos de linea por designacion de la SNA) en la Comision de Gobierno de IA
</commit_message>
<xml_diff>
--- a/normativo/DIRECTIVA-GOBIERNO-IA.docx
+++ b/normativo/DIRECTIVA-GOBIERNO-IA.docx
@@ -6697,26 +6697,17 @@
               <w:spacing w:before="20" w:after="20" w:line="276" w:lineRule="auto"/>
               <w:rPr>
                 <w:rFonts w:ascii="Arial" w:hAnsi="Arial" w:cs="Arial"/>
+                <w:highlight w:val="lightGray"/>
               </w:rPr>
             </w:pPr>
-            <w:commentRangeStart w:id="7"/>
             <w:r>
               <w:rPr>
                 <w:rFonts w:ascii="Arial" w:eastAsia="Arial" w:hAnsi="Arial" w:cs="Arial"/>
                 <w:b/>
                 <w:bCs/>
-              </w:rPr>
-              <w:t>Representante de Negocio</w:t>
-            </w:r>
-            <w:commentRangeEnd w:id="7"/>
-            <w:r>
-              <w:rPr>
-                <w:rStyle w:val="Refdecomentario"/>
-                <w:rFonts w:ascii="Arial" w:hAnsi="Arial" w:cs="Arial"/>
-                <w:sz w:val="22"/>
-                <w:szCs w:val="22"/>
-              </w:rPr>
-              <w:commentReference w:id="7"/>
+                <w:highlight w:val="lightGray"/>
+              </w:rPr>
+              <w:t>Visión de negocio</w:t>
             </w:r>
           </w:p>
         </w:tc>
@@ -6742,13 +6733,15 @@
               <w:spacing w:before="20" w:after="20" w:line="276" w:lineRule="auto"/>
               <w:rPr>
                 <w:rFonts w:ascii="Arial" w:hAnsi="Arial" w:cs="Arial"/>
+                <w:highlight w:val="lightGray"/>
               </w:rPr>
             </w:pPr>
             <w:r>
               <w:rPr>
                 <w:rFonts w:ascii="Arial" w:eastAsia="Arial" w:hAnsi="Arial" w:cs="Arial"/>
-              </w:rPr>
-              <w:t>Superintendencias Nacionales Adjuntas</w:t>
+                <w:highlight w:val="lightGray"/>
+              </w:rPr>
+              <w:t>Órganos de línea, por designación de la Superintendencia Nacional Adjunta de la que dependen</w:t>
             </w:r>
           </w:p>
         </w:tc>
@@ -6777,19 +6770,37 @@
                 <w:numId w:val="16"/>
               </w:numPr>
               <w:spacing w:before="20" w:after="20" w:line="276" w:lineRule="auto"/>
-              <w:ind w:left="299" w:hanging="283"/>
+              <w:ind w:left="269"/>
               <w:jc w:val="left"/>
               <w:rPr>
                 <w:b w:val="0"/>
                 <w:bCs w:val="0"/>
+                <w:highlight w:val="lightGray"/>
               </w:rPr>
             </w:pPr>
             <w:r>
               <w:rPr>
                 <w:b w:val="0"/>
                 <w:bCs w:val="0"/>
-              </w:rPr>
-              <w:t>Aporta la visión de negocio a la Comisión de Gobierno de IA.</w:t>
+                <w:highlight w:val="lightGray"/>
+              </w:rPr>
+              <w:t>En materia de negocio: aporta a la Comisión de Gobierno de IA la visión del</w:t>
+            </w:r>
+            <w:r>
+              <w:rPr>
+                <w:b w:val="0"/>
+                <w:bCs w:val="0"/>
+                <w:highlight w:val="lightGray"/>
+              </w:rPr>
+              <w:t xml:space="preserve"> </w:t>
+            </w:r>
+            <w:r>
+              <w:rPr>
+                <w:b w:val="0"/>
+                <w:bCs w:val="0"/>
+                <w:highlight w:val="lightGray"/>
+              </w:rPr>
+              <w:t xml:space="preserve">ámbito de la Superintendencia Nacional Adjunta que lo designa. </w:t>
             </w:r>
           </w:p>
           <w:p>
@@ -6800,44 +6811,94 @@
                 <w:numId w:val="16"/>
               </w:numPr>
               <w:spacing w:before="20" w:after="20" w:line="276" w:lineRule="auto"/>
-              <w:ind w:left="299" w:hanging="283"/>
+              <w:ind w:left="269"/>
               <w:jc w:val="left"/>
               <w:rPr>
                 <w:b w:val="0"/>
                 <w:bCs w:val="0"/>
+                <w:highlight w:val="lightGray"/>
               </w:rPr>
             </w:pPr>
             <w:r>
               <w:rPr>
                 <w:b w:val="0"/>
                 <w:bCs w:val="0"/>
-                <w:highlight w:val="yellow"/>
-              </w:rPr>
-              <w:t>Identifica y prioriza las iniciativas de negocio susceptibles de generar valor mediante SBIA.</w:t>
+                <w:highlight w:val="lightGray"/>
+              </w:rPr>
+              <w:lastRenderedPageBreak/>
+              <w:t>Contribuye a la</w:t>
             </w:r>
-          </w:p>
-          <w:p>
-            <w:pPr>
-              <w:pStyle w:val="Prrafodelista"/>
-              <w:numPr>
-                <w:ilvl w:val="0"/>
-                <w:numId w:val="16"/>
-              </w:numPr>
-              <w:spacing w:before="20" w:after="20" w:line="276" w:lineRule="auto"/>
-              <w:ind w:left="299" w:hanging="283"/>
-              <w:jc w:val="left"/>
+            <w:r>
               <w:rPr>
                 <w:b w:val="0"/>
                 <w:bCs w:val="0"/>
-              </w:rPr>
-            </w:pPr>
+                <w:highlight w:val="lightGray"/>
+              </w:rPr>
+              <w:t xml:space="preserve"> </w:t>
+            </w:r>
             <w:r>
               <w:rPr>
                 <w:b w:val="0"/>
                 <w:bCs w:val="0"/>
-              </w:rPr>
-              <w:lastRenderedPageBreak/>
-              <w:t>Participa en la evaluación de los casos de uso desde la perspectiva de negocio.</w:t>
+                <w:highlight w:val="lightGray"/>
+              </w:rPr>
+              <w:t>evaluación del componente de IA con el conocimiento operativo de los procesos</w:t>
+            </w:r>
+            <w:r>
+              <w:rPr>
+                <w:b w:val="0"/>
+                <w:bCs w:val="0"/>
+                <w:highlight w:val="lightGray"/>
+              </w:rPr>
+              <w:t xml:space="preserve"> </w:t>
+            </w:r>
+            <w:r>
+              <w:rPr>
+                <w:b w:val="0"/>
+                <w:bCs w:val="0"/>
+                <w:highlight w:val="lightGray"/>
+              </w:rPr>
+              <w:t xml:space="preserve">de dicho ámbito y de su impacto en los administrados. Su participación </w:t>
+            </w:r>
+            <w:r>
+              <w:rPr>
+                <w:b w:val="0"/>
+                <w:bCs w:val="0"/>
+                <w:highlight w:val="lightGray"/>
+              </w:rPr>
+              <w:t>es permanente</w:t>
+            </w:r>
+            <w:r>
+              <w:rPr>
+                <w:b w:val="0"/>
+                <w:bCs w:val="0"/>
+                <w:highlight w:val="lightGray"/>
+              </w:rPr>
+              <w:t xml:space="preserve"> y no sustituye la del propietario del caso de uso, a quien la Comisión</w:t>
+            </w:r>
+            <w:r>
+              <w:rPr>
+                <w:b w:val="0"/>
+                <w:bCs w:val="0"/>
+                <w:highlight w:val="lightGray"/>
+              </w:rPr>
+              <w:t xml:space="preserve"> </w:t>
+            </w:r>
+            <w:r>
+              <w:rPr>
+                <w:b w:val="0"/>
+                <w:bCs w:val="0"/>
+                <w:highlight w:val="lightGray"/>
+              </w:rPr>
+              <w:t>convoca cuando se evalúa un caso de uso de su proceso, conforme al numeral   5.3.2.</w:t>
+            </w:r>
+            <w:r>
+              <w:rPr>
+                <w:b w:val="0"/>
+                <w:bCs w:val="0"/>
+                <w:highlight w:val="lightGray"/>
+              </w:rPr>
+              <w:t xml:space="preserve"> </w:t>
             </w:r>
           </w:p>
         </w:tc>
@@ -7061,7 +7122,7 @@
           <w:szCs w:val="22"/>
         </w:rPr>
       </w:pPr>
-      <w:bookmarkStart w:id="8" w:name="_Toc235003966"/>
+      <w:bookmarkStart w:id="7" w:name="_Toc235003966"/>
       <w:r>
         <w:rPr>
           <w:rFonts w:cs="Arial"/>
@@ -7071,7 +7132,7 @@
         </w:rPr>
         <w:t>DISPOSICIONES ESPECÍFICAS</w:t>
       </w:r>
-      <w:bookmarkEnd w:id="8"/>
+      <w:bookmarkEnd w:id="7"/>
     </w:p>
     <w:p>
       <w:pPr>
@@ -7197,6 +7258,7 @@
                 <w:b/>
                 <w:bCs/>
               </w:rPr>
+              <w:lastRenderedPageBreak/>
               <w:t>N.°</w:t>
             </w:r>
           </w:p>
@@ -7471,7 +7533,6 @@
               <w:rPr>
                 <w:rFonts w:ascii="Arial" w:eastAsia="Arial" w:hAnsi="Arial" w:cs="Arial"/>
               </w:rPr>
-              <w:lastRenderedPageBreak/>
               <w:t>2</w:t>
             </w:r>
           </w:p>
@@ -7973,7 +8034,15 @@
                 <w:rFonts w:ascii="Arial" w:eastAsia="Arial" w:hAnsi="Arial" w:cs="Arial"/>
                 <w:highlight w:val="yellow"/>
               </w:rPr>
-              <w:t>La Gerencia de Calidad de Sistemas conduce las pruebas de verificación y validación de calidad, y la Oficina de Seguridad Informática efectúa el análisis de riesgo y las pruebas de vulnerabilidad, incluido el red teaming para riesgo alto. Con la conformidad de ambas y de la unidad de organización propietaria del caso de uso, la aprobación corresponde conforme al numeral 6.1.2.</w:t>
+              <w:t xml:space="preserve">La Gerencia de Calidad de Sistemas conduce las pruebas de verificación y validación de calidad, y la Oficina de Seguridad Informática efectúa el análisis de riesgo y las pruebas de vulnerabilidad, incluido el red teaming </w:t>
+            </w:r>
+            <w:r>
+              <w:rPr>
+                <w:rFonts w:ascii="Arial" w:eastAsia="Arial" w:hAnsi="Arial" w:cs="Arial"/>
+                <w:highlight w:val="yellow"/>
+              </w:rPr>
+              <w:lastRenderedPageBreak/>
+              <w:t>para riesgo alto. Con la conformidad de ambas y de la unidad de organización propietaria del caso de uso, la aprobación corresponde conforme al numeral 6.1.2.</w:t>
             </w:r>
           </w:p>
         </w:tc>
@@ -8521,6 +8590,7 @@
           <w:color w:val="000000"/>
           <w:highlight w:val="yellow"/>
         </w:rPr>
+        <w:lastRenderedPageBreak/>
         <w:t xml:space="preserve">No procedencia. Cuando el SBIA es clasificado como de </w:t>
       </w:r>
       <w:r>
@@ -8558,16 +8628,7 @@
           <w:color w:val="000000"/>
           <w:highlight w:val="yellow"/>
         </w:rPr>
-        <w:t xml:space="preserve">En la evaluación de la generación de valor, el beneficio puede sustentarse a nivel de un conjunto o programa de SBIA cuando la iniciativa forme parte de un </w:t>
-      </w:r>
-      <w:r>
-        <w:rPr>
-          <w:rFonts w:ascii="Arial" w:eastAsia="Arial" w:hAnsi="Arial" w:cs="Arial"/>
-          <w:color w:val="000000"/>
-          <w:highlight w:val="yellow"/>
-        </w:rPr>
-        <w:lastRenderedPageBreak/>
-        <w:t>portafolio, e incluir beneficios cualitativos y de control de procesos además de los cuantitativos.</w:t>
+        <w:t>En la evaluación de la generación de valor, el beneficio puede sustentarse a nivel de un conjunto o programa de SBIA cuando la iniciativa forme parte de un portafolio, e incluir beneficios cualitativos y de control de procesos además de los cuantitativos.</w:t>
       </w:r>
     </w:p>
     <w:p>
@@ -8580,7 +8641,7 @@
           <w:color w:val="000000"/>
         </w:rPr>
       </w:pPr>
-      <w:commentRangeStart w:id="9"/>
+      <w:commentRangeStart w:id="8"/>
       <w:r>
         <w:rPr>
           <w:rFonts w:ascii="Arial" w:hAnsi="Arial" w:cs="Arial"/>
@@ -8598,7 +8659,7 @@
         <w:tab/>
         <w:t>La INSI aprueba, con opinión favorable del CGTD, la metodología del ciclo de vida del SBIA previsto en el numeral 6.1.1, conforme a sus competencias y a la METDONI. La metodología comprende, como mínimo: el desarrollo y la aplicación de la clasificación de riesgo (Anexo N.° 2) y de la evaluación de impacto algorítmico (Anexo N.° 3), los criterios técnicos de diseño de la arquitectura de los SBIA, el contenido de los entregables de cada etapa, los tipos y las técnicas de prueba aplicables según el nivel de riesgo, los controles de contención, las prácticas de monitoreo y las condiciones de retiro. En tanto no se apruebe, los SBIA siguen el ciclo de vida del numeral 6.1.1 y la normativa de desarrollo de sistemas vigente en la SUNAT.</w:t>
       </w:r>
-      <w:commentRangeEnd w:id="9"/>
+      <w:commentRangeEnd w:id="8"/>
       <w:r>
         <w:rPr>
           <w:rStyle w:val="Refdecomentario"/>
@@ -8607,7 +8668,7 @@
           <w:sz w:val="22"/>
           <w:szCs w:val="22"/>
         </w:rPr>
-        <w:commentReference w:id="9"/>
+        <w:commentReference w:id="8"/>
       </w:r>
     </w:p>
     <w:p>
@@ -8725,6 +8786,7 @@
           <w:color w:val="000000"/>
           <w:highlight w:val="yellow"/>
         </w:rPr>
+        <w:lastRenderedPageBreak/>
         <w:t>6.2.3</w:t>
       </w:r>
       <w:r>
@@ -8750,16 +8812,7 @@
           <w:color w:val="000000"/>
           <w:highlight w:val="yellow"/>
         </w:rPr>
-        <w:t xml:space="preserve">, conforme al artículo 23 del RLIA. Sin perjuicio de lo señalado en el literal e) del numeral 23.1 del citado artículo, no se consideran de uso indebido los SBIA utilizados para apoyar la evaluación humana sobre la implicación de una persona física en una actividad delictiva, siempre que se basen en hechos objetivos y verificables directamente relacionados con una actividad delictiva ya existente y cuenten con mecanismos de supervisión humana, transparencia y auditabilidad para </w:t>
-      </w:r>
-      <w:r>
-        <w:rPr>
-          <w:rFonts w:ascii="Arial" w:eastAsia="Arial" w:hAnsi="Arial" w:cs="Arial"/>
-          <w:color w:val="000000"/>
-          <w:highlight w:val="yellow"/>
-        </w:rPr>
-        <w:lastRenderedPageBreak/>
-        <w:t>garantizar la no discriminación y la protección de los derechos fundamentales, conforme al numeral 23.4 del citado artículo.</w:t>
+        <w:t>, conforme al artículo 23 del RLIA. Sin perjuicio de lo señalado en el literal e) del numeral 23.1 del citado artículo, no se consideran de uso indebido los SBIA utilizados para apoyar la evaluación humana sobre la implicación de una persona física en una actividad delictiva, siempre que se basen en hechos objetivos y verificables directamente relacionados con una actividad delictiva ya existente y cuenten con mecanismos de supervisión humana, transparencia y auditabilidad para garantizar la no discriminación y la protección de los derechos fundamentales, conforme al numeral 23.4 del citado artículo.</w:t>
       </w:r>
     </w:p>
     <w:p>
@@ -9043,6 +9096,7 @@
           <w:szCs w:val="24"/>
           <w:highlight w:val="cyan"/>
         </w:rPr>
+        <w:lastRenderedPageBreak/>
         <w:t>Del diseño, la operación y la seguridad de los SBIA</w:t>
       </w:r>
     </w:p>
@@ -9110,7 +9164,6 @@
           <w:color w:val="000000"/>
           <w:highlight w:val="yellow"/>
         </w:rPr>
-        <w:lastRenderedPageBreak/>
         <w:t>6.5.2</w:t>
       </w:r>
       <w:r>
@@ -9329,7 +9382,16 @@
           <w:color w:val="000000"/>
           <w:highlight w:val="lightGray"/>
         </w:rPr>
-        <w:t xml:space="preserve">La publicación del código fuente de los SBIA financiados con fondos públicos, con licencia libre o abierta en la Plataforma Nacional de Software Público Peruano (PNSSP), se sujeta a la determinación previa de su publicabilidad. Dicha determinación verifica que el código no revele información sujeta a reserva tributaria conforme al artículo 85 del TUO del Código Tributario, información protegida por confidencialidad aduanera, ni reglas de detección de riesgo cuya divulgación comprometa la función de control. La GA, con opinión de la INALI y de la Oficina de Seguridad Informática, determina la publicabilidad antes de cada liberación mayor; la GDS ejecuta la publicación cuando corresponda. </w:t>
+        <w:t xml:space="preserve">La publicación del código fuente de los SBIA financiados con fondos públicos, con licencia libre o abierta en la Plataforma Nacional de Software Público Peruano (PNSSP), se sujeta a la determinación previa de su publicabilidad. Dicha determinación verifica que el código no revele información sujeta a reserva tributaria conforme al artículo 85 del TUO del Código Tributario, información protegida por confidencialidad aduanera, ni reglas de detección de riesgo cuya divulgación comprometa la función de control. La GA, con opinión </w:t>
+      </w:r>
+      <w:r>
+        <w:rPr>
+          <w:rFonts w:ascii="Arial" w:eastAsia="Arial" w:hAnsi="Arial" w:cs="Arial"/>
+          <w:color w:val="000000"/>
+          <w:highlight w:val="lightGray"/>
+        </w:rPr>
+        <w:lastRenderedPageBreak/>
+        <w:t xml:space="preserve">de la INALI y de la Oficina de Seguridad Informática, determina la publicabilidad antes de cada liberación mayor; la GDS ejecuta la publicación cuando corresponda. </w:t>
       </w:r>
     </w:p>
     <w:p>
@@ -9371,16 +9433,7 @@
           <w:highlight w:val="yellow"/>
         </w:rPr>
         <w:tab/>
-        <w:t xml:space="preserve">Todo SBIA cuenta con un mecanismo de supervisión humana proporcional a su nivel de riesgo. En los SBIA de riesgo alto que intervengan en decisiones </w:t>
-      </w:r>
-      <w:r>
-        <w:rPr>
-          <w:rFonts w:ascii="Arial" w:eastAsia="Arial" w:hAnsi="Arial" w:cs="Arial"/>
-          <w:color w:val="000000"/>
-          <w:highlight w:val="yellow"/>
-        </w:rPr>
-        <w:lastRenderedPageBreak/>
-        <w:t>con impacto significativo, la supervisión humana es obligatoria; su extensión a los demás SBIA de riesgo alto y a los de riesgo aceptable es una decisión institucional. La correspondencia es la siguiente:</w:t>
+        <w:t>Todo SBIA cuenta con un mecanismo de supervisión humana proporcional a su nivel de riesgo. En los SBIA de riesgo alto que intervengan en decisiones con impacto significativo, la supervisión humana es obligatoria; su extensión a los demás SBIA de riesgo alto y a los de riesgo aceptable es una decisión institucional. La correspondencia es la siguiente:</w:t>
       </w:r>
     </w:p>
     <w:p>
@@ -9651,6 +9704,7 @@
           <w:rFonts w:ascii="Arial" w:eastAsia="Arial" w:hAnsi="Arial" w:cs="Arial"/>
           <w:color w:val="000000"/>
         </w:rPr>
+        <w:lastRenderedPageBreak/>
         <w:t>6.6.4</w:t>
       </w:r>
       <w:r>
@@ -9706,7 +9760,6 @@
           <w:color w:val="000000"/>
           <w:highlight w:val="cyan"/>
         </w:rPr>
-        <w:lastRenderedPageBreak/>
         <w:t>6.7.1</w:t>
       </w:r>
       <w:r>
@@ -9847,7 +9900,16 @@
           <w:color w:val="000000"/>
           <w:highlight w:val="cyan"/>
         </w:rPr>
-        <w:t xml:space="preserve"> por el Procedimiento para el registro y atención de incidentes y vulnerabilidades de seguridad de la información (A-03.5.1-PR-003). Los incidentes que se presenten durante la operación de un SBIA en producción y que no constituyan incidentes de seguridad de la información se atienden conforme al Procedimiento de Gestión de Incidentes (A-03.1.1-PR-002). El propietario del caso de uso y las gerencias competentes de la INSI comunican los incidentes del uso y funcionamiento del SBIA por los canales que dichos procedimientos establecen; la Comisión de Gobierno de IA los consolida y los reporta en el informe trimestral del numeral 6.9.5.</w:t>
+        <w:t xml:space="preserve"> por el Procedimiento para el registro y atención de incidentes y vulnerabilidades de seguridad de la información (A-03.5.1-PR-003). Los incidentes que se presenten durante la operación de un SBIA en producción y que no constituyan incidentes de seguridad de la información se atienden conforme al Procedimiento de Gestión </w:t>
+      </w:r>
+      <w:r>
+        <w:rPr>
+          <w:rFonts w:ascii="Arial" w:eastAsia="Arial" w:hAnsi="Arial" w:cs="Arial"/>
+          <w:color w:val="000000"/>
+          <w:highlight w:val="cyan"/>
+        </w:rPr>
+        <w:lastRenderedPageBreak/>
+        <w:t>de Incidentes (A-03.1.1-PR-002). El propietario del caso de uso y las gerencias competentes de la INSI comunican los incidentes del uso y funcionamiento del SBIA por los canales que dichos procedimientos establecen; la Comisión de Gobierno de IA los consolida y los reporta en el informe trimestral del numeral 6.9.5.</w:t>
       </w:r>
     </w:p>
     <w:p>
@@ -9875,16 +9937,7 @@
           <w:highlight w:val="yellow"/>
         </w:rPr>
         <w:tab/>
-        <w:t xml:space="preserve">El Oficial de Datos Personales (ODP) asegura que en el desarrollo, la implementación y el uso de los SBIA se realice un tratamiento adecuado de los </w:t>
-      </w:r>
-      <w:r>
-        <w:rPr>
-          <w:rFonts w:ascii="Arial" w:eastAsia="Arial" w:hAnsi="Arial" w:cs="Arial"/>
-          <w:color w:val="000000"/>
-          <w:highlight w:val="yellow"/>
-        </w:rPr>
-        <w:lastRenderedPageBreak/>
-        <w:t>datos personales</w:t>
+        <w:t>El Oficial de Datos Personales (ODP) asegura que en el desarrollo, la implementación y el uso de los SBIA se realice un tratamiento adecuado de los datos personales</w:t>
       </w:r>
       <w:r>
         <w:rPr>
@@ -10169,7 +10222,16 @@
           <w:color w:val="000000"/>
           <w:highlight w:val="lightGray"/>
         </w:rPr>
-        <w:t>Los conjuntos de datos que la SUNAT genere o administre y que califiquen como datos de alto valor se ponen a disposición a través del Centro Nacional de Datos (CND), previa determinación de su publicabilidad conforme al artículo 85 del TUO del Código Tributario y a la normativa de protección de datos personales. El OGD identifica los conjuntos candidatos y propone al CGTD su publicación.</w:t>
+        <w:t xml:space="preserve">Los conjuntos de datos que la SUNAT genere o administre y que califiquen como datos de alto valor se ponen a disposición a través del Centro Nacional de Datos (CND), previa determinación de su publicabilidad conforme al artículo 85 del TUO del Código Tributario y a la normativa de protección de datos </w:t>
+      </w:r>
+      <w:r>
+        <w:rPr>
+          <w:rFonts w:ascii="Arial" w:eastAsia="Arial" w:hAnsi="Arial" w:cs="Arial"/>
+          <w:color w:val="000000"/>
+          <w:highlight w:val="lightGray"/>
+        </w:rPr>
+        <w:lastRenderedPageBreak/>
+        <w:t>personales. El OGD identifica los conjuntos candidatos y propone al CGTD su publicación.</w:t>
       </w:r>
     </w:p>
     <w:p>
@@ -10236,16 +10298,7 @@
           <w:highlight w:val="yellow"/>
         </w:rPr>
         <w:tab/>
-        <w:t xml:space="preserve">Los SBIA de riesgo alto cuentan con mecanismos de transparencia algorítmica que informan al usuario, de forma previa, clara y sencilla, la finalidad o uso del </w:t>
-      </w:r>
-      <w:r>
-        <w:rPr>
-          <w:rFonts w:ascii="Arial" w:eastAsia="Arial" w:hAnsi="Arial" w:cs="Arial"/>
-          <w:color w:val="000000"/>
-          <w:highlight w:val="yellow"/>
-        </w:rPr>
-        <w:lastRenderedPageBreak/>
-        <w:t>SBIA, sus funcionalidades principales y el tipo de decisiones que puede tomar, de modo que comprenda cómo interactúa con el SBIA o con el servicio que lo emplea</w:t>
+        <w:t>Los SBIA de riesgo alto cuentan con mecanismos de transparencia algorítmica que informan al usuario, de forma previa, clara y sencilla, la finalidad o uso del SBIA, sus funcionalidades principales y el tipo de decisiones que puede tomar, de modo que comprenda cómo interactúa con el SBIA o con el servicio que lo emplea</w:t>
       </w:r>
       <w:r>
         <w:rPr>
@@ -10463,6 +10516,7 @@
         <w:ind w:left="851"/>
       </w:pPr>
       <w:r>
+        <w:lastRenderedPageBreak/>
         <w:t>6.10</w:t>
       </w:r>
       <w:r>
@@ -10545,7 +10599,6 @@
           <w:color w:val="000000"/>
           <w:highlight w:val="yellow"/>
         </w:rPr>
-        <w:lastRenderedPageBreak/>
         <w:t>Riesgo aceptable-limitado: revisión mensual de indicadores y revisión integral semestral.</w:t>
       </w:r>
     </w:p>
@@ -10834,6 +10887,7 @@
           <w:color w:val="000000"/>
           <w:highlight w:val="cyan"/>
         </w:rPr>
+        <w:lastRenderedPageBreak/>
         <w:t>No utilizar herramientas de IA externas que no figuren en el catálogo institucional.</w:t>
       </w:r>
     </w:p>
@@ -10903,7 +10957,6 @@
           <w:bCs w:val="0"/>
           <w:color w:val="000000"/>
         </w:rPr>
-        <w:lastRenderedPageBreak/>
         <w:t>No utilizar herramientas de IA para eludir controles internos o procedimientos establecidos.</w:t>
       </w:r>
     </w:p>
@@ -11073,6 +11126,7 @@
           <w:rFonts w:ascii="Arial" w:eastAsia="Arial" w:hAnsi="Arial" w:cs="Arial"/>
           <w:color w:val="000000"/>
         </w:rPr>
+        <w:lastRenderedPageBreak/>
         <w:t>6.12.1</w:t>
       </w:r>
       <w:r>
@@ -11109,16 +11163,7 @@
           <w:highlight w:val="yellow"/>
         </w:rPr>
         <w:tab/>
-        <w:t xml:space="preserve">Los contratos incluyen cláusulas sobre: (a) protección de datos y reserva tributaria; (b) transparencia del modelo; (c) comunicación de vulnerabilidades e incidentes; (d) derecho de auditoría, incluida la realización de auditorías éticas </w:t>
-      </w:r>
-      <w:r>
-        <w:rPr>
-          <w:rFonts w:ascii="Arial" w:eastAsia="Arial" w:hAnsi="Arial" w:cs="Arial"/>
-          <w:color w:val="000000"/>
-          <w:highlight w:val="yellow"/>
-        </w:rPr>
-        <w:lastRenderedPageBreak/>
-        <w:t>y de sesgo sobre el modelo; (e) transferencia de conocimiento; (f) cumplimiento de estándares técnicos. El plazo de notificación de vulnerabilidades se define en los TDR o EETT de cada contratación, según la criticidad del SBIA.</w:t>
+        <w:t>Los contratos incluyen cláusulas sobre: (a) protección de datos y reserva tributaria; (b) transparencia del modelo; (c) comunicación de vulnerabilidades e incidentes; (d) derecho de auditoría, incluida la realización de auditorías éticas y de sesgo sobre el modelo; (e) transferencia de conocimiento; (f) cumplimiento de estándares técnicos. El plazo de notificación de vulnerabilidades se define en los TDR o EETT de cada contratación, según la criticidad del SBIA.</w:t>
       </w:r>
     </w:p>
     <w:p>
@@ -11423,6 +11468,7 @@
           <w:color w:val="000000"/>
           <w:highlight w:val="lightGray"/>
         </w:rPr>
+        <w:lastRenderedPageBreak/>
         <w:t>La protección de la reserva tributaria, secreto comercial y demás obligaciones de confidencialidad aplicables.</w:t>
       </w:r>
     </w:p>
@@ -11469,16 +11515,7 @@
           <w:color w:val="000000"/>
           <w:highlight w:val="lightGray"/>
         </w:rPr>
-        <w:t xml:space="preserve">Esta disposición incorpora los requerimientos establecidos en el numeral 28.9 del artículo 28 del Reglamento y adopta medidas adicionales de sensibilización </w:t>
-      </w:r>
-      <w:r>
-        <w:rPr>
-          <w:rFonts w:ascii="Arial" w:eastAsia="Arial" w:hAnsi="Arial" w:cs="Arial"/>
-          <w:color w:val="000000"/>
-          <w:highlight w:val="lightGray"/>
-        </w:rPr>
-        <w:lastRenderedPageBreak/>
-        <w:t>orientadas a promover el uso seguro, responsable y ético de los sistemas basados en IA, en concordancia con el numeral 7.3 de la NTP-ISO/IEC 42001:2025.</w:t>
+        <w:t>Esta disposición incorpora los requerimientos establecidos en el numeral 28.9 del artículo 28 del Reglamento y adopta medidas adicionales de sensibilización orientadas a promover el uso seguro, responsable y ético de los sistemas basados en IA, en concordancia con el numeral 7.3 de la NTP-ISO/IEC 42001:2025.</w:t>
       </w:r>
     </w:p>
     <w:p>
@@ -11838,6 +11875,7 @@
         <w:rPr>
           <w:highlight w:val="yellow"/>
         </w:rPr>
+        <w:lastRenderedPageBreak/>
         <w:t>6.14</w:t>
       </w:r>
       <w:r>
@@ -11877,16 +11915,7 @@
           <w:highlight w:val="yellow"/>
         </w:rPr>
         <w:tab/>
-        <w:t xml:space="preserve">En el desarrollo, la implementación y el uso de los SBIA, la SUNAT promueve la participación de equipos diversos y multidisciplinarios, garantiza el pleno respeto de los derechos humanos y evita que se generen resultados injustos o </w:t>
-      </w:r>
-      <w:r>
-        <w:rPr>
-          <w:rFonts w:ascii="Arial" w:eastAsia="Arial" w:hAnsi="Arial" w:cs="Arial"/>
-          <w:color w:val="000000"/>
-          <w:highlight w:val="yellow"/>
-        </w:rPr>
-        <w:lastRenderedPageBreak/>
-        <w:t>discriminatorios, considera el impacto social y ambiental, e implementa las mejores prácticas, estándares y normas técnicas para identificar y minimizar los sesgos de los algoritmos y de las bases de datos utilizados</w:t>
+        <w:t>En el desarrollo, la implementación y el uso de los SBIA, la SUNAT promueve la participación de equipos diversos y multidisciplinarios, garantiza el pleno respeto de los derechos humanos y evita que se generen resultados injustos o discriminatorios, considera el impacto social y ambiental, e implementa las mejores prácticas, estándares y normas técnicas para identificar y minimizar los sesgos de los algoritmos y de las bases de datos utilizados</w:t>
       </w:r>
       <w:r>
         <w:rPr>
@@ -12105,6 +12134,7 @@
         <w:rPr>
           <w:highlight w:val="lightGray"/>
         </w:rPr>
+        <w:lastRenderedPageBreak/>
         <w:t>6.15.5 Las unidades competentes de cada instrumento incorporan en sus metodologías o procedimientos la verificación del componente de IA y la opinión de la Comisión, según sus competencias y sin afectar los sistemas administrativos del Estado, conforme al numeral 7.6</w:t>
       </w:r>
       <w:r>
@@ -12120,7 +12150,7 @@
           <w:szCs w:val="22"/>
         </w:rPr>
       </w:pPr>
-      <w:bookmarkStart w:id="10" w:name="_Toc235003967"/>
+      <w:bookmarkStart w:id="9" w:name="_Toc235003967"/>
       <w:r>
         <w:rPr>
           <w:rFonts w:cs="Arial"/>
@@ -12131,7 +12161,7 @@
         <w:lastRenderedPageBreak/>
         <w:t>DISPOSICIONES FINALES</w:t>
       </w:r>
-      <w:bookmarkEnd w:id="10"/>
+      <w:bookmarkEnd w:id="9"/>
     </w:p>
     <w:p>
       <w:pPr>
@@ -12480,7 +12510,7 @@
           <w:szCs w:val="22"/>
         </w:rPr>
       </w:pPr>
-      <w:bookmarkStart w:id="11" w:name="_Toc235003968"/>
+      <w:bookmarkStart w:id="10" w:name="_Toc235003968"/>
       <w:r>
         <w:rPr>
           <w:rFonts w:cs="Arial"/>
@@ -12490,7 +12520,7 @@
         </w:rPr>
         <w:t>ANEXOS</w:t>
       </w:r>
-      <w:bookmarkEnd w:id="11"/>
+      <w:bookmarkEnd w:id="10"/>
     </w:p>
     <w:p>
       <w:pPr>
@@ -16642,23 +16672,7 @@
       </w:r>
     </w:p>
   </w:comment>
-  <w:comment w:id="7" w:author="Kut Castro Mario Fernando" w:date="2026-07-21T11:27:00Z" w:initials="MK">
-    <w:p>
-      <w:pPr>
-        <w:pStyle w:val="Textocomentario"/>
-      </w:pPr>
-      <w:r>
-        <w:rPr>
-          <w:rStyle w:val="Refdecomentario"/>
-        </w:rPr>
-        <w:annotationRef/>
-      </w:r>
-      <w:r>
-        <w:t>Representantes INGP, INER, INDIA, (Para revisión del ROF), a evaluar.</w:t>
-      </w:r>
-    </w:p>
-  </w:comment>
-  <w:comment w:id="9" w:author="Kut Castro Mario Fernando" w:date="2026-07-21T11:40:00Z" w:initials="MK">
+  <w:comment w:id="8" w:author="Kut Castro Mario Fernando" w:date="2026-07-21T11:40:00Z" w:initials="MK">
     <w:p>
       <w:pPr>
         <w:pStyle w:val="Textocomentario"/>
@@ -16680,7 +16694,6 @@
 <file path=word/commentsExtended.xml><?xml version="1.0" encoding="utf-8"?>
 <w15:commentsEx xmlns:wpc="http://schemas.microsoft.com/office/word/2010/wordprocessingCanvas" xmlns:cx="http://schemas.microsoft.com/office/drawing/2014/chartex" xmlns:cx1="http://schemas.microsoft.com/office/drawing/2015/9/8/chartex" xmlns:cx2="http://schemas.microsoft.com/office/drawing/2015/10/21/chartex" xmlns:cx3="http://schemas.microsoft.com/office/drawing/2016/5/9/chartex" xmlns:cx4="http://schemas.microsoft.com/office/drawing/2016/5/10/chartex" xmlns:cx5="http://schemas.microsoft.com/office/drawing/2016/5/11/chartex" xmlns:cx6="http://schemas.microsoft.com/office/drawing/2016/5/12/chartex" xmlns:cx7="http://schemas.microsoft.com/office/drawing/2016/5/13/chartex" xmlns:cx8="http://schemas.microsoft.com/office/drawing/2016/5/14/chartex" xmlns:mc="http://schemas.openxmlformats.org/markup-compatibility/2006" xmlns:aink="http://schemas.microsoft.com/office/drawing/2016/ink" xmlns:am3d="http://schemas.microsoft.com/office/drawing/2017/model3d" xmlns:o="urn:schemas-microsoft-com:office:office" xmlns:oel="http://schemas.microsoft.com/office/2019/extlst" xmlns:r="http://schemas.openxmlformats.org/officeDocument/2006/relationships" xmlns:m="http://schemas.openxmlformats.org/officeDocument/2006/math" xmlns:v="urn:schemas-microsoft-com:vml" xmlns:wp14="http://schemas.microsoft.com/office/word/2010/wordprocessingDrawing" xmlns:wp="http://schemas.openxmlformats.org/drawingml/2006/wordprocessingDrawing" xmlns:w10="urn:schemas-microsoft-com:office:word" xmlns:w="http://schemas.openxmlformats.org/wordprocessingml/2006/main" xmlns:w14="http://schemas.microsoft.com/office/word/2010/wordml" xmlns:w15="http://schemas.microsoft.com/office/word/2012/wordml" xmlns:w16cex="http://schemas.microsoft.com/office/word/2018/wordml/cex" xmlns:w16cid="http://schemas.microsoft.com/office/word/2016/wordml/cid" xmlns:w16="http://schemas.microsoft.com/office/word/2018/wordml" xmlns:w16du="http://schemas.microsoft.com/office/word/2023/wordml/word16du" xmlns:w16sdtdh="http://schemas.microsoft.com/office/word/2020/wordml/sdtdatahash" xmlns:w16sdtfl="http://schemas.microsoft.com/office/word/2024/wordml/sdtformatlock" xmlns:w16se="http://schemas.microsoft.com/office/word/2015/wordml/symex" xmlns:wpg="http://schemas.microsoft.com/office/word/2010/wordprocessingGroup" xmlns:wpi="http://schemas.microsoft.com/office/word/2010/wordprocessingInk" xmlns:wne="http://schemas.microsoft.com/office/word/2006/wordml" xmlns:wps="http://schemas.microsoft.com/office/word/2010/wordprocessingShape" mc:Ignorable="w14 w15 w16se w16cid w16 w16cex w16sdtdh w16sdtfl w16du wp14">
   <w15:commentEx w15:paraId="3C0FED1C" w15:done="0"/>
-  <w15:commentEx w15:paraId="2EB03F52" w15:done="0"/>
   <w15:commentEx w15:paraId="7A362A96" w15:done="0"/>
 </w15:commentsEx>
 </file>
@@ -16688,7 +16701,6 @@
 <file path=word/commentsExtensible.xml><?xml version="1.0" encoding="utf-8"?>
 <w16cex:commentsExtensible xmlns:wpc="http://schemas.microsoft.com/office/word/2010/wordprocessingCanvas" xmlns:cx="http://schemas.microsoft.com/office/drawing/2014/chartex" xmlns:cx1="http://schemas.microsoft.com/office/drawing/2015/9/8/chartex" xmlns:cx2="http://schemas.microsoft.com/office/drawing/2015/10/21/chartex" xmlns:cx3="http://schemas.microsoft.com/office/drawing/2016/5/9/chartex" xmlns:cx4="http://schemas.microsoft.com/office/drawing/2016/5/10/chartex" xmlns:cx5="http://schemas.microsoft.com/office/drawing/2016/5/11/chartex" xmlns:cx6="http://schemas.microsoft.com/office/drawing/2016/5/12/chartex" xmlns:cx7="http://schemas.microsoft.com/office/drawing/2016/5/13/chartex" xmlns:cx8="http://schemas.microsoft.com/office/drawing/2016/5/14/chartex" xmlns:cr="http://schemas.microsoft.com/office/comments/2020/reactions" xmlns:mc="http://schemas.openxmlformats.org/markup-compatibility/2006" xmlns:aink="http://schemas.microsoft.com/office/drawing/2016/ink" xmlns:am3d="http://schemas.microsoft.com/office/drawing/2017/model3d" xmlns:o="urn:schemas-microsoft-com:office:office" xmlns:oel="http://schemas.microsoft.com/office/2019/extlst" xmlns:r="http://schemas.openxmlformats.org/officeDocument/2006/relationships" xmlns:m="http://schemas.openxmlformats.org/officeDocument/2006/math" xmlns:v="urn:schemas-microsoft-com:vml" xmlns:wp14="http://schemas.microsoft.com/office/word/2010/wordprocessingDrawing" xmlns:wp="http://schemas.openxmlformats.org/drawingml/2006/wordprocessingDrawing" xmlns:w10="urn:schemas-microsoft-com:office:word" xmlns:w="http://schemas.openxmlformats.org/wordprocessingml/2006/main" xmlns:w14="http://schemas.microsoft.com/office/word/2010/wordml" xmlns:w15="http://schemas.microsoft.com/office/word/2012/wordml" xmlns:w16cex="http://schemas.microsoft.com/office/word/2018/wordml/cex" xmlns:w16cid="http://schemas.microsoft.com/office/word/2016/wordml/cid" xmlns:w16="http://schemas.microsoft.com/office/word/2018/wordml" xmlns:w16du="http://schemas.microsoft.com/office/word/2023/wordml/word16du" xmlns:w16sdtdh="http://schemas.microsoft.com/office/word/2020/wordml/sdtdatahash" xmlns:w16sdtfl="http://schemas.microsoft.com/office/word/2024/wordml/sdtformatlock" xmlns:w16se="http://schemas.microsoft.com/office/word/2015/wordml/symex" xmlns:wpg="http://schemas.microsoft.com/office/word/2010/wordprocessingGroup" xmlns:wpi="http://schemas.microsoft.com/office/word/2010/wordprocessingInk" xmlns:wne="http://schemas.microsoft.com/office/word/2006/wordml" xmlns:wps="http://schemas.microsoft.com/office/word/2010/wordprocessingShape" mc:Ignorable="w14 w15 w16se w16cid w16 w16cex w16sdtdh w16sdtfl cr w16du wp14">
   <w16cex:commentExtensible w16cex:durableId="6387E4DA" w16cex:dateUtc="2026-07-21T16:30:00Z"/>
-  <w16cex:commentExtensible w16cex:durableId="2C51B84E" w16cex:dateUtc="2026-07-21T16:27:00Z"/>
   <w16cex:commentExtensible w16cex:durableId="29EDEAD0" w16cex:dateUtc="2026-07-21T16:40:00Z"/>
 </w16cex:commentsExtensible>
 </file>
@@ -16696,7 +16708,6 @@
 <file path=word/commentsIds.xml><?xml version="1.0" encoding="utf-8"?>
 <w16cid:commentsIds xmlns:wpc="http://schemas.microsoft.com/office/word/2010/wordprocessingCanvas" xmlns:cx="http://schemas.microsoft.com/office/drawing/2014/chartex" xmlns:cx1="http://schemas.microsoft.com/office/drawing/2015/9/8/chartex" xmlns:cx2="http://schemas.microsoft.com/office/drawing/2015/10/21/chartex" xmlns:cx3="http://schemas.microsoft.com/office/drawing/2016/5/9/chartex" xmlns:cx4="http://schemas.microsoft.com/office/drawing/2016/5/10/chartex" xmlns:cx5="http://schemas.microsoft.com/office/drawing/2016/5/11/chartex" xmlns:cx6="http://schemas.microsoft.com/office/drawing/2016/5/12/chartex" xmlns:cx7="http://schemas.microsoft.com/office/drawing/2016/5/13/chartex" xmlns:cx8="http://schemas.microsoft.com/office/drawing/2016/5/14/chartex" xmlns:mc="http://schemas.openxmlformats.org/markup-compatibility/2006" xmlns:aink="http://schemas.microsoft.com/office/drawing/2016/ink" xmlns:am3d="http://schemas.microsoft.com/office/drawing/2017/model3d" xmlns:o="urn:schemas-microsoft-com:office:office" xmlns:oel="http://schemas.microsoft.com/office/2019/extlst" xmlns:r="http://schemas.openxmlformats.org/officeDocument/2006/relationships" xmlns:m="http://schemas.openxmlformats.org/officeDocument/2006/math" xmlns:v="urn:schemas-microsoft-com:vml" xmlns:wp14="http://schemas.microsoft.com/office/word/2010/wordprocessingDrawing" xmlns:wp="http://schemas.openxmlformats.org/drawingml/2006/wordprocessingDrawing" xmlns:w10="urn:schemas-microsoft-com:office:word" xmlns:w="http://schemas.openxmlformats.org/wordprocessingml/2006/main" xmlns:w14="http://schemas.microsoft.com/office/word/2010/wordml" xmlns:w15="http://schemas.microsoft.com/office/word/2012/wordml" xmlns:w16cex="http://schemas.microsoft.com/office/word/2018/wordml/cex" xmlns:w16cid="http://schemas.microsoft.com/office/word/2016/wordml/cid" xmlns:w16="http://schemas.microsoft.com/office/word/2018/wordml" xmlns:w16du="http://schemas.microsoft.com/office/word/2023/wordml/word16du" xmlns:w16sdtdh="http://schemas.microsoft.com/office/word/2020/wordml/sdtdatahash" xmlns:w16sdtfl="http://schemas.microsoft.com/office/word/2024/wordml/sdtformatlock" xmlns:w16se="http://schemas.microsoft.com/office/word/2015/wordml/symex" xmlns:wpg="http://schemas.microsoft.com/office/word/2010/wordprocessingGroup" xmlns:wpi="http://schemas.microsoft.com/office/word/2010/wordprocessingInk" xmlns:wne="http://schemas.microsoft.com/office/word/2006/wordml" xmlns:wps="http://schemas.microsoft.com/office/word/2010/wordprocessingShape" mc:Ignorable="w14 w15 w16se w16cid w16 w16cex w16sdtdh w16sdtfl w16du wp14">
   <w16cid:commentId w16cid:paraId="3C0FED1C" w16cid:durableId="6387E4DA"/>
-  <w16cid:commentId w16cid:paraId="2EB03F52" w16cid:durableId="2C51B84E"/>
   <w16cid:commentId w16cid:paraId="7A362A96" w16cid:durableId="29EDEAD0"/>
 </w16cid:commentsIds>
 </file>

</xml_diff>

<commit_message>
docs: reformula 6.1.5 (INSI desarrolla y aprueba la metodologia del ciclo de vida del SBIA, con opinion de la Comision) y precisa 7.6 (documentos de menor rango no modifican la directiva)
</commit_message>
<xml_diff>
--- a/normativo/DIRECTIVA-GOBIERNO-IA.docx
+++ b/normativo/DIRECTIVA-GOBIERNO-IA.docx
@@ -8641,12 +8641,11 @@
           <w:color w:val="000000"/>
         </w:rPr>
       </w:pPr>
-      <w:commentRangeStart w:id="8"/>
       <w:r>
         <w:rPr>
           <w:rFonts w:ascii="Arial" w:hAnsi="Arial" w:cs="Arial"/>
           <w:color w:val="000000"/>
-          <w:highlight w:val="cyan"/>
+          <w:highlight w:val="lightGray"/>
         </w:rPr>
         <w:t>6.1.5</w:t>
       </w:r>
@@ -8654,21 +8653,89 @@
         <w:rPr>
           <w:rFonts w:ascii="Arial" w:hAnsi="Arial" w:cs="Arial"/>
           <w:color w:val="000000"/>
-          <w:highlight w:val="cyan"/>
+          <w:highlight w:val="lightGray"/>
         </w:rPr>
         <w:tab/>
-        <w:t>La INSI aprueba, con opinión favorable del CGTD, la metodología del ciclo de vida del SBIA previsto en el numeral 6.1.1, conforme a sus competencias y a la METDONI. La metodología comprende, como mínimo: el desarrollo y la aplicación de la clasificación de riesgo (Anexo N.° 2) y de la evaluación de impacto algorítmico (Anexo N.° 3), los criterios técnicos de diseño de la arquitectura de los SBIA, el contenido de los entregables de cada etapa, los tipos y las técnicas de prueba aplicables según el nivel de riesgo, los controles de contención, las prácticas de monitoreo y las condiciones de retiro. En tanto no se apruebe, los SBIA siguen el ciclo de vida del numeral 6.1.1 y la normativa de desarrollo de sistemas vigente en la SUNAT.</w:t>
-      </w:r>
-      <w:commentRangeEnd w:id="8"/>
-      <w:r>
-        <w:rPr>
-          <w:rStyle w:val="Refdecomentario"/>
-          <w:rFonts w:ascii="Arial" w:eastAsia="Arial" w:hAnsi="Arial" w:cs="Arial"/>
-          <w:color w:val="000000"/>
-          <w:sz w:val="22"/>
-          <w:szCs w:val="22"/>
-        </w:rPr>
-        <w:commentReference w:id="8"/>
+      </w:r>
+      <w:r>
+        <w:rPr>
+          <w:rFonts w:ascii="Arial" w:hAnsi="Arial" w:cs="Arial"/>
+          <w:color w:val="000000"/>
+          <w:highlight w:val="lightGray"/>
+        </w:rPr>
+        <w:t>La INSI desarrolla y aprueba, conforme a sus competencias y a la METDONI, la metodología del ciclo de vida del SBIA previsto en el numeral 6.1.1.Por comprender actuaciones a cargo de unidades de organización distintas de la INSI, su formulación recoge los aportes de dichas unidades y su aprobación</w:t>
+      </w:r>
+      <w:r>
+        <w:rPr>
+          <w:rFonts w:ascii="Arial" w:hAnsi="Arial" w:cs="Arial"/>
+          <w:color w:val="000000"/>
+          <w:highlight w:val="lightGray"/>
+        </w:rPr>
+        <w:t xml:space="preserve"> </w:t>
+      </w:r>
+      <w:r>
+        <w:rPr>
+          <w:rFonts w:ascii="Arial" w:hAnsi="Arial" w:cs="Arial"/>
+          <w:color w:val="000000"/>
+          <w:highlight w:val="lightGray"/>
+        </w:rPr>
+        <w:t>requiere la opinión favorable de la Comisión de Gobierno de IA, en ejercicio de las facultades previstas en el literal h del numeral 6.4 y en el numeral 6.5 de la METDONI. La metodología comprende, como mínimo: la aplicación de la clasificación de riesgo y de la evaluación de impacto algorítmico, los criterios</w:t>
+      </w:r>
+      <w:r>
+        <w:rPr>
+          <w:rFonts w:ascii="Arial" w:hAnsi="Arial" w:cs="Arial"/>
+          <w:color w:val="000000"/>
+          <w:highlight w:val="lightGray"/>
+        </w:rPr>
+        <w:t xml:space="preserve"> </w:t>
+      </w:r>
+      <w:r>
+        <w:rPr>
+          <w:rFonts w:ascii="Arial" w:hAnsi="Arial" w:cs="Arial"/>
+          <w:color w:val="000000"/>
+          <w:highlight w:val="lightGray"/>
+        </w:rPr>
+        <w:t>técnicos de diseño de la arquitectura de los SBIA, el contenido de los entregables de cada etapa, los tipos y las técnicas de prueba aplicables según</w:t>
+      </w:r>
+      <w:r>
+        <w:rPr>
+          <w:rFonts w:ascii="Arial" w:hAnsi="Arial" w:cs="Arial"/>
+          <w:color w:val="000000"/>
+          <w:highlight w:val="lightGray"/>
+        </w:rPr>
+        <w:t xml:space="preserve"> </w:t>
+      </w:r>
+      <w:r>
+        <w:rPr>
+          <w:rFonts w:ascii="Arial" w:hAnsi="Arial" w:cs="Arial"/>
+          <w:color w:val="000000"/>
+          <w:highlight w:val="lightGray"/>
+        </w:rPr>
+        <w:t>el nivel de riesgo, los controles de contención, las prácticas de monitoreo y las condiciones de retiro. En tanto no se apruebe, los SBIA siguen el ciclo de</w:t>
+      </w:r>
+      <w:r>
+        <w:rPr>
+          <w:rFonts w:ascii="Arial" w:hAnsi="Arial" w:cs="Arial"/>
+          <w:color w:val="000000"/>
+          <w:highlight w:val="lightGray"/>
+        </w:rPr>
+        <w:t xml:space="preserve"> </w:t>
+      </w:r>
+      <w:r>
+        <w:rPr>
+          <w:rFonts w:ascii="Arial" w:hAnsi="Arial" w:cs="Arial"/>
+          <w:color w:val="000000"/>
+          <w:highlight w:val="lightGray"/>
+        </w:rPr>
+        <w:t>vida del numeral 6.1.1 y la normativa de desarrollo de sistemas vigente en la SUNAT</w:t>
+      </w:r>
+      <w:r>
+        <w:rPr>
+          <w:rFonts w:ascii="Arial" w:hAnsi="Arial" w:cs="Arial"/>
+          <w:color w:val="000000"/>
+          <w:highlight w:val="lightGray"/>
+        </w:rPr>
+        <w:t>.</w:t>
       </w:r>
     </w:p>
     <w:p>
@@ -8752,7 +8819,16 @@
           <w:color w:val="000000"/>
           <w:highlight w:val="yellow"/>
         </w:rPr>
-        <w:t xml:space="preserve">La opinión de la OII, en materia de ética, integridad y prevención de sesgos, y la de la INALI, en materia de cumplimiento normativo, constan de manera expresa en la propuesta. El CGTD aprueba la clasificación de las iniciativas de SBIA de riesgo alto y de aquellos estratégicos para la entidad; la Comisión de Gobierno de IA aprueba la clasificación de los SBIA de riesgo aceptable e informa de ello al CGTD. </w:t>
+        <w:t xml:space="preserve">La opinión de la OII, en materia de ética, integridad y prevención de sesgos, y la de la INALI, en materia de cumplimiento normativo, constan de manera expresa en la propuesta. El CGTD aprueba la clasificación de las iniciativas de SBIA de riesgo alto y de aquellos estratégicos para la entidad; la Comisión de Gobierno de IA aprueba la clasificación de los SBIA de riesgo aceptable e informa de ello </w:t>
+      </w:r>
+      <w:r>
+        <w:rPr>
+          <w:rFonts w:ascii="Arial" w:eastAsia="Arial" w:hAnsi="Arial" w:cs="Arial"/>
+          <w:color w:val="000000"/>
+          <w:highlight w:val="yellow"/>
+        </w:rPr>
+        <w:lastRenderedPageBreak/>
+        <w:t xml:space="preserve">al CGTD. </w:t>
       </w:r>
       <w:r>
         <w:rPr>
@@ -8786,7 +8862,6 @@
           <w:color w:val="000000"/>
           <w:highlight w:val="yellow"/>
         </w:rPr>
-        <w:lastRenderedPageBreak/>
         <w:t>6.2.3</w:t>
       </w:r>
       <w:r>
@@ -9057,7 +9132,16 @@
           <w:highlight w:val="yellow"/>
         </w:rPr>
         <w:tab/>
-        <w:t>Cuando la EIA detecte riesgos que afecten los derechos fundamentales o puedan generar decisiones automatizadas erróneas, el propietario del caso de uso y el equipo técnico del SBIA adoptan las medidas necesarias para mitigar los impactos y realizan los ajustes necesarios previos a la implementación final, entre ellos ajustes en los modelos, mejora en la calidad de los datos y mecanismos de supervisión humana. Dichas medidas quedan documentadas</w:t>
+        <w:t xml:space="preserve">Cuando la EIA detecte riesgos que afecten los derechos fundamentales o puedan generar decisiones automatizadas erróneas, el propietario del caso de uso y el equipo técnico del SBIA adoptan las medidas necesarias para mitigar </w:t>
+      </w:r>
+      <w:r>
+        <w:rPr>
+          <w:rFonts w:ascii="Arial" w:eastAsia="Arial" w:hAnsi="Arial" w:cs="Arial"/>
+          <w:color w:val="000000"/>
+          <w:highlight w:val="yellow"/>
+        </w:rPr>
+        <w:lastRenderedPageBreak/>
+        <w:t>los impactos y realizan los ajustes necesarios previos a la implementación final, entre ellos ajustes en los modelos, mejora en la calidad de los datos y mecanismos de supervisión humana. Dichas medidas quedan documentadas</w:t>
       </w:r>
       <w:r>
         <w:rPr>
@@ -9096,7 +9180,6 @@
           <w:szCs w:val="24"/>
           <w:highlight w:val="cyan"/>
         </w:rPr>
-        <w:lastRenderedPageBreak/>
         <w:t>Del diseño, la operación y la seguridad de los SBIA</w:t>
       </w:r>
     </w:p>
@@ -9382,7 +9465,7 @@
           <w:color w:val="000000"/>
           <w:highlight w:val="lightGray"/>
         </w:rPr>
-        <w:t xml:space="preserve">La publicación del código fuente de los SBIA financiados con fondos públicos, con licencia libre o abierta en la Plataforma Nacional de Software Público Peruano (PNSSP), se sujeta a la determinación previa de su publicabilidad. Dicha determinación verifica que el código no revele información sujeta a reserva tributaria conforme al artículo 85 del TUO del Código Tributario, información protegida por confidencialidad aduanera, ni reglas de detección de riesgo cuya divulgación comprometa la función de control. La GA, con opinión </w:t>
+        <w:t xml:space="preserve">La publicación del código fuente de los SBIA financiados con fondos públicos, con licencia libre o abierta en la Plataforma Nacional de Software Público Peruano (PNSSP), se sujeta a la determinación previa de su publicabilidad. </w:t>
       </w:r>
       <w:r>
         <w:rPr>
@@ -9391,7 +9474,7 @@
           <w:highlight w:val="lightGray"/>
         </w:rPr>
         <w:lastRenderedPageBreak/>
-        <w:t xml:space="preserve">de la INALI y de la Oficina de Seguridad Informática, determina la publicabilidad antes de cada liberación mayor; la GDS ejecuta la publicación cuando corresponda. </w:t>
+        <w:t xml:space="preserve">Dicha determinación verifica que el código no revele información sujeta a reserva tributaria conforme al artículo 85 del TUO del Código Tributario, información protegida por confidencialidad aduanera, ni reglas de detección de riesgo cuya divulgación comprometa la función de control. La GA, con opinión de la INALI y de la Oficina de Seguridad Informática, determina la publicabilidad antes de cada liberación mayor; la GDS ejecuta la publicación cuando corresponda. </w:t>
       </w:r>
     </w:p>
     <w:p>
@@ -9647,6 +9730,7 @@
           <w:color w:val="000000"/>
           <w:highlight w:val="yellow"/>
         </w:rPr>
+        <w:lastRenderedPageBreak/>
         <w:t>Dispone de los medios técnicos y la autoridad para detener, corregir o invalidar una decisión del SBIA cuando lo considere necesario.</w:t>
       </w:r>
     </w:p>
@@ -9704,7 +9788,6 @@
           <w:rFonts w:ascii="Arial" w:eastAsia="Arial" w:hAnsi="Arial" w:cs="Arial"/>
           <w:color w:val="000000"/>
         </w:rPr>
-        <w:lastRenderedPageBreak/>
         <w:t>6.6.4</w:t>
       </w:r>
       <w:r>
@@ -9900,7 +9983,7 @@
           <w:color w:val="000000"/>
           <w:highlight w:val="cyan"/>
         </w:rPr>
-        <w:t xml:space="preserve"> por el Procedimiento para el registro y atención de incidentes y vulnerabilidades de seguridad de la información (A-03.5.1-PR-003). Los incidentes que se presenten durante la operación de un SBIA en producción y que no constituyan incidentes de seguridad de la información se atienden conforme al Procedimiento de Gestión </w:t>
+        <w:t xml:space="preserve"> por el Procedimiento </w:t>
       </w:r>
       <w:r>
         <w:rPr>
@@ -9909,7 +9992,7 @@
           <w:highlight w:val="cyan"/>
         </w:rPr>
         <w:lastRenderedPageBreak/>
-        <w:t>de Incidentes (A-03.1.1-PR-002). El propietario del caso de uso y las gerencias competentes de la INSI comunican los incidentes del uso y funcionamiento del SBIA por los canales que dichos procedimientos establecen; la Comisión de Gobierno de IA los consolida y los reporta en el informe trimestral del numeral 6.9.5.</w:t>
+        <w:t>para el registro y atención de incidentes y vulnerabilidades de seguridad de la información (A-03.5.1-PR-003). Los incidentes que se presenten durante la operación de un SBIA en producción y que no constituyan incidentes de seguridad de la información se atienden conforme al Procedimiento de Gestión de Incidentes (A-03.1.1-PR-002). El propietario del caso de uso y las gerencias competentes de la INSI comunican los incidentes del uso y funcionamiento del SBIA por los canales que dichos procedimientos establecen; la Comisión de Gobierno de IA los consolida y los reporta en el informe trimestral del numeral 6.9.5.</w:t>
       </w:r>
     </w:p>
     <w:p>
@@ -10206,6 +10289,7 @@
           <w:color w:val="000000"/>
           <w:highlight w:val="lightGray"/>
         </w:rPr>
+        <w:lastRenderedPageBreak/>
         <w:t xml:space="preserve">6.8.5 </w:t>
       </w:r>
       <w:r>
@@ -10222,16 +10306,7 @@
           <w:color w:val="000000"/>
           <w:highlight w:val="lightGray"/>
         </w:rPr>
-        <w:t xml:space="preserve">Los conjuntos de datos que la SUNAT genere o administre y que califiquen como datos de alto valor se ponen a disposición a través del Centro Nacional de Datos (CND), previa determinación de su publicabilidad conforme al artículo 85 del TUO del Código Tributario y a la normativa de protección de datos </w:t>
-      </w:r>
-      <w:r>
-        <w:rPr>
-          <w:rFonts w:ascii="Arial" w:eastAsia="Arial" w:hAnsi="Arial" w:cs="Arial"/>
-          <w:color w:val="000000"/>
-          <w:highlight w:val="lightGray"/>
-        </w:rPr>
-        <w:lastRenderedPageBreak/>
-        <w:t>personales. El OGD identifica los conjuntos candidatos y propone al CGTD su publicación.</w:t>
+        <w:t>Los conjuntos de datos que la SUNAT genere o administre y que califiquen como datos de alto valor se ponen a disposición a través del Centro Nacional de Datos (CND), previa determinación de su publicabilidad conforme al artículo 85 del TUO del Código Tributario y a la normativa de protección de datos personales. El OGD identifica los conjuntos candidatos y propone al CGTD su publicación.</w:t>
       </w:r>
     </w:p>
     <w:p>
@@ -10483,6 +10558,7 @@
           <w:color w:val="000000"/>
           <w:highlight w:val="yellow"/>
         </w:rPr>
+        <w:lastRenderedPageBreak/>
         <w:t>6.9.7</w:t>
       </w:r>
       <w:r>
@@ -10516,7 +10592,6 @@
         <w:ind w:left="851"/>
       </w:pPr>
       <w:r>
-        <w:lastRenderedPageBreak/>
         <w:t>6.10</w:t>
       </w:r>
       <w:r>
@@ -10863,6 +10938,7 @@
           <w:color w:val="000000"/>
           <w:highlight w:val="cyan"/>
         </w:rPr>
+        <w:lastRenderedPageBreak/>
         <w:t>No ingresar información sujeta a reserva tributaria ni datos personales de contribuyentes u operadores aduaneros en herramientas de IA que no estén autorizadas para ese tratamiento en el catálogo institucional. El catálogo indica, para cada herramienta, los tipos de información que puede procesar. El tratamiento de información sujeta a reserva tributaria se rige por el numeral 6.7.3.</w:t>
       </w:r>
     </w:p>
@@ -10887,7 +10963,6 @@
           <w:color w:val="000000"/>
           <w:highlight w:val="cyan"/>
         </w:rPr>
-        <w:lastRenderedPageBreak/>
         <w:t>No utilizar herramientas de IA externas que no figuren en el catálogo institucional.</w:t>
       </w:r>
     </w:p>
@@ -11083,7 +11158,16 @@
           <w:color w:val="000000"/>
           <w:highlight w:val="cyan"/>
         </w:rPr>
-        <w:t xml:space="preserve"> El registro, el control y el retiro de las herramientas de IA como software se rigen por el Procedimiento para el Registro, Control y Retiro de Software de la SUNAT (A-03.3.2-PR-01).</w:t>
+        <w:t xml:space="preserve"> El registro, el control y el retiro de las herramientas de IA como software se rigen por el </w:t>
+      </w:r>
+      <w:r>
+        <w:rPr>
+          <w:rFonts w:ascii="Arial" w:eastAsia="Arial" w:hAnsi="Arial" w:cs="Arial"/>
+          <w:color w:val="000000"/>
+          <w:highlight w:val="cyan"/>
+        </w:rPr>
+        <w:lastRenderedPageBreak/>
+        <w:t>Procedimiento para el Registro, Control y Retiro de Software de la SUNAT (A-03.3.2-PR-01).</w:t>
       </w:r>
     </w:p>
     <w:p>
@@ -11126,7 +11210,6 @@
           <w:rFonts w:ascii="Arial" w:eastAsia="Arial" w:hAnsi="Arial" w:cs="Arial"/>
           <w:color w:val="000000"/>
         </w:rPr>
-        <w:lastRenderedPageBreak/>
         <w:t>6.12.1</w:t>
       </w:r>
       <w:r>
@@ -11390,6 +11473,7 @@
           <w:color w:val="000000"/>
           <w:highlight w:val="lightGray"/>
         </w:rPr>
+        <w:lastRenderedPageBreak/>
         <w:t>La finalidad y los principios institucionales aplicables a los sistemas basados en IA.</w:t>
       </w:r>
     </w:p>
@@ -11468,7 +11552,6 @@
           <w:color w:val="000000"/>
           <w:highlight w:val="lightGray"/>
         </w:rPr>
-        <w:lastRenderedPageBreak/>
         <w:t>La protección de la reserva tributaria, secreto comercial y demás obligaciones de confidencialidad aplicables.</w:t>
       </w:r>
     </w:p>
@@ -11846,7 +11929,16 @@
           <w:color w:val="000000"/>
           <w:highlight w:val="lightGray"/>
         </w:rPr>
-        <w:t>Las acciones de gestión del cambio facilitan la consolidación de la Política institucional de uso seguro, responsable y ético de los sistemas basados en IA y del sistema de gestión de IA, promoviendo su integración en la gestión institucional y favoreciendo las condiciones organizacionales necesarias para su sostenibilidad y mejora continua, en concordancia con los numerales 28.1 y 28.2 del artículo 28 del Reglamento.</w:t>
+        <w:t xml:space="preserve">Las acciones de gestión del cambio facilitan la consolidación de la Política institucional de uso seguro, responsable y ético de los sistemas basados en IA y del sistema de gestión de IA, promoviendo su integración en la gestión institucional y favoreciendo las condiciones organizacionales necesarias para su sostenibilidad y </w:t>
+      </w:r>
+      <w:r>
+        <w:rPr>
+          <w:rFonts w:ascii="Arial" w:eastAsia="Arial" w:hAnsi="Arial" w:cs="Arial"/>
+          <w:color w:val="000000"/>
+          <w:highlight w:val="lightGray"/>
+        </w:rPr>
+        <w:lastRenderedPageBreak/>
+        <w:t>mejora continua, en concordancia con los numerales 28.1 y 28.2 del artículo 28 del Reglamento.</w:t>
       </w:r>
     </w:p>
     <w:p>
@@ -11875,7 +11967,6 @@
         <w:rPr>
           <w:highlight w:val="yellow"/>
         </w:rPr>
-        <w:lastRenderedPageBreak/>
         <w:t>6.14</w:t>
       </w:r>
       <w:r>
@@ -12049,11 +12140,13 @@
         <w:ind w:left="1276" w:hanging="709"/>
         <w:jc w:val="both"/>
         <w:rPr>
+          <w:rFonts w:ascii="Arial" w:hAnsi="Arial" w:cs="Arial"/>
           <w:highlight w:val="lightGray"/>
         </w:rPr>
       </w:pPr>
       <w:r>
         <w:rPr>
+          <w:rFonts w:ascii="Arial" w:hAnsi="Arial" w:cs="Arial"/>
           <w:highlight w:val="lightGray"/>
         </w:rPr>
         <w:t>6.15.1 Toda iniciativa, requerimiento o proyecto que incorpore o prevea un componente basado en IA requiere la opinión de viabilidad de la Comisión de Gobierno de IA sobre dicho componente. La opinión es insumo del análisis que sustenta la decisión que corresponda y es determinante respecto del componente de IA; no sustituye las aprobaciones que competen a la Alta Dirección ni las de los sistemas administrativos del Estado. Se emite sobre la Ficha de Evaluación de Caso de Uso (Anexo N.° 4), adecuada a la naturaleza y magnitud de la iniciativa, requerimiento o proyecto.</w:t>
@@ -12068,11 +12161,13 @@
         <w:ind w:left="1276" w:hanging="709"/>
         <w:jc w:val="both"/>
         <w:rPr>
+          <w:rFonts w:ascii="Arial" w:hAnsi="Arial" w:cs="Arial"/>
           <w:highlight w:val="lightGray"/>
         </w:rPr>
       </w:pPr>
       <w:r>
         <w:rPr>
+          <w:rFonts w:ascii="Arial" w:hAnsi="Arial" w:cs="Arial"/>
           <w:highlight w:val="lightGray"/>
         </w:rPr>
         <w:t>6.15.2 En la gestión de la demanda informática, cuando un requerimiento implique el desarrollo, la adquisición o el uso de un SBIA o de una herramienta de IA, se recaba la opinión de la Comisión antes de su atención, con los formatos vigentes de la demanda complementados con la información que la INSI determine.</w:t>
@@ -12087,13 +12182,16 @@
         <w:ind w:left="1276" w:hanging="709"/>
         <w:jc w:val="both"/>
         <w:rPr>
+          <w:rFonts w:ascii="Arial" w:hAnsi="Arial" w:cs="Arial"/>
           <w:highlight w:val="lightGray"/>
         </w:rPr>
       </w:pPr>
       <w:r>
         <w:rPr>
+          <w:rFonts w:ascii="Arial" w:hAnsi="Arial" w:cs="Arial"/>
           <w:highlight w:val="lightGray"/>
         </w:rPr>
+        <w:lastRenderedPageBreak/>
         <w:t>6.15.3 En la formulación de proyectos institucionales conforme al MGPP, cuando se identifique un componente basado en IA se incorpora la opinión de la Comisión como parte del caso de negocio, con carácter previo a su aprobación.</w:t>
       </w:r>
     </w:p>
@@ -12106,11 +12204,13 @@
         <w:ind w:left="1276" w:hanging="709"/>
         <w:jc w:val="both"/>
         <w:rPr>
+          <w:rFonts w:ascii="Arial" w:hAnsi="Arial" w:cs="Arial"/>
           <w:highlight w:val="lightGray"/>
         </w:rPr>
       </w:pPr>
       <w:r>
         <w:rPr>
+          <w:rFonts w:ascii="Arial" w:hAnsi="Arial" w:cs="Arial"/>
           <w:highlight w:val="lightGray"/>
         </w:rPr>
         <w:t>6.15.4 Cuando un proyecto de inversión pública sujeto al Sistema Nacional de Programación Multianual y Gestión de Inversiones incorpore un componente basado en IA, la Unidad Formuladora considera la opinión de la Comisión como insumo del análisis técnico que sustenta la declaración de viabilidad, sin perjuicio de las disposiciones del referido Sistema. En la ejecución, el SBIA observa el ciclo de vida del numeral 6.1.</w:t>
@@ -12134,7 +12234,6 @@
         <w:rPr>
           <w:highlight w:val="lightGray"/>
         </w:rPr>
-        <w:lastRenderedPageBreak/>
         <w:t>6.15.5 Las unidades competentes de cada instrumento incorporan en sus metodologías o procedimientos la verificación del componente de IA y la opinión de la Comisión, según sus competencias y sin afectar los sistemas administrativos del Estado, conforme al numeral 7.6</w:t>
       </w:r>
       <w:r>
@@ -12150,7 +12249,7 @@
           <w:szCs w:val="22"/>
         </w:rPr>
       </w:pPr>
-      <w:bookmarkStart w:id="9" w:name="_Toc235003967"/>
+      <w:bookmarkStart w:id="8" w:name="_Toc235003967"/>
       <w:r>
         <w:rPr>
           <w:rFonts w:cs="Arial"/>
@@ -12161,7 +12260,7 @@
         <w:lastRenderedPageBreak/>
         <w:t>DISPOSICIONES FINALES</w:t>
       </w:r>
-      <w:bookmarkEnd w:id="9"/>
+      <w:bookmarkEnd w:id="8"/>
     </w:p>
     <w:p>
       <w:pPr>
@@ -12329,7 +12428,16 @@
           <w:color w:val="000000"/>
           <w:highlight w:val="cyan"/>
         </w:rPr>
-        <w:t>Las unidades de organización a las que la presente directiva asigna una responsabilidad desarrollan y aprueban, en el ámbito de las competencias que les reconoce el ROF, los documentos normativos institucionales de menor rango (metodologías, guías metodológicas, procedimientos, instructivos y lineamientos temporales) que establecen la forma de ejecutar dicha responsabilidad, conforme a la METDONI. Los encargos son los previstos en las disposiciones específicas de la presente directiva; su plazo se establece mediante acuerdo del Comité de Gobierno y Transformación Digital. La Comisión de Gobierno de IA hace seguimiento de su cumplimiento y lo reporta en el informe trimestral del numeral 6.9.5; cuando identifique la necesidad de un instrumento no previsto, propone al CGTD la unidad competente.</w:t>
+        <w:t xml:space="preserve">Las unidades de organización a las que la presente directiva asigna una responsabilidad desarrollan y aprueban, en el ámbito de las competencias que les reconoce el ROF, los documentos normativos institucionales de menor rango (metodologías, guías metodológicas, procedimientos, instructivos y lineamientos temporales) que establecen la forma de ejecutar dicha responsabilidad, conforme a la METDONI. </w:t>
+      </w:r>
+      <w:r>
+        <w:rPr>
+          <w:b w:val="0"/>
+          <w:bCs w:val="0"/>
+          <w:color w:val="000000"/>
+          <w:highlight w:val="lightGray"/>
+        </w:rPr>
+        <w:t>Dichos documentos desarrollan la aplicación de lo dispuesto en la presente directiva y no modifican sus disposiciones, sus Anexos ni las competencias de aprobación que establece</w:t>
       </w:r>
     </w:p>
     <w:p>
@@ -12488,17 +12596,25 @@
           <w:bCs w:val="0"/>
           <w:highlight w:val="yellow"/>
         </w:rPr>
+        <w:t>7.11</w:t>
+      </w:r>
+      <w:r>
+        <w:rPr>
+          <w:b w:val="0"/>
+          <w:bCs w:val="0"/>
+          <w:highlight w:val="yellow"/>
+        </w:rPr>
+        <w:tab/>
+        <w:t xml:space="preserve">El Plan de Acción de Inteligencia Artificial (PAIA) forma parte del Portafolio de Proyectos del PGD, conforme al numeral 5.5 del artículo 5 de la ENIA. Su aprobación requiere que la SUNAT haya aprobado o implementado previamente su </w:t>
+      </w:r>
+      <w:r>
+        <w:rPr>
+          <w:b w:val="0"/>
+          <w:bCs w:val="0"/>
+          <w:highlight w:val="yellow"/>
+        </w:rPr>
         <w:lastRenderedPageBreak/>
-        <w:t>7.11</w:t>
-      </w:r>
-      <w:r>
-        <w:rPr>
-          <w:b w:val="0"/>
-          <w:bCs w:val="0"/>
-          <w:highlight w:val="yellow"/>
-        </w:rPr>
-        <w:tab/>
-        <w:t>El Plan de Acción de Inteligencia Artificial (PAIA) forma parte del Portafolio de Proyectos del PGD, conforme al numeral 5.5 del artículo 5 de la ENIA. Su aprobación requiere que la SUNAT haya aprobado o implementado previamente su Plan de Acción de Gobierno de Datos (PAGD), conforme al numeral 5.4 del mismo artículo; el PAGD forma parte del PGD y su formulación la coordina el CGTD, en concordancia con la ENGD. Las iniciativas, proyectos y acciones priorizadas en el PAIA se articulan con el Plan Estratégico Institucional, el Plan Operativo Institucional, el Programa Multianual de Inversiones y el PGD, conforme al numeral 4.4 del artículo 4 de la misma norma y al numeral 28.10 del artículo 28 del RLIA. Su formulación corresponde a la fase posterior a la aprobación de la presente directiva.</w:t>
+        <w:t>Plan de Acción de Gobierno de Datos (PAGD), conforme al numeral 5.4 del mismo artículo; el PAGD forma parte del PGD y su formulación la coordina el CGTD, en concordancia con la ENGD. Las iniciativas, proyectos y acciones priorizadas en el PAIA se articulan con el Plan Estratégico Institucional, el Plan Operativo Institucional, el Programa Multianual de Inversiones y el PGD, conforme al numeral 4.4 del artículo 4 de la misma norma y al numeral 28.10 del artículo 28 del RLIA. Su formulación corresponde a la fase posterior a la aprobación de la presente directiva.</w:t>
       </w:r>
     </w:p>
     <w:p>
@@ -12510,7 +12626,7 @@
           <w:szCs w:val="22"/>
         </w:rPr>
       </w:pPr>
-      <w:bookmarkStart w:id="10" w:name="_Toc235003968"/>
+      <w:bookmarkStart w:id="9" w:name="_Toc235003968"/>
       <w:r>
         <w:rPr>
           <w:rFonts w:cs="Arial"/>
@@ -12520,7 +12636,7 @@
         </w:rPr>
         <w:t>ANEXOS</w:t>
       </w:r>
-      <w:bookmarkEnd w:id="10"/>
+      <w:bookmarkEnd w:id="9"/>
     </w:p>
     <w:p>
       <w:pPr>
@@ -16672,43 +16788,24 @@
       </w:r>
     </w:p>
   </w:comment>
-  <w:comment w:id="8" w:author="Kut Castro Mario Fernando" w:date="2026-07-21T11:40:00Z" w:initials="MK">
-    <w:p>
-      <w:pPr>
-        <w:pStyle w:val="Textocomentario"/>
-      </w:pPr>
-      <w:r>
-        <w:rPr>
-          <w:rStyle w:val="Refdecomentario"/>
-        </w:rPr>
-        <w:annotationRef/>
-      </w:r>
-      <w:r>
-        <w:t>Analizar bajo METDONI.</w:t>
-      </w:r>
-    </w:p>
-  </w:comment>
 </w:comments>
 </file>
 
 <file path=word/commentsExtended.xml><?xml version="1.0" encoding="utf-8"?>
 <w15:commentsEx xmlns:wpc="http://schemas.microsoft.com/office/word/2010/wordprocessingCanvas" xmlns:cx="http://schemas.microsoft.com/office/drawing/2014/chartex" xmlns:cx1="http://schemas.microsoft.com/office/drawing/2015/9/8/chartex" xmlns:cx2="http://schemas.microsoft.com/office/drawing/2015/10/21/chartex" xmlns:cx3="http://schemas.microsoft.com/office/drawing/2016/5/9/chartex" xmlns:cx4="http://schemas.microsoft.com/office/drawing/2016/5/10/chartex" xmlns:cx5="http://schemas.microsoft.com/office/drawing/2016/5/11/chartex" xmlns:cx6="http://schemas.microsoft.com/office/drawing/2016/5/12/chartex" xmlns:cx7="http://schemas.microsoft.com/office/drawing/2016/5/13/chartex" xmlns:cx8="http://schemas.microsoft.com/office/drawing/2016/5/14/chartex" xmlns:mc="http://schemas.openxmlformats.org/markup-compatibility/2006" xmlns:aink="http://schemas.microsoft.com/office/drawing/2016/ink" xmlns:am3d="http://schemas.microsoft.com/office/drawing/2017/model3d" xmlns:o="urn:schemas-microsoft-com:office:office" xmlns:oel="http://schemas.microsoft.com/office/2019/extlst" xmlns:r="http://schemas.openxmlformats.org/officeDocument/2006/relationships" xmlns:m="http://schemas.openxmlformats.org/officeDocument/2006/math" xmlns:v="urn:schemas-microsoft-com:vml" xmlns:wp14="http://schemas.microsoft.com/office/word/2010/wordprocessingDrawing" xmlns:wp="http://schemas.openxmlformats.org/drawingml/2006/wordprocessingDrawing" xmlns:w10="urn:schemas-microsoft-com:office:word" xmlns:w="http://schemas.openxmlformats.org/wordprocessingml/2006/main" xmlns:w14="http://schemas.microsoft.com/office/word/2010/wordml" xmlns:w15="http://schemas.microsoft.com/office/word/2012/wordml" xmlns:w16cex="http://schemas.microsoft.com/office/word/2018/wordml/cex" xmlns:w16cid="http://schemas.microsoft.com/office/word/2016/wordml/cid" xmlns:w16="http://schemas.microsoft.com/office/word/2018/wordml" xmlns:w16du="http://schemas.microsoft.com/office/word/2023/wordml/word16du" xmlns:w16sdtdh="http://schemas.microsoft.com/office/word/2020/wordml/sdtdatahash" xmlns:w16sdtfl="http://schemas.microsoft.com/office/word/2024/wordml/sdtformatlock" xmlns:w16se="http://schemas.microsoft.com/office/word/2015/wordml/symex" xmlns:wpg="http://schemas.microsoft.com/office/word/2010/wordprocessingGroup" xmlns:wpi="http://schemas.microsoft.com/office/word/2010/wordprocessingInk" xmlns:wne="http://schemas.microsoft.com/office/word/2006/wordml" xmlns:wps="http://schemas.microsoft.com/office/word/2010/wordprocessingShape" mc:Ignorable="w14 w15 w16se w16cid w16 w16cex w16sdtdh w16sdtfl w16du wp14">
   <w15:commentEx w15:paraId="3C0FED1C" w15:done="0"/>
-  <w15:commentEx w15:paraId="7A362A96" w15:done="0"/>
 </w15:commentsEx>
 </file>
 
 <file path=word/commentsExtensible.xml><?xml version="1.0" encoding="utf-8"?>
 <w16cex:commentsExtensible xmlns:wpc="http://schemas.microsoft.com/office/word/2010/wordprocessingCanvas" xmlns:cx="http://schemas.microsoft.com/office/drawing/2014/chartex" xmlns:cx1="http://schemas.microsoft.com/office/drawing/2015/9/8/chartex" xmlns:cx2="http://schemas.microsoft.com/office/drawing/2015/10/21/chartex" xmlns:cx3="http://schemas.microsoft.com/office/drawing/2016/5/9/chartex" xmlns:cx4="http://schemas.microsoft.com/office/drawing/2016/5/10/chartex" xmlns:cx5="http://schemas.microsoft.com/office/drawing/2016/5/11/chartex" xmlns:cx6="http://schemas.microsoft.com/office/drawing/2016/5/12/chartex" xmlns:cx7="http://schemas.microsoft.com/office/drawing/2016/5/13/chartex" xmlns:cx8="http://schemas.microsoft.com/office/drawing/2016/5/14/chartex" xmlns:cr="http://schemas.microsoft.com/office/comments/2020/reactions" xmlns:mc="http://schemas.openxmlformats.org/markup-compatibility/2006" xmlns:aink="http://schemas.microsoft.com/office/drawing/2016/ink" xmlns:am3d="http://schemas.microsoft.com/office/drawing/2017/model3d" xmlns:o="urn:schemas-microsoft-com:office:office" xmlns:oel="http://schemas.microsoft.com/office/2019/extlst" xmlns:r="http://schemas.openxmlformats.org/officeDocument/2006/relationships" xmlns:m="http://schemas.openxmlformats.org/officeDocument/2006/math" xmlns:v="urn:schemas-microsoft-com:vml" xmlns:wp14="http://schemas.microsoft.com/office/word/2010/wordprocessingDrawing" xmlns:wp="http://schemas.openxmlformats.org/drawingml/2006/wordprocessingDrawing" xmlns:w10="urn:schemas-microsoft-com:office:word" xmlns:w="http://schemas.openxmlformats.org/wordprocessingml/2006/main" xmlns:w14="http://schemas.microsoft.com/office/word/2010/wordml" xmlns:w15="http://schemas.microsoft.com/office/word/2012/wordml" xmlns:w16cex="http://schemas.microsoft.com/office/word/2018/wordml/cex" xmlns:w16cid="http://schemas.microsoft.com/office/word/2016/wordml/cid" xmlns:w16="http://schemas.microsoft.com/office/word/2018/wordml" xmlns:w16du="http://schemas.microsoft.com/office/word/2023/wordml/word16du" xmlns:w16sdtdh="http://schemas.microsoft.com/office/word/2020/wordml/sdtdatahash" xmlns:w16sdtfl="http://schemas.microsoft.com/office/word/2024/wordml/sdtformatlock" xmlns:w16se="http://schemas.microsoft.com/office/word/2015/wordml/symex" xmlns:wpg="http://schemas.microsoft.com/office/word/2010/wordprocessingGroup" xmlns:wpi="http://schemas.microsoft.com/office/word/2010/wordprocessingInk" xmlns:wne="http://schemas.microsoft.com/office/word/2006/wordml" xmlns:wps="http://schemas.microsoft.com/office/word/2010/wordprocessingShape" mc:Ignorable="w14 w15 w16se w16cid w16 w16cex w16sdtdh w16sdtfl cr w16du wp14">
   <w16cex:commentExtensible w16cex:durableId="6387E4DA" w16cex:dateUtc="2026-07-21T16:30:00Z"/>
-  <w16cex:commentExtensible w16cex:durableId="29EDEAD0" w16cex:dateUtc="2026-07-21T16:40:00Z"/>
 </w16cex:commentsExtensible>
 </file>
 
 <file path=word/commentsIds.xml><?xml version="1.0" encoding="utf-8"?>
 <w16cid:commentsIds xmlns:wpc="http://schemas.microsoft.com/office/word/2010/wordprocessingCanvas" xmlns:cx="http://schemas.microsoft.com/office/drawing/2014/chartex" xmlns:cx1="http://schemas.microsoft.com/office/drawing/2015/9/8/chartex" xmlns:cx2="http://schemas.microsoft.com/office/drawing/2015/10/21/chartex" xmlns:cx3="http://schemas.microsoft.com/office/drawing/2016/5/9/chartex" xmlns:cx4="http://schemas.microsoft.com/office/drawing/2016/5/10/chartex" xmlns:cx5="http://schemas.microsoft.com/office/drawing/2016/5/11/chartex" xmlns:cx6="http://schemas.microsoft.com/office/drawing/2016/5/12/chartex" xmlns:cx7="http://schemas.microsoft.com/office/drawing/2016/5/13/chartex" xmlns:cx8="http://schemas.microsoft.com/office/drawing/2016/5/14/chartex" xmlns:mc="http://schemas.openxmlformats.org/markup-compatibility/2006" xmlns:aink="http://schemas.microsoft.com/office/drawing/2016/ink" xmlns:am3d="http://schemas.microsoft.com/office/drawing/2017/model3d" xmlns:o="urn:schemas-microsoft-com:office:office" xmlns:oel="http://schemas.microsoft.com/office/2019/extlst" xmlns:r="http://schemas.openxmlformats.org/officeDocument/2006/relationships" xmlns:m="http://schemas.openxmlformats.org/officeDocument/2006/math" xmlns:v="urn:schemas-microsoft-com:vml" xmlns:wp14="http://schemas.microsoft.com/office/word/2010/wordprocessingDrawing" xmlns:wp="http://schemas.openxmlformats.org/drawingml/2006/wordprocessingDrawing" xmlns:w10="urn:schemas-microsoft-com:office:word" xmlns:w="http://schemas.openxmlformats.org/wordprocessingml/2006/main" xmlns:w14="http://schemas.microsoft.com/office/word/2010/wordml" xmlns:w15="http://schemas.microsoft.com/office/word/2012/wordml" xmlns:w16cex="http://schemas.microsoft.com/office/word/2018/wordml/cex" xmlns:w16cid="http://schemas.microsoft.com/office/word/2016/wordml/cid" xmlns:w16="http://schemas.microsoft.com/office/word/2018/wordml" xmlns:w16du="http://schemas.microsoft.com/office/word/2023/wordml/word16du" xmlns:w16sdtdh="http://schemas.microsoft.com/office/word/2020/wordml/sdtdatahash" xmlns:w16sdtfl="http://schemas.microsoft.com/office/word/2024/wordml/sdtformatlock" xmlns:w16se="http://schemas.microsoft.com/office/word/2015/wordml/symex" xmlns:wpg="http://schemas.microsoft.com/office/word/2010/wordprocessingGroup" xmlns:wpi="http://schemas.microsoft.com/office/word/2010/wordprocessingInk" xmlns:wne="http://schemas.microsoft.com/office/word/2006/wordml" xmlns:wps="http://schemas.microsoft.com/office/word/2010/wordprocessingShape" mc:Ignorable="w14 w15 w16se w16cid w16 w16cex w16sdtdh w16sdtfl w16du wp14">
   <w16cid:commentId w16cid:paraId="3C0FED1C" w16cid:durableId="6387E4DA"/>
-  <w16cid:commentId w16cid:paraId="7A362A96" w16cid:durableId="29EDEAD0"/>
 </w16cid:commentsIds>
 </file>
 

</xml_diff>

<commit_message>
docs: completa el numeral 7.6 (encargos previstos, plazos por acuerdo del CGTD y seguimiento trimestral de la Comision de Gobierno de IA)
</commit_message>
<xml_diff>
--- a/normativo/DIRECTIVA-GOBIERNO-IA.docx
+++ b/normativo/DIRECTIVA-GOBIERNO-IA.docx
@@ -12439,6 +12439,42 @@
         </w:rPr>
         <w:t>Dichos documentos desarrollan la aplicación de lo dispuesto en la presente directiva y no modifican sus disposiciones, sus Anexos ni las competencias de aprobación que establece</w:t>
       </w:r>
+      <w:r>
+        <w:rPr>
+          <w:b w:val="0"/>
+          <w:bCs w:val="0"/>
+          <w:color w:val="000000"/>
+          <w:highlight w:val="lightGray"/>
+        </w:rPr>
+        <w:t xml:space="preserve">. </w:t>
+      </w:r>
+      <w:r>
+        <w:rPr>
+          <w:b w:val="0"/>
+          <w:bCs w:val="0"/>
+          <w:color w:val="000000"/>
+          <w:highlight w:val="cyan"/>
+        </w:rPr>
+        <w:t>Los encargos son los previstos en las disposiciones específicas de la presente directiva; su plazo se establece mediante acuerdo del Comité de Gobierno y Transformación Digital.</w:t>
+      </w:r>
+      <w:r>
+        <w:rPr>
+          <w:rFonts w:asciiTheme="minorHAnsi" w:eastAsiaTheme="minorEastAsia" w:hAnsiTheme="minorHAnsi" w:cstheme="minorBidi"/>
+          <w:b w:val="0"/>
+          <w:bCs w:val="0"/>
+          <w:highlight w:val="cyan"/>
+        </w:rPr>
+        <w:t xml:space="preserve"> </w:t>
+      </w:r>
+      <w:r>
+        <w:rPr>
+          <w:b w:val="0"/>
+          <w:bCs w:val="0"/>
+          <w:color w:val="000000"/>
+          <w:highlight w:val="cyan"/>
+        </w:rPr>
+        <w:t>La Comisión de Gobierno de IA hace seguimiento de su cumplimiento y lo reporta en el informe trimestral del numeral 6.9.5; cuando identifique la necesidad de un instrumento no previsto, propone al CGTD la unidad competente.</w:t>
+      </w:r>
     </w:p>
     <w:p>
       <w:pPr>
@@ -12577,7 +12613,16 @@
           <w:bCs w:val="0"/>
           <w:highlight w:val="yellow"/>
         </w:rPr>
-        <w:t>Emitidos dichos lineamientos y designado el OIA, la Comisión de Gobierno de IA evalúa su articulación conforme a ellos y propone al CGTD los ajustes que correspondan.</w:t>
+        <w:t xml:space="preserve">Emitidos dichos lineamientos </w:t>
+      </w:r>
+      <w:r>
+        <w:rPr>
+          <w:b w:val="0"/>
+          <w:bCs w:val="0"/>
+          <w:highlight w:val="yellow"/>
+        </w:rPr>
+        <w:lastRenderedPageBreak/>
+        <w:t>y designado el OIA, la Comisión de Gobierno de IA evalúa su articulación conforme a ellos y propone al CGTD los ajustes que correspondan.</w:t>
       </w:r>
     </w:p>
     <w:p>
@@ -12605,16 +12650,7 @@
           <w:highlight w:val="yellow"/>
         </w:rPr>
         <w:tab/>
-        <w:t xml:space="preserve">El Plan de Acción de Inteligencia Artificial (PAIA) forma parte del Portafolio de Proyectos del PGD, conforme al numeral 5.5 del artículo 5 de la ENIA. Su aprobación requiere que la SUNAT haya aprobado o implementado previamente su </w:t>
-      </w:r>
-      <w:r>
-        <w:rPr>
-          <w:b w:val="0"/>
-          <w:bCs w:val="0"/>
-          <w:highlight w:val="yellow"/>
-        </w:rPr>
-        <w:lastRenderedPageBreak/>
-        <w:t>Plan de Acción de Gobierno de Datos (PAGD), conforme al numeral 5.4 del mismo artículo; el PAGD forma parte del PGD y su formulación la coordina el CGTD, en concordancia con la ENGD. Las iniciativas, proyectos y acciones priorizadas en el PAIA se articulan con el Plan Estratégico Institucional, el Plan Operativo Institucional, el Programa Multianual de Inversiones y el PGD, conforme al numeral 4.4 del artículo 4 de la misma norma y al numeral 28.10 del artículo 28 del RLIA. Su formulación corresponde a la fase posterior a la aprobación de la presente directiva.</w:t>
+        <w:t>El Plan de Acción de Inteligencia Artificial (PAIA) forma parte del Portafolio de Proyectos del PGD, conforme al numeral 5.5 del artículo 5 de la ENIA. Su aprobación requiere que la SUNAT haya aprobado o implementado previamente su Plan de Acción de Gobierno de Datos (PAGD), conforme al numeral 5.4 del mismo artículo; el PAGD forma parte del PGD y su formulación la coordina el CGTD, en concordancia con la ENGD. Las iniciativas, proyectos y acciones priorizadas en el PAIA se articulan con el Plan Estratégico Institucional, el Plan Operativo Institucional, el Programa Multianual de Inversiones y el PGD, conforme al numeral 4.4 del artículo 4 de la misma norma y al numeral 28.10 del artículo 28 del RLIA. Su formulación corresponde a la fase posterior a la aprobación de la presente directiva.</w:t>
       </w:r>
     </w:p>
     <w:p>

</xml_diff>

<commit_message>
docs: reformula 7.9 (los Anexos forman parte de la directiva; detalle en documentos de menor rango via METDONI), ajusta 6.15.5, agrega contenido minimo de la evaluacion del caso de uso (RLIA 28.4) y corrige typos
</commit_message>
<xml_diff>
--- a/normativo/DIRECTIVA-GOBIERNO-IA.docx
+++ b/normativo/DIRECTIVA-GOBIERNO-IA.docx
@@ -6890,7 +6890,7 @@
                 <w:bCs w:val="0"/>
                 <w:highlight w:val="lightGray"/>
               </w:rPr>
-              <w:t>convoca cuando se evalúa un caso de uso de su proceso, conforme al numeral   5.3.2.</w:t>
+              <w:t>convoca cuando se evalúa un caso de uso de su proceso, conforme al numeral</w:t>
             </w:r>
             <w:r>
               <w:rPr>
@@ -6899,6 +6899,14 @@
                 <w:highlight w:val="lightGray"/>
               </w:rPr>
               <w:t xml:space="preserve"> </w:t>
+            </w:r>
+            <w:r>
+              <w:rPr>
+                <w:b w:val="0"/>
+                <w:bCs w:val="0"/>
+                <w:highlight w:val="lightGray"/>
+              </w:rPr>
+              <w:t>5.3.2.</w:t>
             </w:r>
           </w:p>
         </w:tc>
@@ -8663,7 +8671,23 @@
           <w:color w:val="000000"/>
           <w:highlight w:val="lightGray"/>
         </w:rPr>
-        <w:t>La INSI desarrolla y aprueba, conforme a sus competencias y a la METDONI, la metodología del ciclo de vida del SBIA previsto en el numeral 6.1.1.Por comprender actuaciones a cargo de unidades de organización distintas de la INSI, su formulación recoge los aportes de dichas unidades y su aprobación</w:t>
+        <w:t>La INSI desarrolla y aprueba, conforme a sus competencias y a la METDONI, la metodología del ciclo de vida del SBIA previsto en el numeral 6.1.1.</w:t>
+      </w:r>
+      <w:r>
+        <w:rPr>
+          <w:rFonts w:ascii="Arial" w:hAnsi="Arial" w:cs="Arial"/>
+          <w:color w:val="000000"/>
+          <w:highlight w:val="lightGray"/>
+        </w:rPr>
+        <w:t xml:space="preserve"> </w:t>
+      </w:r>
+      <w:r>
+        <w:rPr>
+          <w:rFonts w:ascii="Arial" w:hAnsi="Arial" w:cs="Arial"/>
+          <w:color w:val="000000"/>
+          <w:highlight w:val="lightGray"/>
+        </w:rPr>
+        <w:t>Por comprender actuaciones a cargo de unidades de organización distintas de la INSI, su formulación recoge los aportes de dichas unidades y su aprobación</w:t>
       </w:r>
       <w:r>
         <w:rPr>
@@ -12218,9 +12242,6 @@
     </w:p>
     <w:p>
       <w:pPr>
-        <w:tabs>
-          <w:tab w:val="left" w:pos="1276"/>
-        </w:tabs>
         <w:spacing w:after="60" w:line="276" w:lineRule="auto"/>
         <w:ind w:left="1276" w:hanging="709"/>
         <w:jc w:val="both"/>
@@ -12232,11 +12253,43 @@
       </w:pPr>
       <w:r>
         <w:rPr>
+          <w:rFonts w:ascii="Arial" w:hAnsi="Arial" w:cs="Arial"/>
           <w:highlight w:val="lightGray"/>
         </w:rPr>
-        <w:t>6.15.5 Las unidades competentes de cada instrumento incorporan en sus metodologías o procedimientos la verificación del componente de IA y la opinión de la Comisión, según sus competencias y sin afectar los sistemas administrativos del Estado, conforme al numeral 7.6</w:t>
-      </w:r>
-      <w:r>
+        <w:t>6.15.5</w:t>
+      </w:r>
+      <w:r>
+        <w:rPr>
+          <w:rFonts w:ascii="Arial" w:hAnsi="Arial" w:cs="Arial"/>
+          <w:highlight w:val="lightGray"/>
+        </w:rPr>
+        <w:t xml:space="preserve"> </w:t>
+      </w:r>
+      <w:r>
+        <w:rPr>
+          <w:rFonts w:ascii="Arial" w:hAnsi="Arial" w:cs="Arial"/>
+          <w:highlight w:val="lightGray"/>
+        </w:rPr>
+        <w:t xml:space="preserve">Las unidades competentes de cada instrumento incorporan en sus </w:t>
+      </w:r>
+      <w:r>
+        <w:rPr>
+          <w:rFonts w:ascii="Arial" w:hAnsi="Arial" w:cs="Arial"/>
+          <w:highlight w:val="lightGray"/>
+        </w:rPr>
+        <w:t xml:space="preserve">documentos normativos </w:t>
+      </w:r>
+      <w:r>
+        <w:rPr>
+          <w:rFonts w:ascii="Arial" w:hAnsi="Arial" w:cs="Arial"/>
+          <w:highlight w:val="lightGray"/>
+        </w:rPr>
+        <w:t>la verificación del componente de IA y la opinión de la Comisión, según sus competencias y sin afectar los sistemas administrativos del Estado, conforme al numeral 7.6</w:t>
+      </w:r>
+      <w:r>
+        <w:rPr>
+          <w:rFonts w:ascii="Arial" w:hAnsi="Arial" w:cs="Arial"/>
+        </w:rPr>
         <w:br w:type="page"/>
       </w:r>
     </w:p>
@@ -12557,7 +12610,7 @@
         <w:rPr>
           <w:b w:val="0"/>
           <w:bCs w:val="0"/>
-          <w:highlight w:val="yellow"/>
+          <w:highlight w:val="lightGray"/>
         </w:rPr>
         <w:t>7.9</w:t>
       </w:r>
@@ -12565,10 +12618,65 @@
         <w:rPr>
           <w:b w:val="0"/>
           <w:bCs w:val="0"/>
-          <w:highlight w:val="yellow"/>
+          <w:highlight w:val="lightGray"/>
         </w:rPr>
         <w:tab/>
-        <w:t>Los Anexos, los indicadores y las fichas de la presente directiva se actualizan mediante acto administrativo del CGTD, sin requerir la modificación de la directiva, conforme a los numerales 6.10.2, 7.5 y 7.7.</w:t>
+      </w:r>
+      <w:r>
+        <w:rPr>
+          <w:b w:val="0"/>
+          <w:bCs w:val="0"/>
+          <w:highlight w:val="lightGray"/>
+        </w:rPr>
+        <w:t>Los Anexos forman parte de la presente directiva y su modificación se</w:t>
+      </w:r>
+      <w:r>
+        <w:rPr>
+          <w:b w:val="0"/>
+          <w:bCs w:val="0"/>
+          <w:highlight w:val="lightGray"/>
+        </w:rPr>
+        <w:t xml:space="preserve"> </w:t>
+      </w:r>
+      <w:r>
+        <w:rPr>
+          <w:b w:val="0"/>
+          <w:bCs w:val="0"/>
+          <w:highlight w:val="lightGray"/>
+        </w:rPr>
+        <w:t>efectúa conforme a la METDONI. El detalle de aplicación de los Anexos, así como</w:t>
+      </w:r>
+      <w:r>
+        <w:rPr>
+          <w:b w:val="0"/>
+          <w:bCs w:val="0"/>
+          <w:highlight w:val="lightGray"/>
+        </w:rPr>
+        <w:t xml:space="preserve"> </w:t>
+      </w:r>
+      <w:r>
+        <w:rPr>
+          <w:b w:val="0"/>
+          <w:bCs w:val="0"/>
+          <w:highlight w:val="lightGray"/>
+        </w:rPr>
+        <w:t>los formatos, campos e indicadores operativos que de ellos se derivan, se establecen en los documentos normativos institucionales de menor rango</w:t>
+      </w:r>
+      <w:r>
+        <w:rPr>
+          <w:b w:val="0"/>
+          <w:bCs w:val="0"/>
+          <w:highlight w:val="lightGray"/>
+        </w:rPr>
+        <w:t xml:space="preserve"> </w:t>
+      </w:r>
+      <w:r>
+        <w:rPr>
+          <w:b w:val="0"/>
+          <w:bCs w:val="0"/>
+          <w:highlight w:val="lightGray"/>
+        </w:rPr>
+        <w:t>previstos en el numeral 7.6, que las unidades competentes actualizan sin requerir la modificación de la presente directiva.</w:t>
       </w:r>
     </w:p>
     <w:p>
@@ -12596,7 +12704,16 @@
           <w:highlight w:val="yellow"/>
         </w:rPr>
         <w:tab/>
-        <w:t>El Oficial de Inteligencia Artificial (OIA) de la SUNAT, previsto en el artículo 6 de la Estrategia Nacional de Inteligencia Artificial 2026-2030, recae en un miembro del CGTD y coordina el gobierno y la gestión de la inteligencia artificial institucional, así como el seguimiento del Plan de Acción de Inteligencia Artificial. Su designación se efectúa mediante acto de la máxima autoridad administrativa de la entidad, previamente a la formulación del Plan de Acción de Inteligencia Artificial. Su perfil, responsabilidades, designación y articulación se determinan conforme a los lineamientos que emita la SGTD-PCM, en aplicación de la Primera Disposición Complementaria Final de la citada Estrategia. En tanto no se emitan dichos lineamientos, las funciones de coordinación técnica en materia de IA son ejercidas por el Coordinador de la Comisión de Gobierno de IA.</w:t>
+        <w:t xml:space="preserve">El Oficial de Inteligencia Artificial (OIA) de la SUNAT, previsto en el artículo 6 de la Estrategia Nacional de Inteligencia Artificial 2026-2030, recae en un miembro del CGTD y coordina el gobierno y la gestión de la inteligencia artificial institucional, así como el seguimiento del Plan de Acción de Inteligencia Artificial. Su designación se efectúa mediante acto de la máxima autoridad administrativa de la entidad, previamente a la formulación del Plan de Acción de Inteligencia Artificial. Su perfil, responsabilidades, designación y articulación se determinan conforme a los lineamientos que emita la SGTD-PCM, en aplicación de la Primera Disposición </w:t>
+      </w:r>
+      <w:r>
+        <w:rPr>
+          <w:b w:val="0"/>
+          <w:bCs w:val="0"/>
+          <w:highlight w:val="yellow"/>
+        </w:rPr>
+        <w:lastRenderedPageBreak/>
+        <w:t>Complementaria Final de la citada Estrategia. En tanto no se emitan dichos lineamientos, las funciones de coordinación técnica en materia de IA son ejercidas por el Coordinador de la Comisión de Gobierno de IA.</w:t>
       </w:r>
       <w:r>
         <w:rPr>
@@ -12613,16 +12730,7 @@
           <w:bCs w:val="0"/>
           <w:highlight w:val="yellow"/>
         </w:rPr>
-        <w:t xml:space="preserve">Emitidos dichos lineamientos </w:t>
-      </w:r>
-      <w:r>
-        <w:rPr>
-          <w:b w:val="0"/>
-          <w:bCs w:val="0"/>
-          <w:highlight w:val="yellow"/>
-        </w:rPr>
-        <w:lastRenderedPageBreak/>
-        <w:t>y designado el OIA, la Comisión de Gobierno de IA evalúa su articulación conforme a ellos y propone al CGTD los ajustes que correspondan.</w:t>
+        <w:t>Emitidos dichos lineamientos y designado el OIA, la Comisión de Gobierno de IA evalúa su articulación conforme a ellos y propone al CGTD los ajustes que correspondan.</w:t>
       </w:r>
     </w:p>
     <w:p>
@@ -16109,18 +16217,99 @@
       <w:pPr>
         <w:spacing w:before="200" w:after="120" w:line="276" w:lineRule="auto"/>
         <w:rPr>
-          <w:rFonts w:ascii="Arial" w:hAnsi="Arial" w:cs="Arial"/>
-        </w:rPr>
-      </w:pPr>
-      <w:r>
-        <w:rPr>
           <w:rFonts w:ascii="Arial" w:eastAsia="Arial" w:hAnsi="Arial" w:cs="Arial"/>
           <w:b/>
           <w:bCs/>
           <w:color w:val="000000"/>
         </w:rPr>
+      </w:pPr>
+      <w:r>
+        <w:rPr>
+          <w:rFonts w:ascii="Arial" w:eastAsia="Arial" w:hAnsi="Arial" w:cs="Arial"/>
+          <w:b/>
+          <w:bCs/>
+          <w:color w:val="000000"/>
+        </w:rPr>
         <w:lastRenderedPageBreak/>
         <w:t>Anexo N.° 4: Ficha de Evaluación de Caso de Uso de SBIA</w:t>
+      </w:r>
+    </w:p>
+    <w:p>
+      <w:pPr>
+        <w:spacing w:before="200" w:after="120" w:line="276" w:lineRule="auto"/>
+        <w:jc w:val="both"/>
+        <w:rPr>
+          <w:rFonts w:ascii="Arial" w:hAnsi="Arial" w:cs="Arial"/>
+        </w:rPr>
+      </w:pPr>
+      <w:r>
+        <w:rPr>
+          <w:rFonts w:ascii="Arial" w:hAnsi="Arial" w:cs="Arial"/>
+          <w:highlight w:val="lightGray"/>
+        </w:rPr>
+        <w:t>Constituye el contenido mínimo de la evaluación del caso de uso y recoge los</w:t>
+      </w:r>
+      <w:r>
+        <w:rPr>
+          <w:rFonts w:ascii="Arial" w:hAnsi="Arial" w:cs="Arial"/>
+          <w:highlight w:val="lightGray"/>
+        </w:rPr>
+        <w:t xml:space="preserve"> </w:t>
+      </w:r>
+      <w:r>
+        <w:rPr>
+          <w:rFonts w:ascii="Arial" w:hAnsi="Arial" w:cs="Arial"/>
+          <w:highlight w:val="lightGray"/>
+        </w:rPr>
+        <w:t xml:space="preserve">datos y </w:t>
+      </w:r>
+      <w:r>
+        <w:rPr>
+          <w:rFonts w:ascii="Arial" w:hAnsi="Arial" w:cs="Arial"/>
+          <w:highlight w:val="lightGray"/>
+        </w:rPr>
+        <w:t>las evidencias</w:t>
+      </w:r>
+      <w:r>
+        <w:rPr>
+          <w:rFonts w:ascii="Arial" w:hAnsi="Arial" w:cs="Arial"/>
+          <w:highlight w:val="lightGray"/>
+        </w:rPr>
+        <w:t xml:space="preserve"> del problema que sustentan la iniciativa, conforme al</w:t>
+      </w:r>
+      <w:r>
+        <w:rPr>
+          <w:rFonts w:ascii="Arial" w:hAnsi="Arial" w:cs="Arial"/>
+          <w:highlight w:val="lightGray"/>
+        </w:rPr>
+        <w:t xml:space="preserve"> </w:t>
+      </w:r>
+      <w:r>
+        <w:rPr>
+          <w:rFonts w:ascii="Arial" w:hAnsi="Arial" w:cs="Arial"/>
+          <w:highlight w:val="lightGray"/>
+        </w:rPr>
+        <w:t>numeral 28.4 del artículo 28 del RLIA. Se adecúa a la naturaleza y magnitud de la iniciativa, requerimiento o</w:t>
+      </w:r>
+      <w:r>
+        <w:rPr>
+          <w:rFonts w:ascii="Arial" w:hAnsi="Arial" w:cs="Arial"/>
+          <w:highlight w:val="lightGray"/>
+        </w:rPr>
+        <w:t xml:space="preserve"> </w:t>
+      </w:r>
+      <w:r>
+        <w:rPr>
+          <w:rFonts w:ascii="Arial" w:hAnsi="Arial" w:cs="Arial"/>
+          <w:highlight w:val="lightGray"/>
+        </w:rPr>
+        <w:t>proyecto, conforme al numeral 6.15.1</w:t>
+      </w:r>
+      <w:r>
+        <w:rPr>
+          <w:rFonts w:ascii="Arial" w:hAnsi="Arial" w:cs="Arial"/>
+        </w:rPr>
+        <w:t>.</w:t>
       </w:r>
     </w:p>
     <w:p>
@@ -16657,6 +16846,7 @@
           <w:color w:val="000000"/>
           <w:highlight w:val="yellow"/>
         </w:rPr>
+        <w:lastRenderedPageBreak/>
         <w:t>Sección 7 — Datos y riesgos preliminares:</w:t>
       </w:r>
     </w:p>
@@ -16742,7 +16932,6 @@
           <w:color w:val="000000"/>
           <w:highlight w:val="yellow"/>
         </w:rPr>
-        <w:lastRenderedPageBreak/>
         <w:t>Sección 8 — Firmas:</w:t>
       </w:r>
     </w:p>

</xml_diff>

<commit_message>
docs: ajuste de forma en 6.5.3 (guiones a parentesis en el listado de requisitos de arquitectura de SBIA)
</commit_message>
<xml_diff>
--- a/normativo/DIRECTIVA-GOBIERNO-IA.docx
+++ b/normativo/DIRECTIVA-GOBIERNO-IA.docx
@@ -9330,7 +9330,7 @@
           <w:color w:val="000000"/>
           <w:highlight w:val="lightGray"/>
         </w:rPr>
-        <w:t xml:space="preserve">El diseño de la arquitectura de los SBIA observa los Principios de Arquitectura (AAT.PRAQ.01) y los Lineamientos de Arquitectura (LAT.LIAQ.01) de la SUNAT, en sus versiones vigentes, en lo que corresponda a su naturaleza. La GA adecua dichos instrumentos y los estándares de arquitectura de su competencia para incorporar los requisitos propios de los SBIA —modelos, conjuntos de datos, componentes generativos y </w:t>
+        <w:t xml:space="preserve">El diseño de la arquitectura de los SBIA observa los Principios de Arquitectura (AAT.PRAQ.01) y los Lineamientos de Arquitectura (LAT.LIAQ.01) de la SUNAT, en sus versiones vigentes, en lo que corresponda a su naturaleza. La GA adecua dichos instrumentos y los estándares de arquitectura de su competencia para incorporar los requisitos propios de los SBIA </w:t>
       </w:r>
       <w:r>
         <w:rPr>
@@ -9338,6 +9338,22 @@
           <w:color w:val="000000"/>
           <w:highlight w:val="lightGray"/>
         </w:rPr>
+        <w:t>(</w:t>
+      </w:r>
+      <w:r>
+        <w:rPr>
+          <w:rFonts w:ascii="Arial" w:eastAsia="Arial" w:hAnsi="Arial" w:cs="Arial"/>
+          <w:color w:val="000000"/>
+          <w:highlight w:val="lightGray"/>
+        </w:rPr>
+        <w:t xml:space="preserve">modelos, conjuntos de datos, componentes generativos y </w:t>
+      </w:r>
+      <w:r>
+        <w:rPr>
+          <w:rFonts w:ascii="Arial" w:eastAsia="Arial" w:hAnsi="Arial" w:cs="Arial"/>
+          <w:color w:val="000000"/>
+          <w:highlight w:val="lightGray"/>
+        </w:rPr>
         <w:t>agenticos</w:t>
       </w:r>
       <w:r>
@@ -9346,7 +9362,23 @@
           <w:color w:val="000000"/>
           <w:highlight w:val="lightGray"/>
         </w:rPr>
-        <w:t>, e infraestructura especializada—, conforme al literal c) del artículo 130 del ROF, y los aprueba mediante el documento normativo institucional que corresponda según la METDONI.</w:t>
+        <w:t>, e infraestructura especializada</w:t>
+      </w:r>
+      <w:r>
+        <w:rPr>
+          <w:rFonts w:ascii="Arial" w:eastAsia="Arial" w:hAnsi="Arial" w:cs="Arial"/>
+          <w:color w:val="000000"/>
+          <w:highlight w:val="lightGray"/>
+        </w:rPr>
+        <w:t>),</w:t>
+      </w:r>
+      <w:r>
+        <w:rPr>
+          <w:rFonts w:ascii="Arial" w:eastAsia="Arial" w:hAnsi="Arial" w:cs="Arial"/>
+          <w:color w:val="000000"/>
+          <w:highlight w:val="lightGray"/>
+        </w:rPr>
+        <w:t xml:space="preserve"> conforme al literal c) del artículo 130 del ROF, y los aprueba mediante el documento normativo institucional que corresponda según la METDONI.</w:t>
       </w:r>
     </w:p>
     <w:p>

</xml_diff>

<commit_message>
docs: reguardado de la directiva con ajustes menores de formato (sin cambios de texto sustantivos)
</commit_message>
<xml_diff>
--- a/normativo/DIRECTIVA-GOBIERNO-IA.docx
+++ b/normativo/DIRECTIVA-GOBIERNO-IA.docx
@@ -11228,6 +11228,20 @@
     </w:p>
     <w:p>
       <w:pPr>
+        <w:pStyle w:val="SubtituloDONI"/>
+        <w:spacing w:line="276" w:lineRule="auto"/>
+        <w:ind w:left="851"/>
+      </w:pPr>
+      <w:r>
+        <w:t>6.12</w:t>
+      </w:r>
+      <w:r>
+        <w:tab/>
+        <w:t>De la gestión de proveedores de IA</w:t>
+      </w:r>
+    </w:p>
+    <w:p>
+      <w:pPr>
         <w:spacing w:after="60" w:line="276" w:lineRule="auto"/>
         <w:ind w:left="1276" w:hanging="720"/>
         <w:jc w:val="both"/>
@@ -11236,162 +11250,137 @@
           <w:color w:val="000000"/>
         </w:rPr>
       </w:pPr>
+      <w:r>
+        <w:rPr>
+          <w:rFonts w:ascii="Arial" w:eastAsia="Arial" w:hAnsi="Arial" w:cs="Arial"/>
+          <w:color w:val="000000"/>
+        </w:rPr>
+        <w:t>6.12.1</w:t>
+      </w:r>
+      <w:r>
+        <w:rPr>
+          <w:rFonts w:ascii="Arial" w:eastAsia="Arial" w:hAnsi="Arial" w:cs="Arial"/>
+          <w:color w:val="000000"/>
+        </w:rPr>
+        <w:tab/>
+        <w:t>La adquisición de SBIA incluye en los TDR o EETT los requisitos de cumplimiento de la presente directiva y normativa aplicable.</w:t>
+      </w:r>
+    </w:p>
+    <w:p>
+      <w:pPr>
+        <w:spacing w:after="60" w:line="276" w:lineRule="auto"/>
+        <w:ind w:left="1276" w:hanging="720"/>
+        <w:jc w:val="both"/>
+        <w:rPr>
+          <w:rFonts w:ascii="Arial" w:eastAsia="Arial" w:hAnsi="Arial" w:cs="Arial"/>
+          <w:color w:val="000000"/>
+        </w:rPr>
+      </w:pPr>
+      <w:r>
+        <w:rPr>
+          <w:rFonts w:ascii="Arial" w:eastAsia="Arial" w:hAnsi="Arial" w:cs="Arial"/>
+          <w:color w:val="000000"/>
+          <w:highlight w:val="yellow"/>
+        </w:rPr>
+        <w:t>6.12.2</w:t>
+      </w:r>
+      <w:r>
+        <w:rPr>
+          <w:rFonts w:ascii="Arial" w:eastAsia="Arial" w:hAnsi="Arial" w:cs="Arial"/>
+          <w:color w:val="000000"/>
+          <w:highlight w:val="yellow"/>
+        </w:rPr>
+        <w:tab/>
+        <w:t>Los contratos incluyen cláusulas sobre: (a) protección de datos y reserva tributaria; (b) transparencia del modelo; (c) comunicación de vulnerabilidades e incidentes; (d) derecho de auditoría, incluida la realización de auditorías éticas y de sesgo sobre el modelo; (e) transferencia de conocimiento; (f) cumplimiento de estándares técnicos. El plazo de notificación de vulnerabilidades se define en los TDR o EETT de cada contratación, según la criticidad del SBIA.</w:t>
+      </w:r>
+    </w:p>
+    <w:p>
+      <w:pPr>
+        <w:spacing w:after="60" w:line="276" w:lineRule="auto"/>
+        <w:ind w:left="1276" w:hanging="720"/>
+        <w:jc w:val="both"/>
+        <w:rPr>
+          <w:rFonts w:ascii="Arial" w:eastAsia="Arial" w:hAnsi="Arial" w:cs="Arial"/>
+          <w:color w:val="000000"/>
+        </w:rPr>
+      </w:pPr>
+      <w:r>
+        <w:rPr>
+          <w:rFonts w:ascii="Arial" w:eastAsia="Arial" w:hAnsi="Arial" w:cs="Arial"/>
+          <w:color w:val="000000"/>
+        </w:rPr>
+        <w:t>6.12.3</w:t>
+      </w:r>
+      <w:r>
+        <w:rPr>
+          <w:rFonts w:ascii="Arial" w:eastAsia="Arial" w:hAnsi="Arial" w:cs="Arial"/>
+          <w:color w:val="000000"/>
+        </w:rPr>
+        <w:tab/>
+        <w:t>Para SBIA SaaS, la INSI verifica la compatibilidad de los términos de uso con las obligaciones de SUNAT en materia de datos y reserva tributaria.</w:t>
+      </w:r>
+    </w:p>
+    <w:p>
+      <w:pPr>
+        <w:spacing w:after="60" w:line="276" w:lineRule="auto"/>
+        <w:ind w:left="1276" w:hanging="720"/>
+        <w:jc w:val="both"/>
+        <w:rPr>
+          <w:rFonts w:ascii="Arial" w:eastAsia="Arial" w:hAnsi="Arial" w:cs="Arial"/>
+          <w:color w:val="000000"/>
+        </w:rPr>
+      </w:pPr>
+      <w:r>
+        <w:rPr>
+          <w:rFonts w:ascii="Arial" w:eastAsia="Arial" w:hAnsi="Arial" w:cs="Arial"/>
+          <w:color w:val="000000"/>
+          <w:highlight w:val="yellow"/>
+        </w:rPr>
+        <w:t>6.12.4</w:t>
+      </w:r>
+      <w:r>
+        <w:rPr>
+          <w:rFonts w:ascii="Arial" w:eastAsia="Arial" w:hAnsi="Arial" w:cs="Arial"/>
+          <w:color w:val="000000"/>
+          <w:highlight w:val="yellow"/>
+        </w:rPr>
+        <w:tab/>
+        <w:t>Los contratos prohíben al proveedor emplear la información de la SUNAT (en particular la sujeta a reserva tributaria y los datos personales) para entrenar, ajustar o mejorar sus modelos o para cualquier fin propio, en concordancia con el artículo 85 del Código Tributario, que extiende la obligación de reserva a quienes accedan a dicha información. La propiedad intelectual de los ajustes (fine-tuning) realizados con información o para necesidades de la SUNAT corresponde a la SUNAT.</w:t>
+      </w:r>
+    </w:p>
+    <w:p>
+      <w:pPr>
+        <w:spacing w:after="60" w:line="276" w:lineRule="auto"/>
+        <w:ind w:left="1276" w:hanging="720"/>
+        <w:jc w:val="both"/>
+        <w:rPr>
+          <w:rFonts w:ascii="Arial" w:eastAsia="Arial" w:hAnsi="Arial" w:cs="Arial"/>
+          <w:color w:val="000000"/>
+        </w:rPr>
+      </w:pPr>
+      <w:r>
+        <w:rPr>
+          <w:rFonts w:ascii="Arial" w:eastAsia="Arial" w:hAnsi="Arial" w:cs="Arial"/>
+          <w:color w:val="000000"/>
+          <w:highlight w:val="yellow"/>
+        </w:rPr>
+        <w:t>6.12.5</w:t>
+      </w:r>
+      <w:r>
+        <w:rPr>
+          <w:rFonts w:ascii="Arial" w:eastAsia="Arial" w:hAnsi="Arial" w:cs="Arial"/>
+          <w:color w:val="000000"/>
+          <w:highlight w:val="yellow"/>
+        </w:rPr>
+        <w:tab/>
+        <w:t>Para los SBIA de riesgo alto, el proveedor entrega la documentación técnica que permita comprender la lógica general del modelo y los factores que influyen en sus resultados, en la medida necesaria para el cumplimiento de las obligaciones de transparencia y explicabilidad de la SUNAT, evitando soluciones de caja negra no auditables.</w:t>
+      </w:r>
     </w:p>
     <w:p>
       <w:pPr>
         <w:pStyle w:val="SubtituloDONI"/>
         <w:spacing w:line="276" w:lineRule="auto"/>
         <w:ind w:left="851"/>
-      </w:pPr>
-      <w:r>
-        <w:t>6.12</w:t>
-      </w:r>
-      <w:r>
-        <w:tab/>
-        <w:t>De la gestión de proveedores de IA</w:t>
-      </w:r>
-    </w:p>
-    <w:p>
-      <w:pPr>
-        <w:spacing w:after="60" w:line="276" w:lineRule="auto"/>
-        <w:ind w:left="1276" w:hanging="720"/>
-        <w:jc w:val="both"/>
-        <w:rPr>
-          <w:rFonts w:ascii="Arial" w:eastAsia="Arial" w:hAnsi="Arial" w:cs="Arial"/>
-          <w:color w:val="000000"/>
-        </w:rPr>
-      </w:pPr>
-      <w:r>
-        <w:rPr>
-          <w:rFonts w:ascii="Arial" w:eastAsia="Arial" w:hAnsi="Arial" w:cs="Arial"/>
-          <w:color w:val="000000"/>
-        </w:rPr>
-        <w:t>6.12.1</w:t>
-      </w:r>
-      <w:r>
-        <w:rPr>
-          <w:rFonts w:ascii="Arial" w:eastAsia="Arial" w:hAnsi="Arial" w:cs="Arial"/>
-          <w:color w:val="000000"/>
-        </w:rPr>
-        <w:tab/>
-        <w:t>La adquisición de SBIA incluye en los TDR o EETT los requisitos de cumplimiento de la presente directiva y normativa aplicable.</w:t>
-      </w:r>
-    </w:p>
-    <w:p>
-      <w:pPr>
-        <w:spacing w:after="60" w:line="276" w:lineRule="auto"/>
-        <w:ind w:left="1276" w:hanging="720"/>
-        <w:jc w:val="both"/>
-        <w:rPr>
-          <w:rFonts w:ascii="Arial" w:eastAsia="Arial" w:hAnsi="Arial" w:cs="Arial"/>
-          <w:color w:val="000000"/>
-        </w:rPr>
-      </w:pPr>
-      <w:r>
-        <w:rPr>
-          <w:rFonts w:ascii="Arial" w:eastAsia="Arial" w:hAnsi="Arial" w:cs="Arial"/>
-          <w:color w:val="000000"/>
-          <w:highlight w:val="yellow"/>
-        </w:rPr>
-        <w:t>6.12.2</w:t>
-      </w:r>
-      <w:r>
-        <w:rPr>
-          <w:rFonts w:ascii="Arial" w:eastAsia="Arial" w:hAnsi="Arial" w:cs="Arial"/>
-          <w:color w:val="000000"/>
-          <w:highlight w:val="yellow"/>
-        </w:rPr>
-        <w:tab/>
-        <w:t>Los contratos incluyen cláusulas sobre: (a) protección de datos y reserva tributaria; (b) transparencia del modelo; (c) comunicación de vulnerabilidades e incidentes; (d) derecho de auditoría, incluida la realización de auditorías éticas y de sesgo sobre el modelo; (e) transferencia de conocimiento; (f) cumplimiento de estándares técnicos. El plazo de notificación de vulnerabilidades se define en los TDR o EETT de cada contratación, según la criticidad del SBIA.</w:t>
-      </w:r>
-    </w:p>
-    <w:p>
-      <w:pPr>
-        <w:spacing w:after="60" w:line="276" w:lineRule="auto"/>
-        <w:ind w:left="1276" w:hanging="720"/>
-        <w:jc w:val="both"/>
-        <w:rPr>
-          <w:rFonts w:ascii="Arial" w:eastAsia="Arial" w:hAnsi="Arial" w:cs="Arial"/>
-          <w:color w:val="000000"/>
-        </w:rPr>
-      </w:pPr>
-      <w:r>
-        <w:rPr>
-          <w:rFonts w:ascii="Arial" w:eastAsia="Arial" w:hAnsi="Arial" w:cs="Arial"/>
-          <w:color w:val="000000"/>
-        </w:rPr>
-        <w:t>6.12.3</w:t>
-      </w:r>
-      <w:r>
-        <w:rPr>
-          <w:rFonts w:ascii="Arial" w:eastAsia="Arial" w:hAnsi="Arial" w:cs="Arial"/>
-          <w:color w:val="000000"/>
-        </w:rPr>
-        <w:tab/>
-        <w:t>Para SBIA SaaS, la INSI verifica la compatibilidad de los términos de uso con las obligaciones de SUNAT en materia de datos y reserva tributaria.</w:t>
-      </w:r>
-    </w:p>
-    <w:p>
-      <w:pPr>
-        <w:spacing w:after="60" w:line="276" w:lineRule="auto"/>
-        <w:ind w:left="1276" w:hanging="720"/>
-        <w:jc w:val="both"/>
-        <w:rPr>
-          <w:rFonts w:ascii="Arial" w:eastAsia="Arial" w:hAnsi="Arial" w:cs="Arial"/>
-          <w:color w:val="000000"/>
-        </w:rPr>
-      </w:pPr>
-      <w:r>
-        <w:rPr>
-          <w:rFonts w:ascii="Arial" w:eastAsia="Arial" w:hAnsi="Arial" w:cs="Arial"/>
-          <w:color w:val="000000"/>
-          <w:highlight w:val="yellow"/>
-        </w:rPr>
-        <w:t>6.12.4</w:t>
-      </w:r>
-      <w:r>
-        <w:rPr>
-          <w:rFonts w:ascii="Arial" w:eastAsia="Arial" w:hAnsi="Arial" w:cs="Arial"/>
-          <w:color w:val="000000"/>
-          <w:highlight w:val="yellow"/>
-        </w:rPr>
-        <w:tab/>
-        <w:t>Los contratos prohíben al proveedor emplear la información de la SUNAT (en particular la sujeta a reserva tributaria y los datos personales) para entrenar, ajustar o mejorar sus modelos o para cualquier fin propio, en concordancia con el artículo 85 del Código Tributario, que extiende la obligación de reserva a quienes accedan a dicha información. La propiedad intelectual de los ajustes (fine-tuning) realizados con información o para necesidades de la SUNAT corresponde a la SUNAT.</w:t>
-      </w:r>
-    </w:p>
-    <w:p>
-      <w:pPr>
-        <w:spacing w:after="60" w:line="276" w:lineRule="auto"/>
-        <w:ind w:left="1276" w:hanging="720"/>
-        <w:jc w:val="both"/>
-        <w:rPr>
-          <w:rFonts w:ascii="Arial" w:eastAsia="Arial" w:hAnsi="Arial" w:cs="Arial"/>
-          <w:color w:val="000000"/>
-        </w:rPr>
-      </w:pPr>
-      <w:r>
-        <w:rPr>
-          <w:rFonts w:ascii="Arial" w:eastAsia="Arial" w:hAnsi="Arial" w:cs="Arial"/>
-          <w:color w:val="000000"/>
-          <w:highlight w:val="yellow"/>
-        </w:rPr>
-        <w:t>6.12.5</w:t>
-      </w:r>
-      <w:r>
-        <w:rPr>
-          <w:rFonts w:ascii="Arial" w:eastAsia="Arial" w:hAnsi="Arial" w:cs="Arial"/>
-          <w:color w:val="000000"/>
-          <w:highlight w:val="yellow"/>
-        </w:rPr>
-        <w:tab/>
-        <w:t>Para los SBIA de riesgo alto, el proveedor entrega la documentación técnica que permita comprender la lógica general del modelo y los factores que influyen en sus resultados, en la medida necesaria para el cumplimiento de las obligaciones de transparencia y explicabilidad de la SUNAT, evitando soluciones de caja negra no auditables.</w:t>
-      </w:r>
-    </w:p>
-    <w:p>
-      <w:pPr>
-        <w:pStyle w:val="SubtituloDONI"/>
-        <w:spacing w:line="276" w:lineRule="auto"/>
-        <w:ind w:left="851"/>
         <w:rPr>
           <w:highlight w:val="lightGray"/>
         </w:rPr>
@@ -11412,8 +11401,12 @@
     </w:p>
     <w:p>
       <w:pPr>
+        <w:tabs>
+          <w:tab w:val="left" w:pos="1276"/>
+          <w:tab w:val="left" w:pos="1560"/>
+        </w:tabs>
         <w:spacing w:line="276" w:lineRule="auto"/>
-        <w:ind w:left="851"/>
+        <w:ind w:left="1134"/>
         <w:jc w:val="both"/>
         <w:rPr>
           <w:rFonts w:ascii="Arial" w:eastAsia="Arial" w:hAnsi="Arial" w:cs="Arial"/>
@@ -11469,7 +11462,7 @@
     <w:p>
       <w:pPr>
         <w:spacing w:line="276" w:lineRule="auto"/>
-        <w:ind w:left="851"/>
+        <w:ind w:left="1134"/>
         <w:jc w:val="both"/>
         <w:rPr>
           <w:rFonts w:ascii="Arial" w:eastAsia="Arial" w:hAnsi="Arial" w:cs="Arial"/>
@@ -11489,7 +11482,7 @@
     <w:p>
       <w:pPr>
         <w:spacing w:line="276" w:lineRule="auto"/>
-        <w:ind w:left="851"/>
+        <w:ind w:left="1134"/>
         <w:jc w:val="both"/>
         <w:rPr>
           <w:rFonts w:ascii="Arial" w:eastAsia="Arial" w:hAnsi="Arial" w:cs="Arial"/>
@@ -11514,7 +11507,7 @@
           <w:numId w:val="26"/>
         </w:numPr>
         <w:spacing w:before="0" w:line="276" w:lineRule="auto"/>
-        <w:ind w:left="1276"/>
+        <w:ind w:left="1560"/>
         <w:rPr>
           <w:b w:val="0"/>
           <w:bCs w:val="0"/>
@@ -11529,7 +11522,6 @@
           <w:color w:val="000000"/>
           <w:highlight w:val="lightGray"/>
         </w:rPr>
-        <w:lastRenderedPageBreak/>
         <w:t>La finalidad y los principios institucionales aplicables a los sistemas basados en IA.</w:t>
       </w:r>
     </w:p>
@@ -11541,7 +11533,7 @@
           <w:numId w:val="26"/>
         </w:numPr>
         <w:spacing w:before="0" w:line="276" w:lineRule="auto"/>
-        <w:ind w:left="1276"/>
+        <w:ind w:left="1701"/>
         <w:rPr>
           <w:b w:val="0"/>
           <w:bCs w:val="0"/>
@@ -11556,6 +11548,7 @@
           <w:color w:val="000000"/>
           <w:highlight w:val="lightGray"/>
         </w:rPr>
+        <w:lastRenderedPageBreak/>
         <w:t>Los riesgos derivados de su diseño, desarrollo, implementación y uso.</w:t>
       </w:r>
     </w:p>
@@ -11567,7 +11560,7 @@
           <w:numId w:val="26"/>
         </w:numPr>
         <w:spacing w:before="0" w:line="276" w:lineRule="auto"/>
-        <w:ind w:left="1276"/>
+        <w:ind w:left="1701"/>
         <w:rPr>
           <w:b w:val="0"/>
           <w:bCs w:val="0"/>
@@ -11593,7 +11586,7 @@
           <w:numId w:val="26"/>
         </w:numPr>
         <w:spacing w:before="0" w:line="276" w:lineRule="auto"/>
-        <w:ind w:left="1276"/>
+        <w:ind w:left="1701"/>
         <w:rPr>
           <w:b w:val="0"/>
           <w:bCs w:val="0"/>
@@ -11619,28 +11612,31 @@
           <w:numId w:val="26"/>
         </w:numPr>
         <w:spacing w:before="0" w:line="276" w:lineRule="auto"/>
+        <w:ind w:left="1701"/>
+        <w:rPr>
+          <w:b w:val="0"/>
+          <w:bCs w:val="0"/>
+          <w:color w:val="000000"/>
+          <w:highlight w:val="lightGray"/>
+        </w:rPr>
+      </w:pPr>
+      <w:r>
+        <w:rPr>
+          <w:b w:val="0"/>
+          <w:bCs w:val="0"/>
+          <w:color w:val="000000"/>
+          <w:highlight w:val="lightGray"/>
+        </w:rPr>
+        <w:t>El impacto social y ambiental de los sistemas basados en IA.</w:t>
+      </w:r>
+    </w:p>
+    <w:p>
+      <w:pPr>
+        <w:tabs>
+          <w:tab w:val="left" w:pos="1276"/>
+        </w:tabs>
+        <w:spacing w:line="276" w:lineRule="auto"/>
         <w:ind w:left="1276"/>
-        <w:rPr>
-          <w:b w:val="0"/>
-          <w:bCs w:val="0"/>
-          <w:color w:val="000000"/>
-          <w:highlight w:val="lightGray"/>
-        </w:rPr>
-      </w:pPr>
-      <w:r>
-        <w:rPr>
-          <w:b w:val="0"/>
-          <w:bCs w:val="0"/>
-          <w:color w:val="000000"/>
-          <w:highlight w:val="lightGray"/>
-        </w:rPr>
-        <w:t>El impacto social y ambiental de los sistemas basados en IA.</w:t>
-      </w:r>
-    </w:p>
-    <w:p>
-      <w:pPr>
-        <w:spacing w:line="276" w:lineRule="auto"/>
-        <w:ind w:left="851"/>
         <w:jc w:val="both"/>
         <w:rPr>
           <w:rFonts w:ascii="Arial" w:eastAsia="Arial" w:hAnsi="Arial" w:cs="Arial"/>
@@ -11696,7 +11692,7 @@
     <w:p>
       <w:pPr>
         <w:spacing w:line="276" w:lineRule="auto"/>
-        <w:ind w:left="851"/>
+        <w:ind w:left="1276"/>
         <w:jc w:val="both"/>
         <w:rPr>
           <w:rFonts w:ascii="Arial" w:eastAsia="Arial" w:hAnsi="Arial" w:cs="Arial"/>
@@ -11716,7 +11712,7 @@
     <w:p>
       <w:pPr>
         <w:spacing w:line="276" w:lineRule="auto"/>
-        <w:ind w:left="851"/>
+        <w:ind w:left="1276"/>
         <w:jc w:val="both"/>
         <w:rPr>
           <w:rFonts w:ascii="Arial" w:eastAsia="Arial" w:hAnsi="Arial" w:cs="Arial"/>
@@ -11736,7 +11732,7 @@
     <w:p>
       <w:pPr>
         <w:spacing w:line="276" w:lineRule="auto"/>
-        <w:ind w:left="851"/>
+        <w:ind w:left="1276"/>
         <w:jc w:val="both"/>
         <w:rPr>
           <w:rFonts w:ascii="Arial" w:eastAsia="Arial" w:hAnsi="Arial" w:cs="Arial"/>
@@ -11761,7 +11757,7 @@
           <w:numId w:val="25"/>
         </w:numPr>
         <w:spacing w:before="0" w:line="276" w:lineRule="auto"/>
-        <w:ind w:left="1276"/>
+        <w:ind w:left="1701"/>
         <w:rPr>
           <w:b w:val="0"/>
           <w:bCs w:val="0"/>
@@ -11787,7 +11783,7 @@
           <w:numId w:val="25"/>
         </w:numPr>
         <w:spacing w:before="0" w:line="276" w:lineRule="auto"/>
-        <w:ind w:left="1276"/>
+        <w:ind w:left="1701"/>
         <w:rPr>
           <w:b w:val="0"/>
           <w:bCs w:val="0"/>
@@ -11813,7 +11809,7 @@
           <w:numId w:val="25"/>
         </w:numPr>
         <w:spacing w:before="0" w:line="276" w:lineRule="auto"/>
-        <w:ind w:left="1276"/>
+        <w:ind w:left="1701"/>
         <w:rPr>
           <w:b w:val="0"/>
           <w:bCs w:val="0"/>
@@ -11839,7 +11835,7 @@
           <w:numId w:val="25"/>
         </w:numPr>
         <w:spacing w:before="0" w:line="276" w:lineRule="auto"/>
-        <w:ind w:left="1276"/>
+        <w:ind w:left="1701"/>
         <w:rPr>
           <w:b w:val="0"/>
           <w:bCs w:val="0"/>
@@ -11865,28 +11861,28 @@
           <w:numId w:val="25"/>
         </w:numPr>
         <w:spacing w:before="0" w:line="276" w:lineRule="auto"/>
+        <w:ind w:left="1701"/>
+        <w:rPr>
+          <w:b w:val="0"/>
+          <w:bCs w:val="0"/>
+          <w:color w:val="000000"/>
+          <w:highlight w:val="lightGray"/>
+        </w:rPr>
+      </w:pPr>
+      <w:r>
+        <w:rPr>
+          <w:b w:val="0"/>
+          <w:bCs w:val="0"/>
+          <w:color w:val="000000"/>
+          <w:highlight w:val="lightGray"/>
+        </w:rPr>
+        <w:t>La protección de la reserva tributaria cuando los sistemas procesen información de los administrados.</w:t>
+      </w:r>
+    </w:p>
+    <w:p>
+      <w:pPr>
+        <w:spacing w:line="276" w:lineRule="auto"/>
         <w:ind w:left="1276"/>
-        <w:rPr>
-          <w:b w:val="0"/>
-          <w:bCs w:val="0"/>
-          <w:color w:val="000000"/>
-          <w:highlight w:val="lightGray"/>
-        </w:rPr>
-      </w:pPr>
-      <w:r>
-        <w:rPr>
-          <w:b w:val="0"/>
-          <w:bCs w:val="0"/>
-          <w:color w:val="000000"/>
-          <w:highlight w:val="lightGray"/>
-        </w:rPr>
-        <w:t>La protección de la reserva tributaria cuando los sistemas procesen información de los administrados.</w:t>
-      </w:r>
-    </w:p>
-    <w:p>
-      <w:pPr>
-        <w:spacing w:line="276" w:lineRule="auto"/>
-        <w:ind w:left="851"/>
         <w:jc w:val="both"/>
         <w:rPr>
           <w:rFonts w:ascii="Arial" w:eastAsia="Arial" w:hAnsi="Arial" w:cs="Arial"/>
@@ -11950,8 +11946,12 @@
     </w:p>
     <w:p>
       <w:pPr>
+        <w:tabs>
+          <w:tab w:val="left" w:pos="1276"/>
+          <w:tab w:val="left" w:pos="1418"/>
+        </w:tabs>
         <w:spacing w:line="276" w:lineRule="auto"/>
-        <w:ind w:left="851"/>
+        <w:ind w:left="1276"/>
         <w:jc w:val="both"/>
         <w:rPr>
           <w:rFonts w:ascii="Arial" w:eastAsia="Arial" w:hAnsi="Arial" w:cs="Arial"/>
@@ -11970,8 +11970,11 @@
     </w:p>
     <w:p>
       <w:pPr>
+        <w:tabs>
+          <w:tab w:val="left" w:pos="1418"/>
+        </w:tabs>
         <w:spacing w:line="276" w:lineRule="auto"/>
-        <w:ind w:left="851"/>
+        <w:ind w:left="1276"/>
         <w:jc w:val="both"/>
         <w:rPr>
           <w:rFonts w:ascii="Arial" w:eastAsia="Arial" w:hAnsi="Arial" w:cs="Arial"/>
@@ -11985,7 +11988,7 @@
           <w:color w:val="000000"/>
           <w:highlight w:val="lightGray"/>
         </w:rPr>
-        <w:t xml:space="preserve">Las acciones de gestión del cambio facilitan la consolidación de la Política institucional de uso seguro, responsable y ético de los sistemas basados en IA y del sistema de gestión de IA, promoviendo su integración en la gestión institucional y favoreciendo las condiciones organizacionales necesarias para su sostenibilidad y </w:t>
+        <w:t xml:space="preserve">Las acciones de gestión del cambio facilitan la consolidación de la Política institucional de uso seguro, responsable y ético de los sistemas basados en IA y del sistema de gestión de IA, promoviendo su integración en la gestión institucional y favoreciendo las condiciones organizacionales necesarias para </w:t>
       </w:r>
       <w:r>
         <w:rPr>
@@ -11994,24 +11997,8 @@
           <w:highlight w:val="lightGray"/>
         </w:rPr>
         <w:lastRenderedPageBreak/>
-        <w:t>mejora continua, en concordancia con los numerales 28.1 y 28.2 del artículo 28 del Reglamento.</w:t>
-      </w:r>
-    </w:p>
-    <w:p>
-      <w:pPr>
-        <w:jc w:val="both"/>
-        <w:rPr>
-          <w:color w:val="000000" w:themeColor="text1"/>
-        </w:rPr>
-      </w:pPr>
-    </w:p>
-    <w:p>
-      <w:pPr>
-        <w:jc w:val="both"/>
-        <w:rPr>
-          <w:color w:val="000000" w:themeColor="text1"/>
-        </w:rPr>
-      </w:pPr>
+        <w:t>su sostenibilidad y mejora continua, en concordancia con los numerales 28.1 y 28.2 del artículo 28 del Reglamento.</w:t>
+      </w:r>
     </w:p>
     <w:p>
       <w:pPr>
@@ -12247,7 +12234,6 @@
           <w:rFonts w:ascii="Arial" w:hAnsi="Arial" w:cs="Arial"/>
           <w:highlight w:val="lightGray"/>
         </w:rPr>
-        <w:lastRenderedPageBreak/>
         <w:t>6.15.3 En la formulación de proyectos institucionales conforme al MGPP, cuando se identifique un componente basado en IA se incorpora la opinión de la Comisión como parte del caso de negocio, con carácter previo a su aprobación.</w:t>
       </w:r>
     </w:p>
@@ -12269,7 +12255,15 @@
           <w:rFonts w:ascii="Arial" w:hAnsi="Arial" w:cs="Arial"/>
           <w:highlight w:val="lightGray"/>
         </w:rPr>
-        <w:t>6.15.4 Cuando un proyecto de inversión pública sujeto al Sistema Nacional de Programación Multianual y Gestión de Inversiones incorpore un componente basado en IA, la Unidad Formuladora considera la opinión de la Comisión como insumo del análisis técnico que sustenta la declaración de viabilidad, sin perjuicio de las disposiciones del referido Sistema. En la ejecución, el SBIA observa el ciclo de vida del numeral 6.1.</w:t>
+        <w:t xml:space="preserve">6.15.4 Cuando un proyecto de inversión pública sujeto al Sistema Nacional de Programación Multianual y Gestión de Inversiones incorpore un componente </w:t>
+      </w:r>
+      <w:r>
+        <w:rPr>
+          <w:rFonts w:ascii="Arial" w:hAnsi="Arial" w:cs="Arial"/>
+          <w:highlight w:val="lightGray"/>
+        </w:rPr>
+        <w:lastRenderedPageBreak/>
+        <w:t>basado en IA, la Unidad Formuladora considera la opinión de la Comisión como insumo del análisis técnico que sustenta la declaración de viabilidad, sin perjuicio de las disposiciones del referido Sistema. En la ejecución, el SBIA observa el ciclo de vida del numeral 6.1.</w:t>
       </w:r>
     </w:p>
     <w:p>

</xml_diff>

<commit_message>
docs: refuerza 6.15.1 (opinion de la Comision como requisito institucional interno en cualquier instrumento) y amplia 6.15.3 (aplica en caso de negocio, plan de gestion y cambios en ejecucion bajo el MGPP)
</commit_message>
<xml_diff>
--- a/normativo/DIRECTIVA-GOBIERNO-IA.docx
+++ b/normativo/DIRECTIVA-GOBIERNO-IA.docx
@@ -2306,15 +2306,7 @@
           <w:color w:val="000000"/>
           <w:highlight w:val="lightGray"/>
         </w:rPr>
-        <w:t>Se exceptúa de su alcance al Órgano de Control Institucional, que se rige por las disposiciones del Sistema Nacional de Control</w:t>
-      </w:r>
-      <w:r>
-        <w:rPr>
-          <w:rFonts w:ascii="Arial" w:hAnsi="Arial" w:cs="Arial"/>
-          <w:color w:val="000000"/>
-          <w:highlight w:val="lightGray"/>
-        </w:rPr>
-        <w:t>.</w:t>
+        <w:t>Se exceptúa de su alcance al Órgano de Control Institucional, que se rige por las disposiciones del Sistema Nacional de Control.</w:t>
       </w:r>
     </w:p>
     <w:p>
@@ -3998,15 +3990,7 @@
           <w:color w:val="000000"/>
           <w:highlight w:val="lightGray"/>
         </w:rPr>
-        <w:t>Los derechos fundamentales son intangibles y constituyen el límite de toda actuación administrativa. Por ello, cuando exista la posibilidad de que la operación de un SBIA pueda afectar los derechos fundamentales de las personas, se priorizará siempre la protección de éstos últimos.</w:t>
-      </w:r>
-      <w:r>
-        <w:rPr>
-          <w:rFonts w:ascii="Arial" w:hAnsi="Arial" w:cs="Arial"/>
-          <w:color w:val="000000"/>
-          <w:highlight w:val="lightGray"/>
-        </w:rPr>
-        <w:t xml:space="preserve"> </w:t>
+        <w:t xml:space="preserve">Los derechos fundamentales son intangibles y constituyen el límite de toda actuación administrativa. Por ello, cuando exista la posibilidad de que la operación de un SBIA pueda afectar los derechos fundamentales de las personas, se priorizará siempre la protección de éstos últimos. </w:t>
       </w:r>
     </w:p>
     <w:p>
@@ -6784,23 +6768,7 @@
                 <w:bCs w:val="0"/>
                 <w:highlight w:val="lightGray"/>
               </w:rPr>
-              <w:t>En materia de negocio: aporta a la Comisión de Gobierno de IA la visión del</w:t>
-            </w:r>
-            <w:r>
-              <w:rPr>
-                <w:b w:val="0"/>
-                <w:bCs w:val="0"/>
-                <w:highlight w:val="lightGray"/>
-              </w:rPr>
-              <w:t xml:space="preserve"> </w:t>
-            </w:r>
-            <w:r>
-              <w:rPr>
-                <w:b w:val="0"/>
-                <w:bCs w:val="0"/>
-                <w:highlight w:val="lightGray"/>
-              </w:rPr>
-              <w:t xml:space="preserve">ámbito de la Superintendencia Nacional Adjunta que lo designa. </w:t>
+              <w:t xml:space="preserve">En materia de negocio: aporta a la Comisión de Gobierno de IA la visión del ámbito de la Superintendencia Nacional Adjunta que lo designa. </w:t>
             </w:r>
           </w:p>
           <w:p>
@@ -6826,71 +6794,7 @@
                 <w:highlight w:val="lightGray"/>
               </w:rPr>
               <w:lastRenderedPageBreak/>
-              <w:t>Contribuye a la</w:t>
-            </w:r>
-            <w:r>
-              <w:rPr>
-                <w:b w:val="0"/>
-                <w:bCs w:val="0"/>
-                <w:highlight w:val="lightGray"/>
-              </w:rPr>
-              <w:t xml:space="preserve"> </w:t>
-            </w:r>
-            <w:r>
-              <w:rPr>
-                <w:b w:val="0"/>
-                <w:bCs w:val="0"/>
-                <w:highlight w:val="lightGray"/>
-              </w:rPr>
-              <w:t>evaluación del componente de IA con el conocimiento operativo de los procesos</w:t>
-            </w:r>
-            <w:r>
-              <w:rPr>
-                <w:b w:val="0"/>
-                <w:bCs w:val="0"/>
-                <w:highlight w:val="lightGray"/>
-              </w:rPr>
-              <w:t xml:space="preserve"> </w:t>
-            </w:r>
-            <w:r>
-              <w:rPr>
-                <w:b w:val="0"/>
-                <w:bCs w:val="0"/>
-                <w:highlight w:val="lightGray"/>
-              </w:rPr>
-              <w:t xml:space="preserve">de dicho ámbito y de su impacto en los administrados. Su participación </w:t>
-            </w:r>
-            <w:r>
-              <w:rPr>
-                <w:b w:val="0"/>
-                <w:bCs w:val="0"/>
-                <w:highlight w:val="lightGray"/>
-              </w:rPr>
-              <w:t>es permanente</w:t>
-            </w:r>
-            <w:r>
-              <w:rPr>
-                <w:b w:val="0"/>
-                <w:bCs w:val="0"/>
-                <w:highlight w:val="lightGray"/>
-              </w:rPr>
-              <w:t xml:space="preserve"> y no sustituye la del propietario del caso de uso, a quien la Comisión</w:t>
-            </w:r>
-            <w:r>
-              <w:rPr>
-                <w:b w:val="0"/>
-                <w:bCs w:val="0"/>
-                <w:highlight w:val="lightGray"/>
-              </w:rPr>
-              <w:t xml:space="preserve"> </w:t>
-            </w:r>
-            <w:r>
-              <w:rPr>
-                <w:b w:val="0"/>
-                <w:bCs w:val="0"/>
-                <w:highlight w:val="lightGray"/>
-              </w:rPr>
-              <w:t>convoca cuando se evalúa un caso de uso de su proceso, conforme al numeral</w:t>
+              <w:t>Contribuye a la evaluación del componente de IA con el conocimiento operativo de los procesos de dicho ámbito y de su impacto en los administrados. Su participación es permanente y no sustituye la del propietario del caso de uso, a quien la Comisión convoca cuando se evalúa un caso de uso de su proceso, conforme al numeral</w:t>
             </w:r>
             <w:r>
               <w:rPr>
@@ -8687,79 +8591,7 @@
           <w:color w:val="000000"/>
           <w:highlight w:val="lightGray"/>
         </w:rPr>
-        <w:t>Por comprender actuaciones a cargo de unidades de organización distintas de la INSI, su formulación recoge los aportes de dichas unidades y su aprobación</w:t>
-      </w:r>
-      <w:r>
-        <w:rPr>
-          <w:rFonts w:ascii="Arial" w:hAnsi="Arial" w:cs="Arial"/>
-          <w:color w:val="000000"/>
-          <w:highlight w:val="lightGray"/>
-        </w:rPr>
-        <w:t xml:space="preserve"> </w:t>
-      </w:r>
-      <w:r>
-        <w:rPr>
-          <w:rFonts w:ascii="Arial" w:hAnsi="Arial" w:cs="Arial"/>
-          <w:color w:val="000000"/>
-          <w:highlight w:val="lightGray"/>
-        </w:rPr>
-        <w:t>requiere la opinión favorable de la Comisión de Gobierno de IA, en ejercicio de las facultades previstas en el literal h del numeral 6.4 y en el numeral 6.5 de la METDONI. La metodología comprende, como mínimo: la aplicación de la clasificación de riesgo y de la evaluación de impacto algorítmico, los criterios</w:t>
-      </w:r>
-      <w:r>
-        <w:rPr>
-          <w:rFonts w:ascii="Arial" w:hAnsi="Arial" w:cs="Arial"/>
-          <w:color w:val="000000"/>
-          <w:highlight w:val="lightGray"/>
-        </w:rPr>
-        <w:t xml:space="preserve"> </w:t>
-      </w:r>
-      <w:r>
-        <w:rPr>
-          <w:rFonts w:ascii="Arial" w:hAnsi="Arial" w:cs="Arial"/>
-          <w:color w:val="000000"/>
-          <w:highlight w:val="lightGray"/>
-        </w:rPr>
-        <w:t>técnicos de diseño de la arquitectura de los SBIA, el contenido de los entregables de cada etapa, los tipos y las técnicas de prueba aplicables según</w:t>
-      </w:r>
-      <w:r>
-        <w:rPr>
-          <w:rFonts w:ascii="Arial" w:hAnsi="Arial" w:cs="Arial"/>
-          <w:color w:val="000000"/>
-          <w:highlight w:val="lightGray"/>
-        </w:rPr>
-        <w:t xml:space="preserve"> </w:t>
-      </w:r>
-      <w:r>
-        <w:rPr>
-          <w:rFonts w:ascii="Arial" w:hAnsi="Arial" w:cs="Arial"/>
-          <w:color w:val="000000"/>
-          <w:highlight w:val="lightGray"/>
-        </w:rPr>
-        <w:t>el nivel de riesgo, los controles de contención, las prácticas de monitoreo y las condiciones de retiro. En tanto no se apruebe, los SBIA siguen el ciclo de</w:t>
-      </w:r>
-      <w:r>
-        <w:rPr>
-          <w:rFonts w:ascii="Arial" w:hAnsi="Arial" w:cs="Arial"/>
-          <w:color w:val="000000"/>
-          <w:highlight w:val="lightGray"/>
-        </w:rPr>
-        <w:t xml:space="preserve"> </w:t>
-      </w:r>
-      <w:r>
-        <w:rPr>
-          <w:rFonts w:ascii="Arial" w:hAnsi="Arial" w:cs="Arial"/>
-          <w:color w:val="000000"/>
-          <w:highlight w:val="lightGray"/>
-        </w:rPr>
-        <w:t>vida del numeral 6.1.1 y la normativa de desarrollo de sistemas vigente en la SUNAT</w:t>
-      </w:r>
-      <w:r>
-        <w:rPr>
-          <w:rFonts w:ascii="Arial" w:hAnsi="Arial" w:cs="Arial"/>
-          <w:color w:val="000000"/>
-          <w:highlight w:val="lightGray"/>
-        </w:rPr>
-        <w:t>.</w:t>
+        <w:t>Por comprender actuaciones a cargo de unidades de organización distintas de la INSI, su formulación recoge los aportes de dichas unidades y su aprobación requiere la opinión favorable de la Comisión de Gobierno de IA, en ejercicio de las facultades previstas en el literal h del numeral 6.4 y en el numeral 6.5 de la METDONI. La metodología comprende, como mínimo: la aplicación de la clasificación de riesgo y de la evaluación de impacto algorítmico, los criterios técnicos de diseño de la arquitectura de los SBIA, el contenido de los entregables de cada etapa, los tipos y las técnicas de prueba aplicables según el nivel de riesgo, los controles de contención, las prácticas de monitoreo y las condiciones de retiro. En tanto no se apruebe, los SBIA siguen el ciclo de vida del numeral 6.1.1 y la normativa de desarrollo de sistemas vigente en la SUNAT.</w:t>
       </w:r>
     </w:p>
     <w:p>
@@ -9314,7 +9146,7 @@
           <w:color w:val="000000"/>
           <w:highlight w:val="lightGray"/>
         </w:rPr>
-        <w:t xml:space="preserve">6.5.3 </w:t>
+        <w:t xml:space="preserve">6.5.3    El diseño de la arquitectura de los SBIA observa los Principios de Arquitectura (AAT.PRAQ.01) y los Lineamientos de Arquitectura (LAT.LIAQ.01) de la SUNAT, en sus versiones vigentes, en lo que corresponda a su naturaleza. La GA adecua dichos instrumentos y los estándares de arquitectura de su competencia para incorporar los requisitos propios de los SBIA </w:t>
       </w:r>
       <w:r>
         <w:rPr>
@@ -9322,7 +9154,7 @@
           <w:color w:val="000000"/>
           <w:highlight w:val="lightGray"/>
         </w:rPr>
-        <w:t xml:space="preserve">   </w:t>
+        <w:t>(</w:t>
       </w:r>
       <w:r>
         <w:rPr>
@@ -9330,39 +9162,7 @@
           <w:color w:val="000000"/>
           <w:highlight w:val="lightGray"/>
         </w:rPr>
-        <w:t xml:space="preserve">El diseño de la arquitectura de los SBIA observa los Principios de Arquitectura (AAT.PRAQ.01) y los Lineamientos de Arquitectura (LAT.LIAQ.01) de la SUNAT, en sus versiones vigentes, en lo que corresponda a su naturaleza. La GA adecua dichos instrumentos y los estándares de arquitectura de su competencia para incorporar los requisitos propios de los SBIA </w:t>
-      </w:r>
-      <w:r>
-        <w:rPr>
-          <w:rFonts w:ascii="Arial" w:eastAsia="Arial" w:hAnsi="Arial" w:cs="Arial"/>
-          <w:color w:val="000000"/>
-          <w:highlight w:val="lightGray"/>
-        </w:rPr>
-        <w:t>(</w:t>
-      </w:r>
-      <w:r>
-        <w:rPr>
-          <w:rFonts w:ascii="Arial" w:eastAsia="Arial" w:hAnsi="Arial" w:cs="Arial"/>
-          <w:color w:val="000000"/>
-          <w:highlight w:val="lightGray"/>
-        </w:rPr>
-        <w:t xml:space="preserve">modelos, conjuntos de datos, componentes generativos y </w:t>
-      </w:r>
-      <w:r>
-        <w:rPr>
-          <w:rFonts w:ascii="Arial" w:eastAsia="Arial" w:hAnsi="Arial" w:cs="Arial"/>
-          <w:color w:val="000000"/>
-          <w:highlight w:val="lightGray"/>
-        </w:rPr>
-        <w:t>agenticos</w:t>
-      </w:r>
-      <w:r>
-        <w:rPr>
-          <w:rFonts w:ascii="Arial" w:eastAsia="Arial" w:hAnsi="Arial" w:cs="Arial"/>
-          <w:color w:val="000000"/>
-          <w:highlight w:val="lightGray"/>
-        </w:rPr>
-        <w:t>, e infraestructura especializada</w:t>
+        <w:t>modelos, conjuntos de datos, componentes generativos y agenticos, e infraestructura especializada</w:t>
       </w:r>
       <w:r>
         <w:rPr>
@@ -9398,23 +9198,7 @@
           <w:color w:val="000000"/>
           <w:highlight w:val="lightGray"/>
         </w:rPr>
-        <w:t xml:space="preserve">6.5.4 </w:t>
-      </w:r>
-      <w:r>
-        <w:rPr>
-          <w:rFonts w:ascii="Arial" w:eastAsia="Arial" w:hAnsi="Arial" w:cs="Arial"/>
-          <w:color w:val="000000"/>
-          <w:highlight w:val="lightGray"/>
-        </w:rPr>
-        <w:t xml:space="preserve">  </w:t>
-      </w:r>
-      <w:r>
-        <w:rPr>
-          <w:rFonts w:ascii="Arial" w:eastAsia="Arial" w:hAnsi="Arial" w:cs="Arial"/>
-          <w:color w:val="000000"/>
-          <w:highlight w:val="lightGray"/>
-        </w:rPr>
-        <w:t>Todo SBIA cuenta con la aprobación de su arquitectura de solución por la GA, previa al inicio del desarrollo, la adquisición o el entrenamiento, conforme a la etapa 3 del numeral 6.1.1. Los requisitos derivados del nivel de riesgo aprobado, incluidos los mecanismos de supervisión humana, explicabilidad y trazabilidad, se incorporan como requisitos no funcionales de la solución.</w:t>
+        <w:t>6.5.4   Todo SBIA cuenta con la aprobación de su arquitectura de solución por la GA, previa al inicio del desarrollo, la adquisición o el entrenamiento, conforme a la etapa 3 del numeral 6.1.1. Los requisitos derivados del nivel de riesgo aprobado, incluidos los mecanismos de supervisión humana, explicabilidad y trazabilidad, se incorporan como requisitos no funcionales de la solución.</w:t>
       </w:r>
     </w:p>
     <w:p>
@@ -9505,23 +9289,7 @@
           <w:color w:val="000000"/>
           <w:highlight w:val="lightGray"/>
         </w:rPr>
-        <w:t xml:space="preserve">6.5.7 </w:t>
-      </w:r>
-      <w:r>
-        <w:rPr>
-          <w:rFonts w:ascii="Arial" w:eastAsia="Arial" w:hAnsi="Arial" w:cs="Arial"/>
-          <w:color w:val="000000"/>
-          <w:highlight w:val="lightGray"/>
-        </w:rPr>
-        <w:t xml:space="preserve">  </w:t>
-      </w:r>
-      <w:r>
-        <w:rPr>
-          <w:rFonts w:ascii="Arial" w:eastAsia="Arial" w:hAnsi="Arial" w:cs="Arial"/>
-          <w:color w:val="000000"/>
-          <w:highlight w:val="lightGray"/>
-        </w:rPr>
-        <w:t xml:space="preserve">La publicación del código fuente de los SBIA financiados con fondos públicos, con licencia libre o abierta en la Plataforma Nacional de Software Público Peruano (PNSSP), se sujeta a la determinación previa de su publicabilidad. </w:t>
+        <w:t xml:space="preserve">6.5.7   La publicación del código fuente de los SBIA financiados con fondos públicos, con licencia libre o abierta en la Plataforma Nacional de Software Público Peruano (PNSSP), se sujeta a la determinación previa de su publicabilidad. </w:t>
       </w:r>
       <w:r>
         <w:rPr>
@@ -10346,23 +10114,7 @@
           <w:highlight w:val="lightGray"/>
         </w:rPr>
         <w:lastRenderedPageBreak/>
-        <w:t xml:space="preserve">6.8.5 </w:t>
-      </w:r>
-      <w:r>
-        <w:rPr>
-          <w:rFonts w:ascii="Arial" w:eastAsia="Arial" w:hAnsi="Arial" w:cs="Arial"/>
-          <w:color w:val="000000"/>
-          <w:highlight w:val="lightGray"/>
-        </w:rPr>
-        <w:t xml:space="preserve">  </w:t>
-      </w:r>
-      <w:r>
-        <w:rPr>
-          <w:rFonts w:ascii="Arial" w:eastAsia="Arial" w:hAnsi="Arial" w:cs="Arial"/>
-          <w:color w:val="000000"/>
-          <w:highlight w:val="lightGray"/>
-        </w:rPr>
-        <w:t>Los conjuntos de datos que la SUNAT genere o administre y que califiquen como datos de alto valor se ponen a disposición a través del Centro Nacional de Datos (CND), previa determinación de su publicabilidad conforme al artículo 85 del TUO del Código Tributario y a la normativa de protección de datos personales. El OGD identifica los conjuntos candidatos y propone al CGTD su publicación.</w:t>
+        <w:t>6.8.5   Los conjuntos de datos que la SUNAT genere o administre y que califiquen como datos de alto valor se ponen a disposición a través del Centro Nacional de Datos (CND), previa determinación de su publicabilidad conforme al artículo 85 del TUO del Código Tributario y a la normativa de protección de datos personales. El OGD identifica los conjuntos candidatos y propone al CGTD su publicación.</w:t>
       </w:r>
     </w:p>
     <w:p>
@@ -11440,23 +11192,7 @@
           <w:color w:val="000000"/>
           <w:highlight w:val="lightGray"/>
         </w:rPr>
-        <w:t>6.</w:t>
-      </w:r>
-      <w:r>
-        <w:rPr>
-          <w:rFonts w:ascii="Arial" w:eastAsia="Arial" w:hAnsi="Arial" w:cs="Arial"/>
-          <w:color w:val="000000"/>
-          <w:highlight w:val="lightGray"/>
-        </w:rPr>
-        <w:t>13</w:t>
-      </w:r>
-      <w:r>
-        <w:rPr>
-          <w:rFonts w:ascii="Arial" w:eastAsia="Arial" w:hAnsi="Arial" w:cs="Arial"/>
-          <w:color w:val="000000"/>
-          <w:highlight w:val="lightGray"/>
-        </w:rPr>
-        <w:t>.1 Sensibilización</w:t>
+        <w:t>6.13.1 Sensibilización</w:t>
       </w:r>
     </w:p>
     <w:p>
@@ -11670,23 +11406,7 @@
           <w:color w:val="000000"/>
           <w:highlight w:val="lightGray"/>
         </w:rPr>
-        <w:t>6.</w:t>
-      </w:r>
-      <w:r>
-        <w:rPr>
-          <w:rFonts w:ascii="Arial" w:eastAsia="Arial" w:hAnsi="Arial" w:cs="Arial"/>
-          <w:color w:val="000000"/>
-          <w:highlight w:val="lightGray"/>
-        </w:rPr>
-        <w:t>13</w:t>
-      </w:r>
-      <w:r>
-        <w:rPr>
-          <w:rFonts w:ascii="Arial" w:eastAsia="Arial" w:hAnsi="Arial" w:cs="Arial"/>
-          <w:color w:val="000000"/>
-          <w:highlight w:val="lightGray"/>
-        </w:rPr>
-        <w:t>.2 Capacitación y fortalecimiento de capacidades</w:t>
+        <w:t>6.13.2 Capacitación y fortalecimiento de capacidades</w:t>
       </w:r>
     </w:p>
     <w:p>
@@ -11925,23 +11645,7 @@
           <w:color w:val="000000"/>
           <w:highlight w:val="lightGray"/>
         </w:rPr>
-        <w:t>6.</w:t>
-      </w:r>
-      <w:r>
-        <w:rPr>
-          <w:rFonts w:ascii="Arial" w:eastAsia="Arial" w:hAnsi="Arial" w:cs="Arial"/>
-          <w:color w:val="000000"/>
-          <w:highlight w:val="lightGray"/>
-        </w:rPr>
-        <w:t>13</w:t>
-      </w:r>
-      <w:r>
-        <w:rPr>
-          <w:rFonts w:ascii="Arial" w:eastAsia="Arial" w:hAnsi="Arial" w:cs="Arial"/>
-          <w:color w:val="000000"/>
-          <w:highlight w:val="lightGray"/>
-        </w:rPr>
-        <w:t>.3 Gestión del cambio</w:t>
+        <w:t>6.13.3 Gestión del cambio</w:t>
       </w:r>
     </w:p>
     <w:p>
@@ -12192,7 +11896,27 @@
           <w:rFonts w:ascii="Arial" w:hAnsi="Arial" w:cs="Arial"/>
           <w:highlight w:val="lightGray"/>
         </w:rPr>
-        <w:t>6.15.1 Toda iniciativa, requerimiento o proyecto que incorpore o prevea un componente basado en IA requiere la opinión de viabilidad de la Comisión de Gobierno de IA sobre dicho componente. La opinión es insumo del análisis que sustenta la decisión que corresponda y es determinante respecto del componente de IA; no sustituye las aprobaciones que competen a la Alta Dirección ni las de los sistemas administrativos del Estado. Se emite sobre la Ficha de Evaluación de Caso de Uso (Anexo N.° 4), adecuada a la naturaleza y magnitud de la iniciativa, requerimiento o proyecto.</w:t>
+        <w:t xml:space="preserve">6.15.1 Toda iniciativa, requerimiento o proyecto que incorpore o prevea un componente basado en IA requiere la opinión de viabilidad de la Comisión de Gobierno de IA sobre dicho componente. </w:t>
+      </w:r>
+      <w:r>
+        <w:rPr>
+          <w:rFonts w:ascii="Arial" w:hAnsi="Arial" w:cs="Arial"/>
+          <w:highlight w:val="lightGray"/>
+        </w:rPr>
+        <w:t>Esta opinión constituye un requisito institucional interno, exigible en virtud de la presente directiva, cualquiera sea el instrumento de gestión bajo el cual la iniciativa, el requerimiento o el proyecto se formule, ejecute o modifique.</w:t>
+      </w:r>
+      <w:r>
+        <w:rPr>
+          <w:rFonts w:ascii="Arial" w:hAnsi="Arial" w:cs="Arial"/>
+        </w:rPr>
+        <w:t xml:space="preserve"> </w:t>
+      </w:r>
+      <w:r>
+        <w:rPr>
+          <w:rFonts w:ascii="Arial" w:hAnsi="Arial" w:cs="Arial"/>
+          <w:highlight w:val="lightGray"/>
+        </w:rPr>
+        <w:t>La opinión es insumo del análisis que sustenta la decisión que corresponda y es determinante respecto del componente de IA; no sustituye las aprobaciones que competen a la Alta Dirección ni las de los sistemas administrativos del Estado. Se emite sobre la Ficha de Evaluación de Caso de Uso (Anexo N.° 4), adecuada a la naturaleza y magnitud de la iniciativa, requerimiento o proyecto.</w:t>
       </w:r>
     </w:p>
     <w:p>
@@ -12234,7 +11958,43 @@
           <w:rFonts w:ascii="Arial" w:hAnsi="Arial" w:cs="Arial"/>
           <w:highlight w:val="lightGray"/>
         </w:rPr>
-        <w:t>6.15.3 En la formulación de proyectos institucionales conforme al MGPP, cuando se identifique un componente basado en IA se incorpora la opinión de la Comisión como parte del caso de negocio, con carácter previo a su aprobación.</w:t>
+        <w:t>6.</w:t>
+      </w:r>
+      <w:r>
+        <w:rPr>
+          <w:rFonts w:ascii="Arial" w:hAnsi="Arial" w:cs="Arial"/>
+          <w:highlight w:val="lightGray"/>
+        </w:rPr>
+        <w:t xml:space="preserve">15.3 </w:t>
+      </w:r>
+      <w:r>
+        <w:rPr>
+          <w:rFonts w:ascii="Arial" w:hAnsi="Arial" w:cs="Arial"/>
+          <w:highlight w:val="lightGray"/>
+        </w:rPr>
+        <w:t xml:space="preserve">En los programas y proyectos institucionales conforme al MGPP, cuando se identifique un componente basado en IA se recaba la opinión de la Comisión </w:t>
+      </w:r>
+      <w:r>
+        <w:rPr>
+          <w:rFonts w:ascii="Arial" w:hAnsi="Arial" w:cs="Arial"/>
+          <w:highlight w:val="lightGray"/>
+        </w:rPr>
+        <w:lastRenderedPageBreak/>
+        <w:t>con carácter previo a la aprobación que corresponda. La obligación aplica en la</w:t>
+      </w:r>
+      <w:r>
+        <w:rPr>
+          <w:rFonts w:ascii="Arial" w:hAnsi="Arial" w:cs="Arial"/>
+          <w:highlight w:val="lightGray"/>
+        </w:rPr>
+        <w:t xml:space="preserve"> </w:t>
+      </w:r>
+      <w:r>
+        <w:rPr>
+          <w:rFonts w:ascii="Arial" w:hAnsi="Arial" w:cs="Arial"/>
+          <w:highlight w:val="lightGray"/>
+        </w:rPr>
+        <w:t>formulación del caso de negocio; en la elaboración del plan de gestión del proyecto, cuando el detalle de los componentes funcionales revele un componente de IA no previsto; y durante la ejecución, cuando una solicitud de cambio incorpore, sustituya o modifique un componente de IA, aun cuando el cambio no impacte los entregables ni los hitos comprometidos.</w:t>
       </w:r>
     </w:p>
     <w:p>
@@ -12255,15 +12015,7 @@
           <w:rFonts w:ascii="Arial" w:hAnsi="Arial" w:cs="Arial"/>
           <w:highlight w:val="lightGray"/>
         </w:rPr>
-        <w:t xml:space="preserve">6.15.4 Cuando un proyecto de inversión pública sujeto al Sistema Nacional de Programación Multianual y Gestión de Inversiones incorpore un componente </w:t>
-      </w:r>
-      <w:r>
-        <w:rPr>
-          <w:rFonts w:ascii="Arial" w:hAnsi="Arial" w:cs="Arial"/>
-          <w:highlight w:val="lightGray"/>
-        </w:rPr>
-        <w:lastRenderedPageBreak/>
-        <w:t>basado en IA, la Unidad Formuladora considera la opinión de la Comisión como insumo del análisis técnico que sustenta la declaración de viabilidad, sin perjuicio de las disposiciones del referido Sistema. En la ejecución, el SBIA observa el ciclo de vida del numeral 6.1.</w:t>
+        <w:t>6.15.4 Cuando un proyecto de inversión pública sujeto al Sistema Nacional de Programación Multianual y Gestión de Inversiones incorpore un componente basado en IA, la Unidad Formuladora considera la opinión de la Comisión como insumo del análisis técnico que sustenta la declaración de viabilidad, sin perjuicio de las disposiciones del referido Sistema. En la ejecución, el SBIA observa el ciclo de vida del numeral 6.1.</w:t>
       </w:r>
     </w:p>
     <w:p>
@@ -12654,55 +12406,7 @@
           <w:bCs w:val="0"/>
           <w:highlight w:val="lightGray"/>
         </w:rPr>
-        <w:t>Los Anexos forman parte de la presente directiva y su modificación se</w:t>
-      </w:r>
-      <w:r>
-        <w:rPr>
-          <w:b w:val="0"/>
-          <w:bCs w:val="0"/>
-          <w:highlight w:val="lightGray"/>
-        </w:rPr>
-        <w:t xml:space="preserve"> </w:t>
-      </w:r>
-      <w:r>
-        <w:rPr>
-          <w:b w:val="0"/>
-          <w:bCs w:val="0"/>
-          <w:highlight w:val="lightGray"/>
-        </w:rPr>
-        <w:t>efectúa conforme a la METDONI. El detalle de aplicación de los Anexos, así como</w:t>
-      </w:r>
-      <w:r>
-        <w:rPr>
-          <w:b w:val="0"/>
-          <w:bCs w:val="0"/>
-          <w:highlight w:val="lightGray"/>
-        </w:rPr>
-        <w:t xml:space="preserve"> </w:t>
-      </w:r>
-      <w:r>
-        <w:rPr>
-          <w:b w:val="0"/>
-          <w:bCs w:val="0"/>
-          <w:highlight w:val="lightGray"/>
-        </w:rPr>
-        <w:t>los formatos, campos e indicadores operativos que de ellos se derivan, se establecen en los documentos normativos institucionales de menor rango</w:t>
-      </w:r>
-      <w:r>
-        <w:rPr>
-          <w:b w:val="0"/>
-          <w:bCs w:val="0"/>
-          <w:highlight w:val="lightGray"/>
-        </w:rPr>
-        <w:t xml:space="preserve"> </w:t>
-      </w:r>
-      <w:r>
-        <w:rPr>
-          <w:b w:val="0"/>
-          <w:bCs w:val="0"/>
-          <w:highlight w:val="lightGray"/>
-        </w:rPr>
-        <w:t>previstos en el numeral 7.6, que las unidades competentes actualizan sin requerir la modificación de la presente directiva.</w:t>
+        <w:t>Los Anexos forman parte de la presente directiva y su modificación se efectúa conforme a la METDONI. El detalle de aplicación de los Anexos, así como los formatos, campos e indicadores operativos que de ellos se derivan, se establecen en los documentos normativos institucionales de menor rango previstos en el numeral 7.6, que las unidades competentes actualizan sin requerir la modificación de la presente directiva.</w:t>
       </w:r>
     </w:p>
     <w:p>
@@ -16273,63 +15977,7 @@
           <w:rFonts w:ascii="Arial" w:hAnsi="Arial" w:cs="Arial"/>
           <w:highlight w:val="lightGray"/>
         </w:rPr>
-        <w:t>Constituye el contenido mínimo de la evaluación del caso de uso y recoge los</w:t>
-      </w:r>
-      <w:r>
-        <w:rPr>
-          <w:rFonts w:ascii="Arial" w:hAnsi="Arial" w:cs="Arial"/>
-          <w:highlight w:val="lightGray"/>
-        </w:rPr>
-        <w:t xml:space="preserve"> </w:t>
-      </w:r>
-      <w:r>
-        <w:rPr>
-          <w:rFonts w:ascii="Arial" w:hAnsi="Arial" w:cs="Arial"/>
-          <w:highlight w:val="lightGray"/>
-        </w:rPr>
-        <w:t xml:space="preserve">datos y </w:t>
-      </w:r>
-      <w:r>
-        <w:rPr>
-          <w:rFonts w:ascii="Arial" w:hAnsi="Arial" w:cs="Arial"/>
-          <w:highlight w:val="lightGray"/>
-        </w:rPr>
-        <w:t>las evidencias</w:t>
-      </w:r>
-      <w:r>
-        <w:rPr>
-          <w:rFonts w:ascii="Arial" w:hAnsi="Arial" w:cs="Arial"/>
-          <w:highlight w:val="lightGray"/>
-        </w:rPr>
-        <w:t xml:space="preserve"> del problema que sustentan la iniciativa, conforme al</w:t>
-      </w:r>
-      <w:r>
-        <w:rPr>
-          <w:rFonts w:ascii="Arial" w:hAnsi="Arial" w:cs="Arial"/>
-          <w:highlight w:val="lightGray"/>
-        </w:rPr>
-        <w:t xml:space="preserve"> </w:t>
-      </w:r>
-      <w:r>
-        <w:rPr>
-          <w:rFonts w:ascii="Arial" w:hAnsi="Arial" w:cs="Arial"/>
-          <w:highlight w:val="lightGray"/>
-        </w:rPr>
-        <w:t>numeral 28.4 del artículo 28 del RLIA. Se adecúa a la naturaleza y magnitud de la iniciativa, requerimiento o</w:t>
-      </w:r>
-      <w:r>
-        <w:rPr>
-          <w:rFonts w:ascii="Arial" w:hAnsi="Arial" w:cs="Arial"/>
-          <w:highlight w:val="lightGray"/>
-        </w:rPr>
-        <w:t xml:space="preserve"> </w:t>
-      </w:r>
-      <w:r>
-        <w:rPr>
-          <w:rFonts w:ascii="Arial" w:hAnsi="Arial" w:cs="Arial"/>
-          <w:highlight w:val="lightGray"/>
-        </w:rPr>
-        <w:t>proyecto, conforme al numeral 6.15.1</w:t>
+        <w:t>Constituye el contenido mínimo de la evaluación del caso de uso y recoge los datos y las evidencias del problema que sustentan la iniciativa, conforme al numeral 28.4 del artículo 28 del RLIA. Se adecúa a la naturaleza y magnitud de la iniciativa, requerimiento o proyecto, conforme al numeral 6.15.1</w:t>
       </w:r>
       <w:r>
         <w:rPr>
@@ -20927,6 +20575,7 @@
   <w:style w:type="character" w:default="1" w:styleId="Fuentedeprrafopredeter">
     <w:name w:val="Default Paragraph Font"/>
     <w:uiPriority w:val="1"/>
+    <w:semiHidden/>
     <w:unhideWhenUsed/>
   </w:style>
   <w:style w:type="table" w:default="1" w:styleId="Tablanormal">
@@ -22150,6 +21799,16 @@
 </file>
 
 <file path=customXml/item2.xml><?xml version="1.0" encoding="utf-8"?>
+<p:properties xmlns:p="http://schemas.microsoft.com/office/2006/metadata/properties" xmlns:xsi="http://www.w3.org/2001/XMLSchema-instance" xmlns:pc="http://schemas.microsoft.com/office/infopath/2007/PartnerControls">
+  <documentManagement/>
+</p:properties>
+</file>
+
+<file path=customXml/item3.xml><?xml version="1.0" encoding="utf-8"?>
+<b:Sources xmlns:b="http://schemas.openxmlformats.org/officeDocument/2006/bibliography" xmlns="http://schemas.openxmlformats.org/officeDocument/2006/bibliography" SelectedStyle="\APASixthEditionOfficeOnline.xsl" StyleName="APA" Version="6"/>
+</file>
+
+<file path=customXml/item4.xml><?xml version="1.0" encoding="utf-8"?>
 <ct:contentTypeSchema xmlns:ct="http://schemas.microsoft.com/office/2006/metadata/contentType" xmlns:ma="http://schemas.microsoft.com/office/2006/metadata/properties/metaAttributes" ct:_="" ma:_="" ma:contentTypeName="Document" ma:contentTypeID="0x0101005C14AC06E2BCC9479AB1E7BFB85765A3" ma:contentTypeVersion="3" ma:contentTypeDescription="Create a new document." ma:contentTypeScope="" ma:versionID="7c0f1869e227914bb9e091b5d5366560">
   <xsd:schema xmlns:xsd="http://www.w3.org/2001/XMLSchema" xmlns:xs="http://www.w3.org/2001/XMLSchema" xmlns:p="http://schemas.microsoft.com/office/2006/metadata/properties" xmlns:ns2="fdb19afe-0f16-4040-a6da-335f4767bfc9" targetNamespace="http://schemas.microsoft.com/office/2006/metadata/properties" ma:root="true" ma:fieldsID="a498babe3b735ed6250eb2675f7bac41" ns2:_="">
     <xsd:import namespace="fdb19afe-0f16-4040-a6da-335f4767bfc9"/>
@@ -22287,16 +21946,6 @@
 </ct:contentTypeSchema>
 </file>
 
-<file path=customXml/item3.xml><?xml version="1.0" encoding="utf-8"?>
-<b:Sources xmlns:b="http://schemas.openxmlformats.org/officeDocument/2006/bibliography" xmlns="http://schemas.openxmlformats.org/officeDocument/2006/bibliography" SelectedStyle="\APASixthEditionOfficeOnline.xsl" StyleName="APA" Version="6"/>
-</file>
-
-<file path=customXml/item4.xml><?xml version="1.0" encoding="utf-8"?>
-<p:properties xmlns:p="http://schemas.microsoft.com/office/2006/metadata/properties" xmlns:xsi="http://www.w3.org/2001/XMLSchema-instance" xmlns:pc="http://schemas.microsoft.com/office/infopath/2007/PartnerControls">
-  <documentManagement/>
-</p:properties>
-</file>
-
 <file path=customXml/itemProps1.xml><?xml version="1.0" encoding="utf-8"?>
 <ds:datastoreItem xmlns:ds="http://schemas.openxmlformats.org/officeDocument/2006/customXml" ds:itemID="{007781DB-EED9-4359-8AD9-68137B52B701}">
   <ds:schemaRefs>
@@ -22306,6 +21955,23 @@
 </file>
 
 <file path=customXml/itemProps2.xml><?xml version="1.0" encoding="utf-8"?>
+<ds:datastoreItem xmlns:ds="http://schemas.openxmlformats.org/officeDocument/2006/customXml" ds:itemID="{E06D9414-6C68-4A1C-B889-BD6BE2EA8645}">
+  <ds:schemaRefs>
+    <ds:schemaRef ds:uri="http://schemas.microsoft.com/office/2006/metadata/properties"/>
+    <ds:schemaRef ds:uri="http://schemas.microsoft.com/office/infopath/2007/PartnerControls"/>
+  </ds:schemaRefs>
+</ds:datastoreItem>
+</file>
+
+<file path=customXml/itemProps3.xml><?xml version="1.0" encoding="utf-8"?>
+<ds:datastoreItem xmlns:ds="http://schemas.openxmlformats.org/officeDocument/2006/customXml" ds:itemID="{599D4DEC-5966-453E-8EBA-1FE602AD820F}">
+  <ds:schemaRefs>
+    <ds:schemaRef ds:uri="http://schemas.openxmlformats.org/officeDocument/2006/bibliography"/>
+  </ds:schemaRefs>
+</ds:datastoreItem>
+</file>
+
+<file path=customXml/itemProps4.xml><?xml version="1.0" encoding="utf-8"?>
 <ds:datastoreItem xmlns:ds="http://schemas.openxmlformats.org/officeDocument/2006/customXml" ds:itemID="{5C1C6231-2072-4263-80CD-99FB4E777A75}">
   <ds:schemaRefs>
     <ds:schemaRef ds:uri="http://schemas.microsoft.com/office/2006/metadata/contentType"/>
@@ -22321,21 +21987,4 @@
     <ds:schemaRef ds:uri="http://schemas.microsoft.com/internal/obd"/>
   </ds:schemaRefs>
 </ds:datastoreItem>
-</file>
-
-<file path=customXml/itemProps3.xml><?xml version="1.0" encoding="utf-8"?>
-<ds:datastoreItem xmlns:ds="http://schemas.openxmlformats.org/officeDocument/2006/customXml" ds:itemID="{599D4DEC-5966-453E-8EBA-1FE602AD820F}">
-  <ds:schemaRefs>
-    <ds:schemaRef ds:uri="http://schemas.openxmlformats.org/officeDocument/2006/bibliography"/>
-  </ds:schemaRefs>
-</ds:datastoreItem>
-</file>
-
-<file path=customXml/itemProps4.xml><?xml version="1.0" encoding="utf-8"?>
-<ds:datastoreItem xmlns:ds="http://schemas.openxmlformats.org/officeDocument/2006/customXml" ds:itemID="{E06D9414-6C68-4A1C-B889-BD6BE2EA8645}">
-  <ds:schemaRefs>
-    <ds:schemaRef ds:uri="http://schemas.microsoft.com/office/2006/metadata/properties"/>
-    <ds:schemaRef ds:uri="http://schemas.microsoft.com/office/infopath/2007/PartnerControls"/>
-  </ds:schemaRefs>
-</ds:datastoreItem>
 </file>
</xml_diff>

<commit_message>
docs: incorpora la gestion de cambios sobre SBIA en operacion (nuevos 6.10.4 y 6.10.5 sobre cambio significativo y revalidacion), datos certificados (6.8.6), articulacion con gobernanza de datos y analitica (6.15.6) y campo de version/cambio en el Anexo 1; amplia 6.1.5
</commit_message>
<xml_diff>
--- a/normativo/DIRECTIVA-GOBIERNO-IA.docx
+++ b/normativo/DIRECTIVA-GOBIERNO-IA.docx
@@ -8591,7 +8591,127 @@
           <w:color w:val="000000"/>
           <w:highlight w:val="lightGray"/>
         </w:rPr>
-        <w:t>Por comprender actuaciones a cargo de unidades de organización distintas de la INSI, su formulación recoge los aportes de dichas unidades y su aprobación requiere la opinión favorable de la Comisión de Gobierno de IA, en ejercicio de las facultades previstas en el literal h del numeral 6.4 y en el numeral 6.5 de la METDONI. La metodología comprende, como mínimo: la aplicación de la clasificación de riesgo y de la evaluación de impacto algorítmico, los criterios técnicos de diseño de la arquitectura de los SBIA, el contenido de los entregables de cada etapa, los tipos y las técnicas de prueba aplicables según el nivel de riesgo, los controles de contención, las prácticas de monitoreo y las condiciones de retiro. En tanto no se apruebe, los SBIA siguen el ciclo de vida del numeral 6.1.1 y la normativa de desarrollo de sistemas vigente en la SUNAT.</w:t>
+        <w:t xml:space="preserve">Por comprender actuaciones a cargo de unidades de organización distintas de la INSI, su formulación recoge los aportes de dichas unidades y su aprobación requiere la opinión favorable de la Comisión de Gobierno de IA, en ejercicio de las facultades previstas en el literal h del numeral 6.4 y en el numeral 6.5 de la METDONI. La metodología comprende, como mínimo: la aplicación de la clasificación de riesgo y de la evaluación de impacto algorítmico, los criterios técnicos de diseño de la arquitectura de los SBIA, el contenido de los entregables de cada etapa, los tipos y las técnicas de prueba aplicables según el nivel de riesgo, </w:t>
+      </w:r>
+      <w:r>
+        <w:rPr>
+          <w:rFonts w:ascii="Arial" w:hAnsi="Arial" w:cs="Arial"/>
+          <w:color w:val="000000"/>
+          <w:highlight w:val="lightGray"/>
+        </w:rPr>
+        <w:t xml:space="preserve">los controles de </w:t>
+      </w:r>
+      <w:r>
+        <w:rPr>
+          <w:rFonts w:ascii="Arial" w:hAnsi="Arial" w:cs="Arial"/>
+          <w:color w:val="000000"/>
+          <w:highlight w:val="lightGray"/>
+        </w:rPr>
+        <w:t>contención</w:t>
+      </w:r>
+      <w:r>
+        <w:rPr>
+          <w:rFonts w:ascii="Arial" w:hAnsi="Arial" w:cs="Arial"/>
+          <w:color w:val="000000"/>
+          <w:highlight w:val="lightGray"/>
+        </w:rPr>
+        <w:t xml:space="preserve">, las </w:t>
+      </w:r>
+      <w:r>
+        <w:rPr>
+          <w:rFonts w:ascii="Arial" w:hAnsi="Arial" w:cs="Arial"/>
+          <w:color w:val="000000"/>
+          <w:highlight w:val="lightGray"/>
+        </w:rPr>
+        <w:t>prácticas</w:t>
+      </w:r>
+      <w:r>
+        <w:rPr>
+          <w:rFonts w:ascii="Arial" w:hAnsi="Arial" w:cs="Arial"/>
+          <w:color w:val="000000"/>
+          <w:highlight w:val="lightGray"/>
+        </w:rPr>
+        <w:t xml:space="preserve"> de monitoreo, la </w:t>
+      </w:r>
+      <w:r>
+        <w:rPr>
+          <w:rFonts w:ascii="Arial" w:hAnsi="Arial" w:cs="Arial"/>
+          <w:color w:val="000000"/>
+          <w:highlight w:val="lightGray"/>
+        </w:rPr>
+        <w:t>gestión</w:t>
+      </w:r>
+      <w:r>
+        <w:rPr>
+          <w:rFonts w:ascii="Arial" w:hAnsi="Arial" w:cs="Arial"/>
+          <w:color w:val="000000"/>
+          <w:highlight w:val="lightGray"/>
+        </w:rPr>
+        <w:t xml:space="preserve"> de los cambios sobre los SBIA en </w:t>
+      </w:r>
+      <w:r>
+        <w:rPr>
+          <w:rFonts w:ascii="Arial" w:hAnsi="Arial" w:cs="Arial"/>
+          <w:color w:val="000000"/>
+          <w:highlight w:val="lightGray"/>
+        </w:rPr>
+        <w:t>operación</w:t>
+      </w:r>
+      <w:r>
+        <w:rPr>
+          <w:rFonts w:ascii="Arial" w:hAnsi="Arial" w:cs="Arial"/>
+          <w:color w:val="000000"/>
+          <w:highlight w:val="lightGray"/>
+        </w:rPr>
+        <w:t xml:space="preserve">, incluidos los criterios de </w:t>
+      </w:r>
+      <w:r>
+        <w:rPr>
+          <w:rFonts w:ascii="Arial" w:hAnsi="Arial" w:cs="Arial"/>
+          <w:color w:val="000000"/>
+          <w:highlight w:val="lightGray"/>
+        </w:rPr>
+        <w:t>calificación</w:t>
+      </w:r>
+      <w:r>
+        <w:rPr>
+          <w:rFonts w:ascii="Arial" w:hAnsi="Arial" w:cs="Arial"/>
+          <w:color w:val="000000"/>
+          <w:highlight w:val="lightGray"/>
+        </w:rPr>
+        <w:t xml:space="preserve"> del cambio significativo y el alcance de la </w:t>
+      </w:r>
+      <w:r>
+        <w:rPr>
+          <w:rFonts w:ascii="Arial" w:hAnsi="Arial" w:cs="Arial"/>
+          <w:color w:val="000000"/>
+          <w:highlight w:val="lightGray"/>
+        </w:rPr>
+        <w:t>revalidación</w:t>
+      </w:r>
+      <w:r>
+        <w:rPr>
+          <w:rFonts w:ascii="Arial" w:hAnsi="Arial" w:cs="Arial"/>
+          <w:color w:val="000000"/>
+          <w:highlight w:val="lightGray"/>
+        </w:rPr>
+        <w:t xml:space="preserve"> aplicable, y las condiciones de retiro.</w:t>
+      </w:r>
+      <w:r>
+        <w:rPr>
+          <w:rFonts w:ascii="Arial" w:hAnsi="Arial" w:cs="Arial"/>
+          <w:color w:val="000000"/>
+          <w:highlight w:val="lightGray"/>
+        </w:rPr>
+        <w:t xml:space="preserve">. </w:t>
+      </w:r>
+      <w:r>
+        <w:rPr>
+          <w:rFonts w:ascii="Arial" w:hAnsi="Arial" w:cs="Arial"/>
+          <w:color w:val="000000"/>
+          <w:highlight w:val="lightGray"/>
+        </w:rPr>
+        <w:t>En tanto no se apruebe, los SBIA siguen el ciclo de vida del numeral 6.1.1 y la normativa de desarrollo de sistemas vigente en la SUNAT.</w:t>
       </w:r>
     </w:p>
     <w:p>
@@ -8675,7 +8795,7 @@
           <w:color w:val="000000"/>
           <w:highlight w:val="yellow"/>
         </w:rPr>
-        <w:t xml:space="preserve">La opinión de la OII, en materia de ética, integridad y prevención de sesgos, y la de la INALI, en materia de cumplimiento normativo, constan de manera expresa en la propuesta. El CGTD aprueba la clasificación de las iniciativas de SBIA de riesgo alto y de aquellos estratégicos para la entidad; la Comisión de Gobierno de IA aprueba la clasificación de los SBIA de riesgo aceptable e informa de ello </w:t>
+        <w:t xml:space="preserve">La opinión de la OII, en materia de ética, integridad y prevención de sesgos, y la de la INALI, en materia de cumplimiento normativo, constan de manera expresa en la propuesta. El CGTD aprueba la clasificación de las iniciativas de SBIA de </w:t>
       </w:r>
       <w:r>
         <w:rPr>
@@ -8684,7 +8804,7 @@
           <w:highlight w:val="yellow"/>
         </w:rPr>
         <w:lastRenderedPageBreak/>
-        <w:t xml:space="preserve">al CGTD. </w:t>
+        <w:t xml:space="preserve">riesgo alto y de aquellos estratégicos para la entidad; la Comisión de Gobierno de IA aprueba la clasificación de los SBIA de riesgo aceptable e informa de ello al CGTD. </w:t>
       </w:r>
       <w:r>
         <w:rPr>
@@ -8979,6 +9099,7 @@
           <w:color w:val="000000"/>
           <w:highlight w:val="yellow"/>
         </w:rPr>
+        <w:lastRenderedPageBreak/>
         <w:t>6.4.4</w:t>
       </w:r>
       <w:r>
@@ -8988,16 +9109,7 @@
           <w:highlight w:val="yellow"/>
         </w:rPr>
         <w:tab/>
-        <w:t xml:space="preserve">Cuando la EIA detecte riesgos que afecten los derechos fundamentales o puedan generar decisiones automatizadas erróneas, el propietario del caso de uso y el equipo técnico del SBIA adoptan las medidas necesarias para mitigar </w:t>
-      </w:r>
-      <w:r>
-        <w:rPr>
-          <w:rFonts w:ascii="Arial" w:eastAsia="Arial" w:hAnsi="Arial" w:cs="Arial"/>
-          <w:color w:val="000000"/>
-          <w:highlight w:val="yellow"/>
-        </w:rPr>
-        <w:lastRenderedPageBreak/>
-        <w:t>los impactos y realizan los ajustes necesarios previos a la implementación final, entre ellos ajustes en los modelos, mejora en la calidad de los datos y mecanismos de supervisión humana. Dichas medidas quedan documentadas</w:t>
+        <w:t>Cuando la EIA detecte riesgos que afecten los derechos fundamentales o puedan generar decisiones automatizadas erróneas, el propietario del caso de uso y el equipo técnico del SBIA adoptan las medidas necesarias para mitigar los impactos y realizan los ajustes necesarios previos a la implementación final, entre ellos ajustes en los modelos, mejora en la calidad de los datos y mecanismos de supervisión humana. Dichas medidas quedan documentadas</w:t>
       </w:r>
       <w:r>
         <w:rPr>
@@ -9289,16 +9401,8 @@
           <w:color w:val="000000"/>
           <w:highlight w:val="lightGray"/>
         </w:rPr>
-        <w:t xml:space="preserve">6.5.7   La publicación del código fuente de los SBIA financiados con fondos públicos, con licencia libre o abierta en la Plataforma Nacional de Software Público Peruano (PNSSP), se sujeta a la determinación previa de su publicabilidad. </w:t>
-      </w:r>
-      <w:r>
-        <w:rPr>
-          <w:rFonts w:ascii="Arial" w:eastAsia="Arial" w:hAnsi="Arial" w:cs="Arial"/>
-          <w:color w:val="000000"/>
-          <w:highlight w:val="lightGray"/>
-        </w:rPr>
         <w:lastRenderedPageBreak/>
-        <w:t xml:space="preserve">Dicha determinación verifica que el código no revele información sujeta a reserva tributaria conforme al artículo 85 del TUO del Código Tributario, información protegida por confidencialidad aduanera, ni reglas de detección de riesgo cuya divulgación comprometa la función de control. La GA, con opinión de la INALI y de la Oficina de Seguridad Informática, determina la publicabilidad antes de cada liberación mayor; la GDS ejecuta la publicación cuando corresponda. </w:t>
+        <w:t xml:space="preserve">6.5.7   La publicación del código fuente de los SBIA financiados con fondos públicos, con licencia libre o abierta en la Plataforma Nacional de Software Público Peruano (PNSSP), se sujeta a la determinación previa de su publicabilidad. Dicha determinación verifica que el código no revele información sujeta a reserva tributaria conforme al artículo 85 del TUO del Código Tributario, información protegida por confidencialidad aduanera, ni reglas de detección de riesgo cuya divulgación comprometa la función de control. La GA, con opinión de la INALI y de la Oficina de Seguridad Informática, determina la publicabilidad antes de cada liberación mayor; la GDS ejecuta la publicación cuando corresponda. </w:t>
       </w:r>
     </w:p>
     <w:p>
@@ -9515,7 +9619,17 @@
           <w:color w:val="000000"/>
           <w:highlight w:val="yellow"/>
         </w:rPr>
-        <w:t>Ha recibido capacitación específica sobre el funcionamiento, las limitaciones y los riesgos del SBIA que supervisa, incluyendo la identificación y prevención de sesgos algorítmicos, a fin de no sesgarse por los resultados del sistema</w:t>
+        <w:t xml:space="preserve">Ha recibido capacitación específica sobre el funcionamiento, las limitaciones y los riesgos del SBIA que supervisa, incluyendo la </w:t>
+      </w:r>
+      <w:r>
+        <w:rPr>
+          <w:b w:val="0"/>
+          <w:bCs w:val="0"/>
+          <w:color w:val="000000"/>
+          <w:highlight w:val="yellow"/>
+        </w:rPr>
+        <w:lastRenderedPageBreak/>
+        <w:t>identificación y prevención de sesgos algorítmicos, a fin de no sesgarse por los resultados del sistema</w:t>
       </w:r>
       <w:r>
         <w:rPr>
@@ -9554,7 +9668,6 @@
           <w:color w:val="000000"/>
           <w:highlight w:val="yellow"/>
         </w:rPr>
-        <w:lastRenderedPageBreak/>
         <w:t>Dispone de los medios técnicos y la autoridad para detener, corregir o invalidar una decisión del SBIA cuando lo considere necesario.</w:t>
       </w:r>
     </w:p>
@@ -9784,6 +9897,7 @@
           <w:color w:val="000000"/>
           <w:highlight w:val="cyan"/>
         </w:rPr>
+        <w:lastRenderedPageBreak/>
         <w:t>6.7.5</w:t>
       </w:r>
       <w:r>
@@ -9807,16 +9921,7 @@
           <w:color w:val="000000"/>
           <w:highlight w:val="cyan"/>
         </w:rPr>
-        <w:t xml:space="preserve"> por el Procedimiento </w:t>
-      </w:r>
-      <w:r>
-        <w:rPr>
-          <w:rFonts w:ascii="Arial" w:eastAsia="Arial" w:hAnsi="Arial" w:cs="Arial"/>
-          <w:color w:val="000000"/>
-          <w:highlight w:val="cyan"/>
-        </w:rPr>
-        <w:lastRenderedPageBreak/>
-        <w:t>para el registro y atención de incidentes y vulnerabilidades de seguridad de la información (A-03.5.1-PR-003). Los incidentes que se presenten durante la operación de un SBIA en producción y que no constituyan incidentes de seguridad de la información se atienden conforme al Procedimiento de Gestión de Incidentes (A-03.1.1-PR-002). El propietario del caso de uso y las gerencias competentes de la INSI comunican los incidentes del uso y funcionamiento del SBIA por los canales que dichos procedimientos establecen; la Comisión de Gobierno de IA los consolida y los reporta en el informe trimestral del numeral 6.9.5.</w:t>
+        <w:t xml:space="preserve"> por el Procedimiento para el registro y atención de incidentes y vulnerabilidades de seguridad de la información (A-03.5.1-PR-003). Los incidentes que se presenten durante la operación de un SBIA en producción y que no constituyan incidentes de seguridad de la información se atienden conforme al Procedimiento de Gestión de Incidentes (A-03.1.1-PR-002). El propietario del caso de uso y las gerencias competentes de la INSI comunican los incidentes del uso y funcionamiento del SBIA por los canales que dichos procedimientos establecen; la Comisión de Gobierno de IA los consolida y los reporta en el informe trimestral del numeral 6.9.5.</w:t>
       </w:r>
     </w:p>
     <w:p>
@@ -10067,6 +10172,7 @@
           <w:color w:val="000000"/>
           <w:highlight w:val="yellow"/>
         </w:rPr>
+        <w:lastRenderedPageBreak/>
         <w:t>6.8.4</w:t>
       </w:r>
       <w:r>
@@ -10113,8 +10219,126 @@
           <w:color w:val="000000"/>
           <w:highlight w:val="lightGray"/>
         </w:rPr>
-        <w:lastRenderedPageBreak/>
         <w:t>6.8.5   Los conjuntos de datos que la SUNAT genere o administre y que califiquen como datos de alto valor se ponen a disposición a través del Centro Nacional de Datos (CND), previa determinación de su publicabilidad conforme al artículo 85 del TUO del Código Tributario y a la normativa de protección de datos personales. El OGD identifica los conjuntos candidatos y propone al CGTD su publicación.</w:t>
+      </w:r>
+    </w:p>
+    <w:p>
+      <w:pPr>
+        <w:tabs>
+          <w:tab w:val="left" w:pos="1418"/>
+        </w:tabs>
+        <w:spacing w:after="60" w:line="276" w:lineRule="auto"/>
+        <w:ind w:left="1276" w:hanging="709"/>
+        <w:jc w:val="both"/>
+        <w:rPr>
+          <w:rFonts w:ascii="Arial" w:eastAsia="Arial" w:hAnsi="Arial" w:cs="Arial"/>
+          <w:color w:val="000000"/>
+          <w:highlight w:val="lightGray"/>
+        </w:rPr>
+      </w:pPr>
+      <w:r>
+        <w:rPr>
+          <w:rFonts w:ascii="Arial" w:eastAsia="Arial" w:hAnsi="Arial" w:cs="Arial"/>
+          <w:color w:val="000000"/>
+          <w:highlight w:val="lightGray"/>
+        </w:rPr>
+        <w:t xml:space="preserve">6.8.6 </w:t>
+      </w:r>
+      <w:r>
+        <w:rPr>
+          <w:rFonts w:ascii="Arial" w:eastAsia="Arial" w:hAnsi="Arial" w:cs="Arial"/>
+          <w:color w:val="000000"/>
+          <w:highlight w:val="lightGray"/>
+        </w:rPr>
+        <w:t xml:space="preserve">  </w:t>
+      </w:r>
+      <w:r>
+        <w:rPr>
+          <w:rFonts w:ascii="Arial" w:eastAsia="Arial" w:hAnsi="Arial" w:cs="Arial"/>
+          <w:color w:val="000000"/>
+          <w:highlight w:val="lightGray"/>
+        </w:rPr>
+        <w:t xml:space="preserve">Los SBIA se construyen sobre conjuntos de datos certificados conforme a la normativa institucional de gobernanza de datos y </w:t>
+      </w:r>
+      <w:r>
+        <w:rPr>
+          <w:rFonts w:ascii="Arial" w:eastAsia="Arial" w:hAnsi="Arial" w:cs="Arial"/>
+          <w:color w:val="000000"/>
+          <w:highlight w:val="lightGray"/>
+        </w:rPr>
+        <w:t>analítica</w:t>
+      </w:r>
+      <w:r>
+        <w:rPr>
+          <w:rFonts w:ascii="Arial" w:eastAsia="Arial" w:hAnsi="Arial" w:cs="Arial"/>
+          <w:color w:val="000000"/>
+          <w:highlight w:val="lightGray"/>
+        </w:rPr>
+        <w:t xml:space="preserve">, cuando estos existan para la materia. El uso de fuentes no certificadas se justifica en la Ficha de </w:t>
+      </w:r>
+      <w:r>
+        <w:rPr>
+          <w:rFonts w:ascii="Arial" w:eastAsia="Arial" w:hAnsi="Arial" w:cs="Arial"/>
+          <w:color w:val="000000"/>
+          <w:highlight w:val="lightGray"/>
+        </w:rPr>
+        <w:t>Evaluación</w:t>
+      </w:r>
+      <w:r>
+        <w:rPr>
+          <w:rFonts w:ascii="Arial" w:eastAsia="Arial" w:hAnsi="Arial" w:cs="Arial"/>
+          <w:color w:val="000000"/>
+          <w:highlight w:val="lightGray"/>
+        </w:rPr>
+        <w:t xml:space="preserve"> de Caso de Uso (Anexo </w:t>
+      </w:r>
+      <w:r>
+        <w:rPr>
+          <w:rFonts w:ascii="Arial" w:eastAsia="Arial" w:hAnsi="Arial" w:cs="Arial"/>
+          <w:color w:val="000000"/>
+          <w:highlight w:val="lightGray"/>
+        </w:rPr>
+        <w:t>N</w:t>
+      </w:r>
+      <w:r>
+        <w:rPr>
+          <w:rFonts w:ascii="Arial" w:eastAsia="Arial" w:hAnsi="Arial" w:cs="Arial"/>
+          <w:color w:val="000000"/>
+          <w:highlight w:val="lightGray"/>
+        </w:rPr>
+        <w:t>°</w:t>
+      </w:r>
+      <w:r>
+        <w:rPr>
+          <w:rFonts w:ascii="Arial" w:eastAsia="Arial" w:hAnsi="Arial" w:cs="Arial"/>
+          <w:color w:val="000000"/>
+          <w:highlight w:val="lightGray"/>
+        </w:rPr>
+        <w:t xml:space="preserve"> 4) y consta en la Ficha de Registro de SBIA (Anexo </w:t>
+      </w:r>
+      <w:r>
+        <w:rPr>
+          <w:rFonts w:ascii="Arial" w:eastAsia="Arial" w:hAnsi="Arial" w:cs="Arial"/>
+          <w:color w:val="000000"/>
+          <w:highlight w:val="lightGray"/>
+        </w:rPr>
+        <w:t>N</w:t>
+      </w:r>
+      <w:r>
+        <w:rPr>
+          <w:rFonts w:ascii="Arial" w:eastAsia="Arial" w:hAnsi="Arial" w:cs="Arial"/>
+          <w:color w:val="000000"/>
+          <w:highlight w:val="lightGray"/>
+        </w:rPr>
+        <w:t>°</w:t>
+      </w:r>
+      <w:r>
+        <w:rPr>
+          <w:rFonts w:ascii="Arial" w:eastAsia="Arial" w:hAnsi="Arial" w:cs="Arial"/>
+          <w:color w:val="000000"/>
+          <w:highlight w:val="lightGray"/>
+        </w:rPr>
+        <w:t xml:space="preserve"> 1).</w:t>
       </w:r>
     </w:p>
     <w:p>
@@ -10297,6 +10521,7 @@
           <w:rFonts w:ascii="Arial" w:eastAsia="Arial" w:hAnsi="Arial" w:cs="Arial"/>
           <w:color w:val="000000"/>
         </w:rPr>
+        <w:lastRenderedPageBreak/>
         <w:t>6.9.5</w:t>
       </w:r>
       <w:r>
@@ -10366,7 +10591,6 @@
           <w:color w:val="000000"/>
           <w:highlight w:val="yellow"/>
         </w:rPr>
-        <w:lastRenderedPageBreak/>
         <w:t>6.9.7</w:t>
       </w:r>
       <w:r>
@@ -10568,7 +10792,8 @@
         <w:ind w:left="1276"/>
         <w:jc w:val="both"/>
         <w:rPr>
-          <w:rFonts w:ascii="Arial" w:hAnsi="Arial" w:cs="Arial"/>
+          <w:rFonts w:ascii="Arial" w:eastAsia="Arial" w:hAnsi="Arial" w:cs="Arial"/>
+          <w:color w:val="000000"/>
         </w:rPr>
       </w:pPr>
       <w:r>
@@ -10577,7 +10802,32 @@
           <w:color w:val="000000"/>
           <w:highlight w:val="yellow"/>
         </w:rPr>
-        <w:t>El análisis de riesgo y las pruebas de vulnerabilidad sobre cada SBIA corresponden a la Oficina de Seguridad Informática, conforme a la etapa de certificación y validación del numeral 6.1.1. Con la concurrencia de ambas actividades y del monitoreo previsto en el numeral 6.10, la SUNAT satisface la obligación de auditorías de seguridad digital del literal c) del artículo 29 del RLIA.</w:t>
+        <w:t xml:space="preserve">El análisis de riesgo y las pruebas de vulnerabilidad sobre cada SBIA corresponden a la Oficina de Seguridad Informática, conforme a la etapa de certificación y validación del numeral 6.1.1. Con la concurrencia de ambas actividades y del monitoreo previsto en el numeral 6.10, la SUNAT satisface la obligación de auditorías de seguridad digital del literal c) del artículo 29 del </w:t>
+      </w:r>
+      <w:r>
+        <w:rPr>
+          <w:rFonts w:ascii="Arial" w:eastAsia="Arial" w:hAnsi="Arial" w:cs="Arial"/>
+          <w:color w:val="000000"/>
+          <w:highlight w:val="yellow"/>
+        </w:rPr>
+        <w:lastRenderedPageBreak/>
+        <w:t>RLIA.</w:t>
+      </w:r>
+      <w:r>
+        <w:rPr>
+          <w:rFonts w:ascii="Arial" w:eastAsia="Arial" w:hAnsi="Arial" w:cs="Arial"/>
+          <w:color w:val="000000"/>
+          <w:highlight w:val="yellow"/>
+        </w:rPr>
+        <w:t xml:space="preserve"> </w:t>
+      </w:r>
+      <w:r>
+        <w:rPr>
+          <w:rFonts w:ascii="Arial" w:eastAsia="Arial" w:hAnsi="Arial" w:cs="Arial"/>
+          <w:color w:val="000000"/>
+          <w:highlight w:val="yellow"/>
+        </w:rPr>
+        <w:t>Los resultados de las auditorías alimentan el informe trimestral de la Comisión de Gobierno de IA al CGTD.</w:t>
       </w:r>
     </w:p>
     <w:p>
@@ -10586,16 +10836,352 @@
         <w:ind w:left="1276"/>
         <w:jc w:val="both"/>
         <w:rPr>
+          <w:rFonts w:ascii="Arial" w:eastAsia="Arial" w:hAnsi="Arial" w:cs="Arial"/>
+          <w:color w:val="000000"/>
+        </w:rPr>
+      </w:pPr>
+    </w:p>
+    <w:p>
+      <w:pPr>
+        <w:spacing w:after="0" w:line="276" w:lineRule="auto"/>
+        <w:ind w:left="1276" w:hanging="709"/>
+        <w:jc w:val="both"/>
+        <w:rPr>
           <w:rFonts w:ascii="Arial" w:hAnsi="Arial" w:cs="Arial"/>
-        </w:rPr>
-      </w:pPr>
-      <w:r>
-        <w:rPr>
-          <w:rFonts w:ascii="Arial" w:eastAsia="Arial" w:hAnsi="Arial" w:cs="Arial"/>
-          <w:color w:val="000000"/>
-          <w:highlight w:val="yellow"/>
-        </w:rPr>
-        <w:t>Los resultados de las auditorías alimentan el informe trimestral de la Comisión de Gobierno de IA al CGTD.</w:t>
+          <w:highlight w:val="lightGray"/>
+        </w:rPr>
+      </w:pPr>
+      <w:r>
+        <w:rPr>
+          <w:rFonts w:ascii="Arial" w:hAnsi="Arial" w:cs="Arial"/>
+          <w:highlight w:val="lightGray"/>
+        </w:rPr>
+        <w:t xml:space="preserve">6.10.4 Todo cambio sobre un SBIA en </w:t>
+      </w:r>
+      <w:r>
+        <w:rPr>
+          <w:rFonts w:ascii="Arial" w:hAnsi="Arial" w:cs="Arial"/>
+          <w:highlight w:val="lightGray"/>
+        </w:rPr>
+        <w:t>operación</w:t>
+      </w:r>
+      <w:r>
+        <w:rPr>
+          <w:rFonts w:ascii="Arial" w:hAnsi="Arial" w:cs="Arial"/>
+          <w:highlight w:val="lightGray"/>
+        </w:rPr>
+        <w:t xml:space="preserve"> se gestiona de manera controlada y proporcional a su nivel de riesgo. Constituyen cambio, entre otros, el reentrenamiento o la </w:t>
+      </w:r>
+      <w:r>
+        <w:rPr>
+          <w:rFonts w:ascii="Arial" w:hAnsi="Arial" w:cs="Arial"/>
+          <w:highlight w:val="lightGray"/>
+        </w:rPr>
+        <w:t>recalibración</w:t>
+      </w:r>
+      <w:r>
+        <w:rPr>
+          <w:rFonts w:ascii="Arial" w:hAnsi="Arial" w:cs="Arial"/>
+          <w:highlight w:val="lightGray"/>
+        </w:rPr>
+        <w:t xml:space="preserve"> del modelo, su </w:t>
+      </w:r>
+      <w:r>
+        <w:rPr>
+          <w:rFonts w:ascii="Arial" w:hAnsi="Arial" w:cs="Arial"/>
+          <w:highlight w:val="lightGray"/>
+        </w:rPr>
+        <w:t>sustitución</w:t>
+      </w:r>
+      <w:r>
+        <w:rPr>
+          <w:rFonts w:ascii="Arial" w:hAnsi="Arial" w:cs="Arial"/>
+          <w:highlight w:val="lightGray"/>
+        </w:rPr>
+        <w:t xml:space="preserve"> o el cambio de </w:t>
+      </w:r>
+      <w:r>
+        <w:rPr>
+          <w:rFonts w:ascii="Arial" w:hAnsi="Arial" w:cs="Arial"/>
+          <w:highlight w:val="lightGray"/>
+        </w:rPr>
+        <w:t>versión</w:t>
+      </w:r>
+      <w:r>
+        <w:rPr>
+          <w:rFonts w:ascii="Arial" w:hAnsi="Arial" w:cs="Arial"/>
+          <w:highlight w:val="lightGray"/>
+        </w:rPr>
+        <w:t xml:space="preserve"> del modelo base, la </w:t>
+      </w:r>
+      <w:r>
+        <w:rPr>
+          <w:rFonts w:ascii="Arial" w:hAnsi="Arial" w:cs="Arial"/>
+          <w:highlight w:val="lightGray"/>
+        </w:rPr>
+        <w:t>modificación</w:t>
+      </w:r>
+      <w:r>
+        <w:rPr>
+          <w:rFonts w:ascii="Arial" w:hAnsi="Arial" w:cs="Arial"/>
+          <w:highlight w:val="lightGray"/>
+        </w:rPr>
+        <w:t xml:space="preserve"> de las fuentes o de la estructura de los datos de entrada, la </w:t>
+      </w:r>
+      <w:r>
+        <w:rPr>
+          <w:rFonts w:ascii="Arial" w:hAnsi="Arial" w:cs="Arial"/>
+          <w:highlight w:val="lightGray"/>
+        </w:rPr>
+        <w:t>ampliación</w:t>
+      </w:r>
+      <w:r>
+        <w:rPr>
+          <w:rFonts w:ascii="Arial" w:hAnsi="Arial" w:cs="Arial"/>
+          <w:highlight w:val="lightGray"/>
+        </w:rPr>
+        <w:t xml:space="preserve"> de la finalidad o de la </w:t>
+      </w:r>
+      <w:r>
+        <w:rPr>
+          <w:rFonts w:ascii="Arial" w:hAnsi="Arial" w:cs="Arial"/>
+          <w:highlight w:val="lightGray"/>
+        </w:rPr>
+        <w:t>población</w:t>
+      </w:r>
+      <w:r>
+        <w:rPr>
+          <w:rFonts w:ascii="Arial" w:hAnsi="Arial" w:cs="Arial"/>
+          <w:highlight w:val="lightGray"/>
+        </w:rPr>
+        <w:t xml:space="preserve"> objetivo del SBIA, y el cambio de proveedor. El propietario del caso de uso registra todo cambio en el Inventario Institucional de SBIA y lo comunica a la </w:t>
+      </w:r>
+      <w:r>
+        <w:rPr>
+          <w:rFonts w:ascii="Arial" w:hAnsi="Arial" w:cs="Arial"/>
+          <w:highlight w:val="lightGray"/>
+        </w:rPr>
+        <w:t>Comisión</w:t>
+      </w:r>
+      <w:r>
+        <w:rPr>
+          <w:rFonts w:ascii="Arial" w:hAnsi="Arial" w:cs="Arial"/>
+          <w:highlight w:val="lightGray"/>
+        </w:rPr>
+        <w:t xml:space="preserve"> de Gobierno de IA.</w:t>
+      </w:r>
+    </w:p>
+    <w:p>
+      <w:pPr>
+        <w:spacing w:after="0" w:line="276" w:lineRule="auto"/>
+        <w:ind w:left="1276" w:hanging="709"/>
+        <w:jc w:val="both"/>
+        <w:rPr>
+          <w:rFonts w:ascii="Arial" w:hAnsi="Arial" w:cs="Arial"/>
+        </w:rPr>
+      </w:pPr>
+      <w:r>
+        <w:rPr>
+          <w:rFonts w:ascii="Arial" w:hAnsi="Arial" w:cs="Arial"/>
+          <w:highlight w:val="lightGray"/>
+        </w:rPr>
+        <w:t xml:space="preserve">6.10.5 Es significativo el cambio que altera el </w:t>
+      </w:r>
+      <w:r>
+        <w:rPr>
+          <w:rFonts w:ascii="Arial" w:hAnsi="Arial" w:cs="Arial"/>
+          <w:highlight w:val="lightGray"/>
+        </w:rPr>
+        <w:t>desempeño</w:t>
+      </w:r>
+      <w:r>
+        <w:rPr>
+          <w:rFonts w:ascii="Arial" w:hAnsi="Arial" w:cs="Arial"/>
+          <w:highlight w:val="lightGray"/>
+        </w:rPr>
+        <w:t xml:space="preserve">, la finalidad o la </w:t>
+      </w:r>
+      <w:r>
+        <w:rPr>
+          <w:rFonts w:ascii="Arial" w:hAnsi="Arial" w:cs="Arial"/>
+          <w:highlight w:val="lightGray"/>
+        </w:rPr>
+        <w:t>población</w:t>
+      </w:r>
+      <w:r>
+        <w:rPr>
+          <w:rFonts w:ascii="Arial" w:hAnsi="Arial" w:cs="Arial"/>
+          <w:highlight w:val="lightGray"/>
+        </w:rPr>
+        <w:t xml:space="preserve"> objetivo del SBIA. El cambio significativo requiere, con anterioridad a su puesta en </w:t>
+      </w:r>
+      <w:r>
+        <w:rPr>
+          <w:rFonts w:ascii="Arial" w:hAnsi="Arial" w:cs="Arial"/>
+          <w:highlight w:val="lightGray"/>
+        </w:rPr>
+        <w:t>producción</w:t>
+      </w:r>
+      <w:r>
+        <w:rPr>
+          <w:rFonts w:ascii="Arial" w:hAnsi="Arial" w:cs="Arial"/>
+          <w:highlight w:val="lightGray"/>
+        </w:rPr>
+        <w:t xml:space="preserve">: la </w:t>
+      </w:r>
+      <w:r>
+        <w:rPr>
+          <w:rFonts w:ascii="Arial" w:hAnsi="Arial" w:cs="Arial"/>
+          <w:highlight w:val="lightGray"/>
+        </w:rPr>
+        <w:t>revisión</w:t>
+      </w:r>
+      <w:r>
+        <w:rPr>
+          <w:rFonts w:ascii="Arial" w:hAnsi="Arial" w:cs="Arial"/>
+          <w:highlight w:val="lightGray"/>
+        </w:rPr>
+        <w:t xml:space="preserve"> de la </w:t>
+      </w:r>
+      <w:r>
+        <w:rPr>
+          <w:rFonts w:ascii="Arial" w:hAnsi="Arial" w:cs="Arial"/>
+          <w:highlight w:val="lightGray"/>
+        </w:rPr>
+        <w:t>clasificación</w:t>
+      </w:r>
+      <w:r>
+        <w:rPr>
+          <w:rFonts w:ascii="Arial" w:hAnsi="Arial" w:cs="Arial"/>
+          <w:highlight w:val="lightGray"/>
+        </w:rPr>
+        <w:t xml:space="preserve"> de riesgo conforme al numeral 6.2.2; la </w:t>
+      </w:r>
+      <w:r>
+        <w:rPr>
+          <w:rFonts w:ascii="Arial" w:hAnsi="Arial" w:cs="Arial"/>
+          <w:highlight w:val="lightGray"/>
+        </w:rPr>
+        <w:t>actualización</w:t>
+      </w:r>
+      <w:r>
+        <w:rPr>
+          <w:rFonts w:ascii="Arial" w:hAnsi="Arial" w:cs="Arial"/>
+          <w:highlight w:val="lightGray"/>
+        </w:rPr>
+        <w:t xml:space="preserve"> de la EIA conforme al numeral 6.4.3, cuando corresponda; la </w:t>
+      </w:r>
+      <w:r>
+        <w:rPr>
+          <w:rFonts w:ascii="Arial" w:hAnsi="Arial" w:cs="Arial"/>
+          <w:highlight w:val="lightGray"/>
+        </w:rPr>
+        <w:t>verificación</w:t>
+      </w:r>
+      <w:r>
+        <w:rPr>
+          <w:rFonts w:ascii="Arial" w:hAnsi="Arial" w:cs="Arial"/>
+          <w:highlight w:val="lightGray"/>
+        </w:rPr>
+        <w:t xml:space="preserve"> y </w:t>
+      </w:r>
+      <w:r>
+        <w:rPr>
+          <w:rFonts w:ascii="Arial" w:hAnsi="Arial" w:cs="Arial"/>
+          <w:highlight w:val="lightGray"/>
+        </w:rPr>
+        <w:t>validación</w:t>
+      </w:r>
+      <w:r>
+        <w:rPr>
+          <w:rFonts w:ascii="Arial" w:hAnsi="Arial" w:cs="Arial"/>
+          <w:highlight w:val="lightGray"/>
+        </w:rPr>
+        <w:t xml:space="preserve"> conforme al numeral 6.10.3; y la </w:t>
+      </w:r>
+      <w:r>
+        <w:rPr>
+          <w:rFonts w:ascii="Arial" w:hAnsi="Arial" w:cs="Arial"/>
+          <w:highlight w:val="lightGray"/>
+        </w:rPr>
+        <w:t>aprobación</w:t>
+      </w:r>
+      <w:r>
+        <w:rPr>
+          <w:rFonts w:ascii="Arial" w:hAnsi="Arial" w:cs="Arial"/>
+          <w:highlight w:val="lightGray"/>
+        </w:rPr>
+        <w:t xml:space="preserve"> prevista en el numeral 6.1.2. El despliegue del cambio se realiza con </w:t>
+      </w:r>
+      <w:r>
+        <w:rPr>
+          <w:rFonts w:ascii="Arial" w:hAnsi="Arial" w:cs="Arial"/>
+          <w:highlight w:val="lightGray"/>
+        </w:rPr>
+        <w:t>versión</w:t>
+      </w:r>
+      <w:r>
+        <w:rPr>
+          <w:rFonts w:ascii="Arial" w:hAnsi="Arial" w:cs="Arial"/>
+          <w:highlight w:val="lightGray"/>
+        </w:rPr>
+        <w:t xml:space="preserve"> identificable y con un plan de </w:t>
+      </w:r>
+      <w:r>
+        <w:rPr>
+          <w:rFonts w:ascii="Arial" w:hAnsi="Arial" w:cs="Arial"/>
+          <w:highlight w:val="lightGray"/>
+        </w:rPr>
+        <w:t>reversión</w:t>
+      </w:r>
+      <w:r>
+        <w:rPr>
+          <w:rFonts w:ascii="Arial" w:hAnsi="Arial" w:cs="Arial"/>
+          <w:highlight w:val="lightGray"/>
+        </w:rPr>
+        <w:t xml:space="preserve"> que permita restituir la </w:t>
+      </w:r>
+      <w:r>
+        <w:rPr>
+          <w:rFonts w:ascii="Arial" w:hAnsi="Arial" w:cs="Arial"/>
+          <w:highlight w:val="lightGray"/>
+        </w:rPr>
+        <w:t>versión</w:t>
+      </w:r>
+      <w:r>
+        <w:rPr>
+          <w:rFonts w:ascii="Arial" w:hAnsi="Arial" w:cs="Arial"/>
+          <w:highlight w:val="lightGray"/>
+        </w:rPr>
+        <w:t xml:space="preserve"> anterior del SBIA. La </w:t>
+      </w:r>
+      <w:r>
+        <w:rPr>
+          <w:rFonts w:ascii="Arial" w:hAnsi="Arial" w:cs="Arial"/>
+          <w:highlight w:val="lightGray"/>
+        </w:rPr>
+        <w:t>operación</w:t>
+      </w:r>
+      <w:r>
+        <w:rPr>
+          <w:rFonts w:ascii="Arial" w:hAnsi="Arial" w:cs="Arial"/>
+          <w:highlight w:val="lightGray"/>
+        </w:rPr>
+        <w:t xml:space="preserve"> posterior al cambio es objeto de seguimiento reforzado durante el periodo que corresponda a su nivel de riesgo, conforme a la </w:t>
+      </w:r>
+      <w:r>
+        <w:rPr>
+          <w:rFonts w:ascii="Arial" w:hAnsi="Arial" w:cs="Arial"/>
+          <w:highlight w:val="lightGray"/>
+        </w:rPr>
+        <w:t>metodología</w:t>
+      </w:r>
+      <w:r>
+        <w:rPr>
+          <w:rFonts w:ascii="Arial" w:hAnsi="Arial" w:cs="Arial"/>
+          <w:highlight w:val="lightGray"/>
+        </w:rPr>
+        <w:t xml:space="preserve"> prevista en el numeral 6.1.5.</w:t>
       </w:r>
     </w:p>
     <w:p>
@@ -10746,7 +11332,6 @@
           <w:color w:val="000000"/>
           <w:highlight w:val="cyan"/>
         </w:rPr>
-        <w:lastRenderedPageBreak/>
         <w:t>No ingresar información sujeta a reserva tributaria ni datos personales de contribuyentes u operadores aduaneros en herramientas de IA que no estén autorizadas para ese tratamiento en el catálogo institucional. El catálogo indica, para cada herramienta, los tipos de información que puede procesar. El tratamiento de información sujeta a reserva tributaria se rige por el numeral 6.7.3.</w:t>
       </w:r>
     </w:p>
@@ -10868,7 +11453,16 @@
           <w:highlight w:val="yellow"/>
         </w:rPr>
         <w:tab/>
-        <w:t>El catálogo de herramientas de IA autorizadas para uso institucional registra las herramientas aprobadas conforme al numeral 6.11.5. El catálogo precisa, para cada herramienta, el ámbito de uso autorizado (uso administrativo general o uso restringido) y si su empleo con información sujeta a reserva tributaria está permitido, en concordancia con los numerales 6.11.1 y 6.7.3. La INSI lo publica y lo mantiene actualizado.</w:t>
+        <w:t xml:space="preserve">El catálogo de herramientas de IA autorizadas para uso institucional registra las herramientas aprobadas conforme al numeral 6.11.5. El catálogo precisa, para cada herramienta, el ámbito de uso autorizado (uso administrativo general o uso restringido) y si su empleo con información sujeta a reserva tributaria está </w:t>
+      </w:r>
+      <w:r>
+        <w:rPr>
+          <w:rFonts w:ascii="Arial" w:eastAsia="Arial" w:hAnsi="Arial" w:cs="Arial"/>
+          <w:color w:val="000000"/>
+          <w:highlight w:val="yellow"/>
+        </w:rPr>
+        <w:lastRenderedPageBreak/>
+        <w:t>permitido, en concordancia con los numerales 6.11.1 y 6.7.3. La INSI lo publica y lo mantiene actualizado.</w:t>
       </w:r>
     </w:p>
     <w:p>
@@ -10966,16 +11560,7 @@
           <w:color w:val="000000"/>
           <w:highlight w:val="cyan"/>
         </w:rPr>
-        <w:t xml:space="preserve"> El registro, el control y el retiro de las herramientas de IA como software se rigen por el </w:t>
-      </w:r>
-      <w:r>
-        <w:rPr>
-          <w:rFonts w:ascii="Arial" w:eastAsia="Arial" w:hAnsi="Arial" w:cs="Arial"/>
-          <w:color w:val="000000"/>
-          <w:highlight w:val="cyan"/>
-        </w:rPr>
-        <w:lastRenderedPageBreak/>
-        <w:t>Procedimiento para el Registro, Control y Retiro de Software de la SUNAT (A-03.3.2-PR-01).</w:t>
+        <w:t xml:space="preserve"> El registro, el control y el retiro de las herramientas de IA como software se rigen por el Procedimiento para el Registro, Control y Retiro de Software de la SUNAT (A-03.3.2-PR-01).</w:t>
       </w:r>
     </w:p>
     <w:p>
@@ -11097,7 +11682,16 @@
           <w:highlight w:val="yellow"/>
         </w:rPr>
         <w:tab/>
-        <w:t>Los contratos prohíben al proveedor emplear la información de la SUNAT (en particular la sujeta a reserva tributaria y los datos personales) para entrenar, ajustar o mejorar sus modelos o para cualquier fin propio, en concordancia con el artículo 85 del Código Tributario, que extiende la obligación de reserva a quienes accedan a dicha información. La propiedad intelectual de los ajustes (fine-tuning) realizados con información o para necesidades de la SUNAT corresponde a la SUNAT.</w:t>
+        <w:t xml:space="preserve">Los contratos prohíben al proveedor emplear la información de la SUNAT (en particular la sujeta a reserva tributaria y los datos personales) para entrenar, </w:t>
+      </w:r>
+      <w:r>
+        <w:rPr>
+          <w:rFonts w:ascii="Arial" w:eastAsia="Arial" w:hAnsi="Arial" w:cs="Arial"/>
+          <w:color w:val="000000"/>
+          <w:highlight w:val="yellow"/>
+        </w:rPr>
+        <w:lastRenderedPageBreak/>
+        <w:t>ajustar o mejorar sus modelos o para cualquier fin propio, en concordancia con el artículo 85 del Código Tributario, que extiende la obligación de reserva a quienes accedan a dicha información. La propiedad intelectual de los ajustes (fine-tuning) realizados con información o para necesidades de la SUNAT corresponde a la SUNAT.</w:t>
       </w:r>
     </w:p>
     <w:p>
@@ -11284,7 +11878,6 @@
           <w:color w:val="000000"/>
           <w:highlight w:val="lightGray"/>
         </w:rPr>
-        <w:lastRenderedPageBreak/>
         <w:t>Los riesgos derivados de su diseño, desarrollo, implementación y uso.</w:t>
       </w:r>
     </w:p>
@@ -11446,6 +12039,7 @@
           <w:color w:val="000000"/>
           <w:highlight w:val="lightGray"/>
         </w:rPr>
+        <w:lastRenderedPageBreak/>
         <w:t>Las necesidades de capacitación asociadas a los distintos roles, los contenidos formativos, las modalidades de capacitación y los mecanismos de evaluación de resultados se determinan en el marco normativo del Plan de Desarrollo de las Personas.</w:t>
       </w:r>
     </w:p>
@@ -11692,16 +12286,7 @@
           <w:color w:val="000000"/>
           <w:highlight w:val="lightGray"/>
         </w:rPr>
-        <w:t xml:space="preserve">Las acciones de gestión del cambio facilitan la consolidación de la Política institucional de uso seguro, responsable y ético de los sistemas basados en IA y del sistema de gestión de IA, promoviendo su integración en la gestión institucional y favoreciendo las condiciones organizacionales necesarias para </w:t>
-      </w:r>
-      <w:r>
-        <w:rPr>
-          <w:rFonts w:ascii="Arial" w:eastAsia="Arial" w:hAnsi="Arial" w:cs="Arial"/>
-          <w:color w:val="000000"/>
-          <w:highlight w:val="lightGray"/>
-        </w:rPr>
-        <w:lastRenderedPageBreak/>
-        <w:t>su sostenibilidad y mejora continua, en concordancia con los numerales 28.1 y 28.2 del artículo 28 del Reglamento.</w:t>
+        <w:t>Las acciones de gestión del cambio facilitan la consolidación de la Política institucional de uso seguro, responsable y ético de los sistemas basados en IA y del sistema de gestión de IA, promoviendo su integración en la gestión institucional y favoreciendo las condiciones organizacionales necesarias para su sostenibilidad y mejora continua, en concordancia con los numerales 28.1 y 28.2 del artículo 28 del Reglamento.</w:t>
       </w:r>
     </w:p>
     <w:p>
@@ -11813,7 +12398,16 @@
           <w:color w:val="000000"/>
           <w:highlight w:val="yellow"/>
         </w:rPr>
-        <w:t>. La OII supervisa el cumplimiento de los principios éticos en los SBIA, evalúa los riesgos de sesgo y discriminación y administra el canal de consultas éticas en materia de IA. Su opinión sobre la clasificación de riesgo consta conforme al numeral 6.2.2.</w:t>
+        <w:t xml:space="preserve">. La OII supervisa el cumplimiento de los principios éticos en los SBIA, evalúa los riesgos de sesgo </w:t>
+      </w:r>
+      <w:r>
+        <w:rPr>
+          <w:rFonts w:ascii="Arial" w:eastAsia="Arial" w:hAnsi="Arial" w:cs="Arial"/>
+          <w:color w:val="000000"/>
+          <w:highlight w:val="yellow"/>
+        </w:rPr>
+        <w:lastRenderedPageBreak/>
+        <w:t>y discriminación y administra el canal de consultas éticas en materia de IA. Su opinión sobre la clasificación de riesgo consta conforme al numeral 6.2.2.</w:t>
       </w:r>
     </w:p>
     <w:p>
@@ -11972,15 +12566,7 @@
           <w:rFonts w:ascii="Arial" w:hAnsi="Arial" w:cs="Arial"/>
           <w:highlight w:val="lightGray"/>
         </w:rPr>
-        <w:t xml:space="preserve">En los programas y proyectos institucionales conforme al MGPP, cuando se identifique un componente basado en IA se recaba la opinión de la Comisión </w:t>
-      </w:r>
-      <w:r>
-        <w:rPr>
-          <w:rFonts w:ascii="Arial" w:hAnsi="Arial" w:cs="Arial"/>
-          <w:highlight w:val="lightGray"/>
-        </w:rPr>
-        <w:lastRenderedPageBreak/>
-        <w:t>con carácter previo a la aprobación que corresponda. La obligación aplica en la</w:t>
+        <w:t>En los programas y proyectos institucionales conforme al MGPP, cuando se identifique un componente basado en IA se recaba la opinión de la Comisión con carácter previo a la aprobación que corresponda. La obligación aplica en la</w:t>
       </w:r>
       <w:r>
         <w:rPr>
@@ -12024,9 +12610,7 @@
         <w:ind w:left="1276" w:hanging="709"/>
         <w:jc w:val="both"/>
         <w:rPr>
-          <w:rFonts w:ascii="Arial" w:eastAsia="Arial" w:hAnsi="Arial" w:cs="Arial"/>
-          <w:color w:val="000000"/>
-          <w:highlight w:val="yellow"/>
+          <w:rFonts w:ascii="Arial" w:hAnsi="Arial" w:cs="Arial"/>
         </w:rPr>
       </w:pPr>
       <w:r>
@@ -12063,6 +12647,180 @@
           <w:highlight w:val="lightGray"/>
         </w:rPr>
         <w:t>la verificación del componente de IA y la opinión de la Comisión, según sus competencias y sin afectar los sistemas administrativos del Estado, conforme al numeral 7.6</w:t>
+      </w:r>
+    </w:p>
+    <w:p>
+      <w:pPr>
+        <w:spacing w:after="60" w:line="276" w:lineRule="auto"/>
+        <w:ind w:left="1276" w:hanging="709"/>
+        <w:jc w:val="both"/>
+        <w:rPr>
+          <w:rFonts w:ascii="Arial" w:eastAsia="Arial" w:hAnsi="Arial" w:cs="Arial"/>
+          <w:color w:val="000000"/>
+          <w:highlight w:val="yellow"/>
+        </w:rPr>
+      </w:pPr>
+      <w:r>
+        <w:rPr>
+          <w:rFonts w:ascii="Arial" w:hAnsi="Arial" w:cs="Arial"/>
+          <w:highlight w:val="lightGray"/>
+        </w:rPr>
+        <w:lastRenderedPageBreak/>
+        <w:t xml:space="preserve">6.15.6 La presente directiva se articula con la normativa institucional de gobernanza de datos y </w:t>
+      </w:r>
+      <w:r>
+        <w:rPr>
+          <w:rFonts w:ascii="Arial" w:hAnsi="Arial" w:cs="Arial"/>
+          <w:highlight w:val="lightGray"/>
+        </w:rPr>
+        <w:t>analítica</w:t>
+      </w:r>
+      <w:r>
+        <w:rPr>
+          <w:rFonts w:ascii="Arial" w:hAnsi="Arial" w:cs="Arial"/>
+          <w:highlight w:val="lightGray"/>
+        </w:rPr>
+        <w:t xml:space="preserve">. Cuando un producto </w:t>
+      </w:r>
+      <w:r>
+        <w:rPr>
+          <w:rFonts w:ascii="Arial" w:hAnsi="Arial" w:cs="Arial"/>
+          <w:highlight w:val="lightGray"/>
+        </w:rPr>
+        <w:t>analítico</w:t>
+      </w:r>
+      <w:r>
+        <w:rPr>
+          <w:rFonts w:ascii="Arial" w:hAnsi="Arial" w:cs="Arial"/>
+          <w:highlight w:val="lightGray"/>
+        </w:rPr>
+        <w:t xml:space="preserve"> incorpore un sistema basado en IA, este se sujeta al ciclo de vida, la </w:t>
+      </w:r>
+      <w:r>
+        <w:rPr>
+          <w:rFonts w:ascii="Arial" w:hAnsi="Arial" w:cs="Arial"/>
+          <w:highlight w:val="lightGray"/>
+        </w:rPr>
+        <w:t>clasificación</w:t>
+      </w:r>
+      <w:r>
+        <w:rPr>
+          <w:rFonts w:ascii="Arial" w:hAnsi="Arial" w:cs="Arial"/>
+          <w:highlight w:val="lightGray"/>
+        </w:rPr>
+        <w:t xml:space="preserve"> de riesgo, la </w:t>
+      </w:r>
+      <w:r>
+        <w:rPr>
+          <w:rFonts w:ascii="Arial" w:hAnsi="Arial" w:cs="Arial"/>
+          <w:highlight w:val="lightGray"/>
+        </w:rPr>
+        <w:t>evaluación</w:t>
+      </w:r>
+      <w:r>
+        <w:rPr>
+          <w:rFonts w:ascii="Arial" w:hAnsi="Arial" w:cs="Arial"/>
+          <w:highlight w:val="lightGray"/>
+        </w:rPr>
+        <w:t xml:space="preserve"> de impacto </w:t>
+      </w:r>
+      <w:r>
+        <w:rPr>
+          <w:rFonts w:ascii="Arial" w:hAnsi="Arial" w:cs="Arial"/>
+          <w:highlight w:val="lightGray"/>
+        </w:rPr>
+        <w:t>algorítmico</w:t>
+      </w:r>
+      <w:r>
+        <w:rPr>
+          <w:rFonts w:ascii="Arial" w:hAnsi="Arial" w:cs="Arial"/>
+          <w:highlight w:val="lightGray"/>
+        </w:rPr>
+        <w:t xml:space="preserve">, el registro en el Inventario Institucional de SBIA y las obligaciones de transparencia y </w:t>
+      </w:r>
+      <w:r>
+        <w:rPr>
+          <w:rFonts w:ascii="Arial" w:hAnsi="Arial" w:cs="Arial"/>
+          <w:highlight w:val="lightGray"/>
+        </w:rPr>
+        <w:t>supervisión</w:t>
+      </w:r>
+      <w:r>
+        <w:rPr>
+          <w:rFonts w:ascii="Arial" w:hAnsi="Arial" w:cs="Arial"/>
+          <w:highlight w:val="lightGray"/>
+        </w:rPr>
+        <w:t xml:space="preserve"> humana previstas en la presente directiva. La </w:t>
+      </w:r>
+      <w:r>
+        <w:rPr>
+          <w:rFonts w:ascii="Arial" w:hAnsi="Arial" w:cs="Arial"/>
+          <w:highlight w:val="lightGray"/>
+        </w:rPr>
+        <w:t>certificación</w:t>
+      </w:r>
+      <w:r>
+        <w:rPr>
+          <w:rFonts w:ascii="Arial" w:hAnsi="Arial" w:cs="Arial"/>
+          <w:highlight w:val="lightGray"/>
+        </w:rPr>
+        <w:t xml:space="preserve"> del producto </w:t>
+      </w:r>
+      <w:r>
+        <w:rPr>
+          <w:rFonts w:ascii="Arial" w:hAnsi="Arial" w:cs="Arial"/>
+          <w:highlight w:val="lightGray"/>
+        </w:rPr>
+        <w:t>analítico</w:t>
+      </w:r>
+      <w:r>
+        <w:rPr>
+          <w:rFonts w:ascii="Arial" w:hAnsi="Arial" w:cs="Arial"/>
+          <w:highlight w:val="lightGray"/>
+        </w:rPr>
+        <w:t xml:space="preserve"> requiere, como insumo previo, la </w:t>
+      </w:r>
+      <w:r>
+        <w:rPr>
+          <w:rFonts w:ascii="Arial" w:hAnsi="Arial" w:cs="Arial"/>
+          <w:highlight w:val="lightGray"/>
+        </w:rPr>
+        <w:t>aprobación</w:t>
+      </w:r>
+      <w:r>
+        <w:rPr>
+          <w:rFonts w:ascii="Arial" w:hAnsi="Arial" w:cs="Arial"/>
+          <w:highlight w:val="lightGray"/>
+        </w:rPr>
+        <w:t xml:space="preserve"> que corresponda conforme al numeral 6.1.2. La calidad, el linaje, los metadatos y la </w:t>
+      </w:r>
+      <w:r>
+        <w:rPr>
+          <w:rFonts w:ascii="Arial" w:hAnsi="Arial" w:cs="Arial"/>
+          <w:highlight w:val="lightGray"/>
+        </w:rPr>
+        <w:t>certificación</w:t>
+      </w:r>
+      <w:r>
+        <w:rPr>
+          <w:rFonts w:ascii="Arial" w:hAnsi="Arial" w:cs="Arial"/>
+          <w:highlight w:val="lightGray"/>
+        </w:rPr>
+        <w:t xml:space="preserve"> de los datos que alimentan el sistema se rigen por la normativa de gobernanza de datos y </w:t>
+      </w:r>
+      <w:r>
+        <w:rPr>
+          <w:rFonts w:ascii="Arial" w:hAnsi="Arial" w:cs="Arial"/>
+          <w:highlight w:val="lightGray"/>
+        </w:rPr>
+        <w:t>analítica</w:t>
+      </w:r>
+      <w:r>
+        <w:rPr>
+          <w:rFonts w:ascii="Arial" w:hAnsi="Arial" w:cs="Arial"/>
+          <w:highlight w:val="lightGray"/>
+        </w:rPr>
+        <w:t>.</w:t>
       </w:r>
       <w:r>
         <w:rPr>
@@ -14477,6 +15235,170 @@
                 <w:rFonts w:ascii="Arial" w:eastAsia="Arial" w:hAnsi="Arial" w:cs="Arial"/>
               </w:rPr>
               <w:t>Indicación de si el SBIA aplica etiquetado visible y la forma en que se presenta, cuando corresponda (numeral 6.9.2).</w:t>
+            </w:r>
+          </w:p>
+        </w:tc>
+      </w:tr>
+      <w:tr>
+        <w:tc>
+          <w:tcPr>
+            <w:tcW w:w="527" w:type="dxa"/>
+            <w:tcBorders>
+              <w:top w:val="single" w:sz="4" w:space="0" w:color="000000"/>
+              <w:left w:val="single" w:sz="4" w:space="0" w:color="000000"/>
+              <w:bottom w:val="single" w:sz="4" w:space="0" w:color="000000"/>
+              <w:right w:val="single" w:sz="4" w:space="0" w:color="000000"/>
+            </w:tcBorders>
+            <w:tcMar>
+              <w:top w:w="60" w:type="dxa"/>
+              <w:left w:w="80" w:type="dxa"/>
+              <w:bottom w:w="60" w:type="dxa"/>
+              <w:right w:w="80" w:type="dxa"/>
+            </w:tcMar>
+            <w:vAlign w:val="center"/>
+          </w:tcPr>
+          <w:p>
+            <w:pPr>
+              <w:spacing w:before="20" w:after="20" w:line="276" w:lineRule="auto"/>
+              <w:rPr>
+                <w:rFonts w:ascii="Arial" w:eastAsia="Arial" w:hAnsi="Arial" w:cs="Arial"/>
+              </w:rPr>
+            </w:pPr>
+            <w:r>
+              <w:rPr>
+                <w:rFonts w:ascii="Arial" w:eastAsia="Arial" w:hAnsi="Arial" w:cs="Arial"/>
+              </w:rPr>
+              <w:t>18</w:t>
+            </w:r>
+          </w:p>
+        </w:tc>
+        <w:tc>
+          <w:tcPr>
+            <w:tcW w:w="2109" w:type="dxa"/>
+            <w:tcBorders>
+              <w:top w:val="single" w:sz="4" w:space="0" w:color="000000"/>
+              <w:left w:val="single" w:sz="4" w:space="0" w:color="000000"/>
+              <w:bottom w:val="single" w:sz="4" w:space="0" w:color="000000"/>
+              <w:right w:val="single" w:sz="4" w:space="0" w:color="000000"/>
+            </w:tcBorders>
+            <w:tcMar>
+              <w:top w:w="60" w:type="dxa"/>
+              <w:left w:w="80" w:type="dxa"/>
+              <w:bottom w:w="60" w:type="dxa"/>
+              <w:right w:w="80" w:type="dxa"/>
+            </w:tcMar>
+            <w:vAlign w:val="center"/>
+          </w:tcPr>
+          <w:p>
+            <w:pPr>
+              <w:spacing w:before="20" w:after="20" w:line="276" w:lineRule="auto"/>
+              <w:rPr>
+                <w:rFonts w:ascii="Arial" w:eastAsia="Arial" w:hAnsi="Arial" w:cs="Arial"/>
+                <w:b/>
+                <w:bCs/>
+              </w:rPr>
+            </w:pPr>
+            <w:r>
+              <w:rPr>
+                <w:rFonts w:ascii="Arial" w:eastAsia="Arial" w:hAnsi="Arial" w:cs="Arial"/>
+                <w:b/>
+                <w:bCs/>
+              </w:rPr>
+              <w:t>Versión</w:t>
+            </w:r>
+            <w:r>
+              <w:rPr>
+                <w:rFonts w:ascii="Arial" w:eastAsia="Arial" w:hAnsi="Arial" w:cs="Arial"/>
+                <w:b/>
+                <w:bCs/>
+              </w:rPr>
+              <w:t xml:space="preserve"> vigente y ultimo cambio</w:t>
+            </w:r>
+          </w:p>
+        </w:tc>
+        <w:tc>
+          <w:tcPr>
+            <w:tcW w:w="6151" w:type="dxa"/>
+            <w:tcBorders>
+              <w:top w:val="single" w:sz="4" w:space="0" w:color="000000"/>
+              <w:left w:val="single" w:sz="4" w:space="0" w:color="000000"/>
+              <w:bottom w:val="single" w:sz="4" w:space="0" w:color="000000"/>
+              <w:right w:val="single" w:sz="4" w:space="0" w:color="000000"/>
+            </w:tcBorders>
+            <w:tcMar>
+              <w:top w:w="60" w:type="dxa"/>
+              <w:left w:w="80" w:type="dxa"/>
+              <w:bottom w:w="60" w:type="dxa"/>
+              <w:right w:w="80" w:type="dxa"/>
+            </w:tcMar>
+            <w:vAlign w:val="center"/>
+          </w:tcPr>
+          <w:p>
+            <w:pPr>
+              <w:spacing w:before="20" w:after="20" w:line="276" w:lineRule="auto"/>
+              <w:rPr>
+                <w:rFonts w:ascii="Arial" w:eastAsia="Arial" w:hAnsi="Arial" w:cs="Arial"/>
+              </w:rPr>
+            </w:pPr>
+            <w:r>
+              <w:rPr>
+                <w:rFonts w:ascii="Arial" w:eastAsia="Arial" w:hAnsi="Arial" w:cs="Arial"/>
+              </w:rPr>
+              <w:t>Identificación</w:t>
+            </w:r>
+            <w:r>
+              <w:rPr>
+                <w:rFonts w:ascii="Arial" w:eastAsia="Arial" w:hAnsi="Arial" w:cs="Arial"/>
+              </w:rPr>
+              <w:t xml:space="preserve"> de la </w:t>
+            </w:r>
+            <w:r>
+              <w:rPr>
+                <w:rFonts w:ascii="Arial" w:eastAsia="Arial" w:hAnsi="Arial" w:cs="Arial"/>
+              </w:rPr>
+              <w:t>versión</w:t>
+            </w:r>
+            <w:r>
+              <w:rPr>
+                <w:rFonts w:ascii="Arial" w:eastAsia="Arial" w:hAnsi="Arial" w:cs="Arial"/>
+              </w:rPr>
+              <w:t xml:space="preserve"> del SBIA en </w:t>
+            </w:r>
+            <w:r>
+              <w:rPr>
+                <w:rFonts w:ascii="Arial" w:eastAsia="Arial" w:hAnsi="Arial" w:cs="Arial"/>
+              </w:rPr>
+              <w:t>producción</w:t>
+            </w:r>
+            <w:r>
+              <w:rPr>
+                <w:rFonts w:ascii="Arial" w:eastAsia="Arial" w:hAnsi="Arial" w:cs="Arial"/>
+              </w:rPr>
+              <w:t xml:space="preserve">, fecha del </w:t>
+            </w:r>
+            <w:r>
+              <w:rPr>
+                <w:rFonts w:ascii="Arial" w:eastAsia="Arial" w:hAnsi="Arial" w:cs="Arial"/>
+              </w:rPr>
+              <w:t>último</w:t>
+            </w:r>
+            <w:r>
+              <w:rPr>
+                <w:rFonts w:ascii="Arial" w:eastAsia="Arial" w:hAnsi="Arial" w:cs="Arial"/>
+              </w:rPr>
+              <w:t xml:space="preserve"> cambio y su </w:t>
+            </w:r>
+            <w:r>
+              <w:rPr>
+                <w:rFonts w:ascii="Arial" w:eastAsia="Arial" w:hAnsi="Arial" w:cs="Arial"/>
+              </w:rPr>
+              <w:t>calificación</w:t>
+            </w:r>
+            <w:r>
+              <w:rPr>
+                <w:rFonts w:ascii="Arial" w:eastAsia="Arial" w:hAnsi="Arial" w:cs="Arial"/>
+              </w:rPr>
+              <w:t xml:space="preserve"> como significativo o no, conforme a los numerales 6.10.4 y 6.10.5</w:t>
             </w:r>
           </w:p>
         </w:tc>

</xml_diff>

<commit_message>
docs: precisa que el ciclo de vida del SBIA se apoya en los instrumentos institucionales y afina el Anexo N.° 4
- 6.1.1: aclara que el ciclo de vida no sustituye ni duplica los instrumentos que regulan la gestion de proyectos y el desarrollo de sistemas; se apoya en las conformidades de las unidades competentes y añade solo lo propio de la IA, con desarrollo metodologico conforme a 6.1.5
- 6.5.7: acota la determinacion de publicabilidad del codigo fuente en la PNSSP a reserva tributaria y reglas de deteccion de riesgo (retira la mencion a confidencialidad aduanera)
- Anexo N.° 4: renombra la Seccion 2 a "Necesidad y pertinencia del uso de IA"; agrega en la seccion de datos la base legal que habilita su uso (6.8.3) y las restricciones aplicables
- Corrige un espacio faltante en la matriz de responsabilidades del CGTD
- Regenera el espejo de texto desde el .docx; 0 comentarios pendientes
</commit_message>
<xml_diff>
--- a/normativo/DIRECTIVA-GOBIERNO-IA.docx
+++ b/normativo/DIRECTIVA-GOBIERNO-IA.docx
@@ -4908,6 +4908,18 @@
               </w:rPr>
               <w:t>de IA emite pronunciamiento no favorable, conforme al numeral 6.1.4.</w:t>
             </w:r>
+          </w:p>
+          <w:p>
+            <w:pPr>
+              <w:pStyle w:val="Prrafodelista"/>
+              <w:numPr>
+                <w:ilvl w:val="0"/>
+                <w:numId w:val="13"/>
+              </w:numPr>
+              <w:spacing w:before="20" w:after="20" w:line="276" w:lineRule="auto"/>
+              <w:ind w:left="269" w:hanging="269"/>
+              <w:jc w:val="left"/>
+            </w:pPr>
             <w:r>
               <w:rPr>
                 <w:b w:val="0"/>
@@ -7280,28 +7292,94 @@
           <w:color w:val="000000"/>
         </w:rPr>
         <w:tab/>
-        <w:t>Todo SBIA en la SUNAT sigue un ciclo de vida gestionado con las siguientes etapas</w:t>
-      </w:r>
-      <w:r>
-        <w:rPr>
-          <w:rFonts w:ascii="Arial" w:eastAsia="Arial" w:hAnsi="Arial" w:cs="Arial"/>
-          <w:color w:val="000000"/>
-        </w:rPr>
-        <w:t xml:space="preserve">. </w:t>
-      </w:r>
-      <w:r>
-        <w:rPr>
-          <w:rFonts w:ascii="Arial" w:eastAsia="Arial" w:hAnsi="Arial" w:cs="Arial"/>
-          <w:color w:val="000000"/>
-        </w:rPr>
-        <w:t>El ciclo de vida establecido en este numeral identifica las etapas y los hitos propios del componente de IA</w:t>
-      </w:r>
-      <w:r>
-        <w:rPr>
-          <w:rFonts w:ascii="Arial" w:eastAsia="Arial" w:hAnsi="Arial" w:cs="Arial"/>
-          <w:color w:val="000000"/>
-        </w:rPr>
-        <w:t>:</w:t>
+      </w:r>
+      <w:r>
+        <w:rPr>
+          <w:rFonts w:ascii="Arial" w:eastAsia="Arial" w:hAnsi="Arial" w:cs="Arial"/>
+          <w:color w:val="000000"/>
+          <w:highlight w:val="green"/>
+        </w:rPr>
+        <w:t>Todo SBIA en la SUNAT sigue un ciclo de vida gestionado, con las etapas y los hitos</w:t>
+      </w:r>
+      <w:r>
+        <w:rPr>
+          <w:rFonts w:ascii="Arial" w:eastAsia="Arial" w:hAnsi="Arial" w:cs="Arial"/>
+          <w:color w:val="000000"/>
+          <w:highlight w:val="green"/>
+        </w:rPr>
+        <w:t xml:space="preserve"> </w:t>
+      </w:r>
+      <w:r>
+        <w:rPr>
+          <w:rFonts w:ascii="Arial" w:eastAsia="Arial" w:hAnsi="Arial" w:cs="Arial"/>
+          <w:color w:val="000000"/>
+          <w:highlight w:val="green"/>
+        </w:rPr>
+        <w:t>propios del componente de IA que se detallan a continuación. Este ciclo no sustituye</w:t>
+      </w:r>
+      <w:r>
+        <w:rPr>
+          <w:rFonts w:ascii="Arial" w:eastAsia="Arial" w:hAnsi="Arial" w:cs="Arial"/>
+          <w:color w:val="000000"/>
+          <w:highlight w:val="green"/>
+        </w:rPr>
+        <w:t xml:space="preserve"> </w:t>
+      </w:r>
+      <w:r>
+        <w:rPr>
+          <w:rFonts w:ascii="Arial" w:eastAsia="Arial" w:hAnsi="Arial" w:cs="Arial"/>
+          <w:color w:val="000000"/>
+          <w:highlight w:val="green"/>
+        </w:rPr>
+        <w:t>ni duplica a los instrumentos institucionales que regulan la gestión de proyectos y el</w:t>
+      </w:r>
+      <w:r>
+        <w:rPr>
+          <w:rFonts w:ascii="Arial" w:eastAsia="Arial" w:hAnsi="Arial" w:cs="Arial"/>
+          <w:color w:val="000000"/>
+          <w:highlight w:val="green"/>
+        </w:rPr>
+        <w:t xml:space="preserve"> </w:t>
+      </w:r>
+      <w:r>
+        <w:rPr>
+          <w:rFonts w:ascii="Arial" w:eastAsia="Arial" w:hAnsi="Arial" w:cs="Arial"/>
+          <w:color w:val="000000"/>
+          <w:highlight w:val="green"/>
+        </w:rPr>
+        <w:t>desarrollo de sistemas: se apoya en las conformidades que las unidades de organización</w:t>
+      </w:r>
+      <w:r>
+        <w:rPr>
+          <w:rFonts w:ascii="Arial" w:eastAsia="Arial" w:hAnsi="Arial" w:cs="Arial"/>
+          <w:color w:val="000000"/>
+          <w:highlight w:val="green"/>
+        </w:rPr>
+        <w:t xml:space="preserve"> </w:t>
+      </w:r>
+      <w:r>
+        <w:rPr>
+          <w:rFonts w:ascii="Arial" w:eastAsia="Arial" w:hAnsi="Arial" w:cs="Arial"/>
+          <w:color w:val="000000"/>
+          <w:highlight w:val="green"/>
+        </w:rPr>
+        <w:t>competentes emiten conforme a ellos y añade únicamente lo que es propio de la</w:t>
+      </w:r>
+      <w:r>
+        <w:rPr>
+          <w:rFonts w:ascii="Arial" w:eastAsia="Arial" w:hAnsi="Arial" w:cs="Arial"/>
+          <w:color w:val="000000"/>
+          <w:highlight w:val="green"/>
+        </w:rPr>
+        <w:t xml:space="preserve"> </w:t>
+      </w:r>
+      <w:r>
+        <w:rPr>
+          <w:rFonts w:ascii="Arial" w:eastAsia="Arial" w:hAnsi="Arial" w:cs="Arial"/>
+          <w:color w:val="000000"/>
+          <w:highlight w:val="green"/>
+        </w:rPr>
+        <w:t>inteligencia artificial. Su desarrollo metodológico se efectúa conforme al numeral 6.1.5.</w:t>
       </w:r>
     </w:p>
     <w:tbl>
@@ -7637,6 +7715,7 @@
               <w:rPr>
                 <w:rFonts w:ascii="Arial" w:eastAsia="Arial" w:hAnsi="Arial" w:cs="Arial"/>
               </w:rPr>
+              <w:lastRenderedPageBreak/>
               <w:t>2</w:t>
             </w:r>
           </w:p>
@@ -7721,7 +7800,6 @@
                 <w:rFonts w:ascii="Arial" w:eastAsia="Arial" w:hAnsi="Arial" w:cs="Arial"/>
                 <w:highlight w:val="green"/>
               </w:rPr>
-              <w:lastRenderedPageBreak/>
               <w:t>del componente de IA y propone la clasificación de riesgo del SBIA, conforme al numeral 6.2.</w:t>
             </w:r>
           </w:p>
@@ -7756,16 +7834,7 @@
                 <w:rFonts w:ascii="Arial" w:eastAsia="Arial" w:hAnsi="Arial" w:cs="Arial"/>
                 <w:highlight w:val="green"/>
               </w:rPr>
-              <w:lastRenderedPageBreak/>
-              <w:t xml:space="preserve">Aprobación de la clasificación de riesgo, conforme a los </w:t>
-            </w:r>
-            <w:r>
-              <w:rPr>
-                <w:rFonts w:ascii="Arial" w:eastAsia="Arial" w:hAnsi="Arial" w:cs="Arial"/>
-                <w:highlight w:val="green"/>
-              </w:rPr>
-              <w:lastRenderedPageBreak/>
-              <w:t>numerales 6.1.2 y 6.2.2.</w:t>
+              <w:t>Aprobación de la clasificación de riesgo, conforme a los numerales 6.1.2 y 6.2.2.</w:t>
             </w:r>
           </w:p>
         </w:tc>
@@ -7799,7 +7868,6 @@
               <w:rPr>
                 <w:rFonts w:ascii="Arial" w:eastAsia="Arial" w:hAnsi="Arial" w:cs="Arial"/>
               </w:rPr>
-              <w:lastRenderedPageBreak/>
               <w:t>3</w:t>
             </w:r>
           </w:p>
@@ -8201,6 +8269,7 @@
               <w:rPr>
                 <w:rFonts w:ascii="Arial" w:eastAsia="Arial" w:hAnsi="Arial" w:cs="Arial"/>
               </w:rPr>
+              <w:lastRenderedPageBreak/>
               <w:t>6</w:t>
             </w:r>
           </w:p>
@@ -8301,15 +8370,7 @@
                 <w:rFonts w:ascii="Arial" w:eastAsia="Arial" w:hAnsi="Arial" w:cs="Arial"/>
                 <w:highlight w:val="yellow"/>
               </w:rPr>
-              <w:t xml:space="preserve">Conformidad de la Gerencia de </w:t>
-            </w:r>
-            <w:r>
-              <w:rPr>
-                <w:rFonts w:ascii="Arial" w:eastAsia="Arial" w:hAnsi="Arial" w:cs="Arial"/>
-                <w:highlight w:val="yellow"/>
-              </w:rPr>
-              <w:lastRenderedPageBreak/>
-              <w:t>Operaciones y Soporte a Usuarios (INSI).</w:t>
+              <w:t>Conformidad de la Gerencia de Operaciones y Soporte a Usuarios (INSI).</w:t>
             </w:r>
           </w:p>
         </w:tc>
@@ -8343,7 +8404,6 @@
               <w:rPr>
                 <w:rFonts w:ascii="Arial" w:eastAsia="Arial" w:hAnsi="Arial" w:cs="Arial"/>
               </w:rPr>
-              <w:lastRenderedPageBreak/>
               <w:t>7</w:t>
             </w:r>
           </w:p>
@@ -8851,7 +8911,7 @@
           <w:color w:val="000000"/>
           <w:highlight w:val="lightGray"/>
         </w:rPr>
-        <w:t xml:space="preserve">Por comprender actuaciones a cargo de unidades de organización distintas de la INSI, su formulación recoge los aportes de dichas unidades y su aprobación requiere la opinión favorable de la Comisión de Gobierno de IA, en ejercicio de las facultades previstas en el literal h del numeral 6.4 y en el numeral 6.5 de la </w:t>
+        <w:t xml:space="preserve">Por comprender actuaciones a cargo de unidades de organización distintas de la INSI, su formulación recoge los aportes de dichas unidades y su aprobación </w:t>
       </w:r>
       <w:r>
         <w:rPr>
@@ -8860,7 +8920,7 @@
           <w:highlight w:val="lightGray"/>
         </w:rPr>
         <w:lastRenderedPageBreak/>
-        <w:t xml:space="preserve">METDONI. La metodología comprende, como mínimo: la aplicación de la clasificación de riesgo y de la evaluación de impacto algorítmico, los criterios técnicos de diseño de la arquitectura de los SBIA, el contenido de los entregables de cada etapa, los tipos y las técnicas de prueba aplicables según el nivel de riesgo, </w:t>
+        <w:t xml:space="preserve">requiere la opinión favorable de la Comisión de Gobierno de IA, en ejercicio de las facultades previstas en el literal h del numeral 6.4 y en el numeral 6.5 de la METDONI. La metodología comprende, como mínimo: la aplicación de la clasificación de riesgo y de la evaluación de impacto algorítmico, los criterios técnicos de diseño de la arquitectura de los SBIA, el contenido de los entregables de cada etapa, los tipos y las técnicas de prueba aplicables según el nivel de riesgo, </w:t>
       </w:r>
       <w:r>
         <w:rPr>
@@ -9022,7 +9082,16 @@
           <w:color w:val="000000"/>
           <w:highlight w:val="yellow"/>
         </w:rPr>
-        <w:t>, conforme al artículo 23 del RLIA. Sin perjuicio de lo señalado en el literal e) del numeral 23.1 del citado artículo, no se consideran de uso indebido los SBIA utilizados para apoyar la evaluación humana sobre la implicación de una persona física en una actividad delictiva, siempre que se basen en hechos objetivos y verificables directamente relacionados con una actividad delictiva ya existente y cuenten con mecanismos de supervisión humana, transparencia y auditabilidad para garantizar la no discriminación y la protección de los derechos fundamentales, conforme al numeral 23.4 del citado artículo.</w:t>
+        <w:t xml:space="preserve">, conforme al artículo 23 del RLIA. Sin perjuicio de lo señalado en el literal e) del numeral 23.1 del citado artículo, no se consideran de uso indebido los SBIA utilizados para apoyar la evaluación humana sobre la implicación de una persona física en una actividad delictiva, siempre que se basen en hechos objetivos y verificables directamente relacionados con una actividad delictiva ya existente y cuenten con mecanismos de supervisión humana, transparencia y auditabilidad para </w:t>
+      </w:r>
+      <w:r>
+        <w:rPr>
+          <w:rFonts w:ascii="Arial" w:eastAsia="Arial" w:hAnsi="Arial" w:cs="Arial"/>
+          <w:color w:val="000000"/>
+          <w:highlight w:val="yellow"/>
+        </w:rPr>
+        <w:lastRenderedPageBreak/>
+        <w:t>garantizar la no discriminación y la protección de los derechos fundamentales, conforme al numeral 23.4 del citado artículo.</w:t>
       </w:r>
     </w:p>
     <w:p>
@@ -9040,7 +9109,6 @@
           <w:rFonts w:ascii="Arial" w:eastAsia="Arial" w:hAnsi="Arial" w:cs="Arial"/>
           <w:color w:val="000000"/>
         </w:rPr>
-        <w:lastRenderedPageBreak/>
         <w:t>6.2.4</w:t>
       </w:r>
       <w:r>
@@ -9452,6 +9520,7 @@
           <w:szCs w:val="24"/>
           <w:highlight w:val="cyan"/>
         </w:rPr>
+        <w:lastRenderedPageBreak/>
         <w:t>Del diseño, la operación y la seguridad de los SBIA</w:t>
       </w:r>
     </w:p>
@@ -9465,7 +9534,6 @@
         <w:rPr>
           <w:highlight w:val="yellow"/>
         </w:rPr>
-        <w:lastRenderedPageBreak/>
         <w:t>6.5</w:t>
       </w:r>
       <w:r>
@@ -9706,7 +9774,7 @@
           <w:color w:val="000000"/>
           <w:highlight w:val="lightGray"/>
         </w:rPr>
-        <w:t xml:space="preserve">6.5.7   La publicación del código fuente de los SBIA financiados con fondos públicos, con licencia libre o abierta en la Plataforma Nacional de Software Público Peruano (PNSSP), se sujeta a la determinación previa de su publicabilidad. Dicha determinación verifica que el código no revele información sujeta a reserva tributaria conforme al artículo 85 del TUO del Código Tributario, información protegida por confidencialidad aduanera, ni reglas de detección de riesgo cuya divulgación comprometa la función de control. La GA, con opinión de la INALI y de la Oficina de Seguridad Informática, determina la publicabilidad </w:t>
+        <w:t xml:space="preserve">6.5.7   La publicación del código fuente de los SBIA financiados con fondos públicos, con licencia libre o abierta en la Plataforma Nacional de Software Público Peruano (PNSSP), se sujeta a la determinación previa de su publicabilidad. Dicha determinación verifica que el código no revele información sujeta a reserva tributaria conforme al artículo 85 del TUO del Código Tributario, ni reglas de detección de riesgo cuya divulgación comprometa la función de control. La GA, con opinión de la INALI y de la Oficina de Seguridad Informática, </w:t>
       </w:r>
       <w:r>
         <w:rPr>
@@ -9715,7 +9783,7 @@
           <w:highlight w:val="lightGray"/>
         </w:rPr>
         <w:lastRenderedPageBreak/>
-        <w:t xml:space="preserve">antes de cada liberación mayor; la GDS ejecuta la publicación cuando corresponda. </w:t>
+        <w:t xml:space="preserve">determina la publicabilidad antes de cada liberación mayor; la GDS ejecuta la publicación cuando corresponda. </w:t>
       </w:r>
     </w:p>
     <w:p>
@@ -17468,7 +17536,27 @@
           <w:color w:val="000000"/>
           <w:highlight w:val="green"/>
         </w:rPr>
-        <w:t>Sección 2 — Problema y justificación:</w:t>
+        <w:t xml:space="preserve">Sección 2 — </w:t>
+      </w:r>
+      <w:r>
+        <w:rPr>
+          <w:rFonts w:ascii="Arial" w:eastAsia="Arial" w:hAnsi="Arial" w:cs="Arial"/>
+          <w:b/>
+          <w:bCs/>
+          <w:color w:val="000000"/>
+          <w:highlight w:val="green"/>
+        </w:rPr>
+        <w:t>Necesidad y pertinencia del uso de IA</w:t>
+      </w:r>
+      <w:r>
+        <w:rPr>
+          <w:rFonts w:ascii="Arial" w:eastAsia="Arial" w:hAnsi="Arial" w:cs="Arial"/>
+          <w:b/>
+          <w:bCs/>
+          <w:color w:val="000000"/>
+          <w:highlight w:val="green"/>
+        </w:rPr>
+        <w:t>:</w:t>
       </w:r>
     </w:p>
     <w:p>
@@ -17979,8 +18067,12 @@
     <w:p>
       <w:pPr>
         <w:pStyle w:val="Prrafodelista"/>
+        <w:numPr>
+          <w:ilvl w:val="0"/>
+          <w:numId w:val="35"/>
+        </w:numPr>
         <w:spacing w:before="120" w:after="40" w:line="276" w:lineRule="auto"/>
-        <w:ind w:left="426" w:firstLine="0"/>
+        <w:ind w:left="426"/>
         <w:rPr>
           <w:b w:val="0"/>
           <w:bCs w:val="0"/>
@@ -17988,6 +18080,34 @@
           <w:highlight w:val="green"/>
         </w:rPr>
       </w:pPr>
+      <w:r>
+        <w:rPr>
+          <w:b w:val="0"/>
+          <w:bCs w:val="0"/>
+          <w:color w:val="000000"/>
+          <w:highlight w:val="green"/>
+        </w:rPr>
+        <w:lastRenderedPageBreak/>
+        <w:t>Base legal que habilita el uso de dichos datos para la finalidad del SBIA, conforme al numeral 6.8.3</w:t>
+      </w:r>
+      <w:r>
+        <w:rPr>
+          <w:b w:val="0"/>
+          <w:bCs w:val="0"/>
+          <w:color w:val="000000"/>
+          <w:highlight w:val="green"/>
+        </w:rPr>
+        <w:t xml:space="preserve"> de la Directiva de IA</w:t>
+      </w:r>
+      <w:r>
+        <w:rPr>
+          <w:b w:val="0"/>
+          <w:bCs w:val="0"/>
+          <w:color w:val="000000"/>
+          <w:highlight w:val="green"/>
+        </w:rPr>
+        <w:t>, y restricciones aplicables.</w:t>
+      </w:r>
     </w:p>
     <w:p>
       <w:pPr>
@@ -18006,7 +18126,6 @@
           <w:color w:val="000000"/>
           <w:highlight w:val="green"/>
         </w:rPr>
-        <w:lastRenderedPageBreak/>
         <w:t xml:space="preserve">Sección 5 — </w:t>
       </w:r>
       <w:r>

</xml_diff>

<commit_message>
docs: ajuste de redaccion en la seccion de datos del Anexo N.° 4
- Anexo N.° 4 (Datos): afina la redaccion de los datos requeridos y corrige la autorreferencia ("de la Directiva de IA" -> "de la presente directiva") en la base legal del numeral 6.8.3
- Regenera el espejo de texto desde el .docx; 0 comentarios pendientes
</commit_message>
<xml_diff>
--- a/normativo/DIRECTIVA-GOBIERNO-IA.docx
+++ b/normativo/DIRECTIVA-GOBIERNO-IA.docx
@@ -18034,7 +18034,7 @@
           <w:color w:val="000000"/>
           <w:highlight w:val="green"/>
         </w:rPr>
-        <w:t>Datos requeridos: fuentes, tipos, presencia de datos personales, de información sujeta a</w:t>
+        <w:t>Datos requeridos: fuentes, tipos y presencia de datos personales o de información sujeta</w:t>
       </w:r>
       <w:r>
         <w:rPr>
@@ -18052,16 +18052,7 @@
           <w:color w:val="000000"/>
           <w:highlight w:val="green"/>
         </w:rPr>
-        <w:t>reserva tributaria</w:t>
-      </w:r>
-      <w:r>
-        <w:rPr>
-          <w:b w:val="0"/>
-          <w:bCs w:val="0"/>
-          <w:color w:val="000000"/>
-          <w:highlight w:val="green"/>
-        </w:rPr>
-        <w:t>.</w:t>
+        <w:t>a reserva tributaria.</w:t>
       </w:r>
     </w:p>
     <w:p>
@@ -18087,26 +18078,30 @@
           <w:color w:val="000000"/>
           <w:highlight w:val="green"/>
         </w:rPr>
+        <w:t>Base legal que habilita el uso de dichos datos para la finalidad del SBIA, conforme al</w:t>
+      </w:r>
+    </w:p>
+    <w:p>
+      <w:pPr>
+        <w:pStyle w:val="Prrafodelista"/>
+        <w:spacing w:before="120" w:after="40" w:line="276" w:lineRule="auto"/>
+        <w:ind w:left="426" w:firstLine="0"/>
+        <w:rPr>
+          <w:b w:val="0"/>
+          <w:bCs w:val="0"/>
+          <w:color w:val="000000"/>
+          <w:highlight w:val="green"/>
+        </w:rPr>
+      </w:pPr>
+      <w:r>
+        <w:rPr>
+          <w:b w:val="0"/>
+          <w:bCs w:val="0"/>
+          <w:color w:val="000000"/>
+          <w:highlight w:val="green"/>
+        </w:rPr>
         <w:lastRenderedPageBreak/>
-        <w:t>Base legal que habilita el uso de dichos datos para la finalidad del SBIA, conforme al numeral 6.8.3</w:t>
-      </w:r>
-      <w:r>
-        <w:rPr>
-          <w:b w:val="0"/>
-          <w:bCs w:val="0"/>
-          <w:color w:val="000000"/>
-          <w:highlight w:val="green"/>
-        </w:rPr>
-        <w:t xml:space="preserve"> de la Directiva de IA</w:t>
-      </w:r>
-      <w:r>
-        <w:rPr>
-          <w:b w:val="0"/>
-          <w:bCs w:val="0"/>
-          <w:color w:val="000000"/>
-          <w:highlight w:val="green"/>
-        </w:rPr>
-        <w:t>, y restricciones aplicables.</w:t>
+        <w:t>numeral 6.8.3 de la presente directiva, y restricciones aplicables.</w:t>
       </w:r>
     </w:p>
     <w:p>

</xml_diff>

<commit_message>
docs: introduce la periodicidad del red teaming y corrige erratas de formato en glosario, 6.11.2 y Anexo N.° 1
- 6.7.2 / 6.10.3: el red teaming de SBIA de riesgo alto es previo al despliegue y se repite con la periodicidad que establezca el documento normativo del numeral 6.7.7
- 6.11.1: acota la prohibicion de ingresar reserva tributaria o datos personales a las herramientas cuyo ambito de uso autorizado en el catalogo no comprenda ese tratamiento
- 6.11.2: reincorpora la frase de encabezado del catalogo y corrige el doble punto tras el numeral 6.7.3
- Glosario: corrige el rotulo duplicado en la definicion de Controles de contencion (Guardrails)
- Corrige erratas: "monitoreo continuo" (6.10.1) y "ultimo cambio" (Anexo N.° 1, campo 18)
- Regenera el espejo de texto desde el .docx; 0 comentarios pendientes
</commit_message>
<xml_diff>
--- a/normativo/DIRECTIVA-GOBIERNO-IA.docx
+++ b/normativo/DIRECTIVA-GOBIERNO-IA.docx
@@ -3298,7 +3298,7 @@
           <w:color w:val="000000"/>
           <w:highlight w:val="green"/>
         </w:rPr>
-        <w:t xml:space="preserve">Controles de contención (Guardrails): Conjunto de controles, reglas y mecanismos técnicos que limitan, filtran o validan las entradas y salidas de un SBIA para prevenir, detectar y restringir comportamientos no autorizados o inseguros. Comprenden, entre otros, la validación de entradas, el filtrado de salidas, la protección frente a ataques adversarios y la prevención de la divulgación no autorizada de información. </w:t>
+        <w:t xml:space="preserve">Conjunto de controles, reglas y mecanismos técnicos que limitan, filtran o validan las entradas y salidas de un SBIA para prevenir, detectar y restringir comportamientos no autorizados o inseguros. Comprenden, entre otros, la validación de entradas, el filtrado de salidas, la protección frente a ataques adversarios y la prevención de la divulgación no autorizada de información. </w:t>
       </w:r>
       <w:r>
         <w:rPr>
@@ -10367,7 +10367,31 @@
           <w:highlight w:val="yellow"/>
         </w:rPr>
         <w:tab/>
-        <w:t>Para SBIA de riesgo alto y de riesgo aceptable-limitado se requiere como mínimo: controles de contención (guardrails) de entrada y salida; controles de acceso basados en roles (RBAC); registro inmutable de auditoría (logs) de todas las interacciones; evaluación de vulnerabilidades conforme al OWASP Top 10 para aplicaciones LLM; red teaming previo al despliegue de SBIA de riesgo alto; y anonimización o seudonimización de datos personales antes del procesamiento. Estos controles constituyen medidas de seguridad digital conforme al artículo 29 del RLIA y se implementan aplicando la NTP-ISO/IEC 27002 y la NTP-ISO 31000 vigentes, complementadas con mejores prácticas de seguridad para IA, conforme a la Sexta Disposición Complementaria Final del RLIA.</w:t>
+        <w:t>Para SBIA de riesgo alto y de riesgo aceptable-limitado se requiere como mínimo: controles de contención (guardrails) de entrada y salida; controles de acceso basados en roles (RBAC); registro inmutable de auditoría (logs) de todas las interacciones; evaluación de vulnerabilidades conforme al OWASP Top 10 para aplicaciones LLM;</w:t>
+      </w:r>
+      <w:r>
+        <w:rPr>
+          <w:rFonts w:ascii="Arial" w:eastAsia="Arial" w:hAnsi="Arial" w:cs="Arial"/>
+          <w:color w:val="000000"/>
+          <w:highlight w:val="green"/>
+        </w:rPr>
+        <w:t xml:space="preserve"> </w:t>
+      </w:r>
+      <w:r>
+        <w:rPr>
+          <w:rFonts w:ascii="Arial" w:eastAsia="Arial" w:hAnsi="Arial" w:cs="Arial"/>
+          <w:color w:val="000000"/>
+          <w:highlight w:val="green"/>
+        </w:rPr>
+        <w:t>red teaming de los SBIA de riesgo alto, previo a su despliegue y con la periodicidad que establezca el documento normativo del numeral 6.7.7</w:t>
+      </w:r>
+      <w:r>
+        <w:rPr>
+          <w:rFonts w:ascii="Arial" w:eastAsia="Arial" w:hAnsi="Arial" w:cs="Arial"/>
+          <w:color w:val="000000"/>
+          <w:highlight w:val="yellow"/>
+        </w:rPr>
+        <w:t>; y anonimización o seudonimización de datos personales antes del procesamiento. Estos controles constituyen medidas de seguridad digital conforme al artículo 29 del RLIA y se implementan aplicando la NTP-ISO/IEC 27002 y la NTP-ISO 31000 vigentes, complementadas con mejores prácticas de seguridad para IA, conforme a la Sexta Disposición Complementaria Final del RLIA.</w:t>
       </w:r>
     </w:p>
     <w:p>
@@ -11185,6 +11209,7 @@
         </w:rPr>
         <w:t xml:space="preserve">Riesgo alto: monitoreo </w:t>
       </w:r>
+      <w:proofErr w:type="gramStart"/>
       <w:r>
         <w:rPr>
           <w:b w:val="0"/>
@@ -11192,7 +11217,7 @@
           <w:color w:val="000000"/>
           <w:highlight w:val="yellow"/>
         </w:rPr>
-        <w:t>continúo</w:t>
+        <w:t>contin</w:t>
       </w:r>
       <w:r>
         <w:rPr>
@@ -11201,7 +11226,26 @@
           <w:color w:val="000000"/>
           <w:highlight w:val="yellow"/>
         </w:rPr>
-        <w:t xml:space="preserve"> automatizado con revisión humana semanal y revisión integral trimestral.</w:t>
+        <w:t>uo</w:t>
+      </w:r>
+      <w:proofErr w:type="gramEnd"/>
+      <w:r>
+        <w:rPr>
+          <w:b w:val="0"/>
+          <w:bCs w:val="0"/>
+          <w:color w:val="000000"/>
+          <w:highlight w:val="yellow"/>
+        </w:rPr>
+        <w:t xml:space="preserve"> </w:t>
+      </w:r>
+      <w:r>
+        <w:rPr>
+          <w:b w:val="0"/>
+          <w:bCs w:val="0"/>
+          <w:color w:val="000000"/>
+          <w:highlight w:val="yellow"/>
+        </w:rPr>
+        <w:t>automatizado con revisión humana semanal y revisión integral trimestral.</w:t>
       </w:r>
     </w:p>
     <w:p>
@@ -11331,7 +11375,23 @@
           <w:highlight w:val="green"/>
         </w:rPr>
         <w:lastRenderedPageBreak/>
-        <w:t>calidad, del análisis de riesgo, las pruebas de vulnerabilidad y el red teaming previstos en el numeral 6.7.2, con anterioridad a la implementación del SBIA, y del monitoreo del numeral 6.10, que comprende los indicadores de sesgo del numeral 6.10.2 y las medidas del numeral 6.6.4, durante toda su operación. Los resultados de estas actividades alimentan el informe trimestral de la Comisión de Gobierno de IA al CGTD.</w:t>
+        <w:t xml:space="preserve">calidad, del análisis de riesgo, las pruebas de vulnerabilidad </w:t>
+      </w:r>
+      <w:r>
+        <w:rPr>
+          <w:rFonts w:ascii="Arial" w:eastAsia="Arial" w:hAnsi="Arial" w:cs="Arial"/>
+          <w:color w:val="000000"/>
+          <w:highlight w:val="green"/>
+        </w:rPr>
+        <w:t>y el red teaming previstos en el numeral 6.7.2, con anterioridad a la implementación del SBIA y con la periodicidad prevista en el mismo numeral, y del monitoreo del numeral 6.10</w:t>
+      </w:r>
+      <w:r>
+        <w:rPr>
+          <w:rFonts w:ascii="Arial" w:eastAsia="Arial" w:hAnsi="Arial" w:cs="Arial"/>
+          <w:color w:val="000000"/>
+          <w:highlight w:val="green"/>
+        </w:rPr>
+        <w:t>, que comprende los indicadores de sesgo del numeral 6.10.2 y las medidas del numeral 6.6.4, durante toda su operación. Los resultados de estas actividades alimentan el informe trimestral de la Comisión de Gobierno de IA al CGTD.</w:t>
       </w:r>
     </w:p>
     <w:p>
@@ -11503,21 +11563,22 @@
           <w:ilvl w:val="0"/>
           <w:numId w:val="5"/>
         </w:numPr>
-        <w:spacing w:before="0" w:after="40" w:line="276" w:lineRule="auto"/>
+        <w:spacing w:after="40" w:line="276" w:lineRule="auto"/>
         <w:ind w:left="1701"/>
         <w:rPr>
           <w:b w:val="0"/>
           <w:bCs w:val="0"/>
-        </w:rPr>
-      </w:pPr>
-      <w:r>
-        <w:rPr>
-          <w:b w:val="0"/>
-          <w:bCs w:val="0"/>
-          <w:color w:val="000000"/>
-          <w:highlight w:val="cyan"/>
-        </w:rPr>
-        <w:t>No ingresar información sujeta a reserva tributaria ni datos personales de contribuyentes u operadores aduaneros en herramientas de IA que no estén autorizadas para ese tratamiento en el catálogo institucional. El catálogo indica, para cada herramienta, los tipos de información que puede procesar. El tratamiento de información sujeta a reserva tributaria se rige por el numeral 6.7.3.</w:t>
+          <w:highlight w:val="green"/>
+        </w:rPr>
+      </w:pPr>
+      <w:r>
+        <w:rPr>
+          <w:b w:val="0"/>
+          <w:bCs w:val="0"/>
+          <w:color w:val="000000"/>
+          <w:highlight w:val="green"/>
+        </w:rPr>
+        <w:t>No ingresar información sujeta a reserva tributaria ni datos personales de contribuyentes u operadores aduaneros en herramientas de IA cuyo ámbito de uso autorizado en el catálogo institucional no comprenda ese tratamiento. El tratamiento de información sujeta a reserva tributaria se rige, además, por el numeral 6.7.3.</w:t>
       </w:r>
     </w:p>
     <w:p>
@@ -11645,7 +11706,7 @@
           <w:color w:val="000000"/>
           <w:highlight w:val="green"/>
         </w:rPr>
-        <w:t xml:space="preserve">El catálogo precisa, para cada herramienta, el ámbito de uso autorizado (uso administrativo general o uso restringido) y si se encuentra desplegada en </w:t>
+        <w:t xml:space="preserve">El catálogo de herramientas de IA autorizadas para uso institucional registra las herramientas aprobadas conforme al numeral 6.11.5. El catálogo precisa, </w:t>
       </w:r>
       <w:r>
         <w:rPr>
@@ -11654,33 +11715,7 @@
           <w:highlight w:val="green"/>
         </w:rPr>
         <w:lastRenderedPageBreak/>
-        <w:t>infraestructura bajo control de la SUNAT. Solo las herramientas desplegadas en dicha infraestructura pueden emplearse con información sujeta a reserva tributaria, conforme al numeral 6.7.</w:t>
-      </w:r>
-      <w:proofErr w:type="gramStart"/>
-      <w:r>
-        <w:rPr>
-          <w:rFonts w:ascii="Arial" w:eastAsia="Arial" w:hAnsi="Arial" w:cs="Arial"/>
-          <w:color w:val="000000"/>
-          <w:highlight w:val="green"/>
-        </w:rPr>
-        <w:t>3.</w:t>
-      </w:r>
-      <w:r>
-        <w:rPr>
-          <w:rFonts w:ascii="Arial" w:eastAsia="Arial" w:hAnsi="Arial" w:cs="Arial"/>
-          <w:color w:val="000000"/>
-          <w:highlight w:val="green"/>
-        </w:rPr>
-        <w:t>.</w:t>
-      </w:r>
-      <w:proofErr w:type="gramEnd"/>
-      <w:r>
-        <w:rPr>
-          <w:rFonts w:ascii="Arial" w:eastAsia="Arial" w:hAnsi="Arial" w:cs="Arial"/>
-          <w:color w:val="000000"/>
-          <w:highlight w:val="green"/>
-        </w:rPr>
-        <w:t xml:space="preserve"> La INSI lo publica y lo mantiene actualizado.</w:t>
+        <w:t>para cada herramienta, el ámbito de uso autorizado (uso administrativo general o uso restringido) y si se encuentra desplegada en infraestructura bajo control de la SUNAT. Solo las herramientas desplegadas en dicha infraestructura pueden emplearse con información sujeta a reserva tributaria, conforme al numeral 6.7.3. La INSI lo publica y lo mantiene actualizado.</w:t>
       </w:r>
     </w:p>
     <w:p>
@@ -11864,6 +11899,7 @@
           <w:rFonts w:ascii="Arial" w:eastAsia="Arial" w:hAnsi="Arial" w:cs="Arial"/>
           <w:color w:val="000000"/>
         </w:rPr>
+        <w:lastRenderedPageBreak/>
         <w:t>6.12.3</w:t>
       </w:r>
       <w:r>
@@ -11891,7 +11927,6 @@
           <w:color w:val="000000"/>
           <w:highlight w:val="yellow"/>
         </w:rPr>
-        <w:lastRenderedPageBreak/>
         <w:t>6.12.4</w:t>
       </w:r>
       <w:r>
@@ -15882,7 +15917,23 @@
                 <w:b/>
                 <w:bCs/>
               </w:rPr>
-              <w:t>Versión vigente y ultimo cambio</w:t>
+              <w:t xml:space="preserve">Versión vigente y </w:t>
+            </w:r>
+            <w:r>
+              <w:rPr>
+                <w:rFonts w:ascii="Arial" w:eastAsia="Arial" w:hAnsi="Arial" w:cs="Arial"/>
+                <w:b/>
+                <w:bCs/>
+              </w:rPr>
+              <w:t>ú</w:t>
+            </w:r>
+            <w:r>
+              <w:rPr>
+                <w:rFonts w:ascii="Arial" w:eastAsia="Arial" w:hAnsi="Arial" w:cs="Arial"/>
+                <w:b/>
+                <w:bCs/>
+              </w:rPr>
+              <w:t>ltimo cambio</w:t>
             </w:r>
           </w:p>
         </w:tc>

</xml_diff>

<commit_message>
docs: precisa la aplicabilidad del SGSI a los SBIA en el numeral 6.7.1
- 6.7.1: aclara que la Politica (SGSI-PO-01) y el Manual (SGSI-MA-03) aplican a todo colaborador y tercero vinculado que gestione informacion de la institucion; los demas documentos y lineamientos del SGSI son exigibles cuando el SBIA soporte un proceso comprendido en el alcance de dicho Sistema
- Regenera el espejo de texto desde el .docx; 0 comentarios pendientes
</commit_message>
<xml_diff>
--- a/normativo/DIRECTIVA-GOBIERNO-IA.docx
+++ b/normativo/DIRECTIVA-GOBIERNO-IA.docx
@@ -10392,7 +10392,7 @@
         <w:rPr>
           <w:rFonts w:ascii="Arial" w:eastAsia="Arial" w:hAnsi="Arial" w:cs="Arial"/>
           <w:color w:val="000000"/>
-          <w:highlight w:val="cyan"/>
+          <w:highlight w:val="green"/>
         </w:rPr>
         <w:t>6.7.1</w:t>
       </w:r>
@@ -10400,17 +10400,35 @@
         <w:rPr>
           <w:rFonts w:ascii="Arial" w:eastAsia="Arial" w:hAnsi="Arial" w:cs="Arial"/>
           <w:color w:val="000000"/>
-          <w:highlight w:val="cyan"/>
+          <w:highlight w:val="green"/>
         </w:rPr>
         <w:tab/>
-        <w:t>Los SBIA cumplen la Política de Seguridad de la Información (SGSI-PO-01) y el Manual de Políticas del Sistema de Gestión de Seguridad de la Información (SGSI-MA-03) de la SUNAT, así como los demás documentos normativos y lineamientos de dicho Sistema de Gestión, en sus versiones vigentes</w:t>
-      </w:r>
-      <w:r>
-        <w:rPr>
-          <w:rFonts w:ascii="Arial" w:eastAsia="Arial" w:hAnsi="Arial" w:cs="Arial"/>
-          <w:color w:val="000000"/>
-        </w:rPr>
-        <w:t>.</w:t>
+      </w:r>
+      <w:r>
+        <w:rPr>
+          <w:rFonts w:ascii="Arial" w:eastAsia="Arial" w:hAnsi="Arial" w:cs="Arial"/>
+          <w:color w:val="000000"/>
+          <w:highlight w:val="green"/>
+        </w:rPr>
+        <w:t xml:space="preserve">Los SBIA cumplen la Política de Seguridad de la Información (SGSI-PO-01) y el Manual de Políticas del Sistema de Gestión de Seguridad de la Información (SGSI-MA-03) de la SUNAT, en sus versiones vigentes, que </w:t>
+      </w:r>
+      <w:proofErr w:type="gramStart"/>
+      <w:r>
+        <w:rPr>
+          <w:rFonts w:ascii="Arial" w:eastAsia="Arial" w:hAnsi="Arial" w:cs="Arial"/>
+          <w:color w:val="000000"/>
+          <w:highlight w:val="green"/>
+        </w:rPr>
+        <w:t>son de aplicación</w:t>
+      </w:r>
+      <w:proofErr w:type="gramEnd"/>
+      <w:r>
+        <w:rPr>
+          <w:rFonts w:ascii="Arial" w:eastAsia="Arial" w:hAnsi="Arial" w:cs="Arial"/>
+          <w:color w:val="000000"/>
+          <w:highlight w:val="green"/>
+        </w:rPr>
+        <w:t xml:space="preserve"> a todo colaborador y tercero vinculado que gestione información de la institución. Cuando un SBIA soporte un proceso comprendido en el alcance del Sistema de Gestión de Seguridad de la Información, le son exigibles además los demás documentos normativos y lineamientos de dicho Sistema.</w:t>
       </w:r>
     </w:p>
     <w:p>
@@ -10438,7 +10456,16 @@
           <w:highlight w:val="yellow"/>
         </w:rPr>
         <w:tab/>
-        <w:t>Para SBIA de riesgo alto y de riesgo aceptable-limitado se requiere como mínimo: controles de contención (guardrails) de entrada y salida; controles de acceso basados en roles (RBAC); registro inmutable de auditoría (logs) de todas las interacciones; evaluación de vulnerabilidades conforme al OWASP Top 10 para aplicaciones LLM;</w:t>
+        <w:t xml:space="preserve">Para SBIA de riesgo alto y de riesgo aceptable-limitado se requiere como mínimo: controles de contención (guardrails) de entrada y salida; controles de acceso basados en roles (RBAC); registro inmutable de auditoría (logs) de </w:t>
+      </w:r>
+      <w:r>
+        <w:rPr>
+          <w:rFonts w:ascii="Arial" w:eastAsia="Arial" w:hAnsi="Arial" w:cs="Arial"/>
+          <w:color w:val="000000"/>
+          <w:highlight w:val="yellow"/>
+        </w:rPr>
+        <w:lastRenderedPageBreak/>
+        <w:t>todas las interacciones; evaluación de vulnerabilidades conforme al OWASP Top 10 para aplicaciones LLM;</w:t>
       </w:r>
       <w:r>
         <w:rPr>
@@ -10454,16 +10481,7 @@
           <w:color w:val="000000"/>
           <w:highlight w:val="green"/>
         </w:rPr>
-        <w:t xml:space="preserve">red teaming de los SBIA de riesgo alto, previo a su despliegue y con la periodicidad que establezca el documento normativo </w:t>
-      </w:r>
-      <w:r>
-        <w:rPr>
-          <w:rFonts w:ascii="Arial" w:eastAsia="Arial" w:hAnsi="Arial" w:cs="Arial"/>
-          <w:color w:val="000000"/>
-          <w:highlight w:val="green"/>
-        </w:rPr>
-        <w:lastRenderedPageBreak/>
-        <w:t>del numeral 6.7.7</w:t>
+        <w:t>red teaming de los SBIA de riesgo alto, previo a su despliegue y con la periodicidad que establezca el documento normativo del numeral 6.7.7</w:t>
       </w:r>
       <w:r>
         <w:rPr>
@@ -10616,7 +10634,16 @@
           <w:color w:val="000000"/>
           <w:highlight w:val="yellow"/>
         </w:rPr>
-        <w:t xml:space="preserve"> y actúa como enlace con la Autoridad Nacional de Protección de Datos Personales. Emite opinión sobre el tratamiento de datos personales en los casos de uso de SBIA y en la EIA, cuando corresponda.</w:t>
+        <w:t xml:space="preserve"> y actúa como enlace con la Autoridad Nacional de Protección </w:t>
+      </w:r>
+      <w:r>
+        <w:rPr>
+          <w:rFonts w:ascii="Arial" w:eastAsia="Arial" w:hAnsi="Arial" w:cs="Arial"/>
+          <w:color w:val="000000"/>
+          <w:highlight w:val="yellow"/>
+        </w:rPr>
+        <w:lastRenderedPageBreak/>
+        <w:t>de Datos Personales. Emite opinión sobre el tratamiento de datos personales en los casos de uso de SBIA y en la EIA, cuando corresponda.</w:t>
       </w:r>
     </w:p>
     <w:p>
@@ -10644,16 +10671,7 @@
           <w:highlight w:val="cyan"/>
         </w:rPr>
         <w:tab/>
-        <w:t xml:space="preserve">La Oficina de Seguridad Informática elabora y propone el documento normativo de seguridad informática para SBIA que desarrolla la forma de implementar y </w:t>
-      </w:r>
-      <w:r>
-        <w:rPr>
-          <w:rFonts w:ascii="Arial" w:eastAsia="Arial" w:hAnsi="Arial" w:cs="Arial"/>
-          <w:color w:val="000000"/>
-          <w:highlight w:val="cyan"/>
-        </w:rPr>
-        <w:lastRenderedPageBreak/>
-        <w:t>verificar los controles del numeral 6.7.2, conforme al artículo 106, literales a) y b), del ROF. En tanto no se apruebe, los SBIA observan los controles mínimos del referido numeral.</w:t>
+        <w:t>La Oficina de Seguridad Informática elabora y propone el documento normativo de seguridad informática para SBIA que desarrolla la forma de implementar y verificar los controles del numeral 6.7.2, conforme al artículo 106, literales a) y b), del ROF. En tanto no se apruebe, los SBIA observan los controles mínimos del referido numeral.</w:t>
       </w:r>
     </w:p>
     <w:p>
@@ -10915,16 +10933,8 @@
           <w:color w:val="000000"/>
           <w:highlight w:val="lightGray"/>
         </w:rPr>
-        <w:t xml:space="preserve">6.8.5   Los conjuntos de datos que la SUNAT genere o administre y que califiquen como datos de alto valor se ponen a disposición a través del Centro Nacional de Datos (CND), previa determinación de su publicabilidad conforme al artículo 85 del TUO del Código Tributario y a la normativa de protección de datos </w:t>
-      </w:r>
-      <w:r>
-        <w:rPr>
-          <w:rFonts w:ascii="Arial" w:eastAsia="Arial" w:hAnsi="Arial" w:cs="Arial"/>
-          <w:color w:val="000000"/>
-          <w:highlight w:val="lightGray"/>
-        </w:rPr>
         <w:lastRenderedPageBreak/>
-        <w:t>personales. El OGD identifica los conjuntos candidatos y propone al CGTD su publicación.</w:t>
+        <w:t>6.8.5   Los conjuntos de datos que la SUNAT genere o administre y que califiquen como datos de alto valor se ponen a disposición a través del Centro Nacional de Datos (CND), previa determinación de su publicabilidad conforme al artículo 85 del TUO del Código Tributario y a la normativa de protección de datos personales. El OGD identifica los conjuntos candidatos y propone al CGTD su publicación.</w:t>
       </w:r>
     </w:p>
     <w:p>
@@ -11189,6 +11199,7 @@
           <w:color w:val="000000"/>
           <w:highlight w:val="yellow"/>
         </w:rPr>
+        <w:lastRenderedPageBreak/>
         <w:t>6.9.6</w:t>
       </w:r>
       <w:r>
@@ -11198,16 +11209,7 @@
           <w:highlight w:val="yellow"/>
         </w:rPr>
         <w:tab/>
-        <w:t xml:space="preserve">El CGTD presenta un informe anual a la SN sobre el estado del gobierno de IA institucional, en ejercicio de su responsabilidad de liderar, dirigir, evaluar y </w:t>
-      </w:r>
-      <w:r>
-        <w:rPr>
-          <w:rFonts w:ascii="Arial" w:eastAsia="Arial" w:hAnsi="Arial" w:cs="Arial"/>
-          <w:color w:val="000000"/>
-          <w:highlight w:val="yellow"/>
-        </w:rPr>
-        <w:lastRenderedPageBreak/>
-        <w:t>supervisar los proyectos de SBIA estratégicos</w:t>
+        <w:t>El CGTD presenta un informe anual a la SN sobre el estado del gobierno de IA institucional, en ejercicio de su responsabilidad de liderar, dirigir, evaluar y supervisar los proyectos de SBIA estratégicos</w:t>
       </w:r>
       <w:r>
         <w:rPr>
@@ -11508,15 +11510,7 @@
           <w:color w:val="000000"/>
           <w:highlight w:val="green"/>
         </w:rPr>
-        <w:t xml:space="preserve">El análisis de riesgo y las pruebas de vulnerabilidad sobre la arquitectura de aplicaciones, de información y de infraestructura tecnológica que soporta cada SBIA corresponden a la Oficina de Seguridad Informática, conforme al literal b) del artículo 106 del ROF y a la etapa de certificación y validación del numeral 6.1.1. La obligación de auditorías de seguridad digital del literal c) del artículo 29 del RLIA se satisface con la concurrencia de la verificación y validación de calidad, del análisis de riesgo, las pruebas de vulnerabilidad </w:t>
-      </w:r>
-      <w:r>
-        <w:rPr>
-          <w:rFonts w:ascii="Arial" w:eastAsia="Arial" w:hAnsi="Arial" w:cs="Arial"/>
-          <w:color w:val="000000"/>
-          <w:highlight w:val="green"/>
-        </w:rPr>
-        <w:t xml:space="preserve">y el red teaming previstos en el numeral 6.7.2, con anterioridad a la implementación del SBIA y </w:t>
+        <w:t xml:space="preserve">El análisis de riesgo y las pruebas de vulnerabilidad sobre la arquitectura de aplicaciones, de información y de infraestructura tecnológica que soporta cada SBIA corresponden a la Oficina de Seguridad Informática, conforme al literal b) del artículo 106 del ROF y a la etapa de certificación y validación del numeral 6.1.1. La obligación de auditorías de seguridad digital del literal c) del artículo 29 del RLIA se satisface con la concurrencia de la verificación y validación de </w:t>
       </w:r>
       <w:r>
         <w:rPr>
@@ -11525,7 +11519,15 @@
           <w:highlight w:val="green"/>
         </w:rPr>
         <w:lastRenderedPageBreak/>
-        <w:t>con la periodicidad prevista en el mismo numeral, y del monitoreo del numeral 6.10</w:t>
+        <w:t xml:space="preserve">calidad, del análisis de riesgo, las pruebas de vulnerabilidad </w:t>
+      </w:r>
+      <w:r>
+        <w:rPr>
+          <w:rFonts w:ascii="Arial" w:eastAsia="Arial" w:hAnsi="Arial" w:cs="Arial"/>
+          <w:color w:val="000000"/>
+          <w:highlight w:val="green"/>
+        </w:rPr>
+        <w:t>y el red teaming previstos en el numeral 6.7.2, con anterioridad a la implementación del SBIA y con la periodicidad prevista en el mismo numeral, y del monitoreo del numeral 6.10</w:t>
       </w:r>
       <w:r>
         <w:rPr>
@@ -11848,7 +11850,7 @@
           <w:color w:val="000000"/>
           <w:highlight w:val="green"/>
         </w:rPr>
-        <w:t xml:space="preserve">El catálogo de herramientas de IA autorizadas para uso institucional registra las herramientas aprobadas conforme al numeral 6.11.5. El catálogo precisa, para cada herramienta, el ámbito de uso autorizado (uso administrativo general o uso restringido) y si se encuentra desplegada en infraestructura bajo control </w:t>
+        <w:t xml:space="preserve">El catálogo de herramientas de IA autorizadas para uso institucional registra las herramientas aprobadas conforme al numeral 6.11.5. El catálogo precisa, </w:t>
       </w:r>
       <w:r>
         <w:rPr>
@@ -11857,7 +11859,7 @@
           <w:highlight w:val="green"/>
         </w:rPr>
         <w:lastRenderedPageBreak/>
-        <w:t>de la SUNAT. Solo las herramientas desplegadas en dicha infraestructura pueden emplearse con información sujeta a reserva tributaria, conforme al numeral 6.7.3. La INSI lo publica y lo mantiene actualizado.</w:t>
+        <w:t>para cada herramienta, el ámbito de uso autorizado (uso administrativo general o uso restringido) y si se encuentra desplegada en infraestructura bajo control de la SUNAT. Solo las herramientas desplegadas en dicha infraestructura pueden emplearse con información sujeta a reserva tributaria, conforme al numeral 6.7.3. La INSI lo publica y lo mantiene actualizado.</w:t>
       </w:r>
     </w:p>
     <w:p>
@@ -12023,7 +12025,7 @@
           <w:highlight w:val="green"/>
         </w:rPr>
         <w:tab/>
-        <w:t xml:space="preserve">Los contratos incluyen cláusulas sobre: (a) protección de datos y reserva tributaria; (b) transparencia del modelo; (c) comunicación de vulnerabilidades e incidentes; (d) derecho de auditoría, incluida la realización de auditorías éticas y de sesgo sobre el modelo; (e) transferencia de conocimiento; (f) cumplimiento de estándares técnicos; (g) la prohibición de que el proveedor emplee la información institucional, las instrucciones que se le remitan y los resultados derivados de su tratamiento para el entrenamiento o el ajuste de sus propios modelos; y (h) la identificación de los subprocesadores autorizados y las condiciones de recuperación de la información institucional a la conclusión del </w:t>
+        <w:t xml:space="preserve">Los contratos incluyen cláusulas sobre: (a) protección de datos y reserva tributaria; (b) transparencia del modelo; (c) comunicación de vulnerabilidades e incidentes; (d) derecho de auditoría, incluida la realización de auditorías éticas y de sesgo sobre el modelo; (e) transferencia de conocimiento; (f) cumplimiento de estándares técnicos; (g) la prohibición de que el proveedor emplee la información institucional, las instrucciones que se le remitan y los resultados derivados de su tratamiento para el entrenamiento o el ajuste de sus propios modelos; y (h) la identificación de los subprocesadores autorizados y las </w:t>
       </w:r>
       <w:r>
         <w:rPr>
@@ -12032,7 +12034,7 @@
           <w:highlight w:val="green"/>
         </w:rPr>
         <w:lastRenderedPageBreak/>
-        <w:t>contrato. El plazo de notificación de vulnerabilidades se define en los TDR o EETT de cada contratación, según la criticidad del SBIA</w:t>
+        <w:t>condiciones de recuperación de la información institucional a la conclusión del contrato. El plazo de notificación de vulnerabilidades se define en los TDR o EETT de cada contratación, según la criticidad del SBIA</w:t>
       </w:r>
       <w:r>
         <w:rPr>

</xml_diff>

<commit_message>
docs: precisa la potestad normativa de la GA en arquitectura (6.5.3) y consolida la prohibicion de uso para entrenamiento en 6.12.4
- 6.5.3: la GA emite estandares, modelos de referencia, patrones y demas documentos tecnicos de arquitectura para los SBIA (art. 130 lit. a y c del ROF); los que establezcan obligaciones exigibles a las unidades se aprueban como documento normativo institucional conforme al numeral 7.6
- 6.12.2: retira la clausula (g) de prohibicion de uso para entrenamiento (se consolida en 6.12.4); la identificacion de subprocesadores pasa a ser la clausula (g)
- 6.12.4: amplia la prohibicion para que alcance tambien las instrucciones remitidas al proveedor y los resultados derivados de su tratamiento
- Regenera el espejo de texto desde el .docx; 0 comentarios pendientes
</commit_message>
<xml_diff>
--- a/normativo/DIRECTIVA-GOBIERNO-IA.docx
+++ b/normativo/DIRECTIVA-GOBIERNO-IA.docx
@@ -9787,48 +9787,40 @@
         <w:rPr>
           <w:rFonts w:ascii="Arial" w:eastAsia="Arial" w:hAnsi="Arial" w:cs="Arial"/>
           <w:color w:val="000000"/>
-          <w:highlight w:val="lightGray"/>
-        </w:rPr>
-      </w:pPr>
-      <w:r>
-        <w:rPr>
-          <w:rFonts w:ascii="Arial" w:eastAsia="Arial" w:hAnsi="Arial" w:cs="Arial"/>
-          <w:color w:val="000000"/>
-          <w:highlight w:val="lightGray"/>
-        </w:rPr>
-        <w:t xml:space="preserve">6.5.3    El diseño de la arquitectura de los SBIA observa los Principios de Arquitectura (AAT.PRAQ.01) y los Lineamientos de Arquitectura (LAT.LIAQ.01) de la SUNAT, en sus versiones vigentes, en lo que corresponda a su naturaleza. La GA adecua dichos instrumentos y los estándares de arquitectura de su competencia para incorporar los requisitos propios de los SBIA </w:t>
-      </w:r>
-      <w:r>
-        <w:rPr>
-          <w:rFonts w:ascii="Arial" w:eastAsia="Arial" w:hAnsi="Arial" w:cs="Arial"/>
-          <w:color w:val="000000"/>
-          <w:highlight w:val="lightGray"/>
-        </w:rPr>
-        <w:t>(</w:t>
-      </w:r>
-      <w:r>
-        <w:rPr>
-          <w:rFonts w:ascii="Arial" w:eastAsia="Arial" w:hAnsi="Arial" w:cs="Arial"/>
-          <w:color w:val="000000"/>
-          <w:highlight w:val="lightGray"/>
-        </w:rPr>
-        <w:t>modelos, conjuntos de datos, componentes generativos y agenticos, e infraestructura especializada</w:t>
-      </w:r>
-      <w:r>
-        <w:rPr>
-          <w:rFonts w:ascii="Arial" w:eastAsia="Arial" w:hAnsi="Arial" w:cs="Arial"/>
-          <w:color w:val="000000"/>
-          <w:highlight w:val="lightGray"/>
-        </w:rPr>
-        <w:t>),</w:t>
-      </w:r>
-      <w:r>
-        <w:rPr>
-          <w:rFonts w:ascii="Arial" w:eastAsia="Arial" w:hAnsi="Arial" w:cs="Arial"/>
-          <w:color w:val="000000"/>
-          <w:highlight w:val="lightGray"/>
-        </w:rPr>
-        <w:t xml:space="preserve"> conforme al literal c) del artículo 130 del ROF, y los aprueba mediante el documento normativo institucional que corresponda según la METDONI.</w:t>
+        </w:rPr>
+      </w:pPr>
+      <w:r>
+        <w:rPr>
+          <w:rFonts w:ascii="Arial" w:eastAsia="Arial" w:hAnsi="Arial" w:cs="Arial"/>
+          <w:color w:val="000000"/>
+          <w:highlight w:val="green"/>
+        </w:rPr>
+        <w:t>6.5.3</w:t>
+      </w:r>
+      <w:r>
+        <w:rPr>
+          <w:rFonts w:ascii="Arial" w:eastAsia="Arial" w:hAnsi="Arial" w:cs="Arial"/>
+          <w:color w:val="000000"/>
+          <w:highlight w:val="green"/>
+        </w:rPr>
+        <w:tab/>
+        <w:t xml:space="preserve">El diseño de la arquitectura de los SBIA observa los Principios de Arquitectura (AAT.PRAQ.01) y los Lineamientos de Arquitectura (LAT.LIAQ.01) de la SUNAT, en sus versiones vigentes, en lo que corresponda a su naturaleza. La GA adecua dichos instrumentos y emite los estándares, modelos de referencia, patrones y demás documentos técnicos de arquitectura necesarios para incorporar los requisitos propios de los SBIA (modelos, conjuntos de datos, componentes generativos y </w:t>
+      </w:r>
+      <w:r>
+        <w:rPr>
+          <w:rFonts w:ascii="Arial" w:eastAsia="Arial" w:hAnsi="Arial" w:cs="Arial"/>
+          <w:color w:val="000000"/>
+          <w:highlight w:val="green"/>
+        </w:rPr>
+        <w:t>agenticos</w:t>
+      </w:r>
+      <w:r>
+        <w:rPr>
+          <w:rFonts w:ascii="Arial" w:eastAsia="Arial" w:hAnsi="Arial" w:cs="Arial"/>
+          <w:color w:val="000000"/>
+          <w:highlight w:val="green"/>
+        </w:rPr>
+        <w:t>, e infraestructura especializada), en el ámbito de su competencia y conforme a los literales a) y c) del artículo 130 del ROF. Los que establezcan obligaciones exigibles a las unidades de organización se aprueban como documento normativo institucional conforme al numeral 7.6 de la presente directiva.</w:t>
       </w:r>
     </w:p>
     <w:p>
@@ -9916,6 +9908,7 @@
           <w:color w:val="000000"/>
           <w:highlight w:val="green"/>
         </w:rPr>
+        <w:lastRenderedPageBreak/>
         <w:t>El componente de IA no modifica por sí mismo los controles de seguridad, las políticas institucionales ni los mecanismos de gobierno previstos en la presente directiva.</w:t>
       </w:r>
     </w:p>
@@ -9936,7 +9929,6 @@
           <w:color w:val="000000"/>
           <w:highlight w:val="lightGray"/>
         </w:rPr>
-        <w:lastRenderedPageBreak/>
         <w:t>6.5.6 Los SBIA generativos que utilicen información institucional incorporan mecanismos que vinculen los resultados generados con sus fuentes de información autorizadas y vigentes. Esta trazabilidad sustenta la explicabilidad exigida en el numeral 6.9.3.</w:t>
       </w:r>
     </w:p>
@@ -10109,7 +10101,17 @@
           <w:color w:val="000000"/>
           <w:highlight w:val="yellow"/>
         </w:rPr>
-        <w:t>Human-in-command (obligatorio para todos los SBIA): Un responsable designado por el propietario del caso de uso mantiene la capacidad de desactivar, suspender o modificar el comportamiento del SBIA en cualquier momento, incluida la interrupción inmediata de su operación ante la detección de un riesgo.</w:t>
+        <w:t xml:space="preserve">Human-in-command (obligatorio para todos los SBIA): Un responsable designado por el propietario del caso de uso mantiene la capacidad de </w:t>
+      </w:r>
+      <w:r>
+        <w:rPr>
+          <w:b w:val="0"/>
+          <w:bCs w:val="0"/>
+          <w:color w:val="000000"/>
+          <w:highlight w:val="yellow"/>
+        </w:rPr>
+        <w:lastRenderedPageBreak/>
+        <w:t>desactivar, suspender o modificar el comportamiento del SBIA en cualquier momento, incluida la interrupción inmediata de su operación ante la detección de un riesgo.</w:t>
       </w:r>
     </w:p>
     <w:p>
@@ -10128,7 +10130,6 @@
           <w:color w:val="000000"/>
           <w:highlight w:val="yellow"/>
         </w:rPr>
-        <w:lastRenderedPageBreak/>
         <w:t>6.6.2</w:t>
       </w:r>
       <w:r>
@@ -10447,6 +10448,7 @@
           <w:color w:val="000000"/>
           <w:highlight w:val="yellow"/>
         </w:rPr>
+        <w:lastRenderedPageBreak/>
         <w:t>6.7.2</w:t>
       </w:r>
       <w:r>
@@ -10456,16 +10458,7 @@
           <w:highlight w:val="yellow"/>
         </w:rPr>
         <w:tab/>
-        <w:t xml:space="preserve">Para SBIA de riesgo alto y de riesgo aceptable-limitado se requiere como mínimo: controles de contención (guardrails) de entrada y salida; controles de acceso basados en roles (RBAC); registro inmutable de auditoría (logs) de </w:t>
-      </w:r>
-      <w:r>
-        <w:rPr>
-          <w:rFonts w:ascii="Arial" w:eastAsia="Arial" w:hAnsi="Arial" w:cs="Arial"/>
-          <w:color w:val="000000"/>
-          <w:highlight w:val="yellow"/>
-        </w:rPr>
-        <w:lastRenderedPageBreak/>
-        <w:t>todas las interacciones; evaluación de vulnerabilidades conforme al OWASP Top 10 para aplicaciones LLM;</w:t>
+        <w:t>Para SBIA de riesgo alto y de riesgo aceptable-limitado se requiere como mínimo: controles de contención (guardrails) de entrada y salida; controles de acceso basados en roles (RBAC); registro inmutable de auditoría (logs) de todas las interacciones; evaluación de vulnerabilidades conforme al OWASP Top 10 para aplicaciones LLM;</w:t>
       </w:r>
       <w:r>
         <w:rPr>
@@ -10620,7 +10613,16 @@
           <w:highlight w:val="yellow"/>
         </w:rPr>
         <w:tab/>
-        <w:t>El Oficial de Datos Personales (ODP) asegura que en el desarrollo, la implementación y el uso de los SBIA se realice un tratamiento adecuado de los datos personales</w:t>
+        <w:t xml:space="preserve">El Oficial de Datos Personales (ODP) asegura que en el desarrollo, la implementación y el uso de los SBIA se realice un tratamiento adecuado de los </w:t>
+      </w:r>
+      <w:r>
+        <w:rPr>
+          <w:rFonts w:ascii="Arial" w:eastAsia="Arial" w:hAnsi="Arial" w:cs="Arial"/>
+          <w:color w:val="000000"/>
+          <w:highlight w:val="yellow"/>
+        </w:rPr>
+        <w:lastRenderedPageBreak/>
+        <w:t>datos personales</w:t>
       </w:r>
       <w:r>
         <w:rPr>
@@ -10634,16 +10636,7 @@
           <w:color w:val="000000"/>
           <w:highlight w:val="yellow"/>
         </w:rPr>
-        <w:t xml:space="preserve"> y actúa como enlace con la Autoridad Nacional de Protección </w:t>
-      </w:r>
-      <w:r>
-        <w:rPr>
-          <w:rFonts w:ascii="Arial" w:eastAsia="Arial" w:hAnsi="Arial" w:cs="Arial"/>
-          <w:color w:val="000000"/>
-          <w:highlight w:val="yellow"/>
-        </w:rPr>
-        <w:lastRenderedPageBreak/>
-        <w:t>de Datos Personales. Emite opinión sobre el tratamiento de datos personales en los casos de uso de SBIA y en la EIA, cuando corresponda.</w:t>
+        <w:t xml:space="preserve"> y actúa como enlace con la Autoridad Nacional de Protección de Datos Personales. Emite opinión sobre el tratamiento de datos personales en los casos de uso de SBIA y en la EIA, cuando corresponda.</w:t>
       </w:r>
     </w:p>
     <w:p>
@@ -10887,6 +10880,7 @@
           <w:color w:val="000000"/>
           <w:highlight w:val="yellow"/>
         </w:rPr>
+        <w:lastRenderedPageBreak/>
         <w:t>6.8.4</w:t>
       </w:r>
       <w:r>
@@ -10933,7 +10927,6 @@
           <w:color w:val="000000"/>
           <w:highlight w:val="lightGray"/>
         </w:rPr>
-        <w:lastRenderedPageBreak/>
         <w:t>6.8.5   Los conjuntos de datos que la SUNAT genere o administre y que califiquen como datos de alto valor se ponen a disposición a través del Centro Nacional de Datos (CND), previa determinación de su publicabilidad conforme al artículo 85 del TUO del Código Tributario y a la normativa de protección de datos personales. El OGD identifica los conjuntos candidatos y propone al CGTD su publicación.</w:t>
       </w:r>
     </w:p>
@@ -11172,6 +11165,7 @@
           <w:rFonts w:ascii="Arial" w:eastAsia="Arial" w:hAnsi="Arial" w:cs="Arial"/>
           <w:color w:val="000000"/>
         </w:rPr>
+        <w:lastRenderedPageBreak/>
         <w:t>6.9.5</w:t>
       </w:r>
       <w:r>
@@ -11199,7 +11193,6 @@
           <w:color w:val="000000"/>
           <w:highlight w:val="yellow"/>
         </w:rPr>
-        <w:lastRenderedPageBreak/>
         <w:t>6.9.6</w:t>
       </w:r>
       <w:r>
@@ -11510,7 +11503,7 @@
           <w:color w:val="000000"/>
           <w:highlight w:val="green"/>
         </w:rPr>
-        <w:t xml:space="preserve">El análisis de riesgo y las pruebas de vulnerabilidad sobre la arquitectura de aplicaciones, de información y de infraestructura tecnológica que soporta cada SBIA corresponden a la Oficina de Seguridad Informática, conforme al literal b) del artículo 106 del ROF y a la etapa de certificación y validación del numeral 6.1.1. La obligación de auditorías de seguridad digital del literal c) del artículo 29 del RLIA se satisface con la concurrencia de la verificación y validación de </w:t>
+        <w:t xml:space="preserve">El análisis de riesgo y las pruebas de vulnerabilidad sobre la arquitectura de aplicaciones, de información y de infraestructura tecnológica que soporta cada SBIA corresponden a la Oficina de Seguridad Informática, conforme al literal b) </w:t>
       </w:r>
       <w:r>
         <w:rPr>
@@ -11519,7 +11512,7 @@
           <w:highlight w:val="green"/>
         </w:rPr>
         <w:lastRenderedPageBreak/>
-        <w:t xml:space="preserve">calidad, del análisis de riesgo, las pruebas de vulnerabilidad </w:t>
+        <w:t xml:space="preserve">del artículo 106 del ROF y a la etapa de certificación y validación del numeral 6.1.1. La obligación de auditorías de seguridad digital del literal c) del artículo 29 del RLIA se satisface con la concurrencia de la verificación y validación de calidad, del análisis de riesgo, las pruebas de vulnerabilidad </w:t>
       </w:r>
       <w:r>
         <w:rPr>
@@ -11815,6 +11808,7 @@
           <w:bCs w:val="0"/>
           <w:color w:val="000000"/>
         </w:rPr>
+        <w:lastRenderedPageBreak/>
         <w:t>No utilizar herramientas de IA para eludir controles internos o procedimientos establecidos.</w:t>
       </w:r>
     </w:p>
@@ -11850,16 +11844,7 @@
           <w:color w:val="000000"/>
           <w:highlight w:val="green"/>
         </w:rPr>
-        <w:t xml:space="preserve">El catálogo de herramientas de IA autorizadas para uso institucional registra las herramientas aprobadas conforme al numeral 6.11.5. El catálogo precisa, </w:t>
-      </w:r>
-      <w:r>
-        <w:rPr>
-          <w:rFonts w:ascii="Arial" w:eastAsia="Arial" w:hAnsi="Arial" w:cs="Arial"/>
-          <w:color w:val="000000"/>
-          <w:highlight w:val="green"/>
-        </w:rPr>
-        <w:lastRenderedPageBreak/>
-        <w:t>para cada herramienta, el ámbito de uso autorizado (uso administrativo general o uso restringido) y si se encuentra desplegada en infraestructura bajo control de la SUNAT. Solo las herramientas desplegadas en dicha infraestructura pueden emplearse con información sujeta a reserva tributaria, conforme al numeral 6.7.3. La INSI lo publica y lo mantiene actualizado.</w:t>
+        <w:t>El catálogo de herramientas de IA autorizadas para uso institucional registra las herramientas aprobadas conforme al numeral 6.11.5. El catálogo precisa, para cada herramienta, el ámbito de uso autorizado (uso administrativo general o uso restringido) y si se encuentra desplegada en infraestructura bajo control de la SUNAT. Solo las herramientas desplegadas en dicha infraestructura pueden emplearse con información sujeta a reserva tributaria, conforme al numeral 6.7.3. La INSI lo publica y lo mantiene actualizado.</w:t>
       </w:r>
     </w:p>
     <w:p>
@@ -12025,7 +12010,7 @@
           <w:highlight w:val="green"/>
         </w:rPr>
         <w:tab/>
-        <w:t xml:space="preserve">Los contratos incluyen cláusulas sobre: (a) protección de datos y reserva tributaria; (b) transparencia del modelo; (c) comunicación de vulnerabilidades e incidentes; (d) derecho de auditoría, incluida la realización de auditorías éticas y de sesgo sobre el modelo; (e) transferencia de conocimiento; (f) cumplimiento de estándares técnicos; (g) la prohibición de que el proveedor emplee la información institucional, las instrucciones que se le remitan y los resultados derivados de su tratamiento para el entrenamiento o el ajuste de sus propios modelos; y (h) la identificación de los subprocesadores autorizados y las </w:t>
+        <w:t xml:space="preserve">Los contratos incluyen cláusulas sobre: (a) protección de datos y reserva tributaria; (b) transparencia del modelo; (c) comunicación de vulnerabilidades e incidentes; (d) derecho de auditoría, incluida la realización de auditorías éticas </w:t>
       </w:r>
       <w:r>
         <w:rPr>
@@ -12034,7 +12019,31 @@
           <w:highlight w:val="green"/>
         </w:rPr>
         <w:lastRenderedPageBreak/>
-        <w:t>condiciones de recuperación de la información institucional a la conclusión del contrato. El plazo de notificación de vulnerabilidades se define en los TDR o EETT de cada contratación, según la criticidad del SBIA</w:t>
+        <w:t xml:space="preserve">y de sesgo sobre el modelo; (e) transferencia de conocimiento; </w:t>
+      </w:r>
+      <w:r>
+        <w:rPr>
+          <w:rFonts w:ascii="Arial" w:eastAsia="Arial" w:hAnsi="Arial" w:cs="Arial"/>
+          <w:color w:val="000000"/>
+          <w:highlight w:val="green"/>
+        </w:rPr>
+        <w:t>(f) cumplimiento de estándares técnicos; y (g) la identificación de los subprocesadores autorizados y las condiciones de recuperación de la información institucional a la conclusión del contrato.</w:t>
+      </w:r>
+      <w:r>
+        <w:rPr>
+          <w:rFonts w:ascii="Arial" w:eastAsia="Arial" w:hAnsi="Arial" w:cs="Arial"/>
+          <w:color w:val="000000"/>
+          <w:highlight w:val="green"/>
+        </w:rPr>
+        <w:t xml:space="preserve"> </w:t>
+      </w:r>
+      <w:r>
+        <w:rPr>
+          <w:rFonts w:ascii="Arial" w:eastAsia="Arial" w:hAnsi="Arial" w:cs="Arial"/>
+          <w:color w:val="000000"/>
+          <w:highlight w:val="green"/>
+        </w:rPr>
+        <w:t>El plazo de notificación de vulnerabilidades se define en los TDR o EETT de cada contratación, según la criticidad del SBIA</w:t>
       </w:r>
       <w:r>
         <w:rPr>
@@ -12096,7 +12105,30 @@
           <w:highlight w:val="yellow"/>
         </w:rPr>
         <w:tab/>
-        <w:t>Los contratos prohíben al proveedor emplear la información de la SUNAT (en particular la sujeta a reserva tributaria y los datos personales) para entrenar, ajustar o mejorar sus modelos o para cualquier fin propio, en concordancia con el artículo 85 del Código Tributario, que extiende la obligación de reserva a quienes accedan a dicha información. La propiedad intelectual de los ajustes (fine-tuning) realizados con información o para necesidades de la SUNAT corresponde a la SUNAT.</w:t>
+      </w:r>
+      <w:r>
+        <w:rPr>
+          <w:rFonts w:ascii="Arial" w:eastAsia="Arial" w:hAnsi="Arial" w:cs="Arial"/>
+          <w:color w:val="000000"/>
+          <w:highlight w:val="green"/>
+        </w:rPr>
+        <w:t>Los contratos prohíben al proveedor emplear la información de la SUNAT (en particular la sujeta a reserva tributaria y los datos personales), las instrucciones que se le remitan y los resultados derivados de su tratamiento, para entrenar, ajustar o mejorar sus modelos o para cualquier fin propio</w:t>
+      </w:r>
+      <w:r>
+        <w:rPr>
+          <w:rFonts w:ascii="Arial" w:eastAsia="Arial" w:hAnsi="Arial" w:cs="Arial"/>
+          <w:color w:val="000000"/>
+          <w:highlight w:val="green"/>
+        </w:rPr>
+        <w:t xml:space="preserve">, </w:t>
+      </w:r>
+      <w:r>
+        <w:rPr>
+          <w:rFonts w:ascii="Arial" w:eastAsia="Arial" w:hAnsi="Arial" w:cs="Arial"/>
+          <w:color w:val="000000"/>
+          <w:highlight w:val="yellow"/>
+        </w:rPr>
+        <w:t>en concordancia con el artículo 85 del Código Tributario, que extiende la obligación de reserva a quienes accedan a dicha información. La propiedad intelectual de los ajustes (fine-tuning) realizados con información o para necesidades de la SUNAT corresponde a la SUNAT.</w:t>
       </w:r>
     </w:p>
     <w:p>
@@ -12384,16 +12416,8 @@
           <w:color w:val="000000"/>
           <w:highlight w:val="lightGray"/>
         </w:rPr>
-        <w:t xml:space="preserve">Esta disposición incorpora los requerimientos establecidos en el numeral 28.9 del artículo 28 del Reglamento y adopta medidas adicionales de sensibilización orientadas a promover el uso seguro, responsable y ético de los sistemas </w:t>
-      </w:r>
-      <w:r>
-        <w:rPr>
-          <w:rFonts w:ascii="Arial" w:eastAsia="Arial" w:hAnsi="Arial" w:cs="Arial"/>
-          <w:color w:val="000000"/>
-          <w:highlight w:val="lightGray"/>
-        </w:rPr>
         <w:lastRenderedPageBreak/>
-        <w:t>basados en IA, en concordancia con el numeral 7.3 de la NTP-ISO/IEC 42001:2025.</w:t>
+        <w:t>Esta disposición incorpora los requerimientos establecidos en el numeral 28.9 del artículo 28 del Reglamento y adopta medidas adicionales de sensibilización orientadas a promover el uso seguro, responsable y ético de los sistemas basados en IA, en concordancia con el numeral 7.3 de la NTP-ISO/IEC 42001:2025.</w:t>
       </w:r>
     </w:p>
     <w:p>
@@ -12751,7 +12775,7 @@
           <w:highlight w:val="yellow"/>
         </w:rPr>
         <w:tab/>
-        <w:t xml:space="preserve">En el desarrollo, la implementación y el uso de los SBIA, la SUNAT promueve la participación de equipos diversos y multidisciplinarios, garantiza el pleno respeto de los derechos humanos y evita que se generen resultados injustos o discriminatorios, considera el impacto social y ambiental, e implementa las </w:t>
+        <w:t xml:space="preserve">En el desarrollo, la implementación y el uso de los SBIA, la SUNAT promueve la participación de equipos diversos y multidisciplinarios, garantiza el pleno respeto de los derechos humanos y evita que se generen resultados injustos o </w:t>
       </w:r>
       <w:r>
         <w:rPr>
@@ -12760,7 +12784,7 @@
           <w:highlight w:val="yellow"/>
         </w:rPr>
         <w:lastRenderedPageBreak/>
-        <w:t>mejores prácticas, estándares y normas técnicas para identificar y minimizar los sesgos de los algoritmos y de las bases de datos utilizados</w:t>
+        <w:t>discriminatorios, considera el impacto social y ambiental, e implementa las mejores prácticas, estándares y normas técnicas para identificar y minimizar los sesgos de los algoritmos y de las bases de datos utilizados</w:t>
       </w:r>
       <w:r>
         <w:rPr>

</xml_diff>

<commit_message>
docs: corrige erratas en la definicion de Reserva tributaria del glosario
- Glosario (Reserva tributaria): corrige "tramitaciofn" -> "tramitacion" y elimina el punto sobrante tras la referencia [D.S. N.° 133-2013-EF, Art. 85]
- Regenera el espejo de texto desde el .docx; 0 comentarios pendientes
</commit_message>
<xml_diff>
--- a/normativo/DIRECTIVA-GOBIERNO-IA.docx
+++ b/normativo/DIRECTIVA-GOBIERNO-IA.docx
@@ -3987,45 +3987,7 @@
           <w:color w:val="000000"/>
           <w:highlight w:val="green"/>
         </w:rPr>
-        <w:t xml:space="preserve">Carácter de información reservada que el artículo 85 del TUO del Código Tributario atribuye, por su objeto, a la cuantía y la fuente de las rentas, los gastos, la base imponible y cualesquiera otros datos relativos a ellos, cuando están contenidos en las declaraciones e informaciones que la Administración Tributaria obtiene por cualquier medio de los contribuyentes, responsables o terceros, así como a la </w:t>
-      </w:r>
-      <w:proofErr w:type="spellStart"/>
-      <w:r>
-        <w:rPr>
-          <w:b w:val="0"/>
-          <w:bCs w:val="0"/>
-          <w:color w:val="000000"/>
-          <w:highlight w:val="green"/>
-        </w:rPr>
-        <w:t>tramitació</w:t>
-      </w:r>
-      <w:r>
-        <w:rPr>
-          <w:b w:val="0"/>
-          <w:bCs w:val="0"/>
-          <w:color w:val="000000"/>
-          <w:highlight w:val="green"/>
-        </w:rPr>
-        <w:t>f</w:t>
-      </w:r>
-      <w:r>
-        <w:rPr>
-          <w:b w:val="0"/>
-          <w:bCs w:val="0"/>
-          <w:color w:val="000000"/>
-          <w:highlight w:val="green"/>
-        </w:rPr>
-        <w:t>n</w:t>
-      </w:r>
-      <w:proofErr w:type="spellEnd"/>
-      <w:r>
-        <w:rPr>
-          <w:b w:val="0"/>
-          <w:bCs w:val="0"/>
-          <w:color w:val="000000"/>
-          <w:highlight w:val="green"/>
-        </w:rPr>
-        <w:t xml:space="preserve"> de las denuncias a que se refiere el artículo 192 del mismo Código. Dicha información únicamente puede ser utilizada por la Administración Tributaria para sus fines propios y la obligación de reserva alcanza a </w:t>
+        <w:t xml:space="preserve">Carácter de información reservada que el artículo 85 del TUO del Código Tributario atribuye, por su objeto, a la cuantía y la fuente de las rentas, los gastos, la base imponible y cualesquiera otros datos relativos a ellos, cuando están contenidos en las declaraciones e informaciones que la Administración Tributaria obtiene por cualquier medio de los contribuyentes, responsables o terceros, así como a la tramitación de las denuncias a que se refiere el artículo 192 del mismo Código. Dicha información únicamente puede ser utilizada por la Administración Tributaria para sus fines propios y la obligación de reserva alcanza a </w:t>
       </w:r>
       <w:r>
         <w:rPr>
@@ -4036,15 +3998,6 @@
         </w:rPr>
         <w:lastRenderedPageBreak/>
         <w:t>quienes accedan a ella. El mismo artículo establece excepciones expresas. La determinación de si una información concreta está sujeta a reserva tributaria se efectúa respecto de esa información y no se presume respecto de todo el acervo de datos que la SUNAT administra. [D.S. N.° 133-2013-EF, Art. 85]</w:t>
-      </w:r>
-      <w:r>
-        <w:rPr>
-          <w:b w:val="0"/>
-          <w:bCs w:val="0"/>
-          <w:color w:val="000000"/>
-          <w:highlight w:val="green"/>
-        </w:rPr>
-        <w:t>.</w:t>
       </w:r>
     </w:p>
     <w:p>
@@ -10740,25 +10693,7 @@
           <w:color w:val="000000"/>
           <w:highlight w:val="green"/>
         </w:rPr>
-        <w:t xml:space="preserve">Los SBIA cumplen la Política de Seguridad de la Información (SGSI-PO-01) y el Manual de Políticas del Sistema de Gestión de Seguridad de la Información (SGSI-MA-03) de la SUNAT, en sus versiones vigentes, que </w:t>
-      </w:r>
-      <w:proofErr w:type="gramStart"/>
-      <w:r>
-        <w:rPr>
-          <w:rFonts w:ascii="Arial" w:eastAsia="Arial" w:hAnsi="Arial" w:cs="Arial"/>
-          <w:color w:val="000000"/>
-          <w:highlight w:val="green"/>
-        </w:rPr>
-        <w:t>son de aplicación</w:t>
-      </w:r>
-      <w:proofErr w:type="gramEnd"/>
-      <w:r>
-        <w:rPr>
-          <w:rFonts w:ascii="Arial" w:eastAsia="Arial" w:hAnsi="Arial" w:cs="Arial"/>
-          <w:color w:val="000000"/>
-          <w:highlight w:val="green"/>
-        </w:rPr>
-        <w:t xml:space="preserve"> a todo colaborador y tercero vinculado que gestione información de la institución. Cuando un SBIA soporte un proceso comprendido en el alcance del Sistema de Gestión de Seguridad de la Información, le son exigibles además los demás documentos normativos y lineamientos de dicho Sistema.</w:t>
+        <w:t>Los SBIA cumplen la Política de Seguridad de la Información (SGSI-PO-01) y el Manual de Políticas del Sistema de Gestión de Seguridad de la Información (SGSI-MA-03) de la SUNAT, en sus versiones vigentes, que son de aplicación a todo colaborador y tercero vinculado que gestione información de la institución. Cuando un SBIA soporte un proceso comprendido en el alcance del Sistema de Gestión de Seguridad de la Información, le son exigibles además los demás documentos normativos y lineamientos de dicho Sistema.</w:t>
       </w:r>
     </w:p>
     <w:p>
@@ -11122,7 +11057,6 @@
           <w:color w:val="000000"/>
         </w:rPr>
       </w:pPr>
-      <w:proofErr w:type="gramStart"/>
       <w:r>
         <w:rPr>
           <w:rFonts w:ascii="Arial" w:eastAsia="Arial" w:hAnsi="Arial" w:cs="Arial"/>
@@ -11145,16 +11079,7 @@
           <w:color w:val="000000"/>
           <w:highlight w:val="green"/>
         </w:rPr>
-        <w:t>El</w:t>
-      </w:r>
-      <w:proofErr w:type="gramEnd"/>
-      <w:r>
-        <w:rPr>
-          <w:rFonts w:ascii="Arial" w:eastAsia="Arial" w:hAnsi="Arial" w:cs="Arial"/>
-          <w:color w:val="000000"/>
-          <w:highlight w:val="green"/>
-        </w:rPr>
-        <w:t xml:space="preserve"> propietario del caso de uso, con el custodio técnico del SBIA, define el tratamiento de</w:t>
+        <w:t>El propietario del caso de uso, con el custodio técnico del SBIA, define el tratamiento de</w:t>
       </w:r>
       <w:r>
         <w:rPr>
@@ -14285,25 +14210,7 @@
           <w:color w:val="000000"/>
           <w:highlight w:val="yellow"/>
         </w:rPr>
-        <w:t xml:space="preserve"> </w:t>
-      </w:r>
-      <w:proofErr w:type="gramStart"/>
-      <w:r>
-        <w:rPr>
-          <w:rFonts w:ascii="Arial" w:eastAsia="Arial" w:hAnsi="Arial" w:cs="Arial"/>
-          <w:color w:val="000000"/>
-          <w:highlight w:val="yellow"/>
-        </w:rPr>
-        <w:t>son de aplicación</w:t>
-      </w:r>
-      <w:proofErr w:type="gramEnd"/>
-      <w:r>
-        <w:rPr>
-          <w:rFonts w:ascii="Arial" w:eastAsia="Arial" w:hAnsi="Arial" w:cs="Arial"/>
-          <w:color w:val="000000"/>
-          <w:highlight w:val="yellow"/>
-        </w:rPr>
-        <w:t xml:space="preserve"> en la SUNAT desde su entrada en vigencia. La Comisión de Gobierno de IA evalúa su impacto en la presente directiva y propone al CGTD los ajustes que correspondan.</w:t>
+        <w:t xml:space="preserve"> son de aplicación en la SUNAT desde su entrada en vigencia. La Comisión de Gobierno de IA evalúa su impacto en la presente directiva y propone al CGTD los ajustes que correspondan.</w:t>
       </w:r>
     </w:p>
     <w:p>
@@ -16567,23 +16474,7 @@
                 <w:rFonts w:ascii="Arial" w:eastAsia="Arial" w:hAnsi="Arial" w:cs="Arial"/>
                 <w:lang w:val="en-US"/>
               </w:rPr>
-              <w:t xml:space="preserve">, on-the-loop </w:t>
-            </w:r>
-            <w:proofErr w:type="gramStart"/>
-            <w:r>
-              <w:rPr>
-                <w:rFonts w:ascii="Arial" w:eastAsia="Arial" w:hAnsi="Arial" w:cs="Arial"/>
-                <w:lang w:val="en-US"/>
-              </w:rPr>
-              <w:t>o in</w:t>
-            </w:r>
-            <w:proofErr w:type="gramEnd"/>
-            <w:r>
-              <w:rPr>
-                <w:rFonts w:ascii="Arial" w:eastAsia="Arial" w:hAnsi="Arial" w:cs="Arial"/>
-                <w:lang w:val="en-US"/>
-              </w:rPr>
-              <w:t>-command.</w:t>
+              <w:t>, on-the-loop o in-command.</w:t>
             </w:r>
           </w:p>
         </w:tc>

</xml_diff>

<commit_message>
docs: alinea las referencias cruzadas de los controles aplicables al SBIA (6.2.5, 6.7.2 y 6.15.1)
- 6.2.5: incorpora el numeral 6.7.2 (controles reforzados de seguridad) entre los criterios que determinan los controles aplicables a un SBIA, junto con los numerales 6.6, 6.9 y 6.10
- 6.15.1 (pronunciamiento favorable con condiciones): remite la determinacion de los controles al numeral 6.2.5, en lugar de a la clasificacion de riesgo de forma generica
- Regenera el espejo de texto desde el .docx; 0 comentarios pendientes
</commit_message>
<xml_diff>
--- a/normativo/DIRECTIVA-GOBIERNO-IA.docx
+++ b/normativo/DIRECTIVA-GOBIERNO-IA.docx
@@ -9610,21 +9610,22 @@
           <w:highlight w:val="green"/>
         </w:rPr>
         <w:tab/>
-        <w:t>Los controles aplicables a un SBIA se determinan a partir de su clasificación de riesgo,</w:t>
-      </w:r>
-      <w:r>
-        <w:rPr>
-          <w:highlight w:val="green"/>
-        </w:rPr>
-        <w:t xml:space="preserve"> </w:t>
-      </w:r>
-      <w:r>
-        <w:rPr>
-          <w:rFonts w:ascii="Arial" w:eastAsia="Arial" w:hAnsi="Arial" w:cs="Arial"/>
-          <w:color w:val="000000"/>
-          <w:highlight w:val="green"/>
-        </w:rPr>
-        <w:t>conforme a los numerales 6.6, 6.9 y 6.10: no se proponen ni se negocian. El propietario del</w:t>
+      </w:r>
+      <w:r>
+        <w:rPr>
+          <w:rFonts w:ascii="Arial" w:eastAsia="Arial" w:hAnsi="Arial" w:cs="Arial"/>
+          <w:color w:val="000000"/>
+          <w:highlight w:val="green"/>
+        </w:rPr>
+        <w:t>Los controles aplicables a un SBIA se determinan a partir de su clasificación de riesgo y de los criterios establecidos en los numerales 6.6, 6.7.2, 6.9 y 6.10: no se proponen ni se negocian</w:t>
+      </w:r>
+      <w:r>
+        <w:rPr>
+          <w:rFonts w:ascii="Arial" w:eastAsia="Arial" w:hAnsi="Arial" w:cs="Arial"/>
+          <w:color w:val="000000"/>
+          <w:highlight w:val="green"/>
+        </w:rPr>
+        <w:t>. El propietario del</w:t>
       </w:r>
       <w:r>
         <w:rPr>
@@ -10709,7 +10710,25 @@
           <w:color w:val="000000"/>
           <w:highlight w:val="green"/>
         </w:rPr>
-        <w:t>Los SBIA cumplen la Política de Seguridad de la Información (SGSI-PO-01) y el Manual de Políticas del Sistema de Gestión de Seguridad de la Información (SGSI-MA-03) de la SUNAT, en sus versiones vigentes, que son de aplicación a todo colaborador y tercero vinculado que gestione información de la institución. Cuando un SBIA soporte un proceso comprendido en el alcance del Sistema de Gestión de Seguridad de la Información, le son exigibles además los demás documentos normativos y lineamientos de dicho Sistema.</w:t>
+        <w:t xml:space="preserve">Los SBIA cumplen la Política de Seguridad de la Información (SGSI-PO-01) y el Manual de Políticas del Sistema de Gestión de Seguridad de la Información (SGSI-MA-03) de la SUNAT, en sus versiones vigentes, que </w:t>
+      </w:r>
+      <w:proofErr w:type="gramStart"/>
+      <w:r>
+        <w:rPr>
+          <w:rFonts w:ascii="Arial" w:eastAsia="Arial" w:hAnsi="Arial" w:cs="Arial"/>
+          <w:color w:val="000000"/>
+          <w:highlight w:val="green"/>
+        </w:rPr>
+        <w:t>son de aplicación</w:t>
+      </w:r>
+      <w:proofErr w:type="gramEnd"/>
+      <w:r>
+        <w:rPr>
+          <w:rFonts w:ascii="Arial" w:eastAsia="Arial" w:hAnsi="Arial" w:cs="Arial"/>
+          <w:color w:val="000000"/>
+          <w:highlight w:val="green"/>
+        </w:rPr>
+        <w:t xml:space="preserve"> a todo colaborador y tercero vinculado que gestione información de la institución. Cuando un SBIA soporte un proceso comprendido en el alcance del Sistema de Gestión de Seguridad de la Información, le son exigibles además los demás documentos normativos y lineamientos de dicho Sistema.</w:t>
       </w:r>
     </w:p>
     <w:p>
@@ -11082,6 +11101,7 @@
           <w:color w:val="000000"/>
         </w:rPr>
       </w:pPr>
+      <w:proofErr w:type="gramStart"/>
       <w:r>
         <w:rPr>
           <w:rFonts w:ascii="Arial" w:eastAsia="Arial" w:hAnsi="Arial" w:cs="Arial"/>
@@ -11104,7 +11124,16 @@
           <w:color w:val="000000"/>
           <w:highlight w:val="green"/>
         </w:rPr>
-        <w:t>El propietario del caso de uso, con el custodio técnico del SBIA, define el tratamiento de</w:t>
+        <w:t>El</w:t>
+      </w:r>
+      <w:proofErr w:type="gramEnd"/>
+      <w:r>
+        <w:rPr>
+          <w:rFonts w:ascii="Arial" w:eastAsia="Arial" w:hAnsi="Arial" w:cs="Arial"/>
+          <w:color w:val="000000"/>
+          <w:highlight w:val="green"/>
+        </w:rPr>
+        <w:t xml:space="preserve"> propietario del caso de uso, con el custodio técnico del SBIA, define el tratamiento de</w:t>
       </w:r>
       <w:r>
         <w:rPr>
@@ -14234,7 +14263,25 @@
           <w:color w:val="000000"/>
           <w:highlight w:val="yellow"/>
         </w:rPr>
-        <w:t xml:space="preserve"> son de aplicación en la SUNAT desde su entrada en vigencia. La Comisión de Gobierno de IA evalúa su impacto en la presente directiva y propone al CGTD los ajustes que correspondan.</w:t>
+        <w:t xml:space="preserve"> </w:t>
+      </w:r>
+      <w:proofErr w:type="gramStart"/>
+      <w:r>
+        <w:rPr>
+          <w:rFonts w:ascii="Arial" w:eastAsia="Arial" w:hAnsi="Arial" w:cs="Arial"/>
+          <w:color w:val="000000"/>
+          <w:highlight w:val="yellow"/>
+        </w:rPr>
+        <w:t>son de aplicación</w:t>
+      </w:r>
+      <w:proofErr w:type="gramEnd"/>
+      <w:r>
+        <w:rPr>
+          <w:rFonts w:ascii="Arial" w:eastAsia="Arial" w:hAnsi="Arial" w:cs="Arial"/>
+          <w:color w:val="000000"/>
+          <w:highlight w:val="yellow"/>
+        </w:rPr>
+        <w:t xml:space="preserve"> en la SUNAT desde su entrada en vigencia. La Comisión de Gobierno de IA evalúa su impacto en la presente directiva y propone al CGTD los ajustes que correspondan.</w:t>
       </w:r>
     </w:p>
     <w:p>
@@ -14411,7 +14458,23 @@
           <w:bCs w:val="0"/>
           <w:highlight w:val="green"/>
         </w:rPr>
-        <w:t>Favorable con condiciones, que identifica los controles que la clasificación de riesgo determina y cuya implementación se verifica en el hito de aprobación previo al despliegue, conforme al numeral 6.1.2. Los SBIA clasificados de riesgo alto reciben este pronunciamiento.</w:t>
+        <w:t>Favorable con condiciones, que identifica los controles que corresponden conforme al numeral 6.2.5 y cuya implementación se verifica en el hito de aprobación previo al despliegue, conforme al numeral 6.1.2</w:t>
+      </w:r>
+      <w:r>
+        <w:rPr>
+          <w:b w:val="0"/>
+          <w:bCs w:val="0"/>
+          <w:highlight w:val="green"/>
+        </w:rPr>
+        <w:t xml:space="preserve">. </w:t>
+      </w:r>
+      <w:r>
+        <w:rPr>
+          <w:b w:val="0"/>
+          <w:bCs w:val="0"/>
+          <w:highlight w:val="green"/>
+        </w:rPr>
+        <w:t>Los SBIA clasificados de riesgo alto reciben este pronunciamiento.</w:t>
       </w:r>
     </w:p>
     <w:p>
@@ -16501,7 +16564,23 @@
                 <w:rFonts w:ascii="Arial" w:eastAsia="Arial" w:hAnsi="Arial" w:cs="Arial"/>
                 <w:lang w:val="en-US"/>
               </w:rPr>
-              <w:t>Human-in-the-loop, on-the-loop o in-command.</w:t>
+              <w:t xml:space="preserve">Human-in-the-loop, on-the-loop </w:t>
+            </w:r>
+            <w:proofErr w:type="gramStart"/>
+            <w:r>
+              <w:rPr>
+                <w:rFonts w:ascii="Arial" w:eastAsia="Arial" w:hAnsi="Arial" w:cs="Arial"/>
+                <w:lang w:val="en-US"/>
+              </w:rPr>
+              <w:t>o in</w:t>
+            </w:r>
+            <w:proofErr w:type="gramEnd"/>
+            <w:r>
+              <w:rPr>
+                <w:rFonts w:ascii="Arial" w:eastAsia="Arial" w:hAnsi="Arial" w:cs="Arial"/>
+                <w:lang w:val="en-US"/>
+              </w:rPr>
+              <w:t>-command.</w:t>
             </w:r>
           </w:p>
         </w:tc>

</xml_diff>

<commit_message>
docs: revisión de calidad (tanda 10) — depura la Base Normativa y amplía la clausula de versiones vigentes
- Base Normativa: retira las resoluciones de designacion de funcionarios (Oficial de Gobierno de Datos, Oficial de Seguridad y Confianza Digital y Oficial de Datos Personales), por tratarse de actos de designacion de personas y no de normas que sustenten la directiva
- 7.8: extiende la clausula de aplicacion a la version vigente para comprender, ademas de las normas tecnicas, las metodologias y los instrumentos de gestion institucionales
- Regenera el espejo de texto desde el .docx; 0 comentarios pendientes
</commit_message>
<xml_diff>
--- a/normativo/DIRECTIVA-GOBIERNO-IA.docx
+++ b/normativo/DIRECTIVA-GOBIERNO-IA.docx
@@ -3041,20 +3041,57 @@
           <w:numId w:val="20"/>
         </w:numPr>
         <w:spacing w:line="276" w:lineRule="auto"/>
-        <w:ind w:left="709" w:hanging="567"/>
-        <w:rPr>
-          <w:b w:val="0"/>
-          <w:bCs w:val="0"/>
-          <w:color w:val="000000"/>
-        </w:rPr>
-      </w:pPr>
-      <w:r>
-        <w:rPr>
-          <w:b w:val="0"/>
-          <w:bCs w:val="0"/>
-          <w:color w:val="000000"/>
-        </w:rPr>
-        <w:t>Resolución de Superintendencia N.° 000125-2024/SUNAT, que designa al Oficial de Gobierno de Datos de la SUNAT.</w:t>
+        <w:ind w:hanging="578"/>
+        <w:rPr>
+          <w:b w:val="0"/>
+          <w:bCs w:val="0"/>
+          <w:color w:val="000000"/>
+          <w:highlight w:val="green"/>
+        </w:rPr>
+      </w:pPr>
+      <w:r>
+        <w:rPr>
+          <w:b w:val="0"/>
+          <w:bCs w:val="0"/>
+          <w:color w:val="000000"/>
+          <w:highlight w:val="green"/>
+        </w:rPr>
+        <w:t xml:space="preserve">Resolución de Superintendencia N.° 000144-2026/SUNAT (30/07/2026), que </w:t>
+      </w:r>
+      <w:r>
+        <w:rPr>
+          <w:b w:val="0"/>
+          <w:bCs w:val="0"/>
+          <w:color w:val="000000"/>
+          <w:highlight w:val="green"/>
+        </w:rPr>
+        <w:t>aprueba la Política de uso seguro, responsable y ético de los sistemas basados en inteligencia artificial en la Superintendencia Nacional de Aduanas y de Administración Tributaria</w:t>
+      </w:r>
+      <w:r>
+        <w:rPr>
+          <w:rFonts w:asciiTheme="minorHAnsi" w:eastAsiaTheme="minorEastAsia" w:hAnsiTheme="minorHAnsi" w:cstheme="minorBidi"/>
+          <w:b w:val="0"/>
+          <w:bCs w:val="0"/>
+        </w:rPr>
+        <w:t xml:space="preserve">, </w:t>
+      </w:r>
+      <w:r>
+        <w:rPr>
+          <w:b w:val="0"/>
+          <w:bCs w:val="0"/>
+          <w:color w:val="000000"/>
+          <w:highlight w:val="green"/>
+        </w:rPr>
+        <w:t>en adelante, la Política de IA</w:t>
+      </w:r>
+      <w:r>
+        <w:rPr>
+          <w:b w:val="0"/>
+          <w:bCs w:val="0"/>
+          <w:color w:val="000000"/>
+          <w:highlight w:val="green"/>
+        </w:rPr>
+        <w:t>.</w:t>
       </w:r>
     </w:p>
     <w:p>
@@ -3070,15 +3107,17 @@
           <w:b w:val="0"/>
           <w:bCs w:val="0"/>
           <w:color w:val="000000"/>
-        </w:rPr>
-      </w:pPr>
-      <w:r>
-        <w:rPr>
-          <w:b w:val="0"/>
-          <w:bCs w:val="0"/>
-          <w:color w:val="000000"/>
-        </w:rPr>
-        <w:t>Resolución de Superintendencia N.° 000114-2025/SUNAT (08/04/2025), que designa al Oficial de Seguridad y Confianza Digital de la SUNAT.</w:t>
+          <w:highlight w:val="yellow"/>
+        </w:rPr>
+      </w:pPr>
+      <w:r>
+        <w:rPr>
+          <w:b w:val="0"/>
+          <w:bCs w:val="0"/>
+          <w:color w:val="000000"/>
+          <w:highlight w:val="yellow"/>
+        </w:rPr>
+        <w:t>Resolución de Oficina N.° 001-2024-SUNAT/1V0000, que aprueba la Metodología para la formulación, aprobación y control de los Documentos Normativos Institucionales (METDONI) Versión 1.4.</w:t>
       </w:r>
     </w:p>
     <w:p>
@@ -3094,77 +3133,17 @@
           <w:b w:val="0"/>
           <w:bCs w:val="0"/>
           <w:color w:val="000000"/>
-        </w:rPr>
-      </w:pPr>
-      <w:r>
-        <w:rPr>
-          <w:b w:val="0"/>
-          <w:bCs w:val="0"/>
-          <w:color w:val="000000"/>
-          <w:highlight w:val="yellow"/>
-        </w:rPr>
-        <w:t>Resolución de Superintendencia Nacional Adjunta de Administración y Finanzas N.° 000197-2022-SUNAT/800000 (27/10/2022), que designa al Oficial de Datos Personales de la SUNAT.</w:t>
-      </w:r>
-    </w:p>
-    <w:p>
-      <w:pPr>
-        <w:pStyle w:val="Prrafodelista"/>
-        <w:numPr>
-          <w:ilvl w:val="1"/>
-          <w:numId w:val="20"/>
-        </w:numPr>
-        <w:spacing w:line="276" w:lineRule="auto"/>
-        <w:ind w:hanging="578"/>
-        <w:rPr>
-          <w:b w:val="0"/>
-          <w:bCs w:val="0"/>
-          <w:color w:val="000000"/>
-          <w:highlight w:val="green"/>
-        </w:rPr>
-      </w:pPr>
-      <w:r>
-        <w:rPr>
-          <w:b w:val="0"/>
-          <w:bCs w:val="0"/>
-          <w:color w:val="000000"/>
-          <w:highlight w:val="green"/>
-        </w:rPr>
-        <w:t xml:space="preserve">Resolución de Superintendencia N.° 000144-2026/SUNAT (30/07/2026), que </w:t>
-      </w:r>
-      <w:r>
-        <w:rPr>
-          <w:b w:val="0"/>
-          <w:bCs w:val="0"/>
-          <w:color w:val="000000"/>
-          <w:highlight w:val="green"/>
-        </w:rPr>
-        <w:t>aprueba la Política de uso seguro, responsable y ético de los sistemas basados en inteligencia artificial en la Superintendencia Nacional de Aduanas y de Administración Tributaria</w:t>
-      </w:r>
-      <w:r>
-        <w:rPr>
-          <w:rFonts w:asciiTheme="minorHAnsi" w:eastAsiaTheme="minorEastAsia" w:hAnsiTheme="minorHAnsi" w:cstheme="minorBidi"/>
-          <w:b w:val="0"/>
-          <w:bCs w:val="0"/>
-        </w:rPr>
-        <w:t xml:space="preserve">, </w:t>
-      </w:r>
-      <w:r>
-        <w:rPr>
-          <w:b w:val="0"/>
-          <w:bCs w:val="0"/>
-          <w:color w:val="000000"/>
-          <w:highlight w:val="green"/>
-        </w:rPr>
-        <w:t>en adelante, la Política de IA</w:t>
-      </w:r>
-      <w:r>
-        <w:rPr>
-          <w:b w:val="0"/>
-          <w:bCs w:val="0"/>
-          <w:color w:val="000000"/>
-          <w:highlight w:val="green"/>
-        </w:rPr>
-        <w:t>.</w:t>
+          <w:highlight w:val="lightGray"/>
+        </w:rPr>
+      </w:pPr>
+      <w:r>
+        <w:rPr>
+          <w:b w:val="0"/>
+          <w:bCs w:val="0"/>
+          <w:color w:val="000000"/>
+          <w:highlight w:val="lightGray"/>
+        </w:rPr>
+        <w:t>Resolución de Oficina N.° 000002-2023-SUNAT/1V0000, que aprueba la Metodología para la Gestión por Procesos (METGEP) Versión 5.</w:t>
       </w:r>
     </w:p>
     <w:p>
@@ -3180,18 +3159,17 @@
           <w:b w:val="0"/>
           <w:bCs w:val="0"/>
           <w:color w:val="000000"/>
-          <w:highlight w:val="yellow"/>
-        </w:rPr>
-      </w:pPr>
-      <w:r>
-        <w:rPr>
-          <w:b w:val="0"/>
-          <w:bCs w:val="0"/>
-          <w:color w:val="000000"/>
-          <w:highlight w:val="yellow"/>
-        </w:rPr>
-        <w:lastRenderedPageBreak/>
-        <w:t>Resolución de Oficina N.° 001-2024-SUNAT/1V0000, que aprueba la Metodología para la formulación, aprobación y control de los Documentos Normativos Institucionales (METDONI) Versión 1.4.</w:t>
+          <w:highlight w:val="green"/>
+        </w:rPr>
+      </w:pPr>
+      <w:r>
+        <w:rPr>
+          <w:b w:val="0"/>
+          <w:bCs w:val="0"/>
+          <w:color w:val="000000"/>
+          <w:highlight w:val="green"/>
+        </w:rPr>
+        <w:t>Resolución de Intendencia N.° 004-2019/SUNAT/1U0000 (02/09/2019), que aprueba los Principios de Arquitectura de TI.</w:t>
       </w:r>
     </w:p>
     <w:p>
@@ -3207,68 +3185,17 @@
           <w:b w:val="0"/>
           <w:bCs w:val="0"/>
           <w:color w:val="000000"/>
-          <w:highlight w:val="lightGray"/>
-        </w:rPr>
-      </w:pPr>
-      <w:r>
-        <w:rPr>
-          <w:b w:val="0"/>
-          <w:bCs w:val="0"/>
-          <w:color w:val="000000"/>
-          <w:highlight w:val="lightGray"/>
-        </w:rPr>
-        <w:t>Resolución de Oficina N.° 000002-2023-SUNAT/1V0000, que aprueba la Metodología para la Gestión por Procesos (METGEP) Versión 5.</w:t>
-      </w:r>
-    </w:p>
-    <w:p>
-      <w:pPr>
-        <w:pStyle w:val="Prrafodelista"/>
-        <w:numPr>
-          <w:ilvl w:val="1"/>
-          <w:numId w:val="20"/>
-        </w:numPr>
-        <w:spacing w:line="276" w:lineRule="auto"/>
-        <w:ind w:left="709" w:hanging="567"/>
-        <w:rPr>
-          <w:b w:val="0"/>
-          <w:bCs w:val="0"/>
-          <w:color w:val="000000"/>
-          <w:highlight w:val="green"/>
-        </w:rPr>
-      </w:pPr>
-      <w:r>
-        <w:rPr>
-          <w:b w:val="0"/>
-          <w:bCs w:val="0"/>
-          <w:color w:val="000000"/>
-          <w:highlight w:val="green"/>
-        </w:rPr>
-        <w:t>Resolución de Intendencia N.° 004-2019/SUNAT/1U0000 (02/09/2019), que aprueba los Principios de Arquitectura de TI.</w:t>
-      </w:r>
-    </w:p>
-    <w:p>
-      <w:pPr>
-        <w:pStyle w:val="Prrafodelista"/>
-        <w:numPr>
-          <w:ilvl w:val="1"/>
-          <w:numId w:val="20"/>
-        </w:numPr>
-        <w:spacing w:line="276" w:lineRule="auto"/>
-        <w:ind w:left="709" w:hanging="567"/>
-        <w:rPr>
-          <w:b w:val="0"/>
-          <w:bCs w:val="0"/>
-          <w:color w:val="000000"/>
-          <w:highlight w:val="green"/>
-        </w:rPr>
-      </w:pPr>
-      <w:r>
-        <w:rPr>
-          <w:b w:val="0"/>
-          <w:bCs w:val="0"/>
-          <w:color w:val="000000"/>
-          <w:highlight w:val="green"/>
-        </w:rPr>
+          <w:highlight w:val="green"/>
+        </w:rPr>
+      </w:pPr>
+      <w:r>
+        <w:rPr>
+          <w:b w:val="0"/>
+          <w:bCs w:val="0"/>
+          <w:color w:val="000000"/>
+          <w:highlight w:val="green"/>
+        </w:rPr>
+        <w:lastRenderedPageBreak/>
         <w:t>Resolución de Intendencia N.° 011-2019/SUNAT/1U0000 (21/10/2019), que aprueba los Lineamientos de Arquitectura de TI.</w:t>
       </w:r>
     </w:p>
@@ -16386,7 +16313,14 @@
           <w:bCs w:val="0"/>
         </w:rPr>
         <w:tab/>
-        <w:t>Las referencias a normas técnicas aplican a sus versiones vigentes o a las que las sustituyan.</w:t>
+      </w:r>
+      <w:r>
+        <w:rPr>
+          <w:b w:val="0"/>
+          <w:bCs w:val="0"/>
+          <w:highlight w:val="green"/>
+        </w:rPr>
+        <w:t>Las referencias a normas técnicas, a metodologías y a instrumentos de gestión institucionales aplican a sus versiones vigentes o a las que las sustituyan.</w:t>
       </w:r>
     </w:p>
     <w:p>

</xml_diff>

<commit_message>
docs: revisión de calidad (tanda 11) — completa y corrige las referencias de la Base Normativa
- Incorpora las resoluciones del SGSI que la directiva invoca: RS N.° 173-2018/SUNAT (Politica de Seguridad de la Informacion, SGSI-PO-01) y RS N.° 050-2019/SUNAT (Manual de Politicas del SGSI, SGSI-MA-03)
- D.S. N.° 029-2021-PCM: agrega la modificatoria del D.S. N.° 075-2023-PCM (ademas del D.S. N.° 098-2025-PCM)
- Corrige la fecha de la RM N.° 152-2026-PCM (ENIA 2026-2030) a 01/05/2026 y reordena la RM N.° 119-2018-PCM
- Completa fechas y versiones de la METDONI (16/12/2024, v1.4) y la METGEP (22/12/2023, v5.0)
- Regenera el espejo de texto desde el .docx; 0 comentarios pendientes
</commit_message>
<xml_diff>
--- a/normativo/DIRECTIVA-GOBIERNO-IA.docx
+++ b/normativo/DIRECTIVA-GOBIERNO-IA.docx
@@ -2609,7 +2609,23 @@
           <w:bCs w:val="0"/>
           <w:color w:val="000000"/>
         </w:rPr>
-        <w:t>Resolución Ministerial N.° 152-2026-PCM (29/04/2026), que aprueba la Estrategia Nacional de Inteligencia Artificial (ENIA) 2026-2030.</w:t>
+        <w:t>Resolución Ministerial N.° 152-2026-PCM (</w:t>
+      </w:r>
+      <w:r>
+        <w:rPr>
+          <w:b w:val="0"/>
+          <w:bCs w:val="0"/>
+          <w:color w:val="000000"/>
+        </w:rPr>
+        <w:t>01/05/2026</w:t>
+      </w:r>
+      <w:r>
+        <w:rPr>
+          <w:b w:val="0"/>
+          <w:bCs w:val="0"/>
+          <w:color w:val="000000"/>
+        </w:rPr>
+        <w:t>), que aprueba la Estrategia Nacional de Inteligencia Artificial (ENIA) 2026-2030.</w:t>
       </w:r>
     </w:p>
     <w:p>
@@ -2650,15 +2666,17 @@
           <w:b w:val="0"/>
           <w:bCs w:val="0"/>
           <w:color w:val="000000"/>
-        </w:rPr>
-      </w:pPr>
-      <w:r>
-        <w:rPr>
-          <w:b w:val="0"/>
-          <w:bCs w:val="0"/>
-          <w:color w:val="000000"/>
-        </w:rPr>
-        <w:t>Decreto Legislativo N.° 1412 (13/09/2018), que aprueba la Ley de Gobierno Digital, y sus modificatorias.</w:t>
+          <w:highlight w:val="green"/>
+        </w:rPr>
+      </w:pPr>
+      <w:r>
+        <w:rPr>
+          <w:b w:val="0"/>
+          <w:bCs w:val="0"/>
+          <w:color w:val="000000"/>
+          <w:highlight w:val="green"/>
+        </w:rPr>
+        <w:t>Resolución Ministerial N.° 119-2018-PCM (10/05/2018), que dispone la creación de un Comité de Gobierno Digital en cada entidad de la Administración Pública y establece sus funciones, modificada por la Resolución Ministerial N.° 087-2019-PCM (22/03/2019).</w:t>
       </w:r>
     </w:p>
     <w:p>
@@ -2682,7 +2700,8 @@
           <w:bCs w:val="0"/>
           <w:color w:val="000000"/>
         </w:rPr>
-        <w:t>Decreto de Urgencia N.° 006-2020 (08/01/2020), que crea el Sistema Nacional de Transformación Digital.</w:t>
+        <w:lastRenderedPageBreak/>
+        <w:t>Decreto Legislativo N.° 1412 (13/09/2018), que aprueba la Ley de Gobierno Digital, y sus modificatorias.</w:t>
       </w:r>
     </w:p>
     <w:p>
@@ -2698,18 +2717,15 @@
           <w:b w:val="0"/>
           <w:bCs w:val="0"/>
           <w:color w:val="000000"/>
-          <w:highlight w:val="green"/>
-        </w:rPr>
-      </w:pPr>
-      <w:r>
-        <w:rPr>
-          <w:b w:val="0"/>
-          <w:bCs w:val="0"/>
-          <w:color w:val="000000"/>
-          <w:highlight w:val="green"/>
-        </w:rPr>
-        <w:lastRenderedPageBreak/>
-        <w:t>Decreto Supremo N.° 157-2021-PCM (25/09/2021), que aprueba el Reglamento del Decreto de Urgencia N.° 006-2020; en particular su cuarta disposición complementaria final, conforme a la cual toda mención al Comité de Gobierno Digital se entiende referida al Comité de Gobierno y Transformación Digital.</w:t>
+        </w:rPr>
+      </w:pPr>
+      <w:r>
+        <w:rPr>
+          <w:b w:val="0"/>
+          <w:bCs w:val="0"/>
+          <w:color w:val="000000"/>
+        </w:rPr>
+        <w:t>Decreto de Urgencia N.° 006-2020 (08/01/2020), que crea el Sistema Nacional de Transformación Digital.</w:t>
       </w:r>
     </w:p>
     <w:p>
@@ -2725,15 +2741,17 @@
           <w:b w:val="0"/>
           <w:bCs w:val="0"/>
           <w:color w:val="000000"/>
-        </w:rPr>
-      </w:pPr>
-      <w:r>
-        <w:rPr>
-          <w:b w:val="0"/>
-          <w:bCs w:val="0"/>
-          <w:color w:val="000000"/>
-        </w:rPr>
-        <w:t>Decreto Supremo N.° 029-2021-PCM (18/02/2021), que aprueba el Reglamento del Decreto Legislativo N.° 1412, y su modificatoria aprobada por Decreto Supremo N.° 098-2025-PCM.</w:t>
+          <w:highlight w:val="green"/>
+        </w:rPr>
+      </w:pPr>
+      <w:r>
+        <w:rPr>
+          <w:b w:val="0"/>
+          <w:bCs w:val="0"/>
+          <w:color w:val="000000"/>
+          <w:highlight w:val="green"/>
+        </w:rPr>
+        <w:t>Decreto Supremo N.° 157-2021-PCM (25/09/2021), que aprueba el Reglamento del Decreto de Urgencia N.° 006-2020; en particular su cuarta disposición complementaria final, conforme a la cual toda mención al Comité de Gobierno Digital se entiende referida al Comité de Gobierno y Transformación Digital.</w:t>
       </w:r>
     </w:p>
     <w:p>
@@ -2757,7 +2775,15 @@
           <w:bCs w:val="0"/>
           <w:color w:val="000000"/>
         </w:rPr>
-        <w:t>Decreto Supremo N.° 133-2013-EF (22/06/2013), que aprueba el Texto Único Ordenado del Código Tributario; en particular el artículo 85 sobre reserva tributaria.</w:t>
+        <w:t xml:space="preserve">Decreto Supremo N.° 029-2021-PCM (18/02/2021), que aprueba el Reglamento del Decreto Legislativo N.° 1412, </w:t>
+      </w:r>
+      <w:r>
+        <w:rPr>
+          <w:b w:val="0"/>
+          <w:bCs w:val="0"/>
+          <w:color w:val="000000"/>
+        </w:rPr>
+        <w:t>y sus modificatorias aprobadas por Decreto Supremo N.° 075-2023-PCM y Decreto Supremo N.° 098-2025-PCM (31/07/2025).</w:t>
       </w:r>
     </w:p>
     <w:p>
@@ -2781,7 +2807,7 @@
           <w:bCs w:val="0"/>
           <w:color w:val="000000"/>
         </w:rPr>
-        <w:t>Decreto Legislativo N.° 1053 (27/06/2008), que aprueba la Ley General de Aduanas, y su Reglamento; en lo relativo a la confidencialidad de la información aduanera.</w:t>
+        <w:t>Decreto Supremo N.° 133-2013-EF (22/06/2013), que aprueba el Texto Único Ordenado del Código Tributario; en particular el artículo 85 sobre reserva tributaria.</w:t>
       </w:r>
     </w:p>
     <w:p>
@@ -2805,7 +2831,7 @@
           <w:bCs w:val="0"/>
           <w:color w:val="000000"/>
         </w:rPr>
-        <w:t>Ley N.° 29733 (03/07/2011), Ley de Protección de Datos Personales, y su Reglamento aprobado por Decreto Supremo N.° 003-2013-JUS (22/03/2013).</w:t>
+        <w:t>Decreto Legislativo N.° 1053 (27/06/2008), que aprueba la Ley General de Aduanas, y su Reglamento; en lo relativo a la confidencialidad de la información aduanera.</w:t>
       </w:r>
     </w:p>
     <w:p>
@@ -2828,17 +2854,8 @@
           <w:b w:val="0"/>
           <w:bCs w:val="0"/>
           <w:color w:val="000000"/>
-          <w:highlight w:val="yellow"/>
-        </w:rPr>
-        <w:t>Resolución Directoral N.° 000013-2025-INACAL/DN (30/06/2025)</w:t>
-      </w:r>
-      <w:r>
-        <w:rPr>
-          <w:b w:val="0"/>
-          <w:bCs w:val="0"/>
-          <w:color w:val="000000"/>
-        </w:rPr>
-        <w:t>, que aprueba la Norma Técnica Peruana NTP-ISO/IEC 42001:2025, Tecnología de la información — Inteligencia artificial — Sistema de gestión.</w:t>
+        </w:rPr>
+        <w:t>Ley N.° 29733 (03/07/2011), Ley de Protección de Datos Personales, y su Reglamento aprobado por Decreto Supremo N.° 003-2013-JUS (22/03/2013).</w:t>
       </w:r>
     </w:p>
     <w:p>
@@ -2863,7 +2880,15 @@
           <w:color w:val="000000"/>
           <w:highlight w:val="yellow"/>
         </w:rPr>
-        <w:t>Norma Técnica Peruana NTP-ISO/IEC 27001 vigente, Sistemas de gestión de seguridad de la información — Requisitos.</w:t>
+        <w:t>Resolución Directoral N.° 000013-2025-INACAL/DN (30/06/2025)</w:t>
+      </w:r>
+      <w:r>
+        <w:rPr>
+          <w:b w:val="0"/>
+          <w:bCs w:val="0"/>
+          <w:color w:val="000000"/>
+        </w:rPr>
+        <w:t>, que aprueba la Norma Técnica Peruana NTP-ISO/IEC 42001:2025, Tecnología de la información — Inteligencia artificial — Sistema de gestión.</w:t>
       </w:r>
     </w:p>
     <w:p>
@@ -2888,15 +2913,7 @@
           <w:color w:val="000000"/>
           <w:highlight w:val="yellow"/>
         </w:rPr>
-        <w:t>Norma Técnica Peruana NTP-ISO/IEC 27002 vigente, Controles de seguridad de la información</w:t>
-      </w:r>
-      <w:r>
-        <w:rPr>
-          <w:b w:val="0"/>
-          <w:bCs w:val="0"/>
-          <w:color w:val="000000"/>
-        </w:rPr>
-        <w:t>.</w:t>
+        <w:t>Norma Técnica Peruana NTP-ISO/IEC 27001 vigente, Sistemas de gestión de seguridad de la información — Requisitos.</w:t>
       </w:r>
     </w:p>
     <w:p>
@@ -2921,7 +2938,15 @@
           <w:color w:val="000000"/>
           <w:highlight w:val="yellow"/>
         </w:rPr>
-        <w:t>Norma Técnica Peruana NTP-ISO/IEC 27005 vigente, Orientación sobre la gestión de los riesgos de seguridad de la información.</w:t>
+        <w:t>Norma Técnica Peruana NTP-ISO/IEC 27002 vigente, Controles de seguridad de la información</w:t>
+      </w:r>
+      <w:r>
+        <w:rPr>
+          <w:b w:val="0"/>
+          <w:bCs w:val="0"/>
+          <w:color w:val="000000"/>
+        </w:rPr>
+        <w:t>.</w:t>
       </w:r>
     </w:p>
     <w:p>
@@ -2946,15 +2971,7 @@
           <w:color w:val="000000"/>
           <w:highlight w:val="yellow"/>
         </w:rPr>
-        <w:t>Norma Técnica Peruana NTP-ISO 31000 vigente, Gestión del riesgo</w:t>
-      </w:r>
-      <w:r>
-        <w:rPr>
-          <w:b w:val="0"/>
-          <w:bCs w:val="0"/>
-          <w:color w:val="000000"/>
-        </w:rPr>
-        <w:t>.</w:t>
+        <w:t>Norma Técnica Peruana NTP-ISO/IEC 27005 vigente, Orientación sobre la gestión de los riesgos de seguridad de la información.</w:t>
       </w:r>
     </w:p>
     <w:p>
@@ -2970,17 +2987,24 @@
           <w:b w:val="0"/>
           <w:bCs w:val="0"/>
           <w:color w:val="000000"/>
-          <w:highlight w:val="green"/>
-        </w:rPr>
-      </w:pPr>
-      <w:r>
-        <w:rPr>
-          <w:b w:val="0"/>
-          <w:bCs w:val="0"/>
-          <w:color w:val="000000"/>
-          <w:highlight w:val="green"/>
-        </w:rPr>
-        <w:t>Resolución de Superintendencia N.° 000159-2024/SUNAT (02/08/2024), que aprueba el Texto Integrado del Reglamento de Organización y Funciones de la Superintendencia Nacional de Aduanas y de Administración Tributaria - SUNAT (ROF).</w:t>
+        </w:rPr>
+      </w:pPr>
+      <w:r>
+        <w:rPr>
+          <w:b w:val="0"/>
+          <w:bCs w:val="0"/>
+          <w:color w:val="000000"/>
+          <w:highlight w:val="yellow"/>
+        </w:rPr>
+        <w:t>Norma Técnica Peruana NTP-ISO 31000 vigente, Gestión del riesgo</w:t>
+      </w:r>
+      <w:r>
+        <w:rPr>
+          <w:b w:val="0"/>
+          <w:bCs w:val="0"/>
+          <w:color w:val="000000"/>
+        </w:rPr>
+        <w:t>.</w:t>
       </w:r>
     </w:p>
     <w:p>
@@ -3006,7 +3030,7 @@
           <w:color w:val="000000"/>
           <w:highlight w:val="green"/>
         </w:rPr>
-        <w:t>Resolución Ministerial N.° 119-2018-PCM (10/05/2018), que dispone la creación de un Comité de Gobierno Digital en cada entidad de la Administración Pública y establece sus funciones, modificada por la Resolución Ministerial N.° 087-2019-PCM (22/03/2019).</w:t>
+        <w:t>Resolución de Superintendencia N.° 000159-2024/SUNAT (02/08/2024), que aprueba el Texto Integrado del Reglamento de Organización y Funciones de la Superintendencia Nacional de Aduanas y de Administración Tributaria - SUNAT (ROF).</w:t>
       </w:r>
     </w:p>
     <w:p>
@@ -3102,22 +3126,58 @@
           <w:numId w:val="20"/>
         </w:numPr>
         <w:spacing w:line="276" w:lineRule="auto"/>
-        <w:ind w:left="709" w:hanging="567"/>
-        <w:rPr>
-          <w:b w:val="0"/>
-          <w:bCs w:val="0"/>
-          <w:color w:val="000000"/>
-          <w:highlight w:val="yellow"/>
-        </w:rPr>
-      </w:pPr>
-      <w:r>
-        <w:rPr>
-          <w:b w:val="0"/>
-          <w:bCs w:val="0"/>
-          <w:color w:val="000000"/>
-          <w:highlight w:val="yellow"/>
-        </w:rPr>
-        <w:t>Resolución de Oficina N.° 001-2024-SUNAT/1V0000, que aprueba la Metodología para la formulación, aprobación y control de los Documentos Normativos Institucionales (METDONI) Versión 1.4.</w:t>
+        <w:ind w:hanging="578"/>
+        <w:rPr>
+          <w:b w:val="0"/>
+          <w:bCs w:val="0"/>
+          <w:color w:val="000000"/>
+          <w:highlight w:val="green"/>
+        </w:rPr>
+      </w:pPr>
+      <w:r>
+        <w:rPr>
+          <w:b w:val="0"/>
+          <w:bCs w:val="0"/>
+          <w:color w:val="000000"/>
+          <w:highlight w:val="green"/>
+        </w:rPr>
+        <w:t>Resolución de Superintendencia N.° 173-2018/SUNAT (13/07/2018), que aprueba los documentos de Política, Objetivos y Alcance del Sistema de Gestión de Seguridad de la Información de la SUNAT, entre ellos la Política de Seguridad de la Información (SGSI-PO-01).</w:t>
+      </w:r>
+    </w:p>
+    <w:p>
+      <w:pPr>
+        <w:pStyle w:val="Prrafodelista"/>
+        <w:numPr>
+          <w:ilvl w:val="1"/>
+          <w:numId w:val="20"/>
+        </w:numPr>
+        <w:spacing w:line="276" w:lineRule="auto"/>
+        <w:ind w:hanging="578"/>
+        <w:rPr>
+          <w:b w:val="0"/>
+          <w:bCs w:val="0"/>
+          <w:color w:val="000000"/>
+          <w:highlight w:val="green"/>
+        </w:rPr>
+      </w:pPr>
+      <w:r>
+        <w:rPr>
+          <w:b w:val="0"/>
+          <w:bCs w:val="0"/>
+          <w:color w:val="000000"/>
+          <w:highlight w:val="green"/>
+        </w:rPr>
+        <w:t xml:space="preserve">Resolución de Superintendencia N.° 050-2019/SUNAT (06/03/2019), que aprueba los documentos del Sistema de Gestión de Seguridad de la Información de la SUNAT, </w:t>
+      </w:r>
+      <w:r>
+        <w:rPr>
+          <w:b w:val="0"/>
+          <w:bCs w:val="0"/>
+          <w:color w:val="000000"/>
+          <w:highlight w:val="green"/>
+        </w:rPr>
+        <w:lastRenderedPageBreak/>
+        <w:t>entre ellos el Manual de Políticas del Sistema de Gestión de Seguridad de la Información (SGSI-MA-03).</w:t>
       </w:r>
     </w:p>
     <w:p>
@@ -3133,17 +3193,44 @@
           <w:b w:val="0"/>
           <w:bCs w:val="0"/>
           <w:color w:val="000000"/>
-          <w:highlight w:val="lightGray"/>
-        </w:rPr>
-      </w:pPr>
-      <w:r>
-        <w:rPr>
-          <w:b w:val="0"/>
-          <w:bCs w:val="0"/>
-          <w:color w:val="000000"/>
-          <w:highlight w:val="lightGray"/>
-        </w:rPr>
-        <w:t>Resolución de Oficina N.° 000002-2023-SUNAT/1V0000, que aprueba la Metodología para la Gestión por Procesos (METGEP) Versión 5.</w:t>
+          <w:highlight w:val="yellow"/>
+        </w:rPr>
+      </w:pPr>
+      <w:r>
+        <w:rPr>
+          <w:b w:val="0"/>
+          <w:bCs w:val="0"/>
+          <w:color w:val="000000"/>
+          <w:highlight w:val="yellow"/>
+        </w:rPr>
+        <w:t>Resolución de Oficina N.° 001-2024-SUNAT/1V0000</w:t>
+      </w:r>
+      <w:r>
+        <w:rPr>
+          <w:b w:val="0"/>
+          <w:bCs w:val="0"/>
+          <w:color w:val="000000"/>
+          <w:highlight w:val="yellow"/>
+        </w:rPr>
+        <w:t xml:space="preserve"> </w:t>
+      </w:r>
+      <w:r>
+        <w:rPr>
+          <w:b w:val="0"/>
+          <w:bCs w:val="0"/>
+          <w:color w:val="000000"/>
+          <w:highlight w:val="yellow"/>
+        </w:rPr>
+        <w:t>(16/12/2024)</w:t>
+      </w:r>
+      <w:r>
+        <w:rPr>
+          <w:b w:val="0"/>
+          <w:bCs w:val="0"/>
+          <w:color w:val="000000"/>
+          <w:highlight w:val="yellow"/>
+        </w:rPr>
+        <w:t>, que aprueba la Metodología para la formulación, aprobación y control de los Documentos Normativos Institucionales (METDONI) Versión 1.4.</w:t>
       </w:r>
     </w:p>
     <w:p>
@@ -3159,17 +3246,53 @@
           <w:b w:val="0"/>
           <w:bCs w:val="0"/>
           <w:color w:val="000000"/>
-          <w:highlight w:val="green"/>
-        </w:rPr>
-      </w:pPr>
-      <w:r>
-        <w:rPr>
-          <w:b w:val="0"/>
-          <w:bCs w:val="0"/>
-          <w:color w:val="000000"/>
-          <w:highlight w:val="green"/>
-        </w:rPr>
-        <w:t>Resolución de Intendencia N.° 004-2019/SUNAT/1U0000 (02/09/2019), que aprueba los Principios de Arquitectura de TI.</w:t>
+          <w:highlight w:val="lightGray"/>
+        </w:rPr>
+      </w:pPr>
+      <w:r>
+        <w:rPr>
+          <w:b w:val="0"/>
+          <w:bCs w:val="0"/>
+          <w:color w:val="000000"/>
+          <w:highlight w:val="lightGray"/>
+        </w:rPr>
+        <w:t>Resolución de Oficina N.° 000002-2023-SUNAT/1V0000</w:t>
+      </w:r>
+      <w:r>
+        <w:rPr>
+          <w:b w:val="0"/>
+          <w:bCs w:val="0"/>
+          <w:color w:val="000000"/>
+          <w:highlight w:val="lightGray"/>
+        </w:rPr>
+        <w:t xml:space="preserve"> </w:t>
+      </w:r>
+      <w:r>
+        <w:rPr>
+          <w:b w:val="0"/>
+          <w:bCs w:val="0"/>
+          <w:color w:val="000000"/>
+          <w:highlight w:val="lightGray"/>
+        </w:rPr>
+        <w:t>(22/12/2023)</w:t>
+      </w:r>
+      <w:r>
+        <w:rPr>
+          <w:b w:val="0"/>
+          <w:bCs w:val="0"/>
+          <w:color w:val="000000"/>
+          <w:highlight w:val="lightGray"/>
+        </w:rPr>
+        <w:t>, que aprueba la Metodología para la Gestión por Procesos (METGEP) Versión 5.</w:t>
+      </w:r>
+      <w:r>
+        <w:rPr>
+          <w:b w:val="0"/>
+          <w:bCs w:val="0"/>
+          <w:color w:val="000000"/>
+          <w:highlight w:val="lightGray"/>
+        </w:rPr>
+        <w:t>0.</w:t>
       </w:r>
     </w:p>
     <w:p>
@@ -3195,7 +3318,32 @@
           <w:color w:val="000000"/>
           <w:highlight w:val="green"/>
         </w:rPr>
-        <w:lastRenderedPageBreak/>
+        <w:t>Resolución de Intendencia N.° 004-2019/SUNAT/1U0000 (02/09/2019), que aprueba los Principios de Arquitectura de TI.</w:t>
+      </w:r>
+    </w:p>
+    <w:p>
+      <w:pPr>
+        <w:pStyle w:val="Prrafodelista"/>
+        <w:numPr>
+          <w:ilvl w:val="1"/>
+          <w:numId w:val="20"/>
+        </w:numPr>
+        <w:spacing w:line="276" w:lineRule="auto"/>
+        <w:ind w:left="709" w:hanging="567"/>
+        <w:rPr>
+          <w:b w:val="0"/>
+          <w:bCs w:val="0"/>
+          <w:color w:val="000000"/>
+          <w:highlight w:val="green"/>
+        </w:rPr>
+      </w:pPr>
+      <w:r>
+        <w:rPr>
+          <w:b w:val="0"/>
+          <w:bCs w:val="0"/>
+          <w:color w:val="000000"/>
+          <w:highlight w:val="green"/>
+        </w:rPr>
         <w:t>Resolución de Intendencia N.° 011-2019/SUNAT/1U0000 (21/10/2019), que aprueba los Lineamientos de Arquitectura de TI.</w:t>
       </w:r>
     </w:p>
@@ -9702,7 +9850,6 @@
           <w:color w:val="000000"/>
         </w:rPr>
       </w:pPr>
-      <w:proofErr w:type="gramStart"/>
       <w:r>
         <w:rPr>
           <w:rFonts w:ascii="Arial" w:eastAsia="Arial" w:hAnsi="Arial" w:cs="Arial"/>
@@ -9725,16 +9872,7 @@
           <w:color w:val="000000"/>
           <w:highlight w:val="green"/>
         </w:rPr>
-        <w:t>Todo</w:t>
-      </w:r>
-      <w:proofErr w:type="gramEnd"/>
-      <w:r>
-        <w:rPr>
-          <w:rFonts w:ascii="Arial" w:eastAsia="Arial" w:hAnsi="Arial" w:cs="Arial"/>
-          <w:color w:val="000000"/>
-          <w:highlight w:val="green"/>
-        </w:rPr>
-        <w:t xml:space="preserve"> SBIA cuenta con un equipo técnico multidisciplinario, conformado en función de la necesidad y la complejidad de la materia o del problema público que atiende, conforme al numeral 28.3 del artículo 28 del RLIA. El propietario del caso de uso y el custodio técnico lo conforman previamente al inicio del desarrollo o adquisición, y lo integran, cuando menos, con las unidades de organización cuya competencia comprenda las materias que el SBIA involucra. Su composición se registra en la Ficha de Registro de SBIA (Anexo N.° 1).</w:t>
+        <w:t>Todo SBIA cuenta con un equipo técnico multidisciplinario, conformado en función de la necesidad y la complejidad de la materia o del problema público que atiende, conforme al numeral 28.3 del artículo 28 del RLIA. El propietario del caso de uso y el custodio técnico lo conforman previamente al inicio del desarrollo o adquisición, y lo integran, cuando menos, con las unidades de organización cuya competencia comprenda las materias que el SBIA involucra. Su composición se registra en la Ficha de Registro de SBIA (Anexo N.° 1).</w:t>
       </w:r>
     </w:p>
     <w:p>
@@ -11250,25 +11388,7 @@
           <w:color w:val="000000"/>
           <w:highlight w:val="green"/>
         </w:rPr>
-        <w:t xml:space="preserve">Los SBIA cumplen la Política de Seguridad de la Información (SGSI-PO-01) y el Manual de Políticas del Sistema de Gestión de Seguridad de la Información (SGSI-MA-03) de la SUNAT, en sus versiones vigentes, que </w:t>
-      </w:r>
-      <w:proofErr w:type="gramStart"/>
-      <w:r>
-        <w:rPr>
-          <w:rFonts w:ascii="Arial" w:eastAsia="Arial" w:hAnsi="Arial" w:cs="Arial"/>
-          <w:color w:val="000000"/>
-          <w:highlight w:val="green"/>
-        </w:rPr>
-        <w:t>son de aplicación</w:t>
-      </w:r>
-      <w:proofErr w:type="gramEnd"/>
-      <w:r>
-        <w:rPr>
-          <w:rFonts w:ascii="Arial" w:eastAsia="Arial" w:hAnsi="Arial" w:cs="Arial"/>
-          <w:color w:val="000000"/>
-          <w:highlight w:val="green"/>
-        </w:rPr>
-        <w:t xml:space="preserve"> a todo colaborador y tercero vinculado que gestione información de la institución. Cuando un SBIA soporte un proceso comprendido en el alcance del Sistema de Gestión de Seguridad de la Información, le son exigibles además los demás documentos normativos y lineamientos de dicho Sistema.</w:t>
+        <w:t>Los SBIA cumplen la Política de Seguridad de la Información (SGSI-PO-01) y el Manual de Políticas del Sistema de Gestión de Seguridad de la Información (SGSI-MA-03) de la SUNAT, en sus versiones vigentes, que son de aplicación a todo colaborador y tercero vinculado que gestione información de la institución. Cuando un SBIA soporte un proceso comprendido en el alcance del Sistema de Gestión de Seguridad de la Información, le son exigibles además los demás documentos normativos y lineamientos de dicho Sistema.</w:t>
       </w:r>
     </w:p>
     <w:p>
@@ -11720,7 +11840,6 @@
           <w:color w:val="000000"/>
         </w:rPr>
       </w:pPr>
-      <w:proofErr w:type="gramStart"/>
       <w:r>
         <w:rPr>
           <w:rFonts w:ascii="Arial" w:eastAsia="Arial" w:hAnsi="Arial" w:cs="Arial"/>
@@ -11743,16 +11862,7 @@
           <w:color w:val="000000"/>
           <w:highlight w:val="green"/>
         </w:rPr>
-        <w:t>El</w:t>
-      </w:r>
-      <w:proofErr w:type="gramEnd"/>
-      <w:r>
-        <w:rPr>
-          <w:rFonts w:ascii="Arial" w:eastAsia="Arial" w:hAnsi="Arial" w:cs="Arial"/>
-          <w:color w:val="000000"/>
-          <w:highlight w:val="green"/>
-        </w:rPr>
-        <w:t xml:space="preserve"> propietario del caso de uso, con el custodio técnico del SBIA, define el tratamiento de</w:t>
+        <w:t>El propietario del caso de uso, con el custodio técnico del SBIA, define el tratamiento de</w:t>
       </w:r>
       <w:r>
         <w:rPr>
@@ -15239,25 +15349,7 @@
           <w:color w:val="000000"/>
           <w:highlight w:val="yellow"/>
         </w:rPr>
-        <w:t xml:space="preserve"> </w:t>
-      </w:r>
-      <w:proofErr w:type="gramStart"/>
-      <w:r>
-        <w:rPr>
-          <w:rFonts w:ascii="Arial" w:eastAsia="Arial" w:hAnsi="Arial" w:cs="Arial"/>
-          <w:color w:val="000000"/>
-          <w:highlight w:val="yellow"/>
-        </w:rPr>
-        <w:t>son de aplicación</w:t>
-      </w:r>
-      <w:proofErr w:type="gramEnd"/>
-      <w:r>
-        <w:rPr>
-          <w:rFonts w:ascii="Arial" w:eastAsia="Arial" w:hAnsi="Arial" w:cs="Arial"/>
-          <w:color w:val="000000"/>
-          <w:highlight w:val="yellow"/>
-        </w:rPr>
-        <w:t xml:space="preserve"> en la SUNAT desde su entrada en vigencia. La Comisión de Gobierno de IA evalúa su impacto en la presente directiva y propone al CGTD los ajustes que correspondan.</w:t>
+        <w:t xml:space="preserve"> son de aplicación en la SUNAT desde su entrada en vigencia. La Comisión de Gobierno de IA evalúa su impacto en la presente directiva y propone al CGTD los ajustes que correspondan.</w:t>
       </w:r>
     </w:p>
     <w:p>
@@ -17660,23 +17752,7 @@
                 <w:rFonts w:ascii="Arial" w:eastAsia="Arial" w:hAnsi="Arial" w:cs="Arial"/>
                 <w:lang w:val="en-US"/>
               </w:rPr>
-              <w:t xml:space="preserve">Human-in-the-loop, on-the-loop </w:t>
-            </w:r>
-            <w:proofErr w:type="gramStart"/>
-            <w:r>
-              <w:rPr>
-                <w:rFonts w:ascii="Arial" w:eastAsia="Arial" w:hAnsi="Arial" w:cs="Arial"/>
-                <w:lang w:val="en-US"/>
-              </w:rPr>
-              <w:t>o in</w:t>
-            </w:r>
-            <w:proofErr w:type="gramEnd"/>
-            <w:r>
-              <w:rPr>
-                <w:rFonts w:ascii="Arial" w:eastAsia="Arial" w:hAnsi="Arial" w:cs="Arial"/>
-                <w:lang w:val="en-US"/>
-              </w:rPr>
-              <w:t>-command.</w:t>
+              <w:t>Human-in-the-loop, on-the-loop o in-command.</w:t>
             </w:r>
           </w:p>
         </w:tc>

</xml_diff>

<commit_message>
docs: revisión de calidad (tanda 22) — precisa el derecho a la explicación del numeral 6.9.3
- 6.9.3: alinea el derecho a recibir la explicacion al numeral 25.3 del articulo 25 del RLIA — se activa cuando el SBIA impacta en derechos humanos y corresponde a las personas afectadas
- Limpieza de marcas de resaltado de edicion y actualizacion de los numeros de pagina del indice (sin perdida de contenido)
- Regenera el espejo de texto desde el .docx; 0 comentarios pendientes
</commit_message>
<xml_diff>
--- a/normativo/DIRECTIVA-GOBIERNO-IA.docx
+++ b/normativo/DIRECTIVA-GOBIERNO-IA.docx
@@ -612,23 +612,7 @@
           <w:szCs w:val="22"/>
         </w:rPr>
         <w:fldChar w:fldCharType="begin"/>
-      </w:r>
-      <w:r>
-        <w:rPr>
-          <w:rFonts w:ascii="Arial" w:hAnsi="Arial" w:cs="Arial"/>
-          <w:bCs/>
-          <w:noProof w:val="0"/>
-          <w:szCs w:val="22"/>
-        </w:rPr>
         <w:instrText xml:space="preserve"> TOC \o "1-3" \h \z \u </w:instrText>
-      </w:r>
-      <w:r>
-        <w:rPr>
-          <w:rFonts w:ascii="Arial" w:hAnsi="Arial" w:cs="Arial"/>
-          <w:bCs/>
-          <w:noProof w:val="0"/>
-          <w:szCs w:val="22"/>
-        </w:rPr>
         <w:fldChar w:fldCharType="separate"/>
       </w:r>
       <w:hyperlink w:anchor="_Toc235003961" w:history="1">
@@ -662,40 +646,10 @@
             <w:webHidden/>
           </w:rPr>
           <w:tab/>
-        </w:r>
-        <w:r>
-          <w:rPr>
-            <w:webHidden/>
-          </w:rPr>
           <w:fldChar w:fldCharType="begin"/>
-        </w:r>
-        <w:r>
-          <w:rPr>
-            <w:webHidden/>
-          </w:rPr>
           <w:instrText xml:space="preserve"> PAGEREF _Toc235003961 \h </w:instrText>
-        </w:r>
-        <w:r>
-          <w:rPr>
-            <w:webHidden/>
-          </w:rPr>
-        </w:r>
-        <w:r>
-          <w:rPr>
-            <w:webHidden/>
-          </w:rPr>
           <w:fldChar w:fldCharType="separate"/>
-        </w:r>
-        <w:r>
-          <w:rPr>
-            <w:webHidden/>
-          </w:rPr>
-          <w:t>5</w:t>
-        </w:r>
-        <w:r>
-          <w:rPr>
-            <w:webHidden/>
-          </w:rPr>
+          <w:t>4</w:t>
           <w:fldChar w:fldCharType="end"/>
         </w:r>
       </w:hyperlink>
@@ -743,40 +697,10 @@
             <w:webHidden/>
           </w:rPr>
           <w:tab/>
-        </w:r>
-        <w:r>
-          <w:rPr>
-            <w:webHidden/>
-          </w:rPr>
           <w:fldChar w:fldCharType="begin"/>
-        </w:r>
-        <w:r>
-          <w:rPr>
-            <w:webHidden/>
-          </w:rPr>
           <w:instrText xml:space="preserve"> PAGEREF _Toc235003962 \h </w:instrText>
-        </w:r>
-        <w:r>
-          <w:rPr>
-            <w:webHidden/>
-          </w:rPr>
-        </w:r>
-        <w:r>
-          <w:rPr>
-            <w:webHidden/>
-          </w:rPr>
           <w:fldChar w:fldCharType="separate"/>
-        </w:r>
-        <w:r>
-          <w:rPr>
-            <w:webHidden/>
-          </w:rPr>
-          <w:t>5</w:t>
-        </w:r>
-        <w:r>
-          <w:rPr>
-            <w:webHidden/>
-          </w:rPr>
+          <w:t>4</w:t>
           <w:fldChar w:fldCharType="end"/>
         </w:r>
       </w:hyperlink>
@@ -824,40 +748,10 @@
             <w:webHidden/>
           </w:rPr>
           <w:tab/>
-        </w:r>
-        <w:r>
-          <w:rPr>
-            <w:webHidden/>
-          </w:rPr>
           <w:fldChar w:fldCharType="begin"/>
-        </w:r>
-        <w:r>
-          <w:rPr>
-            <w:webHidden/>
-          </w:rPr>
           <w:instrText xml:space="preserve"> PAGEREF _Toc235003963 \h </w:instrText>
-        </w:r>
-        <w:r>
-          <w:rPr>
-            <w:webHidden/>
-          </w:rPr>
-        </w:r>
-        <w:r>
-          <w:rPr>
-            <w:webHidden/>
-          </w:rPr>
           <w:fldChar w:fldCharType="separate"/>
-        </w:r>
-        <w:r>
-          <w:rPr>
-            <w:webHidden/>
-          </w:rPr>
-          <w:t>5</w:t>
-        </w:r>
-        <w:r>
-          <w:rPr>
-            <w:webHidden/>
-          </w:rPr>
+          <w:t>4</w:t>
           <w:fldChar w:fldCharType="end"/>
         </w:r>
       </w:hyperlink>
@@ -905,40 +799,10 @@
             <w:webHidden/>
           </w:rPr>
           <w:tab/>
-        </w:r>
-        <w:r>
-          <w:rPr>
-            <w:webHidden/>
-          </w:rPr>
           <w:fldChar w:fldCharType="begin"/>
-        </w:r>
-        <w:r>
-          <w:rPr>
-            <w:webHidden/>
-          </w:rPr>
           <w:instrText xml:space="preserve"> PAGEREF _Toc235003964 \h </w:instrText>
-        </w:r>
-        <w:r>
-          <w:rPr>
-            <w:webHidden/>
-          </w:rPr>
-        </w:r>
-        <w:r>
-          <w:rPr>
-            <w:webHidden/>
-          </w:rPr>
           <w:fldChar w:fldCharType="separate"/>
-        </w:r>
-        <w:r>
-          <w:rPr>
-            <w:webHidden/>
-          </w:rPr>
-          <w:t>8</w:t>
-        </w:r>
-        <w:r>
-          <w:rPr>
-            <w:webHidden/>
-          </w:rPr>
+          <w:t>6</w:t>
           <w:fldChar w:fldCharType="end"/>
         </w:r>
       </w:hyperlink>
@@ -986,40 +850,10 @@
             <w:webHidden/>
           </w:rPr>
           <w:tab/>
-        </w:r>
-        <w:r>
-          <w:rPr>
-            <w:webHidden/>
-          </w:rPr>
           <w:fldChar w:fldCharType="begin"/>
-        </w:r>
-        <w:r>
-          <w:rPr>
-            <w:webHidden/>
-          </w:rPr>
           <w:instrText xml:space="preserve"> PAGEREF _Toc235003965 \h </w:instrText>
-        </w:r>
-        <w:r>
-          <w:rPr>
-            <w:webHidden/>
-          </w:rPr>
-        </w:r>
-        <w:r>
-          <w:rPr>
-            <w:webHidden/>
-          </w:rPr>
           <w:fldChar w:fldCharType="separate"/>
-        </w:r>
-        <w:r>
-          <w:rPr>
-            <w:webHidden/>
-          </w:rPr>
-          <w:t>10</w:t>
-        </w:r>
-        <w:r>
-          <w:rPr>
-            <w:webHidden/>
-          </w:rPr>
+          <w:t>7</w:t>
           <w:fldChar w:fldCharType="end"/>
         </w:r>
       </w:hyperlink>
@@ -1067,40 +901,10 @@
             <w:webHidden/>
           </w:rPr>
           <w:tab/>
-        </w:r>
-        <w:r>
-          <w:rPr>
-            <w:webHidden/>
-          </w:rPr>
           <w:fldChar w:fldCharType="begin"/>
-        </w:r>
-        <w:r>
-          <w:rPr>
-            <w:webHidden/>
-          </w:rPr>
           <w:instrText xml:space="preserve"> PAGEREF _Toc235003966 \h </w:instrText>
-        </w:r>
-        <w:r>
-          <w:rPr>
-            <w:webHidden/>
-          </w:rPr>
-        </w:r>
-        <w:r>
-          <w:rPr>
-            <w:webHidden/>
-          </w:rPr>
           <w:fldChar w:fldCharType="separate"/>
-        </w:r>
-        <w:r>
-          <w:rPr>
-            <w:webHidden/>
-          </w:rPr>
-          <w:t>18</w:t>
-        </w:r>
-        <w:r>
-          <w:rPr>
-            <w:webHidden/>
-          </w:rPr>
+          <w:t>10</w:t>
           <w:fldChar w:fldCharType="end"/>
         </w:r>
       </w:hyperlink>
@@ -1148,40 +952,10 @@
             <w:webHidden/>
           </w:rPr>
           <w:tab/>
-        </w:r>
-        <w:r>
-          <w:rPr>
-            <w:webHidden/>
-          </w:rPr>
           <w:fldChar w:fldCharType="begin"/>
-        </w:r>
-        <w:r>
-          <w:rPr>
-            <w:webHidden/>
-          </w:rPr>
           <w:instrText xml:space="preserve"> PAGEREF _Toc235003967 \h </w:instrText>
-        </w:r>
-        <w:r>
-          <w:rPr>
-            <w:webHidden/>
-          </w:rPr>
-        </w:r>
-        <w:r>
-          <w:rPr>
-            <w:webHidden/>
-          </w:rPr>
           <w:fldChar w:fldCharType="separate"/>
-        </w:r>
-        <w:r>
-          <w:rPr>
-            <w:webHidden/>
-          </w:rPr>
-          <w:t>44</w:t>
-        </w:r>
-        <w:r>
-          <w:rPr>
-            <w:webHidden/>
-          </w:rPr>
+          <w:t>21</w:t>
           <w:fldChar w:fldCharType="end"/>
         </w:r>
       </w:hyperlink>
@@ -1229,40 +1003,10 @@
             <w:webHidden/>
           </w:rPr>
           <w:tab/>
-        </w:r>
-        <w:r>
-          <w:rPr>
-            <w:webHidden/>
-          </w:rPr>
           <w:fldChar w:fldCharType="begin"/>
-        </w:r>
-        <w:r>
-          <w:rPr>
-            <w:webHidden/>
-          </w:rPr>
           <w:instrText xml:space="preserve"> PAGEREF _Toc235003968 \h </w:instrText>
-        </w:r>
-        <w:r>
-          <w:rPr>
-            <w:webHidden/>
-          </w:rPr>
-        </w:r>
-        <w:r>
-          <w:rPr>
-            <w:webHidden/>
-          </w:rPr>
           <w:fldChar w:fldCharType="separate"/>
-        </w:r>
-        <w:r>
-          <w:rPr>
-            <w:webHidden/>
-          </w:rPr>
-          <w:t>46</w:t>
-        </w:r>
-        <w:r>
-          <w:rPr>
-            <w:webHidden/>
-          </w:rPr>
+          <w:t>22</w:t>
           <w:fldChar w:fldCharType="end"/>
         </w:r>
       </w:hyperlink>
@@ -1757,7 +1501,7 @@
           <w:bCs w:val="0"/>
           <w:color w:val="000000"/>
         </w:rPr>
-        <w:t>MGPP: Modelo de Gobernabilidad de Programas y Proyectos</w:t>
+        <w:t xml:space="preserve">MGPP: Modelo de Gobernabilidad de Programas y Proyectos</w:t>
       </w:r>
     </w:p>
     <w:p>
@@ -2297,7 +2041,6 @@
           <w:bCs w:val="0"/>
           <w:color w:val="000000"/>
         </w:rPr>
-        <w:lastRenderedPageBreak/>
         <w:t>SGTD: Secretaría de Gobierno y Transformación Digital de la PCM</w:t>
       </w:r>
     </w:p>
@@ -2446,7 +2189,7 @@
           <w:rFonts w:ascii="Arial" w:hAnsi="Arial" w:cs="Arial"/>
           <w:highlight w:val="yellow"/>
         </w:rPr>
-        <w:t>Establecer las disposiciones para el gobierno, la gestión del ciclo de vida y el uso responsable de los Sistemas Basados en Inteligencia Artificial (SBIA) en la SUNAT, precisando los compromisos establecidos en la Política de IA y observando la NTP-ISO/IEC 42001:2025 de uso obligatorio conforme al numeral 28.2 del artículo 28 del RLIA, para garantizar su alineamiento con la estrategia institucional, el cumplimiento del marco normativo vigente, la protección de los derechos de los administrados, la reserva tributaria y la seguridad de la información.</w:t>
+        <w:t xml:space="preserve">Establecer las disposiciones para el gobierno, la gestión del ciclo de vida y el uso responsable de los Sistemas Basados en Inteligencia Artificial (SBIA) en la SUNAT, precisando los compromisos establecidos en la Política de IA y observando la NTP-ISO/IEC 42001:2025 de uso obligatorio conforme al numeral 28.2 del artículo 28 del RLIA, para garantizar su alineamiento con la estrategia institucional, el cumplimiento del marco normativo vigente, la protección de los derechos de los administrados, la reserva tributaria y la seguridad de la información.</w:t>
       </w:r>
     </w:p>
     <w:p>
@@ -2462,7 +2205,7 @@
           <w:rFonts w:ascii="Arial" w:hAnsi="Arial" w:cs="Arial"/>
           <w:highlight w:val="green"/>
         </w:rPr>
-        <w:t>La presente directiva regula la gestión de los SBIA solo en lo específico de la inteligencia artificial. No sustituye a los documentos normativos institucionales que regulan la gestión de proyectos, el desarrollo de sistemas, la gobernanza de datos, la seguridad de la información, las contrataciones y la gestión de las personas:</w:t>
+        <w:t xml:space="preserve">La presente directiva regula la gestión de los SBIA solo en lo específico de la inteligencia artificial. No sustituye a los documentos normativos institucionales que regulan la gestión de proyectos, el desarrollo de sistemas, la gobernanza de datos, la seguridad de la información, las contrataciones y la gestión de las personas:</w:t>
       </w:r>
       <w:r>
         <w:rPr>
@@ -2850,7 +2593,7 @@
           <w:bCs w:val="0"/>
           <w:color w:val="000000"/>
         </w:rPr>
-        <w:t>Decreto Supremo N.° 029-2021-PCM (18/02/2021), que aprueba el Reglamento del Decreto Legislativo N.° 1412, y sus modificatorias aprobadas por Decreto Supremo N.° 075-2023-PCM y Decreto Supremo N.° 098-2025-PCM (31/07/2025).</w:t>
+        <w:t xml:space="preserve">Decreto Supremo N.° 029-2021-PCM (18/02/2021), que aprueba el Reglamento del Decreto Legislativo N.° 1412, y sus modificatorias aprobadas por Decreto Supremo N.° 075-2023-PCM y Decreto Supremo N.° 098-2025-PCM (31/07/2025).</w:t>
       </w:r>
     </w:p>
     <w:p>
@@ -3097,7 +2840,7 @@
           <w:color w:val="000000"/>
           <w:highlight w:val="green"/>
         </w:rPr>
-        <w:t>Resolución de Superintendencia N.° 000144-2026/SUNAT (30/07/2026), que aprueba la Política de uso seguro, responsable y ético de los sistemas basados en inteligencia artificial en la Superintendencia Nacional de Aduanas y de Administración Tributaria</w:t>
+        <w:t xml:space="preserve">Resolución de Superintendencia N.° 000144-2026/SUNAT (30/07/2026), que aprueba la Política de uso seguro, responsable y ético de los sistemas basados en inteligencia artificial en la Superintendencia Nacional de Aduanas y de Administración Tributaria</w:t>
       </w:r>
       <w:r>
         <w:rPr>
@@ -3166,7 +2909,9 @@
           <w:color w:val="000000"/>
           <w:highlight w:val="green"/>
         </w:rPr>
-        <w:t>Resolución de Superintendencia N.° 050-2019/SUNAT (06/03/2019), que aprueba los documentos del Sistema de Gestión de Seguridad de la Información de la SUNAT, entre ellos el Manual de Políticas del Sistema de Gestión de Seguridad de la Información (SGSI-MA-03).</w:t>
+        <w:t xml:space="preserve">Resolución de Superintendencia N.° 050-2019/SUNAT (06/03/2019), que aprueba los documentos del Sistema de Gestión de Seguridad de la Información de la SUNAT, </w:t>
+        <w:lastRenderedPageBreak/>
+        <w:t>entre ellos el Manual de Políticas del Sistema de Gestión de Seguridad de la Información (SGSI-MA-03).</w:t>
       </w:r>
     </w:p>
     <w:p>
@@ -3192,7 +2937,7 @@
           <w:color w:val="000000"/>
           <w:highlight w:val="yellow"/>
         </w:rPr>
-        <w:t>Resolución de Oficina N.° 001-2024-SUNAT/1V0000 (16/12/2024), que aprueba la Metodología para la formulación, aprobación y control de los Documentos Normativos Institucionales (METDONI) Versión 1.4.</w:t>
+        <w:t xml:space="preserve">Resolución de Oficina N.° 001-2024-SUNAT/1V0000 (16/12/2024), que aprueba la Metodología para la formulación, aprobación y control de los Documentos Normativos Institucionales (METDONI) Versión 1.4.</w:t>
       </w:r>
     </w:p>
     <w:p>
@@ -3218,8 +2963,7 @@
           <w:color w:val="000000"/>
           <w:highlight w:val="lightGray"/>
         </w:rPr>
-        <w:lastRenderedPageBreak/>
-        <w:t>Resolución de Oficina N.° 000002-2023-SUNAT/1V0000 (22/12/2023), que aprueba la Metodología para la Gestión por Procesos (METGEP) Versión 5.0.</w:t>
+        <w:t xml:space="preserve">Resolución de Oficina N.° 000002-2023-SUNAT/1V0000 (22/12/2023), que aprueba la Metodología para la Gestión por Procesos (METGEP) Versión 5.0.</w:t>
       </w:r>
     </w:p>
     <w:p>
@@ -3399,7 +3143,7 @@
           <w:bCs w:val="0"/>
           <w:color w:val="000000"/>
         </w:rPr>
-        <w:t>: Conjunto de etapas secuenciales e iterativas desde la ideación hasta el retiro de un SBIA. Sus etapas son las previstas en el numeral 6.1.1 de la presente directiva. [ISO/IEC 22989:2022, sección 3.2.1; NTP-ISO/IEC 42001:2025, Anexo A, A.6]</w:t>
+        <w:t xml:space="preserve">: Conjunto de etapas secuenciales e iterativas desde la ideación hasta el retiro de un SBIA. Sus etapas son las previstas en el numeral 6.1.1 de la presente directiva. [ISO/IEC 22989:2022, sección 3.2.1; NTP-ISO/IEC 42001:2025, Anexo A, A.6]</w:t>
       </w:r>
     </w:p>
     <w:p>
@@ -3653,17 +3397,7 @@
           <w:color w:val="000000"/>
           <w:highlight w:val="yellow"/>
         </w:rPr>
-        <w:t xml:space="preserve">Proceso sistemático y documentado para identificar, analizar y evaluar los riesgos y efectos potenciales que un SBIA </w:t>
-      </w:r>
-      <w:r>
-        <w:rPr>
-          <w:b w:val="0"/>
-          <w:bCs w:val="0"/>
-          <w:color w:val="000000"/>
-          <w:highlight w:val="yellow"/>
-        </w:rPr>
-        <w:lastRenderedPageBreak/>
-        <w:t xml:space="preserve">genera sobre los derechos de los administrados, previo a su desarrollo, adquisición o implementación. </w:t>
+        <w:t xml:space="preserve">Proceso sistemático y documentado para identificar, analizar y evaluar los riesgos y efectos potenciales que un SBIA genera sobre los derechos de los administrados, previo a su desarrollo, adquisición o implementación. </w:t>
       </w:r>
       <w:r>
         <w:rPr>
@@ -3673,7 +3407,7 @@
           <w:highlight w:val="yellow"/>
           <w:lang w:val="en-US"/>
         </w:rPr>
-        <w:t>[D.S. N.° 115-2025-PCM, Art. 30; NTP-ISO/IEC 42001:2025, Anexo A, A.5.2]</w:t>
+        <w:t xml:space="preserve">[D.S. N.° 115-2025-PCM, Art. 30; NTP-ISO/IEC 42001:2025, Anexo A, A.5.2]</w:t>
       </w:r>
     </w:p>
     <w:p>
@@ -3755,6 +3489,7 @@
         <w:rPr>
           <w:color w:val="000000"/>
         </w:rPr>
+        <w:lastRenderedPageBreak/>
         <w:t>Hito de aprobación:</w:t>
       </w:r>
       <w:r>
@@ -3803,7 +3538,7 @@
           <w:color w:val="000000"/>
           <w:lang w:val="en-US"/>
         </w:rPr>
-        <w:t>[D.S. N.° 115-2025-PCM, Art. 7 lit. h); ISO/IEC 22989:2022, sección 3.4.3]</w:t>
+        <w:t xml:space="preserve">[D.S. N.° 115-2025-PCM, Art. 7 lit. h); ISO/IEC 22989:2022, sección 3.4.3]</w:t>
       </w:r>
     </w:p>
     <w:p>
@@ -3843,7 +3578,7 @@
           <w:color w:val="000000"/>
           <w:lang w:val="en-US"/>
         </w:rPr>
-        <w:t>[D.S. N.° 115-2025-PCM, Art. 7 lit. h); ISO/IEC 22989:2022, sección 3.4.4]</w:t>
+        <w:t xml:space="preserve">[D.S. N.° 115-2025-PCM, Art. 7 lit. h); ISO/IEC 22989:2022, sección 3.4.4]</w:t>
       </w:r>
     </w:p>
     <w:p>
@@ -4001,7 +3736,7 @@
           <w:color w:val="000000"/>
           <w:highlight w:val="green"/>
         </w:rPr>
-        <w:t>Unidad de organización que, de acuerdo con sus competencias y funciones en el ROF, es el dueño del proceso en el que se identifica la necesidad a atender mediante un SBIA y que asume la responsabilidad funcional sobre sus resultados y sobre los riesgos derivados de su utilización durante todo su ciclo de vida. Se distingue del custodio técnico, definido en el presente glosario. [METGEP, numeral 4.9; METDONI, numeral 4.6; NTP-ISO/IEC 42001:2025, cláusula 5.3]</w:t>
+        <w:t xml:space="preserve">Unidad de organización que, de acuerdo con sus competencias y funciones en el ROF, es el dueño del proceso en el que se identifica la necesidad a atender mediante un SBIA y que asume la responsabilidad funcional sobre sus resultados y sobre los riesgos derivados de su utilización durante todo su ciclo de vida. Se distingue del custodio técnico, definido en el presente glosario. [METGEP, numeral 4.9; METDONI, numeral 4.6; NTP-ISO/IEC 42001:2025, cláusula 5.3]</w:t>
       </w:r>
     </w:p>
     <w:p>
@@ -4025,7 +3760,6 @@
           <w:color w:val="000000"/>
           <w:highlight w:val="green"/>
         </w:rPr>
-        <w:lastRenderedPageBreak/>
         <w:t>Red Teaming:</w:t>
       </w:r>
       <w:r>
@@ -4068,7 +3802,9 @@
           <w:color w:val="000000"/>
           <w:highlight w:val="green"/>
         </w:rPr>
-        <w:t xml:space="preserve"> Carácter de información reservada que el artículo 85 del TUO del Código Tributario atribuye, por su objeto, a la cuantía y la fuente de las rentas, los gastos, la base imponible y cualesquiera otros datos relativos a ellos, cuando están contenidos en las declaraciones e informaciones que la Administración Tributaria obtiene por cualquier medio de los contribuyentes, responsables o terceros, así como a la tramitación de las denuncias a que se refiere el artículo 192 del mismo Código. Dicha información únicamente puede ser utilizada por la Administración Tributaria para sus fines propios y la obligación de reserva alcanza a quienes accedan a ella. El mismo artículo establece excepciones expresas. La determinación de si una información concreta está sujeta a reserva tributaria se efectúa respecto de esa información y no se presume respecto de todo el acervo de datos que la SUNAT administra. [D.S. N.° 133-2013-EF, Art. 85]</w:t>
+        <w:t xml:space="preserve"> Carácter de información reservada que el artículo 85 del TUO del Código Tributario atribuye, por su objeto, a la cuantía y la fuente de las rentas, los gastos, la base imponible y cualesquiera otros datos relativos a ellos, cuando están contenidos en las declaraciones e informaciones que la Administración Tributaria obtiene por cualquier medio de los contribuyentes, responsables o terceros, así como a la tramitación de las denuncias a que se refiere el artículo 192 del mismo Código. Dicha información únicamente puede ser utilizada por la Administración Tributaria para sus fines propios y la obligación de reserva alcanza a </w:t>
+        <w:lastRenderedPageBreak/>
+        <w:t>quienes accedan a ella. El mismo artículo establece excepciones expresas. La determinación de si una información concreta está sujeta a reserva tributaria se efectúa respecto de esa información y no se presume respecto de todo el acervo de datos que la SUNAT administra. [D.S. N.° 133-2013-EF, Art. 85]</w:t>
       </w:r>
     </w:p>
     <w:p>
@@ -4108,7 +3844,7 @@
           <w:color w:val="000000"/>
           <w:lang w:val="en-US"/>
         </w:rPr>
-        <w:t>[Ley N.° 31814, Art. 2; D.S. N.° 115-2025-PCM, Art. 6 lit. j]</w:t>
+        <w:t xml:space="preserve">[Ley N.° 31814, Art. 2; D.S. N.° 115-2025-PCM, Art. 6 lit. j]</w:t>
       </w:r>
     </w:p>
     <w:p>
@@ -4265,8 +4001,6 @@
       </w:pPr>
       <w:r>
         <w:t>5.1</w:t>
-      </w:r>
-      <w:r>
         <w:tab/>
         <w:t>De los principios para el Gobierno de IA</w:t>
       </w:r>
@@ -4286,14 +4020,7 @@
           <w:rFonts w:ascii="Arial" w:eastAsia="Arial" w:hAnsi="Arial" w:cs="Arial"/>
           <w:color w:val="000000"/>
         </w:rPr>
-        <w:lastRenderedPageBreak/>
         <w:t>5.1.1</w:t>
-      </w:r>
-      <w:r>
-        <w:rPr>
-          <w:rFonts w:ascii="Arial" w:eastAsia="Arial" w:hAnsi="Arial" w:cs="Arial"/>
-          <w:color w:val="000000"/>
-        </w:rPr>
         <w:tab/>
       </w:r>
       <w:r>
@@ -4324,7 +4051,7 @@
           <w:rFonts w:ascii="Arial" w:hAnsi="Arial" w:cs="Arial"/>
           <w:highlight w:val="yellow"/>
         </w:rPr>
-        <w:t>Política de IA</w:t>
+        <w:t xml:space="preserve">Política de IA</w:t>
       </w:r>
       <w:r>
         <w:rPr>
@@ -4352,13 +4079,6 @@
           <w:highlight w:val="lightGray"/>
         </w:rPr>
         <w:t>5.1.2</w:t>
-      </w:r>
-      <w:r>
-        <w:rPr>
-          <w:rFonts w:ascii="Arial" w:hAnsi="Arial" w:cs="Arial"/>
-          <w:color w:val="000000"/>
-          <w:highlight w:val="lightGray"/>
-        </w:rPr>
         <w:tab/>
         <w:t xml:space="preserve">Los derechos fundamentales son intangibles y constituyen el límite de toda actuación administrativa. Por ello, cuando exista la posibilidad de que la operación de un SBIA pueda afectar los derechos fundamentales de las personas, se priorizará siempre la protección de éstos últimos. </w:t>
       </w:r>
@@ -4380,13 +4100,6 @@
           <w:highlight w:val="yellow"/>
         </w:rPr>
         <w:t>5.1.3</w:t>
-      </w:r>
-      <w:r>
-        <w:rPr>
-          <w:rFonts w:ascii="Arial" w:eastAsia="Arial" w:hAnsi="Arial" w:cs="Arial"/>
-          <w:color w:val="000000"/>
-          <w:highlight w:val="yellow"/>
-        </w:rPr>
         <w:tab/>
         <w:t>La reserva tributaria constituye criterio determinante en la evaluación de riesgo de todo SBIA que procese información de contribuyentes.</w:t>
       </w:r>
@@ -4409,14 +4122,6 @@
           <w:highlight w:val="cyan"/>
         </w:rPr>
         <w:t>5.1.4</w:t>
-      </w:r>
-      <w:r>
-        <w:rPr>
-          <w:b w:val="0"/>
-          <w:bCs w:val="0"/>
-          <w:color w:val="000000"/>
-          <w:highlight w:val="cyan"/>
-        </w:rPr>
         <w:tab/>
         <w:t>El Gobierno de IA se orienta a la generación de valor público. Toda iniciativa de SBIA responde a un problema real y relevante de la administración y produce un beneficio verificable para las personas o para la gestión institucional; no se promueven usos de IA sin una necesidad que los justifique.</w:t>
       </w:r>
@@ -4438,13 +4143,6 @@
           <w:highlight w:val="yellow"/>
         </w:rPr>
         <w:t>5.1.5</w:t>
-      </w:r>
-      <w:r>
-        <w:rPr>
-          <w:rFonts w:ascii="Arial" w:eastAsia="Arial" w:hAnsi="Arial" w:cs="Arial"/>
-          <w:color w:val="000000"/>
-          <w:highlight w:val="yellow"/>
-        </w:rPr>
         <w:tab/>
         <w:t>El Gobierno de IA aplica el principio de proporcionalidad: las exigencias de evaluación, supervisión y control se gradúan según el nivel de riesgo del SBIA. La proporcionalidad no exime del cumplimiento de los controles y obligaciones que el RLIA y la presente directiva establecen con carácter obligatorio para cada categoría de riesgo.</w:t>
       </w:r>
@@ -4456,9 +4154,8 @@
         <w:ind w:left="851"/>
       </w:pPr>
       <w:r>
+        <w:lastRenderedPageBreak/>
         <w:t>5.2</w:t>
-      </w:r>
-      <w:r>
         <w:tab/>
         <w:t>De la función de Gobierno de Inteligencia Artificial</w:t>
       </w:r>
@@ -4479,14 +4176,8 @@
           <w:color w:val="000000"/>
         </w:rPr>
         <w:t>5.2.1</w:t>
-      </w:r>
-      <w:r>
-        <w:rPr>
-          <w:rFonts w:ascii="Arial" w:eastAsia="Arial" w:hAnsi="Arial" w:cs="Arial"/>
-          <w:color w:val="000000"/>
-        </w:rPr>
         <w:tab/>
-        <w:t>El Comité de Gobierno y Transformación Digital (CGTD) ejerce la función de gobierno de inteligencia artificial en la SUNAT, conforme al numeral 9.3 del artículo 9 del RLIA, aprobado por Decreto Supremo N.° 115-2025-PCM, y a la Resolución de Superintendencia N.° 084-2019/SUNAT que lo conforma, modificada por las Resoluciones de Superintendencia N.° 142-2019/SUNAT y N.° 000187-2024/SUNAT. El CGTD lidera, dirige, evalúa y supervisa los proyectos de SBIA estratégicos para la entidad. La calificación de estratégico corresponde al CGTD. Se efectúa a más tardar en el acto de aprobación de la clasificación de riesgo y consta en el acuerdo respectivo.</w:t>
+        <w:t xml:space="preserve">El Comité de Gobierno y Transformación Digital (CGTD) ejerce la función de gobierno de inteligencia artificial en la SUNAT, conforme al numeral 9.3 del artículo 9 del RLIA, aprobado por Decreto Supremo N.° 115-2025-PCM, y a la Resolución de Superintendencia N.° 084-2019/SUNAT que lo conforma, modificada por las Resoluciones de Superintendencia N.° 142-2019/SUNAT y N.° 000187-2024/SUNAT. El CGTD lidera, dirige, evalúa y supervisa los proyectos de SBIA estratégicos para la entidad. La calificación de estratégico corresponde al CGTD. Se efectúa a más tardar en el acto de aprobación de la clasificación de riesgo y consta en el acuerdo respectivo.</w:t>
       </w:r>
     </w:p>
     <w:p>
@@ -4497,8 +4188,6 @@
       </w:pPr>
       <w:r>
         <w:t>5.3</w:t>
-      </w:r>
-      <w:r>
         <w:tab/>
         <w:t>De la Comisión de Gobierno de IA</w:t>
       </w:r>
@@ -4520,13 +4209,6 @@
           <w:highlight w:val="green"/>
         </w:rPr>
         <w:t>5.3.1</w:t>
-      </w:r>
-      <w:r>
-        <w:rPr>
-          <w:rFonts w:ascii="Arial" w:eastAsia="Arial" w:hAnsi="Arial" w:cs="Arial"/>
-          <w:color w:val="000000"/>
-          <w:highlight w:val="green"/>
-        </w:rPr>
         <w:tab/>
         <w:t>Para el ejercicio efectivo de la función de gobierno de IA, el CGTD cuenta con la Comisión de Gobierno de IA, instancia de apoyo encargada de preparar las evaluaciones, los informes y las propuestas que el CGTD requiera para la toma de decisiones en materia de IA, y de ejercer las funciones de administración, supervisión y aprobación que la presente directiva le asigna. La Comisión de Gobierno de IA es coordinada por un Coordinador designado por el CGTD.</w:t>
       </w:r>
@@ -4547,14 +4229,8 @@
           <w:color w:val="000000"/>
         </w:rPr>
         <w:t>5.3.2</w:t>
-      </w:r>
-      <w:r>
-        <w:rPr>
-          <w:rFonts w:ascii="Arial" w:eastAsia="Arial" w:hAnsi="Arial" w:cs="Arial"/>
-          <w:color w:val="000000"/>
-        </w:rPr>
         <w:tab/>
-        <w:t>Las funciones de la Comisión de Gobierno de IA, en apoyo al CGTD, se definen en el numeral 5.4 y en las disposiciones específicas de la presente directiva.</w:t>
+        <w:t xml:space="preserve">Las funciones de la Comisión de Gobierno de IA, en apoyo al CGTD, se definen en el numeral 5.4 y en las disposiciones específicas de la presente directiva.</w:t>
       </w:r>
     </w:p>
     <w:p>
@@ -4565,8 +4241,6 @@
       </w:pPr>
       <w:r>
         <w:t>5.4</w:t>
-      </w:r>
-      <w:r>
         <w:tab/>
         <w:t>De los roles y responsabilidades</w:t>
       </w:r>
@@ -4660,7 +4334,6 @@
                 <w:b/>
                 <w:bCs/>
               </w:rPr>
-              <w:lastRenderedPageBreak/>
               <w:t>Instancias de Gobierno de IA</w:t>
             </w:r>
           </w:p>
@@ -4995,6 +4668,7 @@
                 <w:b/>
                 <w:bCs/>
               </w:rPr>
+              <w:lastRenderedPageBreak/>
               <w:t>CGTD (en materia de IA)</w:t>
             </w:r>
           </w:p>
@@ -5297,15 +4971,7 @@
                 <w:b w:val="0"/>
                 <w:bCs w:val="0"/>
               </w:rPr>
-              <w:t xml:space="preserve">Preparar la propuesta del Plan de Acción de Inteligencia Artificial y sus </w:t>
-            </w:r>
-            <w:r>
-              <w:rPr>
-                <w:b w:val="0"/>
-                <w:bCs w:val="0"/>
-              </w:rPr>
-              <w:lastRenderedPageBreak/>
-              <w:t>actualizaciones, conforme al numeral 7.11.</w:t>
+              <w:t xml:space="preserve">Preparar la propuesta del Plan de Acción de Inteligencia Artificial y sus actualizaciones, conforme al numeral 7.11.</w:t>
             </w:r>
           </w:p>
           <w:p>
@@ -5355,6 +5021,7 @@
                 <w:bCs w:val="0"/>
                 <w:highlight w:val="green"/>
               </w:rPr>
+              <w:lastRenderedPageBreak/>
               <w:t>Proponer la clasificación de riesgo de cada SBIA, previo al inicio del desarrollo o adquisición, y elevar al CGTD la relación de las propuestas de riesgo aceptable para su aprobación agregada; la aprobación corresponde conforme al numeral 6.2.2.</w:t>
             </w:r>
           </w:p>
@@ -5476,16 +5143,7 @@
                 <w:bCs w:val="0"/>
                 <w:highlight w:val="green"/>
               </w:rPr>
-              <w:t xml:space="preserve">Aprobar los hitos del ciclo de vida que le corresponden conforme al </w:t>
-            </w:r>
-            <w:r>
-              <w:rPr>
-                <w:b w:val="0"/>
-                <w:bCs w:val="0"/>
-                <w:highlight w:val="green"/>
-              </w:rPr>
-              <w:lastRenderedPageBreak/>
-              <w:t>numeral 6.1.2 y el ciclo de vida simplificado de los SBIA de riesgo aceptable.</w:t>
+              <w:t>Aprobar los hitos del ciclo de vida que le corresponden conforme al numeral 6.1.2 y el ciclo de vida simplificado de los SBIA de riesgo aceptable.</w:t>
             </w:r>
           </w:p>
           <w:p>
@@ -5657,6 +5315,7 @@
                 <w:b/>
                 <w:bCs/>
               </w:rPr>
+              <w:lastRenderedPageBreak/>
               <w:t>Integrantes de la Comisión de Gobierno de IA</w:t>
             </w:r>
           </w:p>
@@ -6069,7 +5728,6 @@
                 <w:color w:val="000000"/>
                 <w:highlight w:val="yellow"/>
               </w:rPr>
-              <w:lastRenderedPageBreak/>
               <w:t>Oficial de Datos Personales</w:t>
             </w:r>
           </w:p>
@@ -6318,6 +5976,7 @@
                 <w:b/>
                 <w:bCs/>
               </w:rPr>
+              <w:lastRenderedPageBreak/>
               <w:t>Ética e Integridad</w:t>
             </w:r>
           </w:p>
@@ -6392,16 +6051,7 @@
                 <w:bCs w:val="0"/>
                 <w:highlight w:val="yellow"/>
               </w:rPr>
-              <w:t xml:space="preserve">En materia de ética, integridad y prevención de sesgos: su opinión sobre la clasificación de riesgo consta de manera expresa en la </w:t>
-            </w:r>
-            <w:r>
-              <w:rPr>
-                <w:b w:val="0"/>
-                <w:bCs w:val="0"/>
-                <w:highlight w:val="yellow"/>
-              </w:rPr>
-              <w:lastRenderedPageBreak/>
-              <w:t>propuesta, conforme al numeral 6.2.2;</w:t>
+              <w:t>En materia de ética, integridad y prevención de sesgos: su opinión sobre la clasificación de riesgo consta de manera expresa en la propuesta, conforme al numeral 6.2.2;</w:t>
             </w:r>
           </w:p>
           <w:p>
@@ -6485,7 +6135,6 @@
                 <w:b/>
                 <w:bCs/>
               </w:rPr>
-              <w:lastRenderedPageBreak/>
               <w:t>Asesoría Legal</w:t>
             </w:r>
           </w:p>
@@ -6593,7 +6242,7 @@
                 <w:bCs w:val="0"/>
                 <w:highlight w:val="green"/>
               </w:rPr>
-              <w:t>Revisa la EIA en materia de cumplimiento normativo. Cuando la revisión comprenda el sentido y el alcance de las normas tributarias o aduaneras, se pronuncia la Intendencia Nacional Jurídico Tributaria o la Intendencia Nacional Jurídico Aduanera, según la materia, a convocatoria de la Comisión de Gobierno de IA.</w:t>
+              <w:t xml:space="preserve">Revisa la EIA en materia de cumplimiento normativo. Cuando la revisión comprenda el sentido y el alcance de las normas tributarias o aduaneras, se pronuncia la Intendencia Nacional Jurídico Tributaria o la Intendencia Nacional Jurídico Aduanera, según la materia, a convocatoria de la Comisión de Gobierno de IA.</w:t>
             </w:r>
           </w:p>
           <w:p>
@@ -6752,16 +6401,9 @@
                 <w:bCs w:val="0"/>
                 <w:highlight w:val="green"/>
               </w:rPr>
-              <w:t xml:space="preserve">Efectúa el análisis de riesgo y las pruebas de vulnerabilidad sobre la arquitectura de aplicaciones, de información y de infraestructura tecnológica que soporta los SBIA, </w:t>
-            </w:r>
-            <w:r>
-              <w:rPr>
-                <w:b w:val="0"/>
-                <w:bCs w:val="0"/>
-                <w:highlight w:val="green"/>
-              </w:rPr>
+              <w:t xml:space="preserve">Efectúa el análisis de riesgo y las pruebas de vulnerabilidad sobre la </w:t>
               <w:lastRenderedPageBreak/>
-              <w:t xml:space="preserve">conforme al literal b) del artículo 106 del ROF. </w:t>
+              <w:t xml:space="preserve">arquitectura de aplicaciones, de información y de infraestructura tecnológica que soporta los SBIA, conforme al literal b) del artículo 106 del ROF. </w:t>
             </w:r>
           </w:p>
           <w:p>
@@ -7333,16 +6975,9 @@
                 <w:bCs w:val="0"/>
                 <w:highlight w:val="lightGray"/>
               </w:rPr>
-              <w:t xml:space="preserve">Contribuye a la evaluación del componente de IA con el conocimiento operativo de los procesos de dicho ámbito y de su impacto en los administrados. Su </w:t>
-            </w:r>
-            <w:r>
-              <w:rPr>
-                <w:b w:val="0"/>
-                <w:bCs w:val="0"/>
-                <w:highlight w:val="lightGray"/>
-              </w:rPr>
+              <w:t xml:space="preserve">Contribuye a la evaluación del componente de IA con el </w:t>
               <w:lastRenderedPageBreak/>
-              <w:t>participación es permanente y no sustituye la del propietario del caso de uso, a quien la Comisión convoca cuando se evalúa un caso de uso de su proceso.</w:t>
+              <w:t xml:space="preserve">conocimiento operativo de los procesos de dicho ámbito y de su impacto en los administrados. Su participación es permanente y no sustituye la del propietario del caso de uso, a quien la Comisión convoca cuando se evalúa un caso de uso de su proceso.</w:t>
             </w:r>
           </w:p>
         </w:tc>
@@ -7651,8 +7286,6 @@
       </w:pPr>
       <w:r>
         <w:t>6.1</w:t>
-      </w:r>
-      <w:r>
         <w:tab/>
         <w:t>Del ciclo de vida de los SBIA</w:t>
       </w:r>
@@ -7673,12 +7306,6 @@
           <w:color w:val="000000"/>
         </w:rPr>
         <w:t>6.1.1</w:t>
-      </w:r>
-      <w:r>
-        <w:rPr>
-          <w:rFonts w:ascii="Arial" w:eastAsia="Arial" w:hAnsi="Arial" w:cs="Arial"/>
-          <w:color w:val="000000"/>
-        </w:rPr>
         <w:tab/>
       </w:r>
       <w:r>
@@ -7687,16 +7314,9 @@
           <w:color w:val="000000"/>
           <w:highlight w:val="green"/>
         </w:rPr>
-        <w:t xml:space="preserve">Todo SBIA en la SUNAT sigue un ciclo de vida gestionado, con las etapas y los hitos propios del componente de IA que se detallan a continuación. Este ciclo </w:t>
-      </w:r>
-      <w:r>
-        <w:rPr>
-          <w:rFonts w:ascii="Arial" w:eastAsia="Arial" w:hAnsi="Arial" w:cs="Arial"/>
-          <w:color w:val="000000"/>
-          <w:highlight w:val="green"/>
-        </w:rPr>
+        <w:t xml:space="preserve">Todo SBIA en la SUNAT sigue un ciclo de vida gestionado, con las etapas y los hitos propios del componente de IA que se detallan a continuación. Este ciclo no sustituye ni duplica a los instrumentos institucionales que regulan la gestión de proyectos y el desarrollo de sistemas: se apoya en las conformidades que las unidades de organización competentes emiten conforme a ellos y añade </w:t>
         <w:lastRenderedPageBreak/>
-        <w:t>no sustituye ni duplica a los instrumentos institucionales que regulan la gestión de proyectos y el desarrollo de sistemas: se apoya en las conformidades que las unidades de organización competentes emiten conforme a ellos y añade únicamente lo que es propio de la inteligencia artificial. Su desarrollo metodológico se efectúa conforme al numeral 6.1.5.</w:t>
+        <w:t xml:space="preserve">únicamente lo que es propio de la inteligencia artificial. Su desarrollo metodológico se efectúa conforme al numeral 6.1.5.</w:t>
       </w:r>
     </w:p>
     <w:tbl>
@@ -7999,7 +7619,7 @@
                 <w:rFonts w:ascii="Arial" w:eastAsia="Arial" w:hAnsi="Arial" w:cs="Arial"/>
                 <w:highlight w:val="green"/>
               </w:rPr>
-              <w:t>La etapa concluye con la presentación a la Comisión de Gobierno de IA de la Ficha de Evaluación de Caso de Uso. La Ficha se presenta suscrita por el propietario del caso de uso y con el visto bueno del titular de su unidad de organización, conforme a la Sección 6 del Anexo N.° 4. La etapa no comporta hito de aprobación: la evaluación del componente de IA y la aprobación corresponden a la etapa 2.</w:t>
+              <w:t xml:space="preserve">La etapa concluye con la presentación a la Comisión de Gobierno de IA de la Ficha de Evaluación de Caso de Uso. La Ficha se presenta suscrita por el propietario del caso de uso y con el visto bueno del titular de su unidad de organización, conforme a la Sección 6 del Anexo N.° 4. La etapa no comporta hito de aprobación: la evaluación del componente de IA y la aprobación corresponden a la etapa 2.</w:t>
             </w:r>
           </w:p>
         </w:tc>
@@ -8169,7 +7789,6 @@
               <w:rPr>
                 <w:rFonts w:ascii="Arial" w:eastAsia="Arial" w:hAnsi="Arial" w:cs="Arial"/>
               </w:rPr>
-              <w:lastRenderedPageBreak/>
               <w:t>3</w:t>
             </w:r>
           </w:p>
@@ -8237,7 +7856,9 @@
                 <w:rFonts w:ascii="Arial" w:eastAsia="Arial" w:hAnsi="Arial" w:cs="Arial"/>
                 <w:highlight w:val="green"/>
               </w:rPr>
-              <w:t>La Gerencia de Arquitectura conduce el diseño de la arquitectura del SBIA y las Divisiones de Arquitectura lo elaboran, conforme al numeral 6.5.1. Se define el mecanismo de supervisión humana, conforme al numeral 6.6. Para los SBIA de riesgo alto se elabora la EIA, conforme al numeral 6.4.</w:t>
+              <w:t xml:space="preserve">La Gerencia de Arquitectura conduce el diseño de la arquitectura del SBIA y las Divisiones de Arquitectura lo elaboran, conforme al numeral 6.5.1. Se define el mecanismo de supervisión humana, conforme al numeral 6.6. Para los SBIA de </w:t>
+              <w:lastRenderedPageBreak/>
+              <w:t>riesgo alto se elabora la EIA, conforme al numeral 6.4.</w:t>
             </w:r>
           </w:p>
         </w:tc>
@@ -8270,7 +7891,10 @@
                 <w:rFonts w:ascii="Arial" w:eastAsia="Arial" w:hAnsi="Arial" w:cs="Arial"/>
                 <w:highlight w:val="green"/>
               </w:rPr>
-              <w:t>Aprobación del diseño de la arquitectura de solución por la División de Arquitectura competente según la materia, conforme al numeral 6.5.4. Para SBIA de riesgo alto, aprobación de la EIA por el CGTD, previa al inicio del desarrollo, adquisición o implementación.</w:t>
+              <w:lastRenderedPageBreak/>
+              <w:t xml:space="preserve">Aprobación del diseño de la arquitectura de solución por la División de Arquitectura competente según la materia, conforme al numeral 6.5.4. Para SBIA de riesgo alto, </w:t>
+              <w:lastRenderedPageBreak/>
+              <w:t>aprobación de la EIA por el CGTD, previa al inicio del desarrollo, adquisición o implementación.</w:t>
             </w:r>
           </w:p>
         </w:tc>
@@ -8304,6 +7928,7 @@
               <w:rPr>
                 <w:rFonts w:ascii="Arial" w:eastAsia="Arial" w:hAnsi="Arial" w:cs="Arial"/>
               </w:rPr>
+              <w:lastRenderedPageBreak/>
               <w:t>4</w:t>
             </w:r>
           </w:p>
@@ -8544,23 +8169,9 @@
                 <w:rFonts w:ascii="Arial" w:hAnsi="Arial" w:cs="Arial"/>
                 <w:highlight w:val="green"/>
               </w:rPr>
-              <w:t xml:space="preserve">La Gerencia de Calidad de Sistemas conduce el control y aseguramiento de la calidad y la División de Control de Calidad efectúa la verificación y validación de la calidad, conforme al </w:t>
-            </w:r>
-            <w:r>
-              <w:rPr>
-                <w:rFonts w:ascii="Arial" w:hAnsi="Arial" w:cs="Arial"/>
-                <w:highlight w:val="green"/>
-              </w:rPr>
+              <w:t xml:space="preserve">La Gerencia de Calidad de Sistemas conduce el control y aseguramiento de la calidad y la División de Control de Calidad efectúa la verificación y validación de la calidad, conforme al numeral 6.10.3. La Oficina de Seguridad Informática efectúa el análisis de riesgo y las pruebas de vulnerabilidad sobre la arquitectura de aplicaciones, de </w:t>
               <w:lastRenderedPageBreak/>
-              <w:t xml:space="preserve">numeral 6.10.3. La Oficina de Seguridad Informática efectúa el análisis de riesgo y las pruebas de vulnerabilidad sobre la arquitectura de aplicaciones, de información y de infraestructura tecnológica que soporta el SBIA, incluido el red teaming para riesgo alto, y verifica la implementación de los requisitos de seguridad propuestos en la etapa anterior. El propietario del caso de uso verifica la implementación del mecanismo de supervisión humana conforme al numeral 6.6.2. La Comisión de Gobierno de IA verifica la implementación de los controles, del mecanismo de supervisión humana y de las medidas frente al sesgo, conforme a los numerales 6.2.5, 6.6.2 y 6.6.4. Asimismo, aprueba el plan de monitoreo del SBIA conforme al numeral 6.10.1. La aprobación requiere la conformidad de la División de Control de Calidad, de la Oficina de Seguridad </w:t>
-            </w:r>
-            <w:r>
-              <w:rPr>
-                <w:rFonts w:ascii="Arial" w:hAnsi="Arial" w:cs="Arial"/>
-                <w:highlight w:val="green"/>
-              </w:rPr>
-              <w:lastRenderedPageBreak/>
-              <w:t>Informática, del propietario del caso de uso y de la Comisión de Gobierno de IA. La titularidad de la aprobación se determina conforme al numeral 6.1.2.</w:t>
+              <w:t>información y de infraestructura tecnológica que soporta el SBIA, incluido el red teaming para riesgo alto, y verifica la implementación de los requisitos de seguridad propuestos en la etapa anterior. El propietario del caso de uso verifica la implementación del mecanismo de supervisión humana conforme al numeral 6.6.2. La Comisión de Gobierno de IA verifica la implementación de los controles, del mecanismo de supervisión humana y de las medidas frente al sesgo, conforme a los numerales 6.2.5, 6.6.2 y 6.6.4. Asimismo, aprueba el plan de monitoreo del SBIA conforme al numeral 6.10.1. La aprobación requiere la conformidad de la División de Control de Calidad, de la Oficina de Seguridad Informática, del propietario del caso de uso y de la Comisión de Gobierno de IA. La titularidad de la aprobación se determina conforme al numeral 6.1.2.</w:t>
             </w:r>
           </w:p>
         </w:tc>
@@ -8930,7 +8541,9 @@
                 <w:rFonts w:ascii="Arial" w:eastAsia="Arial" w:hAnsi="Arial" w:cs="Arial"/>
                 <w:highlight w:val="yellow"/>
               </w:rPr>
-              <w:t>Retiro del SBIA asegurando la preservación de los registros y la continuidad del servicio. Se actualiza el Inventario Institucional de SBIA.</w:t>
+              <w:t xml:space="preserve">Retiro del SBIA asegurando la preservación de los registros y la continuidad del servicio. Se </w:t>
+              <w:lastRenderedPageBreak/>
+              <w:t>actualiza el Inventario Institucional de SBIA.</w:t>
             </w:r>
           </w:p>
         </w:tc>
@@ -8963,7 +8576,10 @@
                 <w:rFonts w:ascii="Arial" w:eastAsia="Arial" w:hAnsi="Arial" w:cs="Arial"/>
                 <w:highlight w:val="yellow"/>
               </w:rPr>
-              <w:t>Aprobación conforme al numeral 6.1.2. Actualización del Inventario Institucional de SBIA.</w:t>
+              <w:lastRenderedPageBreak/>
+              <w:t xml:space="preserve">Aprobación conforme al numeral 6.1.2. Actualización del </w:t>
+              <w:lastRenderedPageBreak/>
+              <w:t>Inventario Institucional de SBIA.</w:t>
             </w:r>
           </w:p>
         </w:tc>
@@ -8996,13 +8612,6 @@
           <w:highlight w:val="green"/>
         </w:rPr>
         <w:t>6.1.2</w:t>
-      </w:r>
-      <w:r>
-        <w:rPr>
-          <w:rFonts w:ascii="Arial" w:hAnsi="Arial" w:cs="Arial"/>
-          <w:color w:val="000000"/>
-          <w:highlight w:val="green"/>
-        </w:rPr>
         <w:tab/>
         <w:t>Los hitos de aprobación previstos en el numeral 6.1.1 son de carácter técnico. Recaen sobre el componente de IA y sobre su tránsito entre las etapas del ciclo de vida, y no constituyen aprobación de la iniciativa, del proyecto ni de la inversión, las cuales se rigen por los instrumentos de gestión institucionales y por las instancias competentes conforme al ROF. Dichos hitos corresponden al CGTD en los SBIA de riesgo alto y en los estratégicos para la entidad, y a la Comisión de Gobierno de IA en los SBIA de riesgo aceptable.</w:t>
       </w:r>
@@ -9015,7 +8624,7 @@
           <w:color w:val="000000"/>
           <w:highlight w:val="green"/>
         </w:rPr>
-        <w:t>Esta regla no alcanza a la aprobación del caso de uso y de su clasificación de riesgo, prevista en la etapa 2 del numeral 6.1.1, que corresponde al CGTD en todos los casos conforme al numeral 6.2.2. La Comisión informa al CGTD de las aprobaciones que otorga. En los SBIA de riesgo alto, todas las etapas e hitos son obligatorios. En los SBIA de riesgo aceptable, la Comisión de Gobierno de IA puede aprobar un ciclo de vida simplificado y documentado, proporcional a la naturaleza y a la magnitud del SBIA.</w:t>
+        <w:t xml:space="preserve">Esta regla no alcanza a la aprobación del caso de uso y de su clasificación de riesgo, prevista en la etapa 2 del numeral 6.1.1, que corresponde al CGTD en todos los casos conforme al numeral 6.2.2. La Comisión informa al CGTD de las aprobaciones que otorga. En los SBIA de riesgo alto, todas las etapas e hitos son obligatorios. En los SBIA de riesgo aceptable, la Comisión de Gobierno de IA puede aprobar un ciclo de vida simplificado y documentado, proporcional a la naturaleza y a la magnitud del SBIA.</w:t>
       </w:r>
     </w:p>
     <w:p>
@@ -9035,13 +8644,6 @@
           <w:highlight w:val="yellow"/>
         </w:rPr>
         <w:t>6.1.3</w:t>
-      </w:r>
-      <w:r>
-        <w:rPr>
-          <w:rFonts w:ascii="Arial" w:eastAsia="Arial" w:hAnsi="Arial" w:cs="Arial"/>
-          <w:color w:val="000000"/>
-          <w:highlight w:val="yellow"/>
-        </w:rPr>
         <w:tab/>
       </w:r>
       <w:r>
@@ -9050,16 +8652,7 @@
           <w:color w:val="000000"/>
           <w:highlight w:val="green"/>
         </w:rPr>
-        <w:t xml:space="preserve">Los SBIA SaaS (enfoque A) siguen un ciclo de vida abreviado, que comprende cuando menos: el registro en el Inventario Institucional de SBIA, la clasificación </w:t>
-      </w:r>
-      <w:r>
-        <w:rPr>
-          <w:rFonts w:ascii="Arial" w:eastAsia="Arial" w:hAnsi="Arial" w:cs="Arial"/>
-          <w:color w:val="000000"/>
-          <w:highlight w:val="green"/>
-        </w:rPr>
-        <w:lastRenderedPageBreak/>
-        <w:t>de riesgo conforme al numeral 6.2 y las verificaciones previstas en el numeral 6.12.3.</w:t>
+        <w:t xml:space="preserve">Los SBIA SaaS (enfoque A) siguen un ciclo de vida abreviado, que comprende cuando menos: el registro en el Inventario Institucional de SBIA, la clasificación de riesgo conforme al numeral 6.2 y las verificaciones previstas en el numeral 6.12.3.</w:t>
       </w:r>
       <w:r>
         <w:t xml:space="preserve"> </w:t>
@@ -9090,15 +8683,8 @@
           <w:highlight w:val="green"/>
         </w:rPr>
         <w:t>6.1.4</w:t>
-      </w:r>
-      <w:r>
-        <w:rPr>
-          <w:rFonts w:ascii="Arial" w:eastAsia="Arial" w:hAnsi="Arial" w:cs="Arial"/>
-          <w:color w:val="000000"/>
-          <w:highlight w:val="green"/>
-        </w:rPr>
         <w:tab/>
-        <w:t>El pronunciamiento de la Comisión de Gobierno de IA en los hitos del ciclo de vida recae sobre el componente de IA, conforme al numeral 6.15.1. Cuando la Ficha de Evaluación de Caso de Uso (Anexo N.° 4) no contiene la información necesaria para pronunciarse, la Comisión acompaña al propietario del caso de uso a completarla y se pronuncia una vez que la recibe. La falta de información no es causal de pronunciamiento no favorable. La Comisión otorga al propietario del caso de uso un plazo para completarla. Vencido el plazo sin que la información se complete, la Comisión eleva el caso al CGTD para que disponga lo que corresponda. El pronunciamiento no favorable se fundamenta por escrito y se eleva al CGTD. Cuando invoca el uso indebido o una contravención normativa, el CGTD verifica la causal y, si concurre, deja constancia en acta de que el caso de uso no procede. Cuando invoca que el resultado esperado se alcanza sin inteligencia artificial, el CGTD resuelve en acta si el caso de uso continúa con el componente de IA o sin él.</w:t>
+        <w:t xml:space="preserve">El pronunciamiento de la Comisión de Gobierno de IA en los hitos del ciclo de vida recae sobre el componente de IA, conforme al numeral 6.15.1. Cuando la Ficha de Evaluación de Caso de Uso (Anexo N.° 4) no contiene la información necesaria para pronunciarse, la Comisión acompaña al propietario del caso de uso a completarla y se pronuncia una vez que la recibe. La falta de información no es causal de pronunciamiento no favorable. La Comisión otorga al propietario del caso de uso un plazo para completarla. Vencido el plazo sin que la información se complete, la Comisión eleva el caso al CGTD para que disponga lo que corresponda. El pronunciamiento no favorable se fundamenta por escrito y se eleva al CGTD. Cuando invoca el uso indebido o una contravención normativa, el CGTD verifica la causal y, si concurre, deja constancia en acta de que el caso de uso no procede. Cuando invoca que el resultado esperado se alcanza sin inteligencia artificial, el CGTD resuelve en acta si el caso de uso continúa con el componente de IA o sin él.</w:t>
       </w:r>
     </w:p>
     <w:p>
@@ -9118,13 +8704,6 @@
           <w:highlight w:val="lightGray"/>
         </w:rPr>
         <w:t>6.1.5</w:t>
-      </w:r>
-      <w:r>
-        <w:rPr>
-          <w:rFonts w:ascii="Arial" w:hAnsi="Arial" w:cs="Arial"/>
-          <w:color w:val="000000"/>
-          <w:highlight w:val="lightGray"/>
-        </w:rPr>
         <w:tab/>
         <w:t xml:space="preserve">La INSI desarrolla y aprueba, conforme a sus competencias, a la METDONI y al numeral 7.6, la metodología del ciclo de vida del SBIA previsto en el numeral 6.1.1. </w:t>
       </w:r>
@@ -9134,7 +8713,9 @@
           <w:color w:val="000000"/>
           <w:highlight w:val="green"/>
         </w:rPr>
-        <w:t xml:space="preserve">Por comprender actuaciones a cargo de unidades de organización distintas de la INSI, su formulación recoge los aportes de dichas unidades y de la Comisión de Gobierno de IA, que la INSI solicita. El proyecto se somete a la validación de la Comisión de Gobierno de IA. Ambas actuaciones se efectúan conforme a la presente directiva y observan lo previsto en los numerales 6.4 y 6.5 de la METDONI. La aprobación corresponde a la INSI conforme al literal j) del artículo 102 del ROF; cuando la Comisión de Gobierno de IA mantenga observaciones no acogidas, estas se elevan al CGTD, que se pronuncia con anterioridad a la aprobación. </w:t>
+        <w:t xml:space="preserve">Por comprender actuaciones a cargo de unidades de organización distintas de la INSI, su formulación recoge los aportes de dichas unidades y de la Comisión de Gobierno de IA, que la INSI solicita. El proyecto se somete a la validación de la Comisión de Gobierno de IA. Ambas actuaciones se efectúan conforme a la presente directiva y observan lo previsto en los numerales 6.4 y 6.5 de la METDONI. La aprobación corresponde a la INSI conforme al literal j) del artículo 102 del ROF; cuando la Comisión de Gobierno de IA mantenga observaciones no </w:t>
+        <w:lastRenderedPageBreak/>
+        <w:t xml:space="preserve">acogidas, estas se elevan al CGTD, que se pronuncia con anterioridad a la aprobación. </w:t>
       </w:r>
       <w:r>
         <w:rPr>
@@ -9142,7 +8723,7 @@
           <w:color w:val="000000"/>
           <w:highlight w:val="lightGray"/>
         </w:rPr>
-        <w:t>La metodología comprende, como mínimo: la aplicación de la clasificación de riesgo y de la evaluación de impacto algorítmico, los criterios técnicos de diseño de la arquitectura de los SBIA, el contenido de los entregables de cada etapa, los tipos y las técnicas de prueba aplicables según el nivel de riesgo, los controles de contención, las prácticas de monitoreo, la gestión de los cambios sobre los SBIA en operación, incluidos los criterios de calificación del cambio significativo y el alcance de la revalidación aplicable,</w:t>
+        <w:t xml:space="preserve">La metodología comprende, como mínimo: la aplicación de la clasificación de riesgo y de la evaluación de impacto algorítmico, los criterios técnicos de diseño de la arquitectura de los SBIA, el contenido de los entregables de cada etapa, los tipos y las técnicas de prueba aplicables según el nivel de riesgo, los controles de contención, las prácticas de monitoreo, la gestión de los cambios sobre los SBIA en operación, incluidos los criterios de calificación del cambio significativo y el alcance de la revalidación aplicable,</w:t>
       </w:r>
       <w:r>
         <w:t xml:space="preserve"> </w:t>
@@ -9166,32 +8747,13 @@
           <w:color w:val="000000"/>
         </w:rPr>
       </w:pPr>
-      <w:proofErr w:type="gramStart"/>
-      <w:r>
-        <w:rPr>
-          <w:rFonts w:ascii="Arial" w:eastAsia="Arial" w:hAnsi="Arial" w:cs="Arial"/>
-          <w:color w:val="000000"/>
-          <w:highlight w:val="green"/>
-        </w:rPr>
-        <w:t>6.1.6  Todo</w:t>
-      </w:r>
-      <w:proofErr w:type="gramEnd"/>
-      <w:r>
-        <w:rPr>
-          <w:rFonts w:ascii="Arial" w:eastAsia="Arial" w:hAnsi="Arial" w:cs="Arial"/>
-          <w:color w:val="000000"/>
-          <w:highlight w:val="green"/>
-        </w:rPr>
-        <w:t xml:space="preserve"> SBIA cuenta con un equipo técnico multidisciplinario, conformado en función de la necesidad y la complejidad de la materia o del problema público que atiende, conforme al numeral 28.3 del artículo 28 del RLIA. El propietario </w:t>
-      </w:r>
-      <w:r>
-        <w:rPr>
-          <w:rFonts w:ascii="Arial" w:eastAsia="Arial" w:hAnsi="Arial" w:cs="Arial"/>
-          <w:color w:val="000000"/>
-          <w:highlight w:val="green"/>
-        </w:rPr>
-        <w:lastRenderedPageBreak/>
-        <w:t>del caso de uso y el custodio técnico lo conforman previamente al inicio del desarrollo o adquisición, y lo integran, cuando menos, con las unidades de organización cuya competencia comprenda las materias que el SBIA involucra. Su composición se registra en la Ficha de Registro de SBIA (Anexo N.° 1).</w:t>
+      <w:r>
+        <w:rPr>
+          <w:rFonts w:ascii="Arial" w:eastAsia="Arial" w:hAnsi="Arial" w:cs="Arial"/>
+          <w:color w:val="000000"/>
+          <w:highlight w:val="green"/>
+        </w:rPr>
+        <w:t xml:space="preserve">6.1.6  Todo SBIA cuenta con un equipo técnico multidisciplinario, conformado en función de la necesidad y la complejidad de la materia o del problema público que atiende, conforme al numeral 28.3 del artículo 28 del RLIA. El propietario del caso de uso y el custodio técnico lo conforman previamente al inicio del desarrollo o adquisición, y lo integran, cuando menos, con las unidades de organización cuya competencia comprenda las materias que el SBIA involucra. Su composición se registra en la Ficha de Registro de SBIA (Anexo N.° 1).</w:t>
       </w:r>
     </w:p>
     <w:p>
@@ -9202,8 +8764,6 @@
       </w:pPr>
       <w:r>
         <w:t>6.2</w:t>
-      </w:r>
-      <w:r>
         <w:tab/>
         <w:t>De la clasificación de los SBIA por nivel de riesgo</w:t>
       </w:r>
@@ -9225,13 +8785,6 @@
           <w:highlight w:val="cyan"/>
         </w:rPr>
         <w:t>6.2.1</w:t>
-      </w:r>
-      <w:r>
-        <w:rPr>
-          <w:rFonts w:ascii="Arial" w:hAnsi="Arial" w:cs="Arial"/>
-          <w:color w:val="000000"/>
-          <w:highlight w:val="cyan"/>
-        </w:rPr>
         <w:tab/>
         <w:t xml:space="preserve">La clasificación de riesgo determina, para cada iniciativa o SBIA de la SUNAT, la categoría de riesgo que genera su uso conforme al RLIA: uso indebido (artículo 23), riesgo alto (artículo 24) o riesgo aceptable (numeral 22.2 del artículo 22). El uso indebido deviene en prohibido; por ello, la SUNAT no desarrolla, adquiere, implementa ni opera SBIA cuyo uso sea indebido, y la clasificación los identifica y excluye en la etapa de evaluación de viabilidad, con anterioridad a su desarrollo o adquisición. </w:t>
       </w:r>
@@ -9261,13 +8814,6 @@
           <w:highlight w:val="green"/>
         </w:rPr>
         <w:t>6.2.2</w:t>
-      </w:r>
-      <w:r>
-        <w:rPr>
-          <w:rFonts w:ascii="Arial" w:eastAsia="Arial" w:hAnsi="Arial" w:cs="Arial"/>
-          <w:color w:val="000000"/>
-          <w:highlight w:val="green"/>
-        </w:rPr>
         <w:tab/>
       </w:r>
       <w:r>
@@ -9275,7 +8821,9 @@
           <w:rFonts w:ascii="Arial" w:eastAsia="Arial" w:hAnsi="Arial" w:cs="Arial"/>
           <w:highlight w:val="green"/>
         </w:rPr>
-        <w:t>Para la aplicación de la clasificación establecida, la Comisión de Gobierno de IA propone la clasificación de riesgo de las iniciativas que se presentan. La opinión de la OII, en materia de ética, integridad y prevención de sesgos, y la de la INALI, en materia de cumplimiento normativo, constan de manera expresa en la propuesta. La aprobación de la clasificación de riesgo corresponde al CGTD en todos los casos. En los SBIA de riesgo alto y en los estratégicos para la entidad, el CGTD aprueba la clasificación mediante pronunciamiento individual. En los SBIA de riesgo aceptable, el CGTD aprueba la clasificación de manera agregada, sobre la relación que la Comisión de Gobierno de IA eleva a cada sesión ordinaria, sin perjuicio de que cualquiera de sus miembros solicite el tratamiento individual de una iniciativa determinada. En tanto el CGTD no apruebe la clasificación agregada, la propuesta de la Comisión de Gobierno de IA habilita la continuación del ciclo de vida, salvo el despliegue, que requiere la clasificación aprobada. Durante ese periodo, las disposiciones que exigen el nivel de riesgo se aplican sobre la clasificación propuesta. Si el CGTD modifica la clasificación al aprobarla, el propietario del caso de uso y el custodio técnico ajustan los requisitos, los controles y el mecanismo de supervisión humana antes del despliegue. La clasificación es parte de la evaluación de viabilidad de acuerdo al ciclo de vida descrito en el numeral 6.1.1. La clasificación aplica los criterios complementarios de la Matriz de Clasificación de Riesgos de IA (Anexo N.° 2); el detalle de su aplicación se desarrolla en la metodología prevista en el numeral 6.1.5.</w:t>
+        <w:t xml:space="preserve">Para la aplicación de la clasificación establecida, la Comisión de Gobierno de IA propone la clasificación de riesgo de las iniciativas que se presentan. La opinión de la OII, en materia de ética, integridad y prevención de sesgos, y la de la INALI, en materia de cumplimiento normativo, constan de manera expresa en la propuesta. La aprobación de la clasificación de riesgo corresponde al CGTD en todos los casos. En los SBIA de riesgo alto y en los estratégicos para la entidad, el CGTD aprueba la clasificación mediante pronunciamiento individual. En los SBIA de riesgo aceptable, el CGTD aprueba la clasificación de manera agregada, sobre la relación que la Comisión de Gobierno de IA eleva a cada sesión ordinaria, sin perjuicio de que cualquiera de sus miembros solicite el tratamiento individual de una iniciativa determinada. En tanto el CGTD no apruebe la clasificación agregada, la propuesta de la Comisión de Gobierno de IA habilita la continuación del ciclo de vida, salvo el despliegue, que requiere la clasificación aprobada. Durante ese periodo, las disposiciones que exigen el nivel de riesgo se aplican sobre la clasificación propuesta. Si el CGTD modifica la clasificación al aprobarla, el propietario del caso de uso y el custodio técnico ajustan los requisitos, los controles y el mecanismo de supervisión humana antes del despliegue. La clasificación es parte de la </w:t>
+        <w:lastRenderedPageBreak/>
+        <w:t xml:space="preserve">evaluación de viabilidad de acuerdo al ciclo de vida descrito en el numeral 6.1.1. La clasificación aplica los criterios complementarios de la Matriz de Clasificación de Riesgos de IA (Anexo N.° 2); el detalle de su aplicación se desarrolla en la metodología prevista en el numeral 6.1.5.</w:t>
       </w:r>
     </w:p>
     <w:p>
@@ -9295,13 +8843,6 @@
           <w:highlight w:val="yellow"/>
         </w:rPr>
         <w:t>6.2.3</w:t>
-      </w:r>
-      <w:r>
-        <w:rPr>
-          <w:rFonts w:ascii="Arial" w:eastAsia="Arial" w:hAnsi="Arial" w:cs="Arial"/>
-          <w:color w:val="000000"/>
-          <w:highlight w:val="yellow"/>
-        </w:rPr>
         <w:tab/>
         <w:t xml:space="preserve">La SUNAT prohíbe el desarrollo, adquisición, implementación u operación de SBIA clasificados como de </w:t>
       </w:r>
@@ -9319,16 +8860,7 @@
           <w:color w:val="000000"/>
           <w:highlight w:val="yellow"/>
         </w:rPr>
-        <w:t xml:space="preserve">, conforme al artículo 23 del RLIA. Sin perjuicio de lo señalado en el literal e) del numeral 23.1 del citado artículo, no se consideran de uso indebido los SBIA utilizados para apoyar la evaluación humana sobre la implicación de una persona física en una actividad delictiva, siempre que se basen en hechos objetivos y verificables directamente </w:t>
-      </w:r>
-      <w:r>
-        <w:rPr>
-          <w:rFonts w:ascii="Arial" w:eastAsia="Arial" w:hAnsi="Arial" w:cs="Arial"/>
-          <w:color w:val="000000"/>
-          <w:highlight w:val="yellow"/>
-        </w:rPr>
-        <w:lastRenderedPageBreak/>
-        <w:t>relacionados con una actividad delictiva ya existente y cuenten con mecanismos de supervisión humana, transparencia y auditabilidad para garantizar la no discriminación y la protección de los derechos fundamentales, conforme al numeral 23.4 del citado artículo.</w:t>
+        <w:t>, conforme al artículo 23 del RLIA. Sin perjuicio de lo señalado en el literal e) del numeral 23.1 del citado artículo, no se consideran de uso indebido los SBIA utilizados para apoyar la evaluación humana sobre la implicación de una persona física en una actividad delictiva, siempre que se basen en hechos objetivos y verificables directamente relacionados con una actividad delictiva ya existente y cuenten con mecanismos de supervisión humana, transparencia y auditabilidad para garantizar la no discriminación y la protección de los derechos fundamentales, conforme al numeral 23.4 del citado artículo.</w:t>
       </w:r>
     </w:p>
     <w:p>
@@ -9347,12 +8879,6 @@
           <w:color w:val="000000"/>
         </w:rPr>
         <w:t>6.2.4</w:t>
-      </w:r>
-      <w:r>
-        <w:rPr>
-          <w:rFonts w:ascii="Arial" w:eastAsia="Arial" w:hAnsi="Arial" w:cs="Arial"/>
-          <w:color w:val="000000"/>
-        </w:rPr>
         <w:tab/>
       </w:r>
       <w:r>
@@ -9361,7 +8887,7 @@
           <w:color w:val="000000"/>
           <w:highlight w:val="green"/>
         </w:rPr>
-        <w:t>La prohibición del uso indebido se asegura mediante la clasificación de riesgo previa y obligatoria, el pronunciamiento no favorable de la Comisión de Gobierno de IA conforme al numeral 6.15.1 y el registro obligatorio en el Inventario Institucional de SBIA.</w:t>
+        <w:t xml:space="preserve">La prohibición del uso indebido se asegura mediante la clasificación de riesgo previa y obligatoria, el pronunciamiento no favorable de la Comisión de Gobierno de IA conforme al numeral 6.15.1 y el registro obligatorio en el Inventario Institucional de SBIA.</w:t>
       </w:r>
       <w:r>
         <w:rPr>
@@ -9396,15 +8922,8 @@
           <w:highlight w:val="green"/>
         </w:rPr>
         <w:t>6.2.5</w:t>
-      </w:r>
-      <w:r>
-        <w:rPr>
-          <w:rFonts w:ascii="Arial" w:eastAsia="Arial" w:hAnsi="Arial" w:cs="Arial"/>
-          <w:color w:val="000000"/>
-          <w:highlight w:val="green"/>
-        </w:rPr>
         <w:tab/>
-        <w:t>Los controles aplicables a un SBIA se determinan a partir de su clasificación de riesgo y de los criterios que la presente directiva establece según la naturaleza del SBIA, en particular en los numerales 6.5, 6.6, 6.7, 6.9 y 6.10. Los controles no se proponen ni se negocian. El propietario del caso de uso, con la asistencia técnica de la Comisión de Gobierno de IA, define cómo se implementan en el SBIA. La Comisión de Gobierno de IA verifica su implementación en la etapa 5 del numeral 6.1.1, con anterioridad al despliegue.</w:t>
+        <w:t xml:space="preserve">Los controles aplicables a un SBIA se determinan a partir de su clasificación de riesgo y de los criterios que la presente directiva establece según la naturaleza del SBIA, en particular en los numerales 6.5, 6.6, 6.7, 6.9 y 6.10. Los controles no se proponen ni se negocian. El propietario del caso de uso, con la asistencia técnica de la Comisión de Gobierno de IA, define cómo se implementan en el SBIA. La Comisión de Gobierno de IA verifica su implementación en la etapa 5 del numeral 6.1.1, con anterioridad al despliegue.</w:t>
       </w:r>
     </w:p>
     <w:p>
@@ -9424,15 +8943,8 @@
           <w:highlight w:val="green"/>
         </w:rPr>
         <w:t>6.2.6</w:t>
-      </w:r>
-      <w:r>
-        <w:rPr>
-          <w:rFonts w:ascii="Arial" w:eastAsia="Arial" w:hAnsi="Arial" w:cs="Arial"/>
-          <w:color w:val="000000"/>
-          <w:highlight w:val="green"/>
-        </w:rPr>
         <w:tab/>
-        <w:t>Cuando se determine que un SBIA en operación corresponde a la categoría de uso indebido, el propietario del caso de uso dispone su suspensión inmediata y comunica el hecho a la Comisión de Gobierno de IA. La Comisión eleva el caso al CGTD, que verifica la causal conforme al numeral 6.1.4 y deja constancia en acta. Verificada la causal, el SBIA se retira conforme a la etapa 8 del numeral 6.1.1. La suspensión, su fecha y el acuerdo del CGTD constan en el Inventario Institucional de SBIA.</w:t>
+        <w:t xml:space="preserve">Cuando se determine que un SBIA en operación corresponde a la categoría de uso indebido, el propietario del caso de uso dispone su suspensión inmediata y comunica el hecho a la Comisión de Gobierno de IA. La Comisión eleva el caso al CGTD, que verifica la causal conforme al numeral 6.1.4 y deja constancia en acta. Verificada la causal, el SBIA se retira conforme a la etapa 8 del numeral 6.1.1. La suspensión, su fecha y el acuerdo del CGTD constan en el Inventario Institucional de SBIA.</w:t>
       </w:r>
     </w:p>
     <w:p>
@@ -9443,8 +8955,6 @@
       </w:pPr>
       <w:r>
         <w:t>6.3</w:t>
-      </w:r>
-      <w:r>
         <w:tab/>
         <w:t>Del Inventario Institucional de SBIA</w:t>
       </w:r>
@@ -9465,12 +8975,6 @@
           <w:color w:val="000000"/>
         </w:rPr>
         <w:t>6.3.1</w:t>
-      </w:r>
-      <w:r>
-        <w:rPr>
-          <w:rFonts w:ascii="Arial" w:eastAsia="Arial" w:hAnsi="Arial" w:cs="Arial"/>
-          <w:color w:val="000000"/>
-        </w:rPr>
         <w:tab/>
         <w:t>La Comisión de Gobierno de IA administra el Inventario Institucional de SBIA, donde registra todos los SBIA de la SUNAT. El registro es obligatorio y previo al inicio del desarrollo o adquisición. El Anexo N.° 1 define los campos mínimos.</w:t>
       </w:r>
@@ -9491,12 +8995,6 @@
           <w:color w:val="000000"/>
         </w:rPr>
         <w:t>6.3.2</w:t>
-      </w:r>
-      <w:r>
-        <w:rPr>
-          <w:rFonts w:ascii="Arial" w:eastAsia="Arial" w:hAnsi="Arial" w:cs="Arial"/>
-          <w:color w:val="000000"/>
-        </w:rPr>
         <w:tab/>
         <w:t>La Comisión de Gobierno de IA actualiza el Inventario permanentemente y lo revisa integralmente al menos una vez al año.</w:t>
       </w:r>
@@ -9509,8 +9007,6 @@
       </w:pPr>
       <w:r>
         <w:t>6.4</w:t>
-      </w:r>
-      <w:r>
         <w:tab/>
         <w:t>De la evaluación de impacto algorítmico</w:t>
       </w:r>
@@ -9532,13 +9028,6 @@
           <w:highlight w:val="green"/>
         </w:rPr>
         <w:t>6.4.1</w:t>
-      </w:r>
-      <w:r>
-        <w:rPr>
-          <w:rFonts w:ascii="Arial" w:eastAsia="Arial" w:hAnsi="Arial" w:cs="Arial"/>
-          <w:color w:val="000000"/>
-          <w:highlight w:val="green"/>
-        </w:rPr>
         <w:tab/>
         <w:t xml:space="preserve">Todo SBIA de riesgo alto debe contar con una EIA aprobada por el CGTD previamente al inicio de su desarrollo, adquisición o implementación, conforme al artículo 30 del RLIA. </w:t>
       </w:r>
@@ -9568,24 +9057,10 @@
           <w:highlight w:val="green"/>
         </w:rPr>
         <w:t>6.4.2</w:t>
-      </w:r>
-      <w:r>
-        <w:rPr>
-          <w:rFonts w:ascii="Arial" w:hAnsi="Arial" w:cs="Arial"/>
-          <w:color w:val="000000"/>
-          <w:highlight w:val="green"/>
-        </w:rPr>
         <w:tab/>
-        <w:t xml:space="preserve">El propietario del caso de uso elabora la EIA con la participación del equipo técnico multidisciplinario del SBIA previsto en el numeral 6.1.6. La EIA incorpora los aspectos de negocio (en particular el impacto en el administrado) y los aspectos técnicos. La Comisión de Gobierno de IA, la OII, la INALI y el OGD la revisan. Cuando la materia comprenda el sentido y el alcance de las normas tributarias o aduaneras, la Comisión de Gobierno de IA convoca a la </w:t>
-      </w:r>
-      <w:r>
-        <w:rPr>
-          <w:rFonts w:ascii="Arial" w:hAnsi="Arial" w:cs="Arial"/>
-          <w:color w:val="000000"/>
-          <w:highlight w:val="green"/>
-        </w:rPr>
+        <w:t xml:space="preserve">El propietario del caso de uso elabora la EIA con la participación del equipo técnico multidisciplinario del SBIA previsto en el numeral 6.1.6. La EIA incorpora los aspectos de negocio (en particular el impacto en el administrado) y los aspectos técnicos. La Comisión de Gobierno de IA, la OII, la INALI y el OGD la </w:t>
         <w:lastRenderedPageBreak/>
-        <w:t>Intendencia Nacional Jurídico Tributaria o a la Intendencia Nacional Jurídico Aduanera. Concluidas las revisiones, la Comisión de Gobierno de IA eleva la EIA al CGTD para su aprobación conforme al numeral 6.4.1.</w:t>
+        <w:t>revisan. Cuando la materia comprenda el sentido y el alcance de las normas tributarias o aduaneras, la Comisión de Gobierno de IA convoca a la Intendencia Nacional Jurídico Tributaria o a la Intendencia Nacional Jurídico Aduanera. Concluidas las revisiones, la Comisión de Gobierno de IA eleva la EIA al CGTD para su aprobación conforme al numeral 6.4.1.</w:t>
       </w:r>
     </w:p>
     <w:p>
@@ -9605,13 +9080,6 @@
           <w:highlight w:val="green"/>
         </w:rPr>
         <w:t>6.4.3</w:t>
-      </w:r>
-      <w:r>
-        <w:rPr>
-          <w:rFonts w:ascii="Arial" w:eastAsia="Arial" w:hAnsi="Arial" w:cs="Arial"/>
-          <w:color w:val="000000"/>
-          <w:highlight w:val="green"/>
-        </w:rPr>
         <w:tab/>
         <w:t>La Comisión de Gobierno de IA coordina la actualización de la EIA cuando se produzca un cambio significativo conforme al numeral 6.10.5. La EIA actualizada se revisa y se aprueba conforme al numeral 6.4.2, y su aprobación corresponde al CGTD conforme al numeral 6.4.1.</w:t>
       </w:r>
@@ -9633,13 +9101,6 @@
           <w:highlight w:val="yellow"/>
         </w:rPr>
         <w:t>6.4.4</w:t>
-      </w:r>
-      <w:r>
-        <w:rPr>
-          <w:rFonts w:ascii="Arial" w:eastAsia="Arial" w:hAnsi="Arial" w:cs="Arial"/>
-          <w:color w:val="000000"/>
-          <w:highlight w:val="yellow"/>
-        </w:rPr>
         <w:tab/>
         <w:t>Cuando la EIA detecte riesgos que afecten los derechos fundamentales o puedan generar decisiones automatizadas erróneas, el propietario del caso de uso y el equipo técnico del SBIA adoptan las medidas necesarias para mitigar los impactos y realizan los ajustes necesarios previos a la implementación final, entre ellos ajustes en los modelos, mejora en la calidad de los datos y mecanismos de supervisión humana. Dichas medidas quedan documentadas</w:t>
       </w:r>
@@ -9694,11 +9155,6 @@
           <w:highlight w:val="yellow"/>
         </w:rPr>
         <w:t>6.5</w:t>
-      </w:r>
-      <w:r>
-        <w:rPr>
-          <w:highlight w:val="yellow"/>
-        </w:rPr>
         <w:tab/>
         <w:t>De la arquitectura y el software de los SBIA</w:t>
       </w:r>
@@ -9720,13 +9176,6 @@
           <w:highlight w:val="green"/>
         </w:rPr>
         <w:t>6.5.1</w:t>
-      </w:r>
-      <w:r>
-        <w:rPr>
-          <w:rFonts w:ascii="Arial" w:eastAsia="Arial" w:hAnsi="Arial" w:cs="Arial"/>
-          <w:color w:val="000000"/>
-          <w:highlight w:val="green"/>
-        </w:rPr>
         <w:tab/>
         <w:t>La Gerencia de Arquitectura conduce el diseño de la arquitectura de los SBIA, conforme al literal a) del artículo 130 del ROF. La División de Arquitectura de Información y de Aplicaciones diseña la arquitectura de información y de aplicaciones de los SBIA, conforme a los literales a) y c) del artículo 132 del ROF; la División de Arquitectura Tecnológica diseña la arquitectura de su infraestructura tecnológica, conforme a los literales a) y c) del artículo 134 del ROF. La arquitectura de los SBIA promueve soluciones modulares y escalables y el uso de estándares abiertos que eviten la dependencia tecnológica de un único proveedor.</w:t>
       </w:r>
@@ -9748,13 +9197,6 @@
           <w:highlight w:val="green"/>
         </w:rPr>
         <w:t>6.5.2</w:t>
-      </w:r>
-      <w:r>
-        <w:rPr>
-          <w:rFonts w:ascii="Arial" w:eastAsia="Arial" w:hAnsi="Arial" w:cs="Arial"/>
-          <w:color w:val="000000"/>
-          <w:highlight w:val="green"/>
-        </w:rPr>
         <w:tab/>
         <w:t>El uso, la adquisición y la adecuación del software de los SBIA se sujetan a las disposiciones aplicables a las entidades de la Administración Pública, conforme al numeral 28.6 del artículo 28 del RLIA. Dichas disposiciones comprenden los estándares técnicos para la evaluación de software, los estándares técnicos sobre procesos del ciclo de vida del software y las evaluaciones del uso y aplicaciones del software de IA. Los estándares y documentos técnicos de arquitectura aplicables a los SBIA son los previstos en el numeral 6.5.3, y su cumplimiento se verifica en la aprobación del diseño de arquitectura de solución conforme al numeral 6.5.4.</w:t>
       </w:r>
@@ -9776,42 +9218,8 @@
           <w:highlight w:val="green"/>
         </w:rPr>
         <w:t>6.5.3</w:t>
-      </w:r>
-      <w:r>
-        <w:rPr>
-          <w:rFonts w:ascii="Arial" w:eastAsia="Arial" w:hAnsi="Arial" w:cs="Arial"/>
-          <w:color w:val="000000"/>
-          <w:highlight w:val="green"/>
-        </w:rPr>
         <w:tab/>
-        <w:t xml:space="preserve">El diseño de la arquitectura de los SBIA observa los Principios de Arquitectura de TI (AAT.PRAQ.01) y los Lineamientos de Arquitectura de TI (LAT.LIAQ.01) de la SUNAT, en sus versiones vigentes, en lo que corresponda a su naturaleza. La GA adecua dichos instrumentos y emite los estándares, modelos de referencia, patrones y demás documentos técnicos de arquitectura necesarios para incorporar los requisitos propios de los SBIA (modelos, conjuntos de datos, componentes generativos y </w:t>
-      </w:r>
-      <w:proofErr w:type="spellStart"/>
-      <w:r>
-        <w:rPr>
-          <w:rFonts w:ascii="Arial" w:eastAsia="Arial" w:hAnsi="Arial" w:cs="Arial"/>
-          <w:color w:val="000000"/>
-          <w:highlight w:val="green"/>
-        </w:rPr>
-        <w:t>agénticos</w:t>
-      </w:r>
-      <w:proofErr w:type="spellEnd"/>
-      <w:r>
-        <w:rPr>
-          <w:rFonts w:ascii="Arial" w:eastAsia="Arial" w:hAnsi="Arial" w:cs="Arial"/>
-          <w:color w:val="000000"/>
-          <w:highlight w:val="green"/>
-        </w:rPr>
-        <w:t xml:space="preserve">, e infraestructura especializada), en el ámbito de su competencia y conforme a los literales a) y </w:t>
-      </w:r>
-      <w:r>
-        <w:rPr>
-          <w:rFonts w:ascii="Arial" w:eastAsia="Arial" w:hAnsi="Arial" w:cs="Arial"/>
-          <w:color w:val="000000"/>
-          <w:highlight w:val="green"/>
-        </w:rPr>
-        <w:lastRenderedPageBreak/>
-        <w:t>c) del artículo 130 del ROF. Los que establezcan obligaciones exigibles a las unidades de organización se aprueban como documento normativo institucional conforme al numeral 7.6 de la presente directiva.</w:t>
+        <w:t xml:space="preserve">El diseño de la arquitectura de los SBIA observa los Principios de Arquitectura de TI (AAT.PRAQ.01) y los Lineamientos de Arquitectura de TI (LAT.LIAQ.01) de la SUNAT, en sus versiones vigentes, en lo que corresponda a su naturaleza. La GA adecua dichos instrumentos y emite los estándares, modelos de referencia, patrones y demás documentos técnicos de arquitectura necesarios para incorporar los requisitos propios de los SBIA (modelos, conjuntos de datos, componentes generativos y agénticos, e infraestructura especializada), en el ámbito de su competencia y conforme a los literales a) y c) del artículo 130 del ROF. Los que establezcan obligaciones exigibles a las unidades de organización se aprueban como documento normativo institucional conforme al numeral 7.6 de la presente directiva.</w:t>
       </w:r>
     </w:p>
     <w:p>
@@ -9831,7 +9239,9 @@
           <w:color w:val="000000"/>
           <w:highlight w:val="green"/>
         </w:rPr>
-        <w:t xml:space="preserve">6.5.4   Todo SBIA cuenta con la aprobación del diseño de su arquitectura de solución, previa al inicio del desarrollo, la adquisición o el entrenamiento, conforme a la etapa 3 del numeral 6.1.1. Dicha aprobación corresponde a la División de Arquitectura de Información y de Aplicaciones y a la División de Arquitectura Tecnológica, cada una en el ámbito de su competencia conforme al literal a) de los artículos 132 y 134 del ROF, bajo la conducción de la Gerencia de Arquitectura. </w:t>
+        <w:t xml:space="preserve">6.5.4   Todo SBIA cuenta con la aprobación del diseño de su arquitectura de solución, previa al inicio del desarrollo, la adquisición o el entrenamiento, conforme a la </w:t>
+        <w:lastRenderedPageBreak/>
+        <w:t xml:space="preserve">etapa 3 del numeral 6.1.1. Dicha aprobación corresponde a la División de Arquitectura de Información y de Aplicaciones y a la División de Arquitectura Tecnológica, cada una en el ámbito de su competencia conforme al literal a) de los artículos 132 y 134 del ROF, bajo la conducción de la Gerencia de Arquitectura. </w:t>
       </w:r>
       <w:r>
         <w:rPr>
@@ -9860,15 +9270,8 @@
           <w:highlight w:val="green"/>
         </w:rPr>
         <w:t>6.5.5</w:t>
-      </w:r>
-      <w:r>
-        <w:rPr>
-          <w:rFonts w:ascii="Arial" w:eastAsia="Arial" w:hAnsi="Arial" w:cs="Arial"/>
-          <w:color w:val="000000"/>
-          <w:highlight w:val="green"/>
-        </w:rPr>
         <w:tab/>
-        <w:t>Los SBIA que ejecuten acciones sobre sistemas, datos o procesos con algún grado de autonomía incorporan mecanismos de autorización, restricción y registro de dichas acciones. Dichos mecanismos son proporcionales al nivel de riesgo determinado conforme al numeral 6.2.2 y al grado de autonomía asignado. El propietario del caso de uso define el alcance de las acciones autorizadas; la División de Arquitectura de Información y de Aplicaciones aprueba el diseño de dichos mecanismos, conforme al literal a) del artículo 132 del ROF, y la División de Arquitectura Tecnológica valida los componentes de infraestructura tecnológica que los soportan, conforme al literal c) del artículo 134 del ROF, cada una en el ámbito de su competencia. Ambas validaciones se efectúan en la etapa 5 del numeral 6.1.1, con anterioridad al despliegue.</w:t>
+        <w:t xml:space="preserve">Los SBIA que ejecuten acciones sobre sistemas, datos o procesos con algún grado de autonomía incorporan mecanismos de autorización, restricción y registro de dichas acciones. Dichos mecanismos son proporcionales al nivel de riesgo determinado conforme al numeral 6.2.2 y al grado de autonomía asignado. El propietario del caso de uso define el alcance de las acciones autorizadas; la División de Arquitectura de Información y de Aplicaciones aprueba el diseño de dichos mecanismos, conforme al literal a) del artículo 132 del ROF, y la División de Arquitectura Tecnológica valida los componentes de infraestructura tecnológica que los soportan, conforme al literal c) del artículo 134 del ROF, cada una en el ámbito de su competencia. Ambas validaciones se efectúan en la etapa 5 del numeral 6.1.1, con anterioridad al despliegue.</w:t>
       </w:r>
     </w:p>
     <w:p>
@@ -9947,24 +9350,8 @@
           <w:highlight w:val="green"/>
         </w:rPr>
         <w:t>6.5.7</w:t>
-      </w:r>
-      <w:r>
-        <w:rPr>
-          <w:rFonts w:ascii="Arial" w:eastAsia="Arial" w:hAnsi="Arial" w:cs="Arial"/>
-          <w:color w:val="000000"/>
-          <w:highlight w:val="green"/>
-        </w:rPr>
         <w:tab/>
-        <w:t xml:space="preserve">La publicación del código fuente de los SBIA financiados con fondos públicos, con licencia libre o abierta en la Plataforma Nacional de Software Público Peruano (PNSSP), se sujeta a la determinación previa de su publicabilidad. Esta obligación está prevista en el numeral 28.8 del artículo 28 del RLIA. Dicha </w:t>
-      </w:r>
-      <w:r>
-        <w:rPr>
-          <w:rFonts w:ascii="Arial" w:eastAsia="Arial" w:hAnsi="Arial" w:cs="Arial"/>
-          <w:color w:val="000000"/>
-          <w:highlight w:val="green"/>
-        </w:rPr>
-        <w:lastRenderedPageBreak/>
-        <w:t>determinación verifica que el código no revele información sujeta a reserva tributaria conforme al artículo 85 del TUO del Código Tributario. Verifica asimismo que no revele reglas de detección de riesgo cuya divulgación comprometa la función de control.</w:t>
+        <w:t xml:space="preserve">La publicación del código fuente de los SBIA financiados con fondos públicos, con licencia libre o abierta en la Plataforma Nacional de Software Público Peruano (PNSSP), se sujeta a la determinación previa de su publicabilidad. Esta obligación está prevista en el numeral 28.8 del artículo 28 del RLIA. Dicha determinación verifica que el código no revele información sujeta a reserva tributaria conforme al artículo 85 del TUO del Código Tributario. Verifica asimismo que no revele reglas de detección de riesgo cuya divulgación comprometa la función de control.</w:t>
       </w:r>
     </w:p>
     <w:p>
@@ -9984,15 +9371,8 @@
           <w:highlight w:val="green"/>
         </w:rPr>
         <w:t>6.5.8</w:t>
-      </w:r>
-      <w:r>
-        <w:rPr>
-          <w:rFonts w:ascii="Arial" w:eastAsia="Arial" w:hAnsi="Arial" w:cs="Arial"/>
-          <w:color w:val="000000"/>
-          <w:highlight w:val="green"/>
-        </w:rPr>
         <w:tab/>
-        <w:t>La GA conduce la determinación de publicabilidad prevista en el numeral 6.5.7. La efectúa antes de cada liberación mayor y, en todo caso, con ocasión de la revisión integral anual del Inventario Institucional de SBIA prevista en el numeral 6.3.2. La GA solicita para ello la opinión de la Oficina de Seguridad Informática y la de la INALI en materia de cumplimiento normativo. Cuando la determinación comprenda el sentido y el alcance de las normas tributarias o aduaneras, la GA solicita la opinión de la Intendencia Nacional Jurídico Tributaria o de la Intendencia Nacional Jurídico Aduanera, según la materia. La publicabilidad resulta de dichas opiniones. La determinación y su resultado constan en la Ficha de Registro de SBIA (Anexo N.° 1). Cuando el código no resulte publicable, se consigna igualmente la justificación legal de la restricción. La GDS pone a disposición el código fuente cuya publicación se haya determinado procedente, conforme a los mecanismos que establezca la Plataforma Nacional de Software Público Peruano.</w:t>
+        <w:t xml:space="preserve">La GA conduce la determinación de publicabilidad prevista en el numeral 6.5.7. La efectúa antes de cada liberación mayor y, en todo caso, con ocasión de la revisión integral anual del Inventario Institucional de SBIA prevista en el numeral 6.3.2. La GA solicita para ello la opinión de la Oficina de Seguridad Informática y la de la INALI en materia de cumplimiento normativo. Cuando la determinación comprenda el sentido y el alcance de las normas tributarias o aduaneras, la GA solicita la opinión de la Intendencia Nacional Jurídico Tributaria o de la Intendencia Nacional Jurídico Aduanera, según la materia. La publicabilidad resulta de dichas opiniones. La determinación y su resultado constan en la Ficha de Registro de SBIA (Anexo N.° 1). Cuando el código no resulte publicable, se consigna igualmente la justificación legal de la restricción. La GDS pone a disposición el código fuente cuya publicación se haya determinado procedente, conforme a los mecanismos que establezca la Plataforma Nacional de Software Público Peruano.</w:t>
       </w:r>
     </w:p>
     <w:p>
@@ -10011,7 +9391,7 @@
           <w:color w:val="000000"/>
           <w:highlight w:val="green"/>
         </w:rPr>
-        <w:t>6.5.9 Los SBIA separan las funciones basadas en inferencia, generación o razonamiento probabilístico de aquellas que requieren un resultado determinístico. Constituyen funciones determinísticas, entre otras, los cálculos que determinan obligaciones o derechos, el cómputo de plazos, la aplicación de reglas normativas y de negocio, las validaciones de cumplimiento normativo y la ejecución de transacciones sobre los sistemas institucionales. El componente de IA puede interpretar, clasificar, recomendar u orquestar dichas funciones; su ejecución corresponde a los servicios, motores de reglas o componentes institucionales diseñados para tal fin. Esta separación se sustenta en la arquitectura de solución aprobada conforme al numeral 6.5.4, y sus criterios técnicos se desarrollan conforme al numeral 6.5.3.</w:t>
+        <w:t xml:space="preserve">6.5.9 Los SBIA separan las funciones basadas en inferencia, generación o razonamiento probabilístico de aquellas que requieren un resultado determinístico. Constituyen funciones determinísticas, entre otras, los cálculos que determinan obligaciones o derechos, el cómputo de plazos, la aplicación de reglas normativas y de negocio, las validaciones de cumplimiento normativo y la ejecución de transacciones sobre los sistemas institucionales. El componente de IA puede interpretar, clasificar, recomendar u orquestar dichas funciones; su ejecución corresponde a los servicios, motores de reglas o componentes institucionales diseñados para tal fin. Esta separación se sustenta en la arquitectura de solución aprobada conforme al numeral 6.5.4, y sus criterios técnicos se desarrollan conforme al numeral 6.5.3.</w:t>
       </w:r>
     </w:p>
     <w:p>
@@ -10022,8 +9402,6 @@
       </w:pPr>
       <w:r>
         <w:t>6.6</w:t>
-      </w:r>
-      <w:r>
         <w:tab/>
         <w:t>De la supervisión humana</w:t>
       </w:r>
@@ -10045,13 +9423,6 @@
           <w:highlight w:val="green"/>
         </w:rPr>
         <w:t>6.6.1</w:t>
-      </w:r>
-      <w:r>
-        <w:rPr>
-          <w:rFonts w:ascii="Arial" w:eastAsia="Arial" w:hAnsi="Arial" w:cs="Arial"/>
-          <w:color w:val="000000"/>
-          <w:highlight w:val="green"/>
-        </w:rPr>
         <w:tab/>
         <w:t>Todo SBIA cuenta con un mecanismo de supervisión humana proporcional a su nivel de riesgo, conforme al literal h) del artículo 7 del RLIA. La modalidad de supervisión humana exigible a cada SBIA es la siguiente. Los casos de uso que se mencionan son enunciativos y no sustituyen la clasificación de riesgo prevista en el numeral 6.2.1:</w:t>
       </w:r>
@@ -10103,17 +9474,7 @@
           <w:color w:val="000000"/>
           <w:highlight w:val="green"/>
         </w:rPr>
-        <w:t xml:space="preserve">Human-on-the-loop (obligatorio para los SBIA de riesgo aceptable que interactúan directamente con el administrado o cuyo resultado influye en la atención que este recibe): Un supervisor humano monitorea las </w:t>
-      </w:r>
-      <w:r>
-        <w:rPr>
-          <w:b w:val="0"/>
-          <w:bCs w:val="0"/>
-          <w:color w:val="000000"/>
-          <w:highlight w:val="green"/>
-        </w:rPr>
-        <w:lastRenderedPageBreak/>
-        <w:t>operaciones del SBIA y puede intervenir ante anomalías, sin validar cada resultado individual. Aplica, entre otros, a chatbots de atención, asistentes de orientación y preclasificación.</w:t>
+        <w:t>Human-on-the-loop (obligatorio para los SBIA de riesgo aceptable que interactúan directamente con el administrado o cuyo resultado influye en la atención que este recibe): Un supervisor humano monitorea las operaciones del SBIA y puede intervenir ante anomalías, sin validar cada resultado individual. Aplica, entre otros, a chatbots de atención, asistentes de orientación y preclasificación.</w:t>
       </w:r>
     </w:p>
     <w:p>
@@ -10158,13 +9519,6 @@
           <w:highlight w:val="yellow"/>
         </w:rPr>
         <w:t>6.6.2</w:t>
-      </w:r>
-      <w:r>
-        <w:rPr>
-          <w:rFonts w:ascii="Arial" w:eastAsia="Arial" w:hAnsi="Arial" w:cs="Arial"/>
-          <w:color w:val="000000"/>
-          <w:highlight w:val="yellow"/>
-        </w:rPr>
         <w:tab/>
         <w:t>El propietario del caso de uso, con la asistencia técnica de la Comisión de Gobierno de IA, define el mecanismo específico de supervisión humana del SBIA. La definición se efectúa conforme a la clasificación de riesgo determinada según el numeral 6.2.2. Dicha definición se documenta en la Ficha de Registro de SBIA (Anexo N.° 1) y en la EIA cuando corresponda. El mecanismo requiere la conformidad de la Comisión de Gobierno de IA en la etapa 5 del numeral 6.1.1, con anterioridad al despliegue.</w:t>
       </w:r>
@@ -10185,12 +9539,6 @@
           <w:color w:val="000000"/>
         </w:rPr>
         <w:t>6.6.3</w:t>
-      </w:r>
-      <w:r>
-        <w:rPr>
-          <w:rFonts w:ascii="Arial" w:eastAsia="Arial" w:hAnsi="Arial" w:cs="Arial"/>
-          <w:color w:val="000000"/>
-        </w:rPr>
         <w:tab/>
         <w:t>El propietario del caso de uso garantiza que el personal de supervisión cumple con las siguientes condiciones:</w:t>
       </w:r>
@@ -10215,6 +9563,7 @@
           <w:bCs w:val="0"/>
           <w:color w:val="000000"/>
         </w:rPr>
+        <w:lastRenderedPageBreak/>
         <w:t>Cuenta con las competencias técnicas y funcionales necesarias para evaluar los resultados del SBIA en su ámbito de aplicación.</w:t>
       </w:r>
     </w:p>
@@ -10360,12 +9709,6 @@
           <w:color w:val="000000"/>
         </w:rPr>
         <w:t>6.6.4</w:t>
-      </w:r>
-      <w:r>
-        <w:rPr>
-          <w:rFonts w:ascii="Arial" w:eastAsia="Arial" w:hAnsi="Arial" w:cs="Arial"/>
-          <w:color w:val="000000"/>
-        </w:rPr>
         <w:tab/>
         <w:t xml:space="preserve">Todo SBIA, independientemente de su nivel de riesgo, incorpora medidas proporcionales para prevenir, detectar y corregir resultados discriminatorios o sesgados que puedan afectar a los administrados, conforme al literal a) del artículo 7 del RLIA y al compromiso 6 de la </w:t>
       </w:r>
@@ -10374,7 +9717,7 @@
           <w:rFonts w:ascii="Arial" w:hAnsi="Arial" w:cs="Arial"/>
           <w:highlight w:val="green"/>
         </w:rPr>
-        <w:t>Política de IA</w:t>
+        <w:t xml:space="preserve">Política de IA</w:t>
       </w:r>
       <w:r>
         <w:rPr>
@@ -10408,8 +9751,6 @@
       </w:pPr>
       <w:r>
         <w:t>6.7</w:t>
-      </w:r>
-      <w:r>
         <w:tab/>
         <w:t>De la seguridad y privacidad en SBIA</w:t>
       </w:r>
@@ -10431,42 +9772,8 @@
           <w:highlight w:val="green"/>
         </w:rPr>
         <w:t>6.7.1</w:t>
-      </w:r>
-      <w:r>
-        <w:rPr>
-          <w:rFonts w:ascii="Arial" w:eastAsia="Arial" w:hAnsi="Arial" w:cs="Arial"/>
-          <w:color w:val="000000"/>
-          <w:highlight w:val="green"/>
-        </w:rPr>
         <w:tab/>
-        <w:t xml:space="preserve">Los SBIA cumplen la Política de Seguridad de la Información (SGSI-PO-01) y el Manual de Políticas del Sistema de Gestión de Seguridad de la Información </w:t>
-      </w:r>
-      <w:r>
-        <w:rPr>
-          <w:rFonts w:ascii="Arial" w:eastAsia="Arial" w:hAnsi="Arial" w:cs="Arial"/>
-          <w:color w:val="000000"/>
-          <w:highlight w:val="green"/>
-        </w:rPr>
-        <w:lastRenderedPageBreak/>
-        <w:t xml:space="preserve">(SGSI-MA-03) de la SUNAT, en sus versiones vigentes. El Manual de Políticas </w:t>
-      </w:r>
-      <w:proofErr w:type="gramStart"/>
-      <w:r>
-        <w:rPr>
-          <w:rFonts w:ascii="Arial" w:eastAsia="Arial" w:hAnsi="Arial" w:cs="Arial"/>
-          <w:color w:val="000000"/>
-          <w:highlight w:val="green"/>
-        </w:rPr>
-        <w:t>es de aplicación</w:t>
-      </w:r>
-      <w:proofErr w:type="gramEnd"/>
-      <w:r>
-        <w:rPr>
-          <w:rFonts w:ascii="Arial" w:eastAsia="Arial" w:hAnsi="Arial" w:cs="Arial"/>
-          <w:color w:val="000000"/>
-          <w:highlight w:val="green"/>
-        </w:rPr>
-        <w:t xml:space="preserve"> a todos los colaboradores, al personal de modalidades formativas y a los terceros vinculados que gestionen información de la institución. Cuando un SBIA constituya un activo de información de un proceso comprendido en el alcance del Sistema de Gestión de Seguridad de la Información, le son exigibles además los demás documentos normativos y lineamientos de dicho Sistema.</w:t>
+        <w:t>Los SBIA cumplen la Política de Seguridad de la Información (SGSI-PO-01) y el Manual de Políticas del Sistema de Gestión de Seguridad de la Información (SGSI-MA-03) de la SUNAT, en sus versiones vigentes. El Manual de Políticas es de aplicación a todos los colaboradores, al personal de modalidades formativas y a los terceros vinculados que gestionen información de la institución. Cuando un SBIA constituya un activo de información de un proceso comprendido en el alcance del Sistema de Gestión de Seguridad de la Información, le son exigibles además los demás documentos normativos y lineamientos de dicho Sistema.</w:t>
       </w:r>
     </w:p>
     <w:p>
@@ -10486,15 +9793,8 @@
           <w:highlight w:val="green"/>
         </w:rPr>
         <w:t>6.7.2</w:t>
-      </w:r>
-      <w:r>
-        <w:rPr>
-          <w:rFonts w:ascii="Arial" w:eastAsia="Arial" w:hAnsi="Arial" w:cs="Arial"/>
-          <w:color w:val="000000"/>
-          <w:highlight w:val="green"/>
-        </w:rPr>
         <w:tab/>
-        <w:t>Para los SBIA de riesgo alto y para los SBIA de riesgo aceptable que interactúen directamente con el administrado, incorporen componentes generativos o procesen datos personales o información sujeta a reserva tributaria, el custodio técnico implementa como mínimo:</w:t>
+        <w:t xml:space="preserve">Para los SBIA de riesgo alto y para los SBIA de riesgo aceptable que interactúen directamente con el administrado, incorporen componentes generativos o procesen datos personales o información sujeta a reserva tributaria, el custodio técnico implementa como mínimo:</w:t>
       </w:r>
     </w:p>
     <w:p>
@@ -10663,7 +9963,7 @@
           <w:color w:val="000000"/>
           <w:highlight w:val="green"/>
         </w:rPr>
-        <w:t>Su implementación se verifica en la etapa 5 del numeral 6.1.1, conforme al numeral 6.2.5. Se registra en la Ficha de Registro de SBIA (Anexo N.° 1). Estos controles constituyen medidas de seguridad digital conforme al artículo 29 del RLIA. Se implementan aplicando la NTP-ISO/IEC 27002 y la NTP-ISO 31000 vigentes, complementadas con mejores prácticas de seguridad para IA, conforme a la Sexta Disposición Complementaria Final del RLIA.</w:t>
+        <w:t xml:space="preserve">Su implementación se verifica en la etapa 5 del numeral 6.1.1, conforme al numeral 6.2.5. Se registra en la Ficha de Registro de SBIA (Anexo N.° 1). Estos controles constituyen medidas de seguridad digital conforme al artículo 29 del RLIA. Se implementan aplicando la NTP-ISO/IEC 27002 y la NTP-ISO 31000 vigentes, complementadas con mejores prácticas de seguridad para IA, conforme a la Sexta Disposición Complementaria Final del RLIA.</w:t>
       </w:r>
     </w:p>
     <w:p>
@@ -10682,12 +9982,6 @@
           <w:color w:val="000000"/>
         </w:rPr>
         <w:t>6.7.3</w:t>
-      </w:r>
-      <w:r>
-        <w:rPr>
-          <w:rFonts w:ascii="Arial" w:eastAsia="Arial" w:hAnsi="Arial" w:cs="Arial"/>
-          <w:color w:val="000000"/>
-        </w:rPr>
         <w:tab/>
       </w:r>
       <w:r>
@@ -10716,13 +10010,6 @@
           <w:highlight w:val="yellow"/>
         </w:rPr>
         <w:t>6.7.4</w:t>
-      </w:r>
-      <w:r>
-        <w:rPr>
-          <w:rFonts w:ascii="Arial" w:eastAsia="Arial" w:hAnsi="Arial" w:cs="Arial"/>
-          <w:color w:val="000000"/>
-          <w:highlight w:val="yellow"/>
-        </w:rPr>
         <w:tab/>
         <w:t>Todo SBIA, con independencia de su nivel de riesgo, integra la privacidad desde el diseño, minimizando la cantidad de datos personales recopilados y utilizando técnicas de anonimización, conforme al literal b) del artículo 29 del RLIA y a la Ley N.° 29733. En el desarrollo, la implementación y el uso de los SBIA se cumple la normativa vigente sobre privacidad y protección de datos personales, de acuerdo con lo que establezca la Autoridad Nacional de Protección de Datos Personales del Ministerio de Justicia y Derechos Humanos, conforme al artículo 26 del RLIA. Cuando la anonimización no resulte compatible con la finalidad del SBIA, la SUNAT admite la seudonimización; su justificación se documenta en la EIA o en la Ficha de Registro de SBIA, según corresponda.</w:t>
       </w:r>
@@ -10751,15 +10038,7 @@
           <w:color w:val="000000"/>
           <w:highlight w:val="cyan"/>
         </w:rPr>
-        <w:lastRenderedPageBreak/>
         <w:t>6.7.5</w:t>
-      </w:r>
-      <w:r>
-        <w:rPr>
-          <w:rFonts w:ascii="Arial" w:eastAsia="Arial" w:hAnsi="Arial" w:cs="Arial"/>
-          <w:color w:val="000000"/>
-          <w:highlight w:val="cyan"/>
-        </w:rPr>
         <w:tab/>
         <w:t>La gestión de los incidentes y de las vulnerabilidades de seguridad de la información asociados a un SBIA se registra y atiende</w:t>
       </w:r>
@@ -10794,7 +10073,9 @@
           <w:color w:val="000000"/>
           <w:highlight w:val="green"/>
         </w:rPr>
-        <w:t>La Gerencia de Operaciones y Soporte a Usuarios adecúa el Procedimiento de Gestión de Incidentes (A-03.1.1-PR-002) para comprender los incidentes propios del SBIA y su criterio de cierre, conforme al numeral 7.6 de la presente directiva. En tanto no se apruebe dicha adecuación, estos incidentes se registran por dicho procedimiento y su atención se rige por el presente numeral.</w:t>
+        <w:t xml:space="preserve">La Gerencia de Operaciones y Soporte a Usuarios adecúa el Procedimiento de Gestión de Incidentes (A-03.1.1-PR-002) para comprender los incidentes propios del SBIA y su criterio de cierre, conforme al numeral 7.6 de la presente directiva. En tanto no se apruebe dicha adecuación, estos </w:t>
+        <w:lastRenderedPageBreak/>
+        <w:t>incidentes se registran por dicho procedimiento y su atención se rige por el presente numeral.</w:t>
       </w:r>
     </w:p>
     <w:p>
@@ -10814,13 +10095,6 @@
           <w:highlight w:val="yellow"/>
         </w:rPr>
         <w:t>6.7.6</w:t>
-      </w:r>
-      <w:r>
-        <w:rPr>
-          <w:rFonts w:ascii="Arial" w:eastAsia="Arial" w:hAnsi="Arial" w:cs="Arial"/>
-          <w:color w:val="000000"/>
-          <w:highlight w:val="yellow"/>
-        </w:rPr>
         <w:tab/>
         <w:t>El Oficial de Datos Personales (ODP) asegura que en el desarrollo, la implementación y el uso de los SBIA se realice un tratamiento adecuado de los datos personales</w:t>
       </w:r>
@@ -10856,13 +10130,6 @@
           <w:highlight w:val="green"/>
         </w:rPr>
         <w:t>6.7.7</w:t>
-      </w:r>
-      <w:r>
-        <w:rPr>
-          <w:rFonts w:ascii="Arial" w:eastAsia="Arial" w:hAnsi="Arial" w:cs="Arial"/>
-          <w:color w:val="000000"/>
-          <w:highlight w:val="green"/>
-        </w:rPr>
         <w:tab/>
         <w:t xml:space="preserve">La Oficina de Seguridad Informática elabora y propone el documento normativo de seguridad informática para SBIA, que desarrolla la forma de implementar y verificar los controles del numeral 6.7.2 y la periodicidad de las pruebas de vulnerabilidad y del red teaming, conforme al artículo 106, literales a) y c), del ROF. Su aprobación se efectúa conforme al numeral 7.6. </w:t>
       </w:r>
@@ -10885,24 +10152,13 @@
           <w:color w:val="000000"/>
         </w:rPr>
       </w:pPr>
-      <w:proofErr w:type="gramStart"/>
-      <w:r>
-        <w:rPr>
-          <w:rFonts w:ascii="Arial" w:eastAsia="Arial" w:hAnsi="Arial" w:cs="Arial"/>
-          <w:color w:val="000000"/>
-          <w:highlight w:val="green"/>
-        </w:rPr>
-        <w:lastRenderedPageBreak/>
-        <w:t>6.7.8  El</w:t>
-      </w:r>
-      <w:proofErr w:type="gramEnd"/>
-      <w:r>
-        <w:rPr>
-          <w:rFonts w:ascii="Arial" w:eastAsia="Arial" w:hAnsi="Arial" w:cs="Arial"/>
-          <w:color w:val="000000"/>
-          <w:highlight w:val="green"/>
-        </w:rPr>
-        <w:t xml:space="preserve"> propietario del caso de uso, con el custodio técnico del SBIA, define el tratamiento de conservación y eliminación de las instrucciones (prompt), respuestas, contextos, representaciones vectoriales (embeddings), registros de interacción y demás información que el SBIA genere o procese durante su operación. El plazo de conservación se determina en función del nivel de riesgo del SBIA, del valor probatorio de la información, de su sensibilidad y de los requisitos de auditoría aplicables, y observa la normativa institucional de gestión documental y archivo que resulte aplicable. En tanto dicha normativa no comprenda la información que el SBIA genera, el plazo se fija en el plan de monitoreo del SBIA y no puede ser inferior al exigido por la normativa tributaria y aduanera para la actuación en que el SBIA interviene. La conservación, el acceso y el uso de dicha información observan la reserva tributaria conforme al artículo 85 del TUO del Código Tributario y la normativa sobre protección de datos personales. El respaldo de la infraestructura tecnológica en la que reside dicha información, así como la custodia y disponibilidad de los medios correspondientes, están a cargo de la División de Soporte y Operación de la Infraestructura Tecnológica, conforme al literal b) del artículo 138 del ROF, y observan lo dispuesto en el numeral 6.7.1.</w:t>
+      <w:r>
+        <w:rPr>
+          <w:rFonts w:ascii="Arial" w:eastAsia="Arial" w:hAnsi="Arial" w:cs="Arial"/>
+          <w:color w:val="000000"/>
+          <w:highlight w:val="green"/>
+        </w:rPr>
+        <w:t xml:space="preserve">6.7.8  El propietario del caso de uso, con el custodio técnico del SBIA, define el tratamiento de conservación y eliminación de las instrucciones (prompt), respuestas, contextos, representaciones vectoriales (embeddings), registros de interacción y demás información que el SBIA genere o procese durante su operación. El plazo de conservación se determina en función del nivel de riesgo del SBIA, del valor probatorio de la información, de su sensibilidad y de los requisitos de auditoría aplicables, y observa la normativa institucional de gestión documental y archivo que resulte aplicable. En tanto dicha normativa no comprenda la información que el SBIA genera, el plazo se fija en el plan de monitoreo del SBIA y no puede ser inferior al exigido por la normativa tributaria y aduanera para la actuación en que el SBIA interviene. La conservación, el acceso y el uso de dicha información observan la reserva tributaria conforme al artículo 85 del TUO del Código Tributario y la normativa sobre protección de datos personales. El respaldo de la infraestructura tecnológica en la que reside dicha información, así como la custodia y disponibilidad de los medios correspondientes, están a cargo de la División de Soporte y Operación de la Infraestructura Tecnológica, conforme al literal b) del artículo 138 del ROF, y observan lo dispuesto en el numeral 6.7.1.</w:t>
       </w:r>
     </w:p>
     <w:p>
@@ -10913,8 +10169,6 @@
       </w:pPr>
       <w:r>
         <w:t>6.8</w:t>
-      </w:r>
-      <w:r>
         <w:tab/>
         <w:t>De los datos para los SBIA</w:t>
       </w:r>
@@ -10940,13 +10194,6 @@
           <w:highlight w:val="yellow"/>
         </w:rPr>
         <w:t>6.8.1</w:t>
-      </w:r>
-      <w:r>
-        <w:rPr>
-          <w:rFonts w:ascii="Arial" w:eastAsia="Arial" w:hAnsi="Arial" w:cs="Arial"/>
-          <w:color w:val="000000"/>
-          <w:highlight w:val="yellow"/>
-        </w:rPr>
         <w:tab/>
         <w:t>Los datos utilizados para el desarrollo, entrenamiento, validación y operación de un SBIA cuentan con procedencia documentada, base legal de uso determinada y requisitos de calidad definidos, conforme a la NTP-ISO/IEC 42001:2025</w:t>
       </w:r>
@@ -10986,13 +10233,6 @@
           <w:highlight w:val="yellow"/>
         </w:rPr>
         <w:t>6.8.2</w:t>
-      </w:r>
-      <w:r>
-        <w:rPr>
-          <w:rFonts w:ascii="Arial" w:eastAsia="Arial" w:hAnsi="Arial" w:cs="Arial"/>
-          <w:color w:val="000000"/>
-          <w:highlight w:val="yellow"/>
-        </w:rPr>
         <w:tab/>
         <w:t>El OGD promueve la calidad y el intercambio de los datos a fin de evitar sesgos y asegurar la precisión y representatividad de los datos utilizados en el entrenamiento, validación y uso de los SBIA</w:t>
       </w:r>
@@ -11045,14 +10285,8 @@
           <w:color w:val="000000"/>
           <w:highlight w:val="green"/>
         </w:rPr>
+        <w:lastRenderedPageBreak/>
         <w:t>6.8.3</w:t>
-      </w:r>
-      <w:r>
-        <w:rPr>
-          <w:rFonts w:ascii="Arial" w:eastAsia="Arial" w:hAnsi="Arial" w:cs="Arial"/>
-          <w:color w:val="000000"/>
-          <w:highlight w:val="green"/>
-        </w:rPr>
         <w:tab/>
         <w:t>El uso de datos protegidos por la reserva tributaria para el desarrollo, entrenamiento, validación u operación de un SBIA requiere la determinación previa de su base legal, conforme al artículo 85 del TUO del Código Tributario. La determinación es previa al inicio del desarrollo o adquisición y consta en la Ficha de Registro de SBIA (Anexo N.° 1). La determinación corresponde al propietario del caso de uso, y la Comisión de Gobierno de IA convoca a la Intendencia Nacional Jurídico Tributaria y, en materia aduanera, a la Intendencia Nacional Jurídico Aduanera, cuya opinión sustenta dicha determinación.</w:t>
       </w:r>
@@ -11077,15 +10311,7 @@
           <w:color w:val="000000"/>
           <w:highlight w:val="yellow"/>
         </w:rPr>
-        <w:lastRenderedPageBreak/>
         <w:t>6.8.4</w:t>
-      </w:r>
-      <w:r>
-        <w:rPr>
-          <w:rFonts w:ascii="Arial" w:eastAsia="Arial" w:hAnsi="Arial" w:cs="Arial"/>
-          <w:color w:val="000000"/>
-          <w:highlight w:val="yellow"/>
-        </w:rPr>
         <w:tab/>
         <w:t>No se utilizan obras protegidas por derechos de autor y derechos conexos como insumo de entrenamiento, ajuste fino o procesamiento en SBIA sin contar con la autorización correspondiente o con la base legal que lo permita</w:t>
       </w:r>
@@ -11124,7 +10350,7 @@
           <w:color w:val="000000"/>
           <w:highlight w:val="green"/>
         </w:rPr>
-        <w:t>6.8.5   Los conjuntos de datos que la SUNAT genere o administre y que califiquen como datos de alto valor se ponen a disposición a través del Centro Nacional de Datos (CND), conforme al numeral 28.7 del artículo 28 del RLIA. La calificación se efectúa conforme a los lineamientos nacionales para la identificación de Datos de Alto Valor que emita la SGTD en aplicación de la Estrategia Nacional de Gobierno de Datos; en tanto no se emitan, el OGD aplica los criterios de priorización que dicha Estrategia enuncia para la publicación obligatoria de Datos de Alto Valor: carácter estratégico, interés nacional, planificación y gestión territorial o alto impacto social. El OGD identifica anualmente los conjuntos candidatos, determina su publicabilidad y propone al CGTD su publicación. La determinación de publicabilidad aplica la reserva tributaria conforme al artículo 85 del TUO del Código Tributario, incluidas sus excepciones expresas (entre ellas la publicación de datos estadísticos de carácter global que no permita la individualización de declaraciones, informaciones, cuentas o personas), y la normativa sobre protección de datos personales. Cuando un conjunto no resulte publicable, la justificación legal de la restricción consta igualmente en el acuerdo del CGTD. Aprobada la publicación, el OGD coordina la puesta a disposición con la unidad de organización que administra el conjunto.</w:t>
+        <w:t xml:space="preserve">6.8.5   Los conjuntos de datos que la SUNAT genere o administre y que califiquen como datos de alto valor se ponen a disposición a través del Centro Nacional de Datos (CND), conforme al numeral 28.7 del artículo 28 del RLIA. La calificación se efectúa conforme a los lineamientos nacionales para la identificación de Datos de Alto Valor que emita la SGTD en aplicación de la Estrategia Nacional de Gobierno de Datos; en tanto no se emitan, el OGD aplica los criterios de priorización que dicha Estrategia enuncia para la publicación obligatoria de Datos de Alto Valor: carácter estratégico, interés nacional, planificación y gestión territorial o alto impacto social. El OGD identifica anualmente los conjuntos candidatos, determina su publicabilidad y propone al CGTD su publicación. La determinación de publicabilidad aplica la reserva tributaria conforme al artículo 85 del TUO del Código Tributario, incluidas sus excepciones expresas (entre ellas la publicación de datos estadísticos de carácter global que no permita la individualización de declaraciones, informaciones, cuentas o personas), y la normativa sobre protección de datos personales. Cuando un conjunto no resulte publicable, la justificación legal de la restricción consta igualmente en el acuerdo del CGTD. Aprobada la publicación, el OGD coordina la puesta a disposición con la unidad de organización que administra el conjunto.</w:t>
       </w:r>
     </w:p>
     <w:p>
@@ -11147,7 +10373,7 @@
           <w:color w:val="000000"/>
           <w:highlight w:val="green"/>
         </w:rPr>
-        <w:t>6.8.6   Los SBIA se construyen sobre conjuntos de datos certificados conforme a la normativa institucional de gobernanza de datos y analítica, cuando estos existan para la materia. El uso de fuentes no certificadas se justifica en la Ficha de Evaluación de Caso de Uso (Anexo N.° 4) y consta en la Ficha de Registro de SBIA (Anexo N.° 1). En tanto no exista normativa de certificación para la materia, el OGD emite opinión sobre la idoneidad de los conjuntos de datos, conforme al numeral 6.8.2.</w:t>
+        <w:t xml:space="preserve">6.8.6   Los SBIA se construyen sobre conjuntos de datos certificados conforme a la normativa institucional de gobernanza de datos y analítica, cuando estos existan para la materia. El uso de fuentes no certificadas se justifica en la Ficha de Evaluación de Caso de Uso (Anexo N.° 4) y consta en la Ficha de Registro de SBIA (Anexo N.° 1). En tanto no exista normativa de certificación para la materia, el OGD emite opinión sobre la idoneidad de los conjuntos de datos, conforme al numeral 6.8.2.</w:t>
       </w:r>
     </w:p>
     <w:p>
@@ -11183,8 +10409,6 @@
       </w:pPr>
       <w:r>
         <w:t>6.9</w:t>
-      </w:r>
-      <w:r>
         <w:tab/>
         <w:t>De la transparencia, explicabilidad y rendición de cuentas</w:t>
       </w:r>
@@ -11207,15 +10431,10 @@
           <w:highlight w:val="yellow"/>
         </w:rPr>
         <w:t>6.9.1</w:t>
-      </w:r>
-      <w:r>
-        <w:rPr>
-          <w:rFonts w:ascii="Arial" w:eastAsia="Arial" w:hAnsi="Arial" w:cs="Arial"/>
-          <w:color w:val="000000"/>
-          <w:highlight w:val="yellow"/>
-        </w:rPr>
         <w:tab/>
-        <w:t>Los SBIA de riesgo alto cuentan con mecanismos de transparencia algorítmica que informan al usuario, de forma previa, clara y sencilla, la finalidad o uso del SBIA, sus funcionalidades principales y el tipo de decisiones que puede tomar, de modo que comprenda cómo interactúa con el SBIA o con el servicio que lo emplea</w:t>
+        <w:t xml:space="preserve">Los SBIA de riesgo alto cuentan con mecanismos de transparencia algorítmica que informan al usuario, de forma previa, clara y sencilla, la finalidad o uso del SBIA, sus funcionalidades principales y el tipo de decisiones que puede tomar, de modo que comprenda cómo interactúa con el SBIA o con el servicio que lo </w:t>
+        <w:lastRenderedPageBreak/>
+        <w:t>emplea</w:t>
       </w:r>
       <w:r>
         <w:rPr>
@@ -11265,15 +10484,7 @@
           <w:color w:val="000000"/>
           <w:highlight w:val="cyan"/>
         </w:rPr>
-        <w:lastRenderedPageBreak/>
         <w:t>6.9.2</w:t>
-      </w:r>
-      <w:r>
-        <w:rPr>
-          <w:rFonts w:ascii="Arial" w:eastAsia="Arial" w:hAnsi="Arial" w:cs="Arial"/>
-          <w:color w:val="000000"/>
-          <w:highlight w:val="cyan"/>
-        </w:rPr>
         <w:tab/>
         <w:t>Entre los mecanismos del numeral 6.9.1 se incluye el etiquetado visible del SBIA. El etiquetado informa al usuario, con antelación, que el producto, servicio o contenido se opera con base en IA. Permite además comprender de manera general sus principales capacidades y limitaciones funcionales. El etiquetado alcanza también a todo SBIA que interactúe directamente con el administrado, cualquiera sea su nivel de riesgo.</w:t>
       </w:r>
@@ -11302,15 +10513,8 @@
           <w:highlight w:val="cyan"/>
         </w:rPr>
         <w:t>6.9.3</w:t>
-      </w:r>
-      <w:r>
-        <w:rPr>
-          <w:rFonts w:ascii="Arial" w:hAnsi="Arial" w:cs="Arial"/>
-          <w:color w:val="000000"/>
-          <w:highlight w:val="cyan"/>
-        </w:rPr>
         <w:tab/>
-        <w:t>Los SBIA de riesgo alto cuentan con mecanismos de explicabilidad que permitan comprender los factores que influyeron en un resultado. Cuando un SBIA intervenga en decisiones que impacten en los derechos de los administrados, estos tienen derecho a recibir la explicación de los resultados, mediante mecanismos que permitan comprender los criterios y factores clave utilizados, en un lenguaje accesible.</w:t>
+        <w:t>Los SBIA de riesgo alto cuentan con mecanismos de explicabilidad que permitan comprender los factores que influyeron en un resultado. Cuando un SBIA intervenga en decisiones que impacten en derechos humanos, las personas afectadas tienen derecho a recibir la explicación de los resultados, conforme al numeral 25.3 del artículo 25 del RLIA. La explicación se proporciona mediante mecanismos que permitan comprender los criterios y factores clave utilizados, en un lenguaje accesible.</w:t>
       </w:r>
       <w:r>
         <w:t xml:space="preserve"> </w:t>
@@ -11341,13 +10545,6 @@
           <w:highlight w:val="yellow"/>
         </w:rPr>
         <w:t>6.9.4</w:t>
-      </w:r>
-      <w:r>
-        <w:rPr>
-          <w:rFonts w:ascii="Arial" w:eastAsia="Arial" w:hAnsi="Arial" w:cs="Arial"/>
-          <w:color w:val="000000"/>
-          <w:highlight w:val="yellow"/>
-        </w:rPr>
         <w:tab/>
         <w:t>El funcionario no debe sustentar la motivación de actos administrativos exclusivamente en resultados de un SBIA. El funcionario debe incorporar su análisis y criterio profesional.</w:t>
       </w:r>
@@ -11368,7 +10565,7 @@
           <w:color w:val="000000"/>
           <w:highlight w:val="green"/>
         </w:rPr>
-        <w:t>6.9.5    La Comisión de Gobierno de IA reporta trimestralmente al CGTD el estado del Inventario Institucional de SBIA, los incidentes, los resultados del monitoreo, la verificación técnica de seguridad, el avance de la capacitación y el cumplimiento de los indicadores. El reporte comprende además el seguimiento de los encargos previsto en el numeral 7.6, el estado de las condiciones del PAIA previsto en el numeral 7.11 y el alineamiento previsto en el numeral 7.12. Dicho reporte constituye el informe trimestral de gobierno de IA. Da cuenta de la actividad de la Comisión de Gobierno de IA y no constituye avance del Plan de Gobierno Digital.</w:t>
+        <w:t xml:space="preserve">6.9.5    La Comisión de Gobierno de IA reporta trimestralmente al CGTD el estado del Inventario Institucional de SBIA, los incidentes, los resultados del monitoreo, la verificación técnica de seguridad, el avance de la capacitación y el cumplimiento de los indicadores. El reporte comprende además el seguimiento de los encargos previsto en el numeral 7.6, el estado de las condiciones del PAIA previsto en el numeral 7.11 y el alineamiento previsto en el numeral 7.12. Dicho reporte constituye el informe trimestral de gobierno de IA. Da cuenta de la actividad de la Comisión de Gobierno de IA y no constituye avance del Plan de Gobierno Digital.</w:t>
       </w:r>
     </w:p>
     <w:p>
@@ -11387,17 +10584,11 @@
           <w:color w:val="000000"/>
           <w:highlight w:val="green"/>
         </w:rPr>
+        <w:t>6.9.6</w:t>
+        <w:tab/>
+        <w:t xml:space="preserve">El estado del gobierno de IA institucional se informa como sección del informe de seguimiento del Plan de Gobierno Digital que presenta el CGTD, con la </w:t>
         <w:lastRenderedPageBreak/>
-        <w:t>6.9.6</w:t>
-      </w:r>
-      <w:r>
-        <w:rPr>
-          <w:rFonts w:ascii="Arial" w:eastAsia="Arial" w:hAnsi="Arial" w:cs="Arial"/>
-          <w:color w:val="000000"/>
-          <w:highlight w:val="green"/>
-        </w:rPr>
-        <w:tab/>
-        <w:t>El estado del gobierno de IA institucional se informa como sección del informe de seguimiento del Plan de Gobierno Digital que presenta el CGTD, con la periodicidad y por el conducto que dicho instrumento establece. La inclusión de los proyectos de SBIA en el Plan de Gobierno Digital se efectúa conforme al numeral 28.10 del artículo 28 del RLIA y a los numerales 7.11 y 7.12 de la presente directiva. Dicha sección sustenta la información que la SUNAT remita a la SGTD en materia de inteligencia artificial. No se genera un informe institucional adicional por esta materia.</w:t>
+        <w:t>periodicidad y por el conducto que dicho instrumento establece. La inclusión de los proyectos de SBIA en el Plan de Gobierno Digital se efectúa conforme al numeral 28.10 del artículo 28 del RLIA y a los numerales 7.11 y 7.12 de la presente directiva. Dicha sección sustenta la información que la SUNAT remita a la SGTD en materia de inteligencia artificial. No se genera un informe institucional adicional por esta materia.</w:t>
       </w:r>
     </w:p>
     <w:p>
@@ -11417,13 +10608,6 @@
           <w:highlight w:val="yellow"/>
         </w:rPr>
         <w:t>6.9.7</w:t>
-      </w:r>
-      <w:r>
-        <w:rPr>
-          <w:rFonts w:ascii="Arial" w:eastAsia="Arial" w:hAnsi="Arial" w:cs="Arial"/>
-          <w:color w:val="000000"/>
-          <w:highlight w:val="yellow"/>
-        </w:rPr>
         <w:tab/>
         <w:t>Los lineamientos sobre Transparencia Algorítmica que apruebe la SGTD</w:t>
       </w:r>
@@ -11450,8 +10634,6 @@
       </w:pPr>
       <w:r>
         <w:t>6.10</w:t>
-      </w:r>
-      <w:r>
         <w:tab/>
         <w:t>Del monitoreo, auditoría y mejora continua</w:t>
       </w:r>
@@ -11474,15 +10656,8 @@
           <w:highlight w:val="green"/>
         </w:rPr>
         <w:t>6.10.1</w:t>
-      </w:r>
-      <w:r>
-        <w:rPr>
-          <w:rFonts w:ascii="Arial" w:eastAsia="Arial" w:hAnsi="Arial" w:cs="Arial"/>
-          <w:color w:val="000000"/>
-          <w:highlight w:val="green"/>
-        </w:rPr>
         <w:tab/>
-        <w:t>Todo SBIA en operación es objeto de monitoreo. La Comisión de Gobierno de IA determina la frecuencia y la profundidad del monitoreo de cada SBIA en función de su nivel de riesgo, del impacto que un resultado erróneo produciría en el administrado o en la institución, del volumen de operaciones que procesa y del grado de autonomía con que opera. La frecuencia determinada, los indicadores aplicables conforme al numeral 6.10.2, sus umbrales determinados conforme a dicho numeral y los responsables de la medición constan en el plan de monitoreo del SBIA, que la Comisión de Gobierno de IA aprueba con anterioridad a su puesta en producción.</w:t>
+        <w:t xml:space="preserve">Todo SBIA en operación es objeto de monitoreo. La Comisión de Gobierno de IA determina la frecuencia y la profundidad del monitoreo de cada SBIA en función de su nivel de riesgo, del impacto que un resultado erróneo produciría en el administrado o en la institución, del volumen de operaciones que procesa y del grado de autonomía con que opera. La frecuencia determinada, los indicadores aplicables conforme al numeral 6.10.2, sus umbrales determinados conforme a dicho numeral y los responsables de la medición constan en el plan de monitoreo del SBIA, que la Comisión de Gobierno de IA aprueba con anterioridad a su puesta en producción.</w:t>
       </w:r>
     </w:p>
     <w:p>
@@ -11554,25 +10729,7 @@
           <w:color w:val="000000"/>
           <w:highlight w:val="green"/>
         </w:rPr>
-        <w:t xml:space="preserve">Cuando el plan de monitoreo prevea vigilancia automatizada, esta </w:t>
-      </w:r>
-      <w:proofErr w:type="spellStart"/>
-      <w:r>
-        <w:rPr>
-          <w:rFonts w:ascii="Arial" w:eastAsia="Arial" w:hAnsi="Arial" w:cs="Arial"/>
-          <w:color w:val="000000"/>
-          <w:highlight w:val="green"/>
-        </w:rPr>
-        <w:t>opera</w:t>
-      </w:r>
-      <w:proofErr w:type="spellEnd"/>
-      <w:r>
-        <w:rPr>
-          <w:rFonts w:ascii="Arial" w:eastAsia="Arial" w:hAnsi="Arial" w:cs="Arial"/>
-          <w:color w:val="000000"/>
-          <w:highlight w:val="green"/>
-        </w:rPr>
-        <w:t xml:space="preserve"> durante el horario de operación del SBIA, salvo que su criticidad justifique cobertura permanente, lo que se sustenta en el mismo plan.</w:t>
+        <w:t>Cuando el plan de monitoreo prevea vigilancia automatizada, esta opera durante el horario de operación del SBIA, salvo que su criticidad justifique cobertura permanente, lo que se sustenta en el mismo plan.</w:t>
       </w:r>
     </w:p>
     <w:p>
@@ -11611,24 +10768,8 @@
           <w:highlight w:val="green"/>
         </w:rPr>
         <w:t>6.10.2</w:t>
-      </w:r>
-      <w:r>
-        <w:rPr>
-          <w:rFonts w:ascii="Arial" w:eastAsia="Arial" w:hAnsi="Arial" w:cs="Arial"/>
-          <w:color w:val="000000"/>
-          <w:highlight w:val="green"/>
-        </w:rPr>
         <w:tab/>
-        <w:t xml:space="preserve">La Comisión de Gobierno de IA define, para cada SBIA registrado en el Inventario, los indicadores de monitoreo que como mínimo incluyen: tasa de precisión, tasa de error, tiempo de respuesta, disponibilidad, detección de drift, indicadores de sesgo, tasa de intervención humana e indicadores de detección del uso irregular previstos en el numeral 6.10.6. Los umbrales de cada indicador, las alertas que su superación activa y las acciones de tratamiento correspondientes se definen con anterioridad a la puesta en producción del SBIA, conforme a la metodología prevista en el numeral 6.1.5. En tanto no se </w:t>
-      </w:r>
-      <w:r>
-        <w:rPr>
-          <w:rFonts w:ascii="Arial" w:eastAsia="Arial" w:hAnsi="Arial" w:cs="Arial"/>
-          <w:color w:val="000000"/>
-          <w:highlight w:val="green"/>
-        </w:rPr>
-        <w:lastRenderedPageBreak/>
-        <w:t>apruebe dicha metodología, se establecen en el plan de monitoreo que aprueba la Comisión de Gobierno de IA.</w:t>
+        <w:t xml:space="preserve">La Comisión de Gobierno de IA define, para cada SBIA registrado en el Inventario, los indicadores de monitoreo que como mínimo incluyen: tasa de precisión, tasa de error, tiempo de respuesta, disponibilidad, detección de drift, indicadores de sesgo, tasa de intervención humana e indicadores de detección del uso irregular previstos en el numeral 6.10.6. Los umbrales de cada indicador, las alertas que su superación activa y las acciones de tratamiento correspondientes se definen con anterioridad a la puesta en producción del SBIA, conforme a la metodología prevista en el numeral 6.1.5. En tanto no se apruebe dicha metodología, se establecen en el plan de monitoreo que aprueba la Comisión de Gobierno de IA.</w:t>
       </w:r>
       <w:r>
         <w:rPr>
@@ -11661,14 +10802,8 @@
           <w:color w:val="000000"/>
           <w:highlight w:val="yellow"/>
         </w:rPr>
+        <w:lastRenderedPageBreak/>
         <w:t>6.10.3</w:t>
-      </w:r>
-      <w:r>
-        <w:rPr>
-          <w:rFonts w:ascii="Arial" w:eastAsia="Arial" w:hAnsi="Arial" w:cs="Arial"/>
-          <w:color w:val="000000"/>
-          <w:highlight w:val="yellow"/>
-        </w:rPr>
         <w:tab/>
         <w:t>La Gerencia de Calidad de Sistemas conduce el control y aseguramiento de la calidad de los SBIA, conforme a sus funciones (artículos 123 y 124, literal a, del ROF). La verificación y validación de la calidad, incluida la ejecución de las pruebas funcionales y no funcionales, corresponde a la División de Control de Calidad, conforme a sus funciones (artículos 125 y 126, literal a, del ROF), y comprende además las pruebas de rendimiento y de regresión que correspondan al tipo de SBIA.</w:t>
       </w:r>
@@ -11689,7 +10824,7 @@
           <w:color w:val="000000"/>
           <w:highlight w:val="green"/>
         </w:rPr>
-        <w:t>El análisis de riesgo y las pruebas de vulnerabilidad sobre la arquitectura de aplicaciones, de información y de infraestructura tecnológica que soporta cada SBIA corresponden a la Oficina de Seguridad Informática, conforme al literal b) del artículo 106 del ROF y a la etapa de certificación y validación del numeral 6.1.1. La obligación de auditorías de seguridad digital del literal c) del artículo 29 del RLIA se satisface con la concurrencia de la verificación y validación de calidad, del análisis de riesgo, las pruebas de vulnerabilidad y el red teaming previstos en el numeral 6.7.2, con anterioridad a la implementación del SBIA y con la periodicidad que establezca el documento normativo del numeral 6.7.7, y del monitoreo del numeral 6.10, que comprende los indicadores de sesgo del numeral 6.10.2 y las medidas del numeral 6.6.4, durante toda su operación. Los resultados de estas actividades alimentan el informe trimestral de la Comisión de Gobierno de IA al CGTD.</w:t>
+        <w:t xml:space="preserve">El análisis de riesgo y las pruebas de vulnerabilidad sobre la arquitectura de aplicaciones, de información y de infraestructura tecnológica que soporta cada SBIA corresponden a la Oficina de Seguridad Informática, conforme al literal b) del artículo 106 del ROF y a la etapa de certificación y validación del numeral 6.1.1. La obligación de auditorías de seguridad digital del literal c) del artículo 29 del RLIA se satisface con la concurrencia de la verificación y validación de calidad, del análisis de riesgo, las pruebas de vulnerabilidad y el red teaming previstos en el numeral 6.7.2, con anterioridad a la implementación del SBIA y con la periodicidad que establezca el documento normativo del numeral 6.7.7, y del monitoreo del numeral 6.10, que comprende los indicadores de sesgo del numeral 6.10.2 y las medidas del numeral 6.6.4, durante toda su operación. Los resultados de estas actividades alimentan el informe trimestral de la Comisión de Gobierno de IA al CGTD.</w:t>
       </w:r>
     </w:p>
     <w:p>
@@ -11738,15 +10873,7 @@
           <w:rFonts w:ascii="Arial" w:hAnsi="Arial" w:cs="Arial"/>
           <w:highlight w:val="lightGray"/>
         </w:rPr>
-        <w:t xml:space="preserve">cambio significativo requiere, con anterioridad a su puesta en producción: la revisión de la clasificación de riesgo conforme al numeral 6.2.2; la actualización de la EIA conforme al numeral 6.4.3, cuando corresponda; la verificación y validación conforme al numeral 6.10.3; y la aprobación prevista en el numeral 6.1.2. El despliegue del cambio se realiza con versión identificable y con un plan de reversión que permita restituir la versión anterior del SBIA. La operación posterior al cambio es objeto de </w:t>
-      </w:r>
-      <w:r>
-        <w:rPr>
-          <w:rFonts w:ascii="Arial" w:hAnsi="Arial" w:cs="Arial"/>
-          <w:highlight w:val="lightGray"/>
-        </w:rPr>
-        <w:lastRenderedPageBreak/>
-        <w:t>seguimiento reforzado durante el periodo que corresponda a su nivel de riesgo, conforme a la metodología prevista en el numeral 6.1.5.</w:t>
+        <w:t>cambio significativo requiere, con anterioridad a su puesta en producción: la revisión de la clasificación de riesgo conforme al numeral 6.2.2; la actualización de la EIA conforme al numeral 6.4.3, cuando corresponda; la verificación y validación conforme al numeral 6.10.3; y la aprobación prevista en el numeral 6.1.2. El despliegue del cambio se realiza con versión identificable y con un plan de reversión que permita restituir la versión anterior del SBIA. La operación posterior al cambio es objeto de seguimiento reforzado durante el periodo que corresponda a su nivel de riesgo, conforme a la metodología prevista en el numeral 6.1.5.</w:t>
       </w:r>
     </w:p>
     <w:p>
@@ -11763,7 +10890,9 @@
           <w:rFonts w:ascii="Arial" w:hAnsi="Arial" w:cs="Arial"/>
           <w:highlight w:val="green"/>
         </w:rPr>
-        <w:t>6.10.6 El monitoreo comprende la detección del uso irregular del SBIA por parte de quienes lo operan o interactúan con él, con independencia del nivel de riesgo que tenga asignado. El uso irregular se distingue del uso indebido a que se refiere el artículo 23 del RLIA, que es una categoría de clasificación del SBIA. Constituyen indicios de uso irregular, entre otros, la manipulación de los datos de entrada para inducir un resultado determinado, el empleo del SBIA para una finalidad distinta de la registrada en el Inventario Institucional de SBIA y los patrones de uso incompatibles con la operación normal del proceso. La Comisión de Gobierno de IA define los indicadores que permitan detectar dichos patrones, conforme al numeral 6.10.2, y los incorpora al plan de monitoreo. Los efectos del uso irregular sobre el funcionamiento del SBIA se tratan conforme al numeral 6.7.5. La conducta se comunica a la Oficina de Integridad Institucional y se trata conforme a las normas de integridad institucional.</w:t>
+        <w:t xml:space="preserve">6.10.6 El monitoreo comprende la detección del uso irregular del SBIA por parte de quienes lo operan o interactúan con él, con independencia del nivel de riesgo que tenga asignado. El uso irregular se distingue del uso indebido a que se refiere el artículo 23 del RLIA, que es una categoría de clasificación del SBIA. Constituyen indicios de uso irregular, entre otros, la manipulación de los datos de entrada para inducir un resultado determinado, el empleo del SBIA para una finalidad distinta de la registrada en el Inventario Institucional de SBIA y los </w:t>
+        <w:lastRenderedPageBreak/>
+        <w:t xml:space="preserve">patrones de uso incompatibles con la operación normal del proceso. La Comisión de Gobierno de IA define los indicadores que permitan detectar dichos patrones, conforme al numeral 6.10.2, y los incorpora al plan de monitoreo. Los efectos del uso irregular sobre el funcionamiento del SBIA se tratan conforme al numeral 6.7.5. La conducta se comunica a la Oficina de Integridad Institucional y se trata conforme a las normas de integridad institucional.</w:t>
       </w:r>
     </w:p>
     <w:p>
@@ -11808,7 +10937,7 @@
           <w:szCs w:val="24"/>
           <w:highlight w:val="cyan"/>
         </w:rPr>
-        <w:t>Del uso responsable y ético, de las capacidades y proveedores</w:t>
+        <w:t xml:space="preserve">Del uso responsable y ético, de las capacidades y proveedores</w:t>
       </w:r>
     </w:p>
     <w:p>
@@ -11819,8 +10948,6 @@
       </w:pPr>
       <w:r>
         <w:t>6.11</w:t>
-      </w:r>
-      <w:r>
         <w:tab/>
         <w:t>Del uso responsable de herramientas de IA</w:t>
       </w:r>
@@ -11841,12 +10968,6 @@
           <w:color w:val="000000"/>
         </w:rPr>
         <w:t>6.11.1</w:t>
-      </w:r>
-      <w:r>
-        <w:rPr>
-          <w:rFonts w:ascii="Arial" w:eastAsia="Arial" w:hAnsi="Arial" w:cs="Arial"/>
-          <w:color w:val="000000"/>
-        </w:rPr>
         <w:tab/>
         <w:t xml:space="preserve">Los colaboradores que utilicen herramientas de IA generativa </w:t>
       </w:r>
@@ -12000,13 +11121,6 @@
           <w:highlight w:val="green"/>
         </w:rPr>
         <w:t>6.11.2</w:t>
-      </w:r>
-      <w:r>
-        <w:rPr>
-          <w:rFonts w:ascii="Arial" w:eastAsia="Arial" w:hAnsi="Arial" w:cs="Arial"/>
-          <w:color w:val="000000"/>
-          <w:highlight w:val="green"/>
-        </w:rPr>
         <w:tab/>
         <w:t>El catálogo de herramientas de IA autorizadas para uso institucional, en adelante el catálogo institucional, registra las herramientas aprobadas conforme al numeral 6.11.5. El catálogo precisa, para cada herramienta, el ámbito de uso autorizado (uso administrativo general o uso restringido) y si se encuentra desplegada en infraestructura bajo control de la SUNAT. Solo las herramientas desplegadas en dicha infraestructura pueden emplearse con información sujeta a reserva tributaria, conforme al numeral 6.7.3. La INSI lo publica y lo mantiene actualizado.</w:t>
       </w:r>
@@ -12027,15 +11141,7 @@
           <w:color w:val="000000"/>
           <w:highlight w:val="green"/>
         </w:rPr>
-        <w:lastRenderedPageBreak/>
         <w:t>6.11.3</w:t>
-      </w:r>
-      <w:r>
-        <w:rPr>
-          <w:rFonts w:ascii="Arial" w:eastAsia="Arial" w:hAnsi="Arial" w:cs="Arial"/>
-          <w:color w:val="000000"/>
-          <w:highlight w:val="green"/>
-        </w:rPr>
         <w:tab/>
         <w:t xml:space="preserve">Los lineamientos técnicos que regulan el uso de LLM open source en la infraestructura institucional integran los documentos técnicos de arquitectura previstos en el numeral 6.5.3. La División de Arquitectura de Información y de Aplicaciones los elabora y propone en lo referido al modelo y a la arquitectura de aplicaciones, conforme al literal b) del artículo 132 del ROF, y la División de Arquitectura Tecnológica en lo referido a la infraestructura especializada que los soporta, conforme a los literales c) y d) del artículo 134 del ROF. Su aprobación se efectúa conforme al numeral 6.5.3. Las unidades de organización los cumplen como condición para el despliegue de estos modelos. En tanto no se aprueben, el despliegue de estos modelos requiere la autorización previa de la Gerencia de Arquitectura y observa los controles del numeral 6.7.2. </w:t>
       </w:r>
@@ -12045,7 +11151,9 @@
           <w:color w:val="000000"/>
           <w:highlight w:val="cyan"/>
         </w:rPr>
-        <w:t>El despliegue de estos modelos observa, en lo que corresponda, el Procedimiento para el Registro, Control y Retiro de Software de la SUNAT (A-03.3.2-PR-01).</w:t>
+        <w:t xml:space="preserve">El despliegue de estos </w:t>
+        <w:lastRenderedPageBreak/>
+        <w:t>modelos observa, en lo que corresponda, el Procedimiento para el Registro, Control y Retiro de Software de la SUNAT (A-03.3.2-PR-01).</w:t>
       </w:r>
     </w:p>
     <w:p>
@@ -12065,15 +11173,8 @@
           <w:highlight w:val="green"/>
         </w:rPr>
         <w:t>6.11.4</w:t>
-      </w:r>
-      <w:r>
-        <w:rPr>
-          <w:rFonts w:ascii="Arial" w:eastAsia="Arial" w:hAnsi="Arial" w:cs="Arial"/>
-          <w:color w:val="000000"/>
-          <w:highlight w:val="green"/>
-        </w:rPr>
         <w:tab/>
-        <w:t>Ninguna unidad de organización desarrolla, adquiere, contrata, implementa u opera SBIA fuera del límite de la presente directiva, independientemente de su complejidad, presupuesto o ámbito geográfico. En particular: (a) toda iniciativa de SBIA como proyecto se sujeta al ciclo de vida del numeral 6.1, incluidos sus hitos de aprobación, y se registra en el Inventario Institucional de SBIA; (b) toda herramienta de IA que se contrate como servicio (suscripciones, APIs, plataformas SaaS) cuenta previamente con la aprobación prevista en el numeral 6.11.5 y con su inclusión en el catálogo institucional (numeral 6.11.2). Cuando la herramienta constituya además un SBIA, le son aplicables las verificaciones del numeral 6.12 que correspondan. Los colaboradores utilizan exclusivamente las herramientas de IA que figuran en dicho catálogo. La Comisión de Gobierno de IA promueve la regularización mediante el registro y el acompañamiento proporcional a la unidad involucrada, y comunica al CGTD y, según corresponda, a la OII, los incumplimientos reiterados. Cuando de la regularización resulte que el SBIA corresponde a la categoría de uso indebido prevista en el artículo 23 del RLIA, no procede su regularización y se aplica lo dispuesto en los numerales 6.2.1, 6.2.3 y 6.2.6.</w:t>
+        <w:t xml:space="preserve">Ninguna unidad de organización desarrolla, adquiere, contrata, implementa u opera SBIA fuera del límite de la presente directiva, independientemente de su complejidad, presupuesto o ámbito geográfico. En particular: (a) toda iniciativa de SBIA como proyecto se sujeta al ciclo de vida del numeral 6.1, incluidos sus hitos de aprobación, y se registra en el Inventario Institucional de SBIA; (b) toda herramienta de IA que se contrate como servicio (suscripciones, APIs, plataformas SaaS) cuenta previamente con la aprobación prevista en el numeral 6.11.5 y con su inclusión en el catálogo institucional (numeral 6.11.2). Cuando la herramienta constituya además un SBIA, le son aplicables las verificaciones del numeral 6.12 que correspondan. Los colaboradores utilizan exclusivamente las herramientas de IA que figuran en dicho catálogo. La Comisión de Gobierno de IA promueve la regularización mediante el registro y el acompañamiento proporcional a la unidad involucrada, y comunica al CGTD y, según corresponda, a la OII, los incumplimientos reiterados. Cuando de la regularización resulte que el SBIA corresponde a la categoría de uso indebido prevista en el artículo 23 del RLIA, no procede su regularización y se aplica lo dispuesto en los numerales 6.2.1, 6.2.3 y 6.2.6.</w:t>
       </w:r>
     </w:p>
     <w:p>
@@ -12093,13 +11194,6 @@
           <w:highlight w:val="cyan"/>
         </w:rPr>
         <w:t>6.11.5</w:t>
-      </w:r>
-      <w:r>
-        <w:rPr>
-          <w:rFonts w:ascii="Arial" w:hAnsi="Arial" w:cs="Arial"/>
-          <w:color w:val="000000"/>
-          <w:highlight w:val="cyan"/>
-        </w:rPr>
         <w:tab/>
         <w:t xml:space="preserve">La GA aprueba las herramientas de IA que pueden emplearse en la SUNAT, conforme a sus funciones (artículo 130, literal c, del ROF), y las registra en el catálogo institucional. </w:t>
       </w:r>
@@ -12117,7 +11211,7 @@
           <w:color w:val="000000"/>
           <w:highlight w:val="cyan"/>
         </w:rPr>
-        <w:t>El catálogo institucional constituye el subconjunto de inteligencia artificial del inventario de software autorizado; ambos se distinguen del Inventario Institucional de SBIA, que registra los SBIA y no las herramientas.</w:t>
+        <w:t xml:space="preserve">El catálogo institucional constituye el subconjunto de inteligencia artificial del inventario de software autorizado; ambos se distinguen del Inventario Institucional de SBIA, que registra los SBIA y no las herramientas.</w:t>
       </w:r>
       <w:r>
         <w:rPr>
@@ -12133,16 +11227,7 @@
           <w:color w:val="000000"/>
           <w:highlight w:val="green"/>
         </w:rPr>
-        <w:t xml:space="preserve">El registro, el control y el retiro de las herramientas de IA que requieren instalación en los equipos informáticos se rigen por el Procedimiento para el Registro, Control y Retiro de Software de la SUNAT (A-03.3.2-PR-01). La Gerencia de Operaciones y Soporte a Usuarios adecúa dicho procedimiento para </w:t>
-      </w:r>
-      <w:r>
-        <w:rPr>
-          <w:rFonts w:ascii="Arial" w:eastAsia="Arial" w:hAnsi="Arial" w:cs="Arial"/>
-          <w:color w:val="000000"/>
-          <w:highlight w:val="green"/>
-        </w:rPr>
-        <w:lastRenderedPageBreak/>
-        <w:t>comprender las herramientas de IA que se consumen como servicio y no requieren instalación, conforme al numeral 7.6 de la presente directiva. En tanto no se apruebe dicha adecuación, el alta y la baja de estas herramientas en el catálogo institucional se efectúan conforme al presente numeral.</w:t>
+        <w:t>El registro, el control y el retiro de las herramientas de IA que requieren instalación en los equipos informáticos se rigen por el Procedimiento para el Registro, Control y Retiro de Software de la SUNAT (A-03.3.2-PR-01). La Gerencia de Operaciones y Soporte a Usuarios adecúa dicho procedimiento para comprender las herramientas de IA que se consumen como servicio y no requieren instalación, conforme al numeral 7.6 de la presente directiva. En tanto no se apruebe dicha adecuación, el alta y la baja de estas herramientas en el catálogo institucional se efectúan conforme al presente numeral.</w:t>
       </w:r>
     </w:p>
     <w:p>
@@ -12153,8 +11238,6 @@
       </w:pPr>
       <w:r>
         <w:t>6.12</w:t>
-      </w:r>
-      <w:r>
         <w:tab/>
         <w:t>De la gestión de proveedores de IA</w:t>
       </w:r>
@@ -12176,13 +11259,6 @@
           <w:highlight w:val="green"/>
         </w:rPr>
         <w:t>6.12.1</w:t>
-      </w:r>
-      <w:r>
-        <w:rPr>
-          <w:rFonts w:ascii="Arial" w:eastAsia="Arial" w:hAnsi="Arial" w:cs="Arial"/>
-          <w:color w:val="000000"/>
-          <w:highlight w:val="green"/>
-        </w:rPr>
         <w:tab/>
         <w:t>La unidad de organización que formula los términos de referencia o las especificaciones técnicas para la adquisición de un SBIA incorpora en ellos los requisitos de cumplimiento de la presente directiva y de la normativa aplicable. La Gerencia de Arquitectura verifica su incorporación con anterioridad a la aprobación de los términos de referencia o de las especificaciones técnicas, conforme al literal c) del artículo 130 del ROF. El resultado de la verificación consta en el expediente de contratación.</w:t>
       </w:r>
@@ -12204,15 +11280,10 @@
           <w:highlight w:val="green"/>
         </w:rPr>
         <w:t>6.12.2</w:t>
-      </w:r>
-      <w:r>
-        <w:rPr>
-          <w:rFonts w:ascii="Arial" w:eastAsia="Arial" w:hAnsi="Arial" w:cs="Arial"/>
-          <w:color w:val="000000"/>
-          <w:highlight w:val="green"/>
-        </w:rPr>
         <w:tab/>
-        <w:t>La unidad de organización que formula los términos de referencia o las especificaciones técnicas incorpora en ellos las cláusulas que el contrato debe contener sobre: (a) protección de datos y reserva tributaria; (b) transparencia del modelo; (c) comunicación de vulnerabilidades e incidentes; (d) derecho de auditoría, incluida la realización de auditorías éticas y de sesgo sobre el modelo; (e) transferencia de conocimiento; (f) cumplimiento de estándares técnicos; y (g) la identificación de los subprocesadores autorizados y las condiciones de recuperación de la información institucional a la conclusión del contrato. El plazo de notificación de vulnerabilidades se define en los TDR o EETT de cada contratación, según la criticidad del SBIA.</w:t>
+        <w:t xml:space="preserve">La unidad de organización que formula los términos de referencia o las especificaciones técnicas incorpora en ellos las cláusulas que el contrato debe </w:t>
+        <w:lastRenderedPageBreak/>
+        <w:t xml:space="preserve">contener sobre: (a) protección de datos y reserva tributaria; (b) transparencia del modelo; (c) comunicación de vulnerabilidades e incidentes; (d) derecho de auditoría, incluida la realización de auditorías éticas y de sesgo sobre el modelo; (e) transferencia de conocimiento; (f) cumplimiento de estándares técnicos; y (g) la identificación de los subprocesadores autorizados y las condiciones de recuperación de la información institucional a la conclusión del contrato. El plazo de notificación de vulnerabilidades se define en los TDR o EETT de cada contratación, según la criticidad del SBIA.</w:t>
       </w:r>
     </w:p>
     <w:p>
@@ -12232,13 +11303,6 @@
           <w:highlight w:val="green"/>
         </w:rPr>
         <w:t>6.12.3</w:t>
-      </w:r>
-      <w:r>
-        <w:rPr>
-          <w:rFonts w:ascii="Arial" w:eastAsia="Arial" w:hAnsi="Arial" w:cs="Arial"/>
-          <w:color w:val="000000"/>
-          <w:highlight w:val="green"/>
-        </w:rPr>
         <w:tab/>
         <w:t>Para SBIA SaaS, la INSI verifica que las condiciones técnicas y operativas del servicio se ajusten a la restricción del numeral 6.7.3. La compatibilidad de los términos de uso con las obligaciones de la SUNAT en materia de datos es materia de la opinión previa de la INALI prevista en el numeral 5.4. Estos SBIA no procesan información sujeta a reserva tributaria.</w:t>
       </w:r>
@@ -12260,13 +11324,6 @@
           <w:highlight w:val="green"/>
         </w:rPr>
         <w:t>6.12.4</w:t>
-      </w:r>
-      <w:r>
-        <w:rPr>
-          <w:rFonts w:ascii="Arial" w:eastAsia="Arial" w:hAnsi="Arial" w:cs="Arial"/>
-          <w:color w:val="000000"/>
-          <w:highlight w:val="green"/>
-        </w:rPr>
         <w:tab/>
         <w:t>La unidad de organización que formula los términos de referencia o las especificaciones técnicas incorpora en ellos la cláusula que prohíbe al proveedor y a su personal emplear la información de la SUNAT a la que accedan en ejecución del contrato, las instrucciones que se les remitan y los resultados derivados de su tratamiento, para entrenar, ajustar o mejorar sus modelos o para cualquier fin distinto de la ejecución del contrato. Tratándose de información sujeta a reserva tributaria, la prohibición se sustenta en el artículo 85 del Código Tributario, que extiende la obligación de reserva a quienes accedan a dicha información.</w:t>
       </w:r>
@@ -12288,24 +11345,8 @@
           <w:highlight w:val="green"/>
         </w:rPr>
         <w:t>6.12.5</w:t>
-      </w:r>
-      <w:r>
-        <w:rPr>
-          <w:rFonts w:ascii="Arial" w:eastAsia="Arial" w:hAnsi="Arial" w:cs="Arial"/>
-          <w:color w:val="000000"/>
-          <w:highlight w:val="green"/>
-        </w:rPr>
         <w:tab/>
-        <w:t xml:space="preserve">Para los SBIA de riesgo alto, los contratos obligan al proveedor a entregar la documentación técnica sobre los principios de funcionamiento del sistema, las fuentes de datos utilizadas y la lógica del algoritmo, conforme al numeral 31.1 del artículo 31 del RLIA, en la medida necesaria para el cumplimiento de las obligaciones de transparencia y explicabilidad de la SUNAT y con respeto del secreto industrial y comercial, conforme al numeral 25.1 del artículo 25 del RLIA. La Comisión de Gobierno de IA determina el alcance de la </w:t>
-      </w:r>
-      <w:r>
-        <w:rPr>
-          <w:rFonts w:ascii="Arial" w:eastAsia="Arial" w:hAnsi="Arial" w:cs="Arial"/>
-          <w:color w:val="000000"/>
-          <w:highlight w:val="green"/>
-        </w:rPr>
-        <w:lastRenderedPageBreak/>
-        <w:t>documentación exigible al evaluar el componente de IA del caso de uso. No se admiten soluciones de caja negra no auditables.</w:t>
+        <w:t>Para los SBIA de riesgo alto, los contratos obligan al proveedor a entregar la documentación técnica sobre los principios de funcionamiento del sistema, las fuentes de datos utilizadas y la lógica del algoritmo, conforme al numeral 31.1 del artículo 31 del RLIA, en la medida necesaria para el cumplimiento de las obligaciones de transparencia y explicabilidad de la SUNAT y con respeto del secreto industrial y comercial, conforme al numeral 25.1 del artículo 25 del RLIA. La Comisión de Gobierno de IA determina el alcance de la documentación exigible al evaluar el componente de IA del caso de uso. No se admiten soluciones de caja negra no auditables.</w:t>
       </w:r>
     </w:p>
     <w:p>
@@ -12322,11 +11363,6 @@
           <w:highlight w:val="green"/>
         </w:rPr>
         <w:t>6.13</w:t>
-      </w:r>
-      <w:r>
-        <w:rPr>
-          <w:highlight w:val="green"/>
-        </w:rPr>
         <w:tab/>
         <w:t>De la sensibilización, la capacitación y la gestión del cambio</w:t>
       </w:r>
@@ -12392,7 +11428,7 @@
           <w:color w:val="000000"/>
           <w:highlight w:val="lightGray"/>
         </w:rPr>
-        <w:t>Todo el personal de la SUNAT vinculado al diseño, desarrollo, implementación, evaluación o uso de SBIA es sensibilizado respecto del uso seguro, responsable y ético de dichos sistemas, así como de los riesgos asociados y de las disposiciones establecidas en la Política de IA.</w:t>
+        <w:t xml:space="preserve">Todo el personal de la SUNAT vinculado al diseño, desarrollo, implementación, evaluación o uso de SBIA es sensibilizado respecto del uso seguro, responsable y ético de dichos sistemas, así como de los riesgos asociados y de las disposiciones establecidas en la Política de IA.</w:t>
       </w:r>
     </w:p>
     <w:p>
@@ -12438,7 +11474,7 @@
           <w:color w:val="000000"/>
           <w:highlight w:val="lightGray"/>
         </w:rPr>
-        <w:t>La finalidad y los principios institucionales aplicables a los SBIA</w:t>
+        <w:t xml:space="preserve">La finalidad y los principios institucionales aplicables a los SBIA</w:t>
       </w:r>
     </w:p>
     <w:p>
@@ -12464,6 +11500,7 @@
           <w:color w:val="000000"/>
           <w:highlight w:val="lightGray"/>
         </w:rPr>
+        <w:lastRenderedPageBreak/>
         <w:t>Los riesgos derivados de su diseño, desarrollo, implementación y uso.</w:t>
       </w:r>
     </w:p>
@@ -12542,7 +11579,7 @@
           <w:color w:val="000000"/>
           <w:highlight w:val="lightGray"/>
         </w:rPr>
-        <w:t>El impacto social y ambiental de los SBIA.</w:t>
+        <w:t xml:space="preserve">El impacto social y ambiental de los SBIA.</w:t>
       </w:r>
     </w:p>
     <w:p>
@@ -12565,7 +11602,7 @@
           <w:color w:val="000000"/>
           <w:highlight w:val="green"/>
         </w:rPr>
-        <w:t>Esta disposición desarrolla el principio rector de sensibilización y educación en IA establecido en el literal f) del artículo 7 del RLIA, en concordancia con el numeral 7.3 de la NTP-ISO/IEC 42001:2025.</w:t>
+        <w:t xml:space="preserve">Esta disposición desarrolla el principio rector de sensibilización y educación en IA establecido en el literal f) del artículo 7 del RLIA, en concordancia con el numeral 7.3 de la NTP-ISO/IEC 42001:2025.</w:t>
       </w:r>
     </w:p>
     <w:p>
@@ -12671,7 +11708,7 @@
           <w:color w:val="000000"/>
           <w:highlight w:val="lightGray"/>
         </w:rPr>
-        <w:t>Los fundamentos y el ciclo de vida de los SBIA.</w:t>
+        <w:t xml:space="preserve">Los fundamentos y el ciclo de vida de los SBIA.</w:t>
       </w:r>
     </w:p>
     <w:p>
@@ -12749,7 +11786,6 @@
           <w:color w:val="000000"/>
           <w:highlight w:val="lightGray"/>
         </w:rPr>
-        <w:lastRenderedPageBreak/>
         <w:t>La protección de datos personales.</w:t>
       </w:r>
     </w:p>
@@ -12796,14 +11832,7 @@
           <w:color w:val="000000"/>
           <w:highlight w:val="lightGray"/>
         </w:rPr>
-        <w:t>Esta disposición se implementa conforme al numeral 28.5 del artículo 28 del RLIA y en concordancia con el numeral 7.2 y el Anexo A.4 de la NTP</w:t>
-      </w:r>
-      <w:r>
-        <w:rPr>
-          <w:rFonts w:ascii="Arial" w:eastAsia="Arial" w:hAnsi="Arial" w:cs="Arial"/>
-          <w:color w:val="000000"/>
-          <w:highlight w:val="lightGray"/>
-        </w:rPr>
+        <w:t xml:space="preserve">Esta disposición se implementa conforme al numeral 28.5 del artículo 28 del RLIA y en concordancia con el numeral 7.2 y el Anexo A.4 de la NTP</w:t>
         <w:noBreakHyphen/>
         <w:t>ISO/IEC 42001:2025.</w:t>
       </w:r>
@@ -12872,7 +11901,7 @@
           <w:color w:val="000000"/>
           <w:highlight w:val="lightGray"/>
         </w:rPr>
-        <w:t>Las acciones de gestión del cambio facilitan la consolidación de la Política de IA y del sistema de gestión de IA, promoviendo su integración en la gestión institucional y favoreciendo las condiciones organizacionales necesarias para su sostenibilidad y mejora continua, en concordancia con los numerales 28.1 y 28.2 del artículo 28 del RLIA.</w:t>
+        <w:t xml:space="preserve">Las acciones de gestión del cambio facilitan la consolidación de la Política de IA y del sistema de gestión de IA, promoviendo su integración en la gestión institucional y favoreciendo las condiciones organizacionales necesarias para su sostenibilidad y mejora continua, en concordancia con los numerales 28.1 y 28.2 del artículo 28 del RLIA.</w:t>
       </w:r>
     </w:p>
     <w:p>
@@ -12886,11 +11915,6 @@
           <w:highlight w:val="yellow"/>
         </w:rPr>
         <w:t>6.14</w:t>
-      </w:r>
-      <w:r>
-        <w:rPr>
-          <w:highlight w:val="yellow"/>
-        </w:rPr>
         <w:tab/>
         <w:t>De la ética y la integridad en los SBIA</w:t>
       </w:r>
@@ -12915,16 +11939,10 @@
           <w:color w:val="000000"/>
           <w:highlight w:val="yellow"/>
         </w:rPr>
+        <w:lastRenderedPageBreak/>
         <w:t>6.14.1</w:t>
-      </w:r>
-      <w:r>
-        <w:rPr>
-          <w:rFonts w:ascii="Arial" w:eastAsia="Arial" w:hAnsi="Arial" w:cs="Arial"/>
-          <w:color w:val="000000"/>
-          <w:highlight w:val="yellow"/>
-        </w:rPr>
         <w:tab/>
-        <w:t>En el desarrollo, la implementación y el uso de los SBIA, la SUNAT observa las acciones previstas en el numeral 27.1 del artículo 27 del RLIA. Promueve la participación de equipos diversos y multidisciplinarios. Garantiza el pleno respeto de los derechos humanos y evita que se generen resultados injustos o discriminatorios. Considera el impacto social y ambiental. Implementa las mejores prácticas, estándares y normas técnicas para identificar y minimizar los sesgos de los algoritmos y de las bases de datos utilizados</w:t>
+        <w:t xml:space="preserve">En el desarrollo, la implementación y el uso de los SBIA, la SUNAT observa las acciones previstas en el numeral 27.1 del artículo 27 del RLIA. Promueve la participación de equipos diversos y multidisciplinarios. Garantiza el pleno respeto de los derechos humanos y evita que se generen resultados injustos o discriminatorios. Considera el impacto social y ambiental. Implementa las mejores prácticas, estándares y normas técnicas para identificar y minimizar los sesgos de los algoritmos y de las bases de datos utilizados</w:t>
       </w:r>
       <w:r>
         <w:rPr>
@@ -12962,6 +11980,15 @@
           <w:highlight w:val="yellow"/>
         </w:rPr>
         <w:t>6.14.2</w:t>
+        <w:tab/>
+      </w:r>
+      <w:r>
+        <w:rPr>
+          <w:rFonts w:ascii="Arial" w:eastAsia="Arial" w:hAnsi="Arial" w:cs="Arial"/>
+          <w:color w:val="000000"/>
+          <w:highlight w:val="green"/>
+        </w:rPr>
+        <w:t xml:space="preserve">La SUNAT promueve que su personal cumpla, en el desarrollo, la implementación y el uso de los SBIA, las normas del Código de Ética de la Función Pública, su Reglamento y las normas de integridad, así como las recomendaciones internacionales y los principios éticos de la Organización para la Cooperación y el Desarrollo Económico (OCDE) en materia de inteligencia artificial, conforme al numeral 28.9 del artículo 28 del RLIA. La OII supervisa en los SBIA el cumplimiento de los principios rectores establecidos en el artículo 7 del RLIA y de los compromisos de la Política de IA; evalúa los riesgos de sesgo y discriminación y administra el canal de consultas éticas en materia de IA. </w:t>
       </w:r>
       <w:r>
         <w:rPr>
@@ -12969,22 +11996,6 @@
           <w:color w:val="000000"/>
           <w:highlight w:val="yellow"/>
         </w:rPr>
-        <w:tab/>
-      </w:r>
-      <w:r>
-        <w:rPr>
-          <w:rFonts w:ascii="Arial" w:eastAsia="Arial" w:hAnsi="Arial" w:cs="Arial"/>
-          <w:color w:val="000000"/>
-          <w:highlight w:val="green"/>
-        </w:rPr>
-        <w:t xml:space="preserve">La SUNAT promueve que su personal cumpla, en el desarrollo, la implementación y el uso de los SBIA, las normas del Código de Ética de la Función Pública, su Reglamento y las normas de integridad, así como las recomendaciones internacionales y los principios éticos de la Organización para la Cooperación y el Desarrollo Económico (OCDE) en materia de inteligencia artificial, conforme al numeral 28.9 del artículo 28 del RLIA. La OII supervisa en los SBIA el cumplimiento de los principios rectores establecidos en el artículo 7 del RLIA y de los compromisos de la Política de IA; evalúa los riesgos de sesgo y discriminación y administra el canal de consultas éticas en materia de IA. </w:t>
-      </w:r>
-      <w:r>
-        <w:rPr>
-          <w:rFonts w:ascii="Arial" w:eastAsia="Arial" w:hAnsi="Arial" w:cs="Arial"/>
-          <w:color w:val="000000"/>
-          <w:highlight w:val="yellow"/>
-        </w:rPr>
         <w:t>Su opinión sobre la clasificación de riesgo consta conforme al numeral 6.2.2.</w:t>
       </w:r>
       <w:r>
@@ -12996,7 +12007,7 @@
           <w:color w:val="000000"/>
           <w:highlight w:val="green"/>
         </w:rPr>
-        <w:t>Esta disposición desarrolla el numeral 28.9 del artículo 28 del RLIA.</w:t>
+        <w:t xml:space="preserve">Esta disposición desarrolla el numeral 28.9 del artículo 28 del RLIA.</w:t>
       </w:r>
     </w:p>
     <w:p>
@@ -13019,13 +12030,6 @@
           <w:highlight w:val="yellow"/>
         </w:rPr>
         <w:t>6.14.3</w:t>
-      </w:r>
-      <w:r>
-        <w:rPr>
-          <w:rFonts w:ascii="Arial" w:eastAsia="Arial" w:hAnsi="Arial" w:cs="Arial"/>
-          <w:color w:val="000000"/>
-          <w:highlight w:val="yellow"/>
-        </w:rPr>
         <w:tab/>
         <w:t>Los Lineamientos Éticos que apruebe la SGTD</w:t>
       </w:r>
@@ -13041,34 +12045,7 @@
           <w:color w:val="000000"/>
           <w:highlight w:val="yellow"/>
         </w:rPr>
-        <w:t xml:space="preserve"> </w:t>
-      </w:r>
-      <w:proofErr w:type="gramStart"/>
-      <w:r>
-        <w:rPr>
-          <w:rFonts w:ascii="Arial" w:eastAsia="Arial" w:hAnsi="Arial" w:cs="Arial"/>
-          <w:color w:val="000000"/>
-          <w:highlight w:val="yellow"/>
-        </w:rPr>
-        <w:t>son de aplicación</w:t>
-      </w:r>
-      <w:proofErr w:type="gramEnd"/>
-      <w:r>
-        <w:rPr>
-          <w:rFonts w:ascii="Arial" w:eastAsia="Arial" w:hAnsi="Arial" w:cs="Arial"/>
-          <w:color w:val="000000"/>
-          <w:highlight w:val="yellow"/>
-        </w:rPr>
-        <w:t xml:space="preserve"> en la SUNAT desde su entrada en vigencia. La Comisión de Gobierno de IA evalúa </w:t>
-      </w:r>
-      <w:r>
-        <w:rPr>
-          <w:rFonts w:ascii="Arial" w:eastAsia="Arial" w:hAnsi="Arial" w:cs="Arial"/>
-          <w:color w:val="000000"/>
-          <w:highlight w:val="yellow"/>
-        </w:rPr>
-        <w:lastRenderedPageBreak/>
-        <w:t>su impacto en la presente directiva y propone al CGTD los ajustes que correspondan.</w:t>
+        <w:t xml:space="preserve"> son de aplicación en la SUNAT desde su entrada en vigencia. La Comisión de Gobierno de IA evalúa su impacto en la presente directiva y propone al CGTD los ajustes que correspondan.</w:t>
       </w:r>
     </w:p>
     <w:p>
@@ -13127,7 +12104,9 @@
           <w:rFonts w:ascii="Arial" w:hAnsi="Arial" w:cs="Arial"/>
           <w:highlight w:val="green"/>
         </w:rPr>
-        <w:t>6.15.1 Toda iniciativa, requerimiento o proyecto que incorpore o prevea un componente basado en IA requiere la opinión técnica previa de la Comisión de Gobierno de IA sobre dicho componente, cualquiera sea el instrumento de gestión bajo el cual se formule, ejecute o modifique. La opinión se emite sobre la Ficha de Evaluación de Caso de Uso (Anexo N.° 4), adecuada a la naturaleza y magnitud de la iniciativa, requerimiento o proyecto. La opinión comprende la pertinencia del uso de inteligencia artificial y la clasificación de riesgo del componente, conforme al Anexo N.° 2 y a los artículos 22 a 24 del RLIA. Determinar la pertinencia es establecer si el resultado esperado requiere inteligencia artificial o se alcanza sin ella, conforme al numeral 5.1.4. Los controles aplicables se determinan a partir de la clasificación, conforme al numeral 6.2.5. La opinión no comprende la generación de valor, el costo, la prioridad ni la viabilidad presupuestal de la iniciativa, que corresponden a los instrumentos de gestión respectivos y a las instancias competentes. La opinión adopta uno de los siguientes pronunciamientos:</w:t>
+        <w:t xml:space="preserve">6.15.1 Toda iniciativa, requerimiento o proyecto que incorpore o prevea un componente basado en IA requiere la opinión técnica previa de la Comisión de Gobierno de IA sobre dicho componente, cualquiera sea el instrumento de gestión bajo el cual se formule, ejecute o modifique. La opinión se emite sobre la Ficha de Evaluación de Caso de Uso (Anexo N.° 4), adecuada a la naturaleza y magnitud de la iniciativa, requerimiento o proyecto. La opinión comprende la pertinencia del uso de inteligencia artificial y la clasificación de riesgo del componente, conforme al Anexo N.° 2 y a los artículos 22 a 24 del RLIA. Determinar la pertinencia es establecer si el resultado esperado requiere inteligencia artificial o se alcanza sin ella, conforme al numeral 5.1.4. Los controles aplicables se determinan a partir de la clasificación, conforme al numeral 6.2.5. La opinión no comprende la generación de valor, el costo, la </w:t>
+        <w:lastRenderedPageBreak/>
+        <w:t xml:space="preserve">prioridad ni la viabilidad presupuestal de la iniciativa, que corresponden a los instrumentos de gestión respectivos y a las instancias competentes. La opinión adopta uno de los siguientes pronunciamientos:</w:t>
       </w:r>
     </w:p>
     <w:p>
@@ -13181,7 +12160,7 @@
           <w:bCs w:val="0"/>
           <w:highlight w:val="green"/>
         </w:rPr>
-        <w:t>Favorable con condiciones, que identifica los controles que corresponden conforme al numeral 6.2.5 y cuya implementación se verifica en la etapa 5 del numeral 6.1.1. Los SBIA clasificados de riesgo alto reciben este pronunciamiento.</w:t>
+        <w:t xml:space="preserve">Favorable con condiciones, que identifica los controles que corresponden conforme al numeral 6.2.5 y cuya implementación se verifica en la etapa 5 del numeral 6.1.1. Los SBIA clasificados de riesgo alto reciben este pronunciamiento.</w:t>
       </w:r>
     </w:p>
     <w:p>
@@ -13208,7 +12187,7 @@
           <w:bCs w:val="0"/>
           <w:highlight w:val="green"/>
         </w:rPr>
-        <w:t>No favorable, cuando el uso es indebido conforme al artículo 23 del RLIA, contraviene la Política de IA o la normativa vigente, o el resultado esperado se alcanza sin inteligencia artificial. En este último caso la iniciativa puede continuar sin el componente de IA.</w:t>
+        <w:t xml:space="preserve">No favorable, cuando el uso es indebido conforme al artículo 23 del RLIA, contraviene la Política de IA o la normativa vigente, o el resultado esperado se alcanza sin inteligencia artificial. En este último caso la iniciativa puede continuar sin el componente de IA.</w:t>
       </w:r>
     </w:p>
     <w:p>
@@ -13228,7 +12207,7 @@
           <w:rFonts w:ascii="Arial" w:hAnsi="Arial" w:cs="Arial"/>
           <w:highlight w:val="green"/>
         </w:rPr>
-        <w:t>6.15.2 El uso indebido está prohibido por el artículo 23 del RLIA y el sometimiento de los SBIA de riesgo alto a condiciones y controles es obligatorio conforme al literal b) del numeral 22.1 del artículo 22 del RLIA, a sus artículos 25, 29 y 30 y al numeral 28.11 de su artículo 28: en ambos casos obliga la norma, no la opinión. En los demás casos la opinión sustenta la decisión, pero no la reemplaza. La aprobación corresponde, en cada caso, a la instancia competente conforme al ROF, a las normas de delegación de facultades, a los instrumentos de gestión institucionales o a la normativa de los sistemas administrativos del Estado.</w:t>
+        <w:t xml:space="preserve">6.15.2 El uso indebido está prohibido por el artículo 23 del RLIA y el sometimiento de los SBIA de riesgo alto a condiciones y controles es obligatorio conforme al literal b) del numeral 22.1 del artículo 22 del RLIA, a sus artículos 25, 29 y 30 y al numeral 28.11 de su artículo 28: en ambos casos obliga la norma, no la opinión. En los demás casos la opinión sustenta la decisión, pero no la reemplaza. La aprobación corresponde, en cada caso, a la instancia competente conforme al ROF, a las normas de delegación de facultades, a los instrumentos de gestión institucionales o a la normativa de los sistemas administrativos del Estado.</w:t>
       </w:r>
     </w:p>
     <w:p>
@@ -13249,15 +12228,7 @@
           <w:rFonts w:ascii="Arial" w:hAnsi="Arial" w:cs="Arial"/>
           <w:highlight w:val="lightGray"/>
         </w:rPr>
-        <w:t xml:space="preserve">6.15.3 En la gestión de la demanda informática, cuando un requerimiento implique el desarrollo, la adquisición o el uso de un SBIA o de una herramienta de IA, se recaba la opinión de la Comisión antes de su atención, con los formatos </w:t>
-      </w:r>
-      <w:r>
-        <w:rPr>
-          <w:rFonts w:ascii="Arial" w:hAnsi="Arial" w:cs="Arial"/>
-          <w:highlight w:val="lightGray"/>
-        </w:rPr>
-        <w:lastRenderedPageBreak/>
-        <w:t>vigentes de la demanda complementados con la información que la INSI determine.</w:t>
+        <w:t>6.15.3 En la gestión de la demanda informática, cuando un requerimiento implique el desarrollo, la adquisición o el uso de un SBIA o de una herramienta de IA, se recaba la opinión de la Comisión antes de su atención, con los formatos vigentes de la demanda complementados con la información que la INSI determine.</w:t>
       </w:r>
     </w:p>
     <w:p>
@@ -13278,7 +12249,7 @@
           <w:rFonts w:ascii="Arial" w:hAnsi="Arial" w:cs="Arial"/>
           <w:highlight w:val="green"/>
         </w:rPr>
-        <w:t>6.15.4 En los programas y proyectos institucionales conforme al MGPP, la opinión de la Comisión de Gobierno de IA se recaba desde que se identifica un componente basado en IA, en cualquier fase, y antes de la decisión que autoriza avanzar a la fase siguiente. La opinión se incorpora al expediente del caso de negocio o del plan de gestión, según corresponda, junto con las validaciones y opiniones que el MGPP ya prevé, y no requiere una etapa ni una instancia adicionales. Aplica en particular:</w:t>
+        <w:t xml:space="preserve">6.15.4 En los programas y proyectos institucionales conforme al MGPP, la opinión de la Comisión de Gobierno de IA se recaba desde que se identifica un componente basado en IA, en cualquier fase, y antes de la decisión que autoriza avanzar a la fase siguiente. La opinión se incorpora al expediente del caso de negocio o del plan de gestión, según corresponda, junto con las validaciones y opiniones que el MGPP ya prevé, y no requiere una etapa ni una instancia adicionales. Aplica en particular:</w:t>
       </w:r>
     </w:p>
     <w:p>
@@ -13451,7 +12422,7 @@
           <w:rFonts w:ascii="Arial" w:hAnsi="Arial" w:cs="Arial"/>
           <w:highlight w:val="green"/>
         </w:rPr>
-        <w:t>6.15.6 Las unidades de organización competentes de cada instrumento de gestión incorporan en sus documentos normativos la verificación del componente de IA y la opinión de la Comisión de Gobierno de IA, conforme al numeral 7.6. Esta incorporación alcanza al Modelo de Gobernabilidad de Programas y Proyectos y a la gestión de la demanda informática. La presente directiva no sustituye dichos instrumentos.</w:t>
+        <w:t xml:space="preserve">6.15.6 Las unidades de organización competentes de cada instrumento de gestión incorporan en sus documentos normativos la verificación del componente de IA y la opinión de la Comisión de Gobierno de IA, conforme al numeral 7.6. Esta incorporación alcanza al Modelo de Gobernabilidad de Programas y Proyectos y a la gestión de la demanda informática. La presente directiva no sustituye dichos instrumentos.</w:t>
       </w:r>
     </w:p>
     <w:p>
@@ -13578,6 +12549,7 @@
           <w:color w:val="000000"/>
           <w:szCs w:val="22"/>
         </w:rPr>
+        <w:lastRenderedPageBreak/>
         <w:t>DISPOSICIONES FINALES</w:t>
       </w:r>
       <w:bookmarkEnd w:id="7"/>
@@ -13598,12 +12570,6 @@
           <w:bCs w:val="0"/>
         </w:rPr>
         <w:t>7.1</w:t>
-      </w:r>
-      <w:r>
-        <w:rPr>
-          <w:b w:val="0"/>
-          <w:bCs w:val="0"/>
-        </w:rPr>
         <w:tab/>
         <w:t>La presente directiva entra en vigencia al día siguiente de la emisión de la Resolución de Superintendencia que la aprueba.</w:t>
       </w:r>
@@ -13624,12 +12590,6 @@
           <w:bCs w:val="0"/>
         </w:rPr>
         <w:t>7.2</w:t>
-      </w:r>
-      <w:r>
-        <w:rPr>
-          <w:b w:val="0"/>
-          <w:bCs w:val="0"/>
-        </w:rPr>
         <w:tab/>
         <w:t>La actualización de la presente directiva es propuesta por la Comisión de Gobierno de IA, conforme a la METDONI.</w:t>
       </w:r>
@@ -13651,13 +12611,6 @@
           <w:highlight w:val="yellow"/>
         </w:rPr>
         <w:t>7.3</w:t>
-      </w:r>
-      <w:r>
-        <w:rPr>
-          <w:b w:val="0"/>
-          <w:bCs w:val="0"/>
-          <w:highlight w:val="yellow"/>
-        </w:rPr>
         <w:tab/>
         <w:t>La Comisión de Gobierno de IA se conforma mediante Resolución de Superintendencia, a propuesta del CGTD, conforme al numeral 5.3 de la presente directiva.</w:t>
       </w:r>
@@ -13696,13 +12649,6 @@
           <w:highlight w:val="green"/>
         </w:rPr>
         <w:t>7.4</w:t>
-      </w:r>
-      <w:r>
-        <w:rPr>
-          <w:b w:val="0"/>
-          <w:bCs w:val="0"/>
-          <w:highlight w:val="green"/>
-        </w:rPr>
         <w:tab/>
         <w:t>El Sistema de Gestión de Inteligencia Artificial (SGIA) de la SUNAT se rige por la NTP-ISO/IEC 42001:2025, de uso obligatorio conforme al numeral 28.2 del artículo 28 del RLIA. Los límites y la aplicabilidad del SGIA se determinan conforme al capítulo 4.3 de la referida norma técnica, considerando el alcance, la complejidad y el contexto institucional, y su implementación se gradúa con un enfoque basado en riesgos. La Comisión de Gobierno de IA propone al CGTD el plan de implementación del SGIA, con hitos y responsables. El CGTD lo aprueba. La Comisión coordina los lineamientos técnicos que correspondan, que se aprueban conforme al numeral 7.6.</w:t>
       </w:r>
@@ -13723,12 +12669,6 @@
           <w:bCs w:val="0"/>
         </w:rPr>
         <w:t>7.5</w:t>
-      </w:r>
-      <w:r>
-        <w:rPr>
-          <w:b w:val="0"/>
-          <w:bCs w:val="0"/>
-        </w:rPr>
         <w:tab/>
         <w:t xml:space="preserve">La Comisión de Gobierno de IA, con el apoyo técnico de la INSI, implementa el Inventario Institucional de SBIA. </w:t>
       </w:r>
@@ -13766,17 +12706,7 @@
           <w:color w:val="000000"/>
           <w:highlight w:val="green"/>
         </w:rPr>
-        <w:t xml:space="preserve">Las unidades de organización a las que la presente directiva asigna una responsabilidad formulan los documentos normativos institucionales de menor rango (metodologías, guías metodológicas, procedimientos, instructivos y lineamientos temporales) que establecen la forma de ejecutar dicha </w:t>
-      </w:r>
-      <w:r>
-        <w:rPr>
-          <w:b w:val="0"/>
-          <w:bCs w:val="0"/>
-          <w:color w:val="000000"/>
-          <w:highlight w:val="green"/>
-        </w:rPr>
-        <w:lastRenderedPageBreak/>
-        <w:t>responsabilidad. Su aprobación corresponde a la unidad de organización normativa que determina la METDONI conforme a las competencias del ROF; cuando la unidad que formula no cuenta con esa potestad, eleva la propuesta a la que sí la tiene.</w:t>
+        <w:t>Las unidades de organización a las que la presente directiva asigna una responsabilidad formulan los documentos normativos institucionales de menor rango (metodologías, guías metodológicas, procedimientos, instructivos y lineamientos temporales) que establecen la forma de ejecutar dicha responsabilidad. Su aprobación corresponde a la unidad de organización normativa que determina la METDONI conforme a las competencias del ROF; cuando la unidad que formula no cuenta con esa potestad, eleva la propuesta a la que sí la tiene.</w:t>
       </w:r>
       <w:r>
         <w:rPr>
@@ -13839,12 +12769,6 @@
           <w:bCs w:val="0"/>
         </w:rPr>
         <w:t>7.7</w:t>
-      </w:r>
-      <w:r>
-        <w:rPr>
-          <w:b w:val="0"/>
-          <w:bCs w:val="0"/>
-        </w:rPr>
         <w:tab/>
         <w:t xml:space="preserve">El CGTD resuelve las situaciones no previstas, sin perjuicio de la aplicación </w:t>
       </w:r>
@@ -13880,12 +12804,6 @@
           <w:bCs w:val="0"/>
         </w:rPr>
         <w:t>7.8</w:t>
-      </w:r>
-      <w:r>
-        <w:rPr>
-          <w:b w:val="0"/>
-          <w:bCs w:val="0"/>
-        </w:rPr>
         <w:tab/>
       </w:r>
       <w:r>
@@ -13914,15 +12832,10 @@
           <w:highlight w:val="green"/>
         </w:rPr>
         <w:t>7.9</w:t>
-      </w:r>
-      <w:r>
-        <w:rPr>
-          <w:b w:val="0"/>
-          <w:bCs w:val="0"/>
-          <w:highlight w:val="green"/>
-        </w:rPr>
         <w:tab/>
-        <w:t>El detalle de aplicación de los Anexos (los formatos, los criterios de registro, los catálogos de valores y los indicadores operativos, así como los campos adicionales que resulten necesarios) se establece en los documentos normativos institucionales de menor rango previstos en el numeral 7.6, que las unidades competentes actualizan sin requerir la modificación de la presente directiva. Dichos documentos no suprimen ni reducen los campos ni los contenidos mínimos que los Anexos establecen.</w:t>
+        <w:t xml:space="preserve">El detalle de aplicación de los Anexos (los formatos, los criterios de registro, los catálogos de valores y los indicadores operativos, así como los campos adicionales que resulten necesarios) se establece en los documentos normativos institucionales </w:t>
+        <w:lastRenderedPageBreak/>
+        <w:t>de menor rango previstos en el numeral 7.6, que las unidades competentes actualizan sin requerir la modificación de la presente directiva. Dichos documentos no suprimen ni reducen los campos ni los contenidos mínimos que los Anexos establecen.</w:t>
       </w:r>
     </w:p>
     <w:p>
@@ -13942,13 +12855,6 @@
           <w:highlight w:val="yellow"/>
         </w:rPr>
         <w:t>7.10</w:t>
-      </w:r>
-      <w:r>
-        <w:rPr>
-          <w:b w:val="0"/>
-          <w:bCs w:val="0"/>
-          <w:highlight w:val="yellow"/>
-        </w:rPr>
         <w:tab/>
         <w:t xml:space="preserve">El Oficial de Inteligencia Artificial (OIA) de la SUNAT, previsto en el artículo 6 de la Resolución Ministerial N.° 152-2026-PCM, que aprueba la ENIA, recae en un miembro del CGTD y coordina el gobierno y la gestión de la inteligencia artificial institucional, así como el seguimiento del Plan de Acción de Inteligencia Artificial. Su designación se efectúa mediante acto de la máxima autoridad administrativa de la entidad, previamente a la formulación del Plan de Acción de Inteligencia Artificial. Su perfil, responsabilidades, designación y articulación se determinan conforme a los lineamientos que emita la SGTD, en aplicación de la Primera Disposición Complementaria Final de la citada Resolución Ministerial. </w:t>
       </w:r>
@@ -13977,15 +12883,7 @@
           <w:bCs w:val="0"/>
           <w:highlight w:val="yellow"/>
         </w:rPr>
-        <w:lastRenderedPageBreak/>
         <w:t>7.11</w:t>
-      </w:r>
-      <w:r>
-        <w:rPr>
-          <w:b w:val="0"/>
-          <w:bCs w:val="0"/>
-          <w:highlight w:val="yellow"/>
-        </w:rPr>
         <w:tab/>
         <w:t xml:space="preserve">El Plan de Acción de Inteligencia Artificial (PAIA) forma parte del Portafolio de Proyectos del PGD, conforme al numeral 5.5 del artículo 5 de la Resolución Ministerial N.° 152-2026-PCM. Su aprobación requiere que la SUNAT haya aprobado o implementado previamente su Plan de Acción de Gobierno de Datos (PAGD), conforme al numeral 5.4 del mismo artículo de dicha Resolución Ministerial; el PAGD forma parte del PGD y su formulación la coordina el CGTD, en concordancia con la ENGD. Las iniciativas, proyectos y acciones priorizadas en el PAIA se articulan con el Plan Estratégico Institucional, el Plan Operativo Institucional, el Programa Multianual de Inversiones y el PGD, conforme al numeral 4.4 del artículo 4 de la misma Resolución Ministerial y al numeral 28.10 del artículo 28 del RLIA. </w:t>
       </w:r>
@@ -14146,14 +13044,6 @@
           <w:color w:val="000000"/>
         </w:rPr>
         <w:br w:type="page"/>
-      </w:r>
-      <w:r>
-        <w:rPr>
-          <w:rFonts w:ascii="Arial" w:eastAsia="Arial" w:hAnsi="Arial" w:cs="Arial"/>
-          <w:b/>
-          <w:bCs/>
-          <w:color w:val="000000"/>
-        </w:rPr>
         <w:lastRenderedPageBreak/>
         <w:t>Anexo N.° 1: Ficha de Registro de SBIA (Campos mínimos del Inventario). Constituye el contenido mínimo del registro y se actualiza conforme al numeral 7.9.</w:t>
       </w:r>
@@ -15187,23 +14077,7 @@
                 <w:rFonts w:ascii="Arial" w:eastAsia="Arial" w:hAnsi="Arial" w:cs="Arial"/>
                 <w:lang w:val="en-US"/>
               </w:rPr>
-              <w:t xml:space="preserve">Human-in-the-loop, on-the-loop </w:t>
-            </w:r>
-            <w:proofErr w:type="gramStart"/>
-            <w:r>
-              <w:rPr>
-                <w:rFonts w:ascii="Arial" w:eastAsia="Arial" w:hAnsi="Arial" w:cs="Arial"/>
-                <w:lang w:val="en-US"/>
-              </w:rPr>
-              <w:t>o in</w:t>
-            </w:r>
-            <w:proofErr w:type="gramEnd"/>
-            <w:r>
-              <w:rPr>
-                <w:rFonts w:ascii="Arial" w:eastAsia="Arial" w:hAnsi="Arial" w:cs="Arial"/>
-                <w:lang w:val="en-US"/>
-              </w:rPr>
-              <w:t>-command.</w:t>
+              <w:t>Human-in-the-loop, on-the-loop o in-command.</w:t>
             </w:r>
           </w:p>
         </w:tc>
@@ -15745,7 +14619,6 @@
                 <w:rFonts w:ascii="Arial" w:eastAsia="Arial" w:hAnsi="Arial" w:cs="Arial"/>
                 <w:highlight w:val="green"/>
               </w:rPr>
-              <w:lastRenderedPageBreak/>
               <w:t>15</w:t>
             </w:r>
           </w:p>
@@ -16054,6 +14927,7 @@
               <w:rPr>
                 <w:rFonts w:ascii="Arial" w:eastAsia="Arial" w:hAnsi="Arial" w:cs="Arial"/>
               </w:rPr>
+              <w:lastRenderedPageBreak/>
               <w:t>18</w:t>
             </w:r>
           </w:p>
@@ -16090,7 +14964,7 @@
                 <w:b/>
                 <w:bCs/>
               </w:rPr>
-              <w:t>Versión vigente y último cambio</w:t>
+              <w:t xml:space="preserve">Versión vigente y último cambio</w:t>
             </w:r>
           </w:p>
         </w:tc>
@@ -16806,7 +15680,6 @@
                 <w:rFonts w:ascii="Arial" w:eastAsia="Arial" w:hAnsi="Arial" w:cs="Arial"/>
                 <w:highlight w:val="green"/>
               </w:rPr>
-              <w:lastRenderedPageBreak/>
               <w:t>25</w:t>
             </w:r>
           </w:p>
@@ -17263,7 +16136,7 @@
                 <w:bCs/>
                 <w:highlight w:val="yellow"/>
               </w:rPr>
-              <w:t>Riesgo aceptable (Art. 22.2)</w:t>
+              <w:t xml:space="preserve">Riesgo aceptable (Art. 22.2)</w:t>
             </w:r>
           </w:p>
         </w:tc>
@@ -18306,7 +17179,7 @@
           <w:bCs w:val="0"/>
           <w:color w:val="000000"/>
         </w:rPr>
-        <w:t>Cumplimiento normativo: Ley IA, RLIA, protección de datos personales y reserva tributaria.</w:t>
+        <w:t xml:space="preserve">Cumplimiento normativo: Ley IA, RLIA, protección de datos personales y reserva tributaria.</w:t>
       </w:r>
     </w:p>
     <w:p>
@@ -18444,7 +17317,7 @@
           <w:rFonts w:ascii="Arial" w:hAnsi="Arial" w:cs="Arial"/>
           <w:highlight w:val="green"/>
         </w:rPr>
-        <w:t>Constituye el contenido mínimo de la evaluación del caso de uso y recoge los datos y las evidencias del problema que sustentan la iniciativa, conforme al numeral 28.4 del artículo 28 del RLIA. Se adecúa a la naturaleza y magnitud de la iniciativa, requerimiento o proyecto, conforme al numeral 6.15.1. Se actualiza conforme al numeral 7.9. Los campos cuya información ya figura en el caso de negocio, en la ficha de necesidad de la gestión de demanda informática o en otro instrumento previo se completan indicando el documento y la sección donde consta. No se transcribe información ya contenida en dichas fuentes. Los controles aplicables al SBIA se determinan a partir de su clasificación de riesgo y se registran en la Ficha de Registro de SBIA (Anexo N.° 1); no forman parte de esta ficha.</w:t>
+        <w:t xml:space="preserve">Constituye el contenido mínimo de la evaluación del caso de uso y recoge los datos y las evidencias del problema que sustentan la iniciativa, conforme al numeral 28.4 del artículo 28 del RLIA. Se adecúa a la naturaleza y magnitud de la iniciativa, requerimiento o proyecto, conforme al numeral 6.15.1. Se actualiza conforme al numeral 7.9. Los campos cuya información ya figura en el caso de negocio, en la ficha de necesidad de la gestión de demanda informática o en otro instrumento previo se completan indicando el documento y la sección donde consta. No se transcribe información ya contenida en dichas fuentes. Los controles aplicables al SBIA se determinan a partir de su clasificación de riesgo y se registran en la Ficha de Registro de SBIA (Anexo N.° 1); no forman parte de esta ficha.</w:t>
       </w:r>
     </w:p>
     <w:p>
@@ -18658,7 +17531,7 @@
           <w:color w:val="000000"/>
           <w:highlight w:val="green"/>
         </w:rPr>
-        <w:t>Sección 2 — Necesidad y pertinencia del uso de IA:</w:t>
+        <w:t xml:space="preserve">Sección 2 — Necesidad y pertinencia del uso de IA:</w:t>
       </w:r>
     </w:p>
     <w:p>
@@ -18710,7 +17583,7 @@
           <w:color w:val="000000"/>
           <w:highlight w:val="green"/>
         </w:rPr>
-        <w:t>Alternativa sin inteligencia artificial: describir la solución basada en reglas, automatización o análisis convencional que se evaluó, y por qué no satisface la necesidad.</w:t>
+        <w:t xml:space="preserve">Alternativa sin inteligencia artificial: describir la solución basada en reglas, automatización o análisis convencional que se evaluó, y por qué no satisface la necesidad.</w:t>
       </w:r>
     </w:p>
     <w:p>
@@ -18788,7 +17661,7 @@
           <w:color w:val="000000"/>
           <w:highlight w:val="green"/>
         </w:rPr>
-        <w:t>Costo de gobernanza previsto (monitoreo, reentrenamiento, supervisión humana y evaluación periódica) y por qué la mejora esperada lo justifica.</w:t>
+        <w:t xml:space="preserve">Costo de gobernanza previsto (monitoreo, reentrenamiento, supervisión humana y evaluación periódica) y por qué la mejora esperada lo justifica.</w:t>
       </w:r>
     </w:p>
     <w:p>
@@ -18836,7 +17709,7 @@
           <w:color w:val="000000"/>
           <w:highlight w:val="green"/>
         </w:rPr>
-        <w:t>Sección 3 — Descripción funcional y autonomía:</w:t>
+        <w:t xml:space="preserve">Sección 3 — Descripción funcional y autonomía:</w:t>
       </w:r>
     </w:p>
     <w:p>
@@ -18962,7 +17835,7 @@
           <w:color w:val="000000"/>
           <w:highlight w:val="green"/>
         </w:rPr>
-        <w:t>Punto del proceso en que interviene el SBIA y momento en que un funcionario conoce su resultado.</w:t>
+        <w:t xml:space="preserve">Punto del proceso en que interviene el SBIA y momento en que un funcionario conoce su resultado.</w:t>
       </w:r>
     </w:p>
     <w:p>
@@ -18981,7 +17854,7 @@
           <w:color w:val="000000"/>
           <w:highlight w:val="green"/>
         </w:rPr>
-        <w:t>Sección 4 — Datos:</w:t>
+        <w:t xml:space="preserve">Sección 4 — Datos:</w:t>
       </w:r>
     </w:p>
     <w:p>
@@ -19008,7 +17881,7 @@
           <w:highlight w:val="green"/>
         </w:rPr>
         <w:lastRenderedPageBreak/>
-        <w:t>Datos requeridos: fuentes, tipos y presencia de datos personales, de datos sensibles, de datos biométricos o de información sujeta a reserva tributaria.</w:t>
+        <w:t xml:space="preserve">Datos requeridos: fuentes, tipos y presencia de datos personales, de datos sensibles, de datos biométricos o de información sujeta a reserva tributaria.</w:t>
       </w:r>
     </w:p>
     <w:p>
@@ -19076,7 +17949,7 @@
           <w:color w:val="000000"/>
           <w:highlight w:val="green"/>
         </w:rPr>
-        <w:t>Sección 5 — Efecto sobre las personas y los procesos:</w:t>
+        <w:t xml:space="preserve">Sección 5 — Efecto sobre las personas y los procesos:</w:t>
       </w:r>
     </w:p>
     <w:p>
@@ -19102,7 +17975,7 @@
           <w:color w:val="000000"/>
           <w:highlight w:val="green"/>
         </w:rPr>
-        <w:t>Efecto del resultado del SBIA en derechos, obligaciones o en la atención de los administrados.</w:t>
+        <w:t xml:space="preserve">Efecto del resultado del SBIA en derechos, obligaciones o en la atención de los administrados.</w:t>
       </w:r>
     </w:p>
     <w:p>
@@ -19206,7 +18079,7 @@
           <w:color w:val="000000"/>
           <w:highlight w:val="green"/>
         </w:rPr>
-        <w:t>Clasificación de riesgo preliminar sugerida por el propietario del caso de uso conforme al Anexo N.° 2. Es referencial y no vincula a la Comisión de Gobierno de IA.</w:t>
+        <w:t xml:space="preserve">Clasificación de riesgo preliminar sugerida por el propietario del caso de uso conforme al Anexo N.° 2. Es referencial y no vincula a la Comisión de Gobierno de IA.</w:t>
       </w:r>
     </w:p>
     <w:p>
@@ -19226,7 +18099,7 @@
           <w:color w:val="000000"/>
           <w:highlight w:val="green"/>
         </w:rPr>
-        <w:t>Sección 6 — Firmas:</w:t>
+        <w:t xml:space="preserve">Sección 6 — Firmas:</w:t>
       </w:r>
     </w:p>
     <w:p>
@@ -24225,7 +23098,6 @@
   <w:style w:type="character" w:default="1" w:styleId="Fuentedeprrafopredeter">
     <w:name w:val="Default Paragraph Font"/>
     <w:uiPriority w:val="1"/>
-    <w:semiHidden/>
     <w:unhideWhenUsed/>
   </w:style>
   <w:style w:type="table" w:default="1" w:styleId="Tablanormal">
@@ -25453,6 +24325,25 @@
 </file>
 
 <file path=customXml/item1.xml><?xml version="1.0" encoding="utf-8"?>
+<?mso-contentType ?>
+<FormTemplates xmlns="http://schemas.microsoft.com/sharepoint/v3/contenttype/forms">
+  <Display>DocumentLibraryForm</Display>
+  <Edit>DocumentLibraryForm</Edit>
+  <New>DocumentLibraryForm</New>
+</FormTemplates>
+</file>
+
+<file path=customXml/item2.xml><?xml version="1.0" encoding="utf-8"?>
+<p:properties xmlns:p="http://schemas.microsoft.com/office/2006/metadata/properties" xmlns:xsi="http://www.w3.org/2001/XMLSchema-instance" xmlns:pc="http://schemas.microsoft.com/office/infopath/2007/PartnerControls">
+  <documentManagement/>
+</p:properties>
+</file>
+
+<file path=customXml/item3.xml><?xml version="1.0" encoding="utf-8"?>
+<b:Sources xmlns:b="http://schemas.openxmlformats.org/officeDocument/2006/bibliography" xmlns="http://schemas.openxmlformats.org/officeDocument/2006/bibliography" SelectedStyle="\APASixthEditionOfficeOnline.xsl" StyleName="APA" Version="6"/>
+</file>
+
+<file path=customXml/item4.xml><?xml version="1.0" encoding="utf-8"?>
 <ct:contentTypeSchema xmlns:ct="http://schemas.microsoft.com/office/2006/metadata/contentType" xmlns:ma="http://schemas.microsoft.com/office/2006/metadata/properties/metaAttributes" ct:_="" ma:_="" ma:contentTypeName="Document" ma:contentTypeID="0x0101005C14AC06E2BCC9479AB1E7BFB85765A3" ma:contentTypeVersion="3" ma:contentTypeDescription="Create a new document." ma:contentTypeScope="" ma:versionID="7c0f1869e227914bb9e091b5d5366560">
   <xsd:schema xmlns:xsd="http://www.w3.org/2001/XMLSchema" xmlns:xs="http://www.w3.org/2001/XMLSchema" xmlns:p="http://schemas.microsoft.com/office/2006/metadata/properties" xmlns:ns2="fdb19afe-0f16-4040-a6da-335f4767bfc9" targetNamespace="http://schemas.microsoft.com/office/2006/metadata/properties" ma:root="true" ma:fieldsID="a498babe3b735ed6250eb2675f7bac41" ns2:_="">
     <xsd:import namespace="fdb19afe-0f16-4040-a6da-335f4767bfc9"/>
@@ -25590,26 +24481,32 @@
 </ct:contentTypeSchema>
 </file>
 
-<file path=customXml/item2.xml><?xml version="1.0" encoding="utf-8"?>
-<b:Sources xmlns:b="http://schemas.openxmlformats.org/officeDocument/2006/bibliography" xmlns="http://schemas.openxmlformats.org/officeDocument/2006/bibliography" SelectedStyle="\APASixthEditionOfficeOnline.xsl" StyleName="APA" Version="6"/>
+<file path=customXml/itemProps1.xml><?xml version="1.0" encoding="utf-8"?>
+<ds:datastoreItem xmlns:ds="http://schemas.openxmlformats.org/officeDocument/2006/customXml" ds:itemID="{007781DB-EED9-4359-8AD9-68137B52B701}">
+  <ds:schemaRefs>
+    <ds:schemaRef ds:uri="http://schemas.microsoft.com/sharepoint/v3/contenttype/forms"/>
+  </ds:schemaRefs>
+</ds:datastoreItem>
 </file>
 
-<file path=customXml/item3.xml><?xml version="1.0" encoding="utf-8"?>
-<p:properties xmlns:p="http://schemas.microsoft.com/office/2006/metadata/properties" xmlns:xsi="http://www.w3.org/2001/XMLSchema-instance" xmlns:pc="http://schemas.microsoft.com/office/infopath/2007/PartnerControls">
-  <documentManagement/>
-</p:properties>
+<file path=customXml/itemProps2.xml><?xml version="1.0" encoding="utf-8"?>
+<ds:datastoreItem xmlns:ds="http://schemas.openxmlformats.org/officeDocument/2006/customXml" ds:itemID="{E06D9414-6C68-4A1C-B889-BD6BE2EA8645}">
+  <ds:schemaRefs>
+    <ds:schemaRef ds:uri="http://schemas.microsoft.com/office/2006/metadata/properties"/>
+    <ds:schemaRef ds:uri="http://schemas.microsoft.com/office/infopath/2007/PartnerControls"/>
+  </ds:schemaRefs>
+</ds:datastoreItem>
 </file>
 
-<file path=customXml/item4.xml><?xml version="1.0" encoding="utf-8"?>
-<?mso-contentType ?>
-<FormTemplates xmlns="http://schemas.microsoft.com/sharepoint/v3/contenttype/forms">
-  <Display>DocumentLibraryForm</Display>
-  <Edit>DocumentLibraryForm</Edit>
-  <New>DocumentLibraryForm</New>
-</FormTemplates>
+<file path=customXml/itemProps3.xml><?xml version="1.0" encoding="utf-8"?>
+<ds:datastoreItem xmlns:ds="http://schemas.openxmlformats.org/officeDocument/2006/customXml" ds:itemID="{599D4DEC-5966-453E-8EBA-1FE602AD820F}">
+  <ds:schemaRefs>
+    <ds:schemaRef ds:uri="http://schemas.openxmlformats.org/officeDocument/2006/bibliography"/>
+  </ds:schemaRefs>
+</ds:datastoreItem>
 </file>
 
-<file path=customXml/itemProps1.xml><?xml version="1.0" encoding="utf-8"?>
+<file path=customXml/itemProps4.xml><?xml version="1.0" encoding="utf-8"?>
 <ds:datastoreItem xmlns:ds="http://schemas.openxmlformats.org/officeDocument/2006/customXml" ds:itemID="{5C1C6231-2072-4263-80CD-99FB4E777A75}">
   <ds:schemaRefs>
     <ds:schemaRef ds:uri="http://schemas.microsoft.com/office/2006/metadata/contentType"/>
@@ -25625,29 +24522,4 @@
     <ds:schemaRef ds:uri="http://schemas.microsoft.com/internal/obd"/>
   </ds:schemaRefs>
 </ds:datastoreItem>
-</file>
-
-<file path=customXml/itemProps2.xml><?xml version="1.0" encoding="utf-8"?>
-<ds:datastoreItem xmlns:ds="http://schemas.openxmlformats.org/officeDocument/2006/customXml" ds:itemID="{599D4DEC-5966-453E-8EBA-1FE602AD820F}">
-  <ds:schemaRefs>
-    <ds:schemaRef ds:uri="http://schemas.openxmlformats.org/officeDocument/2006/bibliography"/>
-  </ds:schemaRefs>
-</ds:datastoreItem>
-</file>
-
-<file path=customXml/itemProps3.xml><?xml version="1.0" encoding="utf-8"?>
-<ds:datastoreItem xmlns:ds="http://schemas.openxmlformats.org/officeDocument/2006/customXml" ds:itemID="{E06D9414-6C68-4A1C-B889-BD6BE2EA8645}">
-  <ds:schemaRefs>
-    <ds:schemaRef ds:uri="http://schemas.microsoft.com/office/2006/metadata/properties"/>
-    <ds:schemaRef ds:uri="http://schemas.microsoft.com/office/infopath/2007/PartnerControls"/>
-  </ds:schemaRefs>
-</ds:datastoreItem>
-</file>
-
-<file path=customXml/itemProps4.xml><?xml version="1.0" encoding="utf-8"?>
-<ds:datastoreItem xmlns:ds="http://schemas.openxmlformats.org/officeDocument/2006/customXml" ds:itemID="{007781DB-EED9-4359-8AD9-68137B52B701}">
-  <ds:schemaRefs>
-    <ds:schemaRef ds:uri="http://schemas.microsoft.com/sharepoint/v3/contenttype/forms"/>
-  </ds:schemaRefs>
-</ds:datastoreItem>
 </file>
</xml_diff>

<commit_message>
docs: revisión de calidad (tanda 24) — acota un contenido formativo del numeral 6.13
- 6.13: el contenido formativo se acota a "la gestion de los riesgos de IA" (retira "y la seguridad de la informacion aplicables")
- Regenera el espejo de texto desde el .docx; 0 comentarios pendientes
</commit_message>
<xml_diff>
--- a/normativo/DIRECTIVA-GOBIERNO-IA.docx
+++ b/normativo/DIRECTIVA-GOBIERNO-IA.docx
@@ -66,7 +66,7 @@
           <w:noProof/>
         </w:rPr>
         <w:drawing>
-          <wp:anchor distT="0" distB="0" distL="114300" distR="114300" simplePos="0" relativeHeight="251659264" behindDoc="1" locked="0" layoutInCell="1" allowOverlap="1" wp14:anchorId="6EA6AC39" wp14:editId="0B29F395">
+          <wp:anchor distT="0" distB="0" distL="114300" distR="114300" simplePos="0" relativeHeight="251659264" behindDoc="1" locked="0" layoutInCell="1" allowOverlap="1" wp14:anchorId="3AC8DC74" wp14:editId="46BE3372">
             <wp:simplePos x="0" y="0"/>
             <wp:positionH relativeFrom="margin">
               <wp:align>right</wp:align>
@@ -248,7 +248,7 @@
         <mc:AlternateContent>
           <mc:Choice Requires="wps">
             <w:drawing>
-              <wp:inline distT="0" distB="0" distL="0" distR="0" wp14:anchorId="63724BC1" wp14:editId="646E50B1">
+              <wp:inline distT="0" distB="0" distL="0" distR="0" wp14:anchorId="09C86612" wp14:editId="68008938">
                 <wp:extent cx="1786480" cy="603250"/>
                 <wp:effectExtent l="19050" t="19050" r="23495" b="25400"/>
                 <wp:docPr id="1" name="Rectángulo: esquinas redondeadas 2"/>
@@ -346,7 +346,7 @@
           </mc:Choice>
           <mc:Fallback>
             <w:pict>
-              <v:roundrect w14:anchorId="63724BC1" id="Rectángulo: esquinas redondeadas 2" o:spid="_x0000_s1026" style="width:140.65pt;height:47.5pt;visibility:visible;mso-wrap-style:square;mso-left-percent:-10001;mso-top-percent:-10001;mso-position-horizontal:absolute;mso-position-horizontal-relative:char;mso-position-vertical:absolute;mso-position-vertical-relative:line;mso-left-percent:-10001;mso-top-percent:-10001;v-text-anchor:top" arcsize="10923f" o:gfxdata="UEsDBBQABgAIAAAAIQC2gziS/gAAAOEBAAATAAAAW0NvbnRlbnRfVHlwZXNdLnhtbJSRQU7DMBBF 90jcwfIWJU67QAgl6YK0S0CoHGBkTxKLZGx5TGhvj5O2G0SRWNoz/78nu9wcxkFMGNg6quQqL6RA 0s5Y6ir5vt9lD1JwBDIwOMJKHpHlpr69KfdHjyxSmriSfYz+USnWPY7AufNIadK6MEJMx9ApD/oD OlTrorhX2lFEilmcO2RdNtjC5xDF9pCuTyYBB5bi6bQ4syoJ3g9WQ0ymaiLzg5KdCXlKLjvcW893 SUOqXwnz5DrgnHtJTxOsQfEKIT7DmDSUCaxw7Rqn8787ZsmRM9e2VmPeBN4uqYvTtW7jvijg9N/y JsXecLq0q+WD6m8AAAD//wMAUEsDBBQABgAIAAAAIQA4/SH/1gAAAJQBAAALAAAAX3JlbHMvLnJl bHOkkMFqwzAMhu+DvYPRfXGawxijTi+j0GvpHsDYimMaW0Yy2fr2M4PBMnrbUb/Q94l/f/hMi1qR JVI2sOt6UJgd+ZiDgffL8ekFlFSbvV0oo4EbChzGx4f9GRdb25HMsYhqlCwG5lrLq9biZkxWOiqY 22YiTra2kYMu1l1tQD30/bPm3wwYN0x18gb45AdQl1tp5j/sFB2T0FQ7R0nTNEV3j6o9feQzro1i OWA14Fm+Q8a1a8+Bvu/d/dMb2JY5uiPbhG/ktn4cqGU/er3pcvwCAAD//wMAUEsDBBQABgAIAAAA IQAvH5D5KwIAAFQEAAAOAAAAZHJzL2Uyb0RvYy54bWysVNuO0zAQfUfiHyy/0ySlTUvUdLXqUoS0 XMTCBzi2cwHHY2y3yfL1jJ22dIEnRB6sGY995syZcTY3Y6/IUVrXgS5pNkspkZqD6HRT0i+f9y/W lDjPtGAKtCzpo3T0Zvv82WYwhZxDC0pISxBEu2IwJW29N0WSON7KnrkZGKkxWIPtmUfXNomwbED0 XiXzNM2TAawwFrh0DnfvpiDdRvy6ltx/qGsnPVElRW4+rjauVViT7YYVjWWm7fiJBvsHFj3rNCa9 QN0xz8jBdn9A9R234KD2Mw59AnXdcRlrwGqy9LdqHlpmZKwFxXHmIpP7f7D8/fHBfLSBujP3wL85 omHXMt3IW2thaCUTmC4LQiWDccXlQnAcXiXV8A4EtpYdPEQNxtr2ARCrI2OU+vEitRw94biZrdb5 Yo0d4RjL05fzZexFworzbWOdfyOhJ8EoqYWDFp+wnzEFO947H/UWRLM+ZBdfKal7hd07MkWyPM9X kTQrTocR+4wZywXViX2nVHRsU+2UJXi1pPv4nS6762NKk6Gk8/VytYw0ngTdNUYav79hxELi2AVt X2sRbc86NdlIU+nAScbxxTrP0ge1w2C7wo/ViLvBrEA8YhMsTKONTxGNFuwPSgYc65K67wdmJSXq rcZGvsoWi/AOorNYrubo2OtIdR1hmiNUST0lk7nz09s5GNs1LWbKog4abrH5dXehOrE6jQyOLlpP 3sa1H0/9+hlsfwIAAP//AwBQSwMEFAAGAAgAAAAhAB7EOUjaAAAABAEAAA8AAABkcnMvZG93bnJl di54bWxMj8FOwzAQRO9I/QdrK3FB1E4QUEKcqlRC4koL4rqJt3HUeB3Fbhv+HsOFXlYazWjmbbma XC9ONIbOs4ZsoUAQN9503Gr42L3eLkGEiGyw90wavinAqppdlVgYf+Z3Om1jK1IJhwI12BiHQsrQ WHIYFn4gTt7ejw5jkmMrzYjnVO56mSv1IB12nBYsDrSx1By2R6dh32Q+f9zcvH3KiFn3pV52tbNa X8+n9TOISFP8D8MvfkKHKjHV/sgmiF5DeiT+3eTly+wORK3h6V6BrEp5CV/9AAAA//8DAFBLAQIt ABQABgAIAAAAIQC2gziS/gAAAOEBAAATAAAAAAAAAAAAAAAAAAAAAABbQ29udGVudF9UeXBlc10u eG1sUEsBAi0AFAAGAAgAAAAhADj9If/WAAAAlAEAAAsAAAAAAAAAAAAAAAAALwEAAF9yZWxzLy5y ZWxzUEsBAi0AFAAGAAgAAAAhAC8fkPkrAgAAVAQAAA4AAAAAAAAAAAAAAAAALgIAAGRycy9lMm9E b2MueG1sUEsBAi0AFAAGAAgAAAAhAB7EOUjaAAAABAEAAA8AAAAAAAAAAAAAAAAAhQQAAGRycy9k b3ducmV2LnhtbFBLBQYAAAAABAAEAPMAAACMBQAAAAA= " strokeweight="2.25pt">
+              <v:roundrect w14:anchorId="09C86612" id="Rectángulo: esquinas redondeadas 2" o:spid="_x0000_s1026" style="width:140.65pt;height:47.5pt;visibility:visible;mso-wrap-style:square;mso-left-percent:-10001;mso-top-percent:-10001;mso-position-horizontal:absolute;mso-position-horizontal-relative:char;mso-position-vertical:absolute;mso-position-vertical-relative:line;mso-left-percent:-10001;mso-top-percent:-10001;v-text-anchor:top" arcsize="10923f" o:gfxdata="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" strokeweight="2.25pt">
                 <v:shadow offset="6pt,6pt"/>
                 <v:textbox>
                   <w:txbxContent>
@@ -612,7 +612,23 @@
           <w:szCs w:val="22"/>
         </w:rPr>
         <w:fldChar w:fldCharType="begin"/>
+      </w:r>
+      <w:r>
+        <w:rPr>
+          <w:rFonts w:ascii="Arial" w:hAnsi="Arial" w:cs="Arial"/>
+          <w:bCs/>
+          <w:noProof w:val="0"/>
+          <w:szCs w:val="22"/>
+        </w:rPr>
         <w:instrText xml:space="preserve"> TOC \o "1-3" \h \z \u </w:instrText>
+      </w:r>
+      <w:r>
+        <w:rPr>
+          <w:rFonts w:ascii="Arial" w:hAnsi="Arial" w:cs="Arial"/>
+          <w:bCs/>
+          <w:noProof w:val="0"/>
+          <w:szCs w:val="22"/>
+        </w:rPr>
         <w:fldChar w:fldCharType="separate"/>
       </w:r>
       <w:hyperlink w:anchor="_Toc235003961" w:history="1">
@@ -646,10 +662,40 @@
             <w:webHidden/>
           </w:rPr>
           <w:tab/>
+        </w:r>
+        <w:r>
+          <w:rPr>
+            <w:webHidden/>
+          </w:rPr>
           <w:fldChar w:fldCharType="begin"/>
+        </w:r>
+        <w:r>
+          <w:rPr>
+            <w:webHidden/>
+          </w:rPr>
           <w:instrText xml:space="preserve"> PAGEREF _Toc235003961 \h </w:instrText>
+        </w:r>
+        <w:r>
+          <w:rPr>
+            <w:webHidden/>
+          </w:rPr>
+        </w:r>
+        <w:r>
+          <w:rPr>
+            <w:webHidden/>
+          </w:rPr>
           <w:fldChar w:fldCharType="separate"/>
+        </w:r>
+        <w:r>
+          <w:rPr>
+            <w:webHidden/>
+          </w:rPr>
           <w:t>4</w:t>
+        </w:r>
+        <w:r>
+          <w:rPr>
+            <w:webHidden/>
+          </w:rPr>
           <w:fldChar w:fldCharType="end"/>
         </w:r>
       </w:hyperlink>
@@ -697,10 +743,40 @@
             <w:webHidden/>
           </w:rPr>
           <w:tab/>
+        </w:r>
+        <w:r>
+          <w:rPr>
+            <w:webHidden/>
+          </w:rPr>
           <w:fldChar w:fldCharType="begin"/>
+        </w:r>
+        <w:r>
+          <w:rPr>
+            <w:webHidden/>
+          </w:rPr>
           <w:instrText xml:space="preserve"> PAGEREF _Toc235003962 \h </w:instrText>
+        </w:r>
+        <w:r>
+          <w:rPr>
+            <w:webHidden/>
+          </w:rPr>
+        </w:r>
+        <w:r>
+          <w:rPr>
+            <w:webHidden/>
+          </w:rPr>
           <w:fldChar w:fldCharType="separate"/>
+        </w:r>
+        <w:r>
+          <w:rPr>
+            <w:webHidden/>
+          </w:rPr>
           <w:t>4</w:t>
+        </w:r>
+        <w:r>
+          <w:rPr>
+            <w:webHidden/>
+          </w:rPr>
           <w:fldChar w:fldCharType="end"/>
         </w:r>
       </w:hyperlink>
@@ -748,10 +824,40 @@
             <w:webHidden/>
           </w:rPr>
           <w:tab/>
+        </w:r>
+        <w:r>
+          <w:rPr>
+            <w:webHidden/>
+          </w:rPr>
           <w:fldChar w:fldCharType="begin"/>
+        </w:r>
+        <w:r>
+          <w:rPr>
+            <w:webHidden/>
+          </w:rPr>
           <w:instrText xml:space="preserve"> PAGEREF _Toc235003963 \h </w:instrText>
+        </w:r>
+        <w:r>
+          <w:rPr>
+            <w:webHidden/>
+          </w:rPr>
+        </w:r>
+        <w:r>
+          <w:rPr>
+            <w:webHidden/>
+          </w:rPr>
           <w:fldChar w:fldCharType="separate"/>
+        </w:r>
+        <w:r>
+          <w:rPr>
+            <w:webHidden/>
+          </w:rPr>
           <w:t>4</w:t>
+        </w:r>
+        <w:r>
+          <w:rPr>
+            <w:webHidden/>
+          </w:rPr>
           <w:fldChar w:fldCharType="end"/>
         </w:r>
       </w:hyperlink>
@@ -799,10 +905,40 @@
             <w:webHidden/>
           </w:rPr>
           <w:tab/>
+        </w:r>
+        <w:r>
+          <w:rPr>
+            <w:webHidden/>
+          </w:rPr>
           <w:fldChar w:fldCharType="begin"/>
+        </w:r>
+        <w:r>
+          <w:rPr>
+            <w:webHidden/>
+          </w:rPr>
           <w:instrText xml:space="preserve"> PAGEREF _Toc235003964 \h </w:instrText>
+        </w:r>
+        <w:r>
+          <w:rPr>
+            <w:webHidden/>
+          </w:rPr>
+        </w:r>
+        <w:r>
+          <w:rPr>
+            <w:webHidden/>
+          </w:rPr>
           <w:fldChar w:fldCharType="separate"/>
+        </w:r>
+        <w:r>
+          <w:rPr>
+            <w:webHidden/>
+          </w:rPr>
           <w:t>6</w:t>
+        </w:r>
+        <w:r>
+          <w:rPr>
+            <w:webHidden/>
+          </w:rPr>
           <w:fldChar w:fldCharType="end"/>
         </w:r>
       </w:hyperlink>
@@ -850,10 +986,40 @@
             <w:webHidden/>
           </w:rPr>
           <w:tab/>
+        </w:r>
+        <w:r>
+          <w:rPr>
+            <w:webHidden/>
+          </w:rPr>
           <w:fldChar w:fldCharType="begin"/>
+        </w:r>
+        <w:r>
+          <w:rPr>
+            <w:webHidden/>
+          </w:rPr>
           <w:instrText xml:space="preserve"> PAGEREF _Toc235003965 \h </w:instrText>
+        </w:r>
+        <w:r>
+          <w:rPr>
+            <w:webHidden/>
+          </w:rPr>
+        </w:r>
+        <w:r>
+          <w:rPr>
+            <w:webHidden/>
+          </w:rPr>
           <w:fldChar w:fldCharType="separate"/>
+        </w:r>
+        <w:r>
+          <w:rPr>
+            <w:webHidden/>
+          </w:rPr>
           <w:t>7</w:t>
+        </w:r>
+        <w:r>
+          <w:rPr>
+            <w:webHidden/>
+          </w:rPr>
           <w:fldChar w:fldCharType="end"/>
         </w:r>
       </w:hyperlink>
@@ -901,10 +1067,40 @@
             <w:webHidden/>
           </w:rPr>
           <w:tab/>
+        </w:r>
+        <w:r>
+          <w:rPr>
+            <w:webHidden/>
+          </w:rPr>
           <w:fldChar w:fldCharType="begin"/>
+        </w:r>
+        <w:r>
+          <w:rPr>
+            <w:webHidden/>
+          </w:rPr>
           <w:instrText xml:space="preserve"> PAGEREF _Toc235003966 \h </w:instrText>
+        </w:r>
+        <w:r>
+          <w:rPr>
+            <w:webHidden/>
+          </w:rPr>
+        </w:r>
+        <w:r>
+          <w:rPr>
+            <w:webHidden/>
+          </w:rPr>
           <w:fldChar w:fldCharType="separate"/>
+        </w:r>
+        <w:r>
+          <w:rPr>
+            <w:webHidden/>
+          </w:rPr>
           <w:t>10</w:t>
+        </w:r>
+        <w:r>
+          <w:rPr>
+            <w:webHidden/>
+          </w:rPr>
           <w:fldChar w:fldCharType="end"/>
         </w:r>
       </w:hyperlink>
@@ -952,10 +1148,40 @@
             <w:webHidden/>
           </w:rPr>
           <w:tab/>
+        </w:r>
+        <w:r>
+          <w:rPr>
+            <w:webHidden/>
+          </w:rPr>
           <w:fldChar w:fldCharType="begin"/>
+        </w:r>
+        <w:r>
+          <w:rPr>
+            <w:webHidden/>
+          </w:rPr>
           <w:instrText xml:space="preserve"> PAGEREF _Toc235003967 \h </w:instrText>
+        </w:r>
+        <w:r>
+          <w:rPr>
+            <w:webHidden/>
+          </w:rPr>
+        </w:r>
+        <w:r>
+          <w:rPr>
+            <w:webHidden/>
+          </w:rPr>
           <w:fldChar w:fldCharType="separate"/>
+        </w:r>
+        <w:r>
+          <w:rPr>
+            <w:webHidden/>
+          </w:rPr>
           <w:t>21</w:t>
+        </w:r>
+        <w:r>
+          <w:rPr>
+            <w:webHidden/>
+          </w:rPr>
           <w:fldChar w:fldCharType="end"/>
         </w:r>
       </w:hyperlink>
@@ -1003,10 +1229,40 @@
             <w:webHidden/>
           </w:rPr>
           <w:tab/>
+        </w:r>
+        <w:r>
+          <w:rPr>
+            <w:webHidden/>
+          </w:rPr>
           <w:fldChar w:fldCharType="begin"/>
+        </w:r>
+        <w:r>
+          <w:rPr>
+            <w:webHidden/>
+          </w:rPr>
           <w:instrText xml:space="preserve"> PAGEREF _Toc235003968 \h </w:instrText>
+        </w:r>
+        <w:r>
+          <w:rPr>
+            <w:webHidden/>
+          </w:rPr>
+        </w:r>
+        <w:r>
+          <w:rPr>
+            <w:webHidden/>
+          </w:rPr>
           <w:fldChar w:fldCharType="separate"/>
+        </w:r>
+        <w:r>
+          <w:rPr>
+            <w:webHidden/>
+          </w:rPr>
           <w:t>22</w:t>
+        </w:r>
+        <w:r>
+          <w:rPr>
+            <w:webHidden/>
+          </w:rPr>
           <w:fldChar w:fldCharType="end"/>
         </w:r>
       </w:hyperlink>
@@ -1547,7 +1803,7 @@
           <w:bCs w:val="0"/>
           <w:color w:val="000000"/>
         </w:rPr>
-        <w:t xml:space="preserve">MGPP: Modelo de Gobernabilidad de Programas y Proyectos</w:t>
+        <w:t>MGPP: Modelo de Gobernabilidad de Programas y Proyectos</w:t>
       </w:r>
     </w:p>
     <w:p>
@@ -2039,6 +2295,7 @@
           <w:bCs w:val="0"/>
           <w:color w:val="000000"/>
         </w:rPr>
+        <w:lastRenderedPageBreak/>
         <w:t>SGIA: Sistema de Gestión de Inteligencia Artificial</w:t>
       </w:r>
     </w:p>
@@ -2235,7 +2492,7 @@
           <w:rFonts w:ascii="Arial" w:hAnsi="Arial" w:cs="Arial"/>
           <w:highlight w:val="yellow"/>
         </w:rPr>
-        <w:t xml:space="preserve">Establecer las disposiciones para el gobierno, la gestión del ciclo de vida y el uso responsable de los Sistemas Basados en Inteligencia Artificial (SBIA) en la SUNAT, precisando los compromisos establecidos en la Política de IA y observando la NTP-ISO/IEC 42001:2025 de uso obligatorio conforme al numeral 28.2 del artículo 28 del RLIA, para garantizar su alineamiento con la estrategia institucional, el cumplimiento del marco normativo vigente, la protección de los derechos de los administrados, la reserva tributaria y la seguridad de la información.</w:t>
+        <w:t>Establecer las disposiciones para el gobierno, la gestión del ciclo de vida y el uso responsable de los Sistemas Basados en Inteligencia Artificial (SBIA) en la SUNAT, precisando los compromisos establecidos en la Política de IA y observando la NTP-ISO/IEC 42001:2025 de uso obligatorio conforme al numeral 28.2 del artículo 28 del RLIA, para garantizar su alineamiento con la estrategia institucional, el cumplimiento del marco normativo vigente, la protección de los derechos de los administrados, la reserva tributaria y la seguridad de la información.</w:t>
       </w:r>
     </w:p>
     <w:p>
@@ -2251,7 +2508,7 @@
           <w:rFonts w:ascii="Arial" w:hAnsi="Arial" w:cs="Arial"/>
           <w:highlight w:val="green"/>
         </w:rPr>
-        <w:t xml:space="preserve">La presente directiva regula la gestión de los SBIA solo en lo específico de la inteligencia artificial. No sustituye a los documentos normativos institucionales que regulan la gestión de proyectos, el desarrollo de sistemas, la gobernanza de datos, la seguridad de la información, las contrataciones y la gestión de las personas:</w:t>
+        <w:t>La presente directiva regula la gestión de los SBIA solo en lo específico de la inteligencia artificial. No sustituye a los documentos normativos institucionales que regulan la gestión de proyectos, el desarrollo de sistemas, la gobernanza de datos, la seguridad de la información, las contrataciones y la gestión de las personas:</w:t>
       </w:r>
       <w:r>
         <w:rPr>
@@ -2639,7 +2896,7 @@
           <w:bCs w:val="0"/>
           <w:color w:val="000000"/>
         </w:rPr>
-        <w:t xml:space="preserve">Decreto Supremo N.° 029-2021-PCM (18/02/2021), que aprueba el Reglamento del Decreto Legislativo N.° 1412, y sus modificatorias aprobadas por Decreto Supremo N.° 075-2023-PCM y Decreto Supremo N.° 098-2025-PCM (31/07/2025).</w:t>
+        <w:t>Decreto Supremo N.° 029-2021-PCM (18/02/2021), que aprueba el Reglamento del Decreto Legislativo N.° 1412, y sus modificatorias aprobadas por Decreto Supremo N.° 075-2023-PCM y Decreto Supremo N.° 098-2025-PCM (31/07/2025).</w:t>
       </w:r>
     </w:p>
     <w:p>
@@ -2886,7 +3143,7 @@
           <w:color w:val="000000"/>
           <w:highlight w:val="green"/>
         </w:rPr>
-        <w:t xml:space="preserve">Resolución de Superintendencia N.° 000144-2026/SUNAT (30/07/2026), que aprueba la Política de uso seguro, responsable y ético de los sistemas basados en inteligencia artificial en la Superintendencia Nacional de Aduanas y de Administración Tributaria</w:t>
+        <w:t>Resolución de Superintendencia N.° 000144-2026/SUNAT (30/07/2026), que aprueba la Política de uso seguro, responsable y ético de los sistemas basados en inteligencia artificial en la Superintendencia Nacional de Aduanas y de Administración Tributaria</w:t>
       </w:r>
       <w:r>
         <w:rPr>
@@ -2955,9 +3212,7 @@
           <w:color w:val="000000"/>
           <w:highlight w:val="green"/>
         </w:rPr>
-        <w:t xml:space="preserve">Resolución de Superintendencia N.° 050-2019/SUNAT (06/03/2019), que aprueba los documentos del Sistema de Gestión de Seguridad de la Información de la SUNAT, </w:t>
-        <w:lastRenderedPageBreak/>
-        <w:t>entre ellos el Manual de Políticas del Sistema de Gestión de Seguridad de la Información (SGSI-MA-03).</w:t>
+        <w:t>Resolución de Superintendencia N.° 050-2019/SUNAT (06/03/2019), que aprueba los documentos del Sistema de Gestión de Seguridad de la Información de la SUNAT, entre ellos el Manual de Políticas del Sistema de Gestión de Seguridad de la Información (SGSI-MA-03).</w:t>
       </w:r>
     </w:p>
     <w:p>
@@ -2983,7 +3238,7 @@
           <w:color w:val="000000"/>
           <w:highlight w:val="yellow"/>
         </w:rPr>
-        <w:t xml:space="preserve">Resolución de Oficina N.° 001-2024-SUNAT/1V0000 (16/12/2024), que aprueba la Metodología para la formulación, aprobación y control de los Documentos Normativos Institucionales (METDONI) Versión 1.4.</w:t>
+        <w:t>Resolución de Oficina N.° 001-2024-SUNAT/1V0000 (16/12/2024), que aprueba la Metodología para la formulación, aprobación y control de los Documentos Normativos Institucionales (METDONI) Versión 1.4.</w:t>
       </w:r>
     </w:p>
     <w:p>
@@ -3009,7 +3264,8 @@
           <w:color w:val="000000"/>
           <w:highlight w:val="lightGray"/>
         </w:rPr>
-        <w:t xml:space="preserve">Resolución de Oficina N.° 000002-2023-SUNAT/1V0000 (22/12/2023), que aprueba la Metodología para la Gestión por Procesos (METGEP) Versión 5.0.</w:t>
+        <w:lastRenderedPageBreak/>
+        <w:t>Resolución de Oficina N.° 000002-2023-SUNAT/1V0000 (22/12/2023), que aprueba la Metodología para la Gestión por Procesos (METGEP) Versión 5.0.</w:t>
       </w:r>
     </w:p>
     <w:p>
@@ -3189,7 +3445,7 @@
           <w:bCs w:val="0"/>
           <w:color w:val="000000"/>
         </w:rPr>
-        <w:t xml:space="preserve">: Conjunto de etapas secuenciales e iterativas desde la ideación hasta el retiro de un SBIA. Sus etapas son las previstas en el numeral 6.1.1 de la presente directiva. [ISO/IEC 22989:2022, sección 3.2.1; NTP-ISO/IEC 42001:2025, Anexo A, A.6]</w:t>
+        <w:t>: Conjunto de etapas secuenciales e iterativas desde la ideación hasta el retiro de un SBIA. Sus etapas son las previstas en el numeral 6.1.1 de la presente directiva. [ISO/IEC 22989:2022, sección 3.2.1; NTP-ISO/IEC 42001:2025, Anexo A, A.6]</w:t>
       </w:r>
     </w:p>
     <w:p>
@@ -3443,7 +3699,17 @@
           <w:color w:val="000000"/>
           <w:highlight w:val="yellow"/>
         </w:rPr>
-        <w:t xml:space="preserve">Proceso sistemático y documentado para identificar, analizar y evaluar los riesgos y efectos potenciales que un SBIA genera sobre los derechos de los administrados, previo a su desarrollo, adquisición o implementación. </w:t>
+        <w:t xml:space="preserve">Proceso sistemático y documentado para identificar, analizar y evaluar los riesgos y efectos potenciales que un SBIA </w:t>
+      </w:r>
+      <w:r>
+        <w:rPr>
+          <w:b w:val="0"/>
+          <w:bCs w:val="0"/>
+          <w:color w:val="000000"/>
+          <w:highlight w:val="yellow"/>
+        </w:rPr>
+        <w:lastRenderedPageBreak/>
+        <w:t xml:space="preserve">genera sobre los derechos de los administrados, previo a su desarrollo, adquisición o implementación. </w:t>
       </w:r>
       <w:r>
         <w:rPr>
@@ -3453,7 +3719,7 @@
           <w:highlight w:val="yellow"/>
           <w:lang w:val="en-US"/>
         </w:rPr>
-        <w:t xml:space="preserve">[D.S. N.° 115-2025-PCM, Art. 30; NTP-ISO/IEC 42001:2025, Anexo A, A.5.2]</w:t>
+        <w:t>[D.S. N.° 115-2025-PCM, Art. 30; NTP-ISO/IEC 42001:2025, Anexo A, A.5.2]</w:t>
       </w:r>
     </w:p>
     <w:p>
@@ -3535,7 +3801,6 @@
         <w:rPr>
           <w:color w:val="000000"/>
         </w:rPr>
-        <w:lastRenderedPageBreak/>
         <w:t>Hito de aprobación:</w:t>
       </w:r>
       <w:r>
@@ -3584,7 +3849,7 @@
           <w:color w:val="000000"/>
           <w:lang w:val="en-US"/>
         </w:rPr>
-        <w:t xml:space="preserve">[D.S. N.° 115-2025-PCM, Art. 7 lit. h); ISO/IEC 22989:2022, sección 3.4.3]</w:t>
+        <w:t>[D.S. N.° 115-2025-PCM, Art. 7 lit. h); ISO/IEC 22989:2022, sección 3.4.3]</w:t>
       </w:r>
     </w:p>
     <w:p>
@@ -3624,7 +3889,7 @@
           <w:color w:val="000000"/>
           <w:lang w:val="en-US"/>
         </w:rPr>
-        <w:t xml:space="preserve">[D.S. N.° 115-2025-PCM, Art. 7 lit. h); ISO/IEC 22989:2022, sección 3.4.4]</w:t>
+        <w:t>[D.S. N.° 115-2025-PCM, Art. 7 lit. h); ISO/IEC 22989:2022, sección 3.4.4]</w:t>
       </w:r>
     </w:p>
     <w:p>
@@ -3782,7 +4047,7 @@
           <w:color w:val="000000"/>
           <w:highlight w:val="green"/>
         </w:rPr>
-        <w:t xml:space="preserve">Unidad de organización que, de acuerdo con sus competencias y funciones en el ROF, es el dueño del proceso en el que se identifica la necesidad a atender mediante un SBIA y que asume la responsabilidad funcional sobre sus resultados y sobre los riesgos derivados de su utilización durante todo su ciclo de vida. Se distingue del custodio técnico, definido en el presente glosario. [METGEP, numeral 4.9; METDONI, numeral 4.6; NTP-ISO/IEC 42001:2025, cláusula 5.3]</w:t>
+        <w:t>Unidad de organización que, de acuerdo con sus competencias y funciones en el ROF, es el dueño del proceso en el que se identifica la necesidad a atender mediante un SBIA y que asume la responsabilidad funcional sobre sus resultados y sobre los riesgos derivados de su utilización durante todo su ciclo de vida. Se distingue del custodio técnico, definido en el presente glosario. [METGEP, numeral 4.9; METDONI, numeral 4.6; NTP-ISO/IEC 42001:2025, cláusula 5.3]</w:t>
       </w:r>
     </w:p>
     <w:p>
@@ -3806,6 +4071,7 @@
           <w:color w:val="000000"/>
           <w:highlight w:val="green"/>
         </w:rPr>
+        <w:lastRenderedPageBreak/>
         <w:t>Red Teaming:</w:t>
       </w:r>
       <w:r>
@@ -3848,9 +4114,7 @@
           <w:color w:val="000000"/>
           <w:highlight w:val="green"/>
         </w:rPr>
-        <w:t xml:space="preserve"> Carácter de información reservada que el artículo 85 del TUO del Código Tributario atribuye, por su objeto, a la cuantía y la fuente de las rentas, los gastos, la base imponible y cualesquiera otros datos relativos a ellos, cuando están contenidos en las declaraciones e informaciones que la Administración Tributaria obtiene por cualquier medio de los contribuyentes, responsables o terceros, así como a la tramitación de las denuncias a que se refiere el artículo 192 del mismo Código. Dicha información únicamente puede ser utilizada por la Administración Tributaria para sus fines propios y la obligación de reserva alcanza a </w:t>
-        <w:lastRenderedPageBreak/>
-        <w:t>quienes accedan a ella. El mismo artículo establece excepciones expresas. La determinación de si una información concreta está sujeta a reserva tributaria se efectúa respecto de esa información y no se presume respecto de todo el acervo de datos que la SUNAT administra. [D.S. N.° 133-2013-EF, Art. 85]</w:t>
+        <w:t xml:space="preserve"> Carácter de información reservada que el artículo 85 del TUO del Código Tributario atribuye, por su objeto, a la cuantía y la fuente de las rentas, los gastos, la base imponible y cualesquiera otros datos relativos a ellos, cuando están contenidos en las declaraciones e informaciones que la Administración Tributaria obtiene por cualquier medio de los contribuyentes, responsables o terceros, así como a la tramitación de las denuncias a que se refiere el artículo 192 del mismo Código. Dicha información únicamente puede ser utilizada por la Administración Tributaria para sus fines propios y la obligación de reserva alcanza a quienes accedan a ella. El mismo artículo establece excepciones expresas. La determinación de si una información concreta está sujeta a reserva tributaria se efectúa respecto de esa información y no se presume respecto de todo el acervo de datos que la SUNAT administra. [D.S. N.° 133-2013-EF, Art. 85]</w:t>
       </w:r>
     </w:p>
     <w:p>
@@ -3890,7 +4154,7 @@
           <w:color w:val="000000"/>
           <w:lang w:val="en-US"/>
         </w:rPr>
-        <w:t xml:space="preserve">[Ley N.° 31814, Art. 2; D.S. N.° 115-2025-PCM, Art. 6 lit. j]</w:t>
+        <w:t>[Ley N.° 31814, Art. 2; D.S. N.° 115-2025-PCM, Art. 6 lit. j]</w:t>
       </w:r>
     </w:p>
     <w:p>
@@ -4047,6 +4311,8 @@
       </w:pPr>
       <w:r>
         <w:t>5.1</w:t>
+      </w:r>
+      <w:r>
         <w:tab/>
         <w:t>De los principios para el Gobierno de IA</w:t>
       </w:r>
@@ -4066,7 +4332,14 @@
           <w:rFonts w:ascii="Arial" w:eastAsia="Arial" w:hAnsi="Arial" w:cs="Arial"/>
           <w:color w:val="000000"/>
         </w:rPr>
+        <w:lastRenderedPageBreak/>
         <w:t>5.1.1</w:t>
+      </w:r>
+      <w:r>
+        <w:rPr>
+          <w:rFonts w:ascii="Arial" w:eastAsia="Arial" w:hAnsi="Arial" w:cs="Arial"/>
+          <w:color w:val="000000"/>
+        </w:rPr>
         <w:tab/>
       </w:r>
       <w:r>
@@ -4097,7 +4370,7 @@
           <w:rFonts w:ascii="Arial" w:hAnsi="Arial" w:cs="Arial"/>
           <w:highlight w:val="yellow"/>
         </w:rPr>
-        <w:t xml:space="preserve">Política de IA</w:t>
+        <w:t>Política de IA</w:t>
       </w:r>
       <w:r>
         <w:rPr>
@@ -4125,6 +4398,13 @@
           <w:highlight w:val="lightGray"/>
         </w:rPr>
         <w:t>5.1.2</w:t>
+      </w:r>
+      <w:r>
+        <w:rPr>
+          <w:rFonts w:ascii="Arial" w:hAnsi="Arial" w:cs="Arial"/>
+          <w:color w:val="000000"/>
+          <w:highlight w:val="lightGray"/>
+        </w:rPr>
         <w:tab/>
         <w:t xml:space="preserve">Los derechos fundamentales son intangibles y constituyen el límite de toda actuación administrativa. Por ello, cuando exista la posibilidad de que la operación de un SBIA pueda afectar los derechos fundamentales de las personas, se priorizará siempre la protección de éstos últimos. </w:t>
       </w:r>
@@ -4146,6 +4426,13 @@
           <w:highlight w:val="yellow"/>
         </w:rPr>
         <w:t>5.1.3</w:t>
+      </w:r>
+      <w:r>
+        <w:rPr>
+          <w:rFonts w:ascii="Arial" w:eastAsia="Arial" w:hAnsi="Arial" w:cs="Arial"/>
+          <w:color w:val="000000"/>
+          <w:highlight w:val="yellow"/>
+        </w:rPr>
         <w:tab/>
         <w:t>La reserva tributaria constituye criterio determinante en la evaluación de riesgo de todo SBIA que procese información de contribuyentes.</w:t>
       </w:r>
@@ -4168,6 +4455,14 @@
           <w:highlight w:val="cyan"/>
         </w:rPr>
         <w:t>5.1.4</w:t>
+      </w:r>
+      <w:r>
+        <w:rPr>
+          <w:b w:val="0"/>
+          <w:bCs w:val="0"/>
+          <w:color w:val="000000"/>
+          <w:highlight w:val="cyan"/>
+        </w:rPr>
         <w:tab/>
         <w:t>El Gobierno de IA se orienta a la generación de valor público. Toda iniciativa de SBIA responde a un problema real y relevante de la administración y produce un beneficio verificable para las personas o para la gestión institucional; no se promueven usos de IA sin una necesidad que los justifique.</w:t>
       </w:r>
@@ -4189,6 +4484,13 @@
           <w:highlight w:val="yellow"/>
         </w:rPr>
         <w:t>5.1.5</w:t>
+      </w:r>
+      <w:r>
+        <w:rPr>
+          <w:rFonts w:ascii="Arial" w:eastAsia="Arial" w:hAnsi="Arial" w:cs="Arial"/>
+          <w:color w:val="000000"/>
+          <w:highlight w:val="yellow"/>
+        </w:rPr>
         <w:tab/>
         <w:t>El Gobierno de IA aplica el principio de proporcionalidad: las exigencias de evaluación, supervisión y control se gradúan según el nivel de riesgo del SBIA. La proporcionalidad no exime del cumplimiento de los controles y obligaciones que el RLIA y la presente directiva establecen con carácter obligatorio para cada categoría de riesgo.</w:t>
       </w:r>
@@ -4200,8 +4502,9 @@
         <w:ind w:left="851"/>
       </w:pPr>
       <w:r>
-        <w:lastRenderedPageBreak/>
         <w:t>5.2</w:t>
+      </w:r>
+      <w:r>
         <w:tab/>
         <w:t>De la función de Gobierno de Inteligencia Artificial</w:t>
       </w:r>
@@ -4222,8 +4525,14 @@
           <w:color w:val="000000"/>
         </w:rPr>
         <w:t>5.2.1</w:t>
+      </w:r>
+      <w:r>
+        <w:rPr>
+          <w:rFonts w:ascii="Arial" w:eastAsia="Arial" w:hAnsi="Arial" w:cs="Arial"/>
+          <w:color w:val="000000"/>
+        </w:rPr>
         <w:tab/>
-        <w:t xml:space="preserve">El Comité de Gobierno y Transformación Digital (CGTD) ejerce la función de gobierno de inteligencia artificial en la SUNAT, conforme al numeral 9.3 del artículo 9 del RLIA, aprobado por Decreto Supremo N.° 115-2025-PCM, y a la Resolución de Superintendencia N.° 084-2019/SUNAT que lo conforma, modificada por las Resoluciones de Superintendencia N.° 142-2019/SUNAT y N.° 000187-2024/SUNAT. El CGTD lidera, dirige, evalúa y supervisa los proyectos de SBIA estratégicos para la entidad. La calificación de estratégico corresponde al CGTD. Se efectúa a más tardar en el acto de aprobación de la clasificación de riesgo y consta en el acuerdo respectivo.</w:t>
+        <w:t>El Comité de Gobierno y Transformación Digital (CGTD) ejerce la función de gobierno de inteligencia artificial en la SUNAT, conforme al numeral 9.3 del artículo 9 del RLIA, aprobado por Decreto Supremo N.° 115-2025-PCM, y a la Resolución de Superintendencia N.° 084-2019/SUNAT que lo conforma, modificada por las Resoluciones de Superintendencia N.° 142-2019/SUNAT y N.° 000187-2024/SUNAT. El CGTD lidera, dirige, evalúa y supervisa los proyectos de SBIA estratégicos para la entidad. La calificación de estratégico corresponde al CGTD. Se efectúa a más tardar en el acto de aprobación de la clasificación de riesgo y consta en el acuerdo respectivo.</w:t>
       </w:r>
     </w:p>
     <w:p>
@@ -4234,6 +4543,8 @@
       </w:pPr>
       <w:r>
         <w:t>5.3</w:t>
+      </w:r>
+      <w:r>
         <w:tab/>
         <w:t>De la Comisión de Gobierno de IA</w:t>
       </w:r>
@@ -4255,6 +4566,13 @@
           <w:highlight w:val="green"/>
         </w:rPr>
         <w:t>5.3.1</w:t>
+      </w:r>
+      <w:r>
+        <w:rPr>
+          <w:rFonts w:ascii="Arial" w:eastAsia="Arial" w:hAnsi="Arial" w:cs="Arial"/>
+          <w:color w:val="000000"/>
+          <w:highlight w:val="green"/>
+        </w:rPr>
         <w:tab/>
         <w:t>Para el ejercicio efectivo de la función de gobierno de IA, el CGTD cuenta con la Comisión de Gobierno de IA, instancia de apoyo encargada de preparar las evaluaciones, los informes y las propuestas que el CGTD requiera para la toma de decisiones en materia de IA, y de ejercer las funciones de administración, supervisión y aprobación que la presente directiva le asigna. La Comisión de Gobierno de IA es coordinada por un Coordinador designado por el CGTD.</w:t>
       </w:r>
@@ -4275,8 +4593,14 @@
           <w:color w:val="000000"/>
         </w:rPr>
         <w:t>5.3.2</w:t>
+      </w:r>
+      <w:r>
+        <w:rPr>
+          <w:rFonts w:ascii="Arial" w:eastAsia="Arial" w:hAnsi="Arial" w:cs="Arial"/>
+          <w:color w:val="000000"/>
+        </w:rPr>
         <w:tab/>
-        <w:t xml:space="preserve">Las funciones de la Comisión de Gobierno de IA, en apoyo al CGTD, se definen en el numeral 5.4 y en las disposiciones específicas de la presente directiva.</w:t>
+        <w:t>Las funciones de la Comisión de Gobierno de IA, en apoyo al CGTD, se definen en el numeral 5.4 y en las disposiciones específicas de la presente directiva.</w:t>
       </w:r>
     </w:p>
     <w:p>
@@ -4287,6 +4611,8 @@
       </w:pPr>
       <w:r>
         <w:t>5.4</w:t>
+      </w:r>
+      <w:r>
         <w:tab/>
         <w:t>De los roles y responsabilidades</w:t>
       </w:r>
@@ -4380,6 +4706,7 @@
                 <w:b/>
                 <w:bCs/>
               </w:rPr>
+              <w:lastRenderedPageBreak/>
               <w:t>Instancias de Gobierno de IA</w:t>
             </w:r>
           </w:p>
@@ -4714,7 +5041,6 @@
                 <w:b/>
                 <w:bCs/>
               </w:rPr>
-              <w:lastRenderedPageBreak/>
               <w:t>CGTD (en materia de IA)</w:t>
             </w:r>
           </w:p>
@@ -5017,7 +5343,15 @@
                 <w:b w:val="0"/>
                 <w:bCs w:val="0"/>
               </w:rPr>
-              <w:t xml:space="preserve">Preparar la propuesta del Plan de Acción de Inteligencia Artificial y sus actualizaciones, conforme al numeral 7.11.</w:t>
+              <w:t xml:space="preserve">Preparar la propuesta del Plan de Acción de Inteligencia Artificial y sus </w:t>
+            </w:r>
+            <w:r>
+              <w:rPr>
+                <w:b w:val="0"/>
+                <w:bCs w:val="0"/>
+              </w:rPr>
+              <w:lastRenderedPageBreak/>
+              <w:t>actualizaciones, conforme al numeral 7.11.</w:t>
             </w:r>
           </w:p>
           <w:p>
@@ -5067,7 +5401,6 @@
                 <w:bCs w:val="0"/>
                 <w:highlight w:val="green"/>
               </w:rPr>
-              <w:lastRenderedPageBreak/>
               <w:t>Proponer la clasificación de riesgo de cada SBIA, previo al inicio del desarrollo o adquisición, y elevar al CGTD la relación de las propuestas de riesgo aceptable para su aprobación agregada; la aprobación corresponde conforme al numeral 6.2.2.</w:t>
             </w:r>
           </w:p>
@@ -5189,7 +5522,16 @@
                 <w:bCs w:val="0"/>
                 <w:highlight w:val="green"/>
               </w:rPr>
-              <w:t>Aprobar los hitos del ciclo de vida que le corresponden conforme al numeral 6.1.2 y el ciclo de vida simplificado de los SBIA de riesgo aceptable.</w:t>
+              <w:t xml:space="preserve">Aprobar los hitos del ciclo de vida que le corresponden conforme al </w:t>
+            </w:r>
+            <w:r>
+              <w:rPr>
+                <w:b w:val="0"/>
+                <w:bCs w:val="0"/>
+                <w:highlight w:val="green"/>
+              </w:rPr>
+              <w:lastRenderedPageBreak/>
+              <w:t>numeral 6.1.2 y el ciclo de vida simplificado de los SBIA de riesgo aceptable.</w:t>
             </w:r>
           </w:p>
           <w:p>
@@ -5361,7 +5703,6 @@
                 <w:b/>
                 <w:bCs/>
               </w:rPr>
-              <w:lastRenderedPageBreak/>
               <w:t>Integrantes de la Comisión de Gobierno de IA</w:t>
             </w:r>
           </w:p>
@@ -5608,7 +5949,15 @@
                 <w:b w:val="0"/>
                 <w:bCs w:val="0"/>
               </w:rPr>
-              <w:t xml:space="preserve">Supervisa y evalúa que los modelos y algoritmos de los SBIA de riesgo alto cumplan los estándares de calidad y ética aplicables, conforme al numeral 6.5 del artículo 6 de la Resolución Ministerial N.° 152-2026-PCM. La ejerce en coordinación con las unidades de organización y con los propietarios de los casos de uso, y se apoya en las verificaciones previstas en los numerales 6.10.3 y 6.14.</w:t>
+              <w:t xml:space="preserve">Supervisa y evalúa que los modelos y algoritmos de los SBIA de riesgo alto cumplan los estándares de calidad y ética aplicables, conforme al numeral 6.5 del artículo 6 de la Resolución Ministerial N.° 152-2026-PCM. La ejerce en coordinación con las unidades de organización y con los propietarios de los casos de uso, </w:t>
+            </w:r>
+            <w:r>
+              <w:rPr>
+                <w:b w:val="0"/>
+                <w:bCs w:val="0"/>
+              </w:rPr>
+              <w:lastRenderedPageBreak/>
+              <w:t>y se apoya en las verificaciones previstas en los numerales 6.10.3 y 6.14.</w:t>
             </w:r>
           </w:p>
         </w:tc>
@@ -5642,6 +5991,7 @@
                 <w:bCs/>
                 <w:color w:val="000000"/>
               </w:rPr>
+              <w:lastRenderedPageBreak/>
               <w:t>Oficial de</w:t>
             </w:r>
           </w:p>
@@ -6009,7 +6359,17 @@
                 <w:color w:val="000000"/>
                 <w:highlight w:val="green"/>
               </w:rPr>
-              <w:t>En materia de seguridad digital: asegura y supervisa la adopción de los estándares y normas técnicas de seguridad de la información cuando la INSI desarrolla, adquiere o terceriza SBIA. Propone las medidas de gestión de riesgos de seguridad de la información aplicables a los SBIA. Comunica al Centro Nacional de Seguridad Digital (CNSD) los incidentes de seguridad digital que involucren un SBIA y los informa a la máxima autoridad administrativa de la entidad, conforme a la Directiva N.° 001-2023-PCM/SGTD. Informa al CGTD los que resulten críticos. Cuando un SBIA constituya un activo de información de un proceso comprendido en el alcance del SGSI, coordina la aplicación de los controles que correspondan.</w:t>
+              <w:t xml:space="preserve">En materia de seguridad digital: asegura y supervisa la adopción de los estándares y normas técnicas de seguridad de la información cuando la INSI desarrolla, adquiere o terceriza SBIA. Propone las medidas de gestión de riesgos de seguridad de la información aplicables a los SBIA. Comunica al Centro Nacional de Seguridad Digital (CNSD) los incidentes de seguridad digital que involucren un SBIA y los informa a la máxima autoridad administrativa de la entidad, conforme a la Directiva N.° 001-2023-PCM/SGTD. Informa al </w:t>
+            </w:r>
+            <w:r>
+              <w:rPr>
+                <w:b w:val="0"/>
+                <w:bCs w:val="0"/>
+                <w:color w:val="000000"/>
+                <w:highlight w:val="green"/>
+              </w:rPr>
+              <w:lastRenderedPageBreak/>
+              <w:t>CGTD los que resulten críticos. Cuando un SBIA constituya un activo de información de un proceso comprendido en el alcance del SGSI, coordina la aplicación de los controles que correspondan.</w:t>
             </w:r>
           </w:p>
         </w:tc>
@@ -6311,7 +6671,7 @@
                 <w:bCs w:val="0"/>
                 <w:highlight w:val="green"/>
               </w:rPr>
-              <w:t xml:space="preserve">Revisa la EIA en materia de cumplimiento normativo. Cuando la revisión comprenda el sentido y el alcance de las normas tributarias o aduaneras, se pronuncia la Intendencia Nacional Jurídico Tributaria o la Intendencia Nacional Jurídico Aduanera, según la materia, a convocatoria de la Comisión de Gobierno de IA.</w:t>
+              <w:t>Revisa la EIA en materia de cumplimiento normativo. Cuando la revisión comprenda el sentido y el alcance de las normas tributarias o aduaneras, se pronuncia la Intendencia Nacional Jurídico Tributaria o la Intendencia Nacional Jurídico Aduanera, según la materia, a convocatoria de la Comisión de Gobierno de IA.</w:t>
             </w:r>
           </w:p>
           <w:p>
@@ -6335,6 +6695,7 @@
                 <w:bCs w:val="0"/>
                 <w:highlight w:val="yellow"/>
               </w:rPr>
+              <w:lastRenderedPageBreak/>
               <w:t xml:space="preserve">Emite opinión previa sobre contratos con proveedores internacionales de IA. </w:t>
             </w:r>
           </w:p>
@@ -6395,6 +6756,7 @@
                 <w:b/>
                 <w:bCs/>
               </w:rPr>
+              <w:lastRenderedPageBreak/>
               <w:t>Seguridad de IA</w:t>
             </w:r>
           </w:p>
@@ -6470,9 +6832,7 @@
                 <w:bCs w:val="0"/>
                 <w:highlight w:val="green"/>
               </w:rPr>
-              <w:t xml:space="preserve">Efectúa el análisis de riesgo y las pruebas de vulnerabilidad sobre la </w:t>
-              <w:lastRenderedPageBreak/>
-              <w:t xml:space="preserve">arquitectura de aplicaciones, de información y de infraestructura tecnológica que soporta los SBIA, conforme al literal b) del artículo 106 del ROF. </w:t>
+              <w:t xml:space="preserve">Efectúa el análisis de riesgo y las pruebas de vulnerabilidad sobre la arquitectura de aplicaciones, de información y de infraestructura tecnológica que soporta los SBIA, conforme al literal b) del artículo 106 del ROF. </w:t>
             </w:r>
           </w:p>
           <w:p>
@@ -6533,7 +6893,6 @@
                 <w:b/>
                 <w:bCs/>
               </w:rPr>
-              <w:lastRenderedPageBreak/>
               <w:t>Arquitectura de IA</w:t>
             </w:r>
           </w:p>
@@ -6803,7 +7162,17 @@
                 <w:bCs/>
                 <w:highlight w:val="yellow"/>
               </w:rPr>
-              <w:t>Integración de programas y proyectos institucionales</w:t>
+              <w:t xml:space="preserve">Integración de programas y </w:t>
+            </w:r>
+            <w:r>
+              <w:rPr>
+                <w:rFonts w:ascii="Arial" w:eastAsia="Arial" w:hAnsi="Arial" w:cs="Arial"/>
+                <w:b/>
+                <w:bCs/>
+                <w:highlight w:val="yellow"/>
+              </w:rPr>
+              <w:lastRenderedPageBreak/>
+              <w:t>proyectos institucionales</w:t>
             </w:r>
           </w:p>
         </w:tc>
@@ -6836,6 +7205,7 @@
                 <w:rFonts w:ascii="Arial" w:eastAsia="Arial" w:hAnsi="Arial" w:cs="Arial"/>
                 <w:highlight w:val="yellow"/>
               </w:rPr>
+              <w:lastRenderedPageBreak/>
               <w:t>OIPPI</w:t>
             </w:r>
           </w:p>
@@ -6879,7 +7249,16 @@
                 <w:bCs w:val="0"/>
                 <w:highlight w:val="yellow"/>
               </w:rPr>
-              <w:t>Promueve un enfoque holístico, sistemático y con sinergia en el desarrollo del caso de negocio de las iniciativas de SBIA.</w:t>
+              <w:t xml:space="preserve">Promueve un enfoque holístico, sistemático y con sinergia en el </w:t>
+            </w:r>
+            <w:r>
+              <w:rPr>
+                <w:b w:val="0"/>
+                <w:bCs w:val="0"/>
+                <w:highlight w:val="yellow"/>
+              </w:rPr>
+              <w:lastRenderedPageBreak/>
+              <w:t>desarrollo del caso de negocio de las iniciativas de SBIA.</w:t>
             </w:r>
           </w:p>
           <w:p>
@@ -6942,6 +7321,7 @@
                 <w:bCs/>
                 <w:highlight w:val="lightGray"/>
               </w:rPr>
+              <w:lastRenderedPageBreak/>
               <w:t>Visión de negocio</w:t>
             </w:r>
           </w:p>
@@ -7044,9 +7424,7 @@
                 <w:bCs w:val="0"/>
                 <w:highlight w:val="lightGray"/>
               </w:rPr>
-              <w:t xml:space="preserve">Contribuye a la evaluación del componente de IA con el </w:t>
-              <w:lastRenderedPageBreak/>
-              <w:t xml:space="preserve">conocimiento operativo de los procesos de dicho ámbito y de su impacto en los administrados. Su participación es permanente y no sustituye la del propietario del caso de uso, a quien la Comisión convoca cuando se evalúa un caso de uso de su proceso.</w:t>
+              <w:t>Contribuye a la evaluación del componente de IA con el conocimiento operativo de los procesos de dicho ámbito y de su impacto en los administrados. Su participación es permanente y no sustituye la del propietario del caso de uso, a quien la Comisión convoca cuando se evalúa un caso de uso de su proceso.</w:t>
             </w:r>
           </w:p>
         </w:tc>
@@ -7085,7 +7463,6 @@
                 <w:b/>
                 <w:bCs/>
               </w:rPr>
-              <w:lastRenderedPageBreak/>
               <w:t>Otras unidades de organización con responsabilidad en el gobierno de IA</w:t>
             </w:r>
           </w:p>
@@ -7246,7 +7623,16 @@
                 <w:bCs w:val="0"/>
                 <w:highlight w:val="yellow"/>
               </w:rPr>
-              <w:t>Promueve la adopción de la inteligencia artificial en el ámbito de las personas, conforme al numeral 6.13.3.</w:t>
+              <w:t xml:space="preserve">Promueve la adopción de la inteligencia artificial en el ámbito de </w:t>
+            </w:r>
+            <w:r>
+              <w:rPr>
+                <w:b w:val="0"/>
+                <w:bCs w:val="0"/>
+                <w:highlight w:val="yellow"/>
+              </w:rPr>
+              <w:lastRenderedPageBreak/>
+              <w:t>las personas, conforme al numeral 6.13.3.</w:t>
             </w:r>
           </w:p>
           <w:p>
@@ -7330,7 +7716,8 @@
                 <w:b/>
                 <w:bCs/>
               </w:rPr>
-              <w:t xml:space="preserve">Interpretación normativa tributaria</w:t>
+              <w:lastRenderedPageBreak/>
+              <w:t>Interpretación normativa tributaria</w:t>
             </w:r>
           </w:p>
         </w:tc>
@@ -7362,7 +7749,7 @@
               <w:rPr>
                 <w:rFonts w:ascii="Arial" w:eastAsia="Arial" w:hAnsi="Arial" w:cs="Arial"/>
               </w:rPr>
-              <w:t xml:space="preserve">INJT</w:t>
+              <w:t>INJT</w:t>
             </w:r>
           </w:p>
         </w:tc>
@@ -7403,7 +7790,7 @@
                 <w:b w:val="0"/>
                 <w:bCs w:val="0"/>
               </w:rPr>
-              <w:t xml:space="preserve">Interpreta, con carácter vinculante, el sentido y el alcance de las normas tributarias, conforme al artículo 362 del ROF.</w:t>
+              <w:t>Interpreta, con carácter vinculante, el sentido y el alcance de las normas tributarias, conforme al artículo 362 del ROF.</w:t>
             </w:r>
           </w:p>
           <w:p>
@@ -7426,7 +7813,7 @@
                 <w:b w:val="0"/>
                 <w:bCs w:val="0"/>
               </w:rPr>
-              <w:t xml:space="preserve">Emite opinión legal vinculante sobre las consultas que le formulan las unidades de organización en las materias de su competencia, conforme al literal c) del artículo 363 del ROF.</w:t>
+              <w:t>Emite opinión legal vinculante sobre las consultas que le formulan las unidades de organización en las materias de su competencia, conforme al literal c) del artículo 363 del ROF.</w:t>
             </w:r>
           </w:p>
           <w:p>
@@ -7449,7 +7836,7 @@
                 <w:b w:val="0"/>
                 <w:bCs w:val="0"/>
               </w:rPr>
-              <w:t xml:space="preserve">La Comisión de Gobierno de IA la convoca conforme a los numerales 6.4.2, 6.7.8 y 6.8.3.</w:t>
+              <w:t>La Comisión de Gobierno de IA la convoca conforme a los numerales 6.4.2, 6.7.8 y 6.8.3.</w:t>
             </w:r>
           </w:p>
           <w:p>
@@ -7472,7 +7859,7 @@
                 <w:b w:val="0"/>
                 <w:bCs w:val="0"/>
               </w:rPr>
-              <w:t xml:space="preserve">La Gerencia de Arquitectura solicita su opinión conforme al numeral 6.5.8.</w:t>
+              <w:t>La Gerencia de Arquitectura solicita su opinión conforme al numeral 6.5.8.</w:t>
             </w:r>
           </w:p>
         </w:tc>
@@ -7508,7 +7895,7 @@
                 <w:b/>
                 <w:bCs/>
               </w:rPr>
-              <w:t xml:space="preserve">Interpretación normativa aduanera</w:t>
+              <w:t>Interpretación normativa aduanera</w:t>
             </w:r>
           </w:p>
         </w:tc>
@@ -7540,7 +7927,7 @@
               <w:rPr>
                 <w:rFonts w:ascii="Arial" w:eastAsia="Arial" w:hAnsi="Arial" w:cs="Arial"/>
               </w:rPr>
-              <w:t xml:space="preserve">INJA</w:t>
+              <w:t>INJA</w:t>
             </w:r>
           </w:p>
         </w:tc>
@@ -7581,7 +7968,7 @@
                 <w:b w:val="0"/>
                 <w:bCs w:val="0"/>
               </w:rPr>
-              <w:t xml:space="preserve">Interpreta, con carácter vinculante, el sentido y el alcance de las normas en materia aduanera, conforme al artículo 453 del ROF.</w:t>
+              <w:t>Interpreta, con carácter vinculante, el sentido y el alcance de las normas en materia aduanera, conforme al artículo 453 del ROF.</w:t>
             </w:r>
           </w:p>
           <w:p>
@@ -7604,7 +7991,7 @@
                 <w:b w:val="0"/>
                 <w:bCs w:val="0"/>
               </w:rPr>
-              <w:t xml:space="preserve">Emite opinión legal vinculante y absuelve las consultas que le formulan las unidades de organización en las materias de su competencia, conforme a los literales c) y d) del artículo 454 del ROF.</w:t>
+              <w:t>Emite opinión legal vinculante y absuelve las consultas que le formulan las unidades de organización en las materias de su competencia, conforme a los literales c) y d) del artículo 454 del ROF.</w:t>
             </w:r>
           </w:p>
           <w:p>
@@ -7627,7 +8014,15 @@
                 <w:b w:val="0"/>
                 <w:bCs w:val="0"/>
               </w:rPr>
-              <w:t xml:space="preserve">Cuando la materia tenga incidencia tributaria, coordina con la Intendencia Nacional Jurídico Tributaria, conforme al literal c) del citado artículo.</w:t>
+              <w:t xml:space="preserve">Cuando la materia tenga incidencia tributaria, coordina con la Intendencia Nacional Jurídico </w:t>
+            </w:r>
+            <w:r>
+              <w:rPr>
+                <w:b w:val="0"/>
+                <w:bCs w:val="0"/>
+              </w:rPr>
+              <w:lastRenderedPageBreak/>
+              <w:t>Tributaria, conforme al literal c) del citado artículo.</w:t>
             </w:r>
           </w:p>
           <w:p>
@@ -7650,7 +8045,7 @@
                 <w:b w:val="0"/>
                 <w:bCs w:val="0"/>
               </w:rPr>
-              <w:t xml:space="preserve">La Comisión de Gobierno de IA la convoca conforme a los numerales 6.4.2, 6.7.8 y 6.8.3.</w:t>
+              <w:t>La Comisión de Gobierno de IA la convoca conforme a los numerales 6.4.2, 6.7.8 y 6.8.3.</w:t>
             </w:r>
           </w:p>
           <w:p>
@@ -7673,7 +8068,7 @@
                 <w:b w:val="0"/>
                 <w:bCs w:val="0"/>
               </w:rPr>
-              <w:t xml:space="preserve">La Gerencia de Arquitectura solicita su opinión conforme al numeral 6.5.8.</w:t>
+              <w:t>La Gerencia de Arquitectura solicita su opinión conforme al numeral 6.5.8.</w:t>
             </w:r>
           </w:p>
         </w:tc>
@@ -7696,6 +8091,7 @@
           <w:color w:val="000000"/>
           <w:szCs w:val="22"/>
         </w:rPr>
+        <w:lastRenderedPageBreak/>
         <w:br w:type="textWrapping" w:clear="all"/>
         <w:t>DISPOSICIONES ESPECÍFICAS</w:t>
       </w:r>
@@ -7734,6 +8130,8 @@
       </w:pPr>
       <w:r>
         <w:t>6.1</w:t>
+      </w:r>
+      <w:r>
         <w:tab/>
         <w:t>Del ciclo de vida de los SBIA</w:t>
       </w:r>
@@ -7754,6 +8152,12 @@
           <w:color w:val="000000"/>
         </w:rPr>
         <w:t>6.1.1</w:t>
+      </w:r>
+      <w:r>
+        <w:rPr>
+          <w:rFonts w:ascii="Arial" w:eastAsia="Arial" w:hAnsi="Arial" w:cs="Arial"/>
+          <w:color w:val="000000"/>
+        </w:rPr>
         <w:tab/>
       </w:r>
       <w:r>
@@ -7762,9 +8166,7 @@
           <w:color w:val="000000"/>
           <w:highlight w:val="green"/>
         </w:rPr>
-        <w:t xml:space="preserve">Todo SBIA en la SUNAT sigue un ciclo de vida gestionado, con las etapas y los hitos propios del componente de IA que se detallan a continuación. Este ciclo no sustituye ni duplica a los instrumentos institucionales que regulan la gestión de proyectos y el desarrollo de sistemas: se apoya en las conformidades que las unidades de organización competentes emiten conforme a ellos y añade </w:t>
-        <w:lastRenderedPageBreak/>
-        <w:t xml:space="preserve">únicamente lo que es propio de la inteligencia artificial. Su desarrollo metodológico se efectúa conforme al numeral 6.1.5.</w:t>
+        <w:t>Todo SBIA en la SUNAT sigue un ciclo de vida gestionado, con las etapas y los hitos propios del componente de IA que se detallan a continuación. Este ciclo no sustituye ni duplica a los instrumentos institucionales que regulan la gestión de proyectos y el desarrollo de sistemas: se apoya en las conformidades que las unidades de organización competentes emiten conforme a ellos y añade únicamente lo que es propio de la inteligencia artificial. Su desarrollo metodológico se efectúa conforme al numeral 6.1.5.</w:t>
       </w:r>
     </w:p>
     <w:tbl>
@@ -8067,7 +8469,15 @@
                 <w:rFonts w:ascii="Arial" w:eastAsia="Arial" w:hAnsi="Arial" w:cs="Arial"/>
                 <w:highlight w:val="green"/>
               </w:rPr>
-              <w:t xml:space="preserve">La etapa concluye con la presentación a la Comisión de Gobierno de IA de la Ficha de Evaluación de Caso de Uso. La Ficha se presenta suscrita por el propietario del caso de uso y con el visto bueno del titular de su unidad de organización, conforme a la Sección 6 del Anexo N.° 4. La etapa no comporta hito de aprobación: la evaluación del componente de IA y la aprobación corresponden a la etapa 2.</w:t>
+              <w:t xml:space="preserve">La etapa concluye con la presentación a la Comisión de Gobierno de IA de la Ficha de Evaluación de Caso de Uso. La Ficha se presenta suscrita por el propietario del caso de uso y con el visto bueno del titular de su unidad de organización, conforme a la Sección 6 del Anexo N.° 4. La etapa no comporta hito </w:t>
+            </w:r>
+            <w:r>
+              <w:rPr>
+                <w:rFonts w:ascii="Arial" w:eastAsia="Arial" w:hAnsi="Arial" w:cs="Arial"/>
+                <w:highlight w:val="green"/>
+              </w:rPr>
+              <w:lastRenderedPageBreak/>
+              <w:t>de aprobación: la evaluación del componente de IA y la aprobación corresponden a la etapa 2.</w:t>
             </w:r>
           </w:p>
         </w:tc>
@@ -8101,6 +8511,7 @@
               <w:rPr>
                 <w:rFonts w:ascii="Arial" w:eastAsia="Arial" w:hAnsi="Arial" w:cs="Arial"/>
               </w:rPr>
+              <w:lastRenderedPageBreak/>
               <w:t>2</w:t>
             </w:r>
           </w:p>
@@ -8304,9 +8715,7 @@
                 <w:rFonts w:ascii="Arial" w:eastAsia="Arial" w:hAnsi="Arial" w:cs="Arial"/>
                 <w:highlight w:val="green"/>
               </w:rPr>
-              <w:t xml:space="preserve">La Gerencia de Arquitectura conduce el diseño de la arquitectura del SBIA y las Divisiones de Arquitectura lo elaboran, conforme al numeral 6.5.1. Se define el mecanismo de supervisión humana, conforme al numeral 6.6. Para los SBIA de </w:t>
-              <w:lastRenderedPageBreak/>
-              <w:t>riesgo alto se elabora la EIA, conforme al numeral 6.4.</w:t>
+              <w:t>La Gerencia de Arquitectura conduce el diseño de la arquitectura del SBIA y las Divisiones de Arquitectura lo elaboran, conforme al numeral 6.5.1. Se define el mecanismo de supervisión humana, conforme al numeral 6.6. Para los SBIA de riesgo alto se elabora la EIA, conforme al numeral 6.4.</w:t>
             </w:r>
           </w:p>
         </w:tc>
@@ -8339,10 +8748,7 @@
                 <w:rFonts w:ascii="Arial" w:eastAsia="Arial" w:hAnsi="Arial" w:cs="Arial"/>
                 <w:highlight w:val="green"/>
               </w:rPr>
-              <w:lastRenderedPageBreak/>
-              <w:t xml:space="preserve">Aprobación del diseño de la arquitectura de solución por la División de Arquitectura competente según la materia, conforme al numeral 6.5.4. Para SBIA de riesgo alto, </w:t>
-              <w:lastRenderedPageBreak/>
-              <w:t>aprobación de la EIA por el CGTD, previa al inicio del desarrollo, adquisición o implementación.</w:t>
+              <w:t>Aprobación del diseño de la arquitectura de solución por la División de Arquitectura competente según la materia, conforme al numeral 6.5.4. Para SBIA de riesgo alto, aprobación de la EIA por el CGTD, previa al inicio del desarrollo, adquisición o implementación.</w:t>
             </w:r>
           </w:p>
         </w:tc>
@@ -8376,7 +8782,6 @@
               <w:rPr>
                 <w:rFonts w:ascii="Arial" w:eastAsia="Arial" w:hAnsi="Arial" w:cs="Arial"/>
               </w:rPr>
-              <w:lastRenderedPageBreak/>
               <w:t>4</w:t>
             </w:r>
           </w:p>
@@ -8444,7 +8849,15 @@
                 <w:rFonts w:ascii="Arial" w:eastAsia="Arial" w:hAnsi="Arial" w:cs="Arial"/>
                 <w:highlight w:val="green"/>
               </w:rPr>
-              <w:t>Las gerencias competentes de la INSI ejecutan el desarrollo del SBIA o gestionan su adquisición. La Oficina de Seguridad Informática evalúa y propone los requisitos de seguridad del SBIA, conforme al literal e) del artículo 106 del ROF; dichos requisitos se incorporan como requisitos no funcionales y su implementación se verifica en la etapa de certificación y validación. El mecanismo de supervisión humana definido en la etapa de diseño se implementa en esta etapa conforme al numeral 6.6.2, y es distinto de los requisitos de seguridad antes señalados; su definición corresponde al propietario del caso de uso</w:t>
+              <w:t xml:space="preserve">Las gerencias competentes de la INSI ejecutan el desarrollo del SBIA o gestionan su adquisición. La Oficina de Seguridad Informática evalúa y propone los requisitos de seguridad del SBIA, </w:t>
+            </w:r>
+            <w:r>
+              <w:rPr>
+                <w:rFonts w:ascii="Arial" w:eastAsia="Arial" w:hAnsi="Arial" w:cs="Arial"/>
+                <w:highlight w:val="green"/>
+              </w:rPr>
+              <w:lastRenderedPageBreak/>
+              <w:t>conforme al literal e) del artículo 106 del ROF; dichos requisitos se incorporan como requisitos no funcionales y su implementación se verifica en la etapa de certificación y validación. El mecanismo de supervisión humana definido en la etapa de diseño se implementa en esta etapa conforme al numeral 6.6.2, y es distinto de los requisitos de seguridad antes señalados; su definición corresponde al propietario del caso de uso</w:t>
             </w:r>
             <w:r>
               <w:rPr>
@@ -8482,7 +8895,15 @@
               <w:rPr>
                 <w:rFonts w:ascii="Arial" w:eastAsia="Arial" w:hAnsi="Arial" w:cs="Arial"/>
               </w:rPr>
-              <w:t>En desarrollo interno: Conformidad de Gerencia de Desarrollo de Sistemas (INSI). En adquisición: Conformidad de la gerencia INSI responsable.</w:t>
+              <w:lastRenderedPageBreak/>
+              <w:t xml:space="preserve">En desarrollo interno: Conformidad de Gerencia de Desarrollo de Sistemas (INSI). En adquisición: Conformidad de la </w:t>
+            </w:r>
+            <w:r>
+              <w:rPr>
+                <w:rFonts w:ascii="Arial" w:eastAsia="Arial" w:hAnsi="Arial" w:cs="Arial"/>
+              </w:rPr>
+              <w:lastRenderedPageBreak/>
+              <w:t>gerencia INSI responsable.</w:t>
             </w:r>
           </w:p>
         </w:tc>
@@ -8516,6 +8937,7 @@
               <w:rPr>
                 <w:rFonts w:ascii="Arial" w:eastAsia="Arial" w:hAnsi="Arial" w:cs="Arial"/>
               </w:rPr>
+              <w:lastRenderedPageBreak/>
               <w:t>5</w:t>
             </w:r>
           </w:p>
@@ -8617,9 +9039,15 @@
                 <w:rFonts w:ascii="Arial" w:hAnsi="Arial" w:cs="Arial"/>
                 <w:highlight w:val="green"/>
               </w:rPr>
-              <w:t xml:space="preserve">La Gerencia de Calidad de Sistemas conduce el control y aseguramiento de la calidad y la División de Control de Calidad efectúa la verificación y validación de la calidad, conforme al numeral 6.10.3. La Oficina de Seguridad Informática efectúa el análisis de riesgo y las pruebas de vulnerabilidad sobre la arquitectura de aplicaciones, de </w:t>
+              <w:t xml:space="preserve">La Gerencia de Calidad de Sistemas conduce el control y aseguramiento de la calidad y la División de Control de Calidad efectúa la verificación y validación de la calidad, conforme al numeral 6.10.3. La Oficina de Seguridad Informática efectúa el análisis de riesgo y las pruebas de vulnerabilidad sobre la arquitectura de aplicaciones, de información y de infraestructura tecnológica que soporta el SBIA, incluido el red teaming para riesgo alto, y verifica la implementación de los requisitos de seguridad propuestos en la etapa anterior. El propietario del caso de </w:t>
+            </w:r>
+            <w:r>
+              <w:rPr>
+                <w:rFonts w:ascii="Arial" w:hAnsi="Arial" w:cs="Arial"/>
+                <w:highlight w:val="green"/>
+              </w:rPr>
               <w:lastRenderedPageBreak/>
-              <w:t>información y de infraestructura tecnológica que soporta el SBIA, incluido el red teaming para riesgo alto, y verifica la implementación de los requisitos de seguridad propuestos en la etapa anterior. El propietario del caso de uso verifica la implementación del mecanismo de supervisión humana conforme al numeral 6.6.2. La Comisión de Gobierno de IA verifica la implementación de los controles, del mecanismo de supervisión humana y de las medidas frente al sesgo, conforme a los numerales 6.2.5, 6.6.2 y 6.6.4. Asimismo, aprueba el plan de monitoreo del SBIA conforme al numeral 6.10.1. La aprobación requiere la conformidad de la División de Control de Calidad, de la Oficina de Seguridad Informática, del propietario del caso de uso y de la Comisión de Gobierno de IA. La titularidad de la aprobación se determina conforme al numeral 6.1.2.</w:t>
+              <w:t>uso verifica la implementación del mecanismo de supervisión humana conforme al numeral 6.6.2. La Comisión de Gobierno de IA verifica la implementación de los controles, del mecanismo de supervisión humana y de las medidas frente al sesgo, conforme a los numerales 6.2.5, 6.6.2 y 6.6.4. Asimismo, aprueba el plan de monitoreo del SBIA conforme al numeral 6.10.1. La aprobación requiere la conformidad de la División de Control de Calidad, de la Oficina de Seguridad Informática, del propietario del caso de uso y de la Comisión de Gobierno de IA. La titularidad de la aprobación se determina conforme al numeral 6.1.2.</w:t>
             </w:r>
           </w:p>
         </w:tc>
@@ -8856,7 +9284,15 @@
                 <w:rFonts w:ascii="Arial" w:eastAsia="Arial" w:hAnsi="Arial" w:cs="Arial"/>
                 <w:highlight w:val="yellow"/>
               </w:rPr>
-              <w:t>El SBIA opera bajo la supervisión humana y el monitoreo previstos en los numerales 6.6 y 6.10. Los incidentes se gestionan conforme al numeral 6.7.5.</w:t>
+              <w:t xml:space="preserve">El SBIA opera bajo la supervisión humana y el monitoreo previstos en los numerales 6.6 y 6.10. Los </w:t>
+            </w:r>
+            <w:r>
+              <w:rPr>
+                <w:rFonts w:ascii="Arial" w:eastAsia="Arial" w:hAnsi="Arial" w:cs="Arial"/>
+                <w:highlight w:val="yellow"/>
+              </w:rPr>
+              <w:lastRenderedPageBreak/>
+              <w:t>incidentes se gestionan conforme al numeral 6.7.5.</w:t>
             </w:r>
           </w:p>
         </w:tc>
@@ -8888,6 +9324,7 @@
               <w:rPr>
                 <w:rFonts w:ascii="Arial" w:eastAsia="Arial" w:hAnsi="Arial" w:cs="Arial"/>
               </w:rPr>
+              <w:lastRenderedPageBreak/>
               <w:t>Revisiones periódicas según nivel de riesgo.</w:t>
             </w:r>
           </w:p>
@@ -8989,9 +9426,7 @@
                 <w:rFonts w:ascii="Arial" w:eastAsia="Arial" w:hAnsi="Arial" w:cs="Arial"/>
                 <w:highlight w:val="yellow"/>
               </w:rPr>
-              <w:t xml:space="preserve">Retiro del SBIA asegurando la preservación de los registros y la continuidad del servicio. Se </w:t>
-              <w:lastRenderedPageBreak/>
-              <w:t>actualiza el Inventario Institucional de SBIA.</w:t>
+              <w:t>Retiro del SBIA asegurando la preservación de los registros y la continuidad del servicio. Se actualiza el Inventario Institucional de SBIA.</w:t>
             </w:r>
           </w:p>
         </w:tc>
@@ -9024,10 +9459,7 @@
                 <w:rFonts w:ascii="Arial" w:eastAsia="Arial" w:hAnsi="Arial" w:cs="Arial"/>
                 <w:highlight w:val="yellow"/>
               </w:rPr>
-              <w:lastRenderedPageBreak/>
-              <w:t xml:space="preserve">Aprobación conforme al numeral 6.1.2. Actualización del </w:t>
-              <w:lastRenderedPageBreak/>
-              <w:t>Inventario Institucional de SBIA.</w:t>
+              <w:t>Aprobación conforme al numeral 6.1.2. Actualización del Inventario Institucional de SBIA.</w:t>
             </w:r>
           </w:p>
         </w:tc>
@@ -9060,6 +9492,13 @@
           <w:highlight w:val="green"/>
         </w:rPr>
         <w:t>6.1.2</w:t>
+      </w:r>
+      <w:r>
+        <w:rPr>
+          <w:rFonts w:ascii="Arial" w:hAnsi="Arial" w:cs="Arial"/>
+          <w:color w:val="000000"/>
+          <w:highlight w:val="green"/>
+        </w:rPr>
         <w:tab/>
         <w:t>Los hitos de aprobación previstos en el numeral 6.1.1 son de carácter técnico. Recaen sobre el componente de IA y sobre su tránsito entre las etapas del ciclo de vida, y no constituyen aprobación de la iniciativa, del proyecto ni de la inversión, las cuales se rigen por los instrumentos de gestión institucionales y por las instancias competentes conforme al ROF. Dichos hitos corresponden al CGTD en los SBIA de riesgo alto y en los estratégicos para la entidad, y a la Comisión de Gobierno de IA en los SBIA de riesgo aceptable.</w:t>
       </w:r>
@@ -9072,7 +9511,7 @@
           <w:color w:val="000000"/>
           <w:highlight w:val="green"/>
         </w:rPr>
-        <w:t xml:space="preserve">Esta regla no alcanza a la aprobación del caso de uso y de su clasificación de riesgo, prevista en la etapa 2 del numeral 6.1.1, que corresponde al CGTD en todos los casos conforme al numeral 6.2.2. La Comisión informa al CGTD de las aprobaciones que otorga. En los SBIA de riesgo alto, todas las etapas e hitos son obligatorios. En los SBIA de riesgo aceptable, la Comisión de Gobierno de IA puede aprobar un ciclo de vida simplificado y documentado, proporcional a la naturaleza y a la magnitud del SBIA.</w:t>
+        <w:t>Esta regla no alcanza a la aprobación del caso de uso y de su clasificación de riesgo, prevista en la etapa 2 del numeral 6.1.1, que corresponde al CGTD en todos los casos conforme al numeral 6.2.2. La Comisión informa al CGTD de las aprobaciones que otorga. En los SBIA de riesgo alto, todas las etapas e hitos son obligatorios. En los SBIA de riesgo aceptable, la Comisión de Gobierno de IA puede aprobar un ciclo de vida simplificado y documentado, proporcional a la naturaleza y a la magnitud del SBIA.</w:t>
       </w:r>
     </w:p>
     <w:p>
@@ -9092,6 +9531,13 @@
           <w:highlight w:val="yellow"/>
         </w:rPr>
         <w:t>6.1.3</w:t>
+      </w:r>
+      <w:r>
+        <w:rPr>
+          <w:rFonts w:ascii="Arial" w:eastAsia="Arial" w:hAnsi="Arial" w:cs="Arial"/>
+          <w:color w:val="000000"/>
+          <w:highlight w:val="yellow"/>
+        </w:rPr>
         <w:tab/>
       </w:r>
       <w:r>
@@ -9100,7 +9546,7 @@
           <w:color w:val="000000"/>
           <w:highlight w:val="green"/>
         </w:rPr>
-        <w:t xml:space="preserve">Los SBIA SaaS (enfoque A) siguen un ciclo de vida abreviado, que comprende cuando menos: el registro en el Inventario Institucional de SBIA, la clasificación de riesgo conforme al numeral 6.2 y las verificaciones previstas en el numeral 6.12.3.</w:t>
+        <w:t>Los SBIA SaaS (enfoque A) siguen un ciclo de vida abreviado, que comprende cuando menos: el registro en el Inventario Institucional de SBIA, la clasificación de riesgo conforme al numeral 6.2 y las verificaciones previstas en el numeral 6.12.3.</w:t>
       </w:r>
       <w:r>
         <w:t xml:space="preserve"> </w:t>
@@ -9131,8 +9577,24 @@
           <w:highlight w:val="green"/>
         </w:rPr>
         <w:t>6.1.4</w:t>
+      </w:r>
+      <w:r>
+        <w:rPr>
+          <w:rFonts w:ascii="Arial" w:eastAsia="Arial" w:hAnsi="Arial" w:cs="Arial"/>
+          <w:color w:val="000000"/>
+          <w:highlight w:val="green"/>
+        </w:rPr>
         <w:tab/>
-        <w:t xml:space="preserve">El pronunciamiento de la Comisión de Gobierno de IA en los hitos del ciclo de vida recae sobre el componente de IA, conforme al numeral 6.15.1. Cuando la Ficha de Evaluación de Caso de Uso (Anexo N.° 4) no contiene la información necesaria para pronunciarse, la Comisión acompaña al propietario del caso de uso a completarla y se pronuncia una vez que la recibe. La falta de información no es causal de pronunciamiento no favorable. La Comisión otorga al propietario del caso de uso un plazo para completarla. Vencido el plazo sin que la información se complete, la Comisión eleva el caso al CGTD para que disponga lo que corresponda. El pronunciamiento no favorable se fundamenta por escrito y se eleva al CGTD. Cuando invoca el uso indebido o una contravención normativa, el CGTD verifica la causal y, si concurre, deja constancia en acta de que el caso de uso no procede. Cuando invoca que el resultado esperado se alcanza sin inteligencia artificial, el CGTD resuelve en acta si el caso de uso continúa con el componente de IA o sin él.</w:t>
+        <w:t xml:space="preserve">El pronunciamiento de la Comisión de Gobierno de IA en los hitos del ciclo de vida recae sobre el componente de IA, conforme al numeral 6.15.1. Cuando la Ficha de Evaluación de Caso de Uso (Anexo N.° 4) no contiene la información necesaria para pronunciarse, la Comisión acompaña al propietario del caso de uso a completarla y se pronuncia una vez que la recibe. La falta de información no es causal de pronunciamiento no favorable. La Comisión otorga al propietario del caso de uso un plazo para completarla. Vencido el plazo sin que la información se complete, la Comisión eleva el caso al CGTD para que disponga lo que corresponda. El pronunciamiento no favorable se fundamenta por escrito y se eleva al CGTD. Cuando invoca el uso indebido o una </w:t>
+      </w:r>
+      <w:r>
+        <w:rPr>
+          <w:rFonts w:ascii="Arial" w:eastAsia="Arial" w:hAnsi="Arial" w:cs="Arial"/>
+          <w:color w:val="000000"/>
+          <w:highlight w:val="green"/>
+        </w:rPr>
+        <w:lastRenderedPageBreak/>
+        <w:t>contravención normativa, el CGTD verifica la causal y, si concurre, deja constancia en acta de que el caso de uso no procede. Cuando invoca que el resultado esperado se alcanza sin inteligencia artificial, el CGTD resuelve en acta si el caso de uso continúa con el componente de IA o sin él.</w:t>
       </w:r>
     </w:p>
     <w:p>
@@ -9152,6 +9614,13 @@
           <w:highlight w:val="lightGray"/>
         </w:rPr>
         <w:t>6.1.5</w:t>
+      </w:r>
+      <w:r>
+        <w:rPr>
+          <w:rFonts w:ascii="Arial" w:hAnsi="Arial" w:cs="Arial"/>
+          <w:color w:val="000000"/>
+          <w:highlight w:val="lightGray"/>
+        </w:rPr>
         <w:tab/>
         <w:t xml:space="preserve">La INSI desarrolla y aprueba, conforme a sus competencias, a la METDONI y al numeral 7.6, la metodología del ciclo de vida del SBIA previsto en el numeral 6.1.1. </w:t>
       </w:r>
@@ -9161,9 +9630,7 @@
           <w:color w:val="000000"/>
           <w:highlight w:val="green"/>
         </w:rPr>
-        <w:t xml:space="preserve">Por comprender actuaciones a cargo de unidades de organización distintas de la INSI, su formulación recoge los aportes de dichas unidades y de la Comisión de Gobierno de IA, que la INSI solicita. El proyecto se somete a la validación de la Comisión de Gobierno de IA. Ambas actuaciones se efectúan conforme a la presente directiva y observan lo previsto en los numerales 6.4 y 6.5 de la METDONI. La aprobación corresponde a la INSI conforme al literal j) del artículo 102 del ROF; cuando la Comisión de Gobierno de IA mantenga observaciones no </w:t>
-        <w:lastRenderedPageBreak/>
-        <w:t xml:space="preserve">acogidas, estas se elevan al CGTD, que se pronuncia con anterioridad a la aprobación. </w:t>
+        <w:t xml:space="preserve">Por comprender actuaciones a cargo de unidades de organización distintas de la INSI, su formulación recoge los aportes de dichas unidades y de la Comisión de Gobierno de IA, que la INSI solicita. El proyecto se somete a la validación de la Comisión de Gobierno de IA. Ambas actuaciones se efectúan conforme a la presente directiva y observan lo previsto en los numerales 6.4 y 6.5 de la METDONI. La aprobación corresponde a la INSI conforme al literal j) del artículo 102 del ROF; cuando la Comisión de Gobierno de IA mantenga observaciones no acogidas, estas se elevan al CGTD, que se pronuncia con anterioridad a la aprobación. </w:t>
       </w:r>
       <w:r>
         <w:rPr>
@@ -9171,7 +9638,7 @@
           <w:color w:val="000000"/>
           <w:highlight w:val="lightGray"/>
         </w:rPr>
-        <w:t xml:space="preserve">La metodología comprende, como mínimo: la aplicación de la clasificación de riesgo y de la evaluación de impacto algorítmico, los criterios técnicos de diseño de la arquitectura de los SBIA, el contenido de los entregables de cada etapa, los tipos y las técnicas de prueba aplicables según el nivel de riesgo, los controles de contención, las prácticas de monitoreo, la gestión de los cambios sobre los SBIA en operación, incluidos los criterios de calificación del cambio significativo y el alcance de la revalidación aplicable,</w:t>
+        <w:t>La metodología comprende, como mínimo: la aplicación de la clasificación de riesgo y de la evaluación de impacto algorítmico, los criterios técnicos de diseño de la arquitectura de los SBIA, el contenido de los entregables de cada etapa, los tipos y las técnicas de prueba aplicables según el nivel de riesgo, los controles de contención, las prácticas de monitoreo, la gestión de los cambios sobre los SBIA en operación, incluidos los criterios de calificación del cambio significativo y el alcance de la revalidación aplicable,</w:t>
       </w:r>
       <w:r>
         <w:t xml:space="preserve"> </w:t>
@@ -9201,7 +9668,7 @@
           <w:color w:val="000000"/>
           <w:highlight w:val="green"/>
         </w:rPr>
-        <w:t xml:space="preserve">6.1.6  Todo SBIA cuenta con un equipo técnico multidisciplinario, conformado en función de la necesidad y la complejidad de la materia o del problema público que atiende, conforme al numeral 28.3 del artículo 28 del RLIA. El propietario del caso de uso y el custodio técnico lo conforman previamente al inicio del desarrollo o adquisición, y lo integran, cuando menos, con las unidades de organización cuya competencia comprenda las materias que el SBIA involucra. Su composición se registra en la Ficha de Registro de SBIA (Anexo N.° 1).</w:t>
+        <w:t>6.1.6  Todo SBIA cuenta con un equipo técnico multidisciplinario, conformado en función de la necesidad y la complejidad de la materia o del problema público que atiende, conforme al numeral 28.3 del artículo 28 del RLIA. El propietario del caso de uso y el custodio técnico lo conforman previamente al inicio del desarrollo o adquisición, y lo integran, cuando menos, con las unidades de organización cuya competencia comprenda las materias que el SBIA involucra. Su composición se registra en la Ficha de Registro de SBIA (Anexo N.° 1).</w:t>
       </w:r>
     </w:p>
     <w:p>
@@ -9212,6 +9679,8 @@
       </w:pPr>
       <w:r>
         <w:t>6.2</w:t>
+      </w:r>
+      <w:r>
         <w:tab/>
         <w:t>De la clasificación de los SBIA por nivel de riesgo</w:t>
       </w:r>
@@ -9233,6 +9702,13 @@
           <w:highlight w:val="cyan"/>
         </w:rPr>
         <w:t>6.2.1</w:t>
+      </w:r>
+      <w:r>
+        <w:rPr>
+          <w:rFonts w:ascii="Arial" w:hAnsi="Arial" w:cs="Arial"/>
+          <w:color w:val="000000"/>
+          <w:highlight w:val="cyan"/>
+        </w:rPr>
         <w:tab/>
         <w:t xml:space="preserve">La clasificación de riesgo determina, para cada iniciativa o SBIA de la SUNAT, la categoría de riesgo que genera su uso conforme al RLIA: uso indebido (artículo 23), riesgo alto (artículo 24) o riesgo aceptable (numeral 22.2 del artículo 22). El uso indebido deviene en prohibido; por ello, la SUNAT no desarrolla, adquiere, implementa ni opera SBIA cuyo uso sea indebido, y la clasificación los identifica y excluye en la etapa de evaluación de viabilidad, con anterioridad a su desarrollo o adquisición. </w:t>
       </w:r>
@@ -9261,7 +9737,15 @@
           <w:color w:val="000000"/>
           <w:highlight w:val="green"/>
         </w:rPr>
+        <w:lastRenderedPageBreak/>
         <w:t>6.2.2</w:t>
+      </w:r>
+      <w:r>
+        <w:rPr>
+          <w:rFonts w:ascii="Arial" w:eastAsia="Arial" w:hAnsi="Arial" w:cs="Arial"/>
+          <w:color w:val="000000"/>
+          <w:highlight w:val="green"/>
+        </w:rPr>
         <w:tab/>
       </w:r>
       <w:r>
@@ -9269,9 +9753,7 @@
           <w:rFonts w:ascii="Arial" w:eastAsia="Arial" w:hAnsi="Arial" w:cs="Arial"/>
           <w:highlight w:val="green"/>
         </w:rPr>
-        <w:t xml:space="preserve">Para la aplicación de la clasificación establecida, la Comisión de Gobierno de IA propone la clasificación de riesgo de las iniciativas que se presentan. La opinión de la OII, en materia de ética, integridad y prevención de sesgos, y la de la INALI, en materia de cumplimiento normativo, constan de manera expresa en la propuesta. La aprobación de la clasificación de riesgo corresponde al CGTD en todos los casos. En los SBIA de riesgo alto y en los estratégicos para la entidad, el CGTD aprueba la clasificación mediante pronunciamiento individual. En los SBIA de riesgo aceptable, el CGTD aprueba la clasificación de manera agregada, sobre la relación que la Comisión de Gobierno de IA eleva a cada sesión ordinaria, sin perjuicio de que cualquiera de sus miembros solicite el tratamiento individual de una iniciativa determinada. En tanto el CGTD no apruebe la clasificación agregada, la propuesta de la Comisión de Gobierno de IA habilita la continuación del ciclo de vida, salvo el despliegue, que requiere la clasificación aprobada. Durante ese periodo, las disposiciones que exigen el nivel de riesgo se aplican sobre la clasificación propuesta. Si el CGTD modifica la clasificación al aprobarla, el propietario del caso de uso y el custodio técnico ajustan los requisitos, los controles y el mecanismo de supervisión humana antes del despliegue. La clasificación es parte de la </w:t>
-        <w:lastRenderedPageBreak/>
-        <w:t xml:space="preserve">evaluación de viabilidad de acuerdo al ciclo de vida descrito en el numeral 6.1.1. La clasificación aplica los criterios complementarios de la Matriz de Clasificación de Riesgos de IA (Anexo N.° 2); el detalle de su aplicación se desarrolla en la metodología prevista en el numeral 6.1.5.</w:t>
+        <w:t>Para la aplicación de la clasificación establecida, la Comisión de Gobierno de IA propone la clasificación de riesgo de las iniciativas que se presentan. La opinión de la OII, en materia de ética, integridad y prevención de sesgos, y la de la INALI, en materia de cumplimiento normativo, constan de manera expresa en la propuesta. La aprobación de la clasificación de riesgo corresponde al CGTD en todos los casos. En los SBIA de riesgo alto y en los estratégicos para la entidad, el CGTD aprueba la clasificación mediante pronunciamiento individual. En los SBIA de riesgo aceptable, el CGTD aprueba la clasificación de manera agregada, sobre la relación que la Comisión de Gobierno de IA eleva a cada sesión ordinaria, sin perjuicio de que cualquiera de sus miembros solicite el tratamiento individual de una iniciativa determinada. En tanto el CGTD no apruebe la clasificación agregada, la propuesta de la Comisión de Gobierno de IA habilita la continuación del ciclo de vida, salvo el despliegue, que requiere la clasificación aprobada. Durante ese periodo, las disposiciones que exigen el nivel de riesgo se aplican sobre la clasificación propuesta. Si el CGTD modifica la clasificación al aprobarla, el propietario del caso de uso y el custodio técnico ajustan los requisitos, los controles y el mecanismo de supervisión humana antes del despliegue. La clasificación es parte de la evaluación de viabilidad de acuerdo al ciclo de vida descrito en el numeral 6.1.1. La clasificación aplica los criterios complementarios de la Matriz de Clasificación de Riesgos de IA (Anexo N.° 2); el detalle de su aplicación se desarrolla en la metodología prevista en el numeral 6.1.5.</w:t>
       </w:r>
     </w:p>
     <w:p>
@@ -9291,6 +9773,13 @@
           <w:highlight w:val="yellow"/>
         </w:rPr>
         <w:t>6.2.3</w:t>
+      </w:r>
+      <w:r>
+        <w:rPr>
+          <w:rFonts w:ascii="Arial" w:eastAsia="Arial" w:hAnsi="Arial" w:cs="Arial"/>
+          <w:color w:val="000000"/>
+          <w:highlight w:val="yellow"/>
+        </w:rPr>
         <w:tab/>
         <w:t xml:space="preserve">La SUNAT prohíbe el desarrollo, adquisición, implementación u operación de SBIA clasificados como de </w:t>
       </w:r>
@@ -9327,6 +9816,12 @@
           <w:color w:val="000000"/>
         </w:rPr>
         <w:t>6.2.4</w:t>
+      </w:r>
+      <w:r>
+        <w:rPr>
+          <w:rFonts w:ascii="Arial" w:eastAsia="Arial" w:hAnsi="Arial" w:cs="Arial"/>
+          <w:color w:val="000000"/>
+        </w:rPr>
         <w:tab/>
       </w:r>
       <w:r>
@@ -9335,7 +9830,7 @@
           <w:color w:val="000000"/>
           <w:highlight w:val="green"/>
         </w:rPr>
-        <w:t xml:space="preserve">La prohibición del uso indebido se asegura mediante la clasificación de riesgo previa y obligatoria, el pronunciamiento no favorable de la Comisión de Gobierno de IA conforme al numeral 6.15.1 y el registro obligatorio en el Inventario Institucional de SBIA.</w:t>
+        <w:t>La prohibición del uso indebido se asegura mediante la clasificación de riesgo previa y obligatoria, el pronunciamiento no favorable de la Comisión de Gobierno de IA conforme al numeral 6.15.1 y el registro obligatorio en el Inventario Institucional de SBIA.</w:t>
       </w:r>
       <w:r>
         <w:rPr>
@@ -9370,8 +9865,15 @@
           <w:highlight w:val="green"/>
         </w:rPr>
         <w:t>6.2.5</w:t>
+      </w:r>
+      <w:r>
+        <w:rPr>
+          <w:rFonts w:ascii="Arial" w:eastAsia="Arial" w:hAnsi="Arial" w:cs="Arial"/>
+          <w:color w:val="000000"/>
+          <w:highlight w:val="green"/>
+        </w:rPr>
         <w:tab/>
-        <w:t xml:space="preserve">Los controles aplicables a un SBIA se determinan a partir de su clasificación de riesgo y de los criterios que la presente directiva establece según la naturaleza del SBIA, en particular en los numerales 6.5, 6.6, 6.7, 6.9 y 6.10. Los controles no se proponen ni se negocian. El propietario del caso de uso, con la asistencia técnica de la Comisión de Gobierno de IA, define cómo se implementan en el SBIA. La Comisión de Gobierno de IA verifica su implementación en la etapa 5 del numeral 6.1.1, con anterioridad al despliegue.</w:t>
+        <w:t>Los controles aplicables a un SBIA se determinan a partir de su clasificación de riesgo y de los criterios que la presente directiva establece según la naturaleza del SBIA, en particular en los numerales 6.5, 6.6, 6.7, 6.9 y 6.10. Los controles no se proponen ni se negocian. El propietario del caso de uso, con la asistencia técnica de la Comisión de Gobierno de IA, define cómo se implementan en el SBIA. La Comisión de Gobierno de IA verifica su implementación en la etapa 5 del numeral 6.1.1, con anterioridad al despliegue.</w:t>
       </w:r>
     </w:p>
     <w:p>
@@ -9390,9 +9892,17 @@
           <w:color w:val="000000"/>
           <w:highlight w:val="green"/>
         </w:rPr>
+        <w:lastRenderedPageBreak/>
         <w:t>6.2.6</w:t>
+      </w:r>
+      <w:r>
+        <w:rPr>
+          <w:rFonts w:ascii="Arial" w:eastAsia="Arial" w:hAnsi="Arial" w:cs="Arial"/>
+          <w:color w:val="000000"/>
+          <w:highlight w:val="green"/>
+        </w:rPr>
         <w:tab/>
-        <w:t xml:space="preserve">Cuando se determine que un SBIA en operación corresponde a la categoría de uso indebido, el propietario del caso de uso dispone su suspensión inmediata y comunica el hecho a la Comisión de Gobierno de IA. La Comisión eleva el caso al CGTD, que verifica la causal conforme al numeral 6.1.4 y deja constancia en acta. Verificada la causal, el SBIA se retira conforme a la etapa 8 del numeral 6.1.1. La suspensión, su fecha y el acuerdo del CGTD constan en el Inventario Institucional de SBIA.</w:t>
+        <w:t>Cuando se determine que un SBIA en operación corresponde a la categoría de uso indebido, el propietario del caso de uso dispone su suspensión inmediata y comunica el hecho a la Comisión de Gobierno de IA. La Comisión eleva el caso al CGTD, que verifica la causal conforme al numeral 6.1.4 y deja constancia en acta. Verificada la causal, el SBIA se retira conforme a la etapa 8 del numeral 6.1.1. La suspensión, su fecha y el acuerdo del CGTD constan en el Inventario Institucional de SBIA.</w:t>
       </w:r>
     </w:p>
     <w:p>
@@ -9403,6 +9913,8 @@
       </w:pPr>
       <w:r>
         <w:t>6.3</w:t>
+      </w:r>
+      <w:r>
         <w:tab/>
         <w:t>Del Inventario Institucional de SBIA</w:t>
       </w:r>
@@ -9423,6 +9935,12 @@
           <w:color w:val="000000"/>
         </w:rPr>
         <w:t>6.3.1</w:t>
+      </w:r>
+      <w:r>
+        <w:rPr>
+          <w:rFonts w:ascii="Arial" w:eastAsia="Arial" w:hAnsi="Arial" w:cs="Arial"/>
+          <w:color w:val="000000"/>
+        </w:rPr>
         <w:tab/>
         <w:t>La Comisión de Gobierno de IA administra el Inventario Institucional de SBIA, donde registra todos los SBIA de la SUNAT. El registro es obligatorio y previo al inicio del desarrollo o adquisición. El Anexo N.° 1 define los campos mínimos.</w:t>
       </w:r>
@@ -9443,6 +9961,12 @@
           <w:color w:val="000000"/>
         </w:rPr>
         <w:t>6.3.2</w:t>
+      </w:r>
+      <w:r>
+        <w:rPr>
+          <w:rFonts w:ascii="Arial" w:eastAsia="Arial" w:hAnsi="Arial" w:cs="Arial"/>
+          <w:color w:val="000000"/>
+        </w:rPr>
         <w:tab/>
         <w:t>La Comisión de Gobierno de IA actualiza el Inventario permanentemente y lo revisa integralmente al menos una vez al año.</w:t>
       </w:r>
@@ -9455,6 +9979,8 @@
       </w:pPr>
       <w:r>
         <w:t>6.4</w:t>
+      </w:r>
+      <w:r>
         <w:tab/>
         <w:t>De la evaluación de impacto algorítmico</w:t>
       </w:r>
@@ -9476,6 +10002,13 @@
           <w:highlight w:val="green"/>
         </w:rPr>
         <w:t>6.4.1</w:t>
+      </w:r>
+      <w:r>
+        <w:rPr>
+          <w:rFonts w:ascii="Arial" w:eastAsia="Arial" w:hAnsi="Arial" w:cs="Arial"/>
+          <w:color w:val="000000"/>
+          <w:highlight w:val="green"/>
+        </w:rPr>
         <w:tab/>
         <w:t xml:space="preserve">Todo SBIA de riesgo alto debe contar con una EIA aprobada por el CGTD previamente al inicio de su desarrollo, adquisición o implementación, conforme al artículo 30 del RLIA. </w:t>
       </w:r>
@@ -9505,10 +10038,15 @@
           <w:highlight w:val="green"/>
         </w:rPr>
         <w:t>6.4.2</w:t>
+      </w:r>
+      <w:r>
+        <w:rPr>
+          <w:rFonts w:ascii="Arial" w:hAnsi="Arial" w:cs="Arial"/>
+          <w:color w:val="000000"/>
+          <w:highlight w:val="green"/>
+        </w:rPr>
         <w:tab/>
-        <w:t xml:space="preserve">El propietario del caso de uso elabora la EIA con la participación del equipo técnico multidisciplinario del SBIA previsto en el numeral 6.1.6. La EIA incorpora los aspectos de negocio (en particular el impacto en el administrado) y los aspectos técnicos. La Comisión de Gobierno de IA, la OII, la INALI y el OGD la </w:t>
-        <w:lastRenderedPageBreak/>
-        <w:t>revisan. Cuando la materia comprenda el sentido y el alcance de las normas tributarias o aduaneras, la Comisión de Gobierno de IA convoca a la Intendencia Nacional Jurídico Tributaria o a la Intendencia Nacional Jurídico Aduanera. Concluidas las revisiones, la Comisión de Gobierno de IA eleva la EIA al CGTD para su aprobación conforme al numeral 6.4.1.</w:t>
+        <w:t>El propietario del caso de uso elabora la EIA con la participación del equipo técnico multidisciplinario del SBIA previsto en el numeral 6.1.6. La EIA incorpora los aspectos de negocio (en particular el impacto en el administrado) y los aspectos técnicos. La Comisión de Gobierno de IA, la OII, la INALI y el OGD la revisan. Cuando la materia comprenda el sentido y el alcance de las normas tributarias o aduaneras, la Comisión de Gobierno de IA convoca a la Intendencia Nacional Jurídico Tributaria o a la Intendencia Nacional Jurídico Aduanera. Concluidas las revisiones, la Comisión de Gobierno de IA eleva la EIA al CGTD para su aprobación conforme al numeral 6.4.1.</w:t>
       </w:r>
     </w:p>
     <w:p>
@@ -9528,6 +10066,13 @@
           <w:highlight w:val="green"/>
         </w:rPr>
         <w:t>6.4.3</w:t>
+      </w:r>
+      <w:r>
+        <w:rPr>
+          <w:rFonts w:ascii="Arial" w:eastAsia="Arial" w:hAnsi="Arial" w:cs="Arial"/>
+          <w:color w:val="000000"/>
+          <w:highlight w:val="green"/>
+        </w:rPr>
         <w:tab/>
         <w:t>La Comisión de Gobierno de IA coordina la actualización de la EIA cuando se produzca un cambio significativo conforme al numeral 6.10.5. La EIA actualizada se revisa y se aprueba conforme al numeral 6.4.2, y su aprobación corresponde al CGTD conforme al numeral 6.4.1.</w:t>
       </w:r>
@@ -9549,6 +10094,13 @@
           <w:highlight w:val="yellow"/>
         </w:rPr>
         <w:t>6.4.4</w:t>
+      </w:r>
+      <w:r>
+        <w:rPr>
+          <w:rFonts w:ascii="Arial" w:eastAsia="Arial" w:hAnsi="Arial" w:cs="Arial"/>
+          <w:color w:val="000000"/>
+          <w:highlight w:val="yellow"/>
+        </w:rPr>
         <w:tab/>
         <w:t>Cuando la EIA detecte riesgos que afecten los derechos fundamentales o puedan generar decisiones automatizadas erróneas, el propietario del caso de uso y el equipo técnico del SBIA adoptan las medidas necesarias para mitigar los impactos y realizan los ajustes necesarios previos a la implementación final, entre ellos ajustes en los modelos, mejora en la calidad de los datos y mecanismos de supervisión humana. Dichas medidas quedan documentadas</w:t>
       </w:r>
@@ -9602,7 +10154,13 @@
         <w:rPr>
           <w:highlight w:val="yellow"/>
         </w:rPr>
+        <w:lastRenderedPageBreak/>
         <w:t>6.5</w:t>
+      </w:r>
+      <w:r>
+        <w:rPr>
+          <w:highlight w:val="yellow"/>
+        </w:rPr>
         <w:tab/>
         <w:t>De la arquitectura y el software de los SBIA</w:t>
       </w:r>
@@ -9624,6 +10182,13 @@
           <w:highlight w:val="green"/>
         </w:rPr>
         <w:t>6.5.1</w:t>
+      </w:r>
+      <w:r>
+        <w:rPr>
+          <w:rFonts w:ascii="Arial" w:eastAsia="Arial" w:hAnsi="Arial" w:cs="Arial"/>
+          <w:color w:val="000000"/>
+          <w:highlight w:val="green"/>
+        </w:rPr>
         <w:tab/>
         <w:t>La Gerencia de Arquitectura conduce el diseño de la arquitectura de los SBIA, conforme al literal a) del artículo 130 del ROF. La División de Arquitectura de Información y de Aplicaciones diseña la arquitectura de información y de aplicaciones de los SBIA, conforme a los literales a) y c) del artículo 132 del ROF; la División de Arquitectura Tecnológica diseña la arquitectura de su infraestructura tecnológica, conforme a los literales a) y c) del artículo 134 del ROF. La arquitectura de los SBIA promueve soluciones modulares y escalables y el uso de estándares abiertos que eviten la dependencia tecnológica de un único proveedor.</w:t>
       </w:r>
@@ -9645,6 +10210,13 @@
           <w:highlight w:val="green"/>
         </w:rPr>
         <w:t>6.5.2</w:t>
+      </w:r>
+      <w:r>
+        <w:rPr>
+          <w:rFonts w:ascii="Arial" w:eastAsia="Arial" w:hAnsi="Arial" w:cs="Arial"/>
+          <w:color w:val="000000"/>
+          <w:highlight w:val="green"/>
+        </w:rPr>
         <w:tab/>
         <w:t>El uso, la adquisición y la adecuación del software de los SBIA se sujetan a las disposiciones aplicables a las entidades de la Administración Pública, conforme al numeral 28.6 del artículo 28 del RLIA. Dichas disposiciones comprenden los estándares técnicos para la evaluación de software, los estándares técnicos sobre procesos del ciclo de vida del software y las evaluaciones del uso y aplicaciones del software de IA. Los estándares y documentos técnicos de arquitectura aplicables a los SBIA son los previstos en el numeral 6.5.3, y su cumplimiento se verifica en la aprobación del diseño de arquitectura de solución conforme al numeral 6.5.4.</w:t>
       </w:r>
@@ -9666,8 +10238,15 @@
           <w:highlight w:val="green"/>
         </w:rPr>
         <w:t>6.5.3</w:t>
+      </w:r>
+      <w:r>
+        <w:rPr>
+          <w:rFonts w:ascii="Arial" w:eastAsia="Arial" w:hAnsi="Arial" w:cs="Arial"/>
+          <w:color w:val="000000"/>
+          <w:highlight w:val="green"/>
+        </w:rPr>
         <w:tab/>
-        <w:t xml:space="preserve">El diseño de la arquitectura de los SBIA observa los Principios de Arquitectura de TI (AAT.PRAQ.01) y los Lineamientos de Arquitectura de TI (LAT.LIAQ.01) de la SUNAT, en sus versiones vigentes, en lo que corresponda a su naturaleza. La GA adecua dichos instrumentos y emite los estándares, modelos de referencia, patrones y demás documentos técnicos de arquitectura necesarios para incorporar los requisitos propios de los SBIA (modelos, conjuntos de datos, componentes generativos y agénticos, e infraestructura especializada), en el ámbito de su competencia y conforme a los literales a) y c) del artículo 130 del ROF. Los que establezcan obligaciones exigibles a las unidades de organización se aprueban como documento normativo institucional conforme al numeral 7.6 de la presente directiva.</w:t>
+        <w:t>El diseño de la arquitectura de los SBIA observa los Principios de Arquitectura de TI (AAT.PRAQ.01) y los Lineamientos de Arquitectura de TI (LAT.LIAQ.01) de la SUNAT, en sus versiones vigentes, en lo que corresponda a su naturaleza. La GA adecua dichos instrumentos y emite los estándares, modelos de referencia, patrones y demás documentos técnicos de arquitectura necesarios para incorporar los requisitos propios de los SBIA (modelos, conjuntos de datos, componentes generativos y agénticos, e infraestructura especializada), en el ámbito de su competencia y conforme a los literales a) y c) del artículo 130 del ROF. Los que establezcan obligaciones exigibles a las unidades de organización se aprueban como documento normativo institucional conforme al numeral 7.6 de la presente directiva.</w:t>
       </w:r>
     </w:p>
     <w:p>
@@ -9687,9 +10266,7 @@
           <w:color w:val="000000"/>
           <w:highlight w:val="green"/>
         </w:rPr>
-        <w:t xml:space="preserve">6.5.4   Todo SBIA cuenta con la aprobación del diseño de su arquitectura de solución, previa al inicio del desarrollo, la adquisición o el entrenamiento, conforme a la </w:t>
-        <w:lastRenderedPageBreak/>
-        <w:t xml:space="preserve">etapa 3 del numeral 6.1.1. Dicha aprobación corresponde a la División de Arquitectura de Información y de Aplicaciones y a la División de Arquitectura Tecnológica, cada una en el ámbito de su competencia conforme al literal a) de los artículos 132 y 134 del ROF, bajo la conducción de la Gerencia de Arquitectura. </w:t>
+        <w:t xml:space="preserve">6.5.4   Todo SBIA cuenta con la aprobación del diseño de su arquitectura de solución, previa al inicio del desarrollo, la adquisición o el entrenamiento, conforme a la etapa 3 del numeral 6.1.1. Dicha aprobación corresponde a la División de Arquitectura de Información y de Aplicaciones y a la División de Arquitectura Tecnológica, cada una en el ámbito de su competencia conforme al literal a) de los artículos 132 y 134 del ROF, bajo la conducción de la Gerencia de Arquitectura. </w:t>
       </w:r>
       <w:r>
         <w:rPr>
@@ -9718,8 +10295,24 @@
           <w:highlight w:val="green"/>
         </w:rPr>
         <w:t>6.5.5</w:t>
+      </w:r>
+      <w:r>
+        <w:rPr>
+          <w:rFonts w:ascii="Arial" w:eastAsia="Arial" w:hAnsi="Arial" w:cs="Arial"/>
+          <w:color w:val="000000"/>
+          <w:highlight w:val="green"/>
+        </w:rPr>
         <w:tab/>
-        <w:t xml:space="preserve">Los SBIA que ejecuten acciones sobre sistemas, datos o procesos con algún grado de autonomía incorporan mecanismos de autorización, restricción y registro de dichas acciones. Dichos mecanismos son proporcionales al nivel de riesgo determinado conforme al numeral 6.2.2 y al grado de autonomía asignado. El propietario del caso de uso define el alcance de las acciones autorizadas; la División de Arquitectura de Información y de Aplicaciones aprueba el diseño de dichos mecanismos, conforme al literal a) del artículo 132 del ROF, y la División de Arquitectura Tecnológica valida los componentes de infraestructura tecnológica que los soportan, conforme al literal c) del artículo 134 del ROF, cada una en el ámbito de su competencia. Ambas validaciones se efectúan en la etapa 5 del numeral 6.1.1, con anterioridad al despliegue.</w:t>
+        <w:t xml:space="preserve">Los SBIA que ejecuten acciones sobre sistemas, datos o procesos con algún grado de autonomía incorporan mecanismos de autorización, restricción y registro de dichas acciones. Dichos mecanismos son proporcionales al nivel de </w:t>
+      </w:r>
+      <w:r>
+        <w:rPr>
+          <w:rFonts w:ascii="Arial" w:eastAsia="Arial" w:hAnsi="Arial" w:cs="Arial"/>
+          <w:color w:val="000000"/>
+          <w:highlight w:val="green"/>
+        </w:rPr>
+        <w:lastRenderedPageBreak/>
+        <w:t>riesgo determinado conforme al numeral 6.2.2 y al grado de autonomía asignado. El propietario del caso de uso define el alcance de las acciones autorizadas; la División de Arquitectura de Información y de Aplicaciones aprueba el diseño de dichos mecanismos, conforme al literal a) del artículo 132 del ROF, y la División de Arquitectura Tecnológica valida los componentes de infraestructura tecnológica que los soportan, conforme al literal c) del artículo 134 del ROF, cada una en el ámbito de su competencia. Ambas validaciones se efectúan en la etapa 5 del numeral 6.1.1, con anterioridad al despliegue.</w:t>
       </w:r>
     </w:p>
     <w:p>
@@ -9798,8 +10391,15 @@
           <w:highlight w:val="green"/>
         </w:rPr>
         <w:t>6.5.7</w:t>
+      </w:r>
+      <w:r>
+        <w:rPr>
+          <w:rFonts w:ascii="Arial" w:eastAsia="Arial" w:hAnsi="Arial" w:cs="Arial"/>
+          <w:color w:val="000000"/>
+          <w:highlight w:val="green"/>
+        </w:rPr>
         <w:tab/>
-        <w:t xml:space="preserve">La publicación del código fuente de los SBIA financiados con fondos públicos, con licencia libre o abierta en la Plataforma Nacional de Software Público Peruano (PNSSP), se sujeta a la determinación previa de su publicabilidad. Esta obligación está prevista en el numeral 28.8 del artículo 28 del RLIA. Dicha determinación verifica que el código no revele información sujeta a reserva tributaria conforme al artículo 85 del TUO del Código Tributario. Verifica asimismo que no revele reglas de detección de riesgo cuya divulgación comprometa la función de control.</w:t>
+        <w:t>La publicación del código fuente de los SBIA financiados con fondos públicos, con licencia libre o abierta en la Plataforma Nacional de Software Público Peruano (PNSSP), se sujeta a la determinación previa de su publicabilidad. Esta obligación está prevista en el numeral 28.8 del artículo 28 del RLIA. Dicha determinación verifica que el código no revele información sujeta a reserva tributaria conforme al artículo 85 del TUO del Código Tributario. Verifica asimismo que no revele reglas de detección de riesgo cuya divulgación comprometa la función de control.</w:t>
       </w:r>
     </w:p>
     <w:p>
@@ -9819,8 +10419,24 @@
           <w:highlight w:val="green"/>
         </w:rPr>
         <w:t>6.5.8</w:t>
+      </w:r>
+      <w:r>
+        <w:rPr>
+          <w:rFonts w:ascii="Arial" w:eastAsia="Arial" w:hAnsi="Arial" w:cs="Arial"/>
+          <w:color w:val="000000"/>
+          <w:highlight w:val="green"/>
+        </w:rPr>
         <w:tab/>
-        <w:t xml:space="preserve">La GA conduce la determinación de publicabilidad prevista en el numeral 6.5.7. La efectúa antes de cada liberación mayor y, en todo caso, con ocasión de la revisión integral anual del Inventario Institucional de SBIA prevista en el numeral 6.3.2. La GA solicita para ello la opinión de la Oficina de Seguridad Informática y la de la INALI en materia de cumplimiento normativo. Cuando la determinación comprenda el sentido y el alcance de las normas tributarias o aduaneras, la GA solicita la opinión de la Intendencia Nacional Jurídico Tributaria o de la Intendencia Nacional Jurídico Aduanera, según la materia. La publicabilidad resulta de dichas opiniones. La determinación y su resultado constan en la Ficha de Registro de SBIA (Anexo N.° 1). Cuando el código no resulte publicable, se consigna igualmente la justificación legal de la restricción. La GDS pone a disposición el código fuente cuya publicación se haya determinado procedente, conforme a los mecanismos que establezca la Plataforma Nacional de Software Público Peruano.</w:t>
+        <w:t xml:space="preserve">La GA conduce la determinación de publicabilidad prevista en el numeral 6.5.7. La efectúa antes de cada liberación mayor y, en todo caso, con ocasión de la revisión integral anual del Inventario Institucional de SBIA prevista en el numeral 6.3.2. La GA solicita para ello la opinión de la Oficina de Seguridad Informática y la de la INALI en materia de cumplimiento normativo. Cuando la determinación comprenda el sentido y el alcance de las normas tributarias o aduaneras, la GA solicita la opinión de la Intendencia Nacional Jurídico Tributaria o de la Intendencia Nacional Jurídico Aduanera, según la materia. La publicabilidad resulta de dichas opiniones. La determinación y su resultado constan en la Ficha de Registro de SBIA (Anexo N.° 1). Cuando el código no resulte publicable, se consigna igualmente la justificación legal de la restricción. La GDS pone a disposición el código fuente cuya publicación se haya </w:t>
+      </w:r>
+      <w:r>
+        <w:rPr>
+          <w:rFonts w:ascii="Arial" w:eastAsia="Arial" w:hAnsi="Arial" w:cs="Arial"/>
+          <w:color w:val="000000"/>
+          <w:highlight w:val="green"/>
+        </w:rPr>
+        <w:lastRenderedPageBreak/>
+        <w:t>determinado procedente, conforme a los mecanismos que establezca la Plataforma Nacional de Software Público Peruano.</w:t>
       </w:r>
     </w:p>
     <w:p>
@@ -9839,7 +10455,7 @@
           <w:color w:val="000000"/>
           <w:highlight w:val="green"/>
         </w:rPr>
-        <w:t xml:space="preserve">6.5.9 Los SBIA separan las funciones basadas en inferencia, generación o razonamiento probabilístico de aquellas que requieren un resultado determinístico. Constituyen funciones determinísticas, entre otras, los cálculos que determinan obligaciones o derechos, el cómputo de plazos, la aplicación de reglas normativas y de negocio, las validaciones de cumplimiento normativo y la ejecución de transacciones sobre los sistemas institucionales. El componente de IA puede interpretar, clasificar, recomendar u orquestar dichas funciones; su ejecución corresponde a los servicios, motores de reglas o componentes institucionales diseñados para tal fin. Esta separación se sustenta en la arquitectura de solución aprobada conforme al numeral 6.5.4, y sus criterios técnicos se desarrollan conforme al numeral 6.5.3.</w:t>
+        <w:t>6.5.9 Los SBIA separan las funciones basadas en inferencia, generación o razonamiento probabilístico de aquellas que requieren un resultado determinístico. Constituyen funciones determinísticas, entre otras, los cálculos que determinan obligaciones o derechos, el cómputo de plazos, la aplicación de reglas normativas y de negocio, las validaciones de cumplimiento normativo y la ejecución de transacciones sobre los sistemas institucionales. El componente de IA puede interpretar, clasificar, recomendar u orquestar dichas funciones; su ejecución corresponde a los servicios, motores de reglas o componentes institucionales diseñados para tal fin. Esta separación se sustenta en la arquitectura de solución aprobada conforme al numeral 6.5.4, y sus criterios técnicos se desarrollan conforme al numeral 6.5.3.</w:t>
       </w:r>
     </w:p>
     <w:p>
@@ -9850,6 +10466,8 @@
       </w:pPr>
       <w:r>
         <w:t>6.6</w:t>
+      </w:r>
+      <w:r>
         <w:tab/>
         <w:t>De la supervisión humana</w:t>
       </w:r>
@@ -9871,6 +10489,13 @@
           <w:highlight w:val="green"/>
         </w:rPr>
         <w:t>6.6.1</w:t>
+      </w:r>
+      <w:r>
+        <w:rPr>
+          <w:rFonts w:ascii="Arial" w:eastAsia="Arial" w:hAnsi="Arial" w:cs="Arial"/>
+          <w:color w:val="000000"/>
+          <w:highlight w:val="green"/>
+        </w:rPr>
         <w:tab/>
         <w:t>Todo SBIA cuenta con un mecanismo de supervisión humana proporcional a su nivel de riesgo, conforme al literal h) del artículo 7 del RLIA. La modalidad de supervisión humana exigible a cada SBIA es la siguiente. Los casos de uso que se mencionan son enunciativos y no sustituyen la clasificación de riesgo prevista en el numeral 6.2.1:</w:t>
       </w:r>
@@ -9967,6 +10592,13 @@
           <w:highlight w:val="yellow"/>
         </w:rPr>
         <w:t>6.6.2</w:t>
+      </w:r>
+      <w:r>
+        <w:rPr>
+          <w:rFonts w:ascii="Arial" w:eastAsia="Arial" w:hAnsi="Arial" w:cs="Arial"/>
+          <w:color w:val="000000"/>
+          <w:highlight w:val="yellow"/>
+        </w:rPr>
         <w:tab/>
         <w:t>El propietario del caso de uso, con la asistencia técnica de la Comisión de Gobierno de IA, define el mecanismo específico de supervisión humana del SBIA. La definición se efectúa conforme a la clasificación de riesgo determinada según el numeral 6.2.2. Dicha definición se documenta en la Ficha de Registro de SBIA (Anexo N.° 1) y en la EIA cuando corresponda. El mecanismo requiere la conformidad de la Comisión de Gobierno de IA en la etapa 5 del numeral 6.1.1, con anterioridad al despliegue.</w:t>
       </w:r>
@@ -9986,7 +10618,14 @@
           <w:rFonts w:ascii="Arial" w:eastAsia="Arial" w:hAnsi="Arial" w:cs="Arial"/>
           <w:color w:val="000000"/>
         </w:rPr>
+        <w:lastRenderedPageBreak/>
         <w:t>6.6.3</w:t>
+      </w:r>
+      <w:r>
+        <w:rPr>
+          <w:rFonts w:ascii="Arial" w:eastAsia="Arial" w:hAnsi="Arial" w:cs="Arial"/>
+          <w:color w:val="000000"/>
+        </w:rPr>
         <w:tab/>
         <w:t>El propietario del caso de uso garantiza que el personal de supervisión cumple con las siguientes condiciones:</w:t>
       </w:r>
@@ -10011,7 +10650,6 @@
           <w:bCs w:val="0"/>
           <w:color w:val="000000"/>
         </w:rPr>
-        <w:lastRenderedPageBreak/>
         <w:t>Cuenta con las competencias técnicas y funcionales necesarias para evaluar los resultados del SBIA en su ámbito de aplicación.</w:t>
       </w:r>
     </w:p>
@@ -10157,6 +10795,12 @@
           <w:color w:val="000000"/>
         </w:rPr>
         <w:t>6.6.4</w:t>
+      </w:r>
+      <w:r>
+        <w:rPr>
+          <w:rFonts w:ascii="Arial" w:eastAsia="Arial" w:hAnsi="Arial" w:cs="Arial"/>
+          <w:color w:val="000000"/>
+        </w:rPr>
         <w:tab/>
         <w:t xml:space="preserve">Todo SBIA, independientemente de su nivel de riesgo, incorpora medidas proporcionales para prevenir, detectar y corregir resultados discriminatorios o sesgados que puedan afectar a los administrados, conforme al literal a) del artículo 7 del RLIA y al compromiso 6 de la </w:t>
       </w:r>
@@ -10165,7 +10809,7 @@
           <w:rFonts w:ascii="Arial" w:hAnsi="Arial" w:cs="Arial"/>
           <w:highlight w:val="green"/>
         </w:rPr>
-        <w:t xml:space="preserve">Política de IA</w:t>
+        <w:t>Política de IA</w:t>
       </w:r>
       <w:r>
         <w:rPr>
@@ -10199,6 +10843,8 @@
       </w:pPr>
       <w:r>
         <w:t>6.7</w:t>
+      </w:r>
+      <w:r>
         <w:tab/>
         <w:t>De la seguridad y privacidad en SBIA</w:t>
       </w:r>
@@ -10220,6 +10866,13 @@
           <w:highlight w:val="green"/>
         </w:rPr>
         <w:t>6.7.1</w:t>
+      </w:r>
+      <w:r>
+        <w:rPr>
+          <w:rFonts w:ascii="Arial" w:eastAsia="Arial" w:hAnsi="Arial" w:cs="Arial"/>
+          <w:color w:val="000000"/>
+          <w:highlight w:val="green"/>
+        </w:rPr>
         <w:tab/>
         <w:t>Los SBIA cumplen la Política de Seguridad de la Información (SGSI-PO-01) y el Manual de Políticas del Sistema de Gestión de Seguridad de la Información (SGSI-MA-03) de la SUNAT, en sus versiones vigentes. El Manual de Políticas es de aplicación a todos los colaboradores, al personal de modalidades formativas y a los terceros vinculados que gestionen información de la institución. Cuando un SBIA constituya un activo de información de un proceso comprendido en el alcance del Sistema de Gestión de Seguridad de la Información, le son exigibles además los demás documentos normativos y lineamientos de dicho Sistema.</w:t>
       </w:r>
@@ -10241,8 +10894,15 @@
           <w:highlight w:val="green"/>
         </w:rPr>
         <w:t>6.7.2</w:t>
+      </w:r>
+      <w:r>
+        <w:rPr>
+          <w:rFonts w:ascii="Arial" w:eastAsia="Arial" w:hAnsi="Arial" w:cs="Arial"/>
+          <w:color w:val="000000"/>
+          <w:highlight w:val="green"/>
+        </w:rPr>
         <w:tab/>
-        <w:t xml:space="preserve">Para los SBIA de riesgo alto y para los SBIA de riesgo aceptable que interactúen directamente con el administrado, incorporen componentes generativos o procesen datos personales o información sujeta a reserva tributaria, el custodio técnico implementa como mínimo:</w:t>
+        <w:t>Para los SBIA de riesgo alto y para los SBIA de riesgo aceptable que interactúen directamente con el administrado, incorporen componentes generativos o procesen datos personales o información sujeta a reserva tributaria, el custodio técnico implementa como mínimo:</w:t>
       </w:r>
     </w:p>
     <w:p>
@@ -10342,6 +11002,7 @@
           <w:color w:val="000000"/>
           <w:highlight w:val="green"/>
         </w:rPr>
+        <w:lastRenderedPageBreak/>
         <w:t>Evaluación de vulnerabilidades conforme al OWASP Top 10 para aplicaciones LLM, en la versión que determine el documento normativo del numeral 6.7.7.</w:t>
       </w:r>
     </w:p>
@@ -10411,7 +11072,7 @@
           <w:color w:val="000000"/>
           <w:highlight w:val="green"/>
         </w:rPr>
-        <w:t xml:space="preserve">Su implementación se verifica en la etapa 5 del numeral 6.1.1, conforme al numeral 6.2.5. Se registra en la Ficha de Registro de SBIA (Anexo N.° 1). Estos controles constituyen medidas de seguridad digital conforme al artículo 29 del RLIA. Se implementan aplicando la NTP-ISO/IEC 27002 y la NTP-ISO 31000 vigentes, complementadas con mejores prácticas de seguridad para IA, conforme a la Sexta Disposición Complementaria Final del RLIA.</w:t>
+        <w:t>Su implementación se verifica en la etapa 5 del numeral 6.1.1, conforme al numeral 6.2.5. Se registra en la Ficha de Registro de SBIA (Anexo N.° 1). Estos controles constituyen medidas de seguridad digital conforme al artículo 29 del RLIA. Se implementan aplicando la NTP-ISO/IEC 27002 y la NTP-ISO 31000 vigentes, complementadas con mejores prácticas de seguridad para IA, conforme a la Sexta Disposición Complementaria Final del RLIA.</w:t>
       </w:r>
     </w:p>
     <w:p>
@@ -10430,6 +11091,12 @@
           <w:color w:val="000000"/>
         </w:rPr>
         <w:t>6.7.3</w:t>
+      </w:r>
+      <w:r>
+        <w:rPr>
+          <w:rFonts w:ascii="Arial" w:eastAsia="Arial" w:hAnsi="Arial" w:cs="Arial"/>
+          <w:color w:val="000000"/>
+        </w:rPr>
         <w:tab/>
       </w:r>
       <w:r>
@@ -10458,6 +11125,13 @@
           <w:highlight w:val="yellow"/>
         </w:rPr>
         <w:t>6.7.4</w:t>
+      </w:r>
+      <w:r>
+        <w:rPr>
+          <w:rFonts w:ascii="Arial" w:eastAsia="Arial" w:hAnsi="Arial" w:cs="Arial"/>
+          <w:color w:val="000000"/>
+          <w:highlight w:val="yellow"/>
+        </w:rPr>
         <w:tab/>
         <w:t>Todo SBIA, con independencia de su nivel de riesgo, integra la privacidad desde el diseño, minimizando la cantidad de datos personales recopilados y utilizando técnicas de anonimización, conforme al literal b) del artículo 29 del RLIA y a la Ley N.° 29733. En el desarrollo, la implementación y el uso de los SBIA se cumple la normativa vigente sobre privacidad y protección de datos personales, de acuerdo con lo que establezca la Autoridad Nacional de Protección de Datos Personales del Ministerio de Justicia y Derechos Humanos, conforme al artículo 26 del RLIA. Cuando la anonimización no resulte compatible con la finalidad del SBIA, la SUNAT admite la seudonimización; su justificación se documenta en la EIA o en la Ficha de Registro de SBIA, según corresponda.</w:t>
       </w:r>
@@ -10487,6 +11161,13 @@
           <w:highlight w:val="cyan"/>
         </w:rPr>
         <w:t>6.7.5</w:t>
+      </w:r>
+      <w:r>
+        <w:rPr>
+          <w:rFonts w:ascii="Arial" w:eastAsia="Arial" w:hAnsi="Arial" w:cs="Arial"/>
+          <w:color w:val="000000"/>
+          <w:highlight w:val="cyan"/>
+        </w:rPr>
         <w:tab/>
         <w:t>La gestión de los incidentes y de las vulnerabilidades de seguridad de la información asociados a un SBIA se registra y atiende</w:t>
       </w:r>
@@ -10502,7 +11183,16 @@
           <w:color w:val="000000"/>
           <w:highlight w:val="cyan"/>
         </w:rPr>
-        <w:t xml:space="preserve"> por el Procedimiento para el registro y atención de incidentes y vulnerabilidades de seguridad de la información (A-03.5.1-PR-003). Los incidentes que se presenten durante la operación de un SBIA en producción y que no constituyan incidentes de seguridad de la información se atienden conforme al Procedimiento de Gestión de Incidentes (A-03.1.1-PR-002). Los que se detecten durante el diseño, el desarrollo o las pruebas se tratan dentro del ciclo de vida previsto en el numeral 6.1.1 y se resuelven con anterioridad al hito de la etapa en que se detectan. El custodio técnico deja constancia de su tratamiento y lo comunica a la Comisión de Gobierno de IA. Estas reglas comprenden los incidentes derivados del diseño, del desarrollo, del uso y del funcionamiento del SBIA, conforme al literal d) del artículo 29 del RLIA. </w:t>
+        <w:t xml:space="preserve"> por el Procedimiento para el registro y atención de incidentes y vulnerabilidades de seguridad de la información (A-03.5.1-PR-003). Los incidentes que se presenten durante la operación de un SBIA en producción y que no constituyan incidentes de seguridad de la información se atienden conforme al Procedimiento de Gestión de Incidentes (A-03.1.1-PR-002). Los que se detecten durante el diseño, el desarrollo o las pruebas se tratan dentro del ciclo de vida previsto en el numeral 6.1.1 y se resuelven con anterioridad al hito de la etapa en que se detectan. El custodio técnico deja constancia de su tratamiento y lo comunica a la Comisión de Gobierno de IA. Estas reglas comprenden los incidentes derivados del diseño, del desarrollo, del uso y del funcionamiento del SBIA, conforme al literal </w:t>
+      </w:r>
+      <w:r>
+        <w:rPr>
+          <w:rFonts w:ascii="Arial" w:eastAsia="Arial" w:hAnsi="Arial" w:cs="Arial"/>
+          <w:color w:val="000000"/>
+          <w:highlight w:val="cyan"/>
+        </w:rPr>
+        <w:lastRenderedPageBreak/>
+        <w:t xml:space="preserve">d) del artículo 29 del RLIA. </w:t>
       </w:r>
       <w:r>
         <w:rPr>
@@ -10521,9 +11211,7 @@
           <w:color w:val="000000"/>
           <w:highlight w:val="green"/>
         </w:rPr>
-        <w:t xml:space="preserve">La Gerencia de Operaciones y Soporte a Usuarios adecúa el Procedimiento de Gestión de Incidentes (A-03.1.1-PR-002) para comprender los incidentes propios del SBIA y su criterio de cierre, conforme al numeral 7.6 de la presente directiva. En tanto no se apruebe dicha adecuación, estos </w:t>
-        <w:lastRenderedPageBreak/>
-        <w:t>incidentes se registran por dicho procedimiento y su atención se rige por el presente numeral.</w:t>
+        <w:t>La Gerencia de Operaciones y Soporte a Usuarios adecúa el Procedimiento de Gestión de Incidentes (A-03.1.1-PR-002) para comprender los incidentes propios del SBIA y su criterio de cierre, conforme al numeral 7.6 de la presente directiva. En tanto no se apruebe dicha adecuación, estos incidentes se registran por dicho procedimiento y su atención se rige por el presente numeral.</w:t>
       </w:r>
     </w:p>
     <w:p>
@@ -10543,6 +11231,13 @@
           <w:highlight w:val="yellow"/>
         </w:rPr>
         <w:t>6.7.6</w:t>
+      </w:r>
+      <w:r>
+        <w:rPr>
+          <w:rFonts w:ascii="Arial" w:eastAsia="Arial" w:hAnsi="Arial" w:cs="Arial"/>
+          <w:color w:val="000000"/>
+          <w:highlight w:val="yellow"/>
+        </w:rPr>
         <w:tab/>
         <w:t>El Oficial de Datos Personales (ODP) asegura que en el desarrollo, la implementación y el uso de los SBIA se realice un tratamiento adecuado de los datos personales</w:t>
       </w:r>
@@ -10578,6 +11273,13 @@
           <w:highlight w:val="green"/>
         </w:rPr>
         <w:t>6.7.7</w:t>
+      </w:r>
+      <w:r>
+        <w:rPr>
+          <w:rFonts w:ascii="Arial" w:eastAsia="Arial" w:hAnsi="Arial" w:cs="Arial"/>
+          <w:color w:val="000000"/>
+          <w:highlight w:val="green"/>
+        </w:rPr>
         <w:tab/>
         <w:t xml:space="preserve">La Oficina de Seguridad Informática elabora y propone el documento normativo de seguridad informática para SBIA, que desarrolla la forma de implementar y verificar los controles del numeral 6.7.2 y la periodicidad de las pruebas de vulnerabilidad y del red teaming, conforme al artículo 106, literales a) y c), del ROF. Su aprobación se efectúa conforme al numeral 7.6. </w:t>
       </w:r>
@@ -10606,7 +11308,16 @@
           <w:color w:val="000000"/>
           <w:highlight w:val="green"/>
         </w:rPr>
-        <w:t xml:space="preserve">6.7.8  El propietario del caso de uso, con el custodio técnico del SBIA, define el tratamiento de conservación y eliminación de las instrucciones (prompt), respuestas, contextos, representaciones vectoriales (embeddings), registros de interacción y demás información que el SBIA genere o procese durante su operación. El plazo de conservación se determina en función del nivel de riesgo del SBIA, del valor probatorio de la información, de su sensibilidad y de los requisitos de auditoría aplicables, y observa la normativa institucional de gestión documental y archivo que resulte aplicable. En tanto dicha normativa no comprenda la información que el SBIA genera, el plazo se fija en el plan de monitoreo del SBIA y no puede ser inferior al exigido por la normativa tributaria y aduanera para la actuación en que el SBIA interviene. Para determinar dicho mínimo, la Comisión de Gobierno de IA convoca a la Intendencia Nacional Jurídico Tributaria o a la Intendencia Nacional Jurídico Aduanera, según la materia. La conservación, el acceso y el uso de dicha información observan la reserva tributaria conforme al artículo 85 del TUO del Código Tributario y la normativa sobre protección de datos personales. El respaldo de la infraestructura tecnológica en la que reside dicha información, así como la custodia y disponibilidad de los medios correspondientes, están a cargo de la División de Soporte y Operación de la Infraestructura Tecnológica, conforme al literal b) del artículo 138 del ROF, y observan lo dispuesto en el numeral 6.7.1.</w:t>
+        <w:t xml:space="preserve">6.7.8  El propietario del caso de uso, con el custodio técnico del SBIA, define el tratamiento de conservación y eliminación de las instrucciones (prompt), respuestas, contextos, representaciones vectoriales (embeddings), registros de interacción y demás información que el SBIA genere o procese durante su operación. El plazo de conservación se determina en función del nivel de riesgo del SBIA, del valor probatorio de la información, de su sensibilidad y de los requisitos de auditoría aplicables, y observa la normativa institucional de gestión documental y archivo que resulte aplicable. En tanto dicha normativa no comprenda la información que el SBIA genera, el plazo se fija en el plan de monitoreo del SBIA y no puede ser inferior al exigido por la normativa tributaria y aduanera para la actuación en que el SBIA interviene. Para determinar dicho mínimo, la Comisión de Gobierno de IA convoca a la Intendencia Nacional Jurídico Tributaria o a la Intendencia Nacional Jurídico Aduanera, según la materia. La conservación, el acceso y el uso de dicha información observan la </w:t>
+      </w:r>
+      <w:r>
+        <w:rPr>
+          <w:rFonts w:ascii="Arial" w:eastAsia="Arial" w:hAnsi="Arial" w:cs="Arial"/>
+          <w:color w:val="000000"/>
+          <w:highlight w:val="green"/>
+        </w:rPr>
+        <w:lastRenderedPageBreak/>
+        <w:t>reserva tributaria conforme al artículo 85 del TUO del Código Tributario y la normativa sobre protección de datos personales. El respaldo de la infraestructura tecnológica en la que reside dicha información, así como la custodia y disponibilidad de los medios correspondientes, están a cargo de la División de Soporte y Operación de la Infraestructura Tecnológica, conforme al literal b) del artículo 138 del ROF, y observan lo dispuesto en el numeral 6.7.1.</w:t>
       </w:r>
     </w:p>
     <w:p>
@@ -10617,6 +11328,8 @@
       </w:pPr>
       <w:r>
         <w:t>6.8</w:t>
+      </w:r>
+      <w:r>
         <w:tab/>
         <w:t>De los datos para los SBIA</w:t>
       </w:r>
@@ -10642,6 +11355,13 @@
           <w:highlight w:val="yellow"/>
         </w:rPr>
         <w:t>6.8.1</w:t>
+      </w:r>
+      <w:r>
+        <w:rPr>
+          <w:rFonts w:ascii="Arial" w:eastAsia="Arial" w:hAnsi="Arial" w:cs="Arial"/>
+          <w:color w:val="000000"/>
+          <w:highlight w:val="yellow"/>
+        </w:rPr>
         <w:tab/>
         <w:t>Los datos utilizados para el desarrollo, entrenamiento, validación y operación de un SBIA cuentan con procedencia documentada, base legal de uso determinada y requisitos de calidad definidos, conforme a la NTP-ISO/IEC 42001:2025</w:t>
       </w:r>
@@ -10681,6 +11401,13 @@
           <w:highlight w:val="yellow"/>
         </w:rPr>
         <w:t>6.8.2</w:t>
+      </w:r>
+      <w:r>
+        <w:rPr>
+          <w:rFonts w:ascii="Arial" w:eastAsia="Arial" w:hAnsi="Arial" w:cs="Arial"/>
+          <w:color w:val="000000"/>
+          <w:highlight w:val="yellow"/>
+        </w:rPr>
         <w:tab/>
         <w:t>El OGD promueve la calidad y el intercambio de los datos a fin de evitar sesgos y asegurar la precisión y representatividad de los datos utilizados en el entrenamiento, validación y uso de los SBIA</w:t>
       </w:r>
@@ -10733,8 +11460,14 @@
           <w:color w:val="000000"/>
           <w:highlight w:val="green"/>
         </w:rPr>
-        <w:lastRenderedPageBreak/>
         <w:t>6.8.3</w:t>
+      </w:r>
+      <w:r>
+        <w:rPr>
+          <w:rFonts w:ascii="Arial" w:eastAsia="Arial" w:hAnsi="Arial" w:cs="Arial"/>
+          <w:color w:val="000000"/>
+          <w:highlight w:val="green"/>
+        </w:rPr>
         <w:tab/>
         <w:t>El uso de datos protegidos por la reserva tributaria para el desarrollo, entrenamiento, validación u operación de un SBIA requiere la determinación previa de su base legal, conforme al artículo 85 del TUO del Código Tributario. La determinación es previa al inicio del desarrollo o adquisición y consta en la Ficha de Registro de SBIA (Anexo N.° 1). La determinación corresponde al propietario del caso de uso, y la Comisión de Gobierno de IA convoca a la Intendencia Nacional Jurídico Tributaria y, en materia aduanera, a la Intendencia Nacional Jurídico Aduanera, cuya opinión sustenta dicha determinación.</w:t>
       </w:r>
@@ -10760,6 +11493,13 @@
           <w:highlight w:val="yellow"/>
         </w:rPr>
         <w:t>6.8.4</w:t>
+      </w:r>
+      <w:r>
+        <w:rPr>
+          <w:rFonts w:ascii="Arial" w:eastAsia="Arial" w:hAnsi="Arial" w:cs="Arial"/>
+          <w:color w:val="000000"/>
+          <w:highlight w:val="yellow"/>
+        </w:rPr>
         <w:tab/>
         <w:t>No se utilizan obras protegidas por derechos de autor y derechos conexos como insumo de entrenamiento, ajuste fino o procesamiento en SBIA sin contar con la autorización correspondiente o con la base legal que lo permita</w:t>
       </w:r>
@@ -10798,7 +11538,16 @@
           <w:color w:val="000000"/>
           <w:highlight w:val="green"/>
         </w:rPr>
-        <w:t xml:space="preserve">6.8.5   Los conjuntos de datos que la SUNAT genere o administre y que califiquen como datos de alto valor se ponen a disposición a través del Centro Nacional de Datos (CND), conforme al numeral 28.7 del artículo 28 del RLIA. La calificación se efectúa conforme a los lineamientos nacionales para la identificación de Datos de Alto Valor que emita la SGTD en aplicación de la Estrategia Nacional de Gobierno de Datos; en tanto no se emitan, el OGD aplica los criterios de priorización que dicha Estrategia enuncia para la publicación obligatoria de Datos de Alto Valor: carácter estratégico, interés nacional, planificación y gestión territorial o alto impacto social. El OGD identifica anualmente los conjuntos candidatos, determina su publicabilidad y propone al CGTD su publicación. La determinación de publicabilidad aplica la reserva tributaria conforme al artículo 85 del TUO del Código Tributario, incluidas sus excepciones expresas (entre ellas la publicación de datos estadísticos de carácter global que no permita la individualización de declaraciones, informaciones, cuentas o personas), y la normativa sobre protección de datos personales. Cuando un conjunto no resulte publicable, la justificación legal de la restricción consta igualmente en el acuerdo del CGTD. Aprobada la publicación, el OGD coordina la puesta a disposición con la unidad de organización que administra el conjunto.</w:t>
+        <w:t xml:space="preserve">6.8.5   Los conjuntos de datos que la SUNAT genere o administre y que califiquen como datos de alto valor se ponen a disposición a través del Centro Nacional de Datos (CND), conforme al numeral 28.7 del artículo 28 del RLIA. La calificación se efectúa conforme a los lineamientos nacionales para la identificación de Datos de Alto Valor que emita la SGTD en aplicación de la Estrategia Nacional de Gobierno de Datos; en tanto no se emitan, el OGD aplica los criterios de priorización que dicha Estrategia enuncia para la publicación obligatoria de Datos de Alto Valor: carácter estratégico, interés nacional, planificación y gestión territorial o alto impacto social. El OGD identifica anualmente los conjuntos candidatos, determina su publicabilidad y propone al CGTD su publicación. La determinación de publicabilidad aplica la </w:t>
+      </w:r>
+      <w:r>
+        <w:rPr>
+          <w:rFonts w:ascii="Arial" w:eastAsia="Arial" w:hAnsi="Arial" w:cs="Arial"/>
+          <w:color w:val="000000"/>
+          <w:highlight w:val="green"/>
+        </w:rPr>
+        <w:lastRenderedPageBreak/>
+        <w:t>reserva tributaria conforme al artículo 85 del TUO del Código Tributario, incluidas sus excepciones expresas (entre ellas la publicación de datos estadísticos de carácter global que no permita la individualización de declaraciones, informaciones, cuentas o personas), y la normativa sobre protección de datos personales. Cuando un conjunto no resulte publicable, la justificación legal de la restricción consta igualmente en el acuerdo del CGTD. Aprobada la publicación, el OGD coordina la puesta a disposición con la unidad de organización que administra el conjunto.</w:t>
       </w:r>
     </w:p>
     <w:p>
@@ -10821,7 +11570,7 @@
           <w:color w:val="000000"/>
           <w:highlight w:val="green"/>
         </w:rPr>
-        <w:t xml:space="preserve">6.8.6   Los SBIA se construyen sobre conjuntos de datos certificados conforme a la normativa institucional de gobernanza de datos y analítica, cuando estos existan para la materia. El uso de fuentes no certificadas se justifica en la Ficha de Evaluación de Caso de Uso (Anexo N.° 4) y consta en la Ficha de Registro de SBIA (Anexo N.° 1). En tanto no exista normativa de certificación para la materia, el OGD emite opinión sobre la idoneidad de los conjuntos de datos, conforme al numeral 6.8.2.</w:t>
+        <w:t>6.8.6   Los SBIA se construyen sobre conjuntos de datos certificados conforme a la normativa institucional de gobernanza de datos y analítica, cuando estos existan para la materia. El uso de fuentes no certificadas se justifica en la Ficha de Evaluación de Caso de Uso (Anexo N.° 4) y consta en la Ficha de Registro de SBIA (Anexo N.° 1). En tanto no exista normativa de certificación para la materia, el OGD emite opinión sobre la idoneidad de los conjuntos de datos, conforme al numeral 6.8.2.</w:t>
       </w:r>
     </w:p>
     <w:p>
@@ -10857,6 +11606,8 @@
       </w:pPr>
       <w:r>
         <w:t>6.9</w:t>
+      </w:r>
+      <w:r>
         <w:tab/>
         <w:t>De la transparencia, explicabilidad y rendición de cuentas</w:t>
       </w:r>
@@ -10879,10 +11630,15 @@
           <w:highlight w:val="yellow"/>
         </w:rPr>
         <w:t>6.9.1</w:t>
+      </w:r>
+      <w:r>
+        <w:rPr>
+          <w:rFonts w:ascii="Arial" w:eastAsia="Arial" w:hAnsi="Arial" w:cs="Arial"/>
+          <w:color w:val="000000"/>
+          <w:highlight w:val="yellow"/>
+        </w:rPr>
         <w:tab/>
-        <w:t xml:space="preserve">Los SBIA de riesgo alto cuentan con mecanismos de transparencia algorítmica que informan al usuario, de forma previa, clara y sencilla, la finalidad o uso del SBIA, sus funcionalidades principales y el tipo de decisiones que puede tomar, de modo que comprenda cómo interactúa con el SBIA o con el servicio que lo </w:t>
-        <w:lastRenderedPageBreak/>
-        <w:t>emplea</w:t>
+        <w:t>Los SBIA de riesgo alto cuentan con mecanismos de transparencia algorítmica que informan al usuario, de forma previa, clara y sencilla, la finalidad o uso del SBIA, sus funcionalidades principales y el tipo de decisiones que puede tomar, de modo que comprenda cómo interactúa con el SBIA o con el servicio que lo emplea</w:t>
       </w:r>
       <w:r>
         <w:rPr>
@@ -10933,6 +11689,13 @@
           <w:highlight w:val="cyan"/>
         </w:rPr>
         <w:t>6.9.2</w:t>
+      </w:r>
+      <w:r>
+        <w:rPr>
+          <w:rFonts w:ascii="Arial" w:eastAsia="Arial" w:hAnsi="Arial" w:cs="Arial"/>
+          <w:color w:val="000000"/>
+          <w:highlight w:val="cyan"/>
+        </w:rPr>
         <w:tab/>
         <w:t>Entre los mecanismos del numeral 6.9.1 se incluye el etiquetado visible del SBIA. El etiquetado informa al usuario, con antelación, que el producto, servicio o contenido se opera con base en IA. Permite además comprender de manera general sus principales capacidades y limitaciones funcionales. El etiquetado alcanza también a todo SBIA que interactúe directamente con el administrado, cualquiera sea su nivel de riesgo.</w:t>
       </w:r>
@@ -10961,8 +11724,24 @@
           <w:highlight w:val="cyan"/>
         </w:rPr>
         <w:t>6.9.3</w:t>
+      </w:r>
+      <w:r>
+        <w:rPr>
+          <w:rFonts w:ascii="Arial" w:hAnsi="Arial" w:cs="Arial"/>
+          <w:color w:val="000000"/>
+          <w:highlight w:val="cyan"/>
+        </w:rPr>
         <w:tab/>
-        <w:t>Los SBIA de riesgo alto cuentan con mecanismos de explicabilidad que permitan comprender los factores que influyeron en un resultado. Cuando un SBIA intervenga en decisiones que impacten en derechos humanos, las personas afectadas tienen derecho a recibir la explicación de los resultados, conforme al numeral 25.3 del artículo 25 del RLIA. La explicación se proporciona mediante mecanismos que permitan comprender los criterios y factores clave utilizados, en un lenguaje accesible.</w:t>
+        <w:t xml:space="preserve">Los SBIA de riesgo alto cuentan con mecanismos de explicabilidad que permitan comprender los factores que influyeron en un resultado. Cuando un </w:t>
+      </w:r>
+      <w:r>
+        <w:rPr>
+          <w:rFonts w:ascii="Arial" w:hAnsi="Arial" w:cs="Arial"/>
+          <w:color w:val="000000"/>
+          <w:highlight w:val="cyan"/>
+        </w:rPr>
+        <w:lastRenderedPageBreak/>
+        <w:t>SBIA intervenga en decisiones que impacten en derechos humanos, las personas afectadas tienen derecho a recibir la explicación de los resultados, conforme al numeral 25.3 del artículo 25 del RLIA. La explicación se proporciona mediante mecanismos que permitan comprender los criterios y factores clave utilizados, en un lenguaje accesible.</w:t>
       </w:r>
       <w:r>
         <w:t xml:space="preserve"> </w:t>
@@ -10993,6 +11772,13 @@
           <w:highlight w:val="yellow"/>
         </w:rPr>
         <w:t>6.9.4</w:t>
+      </w:r>
+      <w:r>
+        <w:rPr>
+          <w:rFonts w:ascii="Arial" w:eastAsia="Arial" w:hAnsi="Arial" w:cs="Arial"/>
+          <w:color w:val="000000"/>
+          <w:highlight w:val="yellow"/>
+        </w:rPr>
         <w:tab/>
         <w:t>El funcionario no debe sustentar la motivación de actos administrativos exclusivamente en resultados de un SBIA. El funcionario debe incorporar su análisis y criterio profesional.</w:t>
       </w:r>
@@ -11013,7 +11799,7 @@
           <w:color w:val="000000"/>
           <w:highlight w:val="green"/>
         </w:rPr>
-        <w:t xml:space="preserve">6.9.5    La Comisión de Gobierno de IA reporta trimestralmente al CGTD el estado del Inventario Institucional de SBIA, los incidentes, los resultados del monitoreo, la verificación técnica de seguridad, el avance de la capacitación y el cumplimiento de los indicadores. El reporte comprende además el seguimiento de los encargos previsto en el numeral 7.6, el estado de las condiciones del PAIA previsto en el numeral 7.11 y el alineamiento previsto en el numeral 7.12. Dicho reporte constituye el informe trimestral de gobierno de IA. Da cuenta de la actividad de la Comisión de Gobierno de IA y no constituye avance del Plan de Gobierno Digital.</w:t>
+        <w:t>6.9.5    La Comisión de Gobierno de IA reporta trimestralmente al CGTD el estado del Inventario Institucional de SBIA, los incidentes, los resultados del monitoreo, la verificación técnica de seguridad, el avance de la capacitación y el cumplimiento de los indicadores. El reporte comprende además el seguimiento de los encargos previsto en el numeral 7.6, el estado de las condiciones del PAIA previsto en el numeral 7.11 y el alineamiento previsto en el numeral 7.12. Dicho reporte constituye el informe trimestral de gobierno de IA. Da cuenta de la actividad de la Comisión de Gobierno de IA y no constituye avance del Plan de Gobierno Digital.</w:t>
       </w:r>
     </w:p>
     <w:p>
@@ -11033,10 +11819,15 @@
           <w:highlight w:val="green"/>
         </w:rPr>
         <w:t>6.9.6</w:t>
+      </w:r>
+      <w:r>
+        <w:rPr>
+          <w:rFonts w:ascii="Arial" w:eastAsia="Arial" w:hAnsi="Arial" w:cs="Arial"/>
+          <w:color w:val="000000"/>
+          <w:highlight w:val="green"/>
+        </w:rPr>
         <w:tab/>
-        <w:t xml:space="preserve">El estado del gobierno de IA institucional se informa como sección del informe de seguimiento del Plan de Gobierno Digital que presenta el CGTD, con la </w:t>
-        <w:lastRenderedPageBreak/>
-        <w:t>periodicidad y por el conducto que dicho instrumento establece. La inclusión de los proyectos de SBIA en el Plan de Gobierno Digital se efectúa conforme al numeral 28.10 del artículo 28 del RLIA y a los numerales 7.11 y 7.12 de la presente directiva. Dicha sección sustenta la información que la SUNAT remita a la SGTD en materia de inteligencia artificial. No se genera un informe institucional adicional por esta materia.</w:t>
+        <w:t>El estado del gobierno de IA institucional se informa como sección del informe de seguimiento del Plan de Gobierno Digital que presenta el CGTD, con la periodicidad y por el conducto que dicho instrumento establece. La inclusión de los proyectos de SBIA en el Plan de Gobierno Digital se efectúa conforme al numeral 28.10 del artículo 28 del RLIA y a los numerales 7.11 y 7.12 de la presente directiva. Dicha sección sustenta la información que la SUNAT remita a la SGTD en materia de inteligencia artificial. No se genera un informe institucional adicional por esta materia.</w:t>
       </w:r>
     </w:p>
     <w:p>
@@ -11056,6 +11847,13 @@
           <w:highlight w:val="yellow"/>
         </w:rPr>
         <w:t>6.9.7</w:t>
+      </w:r>
+      <w:r>
+        <w:rPr>
+          <w:rFonts w:ascii="Arial" w:eastAsia="Arial" w:hAnsi="Arial" w:cs="Arial"/>
+          <w:color w:val="000000"/>
+          <w:highlight w:val="yellow"/>
+        </w:rPr>
         <w:tab/>
         <w:t>Los lineamientos sobre Transparencia Algorítmica que apruebe la SGTD</w:t>
       </w:r>
@@ -11081,7 +11879,10 @@
         <w:ind w:left="851"/>
       </w:pPr>
       <w:r>
+        <w:lastRenderedPageBreak/>
         <w:t>6.10</w:t>
+      </w:r>
+      <w:r>
         <w:tab/>
         <w:t>Del monitoreo, auditoría y mejora continua</w:t>
       </w:r>
@@ -11104,8 +11905,15 @@
           <w:highlight w:val="green"/>
         </w:rPr>
         <w:t>6.10.1</w:t>
+      </w:r>
+      <w:r>
+        <w:rPr>
+          <w:rFonts w:ascii="Arial" w:eastAsia="Arial" w:hAnsi="Arial" w:cs="Arial"/>
+          <w:color w:val="000000"/>
+          <w:highlight w:val="green"/>
+        </w:rPr>
         <w:tab/>
-        <w:t xml:space="preserve">Todo SBIA en operación es objeto de monitoreo. La Comisión de Gobierno de IA determina la frecuencia y la profundidad del monitoreo de cada SBIA en función de su nivel de riesgo, del impacto que un resultado erróneo produciría en el administrado o en la institución, del volumen de operaciones que procesa y del grado de autonomía con que opera. La frecuencia determinada, los indicadores aplicables conforme al numeral 6.10.2, sus umbrales determinados conforme a dicho numeral y los responsables de la medición constan en el plan de monitoreo del SBIA, que la Comisión de Gobierno de IA aprueba con anterioridad a su puesta en producción.</w:t>
+        <w:t>Todo SBIA en operación es objeto de monitoreo. La Comisión de Gobierno de IA determina la frecuencia y la profundidad del monitoreo de cada SBIA en función de su nivel de riesgo, del impacto que un resultado erróneo produciría en el administrado o en la institución, del volumen de operaciones que procesa y del grado de autonomía con que opera. La frecuencia determinada, los indicadores aplicables conforme al numeral 6.10.2, sus umbrales determinados conforme a dicho numeral y los responsables de la medición constan en el plan de monitoreo del SBIA, que la Comisión de Gobierno de IA aprueba con anterioridad a su puesta en producción.</w:t>
       </w:r>
     </w:p>
     <w:p>
@@ -11216,8 +12024,15 @@
           <w:highlight w:val="green"/>
         </w:rPr>
         <w:t>6.10.2</w:t>
+      </w:r>
+      <w:r>
+        <w:rPr>
+          <w:rFonts w:ascii="Arial" w:eastAsia="Arial" w:hAnsi="Arial" w:cs="Arial"/>
+          <w:color w:val="000000"/>
+          <w:highlight w:val="green"/>
+        </w:rPr>
         <w:tab/>
-        <w:t xml:space="preserve">La Comisión de Gobierno de IA define, para cada SBIA registrado en el Inventario, los indicadores de monitoreo que como mínimo incluyen: tasa de precisión, tasa de error, tiempo de respuesta, disponibilidad, detección de drift, indicadores de sesgo, tasa de intervención humana e indicadores de detección del uso irregular previstos en el numeral 6.10.6. Los umbrales de cada indicador, las alertas que su superación activa y las acciones de tratamiento correspondientes se definen con anterioridad a la puesta en producción del SBIA, conforme a la metodología prevista en el numeral 6.1.5. En tanto no se apruebe dicha metodología, se establecen en el plan de monitoreo que aprueba la Comisión de Gobierno de IA.</w:t>
+        <w:t>La Comisión de Gobierno de IA define, para cada SBIA registrado en el Inventario, los indicadores de monitoreo que como mínimo incluyen: tasa de precisión, tasa de error, tiempo de respuesta, disponibilidad, detección de drift, indicadores de sesgo, tasa de intervención humana e indicadores de detección del uso irregular previstos en el numeral 6.10.6. Los umbrales de cada indicador, las alertas que su superación activa y las acciones de tratamiento correspondientes se definen con anterioridad a la puesta en producción del SBIA, conforme a la metodología prevista en el numeral 6.1.5. En tanto no se apruebe dicha metodología, se establecen en el plan de monitoreo que aprueba la Comisión de Gobierno de IA.</w:t>
       </w:r>
       <w:r>
         <w:rPr>
@@ -11250,8 +12065,14 @@
           <w:color w:val="000000"/>
           <w:highlight w:val="yellow"/>
         </w:rPr>
-        <w:lastRenderedPageBreak/>
         <w:t>6.10.3</w:t>
+      </w:r>
+      <w:r>
+        <w:rPr>
+          <w:rFonts w:ascii="Arial" w:eastAsia="Arial" w:hAnsi="Arial" w:cs="Arial"/>
+          <w:color w:val="000000"/>
+          <w:highlight w:val="yellow"/>
+        </w:rPr>
         <w:tab/>
         <w:t>La Gerencia de Calidad de Sistemas conduce el control y aseguramiento de la calidad de los SBIA, conforme a sus funciones (artículos 123 y 124, literal a, del ROF). La verificación y validación de la calidad, incluida la ejecución de las pruebas funcionales y no funcionales, corresponde a la División de Control de Calidad, conforme a sus funciones (artículos 125 y 126, literal a, del ROF), y comprende además las pruebas de rendimiento y de regresión que correspondan al tipo de SBIA.</w:t>
       </w:r>
@@ -11272,7 +12093,16 @@
           <w:color w:val="000000"/>
           <w:highlight w:val="green"/>
         </w:rPr>
-        <w:t xml:space="preserve">El análisis de riesgo y las pruebas de vulnerabilidad sobre la arquitectura de aplicaciones, de información y de infraestructura tecnológica que soporta cada SBIA corresponden a la Oficina de Seguridad Informática, conforme al literal b) del artículo 106 del ROF y a la etapa de certificación y validación del numeral 6.1.1. La obligación de auditorías de seguridad digital del literal c) del artículo 29 del RLIA se satisface con la concurrencia de la verificación y validación de calidad, del análisis de riesgo, las pruebas de vulnerabilidad y el red teaming previstos en el numeral 6.7.2, con anterioridad a la implementación del SBIA y con la periodicidad que establezca el documento normativo del numeral 6.7.7, y del monitoreo del numeral 6.10, que comprende los indicadores de sesgo del numeral 6.10.2 y las medidas del numeral 6.6.4, durante toda su operación. Los resultados de estas actividades alimentan el informe trimestral de la Comisión de Gobierno de IA al CGTD.</w:t>
+        <w:t xml:space="preserve">El análisis de riesgo y las pruebas de vulnerabilidad sobre la arquitectura de aplicaciones, de información y de infraestructura tecnológica que soporta cada SBIA corresponden a la Oficina de Seguridad Informática, conforme al literal b) </w:t>
+      </w:r>
+      <w:r>
+        <w:rPr>
+          <w:rFonts w:ascii="Arial" w:eastAsia="Arial" w:hAnsi="Arial" w:cs="Arial"/>
+          <w:color w:val="000000"/>
+          <w:highlight w:val="green"/>
+        </w:rPr>
+        <w:lastRenderedPageBreak/>
+        <w:t>del artículo 106 del ROF y a la etapa de certificación y validación del numeral 6.1.1. La obligación de auditorías de seguridad digital del literal c) del artículo 29 del RLIA se satisface con la concurrencia de la verificación y validación de calidad, del análisis de riesgo, las pruebas de vulnerabilidad y el red teaming previstos en el numeral 6.7.2, con anterioridad a la implementación del SBIA y con la periodicidad que establezca el documento normativo del numeral 6.7.7, y del monitoreo del numeral 6.10, que comprende los indicadores de sesgo del numeral 6.10.2 y las medidas del numeral 6.6.4, durante toda su operación. Los resultados de estas actividades alimentan el informe trimestral de la Comisión de Gobierno de IA al CGTD.</w:t>
       </w:r>
     </w:p>
     <w:p>
@@ -11338,9 +12168,7 @@
           <w:rFonts w:ascii="Arial" w:hAnsi="Arial" w:cs="Arial"/>
           <w:highlight w:val="green"/>
         </w:rPr>
-        <w:t xml:space="preserve">6.10.6 El monitoreo comprende la detección del uso irregular del SBIA por parte de quienes lo operan o interactúan con él, con independencia del nivel de riesgo que tenga asignado. El uso irregular se distingue del uso indebido a que se refiere el artículo 23 del RLIA, que es una categoría de clasificación del SBIA. Constituyen indicios de uso irregular, entre otros, la manipulación de los datos de entrada para inducir un resultado determinado, el empleo del SBIA para una finalidad distinta de la registrada en el Inventario Institucional de SBIA y los </w:t>
-        <w:lastRenderedPageBreak/>
-        <w:t xml:space="preserve">patrones de uso incompatibles con la operación normal del proceso. La Comisión de Gobierno de IA define los indicadores que permitan detectar dichos patrones, conforme al numeral 6.10.2, y los incorpora al plan de monitoreo. Los efectos del uso irregular sobre el funcionamiento del SBIA se tratan conforme al numeral 6.7.5. La conducta se comunica a la Oficina de Integridad Institucional y se trata conforme a las normas de integridad institucional.</w:t>
+        <w:t>6.10.6 El monitoreo comprende la detección del uso irregular del SBIA por parte de quienes lo operan o interactúan con él, con independencia del nivel de riesgo que tenga asignado. El uso irregular se distingue del uso indebido a que se refiere el artículo 23 del RLIA, que es una categoría de clasificación del SBIA. Constituyen indicios de uso irregular, entre otros, la manipulación de los datos de entrada para inducir un resultado determinado, el empleo del SBIA para una finalidad distinta de la registrada en el Inventario Institucional de SBIA y los patrones de uso incompatibles con la operación normal del proceso. La Comisión de Gobierno de IA define los indicadores que permitan detectar dichos patrones, conforme al numeral 6.10.2, y los incorpora al plan de monitoreo. Los efectos del uso irregular sobre el funcionamiento del SBIA se tratan conforme al numeral 6.7.5. La conducta se comunica a la Oficina de Integridad Institucional y se trata conforme a las normas de integridad institucional.</w:t>
       </w:r>
     </w:p>
     <w:p>
@@ -11385,7 +12213,7 @@
           <w:szCs w:val="24"/>
           <w:highlight w:val="cyan"/>
         </w:rPr>
-        <w:t xml:space="preserve">Del uso responsable y ético, de las capacidades y proveedores</w:t>
+        <w:t>Del uso responsable y ético, de las capacidades y proveedores</w:t>
       </w:r>
     </w:p>
     <w:p>
@@ -11396,6 +12224,8 @@
       </w:pPr>
       <w:r>
         <w:t>6.11</w:t>
+      </w:r>
+      <w:r>
         <w:tab/>
         <w:t>Del uso responsable de herramientas de IA</w:t>
       </w:r>
@@ -11416,6 +12246,12 @@
           <w:color w:val="000000"/>
         </w:rPr>
         <w:t>6.11.1</w:t>
+      </w:r>
+      <w:r>
+        <w:rPr>
+          <w:rFonts w:ascii="Arial" w:eastAsia="Arial" w:hAnsi="Arial" w:cs="Arial"/>
+          <w:color w:val="000000"/>
+        </w:rPr>
         <w:tab/>
         <w:t xml:space="preserve">Los colaboradores que utilicen herramientas de IA generativa </w:t>
       </w:r>
@@ -11569,6 +12405,13 @@
           <w:highlight w:val="green"/>
         </w:rPr>
         <w:t>6.11.2</w:t>
+      </w:r>
+      <w:r>
+        <w:rPr>
+          <w:rFonts w:ascii="Arial" w:eastAsia="Arial" w:hAnsi="Arial" w:cs="Arial"/>
+          <w:color w:val="000000"/>
+          <w:highlight w:val="green"/>
+        </w:rPr>
         <w:tab/>
         <w:t>El catálogo de herramientas de IA autorizadas para uso institucional, en adelante el catálogo institucional, registra las herramientas aprobadas conforme al numeral 6.11.5. El catálogo precisa, para cada herramienta, el ámbito de uso autorizado (uso administrativo general o uso restringido) y si se encuentra desplegada en infraestructura bajo control de la SUNAT. Solo las herramientas desplegadas en dicha infraestructura pueden emplearse con información sujeta a reserva tributaria, conforme al numeral 6.7.3. La INSI lo publica y lo mantiene actualizado.</w:t>
       </w:r>
@@ -11590,6 +12433,13 @@
           <w:highlight w:val="green"/>
         </w:rPr>
         <w:t>6.11.3</w:t>
+      </w:r>
+      <w:r>
+        <w:rPr>
+          <w:rFonts w:ascii="Arial" w:eastAsia="Arial" w:hAnsi="Arial" w:cs="Arial"/>
+          <w:color w:val="000000"/>
+          <w:highlight w:val="green"/>
+        </w:rPr>
         <w:tab/>
         <w:t xml:space="preserve">Los lineamientos técnicos que regulan el uso de LLM open source en la infraestructura institucional integran los documentos técnicos de arquitectura previstos en el numeral 6.5.3. La División de Arquitectura de Información y de Aplicaciones los elabora y propone en lo referido al modelo y a la arquitectura de aplicaciones, conforme al literal b) del artículo 132 del ROF, y la División de Arquitectura Tecnológica en lo referido a la infraestructura especializada que los soporta, conforme a los literales c) y d) del artículo 134 del ROF. Su aprobación se efectúa conforme al numeral 6.5.3. Las unidades de organización los cumplen como condición para el despliegue de estos modelos. En tanto no se aprueben, el despliegue de estos modelos requiere la autorización previa de la Gerencia de Arquitectura y observa los controles del numeral 6.7.2. </w:t>
       </w:r>
@@ -11599,9 +12449,7 @@
           <w:color w:val="000000"/>
           <w:highlight w:val="cyan"/>
         </w:rPr>
-        <w:t xml:space="preserve">El despliegue de estos </w:t>
-        <w:lastRenderedPageBreak/>
-        <w:t>modelos observa, en lo que corresponda, el Procedimiento para el Registro, Control y Retiro de Software de la SUNAT (A-03.3.2-PR-01).</w:t>
+        <w:t>El despliegue de estos modelos observa, en lo que corresponda, el Procedimiento para el Registro, Control y Retiro de Software de la SUNAT (A-03.3.2-PR-01).</w:t>
       </w:r>
     </w:p>
     <w:p>
@@ -11621,8 +12469,24 @@
           <w:highlight w:val="green"/>
         </w:rPr>
         <w:t>6.11.4</w:t>
+      </w:r>
+      <w:r>
+        <w:rPr>
+          <w:rFonts w:ascii="Arial" w:eastAsia="Arial" w:hAnsi="Arial" w:cs="Arial"/>
+          <w:color w:val="000000"/>
+          <w:highlight w:val="green"/>
+        </w:rPr>
         <w:tab/>
-        <w:t xml:space="preserve">Ninguna unidad de organización desarrolla, adquiere, contrata, implementa u opera SBIA fuera del límite de la presente directiva, independientemente de su complejidad, presupuesto o ámbito geográfico. En particular: (a) toda iniciativa de SBIA como proyecto se sujeta al ciclo de vida del numeral 6.1, incluidos sus hitos de aprobación, y se registra en el Inventario Institucional de SBIA; (b) toda herramienta de IA que se contrate como servicio (suscripciones, APIs, plataformas SaaS) cuenta previamente con la aprobación prevista en el numeral 6.11.5 y con su inclusión en el catálogo institucional (numeral 6.11.2). Cuando la herramienta constituya además un SBIA, le son aplicables las verificaciones del numeral 6.12 que correspondan. Los colaboradores utilizan exclusivamente las herramientas de IA que figuran en dicho catálogo. La Comisión de Gobierno de IA promueve la regularización mediante el registro y el acompañamiento proporcional a la unidad involucrada, y comunica al CGTD y, según corresponda, a la OII, los incumplimientos reiterados. Cuando de la regularización resulte que el SBIA corresponde a la categoría de uso indebido prevista en el artículo 23 del RLIA, no procede su regularización y se aplica lo dispuesto en los numerales 6.2.1, 6.2.3 y 6.2.6.</w:t>
+        <w:t xml:space="preserve">Ninguna unidad de organización desarrolla, adquiere, contrata, implementa u opera SBIA fuera del límite de la presente directiva, independientemente de su </w:t>
+      </w:r>
+      <w:r>
+        <w:rPr>
+          <w:rFonts w:ascii="Arial" w:eastAsia="Arial" w:hAnsi="Arial" w:cs="Arial"/>
+          <w:color w:val="000000"/>
+          <w:highlight w:val="green"/>
+        </w:rPr>
+        <w:lastRenderedPageBreak/>
+        <w:t>complejidad, presupuesto o ámbito geográfico. En particular: (a) toda iniciativa de SBIA como proyecto se sujeta al ciclo de vida del numeral 6.1, incluidos sus hitos de aprobación, y se registra en el Inventario Institucional de SBIA; (b) toda herramienta de IA que se contrate como servicio (suscripciones, APIs, plataformas SaaS) cuenta previamente con la aprobación prevista en el numeral 6.11.5 y con su inclusión en el catálogo institucional (numeral 6.11.2). Cuando la herramienta constituya además un SBIA, le son aplicables las verificaciones del numeral 6.12 que correspondan. Los colaboradores utilizan exclusivamente las herramientas de IA que figuran en dicho catálogo. La Comisión de Gobierno de IA promueve la regularización mediante el registro y el acompañamiento proporcional a la unidad involucrada, y comunica al CGTD y, según corresponda, a la OII, los incumplimientos reiterados. Cuando de la regularización resulte que el SBIA corresponde a la categoría de uso indebido prevista en el artículo 23 del RLIA, no procede su regularización y se aplica lo dispuesto en los numerales 6.2.1, 6.2.3 y 6.2.6.</w:t>
       </w:r>
     </w:p>
     <w:p>
@@ -11642,6 +12506,13 @@
           <w:highlight w:val="cyan"/>
         </w:rPr>
         <w:t>6.11.5</w:t>
+      </w:r>
+      <w:r>
+        <w:rPr>
+          <w:rFonts w:ascii="Arial" w:hAnsi="Arial" w:cs="Arial"/>
+          <w:color w:val="000000"/>
+          <w:highlight w:val="cyan"/>
+        </w:rPr>
         <w:tab/>
         <w:t xml:space="preserve">La GA aprueba las herramientas de IA que pueden emplearse en la SUNAT, conforme a sus funciones (artículo 130, literal c, del ROF), y las registra en el catálogo institucional. </w:t>
       </w:r>
@@ -11659,7 +12530,7 @@
           <w:color w:val="000000"/>
           <w:highlight w:val="cyan"/>
         </w:rPr>
-        <w:t xml:space="preserve">El catálogo institucional constituye el subconjunto de inteligencia artificial del inventario de software autorizado; ambos se distinguen del Inventario Institucional de SBIA, que registra los SBIA y no las herramientas.</w:t>
+        <w:t>El catálogo institucional constituye el subconjunto de inteligencia artificial del inventario de software autorizado; ambos se distinguen del Inventario Institucional de SBIA, que registra los SBIA y no las herramientas.</w:t>
       </w:r>
       <w:r>
         <w:rPr>
@@ -11686,6 +12557,8 @@
       </w:pPr>
       <w:r>
         <w:t>6.12</w:t>
+      </w:r>
+      <w:r>
         <w:tab/>
         <w:t>De la gestión de proveedores de IA</w:t>
       </w:r>
@@ -11707,6 +12580,13 @@
           <w:highlight w:val="green"/>
         </w:rPr>
         <w:t>6.12.1</w:t>
+      </w:r>
+      <w:r>
+        <w:rPr>
+          <w:rFonts w:ascii="Arial" w:eastAsia="Arial" w:hAnsi="Arial" w:cs="Arial"/>
+          <w:color w:val="000000"/>
+          <w:highlight w:val="green"/>
+        </w:rPr>
         <w:tab/>
         <w:t>La unidad de organización que formula los términos de referencia o las especificaciones técnicas para la adquisición de un SBIA incorpora en ellos los requisitos de cumplimiento de la presente directiva y de la normativa aplicable. La Gerencia de Arquitectura verifica su incorporación con anterioridad a la aprobación de los términos de referencia o de las especificaciones técnicas, conforme al literal c) del artículo 130 del ROF. El resultado de la verificación consta en el expediente de contratación.</w:t>
       </w:r>
@@ -11728,10 +12608,24 @@
           <w:highlight w:val="green"/>
         </w:rPr>
         <w:t>6.12.2</w:t>
+      </w:r>
+      <w:r>
+        <w:rPr>
+          <w:rFonts w:ascii="Arial" w:eastAsia="Arial" w:hAnsi="Arial" w:cs="Arial"/>
+          <w:color w:val="000000"/>
+          <w:highlight w:val="green"/>
+        </w:rPr>
         <w:tab/>
-        <w:t xml:space="preserve">La unidad de organización que formula los términos de referencia o las especificaciones técnicas incorpora en ellos las cláusulas que el contrato debe </w:t>
+        <w:t xml:space="preserve">La unidad de organización que formula los términos de referencia o las especificaciones técnicas incorpora en ellos las cláusulas que el contrato debe contener sobre: (a) protección de datos y reserva tributaria; (b) transparencia </w:t>
+      </w:r>
+      <w:r>
+        <w:rPr>
+          <w:rFonts w:ascii="Arial" w:eastAsia="Arial" w:hAnsi="Arial" w:cs="Arial"/>
+          <w:color w:val="000000"/>
+          <w:highlight w:val="green"/>
+        </w:rPr>
         <w:lastRenderedPageBreak/>
-        <w:t xml:space="preserve">contener sobre: (a) protección de datos y reserva tributaria; (b) transparencia del modelo; (c) comunicación de vulnerabilidades e incidentes; (d) derecho de auditoría, incluida la realización de auditorías éticas y de sesgo sobre el modelo; (e) transferencia de conocimiento; (f) cumplimiento de estándares técnicos; y (g) la identificación de los subprocesadores autorizados y las condiciones de recuperación de la información institucional a la conclusión del contrato. El plazo de notificación de vulnerabilidades se define en los TDR o EETT de cada contratación, según la criticidad del SBIA.</w:t>
+        <w:t>del modelo; (c) comunicación de vulnerabilidades e incidentes; (d) derecho de auditoría, incluida la realización de auditorías éticas y de sesgo sobre el modelo; (e) transferencia de conocimiento; (f) cumplimiento de estándares técnicos; y (g) la identificación de los subprocesadores autorizados y las condiciones de recuperación de la información institucional a la conclusión del contrato. El plazo de notificación de vulnerabilidades se define en los TDR o EETT de cada contratación, según la criticidad del SBIA.</w:t>
       </w:r>
     </w:p>
     <w:p>
@@ -11751,6 +12645,13 @@
           <w:highlight w:val="green"/>
         </w:rPr>
         <w:t>6.12.3</w:t>
+      </w:r>
+      <w:r>
+        <w:rPr>
+          <w:rFonts w:ascii="Arial" w:eastAsia="Arial" w:hAnsi="Arial" w:cs="Arial"/>
+          <w:color w:val="000000"/>
+          <w:highlight w:val="green"/>
+        </w:rPr>
         <w:tab/>
         <w:t>Para SBIA SaaS, la INSI verifica que las condiciones técnicas y operativas del servicio se ajusten a la restricción del numeral 6.7.3. La compatibilidad de los términos de uso con las obligaciones de la SUNAT en materia de datos es materia de la opinión previa de la INALI prevista en el numeral 5.4. Estos SBIA no procesan información sujeta a reserva tributaria.</w:t>
       </w:r>
@@ -11772,6 +12673,13 @@
           <w:highlight w:val="green"/>
         </w:rPr>
         <w:t>6.12.4</w:t>
+      </w:r>
+      <w:r>
+        <w:rPr>
+          <w:rFonts w:ascii="Arial" w:eastAsia="Arial" w:hAnsi="Arial" w:cs="Arial"/>
+          <w:color w:val="000000"/>
+          <w:highlight w:val="green"/>
+        </w:rPr>
         <w:tab/>
         <w:t>La unidad de organización que formula los términos de referencia o las especificaciones técnicas incorpora en ellos la cláusula que prohíbe al proveedor y a su personal emplear la información de la SUNAT a la que accedan en ejecución del contrato, las instrucciones que se les remitan y los resultados derivados de su tratamiento, para entrenar, ajustar o mejorar sus modelos o para cualquier fin distinto de la ejecución del contrato. Tratándose de información sujeta a reserva tributaria, la prohibición se sustenta en el artículo 85 del Código Tributario, que extiende la obligación de reserva a quienes accedan a dicha información.</w:t>
       </w:r>
@@ -11793,6 +12701,13 @@
           <w:highlight w:val="green"/>
         </w:rPr>
         <w:t>6.12.5</w:t>
+      </w:r>
+      <w:r>
+        <w:rPr>
+          <w:rFonts w:ascii="Arial" w:eastAsia="Arial" w:hAnsi="Arial" w:cs="Arial"/>
+          <w:color w:val="000000"/>
+          <w:highlight w:val="green"/>
+        </w:rPr>
         <w:tab/>
         <w:t>Para los SBIA de riesgo alto, los contratos obligan al proveedor a entregar la documentación técnica sobre los principios de funcionamiento del sistema, las fuentes de datos utilizadas y la lógica del algoritmo, conforme al numeral 31.1 del artículo 31 del RLIA, en la medida necesaria para el cumplimiento de las obligaciones de transparencia y explicabilidad de la SUNAT y con respeto del secreto industrial y comercial, conforme al numeral 25.1 del artículo 25 del RLIA. La Comisión de Gobierno de IA determina el alcance de la documentación exigible al evaluar el componente de IA del caso de uso. No se admiten soluciones de caja negra no auditables.</w:t>
       </w:r>
@@ -11811,6 +12726,11 @@
           <w:highlight w:val="green"/>
         </w:rPr>
         <w:t>6.13</w:t>
+      </w:r>
+      <w:r>
+        <w:rPr>
+          <w:highlight w:val="green"/>
+        </w:rPr>
         <w:tab/>
         <w:t>De la sensibilización, la capacitación y la gestión del cambio</w:t>
       </w:r>
@@ -11876,7 +12796,7 @@
           <w:color w:val="000000"/>
           <w:highlight w:val="lightGray"/>
         </w:rPr>
-        <w:t xml:space="preserve">Todo el personal de la SUNAT vinculado al diseño, desarrollo, implementación, evaluación o uso de SBIA es sensibilizado respecto del uso seguro, responsable y ético de dichos sistemas, así como de los riesgos asociados y de las disposiciones establecidas en la Política de IA.</w:t>
+        <w:t>Todo el personal de la SUNAT vinculado al diseño, desarrollo, implementación, evaluación o uso de SBIA es sensibilizado respecto del uso seguro, responsable y ético de dichos sistemas, así como de los riesgos asociados y de las disposiciones establecidas en la Política de IA.</w:t>
       </w:r>
     </w:p>
     <w:p>
@@ -11922,7 +12842,8 @@
           <w:color w:val="000000"/>
           <w:highlight w:val="lightGray"/>
         </w:rPr>
-        <w:t xml:space="preserve">La finalidad y los principios institucionales aplicables a los SBIA</w:t>
+        <w:lastRenderedPageBreak/>
+        <w:t>La finalidad y los principios institucionales aplicables a los SBIA</w:t>
       </w:r>
     </w:p>
     <w:p>
@@ -11948,7 +12869,6 @@
           <w:color w:val="000000"/>
           <w:highlight w:val="lightGray"/>
         </w:rPr>
-        <w:lastRenderedPageBreak/>
         <w:t>Los riesgos derivados de su diseño, desarrollo, implementación y uso.</w:t>
       </w:r>
     </w:p>
@@ -12027,7 +12947,7 @@
           <w:color w:val="000000"/>
           <w:highlight w:val="lightGray"/>
         </w:rPr>
-        <w:t xml:space="preserve">El impacto social y ambiental de los SBIA.</w:t>
+        <w:t>El impacto social y ambiental de los SBIA.</w:t>
       </w:r>
     </w:p>
     <w:p>
@@ -12050,7 +12970,7 @@
           <w:color w:val="000000"/>
           <w:highlight w:val="green"/>
         </w:rPr>
-        <w:t xml:space="preserve">Esta disposición desarrolla el principio rector de sensibilización y educación en IA establecido en el literal f) del artículo 7 del RLIA, en concordancia con el numeral 7.3 de la NTP-ISO/IEC 42001:2025.</w:t>
+        <w:t>Esta disposición desarrolla el principio rector de sensibilización y educación en IA establecido en el literal f) del artículo 7 del RLIA, en concordancia con el numeral 7.3 de la NTP-ISO/IEC 42001:2025.</w:t>
       </w:r>
     </w:p>
     <w:p>
@@ -12156,7 +13076,7 @@
           <w:color w:val="000000"/>
           <w:highlight w:val="lightGray"/>
         </w:rPr>
-        <w:t xml:space="preserve">Los fundamentos y el ciclo de vida de los SBIA.</w:t>
+        <w:t>Los fundamentos y el ciclo de vida de los SBIA.</w:t>
       </w:r>
     </w:p>
     <w:p>
@@ -12182,7 +13102,7 @@
           <w:color w:val="000000"/>
           <w:highlight w:val="lightGray"/>
         </w:rPr>
-        <w:t>La gestión de los riesgos de IA y la seguridad de la información aplicables.</w:t>
+        <w:t>La gestión de los riesgos de IA.</w:t>
       </w:r>
     </w:p>
     <w:p>
@@ -12280,7 +13200,14 @@
           <w:color w:val="000000"/>
           <w:highlight w:val="lightGray"/>
         </w:rPr>
-        <w:t xml:space="preserve">Esta disposición se implementa conforme al numeral 28.5 del artículo 28 del RLIA y en concordancia con el numeral 7.2 y el Anexo A.4 de la NTP</w:t>
+        <w:t>Esta disposición se implementa conforme al numeral 28.5 del artículo 28 del RLIA y en concordancia con el numeral 7.2 y el Anexo A.4 de la NTP</w:t>
+      </w:r>
+      <w:r>
+        <w:rPr>
+          <w:rFonts w:ascii="Arial" w:eastAsia="Arial" w:hAnsi="Arial" w:cs="Arial"/>
+          <w:color w:val="000000"/>
+          <w:highlight w:val="lightGray"/>
+        </w:rPr>
         <w:noBreakHyphen/>
         <w:t>ISO/IEC 42001:2025.</w:t>
       </w:r>
@@ -12349,7 +13276,16 @@
           <w:color w:val="000000"/>
           <w:highlight w:val="lightGray"/>
         </w:rPr>
-        <w:t xml:space="preserve">Las acciones de gestión del cambio facilitan la consolidación de la Política de IA y del sistema de gestión de IA, promoviendo su integración en la gestión institucional y favoreciendo las condiciones organizacionales necesarias para su sostenibilidad y mejora continua, en concordancia con los numerales 28.1 y 28.2 del artículo 28 del RLIA.</w:t>
+        <w:t xml:space="preserve">Las acciones de gestión del cambio facilitan la consolidación de la Política de IA y del sistema de gestión de IA, promoviendo su integración en la gestión institucional y favoreciendo las condiciones organizacionales necesarias para </w:t>
+      </w:r>
+      <w:r>
+        <w:rPr>
+          <w:rFonts w:ascii="Arial" w:eastAsia="Arial" w:hAnsi="Arial" w:cs="Arial"/>
+          <w:color w:val="000000"/>
+          <w:highlight w:val="lightGray"/>
+        </w:rPr>
+        <w:lastRenderedPageBreak/>
+        <w:t>su sostenibilidad y mejora continua, en concordancia con los numerales 28.1 y 28.2 del artículo 28 del RLIA.</w:t>
       </w:r>
     </w:p>
     <w:p>
@@ -12363,6 +13299,11 @@
           <w:highlight w:val="yellow"/>
         </w:rPr>
         <w:t>6.14</w:t>
+      </w:r>
+      <w:r>
+        <w:rPr>
+          <w:highlight w:val="yellow"/>
+        </w:rPr>
         <w:tab/>
         <w:t>De la ética y la integridad en los SBIA</w:t>
       </w:r>
@@ -12387,10 +13328,16 @@
           <w:color w:val="000000"/>
           <w:highlight w:val="yellow"/>
         </w:rPr>
-        <w:lastRenderedPageBreak/>
         <w:t>6.14.1</w:t>
+      </w:r>
+      <w:r>
+        <w:rPr>
+          <w:rFonts w:ascii="Arial" w:eastAsia="Arial" w:hAnsi="Arial" w:cs="Arial"/>
+          <w:color w:val="000000"/>
+          <w:highlight w:val="yellow"/>
+        </w:rPr>
         <w:tab/>
-        <w:t xml:space="preserve">En el desarrollo, la implementación y el uso de los SBIA, la SUNAT observa las acciones previstas en el numeral 27.1 del artículo 27 del RLIA. Promueve la participación de equipos diversos y multidisciplinarios. Garantiza el pleno respeto de los derechos humanos y evita que se generen resultados injustos o discriminatorios. Considera el impacto social y ambiental. Implementa las mejores prácticas, estándares y normas técnicas para identificar y minimizar los sesgos de los algoritmos y de las bases de datos utilizados</w:t>
+        <w:t>En el desarrollo, la implementación y el uso de los SBIA, la SUNAT observa las acciones previstas en el numeral 27.1 del artículo 27 del RLIA. Promueve la participación de equipos diversos y multidisciplinarios. Garantiza el pleno respeto de los derechos humanos y evita que se generen resultados injustos o discriminatorios. Considera el impacto social y ambiental. Implementa las mejores prácticas, estándares y normas técnicas para identificar y minimizar los sesgos de los algoritmos y de las bases de datos utilizados</w:t>
       </w:r>
       <w:r>
         <w:rPr>
@@ -12428,6 +13375,13 @@
           <w:highlight w:val="yellow"/>
         </w:rPr>
         <w:t>6.14.2</w:t>
+      </w:r>
+      <w:r>
+        <w:rPr>
+          <w:rFonts w:ascii="Arial" w:eastAsia="Arial" w:hAnsi="Arial" w:cs="Arial"/>
+          <w:color w:val="000000"/>
+          <w:highlight w:val="yellow"/>
+        </w:rPr>
         <w:tab/>
       </w:r>
       <w:r>
@@ -12455,7 +13409,7 @@
           <w:color w:val="000000"/>
           <w:highlight w:val="green"/>
         </w:rPr>
-        <w:t xml:space="preserve">Esta disposición desarrolla el numeral 28.9 del artículo 28 del RLIA.</w:t>
+        <w:t>Esta disposición desarrolla el numeral 28.9 del artículo 28 del RLIA.</w:t>
       </w:r>
     </w:p>
     <w:p>
@@ -12478,6 +13432,13 @@
           <w:highlight w:val="yellow"/>
         </w:rPr>
         <w:t>6.14.3</w:t>
+      </w:r>
+      <w:r>
+        <w:rPr>
+          <w:rFonts w:ascii="Arial" w:eastAsia="Arial" w:hAnsi="Arial" w:cs="Arial"/>
+          <w:color w:val="000000"/>
+          <w:highlight w:val="yellow"/>
+        </w:rPr>
         <w:tab/>
         <w:t>Los Lineamientos Éticos que apruebe la SGTD</w:t>
       </w:r>
@@ -12552,9 +13513,15 @@
           <w:rFonts w:ascii="Arial" w:hAnsi="Arial" w:cs="Arial"/>
           <w:highlight w:val="green"/>
         </w:rPr>
-        <w:t xml:space="preserve">6.15.1 Toda iniciativa, requerimiento o proyecto que incorpore o prevea un componente basado en IA requiere la opinión técnica previa de la Comisión de Gobierno de IA sobre dicho componente, cualquiera sea el instrumento de gestión bajo el cual se formule, ejecute o modifique. La opinión se emite sobre la Ficha de Evaluación de Caso de Uso (Anexo N.° 4), adecuada a la naturaleza y magnitud de la iniciativa, requerimiento o proyecto. La opinión comprende la pertinencia del uso de inteligencia artificial y la clasificación de riesgo del componente, conforme al Anexo N.° 2 y a los artículos 22 a 24 del RLIA. Determinar la pertinencia es establecer si el resultado esperado requiere inteligencia artificial o se alcanza sin ella, conforme al numeral 5.1.4. Los controles aplicables se determinan a partir de la clasificación, conforme al numeral 6.2.5. La opinión no comprende la generación de valor, el costo, la </w:t>
+        <w:t xml:space="preserve">6.15.1 Toda iniciativa, requerimiento o proyecto que incorpore o prevea un componente basado en IA requiere la opinión técnica previa de la Comisión de Gobierno de IA sobre dicho componente, cualquiera sea el instrumento de gestión bajo el cual se formule, ejecute o modifique. La opinión se emite sobre la Ficha de Evaluación de Caso de Uso (Anexo N.° 4), adecuada a la naturaleza y magnitud de la iniciativa, requerimiento o proyecto. La opinión comprende la pertinencia del uso de inteligencia artificial y la clasificación de riesgo del componente, conforme al Anexo N.° 2 y a los artículos 22 a 24 del RLIA. </w:t>
+      </w:r>
+      <w:r>
+        <w:rPr>
+          <w:rFonts w:ascii="Arial" w:hAnsi="Arial" w:cs="Arial"/>
+          <w:highlight w:val="green"/>
+        </w:rPr>
         <w:lastRenderedPageBreak/>
-        <w:t xml:space="preserve">prioridad ni la viabilidad presupuestal de la iniciativa, que corresponden a los instrumentos de gestión respectivos y a las instancias competentes. La opinión adopta uno de los siguientes pronunciamientos:</w:t>
+        <w:t>Determinar la pertinencia es establecer si el resultado esperado requiere inteligencia artificial o se alcanza sin ella, conforme al numeral 5.1.4. Los controles aplicables se determinan a partir de la clasificación, conforme al numeral 6.2.5. La opinión no comprende la generación de valor, el costo, la prioridad ni la viabilidad presupuestal de la iniciativa, que corresponden a los instrumentos de gestión respectivos y a las instancias competentes. La opinión adopta uno de los siguientes pronunciamientos:</w:t>
       </w:r>
     </w:p>
     <w:p>
@@ -12608,7 +13575,7 @@
           <w:bCs w:val="0"/>
           <w:highlight w:val="green"/>
         </w:rPr>
-        <w:t xml:space="preserve">Favorable con condiciones, que identifica los controles que corresponden conforme al numeral 6.2.5 y cuya implementación se verifica en la etapa 5 del numeral 6.1.1. Los SBIA clasificados de riesgo alto reciben este pronunciamiento.</w:t>
+        <w:t>Favorable con condiciones, que identifica los controles que corresponden conforme al numeral 6.2.5 y cuya implementación se verifica en la etapa 5 del numeral 6.1.1. Los SBIA clasificados de riesgo alto reciben este pronunciamiento.</w:t>
       </w:r>
     </w:p>
     <w:p>
@@ -12635,7 +13602,7 @@
           <w:bCs w:val="0"/>
           <w:highlight w:val="green"/>
         </w:rPr>
-        <w:t xml:space="preserve">No favorable, cuando el uso es indebido conforme al artículo 23 del RLIA, contraviene la Política de IA o la normativa vigente, o el resultado esperado se alcanza sin inteligencia artificial. En este último caso la iniciativa puede continuar sin el componente de IA.</w:t>
+        <w:t>No favorable, cuando el uso es indebido conforme al artículo 23 del RLIA, contraviene la Política de IA o la normativa vigente, o el resultado esperado se alcanza sin inteligencia artificial. En este último caso la iniciativa puede continuar sin el componente de IA.</w:t>
       </w:r>
     </w:p>
     <w:p>
@@ -12655,7 +13622,7 @@
           <w:rFonts w:ascii="Arial" w:hAnsi="Arial" w:cs="Arial"/>
           <w:highlight w:val="green"/>
         </w:rPr>
-        <w:t xml:space="preserve">6.15.2 El uso indebido está prohibido por el artículo 23 del RLIA y el sometimiento de los SBIA de riesgo alto a condiciones y controles es obligatorio conforme al literal b) del numeral 22.1 del artículo 22 del RLIA, a sus artículos 25, 29 y 30 y al numeral 28.11 de su artículo 28: en ambos casos obliga la norma, no la opinión. En los demás casos la opinión sustenta la decisión, pero no la reemplaza. La aprobación corresponde, en cada caso, a la instancia competente conforme al ROF, a las normas de delegación de facultades, a los instrumentos de gestión institucionales o a la normativa de los sistemas administrativos del Estado.</w:t>
+        <w:t>6.15.2 El uso indebido está prohibido por el artículo 23 del RLIA y el sometimiento de los SBIA de riesgo alto a condiciones y controles es obligatorio conforme al literal b) del numeral 22.1 del artículo 22 del RLIA, a sus artículos 25, 29 y 30 y al numeral 28.11 de su artículo 28: en ambos casos obliga la norma, no la opinión. En los demás casos la opinión sustenta la decisión, pero no la reemplaza. La aprobación corresponde, en cada caso, a la instancia competente conforme al ROF, a las normas de delegación de facultades, a los instrumentos de gestión institucionales o a la normativa de los sistemas administrativos del Estado.</w:t>
       </w:r>
     </w:p>
     <w:p>
@@ -12697,7 +13664,7 @@
           <w:rFonts w:ascii="Arial" w:hAnsi="Arial" w:cs="Arial"/>
           <w:highlight w:val="green"/>
         </w:rPr>
-        <w:t xml:space="preserve">6.15.4 En los programas y proyectos institucionales conforme al MGPP, la opinión de la Comisión de Gobierno de IA se recaba desde que se identifica un componente basado en IA, en cualquier fase, y antes de la decisión que autoriza avanzar a la fase siguiente. La opinión se incorpora al expediente del caso de negocio o del plan de gestión, según corresponda, junto con las validaciones y opiniones que el MGPP ya prevé, y no requiere una etapa ni una instancia adicionales. Aplica en particular:</w:t>
+        <w:t>6.15.4 En los programas y proyectos institucionales conforme al MGPP, la opinión de la Comisión de Gobierno de IA se recaba desde que se identifica un componente basado en IA, en cualquier fase, y antes de la decisión que autoriza avanzar a la fase siguiente. La opinión se incorpora al expediente del caso de negocio o del plan de gestión, según corresponda, junto con las validaciones y opiniones que el MGPP ya prevé, y no requiere una etapa ni una instancia adicionales. Aplica en particular:</w:t>
       </w:r>
     </w:p>
     <w:p>
@@ -12778,6 +13745,7 @@
           <w:bCs w:val="0"/>
           <w:highlight w:val="green"/>
         </w:rPr>
+        <w:lastRenderedPageBreak/>
         <w:t>en el modelamiento del proceso de negocio, antes de su remisión a la INSI para desarrollo, cuando este revele un componente de IA no declarado en el alcance inicial;</w:t>
       </w:r>
     </w:p>
@@ -12870,7 +13838,7 @@
           <w:rFonts w:ascii="Arial" w:hAnsi="Arial" w:cs="Arial"/>
           <w:highlight w:val="green"/>
         </w:rPr>
-        <w:t xml:space="preserve">6.15.6 Las unidades de organización competentes de cada instrumento de gestión incorporan en sus documentos normativos la verificación del componente de IA y la opinión de la Comisión de Gobierno de IA, conforme al numeral 7.6. Esta incorporación alcanza al Modelo de Gobernabilidad de Programas y Proyectos y a la gestión de la demanda informática. La presente directiva no sustituye dichos instrumentos.</w:t>
+        <w:t>6.15.6 Las unidades de organización competentes de cada instrumento de gestión incorporan en sus documentos normativos la verificación del componente de IA y la opinión de la Comisión de Gobierno de IA, conforme al numeral 7.6. Esta incorporación alcanza al Modelo de Gobernabilidad de Programas y Proyectos y a la gestión de la demanda informática. La presente directiva no sustituye dichos instrumentos.</w:t>
       </w:r>
     </w:p>
     <w:p>
@@ -12997,7 +13965,6 @@
           <w:color w:val="000000"/>
           <w:szCs w:val="22"/>
         </w:rPr>
-        <w:lastRenderedPageBreak/>
         <w:t>DISPOSICIONES FINALES</w:t>
       </w:r>
       <w:bookmarkEnd w:id="7"/>
@@ -13018,6 +13985,12 @@
           <w:bCs w:val="0"/>
         </w:rPr>
         <w:t>7.1</w:t>
+      </w:r>
+      <w:r>
+        <w:rPr>
+          <w:b w:val="0"/>
+          <w:bCs w:val="0"/>
+        </w:rPr>
         <w:tab/>
         <w:t>La presente directiva entra en vigencia al día siguiente de la emisión de la Resolución de Superintendencia que la aprueba.</w:t>
       </w:r>
@@ -13038,6 +14011,12 @@
           <w:bCs w:val="0"/>
         </w:rPr>
         <w:t>7.2</w:t>
+      </w:r>
+      <w:r>
+        <w:rPr>
+          <w:b w:val="0"/>
+          <w:bCs w:val="0"/>
+        </w:rPr>
         <w:tab/>
         <w:t>La actualización de la presente directiva es propuesta por la Comisión de Gobierno de IA, conforme a la METDONI.</w:t>
       </w:r>
@@ -13059,6 +14038,13 @@
           <w:highlight w:val="yellow"/>
         </w:rPr>
         <w:t>7.3</w:t>
+      </w:r>
+      <w:r>
+        <w:rPr>
+          <w:b w:val="0"/>
+          <w:bCs w:val="0"/>
+          <w:highlight w:val="yellow"/>
+        </w:rPr>
         <w:tab/>
         <w:t>La Comisión de Gobierno de IA se conforma mediante Resolución de Superintendencia, a propuesta del CGTD, conforme al numeral 5.3 de la presente directiva.</w:t>
       </w:r>
@@ -13097,6 +14083,13 @@
           <w:highlight w:val="green"/>
         </w:rPr>
         <w:t>7.4</w:t>
+      </w:r>
+      <w:r>
+        <w:rPr>
+          <w:b w:val="0"/>
+          <w:bCs w:val="0"/>
+          <w:highlight w:val="green"/>
+        </w:rPr>
         <w:tab/>
         <w:t>El Sistema de Gestión de Inteligencia Artificial (SGIA) de la SUNAT se rige por la NTP-ISO/IEC 42001:2025, de uso obligatorio conforme al numeral 28.2 del artículo 28 del RLIA. Los límites y la aplicabilidad del SGIA se determinan conforme al capítulo 4.3 de la referida norma técnica, considerando el alcance, la complejidad y el contexto institucional, y su implementación se gradúa con un enfoque basado en riesgos. La Comisión de Gobierno de IA propone al CGTD el plan de implementación del SGIA, con hitos y responsables. El CGTD lo aprueba. La Comisión coordina los lineamientos técnicos que correspondan, que se aprueban conforme al numeral 7.6.</w:t>
       </w:r>
@@ -13124,6 +14117,12 @@
           <w:bCs w:val="0"/>
         </w:rPr>
         <w:t>7.5</w:t>
+      </w:r>
+      <w:r>
+        <w:rPr>
+          <w:b w:val="0"/>
+          <w:bCs w:val="0"/>
+        </w:rPr>
         <w:tab/>
         <w:t xml:space="preserve">La Comisión de Gobierno de IA, con el apoyo técnico de la INSI, implementa el Inventario Institucional de SBIA. </w:t>
       </w:r>
@@ -13145,6 +14144,7 @@
           <w:color w:val="000000"/>
           <w:highlight w:val="green"/>
         </w:rPr>
+        <w:lastRenderedPageBreak/>
         <w:t>7.6</w:t>
       </w:r>
       <w:r>
@@ -13224,6 +14224,12 @@
           <w:bCs w:val="0"/>
         </w:rPr>
         <w:t>7.7</w:t>
+      </w:r>
+      <w:r>
+        <w:rPr>
+          <w:b w:val="0"/>
+          <w:bCs w:val="0"/>
+        </w:rPr>
         <w:tab/>
         <w:t xml:space="preserve">El CGTD resuelve las situaciones no previstas, sin perjuicio de la aplicación </w:t>
       </w:r>
@@ -13259,6 +14265,12 @@
           <w:bCs w:val="0"/>
         </w:rPr>
         <w:t>7.8</w:t>
+      </w:r>
+      <w:r>
+        <w:rPr>
+          <w:b w:val="0"/>
+          <w:bCs w:val="0"/>
+        </w:rPr>
         <w:tab/>
       </w:r>
       <w:r>
@@ -13287,10 +14299,15 @@
           <w:highlight w:val="green"/>
         </w:rPr>
         <w:t>7.9</w:t>
+      </w:r>
+      <w:r>
+        <w:rPr>
+          <w:b w:val="0"/>
+          <w:bCs w:val="0"/>
+          <w:highlight w:val="green"/>
+        </w:rPr>
         <w:tab/>
-        <w:t xml:space="preserve">El detalle de aplicación de los Anexos (los formatos, los criterios de registro, los catálogos de valores y los indicadores operativos, así como los campos adicionales que resulten necesarios) se establece en los documentos normativos institucionales </w:t>
-        <w:lastRenderedPageBreak/>
-        <w:t>de menor rango previstos en el numeral 7.6, que las unidades competentes actualizan sin requerir la modificación de la presente directiva. Dichos documentos no suprimen ni reducen los campos ni los contenidos mínimos que los Anexos establecen.</w:t>
+        <w:t>El detalle de aplicación de los Anexos (los formatos, los criterios de registro, los catálogos de valores y los indicadores operativos, así como los campos adicionales que resulten necesarios) se establece en los documentos normativos institucionales de menor rango previstos en el numeral 7.6, que las unidades competentes actualizan sin requerir la modificación de la presente directiva. Dichos documentos no suprimen ni reducen los campos ni los contenidos mínimos que los Anexos establecen.</w:t>
       </w:r>
     </w:p>
     <w:p>
@@ -13310,6 +14327,13 @@
           <w:highlight w:val="yellow"/>
         </w:rPr>
         <w:t>7.10</w:t>
+      </w:r>
+      <w:r>
+        <w:rPr>
+          <w:b w:val="0"/>
+          <w:bCs w:val="0"/>
+          <w:highlight w:val="yellow"/>
+        </w:rPr>
         <w:tab/>
         <w:t xml:space="preserve">El Oficial de Inteligencia Artificial (OIA) de la SUNAT, previsto en el artículo 6 de la Resolución Ministerial N.° 152-2026-PCM, que aprueba la ENIA, recae en un miembro del CGTD y coordina el gobierno y la gestión de la inteligencia artificial institucional, así como el seguimiento del Plan de Acción de Inteligencia Artificial. Su designación se efectúa mediante acto de la máxima autoridad administrativa de la entidad, previamente a la formulación del Plan de Acción de Inteligencia Artificial. Su perfil, responsabilidades, designación y articulación se determinan conforme a los lineamientos que emita la SGTD, en aplicación de la Primera Disposición Complementaria Final de la citada Resolución Ministerial. </w:t>
       </w:r>
@@ -13319,7 +14343,16 @@
           <w:bCs w:val="0"/>
           <w:highlight w:val="green"/>
         </w:rPr>
-        <w:t>En tanto no se emitan dichos lineamientos y no se designe al OIA, el Coordinador designado conforme al numeral 7.3 ejerce las funciones de coordinación técnica en materia de IA. Designado el OIA, la coordinación de la Comisión de Gobierno de IA recae en él, salvo que los lineamientos de la SGTD dispongan una articulación distinta. La Comisión de Gobierno de IA evalúa su articulación conforme a dichos lineamientos y propone al CGTD los ajustes que correspondan.</w:t>
+        <w:t xml:space="preserve">En tanto no se emitan dichos lineamientos y no se designe al OIA, el Coordinador designado conforme al numeral 7.3 ejerce las funciones de coordinación técnica en materia de IA. Designado el OIA, la coordinación de la Comisión de Gobierno de IA recae en él, </w:t>
+      </w:r>
+      <w:r>
+        <w:rPr>
+          <w:b w:val="0"/>
+          <w:bCs w:val="0"/>
+          <w:highlight w:val="green"/>
+        </w:rPr>
+        <w:lastRenderedPageBreak/>
+        <w:t>salvo que los lineamientos de la SGTD dispongan una articulación distinta. La Comisión de Gobierno de IA evalúa su articulación conforme a dichos lineamientos y propone al CGTD los ajustes que correspondan.</w:t>
       </w:r>
       <w:r>
         <w:rPr>
@@ -13346,6 +14379,13 @@
           <w:highlight w:val="yellow"/>
         </w:rPr>
         <w:t>7.11</w:t>
+      </w:r>
+      <w:r>
+        <w:rPr>
+          <w:b w:val="0"/>
+          <w:bCs w:val="0"/>
+          <w:highlight w:val="yellow"/>
+        </w:rPr>
         <w:tab/>
         <w:t xml:space="preserve">El Plan de Acción de Inteligencia Artificial (PAIA) forma parte del Portafolio de Proyectos del PGD, conforme al numeral 5.5 del artículo 5 de la Resolución Ministerial N.° 152-2026-PCM. Su aprobación requiere que la SUNAT haya aprobado o implementado previamente su Plan de Acción de Gobierno de Datos (PAGD), conforme al numeral 5.4 del mismo artículo de dicha Resolución Ministerial; el PAGD forma parte del PGD y su formulación la coordina el CGTD, en concordancia con la ENGD. Las iniciativas, proyectos y acciones priorizadas en el PAIA se articulan con el Plan Estratégico Institucional, el Plan Operativo Institucional, el Programa Multianual de Inversiones y el PGD, conforme al numeral 4.4 del artículo 4 de la misma Resolución Ministerial y al numeral 28.10 del artículo 28 del RLIA. </w:t>
       </w:r>
@@ -13394,8 +14434,14 @@
           <w:bCs w:val="0"/>
         </w:rPr>
         <w:t>7.13</w:t>
+      </w:r>
+      <w:r>
+        <w:rPr>
+          <w:b w:val="0"/>
+          <w:bCs w:val="0"/>
+        </w:rPr>
         <w:tab/>
-        <w:t xml:space="preserve">El OIA reporta trimestralmente al CGTD el seguimiento de la implementación del PAIA, conforme al numeral 8.3 del artículo 8 de la Resolución Ministerial N.° 152-2026-PCM. Dicho reporte se integra al informe trimestral de gobierno de IA previsto en el numeral 6.9.5. Asimismo, el OIA registra los avances de la implementación del PAIA en la Plataforma de Cumplimiento Digital, en el último trimestre de cada año, conforme al numeral 8.4 del mismo artículo. La Comisión de Gobierno de IA le proporciona la información institucional que requiera para ambos fines.</w:t>
+        <w:t>El OIA reporta trimestralmente al CGTD el seguimiento de la implementación del PAIA, conforme al numeral 8.3 del artículo 8 de la Resolución Ministerial N.° 152-2026-PCM. Dicho reporte se integra al informe trimestral de gobierno de IA previsto en el numeral 6.9.5. Asimismo, el OIA registra los avances de la implementación del PAIA en la Plataforma de Cumplimiento Digital, en el último trimestre de cada año, conforme al numeral 8.4 del mismo artículo. La Comisión de Gobierno de IA le proporciona la información institucional que requiera para ambos fines.</w:t>
       </w:r>
     </w:p>
     <w:p>
@@ -13526,6 +14572,14 @@
           <w:color w:val="000000"/>
         </w:rPr>
         <w:br w:type="page"/>
+      </w:r>
+      <w:r>
+        <w:rPr>
+          <w:rFonts w:ascii="Arial" w:eastAsia="Arial" w:hAnsi="Arial" w:cs="Arial"/>
+          <w:b/>
+          <w:bCs/>
+          <w:color w:val="000000"/>
+        </w:rPr>
         <w:lastRenderedPageBreak/>
         <w:t>Anexo N.° 1: Ficha de Registro de SBIA (Campos mínimos del Inventario). Constituye el contenido mínimo del registro y se actualiza conforme al numeral 7.9.</w:t>
       </w:r>
@@ -15101,6 +16155,7 @@
                 <w:rFonts w:ascii="Arial" w:eastAsia="Arial" w:hAnsi="Arial" w:cs="Arial"/>
                 <w:highlight w:val="green"/>
               </w:rPr>
+              <w:lastRenderedPageBreak/>
               <w:t>15</w:t>
             </w:r>
           </w:p>
@@ -15409,7 +16464,6 @@
               <w:rPr>
                 <w:rFonts w:ascii="Arial" w:eastAsia="Arial" w:hAnsi="Arial" w:cs="Arial"/>
               </w:rPr>
-              <w:lastRenderedPageBreak/>
               <w:t>18</w:t>
             </w:r>
           </w:p>
@@ -15446,7 +16500,7 @@
                 <w:b/>
                 <w:bCs/>
               </w:rPr>
-              <w:t xml:space="preserve">Versión vigente y último cambio</w:t>
+              <w:t>Versión vigente y último cambio</w:t>
             </w:r>
           </w:p>
         </w:tc>
@@ -16162,6 +17216,7 @@
                 <w:rFonts w:ascii="Arial" w:eastAsia="Arial" w:hAnsi="Arial" w:cs="Arial"/>
                 <w:highlight w:val="green"/>
               </w:rPr>
+              <w:lastRenderedPageBreak/>
               <w:t>25</w:t>
             </w:r>
           </w:p>
@@ -16618,7 +17673,7 @@
                 <w:bCs/>
                 <w:highlight w:val="yellow"/>
               </w:rPr>
-              <w:t xml:space="preserve">Riesgo aceptable (Art. 22.2)</w:t>
+              <w:t>Riesgo aceptable (Art. 22.2)</w:t>
             </w:r>
           </w:p>
         </w:tc>
@@ -17661,7 +18716,7 @@
           <w:bCs w:val="0"/>
           <w:color w:val="000000"/>
         </w:rPr>
-        <w:t xml:space="preserve">Cumplimiento normativo: Ley IA, RLIA, protección de datos personales y reserva tributaria.</w:t>
+        <w:t>Cumplimiento normativo: Ley IA, RLIA, protección de datos personales y reserva tributaria.</w:t>
       </w:r>
     </w:p>
     <w:p>
@@ -17799,7 +18854,7 @@
           <w:rFonts w:ascii="Arial" w:hAnsi="Arial" w:cs="Arial"/>
           <w:highlight w:val="green"/>
         </w:rPr>
-        <w:t xml:space="preserve">Constituye el contenido mínimo de la evaluación del caso de uso y recoge los datos y las evidencias del problema que sustentan la iniciativa, conforme al numeral 28.4 del artículo 28 del RLIA. Se adecúa a la naturaleza y magnitud de la iniciativa, requerimiento o proyecto, conforme al numeral 6.15.1. Se actualiza conforme al numeral 7.9. Los campos cuya información ya figura en el caso de negocio, en la ficha de necesidad de la gestión de demanda informática o en otro instrumento previo se completan indicando el documento y la sección donde consta. No se transcribe información ya contenida en dichas fuentes. Los controles aplicables al SBIA se determinan a partir de su clasificación de riesgo y se registran en la Ficha de Registro de SBIA (Anexo N.° 1); no forman parte de esta ficha.</w:t>
+        <w:t>Constituye el contenido mínimo de la evaluación del caso de uso y recoge los datos y las evidencias del problema que sustentan la iniciativa, conforme al numeral 28.4 del artículo 28 del RLIA. Se adecúa a la naturaleza y magnitud de la iniciativa, requerimiento o proyecto, conforme al numeral 6.15.1. Se actualiza conforme al numeral 7.9. Los campos cuya información ya figura en el caso de negocio, en la ficha de necesidad de la gestión de demanda informática o en otro instrumento previo se completan indicando el documento y la sección donde consta. No se transcribe información ya contenida en dichas fuentes. Los controles aplicables al SBIA se determinan a partir de su clasificación de riesgo y se registran en la Ficha de Registro de SBIA (Anexo N.° 1); no forman parte de esta ficha.</w:t>
       </w:r>
     </w:p>
     <w:p>
@@ -18013,7 +19068,7 @@
           <w:color w:val="000000"/>
           <w:highlight w:val="green"/>
         </w:rPr>
-        <w:t xml:space="preserve">Sección 2 — Necesidad y pertinencia del uso de IA:</w:t>
+        <w:t>Sección 2 — Necesidad y pertinencia del uso de IA:</w:t>
       </w:r>
     </w:p>
     <w:p>
@@ -18065,7 +19120,7 @@
           <w:color w:val="000000"/>
           <w:highlight w:val="green"/>
         </w:rPr>
-        <w:t xml:space="preserve">Alternativa sin inteligencia artificial: describir la solución basada en reglas, automatización o análisis convencional que se evaluó, y por qué no satisface la necesidad.</w:t>
+        <w:t>Alternativa sin inteligencia artificial: describir la solución basada en reglas, automatización o análisis convencional que se evaluó, y por qué no satisface la necesidad.</w:t>
       </w:r>
     </w:p>
     <w:p>
@@ -18143,7 +19198,7 @@
           <w:color w:val="000000"/>
           <w:highlight w:val="green"/>
         </w:rPr>
-        <w:t xml:space="preserve">Costo de gobernanza previsto (monitoreo, reentrenamiento, supervisión humana y evaluación periódica) y por qué la mejora esperada lo justifica.</w:t>
+        <w:t>Costo de gobernanza previsto (monitoreo, reentrenamiento, supervisión humana y evaluación periódica) y por qué la mejora esperada lo justifica.</w:t>
       </w:r>
     </w:p>
     <w:p>
@@ -18191,7 +19246,7 @@
           <w:color w:val="000000"/>
           <w:highlight w:val="green"/>
         </w:rPr>
-        <w:t xml:space="preserve">Sección 3 — Descripción funcional y autonomía:</w:t>
+        <w:t>Sección 3 — Descripción funcional y autonomía:</w:t>
       </w:r>
     </w:p>
     <w:p>
@@ -18317,7 +19372,7 @@
           <w:color w:val="000000"/>
           <w:highlight w:val="green"/>
         </w:rPr>
-        <w:t xml:space="preserve">Punto del proceso en que interviene el SBIA y momento en que un funcionario conoce su resultado.</w:t>
+        <w:t>Punto del proceso en que interviene el SBIA y momento en que un funcionario conoce su resultado.</w:t>
       </w:r>
     </w:p>
     <w:p>
@@ -18336,7 +19391,7 @@
           <w:color w:val="000000"/>
           <w:highlight w:val="green"/>
         </w:rPr>
-        <w:t xml:space="preserve">Sección 4 — Datos:</w:t>
+        <w:t>Sección 4 — Datos:</w:t>
       </w:r>
     </w:p>
     <w:p>
@@ -18363,7 +19418,7 @@
           <w:highlight w:val="green"/>
         </w:rPr>
         <w:lastRenderedPageBreak/>
-        <w:t xml:space="preserve">Datos requeridos: fuentes, tipos y presencia de datos personales, de datos sensibles, de datos biométricos o de información sujeta a reserva tributaria.</w:t>
+        <w:t>Datos requeridos: fuentes, tipos y presencia de datos personales, de datos sensibles, de datos biométricos o de información sujeta a reserva tributaria.</w:t>
       </w:r>
     </w:p>
     <w:p>
@@ -18431,7 +19486,7 @@
           <w:color w:val="000000"/>
           <w:highlight w:val="green"/>
         </w:rPr>
-        <w:t xml:space="preserve">Sección 5 — Efecto sobre las personas y los procesos:</w:t>
+        <w:t>Sección 5 — Efecto sobre las personas y los procesos:</w:t>
       </w:r>
     </w:p>
     <w:p>
@@ -18457,7 +19512,7 @@
           <w:color w:val="000000"/>
           <w:highlight w:val="green"/>
         </w:rPr>
-        <w:t xml:space="preserve">Efecto del resultado del SBIA en derechos, obligaciones o en la atención de los administrados.</w:t>
+        <w:t>Efecto del resultado del SBIA en derechos, obligaciones o en la atención de los administrados.</w:t>
       </w:r>
     </w:p>
     <w:p>
@@ -18561,7 +19616,7 @@
           <w:color w:val="000000"/>
           <w:highlight w:val="green"/>
         </w:rPr>
-        <w:t xml:space="preserve">Clasificación de riesgo preliminar sugerida por el propietario del caso de uso conforme al Anexo N.° 2. Es referencial y no vincula a la Comisión de Gobierno de IA.</w:t>
+        <w:t>Clasificación de riesgo preliminar sugerida por el propietario del caso de uso conforme al Anexo N.° 2. Es referencial y no vincula a la Comisión de Gobierno de IA.</w:t>
       </w:r>
     </w:p>
     <w:p>
@@ -18581,7 +19636,7 @@
           <w:color w:val="000000"/>
           <w:highlight w:val="green"/>
         </w:rPr>
-        <w:t xml:space="preserve">Sección 6 — Firmas:</w:t>
+        <w:t>Sección 6 — Firmas:</w:t>
       </w:r>
     </w:p>
     <w:p>
@@ -23580,6 +24635,7 @@
   <w:style w:type="character" w:default="1" w:styleId="Fuentedeprrafopredeter">
     <w:name w:val="Default Paragraph Font"/>
     <w:uiPriority w:val="1"/>
+    <w:semiHidden/>
     <w:unhideWhenUsed/>
   </w:style>
   <w:style w:type="table" w:default="1" w:styleId="Tablanormal">
@@ -24807,12 +25863,7 @@
 </file>
 
 <file path=customXml/item1.xml><?xml version="1.0" encoding="utf-8"?>
-<?mso-contentType ?>
-<FormTemplates xmlns="http://schemas.microsoft.com/sharepoint/v3/contenttype/forms">
-  <Display>DocumentLibraryForm</Display>
-  <Edit>DocumentLibraryForm</Edit>
-  <New>DocumentLibraryForm</New>
-</FormTemplates>
+<b:Sources xmlns:b="http://schemas.openxmlformats.org/officeDocument/2006/bibliography" xmlns="http://schemas.openxmlformats.org/officeDocument/2006/bibliography" SelectedStyle="\APASixthEditionOfficeOnline.xsl" StyleName="APA" Version="6"/>
 </file>
 
 <file path=customXml/item2.xml><?xml version="1.0" encoding="utf-8"?>
@@ -24822,7 +25873,12 @@
 </file>
 
 <file path=customXml/item3.xml><?xml version="1.0" encoding="utf-8"?>
-<b:Sources xmlns:b="http://schemas.openxmlformats.org/officeDocument/2006/bibliography" xmlns="http://schemas.openxmlformats.org/officeDocument/2006/bibliography" SelectedStyle="\APASixthEditionOfficeOnline.xsl" StyleName="APA" Version="6"/>
+<?mso-contentType ?>
+<FormTemplates xmlns="http://schemas.microsoft.com/sharepoint/v3/contenttype/forms">
+  <Display>DocumentLibraryForm</Display>
+  <Edit>DocumentLibraryForm</Edit>
+  <New>DocumentLibraryForm</New>
+</FormTemplates>
 </file>
 
 <file path=customXml/item4.xml><?xml version="1.0" encoding="utf-8"?>
@@ -24964,9 +26020,9 @@
 </file>
 
 <file path=customXml/itemProps1.xml><?xml version="1.0" encoding="utf-8"?>
-<ds:datastoreItem xmlns:ds="http://schemas.openxmlformats.org/officeDocument/2006/customXml" ds:itemID="{007781DB-EED9-4359-8AD9-68137B52B701}">
+<ds:datastoreItem xmlns:ds="http://schemas.openxmlformats.org/officeDocument/2006/customXml" ds:itemID="{599D4DEC-5966-453E-8EBA-1FE602AD820F}">
   <ds:schemaRefs>
-    <ds:schemaRef ds:uri="http://schemas.microsoft.com/sharepoint/v3/contenttype/forms"/>
+    <ds:schemaRef ds:uri="http://schemas.openxmlformats.org/officeDocument/2006/bibliography"/>
   </ds:schemaRefs>
 </ds:datastoreItem>
 </file>
@@ -24981,9 +26037,9 @@
 </file>
 
 <file path=customXml/itemProps3.xml><?xml version="1.0" encoding="utf-8"?>
-<ds:datastoreItem xmlns:ds="http://schemas.openxmlformats.org/officeDocument/2006/customXml" ds:itemID="{599D4DEC-5966-453E-8EBA-1FE602AD820F}">
+<ds:datastoreItem xmlns:ds="http://schemas.openxmlformats.org/officeDocument/2006/customXml" ds:itemID="{007781DB-EED9-4359-8AD9-68137B52B701}">
   <ds:schemaRefs>
-    <ds:schemaRef ds:uri="http://schemas.openxmlformats.org/officeDocument/2006/bibliography"/>
+    <ds:schemaRef ds:uri="http://schemas.microsoft.com/sharepoint/v3/contenttype/forms"/>
   </ds:schemaRefs>
 </ds:datastoreItem>
 </file>

</xml_diff>

<commit_message>
docs: revisión de calidad (tanda 25) — depura el numeral 7.13
- 7.13: retira la ultima oracion sobre la provision de informacion por la Comision de Gobierno de IA al OIA
- Regenera el espejo de texto desde el .docx; 0 comentarios pendientes
</commit_message>
<xml_diff>
--- a/normativo/DIRECTIVA-GOBIERNO-IA.docx
+++ b/normativo/DIRECTIVA-GOBIERNO-IA.docx
@@ -9662,13 +9662,23 @@
           <w:color w:val="000000"/>
         </w:rPr>
       </w:pPr>
-      <w:r>
-        <w:rPr>
-          <w:rFonts w:ascii="Arial" w:eastAsia="Arial" w:hAnsi="Arial" w:cs="Arial"/>
-          <w:color w:val="000000"/>
-          <w:highlight w:val="green"/>
-        </w:rPr>
-        <w:t>6.1.6  Todo SBIA cuenta con un equipo técnico multidisciplinario, conformado en función de la necesidad y la complejidad de la materia o del problema público que atiende, conforme al numeral 28.3 del artículo 28 del RLIA. El propietario del caso de uso y el custodio técnico lo conforman previamente al inicio del desarrollo o adquisición, y lo integran, cuando menos, con las unidades de organización cuya competencia comprenda las materias que el SBIA involucra. Su composición se registra en la Ficha de Registro de SBIA (Anexo N.° 1).</w:t>
+      <w:proofErr w:type="gramStart"/>
+      <w:r>
+        <w:rPr>
+          <w:rFonts w:ascii="Arial" w:eastAsia="Arial" w:hAnsi="Arial" w:cs="Arial"/>
+          <w:color w:val="000000"/>
+          <w:highlight w:val="green"/>
+        </w:rPr>
+        <w:t>6.1.6  Todo</w:t>
+      </w:r>
+      <w:proofErr w:type="gramEnd"/>
+      <w:r>
+        <w:rPr>
+          <w:rFonts w:ascii="Arial" w:eastAsia="Arial" w:hAnsi="Arial" w:cs="Arial"/>
+          <w:color w:val="000000"/>
+          <w:highlight w:val="green"/>
+        </w:rPr>
+        <w:t xml:space="preserve"> SBIA cuenta con un equipo técnico multidisciplinario, conformado en función de la necesidad y la complejidad de la materia o del problema público que atiende, conforme al numeral 28.3 del artículo 28 del RLIA. El propietario del caso de uso y el custodio técnico lo conforman previamente al inicio del desarrollo o adquisición, y lo integran, cuando menos, con las unidades de organización cuya competencia comprenda las materias que el SBIA involucra. Su composición se registra en la Ficha de Registro de SBIA (Anexo N.° 1).</w:t>
       </w:r>
     </w:p>
     <w:p>
@@ -10246,7 +10256,25 @@
           <w:highlight w:val="green"/>
         </w:rPr>
         <w:tab/>
-        <w:t>El diseño de la arquitectura de los SBIA observa los Principios de Arquitectura de TI (AAT.PRAQ.01) y los Lineamientos de Arquitectura de TI (LAT.LIAQ.01) de la SUNAT, en sus versiones vigentes, en lo que corresponda a su naturaleza. La GA adecua dichos instrumentos y emite los estándares, modelos de referencia, patrones y demás documentos técnicos de arquitectura necesarios para incorporar los requisitos propios de los SBIA (modelos, conjuntos de datos, componentes generativos y agénticos, e infraestructura especializada), en el ámbito de su competencia y conforme a los literales a) y c) del artículo 130 del ROF. Los que establezcan obligaciones exigibles a las unidades de organización se aprueban como documento normativo institucional conforme al numeral 7.6 de la presente directiva.</w:t>
+        <w:t xml:space="preserve">El diseño de la arquitectura de los SBIA observa los Principios de Arquitectura de TI (AAT.PRAQ.01) y los Lineamientos de Arquitectura de TI (LAT.LIAQ.01) de la SUNAT, en sus versiones vigentes, en lo que corresponda a su naturaleza. La GA adecua dichos instrumentos y emite los estándares, modelos de referencia, patrones y demás documentos técnicos de arquitectura necesarios para incorporar los requisitos propios de los SBIA (modelos, conjuntos de datos, componentes generativos y </w:t>
+      </w:r>
+      <w:proofErr w:type="spellStart"/>
+      <w:r>
+        <w:rPr>
+          <w:rFonts w:ascii="Arial" w:eastAsia="Arial" w:hAnsi="Arial" w:cs="Arial"/>
+          <w:color w:val="000000"/>
+          <w:highlight w:val="green"/>
+        </w:rPr>
+        <w:t>agénticos</w:t>
+      </w:r>
+      <w:proofErr w:type="spellEnd"/>
+      <w:r>
+        <w:rPr>
+          <w:rFonts w:ascii="Arial" w:eastAsia="Arial" w:hAnsi="Arial" w:cs="Arial"/>
+          <w:color w:val="000000"/>
+          <w:highlight w:val="green"/>
+        </w:rPr>
+        <w:t>, e infraestructura especializada), en el ámbito de su competencia y conforme a los literales a) y c) del artículo 130 del ROF. Los que establezcan obligaciones exigibles a las unidades de organización se aprueban como documento normativo institucional conforme al numeral 7.6 de la presente directiva.</w:t>
       </w:r>
     </w:p>
     <w:p>
@@ -10874,7 +10902,25 @@
           <w:highlight w:val="green"/>
         </w:rPr>
         <w:tab/>
-        <w:t>Los SBIA cumplen la Política de Seguridad de la Información (SGSI-PO-01) y el Manual de Políticas del Sistema de Gestión de Seguridad de la Información (SGSI-MA-03) de la SUNAT, en sus versiones vigentes. El Manual de Políticas es de aplicación a todos los colaboradores, al personal de modalidades formativas y a los terceros vinculados que gestionen información de la institución. Cuando un SBIA constituya un activo de información de un proceso comprendido en el alcance del Sistema de Gestión de Seguridad de la Información, le son exigibles además los demás documentos normativos y lineamientos de dicho Sistema.</w:t>
+        <w:t xml:space="preserve">Los SBIA cumplen la Política de Seguridad de la Información (SGSI-PO-01) y el Manual de Políticas del Sistema de Gestión de Seguridad de la Información (SGSI-MA-03) de la SUNAT, en sus versiones vigentes. El Manual de Políticas </w:t>
+      </w:r>
+      <w:proofErr w:type="gramStart"/>
+      <w:r>
+        <w:rPr>
+          <w:rFonts w:ascii="Arial" w:eastAsia="Arial" w:hAnsi="Arial" w:cs="Arial"/>
+          <w:color w:val="000000"/>
+          <w:highlight w:val="green"/>
+        </w:rPr>
+        <w:t>es de aplicación</w:t>
+      </w:r>
+      <w:proofErr w:type="gramEnd"/>
+      <w:r>
+        <w:rPr>
+          <w:rFonts w:ascii="Arial" w:eastAsia="Arial" w:hAnsi="Arial" w:cs="Arial"/>
+          <w:color w:val="000000"/>
+          <w:highlight w:val="green"/>
+        </w:rPr>
+        <w:t xml:space="preserve"> a todos los colaboradores, al personal de modalidades formativas y a los terceros vinculados que gestionen información de la institución. Cuando un SBIA constituya un activo de información de un proceso comprendido en el alcance del Sistema de Gestión de Seguridad de la Información, le son exigibles además los demás documentos normativos y lineamientos de dicho Sistema.</w:t>
       </w:r>
     </w:p>
     <w:p>
@@ -11302,13 +11348,23 @@
           <w:color w:val="000000"/>
         </w:rPr>
       </w:pPr>
-      <w:r>
-        <w:rPr>
-          <w:rFonts w:ascii="Arial" w:eastAsia="Arial" w:hAnsi="Arial" w:cs="Arial"/>
-          <w:color w:val="000000"/>
-          <w:highlight w:val="green"/>
-        </w:rPr>
-        <w:t xml:space="preserve">6.7.8  El propietario del caso de uso, con el custodio técnico del SBIA, define el tratamiento de conservación y eliminación de las instrucciones (prompt), respuestas, contextos, representaciones vectoriales (embeddings), registros de interacción y demás información que el SBIA genere o procese durante su operación. El plazo de conservación se determina en función del nivel de riesgo del SBIA, del valor probatorio de la información, de su sensibilidad y de los requisitos de auditoría aplicables, y observa la normativa institucional de gestión documental y archivo que resulte aplicable. En tanto dicha normativa no comprenda la información que el SBIA genera, el plazo se fija en el plan de monitoreo del SBIA y no puede ser inferior al exigido por la normativa tributaria y aduanera para la actuación en que el SBIA interviene. Para determinar dicho mínimo, la Comisión de Gobierno de IA convoca a la Intendencia Nacional Jurídico Tributaria o a la Intendencia Nacional Jurídico Aduanera, según la materia. La conservación, el acceso y el uso de dicha información observan la </w:t>
+      <w:proofErr w:type="gramStart"/>
+      <w:r>
+        <w:rPr>
+          <w:rFonts w:ascii="Arial" w:eastAsia="Arial" w:hAnsi="Arial" w:cs="Arial"/>
+          <w:color w:val="000000"/>
+          <w:highlight w:val="green"/>
+        </w:rPr>
+        <w:t>6.7.8  El</w:t>
+      </w:r>
+      <w:proofErr w:type="gramEnd"/>
+      <w:r>
+        <w:rPr>
+          <w:rFonts w:ascii="Arial" w:eastAsia="Arial" w:hAnsi="Arial" w:cs="Arial"/>
+          <w:color w:val="000000"/>
+          <w:highlight w:val="green"/>
+        </w:rPr>
+        <w:t xml:space="preserve"> propietario del caso de uso, con el custodio técnico del SBIA, define el tratamiento de conservación y eliminación de las instrucciones (prompt), respuestas, contextos, representaciones vectoriales (embeddings), registros de interacción y demás información que el SBIA genere o procese durante su operación. El plazo de conservación se determina en función del nivel de riesgo del SBIA, del valor probatorio de la información, de su sensibilidad y de los requisitos de auditoría aplicables, y observa la normativa institucional de gestión documental y archivo que resulte aplicable. En tanto dicha normativa no comprenda la información que el SBIA genera, el plazo se fija en el plan de monitoreo del SBIA y no puede ser inferior al exigido por la normativa tributaria y aduanera para la actuación en que el SBIA interviene. Para determinar dicho mínimo, la Comisión de Gobierno de IA convoca a la Intendencia Nacional Jurídico Tributaria o a la Intendencia Nacional Jurídico Aduanera, según la materia. La conservación, el acceso y el uso de dicha información observan la </w:t>
       </w:r>
       <w:r>
         <w:rPr>
@@ -11985,7 +12041,25 @@
           <w:color w:val="000000"/>
           <w:highlight w:val="green"/>
         </w:rPr>
-        <w:t>Cuando el plan de monitoreo prevea vigilancia automatizada, esta opera durante el horario de operación del SBIA, salvo que su criticidad justifique cobertura permanente, lo que se sustenta en el mismo plan.</w:t>
+        <w:t xml:space="preserve">Cuando el plan de monitoreo prevea vigilancia automatizada, esta </w:t>
+      </w:r>
+      <w:proofErr w:type="spellStart"/>
+      <w:r>
+        <w:rPr>
+          <w:rFonts w:ascii="Arial" w:eastAsia="Arial" w:hAnsi="Arial" w:cs="Arial"/>
+          <w:color w:val="000000"/>
+          <w:highlight w:val="green"/>
+        </w:rPr>
+        <w:t>opera</w:t>
+      </w:r>
+      <w:proofErr w:type="spellEnd"/>
+      <w:r>
+        <w:rPr>
+          <w:rFonts w:ascii="Arial" w:eastAsia="Arial" w:hAnsi="Arial" w:cs="Arial"/>
+          <w:color w:val="000000"/>
+          <w:highlight w:val="green"/>
+        </w:rPr>
+        <w:t xml:space="preserve"> durante el horario de operación del SBIA, salvo que su criticidad justifique cobertura permanente, lo que se sustenta en el mismo plan.</w:t>
       </w:r>
     </w:p>
     <w:p>
@@ -13454,7 +13528,25 @@
           <w:color w:val="000000"/>
           <w:highlight w:val="yellow"/>
         </w:rPr>
-        <w:t xml:space="preserve"> son de aplicación en la SUNAT desde su entrada en vigencia. La Comisión de Gobierno de IA evalúa su impacto en la presente directiva y propone al CGTD los ajustes que correspondan.</w:t>
+        <w:t xml:space="preserve"> </w:t>
+      </w:r>
+      <w:proofErr w:type="gramStart"/>
+      <w:r>
+        <w:rPr>
+          <w:rFonts w:ascii="Arial" w:eastAsia="Arial" w:hAnsi="Arial" w:cs="Arial"/>
+          <w:color w:val="000000"/>
+          <w:highlight w:val="yellow"/>
+        </w:rPr>
+        <w:t>son de aplicación</w:t>
+      </w:r>
+      <w:proofErr w:type="gramEnd"/>
+      <w:r>
+        <w:rPr>
+          <w:rFonts w:ascii="Arial" w:eastAsia="Arial" w:hAnsi="Arial" w:cs="Arial"/>
+          <w:color w:val="000000"/>
+          <w:highlight w:val="yellow"/>
+        </w:rPr>
+        <w:t xml:space="preserve"> en la SUNAT desde su entrada en vigencia. La Comisión de Gobierno de IA evalúa su impacto en la presente directiva y propone al CGTD los ajustes que correspondan.</w:t>
       </w:r>
     </w:p>
     <w:p>
@@ -14441,7 +14533,20 @@
           <w:bCs w:val="0"/>
         </w:rPr>
         <w:tab/>
-        <w:t>El OIA reporta trimestralmente al CGTD el seguimiento de la implementación del PAIA, conforme al numeral 8.3 del artículo 8 de la Resolución Ministerial N.° 152-2026-PCM. Dicho reporte se integra al informe trimestral de gobierno de IA previsto en el numeral 6.9.5. Asimismo, el OIA registra los avances de la implementación del PAIA en la Plataforma de Cumplimiento Digital, en el último trimestre de cada año, conforme al numeral 8.4 del mismo artículo. La Comisión de Gobierno de IA le proporciona la información institucional que requiera para ambos fines.</w:t>
+      </w:r>
+      <w:r>
+        <w:rPr>
+          <w:b w:val="0"/>
+          <w:bCs w:val="0"/>
+        </w:rPr>
+        <w:t xml:space="preserve">El OIA reporta trimestralmente al CGTD el seguimiento de la implementación del PAIA, conforme al numeral 8.3 del artículo 8 de la Resolución Ministerial N.° 152-2026-PCM. Dicho reporte se integra al informe trimestral de gobierno de IA previsto en el numeral 6.9.5. Asimismo, el OIA registra los avances de la implementación del PAIA en la Plataforma de Cumplimiento Digital, en el último trimestre de cada año, conforme al numeral 8.4 del mismo </w:t>
+      </w:r>
+      <w:r>
+        <w:rPr>
+          <w:b w:val="0"/>
+          <w:bCs w:val="0"/>
+        </w:rPr>
+        <w:t>artículo.</w:t>
       </w:r>
     </w:p>
     <w:p>
@@ -15613,7 +15718,23 @@
                 <w:rFonts w:ascii="Arial" w:eastAsia="Arial" w:hAnsi="Arial" w:cs="Arial"/>
                 <w:lang w:val="en-US"/>
               </w:rPr>
-              <w:t>Human-in-the-loop, on-the-loop o in-command.</w:t>
+              <w:t xml:space="preserve">Human-in-the-loop, on-the-loop </w:t>
+            </w:r>
+            <w:proofErr w:type="gramStart"/>
+            <w:r>
+              <w:rPr>
+                <w:rFonts w:ascii="Arial" w:eastAsia="Arial" w:hAnsi="Arial" w:cs="Arial"/>
+                <w:lang w:val="en-US"/>
+              </w:rPr>
+              <w:t>o in</w:t>
+            </w:r>
+            <w:proofErr w:type="gramEnd"/>
+            <w:r>
+              <w:rPr>
+                <w:rFonts w:ascii="Arial" w:eastAsia="Arial" w:hAnsi="Arial" w:cs="Arial"/>
+                <w:lang w:val="en-US"/>
+              </w:rPr>
+              <w:t>-command.</w:t>
             </w:r>
           </w:p>
         </w:tc>
@@ -19378,6 +19499,24 @@
     <w:p>
       <w:pPr>
         <w:spacing w:before="120" w:after="40" w:line="276" w:lineRule="auto"/>
+        <w:rPr>
+          <w:color w:val="000000"/>
+          <w:highlight w:val="green"/>
+        </w:rPr>
+      </w:pPr>
+    </w:p>
+    <w:p>
+      <w:pPr>
+        <w:spacing w:before="120" w:after="40" w:line="276" w:lineRule="auto"/>
+        <w:rPr>
+          <w:color w:val="000000"/>
+          <w:highlight w:val="green"/>
+        </w:rPr>
+      </w:pPr>
+    </w:p>
+    <w:p>
+      <w:pPr>
+        <w:spacing w:before="120" w:after="40" w:line="276" w:lineRule="auto"/>
         <w:jc w:val="both"/>
         <w:rPr>
           <w:rFonts w:ascii="Arial" w:hAnsi="Arial" w:cs="Arial"/>
@@ -19391,6 +19530,7 @@
           <w:color w:val="000000"/>
           <w:highlight w:val="green"/>
         </w:rPr>
+        <w:lastRenderedPageBreak/>
         <w:t>Sección 4 — Datos:</w:t>
       </w:r>
     </w:p>
@@ -19417,7 +19557,6 @@
           <w:color w:val="000000"/>
           <w:highlight w:val="green"/>
         </w:rPr>
-        <w:lastRenderedPageBreak/>
         <w:t>Datos requeridos: fuentes, tipos y presencia de datos personales, de datos sensibles, de datos biométricos o de información sujeta a reserva tributaria.</w:t>
       </w:r>
     </w:p>
@@ -24635,7 +24774,6 @@
   <w:style w:type="character" w:default="1" w:styleId="Fuentedeprrafopredeter">
     <w:name w:val="Default Paragraph Font"/>
     <w:uiPriority w:val="1"/>
-    <w:semiHidden/>
     <w:unhideWhenUsed/>
   </w:style>
   <w:style w:type="table" w:default="1" w:styleId="Tablanormal">

</xml_diff>

<commit_message>
docs: revisión de calidad (tanda 26) — precisa el rol del CGTD sobre el PAIA y simplifica la condición transitoria del 7.10
- Matriz de responsabilidades (CGTD): el CGTD valida el PAIA (antes "aprueba"), conforme al numeral 5.3 del articulo 5 de la RM N.° 152-2026-PCM y al numeral 7.11 de la directiva; la aprobacion de los casos de uso se mantiene como funcion diferenciada
- 7.10: simplifica la condicion transitoria de la coordinacion tecnica a "en tanto no se designe al OIA" (retira la referencia a la falta de lineamientos de la SGTD)
- Regenera el espejo de texto desde el .docx; 0 comentarios pendientes
</commit_message>
<xml_diff>
--- a/normativo/DIRECTIVA-GOBIERNO-IA.docx
+++ b/normativo/DIRECTIVA-GOBIERNO-IA.docx
@@ -5166,7 +5166,15 @@
                 <w:bCs w:val="0"/>
                 <w:highlight w:val="green"/>
               </w:rPr>
-              <w:t>Aprueba los casos de uso y el Plan de Acción de Inteligencia Artificial, conforme al numeral 7.11.</w:t>
+              <w:t xml:space="preserve">Aprueba los casos de uso. Valida el Plan de Acción de Inteligencia Artificial, conforme al numeral 5.3 del artículo 5 de la Resolución Ministerial N.° 152-2026-PCM y al numeral 7.11 de la presente </w:t>
+            </w:r>
+            <w:r>
+              <w:rPr>
+                <w:b w:val="0"/>
+                <w:bCs w:val="0"/>
+                <w:highlight w:val="green"/>
+              </w:rPr>
+              <w:t>directiva.</w:t>
             </w:r>
           </w:p>
           <w:p>
@@ -5270,6 +5278,7 @@
                 <w:b/>
                 <w:bCs/>
               </w:rPr>
+              <w:lastRenderedPageBreak/>
               <w:t>Comisión de Gobierno de IA</w:t>
             </w:r>
           </w:p>
@@ -5343,15 +5352,7 @@
                 <w:b w:val="0"/>
                 <w:bCs w:val="0"/>
               </w:rPr>
-              <w:t xml:space="preserve">Preparar la propuesta del Plan de Acción de Inteligencia Artificial y sus </w:t>
-            </w:r>
-            <w:r>
-              <w:rPr>
-                <w:b w:val="0"/>
-                <w:bCs w:val="0"/>
-              </w:rPr>
-              <w:lastRenderedPageBreak/>
-              <w:t>actualizaciones, conforme al numeral 7.11.</w:t>
+              <w:t>Preparar la propuesta del Plan de Acción de Inteligencia Artificial y sus actualizaciones, conforme al numeral 7.11.</w:t>
             </w:r>
           </w:p>
           <w:p>
@@ -5522,16 +5523,8 @@
                 <w:bCs w:val="0"/>
                 <w:highlight w:val="green"/>
               </w:rPr>
-              <w:t xml:space="preserve">Aprobar los hitos del ciclo de vida que le corresponden conforme al </w:t>
-            </w:r>
-            <w:r>
-              <w:rPr>
-                <w:b w:val="0"/>
-                <w:bCs w:val="0"/>
-                <w:highlight w:val="green"/>
-              </w:rPr>
               <w:lastRenderedPageBreak/>
-              <w:t>numeral 6.1.2 y el ciclo de vida simplificado de los SBIA de riesgo aceptable.</w:t>
+              <w:t>Aprobar los hitos del ciclo de vida que le corresponden conforme al numeral 6.1.2 y el ciclo de vida simplificado de los SBIA de riesgo aceptable.</w:t>
             </w:r>
           </w:p>
           <w:p>
@@ -5949,7 +5942,7 @@
                 <w:b w:val="0"/>
                 <w:bCs w:val="0"/>
               </w:rPr>
-              <w:t xml:space="preserve">Supervisa y evalúa que los modelos y algoritmos de los SBIA de riesgo alto cumplan los estándares de calidad y ética aplicables, conforme al numeral 6.5 del artículo 6 de la Resolución Ministerial N.° 152-2026-PCM. La ejerce en coordinación con las unidades de organización y con los propietarios de los casos de uso, </w:t>
+              <w:t xml:space="preserve">Supervisa y evalúa que los modelos y algoritmos de los SBIA de riesgo alto cumplan los estándares de calidad y ética aplicables, conforme al numeral 6.5 del artículo 6 de la Resolución Ministerial N.° 152-2026-PCM. La ejerce en coordinación con </w:t>
             </w:r>
             <w:r>
               <w:rPr>
@@ -5957,7 +5950,7 @@
                 <w:bCs w:val="0"/>
               </w:rPr>
               <w:lastRenderedPageBreak/>
-              <w:t>y se apoya en las verificaciones previstas en los numerales 6.10.3 y 6.14.</w:t>
+              <w:t>las unidades de organización y con los propietarios de los casos de uso, y se apoya en las verificaciones previstas en los numerales 6.10.3 y 6.14.</w:t>
             </w:r>
           </w:p>
         </w:tc>
@@ -6359,7 +6352,7 @@
                 <w:color w:val="000000"/>
                 <w:highlight w:val="green"/>
               </w:rPr>
-              <w:t xml:space="preserve">En materia de seguridad digital: asegura y supervisa la adopción de los estándares y normas técnicas de seguridad de la información cuando la INSI desarrolla, adquiere o terceriza SBIA. Propone las medidas de gestión de riesgos de seguridad de la información aplicables a los SBIA. Comunica al Centro Nacional de Seguridad Digital (CNSD) los incidentes de seguridad digital que involucren un SBIA y los informa a la máxima autoridad administrativa de la entidad, conforme a la Directiva N.° 001-2023-PCM/SGTD. Informa al </w:t>
+              <w:t xml:space="preserve">En materia de seguridad digital: asegura y supervisa la adopción de los estándares y normas técnicas de seguridad de la información cuando la INSI desarrolla, adquiere o terceriza SBIA. Propone las medidas de gestión de riesgos de seguridad de la información aplicables a los SBIA. Comunica al Centro Nacional de Seguridad Digital (CNSD) los incidentes de seguridad digital que involucren un SBIA y los informa a la máxima autoridad administrativa de la </w:t>
             </w:r>
             <w:r>
               <w:rPr>
@@ -6369,7 +6362,7 @@
                 <w:highlight w:val="green"/>
               </w:rPr>
               <w:lastRenderedPageBreak/>
-              <w:t>CGTD los que resulten críticos. Cuando un SBIA constituya un activo de información de un proceso comprendido en el alcance del SGSI, coordina la aplicación de los controles que correspondan.</w:t>
+              <w:t>entidad, conforme a la Directiva N.° 001-2023-PCM/SGTD. Informa al CGTD los que resulten críticos. Cuando un SBIA constituya un activo de información de un proceso comprendido en el alcance del SGSI, coordina la aplicación de los controles que correspondan.</w:t>
             </w:r>
           </w:p>
         </w:tc>
@@ -6671,7 +6664,16 @@
                 <w:bCs w:val="0"/>
                 <w:highlight w:val="green"/>
               </w:rPr>
-              <w:t>Revisa la EIA en materia de cumplimiento normativo. Cuando la revisión comprenda el sentido y el alcance de las normas tributarias o aduaneras, se pronuncia la Intendencia Nacional Jurídico Tributaria o la Intendencia Nacional Jurídico Aduanera, según la materia, a convocatoria de la Comisión de Gobierno de IA.</w:t>
+              <w:t xml:space="preserve">Revisa la EIA en materia de cumplimiento normativo. Cuando la revisión comprenda el sentido y el alcance de las normas tributarias o aduaneras, se pronuncia la Intendencia Nacional Jurídico Tributaria o la Intendencia Nacional Jurídico Aduanera, según la </w:t>
+            </w:r>
+            <w:r>
+              <w:rPr>
+                <w:b w:val="0"/>
+                <w:bCs w:val="0"/>
+                <w:highlight w:val="green"/>
+              </w:rPr>
+              <w:lastRenderedPageBreak/>
+              <w:t>materia, a convocatoria de la Comisión de Gobierno de IA.</w:t>
             </w:r>
           </w:p>
           <w:p>
@@ -6695,7 +6697,6 @@
                 <w:bCs w:val="0"/>
                 <w:highlight w:val="yellow"/>
               </w:rPr>
-              <w:lastRenderedPageBreak/>
               <w:t xml:space="preserve">Emite opinión previa sobre contratos con proveedores internacionales de IA. </w:t>
             </w:r>
           </w:p>
@@ -7162,17 +7163,8 @@
                 <w:bCs/>
                 <w:highlight w:val="yellow"/>
               </w:rPr>
-              <w:t xml:space="preserve">Integración de programas y </w:t>
-            </w:r>
-            <w:r>
-              <w:rPr>
-                <w:rFonts w:ascii="Arial" w:eastAsia="Arial" w:hAnsi="Arial" w:cs="Arial"/>
-                <w:b/>
-                <w:bCs/>
-                <w:highlight w:val="yellow"/>
-              </w:rPr>
               <w:lastRenderedPageBreak/>
-              <w:t>proyectos institucionales</w:t>
+              <w:t>Integración de programas y proyectos institucionales</w:t>
             </w:r>
           </w:p>
         </w:tc>
@@ -7205,7 +7197,6 @@
                 <w:rFonts w:ascii="Arial" w:eastAsia="Arial" w:hAnsi="Arial" w:cs="Arial"/>
                 <w:highlight w:val="yellow"/>
               </w:rPr>
-              <w:lastRenderedPageBreak/>
               <w:t>OIPPI</w:t>
             </w:r>
           </w:p>
@@ -7249,16 +7240,7 @@
                 <w:bCs w:val="0"/>
                 <w:highlight w:val="yellow"/>
               </w:rPr>
-              <w:t xml:space="preserve">Promueve un enfoque holístico, sistemático y con sinergia en el </w:t>
-            </w:r>
-            <w:r>
-              <w:rPr>
-                <w:b w:val="0"/>
-                <w:bCs w:val="0"/>
-                <w:highlight w:val="yellow"/>
-              </w:rPr>
-              <w:lastRenderedPageBreak/>
-              <w:t>desarrollo del caso de negocio de las iniciativas de SBIA.</w:t>
+              <w:t>Promueve un enfoque holístico, sistemático y con sinergia en el desarrollo del caso de negocio de las iniciativas de SBIA.</w:t>
             </w:r>
           </w:p>
           <w:p>
@@ -7321,7 +7303,6 @@
                 <w:bCs/>
                 <w:highlight w:val="lightGray"/>
               </w:rPr>
-              <w:lastRenderedPageBreak/>
               <w:t>Visión de negocio</w:t>
             </w:r>
           </w:p>
@@ -7623,16 +7604,8 @@
                 <w:bCs w:val="0"/>
                 <w:highlight w:val="yellow"/>
               </w:rPr>
-              <w:t xml:space="preserve">Promueve la adopción de la inteligencia artificial en el ámbito de </w:t>
-            </w:r>
-            <w:r>
-              <w:rPr>
-                <w:b w:val="0"/>
-                <w:bCs w:val="0"/>
-                <w:highlight w:val="yellow"/>
-              </w:rPr>
               <w:lastRenderedPageBreak/>
-              <w:t>las personas, conforme al numeral 6.13.3.</w:t>
+              <w:t>Promueve la adopción de la inteligencia artificial en el ámbito de las personas, conforme al numeral 6.13.3.</w:t>
             </w:r>
           </w:p>
           <w:p>
@@ -8014,7 +7987,7 @@
                 <w:b w:val="0"/>
                 <w:bCs w:val="0"/>
               </w:rPr>
-              <w:t xml:space="preserve">Cuando la materia tenga incidencia tributaria, coordina con la Intendencia Nacional Jurídico </w:t>
+              <w:t xml:space="preserve">Cuando la materia tenga incidencia tributaria, coordina con la </w:t>
             </w:r>
             <w:r>
               <w:rPr>
@@ -8022,7 +7995,7 @@
                 <w:bCs w:val="0"/>
               </w:rPr>
               <w:lastRenderedPageBreak/>
-              <w:t>Tributaria, conforme al literal c) del citado artículo.</w:t>
+              <w:t>Intendencia Nacional Jurídico Tributaria, conforme al literal c) del citado artículo.</w:t>
             </w:r>
           </w:p>
           <w:p>
@@ -8469,7 +8442,7 @@
                 <w:rFonts w:ascii="Arial" w:eastAsia="Arial" w:hAnsi="Arial" w:cs="Arial"/>
                 <w:highlight w:val="green"/>
               </w:rPr>
-              <w:t xml:space="preserve">La etapa concluye con la presentación a la Comisión de Gobierno de IA de la Ficha de Evaluación de Caso de Uso. La Ficha se presenta suscrita por el propietario del caso de uso y con el visto bueno del titular de su unidad de organización, conforme a la Sección 6 del Anexo N.° 4. La etapa no comporta hito </w:t>
+              <w:t xml:space="preserve">La etapa concluye con la presentación a la Comisión de Gobierno de IA de la Ficha de Evaluación de Caso de Uso. La Ficha se presenta suscrita por el propietario del caso de uso y con el visto bueno del titular de su unidad de organización, conforme a la Sección 6 del Anexo N.° 4. La </w:t>
             </w:r>
             <w:r>
               <w:rPr>
@@ -8477,7 +8450,7 @@
                 <w:highlight w:val="green"/>
               </w:rPr>
               <w:lastRenderedPageBreak/>
-              <w:t>de aprobación: la evaluación del componente de IA y la aprobación corresponden a la etapa 2.</w:t>
+              <w:t>etapa no comporta hito de aprobación: la evaluación del componente de IA y la aprobación corresponden a la etapa 2.</w:t>
             </w:r>
           </w:p>
         </w:tc>
@@ -8849,7 +8822,7 @@
                 <w:rFonts w:ascii="Arial" w:eastAsia="Arial" w:hAnsi="Arial" w:cs="Arial"/>
                 <w:highlight w:val="green"/>
               </w:rPr>
-              <w:t xml:space="preserve">Las gerencias competentes de la INSI ejecutan el desarrollo del SBIA o gestionan su adquisición. La Oficina de Seguridad Informática evalúa y propone los requisitos de seguridad del SBIA, </w:t>
+              <w:t xml:space="preserve">Las gerencias competentes de la INSI ejecutan el desarrollo del SBIA o gestionan su adquisición. La Oficina de Seguridad Informática evalúa y propone los </w:t>
             </w:r>
             <w:r>
               <w:rPr>
@@ -8857,7 +8830,7 @@
                 <w:highlight w:val="green"/>
               </w:rPr>
               <w:lastRenderedPageBreak/>
-              <w:t>conforme al literal e) del artículo 106 del ROF; dichos requisitos se incorporan como requisitos no funcionales y su implementación se verifica en la etapa de certificación y validación. El mecanismo de supervisión humana definido en la etapa de diseño se implementa en esta etapa conforme al numeral 6.6.2, y es distinto de los requisitos de seguridad antes señalados; su definición corresponde al propietario del caso de uso</w:t>
+              <w:t>requisitos de seguridad del SBIA, conforme al literal e) del artículo 106 del ROF; dichos requisitos se incorporan como requisitos no funcionales y su implementación se verifica en la etapa de certificación y validación. El mecanismo de supervisión humana definido en la etapa de diseño se implementa en esta etapa conforme al numeral 6.6.2, y es distinto de los requisitos de seguridad antes señalados; su definición corresponde al propietario del caso de uso</w:t>
             </w:r>
             <w:r>
               <w:rPr>
@@ -8896,14 +8869,14 @@
                 <w:rFonts w:ascii="Arial" w:eastAsia="Arial" w:hAnsi="Arial" w:cs="Arial"/>
               </w:rPr>
               <w:lastRenderedPageBreak/>
-              <w:t xml:space="preserve">En desarrollo interno: Conformidad de Gerencia de Desarrollo de Sistemas (INSI). En adquisición: Conformidad de la </w:t>
+              <w:t xml:space="preserve">En desarrollo interno: Conformidad de Gerencia de Desarrollo de Sistemas (INSI). En adquisición: </w:t>
             </w:r>
             <w:r>
               <w:rPr>
                 <w:rFonts w:ascii="Arial" w:eastAsia="Arial" w:hAnsi="Arial" w:cs="Arial"/>
               </w:rPr>
               <w:lastRenderedPageBreak/>
-              <w:t>gerencia INSI responsable.</w:t>
+              <w:t>Conformidad de la gerencia INSI responsable.</w:t>
             </w:r>
           </w:p>
         </w:tc>
@@ -9039,7 +9012,7 @@
                 <w:rFonts w:ascii="Arial" w:hAnsi="Arial" w:cs="Arial"/>
                 <w:highlight w:val="green"/>
               </w:rPr>
-              <w:t xml:space="preserve">La Gerencia de Calidad de Sistemas conduce el control y aseguramiento de la calidad y la División de Control de Calidad efectúa la verificación y validación de la calidad, conforme al numeral 6.10.3. La Oficina de Seguridad Informática efectúa el análisis de riesgo y las pruebas de vulnerabilidad sobre la arquitectura de aplicaciones, de información y de infraestructura tecnológica que soporta el SBIA, incluido el red teaming para riesgo alto, y verifica la implementación de los requisitos de seguridad propuestos en la etapa anterior. El propietario del caso de </w:t>
+              <w:t xml:space="preserve">La Gerencia de Calidad de Sistemas conduce el control y aseguramiento de la calidad y la División de Control de Calidad efectúa la verificación y validación de la calidad, conforme al numeral 6.10.3. La Oficina de Seguridad Informática efectúa el análisis de riesgo y las pruebas de vulnerabilidad sobre la arquitectura de aplicaciones, de información y de infraestructura tecnológica que soporta el SBIA, incluido el red teaming para riesgo alto, y verifica la implementación de los requisitos de seguridad propuestos en la etapa anterior. El </w:t>
             </w:r>
             <w:r>
               <w:rPr>
@@ -9047,7 +9020,7 @@
                 <w:highlight w:val="green"/>
               </w:rPr>
               <w:lastRenderedPageBreak/>
-              <w:t>uso verifica la implementación del mecanismo de supervisión humana conforme al numeral 6.6.2. La Comisión de Gobierno de IA verifica la implementación de los controles, del mecanismo de supervisión humana y de las medidas frente al sesgo, conforme a los numerales 6.2.5, 6.6.2 y 6.6.4. Asimismo, aprueba el plan de monitoreo del SBIA conforme al numeral 6.10.1. La aprobación requiere la conformidad de la División de Control de Calidad, de la Oficina de Seguridad Informática, del propietario del caso de uso y de la Comisión de Gobierno de IA. La titularidad de la aprobación se determina conforme al numeral 6.1.2.</w:t>
+              <w:t>propietario del caso de uso verifica la implementación del mecanismo de supervisión humana conforme al numeral 6.6.2. La Comisión de Gobierno de IA verifica la implementación de los controles, del mecanismo de supervisión humana y de las medidas frente al sesgo, conforme a los numerales 6.2.5, 6.6.2 y 6.6.4. Asimismo, aprueba el plan de monitoreo del SBIA conforme al numeral 6.10.1. La aprobación requiere la conformidad de la División de Control de Calidad, de la Oficina de Seguridad Informática, del propietario del caso de uso y de la Comisión de Gobierno de IA. La titularidad de la aprobación se determina conforme al numeral 6.1.2.</w:t>
             </w:r>
           </w:p>
         </w:tc>
@@ -9284,7 +9257,7 @@
                 <w:rFonts w:ascii="Arial" w:eastAsia="Arial" w:hAnsi="Arial" w:cs="Arial"/>
                 <w:highlight w:val="yellow"/>
               </w:rPr>
-              <w:t xml:space="preserve">El SBIA opera bajo la supervisión humana y el monitoreo previstos en los numerales 6.6 y 6.10. Los </w:t>
+              <w:t xml:space="preserve">El SBIA opera bajo la supervisión humana y el monitoreo previstos </w:t>
             </w:r>
             <w:r>
               <w:rPr>
@@ -9292,7 +9265,7 @@
                 <w:highlight w:val="yellow"/>
               </w:rPr>
               <w:lastRenderedPageBreak/>
-              <w:t>incidentes se gestionan conforme al numeral 6.7.5.</w:t>
+              <w:t>en los numerales 6.6 y 6.10. Los incidentes se gestionan conforme al numeral 6.7.5.</w:t>
             </w:r>
           </w:p>
         </w:tc>
@@ -9585,7 +9558,7 @@
           <w:highlight w:val="green"/>
         </w:rPr>
         <w:tab/>
-        <w:t xml:space="preserve">El pronunciamiento de la Comisión de Gobierno de IA en los hitos del ciclo de vida recae sobre el componente de IA, conforme al numeral 6.15.1. Cuando la Ficha de Evaluación de Caso de Uso (Anexo N.° 4) no contiene la información necesaria para pronunciarse, la Comisión acompaña al propietario del caso de uso a completarla y se pronuncia una vez que la recibe. La falta de información no es causal de pronunciamiento no favorable. La Comisión otorga al propietario del caso de uso un plazo para completarla. Vencido el plazo sin que la información se complete, la Comisión eleva el caso al CGTD para que disponga lo que corresponda. El pronunciamiento no favorable se fundamenta por escrito y se eleva al CGTD. Cuando invoca el uso indebido o una </w:t>
+        <w:t xml:space="preserve">El pronunciamiento de la Comisión de Gobierno de IA en los hitos del ciclo de vida recae sobre el componente de IA, conforme al numeral 6.15.1. Cuando la Ficha de Evaluación de Caso de Uso (Anexo N.° 4) no contiene la información necesaria para pronunciarse, la Comisión acompaña al propietario del caso de uso a completarla y se pronuncia una vez que la recibe. La falta de información no es causal de pronunciamiento no favorable. La Comisión otorga al propietario del caso de uso un plazo para completarla. Vencido el plazo sin que la información se complete, la Comisión eleva el caso al CGTD para que disponga lo que corresponda. El pronunciamiento no favorable se fundamenta </w:t>
       </w:r>
       <w:r>
         <w:rPr>
@@ -9594,7 +9567,7 @@
           <w:highlight w:val="green"/>
         </w:rPr>
         <w:lastRenderedPageBreak/>
-        <w:t>contravención normativa, el CGTD verifica la causal y, si concurre, deja constancia en acta de que el caso de uso no procede. Cuando invoca que el resultado esperado se alcanza sin inteligencia artificial, el CGTD resuelve en acta si el caso de uso continúa con el componente de IA o sin él.</w:t>
+        <w:t>por escrito y se eleva al CGTD. Cuando invoca el uso indebido o una contravención normativa, el CGTD verifica la causal y, si concurre, deja constancia en acta de que el caso de uso no procede. Cuando invoca que el resultado esperado se alcanza sin inteligencia artificial, el CGTD resuelve en acta si el caso de uso continúa con el componente de IA o sin él.</w:t>
       </w:r>
     </w:p>
     <w:p>
@@ -14435,7 +14408,22 @@
           <w:bCs w:val="0"/>
           <w:highlight w:val="green"/>
         </w:rPr>
-        <w:t xml:space="preserve">En tanto no se emitan dichos lineamientos y no se designe al OIA, el Coordinador designado conforme al numeral 7.3 ejerce las funciones de coordinación técnica en materia de IA. Designado el OIA, la coordinación de la Comisión de Gobierno de IA recae en él, </w:t>
+        <w:t>En tanto no se designe al OIA, el Coordinador designado conforme al numeral 7.3 ejerce las funciones de coordinación técnica en materia de IA.</w:t>
+      </w:r>
+      <w:r>
+        <w:rPr>
+          <w:b w:val="0"/>
+          <w:bCs w:val="0"/>
+        </w:rPr>
+        <w:t xml:space="preserve"> </w:t>
+      </w:r>
+      <w:r>
+        <w:rPr>
+          <w:b w:val="0"/>
+          <w:bCs w:val="0"/>
+          <w:highlight w:val="green"/>
+        </w:rPr>
+        <w:t xml:space="preserve">Designado el OIA, la coordinación de la Comisión de Gobierno de IA recae en él, salvo que los lineamientos de la SGTD </w:t>
       </w:r>
       <w:r>
         <w:rPr>
@@ -14444,7 +14432,7 @@
           <w:highlight w:val="green"/>
         </w:rPr>
         <w:lastRenderedPageBreak/>
-        <w:t>salvo que los lineamientos de la SGTD dispongan una articulación distinta. La Comisión de Gobierno de IA evalúa su articulación conforme a dichos lineamientos y propone al CGTD los ajustes que correspondan.</w:t>
+        <w:t>dispongan una articulación distinta. La Comisión de Gobierno de IA evalúa su articulación conforme a dichos lineamientos y propone al CGTD los ajustes que correspondan.</w:t>
       </w:r>
       <w:r>
         <w:rPr>

</xml_diff>

<commit_message>
docs: revisión de calidad (tanda 27) — normaliza el formato de numeración de los numerales
- Uniformiza a tabulacion el separador entre el numero de parrafo y el texto en todos los numerales
- Corrige la sangria de los numerales 6.15.8, 6.15.9 y 6.15.10 (elimina la indentacion residual)
- Sin cambios de contenido; limpieza de marcas de resaltado de edicion
- Regenera el espejo de texto desde el .docx; 0 comentarios pendientes
</commit_message>
<xml_diff>
--- a/normativo/DIRECTIVA-GOBIERNO-IA.docx
+++ b/normativo/DIRECTIVA-GOBIERNO-IA.docx
@@ -4439,9 +4439,8 @@
     </w:p>
     <w:p>
       <w:pPr>
-        <w:pStyle w:val="Prrafodelista"/>
         <w:spacing w:before="0" w:after="60" w:line="276" w:lineRule="auto"/>
-        <w:ind w:left="1276"/>
+        <w:ind w:left="1276" w:hanging="720"/>
         <w:rPr>
           <w:b w:val="0"/>
           <w:bCs w:val="0"/>
@@ -9642,7 +9641,9 @@
           <w:color w:val="000000"/>
           <w:highlight w:val="green"/>
         </w:rPr>
-        <w:t>6.1.6  Todo</w:t>
+        <w:t xml:space="preserve">6.1.6</w:t>
+        <w:tab/>
+        <w:t xml:space="preserve">Todo</w:t>
       </w:r>
       <w:proofErr w:type="gramEnd"/>
       <w:r>
@@ -10105,16 +10106,6 @@
     <w:p>
       <w:pPr>
         <w:spacing w:before="160" w:after="60" w:line="276" w:lineRule="auto"/>
-        <w:rPr>
-          <w:rFonts w:ascii="Arial" w:hAnsi="Arial" w:cs="Arial"/>
-          <w:b/>
-          <w:bCs/>
-          <w:color w:val="1B3A5B"/>
-          <w:sz w:val="24"/>
-          <w:szCs w:val="24"/>
-        </w:rPr>
-      </w:pPr>
-      <w:r>
         <w:rPr>
           <w:rFonts w:ascii="Arial" w:hAnsi="Arial" w:cs="Arial"/>
           <w:b/>
@@ -10124,6 +10115,31 @@
           <w:szCs w:val="24"/>
           <w:highlight w:val="cyan"/>
         </w:rPr>
+      </w:pPr>
+    </w:p>
+    <w:p>
+      <w:pPr>
+        <w:spacing w:before="160" w:after="60" w:line="276" w:lineRule="auto"/>
+        <w:rPr>
+          <w:rFonts w:ascii="Arial" w:hAnsi="Arial" w:cs="Arial"/>
+          <w:b/>
+          <w:bCs/>
+          <w:color w:val="1B3A5B"/>
+          <w:sz w:val="24"/>
+          <w:szCs w:val="24"/>
+        </w:rPr>
+      </w:pPr>
+      <w:r>
+        <w:rPr>
+          <w:rFonts w:ascii="Arial" w:hAnsi="Arial" w:cs="Arial"/>
+          <w:b/>
+          <w:bCs/>
+          <w:color w:val="1B3A5B"/>
+          <w:sz w:val="24"/>
+          <w:szCs w:val="24"/>
+          <w:highlight w:val="cyan"/>
+        </w:rPr>
+        <w:lastRenderedPageBreak/>
         <w:t>Del diseño, la operación y la seguridad de los SBIA</w:t>
       </w:r>
     </w:p>
@@ -10137,7 +10153,6 @@
         <w:rPr>
           <w:highlight w:val="yellow"/>
         </w:rPr>
-        <w:lastRenderedPageBreak/>
         <w:t>6.5</w:t>
       </w:r>
       <w:r>
@@ -10267,7 +10282,9 @@
           <w:color w:val="000000"/>
           <w:highlight w:val="green"/>
         </w:rPr>
-        <w:t xml:space="preserve">6.5.4   Todo SBIA cuenta con la aprobación del diseño de su arquitectura de solución, previa al inicio del desarrollo, la adquisición o el entrenamiento, conforme a la etapa 3 del numeral 6.1.1. Dicha aprobación corresponde a la División de Arquitectura de Información y de Aplicaciones y a la División de Arquitectura Tecnológica, cada una en el ámbito de su competencia conforme al literal a) de los artículos 132 y 134 del ROF, bajo la conducción de la Gerencia de Arquitectura. </w:t>
+        <w:t xml:space="preserve">6.5.4</w:t>
+        <w:tab/>
+        <w:t xml:space="preserve">Todo SBIA cuenta con la aprobación del diseño de su arquitectura de solución, previa al inicio del desarrollo, la adquisición o el entrenamiento, conforme a la etapa 3 del numeral 6.1.1. Dicha aprobación corresponde a la División de Arquitectura de Información y de Aplicaciones y a la División de Arquitectura Tecnológica, cada una en el ámbito de su competencia conforme al literal a) de los artículos 132 y 134 del ROF, bajo la conducción de la Gerencia de Arquitectura. </w:t>
       </w:r>
       <w:r>
         <w:rPr>
@@ -10304,7 +10321,7 @@
           <w:highlight w:val="green"/>
         </w:rPr>
         <w:tab/>
-        <w:t xml:space="preserve">Los SBIA que ejecuten acciones sobre sistemas, datos o procesos con algún grado de autonomía incorporan mecanismos de autorización, restricción y registro de dichas acciones. Dichos mecanismos son proporcionales al nivel de </w:t>
+        <w:t xml:space="preserve">Los SBIA que ejecuten acciones sobre sistemas, datos o procesos con algún grado de autonomía incorporan mecanismos de autorización, restricción y </w:t>
       </w:r>
       <w:r>
         <w:rPr>
@@ -10313,7 +10330,7 @@
           <w:highlight w:val="green"/>
         </w:rPr>
         <w:lastRenderedPageBreak/>
-        <w:t>riesgo determinado conforme al numeral 6.2.2 y al grado de autonomía asignado. El propietario del caso de uso define el alcance de las acciones autorizadas; la División de Arquitectura de Información y de Aplicaciones aprueba el diseño de dichos mecanismos, conforme al literal a) del artículo 132 del ROF, y la División de Arquitectura Tecnológica valida los componentes de infraestructura tecnológica que los soportan, conforme al literal c) del artículo 134 del ROF, cada una en el ámbito de su competencia. Ambas validaciones se efectúan en la etapa 5 del numeral 6.1.1, con anterioridad al despliegue.</w:t>
+        <w:t>registro de dichas acciones. Dichos mecanismos son proporcionales al nivel de riesgo determinado conforme al numeral 6.2.2 y al grado de autonomía asignado. El propietario del caso de uso define el alcance de las acciones autorizadas; la División de Arquitectura de Información y de Aplicaciones aprueba el diseño de dichos mecanismos, conforme al literal a) del artículo 132 del ROF, y la División de Arquitectura Tecnológica valida los componentes de infraestructura tecnológica que los soportan, conforme al literal c) del artículo 134 del ROF, cada una en el ámbito de su competencia. Ambas validaciones se efectúan en la etapa 5 del numeral 6.1.1, con anterioridad al despliegue.</w:t>
       </w:r>
     </w:p>
     <w:p>
@@ -10372,7 +10389,9 @@
           <w:color w:val="000000"/>
           <w:highlight w:val="lightGray"/>
         </w:rPr>
-        <w:t>6.5.6 Los SBIA generativos que utilicen información institucional incorporan mecanismos que vinculen los resultados generados con sus fuentes de información autorizadas y vigentes. Esta trazabilidad sustenta la explicabilidad exigida en el numeral 6.9.3.</w:t>
+        <w:t xml:space="preserve">6.5.6</w:t>
+        <w:tab/>
+        <w:t xml:space="preserve">Los SBIA generativos que utilicen información institucional incorporan mecanismos que vinculen los resultados generados con sus fuentes de información autorizadas y vigentes. Esta trazabilidad sustenta la explicabilidad exigida en el numeral 6.9.3.</w:t>
       </w:r>
     </w:p>
     <w:p>
@@ -10456,7 +10475,9 @@
           <w:color w:val="000000"/>
           <w:highlight w:val="green"/>
         </w:rPr>
-        <w:t>6.5.9 Los SBIA separan las funciones basadas en inferencia, generación o razonamiento probabilístico de aquellas que requieren un resultado determinístico. Constituyen funciones determinísticas, entre otras, los cálculos que determinan obligaciones o derechos, el cómputo de plazos, la aplicación de reglas normativas y de negocio, las validaciones de cumplimiento normativo y la ejecución de transacciones sobre los sistemas institucionales. El componente de IA puede interpretar, clasificar, recomendar u orquestar dichas funciones; su ejecución corresponde a los servicios, motores de reglas o componentes institucionales diseñados para tal fin. Esta separación se sustenta en la arquitectura de solución aprobada conforme al numeral 6.5.4, y sus criterios técnicos se desarrollan conforme al numeral 6.5.3.</w:t>
+        <w:t xml:space="preserve">6.5.9</w:t>
+        <w:tab/>
+        <w:t xml:space="preserve">Los SBIA separan las funciones basadas en inferencia, generación o razonamiento probabilístico de aquellas que requieren un resultado determinístico. Constituyen funciones determinísticas, entre otras, los cálculos que determinan obligaciones o derechos, el cómputo de plazos, la aplicación de reglas normativas y de negocio, las validaciones de cumplimiento normativo y la ejecución de transacciones sobre los sistemas institucionales. El componente de IA puede interpretar, clasificar, recomendar u orquestar dichas funciones; su ejecución corresponde a los servicios, motores de reglas o componentes institucionales diseñados para tal fin. Esta separación se sustenta en la arquitectura de solución aprobada conforme al numeral 6.5.4, y sus criterios técnicos se desarrollan conforme al numeral 6.5.3.</w:t>
       </w:r>
     </w:p>
     <w:p>
@@ -11328,7 +11349,9 @@
           <w:color w:val="000000"/>
           <w:highlight w:val="green"/>
         </w:rPr>
-        <w:t>6.7.8  El</w:t>
+        <w:t xml:space="preserve">6.7.8</w:t>
+        <w:tab/>
+        <w:t xml:space="preserve">El</w:t>
       </w:r>
       <w:proofErr w:type="gramEnd"/>
       <w:r>
@@ -11567,7 +11590,9 @@
           <w:color w:val="000000"/>
           <w:highlight w:val="green"/>
         </w:rPr>
-        <w:t xml:space="preserve">6.8.5   Los conjuntos de datos que la SUNAT genere o administre y que califiquen como datos de alto valor se ponen a disposición a través del Centro Nacional de Datos (CND), conforme al numeral 28.7 del artículo 28 del RLIA. La calificación se efectúa conforme a los lineamientos nacionales para la identificación de Datos de Alto Valor que emita la SGTD en aplicación de la Estrategia Nacional de Gobierno de Datos; en tanto no se emitan, el OGD aplica los criterios de priorización que dicha Estrategia enuncia para la publicación obligatoria de Datos de Alto Valor: carácter estratégico, interés nacional, planificación y gestión territorial o alto impacto social. El OGD identifica anualmente los conjuntos candidatos, determina su publicabilidad y propone al CGTD su publicación. La determinación de publicabilidad aplica la </w:t>
+        <w:t xml:space="preserve">6.8.5</w:t>
+        <w:tab/>
+        <w:t xml:space="preserve">Los conjuntos de datos que la SUNAT genere o administre y que califiquen como datos de alto valor se ponen a disposición a través del Centro Nacional de Datos (CND), conforme al numeral 28.7 del artículo 28 del RLIA. La calificación se efectúa conforme a los lineamientos nacionales para la identificación de Datos de Alto Valor que emita la SGTD en aplicación de la Estrategia Nacional de Gobierno de Datos; en tanto no se emitan, el OGD aplica los criterios de priorización que dicha Estrategia enuncia para la publicación obligatoria de Datos de Alto Valor: carácter estratégico, interés nacional, planificación y gestión territorial o alto impacto social. El OGD identifica anualmente los conjuntos candidatos, determina su publicabilidad y propone al CGTD su publicación. La determinación de publicabilidad aplica la </w:t>
       </w:r>
       <w:r>
         <w:rPr>
@@ -11599,7 +11624,9 @@
           <w:color w:val="000000"/>
           <w:highlight w:val="green"/>
         </w:rPr>
-        <w:t>6.8.6   Los SBIA se construyen sobre conjuntos de datos certificados conforme a la normativa institucional de gobernanza de datos y analítica, cuando estos existan para la materia. El uso de fuentes no certificadas se justifica en la Ficha de Evaluación de Caso de Uso (Anexo N.° 4) y consta en la Ficha de Registro de SBIA (Anexo N.° 1). En tanto no exista normativa de certificación para la materia, el OGD emite opinión sobre la idoneidad de los conjuntos de datos, conforme al numeral 6.8.2.</w:t>
+        <w:t xml:space="preserve">6.8.6</w:t>
+        <w:tab/>
+        <w:t xml:space="preserve">Los SBIA se construyen sobre conjuntos de datos certificados conforme a la normativa institucional de gobernanza de datos y analítica, cuando estos existan para la materia. El uso de fuentes no certificadas se justifica en la Ficha de Evaluación de Caso de Uso (Anexo N.° 4) y consta en la Ficha de Registro de SBIA (Anexo N.° 1). En tanto no exista normativa de certificación para la materia, el OGD emite opinión sobre la idoneidad de los conjuntos de datos, conforme al numeral 6.8.2.</w:t>
       </w:r>
     </w:p>
     <w:p>
@@ -11828,7 +11855,9 @@
           <w:color w:val="000000"/>
           <w:highlight w:val="green"/>
         </w:rPr>
-        <w:t>6.9.5    La Comisión de Gobierno de IA reporta trimestralmente al CGTD el estado del Inventario Institucional de SBIA, los incidentes, los resultados del monitoreo, la verificación técnica de seguridad, el avance de la capacitación y el cumplimiento de los indicadores. El reporte comprende además el seguimiento de los encargos previsto en el numeral 7.6, el estado de las condiciones del PAIA previsto en el numeral 7.11 y el alineamiento previsto en el numeral 7.12. Dicho reporte constituye el informe trimestral de gobierno de IA. Da cuenta de la actividad de la Comisión de Gobierno de IA y no constituye avance del Plan de Gobierno Digital.</w:t>
+        <w:t xml:space="preserve">6.9.5</w:t>
+        <w:tab/>
+        <w:t xml:space="preserve">La Comisión de Gobierno de IA reporta trimestralmente al CGTD el estado del Inventario Institucional de SBIA, los incidentes, los resultados del monitoreo, la verificación técnica de seguridad, el avance de la capacitación y el cumplimiento de los indicadores. El reporte comprende además el seguimiento de los encargos previsto en el numeral 7.6, el estado de las condiciones del PAIA previsto en el numeral 7.11 y el alineamiento previsto en el numeral 7.12. Dicho reporte constituye el informe trimestral de gobierno de IA. Da cuenta de la actividad de la Comisión de Gobierno de IA y no constituye avance del Plan de Gobierno Digital.</w:t>
       </w:r>
     </w:p>
     <w:p>
@@ -12167,7 +12196,9 @@
           <w:rFonts w:ascii="Arial" w:hAnsi="Arial" w:cs="Arial"/>
           <w:highlight w:val="lightGray"/>
         </w:rPr>
-        <w:t>6.10.4 Todo cambio sobre un SBIA en operación se gestiona de manera controlada y proporcional a su nivel de riesgo. Constituyen cambio, entre otros, el reentrenamiento o la recalibración del modelo, su sustitución o el cambio de versión del modelo base, la modificación de las fuentes o de la estructura de los datos de entrada, la ampliación de la finalidad o de la población objetivo del SBIA, y el cambio de proveedor. El propietario del caso de uso registra todo cambio en el Inventario Institucional de SBIA, lo califica como significativo o no conforme al numeral 6.10.5 y lo comunica a la Comisión de Gobierno de IA. La Comisión valida dicha calificación.</w:t>
+        <w:t xml:space="preserve">6.10.4</w:t>
+        <w:tab/>
+        <w:t xml:space="preserve">Todo cambio sobre un SBIA en operación se gestiona de manera controlada y proporcional a su nivel de riesgo. Constituyen cambio, entre otros, el reentrenamiento o la recalibración del modelo, su sustitución o el cambio de versión del modelo base, la modificación de las fuentes o de la estructura de los datos de entrada, la ampliación de la finalidad o de la población objetivo del SBIA, y el cambio de proveedor. El propietario del caso de uso registra todo cambio en el Inventario Institucional de SBIA, lo califica como significativo o no conforme al numeral 6.10.5 y lo comunica a la Comisión de Gobierno de IA. La Comisión valida dicha calificación.</w:t>
       </w:r>
     </w:p>
     <w:p>
@@ -12191,7 +12222,9 @@
           <w:rFonts w:ascii="Arial" w:hAnsi="Arial" w:cs="Arial"/>
           <w:highlight w:val="green"/>
         </w:rPr>
-        <w:t xml:space="preserve">5 Es significativo el cambio que altera el nivel de riesgo del SBIA, su finalidad, la población objetivo o el contexto de aplicación. También lo es el que degrada su desempeño por debajo de los umbrales del plan de monitoreo. Los demás cambios se gestionan conforme al numeral 6.10.4, de manera proporcional a su nivel de riesgo. El </w:t>
+        <w:t xml:space="preserve">5</w:t>
+        <w:tab/>
+        <w:t xml:space="preserve">Es significativo el cambio que altera el nivel de riesgo del SBIA, su finalidad, la población objetivo o el contexto de aplicación. También lo es el que degrada su desempeño por debajo de los umbrales del plan de monitoreo. Los demás cambios se gestionan conforme al numeral 6.10.4, de manera proporcional a su nivel de riesgo. El </w:t>
       </w:r>
       <w:r>
         <w:rPr>
@@ -12215,7 +12248,9 @@
           <w:rFonts w:ascii="Arial" w:hAnsi="Arial" w:cs="Arial"/>
           <w:highlight w:val="green"/>
         </w:rPr>
-        <w:t>6.10.6 El monitoreo comprende la detección del uso irregular del SBIA por parte de quienes lo operan o interactúan con él, con independencia del nivel de riesgo que tenga asignado. El uso irregular se distingue del uso indebido a que se refiere el artículo 23 del RLIA, que es una categoría de clasificación del SBIA. Constituyen indicios de uso irregular, entre otros, la manipulación de los datos de entrada para inducir un resultado determinado, el empleo del SBIA para una finalidad distinta de la registrada en el Inventario Institucional de SBIA y los patrones de uso incompatibles con la operación normal del proceso. La Comisión de Gobierno de IA define los indicadores que permitan detectar dichos patrones, conforme al numeral 6.10.2, y los incorpora al plan de monitoreo. Los efectos del uso irregular sobre el funcionamiento del SBIA se tratan conforme al numeral 6.7.5. La conducta se comunica a la Oficina de Integridad Institucional y se trata conforme a las normas de integridad institucional.</w:t>
+        <w:t xml:space="preserve">6.10.6</w:t>
+        <w:tab/>
+        <w:t xml:space="preserve">El monitoreo comprende la detección del uso irregular del SBIA por parte de quienes lo operan o interactúan con él, con independencia del nivel de riesgo que tenga asignado. El uso irregular se distingue del uso indebido a que se refiere el artículo 23 del RLIA, que es una categoría de clasificación del SBIA. Constituyen indicios de uso irregular, entre otros, la manipulación de los datos de entrada para inducir un resultado determinado, el empleo del SBIA para una finalidad distinta de la registrada en el Inventario Institucional de SBIA y los patrones de uso incompatibles con la operación normal del proceso. La Comisión de Gobierno de IA define los indicadores que permitan detectar dichos patrones, conforme al numeral 6.10.2, y los incorpora al plan de monitoreo. Los efectos del uso irregular sobre el funcionamiento del SBIA se tratan conforme al numeral 6.7.5. La conducta se comunica a la Oficina de Integridad Institucional y se trata conforme a las normas de integridad institucional.</w:t>
       </w:r>
     </w:p>
     <w:p>
@@ -12823,7 +12858,9 @@
           <w:color w:val="000000"/>
           <w:highlight w:val="lightGray"/>
         </w:rPr>
-        <w:t>6.13.1 Sensibilización</w:t>
+        <w:t xml:space="preserve">6.13.1</w:t>
+        <w:tab/>
+        <w:t xml:space="preserve">Sensibilización</w:t>
       </w:r>
     </w:p>
     <w:p>
@@ -13037,7 +13074,9 @@
           <w:color w:val="000000"/>
           <w:highlight w:val="lightGray"/>
         </w:rPr>
-        <w:t>6.13.2 Capacitación y fortalecimiento de capacidades</w:t>
+        <w:t xml:space="preserve">6.13.2</w:t>
+        <w:tab/>
+        <w:t xml:space="preserve">Capacitación y fortalecimiento de capacidades</w:t>
       </w:r>
     </w:p>
     <w:p>
@@ -13276,7 +13315,9 @@
           <w:color w:val="000000"/>
           <w:highlight w:val="lightGray"/>
         </w:rPr>
-        <w:t>6.13.3 Gestión del cambio</w:t>
+        <w:t xml:space="preserve">6.13.3</w:t>
+        <w:tab/>
+        <w:t xml:space="preserve">Gestión del cambio</w:t>
       </w:r>
     </w:p>
     <w:p>
@@ -13535,7 +13576,9 @@
         <w:rPr>
           <w:highlight w:val="lightGray"/>
         </w:rPr>
-        <w:t>6.15 De la articulación con la formulación de iniciativas, proyectos e inversiones</w:t>
+        <w:t xml:space="preserve">6.15</w:t>
+        <w:tab/>
+        <w:t xml:space="preserve">De la articulación con la formulación de iniciativas, proyectos e inversiones</w:t>
       </w:r>
     </w:p>
     <w:p>
@@ -13578,7 +13621,9 @@
           <w:rFonts w:ascii="Arial" w:hAnsi="Arial" w:cs="Arial"/>
           <w:highlight w:val="green"/>
         </w:rPr>
-        <w:t xml:space="preserve">6.15.1 Toda iniciativa, requerimiento o proyecto que incorpore o prevea un componente basado en IA requiere la opinión técnica previa de la Comisión de Gobierno de IA sobre dicho componente, cualquiera sea el instrumento de gestión bajo el cual se formule, ejecute o modifique. La opinión se emite sobre la Ficha de Evaluación de Caso de Uso (Anexo N.° 4), adecuada a la naturaleza y magnitud de la iniciativa, requerimiento o proyecto. La opinión comprende la pertinencia del uso de inteligencia artificial y la clasificación de riesgo del componente, conforme al Anexo N.° 2 y a los artículos 22 a 24 del RLIA. </w:t>
+        <w:t xml:space="preserve">6.15.1</w:t>
+        <w:tab/>
+        <w:t xml:space="preserve">Toda iniciativa, requerimiento o proyecto que incorpore o prevea un componente basado en IA requiere la opinión técnica previa de la Comisión de Gobierno de IA sobre dicho componente, cualquiera sea el instrumento de gestión bajo el cual se formule, ejecute o modifique. La opinión se emite sobre la Ficha de Evaluación de Caso de Uso (Anexo N.° 4), adecuada a la naturaleza y magnitud de la iniciativa, requerimiento o proyecto. La opinión comprende la pertinencia del uso de inteligencia artificial y la clasificación de riesgo del componente, conforme al Anexo N.° 2 y a los artículos 22 a 24 del RLIA. </w:t>
       </w:r>
       <w:r>
         <w:rPr>
@@ -13687,7 +13732,9 @@
           <w:rFonts w:ascii="Arial" w:hAnsi="Arial" w:cs="Arial"/>
           <w:highlight w:val="green"/>
         </w:rPr>
-        <w:t>6.15.2 El uso indebido está prohibido por el artículo 23 del RLIA y el sometimiento de los SBIA de riesgo alto a condiciones y controles es obligatorio conforme al literal b) del numeral 22.1 del artículo 22 del RLIA, a sus artículos 25, 29 y 30 y al numeral 28.11 de su artículo 28: en ambos casos obliga la norma, no la opinión. En los demás casos la opinión sustenta la decisión, pero no la reemplaza. La aprobación corresponde, en cada caso, a la instancia competente conforme al ROF, a las normas de delegación de facultades, a los instrumentos de gestión institucionales o a la normativa de los sistemas administrativos del Estado.</w:t>
+        <w:t xml:space="preserve">6.15.2</w:t>
+        <w:tab/>
+        <w:t xml:space="preserve">El uso indebido está prohibido por el artículo 23 del RLIA y el sometimiento de los SBIA de riesgo alto a condiciones y controles es obligatorio conforme al literal b) del numeral 22.1 del artículo 22 del RLIA, a sus artículos 25, 29 y 30 y al numeral 28.11 de su artículo 28: en ambos casos obliga la norma, no la opinión. En los demás casos la opinión sustenta la decisión, pero no la reemplaza. La aprobación corresponde, en cada caso, a la instancia competente conforme al ROF, a las normas de delegación de facultades, a los instrumentos de gestión institucionales o a la normativa de los sistemas administrativos del Estado.</w:t>
       </w:r>
     </w:p>
     <w:p>
@@ -13708,7 +13755,9 @@
           <w:rFonts w:ascii="Arial" w:hAnsi="Arial" w:cs="Arial"/>
           <w:highlight w:val="lightGray"/>
         </w:rPr>
-        <w:t>6.15.3 En la gestión de la demanda informática, cuando un requerimiento implique el desarrollo, la adquisición o el uso de un SBIA o de una herramienta de IA, se recaba la opinión de la Comisión antes de su atención, con los formatos vigentes de la demanda complementados con la información que la INSI determine.</w:t>
+        <w:t xml:space="preserve">6.15.3</w:t>
+        <w:tab/>
+        <w:t xml:space="preserve">En la gestión de la demanda informática, cuando un requerimiento implique el desarrollo, la adquisición o el uso de un SBIA o de una herramienta de IA, se recaba la opinión de la Comisión antes de su atención, con los formatos vigentes de la demanda complementados con la información que la INSI determine.</w:t>
       </w:r>
     </w:p>
     <w:p>
@@ -13729,7 +13778,9 @@
           <w:rFonts w:ascii="Arial" w:hAnsi="Arial" w:cs="Arial"/>
           <w:highlight w:val="green"/>
         </w:rPr>
-        <w:t>6.15.4 En los programas y proyectos institucionales conforme al MGPP, la opinión de la Comisión de Gobierno de IA se recaba desde que se identifica un componente basado en IA, en cualquier fase, y antes de la decisión que autoriza avanzar a la fase siguiente. La opinión se incorpora al expediente del caso de negocio o del plan de gestión, según corresponda, junto con las validaciones y opiniones que el MGPP ya prevé, y no requiere una etapa ni una instancia adicionales. Aplica en particular:</w:t>
+        <w:t xml:space="preserve">6.15.4</w:t>
+        <w:tab/>
+        <w:t xml:space="preserve">En los programas y proyectos institucionales conforme al MGPP, la opinión de la Comisión de Gobierno de IA se recaba desde que se identifica un componente basado en IA, en cualquier fase, y antes de la decisión que autoriza avanzar a la fase siguiente. La opinión se incorpora al expediente del caso de negocio o del plan de gestión, según corresponda, junto con las validaciones y opiniones que el MGPP ya prevé, y no requiere una etapa ni una instancia adicionales. Aplica en particular:</w:t>
       </w:r>
     </w:p>
     <w:p>
@@ -13886,7 +13937,9 @@
           <w:rFonts w:ascii="Arial" w:hAnsi="Arial" w:cs="Arial"/>
           <w:highlight w:val="lightGray"/>
         </w:rPr>
-        <w:t>6.15.5 Cuando un proyecto de inversión pública sujeto al Sistema Nacional de Programación Multianual y Gestión de Inversiones incorpore un componente basado en IA, la Unidad Formuladora considera la opinión de la Comisión como insumo del análisis técnico que sustenta la declaración de viabilidad, sin perjuicio de las disposiciones del referido Sistema. En la ejecución, el SBIA observa el ciclo de vida del numeral 6.1.</w:t>
+        <w:t xml:space="preserve">6.15.5</w:t>
+        <w:tab/>
+        <w:t xml:space="preserve">Cuando un proyecto de inversión pública sujeto al Sistema Nacional de Programación Multianual y Gestión de Inversiones incorpore un componente basado en IA, la Unidad Formuladora considera la opinión de la Comisión como insumo del análisis técnico que sustenta la declaración de viabilidad, sin perjuicio de las disposiciones del referido Sistema. En la ejecución, el SBIA observa el ciclo de vida del numeral 6.1.</w:t>
       </w:r>
     </w:p>
     <w:p>
@@ -13903,7 +13956,9 @@
           <w:rFonts w:ascii="Arial" w:hAnsi="Arial" w:cs="Arial"/>
           <w:highlight w:val="green"/>
         </w:rPr>
-        <w:t>6.15.6 Las unidades de organización competentes de cada instrumento de gestión incorporan en sus documentos normativos la verificación del componente de IA y la opinión de la Comisión de Gobierno de IA, conforme al numeral 7.6. Esta incorporación alcanza al Modelo de Gobernabilidad de Programas y Proyectos y a la gestión de la demanda informática. La presente directiva no sustituye dichos instrumentos.</w:t>
+        <w:t xml:space="preserve">6.15.6</w:t>
+        <w:tab/>
+        <w:t xml:space="preserve">Las unidades de organización competentes de cada instrumento de gestión incorporan en sus documentos normativos la verificación del componente de IA y la opinión de la Comisión de Gobierno de IA, conforme al numeral 7.6. Esta incorporación alcanza al Modelo de Gobernabilidad de Programas y Proyectos y a la gestión de la demanda informática. La presente directiva no sustituye dichos instrumentos.</w:t>
       </w:r>
     </w:p>
     <w:p>
@@ -13922,7 +13977,9 @@
           <w:rFonts w:ascii="Arial" w:hAnsi="Arial" w:cs="Arial"/>
           <w:highlight w:val="lightGray"/>
         </w:rPr>
-        <w:t>6.15.7 La presente directiva se articula con la normativa institucional de gobernanza de datos y analítica. Cuando un producto analítico incorpore un sistema basado en IA, este se sujeta al ciclo de vida, la clasificación de riesgo, la evaluación de impacto algorítmico, el registro en el Inventario Institucional de SBIA y las obligaciones de transparencia y supervisión humana previstas en la presente directiva. La certificación del producto analítico requiere, como insumo previo, la aprobación que corresponda conforme al numeral 6.1.2. La calidad, el linaje, los metadatos y la certificación de los datos que alimentan el sistema se rigen por la normativa institucional de gobernanza de datos y analítica. En tanto dicha normativa no se apruebe, esas materias se rigen por el numeral 6.8 de la presente directiva.</w:t>
+        <w:t xml:space="preserve">6.15.7</w:t>
+        <w:tab/>
+        <w:t xml:space="preserve">La presente directiva se articula con la normativa institucional de gobernanza de datos y analítica. Cuando un producto analítico incorpore un sistema basado en IA, este se sujeta al ciclo de vida, la clasificación de riesgo, la evaluación de impacto algorítmico, el registro en el Inventario Institucional de SBIA y las obligaciones de transparencia y supervisión humana previstas en la presente directiva. La certificación del producto analítico requiere, como insumo previo, la aprobación que corresponda conforme al numeral 6.1.2. La calidad, el linaje, los metadatos y la certificación de los datos que alimentan el sistema se rigen por la normativa institucional de gobernanza de datos y analítica. En tanto dicha normativa no se apruebe, esas materias se rigen por el numeral 6.8 de la presente directiva.</w:t>
       </w:r>
       <w:r>
         <w:rPr>
@@ -13949,14 +14006,15 @@
           <w:rFonts w:ascii="Arial" w:hAnsi="Arial" w:cs="Arial"/>
         </w:rPr>
         <w:lastRenderedPageBreak/>
+      </w:r>
+      <w:r>
+        <w:rPr>
+          <w:rFonts w:ascii="Arial" w:hAnsi="Arial" w:cs="Arial"/>
+          <w:highlight w:val="green"/>
+        </w:rPr>
+        <w:t xml:space="preserve">6.15.8</w:t>
         <w:tab/>
-      </w:r>
-      <w:r>
-        <w:rPr>
-          <w:rFonts w:ascii="Arial" w:hAnsi="Arial" w:cs="Arial"/>
-          <w:highlight w:val="green"/>
-        </w:rPr>
-        <w:t>6.15.8 La INSI, en el ejercicio de las competencias que el MGPP le reconoce en los momentos señalados, advierte la presencia de un componente de IA y la comunica a la Comisión de Gobierno de IA. La opinión de la Comisión es distinta de la validación que la INSI emite en el ámbito de sus competencias: ambas se incorporan al expediente y ninguna sustituye a la otra.</w:t>
+        <w:t xml:space="preserve">La INSI, en el ejercicio de las competencias que el MGPP le reconoce en los momentos señalados, advierte la presencia de un componente de IA y la comunica a la Comisión de Gobierno de IA. La opinión de la Comisión es distinta de la validación que la INSI emite en el ámbito de sus competencias: ambas se incorporan al expediente y ninguna sustituye a la otra.</w:t>
       </w:r>
     </w:p>
     <w:p>
@@ -13975,15 +14033,11 @@
       <w:r>
         <w:rPr>
           <w:rFonts w:ascii="Arial" w:hAnsi="Arial" w:cs="Arial"/>
-        </w:rPr>
+          <w:highlight w:val="green"/>
+        </w:rPr>
+        <w:t xml:space="preserve">6.15.9</w:t>
         <w:tab/>
-      </w:r>
-      <w:r>
-        <w:rPr>
-          <w:rFonts w:ascii="Arial" w:hAnsi="Arial" w:cs="Arial"/>
-          <w:highlight w:val="green"/>
-        </w:rPr>
-        <w:t>6.15.9 Cuando se requiera sustentar la opinión de la Comisión ante el Comité de Proyecto, concurre a la sesión el Coordinador de la Comisión de Gobierno de IA o el miembro que esta designe. Su concurrencia no altera la composición ni las competencias del Comité de Proyecto.</w:t>
+        <w:t xml:space="preserve">Cuando se requiera sustentar la opinión de la Comisión ante el Comité de Proyecto, concurre a la sesión el Coordinador de la Comisión de Gobierno de IA o el miembro que esta designe. Su concurrencia no altera la composición ni las competencias del Comité de Proyecto.</w:t>
       </w:r>
     </w:p>
     <w:p>
@@ -14002,15 +14056,11 @@
       <w:r>
         <w:rPr>
           <w:rFonts w:ascii="Arial" w:hAnsi="Arial" w:cs="Arial"/>
-        </w:rPr>
+          <w:highlight w:val="green"/>
+        </w:rPr>
+        <w:t xml:space="preserve">6.15.10</w:t>
         <w:tab/>
-      </w:r>
-      <w:r>
-        <w:rPr>
-          <w:rFonts w:ascii="Arial" w:hAnsi="Arial" w:cs="Arial"/>
-          <w:highlight w:val="green"/>
-        </w:rPr>
-        <w:t>6.15.10 La unidad de organización competente del MGPP incorpora en dicho instrumento el momento y la instancia ante la que se recaba la opinión, conforme al numeral 7.6.</w:t>
+        <w:t xml:space="preserve">La unidad de organización competente del MGPP incorpora en dicho instrumento el momento y la instancia ante la que se recaba la opinión, conforme al numeral 7.6.</w:t>
       </w:r>
     </w:p>
     <w:p>
@@ -14482,20 +14532,22 @@
       <w:pPr>
         <w:pStyle w:val="SubtituloDONI"/>
         <w:spacing w:line="276" w:lineRule="auto"/>
-        <w:ind w:left="851" w:hanging="709"/>
-        <w:rPr>
-          <w:b w:val="0"/>
-          <w:bCs w:val="0"/>
-          <w:highlight w:val="green"/>
-        </w:rPr>
-      </w:pPr>
-      <w:r>
-        <w:rPr>
-          <w:b w:val="0"/>
-          <w:bCs w:val="0"/>
-          <w:highlight w:val="green"/>
-        </w:rPr>
-        <w:t>7.12    Las iniciativas, proyectos y acciones que incorporen un componente basado en IA y no se encuentren comprendidos en el PAIA acreditan su alineamiento con un objetivo del PGD o del Plan Estratégico Institucional mediante la evidencia documentada que corresponda. La Comisión de Gobierno de IA verifica dicho alineamiento y lo reporta en el informe trimestral del numeral 6.9.5.</w:t>
+        <w:ind w:left="851"/>
+        <w:rPr>
+          <w:b w:val="0"/>
+          <w:bCs w:val="0"/>
+          <w:highlight w:val="green"/>
+        </w:rPr>
+      </w:pPr>
+      <w:r>
+        <w:rPr>
+          <w:b w:val="0"/>
+          <w:bCs w:val="0"/>
+          <w:highlight w:val="green"/>
+        </w:rPr>
+        <w:t xml:space="preserve">7.12</w:t>
+        <w:tab/>
+        <w:t xml:space="preserve">Las iniciativas, proyectos y acciones que incorporen un componente basado en IA y no se encuentren comprendidos en el PAIA acreditan su alineamiento con un objetivo del PGD o del Plan Estratégico Institucional mediante la evidencia documentada que corresponda. La Comisión de Gobierno de IA verifica dicho alineamiento y lo reporta en el informe trimestral del numeral 6.9.5.</w:t>
       </w:r>
     </w:p>
     <w:p>

</xml_diff>

<commit_message>
docs: revisión de calidad (tanda 28) — asigna la ejecución de las pruebas de sesgo a la División de Control de Calidad
- 6.6.4: el propietario del caso de uso, con el custodio tecnico, incorpora las medidas frente al sesgo; la ejecucion de las pruebas que sustentan los indicadores de sesgo (6.10.2) corresponde a la Division de Control de Calidad como prueba no funcional (art. 126 lit. a del ROF); la metodologia del 6.1.5 desarrolla las pruebas aplicables por tipo de SBIA; la Comision verifica su implementacion y resultados en la etapa 5
- 6.10.3: incorpora las pruebas de sesgo entre las que ejecuta la Division de Control de Calidad
- Etapa 5 del ciclo de vida: la Comision verifica ademas los resultados de las pruebas de sesgo
- Regenera el espejo de texto desde el .docx; 0 comentarios pendientes
</commit_message>
<xml_diff>
--- a/normativo/DIRECTIVA-GOBIERNO-IA.docx
+++ b/normativo/DIRECTIVA-GOBIERNO-IA.docx
@@ -9019,7 +9019,7 @@
                 <w:highlight w:val="green"/>
               </w:rPr>
               <w:lastRenderedPageBreak/>
-              <w:t>propietario del caso de uso verifica la implementación del mecanismo de supervisión humana conforme al numeral 6.6.2. La Comisión de Gobierno de IA verifica la implementación de los controles, del mecanismo de supervisión humana y de las medidas frente al sesgo, conforme a los numerales 6.2.5, 6.6.2 y 6.6.4. Asimismo, aprueba el plan de monitoreo del SBIA conforme al numeral 6.10.1. La aprobación requiere la conformidad de la División de Control de Calidad, de la Oficina de Seguridad Informática, del propietario del caso de uso y de la Comisión de Gobierno de IA. La titularidad de la aprobación se determina conforme al numeral 6.1.2.</w:t>
+              <w:t xml:space="preserve">propietario del caso de uso verifica la implementación del mecanismo de supervisión humana conforme al numeral 6.6.2. La Comisión de Gobierno de IA verifica la implementación de los controles, del mecanismo de supervisión humana y de las medidas frente al sesgo, así como los resultados de las pruebas de sesgo, conforme a los numerales 6.2.5, 6.6.2 y 6.6.4. Asimismo, aprueba el plan de monitoreo del SBIA conforme al numeral 6.10.1. La aprobación requiere la conformidad de la División de Control de Calidad, de la Oficina de Seguridad Informática, del propietario del caso de uso y de la Comisión de Gobierno de IA. La titularidad de la aprobación se determina conforme al numeral 6.1.2.</w:t>
             </w:r>
           </w:p>
         </w:tc>
@@ -10824,7 +10824,7 @@
           <w:color w:val="000000"/>
         </w:rPr>
         <w:tab/>
-        <w:t xml:space="preserve">Todo SBIA, independientemente de su nivel de riesgo, incorpora medidas proporcionales para prevenir, detectar y corregir resultados discriminatorios o sesgados que puedan afectar a los administrados, conforme al literal a) del artículo 7 del RLIA y al compromiso 6 de la </w:t>
+        <w:t xml:space="preserve">El propietario del caso de uso, con el custodio técnico, incorpora en todo SBIA, independientemente de su nivel de riesgo, medidas proporcionales para prevenir, detectar y corregir resultados discriminatorios o sesgados que puedan afectar a los administrados, conforme al literal a) del artículo 7 del RLIA y al compromiso 6 de la </w:t>
       </w:r>
       <w:r>
         <w:rPr>
@@ -10852,9 +10852,16 @@
         <w:rPr>
           <w:rFonts w:ascii="Arial" w:eastAsia="Arial" w:hAnsi="Arial" w:cs="Arial"/>
           <w:color w:val="000000"/>
-          <w:highlight w:val="green"/>
-        </w:rPr>
-        <w:t>La Comisión de Gobierno de IA verifica la implementación de estas medidas en la etapa 5 del numeral 6.1.1, con anterioridad al despliegue.</w:t>
+        </w:rPr>
+        <w:t xml:space="preserve">La ejecución de las pruebas que sustentan la medición de los indicadores de sesgo previstos en el numeral 6.10.2 corresponde a la División de Control de Calidad, como prueba no funcional, conforme al literal a) del artículo 126 del ROF. La metodología prevista en el numeral 6.1.5 desarrolla las pruebas aplicables según el tipo de SBIA. </w:t>
+      </w:r>
+      <w:r>
+        <w:rPr>
+          <w:rFonts w:ascii="Arial" w:eastAsia="Arial" w:hAnsi="Arial" w:cs="Arial"/>
+          <w:color w:val="000000"/>
+          <w:highlight w:val="green"/>
+        </w:rPr>
+        <w:t xml:space="preserve">La Comisión de Gobierno de IA verifica la implementación de estas medidas y los resultados de dichas pruebas en la etapa 5 del numeral 6.1.1, con anterioridad al despliegue.</w:t>
       </w:r>
     </w:p>
     <w:p>
@@ -12150,7 +12157,7 @@
           <w:highlight w:val="yellow"/>
         </w:rPr>
         <w:tab/>
-        <w:t>La Gerencia de Calidad de Sistemas conduce el control y aseguramiento de la calidad de los SBIA, conforme a sus funciones (artículos 123 y 124, literal a, del ROF). La verificación y validación de la calidad, incluida la ejecución de las pruebas funcionales y no funcionales, corresponde a la División de Control de Calidad, conforme a sus funciones (artículos 125 y 126, literal a, del ROF), y comprende además las pruebas de rendimiento y de regresión que correspondan al tipo de SBIA.</w:t>
+        <w:t xml:space="preserve">La Gerencia de Calidad de Sistemas conduce el control y aseguramiento de la calidad de los SBIA, conforme a sus funciones (artículos 123 y 124, literal a, del ROF). La verificación y validación de la calidad, incluida la ejecución de las pruebas funcionales y no funcionales, corresponde a la División de Control de Calidad, conforme a sus funciones (artículos 125 y 126, literal a, del ROF), y comprende además las pruebas de rendimiento, de regresión y de sesgo que correspondan al tipo de SBIA.</w:t>
       </w:r>
     </w:p>
     <w:p>

</xml_diff>

<commit_message>
docs: revisión de calidad (tanda 29) — actualiza la paginación del índice
- Actualiza los numeros de pagina del indice tras la repaginacion del documento; sin cambios de texto en el articulado
- Regenera el espejo de texto desde el .docx; 0 comentarios pendientes
</commit_message>
<xml_diff>
--- a/normativo/DIRECTIVA-GOBIERNO-IA.docx
+++ b/normativo/DIRECTIVA-GOBIERNO-IA.docx
@@ -690,7 +690,7 @@
           <w:rPr>
             <w:webHidden/>
           </w:rPr>
-          <w:t>4</w:t>
+          <w:t>5</w:t>
         </w:r>
         <w:r>
           <w:rPr>
@@ -771,7 +771,7 @@
           <w:rPr>
             <w:webHidden/>
           </w:rPr>
-          <w:t>4</w:t>
+          <w:t>5</w:t>
         </w:r>
         <w:r>
           <w:rPr>
@@ -852,7 +852,7 @@
           <w:rPr>
             <w:webHidden/>
           </w:rPr>
-          <w:t>4</w:t>
+          <w:t>5</w:t>
         </w:r>
         <w:r>
           <w:rPr>
@@ -933,7 +933,7 @@
           <w:rPr>
             <w:webHidden/>
           </w:rPr>
-          <w:t>6</w:t>
+          <w:t>8</w:t>
         </w:r>
         <w:r>
           <w:rPr>
@@ -1014,7 +1014,7 @@
           <w:rPr>
             <w:webHidden/>
           </w:rPr>
-          <w:t>7</w:t>
+          <w:t>10</w:t>
         </w:r>
         <w:r>
           <w:rPr>
@@ -1095,7 +1095,7 @@
           <w:rPr>
             <w:webHidden/>
           </w:rPr>
-          <w:t>10</w:t>
+          <w:t>20</w:t>
         </w:r>
         <w:r>
           <w:rPr>
@@ -1176,7 +1176,7 @@
           <w:rPr>
             <w:webHidden/>
           </w:rPr>
-          <w:t>21</w:t>
+          <w:t>46</w:t>
         </w:r>
         <w:r>
           <w:rPr>
@@ -1257,7 +1257,7 @@
           <w:rPr>
             <w:webHidden/>
           </w:rPr>
-          <w:t>22</w:t>
+          <w:t>48</w:t>
         </w:r>
         <w:r>
           <w:rPr>
@@ -4439,17 +4439,11 @@
     </w:p>
     <w:p>
       <w:pPr>
-        <w:spacing w:before="0" w:after="60" w:line="276" w:lineRule="auto"/>
+        <w:spacing w:after="60" w:line="276" w:lineRule="auto"/>
         <w:ind w:left="1276" w:hanging="720"/>
-        <w:rPr>
-          <w:b w:val="0"/>
-          <w:bCs w:val="0"/>
-        </w:rPr>
-      </w:pPr>
-      <w:r>
-        <w:rPr>
-          <w:b w:val="0"/>
-          <w:bCs w:val="0"/>
+      </w:pPr>
+      <w:r>
+        <w:rPr>
           <w:color w:val="000000"/>
           <w:highlight w:val="cyan"/>
         </w:rPr>
@@ -4457,8 +4451,6 @@
       </w:r>
       <w:r>
         <w:rPr>
-          <w:b w:val="0"/>
-          <w:bCs w:val="0"/>
           <w:color w:val="000000"/>
           <w:highlight w:val="cyan"/>
         </w:rPr>
@@ -4632,6 +4624,7 @@
           <w:color w:val="000000"/>
           <w:highlight w:val="yellow"/>
         </w:rPr>
+        <w:lastRenderedPageBreak/>
         <w:t>Los roles y responsabilidades del Gobierno de IA se asignan tomando como referencia las competencias y funciones establecidas en el ROF vigente, sin duplicarlas ni sustituirlas, y se detallan en el</w:t>
       </w:r>
       <w:r>
@@ -4705,7 +4698,6 @@
                 <w:b/>
                 <w:bCs/>
               </w:rPr>
-              <w:lastRenderedPageBreak/>
               <w:t>Instancias de Gobierno de IA</w:t>
             </w:r>
           </w:p>
@@ -5165,15 +5157,7 @@
                 <w:bCs w:val="0"/>
                 <w:highlight w:val="green"/>
               </w:rPr>
-              <w:t xml:space="preserve">Aprueba los casos de uso. Valida el Plan de Acción de Inteligencia Artificial, conforme al numeral 5.3 del artículo 5 de la Resolución Ministerial N.° 152-2026-PCM y al numeral 7.11 de la presente </w:t>
-            </w:r>
-            <w:r>
-              <w:rPr>
-                <w:b w:val="0"/>
-                <w:bCs w:val="0"/>
-                <w:highlight w:val="green"/>
-              </w:rPr>
-              <w:t>directiva.</w:t>
+              <w:t>Aprueba los casos de uso. Valida el Plan de Acción de Inteligencia Artificial, conforme al numeral 5.3 del artículo 5 de la Resolución Ministerial N.° 152-2026-PCM y al numeral 7.11 de la presente directiva.</w:t>
             </w:r>
           </w:p>
           <w:p>
@@ -5219,7 +5203,16 @@
                 <w:bCs w:val="0"/>
                 <w:highlight w:val="green"/>
               </w:rPr>
-              <w:t>Verifica la causal y resuelve sobre el componente de IA cuando la Comisión de Gobierno de IA emite pronunciamiento no favorable, en los casos y con el alcance previstos en el numeral 6.1.4.</w:t>
+              <w:t xml:space="preserve">Verifica la causal y resuelve sobre el componente de IA cuando la Comisión de Gobierno de IA emite pronunciamiento no favorable, en </w:t>
+            </w:r>
+            <w:r>
+              <w:rPr>
+                <w:b w:val="0"/>
+                <w:bCs w:val="0"/>
+                <w:highlight w:val="green"/>
+              </w:rPr>
+              <w:lastRenderedPageBreak/>
+              <w:t>los casos y con el alcance previstos en el numeral 6.1.4.</w:t>
             </w:r>
           </w:p>
           <w:p>
@@ -5497,7 +5490,16 @@
                 <w:bCs w:val="0"/>
                 <w:highlight w:val="green"/>
               </w:rPr>
-              <w:t>Supervisar el cumplimiento de los hitos de aprobación del ciclo de vida de los SBIA y consolidar los informes de monitoreo, verificación técnica de seguridad e incidentes para conocimiento del CGTD.</w:t>
+              <w:t xml:space="preserve">Supervisar el cumplimiento de los hitos de aprobación del ciclo de vida </w:t>
+            </w:r>
+            <w:r>
+              <w:rPr>
+                <w:b w:val="0"/>
+                <w:bCs w:val="0"/>
+                <w:highlight w:val="green"/>
+              </w:rPr>
+              <w:lastRenderedPageBreak/>
+              <w:t>de los SBIA y consolidar los informes de monitoreo, verificación técnica de seguridad e incidentes para conocimiento del CGTD.</w:t>
             </w:r>
           </w:p>
           <w:p>
@@ -5522,7 +5524,6 @@
                 <w:bCs w:val="0"/>
                 <w:highlight w:val="green"/>
               </w:rPr>
-              <w:lastRenderedPageBreak/>
               <w:t>Aprobar los hitos del ciclo de vida que le corresponden conforme al numeral 6.1.2 y el ciclo de vida simplificado de los SBIA de riesgo aceptable.</w:t>
             </w:r>
           </w:p>
@@ -5941,7 +5942,7 @@
                 <w:b w:val="0"/>
                 <w:bCs w:val="0"/>
               </w:rPr>
-              <w:t xml:space="preserve">Supervisa y evalúa que los modelos y algoritmos de los SBIA de riesgo alto cumplan los estándares de calidad y ética aplicables, conforme al numeral 6.5 del artículo 6 de la Resolución Ministerial N.° 152-2026-PCM. La ejerce en coordinación con </w:t>
+              <w:t xml:space="preserve">Supervisa y evalúa que los modelos y algoritmos de los SBIA de riesgo alto cumplan los estándares de </w:t>
             </w:r>
             <w:r>
               <w:rPr>
@@ -5949,7 +5950,7 @@
                 <w:bCs w:val="0"/>
               </w:rPr>
               <w:lastRenderedPageBreak/>
-              <w:t>las unidades de organización y con los propietarios de los casos de uso, y se apoya en las verificaciones previstas en los numerales 6.10.3 y 6.14.</w:t>
+              <w:t>calidad y ética aplicables, conforme al numeral 6.5 del artículo 6 de la Resolución Ministerial N.° 152-2026-PCM. La ejerce en coordinación con las unidades de organización y con los propietarios de los casos de uso, y se apoya en las verificaciones previstas en los numerales 6.10.3 y 6.14.</w:t>
             </w:r>
           </w:p>
         </w:tc>
@@ -6351,7 +6352,7 @@
                 <w:color w:val="000000"/>
                 <w:highlight w:val="green"/>
               </w:rPr>
-              <w:t xml:space="preserve">En materia de seguridad digital: asegura y supervisa la adopción de los estándares y normas técnicas de seguridad de la información cuando la INSI desarrolla, adquiere o terceriza SBIA. Propone las medidas de gestión de riesgos de seguridad de la información aplicables a los SBIA. Comunica al Centro Nacional de Seguridad Digital (CNSD) los incidentes de seguridad digital que involucren un SBIA y los informa a la máxima autoridad administrativa de la </w:t>
+              <w:t xml:space="preserve">En materia de seguridad digital: asegura y supervisa la adopción de los estándares y normas técnicas de seguridad de la información cuando la INSI desarrolla, adquiere o terceriza SBIA. Propone las medidas de gestión de riesgos de seguridad de la información aplicables a los SBIA. Comunica al Centro Nacional de Seguridad </w:t>
             </w:r>
             <w:r>
               <w:rPr>
@@ -6361,7 +6362,7 @@
                 <w:highlight w:val="green"/>
               </w:rPr>
               <w:lastRenderedPageBreak/>
-              <w:t>entidad, conforme a la Directiva N.° 001-2023-PCM/SGTD. Informa al CGTD los que resulten críticos. Cuando un SBIA constituya un activo de información de un proceso comprendido en el alcance del SGSI, coordina la aplicación de los controles que correspondan.</w:t>
+              <w:t>Digital (CNSD) los incidentes de seguridad digital que involucren un SBIA y los informa a la máxima autoridad administrativa de la entidad, conforme a la Directiva N.° 001-2023-PCM/SGTD. Informa al CGTD los que resulten críticos. Cuando un SBIA constituya un activo de información de un proceso comprendido en el alcance del SGSI, coordina la aplicación de los controles que correspondan.</w:t>
             </w:r>
           </w:p>
         </w:tc>
@@ -6663,7 +6664,7 @@
                 <w:bCs w:val="0"/>
                 <w:highlight w:val="green"/>
               </w:rPr>
-              <w:t xml:space="preserve">Revisa la EIA en materia de cumplimiento normativo. Cuando la revisión comprenda el sentido y el alcance de las normas tributarias o aduaneras, se pronuncia la Intendencia Nacional Jurídico Tributaria o la Intendencia Nacional Jurídico Aduanera, según la </w:t>
+              <w:t xml:space="preserve">Revisa la EIA en materia de cumplimiento normativo. Cuando la revisión comprenda el sentido y el alcance de las normas tributarias o aduaneras, se pronuncia la </w:t>
             </w:r>
             <w:r>
               <w:rPr>
@@ -6672,7 +6673,7 @@
                 <w:highlight w:val="green"/>
               </w:rPr>
               <w:lastRenderedPageBreak/>
-              <w:t>materia, a convocatoria de la Comisión de Gobierno de IA.</w:t>
+              <w:t>Intendencia Nacional Jurídico Tributaria o la Intendencia Nacional Jurídico Aduanera, según la materia, a convocatoria de la Comisión de Gobierno de IA.</w:t>
             </w:r>
           </w:p>
           <w:p>
@@ -7125,7 +7126,16 @@
                 <w:bCs w:val="0"/>
                 <w:highlight w:val="green"/>
               </w:rPr>
-              <w:t>Asegura que los SBIA se incorporen al Plan de Sistemas de la INSI, que elabora la División de Gestión de Procesos de Sistemas conforme al literal a) del artículo 112 del ROF.</w:t>
+              <w:t xml:space="preserve">Asegura que los SBIA se incorporen al Plan de Sistemas de la INSI, que elabora la División de Gestión de </w:t>
+            </w:r>
+            <w:r>
+              <w:rPr>
+                <w:b w:val="0"/>
+                <w:bCs w:val="0"/>
+                <w:highlight w:val="green"/>
+              </w:rPr>
+              <w:lastRenderedPageBreak/>
+              <w:t>Procesos de Sistemas conforme al literal a) del artículo 112 del ROF.</w:t>
             </w:r>
           </w:p>
         </w:tc>
@@ -7579,7 +7589,16 @@
                 <w:bCs w:val="0"/>
                 <w:highlight w:val="yellow"/>
               </w:rPr>
-              <w:t>Conduce el proceso de elaboración de las acciones de sensibilización, concientización y capacitación en IA, diferenciadas por grupos de uso de SBIA, y eleva la propuesta para su aprobación, conforme al literal f) del artículo 197 del ROF.</w:t>
+              <w:t xml:space="preserve">Conduce el proceso de elaboración de las acciones de sensibilización, concientización y capacitación en IA, diferenciadas por grupos de uso </w:t>
+            </w:r>
+            <w:r>
+              <w:rPr>
+                <w:b w:val="0"/>
+                <w:bCs w:val="0"/>
+                <w:highlight w:val="yellow"/>
+              </w:rPr>
+              <w:lastRenderedPageBreak/>
+              <w:t>de SBIA, y eleva la propuesta para su aprobación, conforme al literal f) del artículo 197 del ROF.</w:t>
             </w:r>
           </w:p>
           <w:p>
@@ -7603,7 +7622,6 @@
                 <w:bCs w:val="0"/>
                 <w:highlight w:val="yellow"/>
               </w:rPr>
-              <w:lastRenderedPageBreak/>
               <w:t>Promueve la adopción de la inteligencia artificial en el ámbito de las personas, conforme al numeral 6.13.3.</w:t>
             </w:r>
           </w:p>
@@ -7963,7 +7981,15 @@
                 <w:b w:val="0"/>
                 <w:bCs w:val="0"/>
               </w:rPr>
-              <w:t>Emite opinión legal vinculante y absuelve las consultas que le formulan las unidades de organización en las materias de su competencia, conforme a los literales c) y d) del artículo 454 del ROF.</w:t>
+              <w:t xml:space="preserve">Emite opinión legal vinculante y absuelve las consultas que le formulan las unidades de organización en las materias de su competencia, conforme a los </w:t>
+            </w:r>
+            <w:r>
+              <w:rPr>
+                <w:b w:val="0"/>
+                <w:bCs w:val="0"/>
+              </w:rPr>
+              <w:lastRenderedPageBreak/>
+              <w:t>literales c) y d) del artículo 454 del ROF.</w:t>
             </w:r>
           </w:p>
           <w:p>
@@ -7986,15 +8012,7 @@
                 <w:b w:val="0"/>
                 <w:bCs w:val="0"/>
               </w:rPr>
-              <w:t xml:space="preserve">Cuando la materia tenga incidencia tributaria, coordina con la </w:t>
-            </w:r>
-            <w:r>
-              <w:rPr>
-                <w:b w:val="0"/>
-                <w:bCs w:val="0"/>
-              </w:rPr>
-              <w:lastRenderedPageBreak/>
-              <w:t>Intendencia Nacional Jurídico Tributaria, conforme al literal c) del citado artículo.</w:t>
+              <w:t>Cuando la materia tenga incidencia tributaria, coordina con la Intendencia Nacional Jurídico Tributaria, conforme al literal c) del citado artículo.</w:t>
             </w:r>
           </w:p>
           <w:p>
@@ -8441,7 +8459,7 @@
                 <w:rFonts w:ascii="Arial" w:eastAsia="Arial" w:hAnsi="Arial" w:cs="Arial"/>
                 <w:highlight w:val="green"/>
               </w:rPr>
-              <w:t xml:space="preserve">La etapa concluye con la presentación a la Comisión de Gobierno de IA de la Ficha de Evaluación de Caso de Uso. La Ficha se presenta suscrita por el propietario del caso de uso y con el visto bueno del titular de su unidad de organización, conforme a la Sección 6 del Anexo N.° 4. La </w:t>
+              <w:t xml:space="preserve">La etapa concluye con la presentación a la Comisión de Gobierno de IA de la Ficha de Evaluación de Caso de Uso. La Ficha se presenta suscrita por el propietario del caso de uso y con el visto bueno del titular de su </w:t>
             </w:r>
             <w:r>
               <w:rPr>
@@ -8449,7 +8467,7 @@
                 <w:highlight w:val="green"/>
               </w:rPr>
               <w:lastRenderedPageBreak/>
-              <w:t>etapa no comporta hito de aprobación: la evaluación del componente de IA y la aprobación corresponden a la etapa 2.</w:t>
+              <w:t>unidad de organización, conforme a la Sección 6 del Anexo N.° 4. La etapa no comporta hito de aprobación: la evaluación del componente de IA y la aprobación corresponden a la etapa 2.</w:t>
             </w:r>
           </w:p>
         </w:tc>
@@ -8754,6 +8772,7 @@
               <w:rPr>
                 <w:rFonts w:ascii="Arial" w:eastAsia="Arial" w:hAnsi="Arial" w:cs="Arial"/>
               </w:rPr>
+              <w:lastRenderedPageBreak/>
               <w:t>4</w:t>
             </w:r>
           </w:p>
@@ -8821,15 +8840,7 @@
                 <w:rFonts w:ascii="Arial" w:eastAsia="Arial" w:hAnsi="Arial" w:cs="Arial"/>
                 <w:highlight w:val="green"/>
               </w:rPr>
-              <w:t xml:space="preserve">Las gerencias competentes de la INSI ejecutan el desarrollo del SBIA o gestionan su adquisición. La Oficina de Seguridad Informática evalúa y propone los </w:t>
-            </w:r>
-            <w:r>
-              <w:rPr>
-                <w:rFonts w:ascii="Arial" w:eastAsia="Arial" w:hAnsi="Arial" w:cs="Arial"/>
-                <w:highlight w:val="green"/>
-              </w:rPr>
-              <w:lastRenderedPageBreak/>
-              <w:t>requisitos de seguridad del SBIA, conforme al literal e) del artículo 106 del ROF; dichos requisitos se incorporan como requisitos no funcionales y su implementación se verifica en la etapa de certificación y validación. El mecanismo de supervisión humana definido en la etapa de diseño se implementa en esta etapa conforme al numeral 6.6.2, y es distinto de los requisitos de seguridad antes señalados; su definición corresponde al propietario del caso de uso</w:t>
+              <w:t>Las gerencias competentes de la INSI ejecutan el desarrollo del SBIA o gestionan su adquisición. La Oficina de Seguridad Informática evalúa y propone los requisitos de seguridad del SBIA, conforme al literal e) del artículo 106 del ROF; dichos requisitos se incorporan como requisitos no funcionales y su implementación se verifica en la etapa de certificación y validación. El mecanismo de supervisión humana definido en la etapa de diseño se implementa en esta etapa conforme al numeral 6.6.2, y es distinto de los requisitos de seguridad antes señalados; su definición corresponde al propietario del caso de uso</w:t>
             </w:r>
             <w:r>
               <w:rPr>
@@ -8867,15 +8878,7 @@
               <w:rPr>
                 <w:rFonts w:ascii="Arial" w:eastAsia="Arial" w:hAnsi="Arial" w:cs="Arial"/>
               </w:rPr>
-              <w:lastRenderedPageBreak/>
-              <w:t xml:space="preserve">En desarrollo interno: Conformidad de Gerencia de Desarrollo de Sistemas (INSI). En adquisición: </w:t>
-            </w:r>
-            <w:r>
-              <w:rPr>
-                <w:rFonts w:ascii="Arial" w:eastAsia="Arial" w:hAnsi="Arial" w:cs="Arial"/>
-              </w:rPr>
-              <w:lastRenderedPageBreak/>
-              <w:t>Conformidad de la gerencia INSI responsable.</w:t>
+              <w:t>En desarrollo interno: Conformidad de Gerencia de Desarrollo de Sistemas (INSI). En adquisición: Conformidad de la gerencia INSI responsable.</w:t>
             </w:r>
           </w:p>
         </w:tc>
@@ -8909,7 +8912,6 @@
               <w:rPr>
                 <w:rFonts w:ascii="Arial" w:eastAsia="Arial" w:hAnsi="Arial" w:cs="Arial"/>
               </w:rPr>
-              <w:lastRenderedPageBreak/>
               <w:t>5</w:t>
             </w:r>
           </w:p>
@@ -9011,7 +9013,7 @@
                 <w:rFonts w:ascii="Arial" w:hAnsi="Arial" w:cs="Arial"/>
                 <w:highlight w:val="green"/>
               </w:rPr>
-              <w:t xml:space="preserve">La Gerencia de Calidad de Sistemas conduce el control y aseguramiento de la calidad y la División de Control de Calidad efectúa la verificación y validación de la calidad, conforme al numeral 6.10.3. La Oficina de Seguridad Informática efectúa el análisis de riesgo y las pruebas de vulnerabilidad sobre la arquitectura de aplicaciones, de información y de infraestructura tecnológica que soporta el SBIA, incluido el red teaming para riesgo alto, y verifica la implementación de los requisitos de seguridad propuestos en la etapa anterior. El </w:t>
+              <w:t xml:space="preserve">La Gerencia de Calidad de Sistemas conduce el control y aseguramiento de la calidad y la División de Control de Calidad efectúa la verificación y validación de la calidad, conforme al numeral 6.10.3. La Oficina de Seguridad Informática efectúa el análisis de riesgo y las pruebas de vulnerabilidad sobre la arquitectura de aplicaciones, de información y de infraestructura tecnológica que soporta el SBIA, incluido el red teaming para riesgo alto, y </w:t>
             </w:r>
             <w:r>
               <w:rPr>
@@ -9019,7 +9021,7 @@
                 <w:highlight w:val="green"/>
               </w:rPr>
               <w:lastRenderedPageBreak/>
-              <w:t xml:space="preserve">propietario del caso de uso verifica la implementación del mecanismo de supervisión humana conforme al numeral 6.6.2. La Comisión de Gobierno de IA verifica la implementación de los controles, del mecanismo de supervisión humana y de las medidas frente al sesgo, así como los resultados de las pruebas de sesgo, conforme a los numerales 6.2.5, 6.6.2 y 6.6.4. Asimismo, aprueba el plan de monitoreo del SBIA conforme al numeral 6.10.1. La aprobación requiere la conformidad de la División de Control de Calidad, de la Oficina de Seguridad Informática, del propietario del caso de uso y de la Comisión de Gobierno de IA. La titularidad de la aprobación se determina conforme al numeral 6.1.2.</w:t>
+              <w:t>verifica la implementación de los requisitos de seguridad propuestos en la etapa anterior. El propietario del caso de uso verifica la implementación del mecanismo de supervisión humana conforme al numeral 6.6.2. La Comisión de Gobierno de IA verifica la implementación de los controles, del mecanismo de supervisión humana y de las medidas frente al sesgo, así como los resultados de las pruebas de sesgo, conforme a los numerales 6.2.5, 6.6.2 y 6.6.4. Asimismo, aprueba el plan de monitoreo del SBIA conforme al numeral 6.10.1. La aprobación requiere la conformidad de la División de Control de Calidad, de la Oficina de Seguridad Informática, del propietario del caso de uso y de la Comisión de Gobierno de IA. La titularidad de la aprobación se determina conforme al numeral 6.1.2.</w:t>
             </w:r>
           </w:p>
         </w:tc>
@@ -9256,15 +9258,7 @@
                 <w:rFonts w:ascii="Arial" w:eastAsia="Arial" w:hAnsi="Arial" w:cs="Arial"/>
                 <w:highlight w:val="yellow"/>
               </w:rPr>
-              <w:t xml:space="preserve">El SBIA opera bajo la supervisión humana y el monitoreo previstos </w:t>
-            </w:r>
-            <w:r>
-              <w:rPr>
-                <w:rFonts w:ascii="Arial" w:eastAsia="Arial" w:hAnsi="Arial" w:cs="Arial"/>
-                <w:highlight w:val="yellow"/>
-              </w:rPr>
-              <w:lastRenderedPageBreak/>
-              <w:t>en los numerales 6.6 y 6.10. Los incidentes se gestionan conforme al numeral 6.7.5.</w:t>
+              <w:t>El SBIA opera bajo la supervisión humana y el monitoreo previstos en los numerales 6.6 y 6.10. Los incidentes se gestionan conforme al numeral 6.7.5.</w:t>
             </w:r>
           </w:p>
         </w:tc>
@@ -9296,7 +9290,6 @@
               <w:rPr>
                 <w:rFonts w:ascii="Arial" w:eastAsia="Arial" w:hAnsi="Arial" w:cs="Arial"/>
               </w:rPr>
-              <w:lastRenderedPageBreak/>
               <w:t>Revisiones periódicas según nivel de riesgo.</w:t>
             </w:r>
           </w:p>
@@ -9548,6 +9541,7 @@
           <w:color w:val="000000"/>
           <w:highlight w:val="green"/>
         </w:rPr>
+        <w:lastRenderedPageBreak/>
         <w:t>6.1.4</w:t>
       </w:r>
       <w:r>
@@ -9557,16 +9551,7 @@
           <w:highlight w:val="green"/>
         </w:rPr>
         <w:tab/>
-        <w:t xml:space="preserve">El pronunciamiento de la Comisión de Gobierno de IA en los hitos del ciclo de vida recae sobre el componente de IA, conforme al numeral 6.15.1. Cuando la Ficha de Evaluación de Caso de Uso (Anexo N.° 4) no contiene la información necesaria para pronunciarse, la Comisión acompaña al propietario del caso de uso a completarla y se pronuncia una vez que la recibe. La falta de información no es causal de pronunciamiento no favorable. La Comisión otorga al propietario del caso de uso un plazo para completarla. Vencido el plazo sin que la información se complete, la Comisión eleva el caso al CGTD para que disponga lo que corresponda. El pronunciamiento no favorable se fundamenta </w:t>
-      </w:r>
-      <w:r>
-        <w:rPr>
-          <w:rFonts w:ascii="Arial" w:eastAsia="Arial" w:hAnsi="Arial" w:cs="Arial"/>
-          <w:color w:val="000000"/>
-          <w:highlight w:val="green"/>
-        </w:rPr>
-        <w:lastRenderedPageBreak/>
-        <w:t>por escrito y se eleva al CGTD. Cuando invoca el uso indebido o una contravención normativa, el CGTD verifica la causal y, si concurre, deja constancia en acta de que el caso de uso no procede. Cuando invoca que el resultado esperado se alcanza sin inteligencia artificial, el CGTD resuelve en acta si el caso de uso continúa con el componente de IA o sin él.</w:t>
+        <w:t>El pronunciamiento de la Comisión de Gobierno de IA en los hitos del ciclo de vida recae sobre el componente de IA, conforme al numeral 6.15.1. Cuando la Ficha de Evaluación de Caso de Uso (Anexo N.° 4) no contiene la información necesaria para pronunciarse, la Comisión acompaña al propietario del caso de uso a completarla y se pronuncia una vez que la recibe. La falta de información no es causal de pronunciamiento no favorable. La Comisión otorga al propietario del caso de uso un plazo para completarla. Vencido el plazo sin que la información se complete, la Comisión eleva el caso al CGTD para que disponga lo que corresponda. El pronunciamiento no favorable se fundamenta por escrito y se eleva al CGTD. Cuando invoca el uso indebido o una contravención normativa, el CGTD verifica la causal y, si concurre, deja constancia en acta de que el caso de uso no procede. Cuando invoca que el resultado esperado se alcanza sin inteligencia artificial, el CGTD resuelve en acta si el caso de uso continúa con el componente de IA o sin él.</w:t>
       </w:r>
     </w:p>
     <w:p>
@@ -9634,25 +9619,22 @@
           <w:color w:val="000000"/>
         </w:rPr>
       </w:pPr>
-      <w:proofErr w:type="gramStart"/>
-      <w:r>
-        <w:rPr>
-          <w:rFonts w:ascii="Arial" w:eastAsia="Arial" w:hAnsi="Arial" w:cs="Arial"/>
-          <w:color w:val="000000"/>
-          <w:highlight w:val="green"/>
-        </w:rPr>
-        <w:t xml:space="preserve">6.1.6</w:t>
+      <w:r>
+        <w:rPr>
+          <w:rFonts w:ascii="Arial" w:eastAsia="Arial" w:hAnsi="Arial" w:cs="Arial"/>
+          <w:color w:val="000000"/>
+          <w:highlight w:val="green"/>
+        </w:rPr>
+        <w:t>6.1.6</w:t>
+      </w:r>
+      <w:r>
+        <w:rPr>
+          <w:rFonts w:ascii="Arial" w:eastAsia="Arial" w:hAnsi="Arial" w:cs="Arial"/>
+          <w:color w:val="000000"/>
+          <w:highlight w:val="green"/>
+        </w:rPr>
         <w:tab/>
-        <w:t xml:space="preserve">Todo</w:t>
-      </w:r>
-      <w:proofErr w:type="gramEnd"/>
-      <w:r>
-        <w:rPr>
-          <w:rFonts w:ascii="Arial" w:eastAsia="Arial" w:hAnsi="Arial" w:cs="Arial"/>
-          <w:color w:val="000000"/>
-          <w:highlight w:val="green"/>
-        </w:rPr>
-        <w:t xml:space="preserve"> SBIA cuenta con un equipo técnico multidisciplinario, conformado en función de la necesidad y la complejidad de la materia o del problema público que atiende, conforme al numeral 28.3 del artículo 28 del RLIA. El propietario del caso de uso y el custodio técnico lo conforman previamente al inicio del desarrollo o adquisición, y lo integran, cuando menos, con las unidades de organización cuya competencia comprenda las materias que el SBIA involucra. Su composición se registra en la Ficha de Registro de SBIA (Anexo N.° 1).</w:t>
+        <w:t>Todo SBIA cuenta con un equipo técnico multidisciplinario, conformado en función de la necesidad y la complejidad de la materia o del problema público que atiende, conforme al numeral 28.3 del artículo 28 del RLIA. El propietario del caso de uso y el custodio técnico lo conforman previamente al inicio del desarrollo o adquisición, y lo integran, cuando menos, con las unidades de organización cuya competencia comprenda las materias que el SBIA involucra. Su composición se registra en la Ficha de Registro de SBIA (Anexo N.° 1).</w:t>
       </w:r>
     </w:p>
     <w:p>
@@ -9694,7 +9676,16 @@
           <w:highlight w:val="cyan"/>
         </w:rPr>
         <w:tab/>
-        <w:t xml:space="preserve">La clasificación de riesgo determina, para cada iniciativa o SBIA de la SUNAT, la categoría de riesgo que genera su uso conforme al RLIA: uso indebido (artículo 23), riesgo alto (artículo 24) o riesgo aceptable (numeral 22.2 del artículo 22). El uso indebido deviene en prohibido; por ello, la SUNAT no desarrolla, adquiere, implementa ni opera SBIA cuyo uso sea indebido, y la clasificación los identifica y excluye en la etapa de evaluación de viabilidad, con anterioridad a su desarrollo o adquisición. </w:t>
+        <w:t xml:space="preserve">La clasificación de riesgo determina, para cada iniciativa o SBIA de la SUNAT, la categoría de riesgo que genera su uso conforme al RLIA: uso indebido </w:t>
+      </w:r>
+      <w:r>
+        <w:rPr>
+          <w:rFonts w:ascii="Arial" w:hAnsi="Arial" w:cs="Arial"/>
+          <w:color w:val="000000"/>
+          <w:highlight w:val="cyan"/>
+        </w:rPr>
+        <w:lastRenderedPageBreak/>
+        <w:t xml:space="preserve">(artículo 23), riesgo alto (artículo 24) o riesgo aceptable (numeral 22.2 del artículo 22). El uso indebido deviene en prohibido; por ello, la SUNAT no desarrolla, adquiere, implementa ni opera SBIA cuyo uso sea indebido, y la clasificación los identifica y excluye en la etapa de evaluación de viabilidad, con anterioridad a su desarrollo o adquisición. </w:t>
       </w:r>
       <w:r>
         <w:rPr>
@@ -9721,7 +9712,6 @@
           <w:color w:val="000000"/>
           <w:highlight w:val="green"/>
         </w:rPr>
-        <w:lastRenderedPageBreak/>
         <w:t>6.2.2</w:t>
       </w:r>
       <w:r>
@@ -9829,7 +9819,16 @@
           <w:color w:val="000000"/>
           <w:highlight w:val="cyan"/>
         </w:rPr>
-        <w:t>Ante la duda sobre si un SBIA constituye uso indebido, la SUNAT puede formular a la SGTD la consulta prevista en el artículo 23 del RLIA.</w:t>
+        <w:t xml:space="preserve">Ante la duda sobre si un SBIA constituye uso </w:t>
+      </w:r>
+      <w:r>
+        <w:rPr>
+          <w:rFonts w:ascii="Arial" w:eastAsia="Arial" w:hAnsi="Arial" w:cs="Arial"/>
+          <w:color w:val="000000"/>
+          <w:highlight w:val="cyan"/>
+        </w:rPr>
+        <w:lastRenderedPageBreak/>
+        <w:t>indebido, la SUNAT puede formular a la SGTD la consulta prevista en el artículo 23 del RLIA.</w:t>
       </w:r>
     </w:p>
     <w:p>
@@ -9876,7 +9875,6 @@
           <w:color w:val="000000"/>
           <w:highlight w:val="green"/>
         </w:rPr>
-        <w:lastRenderedPageBreak/>
         <w:t>6.2.6</w:t>
       </w:r>
       <w:r>
@@ -10077,6 +10075,7 @@
           <w:color w:val="000000"/>
           <w:highlight w:val="yellow"/>
         </w:rPr>
+        <w:lastRenderedPageBreak/>
         <w:t>6.4.4</w:t>
       </w:r>
       <w:r>
@@ -10139,7 +10138,6 @@
           <w:szCs w:val="24"/>
           <w:highlight w:val="cyan"/>
         </w:rPr>
-        <w:lastRenderedPageBreak/>
         <w:t>Del diseño, la operación y la seguridad de los SBIA</w:t>
       </w:r>
     </w:p>
@@ -10244,25 +10242,7 @@
           <w:highlight w:val="green"/>
         </w:rPr>
         <w:tab/>
-        <w:t xml:space="preserve">El diseño de la arquitectura de los SBIA observa los Principios de Arquitectura de TI (AAT.PRAQ.01) y los Lineamientos de Arquitectura de TI (LAT.LIAQ.01) de la SUNAT, en sus versiones vigentes, en lo que corresponda a su naturaleza. La GA adecua dichos instrumentos y emite los estándares, modelos de referencia, patrones y demás documentos técnicos de arquitectura necesarios para incorporar los requisitos propios de los SBIA (modelos, conjuntos de datos, componentes generativos y </w:t>
-      </w:r>
-      <w:proofErr w:type="spellStart"/>
-      <w:r>
-        <w:rPr>
-          <w:rFonts w:ascii="Arial" w:eastAsia="Arial" w:hAnsi="Arial" w:cs="Arial"/>
-          <w:color w:val="000000"/>
-          <w:highlight w:val="green"/>
-        </w:rPr>
-        <w:t>agénticos</w:t>
-      </w:r>
-      <w:proofErr w:type="spellEnd"/>
-      <w:r>
-        <w:rPr>
-          <w:rFonts w:ascii="Arial" w:eastAsia="Arial" w:hAnsi="Arial" w:cs="Arial"/>
-          <w:color w:val="000000"/>
-          <w:highlight w:val="green"/>
-        </w:rPr>
-        <w:t>, e infraestructura especializada), en el ámbito de su competencia y conforme a los literales a) y c) del artículo 130 del ROF. Los que establezcan obligaciones exigibles a las unidades de organización se aprueban como documento normativo institucional conforme al numeral 7.6 de la presente directiva.</w:t>
+        <w:t>El diseño de la arquitectura de los SBIA observa los Principios de Arquitectura de TI (AAT.PRAQ.01) y los Lineamientos de Arquitectura de TI (LAT.LIAQ.01) de la SUNAT, en sus versiones vigentes, en lo que corresponda a su naturaleza. La GA adecua dichos instrumentos y emite los estándares, modelos de referencia, patrones y demás documentos técnicos de arquitectura necesarios para incorporar los requisitos propios de los SBIA (modelos, conjuntos de datos, componentes generativos y agénticos, e infraestructura especializada), en el ámbito de su competencia y conforme a los literales a) y c) del artículo 130 del ROF. Los que establezcan obligaciones exigibles a las unidades de organización se aprueban como documento normativo institucional conforme al numeral 7.6 de la presente directiva.</w:t>
       </w:r>
     </w:p>
     <w:p>
@@ -10282,9 +10262,25 @@
           <w:color w:val="000000"/>
           <w:highlight w:val="green"/>
         </w:rPr>
-        <w:t xml:space="preserve">6.5.4</w:t>
+        <w:t>6.5.4</w:t>
+      </w:r>
+      <w:r>
+        <w:rPr>
+          <w:rFonts w:ascii="Arial" w:eastAsia="Arial" w:hAnsi="Arial" w:cs="Arial"/>
+          <w:color w:val="000000"/>
+          <w:highlight w:val="green"/>
+        </w:rPr>
         <w:tab/>
-        <w:t xml:space="preserve">Todo SBIA cuenta con la aprobación del diseño de su arquitectura de solución, previa al inicio del desarrollo, la adquisición o el entrenamiento, conforme a la etapa 3 del numeral 6.1.1. Dicha aprobación corresponde a la División de Arquitectura de Información y de Aplicaciones y a la División de Arquitectura Tecnológica, cada una en el ámbito de su competencia conforme al literal a) de los artículos 132 y 134 del ROF, bajo la conducción de la Gerencia de Arquitectura. </w:t>
+        <w:t xml:space="preserve">Todo SBIA cuenta con la aprobación del diseño de su arquitectura de solución, previa al inicio del desarrollo, la adquisición o el entrenamiento, conforme a la etapa 3 del numeral 6.1.1. Dicha aprobación corresponde a la División de </w:t>
+      </w:r>
+      <w:r>
+        <w:rPr>
+          <w:rFonts w:ascii="Arial" w:eastAsia="Arial" w:hAnsi="Arial" w:cs="Arial"/>
+          <w:color w:val="000000"/>
+          <w:highlight w:val="green"/>
+        </w:rPr>
+        <w:lastRenderedPageBreak/>
+        <w:t xml:space="preserve">Arquitectura de Información y de Aplicaciones y a la División de Arquitectura Tecnológica, cada una en el ámbito de su competencia conforme al literal a) de los artículos 132 y 134 del ROF, bajo la conducción de la Gerencia de Arquitectura. </w:t>
       </w:r>
       <w:r>
         <w:rPr>
@@ -10321,16 +10317,7 @@
           <w:highlight w:val="green"/>
         </w:rPr>
         <w:tab/>
-        <w:t xml:space="preserve">Los SBIA que ejecuten acciones sobre sistemas, datos o procesos con algún grado de autonomía incorporan mecanismos de autorización, restricción y </w:t>
-      </w:r>
-      <w:r>
-        <w:rPr>
-          <w:rFonts w:ascii="Arial" w:eastAsia="Arial" w:hAnsi="Arial" w:cs="Arial"/>
-          <w:color w:val="000000"/>
-          <w:highlight w:val="green"/>
-        </w:rPr>
-        <w:lastRenderedPageBreak/>
-        <w:t>registro de dichas acciones. Dichos mecanismos son proporcionales al nivel de riesgo determinado conforme al numeral 6.2.2 y al grado de autonomía asignado. El propietario del caso de uso define el alcance de las acciones autorizadas; la División de Arquitectura de Información y de Aplicaciones aprueba el diseño de dichos mecanismos, conforme al literal a) del artículo 132 del ROF, y la División de Arquitectura Tecnológica valida los componentes de infraestructura tecnológica que los soportan, conforme al literal c) del artículo 134 del ROF, cada una en el ámbito de su competencia. Ambas validaciones se efectúan en la etapa 5 del numeral 6.1.1, con anterioridad al despliegue.</w:t>
+        <w:t>Los SBIA que ejecuten acciones sobre sistemas, datos o procesos con algún grado de autonomía incorporan mecanismos de autorización, restricción y registro de dichas acciones. Dichos mecanismos son proporcionales al nivel de riesgo determinado conforme al numeral 6.2.2 y al grado de autonomía asignado. El propietario del caso de uso define el alcance de las acciones autorizadas; la División de Arquitectura de Información y de Aplicaciones aprueba el diseño de dichos mecanismos, conforme al literal a) del artículo 132 del ROF, y la División de Arquitectura Tecnológica valida los componentes de infraestructura tecnológica que los soportan, conforme al literal c) del artículo 134 del ROF, cada una en el ámbito de su competencia. Ambas validaciones se efectúan en la etapa 5 del numeral 6.1.1, con anterioridad al despliegue.</w:t>
       </w:r>
     </w:p>
     <w:p>
@@ -10389,9 +10376,16 @@
           <w:color w:val="000000"/>
           <w:highlight w:val="lightGray"/>
         </w:rPr>
-        <w:t xml:space="preserve">6.5.6</w:t>
+        <w:t>6.5.6</w:t>
+      </w:r>
+      <w:r>
+        <w:rPr>
+          <w:rFonts w:ascii="Arial" w:eastAsia="Arial" w:hAnsi="Arial" w:cs="Arial"/>
+          <w:color w:val="000000"/>
+          <w:highlight w:val="lightGray"/>
+        </w:rPr>
         <w:tab/>
-        <w:t xml:space="preserve">Los SBIA generativos que utilicen información institucional incorporan mecanismos que vinculen los resultados generados con sus fuentes de información autorizadas y vigentes. Esta trazabilidad sustenta la explicabilidad exigida en el numeral 6.9.3.</w:t>
+        <w:t>Los SBIA generativos que utilicen información institucional incorporan mecanismos que vinculen los resultados generados con sus fuentes de información autorizadas y vigentes. Esta trazabilidad sustenta la explicabilidad exigida en el numeral 6.9.3.</w:t>
       </w:r>
     </w:p>
     <w:p>
@@ -10447,7 +10441,7 @@
           <w:highlight w:val="green"/>
         </w:rPr>
         <w:tab/>
-        <w:t xml:space="preserve">La GA conduce la determinación de publicabilidad prevista en el numeral 6.5.7. La efectúa antes de cada liberación mayor y, en todo caso, con ocasión de la revisión integral anual del Inventario Institucional de SBIA prevista en el numeral 6.3.2. La GA solicita para ello la opinión de la Oficina de Seguridad Informática y la de la INALI en materia de cumplimiento normativo. Cuando la determinación comprenda el sentido y el alcance de las normas tributarias o aduaneras, la GA solicita la opinión de la Intendencia Nacional Jurídico Tributaria o de la Intendencia Nacional Jurídico Aduanera, según la materia. La publicabilidad resulta de dichas opiniones. La determinación y su resultado constan en la Ficha de Registro de SBIA (Anexo N.° 1). Cuando el código no resulte publicable, se consigna igualmente la justificación legal de la restricción. La GDS pone a disposición el código fuente cuya publicación se haya </w:t>
+        <w:t xml:space="preserve">La GA conduce la determinación de publicabilidad prevista en el numeral 6.5.7. La efectúa antes de cada liberación mayor y, en todo caso, con ocasión de la </w:t>
       </w:r>
       <w:r>
         <w:rPr>
@@ -10456,7 +10450,7 @@
           <w:highlight w:val="green"/>
         </w:rPr>
         <w:lastRenderedPageBreak/>
-        <w:t>determinado procedente, conforme a los mecanismos que establezca la Plataforma Nacional de Software Público Peruano.</w:t>
+        <w:t>revisión integral anual del Inventario Institucional de SBIA prevista en el numeral 6.3.2. La GA solicita para ello la opinión de la Oficina de Seguridad Informática y la de la INALI en materia de cumplimiento normativo. Cuando la determinación comprenda el sentido y el alcance de las normas tributarias o aduaneras, la GA solicita la opinión de la Intendencia Nacional Jurídico Tributaria o de la Intendencia Nacional Jurídico Aduanera, según la materia. La publicabilidad resulta de dichas opiniones. La determinación y su resultado constan en la Ficha de Registro de SBIA (Anexo N.° 1). Cuando el código no resulte publicable, se consigna igualmente la justificación legal de la restricción. La GDS pone a disposición el código fuente cuya publicación se haya determinado procedente, conforme a los mecanismos que establezca la Plataforma Nacional de Software Público Peruano.</w:t>
       </w:r>
     </w:p>
     <w:p>
@@ -10475,9 +10469,16 @@
           <w:color w:val="000000"/>
           <w:highlight w:val="green"/>
         </w:rPr>
-        <w:t xml:space="preserve">6.5.9</w:t>
+        <w:t>6.5.9</w:t>
+      </w:r>
+      <w:r>
+        <w:rPr>
+          <w:rFonts w:ascii="Arial" w:eastAsia="Arial" w:hAnsi="Arial" w:cs="Arial"/>
+          <w:color w:val="000000"/>
+          <w:highlight w:val="green"/>
+        </w:rPr>
         <w:tab/>
-        <w:t xml:space="preserve">Los SBIA separan las funciones basadas en inferencia, generación o razonamiento probabilístico de aquellas que requieren un resultado determinístico. Constituyen funciones determinísticas, entre otras, los cálculos que determinan obligaciones o derechos, el cómputo de plazos, la aplicación de reglas normativas y de negocio, las validaciones de cumplimiento normativo y la ejecución de transacciones sobre los sistemas institucionales. El componente de IA puede interpretar, clasificar, recomendar u orquestar dichas funciones; su ejecución corresponde a los servicios, motores de reglas o componentes institucionales diseñados para tal fin. Esta separación se sustenta en la arquitectura de solución aprobada conforme al numeral 6.5.4, y sus criterios técnicos se desarrollan conforme al numeral 6.5.3.</w:t>
+        <w:t>Los SBIA separan las funciones basadas en inferencia, generación o razonamiento probabilístico de aquellas que requieren un resultado determinístico. Constituyen funciones determinísticas, entre otras, los cálculos que determinan obligaciones o derechos, el cómputo de plazos, la aplicación de reglas normativas y de negocio, las validaciones de cumplimiento normativo y la ejecución de transacciones sobre los sistemas institucionales. El componente de IA puede interpretar, clasificar, recomendar u orquestar dichas funciones; su ejecución corresponde a los servicios, motores de reglas o componentes institucionales diseñados para tal fin. Esta separación se sustenta en la arquitectura de solución aprobada conforme al numeral 6.5.4, y sus criterios técnicos se desarrollan conforme al numeral 6.5.3.</w:t>
       </w:r>
     </w:p>
     <w:p>
@@ -10594,7 +10595,17 @@
           <w:color w:val="000000"/>
           <w:highlight w:val="yellow"/>
         </w:rPr>
-        <w:t>Human-in-command (obligatorio para todos los SBIA): Un responsable designado por el propietario del caso de uso mantiene la capacidad de desactivar, suspender o modificar el comportamiento del SBIA en cualquier momento, incluida la interrupción inmediata de su operación ante la detección de un riesgo.</w:t>
+        <w:t xml:space="preserve">Human-in-command (obligatorio para todos los SBIA): Un responsable designado por el propietario del caso de uso mantiene la capacidad de desactivar, suspender o modificar el comportamiento del SBIA en cualquier </w:t>
+      </w:r>
+      <w:r>
+        <w:rPr>
+          <w:b w:val="0"/>
+          <w:bCs w:val="0"/>
+          <w:color w:val="000000"/>
+          <w:highlight w:val="yellow"/>
+        </w:rPr>
+        <w:lastRenderedPageBreak/>
+        <w:t>momento, incluida la interrupción inmediata de su operación ante la detección de un riesgo.</w:t>
       </w:r>
     </w:p>
     <w:p>
@@ -10640,7 +10651,6 @@
           <w:rFonts w:ascii="Arial" w:eastAsia="Arial" w:hAnsi="Arial" w:cs="Arial"/>
           <w:color w:val="000000"/>
         </w:rPr>
-        <w:lastRenderedPageBreak/>
         <w:t>6.6.3</w:t>
       </w:r>
       <w:r>
@@ -10846,22 +10856,15 @@
           <w:rFonts w:ascii="Arial" w:eastAsia="Arial" w:hAnsi="Arial" w:cs="Arial"/>
           <w:color w:val="000000"/>
         </w:rPr>
-        <w:t xml:space="preserve"> </w:t>
-      </w:r>
-      <w:r>
-        <w:rPr>
-          <w:rFonts w:ascii="Arial" w:eastAsia="Arial" w:hAnsi="Arial" w:cs="Arial"/>
-          <w:color w:val="000000"/>
-        </w:rPr>
-        <w:t xml:space="preserve">La ejecución de las pruebas que sustentan la medición de los indicadores de sesgo previstos en el numeral 6.10.2 corresponde a la División de Control de Calidad, como prueba no funcional, conforme al literal a) del artículo 126 del ROF. La metodología prevista en el numeral 6.1.5 desarrolla las pruebas aplicables según el tipo de SBIA. </w:t>
-      </w:r>
-      <w:r>
-        <w:rPr>
-          <w:rFonts w:ascii="Arial" w:eastAsia="Arial" w:hAnsi="Arial" w:cs="Arial"/>
-          <w:color w:val="000000"/>
-          <w:highlight w:val="green"/>
-        </w:rPr>
-        <w:t xml:space="preserve">La Comisión de Gobierno de IA verifica la implementación de estas medidas y los resultados de dichas pruebas en la etapa 5 del numeral 6.1.1, con anterioridad al despliegue.</w:t>
+        <w:t xml:space="preserve"> La ejecución de las pruebas que sustentan la medición de los indicadores de sesgo previstos en el numeral 6.10.2 corresponde a la División de Control de Calidad, como prueba no funcional, conforme al literal a) del artículo 126 del ROF. La metodología prevista en el numeral 6.1.5 desarrolla las pruebas aplicables según el tipo de SBIA. </w:t>
+      </w:r>
+      <w:r>
+        <w:rPr>
+          <w:rFonts w:ascii="Arial" w:eastAsia="Arial" w:hAnsi="Arial" w:cs="Arial"/>
+          <w:color w:val="000000"/>
+          <w:highlight w:val="green"/>
+        </w:rPr>
+        <w:t>La Comisión de Gobierno de IA verifica la implementación de estas medidas y los resultados de dichas pruebas en la etapa 5 del numeral 6.1.1, con anterioridad al despliegue.</w:t>
       </w:r>
     </w:p>
     <w:p>
@@ -10903,25 +10906,16 @@
           <w:highlight w:val="green"/>
         </w:rPr>
         <w:tab/>
-        <w:t xml:space="preserve">Los SBIA cumplen la Política de Seguridad de la Información (SGSI-PO-01) y el Manual de Políticas del Sistema de Gestión de Seguridad de la Información (SGSI-MA-03) de la SUNAT, en sus versiones vigentes. El Manual de Políticas </w:t>
-      </w:r>
-      <w:proofErr w:type="gramStart"/>
-      <w:r>
-        <w:rPr>
-          <w:rFonts w:ascii="Arial" w:eastAsia="Arial" w:hAnsi="Arial" w:cs="Arial"/>
-          <w:color w:val="000000"/>
-          <w:highlight w:val="green"/>
-        </w:rPr>
-        <w:t>es de aplicación</w:t>
-      </w:r>
-      <w:proofErr w:type="gramEnd"/>
-      <w:r>
-        <w:rPr>
-          <w:rFonts w:ascii="Arial" w:eastAsia="Arial" w:hAnsi="Arial" w:cs="Arial"/>
-          <w:color w:val="000000"/>
-          <w:highlight w:val="green"/>
-        </w:rPr>
-        <w:t xml:space="preserve"> a todos los colaboradores, al personal de modalidades formativas y a los terceros vinculados que gestionen información de la institución. Cuando un SBIA constituya un activo de información de un proceso comprendido en el alcance del Sistema de Gestión de Seguridad de la Información, le son exigibles además los demás documentos normativos y lineamientos de dicho Sistema.</w:t>
+        <w:t xml:space="preserve">Los SBIA cumplen la Política de Seguridad de la Información (SGSI-PO-01) y el Manual de Políticas del Sistema de Gestión de Seguridad de la Información </w:t>
+      </w:r>
+      <w:r>
+        <w:rPr>
+          <w:rFonts w:ascii="Arial" w:eastAsia="Arial" w:hAnsi="Arial" w:cs="Arial"/>
+          <w:color w:val="000000"/>
+          <w:highlight w:val="green"/>
+        </w:rPr>
+        <w:lastRenderedPageBreak/>
+        <w:t>(SGSI-MA-03) de la SUNAT, en sus versiones vigentes. El Manual de Políticas es de aplicación a todos los colaboradores, al personal de modalidades formativas y a los terceros vinculados que gestionen información de la institución. Cuando un SBIA constituya un activo de información de un proceso comprendido en el alcance del Sistema de Gestión de Seguridad de la Información, le son exigibles además los demás documentos normativos y lineamientos de dicho Sistema.</w:t>
       </w:r>
     </w:p>
     <w:p>
@@ -11049,7 +11043,6 @@
           <w:color w:val="000000"/>
           <w:highlight w:val="green"/>
         </w:rPr>
-        <w:lastRenderedPageBreak/>
         <w:t>Evaluación de vulnerabilidades conforme al OWASP Top 10 para aplicaciones LLM, en la versión que determine el documento normativo del numeral 6.7.7.</w:t>
       </w:r>
     </w:p>
@@ -11207,6 +11200,7 @@
           <w:color w:val="000000"/>
           <w:highlight w:val="cyan"/>
         </w:rPr>
+        <w:lastRenderedPageBreak/>
         <w:t>6.7.5</w:t>
       </w:r>
       <w:r>
@@ -11230,16 +11224,7 @@
           <w:color w:val="000000"/>
           <w:highlight w:val="cyan"/>
         </w:rPr>
-        <w:t xml:space="preserve"> por el Procedimiento para el registro y atención de incidentes y vulnerabilidades de seguridad de la información (A-03.5.1-PR-003). Los incidentes que se presenten durante la operación de un SBIA en producción y que no constituyan incidentes de seguridad de la información se atienden conforme al Procedimiento de Gestión de Incidentes (A-03.1.1-PR-002). Los que se detecten durante el diseño, el desarrollo o las pruebas se tratan dentro del ciclo de vida previsto en el numeral 6.1.1 y se resuelven con anterioridad al hito de la etapa en que se detectan. El custodio técnico deja constancia de su tratamiento y lo comunica a la Comisión de Gobierno de IA. Estas reglas comprenden los incidentes derivados del diseño, del desarrollo, del uso y del funcionamiento del SBIA, conforme al literal </w:t>
-      </w:r>
-      <w:r>
-        <w:rPr>
-          <w:rFonts w:ascii="Arial" w:eastAsia="Arial" w:hAnsi="Arial" w:cs="Arial"/>
-          <w:color w:val="000000"/>
-          <w:highlight w:val="cyan"/>
-        </w:rPr>
-        <w:lastRenderedPageBreak/>
-        <w:t xml:space="preserve">d) del artículo 29 del RLIA. </w:t>
+        <w:t xml:space="preserve"> por el Procedimiento para el registro y atención de incidentes y vulnerabilidades de seguridad de la información (A-03.5.1-PR-003). Los incidentes que se presenten durante la operación de un SBIA en producción y que no constituyan incidentes de seguridad de la información se atienden conforme al Procedimiento de Gestión de Incidentes (A-03.1.1-PR-002). Los que se detecten durante el diseño, el desarrollo o las pruebas se tratan dentro del ciclo de vida previsto en el numeral 6.1.1 y se resuelven con anterioridad al hito de la etapa en que se detectan. El custodio técnico deja constancia de su tratamiento y lo comunica a la Comisión de Gobierno de IA. Estas reglas comprenden los incidentes derivados del diseño, del desarrollo, del uso y del funcionamiento del SBIA, conforme al literal d) del artículo 29 del RLIA. </w:t>
       </w:r>
       <w:r>
         <w:rPr>
@@ -11349,34 +11334,23 @@
           <w:color w:val="000000"/>
         </w:rPr>
       </w:pPr>
-      <w:proofErr w:type="gramStart"/>
-      <w:r>
-        <w:rPr>
-          <w:rFonts w:ascii="Arial" w:eastAsia="Arial" w:hAnsi="Arial" w:cs="Arial"/>
-          <w:color w:val="000000"/>
-          <w:highlight w:val="green"/>
-        </w:rPr>
-        <w:t xml:space="preserve">6.7.8</w:t>
+      <w:r>
+        <w:rPr>
+          <w:rFonts w:ascii="Arial" w:eastAsia="Arial" w:hAnsi="Arial" w:cs="Arial"/>
+          <w:color w:val="000000"/>
+          <w:highlight w:val="green"/>
+        </w:rPr>
+        <w:lastRenderedPageBreak/>
+        <w:t>6.7.8</w:t>
+      </w:r>
+      <w:r>
+        <w:rPr>
+          <w:rFonts w:ascii="Arial" w:eastAsia="Arial" w:hAnsi="Arial" w:cs="Arial"/>
+          <w:color w:val="000000"/>
+          <w:highlight w:val="green"/>
+        </w:rPr>
         <w:tab/>
-        <w:t xml:space="preserve">El</w:t>
-      </w:r>
-      <w:proofErr w:type="gramEnd"/>
-      <w:r>
-        <w:rPr>
-          <w:rFonts w:ascii="Arial" w:eastAsia="Arial" w:hAnsi="Arial" w:cs="Arial"/>
-          <w:color w:val="000000"/>
-          <w:highlight w:val="green"/>
-        </w:rPr>
-        <w:t xml:space="preserve"> propietario del caso de uso, con el custodio técnico del SBIA, define el tratamiento de conservación y eliminación de las instrucciones (prompt), respuestas, contextos, representaciones vectoriales (embeddings), registros de interacción y demás información que el SBIA genere o procese durante su operación. El plazo de conservación se determina en función del nivel de riesgo del SBIA, del valor probatorio de la información, de su sensibilidad y de los requisitos de auditoría aplicables, y observa la normativa institucional de gestión documental y archivo que resulte aplicable. En tanto dicha normativa no comprenda la información que el SBIA genera, el plazo se fija en el plan de monitoreo del SBIA y no puede ser inferior al exigido por la normativa tributaria y aduanera para la actuación en que el SBIA interviene. Para determinar dicho mínimo, la Comisión de Gobierno de IA convoca a la Intendencia Nacional Jurídico Tributaria o a la Intendencia Nacional Jurídico Aduanera, según la materia. La conservación, el acceso y el uso de dicha información observan la </w:t>
-      </w:r>
-      <w:r>
-        <w:rPr>
-          <w:rFonts w:ascii="Arial" w:eastAsia="Arial" w:hAnsi="Arial" w:cs="Arial"/>
-          <w:color w:val="000000"/>
-          <w:highlight w:val="green"/>
-        </w:rPr>
-        <w:lastRenderedPageBreak/>
-        <w:t>reserva tributaria conforme al artículo 85 del TUO del Código Tributario y la normativa sobre protección de datos personales. El respaldo de la infraestructura tecnológica en la que reside dicha información, así como la custodia y disponibilidad de los medios correspondientes, están a cargo de la División de Soporte y Operación de la Infraestructura Tecnológica, conforme al literal b) del artículo 138 del ROF, y observan lo dispuesto en el numeral 6.7.1.</w:t>
+        <w:t>El propietario del caso de uso, con el custodio técnico del SBIA, define el tratamiento de conservación y eliminación de las instrucciones (prompt), respuestas, contextos, representaciones vectoriales (embeddings), registros de interacción y demás información que el SBIA genere o procese durante su operación. El plazo de conservación se determina en función del nivel de riesgo del SBIA, del valor probatorio de la información, de su sensibilidad y de los requisitos de auditoría aplicables, y observa la normativa institucional de gestión documental y archivo que resulte aplicable. En tanto dicha normativa no comprenda la información que el SBIA genera, el plazo se fija en el plan de monitoreo del SBIA y no puede ser inferior al exigido por la normativa tributaria y aduanera para la actuación en que el SBIA interviene. Para determinar dicho mínimo, la Comisión de Gobierno de IA convoca a la Intendencia Nacional Jurídico Tributaria o a la Intendencia Nacional Jurídico Aduanera, según la materia. La conservación, el acceso y el uso de dicha información observan la reserva tributaria conforme al artículo 85 del TUO del Código Tributario y la normativa sobre protección de datos personales. El respaldo de la infraestructura tecnológica en la que reside dicha información, así como la custodia y disponibilidad de los medios correspondientes, están a cargo de la División de Soporte y Operación de la Infraestructura Tecnológica, conforme al literal b) del artículo 138 del ROF, y observan lo dispuesto en el numeral 6.7.1.</w:t>
       </w:r>
     </w:p>
     <w:p>
@@ -11551,6 +11525,7 @@
           <w:color w:val="000000"/>
           <w:highlight w:val="yellow"/>
         </w:rPr>
+        <w:lastRenderedPageBreak/>
         <w:t>6.8.4</w:t>
       </w:r>
       <w:r>
@@ -11597,18 +11572,16 @@
           <w:color w:val="000000"/>
           <w:highlight w:val="green"/>
         </w:rPr>
-        <w:t xml:space="preserve">6.8.5</w:t>
+        <w:t>6.8.5</w:t>
+      </w:r>
+      <w:r>
+        <w:rPr>
+          <w:rFonts w:ascii="Arial" w:eastAsia="Arial" w:hAnsi="Arial" w:cs="Arial"/>
+          <w:color w:val="000000"/>
+          <w:highlight w:val="green"/>
+        </w:rPr>
         <w:tab/>
-        <w:t xml:space="preserve">Los conjuntos de datos que la SUNAT genere o administre y que califiquen como datos de alto valor se ponen a disposición a través del Centro Nacional de Datos (CND), conforme al numeral 28.7 del artículo 28 del RLIA. La calificación se efectúa conforme a los lineamientos nacionales para la identificación de Datos de Alto Valor que emita la SGTD en aplicación de la Estrategia Nacional de Gobierno de Datos; en tanto no se emitan, el OGD aplica los criterios de priorización que dicha Estrategia enuncia para la publicación obligatoria de Datos de Alto Valor: carácter estratégico, interés nacional, planificación y gestión territorial o alto impacto social. El OGD identifica anualmente los conjuntos candidatos, determina su publicabilidad y propone al CGTD su publicación. La determinación de publicabilidad aplica la </w:t>
-      </w:r>
-      <w:r>
-        <w:rPr>
-          <w:rFonts w:ascii="Arial" w:eastAsia="Arial" w:hAnsi="Arial" w:cs="Arial"/>
-          <w:color w:val="000000"/>
-          <w:highlight w:val="green"/>
-        </w:rPr>
-        <w:lastRenderedPageBreak/>
-        <w:t>reserva tributaria conforme al artículo 85 del TUO del Código Tributario, incluidas sus excepciones expresas (entre ellas la publicación de datos estadísticos de carácter global que no permita la individualización de declaraciones, informaciones, cuentas o personas), y la normativa sobre protección de datos personales. Cuando un conjunto no resulte publicable, la justificación legal de la restricción consta igualmente en el acuerdo del CGTD. Aprobada la publicación, el OGD coordina la puesta a disposición con la unidad de organización que administra el conjunto.</w:t>
+        <w:t>Los conjuntos de datos que la SUNAT genere o administre y que califiquen como datos de alto valor se ponen a disposición a través del Centro Nacional de Datos (CND), conforme al numeral 28.7 del artículo 28 del RLIA. La calificación se efectúa conforme a los lineamientos nacionales para la identificación de Datos de Alto Valor que emita la SGTD en aplicación de la Estrategia Nacional de Gobierno de Datos; en tanto no se emitan, el OGD aplica los criterios de priorización que dicha Estrategia enuncia para la publicación obligatoria de Datos de Alto Valor: carácter estratégico, interés nacional, planificación y gestión territorial o alto impacto social. El OGD identifica anualmente los conjuntos candidatos, determina su publicabilidad y propone al CGTD su publicación. La determinación de publicabilidad aplica la reserva tributaria conforme al artículo 85 del TUO del Código Tributario, incluidas sus excepciones expresas (entre ellas la publicación de datos estadísticos de carácter global que no permita la individualización de declaraciones, informaciones, cuentas o personas), y la normativa sobre protección de datos personales. Cuando un conjunto no resulte publicable, la justificación legal de la restricción consta igualmente en el acuerdo del CGTD. Aprobada la publicación, el OGD coordina la puesta a disposición con la unidad de organización que administra el conjunto.</w:t>
       </w:r>
     </w:p>
     <w:p>
@@ -11631,9 +11604,16 @@
           <w:color w:val="000000"/>
           <w:highlight w:val="green"/>
         </w:rPr>
-        <w:t xml:space="preserve">6.8.6</w:t>
+        <w:t>6.8.6</w:t>
+      </w:r>
+      <w:r>
+        <w:rPr>
+          <w:rFonts w:ascii="Arial" w:eastAsia="Arial" w:hAnsi="Arial" w:cs="Arial"/>
+          <w:color w:val="000000"/>
+          <w:highlight w:val="green"/>
+        </w:rPr>
         <w:tab/>
-        <w:t xml:space="preserve">Los SBIA se construyen sobre conjuntos de datos certificados conforme a la normativa institucional de gobernanza de datos y analítica, cuando estos existan para la materia. El uso de fuentes no certificadas se justifica en la Ficha de Evaluación de Caso de Uso (Anexo N.° 4) y consta en la Ficha de Registro de SBIA (Anexo N.° 1). En tanto no exista normativa de certificación para la materia, el OGD emite opinión sobre la idoneidad de los conjuntos de datos, conforme al numeral 6.8.2.</w:t>
+        <w:t>Los SBIA se construyen sobre conjuntos de datos certificados conforme a la normativa institucional de gobernanza de datos y analítica, cuando estos existan para la materia. El uso de fuentes no certificadas se justifica en la Ficha de Evaluación de Caso de Uso (Anexo N.° 4) y consta en la Ficha de Registro de SBIA (Anexo N.° 1). En tanto no exista normativa de certificación para la materia, el OGD emite opinión sobre la idoneidad de los conjuntos de datos, conforme al numeral 6.8.2.</w:t>
       </w:r>
     </w:p>
     <w:p>
@@ -11751,6 +11731,7 @@
           <w:color w:val="000000"/>
           <w:highlight w:val="cyan"/>
         </w:rPr>
+        <w:lastRenderedPageBreak/>
         <w:t>6.9.2</w:t>
       </w:r>
       <w:r>
@@ -11795,16 +11776,7 @@
           <w:highlight w:val="cyan"/>
         </w:rPr>
         <w:tab/>
-        <w:t xml:space="preserve">Los SBIA de riesgo alto cuentan con mecanismos de explicabilidad que permitan comprender los factores que influyeron en un resultado. Cuando un </w:t>
-      </w:r>
-      <w:r>
-        <w:rPr>
-          <w:rFonts w:ascii="Arial" w:hAnsi="Arial" w:cs="Arial"/>
-          <w:color w:val="000000"/>
-          <w:highlight w:val="cyan"/>
-        </w:rPr>
-        <w:lastRenderedPageBreak/>
-        <w:t>SBIA intervenga en decisiones que impacten en derechos humanos, las personas afectadas tienen derecho a recibir la explicación de los resultados, conforme al numeral 25.3 del artículo 25 del RLIA. La explicación se proporciona mediante mecanismos que permitan comprender los criterios y factores clave utilizados, en un lenguaje accesible.</w:t>
+        <w:t>Los SBIA de riesgo alto cuentan con mecanismos de explicabilidad que permitan comprender los factores que influyeron en un resultado. Cuando un SBIA intervenga en decisiones que impacten en derechos humanos, las personas afectadas tienen derecho a recibir la explicación de los resultados, conforme al numeral 25.3 del artículo 25 del RLIA. La explicación se proporciona mediante mecanismos que permitan comprender los criterios y factores clave utilizados, en un lenguaje accesible.</w:t>
       </w:r>
       <w:r>
         <w:t xml:space="preserve"> </w:t>
@@ -11862,9 +11834,25 @@
           <w:color w:val="000000"/>
           <w:highlight w:val="green"/>
         </w:rPr>
-        <w:t xml:space="preserve">6.9.5</w:t>
+        <w:t>6.9.5</w:t>
+      </w:r>
+      <w:r>
+        <w:rPr>
+          <w:rFonts w:ascii="Arial" w:eastAsia="Arial" w:hAnsi="Arial" w:cs="Arial"/>
+          <w:color w:val="000000"/>
+          <w:highlight w:val="green"/>
+        </w:rPr>
         <w:tab/>
-        <w:t xml:space="preserve">La Comisión de Gobierno de IA reporta trimestralmente al CGTD el estado del Inventario Institucional de SBIA, los incidentes, los resultados del monitoreo, la verificación técnica de seguridad, el avance de la capacitación y el cumplimiento de los indicadores. El reporte comprende además el seguimiento de los encargos previsto en el numeral 7.6, el estado de las condiciones del PAIA previsto en el numeral 7.11 y el alineamiento previsto en el numeral 7.12. Dicho reporte constituye el informe trimestral de gobierno de IA. Da cuenta de la actividad de la Comisión de Gobierno de IA y no constituye avance del Plan de Gobierno Digital.</w:t>
+        <w:t xml:space="preserve">La Comisión de Gobierno de IA reporta trimestralmente al CGTD el estado del Inventario Institucional de SBIA, los incidentes, los resultados del monitoreo, la verificación técnica de seguridad, el avance de la capacitación y el cumplimiento de los indicadores. El reporte comprende además el seguimiento de los encargos previsto en el numeral 7.6, el estado de las condiciones del PAIA previsto en el numeral 7.11 y el alineamiento previsto en el numeral 7.12. Dicho reporte constituye el informe trimestral de gobierno de IA. Da cuenta de </w:t>
+      </w:r>
+      <w:r>
+        <w:rPr>
+          <w:rFonts w:ascii="Arial" w:eastAsia="Arial" w:hAnsi="Arial" w:cs="Arial"/>
+          <w:color w:val="000000"/>
+          <w:highlight w:val="green"/>
+        </w:rPr>
+        <w:lastRenderedPageBreak/>
+        <w:t>la actividad de la Comisión de Gobierno de IA y no constituye avance del Plan de Gobierno Digital.</w:t>
       </w:r>
     </w:p>
     <w:p>
@@ -11944,7 +11932,6 @@
         <w:ind w:left="851"/>
       </w:pPr>
       <w:r>
-        <w:lastRenderedPageBreak/>
         <w:t>6.10</w:t>
       </w:r>
       <w:r>
@@ -12050,25 +12037,7 @@
           <w:color w:val="000000"/>
           <w:highlight w:val="green"/>
         </w:rPr>
-        <w:t xml:space="preserve">Cuando el plan de monitoreo prevea vigilancia automatizada, esta </w:t>
-      </w:r>
-      <w:proofErr w:type="spellStart"/>
-      <w:r>
-        <w:rPr>
-          <w:rFonts w:ascii="Arial" w:eastAsia="Arial" w:hAnsi="Arial" w:cs="Arial"/>
-          <w:color w:val="000000"/>
-          <w:highlight w:val="green"/>
-        </w:rPr>
-        <w:t>opera</w:t>
-      </w:r>
-      <w:proofErr w:type="spellEnd"/>
-      <w:r>
-        <w:rPr>
-          <w:rFonts w:ascii="Arial" w:eastAsia="Arial" w:hAnsi="Arial" w:cs="Arial"/>
-          <w:color w:val="000000"/>
-          <w:highlight w:val="green"/>
-        </w:rPr>
-        <w:t xml:space="preserve"> durante el horario de operación del SBIA, salvo que su criticidad justifique cobertura permanente, lo que se sustenta en el mismo plan.</w:t>
+        <w:t>Cuando el plan de monitoreo prevea vigilancia automatizada, esta opera durante el horario de operación del SBIA, salvo que su criticidad justifique cobertura permanente, lo que se sustenta en el mismo plan.</w:t>
       </w:r>
     </w:p>
     <w:p>
@@ -12115,7 +12084,16 @@
           <w:highlight w:val="green"/>
         </w:rPr>
         <w:tab/>
-        <w:t>La Comisión de Gobierno de IA define, para cada SBIA registrado en el Inventario, los indicadores de monitoreo que como mínimo incluyen: tasa de precisión, tasa de error, tiempo de respuesta, disponibilidad, detección de drift, indicadores de sesgo, tasa de intervención humana e indicadores de detección del uso irregular previstos en el numeral 6.10.6. Los umbrales de cada indicador, las alertas que su superación activa y las acciones de tratamiento correspondientes se definen con anterioridad a la puesta en producción del SBIA, conforme a la metodología prevista en el numeral 6.1.5. En tanto no se apruebe dicha metodología, se establecen en el plan de monitoreo que aprueba la Comisión de Gobierno de IA.</w:t>
+        <w:t xml:space="preserve">La Comisión de Gobierno de IA define, para cada SBIA registrado en el Inventario, los indicadores de monitoreo que como mínimo incluyen: tasa de precisión, tasa de error, tiempo de respuesta, disponibilidad, detección de drift, indicadores de sesgo, tasa de intervención humana e indicadores de detección del uso irregular previstos en el numeral 6.10.6. Los umbrales de cada indicador, las alertas que su superación activa y las acciones de tratamiento </w:t>
+      </w:r>
+      <w:r>
+        <w:rPr>
+          <w:rFonts w:ascii="Arial" w:eastAsia="Arial" w:hAnsi="Arial" w:cs="Arial"/>
+          <w:color w:val="000000"/>
+          <w:highlight w:val="green"/>
+        </w:rPr>
+        <w:lastRenderedPageBreak/>
+        <w:t>correspondientes se definen con anterioridad a la puesta en producción del SBIA, conforme a la metodología prevista en el numeral 6.1.5. En tanto no se apruebe dicha metodología, se establecen en el plan de monitoreo que aprueba la Comisión de Gobierno de IA.</w:t>
       </w:r>
       <w:r>
         <w:rPr>
@@ -12157,7 +12135,7 @@
           <w:highlight w:val="yellow"/>
         </w:rPr>
         <w:tab/>
-        <w:t xml:space="preserve">La Gerencia de Calidad de Sistemas conduce el control y aseguramiento de la calidad de los SBIA, conforme a sus funciones (artículos 123 y 124, literal a, del ROF). La verificación y validación de la calidad, incluida la ejecución de las pruebas funcionales y no funcionales, corresponde a la División de Control de Calidad, conforme a sus funciones (artículos 125 y 126, literal a, del ROF), y comprende además las pruebas de rendimiento, de regresión y de sesgo que correspondan al tipo de SBIA.</w:t>
+        <w:t>La Gerencia de Calidad de Sistemas conduce el control y aseguramiento de la calidad de los SBIA, conforme a sus funciones (artículos 123 y 124, literal a, del ROF). La verificación y validación de la calidad, incluida la ejecución de las pruebas funcionales y no funcionales, corresponde a la División de Control de Calidad, conforme a sus funciones (artículos 125 y 126, literal a, del ROF), y comprende además las pruebas de rendimiento, de regresión y de sesgo que correspondan al tipo de SBIA.</w:t>
       </w:r>
     </w:p>
     <w:p>
@@ -12176,16 +12154,7 @@
           <w:color w:val="000000"/>
           <w:highlight w:val="green"/>
         </w:rPr>
-        <w:t xml:space="preserve">El análisis de riesgo y las pruebas de vulnerabilidad sobre la arquitectura de aplicaciones, de información y de infraestructura tecnológica que soporta cada SBIA corresponden a la Oficina de Seguridad Informática, conforme al literal b) </w:t>
-      </w:r>
-      <w:r>
-        <w:rPr>
-          <w:rFonts w:ascii="Arial" w:eastAsia="Arial" w:hAnsi="Arial" w:cs="Arial"/>
-          <w:color w:val="000000"/>
-          <w:highlight w:val="green"/>
-        </w:rPr>
-        <w:lastRenderedPageBreak/>
-        <w:t>del artículo 106 del ROF y a la etapa de certificación y validación del numeral 6.1.1. La obligación de auditorías de seguridad digital del literal c) del artículo 29 del RLIA se satisface con la concurrencia de la verificación y validación de calidad, del análisis de riesgo, las pruebas de vulnerabilidad y el red teaming previstos en el numeral 6.7.2, con anterioridad a la implementación del SBIA y con la periodicidad que establezca el documento normativo del numeral 6.7.7, y del monitoreo del numeral 6.10, que comprende los indicadores de sesgo del numeral 6.10.2 y las medidas del numeral 6.6.4, durante toda su operación. Los resultados de estas actividades alimentan el informe trimestral de la Comisión de Gobierno de IA al CGTD.</w:t>
+        <w:t>El análisis de riesgo y las pruebas de vulnerabilidad sobre la arquitectura de aplicaciones, de información y de infraestructura tecnológica que soporta cada SBIA corresponden a la Oficina de Seguridad Informática, conforme al literal b) del artículo 106 del ROF y a la etapa de certificación y validación del numeral 6.1.1. La obligación de auditorías de seguridad digital del literal c) del artículo 29 del RLIA se satisface con la concurrencia de la verificación y validación de calidad, del análisis de riesgo, las pruebas de vulnerabilidad y el red teaming previstos en el numeral 6.7.2, con anterioridad a la implementación del SBIA y con la periodicidad que establezca el documento normativo del numeral 6.7.7, y del monitoreo del numeral 6.10, que comprende los indicadores de sesgo del numeral 6.10.2 y las medidas del numeral 6.6.4, durante toda su operación. Los resultados de estas actividades alimentan el informe trimestral de la Comisión de Gobierno de IA al CGTD.</w:t>
       </w:r>
     </w:p>
     <w:p>
@@ -12203,9 +12172,15 @@
           <w:rFonts w:ascii="Arial" w:hAnsi="Arial" w:cs="Arial"/>
           <w:highlight w:val="lightGray"/>
         </w:rPr>
-        <w:t xml:space="preserve">6.10.4</w:t>
+        <w:t>6.10.4</w:t>
+      </w:r>
+      <w:r>
+        <w:rPr>
+          <w:rFonts w:ascii="Arial" w:hAnsi="Arial" w:cs="Arial"/>
+          <w:highlight w:val="lightGray"/>
+        </w:rPr>
         <w:tab/>
-        <w:t xml:space="preserve">Todo cambio sobre un SBIA en operación se gestiona de manera controlada y proporcional a su nivel de riesgo. Constituyen cambio, entre otros, el reentrenamiento o la recalibración del modelo, su sustitución o el cambio de versión del modelo base, la modificación de las fuentes o de la estructura de los datos de entrada, la ampliación de la finalidad o de la población objetivo del SBIA, y el cambio de proveedor. El propietario del caso de uso registra todo cambio en el Inventario Institucional de SBIA, lo califica como significativo o no conforme al numeral 6.10.5 y lo comunica a la Comisión de Gobierno de IA. La Comisión valida dicha calificación.</w:t>
+        <w:t>Todo cambio sobre un SBIA en operación se gestiona de manera controlada y proporcional a su nivel de riesgo. Constituyen cambio, entre otros, el reentrenamiento o la recalibración del modelo, su sustitución o el cambio de versión del modelo base, la modificación de las fuentes o de la estructura de los datos de entrada, la ampliación de la finalidad o de la población objetivo del SBIA, y el cambio de proveedor. El propietario del caso de uso registra todo cambio en el Inventario Institucional de SBIA, lo califica como significativo o no conforme al numeral 6.10.5 y lo comunica a la Comisión de Gobierno de IA. La Comisión valida dicha calificación.</w:t>
       </w:r>
     </w:p>
     <w:p>
@@ -12229,7 +12204,13 @@
           <w:rFonts w:ascii="Arial" w:hAnsi="Arial" w:cs="Arial"/>
           <w:highlight w:val="green"/>
         </w:rPr>
-        <w:t xml:space="preserve">5</w:t>
+        <w:t>5</w:t>
+      </w:r>
+      <w:r>
+        <w:rPr>
+          <w:rFonts w:ascii="Arial" w:hAnsi="Arial" w:cs="Arial"/>
+          <w:highlight w:val="green"/>
+        </w:rPr>
         <w:tab/>
         <w:t xml:space="preserve">Es significativo el cambio que altera el nivel de riesgo del SBIA, su finalidad, la población objetivo o el contexto de aplicación. También lo es el que degrada su desempeño por debajo de los umbrales del plan de monitoreo. Los demás cambios se gestionan conforme al numeral 6.10.4, de manera proporcional a su nivel de riesgo. El </w:t>
       </w:r>
@@ -12238,7 +12219,15 @@
           <w:rFonts w:ascii="Arial" w:hAnsi="Arial" w:cs="Arial"/>
           <w:highlight w:val="lightGray"/>
         </w:rPr>
-        <w:t>cambio significativo requiere, con anterioridad a su puesta en producción: la revisión de la clasificación de riesgo conforme al numeral 6.2.2; la actualización de la EIA conforme al numeral 6.4.3, cuando corresponda; la verificación y validación conforme al numeral 6.10.3; y la aprobación prevista en el numeral 6.1.2. El despliegue del cambio se realiza con versión identificable y con un plan de reversión que permita restituir la versión anterior del SBIA. La operación posterior al cambio es objeto de seguimiento reforzado durante el periodo que corresponda a su nivel de riesgo, conforme a la metodología prevista en el numeral 6.1.5.</w:t>
+        <w:t xml:space="preserve">cambio significativo requiere, con anterioridad a su puesta en producción: la revisión de la clasificación de riesgo conforme al numeral 6.2.2; la actualización de la EIA conforme al numeral 6.4.3, cuando corresponda; la verificación y validación conforme al numeral 6.10.3; y la aprobación prevista en el numeral 6.1.2. El despliegue del cambio se realiza con versión identificable y con un plan de reversión que permita restituir la </w:t>
+      </w:r>
+      <w:r>
+        <w:rPr>
+          <w:rFonts w:ascii="Arial" w:hAnsi="Arial" w:cs="Arial"/>
+          <w:highlight w:val="lightGray"/>
+        </w:rPr>
+        <w:lastRenderedPageBreak/>
+        <w:t>versión anterior del SBIA. La operación posterior al cambio es objeto de seguimiento reforzado durante el periodo que corresponda a su nivel de riesgo, conforme a la metodología prevista en el numeral 6.1.5.</w:t>
       </w:r>
     </w:p>
     <w:p>
@@ -12255,9 +12244,15 @@
           <w:rFonts w:ascii="Arial" w:hAnsi="Arial" w:cs="Arial"/>
           <w:highlight w:val="green"/>
         </w:rPr>
-        <w:t xml:space="preserve">6.10.6</w:t>
+        <w:t>6.10.6</w:t>
+      </w:r>
+      <w:r>
+        <w:rPr>
+          <w:rFonts w:ascii="Arial" w:hAnsi="Arial" w:cs="Arial"/>
+          <w:highlight w:val="green"/>
+        </w:rPr>
         <w:tab/>
-        <w:t xml:space="preserve">El monitoreo comprende la detección del uso irregular del SBIA por parte de quienes lo operan o interactúan con él, con independencia del nivel de riesgo que tenga asignado. El uso irregular se distingue del uso indebido a que se refiere el artículo 23 del RLIA, que es una categoría de clasificación del SBIA. Constituyen indicios de uso irregular, entre otros, la manipulación de los datos de entrada para inducir un resultado determinado, el empleo del SBIA para una finalidad distinta de la registrada en el Inventario Institucional de SBIA y los patrones de uso incompatibles con la operación normal del proceso. La Comisión de Gobierno de IA define los indicadores que permitan detectar dichos patrones, conforme al numeral 6.10.2, y los incorpora al plan de monitoreo. Los efectos del uso irregular sobre el funcionamiento del SBIA se tratan conforme al numeral 6.7.5. La conducta se comunica a la Oficina de Integridad Institucional y se trata conforme a las normas de integridad institucional.</w:t>
+        <w:t>El monitoreo comprende la detección del uso irregular del SBIA por parte de quienes lo operan o interactúan con él, con independencia del nivel de riesgo que tenga asignado. El uso irregular se distingue del uso indebido a que se refiere el artículo 23 del RLIA, que es una categoría de clasificación del SBIA. Constituyen indicios de uso irregular, entre otros, la manipulación de los datos de entrada para inducir un resultado determinado, el empleo del SBIA para una finalidad distinta de la registrada en el Inventario Institucional de SBIA y los patrones de uso incompatibles con la operación normal del proceso. La Comisión de Gobierno de IA define los indicadores que permitan detectar dichos patrones, conforme al numeral 6.10.2, y los incorpora al plan de monitoreo. Los efectos del uso irregular sobre el funcionamiento del SBIA se tratan conforme al numeral 6.7.5. La conducta se comunica a la Oficina de Integridad Institucional y se trata conforme a las normas de integridad institucional.</w:t>
       </w:r>
     </w:p>
     <w:p>
@@ -12521,6 +12516,7 @@
           <w:color w:val="000000"/>
           <w:highlight w:val="green"/>
         </w:rPr>
+        <w:lastRenderedPageBreak/>
         <w:t>6.11.3</w:t>
       </w:r>
       <w:r>
@@ -12566,16 +12562,7 @@
           <w:highlight w:val="green"/>
         </w:rPr>
         <w:tab/>
-        <w:t xml:space="preserve">Ninguna unidad de organización desarrolla, adquiere, contrata, implementa u opera SBIA fuera del límite de la presente directiva, independientemente de su </w:t>
-      </w:r>
-      <w:r>
-        <w:rPr>
-          <w:rFonts w:ascii="Arial" w:eastAsia="Arial" w:hAnsi="Arial" w:cs="Arial"/>
-          <w:color w:val="000000"/>
-          <w:highlight w:val="green"/>
-        </w:rPr>
-        <w:lastRenderedPageBreak/>
-        <w:t>complejidad, presupuesto o ámbito geográfico. En particular: (a) toda iniciativa de SBIA como proyecto se sujeta al ciclo de vida del numeral 6.1, incluidos sus hitos de aprobación, y se registra en el Inventario Institucional de SBIA; (b) toda herramienta de IA que se contrate como servicio (suscripciones, APIs, plataformas SaaS) cuenta previamente con la aprobación prevista en el numeral 6.11.5 y con su inclusión en el catálogo institucional (numeral 6.11.2). Cuando la herramienta constituya además un SBIA, le son aplicables las verificaciones del numeral 6.12 que correspondan. Los colaboradores utilizan exclusivamente las herramientas de IA que figuran en dicho catálogo. La Comisión de Gobierno de IA promueve la regularización mediante el registro y el acompañamiento proporcional a la unidad involucrada, y comunica al CGTD y, según corresponda, a la OII, los incumplimientos reiterados. Cuando de la regularización resulte que el SBIA corresponde a la categoría de uso indebido prevista en el artículo 23 del RLIA, no procede su regularización y se aplica lo dispuesto en los numerales 6.2.1, 6.2.3 y 6.2.6.</w:t>
+        <w:t>Ninguna unidad de organización desarrolla, adquiere, contrata, implementa u opera SBIA fuera del límite de la presente directiva, independientemente de su complejidad, presupuesto o ámbito geográfico. En particular: (a) toda iniciativa de SBIA como proyecto se sujeta al ciclo de vida del numeral 6.1, incluidos sus hitos de aprobación, y se registra en el Inventario Institucional de SBIA; (b) toda herramienta de IA que se contrate como servicio (suscripciones, APIs, plataformas SaaS) cuenta previamente con la aprobación prevista en el numeral 6.11.5 y con su inclusión en el catálogo institucional (numeral 6.11.2). Cuando la herramienta constituya además un SBIA, le son aplicables las verificaciones del numeral 6.12 que correspondan. Los colaboradores utilizan exclusivamente las herramientas de IA que figuran en dicho catálogo. La Comisión de Gobierno de IA promueve la regularización mediante el registro y el acompañamiento proporcional a la unidad involucrada, y comunica al CGTD y, según corresponda, a la OII, los incumplimientos reiterados. Cuando de la regularización resulte que el SBIA corresponde a la categoría de uso indebido prevista en el artículo 23 del RLIA, no procede su regularización y se aplica lo dispuesto en los numerales 6.2.1, 6.2.3 y 6.2.6.</w:t>
       </w:r>
     </w:p>
     <w:p>
@@ -12635,7 +12622,16 @@
           <w:color w:val="000000"/>
           <w:highlight w:val="green"/>
         </w:rPr>
-        <w:t>El registro, el control y el retiro de las herramientas de IA que requieren instalación en los equipos informáticos se rigen por el Procedimiento para el Registro, Control y Retiro de Software de la SUNAT (A-03.3.2-PR-01). La Gerencia de Operaciones y Soporte a Usuarios adecúa dicho procedimiento para comprender las herramientas de IA que se consumen como servicio y no requieren instalación, conforme al numeral 7.6 de la presente directiva. En tanto no se apruebe dicha adecuación, el alta y la baja de estas herramientas en el catálogo institucional se efectúan conforme al presente numeral.</w:t>
+        <w:t xml:space="preserve">El registro, el control y el retiro de las herramientas de IA que requieren instalación en los equipos informáticos se rigen por el Procedimiento para el Registro, Control y Retiro de Software de la SUNAT (A-03.3.2-PR-01). La Gerencia de Operaciones y Soporte a Usuarios adecúa dicho procedimiento para </w:t>
+      </w:r>
+      <w:r>
+        <w:rPr>
+          <w:rFonts w:ascii="Arial" w:eastAsia="Arial" w:hAnsi="Arial" w:cs="Arial"/>
+          <w:color w:val="000000"/>
+          <w:highlight w:val="green"/>
+        </w:rPr>
+        <w:lastRenderedPageBreak/>
+        <w:t>comprender las herramientas de IA que se consumen como servicio y no requieren instalación, conforme al numeral 7.6 de la presente directiva. En tanto no se apruebe dicha adecuación, el alta y la baja de estas herramientas en el catálogo institucional se efectúan conforme al presente numeral.</w:t>
       </w:r>
     </w:p>
     <w:p>
@@ -12705,16 +12701,7 @@
           <w:highlight w:val="green"/>
         </w:rPr>
         <w:tab/>
-        <w:t xml:space="preserve">La unidad de organización que formula los términos de referencia o las especificaciones técnicas incorpora en ellos las cláusulas que el contrato debe contener sobre: (a) protección de datos y reserva tributaria; (b) transparencia </w:t>
-      </w:r>
-      <w:r>
-        <w:rPr>
-          <w:rFonts w:ascii="Arial" w:eastAsia="Arial" w:hAnsi="Arial" w:cs="Arial"/>
-          <w:color w:val="000000"/>
-          <w:highlight w:val="green"/>
-        </w:rPr>
-        <w:lastRenderedPageBreak/>
-        <w:t>del modelo; (c) comunicación de vulnerabilidades e incidentes; (d) derecho de auditoría, incluida la realización de auditorías éticas y de sesgo sobre el modelo; (e) transferencia de conocimiento; (f) cumplimiento de estándares técnicos; y (g) la identificación de los subprocesadores autorizados y las condiciones de recuperación de la información institucional a la conclusión del contrato. El plazo de notificación de vulnerabilidades se define en los TDR o EETT de cada contratación, según la criticidad del SBIA.</w:t>
+        <w:t>La unidad de organización que formula los términos de referencia o las especificaciones técnicas incorpora en ellos las cláusulas que el contrato debe contener sobre: (a) protección de datos y reserva tributaria; (b) transparencia del modelo; (c) comunicación de vulnerabilidades e incidentes; (d) derecho de auditoría, incluida la realización de auditorías éticas y de sesgo sobre el modelo; (e) transferencia de conocimiento; (f) cumplimiento de estándares técnicos; y (g) la identificación de los subprocesadores autorizados y las condiciones de recuperación de la información institucional a la conclusión del contrato. El plazo de notificación de vulnerabilidades se define en los TDR o EETT de cada contratación, según la criticidad del SBIA.</w:t>
       </w:r>
     </w:p>
     <w:p>
@@ -12798,7 +12785,16 @@
           <w:highlight w:val="green"/>
         </w:rPr>
         <w:tab/>
-        <w:t>Para los SBIA de riesgo alto, los contratos obligan al proveedor a entregar la documentación técnica sobre los principios de funcionamiento del sistema, las fuentes de datos utilizadas y la lógica del algoritmo, conforme al numeral 31.1 del artículo 31 del RLIA, en la medida necesaria para el cumplimiento de las obligaciones de transparencia y explicabilidad de la SUNAT y con respeto del secreto industrial y comercial, conforme al numeral 25.1 del artículo 25 del RLIA. La Comisión de Gobierno de IA determina el alcance de la documentación exigible al evaluar el componente de IA del caso de uso. No se admiten soluciones de caja negra no auditables.</w:t>
+        <w:t xml:space="preserve">Para los SBIA de riesgo alto, los contratos obligan al proveedor a entregar la documentación técnica sobre los principios de funcionamiento del sistema, las fuentes de datos utilizadas y la lógica del algoritmo, conforme al numeral 31.1 del artículo 31 del RLIA, en la medida necesaria para el cumplimiento de las obligaciones de transparencia y explicabilidad de la SUNAT y con respeto del secreto industrial y comercial, conforme al numeral 25.1 del artículo 25 del RLIA. La Comisión de Gobierno de IA determina el alcance de la </w:t>
+      </w:r>
+      <w:r>
+        <w:rPr>
+          <w:rFonts w:ascii="Arial" w:eastAsia="Arial" w:hAnsi="Arial" w:cs="Arial"/>
+          <w:color w:val="000000"/>
+          <w:highlight w:val="green"/>
+        </w:rPr>
+        <w:lastRenderedPageBreak/>
+        <w:t>documentación exigible al evaluar el componente de IA del caso de uso. No se admiten soluciones de caja negra no auditables.</w:t>
       </w:r>
     </w:p>
     <w:p>
@@ -12865,9 +12861,16 @@
           <w:color w:val="000000"/>
           <w:highlight w:val="lightGray"/>
         </w:rPr>
-        <w:t xml:space="preserve">6.13.1</w:t>
+        <w:t>6.13.1</w:t>
+      </w:r>
+      <w:r>
+        <w:rPr>
+          <w:rFonts w:ascii="Arial" w:eastAsia="Arial" w:hAnsi="Arial" w:cs="Arial"/>
+          <w:color w:val="000000"/>
+          <w:highlight w:val="lightGray"/>
+        </w:rPr>
         <w:tab/>
-        <w:t xml:space="preserve">Sensibilización</w:t>
+        <w:t>Sensibilización</w:t>
       </w:r>
     </w:p>
     <w:p>
@@ -12933,7 +12936,6 @@
           <w:color w:val="000000"/>
           <w:highlight w:val="lightGray"/>
         </w:rPr>
-        <w:lastRenderedPageBreak/>
         <w:t>La finalidad y los principios institucionales aplicables a los SBIA</w:t>
       </w:r>
     </w:p>
@@ -13081,9 +13083,16 @@
           <w:color w:val="000000"/>
           <w:highlight w:val="lightGray"/>
         </w:rPr>
-        <w:t xml:space="preserve">6.13.2</w:t>
+        <w:t>6.13.2</w:t>
+      </w:r>
+      <w:r>
+        <w:rPr>
+          <w:rFonts w:ascii="Arial" w:eastAsia="Arial" w:hAnsi="Arial" w:cs="Arial"/>
+          <w:color w:val="000000"/>
+          <w:highlight w:val="lightGray"/>
+        </w:rPr>
         <w:tab/>
-        <w:t xml:space="preserve">Capacitación y fortalecimiento de capacidades</w:t>
+        <w:t>Capacitación y fortalecimiento de capacidades</w:t>
       </w:r>
     </w:p>
     <w:p>
@@ -13247,6 +13256,7 @@
           <w:color w:val="000000"/>
           <w:highlight w:val="lightGray"/>
         </w:rPr>
+        <w:lastRenderedPageBreak/>
         <w:t>La protección de datos personales.</w:t>
       </w:r>
     </w:p>
@@ -13322,9 +13332,16 @@
           <w:color w:val="000000"/>
           <w:highlight w:val="lightGray"/>
         </w:rPr>
-        <w:t xml:space="preserve">6.13.3</w:t>
+        <w:t>6.13.3</w:t>
+      </w:r>
+      <w:r>
+        <w:rPr>
+          <w:rFonts w:ascii="Arial" w:eastAsia="Arial" w:hAnsi="Arial" w:cs="Arial"/>
+          <w:color w:val="000000"/>
+          <w:highlight w:val="lightGray"/>
+        </w:rPr>
         <w:tab/>
-        <w:t xml:space="preserve">Gestión del cambio</w:t>
+        <w:t>Gestión del cambio</w:t>
       </w:r>
     </w:p>
     <w:p>
@@ -13371,16 +13388,7 @@
           <w:color w:val="000000"/>
           <w:highlight w:val="lightGray"/>
         </w:rPr>
-        <w:t xml:space="preserve">Las acciones de gestión del cambio facilitan la consolidación de la Política de IA y del sistema de gestión de IA, promoviendo su integración en la gestión institucional y favoreciendo las condiciones organizacionales necesarias para </w:t>
-      </w:r>
-      <w:r>
-        <w:rPr>
-          <w:rFonts w:ascii="Arial" w:eastAsia="Arial" w:hAnsi="Arial" w:cs="Arial"/>
-          <w:color w:val="000000"/>
-          <w:highlight w:val="lightGray"/>
-        </w:rPr>
-        <w:lastRenderedPageBreak/>
-        <w:t>su sostenibilidad y mejora continua, en concordancia con los numerales 28.1 y 28.2 del artículo 28 del RLIA.</w:t>
+        <w:t>Las acciones de gestión del cambio facilitan la consolidación de la Política de IA y del sistema de gestión de IA, promoviendo su integración en la gestión institucional y favoreciendo las condiciones organizacionales necesarias para su sostenibilidad y mejora continua, en concordancia con los numerales 28.1 y 28.2 del artículo 28 del RLIA.</w:t>
       </w:r>
     </w:p>
     <w:p>
@@ -13549,25 +13557,16 @@
           <w:color w:val="000000"/>
           <w:highlight w:val="yellow"/>
         </w:rPr>
-        <w:t xml:space="preserve"> </w:t>
-      </w:r>
-      <w:proofErr w:type="gramStart"/>
+        <w:t xml:space="preserve"> son de aplicación en la SUNAT desde su entrada en vigencia. La Comisión de Gobierno de IA evalúa </w:t>
+      </w:r>
       <w:r>
         <w:rPr>
           <w:rFonts w:ascii="Arial" w:eastAsia="Arial" w:hAnsi="Arial" w:cs="Arial"/>
           <w:color w:val="000000"/>
           <w:highlight w:val="yellow"/>
         </w:rPr>
-        <w:t>son de aplicación</w:t>
-      </w:r>
-      <w:proofErr w:type="gramEnd"/>
-      <w:r>
-        <w:rPr>
-          <w:rFonts w:ascii="Arial" w:eastAsia="Arial" w:hAnsi="Arial" w:cs="Arial"/>
-          <w:color w:val="000000"/>
-          <w:highlight w:val="yellow"/>
-        </w:rPr>
-        <w:t xml:space="preserve"> en la SUNAT desde su entrada en vigencia. La Comisión de Gobierno de IA evalúa su impacto en la presente directiva y propone al CGTD los ajustes que correspondan.</w:t>
+        <w:lastRenderedPageBreak/>
+        <w:t>su impacto en la presente directiva y propone al CGTD los ajustes que correspondan.</w:t>
       </w:r>
     </w:p>
     <w:p>
@@ -13583,9 +13582,14 @@
         <w:rPr>
           <w:highlight w:val="lightGray"/>
         </w:rPr>
-        <w:t xml:space="preserve">6.15</w:t>
+        <w:t>6.15</w:t>
+      </w:r>
+      <w:r>
+        <w:rPr>
+          <w:highlight w:val="lightGray"/>
+        </w:rPr>
         <w:tab/>
-        <w:t xml:space="preserve">De la articulación con la formulación de iniciativas, proyectos e inversiones</w:t>
+        <w:t>De la articulación con la formulación de iniciativas, proyectos e inversiones</w:t>
       </w:r>
     </w:p>
     <w:p>
@@ -13628,17 +13632,15 @@
           <w:rFonts w:ascii="Arial" w:hAnsi="Arial" w:cs="Arial"/>
           <w:highlight w:val="green"/>
         </w:rPr>
-        <w:t xml:space="preserve">6.15.1</w:t>
+        <w:t>6.15.1</w:t>
+      </w:r>
+      <w:r>
+        <w:rPr>
+          <w:rFonts w:ascii="Arial" w:hAnsi="Arial" w:cs="Arial"/>
+          <w:highlight w:val="green"/>
+        </w:rPr>
         <w:tab/>
-        <w:t xml:space="preserve">Toda iniciativa, requerimiento o proyecto que incorpore o prevea un componente basado en IA requiere la opinión técnica previa de la Comisión de Gobierno de IA sobre dicho componente, cualquiera sea el instrumento de gestión bajo el cual se formule, ejecute o modifique. La opinión se emite sobre la Ficha de Evaluación de Caso de Uso (Anexo N.° 4), adecuada a la naturaleza y magnitud de la iniciativa, requerimiento o proyecto. La opinión comprende la pertinencia del uso de inteligencia artificial y la clasificación de riesgo del componente, conforme al Anexo N.° 2 y a los artículos 22 a 24 del RLIA. </w:t>
-      </w:r>
-      <w:r>
-        <w:rPr>
-          <w:rFonts w:ascii="Arial" w:hAnsi="Arial" w:cs="Arial"/>
-          <w:highlight w:val="green"/>
-        </w:rPr>
-        <w:lastRenderedPageBreak/>
-        <w:t>Determinar la pertinencia es establecer si el resultado esperado requiere inteligencia artificial o se alcanza sin ella, conforme al numeral 5.1.4. Los controles aplicables se determinan a partir de la clasificación, conforme al numeral 6.2.5. La opinión no comprende la generación de valor, el costo, la prioridad ni la viabilidad presupuestal de la iniciativa, que corresponden a los instrumentos de gestión respectivos y a las instancias competentes. La opinión adopta uno de los siguientes pronunciamientos:</w:t>
+        <w:t>Toda iniciativa, requerimiento o proyecto que incorpore o prevea un componente basado en IA requiere la opinión técnica previa de la Comisión de Gobierno de IA sobre dicho componente, cualquiera sea el instrumento de gestión bajo el cual se formule, ejecute o modifique. La opinión se emite sobre la Ficha de Evaluación de Caso de Uso (Anexo N.° 4), adecuada a la naturaleza y magnitud de la iniciativa, requerimiento o proyecto. La opinión comprende la pertinencia del uso de inteligencia artificial y la clasificación de riesgo del componente, conforme al Anexo N.° 2 y a los artículos 22 a 24 del RLIA. Determinar la pertinencia es establecer si el resultado esperado requiere inteligencia artificial o se alcanza sin ella, conforme al numeral 5.1.4. Los controles aplicables se determinan a partir de la clasificación, conforme al numeral 6.2.5. La opinión no comprende la generación de valor, el costo, la prioridad ni la viabilidad presupuestal de la iniciativa, que corresponden a los instrumentos de gestión respectivos y a las instancias competentes. La opinión adopta uno de los siguientes pronunciamientos:</w:t>
       </w:r>
     </w:p>
     <w:p>
@@ -13739,9 +13741,15 @@
           <w:rFonts w:ascii="Arial" w:hAnsi="Arial" w:cs="Arial"/>
           <w:highlight w:val="green"/>
         </w:rPr>
-        <w:t xml:space="preserve">6.15.2</w:t>
+        <w:t>6.15.2</w:t>
+      </w:r>
+      <w:r>
+        <w:rPr>
+          <w:rFonts w:ascii="Arial" w:hAnsi="Arial" w:cs="Arial"/>
+          <w:highlight w:val="green"/>
+        </w:rPr>
         <w:tab/>
-        <w:t xml:space="preserve">El uso indebido está prohibido por el artículo 23 del RLIA y el sometimiento de los SBIA de riesgo alto a condiciones y controles es obligatorio conforme al literal b) del numeral 22.1 del artículo 22 del RLIA, a sus artículos 25, 29 y 30 y al numeral 28.11 de su artículo 28: en ambos casos obliga la norma, no la opinión. En los demás casos la opinión sustenta la decisión, pero no la reemplaza. La aprobación corresponde, en cada caso, a la instancia competente conforme al ROF, a las normas de delegación de facultades, a los instrumentos de gestión institucionales o a la normativa de los sistemas administrativos del Estado.</w:t>
+        <w:t>El uso indebido está prohibido por el artículo 23 del RLIA y el sometimiento de los SBIA de riesgo alto a condiciones y controles es obligatorio conforme al literal b) del numeral 22.1 del artículo 22 del RLIA, a sus artículos 25, 29 y 30 y al numeral 28.11 de su artículo 28: en ambos casos obliga la norma, no la opinión. En los demás casos la opinión sustenta la decisión, pero no la reemplaza. La aprobación corresponde, en cada caso, a la instancia competente conforme al ROF, a las normas de delegación de facultades, a los instrumentos de gestión institucionales o a la normativa de los sistemas administrativos del Estado.</w:t>
       </w:r>
     </w:p>
     <w:p>
@@ -13762,9 +13770,23 @@
           <w:rFonts w:ascii="Arial" w:hAnsi="Arial" w:cs="Arial"/>
           <w:highlight w:val="lightGray"/>
         </w:rPr>
-        <w:t xml:space="preserve">6.15.3</w:t>
+        <w:t>6.15.3</w:t>
+      </w:r>
+      <w:r>
+        <w:rPr>
+          <w:rFonts w:ascii="Arial" w:hAnsi="Arial" w:cs="Arial"/>
+          <w:highlight w:val="lightGray"/>
+        </w:rPr>
         <w:tab/>
-        <w:t xml:space="preserve">En la gestión de la demanda informática, cuando un requerimiento implique el desarrollo, la adquisición o el uso de un SBIA o de una herramienta de IA, se recaba la opinión de la Comisión antes de su atención, con los formatos vigentes de la demanda complementados con la información que la INSI determine.</w:t>
+        <w:t xml:space="preserve">En la gestión de la demanda informática, cuando un requerimiento implique el desarrollo, la adquisición o el uso de un SBIA o de una herramienta de IA, se recaba la opinión de la Comisión antes de su atención, con los formatos </w:t>
+      </w:r>
+      <w:r>
+        <w:rPr>
+          <w:rFonts w:ascii="Arial" w:hAnsi="Arial" w:cs="Arial"/>
+          <w:highlight w:val="lightGray"/>
+        </w:rPr>
+        <w:lastRenderedPageBreak/>
+        <w:t>vigentes de la demanda complementados con la información que la INSI determine.</w:t>
       </w:r>
     </w:p>
     <w:p>
@@ -13785,9 +13807,15 @@
           <w:rFonts w:ascii="Arial" w:hAnsi="Arial" w:cs="Arial"/>
           <w:highlight w:val="green"/>
         </w:rPr>
-        <w:t xml:space="preserve">6.15.4</w:t>
+        <w:t>6.15.4</w:t>
+      </w:r>
+      <w:r>
+        <w:rPr>
+          <w:rFonts w:ascii="Arial" w:hAnsi="Arial" w:cs="Arial"/>
+          <w:highlight w:val="green"/>
+        </w:rPr>
         <w:tab/>
-        <w:t xml:space="preserve">En los programas y proyectos institucionales conforme al MGPP, la opinión de la Comisión de Gobierno de IA se recaba desde que se identifica un componente basado en IA, en cualquier fase, y antes de la decisión que autoriza avanzar a la fase siguiente. La opinión se incorpora al expediente del caso de negocio o del plan de gestión, según corresponda, junto con las validaciones y opiniones que el MGPP ya prevé, y no requiere una etapa ni una instancia adicionales. Aplica en particular:</w:t>
+        <w:t>En los programas y proyectos institucionales conforme al MGPP, la opinión de la Comisión de Gobierno de IA se recaba desde que se identifica un componente basado en IA, en cualquier fase, y antes de la decisión que autoriza avanzar a la fase siguiente. La opinión se incorpora al expediente del caso de negocio o del plan de gestión, según corresponda, junto con las validaciones y opiniones que el MGPP ya prevé, y no requiere una etapa ni una instancia adicionales. Aplica en particular:</w:t>
       </w:r>
     </w:p>
     <w:p>
@@ -13868,7 +13896,6 @@
           <w:bCs w:val="0"/>
           <w:highlight w:val="green"/>
         </w:rPr>
-        <w:lastRenderedPageBreak/>
         <w:t>en el modelamiento del proceso de negocio, antes de su remisión a la INSI para desarrollo, cuando este revele un componente de IA no declarado en el alcance inicial;</w:t>
       </w:r>
     </w:p>
@@ -13944,9 +13971,15 @@
           <w:rFonts w:ascii="Arial" w:hAnsi="Arial" w:cs="Arial"/>
           <w:highlight w:val="lightGray"/>
         </w:rPr>
-        <w:t xml:space="preserve">6.15.5</w:t>
+        <w:t>6.15.5</w:t>
+      </w:r>
+      <w:r>
+        <w:rPr>
+          <w:rFonts w:ascii="Arial" w:hAnsi="Arial" w:cs="Arial"/>
+          <w:highlight w:val="lightGray"/>
+        </w:rPr>
         <w:tab/>
-        <w:t xml:space="preserve">Cuando un proyecto de inversión pública sujeto al Sistema Nacional de Programación Multianual y Gestión de Inversiones incorpore un componente basado en IA, la Unidad Formuladora considera la opinión de la Comisión como insumo del análisis técnico que sustenta la declaración de viabilidad, sin perjuicio de las disposiciones del referido Sistema. En la ejecución, el SBIA observa el ciclo de vida del numeral 6.1.</w:t>
+        <w:t>Cuando un proyecto de inversión pública sujeto al Sistema Nacional de Programación Multianual y Gestión de Inversiones incorpore un componente basado en IA, la Unidad Formuladora considera la opinión de la Comisión como insumo del análisis técnico que sustenta la declaración de viabilidad, sin perjuicio de las disposiciones del referido Sistema. En la ejecución, el SBIA observa el ciclo de vida del numeral 6.1.</w:t>
       </w:r>
     </w:p>
     <w:p>
@@ -13963,9 +13996,15 @@
           <w:rFonts w:ascii="Arial" w:hAnsi="Arial" w:cs="Arial"/>
           <w:highlight w:val="green"/>
         </w:rPr>
-        <w:t xml:space="preserve">6.15.6</w:t>
+        <w:t>6.15.6</w:t>
+      </w:r>
+      <w:r>
+        <w:rPr>
+          <w:rFonts w:ascii="Arial" w:hAnsi="Arial" w:cs="Arial"/>
+          <w:highlight w:val="green"/>
+        </w:rPr>
         <w:tab/>
-        <w:t xml:space="preserve">Las unidades de organización competentes de cada instrumento de gestión incorporan en sus documentos normativos la verificación del componente de IA y la opinión de la Comisión de Gobierno de IA, conforme al numeral 7.6. Esta incorporación alcanza al Modelo de Gobernabilidad de Programas y Proyectos y a la gestión de la demanda informática. La presente directiva no sustituye dichos instrumentos.</w:t>
+        <w:t>Las unidades de organización competentes de cada instrumento de gestión incorporan en sus documentos normativos la verificación del componente de IA y la opinión de la Comisión de Gobierno de IA, conforme al numeral 7.6. Esta incorporación alcanza al Modelo de Gobernabilidad de Programas y Proyectos y a la gestión de la demanda informática. La presente directiva no sustituye dichos instrumentos.</w:t>
       </w:r>
     </w:p>
     <w:p>
@@ -13984,9 +14023,15 @@
           <w:rFonts w:ascii="Arial" w:hAnsi="Arial" w:cs="Arial"/>
           <w:highlight w:val="lightGray"/>
         </w:rPr>
-        <w:t xml:space="preserve">6.15.7</w:t>
+        <w:t>6.15.7</w:t>
+      </w:r>
+      <w:r>
+        <w:rPr>
+          <w:rFonts w:ascii="Arial" w:hAnsi="Arial" w:cs="Arial"/>
+          <w:highlight w:val="lightGray"/>
+        </w:rPr>
         <w:tab/>
-        <w:t xml:space="preserve">La presente directiva se articula con la normativa institucional de gobernanza de datos y analítica. Cuando un producto analítico incorpore un sistema basado en IA, este se sujeta al ciclo de vida, la clasificación de riesgo, la evaluación de impacto algorítmico, el registro en el Inventario Institucional de SBIA y las obligaciones de transparencia y supervisión humana previstas en la presente directiva. La certificación del producto analítico requiere, como insumo previo, la aprobación que corresponda conforme al numeral 6.1.2. La calidad, el linaje, los metadatos y la certificación de los datos que alimentan el sistema se rigen por la normativa institucional de gobernanza de datos y analítica. En tanto dicha normativa no se apruebe, esas materias se rigen por el numeral 6.8 de la presente directiva.</w:t>
+        <w:t>La presente directiva se articula con la normativa institucional de gobernanza de datos y analítica. Cuando un producto analítico incorpore un sistema basado en IA, este se sujeta al ciclo de vida, la clasificación de riesgo, la evaluación de impacto algorítmico, el registro en el Inventario Institucional de SBIA y las obligaciones de transparencia y supervisión humana previstas en la presente directiva. La certificación del producto analítico requiere, como insumo previo, la aprobación que corresponda conforme al numeral 6.1.2. La calidad, el linaje, los metadatos y la certificación de los datos que alimentan el sistema se rigen por la normativa institucional de gobernanza de datos y analítica. En tanto dicha normativa no se apruebe, esas materias se rigen por el numeral 6.8 de la presente directiva.</w:t>
       </w:r>
       <w:r>
         <w:rPr>
@@ -14011,17 +14056,18 @@
       <w:r>
         <w:rPr>
           <w:rFonts w:ascii="Arial" w:hAnsi="Arial" w:cs="Arial"/>
+          <w:highlight w:val="green"/>
         </w:rPr>
         <w:lastRenderedPageBreak/>
+        <w:t>6.15.8</w:t>
       </w:r>
       <w:r>
         <w:rPr>
           <w:rFonts w:ascii="Arial" w:hAnsi="Arial" w:cs="Arial"/>
           <w:highlight w:val="green"/>
         </w:rPr>
-        <w:t xml:space="preserve">6.15.8</w:t>
         <w:tab/>
-        <w:t xml:space="preserve">La INSI, en el ejercicio de las competencias que el MGPP le reconoce en los momentos señalados, advierte la presencia de un componente de IA y la comunica a la Comisión de Gobierno de IA. La opinión de la Comisión es distinta de la validación que la INSI emite en el ámbito de sus competencias: ambas se incorporan al expediente y ninguna sustituye a la otra.</w:t>
+        <w:t>La INSI, en el ejercicio de las competencias que el MGPP le reconoce en los momentos señalados, advierte la presencia de un componente de IA y la comunica a la Comisión de Gobierno de IA. La opinión de la Comisión es distinta de la validación que la INSI emite en el ámbito de sus competencias: ambas se incorporan al expediente y ninguna sustituye a la otra.</w:t>
       </w:r>
     </w:p>
     <w:p>
@@ -14042,9 +14088,15 @@
           <w:rFonts w:ascii="Arial" w:hAnsi="Arial" w:cs="Arial"/>
           <w:highlight w:val="green"/>
         </w:rPr>
-        <w:t xml:space="preserve">6.15.9</w:t>
+        <w:t>6.15.9</w:t>
+      </w:r>
+      <w:r>
+        <w:rPr>
+          <w:rFonts w:ascii="Arial" w:hAnsi="Arial" w:cs="Arial"/>
+          <w:highlight w:val="green"/>
+        </w:rPr>
         <w:tab/>
-        <w:t xml:space="preserve">Cuando se requiera sustentar la opinión de la Comisión ante el Comité de Proyecto, concurre a la sesión el Coordinador de la Comisión de Gobierno de IA o el miembro que esta designe. Su concurrencia no altera la composición ni las competencias del Comité de Proyecto.</w:t>
+        <w:t>Cuando se requiera sustentar la opinión de la Comisión ante el Comité de Proyecto, concurre a la sesión el Coordinador de la Comisión de Gobierno de IA o el miembro que esta designe. Su concurrencia no altera la composición ni las competencias del Comité de Proyecto.</w:t>
       </w:r>
     </w:p>
     <w:p>
@@ -14065,9 +14117,15 @@
           <w:rFonts w:ascii="Arial" w:hAnsi="Arial" w:cs="Arial"/>
           <w:highlight w:val="green"/>
         </w:rPr>
-        <w:t xml:space="preserve">6.15.10</w:t>
+        <w:t>6.15.10</w:t>
+      </w:r>
+      <w:r>
+        <w:rPr>
+          <w:rFonts w:ascii="Arial" w:hAnsi="Arial" w:cs="Arial"/>
+          <w:highlight w:val="green"/>
+        </w:rPr>
         <w:tab/>
-        <w:t xml:space="preserve">La unidad de organización competente del MGPP incorpora en dicho instrumento el momento y la instancia ante la que se recaba la opinión, conforme al numeral 7.6.</w:t>
+        <w:t>La unidad de organización competente del MGPP incorpora en dicho instrumento el momento y la instancia ante la que se recaba la opinión, conforme al numeral 7.6.</w:t>
       </w:r>
     </w:p>
     <w:p>
@@ -14552,9 +14610,16 @@
           <w:bCs w:val="0"/>
           <w:highlight w:val="green"/>
         </w:rPr>
-        <w:t xml:space="preserve">7.12</w:t>
+        <w:t>7.12</w:t>
+      </w:r>
+      <w:r>
+        <w:rPr>
+          <w:b w:val="0"/>
+          <w:bCs w:val="0"/>
+          <w:highlight w:val="green"/>
+        </w:rPr>
         <w:tab/>
-        <w:t xml:space="preserve">Las iniciativas, proyectos y acciones que incorporen un componente basado en IA y no se encuentren comprendidos en el PAIA acreditan su alineamiento con un objetivo del PGD o del Plan Estratégico Institucional mediante la evidencia documentada que corresponda. La Comisión de Gobierno de IA verifica dicho alineamiento y lo reporta en el informe trimestral del numeral 6.9.5.</w:t>
+        <w:t>Las iniciativas, proyectos y acciones que incorporen un componente basado en IA y no se encuentren comprendidos en el PAIA acreditan su alineamiento con un objetivo del PGD o del Plan Estratégico Institucional mediante la evidencia documentada que corresponda. La Comisión de Gobierno de IA verifica dicho alineamiento y lo reporta en el informe trimestral del numeral 6.9.5.</w:t>
       </w:r>
     </w:p>
     <w:p>
@@ -14586,14 +14651,7 @@
           <w:b w:val="0"/>
           <w:bCs w:val="0"/>
         </w:rPr>
-        <w:t xml:space="preserve">El OIA reporta trimestralmente al CGTD el seguimiento de la implementación del PAIA, conforme al numeral 8.3 del artículo 8 de la Resolución Ministerial N.° 152-2026-PCM. Dicho reporte se integra al informe trimestral de gobierno de IA previsto en el numeral 6.9.5. Asimismo, el OIA registra los avances de la implementación del PAIA en la Plataforma de Cumplimiento Digital, en el último trimestre de cada año, conforme al numeral 8.4 del mismo </w:t>
-      </w:r>
-      <w:r>
-        <w:rPr>
-          <w:b w:val="0"/>
-          <w:bCs w:val="0"/>
-        </w:rPr>
-        <w:t>artículo.</w:t>
+        <w:t>El OIA reporta trimestralmente al CGTD el seguimiento de la implementación del PAIA, conforme al numeral 8.3 del artículo 8 de la Resolución Ministerial N.° 152-2026-PCM. Dicho reporte se integra al informe trimestral de gobierno de IA previsto en el numeral 6.9.5. Asimismo, el OIA registra los avances de la implementación del PAIA en la Plataforma de Cumplimiento Digital, en el último trimestre de cada año, conforme al numeral 8.4 del mismo artículo.</w:t>
       </w:r>
     </w:p>
     <w:p>
@@ -15765,23 +15823,7 @@
                 <w:rFonts w:ascii="Arial" w:eastAsia="Arial" w:hAnsi="Arial" w:cs="Arial"/>
                 <w:lang w:val="en-US"/>
               </w:rPr>
-              <w:t xml:space="preserve">Human-in-the-loop, on-the-loop </w:t>
-            </w:r>
-            <w:proofErr w:type="gramStart"/>
-            <w:r>
-              <w:rPr>
-                <w:rFonts w:ascii="Arial" w:eastAsia="Arial" w:hAnsi="Arial" w:cs="Arial"/>
-                <w:lang w:val="en-US"/>
-              </w:rPr>
-              <w:t>o in</w:t>
-            </w:r>
-            <w:proofErr w:type="gramEnd"/>
-            <w:r>
-              <w:rPr>
-                <w:rFonts w:ascii="Arial" w:eastAsia="Arial" w:hAnsi="Arial" w:cs="Arial"/>
-                <w:lang w:val="en-US"/>
-              </w:rPr>
-              <w:t>-command.</w:t>
+              <w:t>Human-in-the-loop, on-the-loop o in-command.</w:t>
             </w:r>
           </w:p>
         </w:tc>
@@ -24821,6 +24863,7 @@
   <w:style w:type="character" w:default="1" w:styleId="Fuentedeprrafopredeter">
     <w:name w:val="Default Paragraph Font"/>
     <w:uiPriority w:val="1"/>
+    <w:semiHidden/>
     <w:unhideWhenUsed/>
   </w:style>
   <w:style w:type="table" w:default="1" w:styleId="Tablanormal">
@@ -26048,7 +26091,12 @@
 </file>
 
 <file path=customXml/item1.xml><?xml version="1.0" encoding="utf-8"?>
-<b:Sources xmlns:b="http://schemas.openxmlformats.org/officeDocument/2006/bibliography" xmlns="http://schemas.openxmlformats.org/officeDocument/2006/bibliography" SelectedStyle="\APASixthEditionOfficeOnline.xsl" StyleName="APA" Version="6"/>
+<?mso-contentType ?>
+<FormTemplates xmlns="http://schemas.microsoft.com/sharepoint/v3/contenttype/forms">
+  <Display>DocumentLibraryForm</Display>
+  <Edit>DocumentLibraryForm</Edit>
+  <New>DocumentLibraryForm</New>
+</FormTemplates>
 </file>
 
 <file path=customXml/item2.xml><?xml version="1.0" encoding="utf-8"?>
@@ -26058,12 +26106,7 @@
 </file>
 
 <file path=customXml/item3.xml><?xml version="1.0" encoding="utf-8"?>
-<?mso-contentType ?>
-<FormTemplates xmlns="http://schemas.microsoft.com/sharepoint/v3/contenttype/forms">
-  <Display>DocumentLibraryForm</Display>
-  <Edit>DocumentLibraryForm</Edit>
-  <New>DocumentLibraryForm</New>
-</FormTemplates>
+<b:Sources xmlns:b="http://schemas.openxmlformats.org/officeDocument/2006/bibliography" xmlns="http://schemas.openxmlformats.org/officeDocument/2006/bibliography" SelectedStyle="\APASixthEditionOfficeOnline.xsl" StyleName="APA" Version="6"/>
 </file>
 
 <file path=customXml/item4.xml><?xml version="1.0" encoding="utf-8"?>
@@ -26205,9 +26248,9 @@
 </file>
 
 <file path=customXml/itemProps1.xml><?xml version="1.0" encoding="utf-8"?>
-<ds:datastoreItem xmlns:ds="http://schemas.openxmlformats.org/officeDocument/2006/customXml" ds:itemID="{599D4DEC-5966-453E-8EBA-1FE602AD820F}">
+<ds:datastoreItem xmlns:ds="http://schemas.openxmlformats.org/officeDocument/2006/customXml" ds:itemID="{007781DB-EED9-4359-8AD9-68137B52B701}">
   <ds:schemaRefs>
-    <ds:schemaRef ds:uri="http://schemas.openxmlformats.org/officeDocument/2006/bibliography"/>
+    <ds:schemaRef ds:uri="http://schemas.microsoft.com/sharepoint/v3/contenttype/forms"/>
   </ds:schemaRefs>
 </ds:datastoreItem>
 </file>
@@ -26222,9 +26265,9 @@
 </file>
 
 <file path=customXml/itemProps3.xml><?xml version="1.0" encoding="utf-8"?>
-<ds:datastoreItem xmlns:ds="http://schemas.openxmlformats.org/officeDocument/2006/customXml" ds:itemID="{007781DB-EED9-4359-8AD9-68137B52B701}">
+<ds:datastoreItem xmlns:ds="http://schemas.openxmlformats.org/officeDocument/2006/customXml" ds:itemID="{599D4DEC-5966-453E-8EBA-1FE602AD820F}">
   <ds:schemaRefs>
-    <ds:schemaRef ds:uri="http://schemas.microsoft.com/sharepoint/v3/contenttype/forms"/>
+    <ds:schemaRef ds:uri="http://schemas.openxmlformats.org/officeDocument/2006/bibliography"/>
   </ds:schemaRefs>
 </ds:datastoreItem>
 </file>

</xml_diff>

<commit_message>
docs: revisión de calidad (tanda 30) — ajuste de maquetación en la matriz de responsabilidades
- La matriz de responsabilidades repite su fila de encabezado (Rol / Unidad Organica / Responsabilidades) al dividirse entre paginas; ajustes menores de espaciado. Sin cambios de contenido en el articulado
- Regenera el espejo de texto desde el .docx; 0 comentarios pendientes
</commit_message>
<xml_diff>
--- a/normativo/DIRECTIVA-GOBIERNO-IA.docx
+++ b/normativo/DIRECTIVA-GOBIERNO-IA.docx
@@ -4596,11 +4596,45 @@
     </w:p>
     <w:p>
       <w:pPr>
+        <w:spacing w:after="60" w:line="276" w:lineRule="auto"/>
+        <w:ind w:left="1276" w:hanging="720"/>
+        <w:jc w:val="both"/>
+        <w:rPr>
+          <w:rFonts w:ascii="Arial" w:eastAsia="Arial" w:hAnsi="Arial" w:cs="Arial"/>
+          <w:color w:val="000000"/>
+        </w:rPr>
+      </w:pPr>
+    </w:p>
+    <w:p>
+      <w:pPr>
+        <w:spacing w:after="60" w:line="276" w:lineRule="auto"/>
+        <w:ind w:left="1276" w:hanging="720"/>
+        <w:jc w:val="both"/>
+        <w:rPr>
+          <w:rFonts w:ascii="Arial" w:eastAsia="Arial" w:hAnsi="Arial" w:cs="Arial"/>
+          <w:color w:val="000000"/>
+        </w:rPr>
+      </w:pPr>
+    </w:p>
+    <w:p>
+      <w:pPr>
+        <w:spacing w:after="60" w:line="276" w:lineRule="auto"/>
+        <w:ind w:left="1276" w:hanging="720"/>
+        <w:jc w:val="both"/>
+        <w:rPr>
+          <w:rFonts w:ascii="Arial" w:eastAsia="Arial" w:hAnsi="Arial" w:cs="Arial"/>
+          <w:color w:val="000000"/>
+        </w:rPr>
+      </w:pPr>
+    </w:p>
+    <w:p>
+      <w:pPr>
         <w:pStyle w:val="SubtituloDONI"/>
         <w:spacing w:line="276" w:lineRule="auto"/>
         <w:ind w:left="851"/>
       </w:pPr>
       <w:r>
+        <w:lastRenderedPageBreak/>
         <w:t>5.4</w:t>
       </w:r>
       <w:r>
@@ -4624,7 +4658,6 @@
           <w:color w:val="000000"/>
           <w:highlight w:val="yellow"/>
         </w:rPr>
-        <w:lastRenderedPageBreak/>
         <w:t>Los roles y responsabilidades del Gobierno de IA se asignan tomando como referencia las competencias y funciones establecidas en el ROF vigente, sin duplicarlas ni sustituirlas, y se detallan en el</w:t>
       </w:r>
       <w:r>
@@ -5203,7 +5236,7 @@
                 <w:bCs w:val="0"/>
                 <w:highlight w:val="green"/>
               </w:rPr>
-              <w:t xml:space="preserve">Verifica la causal y resuelve sobre el componente de IA cuando la Comisión de Gobierno de IA emite pronunciamiento no favorable, en </w:t>
+              <w:t xml:space="preserve">Verifica la causal y resuelve sobre el componente de IA cuando la Comisión de Gobierno de IA emite </w:t>
             </w:r>
             <w:r>
               <w:rPr>
@@ -5212,7 +5245,7 @@
                 <w:highlight w:val="green"/>
               </w:rPr>
               <w:lastRenderedPageBreak/>
-              <w:t>los casos y con el alcance previstos en el numeral 6.1.4.</w:t>
+              <w:t>pronunciamiento no favorable, en los casos y con el alcance previstos en el numeral 6.1.4.</w:t>
             </w:r>
           </w:p>
           <w:p>
@@ -5490,16 +5523,8 @@
                 <w:bCs w:val="0"/>
                 <w:highlight w:val="green"/>
               </w:rPr>
-              <w:t xml:space="preserve">Supervisar el cumplimiento de los hitos de aprobación del ciclo de vida </w:t>
-            </w:r>
-            <w:r>
-              <w:rPr>
-                <w:b w:val="0"/>
-                <w:bCs w:val="0"/>
-                <w:highlight w:val="green"/>
-              </w:rPr>
               <w:lastRenderedPageBreak/>
-              <w:t>de los SBIA y consolidar los informes de monitoreo, verificación técnica de seguridad e incidentes para conocimiento del CGTD.</w:t>
+              <w:t>Supervisar el cumplimiento de los hitos de aprobación del ciclo de vida de los SBIA y consolidar los informes de monitoreo, verificación técnica de seguridad e incidentes para conocimiento del CGTD.</w:t>
             </w:r>
           </w:p>
           <w:p>
@@ -5629,7 +5654,7 @@
     <w:p>
       <w:pPr>
         <w:pStyle w:val="SubtituloDONI"/>
-        <w:spacing w:line="276" w:lineRule="auto"/>
+        <w:spacing w:before="0" w:after="0" w:line="276" w:lineRule="auto"/>
         <w:ind w:left="851"/>
       </w:pPr>
     </w:p>
@@ -5942,7 +5967,7 @@
                 <w:b w:val="0"/>
                 <w:bCs w:val="0"/>
               </w:rPr>
-              <w:t xml:space="preserve">Supervisa y evalúa que los modelos y algoritmos de los SBIA de riesgo alto cumplan los estándares de </w:t>
+              <w:t xml:space="preserve">Supervisa y evalúa que los modelos y algoritmos de los SBIA de riesgo </w:t>
             </w:r>
             <w:r>
               <w:rPr>
@@ -5950,7 +5975,7 @@
                 <w:bCs w:val="0"/>
               </w:rPr>
               <w:lastRenderedPageBreak/>
-              <w:t>calidad y ética aplicables, conforme al numeral 6.5 del artículo 6 de la Resolución Ministerial N.° 152-2026-PCM. La ejerce en coordinación con las unidades de organización y con los propietarios de los casos de uso, y se apoya en las verificaciones previstas en los numerales 6.10.3 y 6.14.</w:t>
+              <w:t>alto cumplan los estándares de calidad y ética aplicables, conforme al numeral 6.5 del artículo 6 de la Resolución Ministerial N.° 152-2026-PCM. La ejerce en coordinación con las unidades de organización y con los propietarios de los casos de uso, y se apoya en las verificaciones previstas en los numerales 6.10.3 y 6.14.</w:t>
             </w:r>
           </w:p>
         </w:tc>
@@ -6352,7 +6377,7 @@
                 <w:color w:val="000000"/>
                 <w:highlight w:val="green"/>
               </w:rPr>
-              <w:t xml:space="preserve">En materia de seguridad digital: asegura y supervisa la adopción de los estándares y normas técnicas de seguridad de la información cuando la INSI desarrolla, adquiere o terceriza SBIA. Propone las medidas de gestión de riesgos de seguridad de la información aplicables a los SBIA. Comunica al Centro Nacional de Seguridad </w:t>
+              <w:t xml:space="preserve">En materia de seguridad digital: asegura y supervisa la adopción de los estándares y normas técnicas de seguridad de la información cuando la INSI desarrolla, adquiere o terceriza SBIA. Propone las medidas de gestión de riesgos de seguridad de la información aplicables a los SBIA. Comunica al </w:t>
             </w:r>
             <w:r>
               <w:rPr>
@@ -6362,7 +6387,7 @@
                 <w:highlight w:val="green"/>
               </w:rPr>
               <w:lastRenderedPageBreak/>
-              <w:t>Digital (CNSD) los incidentes de seguridad digital que involucren un SBIA y los informa a la máxima autoridad administrativa de la entidad, conforme a la Directiva N.° 001-2023-PCM/SGTD. Informa al CGTD los que resulten críticos. Cuando un SBIA constituya un activo de información de un proceso comprendido en el alcance del SGSI, coordina la aplicación de los controles que correspondan.</w:t>
+              <w:t>Centro Nacional de Seguridad Digital (CNSD) los incidentes de seguridad digital que involucren un SBIA y los informa a la máxima autoridad administrativa de la entidad, conforme a la Directiva N.° 001-2023-PCM/SGTD. Informa al CGTD los que resulten críticos. Cuando un SBIA constituya un activo de información de un proceso comprendido en el alcance del SGSI, coordina la aplicación de los controles que correspondan.</w:t>
             </w:r>
           </w:p>
         </w:tc>
@@ -6664,7 +6689,7 @@
                 <w:bCs w:val="0"/>
                 <w:highlight w:val="green"/>
               </w:rPr>
-              <w:t xml:space="preserve">Revisa la EIA en materia de cumplimiento normativo. Cuando la revisión comprenda el sentido y el alcance de las normas tributarias o aduaneras, se pronuncia la </w:t>
+              <w:t xml:space="preserve">Revisa la EIA en materia de cumplimiento normativo. Cuando la revisión comprenda el sentido y el alcance de las normas tributarias o </w:t>
             </w:r>
             <w:r>
               <w:rPr>
@@ -6673,7 +6698,7 @@
                 <w:highlight w:val="green"/>
               </w:rPr>
               <w:lastRenderedPageBreak/>
-              <w:t>Intendencia Nacional Jurídico Tributaria o la Intendencia Nacional Jurídico Aduanera, según la materia, a convocatoria de la Comisión de Gobierno de IA.</w:t>
+              <w:t>aduaneras, se pronuncia la Intendencia Nacional Jurídico Tributaria o la Intendencia Nacional Jurídico Aduanera, según la materia, a convocatoria de la Comisión de Gobierno de IA.</w:t>
             </w:r>
           </w:p>
           <w:p>
@@ -7419,7 +7444,52 @@
           </w:p>
         </w:tc>
       </w:tr>
+    </w:tbl>
+    <w:p>
+      <w:pPr>
+        <w:pStyle w:val="Ttulo1"/>
+        <w:numPr>
+          <w:ilvl w:val="0"/>
+          <w:numId w:val="0"/>
+        </w:numPr>
+        <w:spacing w:before="0" w:after="0" w:line="276" w:lineRule="auto"/>
+        <w:ind w:left="709"/>
+        <w:rPr>
+          <w:rFonts w:cs="Arial"/>
+          <w:szCs w:val="22"/>
+        </w:rPr>
+      </w:pPr>
+      <w:bookmarkStart w:id="6" w:name="_Toc235003966"/>
+    </w:p>
+    <w:tbl>
+      <w:tblPr>
+        <w:tblpPr w:leftFromText="141" w:rightFromText="141" w:vertAnchor="text" w:tblpX="846" w:tblpY="1"/>
+        <w:tblOverlap w:val="never"/>
+        <w:tblW w:w="8080" w:type="dxa"/>
+        <w:tblBorders>
+          <w:top w:val="single" w:sz="4" w:space="0" w:color="auto"/>
+          <w:left w:val="single" w:sz="4" w:space="0" w:color="auto"/>
+          <w:bottom w:val="single" w:sz="4" w:space="0" w:color="auto"/>
+          <w:right w:val="single" w:sz="4" w:space="0" w:color="auto"/>
+          <w:insideH w:val="single" w:sz="4" w:space="0" w:color="auto"/>
+          <w:insideV w:val="single" w:sz="4" w:space="0" w:color="auto"/>
+        </w:tblBorders>
+        <w:tblCellMar>
+          <w:left w:w="10" w:type="dxa"/>
+          <w:right w:w="10" w:type="dxa"/>
+        </w:tblCellMar>
+        <w:tblLook w:val="04A0" w:firstRow="1" w:lastRow="0" w:firstColumn="1" w:lastColumn="0" w:noHBand="0" w:noVBand="1"/>
+      </w:tblPr>
+      <w:tblGrid>
+        <w:gridCol w:w="1843"/>
+        <w:gridCol w:w="2205"/>
+        <w:gridCol w:w="4032"/>
+      </w:tblGrid>
       <w:tr>
+        <w:trPr>
+          <w:trHeight w:val="639"/>
+          <w:tblHeader/>
+        </w:trPr>
         <w:tc>
           <w:tcPr>
             <w:tcW w:w="8080" w:type="dxa"/>
@@ -7454,6 +7524,126 @@
                 <w:bCs/>
               </w:rPr>
               <w:t>Otras unidades de organización con responsabilidad en el gobierno de IA</w:t>
+            </w:r>
+          </w:p>
+        </w:tc>
+      </w:tr>
+      <w:tr>
+        <w:trPr>
+          <w:trHeight w:val="580"/>
+          <w:tblHeader/>
+        </w:trPr>
+        <w:tc>
+          <w:tcPr>
+            <w:tcW w:w="1843" w:type="dxa"/>
+            <w:tcBorders>
+              <w:top w:val="single" w:sz="4" w:space="0" w:color="000000"/>
+              <w:left w:val="single" w:sz="4" w:space="0" w:color="000000"/>
+              <w:bottom w:val="single" w:sz="4" w:space="0" w:color="000000"/>
+              <w:right w:val="single" w:sz="4" w:space="0" w:color="000000"/>
+            </w:tcBorders>
+            <w:shd w:val="clear" w:color="auto" w:fill="DEEAF6" w:themeFill="accent5" w:themeFillTint="33"/>
+            <w:tcMar>
+              <w:top w:w="60" w:type="dxa"/>
+              <w:left w:w="80" w:type="dxa"/>
+              <w:bottom w:w="60" w:type="dxa"/>
+              <w:right w:w="80" w:type="dxa"/>
+            </w:tcMar>
+            <w:vAlign w:val="center"/>
+          </w:tcPr>
+          <w:p>
+            <w:pPr>
+              <w:spacing w:before="20" w:after="20" w:line="276" w:lineRule="auto"/>
+              <w:jc w:val="both"/>
+              <w:rPr>
+                <w:rFonts w:ascii="Arial" w:eastAsia="Arial" w:hAnsi="Arial" w:cs="Arial"/>
+                <w:b/>
+                <w:bCs/>
+              </w:rPr>
+            </w:pPr>
+            <w:r>
+              <w:rPr>
+                <w:rFonts w:ascii="Arial" w:eastAsia="Arial" w:hAnsi="Arial" w:cs="Arial"/>
+                <w:b/>
+                <w:bCs/>
+              </w:rPr>
+              <w:t>Rol</w:t>
+            </w:r>
+          </w:p>
+        </w:tc>
+        <w:tc>
+          <w:tcPr>
+            <w:tcW w:w="2205" w:type="dxa"/>
+            <w:tcBorders>
+              <w:top w:val="single" w:sz="4" w:space="0" w:color="000000"/>
+              <w:left w:val="single" w:sz="4" w:space="0" w:color="000000"/>
+              <w:bottom w:val="single" w:sz="4" w:space="0" w:color="000000"/>
+              <w:right w:val="single" w:sz="4" w:space="0" w:color="000000"/>
+            </w:tcBorders>
+            <w:shd w:val="clear" w:color="auto" w:fill="DEEAF6" w:themeFill="accent5" w:themeFillTint="33"/>
+            <w:tcMar>
+              <w:top w:w="60" w:type="dxa"/>
+              <w:left w:w="80" w:type="dxa"/>
+              <w:bottom w:w="60" w:type="dxa"/>
+              <w:right w:w="80" w:type="dxa"/>
+            </w:tcMar>
+            <w:vAlign w:val="center"/>
+          </w:tcPr>
+          <w:p>
+            <w:pPr>
+              <w:spacing w:before="20" w:after="20" w:line="276" w:lineRule="auto"/>
+              <w:jc w:val="both"/>
+              <w:rPr>
+                <w:rFonts w:ascii="Arial" w:eastAsia="Arial" w:hAnsi="Arial" w:cs="Arial"/>
+                <w:b/>
+                <w:bCs/>
+              </w:rPr>
+            </w:pPr>
+            <w:r>
+              <w:rPr>
+                <w:rFonts w:ascii="Arial" w:eastAsia="Arial" w:hAnsi="Arial" w:cs="Arial"/>
+                <w:b/>
+                <w:bCs/>
+              </w:rPr>
+              <w:t>Unidad Orgánica</w:t>
+            </w:r>
+          </w:p>
+        </w:tc>
+        <w:tc>
+          <w:tcPr>
+            <w:tcW w:w="4032" w:type="dxa"/>
+            <w:tcBorders>
+              <w:top w:val="single" w:sz="4" w:space="0" w:color="000000"/>
+              <w:left w:val="single" w:sz="4" w:space="0" w:color="000000"/>
+              <w:bottom w:val="single" w:sz="4" w:space="0" w:color="000000"/>
+              <w:right w:val="single" w:sz="4" w:space="0" w:color="000000"/>
+            </w:tcBorders>
+            <w:shd w:val="clear" w:color="auto" w:fill="DEEAF6" w:themeFill="accent5" w:themeFillTint="33"/>
+            <w:tcMar>
+              <w:top w:w="60" w:type="dxa"/>
+              <w:left w:w="80" w:type="dxa"/>
+              <w:bottom w:w="60" w:type="dxa"/>
+              <w:right w:w="80" w:type="dxa"/>
+            </w:tcMar>
+            <w:vAlign w:val="center"/>
+          </w:tcPr>
+          <w:p>
+            <w:pPr>
+              <w:spacing w:before="20" w:after="20" w:line="276" w:lineRule="auto"/>
+              <w:jc w:val="both"/>
+              <w:rPr>
+                <w:rFonts w:ascii="Arial" w:eastAsia="Arial" w:hAnsi="Arial" w:cs="Arial"/>
+                <w:b/>
+                <w:bCs/>
+              </w:rPr>
+            </w:pPr>
+            <w:r>
+              <w:rPr>
+                <w:rFonts w:ascii="Arial" w:eastAsia="Arial" w:hAnsi="Arial" w:cs="Arial"/>
+                <w:b/>
+                <w:bCs/>
+              </w:rPr>
+              <w:t>Responsabilidades</w:t>
             </w:r>
           </w:p>
         </w:tc>
@@ -7589,16 +7779,8 @@
                 <w:bCs w:val="0"/>
                 <w:highlight w:val="yellow"/>
               </w:rPr>
-              <w:t xml:space="preserve">Conduce el proceso de elaboración de las acciones de sensibilización, concientización y capacitación en IA, diferenciadas por grupos de uso </w:t>
-            </w:r>
-            <w:r>
-              <w:rPr>
-                <w:b w:val="0"/>
-                <w:bCs w:val="0"/>
-                <w:highlight w:val="yellow"/>
-              </w:rPr>
               <w:lastRenderedPageBreak/>
-              <w:t>de SBIA, y eleva la propuesta para su aprobación, conforme al literal f) del artículo 197 del ROF.</w:t>
+              <w:t>Conduce el proceso de elaboración de las acciones de sensibilización, concientización y capacitación en IA, diferenciadas por grupos de uso de SBIA, y eleva la propuesta para su aprobación, conforme al literal f) del artículo 197 del ROF.</w:t>
             </w:r>
           </w:p>
           <w:p>
@@ -7981,7 +8163,7 @@
                 <w:b w:val="0"/>
                 <w:bCs w:val="0"/>
               </w:rPr>
-              <w:t xml:space="preserve">Emite opinión legal vinculante y absuelve las consultas que le formulan las unidades de organización en las materias de su competencia, conforme a los </w:t>
+              <w:t xml:space="preserve">Emite opinión legal vinculante y absuelve las consultas que le </w:t>
             </w:r>
             <w:r>
               <w:rPr>
@@ -7989,7 +8171,7 @@
                 <w:bCs w:val="0"/>
               </w:rPr>
               <w:lastRenderedPageBreak/>
-              <w:t>literales c) y d) del artículo 454 del ROF.</w:t>
+              <w:t>formulan las unidades de organización en las materias de su competencia, conforme a los literales c) y d) del artículo 454 del ROF.</w:t>
             </w:r>
           </w:p>
           <w:p>
@@ -8064,6 +8246,25 @@
         </w:tc>
       </w:tr>
     </w:tbl>
+    <w:p/>
+    <w:p/>
+    <w:p/>
+    <w:p/>
+    <w:p>
+      <w:pPr>
+        <w:pStyle w:val="Ttulo1"/>
+        <w:numPr>
+          <w:ilvl w:val="0"/>
+          <w:numId w:val="0"/>
+        </w:numPr>
+        <w:spacing w:after="0" w:line="276" w:lineRule="auto"/>
+        <w:ind w:left="709"/>
+        <w:rPr>
+          <w:rFonts w:cs="Arial"/>
+          <w:szCs w:val="22"/>
+        </w:rPr>
+      </w:pPr>
+    </w:p>
     <w:p>
       <w:pPr>
         <w:pStyle w:val="Ttulo1"/>
@@ -8073,7 +8274,6 @@
           <w:szCs w:val="22"/>
         </w:rPr>
       </w:pPr>
-      <w:bookmarkStart w:id="6" w:name="_Toc235003966"/>
       <w:r>
         <w:rPr>
           <w:rFonts w:cs="Arial"/>
@@ -8081,8 +8281,6 @@
           <w:color w:val="000000"/>
           <w:szCs w:val="22"/>
         </w:rPr>
-        <w:lastRenderedPageBreak/>
-        <w:br w:type="textWrapping" w:clear="all"/>
         <w:t>DISPOSICIONES ESPECÍFICAS</w:t>
       </w:r>
       <w:bookmarkEnd w:id="6"/>
@@ -8425,7 +8623,16 @@
                 <w:color w:val="000000"/>
                 <w:highlight w:val="cyan"/>
               </w:rPr>
-              <w:t>El propietario del caso de uso formula el caso de uso: identifica la necesidad institucional, define el problema a resolver y el resultado esperado, y lo presenta a la Comisión de Gobierno de IA mediante la Ficha de Evaluación de Caso de Uso (Anexo N.° 4).</w:t>
+              <w:t xml:space="preserve">El propietario del caso de uso formula el caso de uso: identifica la necesidad institucional, define el problema a resolver y el resultado esperado, y lo presenta a la Comisión de Gobierno de IA </w:t>
+            </w:r>
+            <w:r>
+              <w:rPr>
+                <w:rFonts w:ascii="Arial" w:hAnsi="Arial" w:cs="Arial"/>
+                <w:color w:val="000000"/>
+                <w:highlight w:val="cyan"/>
+              </w:rPr>
+              <w:lastRenderedPageBreak/>
+              <w:t>mediante la Ficha de Evaluación de Caso de Uso (Anexo N.° 4).</w:t>
             </w:r>
           </w:p>
         </w:tc>
@@ -8459,7 +8666,8 @@
                 <w:rFonts w:ascii="Arial" w:eastAsia="Arial" w:hAnsi="Arial" w:cs="Arial"/>
                 <w:highlight w:val="green"/>
               </w:rPr>
-              <w:t xml:space="preserve">La etapa concluye con la presentación a la Comisión de Gobierno de IA de la Ficha de Evaluación de Caso de Uso. La Ficha se presenta suscrita por el propietario del caso de uso y con el visto bueno del titular de su </w:t>
+              <w:lastRenderedPageBreak/>
+              <w:t xml:space="preserve">La etapa concluye con la presentación a la Comisión de Gobierno de IA de la Ficha de Evaluación de Caso de Uso. La Ficha se presenta suscrita por </w:t>
             </w:r>
             <w:r>
               <w:rPr>
@@ -8467,7 +8675,7 @@
                 <w:highlight w:val="green"/>
               </w:rPr>
               <w:lastRenderedPageBreak/>
-              <w:t>unidad de organización, conforme a la Sección 6 del Anexo N.° 4. La etapa no comporta hito de aprobación: la evaluación del componente de IA y la aprobación corresponden a la etapa 2.</w:t>
+              <w:t>el propietario del caso de uso y con el visto bueno del titular de su unidad de organización, conforme a la Sección 6 del Anexo N.° 4. La etapa no comporta hito de aprobación: la evaluación del componente de IA y la aprobación corresponden a la etapa 2.</w:t>
             </w:r>
           </w:p>
         </w:tc>
@@ -8738,7 +8946,15 @@
                 <w:rFonts w:ascii="Arial" w:eastAsia="Arial" w:hAnsi="Arial" w:cs="Arial"/>
                 <w:highlight w:val="green"/>
               </w:rPr>
-              <w:t>Aprobación del diseño de la arquitectura de solución por la División de Arquitectura competente según la materia, conforme al numeral 6.5.4. Para SBIA de riesgo alto, aprobación de la EIA por el CGTD, previa al inicio del desarrollo, adquisición o implementación.</w:t>
+              <w:t xml:space="preserve">Aprobación del diseño de la arquitectura de solución por la División de Arquitectura competente según la materia, conforme al numeral 6.5.4. Para SBIA de riesgo alto, aprobación de la EIA por el CGTD, previa al inicio del desarrollo, </w:t>
+            </w:r>
+            <w:r>
+              <w:rPr>
+                <w:rFonts w:ascii="Arial" w:eastAsia="Arial" w:hAnsi="Arial" w:cs="Arial"/>
+                <w:highlight w:val="green"/>
+              </w:rPr>
+              <w:lastRenderedPageBreak/>
+              <w:t>adquisición o implementación.</w:t>
             </w:r>
           </w:p>
         </w:tc>
@@ -9013,7 +9229,7 @@
                 <w:rFonts w:ascii="Arial" w:hAnsi="Arial" w:cs="Arial"/>
                 <w:highlight w:val="green"/>
               </w:rPr>
-              <w:t xml:space="preserve">La Gerencia de Calidad de Sistemas conduce el control y aseguramiento de la calidad y la División de Control de Calidad efectúa la verificación y validación de la calidad, conforme al numeral 6.10.3. La Oficina de Seguridad Informática efectúa el análisis de riesgo y las pruebas de vulnerabilidad sobre la arquitectura de aplicaciones, de información y de infraestructura tecnológica que soporta el SBIA, incluido el red teaming para riesgo alto, y </w:t>
+              <w:t xml:space="preserve">La Gerencia de Calidad de Sistemas conduce el control y aseguramiento de la calidad y la División de Control de Calidad efectúa la verificación y validación de la calidad, conforme al numeral 6.10.3. La Oficina de Seguridad Informática efectúa el análisis de riesgo y las pruebas de vulnerabilidad sobre la arquitectura de aplicaciones, de información y de infraestructura tecnológica que </w:t>
             </w:r>
             <w:r>
               <w:rPr>
@@ -9021,7 +9237,7 @@
                 <w:highlight w:val="green"/>
               </w:rPr>
               <w:lastRenderedPageBreak/>
-              <w:t>verifica la implementación de los requisitos de seguridad propuestos en la etapa anterior. El propietario del caso de uso verifica la implementación del mecanismo de supervisión humana conforme al numeral 6.6.2. La Comisión de Gobierno de IA verifica la implementación de los controles, del mecanismo de supervisión humana y de las medidas frente al sesgo, así como los resultados de las pruebas de sesgo, conforme a los numerales 6.2.5, 6.6.2 y 6.6.4. Asimismo, aprueba el plan de monitoreo del SBIA conforme al numeral 6.10.1. La aprobación requiere la conformidad de la División de Control de Calidad, de la Oficina de Seguridad Informática, del propietario del caso de uso y de la Comisión de Gobierno de IA. La titularidad de la aprobación se determina conforme al numeral 6.1.2.</w:t>
+              <w:t>soporta el SBIA, incluido el red teaming para riesgo alto, y verifica la implementación de los requisitos de seguridad propuestos en la etapa anterior. El propietario del caso de uso verifica la implementación del mecanismo de supervisión humana conforme al numeral 6.6.2. La Comisión de Gobierno de IA verifica la implementación de los controles, del mecanismo de supervisión humana y de las medidas frente al sesgo, así como los resultados de las pruebas de sesgo, conforme a los numerales 6.2.5, 6.6.2 y 6.6.4. Asimismo, aprueba el plan de monitoreo del SBIA conforme al numeral 6.10.1. La aprobación requiere la conformidad de la División de Control de Calidad, de la Oficina de Seguridad Informática, del propietario del caso de uso y de la Comisión de Gobierno de IA. La titularidad de la aprobación se determina conforme al numeral 6.1.2.</w:t>
             </w:r>
           </w:p>
         </w:tc>
@@ -10242,7 +10458,25 @@
           <w:highlight w:val="green"/>
         </w:rPr>
         <w:tab/>
-        <w:t>El diseño de la arquitectura de los SBIA observa los Principios de Arquitectura de TI (AAT.PRAQ.01) y los Lineamientos de Arquitectura de TI (LAT.LIAQ.01) de la SUNAT, en sus versiones vigentes, en lo que corresponda a su naturaleza. La GA adecua dichos instrumentos y emite los estándares, modelos de referencia, patrones y demás documentos técnicos de arquitectura necesarios para incorporar los requisitos propios de los SBIA (modelos, conjuntos de datos, componentes generativos y agénticos, e infraestructura especializada), en el ámbito de su competencia y conforme a los literales a) y c) del artículo 130 del ROF. Los que establezcan obligaciones exigibles a las unidades de organización se aprueban como documento normativo institucional conforme al numeral 7.6 de la presente directiva.</w:t>
+        <w:t xml:space="preserve">El diseño de la arquitectura de los SBIA observa los Principios de Arquitectura de TI (AAT.PRAQ.01) y los Lineamientos de Arquitectura de TI (LAT.LIAQ.01) de la SUNAT, en sus versiones vigentes, en lo que corresponda a su naturaleza. La GA adecua dichos instrumentos y emite los estándares, modelos de referencia, patrones y demás documentos técnicos de arquitectura necesarios para incorporar los requisitos propios de los SBIA (modelos, conjuntos de datos, componentes generativos y </w:t>
+      </w:r>
+      <w:proofErr w:type="spellStart"/>
+      <w:r>
+        <w:rPr>
+          <w:rFonts w:ascii="Arial" w:eastAsia="Arial" w:hAnsi="Arial" w:cs="Arial"/>
+          <w:color w:val="000000"/>
+          <w:highlight w:val="green"/>
+        </w:rPr>
+        <w:t>agénticos</w:t>
+      </w:r>
+      <w:proofErr w:type="spellEnd"/>
+      <w:r>
+        <w:rPr>
+          <w:rFonts w:ascii="Arial" w:eastAsia="Arial" w:hAnsi="Arial" w:cs="Arial"/>
+          <w:color w:val="000000"/>
+          <w:highlight w:val="green"/>
+        </w:rPr>
+        <w:t>, e infraestructura especializada), en el ámbito de su competencia y conforme a los literales a) y c) del artículo 130 del ROF. Los que establezcan obligaciones exigibles a las unidades de organización se aprueban como documento normativo institucional conforme al numeral 7.6 de la presente directiva.</w:t>
       </w:r>
     </w:p>
     <w:p>
@@ -10915,7 +11149,25 @@
           <w:highlight w:val="green"/>
         </w:rPr>
         <w:lastRenderedPageBreak/>
-        <w:t>(SGSI-MA-03) de la SUNAT, en sus versiones vigentes. El Manual de Políticas es de aplicación a todos los colaboradores, al personal de modalidades formativas y a los terceros vinculados que gestionen información de la institución. Cuando un SBIA constituya un activo de información de un proceso comprendido en el alcance del Sistema de Gestión de Seguridad de la Información, le son exigibles además los demás documentos normativos y lineamientos de dicho Sistema.</w:t>
+        <w:t xml:space="preserve">(SGSI-MA-03) de la SUNAT, en sus versiones vigentes. El Manual de Políticas </w:t>
+      </w:r>
+      <w:proofErr w:type="gramStart"/>
+      <w:r>
+        <w:rPr>
+          <w:rFonts w:ascii="Arial" w:eastAsia="Arial" w:hAnsi="Arial" w:cs="Arial"/>
+          <w:color w:val="000000"/>
+          <w:highlight w:val="green"/>
+        </w:rPr>
+        <w:t>es de aplicación</w:t>
+      </w:r>
+      <w:proofErr w:type="gramEnd"/>
+      <w:r>
+        <w:rPr>
+          <w:rFonts w:ascii="Arial" w:eastAsia="Arial" w:hAnsi="Arial" w:cs="Arial"/>
+          <w:color w:val="000000"/>
+          <w:highlight w:val="green"/>
+        </w:rPr>
+        <w:t xml:space="preserve"> a todos los colaboradores, al personal de modalidades formativas y a los terceros vinculados que gestionen información de la institución. Cuando un SBIA constituya un activo de información de un proceso comprendido en el alcance del Sistema de Gestión de Seguridad de la Información, le son exigibles además los demás documentos normativos y lineamientos de dicho Sistema.</w:t>
       </w:r>
     </w:p>
     <w:p>
@@ -12037,7 +12289,25 @@
           <w:color w:val="000000"/>
           <w:highlight w:val="green"/>
         </w:rPr>
-        <w:t>Cuando el plan de monitoreo prevea vigilancia automatizada, esta opera durante el horario de operación del SBIA, salvo que su criticidad justifique cobertura permanente, lo que se sustenta en el mismo plan.</w:t>
+        <w:t xml:space="preserve">Cuando el plan de monitoreo prevea vigilancia automatizada, esta </w:t>
+      </w:r>
+      <w:proofErr w:type="spellStart"/>
+      <w:r>
+        <w:rPr>
+          <w:rFonts w:ascii="Arial" w:eastAsia="Arial" w:hAnsi="Arial" w:cs="Arial"/>
+          <w:color w:val="000000"/>
+          <w:highlight w:val="green"/>
+        </w:rPr>
+        <w:t>opera</w:t>
+      </w:r>
+      <w:proofErr w:type="spellEnd"/>
+      <w:r>
+        <w:rPr>
+          <w:rFonts w:ascii="Arial" w:eastAsia="Arial" w:hAnsi="Arial" w:cs="Arial"/>
+          <w:color w:val="000000"/>
+          <w:highlight w:val="green"/>
+        </w:rPr>
+        <w:t xml:space="preserve"> durante el horario de operación del SBIA, salvo que su criticidad justifique cobertura permanente, lo que se sustenta en el mismo plan.</w:t>
       </w:r>
     </w:p>
     <w:p>
@@ -13557,7 +13827,25 @@
           <w:color w:val="000000"/>
           <w:highlight w:val="yellow"/>
         </w:rPr>
-        <w:t xml:space="preserve"> son de aplicación en la SUNAT desde su entrada en vigencia. La Comisión de Gobierno de IA evalúa </w:t>
+        <w:t xml:space="preserve"> </w:t>
+      </w:r>
+      <w:proofErr w:type="gramStart"/>
+      <w:r>
+        <w:rPr>
+          <w:rFonts w:ascii="Arial" w:eastAsia="Arial" w:hAnsi="Arial" w:cs="Arial"/>
+          <w:color w:val="000000"/>
+          <w:highlight w:val="yellow"/>
+        </w:rPr>
+        <w:t>son de aplicación</w:t>
+      </w:r>
+      <w:proofErr w:type="gramEnd"/>
+      <w:r>
+        <w:rPr>
+          <w:rFonts w:ascii="Arial" w:eastAsia="Arial" w:hAnsi="Arial" w:cs="Arial"/>
+          <w:color w:val="000000"/>
+          <w:highlight w:val="yellow"/>
+        </w:rPr>
+        <w:t xml:space="preserve"> en la SUNAT desde su entrada en vigencia. La Comisión de Gobierno de IA evalúa </w:t>
       </w:r>
       <w:r>
         <w:rPr>
@@ -15823,7 +16111,23 @@
                 <w:rFonts w:ascii="Arial" w:eastAsia="Arial" w:hAnsi="Arial" w:cs="Arial"/>
                 <w:lang w:val="en-US"/>
               </w:rPr>
-              <w:t>Human-in-the-loop, on-the-loop o in-command.</w:t>
+              <w:t xml:space="preserve">Human-in-the-loop, on-the-loop </w:t>
+            </w:r>
+            <w:proofErr w:type="gramStart"/>
+            <w:r>
+              <w:rPr>
+                <w:rFonts w:ascii="Arial" w:eastAsia="Arial" w:hAnsi="Arial" w:cs="Arial"/>
+                <w:lang w:val="en-US"/>
+              </w:rPr>
+              <w:t>o in</w:t>
+            </w:r>
+            <w:proofErr w:type="gramEnd"/>
+            <w:r>
+              <w:rPr>
+                <w:rFonts w:ascii="Arial" w:eastAsia="Arial" w:hAnsi="Arial" w:cs="Arial"/>
+                <w:lang w:val="en-US"/>
+              </w:rPr>
+              <w:t>-command.</w:t>
             </w:r>
           </w:p>
         </w:tc>
@@ -26091,25 +26395,6 @@
 </file>
 
 <file path=customXml/item1.xml><?xml version="1.0" encoding="utf-8"?>
-<?mso-contentType ?>
-<FormTemplates xmlns="http://schemas.microsoft.com/sharepoint/v3/contenttype/forms">
-  <Display>DocumentLibraryForm</Display>
-  <Edit>DocumentLibraryForm</Edit>
-  <New>DocumentLibraryForm</New>
-</FormTemplates>
-</file>
-
-<file path=customXml/item2.xml><?xml version="1.0" encoding="utf-8"?>
-<p:properties xmlns:p="http://schemas.microsoft.com/office/2006/metadata/properties" xmlns:xsi="http://www.w3.org/2001/XMLSchema-instance" xmlns:pc="http://schemas.microsoft.com/office/infopath/2007/PartnerControls">
-  <documentManagement/>
-</p:properties>
-</file>
-
-<file path=customXml/item3.xml><?xml version="1.0" encoding="utf-8"?>
-<b:Sources xmlns:b="http://schemas.openxmlformats.org/officeDocument/2006/bibliography" xmlns="http://schemas.openxmlformats.org/officeDocument/2006/bibliography" SelectedStyle="\APASixthEditionOfficeOnline.xsl" StyleName="APA" Version="6"/>
-</file>
-
-<file path=customXml/item4.xml><?xml version="1.0" encoding="utf-8"?>
 <ct:contentTypeSchema xmlns:ct="http://schemas.microsoft.com/office/2006/metadata/contentType" xmlns:ma="http://schemas.microsoft.com/office/2006/metadata/properties/metaAttributes" ct:_="" ma:_="" ma:contentTypeName="Document" ma:contentTypeID="0x0101005C14AC06E2BCC9479AB1E7BFB85765A3" ma:contentTypeVersion="3" ma:contentTypeDescription="Create a new document." ma:contentTypeScope="" ma:versionID="7c0f1869e227914bb9e091b5d5366560">
   <xsd:schema xmlns:xsd="http://www.w3.org/2001/XMLSchema" xmlns:xs="http://www.w3.org/2001/XMLSchema" xmlns:p="http://schemas.microsoft.com/office/2006/metadata/properties" xmlns:ns2="fdb19afe-0f16-4040-a6da-335f4767bfc9" targetNamespace="http://schemas.microsoft.com/office/2006/metadata/properties" ma:root="true" ma:fieldsID="a498babe3b735ed6250eb2675f7bac41" ns2:_="">
     <xsd:import namespace="fdb19afe-0f16-4040-a6da-335f4767bfc9"/>
@@ -26247,32 +26532,26 @@
 </ct:contentTypeSchema>
 </file>
 
-<file path=customXml/itemProps1.xml><?xml version="1.0" encoding="utf-8"?>
-<ds:datastoreItem xmlns:ds="http://schemas.openxmlformats.org/officeDocument/2006/customXml" ds:itemID="{007781DB-EED9-4359-8AD9-68137B52B701}">
-  <ds:schemaRefs>
-    <ds:schemaRef ds:uri="http://schemas.microsoft.com/sharepoint/v3/contenttype/forms"/>
-  </ds:schemaRefs>
-</ds:datastoreItem>
+<file path=customXml/item2.xml><?xml version="1.0" encoding="utf-8"?>
+<b:Sources xmlns:b="http://schemas.openxmlformats.org/officeDocument/2006/bibliography" xmlns="http://schemas.openxmlformats.org/officeDocument/2006/bibliography" SelectedStyle="\APASixthEditionOfficeOnline.xsl" StyleName="APA" Version="6"/>
 </file>
 
-<file path=customXml/itemProps2.xml><?xml version="1.0" encoding="utf-8"?>
-<ds:datastoreItem xmlns:ds="http://schemas.openxmlformats.org/officeDocument/2006/customXml" ds:itemID="{E06D9414-6C68-4A1C-B889-BD6BE2EA8645}">
-  <ds:schemaRefs>
-    <ds:schemaRef ds:uri="http://schemas.microsoft.com/office/2006/metadata/properties"/>
-    <ds:schemaRef ds:uri="http://schemas.microsoft.com/office/infopath/2007/PartnerControls"/>
-  </ds:schemaRefs>
-</ds:datastoreItem>
+<file path=customXml/item3.xml><?xml version="1.0" encoding="utf-8"?>
+<p:properties xmlns:p="http://schemas.microsoft.com/office/2006/metadata/properties" xmlns:xsi="http://www.w3.org/2001/XMLSchema-instance" xmlns:pc="http://schemas.microsoft.com/office/infopath/2007/PartnerControls">
+  <documentManagement/>
+</p:properties>
 </file>
 
-<file path=customXml/itemProps3.xml><?xml version="1.0" encoding="utf-8"?>
-<ds:datastoreItem xmlns:ds="http://schemas.openxmlformats.org/officeDocument/2006/customXml" ds:itemID="{599D4DEC-5966-453E-8EBA-1FE602AD820F}">
-  <ds:schemaRefs>
-    <ds:schemaRef ds:uri="http://schemas.openxmlformats.org/officeDocument/2006/bibliography"/>
-  </ds:schemaRefs>
-</ds:datastoreItem>
+<file path=customXml/item4.xml><?xml version="1.0" encoding="utf-8"?>
+<?mso-contentType ?>
+<FormTemplates xmlns="http://schemas.microsoft.com/sharepoint/v3/contenttype/forms">
+  <Display>DocumentLibraryForm</Display>
+  <Edit>DocumentLibraryForm</Edit>
+  <New>DocumentLibraryForm</New>
+</FormTemplates>
 </file>
 
-<file path=customXml/itemProps4.xml><?xml version="1.0" encoding="utf-8"?>
+<file path=customXml/itemProps1.xml><?xml version="1.0" encoding="utf-8"?>
 <ds:datastoreItem xmlns:ds="http://schemas.openxmlformats.org/officeDocument/2006/customXml" ds:itemID="{5C1C6231-2072-4263-80CD-99FB4E777A75}">
   <ds:schemaRefs>
     <ds:schemaRef ds:uri="http://schemas.microsoft.com/office/2006/metadata/contentType"/>
@@ -26288,4 +26567,29 @@
     <ds:schemaRef ds:uri="http://schemas.microsoft.com/internal/obd"/>
   </ds:schemaRefs>
 </ds:datastoreItem>
+</file>
+
+<file path=customXml/itemProps2.xml><?xml version="1.0" encoding="utf-8"?>
+<ds:datastoreItem xmlns:ds="http://schemas.openxmlformats.org/officeDocument/2006/customXml" ds:itemID="{599D4DEC-5966-453E-8EBA-1FE602AD820F}">
+  <ds:schemaRefs>
+    <ds:schemaRef ds:uri="http://schemas.openxmlformats.org/officeDocument/2006/bibliography"/>
+  </ds:schemaRefs>
+</ds:datastoreItem>
+</file>
+
+<file path=customXml/itemProps3.xml><?xml version="1.0" encoding="utf-8"?>
+<ds:datastoreItem xmlns:ds="http://schemas.openxmlformats.org/officeDocument/2006/customXml" ds:itemID="{E06D9414-6C68-4A1C-B889-BD6BE2EA8645}">
+  <ds:schemaRefs>
+    <ds:schemaRef ds:uri="http://schemas.microsoft.com/office/2006/metadata/properties"/>
+    <ds:schemaRef ds:uri="http://schemas.microsoft.com/office/infopath/2007/PartnerControls"/>
+  </ds:schemaRefs>
+</ds:datastoreItem>
+</file>
+
+<file path=customXml/itemProps4.xml><?xml version="1.0" encoding="utf-8"?>
+<ds:datastoreItem xmlns:ds="http://schemas.openxmlformats.org/officeDocument/2006/customXml" ds:itemID="{007781DB-EED9-4359-8AD9-68137B52B701}">
+  <ds:schemaRefs>
+    <ds:schemaRef ds:uri="http://schemas.microsoft.com/sharepoint/v3/contenttype/forms"/>
+  </ds:schemaRefs>
+</ds:datastoreItem>
 </file>
</xml_diff>

<commit_message>
docs: revisión de calidad (tanda 31) — preserva la independencia funcional de las unidades de la Comisión y refuerza el rol de la OII en los indicadores de sesgo
- 5.3.3 (nuevo): la condicion de integrante de la Comision de Gobierno de IA no limita las funciones que el ROF asigna a cada unidad; en particular, la OII ejerce con independencia la supervision del numeral 6.14 y el tratamiento de las conductas del numeral 6.10.6, y la INALI la asesoria y revision en materia de cumplimiento normativo
- 6.10.2: el umbral de los indicadores de sesgo se define con la opinion de la OII, que se pronuncia sobre los grupos que pueden resultar afectados y sobre la disparidad inaceptable
- 6.6.4: distingue la medicion inicial de los indicadores de sesgo (previa al despliegue, a cargo de la Division de Control de Calidad) de su medicion durante la operacion conforme al numeral 6.10.2
- Regenera el espejo de texto desde el .docx; 0 comentarios pendientes
</commit_message>
<xml_diff>
--- a/normativo/DIRECTIVA-GOBIERNO-IA.docx
+++ b/normativo/DIRECTIVA-GOBIERNO-IA.docx
@@ -4604,6 +4604,32 @@
           <w:color w:val="000000"/>
         </w:rPr>
       </w:pPr>
+      <w:r>
+        <w:rPr>
+          <w:rFonts w:ascii="Arial" w:eastAsia="Arial" w:hAnsi="Arial" w:cs="Arial"/>
+          <w:color w:val="000000"/>
+        </w:rPr>
+        <w:t xml:space="preserve">5.3.3</w:t>
+      </w:r>
+      <w:r>
+        <w:rPr>
+          <w:rFonts w:ascii="Arial" w:eastAsia="Arial" w:hAnsi="Arial" w:cs="Arial"/>
+          <w:color w:val="000000"/>
+        </w:rPr>
+        <w:tab/>
+        <w:t xml:space="preserve">La condición de integrante de la Comisión de Gobierno de IA no limita ni condiciona el ejercicio de las funciones que el ROF y la normativa institucional asignan a cada unidad de organización que la integra. En particular, la Oficina de Integridad Institucional ejerce con independencia la supervisión prevista en el numeral 6.14 y el tratamiento de las conductas que se le comuniquen conforme al numeral 6.10.6, y la Intendencia Nacional de Asesoría Legal Interna ejerce con independencia la asesoría y la revisión en materia de cumplimiento normativo.</w:t>
+      </w:r>
+    </w:p>
+    <w:p>
+      <w:pPr>
+        <w:spacing w:after="60" w:line="276" w:lineRule="auto"/>
+        <w:ind w:left="1276" w:hanging="720"/>
+        <w:jc w:val="both"/>
+        <w:rPr>
+          <w:rFonts w:ascii="Arial" w:eastAsia="Arial" w:hAnsi="Arial" w:cs="Arial"/>
+          <w:color w:val="000000"/>
+        </w:rPr>
+      </w:pPr>
     </w:p>
     <w:p>
       <w:pPr>
@@ -11090,7 +11116,7 @@
           <w:rFonts w:ascii="Arial" w:eastAsia="Arial" w:hAnsi="Arial" w:cs="Arial"/>
           <w:color w:val="000000"/>
         </w:rPr>
-        <w:t xml:space="preserve"> La ejecución de las pruebas que sustentan la medición de los indicadores de sesgo previstos en el numeral 6.10.2 corresponde a la División de Control de Calidad, como prueba no funcional, conforme al literal a) del artículo 126 del ROF. La metodología prevista en el numeral 6.1.5 desarrolla las pruebas aplicables según el tipo de SBIA. </w:t>
+        <w:t xml:space="preserve"> Con anterioridad al despliegue, la ejecución de las pruebas que sustentan la medición inicial de los indicadores de sesgo previstos en el numeral 6.10.2 corresponde a la División de Control de Calidad, como prueba no funcional, conforme al literal a) del artículo 126 del ROF. Durante la operación, la medición de dichos indicadores se efectúa conforme al numeral 6.10.2. La metodología prevista en el numeral 6.1.5 desarrolla las pruebas aplicables según el tipo de SBIA. </w:t>
       </w:r>
       <w:r>
         <w:rPr>
@@ -12363,7 +12389,7 @@
           <w:highlight w:val="green"/>
         </w:rPr>
         <w:lastRenderedPageBreak/>
-        <w:t>correspondientes se definen con anterioridad a la puesta en producción del SBIA, conforme a la metodología prevista en el numeral 6.1.5. En tanto no se apruebe dicha metodología, se establecen en el plan de monitoreo que aprueba la Comisión de Gobierno de IA.</w:t>
+        <w:t xml:space="preserve">correspondientes se definen con anterioridad a la puesta en producción del SBIA, conforme a la metodología prevista en el numeral 6.1.5. Tratándose de los indicadores de sesgo, el umbral se define con la opinión de la OII, que se pronuncia sobre los grupos que pueden resultar afectados y sobre la disparidad que resulta inaceptable. En tanto no se apruebe dicha metodología, se establecen en el plan de monitoreo que aprueba la Comisión de Gobierno de IA.</w:t>
       </w:r>
       <w:r>
         <w:rPr>

</xml_diff>

<commit_message>
docs: revisión de calidad (tanda 33) — actualiza la paginación del índice
- Actualiza los numeros de pagina del indice tras la repaginacion del documento; sin cambios de texto en el articulado
- Regenera el espejo de texto desde el .docx; 0 comentarios pendientes
</commit_message>
<xml_diff>
--- a/normativo/DIRECTIVA-GOBIERNO-IA.docx
+++ b/normativo/DIRECTIVA-GOBIERNO-IA.docx
@@ -1095,7 +1095,7 @@
           <w:rPr>
             <w:webHidden/>
           </w:rPr>
-          <w:t>20</w:t>
+          <w:t>19</w:t>
         </w:r>
         <w:r>
           <w:rPr>
@@ -1176,7 +1176,7 @@
           <w:rPr>
             <w:webHidden/>
           </w:rPr>
-          <w:t>46</w:t>
+          <w:t>47</w:t>
         </w:r>
         <w:r>
           <w:rPr>
@@ -1257,7 +1257,7 @@
           <w:rPr>
             <w:webHidden/>
           </w:rPr>
-          <w:t>48</w:t>
+          <w:t>49</w:t>
         </w:r>
         <w:r>
           <w:rPr>
@@ -4609,7 +4609,7 @@
           <w:rFonts w:ascii="Arial" w:eastAsia="Arial" w:hAnsi="Arial" w:cs="Arial"/>
           <w:color w:val="000000"/>
         </w:rPr>
-        <w:t xml:space="preserve">5.3.3</w:t>
+        <w:t>5.3.3</w:t>
       </w:r>
       <w:r>
         <w:rPr>
@@ -4617,7 +4617,15 @@
           <w:color w:val="000000"/>
         </w:rPr>
         <w:tab/>
-        <w:t xml:space="preserve">La condición de integrante de la Comisión de Gobierno de IA no limita ni condiciona el ejercicio de las funciones que el ROF y la normativa institucional asignan a cada unidad de organización que la integra. En particular, la Oficina de Integridad Institucional ejerce con independencia la supervisión prevista en el numeral 6.14 y el tratamiento de las conductas que se le comuniquen conforme al numeral 6.10.6, y la Intendencia Nacional de Asesoría Legal Interna ejerce con independencia la asesoría y la revisión en materia de cumplimiento normativo.</w:t>
+        <w:t xml:space="preserve">La condición de integrante de la Comisión de Gobierno de IA no limita ni condiciona el ejercicio de las funciones que el ROF y la normativa institucional asignan a cada unidad de organización que la integra. En particular, la Oficina de Integridad Institucional ejerce con independencia la supervisión prevista en el numeral 6.14 y el tratamiento de las conductas que se le comuniquen </w:t>
+      </w:r>
+      <w:r>
+        <w:rPr>
+          <w:rFonts w:ascii="Arial" w:eastAsia="Arial" w:hAnsi="Arial" w:cs="Arial"/>
+          <w:color w:val="000000"/>
+        </w:rPr>
+        <w:lastRenderedPageBreak/>
+        <w:t>conforme al numeral 6.10.6, y la Intendencia Nacional de Asesoría Legal Interna ejerce con independencia la asesoría y la revisión en materia de cumplimiento normativo.</w:t>
       </w:r>
     </w:p>
     <w:p>
@@ -4660,7 +4668,6 @@
         <w:ind w:left="851"/>
       </w:pPr>
       <w:r>
-        <w:lastRenderedPageBreak/>
         <w:t>5.4</w:t>
       </w:r>
       <w:r>
@@ -5216,7 +5223,16 @@
                 <w:bCs w:val="0"/>
                 <w:highlight w:val="green"/>
               </w:rPr>
-              <w:t>Aprueba los casos de uso. Valida el Plan de Acción de Inteligencia Artificial, conforme al numeral 5.3 del artículo 5 de la Resolución Ministerial N.° 152-2026-PCM y al numeral 7.11 de la presente directiva.</w:t>
+              <w:t xml:space="preserve">Aprueba los casos de uso. Valida el Plan de Acción de Inteligencia Artificial, conforme al numeral 5.3 del artículo 5 de la Resolución </w:t>
+            </w:r>
+            <w:r>
+              <w:rPr>
+                <w:b w:val="0"/>
+                <w:bCs w:val="0"/>
+                <w:highlight w:val="green"/>
+              </w:rPr>
+              <w:lastRenderedPageBreak/>
+              <w:t>Ministerial N.° 152-2026-PCM y al numeral 7.11 de la presente directiva.</w:t>
             </w:r>
           </w:p>
           <w:p>
@@ -5262,16 +5278,7 @@
                 <w:bCs w:val="0"/>
                 <w:highlight w:val="green"/>
               </w:rPr>
-              <w:t xml:space="preserve">Verifica la causal y resuelve sobre el componente de IA cuando la Comisión de Gobierno de IA emite </w:t>
-            </w:r>
-            <w:r>
-              <w:rPr>
-                <w:b w:val="0"/>
-                <w:bCs w:val="0"/>
-                <w:highlight w:val="green"/>
-              </w:rPr>
-              <w:lastRenderedPageBreak/>
-              <w:t>pronunciamiento no favorable, en los casos y con el alcance previstos en el numeral 6.1.4.</w:t>
+              <w:t>Verifica la causal y resuelve sobre el componente de IA cuando la Comisión de Gobierno de IA emite pronunciamiento no favorable, en los casos y con el alcance previstos en el numeral 6.1.4.</w:t>
             </w:r>
           </w:p>
           <w:p>
@@ -5477,6 +5484,7 @@
                 <w:bCs w:val="0"/>
                 <w:highlight w:val="cyan"/>
               </w:rPr>
+              <w:lastRenderedPageBreak/>
               <w:t>Asegurar el cumplimiento del Gobierno de IA en la SUNAT.</w:t>
             </w:r>
           </w:p>
@@ -5549,7 +5557,6 @@
                 <w:bCs w:val="0"/>
                 <w:highlight w:val="green"/>
               </w:rPr>
-              <w:lastRenderedPageBreak/>
               <w:t>Supervisar el cumplimiento de los hitos de aprobación del ciclo de vida de los SBIA y consolidar los informes de monitoreo, verificación técnica de seguridad e incidentes para conocimiento del CGTD.</w:t>
             </w:r>
           </w:p>
@@ -5747,6 +5754,7 @@
                 <w:b/>
                 <w:bCs/>
               </w:rPr>
+              <w:lastRenderedPageBreak/>
               <w:t>Integrantes de la Comisión de Gobierno de IA</w:t>
             </w:r>
           </w:p>
@@ -5993,15 +6001,7 @@
                 <w:b w:val="0"/>
                 <w:bCs w:val="0"/>
               </w:rPr>
-              <w:t xml:space="preserve">Supervisa y evalúa que los modelos y algoritmos de los SBIA de riesgo </w:t>
-            </w:r>
-            <w:r>
-              <w:rPr>
-                <w:b w:val="0"/>
-                <w:bCs w:val="0"/>
-              </w:rPr>
-              <w:lastRenderedPageBreak/>
-              <w:t xml:space="preserve">alto cumplan los estándares de calidad y ética aplicables, conforme al numeral 6.5 del artículo 6 de la Resolución Ministerial N.° 152-2026-PCM. La ejerce en coordinación con las unidades de organización y con los propietarios de los casos de uso, y se apoya en las verificaciones previstas en los numerales 6.6.4, 6.10.3 y 6.14.</w:t>
+              <w:t>Supervisa y evalúa que los modelos y algoritmos de los SBIA de riesgo alto cumplan los estándares de calidad y ética aplicables, conforme al numeral 6.5 del artículo 6 de la Resolución Ministerial N.° 152-2026-PCM. La ejerce en coordinación con las unidades de organización y con los propietarios de los casos de uso, y se apoya en las verificaciones previstas en los numerales 6.6.4, 6.10.3 y 6.14.</w:t>
             </w:r>
           </w:p>
         </w:tc>
@@ -6035,7 +6035,6 @@
                 <w:bCs/>
                 <w:color w:val="000000"/>
               </w:rPr>
-              <w:lastRenderedPageBreak/>
               <w:t>Oficial de</w:t>
             </w:r>
           </w:p>
@@ -6403,7 +6402,7 @@
                 <w:color w:val="000000"/>
                 <w:highlight w:val="green"/>
               </w:rPr>
-              <w:t xml:space="preserve">En materia de seguridad digital: asegura y supervisa la adopción de los estándares y normas técnicas de seguridad de la información cuando la INSI desarrolla, adquiere o terceriza SBIA. Propone las medidas de gestión de riesgos de seguridad de la información aplicables a los SBIA. Comunica al </w:t>
+              <w:t xml:space="preserve">En materia de seguridad digital: asegura y supervisa la adopción de los estándares y normas técnicas de seguridad de la información cuando </w:t>
             </w:r>
             <w:r>
               <w:rPr>
@@ -6413,7 +6412,7 @@
                 <w:highlight w:val="green"/>
               </w:rPr>
               <w:lastRenderedPageBreak/>
-              <w:t>Centro Nacional de Seguridad Digital (CNSD) los incidentes de seguridad digital que involucren un SBIA y los informa a la máxima autoridad administrativa de la entidad, conforme a la Directiva N.° 001-2023-PCM/SGTD. Informa al CGTD los que resulten críticos. Cuando un SBIA constituya un activo de información de un proceso comprendido en el alcance del SGSI, coordina la aplicación de los controles que correspondan.</w:t>
+              <w:t>la INSI desarrolla, adquiere o terceriza SBIA. Propone las medidas de gestión de riesgos de seguridad de la información aplicables a los SBIA. Comunica al Centro Nacional de Seguridad Digital (CNSD) los incidentes de seguridad digital que involucren un SBIA y los informa a la máxima autoridad administrativa de la entidad, conforme a la Directiva N.° 001-2023-PCM/SGTD. Informa al CGTD los que resulten críticos. Cuando un SBIA constituya un activo de información de un proceso comprendido en el alcance del SGSI, coordina la aplicación de los controles que correspondan.</w:t>
             </w:r>
           </w:p>
         </w:tc>
@@ -6707,6 +6706,7 @@
                 <w:bCs w:val="0"/>
                 <w:highlight w:val="yellow"/>
               </w:rPr>
+              <w:lastRenderedPageBreak/>
               <w:t xml:space="preserve">Asesora sobre el cumplimiento normativo de los SBIA. </w:t>
             </w:r>
             <w:r>
@@ -6715,16 +6715,7 @@
                 <w:bCs w:val="0"/>
                 <w:highlight w:val="green"/>
               </w:rPr>
-              <w:t xml:space="preserve">Revisa la EIA en materia de cumplimiento normativo. Cuando la revisión comprenda el sentido y el alcance de las normas tributarias o </w:t>
-            </w:r>
-            <w:r>
-              <w:rPr>
-                <w:b w:val="0"/>
-                <w:bCs w:val="0"/>
-                <w:highlight w:val="green"/>
-              </w:rPr>
-              <w:lastRenderedPageBreak/>
-              <w:t>aduaneras, se pronuncia la Intendencia Nacional Jurídico Tributaria o la Intendencia Nacional Jurídico Aduanera, según la materia, a convocatoria de la Comisión de Gobierno de IA.</w:t>
+              <w:t>Revisa la EIA en materia de cumplimiento normativo. Cuando la revisión comprenda el sentido y el alcance de las normas tributarias o aduaneras, se pronuncia la Intendencia Nacional Jurídico Tributaria o la Intendencia Nacional Jurídico Aduanera, según la materia, a convocatoria de la Comisión de Gobierno de IA.</w:t>
             </w:r>
           </w:p>
           <w:p>
@@ -7077,6 +7068,7 @@
                 <w:b/>
                 <w:bCs/>
               </w:rPr>
+              <w:lastRenderedPageBreak/>
               <w:t>Gestión de proyectos y procesos de TI</w:t>
             </w:r>
           </w:p>
@@ -7177,16 +7169,7 @@
                 <w:bCs w:val="0"/>
                 <w:highlight w:val="green"/>
               </w:rPr>
-              <w:t xml:space="preserve">Asegura que los SBIA se incorporen al Plan de Sistemas de la INSI, que elabora la División de Gestión de </w:t>
-            </w:r>
-            <w:r>
-              <w:rPr>
-                <w:b w:val="0"/>
-                <w:bCs w:val="0"/>
-                <w:highlight w:val="green"/>
-              </w:rPr>
-              <w:lastRenderedPageBreak/>
-              <w:t>Procesos de Sistemas conforme al literal a) del artículo 112 del ROF.</w:t>
+              <w:t>Asegura que los SBIA se incorporen al Plan de Sistemas de la INSI, que elabora la División de Gestión de Procesos de Sistemas conforme al literal a) del artículo 112 del ROF.</w:t>
             </w:r>
           </w:p>
         </w:tc>
@@ -7223,7 +7206,6 @@
                 <w:bCs/>
                 <w:highlight w:val="yellow"/>
               </w:rPr>
-              <w:lastRenderedPageBreak/>
               <w:t>Integración de programas y proyectos institucionales</w:t>
             </w:r>
           </w:p>
@@ -7805,7 +7787,6 @@
                 <w:bCs w:val="0"/>
                 <w:highlight w:val="yellow"/>
               </w:rPr>
-              <w:lastRenderedPageBreak/>
               <w:t>Conduce el proceso de elaboración de las acciones de sensibilización, concientización y capacitación en IA, diferenciadas por grupos de uso de SBIA, y eleva la propuesta para su aprobación, conforme al literal f) del artículo 197 del ROF.</w:t>
             </w:r>
           </w:p>
@@ -7914,7 +7895,6 @@
                 <w:b/>
                 <w:bCs/>
               </w:rPr>
-              <w:lastRenderedPageBreak/>
               <w:t>Interpretación normativa tributaria</w:t>
             </w:r>
           </w:p>
@@ -8057,6 +8037,7 @@
                 <w:b w:val="0"/>
                 <w:bCs w:val="0"/>
               </w:rPr>
+              <w:lastRenderedPageBreak/>
               <w:t>La Gerencia de Arquitectura solicita su opinión conforme al numeral 6.5.8.</w:t>
             </w:r>
           </w:p>
@@ -8093,6 +8074,7 @@
                 <w:b/>
                 <w:bCs/>
               </w:rPr>
+              <w:lastRenderedPageBreak/>
               <w:t>Interpretación normativa aduanera</w:t>
             </w:r>
           </w:p>
@@ -8189,15 +8171,7 @@
                 <w:b w:val="0"/>
                 <w:bCs w:val="0"/>
               </w:rPr>
-              <w:t xml:space="preserve">Emite opinión legal vinculante y absuelve las consultas que le </w:t>
-            </w:r>
-            <w:r>
-              <w:rPr>
-                <w:b w:val="0"/>
-                <w:bCs w:val="0"/>
-              </w:rPr>
-              <w:lastRenderedPageBreak/>
-              <w:t>formulan las unidades de organización en las materias de su competencia, conforme a los literales c) y d) del artículo 454 del ROF.</w:t>
+              <w:t>Emite opinión legal vinculante y absuelve las consultas que le formulan las unidades de organización en las materias de su competencia, conforme a los literales c) y d) del artículo 454 del ROF.</w:t>
             </w:r>
           </w:p>
           <w:p>
@@ -8442,6 +8416,7 @@
                 <w:b/>
                 <w:bCs/>
               </w:rPr>
+              <w:lastRenderedPageBreak/>
               <w:t>N.°</w:t>
             </w:r>
           </w:p>
@@ -8649,16 +8624,7 @@
                 <w:color w:val="000000"/>
                 <w:highlight w:val="cyan"/>
               </w:rPr>
-              <w:t xml:space="preserve">El propietario del caso de uso formula el caso de uso: identifica la necesidad institucional, define el problema a resolver y el resultado esperado, y lo presenta a la Comisión de Gobierno de IA </w:t>
-            </w:r>
-            <w:r>
-              <w:rPr>
-                <w:rFonts w:ascii="Arial" w:hAnsi="Arial" w:cs="Arial"/>
-                <w:color w:val="000000"/>
-                <w:highlight w:val="cyan"/>
-              </w:rPr>
-              <w:lastRenderedPageBreak/>
-              <w:t>mediante la Ficha de Evaluación de Caso de Uso (Anexo N.° 4).</w:t>
+              <w:t>El propietario del caso de uso formula el caso de uso: identifica la necesidad institucional, define el problema a resolver y el resultado esperado, y lo presenta a la Comisión de Gobierno de IA mediante la Ficha de Evaluación de Caso de Uso (Anexo N.° 4).</w:t>
             </w:r>
           </w:p>
         </w:tc>
@@ -8692,16 +8658,7 @@
                 <w:rFonts w:ascii="Arial" w:eastAsia="Arial" w:hAnsi="Arial" w:cs="Arial"/>
                 <w:highlight w:val="green"/>
               </w:rPr>
-              <w:lastRenderedPageBreak/>
-              <w:t xml:space="preserve">La etapa concluye con la presentación a la Comisión de Gobierno de IA de la Ficha de Evaluación de Caso de Uso. La Ficha se presenta suscrita por </w:t>
-            </w:r>
-            <w:r>
-              <w:rPr>
-                <w:rFonts w:ascii="Arial" w:eastAsia="Arial" w:hAnsi="Arial" w:cs="Arial"/>
-                <w:highlight w:val="green"/>
-              </w:rPr>
-              <w:lastRenderedPageBreak/>
-              <w:t>el propietario del caso de uso y con el visto bueno del titular de su unidad de organización, conforme a la Sección 6 del Anexo N.° 4. La etapa no comporta hito de aprobación: la evaluación del componente de IA y la aprobación corresponden a la etapa 2.</w:t>
+              <w:t>La etapa concluye con la presentación a la Comisión de Gobierno de IA de la Ficha de Evaluación de Caso de Uso. La Ficha se presenta suscrita por el propietario del caso de uso y con el visto bueno del titular de su unidad de organización, conforme a la Sección 6 del Anexo N.° 4. La etapa no comporta hito de aprobación: la evaluación del componente de IA y la aprobación corresponden a la etapa 2.</w:t>
             </w:r>
           </w:p>
         </w:tc>
@@ -8735,7 +8692,6 @@
               <w:rPr>
                 <w:rFonts w:ascii="Arial" w:eastAsia="Arial" w:hAnsi="Arial" w:cs="Arial"/>
               </w:rPr>
-              <w:lastRenderedPageBreak/>
               <w:t>2</w:t>
             </w:r>
           </w:p>
@@ -8939,7 +8895,15 @@
                 <w:rFonts w:ascii="Arial" w:eastAsia="Arial" w:hAnsi="Arial" w:cs="Arial"/>
                 <w:highlight w:val="green"/>
               </w:rPr>
-              <w:t>La Gerencia de Arquitectura conduce el diseño de la arquitectura del SBIA y las Divisiones de Arquitectura lo elaboran, conforme al numeral 6.5.1. Se define el mecanismo de supervisión humana, conforme al numeral 6.6. Para los SBIA de riesgo alto se elabora la EIA, conforme al numeral 6.4.</w:t>
+              <w:t xml:space="preserve">La Gerencia de Arquitectura conduce el diseño de la arquitectura del SBIA y las Divisiones de Arquitectura lo </w:t>
+            </w:r>
+            <w:r>
+              <w:rPr>
+                <w:rFonts w:ascii="Arial" w:eastAsia="Arial" w:hAnsi="Arial" w:cs="Arial"/>
+                <w:highlight w:val="green"/>
+              </w:rPr>
+              <w:lastRenderedPageBreak/>
+              <w:t>elaboran, conforme al numeral 6.5.1. Se define el mecanismo de supervisión humana, conforme al numeral 6.6. Para los SBIA de riesgo alto se elabora la EIA, conforme al numeral 6.4.</w:t>
             </w:r>
           </w:p>
         </w:tc>
@@ -8972,7 +8936,8 @@
                 <w:rFonts w:ascii="Arial" w:eastAsia="Arial" w:hAnsi="Arial" w:cs="Arial"/>
                 <w:highlight w:val="green"/>
               </w:rPr>
-              <w:t xml:space="preserve">Aprobación del diseño de la arquitectura de solución por la División de Arquitectura competente según la materia, conforme al numeral 6.5.4. Para SBIA de riesgo alto, aprobación de la EIA por el CGTD, previa al inicio del desarrollo, </w:t>
+              <w:lastRenderedPageBreak/>
+              <w:t xml:space="preserve">Aprobación del diseño de la arquitectura de solución por la División de Arquitectura </w:t>
             </w:r>
             <w:r>
               <w:rPr>
@@ -8980,7 +8945,7 @@
                 <w:highlight w:val="green"/>
               </w:rPr>
               <w:lastRenderedPageBreak/>
-              <w:t>adquisición o implementación.</w:t>
+              <w:t>competente según la materia, conforme al numeral 6.5.4. Para SBIA de riesgo alto, aprobación de la EIA por el CGTD, previa al inicio del desarrollo, adquisición o implementación.</w:t>
             </w:r>
           </w:p>
         </w:tc>
@@ -9255,7 +9220,7 @@
                 <w:rFonts w:ascii="Arial" w:hAnsi="Arial" w:cs="Arial"/>
                 <w:highlight w:val="green"/>
               </w:rPr>
-              <w:t xml:space="preserve">La Gerencia de Calidad de Sistemas conduce el control y aseguramiento de la calidad y la División de Control de Calidad efectúa la verificación y validación de la calidad, conforme al numeral 6.10.3. La Oficina de Seguridad Informática efectúa el análisis de riesgo y las pruebas de vulnerabilidad sobre la arquitectura de aplicaciones, de información y de infraestructura tecnológica que </w:t>
+              <w:t xml:space="preserve">La Gerencia de Calidad de Sistemas conduce el control y aseguramiento de la calidad y la División de Control de Calidad efectúa la verificación y validación de la calidad, conforme al numeral 6.10.3. La Oficina de Seguridad Informática efectúa el análisis de riesgo y las </w:t>
             </w:r>
             <w:r>
               <w:rPr>
@@ -9263,7 +9228,15 @@
                 <w:highlight w:val="green"/>
               </w:rPr>
               <w:lastRenderedPageBreak/>
-              <w:t>soporta el SBIA, incluido el red teaming para riesgo alto, y verifica la implementación de los requisitos de seguridad propuestos en la etapa anterior. El propietario del caso de uso verifica la implementación del mecanismo de supervisión humana conforme al numeral 6.6.2. La Comisión de Gobierno de IA verifica la implementación de los controles, del mecanismo de supervisión humana y de las medidas frente al sesgo, así como los resultados de las pruebas de sesgo, conforme a los numerales 6.2.5, 6.6.2 y 6.6.4. Asimismo, aprueba el plan de monitoreo del SBIA conforme al numeral 6.10.1. La aprobación requiere la conformidad de la División de Control de Calidad, de la Oficina de Seguridad Informática, del propietario del caso de uso y de la Comisión de Gobierno de IA. La titularidad de la aprobación se determina conforme al numeral 6.1.2.</w:t>
+              <w:t xml:space="preserve">pruebas de vulnerabilidad sobre la arquitectura de aplicaciones, de información y de infraestructura tecnológica que soporta el SBIA, incluido el red teaming para riesgo alto, y verifica la implementación de los requisitos de seguridad propuestos en la etapa anterior. El propietario del caso de uso verifica la implementación del mecanismo de supervisión humana conforme al numeral 6.6.2. La Comisión de Gobierno de IA verifica la implementación de los controles, del mecanismo de supervisión humana y de las medidas frente al sesgo, así como los resultados de las pruebas de sesgo, conforme a los numerales 6.2.5, 6.6.2 y 6.6.4. Asimismo, aprueba el plan de monitoreo del SBIA conforme al numeral 6.10.1. La aprobación requiere la conformidad de la División de Control de Calidad, de la Oficina de Seguridad Informática, del </w:t>
+            </w:r>
+            <w:r>
+              <w:rPr>
+                <w:rFonts w:ascii="Arial" w:hAnsi="Arial" w:cs="Arial"/>
+                <w:highlight w:val="green"/>
+              </w:rPr>
+              <w:lastRenderedPageBreak/>
+              <w:t>propietario del caso de uso y de la Comisión de Gobierno de IA. La titularidad de la aprobación se determina conforme al numeral 6.1.2.</w:t>
             </w:r>
           </w:p>
         </w:tc>
@@ -9753,7 +9726,16 @@
           <w:color w:val="000000"/>
           <w:highlight w:val="green"/>
         </w:rPr>
-        <w:t>Los SBIA SaaS (enfoque A) siguen un ciclo de vida abreviado, que comprende cuando menos: el registro en el Inventario Institucional de SBIA, la clasificación de riesgo conforme al numeral 6.2 y las verificaciones previstas en el numeral 6.12.3.</w:t>
+        <w:t xml:space="preserve">Los SBIA SaaS (enfoque A) siguen un ciclo de vida abreviado, que comprende cuando menos: el registro en el Inventario Institucional de SBIA, la clasificación de riesgo conforme al numeral 6.2 y las verificaciones previstas en el numeral </w:t>
+      </w:r>
+      <w:r>
+        <w:rPr>
+          <w:rFonts w:ascii="Arial" w:eastAsia="Arial" w:hAnsi="Arial" w:cs="Arial"/>
+          <w:color w:val="000000"/>
+          <w:highlight w:val="green"/>
+        </w:rPr>
+        <w:lastRenderedPageBreak/>
+        <w:t>6.12.3.</w:t>
       </w:r>
       <w:r>
         <w:t xml:space="preserve"> </w:t>
@@ -9783,7 +9765,6 @@
           <w:color w:val="000000"/>
           <w:highlight w:val="green"/>
         </w:rPr>
-        <w:lastRenderedPageBreak/>
         <w:t>6.1.4</w:t>
       </w:r>
       <w:r>
@@ -9876,7 +9857,16 @@
           <w:highlight w:val="green"/>
         </w:rPr>
         <w:tab/>
-        <w:t>Todo SBIA cuenta con un equipo técnico multidisciplinario, conformado en función de la necesidad y la complejidad de la materia o del problema público que atiende, conforme al numeral 28.3 del artículo 28 del RLIA. El propietario del caso de uso y el custodio técnico lo conforman previamente al inicio del desarrollo o adquisición, y lo integran, cuando menos, con las unidades de organización cuya competencia comprenda las materias que el SBIA involucra. Su composición se registra en la Ficha de Registro de SBIA (Anexo N.° 1).</w:t>
+        <w:t xml:space="preserve">Todo SBIA cuenta con un equipo técnico multidisciplinario, conformado en función de la necesidad y la complejidad de la materia o del problema público que atiende, conforme al numeral 28.3 del artículo 28 del RLIA. El propietario del caso de uso y el custodio técnico lo conforman previamente al inicio del </w:t>
+      </w:r>
+      <w:r>
+        <w:rPr>
+          <w:rFonts w:ascii="Arial" w:eastAsia="Arial" w:hAnsi="Arial" w:cs="Arial"/>
+          <w:color w:val="000000"/>
+          <w:highlight w:val="green"/>
+        </w:rPr>
+        <w:lastRenderedPageBreak/>
+        <w:t>desarrollo o adquisición, y lo integran, cuando menos, con las unidades de organización cuya competencia comprenda las materias que el SBIA involucra. Su composición se registra en la Ficha de Registro de SBIA (Anexo N.° 1).</w:t>
       </w:r>
     </w:p>
     <w:p>
@@ -9918,16 +9908,7 @@
           <w:highlight w:val="cyan"/>
         </w:rPr>
         <w:tab/>
-        <w:t xml:space="preserve">La clasificación de riesgo determina, para cada iniciativa o SBIA de la SUNAT, la categoría de riesgo que genera su uso conforme al RLIA: uso indebido </w:t>
-      </w:r>
-      <w:r>
-        <w:rPr>
-          <w:rFonts w:ascii="Arial" w:hAnsi="Arial" w:cs="Arial"/>
-          <w:color w:val="000000"/>
-          <w:highlight w:val="cyan"/>
-        </w:rPr>
-        <w:lastRenderedPageBreak/>
-        <w:t xml:space="preserve">(artículo 23), riesgo alto (artículo 24) o riesgo aceptable (numeral 22.2 del artículo 22). El uso indebido deviene en prohibido; por ello, la SUNAT no desarrolla, adquiere, implementa ni opera SBIA cuyo uso sea indebido, y la clasificación los identifica y excluye en la etapa de evaluación de viabilidad, con anterioridad a su desarrollo o adquisición. </w:t>
+        <w:t xml:space="preserve">La clasificación de riesgo determina, para cada iniciativa o SBIA de la SUNAT, la categoría de riesgo que genera su uso conforme al RLIA: uso indebido (artículo 23), riesgo alto (artículo 24) o riesgo aceptable (numeral 22.2 del artículo 22). El uso indebido deviene en prohibido; por ello, la SUNAT no desarrolla, adquiere, implementa ni opera SBIA cuyo uso sea indebido, y la clasificación los identifica y excluye en la etapa de evaluación de viabilidad, con anterioridad a su desarrollo o adquisición. </w:t>
       </w:r>
       <w:r>
         <w:rPr>
@@ -10013,7 +9994,16 @@
           <w:color w:val="000000"/>
           <w:highlight w:val="yellow"/>
         </w:rPr>
-        <w:t>, conforme al artículo 23 del RLIA. Sin perjuicio de lo señalado en el literal e) del numeral 23.1 del citado artículo, no se consideran de uso indebido los SBIA utilizados para apoyar la evaluación humana sobre la implicación de una persona física en una actividad delictiva, siempre que se basen en hechos objetivos y verificables directamente relacionados con una actividad delictiva ya existente y cuenten con mecanismos de supervisión humana, transparencia y auditabilidad para garantizar la no discriminación y la protección de los derechos fundamentales, conforme al numeral 23.4 del citado artículo.</w:t>
+        <w:t xml:space="preserve">, conforme al artículo 23 del RLIA. Sin perjuicio de lo señalado en el literal e) del numeral 23.1 del citado artículo, no se consideran de uso indebido los SBIA utilizados para apoyar la evaluación humana sobre la implicación de una persona física en una actividad delictiva, siempre que se basen en hechos objetivos y verificables directamente relacionados con una actividad delictiva ya existente y cuenten con </w:t>
+      </w:r>
+      <w:r>
+        <w:rPr>
+          <w:rFonts w:ascii="Arial" w:eastAsia="Arial" w:hAnsi="Arial" w:cs="Arial"/>
+          <w:color w:val="000000"/>
+          <w:highlight w:val="yellow"/>
+        </w:rPr>
+        <w:lastRenderedPageBreak/>
+        <w:t>mecanismos de supervisión humana, transparencia y auditabilidad para garantizar la no discriminación y la protección de los derechos fundamentales, conforme al numeral 23.4 del citado artículo.</w:t>
       </w:r>
     </w:p>
     <w:p>
@@ -10061,16 +10051,7 @@
           <w:color w:val="000000"/>
           <w:highlight w:val="cyan"/>
         </w:rPr>
-        <w:t xml:space="preserve">Ante la duda sobre si un SBIA constituye uso </w:t>
-      </w:r>
-      <w:r>
-        <w:rPr>
-          <w:rFonts w:ascii="Arial" w:eastAsia="Arial" w:hAnsi="Arial" w:cs="Arial"/>
-          <w:color w:val="000000"/>
-          <w:highlight w:val="cyan"/>
-        </w:rPr>
-        <w:lastRenderedPageBreak/>
-        <w:t>indebido, la SUNAT puede formular a la SGTD la consulta prevista en el artículo 23 del RLIA.</w:t>
+        <w:t>Ante la duda sobre si un SBIA constituye uso indebido, la SUNAT puede formular a la SGTD la consulta prevista en el artículo 23 del RLIA.</w:t>
       </w:r>
     </w:p>
     <w:p>
@@ -10270,7 +10251,16 @@
           <w:highlight w:val="green"/>
         </w:rPr>
         <w:tab/>
-        <w:t>El propietario del caso de uso elabora la EIA con la participación del equipo técnico multidisciplinario del SBIA previsto en el numeral 6.1.6. La EIA incorpora los aspectos de negocio (en particular el impacto en el administrado) y los aspectos técnicos. La Comisión de Gobierno de IA, la OII, la INALI y el OGD la revisan. Cuando la materia comprenda el sentido y el alcance de las normas tributarias o aduaneras, la Comisión de Gobierno de IA convoca a la Intendencia Nacional Jurídico Tributaria o a la Intendencia Nacional Jurídico Aduanera. Concluidas las revisiones, la Comisión de Gobierno de IA eleva la EIA al CGTD para su aprobación conforme al numeral 6.4.1.</w:t>
+        <w:t xml:space="preserve">El propietario del caso de uso elabora la EIA con la participación del equipo técnico multidisciplinario del SBIA previsto en el numeral 6.1.6. La EIA incorpora los aspectos de negocio (en particular el impacto en el administrado) y los aspectos técnicos. La Comisión de Gobierno de IA, la OII, la INALI y el OGD la revisan. Cuando la materia comprenda el sentido y el alcance de las normas tributarias o aduaneras, la Comisión de Gobierno de IA convoca a la Intendencia Nacional Jurídico Tributaria o a la Intendencia Nacional Jurídico </w:t>
+      </w:r>
+      <w:r>
+        <w:rPr>
+          <w:rFonts w:ascii="Arial" w:hAnsi="Arial" w:cs="Arial"/>
+          <w:color w:val="000000"/>
+          <w:highlight w:val="green"/>
+        </w:rPr>
+        <w:lastRenderedPageBreak/>
+        <w:t>Aduanera. Concluidas las revisiones, la Comisión de Gobierno de IA eleva la EIA al CGTD para su aprobación conforme al numeral 6.4.1.</w:t>
       </w:r>
     </w:p>
     <w:p>
@@ -10317,7 +10307,6 @@
           <w:color w:val="000000"/>
           <w:highlight w:val="yellow"/>
         </w:rPr>
-        <w:lastRenderedPageBreak/>
         <w:t>6.4.4</w:t>
       </w:r>
       <w:r>
@@ -10484,25 +10473,16 @@
           <w:highlight w:val="green"/>
         </w:rPr>
         <w:tab/>
-        <w:t xml:space="preserve">El diseño de la arquitectura de los SBIA observa los Principios de Arquitectura de TI (AAT.PRAQ.01) y los Lineamientos de Arquitectura de TI (LAT.LIAQ.01) de la SUNAT, en sus versiones vigentes, en lo que corresponda a su naturaleza. La GA adecua dichos instrumentos y emite los estándares, modelos de referencia, patrones y demás documentos técnicos de arquitectura necesarios para incorporar los requisitos propios de los SBIA (modelos, conjuntos de datos, componentes generativos y </w:t>
-      </w:r>
-      <w:proofErr w:type="spellStart"/>
-      <w:r>
-        <w:rPr>
-          <w:rFonts w:ascii="Arial" w:eastAsia="Arial" w:hAnsi="Arial" w:cs="Arial"/>
-          <w:color w:val="000000"/>
-          <w:highlight w:val="green"/>
-        </w:rPr>
-        <w:t>agénticos</w:t>
-      </w:r>
-      <w:proofErr w:type="spellEnd"/>
-      <w:r>
-        <w:rPr>
-          <w:rFonts w:ascii="Arial" w:eastAsia="Arial" w:hAnsi="Arial" w:cs="Arial"/>
-          <w:color w:val="000000"/>
-          <w:highlight w:val="green"/>
-        </w:rPr>
-        <w:t>, e infraestructura especializada), en el ámbito de su competencia y conforme a los literales a) y c) del artículo 130 del ROF. Los que establezcan obligaciones exigibles a las unidades de organización se aprueban como documento normativo institucional conforme al numeral 7.6 de la presente directiva.</w:t>
+        <w:t xml:space="preserve">El diseño de la arquitectura de los SBIA observa los Principios de Arquitectura de TI (AAT.PRAQ.01) y los Lineamientos de Arquitectura de TI (LAT.LIAQ.01) de la SUNAT, en sus versiones vigentes, en lo que corresponda a su naturaleza. La GA adecua dichos instrumentos y emite los estándares, modelos de referencia, patrones y demás documentos técnicos de arquitectura necesarios para incorporar los requisitos propios de los SBIA (modelos, conjuntos de datos, componentes generativos y agénticos, e infraestructura </w:t>
+      </w:r>
+      <w:r>
+        <w:rPr>
+          <w:rFonts w:ascii="Arial" w:eastAsia="Arial" w:hAnsi="Arial" w:cs="Arial"/>
+          <w:color w:val="000000"/>
+          <w:highlight w:val="green"/>
+        </w:rPr>
+        <w:lastRenderedPageBreak/>
+        <w:t>especializada), en el ámbito de su competencia y conforme a los literales a) y c) del artículo 130 del ROF. Los que establezcan obligaciones exigibles a las unidades de organización se aprueban como documento normativo institucional conforme al numeral 7.6 de la presente directiva.</w:t>
       </w:r>
     </w:p>
     <w:p>
@@ -10531,16 +10511,7 @@
           <w:highlight w:val="green"/>
         </w:rPr>
         <w:tab/>
-        <w:t xml:space="preserve">Todo SBIA cuenta con la aprobación del diseño de su arquitectura de solución, previa al inicio del desarrollo, la adquisición o el entrenamiento, conforme a la etapa 3 del numeral 6.1.1. Dicha aprobación corresponde a la División de </w:t>
-      </w:r>
-      <w:r>
-        <w:rPr>
-          <w:rFonts w:ascii="Arial" w:eastAsia="Arial" w:hAnsi="Arial" w:cs="Arial"/>
-          <w:color w:val="000000"/>
-          <w:highlight w:val="green"/>
-        </w:rPr>
-        <w:lastRenderedPageBreak/>
-        <w:t xml:space="preserve">Arquitectura de Información y de Aplicaciones y a la División de Arquitectura Tecnológica, cada una en el ámbito de su competencia conforme al literal a) de los artículos 132 y 134 del ROF, bajo la conducción de la Gerencia de Arquitectura. </w:t>
+        <w:t xml:space="preserve">Todo SBIA cuenta con la aprobación del diseño de su arquitectura de solución, previa al inicio del desarrollo, la adquisición o el entrenamiento, conforme a la etapa 3 del numeral 6.1.1. Dicha aprobación corresponde a la División de Arquitectura de Información y de Aplicaciones y a la División de Arquitectura Tecnológica, cada una en el ámbito de su competencia conforme al literal a) de los artículos 132 y 134 del ROF, bajo la conducción de la Gerencia de Arquitectura. </w:t>
       </w:r>
       <w:r>
         <w:rPr>
@@ -10673,7 +10644,16 @@
           <w:highlight w:val="green"/>
         </w:rPr>
         <w:tab/>
-        <w:t>La publicación del código fuente de los SBIA financiados con fondos públicos, con licencia libre o abierta en la Plataforma Nacional de Software Público Peruano (PNSSP), se sujeta a la determinación previa de su publicabilidad. Esta obligación está prevista en el numeral 28.8 del artículo 28 del RLIA. Dicha determinación verifica que el código no revele información sujeta a reserva tributaria conforme al artículo 85 del TUO del Código Tributario. Verifica asimismo que no revele reglas de detección de riesgo cuya divulgación comprometa la función de control.</w:t>
+        <w:t xml:space="preserve">La publicación del código fuente de los SBIA financiados con fondos públicos, con licencia libre o abierta en la Plataforma Nacional de Software Público Peruano (PNSSP), se sujeta a la determinación previa de su publicabilidad. </w:t>
+      </w:r>
+      <w:r>
+        <w:rPr>
+          <w:rFonts w:ascii="Arial" w:eastAsia="Arial" w:hAnsi="Arial" w:cs="Arial"/>
+          <w:color w:val="000000"/>
+          <w:highlight w:val="green"/>
+        </w:rPr>
+        <w:lastRenderedPageBreak/>
+        <w:t>Esta obligación está prevista en el numeral 28.8 del artículo 28 del RLIA. Dicha determinación verifica que el código no revele información sujeta a reserva tributaria conforme al artículo 85 del TUO del Código Tributario. Verifica asimismo que no revele reglas de detección de riesgo cuya divulgación comprometa la función de control.</w:t>
       </w:r>
     </w:p>
     <w:p>
@@ -10701,16 +10681,7 @@
           <w:highlight w:val="green"/>
         </w:rPr>
         <w:tab/>
-        <w:t xml:space="preserve">La GA conduce la determinación de publicabilidad prevista en el numeral 6.5.7. La efectúa antes de cada liberación mayor y, en todo caso, con ocasión de la </w:t>
-      </w:r>
-      <w:r>
-        <w:rPr>
-          <w:rFonts w:ascii="Arial" w:eastAsia="Arial" w:hAnsi="Arial" w:cs="Arial"/>
-          <w:color w:val="000000"/>
-          <w:highlight w:val="green"/>
-        </w:rPr>
-        <w:lastRenderedPageBreak/>
-        <w:t>revisión integral anual del Inventario Institucional de SBIA prevista en el numeral 6.3.2. La GA solicita para ello la opinión de la Oficina de Seguridad Informática y la de la INALI en materia de cumplimiento normativo. Cuando la determinación comprenda el sentido y el alcance de las normas tributarias o aduaneras, la GA solicita la opinión de la Intendencia Nacional Jurídico Tributaria o de la Intendencia Nacional Jurídico Aduanera, según la materia. La publicabilidad resulta de dichas opiniones. La determinación y su resultado constan en la Ficha de Registro de SBIA (Anexo N.° 1). Cuando el código no resulte publicable, se consigna igualmente la justificación legal de la restricción. La GDS pone a disposición el código fuente cuya publicación se haya determinado procedente, conforme a los mecanismos que establezca la Plataforma Nacional de Software Público Peruano.</w:t>
+        <w:t>La GA conduce la determinación de publicabilidad prevista en el numeral 6.5.7. La efectúa antes de cada liberación mayor y, en todo caso, con ocasión de la revisión integral anual del Inventario Institucional de SBIA prevista en el numeral 6.3.2. La GA solicita para ello la opinión de la Oficina de Seguridad Informática y la de la INALI en materia de cumplimiento normativo. Cuando la determinación comprenda el sentido y el alcance de las normas tributarias o aduaneras, la GA solicita la opinión de la Intendencia Nacional Jurídico Tributaria o de la Intendencia Nacional Jurídico Aduanera, según la materia. La publicabilidad resulta de dichas opiniones. La determinación y su resultado constan en la Ficha de Registro de SBIA (Anexo N.° 1). Cuando el código no resulte publicable, se consigna igualmente la justificación legal de la restricción. La GDS pone a disposición el código fuente cuya publicación se haya determinado procedente, conforme a los mecanismos que establezca la Plataforma Nacional de Software Público Peruano.</w:t>
       </w:r>
     </w:p>
     <w:p>
@@ -10830,7 +10801,17 @@
           <w:color w:val="000000"/>
           <w:highlight w:val="green"/>
         </w:rPr>
-        <w:t>Human-on-the-loop (obligatorio para los SBIA de riesgo aceptable que interactúan directamente con el administrado o cuyo resultado influye en la atención que este recibe): Un supervisor humano monitorea las operaciones del SBIA y puede intervenir ante anomalías, sin validar cada resultado individual. Aplica, entre otros, a chatbots de atención, asistentes de orientación y preclasificación.</w:t>
+        <w:t xml:space="preserve">Human-on-the-loop (obligatorio para los SBIA de riesgo aceptable que interactúan directamente con el administrado o cuyo resultado influye en la </w:t>
+      </w:r>
+      <w:r>
+        <w:rPr>
+          <w:b w:val="0"/>
+          <w:bCs w:val="0"/>
+          <w:color w:val="000000"/>
+          <w:highlight w:val="green"/>
+        </w:rPr>
+        <w:lastRenderedPageBreak/>
+        <w:t>atención que este recibe): Un supervisor humano monitorea las operaciones del SBIA y puede intervenir ante anomalías, sin validar cada resultado individual. Aplica, entre otros, a chatbots de atención, asistentes de orientación y preclasificación.</w:t>
       </w:r>
     </w:p>
     <w:p>
@@ -10855,17 +10836,7 @@
           <w:color w:val="000000"/>
           <w:highlight w:val="yellow"/>
         </w:rPr>
-        <w:t xml:space="preserve">Human-in-command (obligatorio para todos los SBIA): Un responsable designado por el propietario del caso de uso mantiene la capacidad de desactivar, suspender o modificar el comportamiento del SBIA en cualquier </w:t>
-      </w:r>
-      <w:r>
-        <w:rPr>
-          <w:b w:val="0"/>
-          <w:bCs w:val="0"/>
-          <w:color w:val="000000"/>
-          <w:highlight w:val="yellow"/>
-        </w:rPr>
-        <w:lastRenderedPageBreak/>
-        <w:t>momento, incluida la interrupción inmediata de su operación ante la detección de un riesgo.</w:t>
+        <w:t>Human-in-command (obligatorio para todos los SBIA): Un responsable designado por el propietario del caso de uso mantiene la capacidad de desactivar, suspender o modificar el comportamiento del SBIA en cualquier momento, incluida la interrupción inmediata de su operación ante la detección de un riesgo.</w:t>
       </w:r>
     </w:p>
     <w:p>
@@ -11116,7 +11087,15 @@
           <w:rFonts w:ascii="Arial" w:eastAsia="Arial" w:hAnsi="Arial" w:cs="Arial"/>
           <w:color w:val="000000"/>
         </w:rPr>
-        <w:t xml:space="preserve"> Con anterioridad al despliegue, la ejecución de las pruebas que sustentan la medición inicial de los indicadores de sesgo previstos en el numeral 6.10.2 corresponde a la División de Control de Calidad, como prueba no funcional, conforme al literal a) del artículo 126 del ROF. Durante la operación, la medición de dichos indicadores se efectúa conforme al numeral 6.10.2. La metodología prevista en el numeral 6.1.5 desarrolla las pruebas aplicables según el tipo de SBIA. </w:t>
+        <w:t xml:space="preserve"> Con anterioridad al despliegue, la ejecución de las pruebas que sustentan la medición inicial de los indicadores de sesgo previstos en el numeral 6.10.2 corresponde a la División de Control de Calidad, como prueba no funcional, conforme al literal a) del artículo 126 del ROF. Durante la operación, la medición de dichos indicadores se efectúa conforme </w:t>
+      </w:r>
+      <w:r>
+        <w:rPr>
+          <w:rFonts w:ascii="Arial" w:eastAsia="Arial" w:hAnsi="Arial" w:cs="Arial"/>
+          <w:color w:val="000000"/>
+        </w:rPr>
+        <w:lastRenderedPageBreak/>
+        <w:t xml:space="preserve">al numeral 6.10.2. La metodología prevista en el numeral 6.1.5 desarrolla las pruebas aplicables según el tipo de SBIA. </w:t>
       </w:r>
       <w:r>
         <w:rPr>
@@ -11166,34 +11145,7 @@
           <w:highlight w:val="green"/>
         </w:rPr>
         <w:tab/>
-        <w:t xml:space="preserve">Los SBIA cumplen la Política de Seguridad de la Información (SGSI-PO-01) y el Manual de Políticas del Sistema de Gestión de Seguridad de la Información </w:t>
-      </w:r>
-      <w:r>
-        <w:rPr>
-          <w:rFonts w:ascii="Arial" w:eastAsia="Arial" w:hAnsi="Arial" w:cs="Arial"/>
-          <w:color w:val="000000"/>
-          <w:highlight w:val="green"/>
-        </w:rPr>
-        <w:lastRenderedPageBreak/>
-        <w:t xml:space="preserve">(SGSI-MA-03) de la SUNAT, en sus versiones vigentes. El Manual de Políticas </w:t>
-      </w:r>
-      <w:proofErr w:type="gramStart"/>
-      <w:r>
-        <w:rPr>
-          <w:rFonts w:ascii="Arial" w:eastAsia="Arial" w:hAnsi="Arial" w:cs="Arial"/>
-          <w:color w:val="000000"/>
-          <w:highlight w:val="green"/>
-        </w:rPr>
-        <w:t>es de aplicación</w:t>
-      </w:r>
-      <w:proofErr w:type="gramEnd"/>
-      <w:r>
-        <w:rPr>
-          <w:rFonts w:ascii="Arial" w:eastAsia="Arial" w:hAnsi="Arial" w:cs="Arial"/>
-          <w:color w:val="000000"/>
-          <w:highlight w:val="green"/>
-        </w:rPr>
-        <w:t xml:space="preserve"> a todos los colaboradores, al personal de modalidades formativas y a los terceros vinculados que gestionen información de la institución. Cuando un SBIA constituya un activo de información de un proceso comprendido en el alcance del Sistema de Gestión de Seguridad de la Información, le son exigibles además los demás documentos normativos y lineamientos de dicho Sistema.</w:t>
+        <w:t>Los SBIA cumplen la Política de Seguridad de la Información (SGSI-PO-01) y el Manual de Políticas del Sistema de Gestión de Seguridad de la Información (SGSI-MA-03) de la SUNAT, en sus versiones vigentes. El Manual de Políticas es de aplicación a todos los colaboradores, al personal de modalidades formativas y a los terceros vinculados que gestionen información de la institución. Cuando un SBIA constituya un activo de información de un proceso comprendido en el alcance del Sistema de Gestión de Seguridad de la Información, le son exigibles además los demás documentos normativos y lineamientos de dicho Sistema.</w:t>
       </w:r>
     </w:p>
     <w:p>
@@ -11451,7 +11403,16 @@
           <w:highlight w:val="yellow"/>
         </w:rPr>
         <w:tab/>
-        <w:t>Todo SBIA, con independencia de su nivel de riesgo, integra la privacidad desde el diseño, minimizando la cantidad de datos personales recopilados y utilizando técnicas de anonimización, conforme al literal b) del artículo 29 del RLIA y a la Ley N.° 29733. En el desarrollo, la implementación y el uso de los SBIA se cumple la normativa vigente sobre privacidad y protección de datos personales, de acuerdo con lo que establezca la Autoridad Nacional de Protección de Datos Personales del Ministerio de Justicia y Derechos Humanos, conforme al artículo 26 del RLIA. Cuando la anonimización no resulte compatible con la finalidad del SBIA, la SUNAT admite la seudonimización; su justificación se documenta en la EIA o en la Ficha de Registro de SBIA, según corresponda.</w:t>
+        <w:t xml:space="preserve">Todo SBIA, con independencia de su nivel de riesgo, integra la privacidad desde el diseño, minimizando la cantidad de datos personales recopilados y utilizando técnicas de anonimización, conforme al literal b) del artículo 29 del RLIA y a la Ley N.° 29733. En el desarrollo, la implementación y el uso de los </w:t>
+      </w:r>
+      <w:r>
+        <w:rPr>
+          <w:rFonts w:ascii="Arial" w:eastAsia="Arial" w:hAnsi="Arial" w:cs="Arial"/>
+          <w:color w:val="000000"/>
+          <w:highlight w:val="yellow"/>
+        </w:rPr>
+        <w:lastRenderedPageBreak/>
+        <w:t>SBIA se cumple la normativa vigente sobre privacidad y protección de datos personales, de acuerdo con lo que establezca la Autoridad Nacional de Protección de Datos Personales del Ministerio de Justicia y Derechos Humanos, conforme al artículo 26 del RLIA. Cuando la anonimización no resulte compatible con la finalidad del SBIA, la SUNAT admite la seudonimización; su justificación se documenta en la EIA o en la Ficha de Registro de SBIA, según corresponda.</w:t>
       </w:r>
       <w:r>
         <w:rPr>
@@ -11478,7 +11439,6 @@
           <w:color w:val="000000"/>
           <w:highlight w:val="cyan"/>
         </w:rPr>
-        <w:lastRenderedPageBreak/>
         <w:t>6.7.5</w:t>
       </w:r>
       <w:r>
@@ -11591,7 +11551,16 @@
           <w:highlight w:val="green"/>
         </w:rPr>
         <w:tab/>
-        <w:t xml:space="preserve">La Oficina de Seguridad Informática elabora y propone el documento normativo de seguridad informática para SBIA, que desarrolla la forma de implementar y verificar los controles del numeral 6.7.2 y la periodicidad de las pruebas de vulnerabilidad y del red teaming, conforme al artículo 106, literales a) y c), del ROF. Su aprobación se efectúa conforme al numeral 7.6. </w:t>
+        <w:t xml:space="preserve">La Oficina de Seguridad Informática elabora y propone el documento normativo de seguridad informática para SBIA, que desarrolla la forma de implementar y </w:t>
+      </w:r>
+      <w:r>
+        <w:rPr>
+          <w:rFonts w:ascii="Arial" w:eastAsia="Arial" w:hAnsi="Arial" w:cs="Arial"/>
+          <w:color w:val="000000"/>
+          <w:highlight w:val="green"/>
+        </w:rPr>
+        <w:lastRenderedPageBreak/>
+        <w:t xml:space="preserve">verificar los controles del numeral 6.7.2 y la periodicidad de las pruebas de vulnerabilidad y del red teaming, conforme al artículo 106, literales a) y c), del ROF. Su aprobación se efectúa conforme al numeral 7.6. </w:t>
       </w:r>
       <w:r>
         <w:rPr>
@@ -11618,7 +11587,6 @@
           <w:color w:val="000000"/>
           <w:highlight w:val="green"/>
         </w:rPr>
-        <w:lastRenderedPageBreak/>
         <w:t>6.7.8</w:t>
       </w:r>
       <w:r>
@@ -11780,7 +11748,16 @@
           <w:highlight w:val="green"/>
         </w:rPr>
         <w:tab/>
-        <w:t>El uso de datos protegidos por la reserva tributaria para el desarrollo, entrenamiento, validación u operación de un SBIA requiere la determinación previa de su base legal, conforme al artículo 85 del TUO del Código Tributario. La determinación es previa al inicio del desarrollo o adquisición y consta en la Ficha de Registro de SBIA (Anexo N.° 1). La determinación corresponde al propietario del caso de uso, y la Comisión de Gobierno de IA convoca a la Intendencia Nacional Jurídico Tributaria y, en materia aduanera, a la Intendencia Nacional Jurídico Aduanera, cuya opinión sustenta dicha determinación.</w:t>
+        <w:t xml:space="preserve">El uso de datos protegidos por la reserva tributaria para el desarrollo, entrenamiento, validación u operación de un SBIA requiere la determinación previa de su base legal, conforme al artículo 85 del TUO del Código Tributario. </w:t>
+      </w:r>
+      <w:r>
+        <w:rPr>
+          <w:rFonts w:ascii="Arial" w:eastAsia="Arial" w:hAnsi="Arial" w:cs="Arial"/>
+          <w:color w:val="000000"/>
+          <w:highlight w:val="green"/>
+        </w:rPr>
+        <w:lastRenderedPageBreak/>
+        <w:t>La determinación es previa al inicio del desarrollo o adquisición y consta en la Ficha de Registro de SBIA (Anexo N.° 1). La determinación corresponde al propietario del caso de uso, y la Comisión de Gobierno de IA convoca a la Intendencia Nacional Jurídico Tributaria y, en materia aduanera, a la Intendencia Nacional Jurídico Aduanera, cuya opinión sustenta dicha determinación.</w:t>
       </w:r>
     </w:p>
     <w:p>
@@ -11803,7 +11780,6 @@
           <w:color w:val="000000"/>
           <w:highlight w:val="yellow"/>
         </w:rPr>
-        <w:lastRenderedPageBreak/>
         <w:t>6.8.4</w:t>
       </w:r>
       <w:r>
@@ -11959,7 +11935,16 @@
           <w:highlight w:val="yellow"/>
         </w:rPr>
         <w:tab/>
-        <w:t>Los SBIA de riesgo alto cuentan con mecanismos de transparencia algorítmica que informan al usuario, de forma previa, clara y sencilla, la finalidad o uso del SBIA, sus funcionalidades principales y el tipo de decisiones que puede tomar, de modo que comprenda cómo interactúa con el SBIA o con el servicio que lo emplea</w:t>
+        <w:t xml:space="preserve">Los SBIA de riesgo alto cuentan con mecanismos de transparencia algorítmica que informan al usuario, de forma previa, clara y sencilla, la finalidad o uso del SBIA, sus funcionalidades principales y el tipo de decisiones que puede tomar, de modo que comprenda cómo interactúa con el SBIA o con el servicio que lo </w:t>
+      </w:r>
+      <w:r>
+        <w:rPr>
+          <w:rFonts w:ascii="Arial" w:eastAsia="Arial" w:hAnsi="Arial" w:cs="Arial"/>
+          <w:color w:val="000000"/>
+          <w:highlight w:val="yellow"/>
+        </w:rPr>
+        <w:lastRenderedPageBreak/>
+        <w:t>emplea</w:t>
       </w:r>
       <w:r>
         <w:rPr>
@@ -12009,7 +11994,6 @@
           <w:color w:val="000000"/>
           <w:highlight w:val="cyan"/>
         </w:rPr>
-        <w:lastRenderedPageBreak/>
         <w:t>6.9.2</w:t>
       </w:r>
       <w:r>
@@ -12112,6 +12096,7 @@
           <w:color w:val="000000"/>
           <w:highlight w:val="green"/>
         </w:rPr>
+        <w:lastRenderedPageBreak/>
         <w:t>6.9.5</w:t>
       </w:r>
       <w:r>
@@ -12121,16 +12106,7 @@
           <w:highlight w:val="green"/>
         </w:rPr>
         <w:tab/>
-        <w:t xml:space="preserve">La Comisión de Gobierno de IA reporta trimestralmente al CGTD el estado del Inventario Institucional de SBIA, los incidentes, los resultados del monitoreo, la verificación técnica de seguridad, el avance de la capacitación y el cumplimiento de los indicadores. El reporte comprende además el seguimiento de los encargos previsto en el numeral 7.6, el estado de las condiciones del PAIA previsto en el numeral 7.11 y el alineamiento previsto en el numeral 7.12. Dicho reporte constituye el informe trimestral de gobierno de IA. Da cuenta de </w:t>
-      </w:r>
-      <w:r>
-        <w:rPr>
-          <w:rFonts w:ascii="Arial" w:eastAsia="Arial" w:hAnsi="Arial" w:cs="Arial"/>
-          <w:color w:val="000000"/>
-          <w:highlight w:val="green"/>
-        </w:rPr>
-        <w:lastRenderedPageBreak/>
-        <w:t>la actividad de la Comisión de Gobierno de IA y no constituye avance del Plan de Gobierno Digital.</w:t>
+        <w:t>La Comisión de Gobierno de IA reporta trimestralmente al CGTD el estado del Inventario Institucional de SBIA, los incidentes, los resultados del monitoreo, la verificación técnica de seguridad, el avance de la capacitación y el cumplimiento de los indicadores. El reporte comprende además el seguimiento de los encargos previsto en el numeral 7.6, el estado de las condiciones del PAIA previsto en el numeral 7.11 y el alineamiento previsto en el numeral 7.12. Dicho reporte constituye el informe trimestral de gobierno de IA. Da cuenta de la actividad de la Comisión de Gobierno de IA y no constituye avance del Plan de Gobierno Digital.</w:t>
       </w:r>
     </w:p>
     <w:p>
@@ -12315,25 +12291,7 @@
           <w:color w:val="000000"/>
           <w:highlight w:val="green"/>
         </w:rPr>
-        <w:t xml:space="preserve">Cuando el plan de monitoreo prevea vigilancia automatizada, esta </w:t>
-      </w:r>
-      <w:proofErr w:type="spellStart"/>
-      <w:r>
-        <w:rPr>
-          <w:rFonts w:ascii="Arial" w:eastAsia="Arial" w:hAnsi="Arial" w:cs="Arial"/>
-          <w:color w:val="000000"/>
-          <w:highlight w:val="green"/>
-        </w:rPr>
-        <w:t>opera</w:t>
-      </w:r>
-      <w:proofErr w:type="spellEnd"/>
-      <w:r>
-        <w:rPr>
-          <w:rFonts w:ascii="Arial" w:eastAsia="Arial" w:hAnsi="Arial" w:cs="Arial"/>
-          <w:color w:val="000000"/>
-          <w:highlight w:val="green"/>
-        </w:rPr>
-        <w:t xml:space="preserve"> durante el horario de operación del SBIA, salvo que su criticidad justifique cobertura permanente, lo que se sustenta en el mismo plan.</w:t>
+        <w:t>Cuando el plan de monitoreo prevea vigilancia automatizada, esta opera durante el horario de operación del SBIA, salvo que su criticidad justifique cobertura permanente, lo que se sustenta en el mismo plan.</w:t>
       </w:r>
     </w:p>
     <w:p>
@@ -12352,6 +12310,7 @@
           <w:color w:val="000000"/>
           <w:highlight w:val="green"/>
         </w:rPr>
+        <w:lastRenderedPageBreak/>
         <w:t>Los criterios de determinación de la frecuencia, los tipos de monitoreo aplicables y su desarrollo operativo se establecen en la metodología prevista en el numeral 6.1.5.</w:t>
       </w:r>
     </w:p>
@@ -12380,16 +12339,7 @@
           <w:highlight w:val="green"/>
         </w:rPr>
         <w:tab/>
-        <w:t xml:space="preserve">La Comisión de Gobierno de IA define, para cada SBIA registrado en el Inventario, los indicadores de monitoreo que como mínimo incluyen: tasa de precisión, tasa de error, tiempo de respuesta, disponibilidad, detección de drift, indicadores de sesgo, tasa de intervención humana e indicadores de detección del uso irregular previstos en el numeral 6.10.6. Los umbrales de cada indicador, las alertas que su superación activa y las acciones de tratamiento </w:t>
-      </w:r>
-      <w:r>
-        <w:rPr>
-          <w:rFonts w:ascii="Arial" w:eastAsia="Arial" w:hAnsi="Arial" w:cs="Arial"/>
-          <w:color w:val="000000"/>
-          <w:highlight w:val="green"/>
-        </w:rPr>
-        <w:lastRenderedPageBreak/>
-        <w:t xml:space="preserve">correspondientes se definen con anterioridad a la puesta en producción del SBIA, conforme a la metodología prevista en el numeral 6.1.5. Tratándose de los indicadores de sesgo, el umbral se define con la opinión de la OII, que se pronuncia sobre los grupos que pueden resultar afectados y sobre la disparidad que resulta inaceptable. En tanto no se apruebe dicha metodología, se establecen en el plan de monitoreo que aprueba la Comisión de Gobierno de IA.</w:t>
+        <w:t>La Comisión de Gobierno de IA define, para cada SBIA registrado en el Inventario, los indicadores de monitoreo que como mínimo incluyen: tasa de precisión, tasa de error, tiempo de respuesta, disponibilidad, detección de drift, indicadores de sesgo, tasa de intervención humana e indicadores de detección del uso irregular previstos en el numeral 6.10.6. Los umbrales de cada indicador, las alertas que su superación activa y las acciones de tratamiento correspondientes se definen con anterioridad a la puesta en producción del SBIA, conforme a la metodología prevista en el numeral 6.1.5. Tratándose de los indicadores de sesgo, el umbral se define con la opinión de la OII, que se pronuncia sobre los grupos que pueden resultar afectados y sobre la disparidad que resulta inaceptable. En tanto no se apruebe dicha metodología, se establecen en el plan de monitoreo que aprueba la Comisión de Gobierno de IA.</w:t>
       </w:r>
       <w:r>
         <w:rPr>
@@ -12476,7 +12426,15 @@
           <w:highlight w:val="lightGray"/>
         </w:rPr>
         <w:tab/>
-        <w:t>Todo cambio sobre un SBIA en operación se gestiona de manera controlada y proporcional a su nivel de riesgo. Constituyen cambio, entre otros, el reentrenamiento o la recalibración del modelo, su sustitución o el cambio de versión del modelo base, la modificación de las fuentes o de la estructura de los datos de entrada, la ampliación de la finalidad o de la población objetivo del SBIA, y el cambio de proveedor. El propietario del caso de uso registra todo cambio en el Inventario Institucional de SBIA, lo califica como significativo o no conforme al numeral 6.10.5 y lo comunica a la Comisión de Gobierno de IA. La Comisión valida dicha calificación.</w:t>
+        <w:t xml:space="preserve">Todo cambio sobre un SBIA en operación se gestiona de manera controlada y proporcional a su nivel de riesgo. Constituyen cambio, entre otros, el reentrenamiento o la recalibración del modelo, su sustitución o el cambio de versión del modelo base, la modificación de las fuentes o de la estructura de los datos de entrada, la ampliación de la finalidad o de la población objetivo del SBIA, y el cambio de proveedor. El propietario del caso de uso registra todo cambio en el Inventario Institucional de SBIA, lo califica como significativo o no </w:t>
+      </w:r>
+      <w:r>
+        <w:rPr>
+          <w:rFonts w:ascii="Arial" w:hAnsi="Arial" w:cs="Arial"/>
+          <w:highlight w:val="lightGray"/>
+        </w:rPr>
+        <w:lastRenderedPageBreak/>
+        <w:t>conforme al numeral 6.10.5 y lo comunica a la Comisión de Gobierno de IA. La Comisión valida dicha calificación.</w:t>
       </w:r>
     </w:p>
     <w:p>
@@ -12515,15 +12473,7 @@
           <w:rFonts w:ascii="Arial" w:hAnsi="Arial" w:cs="Arial"/>
           <w:highlight w:val="lightGray"/>
         </w:rPr>
-        <w:t xml:space="preserve">cambio significativo requiere, con anterioridad a su puesta en producción: la revisión de la clasificación de riesgo conforme al numeral 6.2.2; la actualización de la EIA conforme al numeral 6.4.3, cuando corresponda; la verificación y validación conforme al numeral 6.10.3; y la aprobación prevista en el numeral 6.1.2. El despliegue del cambio se realiza con versión identificable y con un plan de reversión que permita restituir la </w:t>
-      </w:r>
-      <w:r>
-        <w:rPr>
-          <w:rFonts w:ascii="Arial" w:hAnsi="Arial" w:cs="Arial"/>
-          <w:highlight w:val="lightGray"/>
-        </w:rPr>
-        <w:lastRenderedPageBreak/>
-        <w:t>versión anterior del SBIA. La operación posterior al cambio es objeto de seguimiento reforzado durante el periodo que corresponda a su nivel de riesgo, conforme a la metodología prevista en el numeral 6.1.5.</w:t>
+        <w:t>cambio significativo requiere, con anterioridad a su puesta en producción: la revisión de la clasificación de riesgo conforme al numeral 6.2.2; la actualización de la EIA conforme al numeral 6.4.3, cuando corresponda; la verificación y validación conforme al numeral 6.10.3; y la aprobación prevista en el numeral 6.1.2. El despliegue del cambio se realiza con versión identificable y con un plan de reversión que permita restituir la versión anterior del SBIA. La operación posterior al cambio es objeto de seguimiento reforzado durante el periodo que corresponda a su nivel de riesgo, conforme a la metodología prevista en el numeral 6.1.5.</w:t>
       </w:r>
     </w:p>
     <w:p>
@@ -12742,6 +12692,7 @@
           <w:bCs w:val="0"/>
           <w:color w:val="000000"/>
         </w:rPr>
+        <w:lastRenderedPageBreak/>
         <w:t>Declarar el uso de IA en la elaboración de informes o documentos con impacto en decisiones administrativas.</w:t>
       </w:r>
     </w:p>
@@ -12812,7 +12763,6 @@
           <w:color w:val="000000"/>
           <w:highlight w:val="green"/>
         </w:rPr>
-        <w:lastRenderedPageBreak/>
         <w:t>6.11.3</w:t>
       </w:r>
       <w:r>
@@ -12886,12 +12836,21 @@
           <w:highlight w:val="cyan"/>
         </w:rPr>
         <w:tab/>
-        <w:t xml:space="preserve">La GA aprueba las herramientas de IA que pueden emplearse en la SUNAT, conforme a sus funciones (artículo 130, literal c, del ROF), y las registra en el catálogo institucional. </w:t>
+        <w:t xml:space="preserve">La GA aprueba las herramientas de IA que pueden emplearse en la SUNAT, conforme a sus funciones (artículo 130, literal c, del ROF), y las registra en el </w:t>
       </w:r>
       <w:r>
         <w:rPr>
           <w:rFonts w:ascii="Arial" w:hAnsi="Arial" w:cs="Arial"/>
           <w:color w:val="000000"/>
+          <w:highlight w:val="cyan"/>
+        </w:rPr>
+        <w:lastRenderedPageBreak/>
+        <w:t xml:space="preserve">catálogo institucional. </w:t>
+      </w:r>
+      <w:r>
+        <w:rPr>
+          <w:rFonts w:ascii="Arial" w:hAnsi="Arial" w:cs="Arial"/>
+          <w:color w:val="000000"/>
           <w:highlight w:val="green"/>
         </w:rPr>
         <w:t xml:space="preserve">La División de Gestión de Infraestructura Tecnológica y la División de Atención a Usuarios administran el inventario de software, cada una en el ámbito de su competencia, conforme al literal b) del artículo 140 y al literal e) del artículo 142 del ROF. A través de dicho inventario se verifica que los equipos informáticos tengan instalado únicamente software autorizado. </w:t>
@@ -12918,16 +12877,7 @@
           <w:color w:val="000000"/>
           <w:highlight w:val="green"/>
         </w:rPr>
-        <w:t xml:space="preserve">El registro, el control y el retiro de las herramientas de IA que requieren instalación en los equipos informáticos se rigen por el Procedimiento para el Registro, Control y Retiro de Software de la SUNAT (A-03.3.2-PR-01). La Gerencia de Operaciones y Soporte a Usuarios adecúa dicho procedimiento para </w:t>
-      </w:r>
-      <w:r>
-        <w:rPr>
-          <w:rFonts w:ascii="Arial" w:eastAsia="Arial" w:hAnsi="Arial" w:cs="Arial"/>
-          <w:color w:val="000000"/>
-          <w:highlight w:val="green"/>
-        </w:rPr>
-        <w:lastRenderedPageBreak/>
-        <w:t>comprender las herramientas de IA que se consumen como servicio y no requieren instalación, conforme al numeral 7.6 de la presente directiva. En tanto no se apruebe dicha adecuación, el alta y la baja de estas herramientas en el catálogo institucional se efectúan conforme al presente numeral.</w:t>
+        <w:t>El registro, el control y el retiro de las herramientas de IA que requieren instalación en los equipos informáticos se rigen por el Procedimiento para el Registro, Control y Retiro de Software de la SUNAT (A-03.3.2-PR-01). La Gerencia de Operaciones y Soporte a Usuarios adecúa dicho procedimiento para comprender las herramientas de IA que se consumen como servicio y no requieren instalación, conforme al numeral 7.6 de la presente directiva. En tanto no se apruebe dicha adecuación, el alta y la baja de estas herramientas en el catálogo institucional se efectúan conforme al presente numeral.</w:t>
       </w:r>
     </w:p>
     <w:p>
@@ -13053,7 +13003,16 @@
           <w:highlight w:val="green"/>
         </w:rPr>
         <w:tab/>
-        <w:t>La unidad de organización que formula los términos de referencia o las especificaciones técnicas incorpora en ellos la cláusula que prohíbe al proveedor y a su personal emplear la información de la SUNAT a la que accedan en ejecución del contrato, las instrucciones que se les remitan y los resultados derivados de su tratamiento, para entrenar, ajustar o mejorar sus modelos o para cualquier fin distinto de la ejecución del contrato. Tratándose de información sujeta a reserva tributaria, la prohibición se sustenta en el artículo 85 del Código Tributario, que extiende la obligación de reserva a quienes accedan a dicha información.</w:t>
+        <w:t xml:space="preserve">La unidad de organización que formula los términos de referencia o las especificaciones técnicas incorpora en ellos la cláusula que prohíbe al proveedor y a su personal emplear la información de la SUNAT a la que accedan en ejecución del contrato, las instrucciones que se les remitan y los resultados derivados de su tratamiento, para entrenar, ajustar o mejorar sus </w:t>
+      </w:r>
+      <w:r>
+        <w:rPr>
+          <w:rFonts w:ascii="Arial" w:eastAsia="Arial" w:hAnsi="Arial" w:cs="Arial"/>
+          <w:color w:val="000000"/>
+          <w:highlight w:val="green"/>
+        </w:rPr>
+        <w:lastRenderedPageBreak/>
+        <w:t>modelos o para cualquier fin distinto de la ejecución del contrato. Tratándose de información sujeta a reserva tributaria, la prohibición se sustenta en el artículo 85 del Código Tributario, que extiende la obligación de reserva a quienes accedan a dicha información.</w:t>
       </w:r>
     </w:p>
     <w:p>
@@ -13081,16 +13040,7 @@
           <w:highlight w:val="green"/>
         </w:rPr>
         <w:tab/>
-        <w:t xml:space="preserve">Para los SBIA de riesgo alto, los contratos obligan al proveedor a entregar la documentación técnica sobre los principios de funcionamiento del sistema, las fuentes de datos utilizadas y la lógica del algoritmo, conforme al numeral 31.1 del artículo 31 del RLIA, en la medida necesaria para el cumplimiento de las obligaciones de transparencia y explicabilidad de la SUNAT y con respeto del secreto industrial y comercial, conforme al numeral 25.1 del artículo 25 del RLIA. La Comisión de Gobierno de IA determina el alcance de la </w:t>
-      </w:r>
-      <w:r>
-        <w:rPr>
-          <w:rFonts w:ascii="Arial" w:eastAsia="Arial" w:hAnsi="Arial" w:cs="Arial"/>
-          <w:color w:val="000000"/>
-          <w:highlight w:val="green"/>
-        </w:rPr>
-        <w:lastRenderedPageBreak/>
-        <w:t>documentación exigible al evaluar el componente de IA del caso de uso. No se admiten soluciones de caja negra no auditables.</w:t>
+        <w:t>Para los SBIA de riesgo alto, los contratos obligan al proveedor a entregar la documentación técnica sobre los principios de funcionamiento del sistema, las fuentes de datos utilizadas y la lógica del algoritmo, conforme al numeral 31.1 del artículo 31 del RLIA, en la medida necesaria para el cumplimiento de las obligaciones de transparencia y explicabilidad de la SUNAT y con respeto del secreto industrial y comercial, conforme al numeral 25.1 del artículo 25 del RLIA. La Comisión de Gobierno de IA determina el alcance de la documentación exigible al evaluar el componente de IA del caso de uso. No se admiten soluciones de caja negra no auditables.</w:t>
       </w:r>
     </w:p>
     <w:p>
@@ -13428,6 +13378,7 @@
           <w:color w:val="000000"/>
           <w:highlight w:val="lightGray"/>
         </w:rPr>
+        <w:lastRenderedPageBreak/>
         <w:t>Las necesidades de capacitación asociadas a los distintos roles, los contenidos formativos, las modalidades de capacitación y los mecanismos de evaluación de resultados se determinan en el marco normativo del Plan de Desarrollo de las Personas. La Intendencia Nacional de Recursos Humanos las incorpora en dicho instrumento a propuesta de la Comisión de Gobierno de IA. En tanto no se incorporen, las acciones formativas en materia de IA se ejecutan conforme al presente numeral.</w:t>
       </w:r>
     </w:p>
@@ -13552,7 +13503,6 @@
           <w:color w:val="000000"/>
           <w:highlight w:val="lightGray"/>
         </w:rPr>
-        <w:lastRenderedPageBreak/>
         <w:t>La protección de datos personales.</w:t>
       </w:r>
     </w:p>
@@ -13789,7 +13739,16 @@
           <w:color w:val="000000"/>
           <w:highlight w:val="green"/>
         </w:rPr>
-        <w:t xml:space="preserve">La SUNAT promueve que su personal cumpla, en el desarrollo, la implementación y el uso de los SBIA, las normas del Código de Ética de la Función Pública, su Reglamento y las normas de integridad, así como las recomendaciones internacionales y los principios éticos de la Organización para la Cooperación y el Desarrollo Económico (OCDE) en materia de inteligencia artificial, conforme al numeral 28.9 del artículo 28 del RLIA. La OII supervisa en los SBIA el cumplimiento de los principios rectores establecidos en el artículo 7 del RLIA y de los compromisos de la Política de IA; evalúa los riesgos de sesgo y discriminación y administra el canal de consultas éticas en materia de IA. </w:t>
+        <w:t xml:space="preserve">La SUNAT promueve que su personal cumpla, en el desarrollo, la implementación y el uso de los SBIA, las normas del Código de Ética de la Función Pública, su Reglamento y las normas de integridad, así como las </w:t>
+      </w:r>
+      <w:r>
+        <w:rPr>
+          <w:rFonts w:ascii="Arial" w:eastAsia="Arial" w:hAnsi="Arial" w:cs="Arial"/>
+          <w:color w:val="000000"/>
+          <w:highlight w:val="green"/>
+        </w:rPr>
+        <w:lastRenderedPageBreak/>
+        <w:t xml:space="preserve">recomendaciones internacionales y los principios éticos de la Organización para la Cooperación y el Desarrollo Económico (OCDE) en materia de inteligencia artificial, conforme al numeral 28.9 del artículo 28 del RLIA. La OII supervisa en los SBIA el cumplimiento de los principios rectores establecidos en el artículo 7 del RLIA y de los compromisos de la Política de IA; evalúa los riesgos de sesgo y discriminación y administra el canal de consultas éticas en materia de IA. </w:t>
       </w:r>
       <w:r>
         <w:rPr>
@@ -13853,34 +13812,7 @@
           <w:color w:val="000000"/>
           <w:highlight w:val="yellow"/>
         </w:rPr>
-        <w:t xml:space="preserve"> </w:t>
-      </w:r>
-      <w:proofErr w:type="gramStart"/>
-      <w:r>
-        <w:rPr>
-          <w:rFonts w:ascii="Arial" w:eastAsia="Arial" w:hAnsi="Arial" w:cs="Arial"/>
-          <w:color w:val="000000"/>
-          <w:highlight w:val="yellow"/>
-        </w:rPr>
-        <w:t>son de aplicación</w:t>
-      </w:r>
-      <w:proofErr w:type="gramEnd"/>
-      <w:r>
-        <w:rPr>
-          <w:rFonts w:ascii="Arial" w:eastAsia="Arial" w:hAnsi="Arial" w:cs="Arial"/>
-          <w:color w:val="000000"/>
-          <w:highlight w:val="yellow"/>
-        </w:rPr>
-        <w:t xml:space="preserve"> en la SUNAT desde su entrada en vigencia. La Comisión de Gobierno de IA evalúa </w:t>
-      </w:r>
-      <w:r>
-        <w:rPr>
-          <w:rFonts w:ascii="Arial" w:eastAsia="Arial" w:hAnsi="Arial" w:cs="Arial"/>
-          <w:color w:val="000000"/>
-          <w:highlight w:val="yellow"/>
-        </w:rPr>
-        <w:lastRenderedPageBreak/>
-        <w:t>su impacto en la presente directiva y propone al CGTD los ajustes que correspondan.</w:t>
+        <w:t xml:space="preserve"> son de aplicación en la SUNAT desde su entrada en vigencia. La Comisión de Gobierno de IA evalúa su impacto en la presente directiva y propone al CGTD los ajustes que correspondan.</w:t>
       </w:r>
     </w:p>
     <w:p>
@@ -14035,7 +13967,16 @@
           <w:bCs w:val="0"/>
           <w:highlight w:val="green"/>
         </w:rPr>
-        <w:t>No favorable, cuando el uso es indebido conforme al artículo 23 del RLIA, contraviene la Política de IA o la normativa vigente, o el resultado esperado se alcanza sin inteligencia artificial. En este último caso la iniciativa puede continuar sin el componente de IA.</w:t>
+        <w:t xml:space="preserve">No favorable, cuando el uso es indebido conforme al artículo 23 del RLIA, contraviene la Política de IA o la normativa vigente, o el resultado esperado </w:t>
+      </w:r>
+      <w:r>
+        <w:rPr>
+          <w:b w:val="0"/>
+          <w:bCs w:val="0"/>
+          <w:highlight w:val="green"/>
+        </w:rPr>
+        <w:lastRenderedPageBreak/>
+        <w:t>se alcanza sin inteligencia artificial. En este último caso la iniciativa puede continuar sin el componente de IA.</w:t>
       </w:r>
     </w:p>
     <w:p>
@@ -14092,15 +14033,7 @@
           <w:highlight w:val="lightGray"/>
         </w:rPr>
         <w:tab/>
-        <w:t xml:space="preserve">En la gestión de la demanda informática, cuando un requerimiento implique el desarrollo, la adquisición o el uso de un SBIA o de una herramienta de IA, se recaba la opinión de la Comisión antes de su atención, con los formatos </w:t>
-      </w:r>
-      <w:r>
-        <w:rPr>
-          <w:rFonts w:ascii="Arial" w:hAnsi="Arial" w:cs="Arial"/>
-          <w:highlight w:val="lightGray"/>
-        </w:rPr>
-        <w:lastRenderedPageBreak/>
-        <w:t>vigentes de la demanda complementados con la información que la INSI determine.</w:t>
+        <w:t>En la gestión de la demanda informática, cuando un requerimiento implique el desarrollo, la adquisición o el uso de un SBIA o de una herramienta de IA, se recaba la opinión de la Comisión antes de su atención, con los formatos vigentes de la demanda complementados con la información que la INSI determine.</w:t>
       </w:r>
     </w:p>
     <w:p>
@@ -14318,7 +14251,15 @@
           <w:highlight w:val="green"/>
         </w:rPr>
         <w:tab/>
-        <w:t>Las unidades de organización competentes de cada instrumento de gestión incorporan en sus documentos normativos la verificación del componente de IA y la opinión de la Comisión de Gobierno de IA, conforme al numeral 7.6. Esta incorporación alcanza al Modelo de Gobernabilidad de Programas y Proyectos y a la gestión de la demanda informática. La presente directiva no sustituye dichos instrumentos.</w:t>
+        <w:t xml:space="preserve">Las unidades de organización competentes de cada instrumento de gestión incorporan en sus documentos normativos la verificación del componente de IA y la opinión de la Comisión de Gobierno de IA, conforme al numeral 7.6. Esta </w:t>
+      </w:r>
+      <w:r>
+        <w:rPr>
+          <w:rFonts w:ascii="Arial" w:hAnsi="Arial" w:cs="Arial"/>
+          <w:highlight w:val="green"/>
+        </w:rPr>
+        <w:lastRenderedPageBreak/>
+        <w:t>incorporación alcanza al Modelo de Gobernabilidad de Programas y Proyectos y a la gestión de la demanda informática. La presente directiva no sustituye dichos instrumentos.</w:t>
       </w:r>
     </w:p>
     <w:p>
@@ -16137,23 +16078,7 @@
                 <w:rFonts w:ascii="Arial" w:eastAsia="Arial" w:hAnsi="Arial" w:cs="Arial"/>
                 <w:lang w:val="en-US"/>
               </w:rPr>
-              <w:t xml:space="preserve">Human-in-the-loop, on-the-loop </w:t>
-            </w:r>
-            <w:proofErr w:type="gramStart"/>
-            <w:r>
-              <w:rPr>
-                <w:rFonts w:ascii="Arial" w:eastAsia="Arial" w:hAnsi="Arial" w:cs="Arial"/>
-                <w:lang w:val="en-US"/>
-              </w:rPr>
-              <w:t>o in</w:t>
-            </w:r>
-            <w:proofErr w:type="gramEnd"/>
-            <w:r>
-              <w:rPr>
-                <w:rFonts w:ascii="Arial" w:eastAsia="Arial" w:hAnsi="Arial" w:cs="Arial"/>
-                <w:lang w:val="en-US"/>
-              </w:rPr>
-              <w:t>-command.</w:t>
+              <w:t>Human-in-the-loop, on-the-loop o in-command.</w:t>
             </w:r>
           </w:p>
         </w:tc>
@@ -26421,6 +26346,16 @@
 </file>
 
 <file path=customXml/item1.xml><?xml version="1.0" encoding="utf-8"?>
+<p:properties xmlns:p="http://schemas.microsoft.com/office/2006/metadata/properties" xmlns:xsi="http://www.w3.org/2001/XMLSchema-instance" xmlns:pc="http://schemas.microsoft.com/office/infopath/2007/PartnerControls">
+  <documentManagement/>
+</p:properties>
+</file>
+
+<file path=customXml/item2.xml><?xml version="1.0" encoding="utf-8"?>
+<b:Sources xmlns:b="http://schemas.openxmlformats.org/officeDocument/2006/bibliography" xmlns="http://schemas.openxmlformats.org/officeDocument/2006/bibliography" SelectedStyle="\APASixthEditionOfficeOnline.xsl" StyleName="APA" Version="6"/>
+</file>
+
+<file path=customXml/item3.xml><?xml version="1.0" encoding="utf-8"?>
 <ct:contentTypeSchema xmlns:ct="http://schemas.microsoft.com/office/2006/metadata/contentType" xmlns:ma="http://schemas.microsoft.com/office/2006/metadata/properties/metaAttributes" ct:_="" ma:_="" ma:contentTypeName="Document" ma:contentTypeID="0x0101005C14AC06E2BCC9479AB1E7BFB85765A3" ma:contentTypeVersion="3" ma:contentTypeDescription="Create a new document." ma:contentTypeScope="" ma:versionID="7c0f1869e227914bb9e091b5d5366560">
   <xsd:schema xmlns:xsd="http://www.w3.org/2001/XMLSchema" xmlns:xs="http://www.w3.org/2001/XMLSchema" xmlns:p="http://schemas.microsoft.com/office/2006/metadata/properties" xmlns:ns2="fdb19afe-0f16-4040-a6da-335f4767bfc9" targetNamespace="http://schemas.microsoft.com/office/2006/metadata/properties" ma:root="true" ma:fieldsID="a498babe3b735ed6250eb2675f7bac41" ns2:_="">
     <xsd:import namespace="fdb19afe-0f16-4040-a6da-335f4767bfc9"/>
@@ -26558,16 +26493,6 @@
 </ct:contentTypeSchema>
 </file>
 
-<file path=customXml/item2.xml><?xml version="1.0" encoding="utf-8"?>
-<b:Sources xmlns:b="http://schemas.openxmlformats.org/officeDocument/2006/bibliography" xmlns="http://schemas.openxmlformats.org/officeDocument/2006/bibliography" SelectedStyle="\APASixthEditionOfficeOnline.xsl" StyleName="APA" Version="6"/>
-</file>
-
-<file path=customXml/item3.xml><?xml version="1.0" encoding="utf-8"?>
-<p:properties xmlns:p="http://schemas.microsoft.com/office/2006/metadata/properties" xmlns:xsi="http://www.w3.org/2001/XMLSchema-instance" xmlns:pc="http://schemas.microsoft.com/office/infopath/2007/PartnerControls">
-  <documentManagement/>
-</p:properties>
-</file>
-
 <file path=customXml/item4.xml><?xml version="1.0" encoding="utf-8"?>
 <?mso-contentType ?>
 <FormTemplates xmlns="http://schemas.microsoft.com/sharepoint/v3/contenttype/forms">
@@ -26578,6 +26503,23 @@
 </file>
 
 <file path=customXml/itemProps1.xml><?xml version="1.0" encoding="utf-8"?>
+<ds:datastoreItem xmlns:ds="http://schemas.openxmlformats.org/officeDocument/2006/customXml" ds:itemID="{E06D9414-6C68-4A1C-B889-BD6BE2EA8645}">
+  <ds:schemaRefs>
+    <ds:schemaRef ds:uri="http://schemas.microsoft.com/office/2006/metadata/properties"/>
+    <ds:schemaRef ds:uri="http://schemas.microsoft.com/office/infopath/2007/PartnerControls"/>
+  </ds:schemaRefs>
+</ds:datastoreItem>
+</file>
+
+<file path=customXml/itemProps2.xml><?xml version="1.0" encoding="utf-8"?>
+<ds:datastoreItem xmlns:ds="http://schemas.openxmlformats.org/officeDocument/2006/customXml" ds:itemID="{599D4DEC-5966-453E-8EBA-1FE602AD820F}">
+  <ds:schemaRefs>
+    <ds:schemaRef ds:uri="http://schemas.openxmlformats.org/officeDocument/2006/bibliography"/>
+  </ds:schemaRefs>
+</ds:datastoreItem>
+</file>
+
+<file path=customXml/itemProps3.xml><?xml version="1.0" encoding="utf-8"?>
 <ds:datastoreItem xmlns:ds="http://schemas.openxmlformats.org/officeDocument/2006/customXml" ds:itemID="{5C1C6231-2072-4263-80CD-99FB4E777A75}">
   <ds:schemaRefs>
     <ds:schemaRef ds:uri="http://schemas.microsoft.com/office/2006/metadata/contentType"/>
@@ -26595,23 +26537,6 @@
 </ds:datastoreItem>
 </file>
 
-<file path=customXml/itemProps2.xml><?xml version="1.0" encoding="utf-8"?>
-<ds:datastoreItem xmlns:ds="http://schemas.openxmlformats.org/officeDocument/2006/customXml" ds:itemID="{599D4DEC-5966-453E-8EBA-1FE602AD820F}">
-  <ds:schemaRefs>
-    <ds:schemaRef ds:uri="http://schemas.openxmlformats.org/officeDocument/2006/bibliography"/>
-  </ds:schemaRefs>
-</ds:datastoreItem>
-</file>
-
-<file path=customXml/itemProps3.xml><?xml version="1.0" encoding="utf-8"?>
-<ds:datastoreItem xmlns:ds="http://schemas.openxmlformats.org/officeDocument/2006/customXml" ds:itemID="{E06D9414-6C68-4A1C-B889-BD6BE2EA8645}">
-  <ds:schemaRefs>
-    <ds:schemaRef ds:uri="http://schemas.microsoft.com/office/2006/metadata/properties"/>
-    <ds:schemaRef ds:uri="http://schemas.microsoft.com/office/infopath/2007/PartnerControls"/>
-  </ds:schemaRefs>
-</ds:datastoreItem>
-</file>
-
 <file path=customXml/itemProps4.xml><?xml version="1.0" encoding="utf-8"?>
 <ds:datastoreItem xmlns:ds="http://schemas.openxmlformats.org/officeDocument/2006/customXml" ds:itemID="{007781DB-EED9-4359-8AD9-68137B52B701}">
   <ds:schemaRefs>

</xml_diff>

<commit_message>
docs: revisión de calidad (tanda 36) — ancla la confidencialidad aduanera al artículo 163 de la Ley General de Aduanas
- Base Normativa (DL N.° 1053): agrega su Reglamento (D.S. N.° 010-2009-EF) y precisa el articulo 163 sobre la naturaleza confidencial de la informacion obtenida para la gestion del riesgo aduanero
- 5.1.3: extiende el criterio determinante de riesgo a la informacion obtenida para la gestion del riesgo aduanero, cuya naturaleza confidencial reconoce el articulo 163 de la Ley General de Aduanas
- Glosario (Transparencia algoritmica) y 6.9.3: sustituyen la mencion generica a "la normativa sobre confidencialidad de la informacion aduanera" por la cita al articulo 163 de la Ley General de Aduanas
- Regenera el espejo de texto desde el .docx; 0 comentarios pendientes
</commit_message>
<xml_diff>
--- a/normativo/DIRECTIVA-GOBIERNO-IA.docx
+++ b/normativo/DIRECTIVA-GOBIERNO-IA.docx
@@ -2688,7 +2688,7 @@
           <w:bCs w:val="0"/>
           <w:color w:val="000000"/>
         </w:rPr>
-        <w:t>Decreto Legislativo N.° 1053 (27/06/2008), que aprueba la Ley General de Aduanas, y su Reglamento; en lo relativo a la confidencialidad de la información aduanera.</w:t>
+        <w:t>Decreto Legislativo N.° 1053 (27/06/2008), que aprueba la Ley General de Aduanas, y su Reglamento aprobado por Decreto Supremo N.° 010-2009-EF (16/01/2009); en particular el artículo 163 sobre la naturaleza confidencial de la información obtenida para la gestión del riesgo aduanero.</w:t>
       </w:r>
     </w:p>
     <w:p>
@@ -3985,7 +3985,7 @@
           <w:color w:val="000000"/>
           <w:highlight w:val="green"/>
         </w:rPr>
-        <w:t xml:space="preserve"> Puesta a disposición del usuario, en lenguaje claro y con anterioridad a su interacción, de la finalidad del SBIA, de sus funcionalidades principales, del tipo de decisiones en que interviene y de sus limitaciones conocidas. No comprende la entrega del modelo, de su código fuente, de sus parámetros, de los conjuntos de datos empleados en su entrenamiento ni de las reglas de detección de riesgo, cuya divulgación se sujeta a los límites derivados del artículo 85 del TUO del Código Tributario, de la normativa sobre confidencialidad de la información aduanera y de la normativa de protección de datos personales. [D.S. N.° 115-2025-PCM, artículo 25]</w:t>
+        <w:t xml:space="preserve"> Puesta a disposición del usuario, en lenguaje claro y con anterioridad a su interacción, de la finalidad del SBIA, de sus funcionalidades principales, del tipo de decisiones en que interviene y de sus limitaciones conocidas. No comprende la entrega del modelo, de su código fuente, de sus parámetros, de los conjuntos de datos empleados en su entrenamiento ni de las reglas de detección de riesgo, cuya divulgación se sujeta a los límites derivados del artículo 85 del TUO del Código Tributario, del artículo 163 de la Ley General de Aduanas y de la normativa de protección de datos personales. [D.S. N.° 115-2025-PCM, artículo 25]</w:t>
       </w:r>
     </w:p>
     <w:p>
@@ -4146,9 +4146,9 @@
           <w:color w:val="000000"/>
           <w:highlight w:val="yellow"/>
         </w:rPr>
-        <w:t>5.1.3</w:t>
+        <w:t>5.1.3La reserva tributaria constituye criterio determinante en la evaluación de riesgo de todo SBIA que procese información de contribuyentes. El mismo criterio aplica a la información obtenida para la gestión del riesgo aduanero, cuya naturaleza confidencial reconoce el artículo 163 de la Ley General de Aduanas.</w:t>
         <w:tab/>
-        <w:t>La reserva tributaria constituye criterio determinante en la evaluación de riesgo de todo SBIA que procese información de contribuyentes.</w:t>
+        <w:t/>
       </w:r>
     </w:p>
     <w:p>
@@ -11224,7 +11224,7 @@
           <w:color w:val="000000"/>
           <w:highlight w:val="green"/>
         </w:rPr>
-        <w:t>Constituyen mecanismos de explicabilidad, según el tipo de SBIA y entre otros: la identificación de las variables o factores que influyeron en el resultado y su peso relativo; la trazabilidad del resultado hacia las fuentes de información que lo sustentan; el registro de la cadena de razonamiento cuando el SBIA la produzca; y la documentación del modelo, que comprende su finalidad, la procedencia de los datos empleados, las métricas de desempeño y las limitaciones conocidas. El custodio técnico genera y mantiene actualizada dicha documentación como condición previa al despliegue del SBIA, y su existencia se verifica en la etapa de certificación y validación del numeral 6.1.1. La explicación se proporciona con el alcance que determina el numeral 25.3 del artículo 25 del RLIA y con las limitaciones que establecen las normas sobre reserva tributaria y sobre confidencialidad de la información aduanera. Los mecanismos exigibles por tipo de SBIA y el contenido mínimo de la documentación se desarrollan en la metodología prevista en el numeral 6.1.5.</w:t>
+        <w:t>Constituyen mecanismos de explicabilidad, según el tipo de SBIA y entre otros: la identificación de las variables o factores que influyeron en el resultado y su peso relativo; la trazabilidad del resultado hacia las fuentes de información que lo sustentan; el registro de la cadena de razonamiento cuando el SBIA la produzca; y la documentación del modelo, que comprende su finalidad, la procedencia de los datos empleados, las métricas de desempeño y las limitaciones conocidas. El custodio técnico genera y mantiene actualizada dicha documentación como condición previa al despliegue del SBIA, y su existencia se verifica en la etapa de certificación y validación del numeral 6.1.1. La explicación se proporciona con el alcance que determina el numeral 25.3 del artículo 25 del RLIA y con las limitaciones que establecen las normas sobre reserva tributaria y el artículo 163 de la Ley General de Aduanas. Los mecanismos exigibles por tipo de SBIA y el contenido mínimo de la documentación se desarrollan en la metodología prevista en el numeral 6.1.5.</w:t>
       </w:r>
     </w:p>
     <w:p>

</xml_diff>

<commit_message>
docs: revisión de calidad (tanda 38) — ajusta la articulación de la capacitación con el Plan de Desarrollo de las Personas
- 6.13.2: precisa que las necesidades de capacitacion, contenidos, modalidades y mecanismos de evaluacion se determinan en el marco del Plan de Desarrollo de las Personas (PDP), dentro de los plazos establecidos; el regimen supletorio aplica en tanto la Comision de Gobierno de IA no formule la propuesta para su incorporacion en el PDP
- Regenera el espejo de texto desde el .docx; 0 comentarios pendientes
</commit_message>
<xml_diff>
--- a/normativo/DIRECTIVA-GOBIERNO-IA.docx
+++ b/normativo/DIRECTIVA-GOBIERNO-IA.docx
@@ -346,7 +346,7 @@
           </mc:Choice>
           <mc:Fallback>
             <w:pict>
-              <v:roundrect w14:anchorId="09C86612" id="Rectángulo: esquinas redondeadas 2" o:spid="_x0000_s1026" style="width:140.65pt;height:47.5pt;visibility:visible;mso-wrap-style:square;mso-left-percent:-10001;mso-top-percent:-10001;mso-position-horizontal:absolute;mso-position-horizontal-relative:char;mso-position-vertical:absolute;mso-position-vertical-relative:line;mso-left-percent:-10001;mso-top-percent:-10001;v-text-anchor:top" arcsize="10923f" o:gfxdata="UEsDBBQABgAIAAAAIQC2gziS/gAAAOEBAAATAAAAW0NvbnRlbnRfVHlwZXNdLnhtbJSRQU7DMBBF 90jcwfIWJU67QAgl6YK0S0CoHGBkTxKLZGx5TGhvj5O2G0SRWNoz/78nu9wcxkFMGNg6quQqL6RA 0s5Y6ir5vt9lD1JwBDIwOMJKHpHlpr69KfdHjyxSmriSfYz+USnWPY7AufNIadK6MEJMx9ApD/oD OlTrorhX2lFEilmcO2RdNtjC5xDF9pCuTyYBB5bi6bQ4syoJ3g9WQ0ymaiLzg5KdCXlKLjvcW893 SUOqXwnz5DrgnHtJTxOsQfEKIT7DmDSUCaxw7Rqn8787ZsmRM9e2VmPeBN4uqYvTtW7jvijg9N/y JsXecLq0q+WD6m8AAAD//wMAUEsDBBQABgAIAAAAIQA4/SH/1gAAAJQBAAALAAAAX3JlbHMvLnJl bHOkkMFqwzAMhu+DvYPRfXGawxijTi+j0GvpHsDYimMaW0Yy2fr2M4PBMnrbUb/Q94l/f/hMi1qR JVI2sOt6UJgd+ZiDgffL8ekFlFSbvV0oo4EbChzGx4f9GRdb25HMsYhqlCwG5lrLq9biZkxWOiqY 22YiTra2kYMu1l1tQD30/bPm3wwYN0x18gb45AdQl1tp5j/sFB2T0FQ7R0nTNEV3j6o9feQzro1i OWA14Fm+Q8a1a8+Bvu/d/dMb2JY5uiPbhG/ktn4cqGU/er3pcvwCAAD//wMAUEsDBBQABgAIAAAA IQAvH5D5KwIAAFQEAAAOAAAAZHJzL2Uyb0RvYy54bWysVNuO0zAQfUfiHyy/0ySlTUvUdLXqUoS0 XMTCBzi2cwHHY2y3yfL1jJ22dIEnRB6sGY995syZcTY3Y6/IUVrXgS5pNkspkZqD6HRT0i+f9y/W lDjPtGAKtCzpo3T0Zvv82WYwhZxDC0pISxBEu2IwJW29N0WSON7KnrkZGKkxWIPtmUfXNomwbED0 XiXzNM2TAawwFrh0DnfvpiDdRvy6ltx/qGsnPVElRW4+rjauVViT7YYVjWWm7fiJBvsHFj3rNCa9 QN0xz8jBdn9A9R234KD2Mw59AnXdcRlrwGqy9LdqHlpmZKwFxXHmIpP7f7D8/fHBfLSBujP3wL85 omHXMt3IW2thaCUTmC4LQiWDccXlQnAcXiXV8A4EtpYdPEQNxtr2ARCrI2OU+vEitRw94biZrdb5 Yo0d4RjL05fzZexFworzbWOdfyOhJ8EoqYWDFp+wnzEFO947H/UWRLM+ZBdfKal7hd07MkWyPM9X kTQrTocR+4wZywXViX2nVHRsU+2UJXi1pPv4nS6762NKk6Gk8/VytYw0ngTdNUYav79hxELi2AVt X2sRbc86NdlIU+nAScbxxTrP0ge1w2C7wo/ViLvBrEA8YhMsTKONTxGNFuwPSgYc65K67wdmJSXq rcZGvsoWi/AOorNYrubo2OtIdR1hmiNUST0lk7nz09s5GNs1LWbKog4abrH5dXehOrE6jQyOLlpP 3sa1H0/9+hlsfwIAAP//AwBQSwMEFAAGAAgAAAAhAB7EOUjaAAAABAEAAA8AAABkcnMvZG93bnJl di54bWxMj8FOwzAQRO9I/QdrK3FB1E4QUEKcqlRC4koL4rqJt3HUeB3Fbhv+HsOFXlYazWjmbbma XC9ONIbOs4ZsoUAQN9503Gr42L3eLkGEiGyw90wavinAqppdlVgYf+Z3Om1jK1IJhwI12BiHQsrQ WHIYFn4gTt7ejw5jkmMrzYjnVO56mSv1IB12nBYsDrSx1By2R6dh32Q+f9zcvH3KiFn3pV52tbNa X8+n9TOISFP8D8MvfkKHKjHV/sgmiF5DeiT+3eTly+wORK3h6V6BrEp5CV/9AAAA//8DAFBLAQIt ABQABgAIAAAAIQC2gziS/gAAAOEBAAATAAAAAAAAAAAAAAAAAAAAAABbQ29udGVudF9UeXBlc10u eG1sUEsBAi0AFAAGAAgAAAAhADj9If/WAAAAlAEAAAsAAAAAAAAAAAAAAAAALwEAAF9yZWxzLy5y ZWxzUEsBAi0AFAAGAAgAAAAhAC8fkPkrAgAAVAQAAA4AAAAAAAAAAAAAAAAALgIAAGRycy9lMm9E b2MueG1sUEsBAi0AFAAGAAgAAAAhAB7EOUjaAAAABAEAAA8AAAAAAAAAAAAAAAAAhQQAAGRycy9k b3ducmV2LnhtbFBLBQYAAAAABAAEAPMAAACMBQAAAAA= " strokeweight="2.25pt">
+              <v:roundrect w14:anchorId="09C86612" id="Rectángulo: esquinas redondeadas 2" o:spid="_x0000_s1026" style="width:140.65pt;height:47.5pt;visibility:visible;mso-wrap-style:square;mso-left-percent:-10001;mso-top-percent:-10001;mso-position-horizontal:absolute;mso-position-horizontal-relative:char;mso-position-vertical:absolute;mso-position-vertical-relative:line;mso-left-percent:-10001;mso-top-percent:-10001;v-text-anchor:top" arcsize="10923f" o:gfxdata="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" strokeweight="2.25pt">
                 <v:shadow offset="6pt,6pt"/>
                 <v:textbox>
                   <w:txbxContent>
@@ -612,7 +612,23 @@
           <w:szCs w:val="22"/>
         </w:rPr>
         <w:fldChar w:fldCharType="begin"/>
+      </w:r>
+      <w:r>
+        <w:rPr>
+          <w:rFonts w:ascii="Arial" w:hAnsi="Arial" w:cs="Arial"/>
+          <w:bCs/>
+          <w:noProof w:val="0"/>
+          <w:szCs w:val="22"/>
+        </w:rPr>
         <w:instrText xml:space="preserve"> TOC \o "1-3" \h \z \u </w:instrText>
+      </w:r>
+      <w:r>
+        <w:rPr>
+          <w:rFonts w:ascii="Arial" w:hAnsi="Arial" w:cs="Arial"/>
+          <w:bCs/>
+          <w:noProof w:val="0"/>
+          <w:szCs w:val="22"/>
+        </w:rPr>
         <w:fldChar w:fldCharType="separate"/>
       </w:r>
       <w:hyperlink w:anchor="_Toc235003961" w:history="1">
@@ -646,10 +662,40 @@
             <w:webHidden/>
           </w:rPr>
           <w:tab/>
+        </w:r>
+        <w:r>
+          <w:rPr>
+            <w:webHidden/>
+          </w:rPr>
           <w:fldChar w:fldCharType="begin"/>
+        </w:r>
+        <w:r>
+          <w:rPr>
+            <w:webHidden/>
+          </w:rPr>
           <w:instrText xml:space="preserve"> PAGEREF _Toc235003961 \h </w:instrText>
+        </w:r>
+        <w:r>
+          <w:rPr>
+            <w:webHidden/>
+          </w:rPr>
+        </w:r>
+        <w:r>
+          <w:rPr>
+            <w:webHidden/>
+          </w:rPr>
           <w:fldChar w:fldCharType="separate"/>
+        </w:r>
+        <w:r>
+          <w:rPr>
+            <w:webHidden/>
+          </w:rPr>
           <w:t>5</w:t>
+        </w:r>
+        <w:r>
+          <w:rPr>
+            <w:webHidden/>
+          </w:rPr>
           <w:fldChar w:fldCharType="end"/>
         </w:r>
       </w:hyperlink>
@@ -697,10 +743,40 @@
             <w:webHidden/>
           </w:rPr>
           <w:tab/>
+        </w:r>
+        <w:r>
+          <w:rPr>
+            <w:webHidden/>
+          </w:rPr>
           <w:fldChar w:fldCharType="begin"/>
+        </w:r>
+        <w:r>
+          <w:rPr>
+            <w:webHidden/>
+          </w:rPr>
           <w:instrText xml:space="preserve"> PAGEREF _Toc235003962 \h </w:instrText>
+        </w:r>
+        <w:r>
+          <w:rPr>
+            <w:webHidden/>
+          </w:rPr>
+        </w:r>
+        <w:r>
+          <w:rPr>
+            <w:webHidden/>
+          </w:rPr>
           <w:fldChar w:fldCharType="separate"/>
+        </w:r>
+        <w:r>
+          <w:rPr>
+            <w:webHidden/>
+          </w:rPr>
           <w:t>5</w:t>
+        </w:r>
+        <w:r>
+          <w:rPr>
+            <w:webHidden/>
+          </w:rPr>
           <w:fldChar w:fldCharType="end"/>
         </w:r>
       </w:hyperlink>
@@ -748,10 +824,40 @@
             <w:webHidden/>
           </w:rPr>
           <w:tab/>
+        </w:r>
+        <w:r>
+          <w:rPr>
+            <w:webHidden/>
+          </w:rPr>
           <w:fldChar w:fldCharType="begin"/>
+        </w:r>
+        <w:r>
+          <w:rPr>
+            <w:webHidden/>
+          </w:rPr>
           <w:instrText xml:space="preserve"> PAGEREF _Toc235003963 \h </w:instrText>
+        </w:r>
+        <w:r>
+          <w:rPr>
+            <w:webHidden/>
+          </w:rPr>
+        </w:r>
+        <w:r>
+          <w:rPr>
+            <w:webHidden/>
+          </w:rPr>
           <w:fldChar w:fldCharType="separate"/>
+        </w:r>
+        <w:r>
+          <w:rPr>
+            <w:webHidden/>
+          </w:rPr>
           <w:t>5</w:t>
+        </w:r>
+        <w:r>
+          <w:rPr>
+            <w:webHidden/>
+          </w:rPr>
           <w:fldChar w:fldCharType="end"/>
         </w:r>
       </w:hyperlink>
@@ -799,10 +905,40 @@
             <w:webHidden/>
           </w:rPr>
           <w:tab/>
+        </w:r>
+        <w:r>
+          <w:rPr>
+            <w:webHidden/>
+          </w:rPr>
           <w:fldChar w:fldCharType="begin"/>
+        </w:r>
+        <w:r>
+          <w:rPr>
+            <w:webHidden/>
+          </w:rPr>
           <w:instrText xml:space="preserve"> PAGEREF _Toc235003964 \h </w:instrText>
+        </w:r>
+        <w:r>
+          <w:rPr>
+            <w:webHidden/>
+          </w:rPr>
+        </w:r>
+        <w:r>
+          <w:rPr>
+            <w:webHidden/>
+          </w:rPr>
           <w:fldChar w:fldCharType="separate"/>
+        </w:r>
+        <w:r>
+          <w:rPr>
+            <w:webHidden/>
+          </w:rPr>
           <w:t>8</w:t>
+        </w:r>
+        <w:r>
+          <w:rPr>
+            <w:webHidden/>
+          </w:rPr>
           <w:fldChar w:fldCharType="end"/>
         </w:r>
       </w:hyperlink>
@@ -850,10 +986,40 @@
             <w:webHidden/>
           </w:rPr>
           <w:tab/>
+        </w:r>
+        <w:r>
+          <w:rPr>
+            <w:webHidden/>
+          </w:rPr>
           <w:fldChar w:fldCharType="begin"/>
+        </w:r>
+        <w:r>
+          <w:rPr>
+            <w:webHidden/>
+          </w:rPr>
           <w:instrText xml:space="preserve"> PAGEREF _Toc235003965 \h </w:instrText>
+        </w:r>
+        <w:r>
+          <w:rPr>
+            <w:webHidden/>
+          </w:rPr>
+        </w:r>
+        <w:r>
+          <w:rPr>
+            <w:webHidden/>
+          </w:rPr>
           <w:fldChar w:fldCharType="separate"/>
+        </w:r>
+        <w:r>
+          <w:rPr>
+            <w:webHidden/>
+          </w:rPr>
           <w:t>10</w:t>
+        </w:r>
+        <w:r>
+          <w:rPr>
+            <w:webHidden/>
+          </w:rPr>
           <w:fldChar w:fldCharType="end"/>
         </w:r>
       </w:hyperlink>
@@ -901,10 +1067,40 @@
             <w:webHidden/>
           </w:rPr>
           <w:tab/>
+        </w:r>
+        <w:r>
+          <w:rPr>
+            <w:webHidden/>
+          </w:rPr>
           <w:fldChar w:fldCharType="begin"/>
+        </w:r>
+        <w:r>
+          <w:rPr>
+            <w:webHidden/>
+          </w:rPr>
           <w:instrText xml:space="preserve"> PAGEREF _Toc235003966 \h </w:instrText>
+        </w:r>
+        <w:r>
+          <w:rPr>
+            <w:webHidden/>
+          </w:rPr>
+        </w:r>
+        <w:r>
+          <w:rPr>
+            <w:webHidden/>
+          </w:rPr>
           <w:fldChar w:fldCharType="separate"/>
+        </w:r>
+        <w:r>
+          <w:rPr>
+            <w:webHidden/>
+          </w:rPr>
           <w:t>19</w:t>
+        </w:r>
+        <w:r>
+          <w:rPr>
+            <w:webHidden/>
+          </w:rPr>
           <w:fldChar w:fldCharType="end"/>
         </w:r>
       </w:hyperlink>
@@ -952,10 +1148,40 @@
             <w:webHidden/>
           </w:rPr>
           <w:tab/>
+        </w:r>
+        <w:r>
+          <w:rPr>
+            <w:webHidden/>
+          </w:rPr>
           <w:fldChar w:fldCharType="begin"/>
+        </w:r>
+        <w:r>
+          <w:rPr>
+            <w:webHidden/>
+          </w:rPr>
           <w:instrText xml:space="preserve"> PAGEREF _Toc235003967 \h </w:instrText>
+        </w:r>
+        <w:r>
+          <w:rPr>
+            <w:webHidden/>
+          </w:rPr>
+        </w:r>
+        <w:r>
+          <w:rPr>
+            <w:webHidden/>
+          </w:rPr>
           <w:fldChar w:fldCharType="separate"/>
+        </w:r>
+        <w:r>
+          <w:rPr>
+            <w:webHidden/>
+          </w:rPr>
           <w:t>47</w:t>
+        </w:r>
+        <w:r>
+          <w:rPr>
+            <w:webHidden/>
+          </w:rPr>
           <w:fldChar w:fldCharType="end"/>
         </w:r>
       </w:hyperlink>
@@ -1003,10 +1229,40 @@
             <w:webHidden/>
           </w:rPr>
           <w:tab/>
+        </w:r>
+        <w:r>
+          <w:rPr>
+            <w:webHidden/>
+          </w:rPr>
           <w:fldChar w:fldCharType="begin"/>
+        </w:r>
+        <w:r>
+          <w:rPr>
+            <w:webHidden/>
+          </w:rPr>
           <w:instrText xml:space="preserve"> PAGEREF _Toc235003968 \h </w:instrText>
+        </w:r>
+        <w:r>
+          <w:rPr>
+            <w:webHidden/>
+          </w:rPr>
+        </w:r>
+        <w:r>
+          <w:rPr>
+            <w:webHidden/>
+          </w:rPr>
           <w:fldChar w:fldCharType="separate"/>
+        </w:r>
+        <w:r>
+          <w:rPr>
+            <w:webHidden/>
+          </w:rPr>
           <w:t>49</w:t>
+        </w:r>
+        <w:r>
+          <w:rPr>
+            <w:webHidden/>
+          </w:rPr>
           <w:fldChar w:fldCharType="end"/>
         </w:r>
       </w:hyperlink>
@@ -2514,7 +2770,6 @@
           <w:bCs w:val="0"/>
           <w:color w:val="000000"/>
         </w:rPr>
-        <w:lastRenderedPageBreak/>
         <w:t>Decreto Legislativo N.° 1412 (13/09/2018), que aprueba la Ley de Gobierno Digital, y sus modificatorias.</w:t>
       </w:r>
     </w:p>
@@ -2563,6 +2818,7 @@
           <w:bCs w:val="0"/>
           <w:color w:val="000000"/>
         </w:rPr>
+        <w:lastRenderedPageBreak/>
         <w:t>Decreto Supremo N.° 029-2021-PCM (18/02/2021), que aprueba el Reglamento del Decreto Legislativo N.° 1412, y sus modificatorias aprobadas por Decreto Supremo N.° 075-2023-PCM y Decreto Supremo N.° 098-2025-PCM (31/07/2025).</w:t>
       </w:r>
     </w:p>
@@ -2956,6 +3212,7 @@
           <w:color w:val="000000"/>
           <w:highlight w:val="green"/>
         </w:rPr>
+        <w:lastRenderedPageBreak/>
         <w:t>Resolución de Superintendencia N.° 000114-2026/SUNAT (12/06/2026), que aprueba la actualización de los documentos del Sistema de Gestión de Seguridad de la Información de la SUNAT, entre ellos el Manual de Políticas del Sistema de Gestión de Seguridad de la Información (SGSI-MA-03), Versión 3.</w:t>
       </w:r>
     </w:p>
@@ -3008,7 +3265,6 @@
           <w:color w:val="000000"/>
           <w:highlight w:val="lightGray"/>
         </w:rPr>
-        <w:lastRenderedPageBreak/>
         <w:t>Resolución de Oficina N.° 000002-2023-SUNAT/1V0000 (22/12/2023), que aprueba la Metodología para la Gestión por Procesos (METGEP) Versión 5.0.</w:t>
       </w:r>
     </w:p>
@@ -3444,6 +3700,14 @@
           <w:highlight w:val="yellow"/>
         </w:rPr>
         <w:t xml:space="preserve">Proceso sistemático y documentado para identificar, analizar y evaluar los riesgos y efectos potenciales que un SBIA </w:t>
+      </w:r>
+      <w:r>
+        <w:rPr>
+          <w:b w:val="0"/>
+          <w:bCs w:val="0"/>
+          <w:color w:val="000000"/>
+          <w:highlight w:val="yellow"/>
+        </w:rPr>
         <w:lastRenderedPageBreak/>
         <w:t xml:space="preserve">genera sobre los derechos de los administrados, previo a su desarrollo, adquisición o implementación. </w:t>
       </w:r>
@@ -4020,6 +4284,30 @@
     </w:p>
     <w:p>
       <w:pPr>
+        <w:spacing w:after="0" w:line="276" w:lineRule="auto"/>
+        <w:rPr>
+          <w:color w:val="000000"/>
+        </w:rPr>
+      </w:pPr>
+    </w:p>
+    <w:p>
+      <w:pPr>
+        <w:spacing w:after="0" w:line="276" w:lineRule="auto"/>
+        <w:rPr>
+          <w:color w:val="000000"/>
+        </w:rPr>
+      </w:pPr>
+    </w:p>
+    <w:p>
+      <w:pPr>
+        <w:spacing w:after="0" w:line="276" w:lineRule="auto"/>
+        <w:rPr>
+          <w:color w:val="000000"/>
+        </w:rPr>
+      </w:pPr>
+    </w:p>
+    <w:p>
+      <w:pPr>
         <w:pStyle w:val="Ttulo1"/>
         <w:spacing w:line="276" w:lineRule="auto"/>
         <w:rPr>
@@ -4035,6 +4323,7 @@
           <w:color w:val="000000"/>
           <w:szCs w:val="22"/>
         </w:rPr>
+        <w:lastRenderedPageBreak/>
         <w:t>DISPOSICIONES GENERALES</w:t>
       </w:r>
       <w:bookmarkEnd w:id="5"/>
@@ -4047,6 +4336,8 @@
       </w:pPr>
       <w:r>
         <w:t>5.1</w:t>
+      </w:r>
+      <w:r>
         <w:tab/>
         <w:t>De los principios para el Gobierno de IA</w:t>
       </w:r>
@@ -4066,8 +4357,13 @@
           <w:rFonts w:ascii="Arial" w:eastAsia="Arial" w:hAnsi="Arial" w:cs="Arial"/>
           <w:color w:val="000000"/>
         </w:rPr>
-        <w:lastRenderedPageBreak/>
         <w:t>5.1.1</w:t>
+      </w:r>
+      <w:r>
+        <w:rPr>
+          <w:rFonts w:ascii="Arial" w:eastAsia="Arial" w:hAnsi="Arial" w:cs="Arial"/>
+          <w:color w:val="000000"/>
+        </w:rPr>
         <w:tab/>
       </w:r>
       <w:r>
@@ -4126,6 +4422,13 @@
           <w:highlight w:val="lightGray"/>
         </w:rPr>
         <w:t>5.1.2</w:t>
+      </w:r>
+      <w:r>
+        <w:rPr>
+          <w:rFonts w:ascii="Arial" w:hAnsi="Arial" w:cs="Arial"/>
+          <w:color w:val="000000"/>
+          <w:highlight w:val="lightGray"/>
+        </w:rPr>
         <w:tab/>
         <w:t xml:space="preserve">Los derechos fundamentales son intangibles y constituyen el límite de toda actuación administrativa. Por ello, cuando exista la posibilidad de que la operación de un SBIA pueda afectar los derechos fundamentales de las personas, se priorizará siempre la protección de éstos últimos. </w:t>
       </w:r>
@@ -4147,8 +4450,14 @@
           <w:highlight w:val="yellow"/>
         </w:rPr>
         <w:t>5.1.3La reserva tributaria constituye criterio determinante en la evaluación de riesgo de todo SBIA que procese información de contribuyentes. El mismo criterio aplica a la información obtenida para la gestión del riesgo aduanero, cuya naturaleza confidencial reconoce el artículo 163 de la Ley General de Aduanas.</w:t>
+      </w:r>
+      <w:r>
+        <w:rPr>
+          <w:rFonts w:ascii="Arial" w:eastAsia="Arial" w:hAnsi="Arial" w:cs="Arial"/>
+          <w:color w:val="000000"/>
+          <w:highlight w:val="yellow"/>
+        </w:rPr>
         <w:tab/>
-        <w:t/>
       </w:r>
     </w:p>
     <w:p>
@@ -4162,6 +4471,12 @@
           <w:highlight w:val="cyan"/>
         </w:rPr>
         <w:t>5.1.4</w:t>
+      </w:r>
+      <w:r>
+        <w:rPr>
+          <w:color w:val="000000"/>
+          <w:highlight w:val="cyan"/>
+        </w:rPr>
         <w:tab/>
         <w:t>El Gobierno de IA se orienta a la generación de valor público. Toda iniciativa de SBIA responde a un problema real y relevante de la administración y produce un beneficio verificable para las personas o para la gestión institucional; no se promueven usos de IA sin una necesidad que los justifique.</w:t>
       </w:r>
@@ -4183,6 +4498,13 @@
           <w:highlight w:val="yellow"/>
         </w:rPr>
         <w:t>5.1.5</w:t>
+      </w:r>
+      <w:r>
+        <w:rPr>
+          <w:rFonts w:ascii="Arial" w:eastAsia="Arial" w:hAnsi="Arial" w:cs="Arial"/>
+          <w:color w:val="000000"/>
+          <w:highlight w:val="yellow"/>
+        </w:rPr>
         <w:tab/>
         <w:t>El Gobierno de IA aplica el principio de proporcionalidad: las exigencias de evaluación, supervisión y control se gradúan según el nivel de riesgo del SBIA. La proporcionalidad no exime del cumplimiento de los controles y obligaciones que el RLIA y la presente directiva establecen con carácter obligatorio para cada categoría de riesgo.</w:t>
       </w:r>
@@ -4195,6 +4517,8 @@
       </w:pPr>
       <w:r>
         <w:t>5.2</w:t>
+      </w:r>
+      <w:r>
         <w:tab/>
         <w:t>De la función de Gobierno de Inteligencia Artificial</w:t>
       </w:r>
@@ -4215,6 +4539,12 @@
           <w:color w:val="000000"/>
         </w:rPr>
         <w:t>5.2.1</w:t>
+      </w:r>
+      <w:r>
+        <w:rPr>
+          <w:rFonts w:ascii="Arial" w:eastAsia="Arial" w:hAnsi="Arial" w:cs="Arial"/>
+          <w:color w:val="000000"/>
+        </w:rPr>
         <w:tab/>
         <w:t>El CGTD ejerce la función de gobierno de inteligencia artificial en la SUNAT, conforme al numeral 9.3 del artículo 9 del RLIA, aprobado por Decreto Supremo N.° 115-2025-PCM, y a la Resolución de Superintendencia N.° 084-2019/SUNAT que lo conforma, modificada por las Resoluciones de Superintendencia N.° 142-2019/SUNAT y N.° 000187-2024/SUNAT. El CGTD lidera, dirige, evalúa y supervisa los proyectos de SBIA estratégicos para la entidad. La calificación de estratégico corresponde al CGTD. Se efectúa a más tardar en el acto de aprobación de la clasificación de riesgo y consta en el acuerdo respectivo.</w:t>
       </w:r>
@@ -4227,6 +4557,8 @@
       </w:pPr>
       <w:r>
         <w:t>5.3</w:t>
+      </w:r>
+      <w:r>
         <w:tab/>
         <w:t>De la Comisión de Gobierno de IA</w:t>
       </w:r>
@@ -4248,6 +4580,13 @@
           <w:highlight w:val="green"/>
         </w:rPr>
         <w:t>5.3.1</w:t>
+      </w:r>
+      <w:r>
+        <w:rPr>
+          <w:rFonts w:ascii="Arial" w:eastAsia="Arial" w:hAnsi="Arial" w:cs="Arial"/>
+          <w:color w:val="000000"/>
+          <w:highlight w:val="green"/>
+        </w:rPr>
         <w:tab/>
         <w:t>Para el ejercicio efectivo de la función de gobierno de IA, el CGTD cuenta con la Comisión de Gobierno de IA, instancia de apoyo encargada de preparar las evaluaciones, los informes y las propuestas que el CGTD requiera para la toma de decisiones en materia de IA, y de ejercer las funciones de administración, supervisión y aprobación que la presente directiva le asigna. La Comisión de Gobierno de IA es coordinada por un Coordinador designado por el CGTD.</w:t>
       </w:r>
@@ -4267,7 +4606,14 @@
           <w:rFonts w:ascii="Arial" w:eastAsia="Arial" w:hAnsi="Arial" w:cs="Arial"/>
           <w:color w:val="000000"/>
         </w:rPr>
+        <w:lastRenderedPageBreak/>
         <w:t>5.3.2</w:t>
+      </w:r>
+      <w:r>
+        <w:rPr>
+          <w:rFonts w:ascii="Arial" w:eastAsia="Arial" w:hAnsi="Arial" w:cs="Arial"/>
+          <w:color w:val="000000"/>
+        </w:rPr>
         <w:tab/>
         <w:t>Las funciones de la Comisión de Gobierno de IA, en apoyo al CGTD, se definen en el numeral 5.4 y en las disposiciones específicas de la presente directiva.</w:t>
       </w:r>
@@ -4288,44 +4634,15 @@
           <w:color w:val="000000"/>
         </w:rPr>
         <w:t>5.3.3</w:t>
+      </w:r>
+      <w:r>
+        <w:rPr>
+          <w:rFonts w:ascii="Arial" w:eastAsia="Arial" w:hAnsi="Arial" w:cs="Arial"/>
+          <w:color w:val="000000"/>
+        </w:rPr>
         <w:tab/>
-        <w:t xml:space="preserve">La condición de integrante de la Comisión de Gobierno de IA no limita ni condiciona el ejercicio de las funciones que el ROF y la normativa institucional asignan a cada unidad de organización que la integra. En particular, la Oficina de Integridad Institucional ejerce con independencia la supervisión prevista en el numeral 6.14 y el tratamiento de las conductas que se le comuniquen </w:t>
-        <w:lastRenderedPageBreak/>
-        <w:t>conforme al numeral 6.10.6, y la Intendencia Nacional de Asesoría Legal Interna ejerce con independencia la asesoría y la revisión en materia de cumplimiento normativo.</w:t>
-      </w:r>
-    </w:p>
-    <w:p>
-      <w:pPr>
-        <w:spacing w:after="60" w:line="276" w:lineRule="auto"/>
-        <w:ind w:left="1276" w:hanging="720"/>
-        <w:jc w:val="both"/>
-        <w:rPr>
-          <w:rFonts w:ascii="Arial" w:eastAsia="Arial" w:hAnsi="Arial" w:cs="Arial"/>
-          <w:color w:val="000000"/>
-        </w:rPr>
-      </w:pPr>
-    </w:p>
-    <w:p>
-      <w:pPr>
-        <w:spacing w:after="60" w:line="276" w:lineRule="auto"/>
-        <w:ind w:left="1276" w:hanging="720"/>
-        <w:jc w:val="both"/>
-        <w:rPr>
-          <w:rFonts w:ascii="Arial" w:eastAsia="Arial" w:hAnsi="Arial" w:cs="Arial"/>
-          <w:color w:val="000000"/>
-        </w:rPr>
-      </w:pPr>
-    </w:p>
-    <w:p>
-      <w:pPr>
-        <w:spacing w:after="60" w:line="276" w:lineRule="auto"/>
-        <w:ind w:left="1276" w:hanging="720"/>
-        <w:jc w:val="both"/>
-        <w:rPr>
-          <w:rFonts w:ascii="Arial" w:eastAsia="Arial" w:hAnsi="Arial" w:cs="Arial"/>
-          <w:color w:val="000000"/>
-        </w:rPr>
-      </w:pPr>
+        <w:t>La condición de integrante de la Comisión de Gobierno de IA no limita ni condiciona el ejercicio de las funciones que el ROF y la normativa institucional asignan a cada unidad de organización que la integra. En particular, la Oficina de Integridad Institucional ejerce con independencia la supervisión prevista en el numeral 6.14 y el tratamiento de las conductas que se le comuniquen conforme al numeral 6.10.6, y la Intendencia Nacional de Asesoría Legal Interna ejerce con independencia la asesoría y la revisión en materia de cumplimiento normativo.</w:t>
+      </w:r>
     </w:p>
     <w:p>
       <w:pPr>
@@ -4335,6 +4652,8 @@
       </w:pPr>
       <w:r>
         <w:t>5.4</w:t>
+      </w:r>
+      <w:r>
         <w:tab/>
         <w:t>De los roles y responsabilidades</w:t>
       </w:r>
@@ -4356,14 +4675,6 @@
           <w:highlight w:val="yellow"/>
         </w:rPr>
         <w:t>Los roles y responsabilidades del Gobierno de IA se asignan tomando como referencia las competencias y funciones establecidas en el ROF vigente, sin duplicarlas ni sustituirlas, conforme se detallan en la siguiente tabla:</w:t>
-      </w:r>
-      <w:r>
-        <w:rPr>
-          <w:rFonts w:ascii="Arial" w:eastAsia="Arial" w:hAnsi="Arial" w:cs="Arial"/>
-          <w:color w:val="000000"/>
-          <w:highlight w:val="cyan"/>
-        </w:rPr>
-        <w:t xml:space="preserve"/>
       </w:r>
     </w:p>
     <w:tbl>
@@ -4862,7 +5173,16 @@
                 <w:bCs w:val="0"/>
                 <w:highlight w:val="green"/>
               </w:rPr>
-              <w:t xml:space="preserve">Aprueba la clasificación de riesgo de todos los SBIA conforme al numeral 6.2.2: de manera individual en los de riesgo alto y en los estratégicos para la entidad, y de manera agregada en los demás de riesgo aceptable. </w:t>
+              <w:t xml:space="preserve">Aprueba la clasificación de riesgo de todos los SBIA conforme al numeral 6.2.2: de manera individual en los de riesgo alto y en los </w:t>
+            </w:r>
+            <w:r>
+              <w:rPr>
+                <w:b w:val="0"/>
+                <w:bCs w:val="0"/>
+                <w:highlight w:val="green"/>
+              </w:rPr>
+              <w:lastRenderedPageBreak/>
+              <w:t xml:space="preserve">estratégicos para la entidad, y de manera agregada en los demás de riesgo aceptable. </w:t>
             </w:r>
           </w:p>
           <w:p>
@@ -4887,9 +5207,7 @@
                 <w:bCs w:val="0"/>
                 <w:highlight w:val="green"/>
               </w:rPr>
-              <w:t xml:space="preserve">Aprueba los casos de uso. Valida el Plan de Acción de Inteligencia Artificial, conforme al numeral 5.3 del artículo 5 de la Resolución </w:t>
-              <w:lastRenderedPageBreak/>
-              <w:t>Ministerial N.° 152-2026-PCM y al numeral 7.11 de la presente directiva.</w:t>
+              <w:t>Aprueba los casos de uso. Valida el Plan de Acción de Inteligencia Artificial, conforme al numeral 5.3 del artículo 5 de la Resolución Ministerial N.° 152-2026-PCM y al numeral 7.11 de la presente directiva.</w:t>
             </w:r>
           </w:p>
           <w:p>
@@ -6059,9 +6377,17 @@
                 <w:color w:val="000000"/>
                 <w:highlight w:val="green"/>
               </w:rPr>
-              <w:t xml:space="preserve">En materia de seguridad digital: asegura y supervisa la adopción de los estándares y normas técnicas de seguridad de la información cuando la INSI desarrolla, adquiere o terceriza SBIA, conforme al numeral 6.7.1. Propone las medidas de gestión de riesgos de seguridad de la información aplicables a los SBIA. El registro y la atención de los incidentes se rigen por el numeral 6.7.5; comunica al Centro Nacional de Seguridad Digital (CNSD) los incidentes de seguridad digital críticos que afecten los procesos misionales o los servicios de la entidad, y los informa a la máxima autoridad administrativa y al CGTD, conforme a la Directiva N.° 001-2023-PCM/SGTD.</w:t>
+              <w:t xml:space="preserve">En materia de seguridad digital: asegura y supervisa la adopción de los estándares y normas técnicas de seguridad de la información cuando </w:t>
+            </w:r>
+            <w:r>
+              <w:rPr>
+                <w:b w:val="0"/>
+                <w:bCs w:val="0"/>
+                <w:color w:val="000000"/>
+                <w:highlight w:val="green"/>
+              </w:rPr>
               <w:lastRenderedPageBreak/>
-              <w:t xml:space="preserve"> Cuando un SBIA constituya un activo de información de un proceso comprendido en el alcance del SGSI, coordina la aplicación de los controles que correspondan.</w:t>
+              <w:t>la INSI desarrolla, adquiere o terceriza SBIA, conforme al numeral 6.7.1. Propone las medidas de gestión de riesgos de seguridad de la información aplicables a los SBIA. El registro y la atención de los incidentes se rigen por el numeral 6.7.5; comunica al Centro Nacional de Seguridad Digital (CNSD) los incidentes de seguridad digital críticos que afecten los procesos misionales o los servicios de la entidad, y los informa a la máxima autoridad administrativa y al CGTD, conforme a la Directiva N.° 001-2023-PCM/SGTD. Cuando un SBIA constituya un activo de información de un proceso comprendido en el alcance del SGSI, coordina la aplicación de los controles que correspondan.</w:t>
             </w:r>
           </w:p>
         </w:tc>
@@ -6330,7 +6656,16 @@
                 <w:bCs w:val="0"/>
                 <w:highlight w:val="yellow"/>
               </w:rPr>
-              <w:t xml:space="preserve">En materia de asesoría jurídica y cumplimiento normativo: su opinión sobre la clasificación de riesgo consta de manera expresa en la propuesta, conforme al numeral 6.2.2. </w:t>
+              <w:t xml:space="preserve">En materia de asesoría jurídica y cumplimiento normativo: su opinión sobre la clasificación de riesgo consta de manera expresa en la </w:t>
+            </w:r>
+            <w:r>
+              <w:rPr>
+                <w:b w:val="0"/>
+                <w:bCs w:val="0"/>
+                <w:highlight w:val="yellow"/>
+              </w:rPr>
+              <w:lastRenderedPageBreak/>
+              <w:t xml:space="preserve">propuesta, conforme al numeral 6.2.2. </w:t>
             </w:r>
           </w:p>
           <w:p>
@@ -6355,7 +6690,6 @@
                 <w:bCs w:val="0"/>
                 <w:highlight w:val="yellow"/>
               </w:rPr>
-              <w:lastRenderedPageBreak/>
               <w:t xml:space="preserve">Asesora sobre el cumplimiento normativo de los SBIA. </w:t>
             </w:r>
             <w:r>
@@ -6681,6 +7015,7 @@
                 <w:b w:val="0"/>
                 <w:bCs w:val="0"/>
               </w:rPr>
+              <w:lastRenderedPageBreak/>
               <w:t>Revisa y aprueba el uso de nuevas tecnologías de IA, en el ámbito de su competencia.</w:t>
             </w:r>
           </w:p>
@@ -7907,7 +8242,7 @@
           <w:numId w:val="0"/>
         </w:numPr>
         <w:spacing w:after="0" w:line="276" w:lineRule="auto"/>
-        <w:ind w:left="709"/>
+        <w:ind w:left="709" w:hanging="709"/>
         <w:rPr>
           <w:rFonts w:cs="Arial"/>
           <w:szCs w:val="22"/>
@@ -7967,6 +8302,8 @@
       </w:pPr>
       <w:r>
         <w:t>6.1</w:t>
+      </w:r>
+      <w:r>
         <w:tab/>
         <w:t>Del ciclo de vida de los SBIA</w:t>
       </w:r>
@@ -7987,6 +8324,12 @@
           <w:color w:val="000000"/>
         </w:rPr>
         <w:t>6.1.1</w:t>
+      </w:r>
+      <w:r>
+        <w:rPr>
+          <w:rFonts w:ascii="Arial" w:eastAsia="Arial" w:hAnsi="Arial" w:cs="Arial"/>
+          <w:color w:val="000000"/>
+        </w:rPr>
         <w:tab/>
       </w:r>
       <w:r>
@@ -8537,6 +8880,12 @@
                 <w:highlight w:val="green"/>
               </w:rPr>
               <w:t xml:space="preserve">La Gerencia de Arquitectura conduce el diseño de la arquitectura del SBIA y las Divisiones de Arquitectura lo </w:t>
+            </w:r>
+            <w:r>
+              <w:rPr>
+                <w:rFonts w:ascii="Arial" w:eastAsia="Arial" w:hAnsi="Arial" w:cs="Arial"/>
+                <w:highlight w:val="green"/>
+              </w:rPr>
               <w:lastRenderedPageBreak/>
               <w:t>elaboran, conforme al numeral 6.5.1. Se define el mecanismo de supervisión humana, conforme al numeral 6.6. Para los SBIA de riesgo alto se elabora la EIA, conforme al numeral 6.4.</w:t>
             </w:r>
@@ -8573,6 +8922,12 @@
               </w:rPr>
               <w:lastRenderedPageBreak/>
               <w:t xml:space="preserve">Aprobación del diseño de la arquitectura de solución por la División de Arquitectura </w:t>
+            </w:r>
+            <w:r>
+              <w:rPr>
+                <w:rFonts w:ascii="Arial" w:eastAsia="Arial" w:hAnsi="Arial" w:cs="Arial"/>
+                <w:highlight w:val="green"/>
+              </w:rPr>
               <w:lastRenderedPageBreak/>
               <w:t>competente según la materia, conforme al numeral 6.5.4. Para SBIA de riesgo alto, aprobación de la EIA por el CGTD, previa al inicio del desarrollo, adquisición o implementación.</w:t>
             </w:r>
@@ -8850,8 +9205,20 @@
                 <w:highlight w:val="green"/>
               </w:rPr>
               <w:t xml:space="preserve">La Gerencia de Calidad de Sistemas conduce el control y aseguramiento de la calidad y la División de Control de Calidad efectúa la verificación y validación de la calidad, conforme al numeral 6.10.3. La Oficina de Seguridad Informática efectúa el análisis de riesgo y las </w:t>
+            </w:r>
+            <w:r>
+              <w:rPr>
+                <w:rFonts w:ascii="Arial" w:hAnsi="Arial" w:cs="Arial"/>
+                <w:highlight w:val="green"/>
+              </w:rPr>
               <w:lastRenderedPageBreak/>
               <w:t xml:space="preserve">pruebas de vulnerabilidad sobre la arquitectura de aplicaciones, de información y de infraestructura tecnológica que soporta el SBIA, incluido el red teaming para riesgo alto, y verifica la implementación de los requisitos de seguridad propuestos en la etapa anterior. El propietario del caso de uso verifica la implementación del mecanismo de supervisión humana conforme al numeral 6.6.2. La Comisión de Gobierno de IA verifica la implementación de los controles, del mecanismo de supervisión humana y de las medidas frente al sesgo, así como los resultados de las pruebas de sesgo, conforme a los numerales 6.2.5, 6.6.2 y 6.6.4. Asimismo, aprueba el plan de monitoreo del SBIA conforme al numeral 6.10.1. La aprobación requiere la conformidad de la División de Control de Calidad, de la Oficina de Seguridad Informática, del </w:t>
+            </w:r>
+            <w:r>
+              <w:rPr>
+                <w:rFonts w:ascii="Arial" w:hAnsi="Arial" w:cs="Arial"/>
+                <w:highlight w:val="green"/>
+              </w:rPr>
               <w:lastRenderedPageBreak/>
               <w:t>propietario del caso de uso y de la Comisión de Gobierno de IA. La titularidad de la aprobación se determina conforme al numeral 6.1.2.</w:t>
             </w:r>
@@ -9289,6 +9656,13 @@
           <w:highlight w:val="green"/>
         </w:rPr>
         <w:t>6.1.2</w:t>
+      </w:r>
+      <w:r>
+        <w:rPr>
+          <w:rFonts w:ascii="Arial" w:hAnsi="Arial" w:cs="Arial"/>
+          <w:color w:val="000000"/>
+          <w:highlight w:val="green"/>
+        </w:rPr>
         <w:tab/>
         <w:t>Los hitos de aprobación previstos en el numeral 6.1.1 son de carácter técnico. Recaen sobre el componente de IA y sobre su tránsito entre las etapas del ciclo de vida, y no constituyen aprobación de la iniciativa, del proyecto ni de la inversión, las cuales se rigen por los instrumentos de gestión institucionales y por las instancias competentes conforme al ROF. Dichos hitos corresponden al CGTD en los SBIA de riesgo alto y en los estratégicos para la entidad, y a la Comisión de Gobierno de IA en los SBIA de riesgo aceptable.</w:t>
       </w:r>
@@ -9321,6 +9695,13 @@
           <w:highlight w:val="yellow"/>
         </w:rPr>
         <w:t>6.1.3</w:t>
+      </w:r>
+      <w:r>
+        <w:rPr>
+          <w:rFonts w:ascii="Arial" w:eastAsia="Arial" w:hAnsi="Arial" w:cs="Arial"/>
+          <w:color w:val="000000"/>
+          <w:highlight w:val="yellow"/>
+        </w:rPr>
         <w:tab/>
       </w:r>
       <w:r>
@@ -9330,6 +9711,13 @@
           <w:highlight w:val="green"/>
         </w:rPr>
         <w:t xml:space="preserve">Los SBIA SaaS (enfoque A) siguen un ciclo de vida abreviado, que comprende cuando menos: el registro en el Inventario Institucional de SBIA, la clasificación de riesgo conforme al numeral 6.2 y las verificaciones previstas en el numeral </w:t>
+      </w:r>
+      <w:r>
+        <w:rPr>
+          <w:rFonts w:ascii="Arial" w:eastAsia="Arial" w:hAnsi="Arial" w:cs="Arial"/>
+          <w:color w:val="000000"/>
+          <w:highlight w:val="green"/>
+        </w:rPr>
         <w:lastRenderedPageBreak/>
         <w:t>6.12.3.</w:t>
       </w:r>
@@ -9362,6 +9750,13 @@
           <w:highlight w:val="green"/>
         </w:rPr>
         <w:t>6.1.4</w:t>
+      </w:r>
+      <w:r>
+        <w:rPr>
+          <w:rFonts w:ascii="Arial" w:eastAsia="Arial" w:hAnsi="Arial" w:cs="Arial"/>
+          <w:color w:val="000000"/>
+          <w:highlight w:val="green"/>
+        </w:rPr>
         <w:tab/>
         <w:t>El pronunciamiento de la Comisión de Gobierno de IA en los hitos del ciclo de vida recae sobre el componente de IA, conforme al numeral 6.15.1. Cuando la Ficha de Evaluación de Caso de Uso (Anexo N.° 4) no contiene la información necesaria para pronunciarse, la Comisión acompaña al propietario del caso de uso a completarla y se pronuncia una vez que la recibe. La falta de información no es causal de pronunciamiento no favorable. La Comisión otorga al propietario del caso de uso un plazo para completarla. Vencido el plazo sin que la información se complete, la Comisión eleva el caso al CGTD para que disponga lo que corresponda. El pronunciamiento no favorable se fundamenta por escrito y se eleva al CGTD. Cuando invoca el uso indebido o una contravención normativa, el CGTD verifica la causal y, si concurre, deja constancia en acta de que el caso de uso no procede. Cuando invoca que el resultado esperado se alcanza sin inteligencia artificial, el CGTD resuelve en acta si el caso de uso continúa con el componente de IA o sin él.</w:t>
       </w:r>
@@ -9383,6 +9778,13 @@
           <w:highlight w:val="lightGray"/>
         </w:rPr>
         <w:t>6.1.5</w:t>
+      </w:r>
+      <w:r>
+        <w:rPr>
+          <w:rFonts w:ascii="Arial" w:hAnsi="Arial" w:cs="Arial"/>
+          <w:color w:val="000000"/>
+          <w:highlight w:val="lightGray"/>
+        </w:rPr>
         <w:tab/>
         <w:t xml:space="preserve">La INSI desarrolla y aprueba, conforme a sus competencias, a la METDONI y al numeral 7.6, la metodología del ciclo de vida del SBIA previsto en el numeral 6.1.1. </w:t>
       </w:r>
@@ -9431,8 +9833,22 @@
           <w:highlight w:val="green"/>
         </w:rPr>
         <w:t>6.1.6</w:t>
+      </w:r>
+      <w:r>
+        <w:rPr>
+          <w:rFonts w:ascii="Arial" w:eastAsia="Arial" w:hAnsi="Arial" w:cs="Arial"/>
+          <w:color w:val="000000"/>
+          <w:highlight w:val="green"/>
+        </w:rPr>
         <w:tab/>
         <w:t xml:space="preserve">Todo SBIA cuenta con un equipo técnico multidisciplinario, conformado en función de la necesidad y la complejidad de la materia o del problema público que atiende, conforme al numeral 28.3 del artículo 28 del RLIA. El propietario del caso de uso y el custodio técnico lo conforman previamente al inicio del </w:t>
+      </w:r>
+      <w:r>
+        <w:rPr>
+          <w:rFonts w:ascii="Arial" w:eastAsia="Arial" w:hAnsi="Arial" w:cs="Arial"/>
+          <w:color w:val="000000"/>
+          <w:highlight w:val="green"/>
+        </w:rPr>
         <w:lastRenderedPageBreak/>
         <w:t>desarrollo o adquisición, y lo integran, cuando menos, con las unidades de organización cuya competencia comprenda las materias que el SBIA involucra. Su composición se registra en la Ficha de Registro de SBIA (Anexo N.° 1).</w:t>
       </w:r>
@@ -9445,6 +9861,8 @@
       </w:pPr>
       <w:r>
         <w:t>6.2</w:t>
+      </w:r>
+      <w:r>
         <w:tab/>
         <w:t>De la clasificación de los SBIA por nivel de riesgo</w:t>
       </w:r>
@@ -9466,6 +9884,13 @@
           <w:highlight w:val="cyan"/>
         </w:rPr>
         <w:t>6.2.1</w:t>
+      </w:r>
+      <w:r>
+        <w:rPr>
+          <w:rFonts w:ascii="Arial" w:hAnsi="Arial" w:cs="Arial"/>
+          <w:color w:val="000000"/>
+          <w:highlight w:val="cyan"/>
+        </w:rPr>
         <w:tab/>
         <w:t xml:space="preserve">La clasificación de riesgo determina, para cada iniciativa o SBIA de la SUNAT, la categoría de riesgo que genera su uso conforme al RLIA: uso indebido (artículo 23), riesgo alto (artículo 24) o riesgo aceptable (numeral 22.2 del artículo 22). El uso indebido deviene en prohibido; por ello, la SUNAT no desarrolla, adquiere, implementa ni opera SBIA cuyo uso sea indebido, y la clasificación los identifica y excluye en la etapa de evaluación de viabilidad, con anterioridad a su desarrollo o adquisición. </w:t>
       </w:r>
@@ -9495,6 +9920,13 @@
           <w:highlight w:val="green"/>
         </w:rPr>
         <w:t>6.2.2</w:t>
+      </w:r>
+      <w:r>
+        <w:rPr>
+          <w:rFonts w:ascii="Arial" w:eastAsia="Arial" w:hAnsi="Arial" w:cs="Arial"/>
+          <w:color w:val="000000"/>
+          <w:highlight w:val="green"/>
+        </w:rPr>
         <w:tab/>
       </w:r>
       <w:r>
@@ -9522,6 +9954,13 @@
           <w:highlight w:val="yellow"/>
         </w:rPr>
         <w:t>6.2.3</w:t>
+      </w:r>
+      <w:r>
+        <w:rPr>
+          <w:rFonts w:ascii="Arial" w:eastAsia="Arial" w:hAnsi="Arial" w:cs="Arial"/>
+          <w:color w:val="000000"/>
+          <w:highlight w:val="yellow"/>
+        </w:rPr>
         <w:tab/>
         <w:t xml:space="preserve">La SUNAT prohíbe el desarrollo, adquisición, implementación u operación de SBIA clasificados como de </w:t>
       </w:r>
@@ -9540,6 +9979,13 @@
           <w:highlight w:val="yellow"/>
         </w:rPr>
         <w:t xml:space="preserve">, conforme al artículo 23 del RLIA. Sin perjuicio de lo señalado en el literal e) del numeral 23.1 del citado artículo, no se consideran de uso indebido los SBIA utilizados para apoyar la evaluación humana sobre la implicación de una persona física en una actividad delictiva, siempre que se basen en hechos objetivos y verificables directamente relacionados con una actividad delictiva ya existente y cuenten con </w:t>
+      </w:r>
+      <w:r>
+        <w:rPr>
+          <w:rFonts w:ascii="Arial" w:eastAsia="Arial" w:hAnsi="Arial" w:cs="Arial"/>
+          <w:color w:val="000000"/>
+          <w:highlight w:val="yellow"/>
+        </w:rPr>
         <w:lastRenderedPageBreak/>
         <w:t>mecanismos de supervisión humana, transparencia y auditabilidad para garantizar la no discriminación y la protección de los derechos fundamentales, conforme al numeral 23.4 del citado artículo.</w:t>
       </w:r>
@@ -9560,6 +10006,12 @@
           <w:color w:val="000000"/>
         </w:rPr>
         <w:t>6.2.4</w:t>
+      </w:r>
+      <w:r>
+        <w:rPr>
+          <w:rFonts w:ascii="Arial" w:eastAsia="Arial" w:hAnsi="Arial" w:cs="Arial"/>
+          <w:color w:val="000000"/>
+        </w:rPr>
         <w:tab/>
       </w:r>
       <w:r>
@@ -9603,6 +10055,13 @@
           <w:highlight w:val="green"/>
         </w:rPr>
         <w:t>6.2.5</w:t>
+      </w:r>
+      <w:r>
+        <w:rPr>
+          <w:rFonts w:ascii="Arial" w:eastAsia="Arial" w:hAnsi="Arial" w:cs="Arial"/>
+          <w:color w:val="000000"/>
+          <w:highlight w:val="green"/>
+        </w:rPr>
         <w:tab/>
         <w:t>Los controles aplicables a un SBIA se determinan a partir de su clasificación de riesgo y de los criterios que la presente directiva establece según la naturaleza del SBIA, en particular en los numerales 6.5, 6.6, 6.7, 6.9 y 6.10. Los controles no se proponen ni se negocian. El propietario del caso de uso, con la asistencia técnica de la Comisión de Gobierno de IA, define cómo se implementan en el SBIA. La Comisión de Gobierno de IA verifica su implementación en la etapa 5 del numeral 6.1.1, con anterioridad al despliegue.</w:t>
       </w:r>
@@ -9624,6 +10083,13 @@
           <w:highlight w:val="green"/>
         </w:rPr>
         <w:t>6.2.6</w:t>
+      </w:r>
+      <w:r>
+        <w:rPr>
+          <w:rFonts w:ascii="Arial" w:eastAsia="Arial" w:hAnsi="Arial" w:cs="Arial"/>
+          <w:color w:val="000000"/>
+          <w:highlight w:val="green"/>
+        </w:rPr>
         <w:tab/>
         <w:t>Cuando se determine que un SBIA en operación corresponde a la categoría de uso indebido, el propietario del caso de uso dispone su suspensión inmediata y comunica el hecho a la Comisión de Gobierno de IA. La Comisión eleva el caso al CGTD, que verifica la causal conforme al numeral 6.1.4 y deja constancia en acta. Verificada la causal, el SBIA se retira conforme a la etapa 8 del numeral 6.1.1. La suspensión, su fecha y el acuerdo del CGTD constan en el Inventario Institucional de SBIA.</w:t>
       </w:r>
@@ -9636,6 +10102,8 @@
       </w:pPr>
       <w:r>
         <w:t>6.3</w:t>
+      </w:r>
+      <w:r>
         <w:tab/>
         <w:t>Del Inventario Institucional de SBIA</w:t>
       </w:r>
@@ -9656,6 +10124,12 @@
           <w:color w:val="000000"/>
         </w:rPr>
         <w:t>6.3.1</w:t>
+      </w:r>
+      <w:r>
+        <w:rPr>
+          <w:rFonts w:ascii="Arial" w:eastAsia="Arial" w:hAnsi="Arial" w:cs="Arial"/>
+          <w:color w:val="000000"/>
+        </w:rPr>
         <w:tab/>
         <w:t>La Comisión de Gobierno de IA administra el Inventario Institucional de SBIA, donde registra todos los SBIA de la SUNAT. El registro es obligatorio y previo al inicio del desarrollo o adquisición. El Anexo N.° 1 define los campos mínimos.</w:t>
       </w:r>
@@ -9676,6 +10150,12 @@
           <w:color w:val="000000"/>
         </w:rPr>
         <w:t>6.3.2</w:t>
+      </w:r>
+      <w:r>
+        <w:rPr>
+          <w:rFonts w:ascii="Arial" w:eastAsia="Arial" w:hAnsi="Arial" w:cs="Arial"/>
+          <w:color w:val="000000"/>
+        </w:rPr>
         <w:tab/>
         <w:t>La Comisión de Gobierno de IA actualiza el Inventario permanentemente y lo revisa integralmente al menos una vez al año.</w:t>
       </w:r>
@@ -9688,6 +10168,8 @@
       </w:pPr>
       <w:r>
         <w:t>6.4</w:t>
+      </w:r>
+      <w:r>
         <w:tab/>
         <w:t>De la evaluación de impacto algorítmico</w:t>
       </w:r>
@@ -9709,6 +10191,13 @@
           <w:highlight w:val="green"/>
         </w:rPr>
         <w:t>6.4.1</w:t>
+      </w:r>
+      <w:r>
+        <w:rPr>
+          <w:rFonts w:ascii="Arial" w:eastAsia="Arial" w:hAnsi="Arial" w:cs="Arial"/>
+          <w:color w:val="000000"/>
+          <w:highlight w:val="green"/>
+        </w:rPr>
         <w:tab/>
         <w:t xml:space="preserve">Todo SBIA de riesgo alto debe contar con una EIA aprobada por el CGTD previamente al inicio de su desarrollo, adquisición o implementación, conforme al artículo 30 del RLIA. </w:t>
       </w:r>
@@ -9738,8 +10227,22 @@
           <w:highlight w:val="green"/>
         </w:rPr>
         <w:t>6.4.2</w:t>
+      </w:r>
+      <w:r>
+        <w:rPr>
+          <w:rFonts w:ascii="Arial" w:hAnsi="Arial" w:cs="Arial"/>
+          <w:color w:val="000000"/>
+          <w:highlight w:val="green"/>
+        </w:rPr>
         <w:tab/>
         <w:t xml:space="preserve">El propietario del caso de uso elabora la EIA con la participación del equipo técnico multidisciplinario del SBIA previsto en el numeral 6.1.6. La EIA incorpora los aspectos de negocio (en particular el impacto en el administrado) y los aspectos técnicos. La Comisión de Gobierno de IA, la OII, la INALI y el OGD la revisan. Cuando la materia comprenda el sentido y el alcance de las normas tributarias o aduaneras, la Comisión de Gobierno de IA convoca a la Intendencia Nacional Jurídico Tributaria o a la Intendencia Nacional Jurídico </w:t>
+      </w:r>
+      <w:r>
+        <w:rPr>
+          <w:rFonts w:ascii="Arial" w:hAnsi="Arial" w:cs="Arial"/>
+          <w:color w:val="000000"/>
+          <w:highlight w:val="green"/>
+        </w:rPr>
         <w:lastRenderedPageBreak/>
         <w:t>Aduanera. Concluidas las revisiones, la Comisión de Gobierno de IA eleva la EIA al CGTD para su aprobación conforme al numeral 6.4.1.</w:t>
       </w:r>
@@ -9761,6 +10264,13 @@
           <w:highlight w:val="green"/>
         </w:rPr>
         <w:t>6.4.3</w:t>
+      </w:r>
+      <w:r>
+        <w:rPr>
+          <w:rFonts w:ascii="Arial" w:eastAsia="Arial" w:hAnsi="Arial" w:cs="Arial"/>
+          <w:color w:val="000000"/>
+          <w:highlight w:val="green"/>
+        </w:rPr>
         <w:tab/>
         <w:t>La Comisión de Gobierno de IA coordina la actualización de la EIA cuando se produzca un cambio significativo conforme al numeral 6.10.5. La EIA actualizada se revisa y se aprueba conforme al numeral 6.4.2, y su aprobación corresponde al CGTD conforme al numeral 6.4.1.</w:t>
       </w:r>
@@ -9782,6 +10292,13 @@
           <w:highlight w:val="yellow"/>
         </w:rPr>
         <w:t>6.4.4</w:t>
+      </w:r>
+      <w:r>
+        <w:rPr>
+          <w:rFonts w:ascii="Arial" w:eastAsia="Arial" w:hAnsi="Arial" w:cs="Arial"/>
+          <w:color w:val="000000"/>
+          <w:highlight w:val="yellow"/>
+        </w:rPr>
         <w:tab/>
         <w:t>Cuando la EIA detecte riesgos que afecten los derechos fundamentales o puedan generar decisiones automatizadas erróneas, el propietario del caso de uso y el equipo técnico del SBIA adoptan las medidas necesarias para mitigar los impactos y realizan los ajustes necesarios previos a la implementación final, entre ellos ajustes en los modelos, mejora en la calidad de los datos y mecanismos de supervisión humana. Dichas medidas quedan documentadas</w:t>
       </w:r>
@@ -9850,6 +10367,11 @@
           <w:highlight w:val="yellow"/>
         </w:rPr>
         <w:t>6.5</w:t>
+      </w:r>
+      <w:r>
+        <w:rPr>
+          <w:highlight w:val="yellow"/>
+        </w:rPr>
         <w:tab/>
         <w:t>De la arquitectura y el software de los SBIA</w:t>
       </w:r>
@@ -9871,6 +10393,13 @@
           <w:highlight w:val="green"/>
         </w:rPr>
         <w:t>6.5.1</w:t>
+      </w:r>
+      <w:r>
+        <w:rPr>
+          <w:rFonts w:ascii="Arial" w:eastAsia="Arial" w:hAnsi="Arial" w:cs="Arial"/>
+          <w:color w:val="000000"/>
+          <w:highlight w:val="green"/>
+        </w:rPr>
         <w:tab/>
         <w:t>La Gerencia de Arquitectura conduce el diseño de la arquitectura de los SBIA, conforme al literal a) del artículo 130 del ROF. La División de Arquitectura de Información y de Aplicaciones diseña la arquitectura de información y de aplicaciones de los SBIA, conforme a los literales a) y c) del artículo 132 del ROF; la División de Arquitectura Tecnológica diseña la arquitectura de su infraestructura tecnológica, conforme a los literales a) y c) del artículo 134 del ROF. La arquitectura de los SBIA promueve soluciones modulares y escalables y el uso de estándares abiertos que eviten la dependencia tecnológica de un único proveedor.</w:t>
       </w:r>
@@ -9892,6 +10421,13 @@
           <w:highlight w:val="green"/>
         </w:rPr>
         <w:t>6.5.2</w:t>
+      </w:r>
+      <w:r>
+        <w:rPr>
+          <w:rFonts w:ascii="Arial" w:eastAsia="Arial" w:hAnsi="Arial" w:cs="Arial"/>
+          <w:color w:val="000000"/>
+          <w:highlight w:val="green"/>
+        </w:rPr>
         <w:tab/>
         <w:t>El uso, la adquisición y la adecuación del software de los SBIA se sujetan a las disposiciones aplicables a las entidades de la Administración Pública, conforme al numeral 28.6 del artículo 28 del RLIA. Dichas disposiciones comprenden los estándares técnicos para la evaluación de software, los estándares técnicos sobre procesos del ciclo de vida del software y las evaluaciones del uso y aplicaciones del software de IA. Los estándares y documentos técnicos de arquitectura aplicables a los SBIA son los previstos en el numeral 6.5.3, y su cumplimiento se verifica en la aprobación del diseño de arquitectura de solución conforme al numeral 6.5.4.</w:t>
       </w:r>
@@ -9913,8 +10449,40 @@
           <w:highlight w:val="green"/>
         </w:rPr>
         <w:t>6.5.3</w:t>
+      </w:r>
+      <w:r>
+        <w:rPr>
+          <w:rFonts w:ascii="Arial" w:eastAsia="Arial" w:hAnsi="Arial" w:cs="Arial"/>
+          <w:color w:val="000000"/>
+          <w:highlight w:val="green"/>
+        </w:rPr>
         <w:tab/>
-        <w:t xml:space="preserve">El diseño de la arquitectura de los SBIA se sujeta a los Principios de Arquitectura de TI (AAT.PRAQ.01) y los Lineamientos de Arquitectura de TI (LAT.LIAQ.01) de la SUNAT, en sus versiones vigentes, en lo que corresponda a su naturaleza. La GA adecua dichos instrumentos y emite los estándares, modelos de referencia, patrones y demás documentos técnicos de arquitectura necesarios para incorporar los requisitos propios de los SBIA (modelos, conjuntos de datos, componentes generativos y agénticos, e infraestructura </w:t>
+        <w:t xml:space="preserve">El diseño de la arquitectura de los SBIA se sujeta a los Principios de Arquitectura de TI (AAT.PRAQ.01) y los Lineamientos de Arquitectura de TI (LAT.LIAQ.01) de la SUNAT, en sus versiones vigentes, en lo que corresponda a su naturaleza. La GA adecua dichos instrumentos y emite los estándares, modelos de referencia, patrones y demás documentos técnicos de arquitectura necesarios para incorporar los requisitos propios de los SBIA (modelos, conjuntos de datos, componentes generativos y </w:t>
+      </w:r>
+      <w:proofErr w:type="spellStart"/>
+      <w:r>
+        <w:rPr>
+          <w:rFonts w:ascii="Arial" w:eastAsia="Arial" w:hAnsi="Arial" w:cs="Arial"/>
+          <w:color w:val="000000"/>
+          <w:highlight w:val="green"/>
+        </w:rPr>
+        <w:t>agénticos</w:t>
+      </w:r>
+      <w:proofErr w:type="spellEnd"/>
+      <w:r>
+        <w:rPr>
+          <w:rFonts w:ascii="Arial" w:eastAsia="Arial" w:hAnsi="Arial" w:cs="Arial"/>
+          <w:color w:val="000000"/>
+          <w:highlight w:val="green"/>
+        </w:rPr>
+        <w:t xml:space="preserve">, e infraestructura </w:t>
+      </w:r>
+      <w:r>
+        <w:rPr>
+          <w:rFonts w:ascii="Arial" w:eastAsia="Arial" w:hAnsi="Arial" w:cs="Arial"/>
+          <w:color w:val="000000"/>
+          <w:highlight w:val="green"/>
+        </w:rPr>
         <w:lastRenderedPageBreak/>
         <w:t>especializada), en el ámbito de su competencia y conforme a los literales a) y c) del artículo 130 del ROF. Los que establezcan obligaciones exigibles a las unidades de organización se aprueban como documento normativo institucional conforme al numeral 7.6 de la presente directiva.</w:t>
       </w:r>
@@ -9937,6 +10505,13 @@
           <w:highlight w:val="green"/>
         </w:rPr>
         <w:t>6.5.4</w:t>
+      </w:r>
+      <w:r>
+        <w:rPr>
+          <w:rFonts w:ascii="Arial" w:eastAsia="Arial" w:hAnsi="Arial" w:cs="Arial"/>
+          <w:color w:val="000000"/>
+          <w:highlight w:val="green"/>
+        </w:rPr>
         <w:tab/>
         <w:t xml:space="preserve">Todo SBIA cuenta con la aprobación del diseño de su arquitectura de solución, previa al inicio del desarrollo, la adquisición o el entrenamiento, conforme a la etapa 3 del numeral 6.1.1. Dicha aprobación corresponde a la División de Arquitectura de Información y de Aplicaciones y a la División de Arquitectura Tecnológica, cada una en el ámbito de su competencia conforme al literal a) de los artículos 132 y 134 del ROF, bajo la conducción de la Gerencia de Arquitectura. </w:t>
       </w:r>
@@ -9967,6 +10542,13 @@
           <w:highlight w:val="green"/>
         </w:rPr>
         <w:t>6.5.5</w:t>
+      </w:r>
+      <w:r>
+        <w:rPr>
+          <w:rFonts w:ascii="Arial" w:eastAsia="Arial" w:hAnsi="Arial" w:cs="Arial"/>
+          <w:color w:val="000000"/>
+          <w:highlight w:val="green"/>
+        </w:rPr>
         <w:tab/>
         <w:t>Los SBIA que ejecuten acciones sobre sistemas, datos o procesos con algún grado de autonomía incorporan mecanismos de autorización, restricción y registro de dichas acciones. Dichos mecanismos son proporcionales al nivel de riesgo determinado conforme al numeral 6.2.2 y al grado de autonomía asignado. El propietario del caso de uso define el alcance de las acciones autorizadas; la División de Arquitectura de Información y de Aplicaciones aprueba el diseño de dichos mecanismos, conforme al literal a) del artículo 132 del ROF, y la División de Arquitectura Tecnológica valida los componentes de infraestructura tecnológica que los soportan, conforme al literal c) del artículo 134 del ROF, cada una en el ámbito de su competencia. Ambas validaciones se efectúan en la etapa 5 del numeral 6.1.1, con anterioridad al despliegue.</w:t>
       </w:r>
@@ -10028,6 +10610,13 @@
           <w:highlight w:val="lightGray"/>
         </w:rPr>
         <w:t>6.5.6</w:t>
+      </w:r>
+      <w:r>
+        <w:rPr>
+          <w:rFonts w:ascii="Arial" w:eastAsia="Arial" w:hAnsi="Arial" w:cs="Arial"/>
+          <w:color w:val="000000"/>
+          <w:highlight w:val="lightGray"/>
+        </w:rPr>
         <w:tab/>
         <w:t>Los SBIA generativos que utilicen información institucional incorporan mecanismos que vinculen los resultados generados con sus fuentes de información autorizadas y vigentes. Esta trazabilidad sustenta la explicabilidad exigida en el numeral 6.9.3.</w:t>
       </w:r>
@@ -10047,7 +10636,15 @@
           <w:rFonts w:ascii="Arial" w:eastAsia="Arial" w:hAnsi="Arial" w:cs="Arial"/>
           <w:color w:val="000000"/>
         </w:rPr>
-        <w:t xml:space="preserve">El propietario del caso de uso determina las fuentes de información que el SBIA consulta y su alcance; dichas fuentes constan en la Ficha de Registro de SBIA (Anexo N.° 1). La recuperación de información se sujeta a los permisos de acceso que corresponden al usuario que formula la consulta, conforme al control de acceso basado en roles previsto en el numeral 6.7.2. El tratamiento de información sujeta a reserva tributaria se rige, además, por el numeral 6.7.3.</w:t>
+        <w:t xml:space="preserve">El propietario del caso de uso determina las fuentes de información que el SBIA consulta y su alcance; dichas fuentes constan en la Ficha de Registro de SBIA (Anexo N.° 1). La recuperación de información se sujeta a los permisos de </w:t>
+      </w:r>
+      <w:r>
+        <w:rPr>
+          <w:rFonts w:ascii="Arial" w:eastAsia="Arial" w:hAnsi="Arial" w:cs="Arial"/>
+          <w:color w:val="000000"/>
+        </w:rPr>
+        <w:lastRenderedPageBreak/>
+        <w:t>acceso que corresponden al usuario que formula la consulta, conforme al control de acceso basado en roles previsto en el numeral 6.7.2. El tratamiento de información sujeta a reserva tributaria se rige, además, por el numeral 6.7.3.</w:t>
       </w:r>
     </w:p>
     <w:p>
@@ -10067,10 +10664,15 @@
           <w:highlight w:val="green"/>
         </w:rPr>
         <w:t>6.5.7</w:t>
+      </w:r>
+      <w:r>
+        <w:rPr>
+          <w:rFonts w:ascii="Arial" w:eastAsia="Arial" w:hAnsi="Arial" w:cs="Arial"/>
+          <w:color w:val="000000"/>
+          <w:highlight w:val="green"/>
+        </w:rPr>
         <w:tab/>
-        <w:t xml:space="preserve">La publicación del código fuente de los SBIA financiados con fondos públicos, con licencia libre o abierta en la Plataforma Nacional de Software Público Peruano (PNSSP), se sujeta a la determinación previa de su publicabilidad. </w:t>
-        <w:lastRenderedPageBreak/>
-        <w:t>Esta obligación está prevista en el numeral 28.8 del artículo 28 del RLIA. Dicha determinación verifica que el código no revele información sujeta a reserva tributaria conforme al artículo 85 del TUO del Código Tributario. Verifica asimismo que no revele reglas de detección de riesgo cuya divulgación comprometa la función de control.</w:t>
+        <w:t>La publicación del código fuente de los SBIA financiados con fondos públicos, con licencia libre o abierta en la Plataforma Nacional de Software Público Peruano (PNSSP), se sujeta a la determinación previa de su publicabilidad. Esta obligación está prevista en el numeral 28.8 del artículo 28 del RLIA. Dicha determinación verifica que el código no revele información sujeta a reserva tributaria conforme al artículo 85 del TUO del Código Tributario. Verifica asimismo que no revele reglas de detección de riesgo cuya divulgación comprometa la función de control.</w:t>
       </w:r>
     </w:p>
     <w:p>
@@ -10090,6 +10692,13 @@
           <w:highlight w:val="green"/>
         </w:rPr>
         <w:t>6.5.8</w:t>
+      </w:r>
+      <w:r>
+        <w:rPr>
+          <w:rFonts w:ascii="Arial" w:eastAsia="Arial" w:hAnsi="Arial" w:cs="Arial"/>
+          <w:color w:val="000000"/>
+          <w:highlight w:val="green"/>
+        </w:rPr>
         <w:tab/>
         <w:t>La GA conduce la determinación de publicabilidad prevista en el numeral 6.5.7. La efectúa antes de cada liberación mayor y, en todo caso, con ocasión de la revisión integral anual del Inventario Institucional de SBIA prevista en el numeral 6.3.2. La GA solicita para ello la opinión de la Oficina de Seguridad Informática y la de la INALI en materia de cumplimiento normativo. Cuando la determinación comprenda el sentido y el alcance de las normas tributarias o aduaneras, la GA solicita la opinión de la Intendencia Nacional Jurídico Tributaria o de la Intendencia Nacional Jurídico Aduanera, según la materia. La publicabilidad resulta de dichas opiniones. La determinación y su resultado constan en la Ficha de Registro de SBIA (Anexo N.° 1). Cuando el código no resulte publicable, se consigna igualmente la justificación legal de la restricción. La GDS pone a disposición el código fuente cuya publicación se haya determinado procedente, conforme a los mecanismos que establezca la Plataforma Nacional de Software Público Peruano.</w:t>
       </w:r>
@@ -10111,6 +10720,13 @@
           <w:highlight w:val="green"/>
         </w:rPr>
         <w:t>6.5.9</w:t>
+      </w:r>
+      <w:r>
+        <w:rPr>
+          <w:rFonts w:ascii="Arial" w:eastAsia="Arial" w:hAnsi="Arial" w:cs="Arial"/>
+          <w:color w:val="000000"/>
+          <w:highlight w:val="green"/>
+        </w:rPr>
         <w:tab/>
         <w:t>Los SBIA separan las funciones basadas en inferencia, generación o razonamiento probabilístico de aquellas que requieren un resultado determinístico. Constituyen funciones determinísticas, entre otras, los cálculos que determinan obligaciones o derechos, el cómputo de plazos, la aplicación de reglas normativas y de negocio, las validaciones de cumplimiento normativo y la ejecución de transacciones sobre los sistemas institucionales. El componente de IA puede interpretar, clasificar, recomendar u orquestar dichas funciones; su ejecución corresponde a los servicios, motores de reglas o componentes institucionales diseñados para tal fin. Esta separación se sustenta en la arquitectura de solución aprobada conforme al numeral 6.5.4, y sus criterios técnicos se desarrollan conforme al numeral 6.5.3.</w:t>
       </w:r>
@@ -10131,8 +10747,30 @@
           <w:color w:val="000000"/>
         </w:rPr>
         <w:t>6.5.10</w:t>
+      </w:r>
+      <w:r>
+        <w:rPr>
+          <w:rFonts w:ascii="Arial" w:eastAsia="Arial" w:hAnsi="Arial" w:cs="Arial"/>
+          <w:color w:val="000000"/>
+        </w:rPr>
         <w:tab/>
-        <w:t xml:space="preserve">Los SBIA pueden incorporar componentes que consulten, recuperen y analicen información de fuentes institucionales autorizadas para fundamentar los resultados que generan, y componentes que ejecuten acciones sobre sistemas, datos o procesos con algún grado de autonomía. Estos últimos se denominan componentes agénticos o agentes de IA. Su denominación no altera la aplicación de la presente directiva al SBIA que los incorpora.</w:t>
+        <w:t xml:space="preserve">Los SBIA pueden incorporar componentes que consulten, recuperen y analicen información de fuentes institucionales autorizadas para fundamentar los resultados que generan, y componentes que ejecuten acciones sobre sistemas, datos o procesos con algún grado de autonomía. Estos últimos se denominan componentes </w:t>
+      </w:r>
+      <w:proofErr w:type="spellStart"/>
+      <w:r>
+        <w:rPr>
+          <w:rFonts w:ascii="Arial" w:eastAsia="Arial" w:hAnsi="Arial" w:cs="Arial"/>
+          <w:color w:val="000000"/>
+        </w:rPr>
+        <w:t>agénticos</w:t>
+      </w:r>
+      <w:proofErr w:type="spellEnd"/>
+      <w:r>
+        <w:rPr>
+          <w:rFonts w:ascii="Arial" w:eastAsia="Arial" w:hAnsi="Arial" w:cs="Arial"/>
+          <w:color w:val="000000"/>
+        </w:rPr>
+        <w:t xml:space="preserve"> o agentes de IA. Su denominación no altera la aplicación de la presente directiva al SBIA que los incorpora.</w:t>
       </w:r>
     </w:p>
     <w:p>
@@ -10150,7 +10788,15 @@
           <w:rFonts w:ascii="Arial" w:eastAsia="Arial" w:hAnsi="Arial" w:cs="Arial"/>
           <w:color w:val="000000"/>
         </w:rPr>
-        <w:t xml:space="preserve">Cuando un SBIA incorpore ambos tipos de componentes, le son exigibles de manera concurrente los mecanismos previstos en los numerales 6.5.5 y 6.5.6, los controles del numeral 6.7.2, la modalidad de supervisión humana que corresponda conforme al numeral 6.6.1 y las medidas de protección de datos personales del numeral 6.7.4.</w:t>
+        <w:t xml:space="preserve">Cuando un SBIA incorpore ambos tipos de componentes, le son exigibles de manera concurrente los mecanismos previstos en los numerales 6.5.5 y 6.5.6, los controles del numeral 6.7.2, la modalidad de supervisión humana que </w:t>
+      </w:r>
+      <w:r>
+        <w:rPr>
+          <w:rFonts w:ascii="Arial" w:eastAsia="Arial" w:hAnsi="Arial" w:cs="Arial"/>
+          <w:color w:val="000000"/>
+        </w:rPr>
+        <w:lastRenderedPageBreak/>
+        <w:t>corresponda conforme al numeral 6.6.1 y las medidas de protección de datos personales del numeral 6.7.4.</w:t>
       </w:r>
     </w:p>
     <w:p>
@@ -10168,7 +10814,7 @@
           <w:rFonts w:ascii="Arial" w:eastAsia="Arial" w:hAnsi="Arial" w:cs="Arial"/>
           <w:color w:val="000000"/>
         </w:rPr>
-        <w:t xml:space="preserve">Estos SBIA operan como apoyo a la actuación de la unidad de organización competente; su resultado no sustituye la decisión que a esta corresponde adoptar conforme a la normativa aplicable.</w:t>
+        <w:t>Estos SBIA operan como apoyo a la actuación de la unidad de organización competente; su resultado no sustituye la decisión que a esta corresponde adoptar conforme a la normativa aplicable.</w:t>
       </w:r>
     </w:p>
     <w:p>
@@ -10179,6 +10825,8 @@
       </w:pPr>
       <w:r>
         <w:t>6.6</w:t>
+      </w:r>
+      <w:r>
         <w:tab/>
         <w:t>De la supervisión humana</w:t>
       </w:r>
@@ -10200,6 +10848,13 @@
           <w:highlight w:val="green"/>
         </w:rPr>
         <w:t>6.6.1</w:t>
+      </w:r>
+      <w:r>
+        <w:rPr>
+          <w:rFonts w:ascii="Arial" w:eastAsia="Arial" w:hAnsi="Arial" w:cs="Arial"/>
+          <w:color w:val="000000"/>
+          <w:highlight w:val="green"/>
+        </w:rPr>
         <w:tab/>
         <w:t>Todo SBIA cuenta con un mecanismo de supervisión humana proporcional a su nivel de riesgo, conforme al literal h) del artículo 7 del RLIA. La modalidad de supervisión humana exigible a cada SBIA es la siguiente. Los casos de uso que se mencionan son enunciativos y no sustituyen la clasificación de riesgo prevista en el numeral 6.2.1:</w:t>
       </w:r>
@@ -10251,9 +10906,7 @@
           <w:color w:val="000000"/>
           <w:highlight w:val="green"/>
         </w:rPr>
-        <w:t xml:space="preserve">Human-on-the-loop (obligatorio para los SBIA de riesgo aceptable que interactúan directamente con el administrado o cuyo resultado influye en la </w:t>
-        <w:lastRenderedPageBreak/>
-        <w:t>atención que este recibe): Un supervisor humano monitorea las operaciones del SBIA y puede intervenir ante anomalías, sin validar cada resultado individual. Aplica, entre otros, a chatbots de atención, asistentes de orientación y preclasificación.</w:t>
+        <w:t>Human-on-the-loop (obligatorio para los SBIA de riesgo aceptable que interactúan directamente con el administrado o cuyo resultado influye en la atención que este recibe): Un supervisor humano monitorea las operaciones del SBIA y puede intervenir ante anomalías, sin validar cada resultado individual. Aplica, entre otros, a chatbots de atención, asistentes de orientación y preclasificación.</w:t>
       </w:r>
     </w:p>
     <w:p>
@@ -10298,6 +10951,13 @@
           <w:highlight w:val="yellow"/>
         </w:rPr>
         <w:t>6.6.2</w:t>
+      </w:r>
+      <w:r>
+        <w:rPr>
+          <w:rFonts w:ascii="Arial" w:eastAsia="Arial" w:hAnsi="Arial" w:cs="Arial"/>
+          <w:color w:val="000000"/>
+          <w:highlight w:val="yellow"/>
+        </w:rPr>
         <w:tab/>
         <w:t>El propietario del caso de uso, con la asistencia técnica de la Comisión de Gobierno de IA, define el mecanismo específico de supervisión humana del SBIA. La definición se efectúa conforme a la clasificación de riesgo determinada según el numeral 6.2.2. Dicha definición se documenta en la Ficha de Registro de SBIA (Anexo N.° 1) y en la EIA cuando corresponda. El mecanismo requiere la conformidad de la Comisión de Gobierno de IA en la etapa 5 del numeral 6.1.1, con anterioridad al despliegue.</w:t>
       </w:r>
@@ -10318,6 +10978,12 @@
           <w:color w:val="000000"/>
         </w:rPr>
         <w:t>6.6.3</w:t>
+      </w:r>
+      <w:r>
+        <w:rPr>
+          <w:rFonts w:ascii="Arial" w:eastAsia="Arial" w:hAnsi="Arial" w:cs="Arial"/>
+          <w:color w:val="000000"/>
+        </w:rPr>
         <w:tab/>
         <w:t>El propietario del caso de uso garantiza que el personal de supervisión cumple con las siguientes condiciones:</w:t>
       </w:r>
@@ -10366,7 +11032,17 @@
           <w:color w:val="000000"/>
           <w:highlight w:val="yellow"/>
         </w:rPr>
-        <w:t>Ha recibido capacitación específica sobre el funcionamiento, las limitaciones y los riesgos del SBIA que supervisa, incluyendo la identificación y prevención de sesgos algorítmicos, a fin de no sesgarse por los resultados del sistema</w:t>
+        <w:t xml:space="preserve">Ha recibido capacitación específica sobre el funcionamiento, las limitaciones y los riesgos del SBIA que supervisa, incluyendo la </w:t>
+      </w:r>
+      <w:r>
+        <w:rPr>
+          <w:b w:val="0"/>
+          <w:bCs w:val="0"/>
+          <w:color w:val="000000"/>
+          <w:highlight w:val="yellow"/>
+        </w:rPr>
+        <w:lastRenderedPageBreak/>
+        <w:t>identificación y prevención de sesgos algorítmicos, a fin de no sesgarse por los resultados del sistema</w:t>
       </w:r>
       <w:r>
         <w:rPr>
@@ -10428,7 +11104,7 @@
           <w:bCs w:val="0"/>
           <w:color w:val="000000"/>
         </w:rPr>
-        <w:t xml:space="preserve">No está sujeto a incentivos, metas ni criterios de evaluación del desempeño que condicionen su juicio a la aceptación de los resultados del SBIA.</w:t>
+        <w:t>No está sujeto a incentivos, metas ni criterios de evaluación del desempeño que condicionen su juicio a la aceptación de los resultados del SBIA.</w:t>
       </w:r>
     </w:p>
     <w:p>
@@ -10471,6 +11147,12 @@
           <w:color w:val="000000"/>
         </w:rPr>
         <w:t>6.6.4</w:t>
+      </w:r>
+      <w:r>
+        <w:rPr>
+          <w:rFonts w:ascii="Arial" w:eastAsia="Arial" w:hAnsi="Arial" w:cs="Arial"/>
+          <w:color w:val="000000"/>
+        </w:rPr>
         <w:tab/>
         <w:t xml:space="preserve">El propietario del caso de uso, con el custodio técnico, incorpora en todo SBIA, independientemente de su nivel de riesgo, medidas proporcionales para prevenir, detectar y corregir resultados discriminatorios o sesgados que puedan afectar a los administrados, conforme al literal a) del artículo 7 del RLIA y al compromiso 6 de la </w:t>
       </w:r>
@@ -10494,9 +11176,7 @@
           <w:rFonts w:ascii="Arial" w:eastAsia="Arial" w:hAnsi="Arial" w:cs="Arial"/>
           <w:color w:val="000000"/>
         </w:rPr>
-        <w:t xml:space="preserve"> Con anterioridad al despliegue, la ejecución de las pruebas que sustentan la medición inicial de los indicadores de sesgo previstos en el numeral 6.10.2 corresponde a la División de Control de Calidad, como prueba no funcional, conforme al literal a) del artículo 126 del ROF. Durante la operación, la medición de dichos indicadores se efectúa conforme </w:t>
-        <w:lastRenderedPageBreak/>
-        <w:t xml:space="preserve">al numeral 6.10.2. La metodología prevista en el numeral 6.1.5 desarrolla las pruebas aplicables según el tipo de SBIA. </w:t>
+        <w:t xml:space="preserve"> Con anterioridad al despliegue, la ejecución de las pruebas que sustentan la medición inicial de los indicadores de sesgo previstos en el numeral 6.10.2 corresponde a la División de Control de Calidad, como prueba no funcional, conforme al literal a) del artículo 126 del ROF. Durante la operación, la medición de dichos indicadores se efectúa conforme al numeral 6.10.2. La metodología prevista en el numeral 6.1.5 desarrolla las pruebas aplicables según el tipo de SBIA. </w:t>
       </w:r>
       <w:r>
         <w:rPr>
@@ -10515,6 +11195,8 @@
       </w:pPr>
       <w:r>
         <w:t>6.7</w:t>
+      </w:r>
+      <w:r>
         <w:tab/>
         <w:t>De la seguridad y privacidad en SBIA</w:t>
       </w:r>
@@ -10536,8 +11218,33 @@
           <w:highlight w:val="green"/>
         </w:rPr>
         <w:t>6.7.1</w:t>
+      </w:r>
+      <w:r>
+        <w:rPr>
+          <w:rFonts w:ascii="Arial" w:eastAsia="Arial" w:hAnsi="Arial" w:cs="Arial"/>
+          <w:color w:val="000000"/>
+          <w:highlight w:val="green"/>
+        </w:rPr>
         <w:tab/>
-        <w:t>Los SBIA cumplen la Política de Seguridad de la Información (SGSI-PO-01) y el Manual de Políticas del Sistema de Gestión de Seguridad de la Información (SGSI-MA-03) de la SUNAT, en sus versiones vigentes. El Manual de Políticas es de aplicación a todos los colaboradores, al personal de modalidades formativas y a los terceros vinculados que gestionen información de la institución. Cuando un SBIA constituya un activo de información de un proceso comprendido en el alcance del Sistema de Gestión de Seguridad de la Información, le son exigibles además los demás documentos normativos y lineamientos de dicho Sistema.</w:t>
+        <w:t xml:space="preserve">Los SBIA cumplen la Política de Seguridad de la Información (SGSI-PO-01) y el Manual de Políticas del Sistema de Gestión de Seguridad de la Información (SGSI-MA-03) de la SUNAT, en sus versiones vigentes. El Manual de Políticas </w:t>
+      </w:r>
+      <w:proofErr w:type="gramStart"/>
+      <w:r>
+        <w:rPr>
+          <w:rFonts w:ascii="Arial" w:eastAsia="Arial" w:hAnsi="Arial" w:cs="Arial"/>
+          <w:color w:val="000000"/>
+          <w:highlight w:val="green"/>
+        </w:rPr>
+        <w:t>es de aplicación</w:t>
+      </w:r>
+      <w:proofErr w:type="gramEnd"/>
+      <w:r>
+        <w:rPr>
+          <w:rFonts w:ascii="Arial" w:eastAsia="Arial" w:hAnsi="Arial" w:cs="Arial"/>
+          <w:color w:val="000000"/>
+          <w:highlight w:val="green"/>
+        </w:rPr>
+        <w:t xml:space="preserve"> a todos los colaboradores, al personal de modalidades formativas y a los terceros vinculados que gestionen información de la institución. Cuando un SBIA constituya un activo de información de un proceso comprendido en el alcance del Sistema de Gestión de Seguridad de la Información, le son exigibles además los demás documentos normativos y lineamientos de dicho Sistema.</w:t>
       </w:r>
     </w:p>
     <w:p>
@@ -10557,6 +11264,13 @@
           <w:highlight w:val="green"/>
         </w:rPr>
         <w:t>6.7.2</w:t>
+      </w:r>
+      <w:r>
+        <w:rPr>
+          <w:rFonts w:ascii="Arial" w:eastAsia="Arial" w:hAnsi="Arial" w:cs="Arial"/>
+          <w:color w:val="000000"/>
+          <w:highlight w:val="green"/>
+        </w:rPr>
         <w:tab/>
         <w:t>Para los SBIA de riesgo alto y para los SBIA de riesgo aceptable que interactúen directamente con el administrado, incorporen componentes generativos o procesen datos personales o información sujeta a reserva tributaria, el custodio técnico implementa como mínimo:</w:t>
       </w:r>
@@ -10633,6 +11347,7 @@
           <w:color w:val="000000"/>
           <w:highlight w:val="green"/>
         </w:rPr>
+        <w:lastRenderedPageBreak/>
         <w:t>Registro inmutable de auditoría (logs) de todas las interacciones.</w:t>
       </w:r>
     </w:p>
@@ -10746,6 +11461,12 @@
           <w:color w:val="000000"/>
         </w:rPr>
         <w:t>6.7.3</w:t>
+      </w:r>
+      <w:r>
+        <w:rPr>
+          <w:rFonts w:ascii="Arial" w:eastAsia="Arial" w:hAnsi="Arial" w:cs="Arial"/>
+          <w:color w:val="000000"/>
+        </w:rPr>
         <w:tab/>
       </w:r>
       <w:r>
@@ -10774,10 +11495,15 @@
           <w:highlight w:val="yellow"/>
         </w:rPr>
         <w:t>6.7.4</w:t>
+      </w:r>
+      <w:r>
+        <w:rPr>
+          <w:rFonts w:ascii="Arial" w:eastAsia="Arial" w:hAnsi="Arial" w:cs="Arial"/>
+          <w:color w:val="000000"/>
+          <w:highlight w:val="yellow"/>
+        </w:rPr>
         <w:tab/>
-        <w:t xml:space="preserve">Todo SBIA, con independencia de su nivel de riesgo, integra la privacidad desde el diseño, minimizando la cantidad de datos personales recopilados y utilizando técnicas de anonimización, conforme al literal b) del artículo 29 del RLIA y a la Ley N.° 29733. En el desarrollo, la implementación y el uso de los </w:t>
-        <w:lastRenderedPageBreak/>
-        <w:t>SBIA se cumple la normativa vigente sobre privacidad y protección de datos personales, de acuerdo con lo que establezca la Autoridad Nacional de Protección de Datos Personales del Ministerio de Justicia y Derechos Humanos, conforme al artículo 26 del RLIA. Cuando la anonimización no resulte compatible con la finalidad del SBIA, la SUNAT admite la seudonimización; su justificación se documenta en la EIA o en la Ficha de Registro de SBIA, según corresponda.</w:t>
+        <w:t>Todo SBIA, con independencia de su nivel de riesgo, integra la privacidad desde el diseño, minimizando la cantidad de datos personales recopilados y utilizando técnicas de anonimización, conforme al literal b) del artículo 29 del RLIA y a la Ley N.° 29733. En el desarrollo, la implementación y el uso de los SBIA se cumple la normativa vigente sobre privacidad y protección de datos personales, de acuerdo con lo que establezca la Autoridad Nacional de Protección de Datos Personales del Ministerio de Justicia y Derechos Humanos, conforme al artículo 26 del RLIA. Cuando la anonimización no resulte compatible con la finalidad del SBIA, la SUNAT admite la seudonimización; su justificación se documenta en la EIA o en la Ficha de Registro de SBIA, según corresponda.</w:t>
       </w:r>
       <w:r>
         <w:rPr>
@@ -10805,6 +11531,13 @@
           <w:highlight w:val="cyan"/>
         </w:rPr>
         <w:t>6.7.5</w:t>
+      </w:r>
+      <w:r>
+        <w:rPr>
+          <w:rFonts w:ascii="Arial" w:eastAsia="Arial" w:hAnsi="Arial" w:cs="Arial"/>
+          <w:color w:val="000000"/>
+          <w:highlight w:val="cyan"/>
+        </w:rPr>
         <w:tab/>
         <w:t>La gestión de los incidentes y de las vulnerabilidades de seguridad de la información asociados a un SBIA se registra y atiende</w:t>
       </w:r>
@@ -10820,7 +11553,16 @@
           <w:color w:val="000000"/>
           <w:highlight w:val="cyan"/>
         </w:rPr>
-        <w:t xml:space="preserve"> por el Procedimiento para el registro y atención de incidentes y vulnerabilidades de seguridad de la información (A-03.5.1-PR-003). Los incidentes que se presenten durante la operación de un SBIA en producción y que no constituyan incidentes de seguridad de la información se atienden conforme al Procedimiento de Gestión de Incidentes (A-03.1.1-PR-002). Los que se detecten durante el diseño, el desarrollo o las pruebas se tratan dentro del ciclo de vida previsto en el numeral 6.1.1 y se resuelven con anterioridad al hito de la etapa en que se detectan. El custodio técnico deja constancia de su tratamiento y lo comunica a la Comisión de Gobierno de IA. Estas reglas comprenden los incidentes derivados del diseño, del desarrollo, del uso y del funcionamiento del SBIA, conforme al literal d) del artículo 29 del RLIA. </w:t>
+        <w:t xml:space="preserve"> por el Procedimiento para el registro y atención de incidentes y vulnerabilidades de seguridad de la información (A-03.5.1-PR-003). Los incidentes que se presenten durante la operación de un SBIA en producción y que no constituyan incidentes de seguridad de la información se atienden conforme al Procedimiento de Gestión de Incidentes (A-03.1.1-PR-002). Los que se detecten durante el diseño, el desarrollo o las pruebas se tratan dentro del ciclo de vida previsto en el numeral 6.1.1 y se resuelven con anterioridad al hito de la etapa en que se detectan. El custodio técnico deja constancia de su tratamiento y lo comunica a la Comisión de Gobierno de IA. Estas reglas comprenden los incidentes derivados del </w:t>
+      </w:r>
+      <w:r>
+        <w:rPr>
+          <w:rFonts w:ascii="Arial" w:eastAsia="Arial" w:hAnsi="Arial" w:cs="Arial"/>
+          <w:color w:val="000000"/>
+          <w:highlight w:val="cyan"/>
+        </w:rPr>
+        <w:lastRenderedPageBreak/>
+        <w:t xml:space="preserve">diseño, del desarrollo, del uso y del funcionamiento del SBIA, conforme al literal d) del artículo 29 del RLIA. </w:t>
       </w:r>
       <w:r>
         <w:rPr>
@@ -10859,6 +11601,13 @@
           <w:highlight w:val="yellow"/>
         </w:rPr>
         <w:t>6.7.6</w:t>
+      </w:r>
+      <w:r>
+        <w:rPr>
+          <w:rFonts w:ascii="Arial" w:eastAsia="Arial" w:hAnsi="Arial" w:cs="Arial"/>
+          <w:color w:val="000000"/>
+          <w:highlight w:val="yellow"/>
+        </w:rPr>
         <w:tab/>
         <w:t>El Oficial de Datos Personales (ODP) asegura que en el desarrollo, la implementación y el uso de los SBIA se realice un tratamiento adecuado de los datos personales</w:t>
       </w:r>
@@ -10894,10 +11643,15 @@
           <w:highlight w:val="green"/>
         </w:rPr>
         <w:t>6.7.7</w:t>
+      </w:r>
+      <w:r>
+        <w:rPr>
+          <w:rFonts w:ascii="Arial" w:eastAsia="Arial" w:hAnsi="Arial" w:cs="Arial"/>
+          <w:color w:val="000000"/>
+          <w:highlight w:val="green"/>
+        </w:rPr>
         <w:tab/>
-        <w:t xml:space="preserve">La Oficina de Seguridad Informática elabora y propone el documento normativo de seguridad informática para SBIA, que desarrolla la forma de implementar y </w:t>
-        <w:lastRenderedPageBreak/>
-        <w:t xml:space="preserve">verificar los controles del numeral 6.7.2 y la periodicidad de las pruebas de vulnerabilidad y del red teaming, conforme al artículo 106, literales a) y c), del ROF. Su aprobación se efectúa conforme al numeral 7.6. </w:t>
+        <w:t xml:space="preserve">La Oficina de Seguridad Informática elabora y propone el documento normativo de seguridad informática para SBIA, que desarrolla la forma de implementar y verificar los controles del numeral 6.7.2 y la periodicidad de las pruebas de vulnerabilidad y del red teaming, conforme al artículo 106, literales a) y c), del ROF. Su aprobación se efectúa conforme al numeral 7.6. </w:t>
       </w:r>
       <w:r>
         <w:rPr>
@@ -10925,8 +11679,24 @@
           <w:highlight w:val="green"/>
         </w:rPr>
         <w:t>6.7.8</w:t>
+      </w:r>
+      <w:r>
+        <w:rPr>
+          <w:rFonts w:ascii="Arial" w:eastAsia="Arial" w:hAnsi="Arial" w:cs="Arial"/>
+          <w:color w:val="000000"/>
+          <w:highlight w:val="green"/>
+        </w:rPr>
         <w:tab/>
-        <w:t>El propietario del caso de uso, con el custodio técnico del SBIA, define el tratamiento de conservación y eliminación de las instrucciones (prompt), respuestas, contextos, representaciones vectoriales (embeddings), registros de interacción y demás información que el SBIA genere o procese durante su operación. El plazo de conservación se determina en función del nivel de riesgo del SBIA, del valor probatorio de la información, de su sensibilidad y de los requisitos de auditoría aplicables, y se sujeta a la normativa institucional de gestión documental y archivo que resulte aplicable. En tanto dicha normativa no comprenda la información que el SBIA genera, el plazo se fija en el plan de monitoreo del SBIA y no puede ser inferior al exigido por la normativa tributaria y aduanera para la actuación en que el SBIA interviene. Para determinar dicho mínimo, la Comisión de Gobierno de IA convoca a la Intendencia Nacional Jurídico Tributaria o a la Intendencia Nacional Jurídico Aduanera, según la materia. La conservación, el acceso y el uso de dicha información se sujetan a la reserva tributaria conforme al artículo 85 del TUO del Código Tributario y a la normativa sobre protección de datos personales. El respaldo de la infraestructura tecnológica en la que reside dicha información, así como la custodia y disponibilidad de los medios correspondientes, están a cargo de la División de Soporte y Operación de la Infraestructura Tecnológica, conforme al literal b) del artículo 138 del ROF, y se sujetan a lo dispuesto en el numeral 6.7.1.</w:t>
+        <w:t xml:space="preserve">El propietario del caso de uso, con el custodio técnico del SBIA, define el tratamiento de conservación y eliminación de las instrucciones (prompt), respuestas, contextos, representaciones vectoriales (embeddings), registros de interacción y demás información que el SBIA genere o procese durante su operación. El plazo de conservación se determina en función del nivel de riesgo del SBIA, del valor probatorio de la información, de su sensibilidad y de los requisitos de auditoría aplicables, y se sujeta a la normativa institucional de gestión documental y archivo que resulte aplicable. En tanto dicha normativa no comprenda la información que el SBIA genera, el plazo se fija en el plan de monitoreo del SBIA y no puede ser inferior al exigido por la normativa tributaria y aduanera para la actuación en que el SBIA interviene. Para determinar dicho mínimo, la Comisión de Gobierno de IA convoca a la Intendencia Nacional Jurídico Tributaria o a la Intendencia Nacional Jurídico Aduanera, según la </w:t>
+      </w:r>
+      <w:r>
+        <w:rPr>
+          <w:rFonts w:ascii="Arial" w:eastAsia="Arial" w:hAnsi="Arial" w:cs="Arial"/>
+          <w:color w:val="000000"/>
+          <w:highlight w:val="green"/>
+        </w:rPr>
+        <w:lastRenderedPageBreak/>
+        <w:t>materia. La conservación, el acceso y el uso de dicha información se sujetan a la reserva tributaria conforme al artículo 85 del TUO del Código Tributario y a la normativa sobre protección de datos personales. El respaldo de la infraestructura tecnológica en la que reside dicha información, así como la custodia y disponibilidad de los medios correspondientes, están a cargo de la División de Soporte y Operación de la Infraestructura Tecnológica, conforme al literal b) del artículo 138 del ROF, y se sujetan a lo dispuesto en el numeral 6.7.1.</w:t>
       </w:r>
     </w:p>
     <w:p>
@@ -10937,6 +11707,8 @@
       </w:pPr>
       <w:r>
         <w:t>6.8</w:t>
+      </w:r>
+      <w:r>
         <w:tab/>
         <w:t>De los datos para los SBIA</w:t>
       </w:r>
@@ -10962,6 +11734,13 @@
           <w:highlight w:val="yellow"/>
         </w:rPr>
         <w:t>6.8.1</w:t>
+      </w:r>
+      <w:r>
+        <w:rPr>
+          <w:rFonts w:ascii="Arial" w:eastAsia="Arial" w:hAnsi="Arial" w:cs="Arial"/>
+          <w:color w:val="000000"/>
+          <w:highlight w:val="yellow"/>
+        </w:rPr>
         <w:tab/>
         <w:t>Los datos utilizados para el desarrollo, entrenamiento, validación y operación de un SBIA cuentan con procedencia documentada, base legal de uso determinada y requisitos de calidad definidos, conforme a la NTP-ISO/IEC 42001:2025</w:t>
       </w:r>
@@ -11001,6 +11780,13 @@
           <w:highlight w:val="yellow"/>
         </w:rPr>
         <w:t>6.8.2</w:t>
+      </w:r>
+      <w:r>
+        <w:rPr>
+          <w:rFonts w:ascii="Arial" w:eastAsia="Arial" w:hAnsi="Arial" w:cs="Arial"/>
+          <w:color w:val="000000"/>
+          <w:highlight w:val="yellow"/>
+        </w:rPr>
         <w:tab/>
         <w:t>El OGD promueve la calidad y el intercambio de los datos a fin de evitar sesgos y asegurar la precisión y representatividad de los datos utilizados en el entrenamiento, validación y uso de los SBIA</w:t>
       </w:r>
@@ -11054,10 +11840,15 @@
           <w:highlight w:val="green"/>
         </w:rPr>
         <w:t>6.8.3</w:t>
+      </w:r>
+      <w:r>
+        <w:rPr>
+          <w:rFonts w:ascii="Arial" w:eastAsia="Arial" w:hAnsi="Arial" w:cs="Arial"/>
+          <w:color w:val="000000"/>
+          <w:highlight w:val="green"/>
+        </w:rPr>
         <w:tab/>
-        <w:t xml:space="preserve">El uso de datos protegidos por la reserva tributaria para el desarrollo, entrenamiento, validación u operación de un SBIA requiere la determinación previa de su base legal, conforme al artículo 85 del TUO del Código Tributario. </w:t>
-        <w:lastRenderedPageBreak/>
-        <w:t>La determinación es previa al inicio del desarrollo o adquisición y consta en la Ficha de Registro de SBIA (Anexo N.° 1). La determinación corresponde al propietario del caso de uso, y la Comisión de Gobierno de IA convoca a la Intendencia Nacional Jurídico Tributaria y, en materia aduanera, a la Intendencia Nacional Jurídico Aduanera, cuya opinión sustenta dicha determinación.</w:t>
+        <w:t>El uso de datos protegidos por la reserva tributaria para el desarrollo, entrenamiento, validación u operación de un SBIA requiere la determinación previa de su base legal, conforme al artículo 85 del TUO del Código Tributario. La determinación es previa al inicio del desarrollo o adquisición y consta en la Ficha de Registro de SBIA (Anexo N.° 1). La determinación corresponde al propietario del caso de uso, y la Comisión de Gobierno de IA convoca a la Intendencia Nacional Jurídico Tributaria y, en materia aduanera, a la Intendencia Nacional Jurídico Aduanera, cuya opinión sustenta dicha determinación.</w:t>
       </w:r>
     </w:p>
     <w:p>
@@ -11081,6 +11872,13 @@
           <w:highlight w:val="yellow"/>
         </w:rPr>
         <w:t>6.8.4</w:t>
+      </w:r>
+      <w:r>
+        <w:rPr>
+          <w:rFonts w:ascii="Arial" w:eastAsia="Arial" w:hAnsi="Arial" w:cs="Arial"/>
+          <w:color w:val="000000"/>
+          <w:highlight w:val="yellow"/>
+        </w:rPr>
         <w:tab/>
         <w:t>No se utilizan obras protegidas por derechos de autor y derechos conexos como insumo de entrenamiento, ajuste fino o procesamiento en SBIA sin contar con la autorización correspondiente o con la base legal que lo permita</w:t>
       </w:r>
@@ -11120,8 +11918,24 @@
           <w:highlight w:val="green"/>
         </w:rPr>
         <w:t>6.8.5</w:t>
+      </w:r>
+      <w:r>
+        <w:rPr>
+          <w:rFonts w:ascii="Arial" w:eastAsia="Arial" w:hAnsi="Arial" w:cs="Arial"/>
+          <w:color w:val="000000"/>
+          <w:highlight w:val="green"/>
+        </w:rPr>
         <w:tab/>
-        <w:t>Los conjuntos de datos que la SUNAT genere o administre y que califiquen como datos de alto valor se ponen a disposición a través del Centro Nacional de Datos (CND), conforme al numeral 28.7 del artículo 28 del RLIA. La calificación se efectúa conforme a los lineamientos nacionales para la identificación de Datos de Alto Valor que emita la SGTD en aplicación de la Estrategia Nacional de Gobierno de Datos; en tanto no se emitan, el OGD aplica los criterios de priorización que dicha Estrategia enuncia para la publicación obligatoria de Datos de Alto Valor: carácter estratégico, interés nacional, planificación y gestión territorial o alto impacto social. El OGD identifica anualmente los conjuntos candidatos, determina su publicabilidad y propone al CGTD su publicación. La determinación de publicabilidad aplica la reserva tributaria conforme al artículo 85 del TUO del Código Tributario, incluidas sus excepciones expresas (entre ellas la publicación de datos estadísticos de carácter global que no permita la individualización de declaraciones, informaciones, cuentas o personas), y la normativa sobre protección de datos personales. Cuando un conjunto no resulte publicable, la justificación legal de la restricción consta igualmente en el acuerdo del CGTD. Aprobada la publicación, el OGD coordina la puesta a disposición con la unidad de organización que administra el conjunto.</w:t>
+        <w:t xml:space="preserve">Los conjuntos de datos que la SUNAT genere o administre y que califiquen como datos de alto valor se ponen a disposición a través del Centro Nacional de Datos (CND), conforme al numeral 28.7 del artículo 28 del RLIA. La calificación se efectúa conforme a los lineamientos nacionales para la identificación de Datos de Alto Valor que emita la SGTD en aplicación de la Estrategia Nacional de Gobierno de Datos; en tanto no se emitan, el OGD aplica los criterios de priorización que dicha Estrategia enuncia para la publicación obligatoria de Datos de Alto Valor: carácter estratégico, interés nacional, planificación y gestión territorial o alto impacto social. El OGD </w:t>
+      </w:r>
+      <w:r>
+        <w:rPr>
+          <w:rFonts w:ascii="Arial" w:eastAsia="Arial" w:hAnsi="Arial" w:cs="Arial"/>
+          <w:color w:val="000000"/>
+          <w:highlight w:val="green"/>
+        </w:rPr>
+        <w:lastRenderedPageBreak/>
+        <w:t>identifica anualmente los conjuntos candidatos, determina su publicabilidad y propone al CGTD su publicación. La determinación de publicabilidad aplica la reserva tributaria conforme al artículo 85 del TUO del Código Tributario, incluidas sus excepciones expresas (entre ellas la publicación de datos estadísticos de carácter global que no permita la individualización de declaraciones, informaciones, cuentas o personas), y la normativa sobre protección de datos personales. Cuando un conjunto no resulte publicable, la justificación legal de la restricción consta igualmente en el acuerdo del CGTD. Aprobada la publicación, el OGD coordina la puesta a disposición con la unidad de organización que administra el conjunto.</w:t>
       </w:r>
     </w:p>
     <w:p>
@@ -11145,6 +11959,13 @@
           <w:highlight w:val="green"/>
         </w:rPr>
         <w:t>6.8.6</w:t>
+      </w:r>
+      <w:r>
+        <w:rPr>
+          <w:rFonts w:ascii="Arial" w:eastAsia="Arial" w:hAnsi="Arial" w:cs="Arial"/>
+          <w:color w:val="000000"/>
+          <w:highlight w:val="green"/>
+        </w:rPr>
         <w:tab/>
         <w:t>Los SBIA se construyen sobre conjuntos de datos certificados conforme a la normativa institucional de gobernanza de datos y analítica, cuando estos existan para la materia. El uso de fuentes no certificadas se justifica en la Ficha de Evaluación de Caso de Uso (Anexo N.° 4) y consta en la Ficha de Registro de SBIA (Anexo N.° 1). En tanto no exista normativa de certificación para la materia, el OGD emite opinión sobre la idoneidad de los conjuntos de datos, conforme al numeral 6.8.2.</w:t>
       </w:r>
@@ -11182,6 +12003,8 @@
       </w:pPr>
       <w:r>
         <w:t>6.9</w:t>
+      </w:r>
+      <w:r>
         <w:tab/>
         <w:t>De la transparencia, explicabilidad y rendición de cuentas</w:t>
       </w:r>
@@ -11204,10 +12027,15 @@
           <w:highlight w:val="yellow"/>
         </w:rPr>
         <w:t>6.9.1</w:t>
+      </w:r>
+      <w:r>
+        <w:rPr>
+          <w:rFonts w:ascii="Arial" w:eastAsia="Arial" w:hAnsi="Arial" w:cs="Arial"/>
+          <w:color w:val="000000"/>
+          <w:highlight w:val="yellow"/>
+        </w:rPr>
         <w:tab/>
-        <w:t xml:space="preserve">Los SBIA de riesgo alto cuentan con mecanismos de transparencia algorítmica que informan al usuario, de forma previa, clara y sencilla, la finalidad o uso del SBIA, sus funcionalidades principales y el tipo de decisiones que puede tomar, de modo que comprenda cómo interactúa con el SBIA o con el servicio que lo </w:t>
-        <w:lastRenderedPageBreak/>
-        <w:t>emplea</w:t>
+        <w:t>Los SBIA de riesgo alto cuentan con mecanismos de transparencia algorítmica que informan al usuario, de forma previa, clara y sencilla, la finalidad o uso del SBIA, sus funcionalidades principales y el tipo de decisiones que puede tomar, de modo que comprenda cómo interactúa con el SBIA o con el servicio que lo emplea</w:t>
       </w:r>
       <w:r>
         <w:rPr>
@@ -11258,6 +12086,13 @@
           <w:highlight w:val="cyan"/>
         </w:rPr>
         <w:t>6.9.2</w:t>
+      </w:r>
+      <w:r>
+        <w:rPr>
+          <w:rFonts w:ascii="Arial" w:eastAsia="Arial" w:hAnsi="Arial" w:cs="Arial"/>
+          <w:color w:val="000000"/>
+          <w:highlight w:val="cyan"/>
+        </w:rPr>
         <w:tab/>
         <w:t>Entre los mecanismos del numeral 6.9.1 se incluye el etiquetado visible del SBIA. El etiquetado informa al usuario, con antelación, que el producto, servicio o contenido se opera con base en IA. Permite además comprender de manera general sus principales capacidades y limitaciones funcionales. El etiquetado alcanza también a todo SBIA que interactúe directamente con el administrado, cualquiera sea su nivel de riesgo.</w:t>
       </w:r>
@@ -11285,7 +12120,15 @@
           <w:color w:val="000000"/>
           <w:highlight w:val="cyan"/>
         </w:rPr>
+        <w:lastRenderedPageBreak/>
         <w:t>6.9.3</w:t>
+      </w:r>
+      <w:r>
+        <w:rPr>
+          <w:rFonts w:ascii="Arial" w:hAnsi="Arial" w:cs="Arial"/>
+          <w:color w:val="000000"/>
+          <w:highlight w:val="cyan"/>
+        </w:rPr>
         <w:tab/>
         <w:t>Los SBIA de riesgo alto cuentan con mecanismos de explicabilidad que permitan comprender los factores que influyeron en un resultado. Cuando un SBIA intervenga en decisiones que impacten en derechos humanos, las personas afectadas tienen derecho a recibir la explicación de los resultados, conforme al numeral 25.3 del artículo 25 del RLIA. La explicación se proporciona mediante mecanismos que permitan comprender los criterios y factores clave utilizados, en un lenguaje accesible.</w:t>
       </w:r>
@@ -11318,6 +12161,13 @@
           <w:highlight w:val="yellow"/>
         </w:rPr>
         <w:t>6.9.4</w:t>
+      </w:r>
+      <w:r>
+        <w:rPr>
+          <w:rFonts w:ascii="Arial" w:eastAsia="Arial" w:hAnsi="Arial" w:cs="Arial"/>
+          <w:color w:val="000000"/>
+          <w:highlight w:val="yellow"/>
+        </w:rPr>
         <w:tab/>
         <w:t>El funcionario no debe sustentar la motivación de actos administrativos exclusivamente en resultados de un SBIA. El funcionario debe incorporar su análisis y criterio profesional.</w:t>
       </w:r>
@@ -11338,8 +12188,14 @@
           <w:color w:val="000000"/>
           <w:highlight w:val="green"/>
         </w:rPr>
-        <w:lastRenderedPageBreak/>
         <w:t>6.9.5</w:t>
+      </w:r>
+      <w:r>
+        <w:rPr>
+          <w:rFonts w:ascii="Arial" w:eastAsia="Arial" w:hAnsi="Arial" w:cs="Arial"/>
+          <w:color w:val="000000"/>
+          <w:highlight w:val="green"/>
+        </w:rPr>
         <w:tab/>
         <w:t>La Comisión de Gobierno de IA reporta trimestralmente al CGTD el estado del Inventario Institucional de SBIA, los incidentes, los resultados del monitoreo, la verificación técnica de seguridad, el avance de la capacitación y el cumplimiento de los indicadores. El reporte comprende además el seguimiento de los encargos previsto en el numeral 7.6, el estado de las condiciones del PAIA previsto en el numeral 7.11 y el alineamiento previsto en el numeral 7.12. Dicho reporte constituye el informe trimestral de gobierno de IA. Da cuenta de la actividad de la Comisión de Gobierno de IA y no constituye avance del Plan de Gobierno Digital.</w:t>
       </w:r>
@@ -11361,6 +12217,13 @@
           <w:highlight w:val="green"/>
         </w:rPr>
         <w:t>6.9.6</w:t>
+      </w:r>
+      <w:r>
+        <w:rPr>
+          <w:rFonts w:ascii="Arial" w:eastAsia="Arial" w:hAnsi="Arial" w:cs="Arial"/>
+          <w:color w:val="000000"/>
+          <w:highlight w:val="green"/>
+        </w:rPr>
         <w:tab/>
         <w:t>El estado del gobierno de IA institucional se informa como sección del informe de seguimiento del Plan de Gobierno Digital que presenta el CGTD, con la periodicidad y por el conducto que dicho instrumento establece. La inclusión de los proyectos de SBIA en el Plan de Gobierno Digital se efectúa conforme al numeral 28.10 del artículo 28 del RLIA y a los numerales 7.11 y 7.12 de la presente directiva. Dicha sección sustenta la información que la SUNAT remita a la SGTD en materia de inteligencia artificial. No se genera un informe institucional adicional por esta materia.</w:t>
       </w:r>
@@ -11382,6 +12245,13 @@
           <w:highlight w:val="yellow"/>
         </w:rPr>
         <w:t>6.9.7</w:t>
+      </w:r>
+      <w:r>
+        <w:rPr>
+          <w:rFonts w:ascii="Arial" w:eastAsia="Arial" w:hAnsi="Arial" w:cs="Arial"/>
+          <w:color w:val="000000"/>
+          <w:highlight w:val="yellow"/>
+        </w:rPr>
         <w:tab/>
         <w:t>Los lineamientos sobre Transparencia Algorítmica que apruebe la SGTD</w:t>
       </w:r>
@@ -11397,7 +12267,16 @@
           <w:color w:val="000000"/>
           <w:highlight w:val="yellow"/>
         </w:rPr>
-        <w:t xml:space="preserve"> se aplican en la SUNAT desde su entrada en vigencia. La Comisión de Gobierno de IA evalúa su impacto en la presente directiva y propone al CGTD los ajustes que correspondan.</w:t>
+        <w:t xml:space="preserve"> se aplican en la SUNAT desde su entrada en vigencia. La Comisión de Gobierno </w:t>
+      </w:r>
+      <w:r>
+        <w:rPr>
+          <w:rFonts w:ascii="Arial" w:eastAsia="Arial" w:hAnsi="Arial" w:cs="Arial"/>
+          <w:color w:val="000000"/>
+          <w:highlight w:val="yellow"/>
+        </w:rPr>
+        <w:lastRenderedPageBreak/>
+        <w:t>de IA evalúa su impacto en la presente directiva y propone al CGTD los ajustes que correspondan.</w:t>
       </w:r>
     </w:p>
     <w:p>
@@ -11408,6 +12287,8 @@
       </w:pPr>
       <w:r>
         <w:t>6.10</w:t>
+      </w:r>
+      <w:r>
         <w:tab/>
         <w:t>Del monitoreo, auditoría y mejora continua</w:t>
       </w:r>
@@ -11430,6 +12311,13 @@
           <w:highlight w:val="green"/>
         </w:rPr>
         <w:t>6.10.1</w:t>
+      </w:r>
+      <w:r>
+        <w:rPr>
+          <w:rFonts w:ascii="Arial" w:eastAsia="Arial" w:hAnsi="Arial" w:cs="Arial"/>
+          <w:color w:val="000000"/>
+          <w:highlight w:val="green"/>
+        </w:rPr>
         <w:tab/>
         <w:t>Todo SBIA en operación es objeto de monitoreo. La Comisión de Gobierno de IA determina la frecuencia y la profundidad del monitoreo de cada SBIA en función de su nivel de riesgo, del impacto que un resultado erróneo produciría en el administrado o en la institución, del volumen de operaciones que procesa y del grado de autonomía con que opera. La frecuencia determinada, los indicadores aplicables conforme al numeral 6.10.2, sus umbrales determinados conforme a dicho numeral y los responsables de la medición constan en el plan de monitoreo del SBIA, que la Comisión de Gobierno de IA aprueba con anterioridad a su puesta en producción.</w:t>
       </w:r>
@@ -11503,7 +12391,25 @@
           <w:color w:val="000000"/>
           <w:highlight w:val="green"/>
         </w:rPr>
-        <w:t>Cuando el plan de monitoreo prevea vigilancia automatizada, esta opera durante el horario de operación del SBIA, salvo que su criticidad justifique cobertura permanente, lo que se sustenta en el mismo plan.</w:t>
+        <w:t xml:space="preserve">Cuando el plan de monitoreo prevea vigilancia automatizada, esta </w:t>
+      </w:r>
+      <w:proofErr w:type="spellStart"/>
+      <w:r>
+        <w:rPr>
+          <w:rFonts w:ascii="Arial" w:eastAsia="Arial" w:hAnsi="Arial" w:cs="Arial"/>
+          <w:color w:val="000000"/>
+          <w:highlight w:val="green"/>
+        </w:rPr>
+        <w:t>opera</w:t>
+      </w:r>
+      <w:proofErr w:type="spellEnd"/>
+      <w:r>
+        <w:rPr>
+          <w:rFonts w:ascii="Arial" w:eastAsia="Arial" w:hAnsi="Arial" w:cs="Arial"/>
+          <w:color w:val="000000"/>
+          <w:highlight w:val="green"/>
+        </w:rPr>
+        <w:t xml:space="preserve"> durante el horario de operación del SBIA, salvo que su criticidad justifique cobertura permanente, lo que se sustenta en el mismo plan.</w:t>
       </w:r>
     </w:p>
     <w:p>
@@ -11522,7 +12428,6 @@
           <w:color w:val="000000"/>
           <w:highlight w:val="green"/>
         </w:rPr>
-        <w:lastRenderedPageBreak/>
         <w:t>Los criterios de determinación de la frecuencia, los tipos de monitoreo aplicables y su desarrollo operativo se establecen en la metodología prevista en el numeral 6.1.5.</w:t>
       </w:r>
     </w:p>
@@ -11543,6 +12448,13 @@
           <w:highlight w:val="green"/>
         </w:rPr>
         <w:t>6.10.2</w:t>
+      </w:r>
+      <w:r>
+        <w:rPr>
+          <w:rFonts w:ascii="Arial" w:eastAsia="Arial" w:hAnsi="Arial" w:cs="Arial"/>
+          <w:color w:val="000000"/>
+          <w:highlight w:val="green"/>
+        </w:rPr>
         <w:tab/>
         <w:t>La Comisión de Gobierno de IA define, para cada SBIA registrado en el Inventario, los indicadores de monitoreo que como mínimo incluyen: tasa de precisión, tasa de error, tiempo de respuesta, disponibilidad, detección de drift, indicadores de sesgo, tasa de intervención humana e indicadores de detección del uso irregular previstos en el numeral 6.10.6. Los umbrales de cada indicador, las alertas que su superación activa y las acciones de tratamiento correspondientes se definen con anterioridad a la puesta en producción del SBIA, conforme a la metodología prevista en el numeral 6.1.5. Tratándose de los indicadores de sesgo, el umbral se define con la opinión de la OII, que se pronuncia sobre los grupos que pueden resultar afectados y sobre la disparidad que resulta inaceptable. En tanto no se apruebe dicha metodología, se establecen en el plan de monitoreo que aprueba la Comisión de Gobierno de IA.</w:t>
       </w:r>
@@ -11577,7 +12489,15 @@
           <w:color w:val="000000"/>
           <w:highlight w:val="yellow"/>
         </w:rPr>
+        <w:lastRenderedPageBreak/>
         <w:t>6.10.3</w:t>
+      </w:r>
+      <w:r>
+        <w:rPr>
+          <w:rFonts w:ascii="Arial" w:eastAsia="Arial" w:hAnsi="Arial" w:cs="Arial"/>
+          <w:color w:val="000000"/>
+          <w:highlight w:val="yellow"/>
+        </w:rPr>
         <w:tab/>
         <w:t>La Gerencia de Calidad de Sistemas conduce el control y aseguramiento de la calidad de los SBIA, conforme a sus funciones (artículos 123 y 124, literal a, del ROF). La verificación y validación de la calidad, incluida la ejecución de las pruebas funcionales y no funcionales, corresponde a la División de Control de Calidad, conforme a sus funciones (artículos 125 y 126, literal a, del ROF), y comprende además las pruebas de rendimiento, de regresión y de sesgo que correspondan al tipo de SBIA.</w:t>
       </w:r>
@@ -11617,10 +12537,14 @@
           <w:highlight w:val="lightGray"/>
         </w:rPr>
         <w:t>6.10.4</w:t>
+      </w:r>
+      <w:r>
+        <w:rPr>
+          <w:rFonts w:ascii="Arial" w:hAnsi="Arial" w:cs="Arial"/>
+          <w:highlight w:val="lightGray"/>
+        </w:rPr>
         <w:tab/>
-        <w:t xml:space="preserve">Todo cambio sobre un SBIA en operación se gestiona de manera controlada y proporcional a su nivel de riesgo. Constituyen cambio, entre otros, el reentrenamiento o la recalibración del modelo, su sustitución o el cambio de versión del modelo base, la modificación de las fuentes o de la estructura de los datos de entrada, la ampliación de la finalidad o de la población objetivo del SBIA, y el cambio de proveedor. El propietario del caso de uso registra todo cambio en el Inventario Institucional de SBIA, lo califica como significativo o no </w:t>
-        <w:lastRenderedPageBreak/>
-        <w:t>conforme al numeral 6.10.5 y lo comunica a la Comisión de Gobierno de IA. La Comisión valida dicha calificación. El reentrenamiento, la recalibración y el cambio de versión del modelo no alteran el identificador con que el SBIA figura en el Inventario Institucional ni la correspondencia entre cada resultado y la versión del modelo que lo produjo, de modo que un resultado pueda reconstruirse y atribuirse a su versión. Esta correspondencia forma parte del registro inmutable de auditoría previsto en el numeral 6.7.2.</w:t>
+        <w:t>Todo cambio sobre un SBIA en operación se gestiona de manera controlada y proporcional a su nivel de riesgo. Constituyen cambio, entre otros, el reentrenamiento o la recalibración del modelo, su sustitución o el cambio de versión del modelo base, la modificación de las fuentes o de la estructura de los datos de entrada, la ampliación de la finalidad o de la población objetivo del SBIA, y el cambio de proveedor. El propietario del caso de uso registra todo cambio en el Inventario Institucional de SBIA, lo califica como significativo o no conforme al numeral 6.10.5 y lo comunica a la Comisión de Gobierno de IA. La Comisión valida dicha calificación. El reentrenamiento, la recalibración y el cambio de versión del modelo no alteran el identificador con que el SBIA figura en el Inventario Institucional ni la correspondencia entre cada resultado y la versión del modelo que lo produjo, de modo que un resultado pueda reconstruirse y atribuirse a su versión. Esta correspondencia forma parte del registro inmutable de auditoría previsto en el numeral 6.7.2.</w:t>
       </w:r>
     </w:p>
     <w:p>
@@ -11645,6 +12569,12 @@
           <w:highlight w:val="green"/>
         </w:rPr>
         <w:t>5</w:t>
+      </w:r>
+      <w:r>
+        <w:rPr>
+          <w:rFonts w:ascii="Arial" w:hAnsi="Arial" w:cs="Arial"/>
+          <w:highlight w:val="green"/>
+        </w:rPr>
         <w:tab/>
         <w:t xml:space="preserve">Es significativo el cambio que altera el nivel de riesgo del SBIA, su finalidad, la población objetivo o el contexto de aplicación. También lo es el que degrada su desempeño por debajo de los umbrales del plan de monitoreo. Los demás cambios se gestionan conforme al numeral 6.10.4, de manera proporcional a su nivel de riesgo. El </w:t>
       </w:r>
@@ -11653,7 +12583,15 @@
           <w:rFonts w:ascii="Arial" w:hAnsi="Arial" w:cs="Arial"/>
           <w:highlight w:val="lightGray"/>
         </w:rPr>
-        <w:t>cambio significativo requiere, con anterioridad a su puesta en producción: la revisión de la clasificación de riesgo conforme al numeral 6.2.2; la actualización de la EIA conforme al numeral 6.4.3, cuando corresponda; la verificación y validación conforme al numeral 6.10.3; y la aprobación prevista en el numeral 6.1.2. El despliegue del cambio se realiza con versión identificable y con un plan de reversión que permita restituir la versión anterior del SBIA. La operación posterior al cambio es objeto de seguimiento reforzado durante el periodo que corresponda a su nivel de riesgo, conforme a la metodología prevista en el numeral 6.1.5.</w:t>
+        <w:t xml:space="preserve">cambio significativo requiere, con anterioridad a su puesta en producción: la revisión de la clasificación de riesgo conforme al numeral 6.2.2; la actualización de la EIA conforme al numeral 6.4.3, cuando corresponda; la verificación y validación conforme al numeral 6.10.3; y la aprobación prevista en el numeral 6.1.2. El despliegue del cambio se realiza con versión identificable y con un plan de reversión que permita restituir la versión anterior del SBIA. La operación posterior al cambio es objeto de </w:t>
+      </w:r>
+      <w:r>
+        <w:rPr>
+          <w:rFonts w:ascii="Arial" w:hAnsi="Arial" w:cs="Arial"/>
+          <w:highlight w:val="lightGray"/>
+        </w:rPr>
+        <w:lastRenderedPageBreak/>
+        <w:t>seguimiento reforzado durante el periodo que corresponda a su nivel de riesgo, conforme a la metodología prevista en el numeral 6.1.5.</w:t>
       </w:r>
     </w:p>
     <w:p>
@@ -11671,6 +12609,12 @@
           <w:highlight w:val="green"/>
         </w:rPr>
         <w:t>6.10.6</w:t>
+      </w:r>
+      <w:r>
+        <w:rPr>
+          <w:rFonts w:ascii="Arial" w:hAnsi="Arial" w:cs="Arial"/>
+          <w:highlight w:val="green"/>
+        </w:rPr>
         <w:tab/>
         <w:t>El monitoreo comprende la detección del uso irregular del SBIA por parte de quienes lo operan o interactúan con él, con independencia del nivel de riesgo que tenga asignado. El uso irregular se distingue del uso indebido a que se refiere el artículo 23 del RLIA, que es una categoría de clasificación del SBIA. Constituyen indicios de uso irregular, entre otros, la manipulación de los datos de entrada para inducir un resultado determinado, el empleo del SBIA para una finalidad distinta de la registrada en el Inventario Institucional de SBIA y los patrones de uso incompatibles con la operación normal del proceso. La Comisión de Gobierno de IA define los indicadores que permitan detectar dichos patrones, conforme al numeral 6.10.2, y los incorpora al plan de monitoreo. Los efectos del uso irregular sobre el funcionamiento del SBIA se tratan conforme al numeral 6.7.5. La conducta se comunica a la Oficina de Integridad Institucional y se trata conforme a las normas de integridad institucional.</w:t>
       </w:r>
@@ -11728,6 +12672,8 @@
       </w:pPr>
       <w:r>
         <w:t>6.11</w:t>
+      </w:r>
+      <w:r>
         <w:tab/>
         <w:t>Del uso responsable de herramientas de IA</w:t>
       </w:r>
@@ -11748,6 +12694,12 @@
           <w:color w:val="000000"/>
         </w:rPr>
         <w:t>6.11.1</w:t>
+      </w:r>
+      <w:r>
+        <w:rPr>
+          <w:rFonts w:ascii="Arial" w:eastAsia="Arial" w:hAnsi="Arial" w:cs="Arial"/>
+          <w:color w:val="000000"/>
+        </w:rPr>
         <w:tab/>
         <w:t xml:space="preserve">Los colaboradores que utilicen herramientas de IA </w:t>
       </w:r>
@@ -11858,7 +12810,6 @@
           <w:bCs w:val="0"/>
           <w:color w:val="000000"/>
         </w:rPr>
-        <w:lastRenderedPageBreak/>
         <w:t>Declarar el uso de IA en la elaboración de informes o documentos con impacto en decisiones administrativas.</w:t>
       </w:r>
     </w:p>
@@ -11902,8 +12853,24 @@
           <w:highlight w:val="green"/>
         </w:rPr>
         <w:t>6.11.2</w:t>
+      </w:r>
+      <w:r>
+        <w:rPr>
+          <w:rFonts w:ascii="Arial" w:eastAsia="Arial" w:hAnsi="Arial" w:cs="Arial"/>
+          <w:color w:val="000000"/>
+          <w:highlight w:val="green"/>
+        </w:rPr>
         <w:tab/>
-        <w:t>El catálogo de herramientas de IA autorizadas para uso institucional, en adelante el catálogo institucional, registra las herramientas aprobadas conforme al numeral 6.11.5. El catálogo precisa, para cada herramienta, el ámbito de uso autorizado (uso administrativo general o uso restringido) y si se encuentra desplegada en infraestructura bajo control de la SUNAT. Solo las herramientas desplegadas en dicha infraestructura pueden emplearse con información sujeta a reserva tributaria, conforme al numeral 6.7.3. La INSI lo publica y lo mantiene actualizado.</w:t>
+        <w:t xml:space="preserve">El catálogo de herramientas de IA autorizadas para uso institucional, en adelante el catálogo institucional, registra las herramientas aprobadas conforme al numeral 6.11.5. El catálogo precisa, para cada herramienta, el ámbito de uso autorizado (uso administrativo general o uso restringido) y si se encuentra desplegada en infraestructura bajo control de la SUNAT. Solo las herramientas desplegadas en dicha infraestructura pueden emplearse con </w:t>
+      </w:r>
+      <w:r>
+        <w:rPr>
+          <w:rFonts w:ascii="Arial" w:eastAsia="Arial" w:hAnsi="Arial" w:cs="Arial"/>
+          <w:color w:val="000000"/>
+          <w:highlight w:val="green"/>
+        </w:rPr>
+        <w:lastRenderedPageBreak/>
+        <w:t>información sujeta a reserva tributaria, conforme al numeral 6.7.3. La INSI lo publica y lo mantiene actualizado.</w:t>
       </w:r>
     </w:p>
     <w:p>
@@ -11923,6 +12890,13 @@
           <w:highlight w:val="green"/>
         </w:rPr>
         <w:t>6.11.3</w:t>
+      </w:r>
+      <w:r>
+        <w:rPr>
+          <w:rFonts w:ascii="Arial" w:eastAsia="Arial" w:hAnsi="Arial" w:cs="Arial"/>
+          <w:color w:val="000000"/>
+          <w:highlight w:val="green"/>
+        </w:rPr>
         <w:tab/>
         <w:t xml:space="preserve">Los lineamientos técnicos que regulan el uso de LLM open source en la infraestructura institucional integran los documentos técnicos de arquitectura previstos en el numeral 6.5.3. La División de Arquitectura de Información y de Aplicaciones los elabora y propone en lo referido al modelo y a la arquitectura de aplicaciones, conforme al literal b) del artículo 132 del ROF, y la División de Arquitectura Tecnológica en lo referido a la infraestructura especializada que los soporta, conforme a los literales c) y d) del artículo 134 del ROF. Su aprobación se efectúa conforme al numeral 6.5.3. Las unidades de organización los cumplen como condición para el despliegue de estos modelos. En tanto no se aprueben, el despliegue de estos modelos requiere la autorización previa de la Gerencia de Arquitectura y se sujeta a los controles del numeral 6.7.2. </w:t>
       </w:r>
@@ -11952,6 +12926,13 @@
           <w:highlight w:val="green"/>
         </w:rPr>
         <w:t>6.11.4</w:t>
+      </w:r>
+      <w:r>
+        <w:rPr>
+          <w:rFonts w:ascii="Arial" w:eastAsia="Arial" w:hAnsi="Arial" w:cs="Arial"/>
+          <w:color w:val="000000"/>
+          <w:highlight w:val="green"/>
+        </w:rPr>
         <w:tab/>
         <w:t>Ninguna unidad de organización desarrolla, adquiere, contrata, implementa u opera SBIA fuera del límite de la presente directiva, independientemente de su complejidad, presupuesto o ámbito geográfico. En particular: (a) toda iniciativa de SBIA como proyecto se sujeta al ciclo de vida del numeral 6.1, incluidos sus hitos de aprobación, y se registra en el Inventario Institucional de SBIA; (b) toda herramienta de IA que se contrate como servicio (suscripciones, APIs, plataformas SaaS) cuenta previamente con la aprobación prevista en el numeral 6.11.5 y con su inclusión en el catálogo institucional (numeral 6.11.2). Cuando la herramienta constituya además un SBIA, le son aplicables las verificaciones del numeral 6.12 que correspondan. Los colaboradores utilizan exclusivamente las herramientas de IA que figuran en dicho catálogo. La Comisión de Gobierno de IA promueve la regularización mediante el registro y el acompañamiento proporcional a la unidad involucrada, y comunica al CGTD y, según corresponda, a la OII, los incumplimientos reiterados. Cuando de la regularización resulte que el SBIA corresponde a la categoría de uso indebido prevista en el artículo 23 del RLIA, no procede su regularización y se aplica lo dispuesto en los numerales 6.2.1, 6.2.3 y 6.2.6.</w:t>
       </w:r>
@@ -11973,42 +12954,56 @@
           <w:highlight w:val="cyan"/>
         </w:rPr>
         <w:t>6.11.5</w:t>
+      </w:r>
+      <w:r>
+        <w:rPr>
+          <w:rFonts w:ascii="Arial" w:hAnsi="Arial" w:cs="Arial"/>
+          <w:color w:val="000000"/>
+          <w:highlight w:val="cyan"/>
+        </w:rPr>
         <w:tab/>
-        <w:t xml:space="preserve">La GA aprueba las herramientas de IA que pueden emplearse en la SUNAT, conforme a sus funciones (artículo 130, literal c, del ROF), y las registra en el </w:t>
+        <w:t xml:space="preserve">La GA aprueba las herramientas de IA que pueden emplearse en la SUNAT, conforme a sus funciones (artículo 130, literal c, del ROF), y las registra en el catálogo institucional. </w:t>
+      </w:r>
+      <w:r>
+        <w:rPr>
+          <w:rFonts w:ascii="Arial" w:hAnsi="Arial" w:cs="Arial"/>
+          <w:color w:val="000000"/>
+          <w:highlight w:val="green"/>
+        </w:rPr>
+        <w:t xml:space="preserve">La División de Gestión de Infraestructura Tecnológica y la División de Atención a Usuarios administran el inventario de software, cada una en el ámbito de su competencia, conforme al literal b) del artículo 140 y al literal e) del artículo 142 del ROF. A través de dicho inventario se verifica que los equipos informáticos tengan instalado únicamente software autorizado. </w:t>
+      </w:r>
+      <w:r>
+        <w:rPr>
+          <w:rFonts w:ascii="Arial" w:hAnsi="Arial" w:cs="Arial"/>
+          <w:color w:val="000000"/>
+          <w:highlight w:val="cyan"/>
+        </w:rPr>
+        <w:t>El catálogo institucional constituye el subconjunto de inteligencia artificial del inventario de software autorizado; ambos se distinguen del Inventario Institucional de SBIA, que registra los SBIA y no las herramientas.</w:t>
+      </w:r>
+      <w:r>
+        <w:rPr>
+          <w:rFonts w:ascii="Arial" w:eastAsia="Arial" w:hAnsi="Arial" w:cs="Arial"/>
+          <w:color w:val="000000"/>
+          <w:highlight w:val="cyan"/>
+        </w:rPr>
+        <w:t xml:space="preserve"> </w:t>
+      </w:r>
+      <w:r>
+        <w:rPr>
+          <w:rFonts w:ascii="Arial" w:eastAsia="Arial" w:hAnsi="Arial" w:cs="Arial"/>
+          <w:color w:val="000000"/>
+          <w:highlight w:val="green"/>
+        </w:rPr>
+        <w:t xml:space="preserve">El registro, el control y el retiro de las herramientas de IA que requieren instalación en los equipos informáticos se rigen por el Procedimiento para el Registro, Control y </w:t>
+      </w:r>
+      <w:r>
+        <w:rPr>
+          <w:rFonts w:ascii="Arial" w:eastAsia="Arial" w:hAnsi="Arial" w:cs="Arial"/>
+          <w:color w:val="000000"/>
+          <w:highlight w:val="green"/>
+        </w:rPr>
         <w:lastRenderedPageBreak/>
-        <w:t xml:space="preserve">catálogo institucional. </w:t>
-      </w:r>
-      <w:r>
-        <w:rPr>
-          <w:rFonts w:ascii="Arial" w:hAnsi="Arial" w:cs="Arial"/>
-          <w:color w:val="000000"/>
-          <w:highlight w:val="green"/>
-        </w:rPr>
-        <w:t xml:space="preserve">La División de Gestión de Infraestructura Tecnológica y la División de Atención a Usuarios administran el inventario de software, cada una en el ámbito de su competencia, conforme al literal b) del artículo 140 y al literal e) del artículo 142 del ROF. A través de dicho inventario se verifica que los equipos informáticos tengan instalado únicamente software autorizado. </w:t>
-      </w:r>
-      <w:r>
-        <w:rPr>
-          <w:rFonts w:ascii="Arial" w:hAnsi="Arial" w:cs="Arial"/>
-          <w:color w:val="000000"/>
-          <w:highlight w:val="cyan"/>
-        </w:rPr>
-        <w:t>El catálogo institucional constituye el subconjunto de inteligencia artificial del inventario de software autorizado; ambos se distinguen del Inventario Institucional de SBIA, que registra los SBIA y no las herramientas.</w:t>
-      </w:r>
-      <w:r>
-        <w:rPr>
-          <w:rFonts w:ascii="Arial" w:eastAsia="Arial" w:hAnsi="Arial" w:cs="Arial"/>
-          <w:color w:val="000000"/>
-          <w:highlight w:val="cyan"/>
-        </w:rPr>
-        <w:t xml:space="preserve"> </w:t>
-      </w:r>
-      <w:r>
-        <w:rPr>
-          <w:rFonts w:ascii="Arial" w:eastAsia="Arial" w:hAnsi="Arial" w:cs="Arial"/>
-          <w:color w:val="000000"/>
-          <w:highlight w:val="green"/>
-        </w:rPr>
-        <w:t>El registro, el control y el retiro de las herramientas de IA que requieren instalación en los equipos informáticos se rigen por el Procedimiento para el Registro, Control y Retiro de Software de la SUNAT (A-03.3.2-PR-01). La Gerencia de Operaciones y Soporte a Usuarios adecúa dicho procedimiento para comprender las herramientas de IA que se consumen como servicio y no requieren instalación, conforme al numeral 7.6 de la presente directiva. En tanto no se apruebe dicha adecuación, el alta y la baja de estas herramientas en el catálogo institucional se efectúan conforme al presente numeral.</w:t>
+        <w:t>Retiro de Software de la SUNAT (A-03.3.2-PR-01). La Gerencia de Operaciones y Soporte a Usuarios adecúa dicho procedimiento para comprender las herramientas de IA que se consumen como servicio y no requieren instalación, conforme al numeral 7.6 de la presente directiva. En tanto no se apruebe dicha adecuación, el alta y la baja de estas herramientas en el catálogo institucional se efectúan conforme al presente numeral.</w:t>
       </w:r>
     </w:p>
     <w:p>
@@ -12027,8 +13022,14 @@
           <w:color w:val="000000"/>
         </w:rPr>
         <w:t>6.11.6</w:t>
+      </w:r>
+      <w:r>
+        <w:rPr>
+          <w:rFonts w:ascii="Arial" w:eastAsia="Arial" w:hAnsi="Arial" w:cs="Arial"/>
+          <w:color w:val="000000"/>
+        </w:rPr>
         <w:tab/>
-        <w:t xml:space="preserve">Los asistentes de IA de propósito general provistos por terceros, empleados para la generación de contenido, el análisis de información, la búsqueda de conocimiento o la automatización de tareas, constituyen herramientas de IA conforme al glosario de la presente directiva y se rigen por los numerales 6.11.1 a 6.11.5, incluida la regla del numeral 6.11.4 sobre las herramientas que además constituyen un SBIA.</w:t>
+        <w:t>Los asistentes de IA de propósito general provistos por terceros, empleados para la generación de contenido, el análisis de información, la búsqueda de conocimiento o la automatización de tareas, constituyen herramientas de IA conforme al glosario de la presente directiva y se rigen por los numerales 6.11.1 a 6.11.5, incluida la regla del numeral 6.11.4 sobre las herramientas que además constituyen un SBIA.</w:t>
       </w:r>
     </w:p>
     <w:p>
@@ -12046,7 +13047,7 @@
           <w:rFonts w:ascii="Arial" w:eastAsia="Arial" w:hAnsi="Arial" w:cs="Arial"/>
           <w:color w:val="000000"/>
         </w:rPr>
-        <w:t xml:space="preserve">El colaborador que utiliza estos asistentes conserva la responsabilidad sobre el contenido que elabora y sobre la decisión en que lo emplea.</w:t>
+        <w:t>El colaborador que utiliza estos asistentes conserva la responsabilidad sobre el contenido que elabora y sobre la decisión en que lo emplea.</w:t>
       </w:r>
     </w:p>
     <w:p>
@@ -12057,6 +13058,8 @@
       </w:pPr>
       <w:r>
         <w:t>6.12</w:t>
+      </w:r>
+      <w:r>
         <w:tab/>
         <w:t>De la gestión de proveedores de IA</w:t>
       </w:r>
@@ -12078,6 +13081,13 @@
           <w:highlight w:val="green"/>
         </w:rPr>
         <w:t>6.12.1</w:t>
+      </w:r>
+      <w:r>
+        <w:rPr>
+          <w:rFonts w:ascii="Arial" w:eastAsia="Arial" w:hAnsi="Arial" w:cs="Arial"/>
+          <w:color w:val="000000"/>
+          <w:highlight w:val="green"/>
+        </w:rPr>
         <w:tab/>
         <w:t>La unidad de organización que formula los términos de referencia o las especificaciones técnicas para la adquisición de un SBIA incorpora en ellos los requisitos de cumplimiento de la presente directiva y de la normativa aplicable. La Gerencia de Arquitectura verifica su incorporación con anterioridad a la aprobación de los términos de referencia o de las especificaciones técnicas, conforme al literal c) del artículo 130 del ROF. El resultado de la verificación consta en el expediente de contratación.</w:t>
       </w:r>
@@ -12099,6 +13109,13 @@
           <w:highlight w:val="green"/>
         </w:rPr>
         <w:t>6.12.2</w:t>
+      </w:r>
+      <w:r>
+        <w:rPr>
+          <w:rFonts w:ascii="Arial" w:eastAsia="Arial" w:hAnsi="Arial" w:cs="Arial"/>
+          <w:color w:val="000000"/>
+          <w:highlight w:val="green"/>
+        </w:rPr>
         <w:tab/>
         <w:t>La unidad de organización que formula los términos de referencia o las especificaciones técnicas incorpora en ellos las cláusulas que el contrato debe contener sobre: (a) protección de datos y reserva tributaria; (b) transparencia del modelo; (c) comunicación de vulnerabilidades e incidentes; (d) derecho de auditoría, incluida la realización de auditorías éticas y de sesgo sobre el modelo; (e) transferencia de conocimiento; (f) cumplimiento de estándares técnicos; y (g) la identificación de los subprocesadores autorizados y las condiciones de recuperación de la información institucional a la conclusión del contrato. El plazo de notificación de vulnerabilidades se define en los TDR o EETT de cada contratación, según la criticidad del SBIA.</w:t>
       </w:r>
@@ -12120,6 +13137,13 @@
           <w:highlight w:val="green"/>
         </w:rPr>
         <w:t>6.12.3</w:t>
+      </w:r>
+      <w:r>
+        <w:rPr>
+          <w:rFonts w:ascii="Arial" w:eastAsia="Arial" w:hAnsi="Arial" w:cs="Arial"/>
+          <w:color w:val="000000"/>
+          <w:highlight w:val="green"/>
+        </w:rPr>
         <w:tab/>
         <w:t>Para SBIA SaaS, la INSI verifica que las condiciones técnicas y operativas del servicio se ajusten a la restricción del numeral 6.7.3. La compatibilidad de los términos de uso con las obligaciones de la SUNAT en materia de datos es materia de la opinión previa de la INALI prevista en el numeral 5.4. Estos SBIA no procesan información sujeta a reserva tributaria.</w:t>
       </w:r>
@@ -12141,10 +13165,24 @@
           <w:highlight w:val="green"/>
         </w:rPr>
         <w:t>6.12.4</w:t>
+      </w:r>
+      <w:r>
+        <w:rPr>
+          <w:rFonts w:ascii="Arial" w:eastAsia="Arial" w:hAnsi="Arial" w:cs="Arial"/>
+          <w:color w:val="000000"/>
+          <w:highlight w:val="green"/>
+        </w:rPr>
         <w:tab/>
-        <w:t xml:space="preserve">La unidad de organización que formula los términos de referencia o las especificaciones técnicas incorpora en ellos la cláusula que prohíbe al proveedor y a su personal emplear la información de la SUNAT a la que accedan en ejecución del contrato, las instrucciones que se les remitan y los resultados derivados de su tratamiento, para entrenar, ajustar o mejorar sus </w:t>
+        <w:t xml:space="preserve">La unidad de organización que formula los términos de referencia o las especificaciones técnicas incorpora en ellos la cláusula que prohíbe al proveedor y a su personal emplear la información de la SUNAT a la que accedan en ejecución del contrato, las instrucciones que se les remitan y los resultados derivados de su tratamiento, para entrenar, ajustar o mejorar sus modelos o para cualquier fin distinto de la ejecución del contrato. Tratándose </w:t>
+      </w:r>
+      <w:r>
+        <w:rPr>
+          <w:rFonts w:ascii="Arial" w:eastAsia="Arial" w:hAnsi="Arial" w:cs="Arial"/>
+          <w:color w:val="000000"/>
+          <w:highlight w:val="green"/>
+        </w:rPr>
         <w:lastRenderedPageBreak/>
-        <w:t>modelos o para cualquier fin distinto de la ejecución del contrato. Tratándose de información sujeta a reserva tributaria, la prohibición se sustenta en el artículo 85 del Código Tributario, que extiende la obligación de reserva a quienes accedan a dicha información.</w:t>
+        <w:t>de información sujeta a reserva tributaria, la prohibición se sustenta en el artículo 85 del Código Tributario, que extiende la obligación de reserva a quienes accedan a dicha información.</w:t>
       </w:r>
     </w:p>
     <w:p>
@@ -12164,6 +13202,13 @@
           <w:highlight w:val="green"/>
         </w:rPr>
         <w:t>6.12.5</w:t>
+      </w:r>
+      <w:r>
+        <w:rPr>
+          <w:rFonts w:ascii="Arial" w:eastAsia="Arial" w:hAnsi="Arial" w:cs="Arial"/>
+          <w:color w:val="000000"/>
+          <w:highlight w:val="green"/>
+        </w:rPr>
         <w:tab/>
         <w:t>Para los SBIA de riesgo alto, los contratos obligan al proveedor a entregar la documentación técnica sobre los principios de funcionamiento del sistema, las fuentes de datos utilizadas y la lógica del algoritmo, conforme al numeral 31.1 del artículo 31 del RLIA, en la medida necesaria para el cumplimiento de las obligaciones de transparencia y explicabilidad de la SUNAT y con respeto del secreto industrial y comercial, conforme al numeral 25.1 del artículo 25 del RLIA. La Comisión de Gobierno de IA determina el alcance de la documentación exigible al evaluar el componente de IA del caso de uso. No se admiten soluciones de caja negra no auditables.</w:t>
       </w:r>
@@ -12182,6 +13227,11 @@
           <w:highlight w:val="green"/>
         </w:rPr>
         <w:t>6.13</w:t>
+      </w:r>
+      <w:r>
+        <w:rPr>
+          <w:highlight w:val="green"/>
+        </w:rPr>
         <w:tab/>
         <w:t>De la sensibilización, la capacitación y la gestión del cambio</w:t>
       </w:r>
@@ -12228,6 +13278,13 @@
           <w:highlight w:val="lightGray"/>
         </w:rPr>
         <w:t>6.13.1</w:t>
+      </w:r>
+      <w:r>
+        <w:rPr>
+          <w:rFonts w:ascii="Arial" w:eastAsia="Arial" w:hAnsi="Arial" w:cs="Arial"/>
+          <w:color w:val="000000"/>
+          <w:highlight w:val="lightGray"/>
+        </w:rPr>
         <w:tab/>
         <w:t>Sensibilización</w:t>
       </w:r>
@@ -12443,6 +13500,13 @@
           <w:highlight w:val="lightGray"/>
         </w:rPr>
         <w:t>6.13.2</w:t>
+      </w:r>
+      <w:r>
+        <w:rPr>
+          <w:rFonts w:ascii="Arial" w:eastAsia="Arial" w:hAnsi="Arial" w:cs="Arial"/>
+          <w:color w:val="000000"/>
+          <w:highlight w:val="lightGray"/>
+        </w:rPr>
         <w:tab/>
         <w:t>Capacitación y fortalecimiento de capacidades</w:t>
       </w:r>
@@ -12464,7 +13528,7 @@
           <w:color w:val="000000"/>
           <w:highlight w:val="lightGray"/>
         </w:rPr>
-        <w:t xml:space="preserve">La Intendencia Nacional de Recursos Humanos fortalece de manera progresiva y sistemática las capacidades y competencias de su personal en materia de SBIA mediante acciones formativas. </w:t>
+        <w:t>La Intendencia Nacional de Recursos Humanos fortalece de manera progresiva y sistemática las capacidades y competencias de su personal en materia de SBIA mediante acciones formativas.</w:t>
       </w:r>
     </w:p>
     <w:p>
@@ -12484,8 +13548,44 @@
           <w:color w:val="000000"/>
           <w:highlight w:val="lightGray"/>
         </w:rPr>
+        <w:t xml:space="preserve">Las necesidades de capacitación asociadas a los distintos roles, los contenidos formativos, modalidades y los mecanismos de evaluación de resultados se </w:t>
+      </w:r>
+      <w:r>
+        <w:rPr>
+          <w:rFonts w:ascii="Arial" w:eastAsia="Arial" w:hAnsi="Arial" w:cs="Arial"/>
+          <w:color w:val="000000"/>
+          <w:highlight w:val="lightGray"/>
+        </w:rPr>
         <w:lastRenderedPageBreak/>
-        <w:t>Las necesidades de capacitación asociadas a los distintos roles, los contenidos formativos, las modalidades de capacitación y los mecanismos de evaluación de resultados se determinan en el marco normativo del Plan de Desarrollo de las Personas. La Intendencia Nacional de Recursos Humanos las incorpora en dicho instrumento a propuesta de la Comisión de Gobierno de IA. En tanto no se incorporen, las acciones formativas en materia de IA se ejecutan conforme al presente numeral.</w:t>
+        <w:t>determinan en el marco normativo del Plan de Desarrollo de las Personas (PDP), dentro de los plazos establecidos.</w:t>
+      </w:r>
+    </w:p>
+    <w:p>
+      <w:pPr>
+        <w:spacing w:line="276" w:lineRule="auto"/>
+        <w:ind w:left="1276"/>
+        <w:jc w:val="both"/>
+        <w:rPr>
+          <w:rFonts w:ascii="Arial" w:eastAsia="Arial" w:hAnsi="Arial" w:cs="Arial"/>
+          <w:color w:val="000000"/>
+          <w:highlight w:val="lightGray"/>
+        </w:rPr>
+      </w:pPr>
+      <w:r>
+        <w:rPr>
+          <w:rFonts w:ascii="Arial" w:eastAsia="Arial" w:hAnsi="Arial" w:cs="Arial"/>
+          <w:color w:val="000000"/>
+          <w:highlight w:val="lightGray"/>
+        </w:rPr>
+        <w:t xml:space="preserve">En tanto la Comisión de Gobierno de IA no formule la propuesta correspondiente para su incorporación en el PDP, las acciones formativas en materia de IA se ejecutan conforme al presente </w:t>
+      </w:r>
+      <w:r>
+        <w:rPr>
+          <w:rFonts w:ascii="Arial" w:eastAsia="Arial" w:hAnsi="Arial" w:cs="Arial"/>
+          <w:color w:val="000000"/>
+          <w:highlight w:val="lightGray"/>
+        </w:rPr>
+        <w:t>numeral.</w:t>
       </w:r>
     </w:p>
     <w:p>
@@ -12656,6 +13756,13 @@
           <w:highlight w:val="lightGray"/>
         </w:rPr>
         <w:t>Esta disposición se implementa conforme al numeral 28.5 del artículo 28 del RLIA y en concordancia con el numeral 7.2 y el Anexo A.4 de la NTP</w:t>
+      </w:r>
+      <w:r>
+        <w:rPr>
+          <w:rFonts w:ascii="Arial" w:eastAsia="Arial" w:hAnsi="Arial" w:cs="Arial"/>
+          <w:color w:val="000000"/>
+          <w:highlight w:val="lightGray"/>
+        </w:rPr>
         <w:noBreakHyphen/>
         <w:t>ISO/IEC 42001:2025.</w:t>
       </w:r>
@@ -12678,6 +13785,13 @@
           <w:highlight w:val="lightGray"/>
         </w:rPr>
         <w:t>6.13.3</w:t>
+      </w:r>
+      <w:r>
+        <w:rPr>
+          <w:rFonts w:ascii="Arial" w:eastAsia="Arial" w:hAnsi="Arial" w:cs="Arial"/>
+          <w:color w:val="000000"/>
+          <w:highlight w:val="lightGray"/>
+        </w:rPr>
         <w:tab/>
         <w:t>Gestión del cambio</w:t>
       </w:r>
@@ -12740,6 +13854,11 @@
           <w:highlight w:val="yellow"/>
         </w:rPr>
         <w:t>6.14</w:t>
+      </w:r>
+      <w:r>
+        <w:rPr>
+          <w:highlight w:val="yellow"/>
+        </w:rPr>
         <w:tab/>
         <w:t>De la ética y la integridad en los SBIA</w:t>
       </w:r>
@@ -12765,6 +13884,13 @@
           <w:highlight w:val="yellow"/>
         </w:rPr>
         <w:t>6.14.1</w:t>
+      </w:r>
+      <w:r>
+        <w:rPr>
+          <w:rFonts w:ascii="Arial" w:eastAsia="Arial" w:hAnsi="Arial" w:cs="Arial"/>
+          <w:color w:val="000000"/>
+          <w:highlight w:val="yellow"/>
+        </w:rPr>
         <w:tab/>
         <w:t>En el desarrollo, la implementación y el uso de los SBIA, la SUNAT adopta las acciones previstas en el numeral 27.1 del artículo 27 del RLIA. Promueve la participación de equipos diversos y multidisciplinarios. Garantiza el pleno respeto de los derechos humanos y evita que se generen resultados injustos o discriminatorios. Considera el impacto social y ambiental. Implementa las mejores prácticas, estándares y normas técnicas para identificar y minimizar los sesgos de los algoritmos y de las bases de datos utilizados</w:t>
       </w:r>
@@ -12804,6 +13930,13 @@
           <w:highlight w:val="yellow"/>
         </w:rPr>
         <w:t>6.14.2</w:t>
+      </w:r>
+      <w:r>
+        <w:rPr>
+          <w:rFonts w:ascii="Arial" w:eastAsia="Arial" w:hAnsi="Arial" w:cs="Arial"/>
+          <w:color w:val="000000"/>
+          <w:highlight w:val="yellow"/>
+        </w:rPr>
         <w:tab/>
       </w:r>
       <w:r>
@@ -12812,9 +13945,16 @@
           <w:color w:val="000000"/>
           <w:highlight w:val="green"/>
         </w:rPr>
-        <w:t xml:space="preserve">La SUNAT promueve que su personal cumpla, en el desarrollo, la implementación y el uso de los SBIA, las normas del Código de Ética de la Función Pública, su Reglamento y las normas de integridad, así como las recomendaciones internacionales y los principios éticos de la Organización para la Cooperación y el Desarrollo Económico (OCDE) en materia de inteligencia artificial, conforme al numeral 28.9 del artículo 28 del RLIA, y los Principios Rectores del Proceso de Hiroshima del G7.</w:t>
+        <w:t xml:space="preserve">La SUNAT promueve que su personal cumpla, en el desarrollo, la implementación y el uso de los SBIA, las normas del Código de Ética de la Función Pública, su Reglamento y las normas de integridad, así como las recomendaciones internacionales y los principios éticos de la Organización </w:t>
+      </w:r>
+      <w:r>
+        <w:rPr>
+          <w:rFonts w:ascii="Arial" w:eastAsia="Arial" w:hAnsi="Arial" w:cs="Arial"/>
+          <w:color w:val="000000"/>
+          <w:highlight w:val="green"/>
+        </w:rPr>
         <w:lastRenderedPageBreak/>
-        <w:t xml:space="preserve"> La OII supervisa en los SBIA el cumplimiento de los principios rectores establecidos en el artículo 7 del RLIA y de los compromisos de la Política de IA; evalúa los riesgos de sesgo y discriminación y administra el canal de consultas éticas en materia de IA. </w:t>
+        <w:t xml:space="preserve">para la Cooperación y el Desarrollo Económico (OCDE) en materia de inteligencia artificial, conforme al numeral 28.9 del artículo 28 del RLIA, y los Principios Rectores del Proceso de Hiroshima del G7. La OII supervisa en los SBIA el cumplimiento de los principios rectores establecidos en el artículo 7 del RLIA y de los compromisos de la Política de IA; evalúa los riesgos de sesgo y discriminación y administra el canal de consultas éticas en materia de IA. </w:t>
       </w:r>
       <w:r>
         <w:rPr>
@@ -12856,6 +13996,13 @@
           <w:highlight w:val="yellow"/>
         </w:rPr>
         <w:t>6.14.3</w:t>
+      </w:r>
+      <w:r>
+        <w:rPr>
+          <w:rFonts w:ascii="Arial" w:eastAsia="Arial" w:hAnsi="Arial" w:cs="Arial"/>
+          <w:color w:val="000000"/>
+          <w:highlight w:val="yellow"/>
+        </w:rPr>
         <w:tab/>
         <w:t>Los Lineamientos Éticos que apruebe la SGTD</w:t>
       </w:r>
@@ -12871,7 +14018,25 @@
           <w:color w:val="000000"/>
           <w:highlight w:val="yellow"/>
         </w:rPr>
-        <w:t xml:space="preserve"> son de aplicación en la SUNAT desde su entrada en vigencia. La Comisión de Gobierno de IA evalúa su impacto en la presente directiva y propone al CGTD los ajustes que correspondan.</w:t>
+        <w:t xml:space="preserve"> </w:t>
+      </w:r>
+      <w:proofErr w:type="gramStart"/>
+      <w:r>
+        <w:rPr>
+          <w:rFonts w:ascii="Arial" w:eastAsia="Arial" w:hAnsi="Arial" w:cs="Arial"/>
+          <w:color w:val="000000"/>
+          <w:highlight w:val="yellow"/>
+        </w:rPr>
+        <w:t>son de aplicación</w:t>
+      </w:r>
+      <w:proofErr w:type="gramEnd"/>
+      <w:r>
+        <w:rPr>
+          <w:rFonts w:ascii="Arial" w:eastAsia="Arial" w:hAnsi="Arial" w:cs="Arial"/>
+          <w:color w:val="000000"/>
+          <w:highlight w:val="yellow"/>
+        </w:rPr>
+        <w:t xml:space="preserve"> en la SUNAT desde su entrada en vigencia. La Comisión de Gobierno de IA evalúa su impacto en la presente directiva y propone al CGTD los ajustes que correspondan.</w:t>
       </w:r>
     </w:p>
     <w:p>
@@ -12888,6 +14053,11 @@
           <w:highlight w:val="lightGray"/>
         </w:rPr>
         <w:t>6.15</w:t>
+      </w:r>
+      <w:r>
+        <w:rPr>
+          <w:highlight w:val="lightGray"/>
+        </w:rPr>
         <w:tab/>
         <w:t>De la articulación con la formulación de iniciativas, proyectos e inversiones</w:t>
       </w:r>
@@ -12933,6 +14103,12 @@
           <w:highlight w:val="green"/>
         </w:rPr>
         <w:t>6.15.1</w:t>
+      </w:r>
+      <w:r>
+        <w:rPr>
+          <w:rFonts w:ascii="Arial" w:hAnsi="Arial" w:cs="Arial"/>
+          <w:highlight w:val="green"/>
+        </w:rPr>
         <w:tab/>
         <w:t>Toda iniciativa, requerimiento o proyecto que incorpore o prevea un componente basado en IA requiere la opinión técnica previa de la Comisión de Gobierno de IA sobre dicho componente, cualquiera sea el instrumento de gestión bajo el cual se formule, ejecute o modifique. La opinión se emite sobre la Ficha de Evaluación de Caso de Uso (Anexo N.° 4), adecuada a la naturaleza y magnitud de la iniciativa, requerimiento o proyecto. La opinión comprende la pertinencia del uso de inteligencia artificial y la clasificación de riesgo del componente, conforme al Anexo N.° 2 y a los artículos 22 a 24 del RLIA. Determinar la pertinencia es establecer si el resultado esperado requiere inteligencia artificial o se alcanza sin ella, conforme al numeral 5.1.4. Los controles aplicables se determinan a partir de la clasificación, conforme al numeral 6.2.5. La opinión no comprende la generación de valor, el costo, la prioridad ni la viabilidad presupuestal de la iniciativa, que corresponden a los instrumentos de gestión respectivos y a las instancias competentes. Cuando otra unidad de organización se ha pronunciado dentro de su competencia, la Comisión de Gobierno de IA no evalúa nuevamente esa materia: toma su pronunciamiento y se pronuncia solo sobre el componente de IA. La opinión adopta uno de los siguientes pronunciamientos:</w:t>
       </w:r>
@@ -13015,9 +14191,8 @@
           <w:bCs w:val="0"/>
           <w:highlight w:val="green"/>
         </w:rPr>
-        <w:t xml:space="preserve">No favorable, cuando el uso es indebido conforme al artículo 23 del RLIA, contraviene la Política de IA o la normativa vigente, o el resultado esperado </w:t>
         <w:lastRenderedPageBreak/>
-        <w:t>se alcanza sin inteligencia artificial. En este último caso la iniciativa puede continuar sin el componente de IA.</w:t>
+        <w:t>No favorable, cuando el uso es indebido conforme al artículo 23 del RLIA, contraviene la Política de IA o la normativa vigente, o el resultado esperado se alcanza sin inteligencia artificial. En este último caso la iniciativa puede continuar sin el componente de IA.</w:t>
       </w:r>
     </w:p>
     <w:p>
@@ -13038,6 +14213,12 @@
           <w:highlight w:val="green"/>
         </w:rPr>
         <w:t>6.15.2</w:t>
+      </w:r>
+      <w:r>
+        <w:rPr>
+          <w:rFonts w:ascii="Arial" w:hAnsi="Arial" w:cs="Arial"/>
+          <w:highlight w:val="green"/>
+        </w:rPr>
         <w:tab/>
         <w:t>El uso indebido está prohibido por el artículo 23 del RLIA y el sometimiento de los SBIA de riesgo alto a condiciones y controles es obligatorio conforme al literal b) del numeral 22.1 del artículo 22 del RLIA, a sus artículos 25, 29 y 30 y al numeral 28.11 de su artículo 28: en ambos casos obliga la norma, no la opinión. En los demás casos la opinión sustenta la decisión, pero no la reemplaza. La aprobación corresponde, en cada caso, a la instancia competente conforme al ROF, a las normas de delegación de facultades, a los instrumentos de gestión institucionales o a la normativa de los sistemas administrativos del Estado.</w:t>
       </w:r>
@@ -13061,6 +14242,12 @@
           <w:highlight w:val="lightGray"/>
         </w:rPr>
         <w:t>6.15.3</w:t>
+      </w:r>
+      <w:r>
+        <w:rPr>
+          <w:rFonts w:ascii="Arial" w:hAnsi="Arial" w:cs="Arial"/>
+          <w:highlight w:val="lightGray"/>
+        </w:rPr>
         <w:tab/>
         <w:t>En la gestión de la demanda informática, cuando un requerimiento implique el desarrollo, la adquisición o el uso de un SBIA o de una herramienta de IA, se recaba la opinión de la Comisión antes de su atención, con los formatos vigentes de la demanda complementados con la información que la INSI determine.</w:t>
       </w:r>
@@ -13084,6 +14271,12 @@
           <w:highlight w:val="green"/>
         </w:rPr>
         <w:t>6.15.4</w:t>
+      </w:r>
+      <w:r>
+        <w:rPr>
+          <w:rFonts w:ascii="Arial" w:hAnsi="Arial" w:cs="Arial"/>
+          <w:highlight w:val="green"/>
+        </w:rPr>
         <w:tab/>
         <w:t>En los programas y proyectos institucionales conforme al MGPP, la opinión de la Comisión de Gobierno de IA se recaba desde que se identifica un componente basado en IA, en cualquier fase, y antes de la decisión que autoriza avanzar a la fase siguiente. La opinión se incorpora al expediente del caso de negocio o del plan de gestión, según corresponda, junto con las validaciones y opiniones que el MGPP ya prevé, y no requiere una etapa ni una instancia adicionales. Aplica en particular:</w:t>
       </w:r>
@@ -13242,6 +14435,12 @@
           <w:highlight w:val="lightGray"/>
         </w:rPr>
         <w:t>6.15.5</w:t>
+      </w:r>
+      <w:r>
+        <w:rPr>
+          <w:rFonts w:ascii="Arial" w:hAnsi="Arial" w:cs="Arial"/>
+          <w:highlight w:val="lightGray"/>
+        </w:rPr>
         <w:tab/>
         <w:t>Cuando un proyecto de inversión pública sujeto al Sistema Nacional de Programación Multianual y Gestión de Inversiones incorpore un componente basado en IA, la Unidad Formuladora considera la opinión de la Comisión como insumo del análisis técnico que sustenta la declaración de viabilidad, sin perjuicio de las disposiciones del referido Sistema. En la ejecución, el SBIA se sujeta al ciclo de vida del numeral 6.1.</w:t>
       </w:r>
@@ -13260,11 +14459,16 @@
           <w:rFonts w:ascii="Arial" w:hAnsi="Arial" w:cs="Arial"/>
           <w:highlight w:val="green"/>
         </w:rPr>
+        <w:lastRenderedPageBreak/>
         <w:t>6.15.6</w:t>
+      </w:r>
+      <w:r>
+        <w:rPr>
+          <w:rFonts w:ascii="Arial" w:hAnsi="Arial" w:cs="Arial"/>
+          <w:highlight w:val="green"/>
+        </w:rPr>
         <w:tab/>
-        <w:t xml:space="preserve">Las unidades de organización competentes de cada instrumento de gestión incorporan en sus documentos normativos la verificación del componente de IA y la opinión de la Comisión de Gobierno de IA, conforme al numeral 7.6. Esta </w:t>
-        <w:lastRenderedPageBreak/>
-        <w:t>incorporación alcanza al Modelo de Gobernabilidad de Programas y Proyectos y a la gestión de la demanda informática. La presente directiva no sustituye dichos instrumentos.</w:t>
+        <w:t>Las unidades de organización competentes de cada instrumento de gestión incorporan en sus documentos normativos la verificación del componente de IA y la opinión de la Comisión de Gobierno de IA, conforme al numeral 7.6. Esta incorporación alcanza al Modelo de Gobernabilidad de Programas y Proyectos y a la gestión de la demanda informática. La presente directiva no sustituye dichos instrumentos.</w:t>
       </w:r>
     </w:p>
     <w:p>
@@ -13284,6 +14488,12 @@
           <w:highlight w:val="lightGray"/>
         </w:rPr>
         <w:t>6.15.7</w:t>
+      </w:r>
+      <w:r>
+        <w:rPr>
+          <w:rFonts w:ascii="Arial" w:hAnsi="Arial" w:cs="Arial"/>
+          <w:highlight w:val="lightGray"/>
+        </w:rPr>
         <w:tab/>
         <w:t>La presente directiva se articula con la normativa institucional de gobernanza de datos y analítica. Cuando un producto analítico incorpore un sistema basado en IA, este se sujeta al ciclo de vida, la clasificación de riesgo, la evaluación de impacto algorítmico, el registro en el Inventario Institucional de SBIA y las obligaciones de transparencia y supervisión humana previstas en la presente directiva. La certificación del producto analítico requiere, como insumo previo, la aprobación que corresponda conforme al numeral 6.1.2. La calidad, el linaje, los metadatos y la certificación de los datos que alimentan el sistema se rigen por la normativa institucional de gobernanza de datos y analítica. En tanto dicha normativa no se apruebe, esas materias se rigen por el numeral 6.8 de la presente directiva.</w:t>
       </w:r>
@@ -13314,6 +14524,12 @@
         </w:rPr>
         <w:lastRenderedPageBreak/>
         <w:t>6.15.8</w:t>
+      </w:r>
+      <w:r>
+        <w:rPr>
+          <w:rFonts w:ascii="Arial" w:hAnsi="Arial" w:cs="Arial"/>
+          <w:highlight w:val="green"/>
+        </w:rPr>
         <w:tab/>
         <w:t>La INSI, en el ejercicio de las competencias que el MGPP le reconoce en los momentos señalados, advierte la presencia de un componente de IA y la comunica a la Comisión de Gobierno de IA. La opinión de la Comisión es distinta de la validación que la INSI emite en el ámbito de sus competencias: ambas se incorporan al expediente y ninguna sustituye a la otra.</w:t>
       </w:r>
@@ -13337,6 +14553,12 @@
           <w:highlight w:val="green"/>
         </w:rPr>
         <w:t>6.15.9</w:t>
+      </w:r>
+      <w:r>
+        <w:rPr>
+          <w:rFonts w:ascii="Arial" w:hAnsi="Arial" w:cs="Arial"/>
+          <w:highlight w:val="green"/>
+        </w:rPr>
         <w:tab/>
         <w:t>Cuando se requiera sustentar la opinión de la Comisión ante el Comité de Proyecto, concurre a la sesión el Coordinador de la Comisión de Gobierno de IA o el miembro que esta designe. Su concurrencia no altera la composición ni las competencias del Comité de Proyecto.</w:t>
       </w:r>
@@ -13360,6 +14582,12 @@
           <w:highlight w:val="green"/>
         </w:rPr>
         <w:t>6.15.10</w:t>
+      </w:r>
+      <w:r>
+        <w:rPr>
+          <w:rFonts w:ascii="Arial" w:hAnsi="Arial" w:cs="Arial"/>
+          <w:highlight w:val="green"/>
+        </w:rPr>
         <w:tab/>
         <w:t>La unidad de organización competente del MGPP incorpora en dicho instrumento el momento y la instancia ante la que se recaba la opinión, conforme al numeral 7.6.</w:t>
       </w:r>
@@ -13401,6 +14629,12 @@
           <w:bCs w:val="0"/>
         </w:rPr>
         <w:t>7.1</w:t>
+      </w:r>
+      <w:r>
+        <w:rPr>
+          <w:b w:val="0"/>
+          <w:bCs w:val="0"/>
+        </w:rPr>
         <w:tab/>
         <w:t>La presente directiva entra en vigencia al día siguiente de la emisión de la Resolución de Superintendencia que la aprueba.</w:t>
       </w:r>
@@ -13421,6 +14655,12 @@
           <w:bCs w:val="0"/>
         </w:rPr>
         <w:t>7.2</w:t>
+      </w:r>
+      <w:r>
+        <w:rPr>
+          <w:b w:val="0"/>
+          <w:bCs w:val="0"/>
+        </w:rPr>
         <w:tab/>
         <w:t>La actualización de la presente directiva es propuesta por la Comisión de Gobierno de IA, conforme a la METDONI.</w:t>
       </w:r>
@@ -13442,6 +14682,13 @@
           <w:highlight w:val="yellow"/>
         </w:rPr>
         <w:t>7.3</w:t>
+      </w:r>
+      <w:r>
+        <w:rPr>
+          <w:b w:val="0"/>
+          <w:bCs w:val="0"/>
+          <w:highlight w:val="yellow"/>
+        </w:rPr>
         <w:tab/>
         <w:t>La Comisión de Gobierno de IA se conforma mediante Resolución de Superintendencia, a propuesta del CGTD, conforme al numeral 5.3 de la presente directiva.</w:t>
       </w:r>
@@ -13480,6 +14727,13 @@
           <w:highlight w:val="green"/>
         </w:rPr>
         <w:t>7.4</w:t>
+      </w:r>
+      <w:r>
+        <w:rPr>
+          <w:b w:val="0"/>
+          <w:bCs w:val="0"/>
+          <w:highlight w:val="green"/>
+        </w:rPr>
         <w:tab/>
         <w:t>El Sistema de Gestión de Inteligencia Artificial (SGIA) de la SUNAT se rige por la NTP-ISO/IEC 42001:2025, de uso obligatorio conforme al numeral 28.2 del artículo 28 del RLIA. Los límites y la aplicabilidad del SGIA se determinan conforme al capítulo 4.3 de la referida norma técnica, considerando el alcance, la complejidad y el contexto institucional, y su implementación se gradúa con un enfoque basado en riesgos. La Comisión de Gobierno de IA propone al CGTD el plan de implementación del SGIA, con hitos y responsables. El CGTD lo aprueba. La Comisión coordina los lineamientos técnicos que correspondan, que se aprueban conforme al numeral 7.6.</w:t>
       </w:r>
@@ -13507,6 +14761,12 @@
           <w:bCs w:val="0"/>
         </w:rPr>
         <w:t>7.5</w:t>
+      </w:r>
+      <w:r>
+        <w:rPr>
+          <w:b w:val="0"/>
+          <w:bCs w:val="0"/>
+        </w:rPr>
         <w:tab/>
         <w:t xml:space="preserve">La Comisión de Gobierno de IA, con el apoyo técnico de la INSI, implementa el Inventario Institucional de SBIA. </w:t>
       </w:r>
@@ -13608,6 +14868,12 @@
           <w:bCs w:val="0"/>
         </w:rPr>
         <w:t>7.7</w:t>
+      </w:r>
+      <w:r>
+        <w:rPr>
+          <w:b w:val="0"/>
+          <w:bCs w:val="0"/>
+        </w:rPr>
         <w:tab/>
         <w:t xml:space="preserve">El CGTD resuelve las situaciones no previstas, sin perjuicio de la aplicación </w:t>
       </w:r>
@@ -13643,6 +14909,12 @@
           <w:bCs w:val="0"/>
         </w:rPr>
         <w:t>7.8</w:t>
+      </w:r>
+      <w:r>
+        <w:rPr>
+          <w:b w:val="0"/>
+          <w:bCs w:val="0"/>
+        </w:rPr>
         <w:tab/>
       </w:r>
       <w:r>
@@ -13671,6 +14943,13 @@
           <w:highlight w:val="green"/>
         </w:rPr>
         <w:t>7.9</w:t>
+      </w:r>
+      <w:r>
+        <w:rPr>
+          <w:b w:val="0"/>
+          <w:bCs w:val="0"/>
+          <w:highlight w:val="green"/>
+        </w:rPr>
         <w:tab/>
         <w:t>El detalle de aplicación de los Anexos (los formatos, los criterios de registro, los catálogos de valores y los indicadores operativos, así como los campos adicionales que resulten necesarios) se establece en los documentos normativos institucionales de menor rango previstos en el numeral 7.6, que las unidades competentes actualizan sin requerir la modificación de la presente directiva. Dichos documentos no suprimen ni reducen los campos ni los contenidos mínimos que los Anexos establecen.</w:t>
       </w:r>
@@ -13692,6 +14971,13 @@
           <w:highlight w:val="yellow"/>
         </w:rPr>
         <w:t>7.10</w:t>
+      </w:r>
+      <w:r>
+        <w:rPr>
+          <w:b w:val="0"/>
+          <w:bCs w:val="0"/>
+          <w:highlight w:val="yellow"/>
+        </w:rPr>
         <w:tab/>
         <w:t xml:space="preserve">El Oficial de Inteligencia Artificial (OIA) de la SUNAT, previsto en el artículo 6 de la Resolución Ministerial N.° 152-2026-PCM, que aprueba la ENIA, recae en un miembro del CGTD y coordina el gobierno y la gestión de la inteligencia artificial institucional, así como el seguimiento del Plan de Acción de Inteligencia Artificial. Su designación se efectúa mediante acto de la máxima autoridad administrativa de la entidad, previamente a la formulación del Plan de Acción de Inteligencia Artificial. Su perfil, responsabilidades, designación y articulación se determinan conforme a los lineamientos que emita la SGTD, en aplicación de la Primera Disposición Complementaria Final de la citada Resolución Ministerial. </w:t>
       </w:r>
@@ -13717,6 +15003,13 @@
           <w:highlight w:val="green"/>
         </w:rPr>
         <w:t xml:space="preserve">Designado el OIA, la coordinación de la Comisión de Gobierno de IA recae en él, salvo que los lineamientos de la SGTD </w:t>
+      </w:r>
+      <w:r>
+        <w:rPr>
+          <w:b w:val="0"/>
+          <w:bCs w:val="0"/>
+          <w:highlight w:val="green"/>
+        </w:rPr>
         <w:lastRenderedPageBreak/>
         <w:t>dispongan una articulación distinta. La Comisión de Gobierno de IA evalúa su articulación conforme a dichos lineamientos y propone al CGTD los ajustes que correspondan.</w:t>
       </w:r>
@@ -13745,6 +15038,13 @@
           <w:highlight w:val="yellow"/>
         </w:rPr>
         <w:t>7.11</w:t>
+      </w:r>
+      <w:r>
+        <w:rPr>
+          <w:b w:val="0"/>
+          <w:bCs w:val="0"/>
+          <w:highlight w:val="yellow"/>
+        </w:rPr>
         <w:tab/>
         <w:t xml:space="preserve">El Plan de Acción de Inteligencia Artificial (PAIA) forma parte del Portafolio de Proyectos del PGD, conforme al numeral 5.5 del artículo 5 de la Resolución Ministerial N.° 152-2026-PCM. Su aprobación requiere que la SUNAT haya aprobado o implementado previamente su Plan de Acción de Gobierno de Datos (PAGD), conforme al numeral 5.4 del mismo artículo de dicha Resolución Ministerial; el PAGD forma parte del PGD y su formulación la coordina el CGTD, en concordancia con la ENGD. Las iniciativas, proyectos y acciones priorizadas en el PAIA se articulan con el Plan Estratégico Institucional, el Plan Operativo Institucional, el Programa Multianual de Inversiones y el PGD, conforme al numeral 4.4 del artículo 4 de la misma Resolución Ministerial y al numeral 28.10 del artículo 28 del RLIA. </w:t>
       </w:r>
@@ -13775,6 +15075,13 @@
           <w:highlight w:val="green"/>
         </w:rPr>
         <w:t>7.12</w:t>
+      </w:r>
+      <w:r>
+        <w:rPr>
+          <w:b w:val="0"/>
+          <w:bCs w:val="0"/>
+          <w:highlight w:val="green"/>
+        </w:rPr>
         <w:tab/>
         <w:t>Las iniciativas, proyectos y acciones que incorporen un componente basado en IA y no se encuentren comprendidos en el PAIA acreditan su alineamiento con un objetivo del PGD o del Plan Estratégico Institucional mediante la evidencia documentada que corresponda. La Comisión de Gobierno de IA verifica dicho alineamiento y lo reporta en el informe trimestral del numeral 6.9.5.</w:t>
       </w:r>
@@ -13795,6 +15102,12 @@
           <w:bCs w:val="0"/>
         </w:rPr>
         <w:t>7.13</w:t>
+      </w:r>
+      <w:r>
+        <w:rPr>
+          <w:b w:val="0"/>
+          <w:bCs w:val="0"/>
+        </w:rPr>
         <w:tab/>
         <w:t>El OIA reporta trimestralmente al CGTD el seguimiento de la implementación del PAIA, conforme al numeral 8.3 del artículo 8 de la Resolución Ministerial N.° 152-2026-PCM. Dicho reporte se integra al informe trimestral de gobierno de IA previsto en el numeral 6.9.5. Asimismo, el OIA registra los avances de la implementación del PAIA en la Plataforma de Cumplimiento Digital, en el último trimestre de cada año, conforme al numeral 8.4 del mismo artículo.</w:t>
       </w:r>
@@ -13815,6 +15128,12 @@
           <w:bCs w:val="0"/>
         </w:rPr>
         <w:t>7.14</w:t>
+      </w:r>
+      <w:r>
+        <w:rPr>
+          <w:b w:val="0"/>
+          <w:bCs w:val="0"/>
+        </w:rPr>
         <w:tab/>
         <w:t>Las unidades de organización comunican a la Comisión de Gobierno de IA los SBIA que, a la entrada en vigencia de la presente directiva, se encuentren en desarrollo o en operación. Dichos SBIA se incorporan al Inventario Institucional de SBIA y su registro se reporta en el informe trimestral previsto en el numeral 6.9.5. La Comisión de Gobierno de IA determina su nivel de riesgo conforme al numeral 6.2.2 y, cuando corresponda la calificación de riesgo alto, dispone la formulación de la Evaluación de Impacto Algorítmico prevista en el numeral 6.4.1. Los hitos de control de las etapas del ciclo de vida ya superadas se sustituyen por una verificación única de la Comisión de Gobierno de IA, que se efectúa con anterioridad a la siguiente puesta en producción o al siguiente cambio significativo calificado conforme al numeral 6.10.5, y que comprende los mecanismos previstos en los numerales 6.5.5, 6.5.6, 6.6.3 y 6.7.2. El propietario del caso de uso ejecuta la adecuación.</w:t>
       </w:r>
@@ -13836,6 +15155,7 @@
           <w:color w:val="000000"/>
           <w:szCs w:val="22"/>
         </w:rPr>
+        <w:lastRenderedPageBreak/>
         <w:t>ANEXOS</w:t>
       </w:r>
       <w:bookmarkEnd w:id="8"/>
@@ -13947,6 +15267,14 @@
           <w:color w:val="000000"/>
         </w:rPr>
         <w:br w:type="page"/>
+      </w:r>
+      <w:r>
+        <w:rPr>
+          <w:rFonts w:ascii="Arial" w:eastAsia="Arial" w:hAnsi="Arial" w:cs="Arial"/>
+          <w:b/>
+          <w:bCs/>
+          <w:color w:val="000000"/>
+        </w:rPr>
         <w:lastRenderedPageBreak/>
         <w:t>Anexo N.° 1: Ficha de Registro de SBIA (Campos mínimos del Inventario). Constituye el contenido mínimo del registro y se actualiza conforme al numeral 7.9.</w:t>
       </w:r>
@@ -14980,7 +16308,23 @@
                 <w:rFonts w:ascii="Arial" w:eastAsia="Arial" w:hAnsi="Arial" w:cs="Arial"/>
                 <w:lang w:val="en-US"/>
               </w:rPr>
-              <w:t>Human-in-the-loop, on-the-loop o in-command.</w:t>
+              <w:t xml:space="preserve">Human-in-the-loop, on-the-loop </w:t>
+            </w:r>
+            <w:proofErr w:type="gramStart"/>
+            <w:r>
+              <w:rPr>
+                <w:rFonts w:ascii="Arial" w:eastAsia="Arial" w:hAnsi="Arial" w:cs="Arial"/>
+                <w:lang w:val="en-US"/>
+              </w:rPr>
+              <w:t>o in</w:t>
+            </w:r>
+            <w:proofErr w:type="gramEnd"/>
+            <w:r>
+              <w:rPr>
+                <w:rFonts w:ascii="Arial" w:eastAsia="Arial" w:hAnsi="Arial" w:cs="Arial"/>
+                <w:lang w:val="en-US"/>
+              </w:rPr>
+              <w:t>-command.</w:t>
             </w:r>
           </w:p>
         </w:tc>
@@ -16475,6 +17819,7 @@
                 <w:rFonts w:ascii="Arial" w:eastAsia="Arial" w:hAnsi="Arial" w:cs="Arial"/>
                 <w:highlight w:val="green"/>
               </w:rPr>
+              <w:lastRenderedPageBreak/>
               <w:t>24</w:t>
             </w:r>
           </w:p>
@@ -16583,7 +17928,6 @@
                 <w:rFonts w:ascii="Arial" w:eastAsia="Arial" w:hAnsi="Arial" w:cs="Arial"/>
                 <w:highlight w:val="green"/>
               </w:rPr>
-              <w:lastRenderedPageBreak/>
               <w:t>25</w:t>
             </w:r>
           </w:p>
@@ -25248,16 +26592,6 @@
 </file>
 
 <file path=customXml/item1.xml><?xml version="1.0" encoding="utf-8"?>
-<p:properties xmlns:p="http://schemas.microsoft.com/office/2006/metadata/properties" xmlns:xsi="http://www.w3.org/2001/XMLSchema-instance" xmlns:pc="http://schemas.microsoft.com/office/infopath/2007/PartnerControls">
-  <documentManagement/>
-</p:properties>
-</file>
-
-<file path=customXml/item2.xml><?xml version="1.0" encoding="utf-8"?>
-<b:Sources xmlns:b="http://schemas.openxmlformats.org/officeDocument/2006/bibliography" xmlns="http://schemas.openxmlformats.org/officeDocument/2006/bibliography" SelectedStyle="\APASixthEditionOfficeOnline.xsl" StyleName="APA" Version="6"/>
-</file>
-
-<file path=customXml/item3.xml><?xml version="1.0" encoding="utf-8"?>
 <ct:contentTypeSchema xmlns:ct="http://schemas.microsoft.com/office/2006/metadata/contentType" xmlns:ma="http://schemas.microsoft.com/office/2006/metadata/properties/metaAttributes" ct:_="" ma:_="" ma:contentTypeName="Document" ma:contentTypeID="0x0101005C14AC06E2BCC9479AB1E7BFB85765A3" ma:contentTypeVersion="3" ma:contentTypeDescription="Create a new document." ma:contentTypeScope="" ma:versionID="7c0f1869e227914bb9e091b5d5366560">
   <xsd:schema xmlns:xsd="http://www.w3.org/2001/XMLSchema" xmlns:xs="http://www.w3.org/2001/XMLSchema" xmlns:p="http://schemas.microsoft.com/office/2006/metadata/properties" xmlns:ns2="fdb19afe-0f16-4040-a6da-335f4767bfc9" targetNamespace="http://schemas.microsoft.com/office/2006/metadata/properties" ma:root="true" ma:fieldsID="a498babe3b735ed6250eb2675f7bac41" ns2:_="">
     <xsd:import namespace="fdb19afe-0f16-4040-a6da-335f4767bfc9"/>
@@ -25395,6 +26729,16 @@
 </ct:contentTypeSchema>
 </file>
 
+<file path=customXml/item2.xml><?xml version="1.0" encoding="utf-8"?>
+<b:Sources xmlns:b="http://schemas.openxmlformats.org/officeDocument/2006/bibliography" xmlns="http://schemas.openxmlformats.org/officeDocument/2006/bibliography" SelectedStyle="\APASixthEditionOfficeOnline.xsl" StyleName="APA" Version="6"/>
+</file>
+
+<file path=customXml/item3.xml><?xml version="1.0" encoding="utf-8"?>
+<p:properties xmlns:p="http://schemas.microsoft.com/office/2006/metadata/properties" xmlns:xsi="http://www.w3.org/2001/XMLSchema-instance" xmlns:pc="http://schemas.microsoft.com/office/infopath/2007/PartnerControls">
+  <documentManagement/>
+</p:properties>
+</file>
+
 <file path=customXml/item4.xml><?xml version="1.0" encoding="utf-8"?>
 <?mso-contentType ?>
 <FormTemplates xmlns="http://schemas.microsoft.com/sharepoint/v3/contenttype/forms">
@@ -25405,23 +26749,6 @@
 </file>
 
 <file path=customXml/itemProps1.xml><?xml version="1.0" encoding="utf-8"?>
-<ds:datastoreItem xmlns:ds="http://schemas.openxmlformats.org/officeDocument/2006/customXml" ds:itemID="{E06D9414-6C68-4A1C-B889-BD6BE2EA8645}">
-  <ds:schemaRefs>
-    <ds:schemaRef ds:uri="http://schemas.microsoft.com/office/2006/metadata/properties"/>
-    <ds:schemaRef ds:uri="http://schemas.microsoft.com/office/infopath/2007/PartnerControls"/>
-  </ds:schemaRefs>
-</ds:datastoreItem>
-</file>
-
-<file path=customXml/itemProps2.xml><?xml version="1.0" encoding="utf-8"?>
-<ds:datastoreItem xmlns:ds="http://schemas.openxmlformats.org/officeDocument/2006/customXml" ds:itemID="{599D4DEC-5966-453E-8EBA-1FE602AD820F}">
-  <ds:schemaRefs>
-    <ds:schemaRef ds:uri="http://schemas.openxmlformats.org/officeDocument/2006/bibliography"/>
-  </ds:schemaRefs>
-</ds:datastoreItem>
-</file>
-
-<file path=customXml/itemProps3.xml><?xml version="1.0" encoding="utf-8"?>
 <ds:datastoreItem xmlns:ds="http://schemas.openxmlformats.org/officeDocument/2006/customXml" ds:itemID="{5C1C6231-2072-4263-80CD-99FB4E777A75}">
   <ds:schemaRefs>
     <ds:schemaRef ds:uri="http://schemas.microsoft.com/office/2006/metadata/contentType"/>
@@ -25439,6 +26766,23 @@
 </ds:datastoreItem>
 </file>
 
+<file path=customXml/itemProps2.xml><?xml version="1.0" encoding="utf-8"?>
+<ds:datastoreItem xmlns:ds="http://schemas.openxmlformats.org/officeDocument/2006/customXml" ds:itemID="{599D4DEC-5966-453E-8EBA-1FE602AD820F}">
+  <ds:schemaRefs>
+    <ds:schemaRef ds:uri="http://schemas.openxmlformats.org/officeDocument/2006/bibliography"/>
+  </ds:schemaRefs>
+</ds:datastoreItem>
+</file>
+
+<file path=customXml/itemProps3.xml><?xml version="1.0" encoding="utf-8"?>
+<ds:datastoreItem xmlns:ds="http://schemas.openxmlformats.org/officeDocument/2006/customXml" ds:itemID="{E06D9414-6C68-4A1C-B889-BD6BE2EA8645}">
+  <ds:schemaRefs>
+    <ds:schemaRef ds:uri="http://schemas.microsoft.com/office/2006/metadata/properties"/>
+    <ds:schemaRef ds:uri="http://schemas.microsoft.com/office/infopath/2007/PartnerControls"/>
+  </ds:schemaRefs>
+</ds:datastoreItem>
+</file>
+
 <file path=customXml/itemProps4.xml><?xml version="1.0" encoding="utf-8"?>
 <ds:datastoreItem xmlns:ds="http://schemas.openxmlformats.org/officeDocument/2006/customXml" ds:itemID="{007781DB-EED9-4359-8AD9-68137B52B701}">
   <ds:schemaRefs>

</xml_diff>